<commit_message>
docs: Depuracion integral de FY y muletillas, rediseño anti-solapamiento de Figura 10, y fundamentacion metodologica explicita (Blume, Hamada, Opciones Reales, Damodaran Lambda, EVT, CIR)
</commit_message>
<xml_diff>
--- a/01_Reporte_PDF/Informe_Valuacion_Aluar_UNCuyo.docx
+++ b/01_Reporte_PDF/Informe_Valuacion_Aluar_UNCuyo.docx
@@ -1224,7 +1224,7 @@
       <w:r>
         <w:fldChar w:fldCharType="separate"/>
       </w:r>
-      <w:hyperlink w:anchor="_Toc237697205" w:history="1">
+      <w:hyperlink w:anchor="_Toc237699670" w:history="1">
         <w:r>
           <w:rPr>
             <w:rStyle w:val="Hipervnculo"/>
@@ -1251,7 +1251,7 @@
             <w:noProof/>
             <w:webHidden/>
           </w:rPr>
-          <w:instrText xml:space="preserve"> PAGEREF _Toc237697205 \h </w:instrText>
+          <w:instrText xml:space="preserve"> PAGEREF _Toc237699670 \h </w:instrText>
         </w:r>
         <w:r>
           <w:rPr>
@@ -1298,7 +1298,7 @@
           <w14:ligatures w14:val="standardContextual"/>
         </w:rPr>
       </w:pPr>
-      <w:hyperlink w:anchor="_Toc237697206" w:history="1">
+      <w:hyperlink w:anchor="_Toc237699671" w:history="1">
         <w:r>
           <w:rPr>
             <w:rStyle w:val="Hipervnculo"/>
@@ -1325,7 +1325,7 @@
             <w:noProof/>
             <w:webHidden/>
           </w:rPr>
-          <w:instrText xml:space="preserve"> PAGEREF _Toc237697206 \h </w:instrText>
+          <w:instrText xml:space="preserve"> PAGEREF _Toc237699671 \h </w:instrText>
         </w:r>
         <w:r>
           <w:rPr>
@@ -1372,7 +1372,7 @@
           <w14:ligatures w14:val="standardContextual"/>
         </w:rPr>
       </w:pPr>
-      <w:hyperlink w:anchor="_Toc237697207" w:history="1">
+      <w:hyperlink w:anchor="_Toc237699672" w:history="1">
         <w:r>
           <w:rPr>
             <w:rStyle w:val="Hipervnculo"/>
@@ -1399,7 +1399,7 @@
             <w:noProof/>
             <w:webHidden/>
           </w:rPr>
-          <w:instrText xml:space="preserve"> PAGEREF _Toc237697207 \h </w:instrText>
+          <w:instrText xml:space="preserve"> PAGEREF _Toc237699672 \h </w:instrText>
         </w:r>
         <w:r>
           <w:rPr>
@@ -1446,7 +1446,7 @@
           <w14:ligatures w14:val="standardContextual"/>
         </w:rPr>
       </w:pPr>
-      <w:hyperlink w:anchor="_Toc237697208" w:history="1">
+      <w:hyperlink w:anchor="_Toc237699673" w:history="1">
         <w:r>
           <w:rPr>
             <w:rStyle w:val="Hipervnculo"/>
@@ -1473,7 +1473,7 @@
             <w:noProof/>
             <w:webHidden/>
           </w:rPr>
-          <w:instrText xml:space="preserve"> PAGEREF _Toc237697208 \h </w:instrText>
+          <w:instrText xml:space="preserve"> PAGEREF _Toc237699673 \h </w:instrText>
         </w:r>
         <w:r>
           <w:rPr>
@@ -1520,7 +1520,7 @@
           <w14:ligatures w14:val="standardContextual"/>
         </w:rPr>
       </w:pPr>
-      <w:hyperlink w:anchor="_Toc237697209" w:history="1">
+      <w:hyperlink w:anchor="_Toc237699674" w:history="1">
         <w:r>
           <w:rPr>
             <w:rStyle w:val="Hipervnculo"/>
@@ -1547,7 +1547,7 @@
             <w:noProof/>
             <w:webHidden/>
           </w:rPr>
-          <w:instrText xml:space="preserve"> PAGEREF _Toc237697209 \h </w:instrText>
+          <w:instrText xml:space="preserve"> PAGEREF _Toc237699674 \h </w:instrText>
         </w:r>
         <w:r>
           <w:rPr>
@@ -1594,7 +1594,7 @@
           <w14:ligatures w14:val="standardContextual"/>
         </w:rPr>
       </w:pPr>
-      <w:hyperlink w:anchor="_Toc237697210" w:history="1">
+      <w:hyperlink w:anchor="_Toc237699675" w:history="1">
         <w:r>
           <w:rPr>
             <w:rStyle w:val="Hipervnculo"/>
@@ -1621,7 +1621,7 @@
             <w:noProof/>
             <w:webHidden/>
           </w:rPr>
-          <w:instrText xml:space="preserve"> PAGEREF _Toc237697210 \h </w:instrText>
+          <w:instrText xml:space="preserve"> PAGEREF _Toc237699675 \h </w:instrText>
         </w:r>
         <w:r>
           <w:rPr>
@@ -1668,13 +1668,13 @@
           <w14:ligatures w14:val="standardContextual"/>
         </w:rPr>
       </w:pPr>
-      <w:hyperlink w:anchor="_Toc237697211" w:history="1">
+      <w:hyperlink w:anchor="_Toc237699676" w:history="1">
         <w:r>
           <w:rPr>
             <w:rStyle w:val="Hipervnculo"/>
             <w:noProof/>
           </w:rPr>
-          <w:t>Desempeño Financiero Reciente (FY2020–FY2025)</w:t>
+          <w:t>Desempeño Financiero Reciente (2020–2025)</w:t>
         </w:r>
         <w:r>
           <w:rPr>
@@ -1695,7 +1695,7 @@
             <w:noProof/>
             <w:webHidden/>
           </w:rPr>
-          <w:instrText xml:space="preserve"> PAGEREF _Toc237697211 \h </w:instrText>
+          <w:instrText xml:space="preserve"> PAGEREF _Toc237699676 \h </w:instrText>
         </w:r>
         <w:r>
           <w:rPr>
@@ -1742,7 +1742,7 @@
           <w14:ligatures w14:val="standardContextual"/>
         </w:rPr>
       </w:pPr>
-      <w:hyperlink w:anchor="_Toc237697212" w:history="1">
+      <w:hyperlink w:anchor="_Toc237699677" w:history="1">
         <w:r>
           <w:rPr>
             <w:rStyle w:val="Hipervnculo"/>
@@ -1769,7 +1769,7 @@
             <w:noProof/>
             <w:webHidden/>
           </w:rPr>
-          <w:instrText xml:space="preserve"> PAGEREF _Toc237697212 \h </w:instrText>
+          <w:instrText xml:space="preserve"> PAGEREF _Toc237699677 \h </w:instrText>
         </w:r>
         <w:r>
           <w:rPr>
@@ -1816,7 +1816,7 @@
           <w14:ligatures w14:val="standardContextual"/>
         </w:rPr>
       </w:pPr>
-      <w:hyperlink w:anchor="_Toc237697213" w:history="1">
+      <w:hyperlink w:anchor="_Toc237699678" w:history="1">
         <w:r>
           <w:rPr>
             <w:rStyle w:val="Hipervnculo"/>
@@ -1843,7 +1843,7 @@
             <w:noProof/>
             <w:webHidden/>
           </w:rPr>
-          <w:instrText xml:space="preserve"> PAGEREF _Toc237697213 \h </w:instrText>
+          <w:instrText xml:space="preserve"> PAGEREF _Toc237699678 \h </w:instrText>
         </w:r>
         <w:r>
           <w:rPr>
@@ -1890,7 +1890,7 @@
           <w14:ligatures w14:val="standardContextual"/>
         </w:rPr>
       </w:pPr>
-      <w:hyperlink w:anchor="_Toc237697214" w:history="1">
+      <w:hyperlink w:anchor="_Toc237699679" w:history="1">
         <w:r>
           <w:rPr>
             <w:rStyle w:val="Hipervnculo"/>
@@ -1917,7 +1917,7 @@
             <w:noProof/>
             <w:webHidden/>
           </w:rPr>
-          <w:instrText xml:space="preserve"> PAGEREF _Toc237697214 \h </w:instrText>
+          <w:instrText xml:space="preserve"> PAGEREF _Toc237699679 \h </w:instrText>
         </w:r>
         <w:r>
           <w:rPr>
@@ -1964,7 +1964,7 @@
           <w14:ligatures w14:val="standardContextual"/>
         </w:rPr>
       </w:pPr>
-      <w:hyperlink w:anchor="_Toc237697215" w:history="1">
+      <w:hyperlink w:anchor="_Toc237699680" w:history="1">
         <w:r>
           <w:rPr>
             <w:rStyle w:val="Hipervnculo"/>
@@ -1991,7 +1991,7 @@
             <w:noProof/>
             <w:webHidden/>
           </w:rPr>
-          <w:instrText xml:space="preserve"> PAGEREF _Toc237697215 \h </w:instrText>
+          <w:instrText xml:space="preserve"> PAGEREF _Toc237699680 \h </w:instrText>
         </w:r>
         <w:r>
           <w:rPr>
@@ -2038,7 +2038,7 @@
           <w14:ligatures w14:val="standardContextual"/>
         </w:rPr>
       </w:pPr>
-      <w:hyperlink w:anchor="_Toc237697216" w:history="1">
+      <w:hyperlink w:anchor="_Toc237699681" w:history="1">
         <w:r>
           <w:rPr>
             <w:rStyle w:val="Hipervnculo"/>
@@ -2065,7 +2065,7 @@
             <w:noProof/>
             <w:webHidden/>
           </w:rPr>
-          <w:instrText xml:space="preserve"> PAGEREF _Toc237697216 \h </w:instrText>
+          <w:instrText xml:space="preserve"> PAGEREF _Toc237699681 \h </w:instrText>
         </w:r>
         <w:r>
           <w:rPr>
@@ -2112,7 +2112,7 @@
           <w14:ligatures w14:val="standardContextual"/>
         </w:rPr>
       </w:pPr>
-      <w:hyperlink w:anchor="_Toc237697217" w:history="1">
+      <w:hyperlink w:anchor="_Toc237699682" w:history="1">
         <w:r>
           <w:rPr>
             <w:rStyle w:val="Hipervnculo"/>
@@ -2139,7 +2139,7 @@
             <w:noProof/>
             <w:webHidden/>
           </w:rPr>
-          <w:instrText xml:space="preserve"> PAGEREF _Toc237697217 \h </w:instrText>
+          <w:instrText xml:space="preserve"> PAGEREF _Toc237699682 \h </w:instrText>
         </w:r>
         <w:r>
           <w:rPr>
@@ -2186,7 +2186,7 @@
           <w14:ligatures w14:val="standardContextual"/>
         </w:rPr>
       </w:pPr>
-      <w:hyperlink w:anchor="_Toc237697218" w:history="1">
+      <w:hyperlink w:anchor="_Toc237699683" w:history="1">
         <w:r>
           <w:rPr>
             <w:rStyle w:val="Hipervnculo"/>
@@ -2213,7 +2213,7 @@
             <w:noProof/>
             <w:webHidden/>
           </w:rPr>
-          <w:instrText xml:space="preserve"> PAGEREF _Toc237697218 \h </w:instrText>
+          <w:instrText xml:space="preserve"> PAGEREF _Toc237699683 \h </w:instrText>
         </w:r>
         <w:r>
           <w:rPr>
@@ -2260,7 +2260,7 @@
           <w14:ligatures w14:val="standardContextual"/>
         </w:rPr>
       </w:pPr>
-      <w:hyperlink w:anchor="_Toc237697219" w:history="1">
+      <w:hyperlink w:anchor="_Toc237699684" w:history="1">
         <w:r>
           <w:rPr>
             <w:rStyle w:val="Hipervnculo"/>
@@ -2287,7 +2287,7 @@
             <w:noProof/>
             <w:webHidden/>
           </w:rPr>
-          <w:instrText xml:space="preserve"> PAGEREF _Toc237697219 \h </w:instrText>
+          <w:instrText xml:space="preserve"> PAGEREF _Toc237699684 \h </w:instrText>
         </w:r>
         <w:r>
           <w:rPr>
@@ -2334,7 +2334,7 @@
           <w14:ligatures w14:val="standardContextual"/>
         </w:rPr>
       </w:pPr>
-      <w:hyperlink w:anchor="_Toc237697220" w:history="1">
+      <w:hyperlink w:anchor="_Toc237699685" w:history="1">
         <w:r>
           <w:rPr>
             <w:rStyle w:val="Hipervnculo"/>
@@ -2361,7 +2361,7 @@
             <w:noProof/>
             <w:webHidden/>
           </w:rPr>
-          <w:instrText xml:space="preserve"> PAGEREF _Toc237697220 \h </w:instrText>
+          <w:instrText xml:space="preserve"> PAGEREF _Toc237699685 \h </w:instrText>
         </w:r>
         <w:r>
           <w:rPr>
@@ -2408,7 +2408,7 @@
           <w14:ligatures w14:val="standardContextual"/>
         </w:rPr>
       </w:pPr>
-      <w:hyperlink w:anchor="_Toc237697221" w:history="1">
+      <w:hyperlink w:anchor="_Toc237699686" w:history="1">
         <w:r>
           <w:rPr>
             <w:rStyle w:val="Hipervnculo"/>
@@ -2435,7 +2435,7 @@
             <w:noProof/>
             <w:webHidden/>
           </w:rPr>
-          <w:instrText xml:space="preserve"> PAGEREF _Toc237697221 \h </w:instrText>
+          <w:instrText xml:space="preserve"> PAGEREF _Toc237699686 \h </w:instrText>
         </w:r>
         <w:r>
           <w:rPr>
@@ -2482,7 +2482,7 @@
           <w14:ligatures w14:val="standardContextual"/>
         </w:rPr>
       </w:pPr>
-      <w:hyperlink w:anchor="_Toc237697222" w:history="1">
+      <w:hyperlink w:anchor="_Toc237699687" w:history="1">
         <w:r>
           <w:rPr>
             <w:rStyle w:val="Hipervnculo"/>
@@ -2509,7 +2509,7 @@
             <w:noProof/>
             <w:webHidden/>
           </w:rPr>
-          <w:instrText xml:space="preserve"> PAGEREF _Toc237697222 \h </w:instrText>
+          <w:instrText xml:space="preserve"> PAGEREF _Toc237699687 \h </w:instrText>
         </w:r>
         <w:r>
           <w:rPr>
@@ -2556,7 +2556,7 @@
           <w14:ligatures w14:val="standardContextual"/>
         </w:rPr>
       </w:pPr>
-      <w:hyperlink w:anchor="_Toc237697223" w:history="1">
+      <w:hyperlink w:anchor="_Toc237699688" w:history="1">
         <w:r>
           <w:rPr>
             <w:rStyle w:val="Hipervnculo"/>
@@ -2583,7 +2583,7 @@
             <w:noProof/>
             <w:webHidden/>
           </w:rPr>
-          <w:instrText xml:space="preserve"> PAGEREF _Toc237697223 \h </w:instrText>
+          <w:instrText xml:space="preserve"> PAGEREF _Toc237699688 \h </w:instrText>
         </w:r>
         <w:r>
           <w:rPr>
@@ -2630,7 +2630,7 @@
           <w14:ligatures w14:val="standardContextual"/>
         </w:rPr>
       </w:pPr>
-      <w:hyperlink w:anchor="_Toc237697224" w:history="1">
+      <w:hyperlink w:anchor="_Toc237699689" w:history="1">
         <w:r>
           <w:rPr>
             <w:rStyle w:val="Hipervnculo"/>
@@ -2657,7 +2657,7 @@
             <w:noProof/>
             <w:webHidden/>
           </w:rPr>
-          <w:instrText xml:space="preserve"> PAGEREF _Toc237697224 \h </w:instrText>
+          <w:instrText xml:space="preserve"> PAGEREF _Toc237699689 \h </w:instrText>
         </w:r>
         <w:r>
           <w:rPr>
@@ -2704,7 +2704,7 @@
           <w14:ligatures w14:val="standardContextual"/>
         </w:rPr>
       </w:pPr>
-      <w:hyperlink w:anchor="_Toc237697225" w:history="1">
+      <w:hyperlink w:anchor="_Toc237699690" w:history="1">
         <w:r>
           <w:rPr>
             <w:rStyle w:val="Hipervnculo"/>
@@ -2731,7 +2731,7 @@
             <w:noProof/>
             <w:webHidden/>
           </w:rPr>
-          <w:instrText xml:space="preserve"> PAGEREF _Toc237697225 \h </w:instrText>
+          <w:instrText xml:space="preserve"> PAGEREF _Toc237699690 \h </w:instrText>
         </w:r>
         <w:r>
           <w:rPr>
@@ -2778,7 +2778,7 @@
           <w14:ligatures w14:val="standardContextual"/>
         </w:rPr>
       </w:pPr>
-      <w:hyperlink w:anchor="_Toc237697226" w:history="1">
+      <w:hyperlink w:anchor="_Toc237699691" w:history="1">
         <w:r>
           <w:rPr>
             <w:rStyle w:val="Hipervnculo"/>
@@ -2805,7 +2805,7 @@
             <w:noProof/>
             <w:webHidden/>
           </w:rPr>
-          <w:instrText xml:space="preserve"> PAGEREF _Toc237697226 \h </w:instrText>
+          <w:instrText xml:space="preserve"> PAGEREF _Toc237699691 \h </w:instrText>
         </w:r>
         <w:r>
           <w:rPr>
@@ -2852,7 +2852,7 @@
           <w14:ligatures w14:val="standardContextual"/>
         </w:rPr>
       </w:pPr>
-      <w:hyperlink w:anchor="_Toc237697227" w:history="1">
+      <w:hyperlink w:anchor="_Toc237699692" w:history="1">
         <w:r>
           <w:rPr>
             <w:rStyle w:val="Hipervnculo"/>
@@ -2879,7 +2879,7 @@
             <w:noProof/>
             <w:webHidden/>
           </w:rPr>
-          <w:instrText xml:space="preserve"> PAGEREF _Toc237697227 \h </w:instrText>
+          <w:instrText xml:space="preserve"> PAGEREF _Toc237699692 \h </w:instrText>
         </w:r>
         <w:r>
           <w:rPr>
@@ -2926,7 +2926,7 @@
           <w14:ligatures w14:val="standardContextual"/>
         </w:rPr>
       </w:pPr>
-      <w:hyperlink w:anchor="_Toc237697228" w:history="1">
+      <w:hyperlink w:anchor="_Toc237699693" w:history="1">
         <w:r>
           <w:rPr>
             <w:rStyle w:val="Hipervnculo"/>
@@ -2983,7 +2983,7 @@
             <w:noProof/>
             <w:webHidden/>
           </w:rPr>
-          <w:instrText xml:space="preserve"> PAGEREF _Toc237697228 \h </w:instrText>
+          <w:instrText xml:space="preserve"> PAGEREF _Toc237699693 \h </w:instrText>
         </w:r>
         <w:r>
           <w:rPr>
@@ -3030,7 +3030,7 @@
           <w14:ligatures w14:val="standardContextual"/>
         </w:rPr>
       </w:pPr>
-      <w:hyperlink w:anchor="_Toc237697229" w:history="1">
+      <w:hyperlink w:anchor="_Toc237699694" w:history="1">
         <w:r>
           <w:rPr>
             <w:rStyle w:val="Hipervnculo"/>
@@ -3057,7 +3057,7 @@
             <w:noProof/>
             <w:webHidden/>
           </w:rPr>
-          <w:instrText xml:space="preserve"> PAGEREF _Toc237697229 \h </w:instrText>
+          <w:instrText xml:space="preserve"> PAGEREF _Toc237699694 \h </w:instrText>
         </w:r>
         <w:r>
           <w:rPr>
@@ -3104,7 +3104,7 @@
           <w14:ligatures w14:val="standardContextual"/>
         </w:rPr>
       </w:pPr>
-      <w:hyperlink w:anchor="_Toc237697230" w:history="1">
+      <w:hyperlink w:anchor="_Toc237699695" w:history="1">
         <w:r>
           <w:rPr>
             <w:rStyle w:val="Hipervnculo"/>
@@ -3131,7 +3131,7 @@
             <w:noProof/>
             <w:webHidden/>
           </w:rPr>
-          <w:instrText xml:space="preserve"> PAGEREF _Toc237697230 \h </w:instrText>
+          <w:instrText xml:space="preserve"> PAGEREF _Toc237699695 \h </w:instrText>
         </w:r>
         <w:r>
           <w:rPr>
@@ -3178,7 +3178,7 @@
           <w14:ligatures w14:val="standardContextual"/>
         </w:rPr>
       </w:pPr>
-      <w:hyperlink w:anchor="_Toc237697231" w:history="1">
+      <w:hyperlink w:anchor="_Toc237699696" w:history="1">
         <w:r>
           <w:rPr>
             <w:rStyle w:val="Hipervnculo"/>
@@ -3205,7 +3205,7 @@
             <w:noProof/>
             <w:webHidden/>
           </w:rPr>
-          <w:instrText xml:space="preserve"> PAGEREF _Toc237697231 \h </w:instrText>
+          <w:instrText xml:space="preserve"> PAGEREF _Toc237699696 \h </w:instrText>
         </w:r>
         <w:r>
           <w:rPr>
@@ -3252,7 +3252,7 @@
           <w14:ligatures w14:val="standardContextual"/>
         </w:rPr>
       </w:pPr>
-      <w:hyperlink w:anchor="_Toc237697232" w:history="1">
+      <w:hyperlink w:anchor="_Toc237699697" w:history="1">
         <w:r>
           <w:rPr>
             <w:rStyle w:val="Hipervnculo"/>
@@ -3279,7 +3279,7 @@
             <w:noProof/>
             <w:webHidden/>
           </w:rPr>
-          <w:instrText xml:space="preserve"> PAGEREF _Toc237697232 \h </w:instrText>
+          <w:instrText xml:space="preserve"> PAGEREF _Toc237699697 \h </w:instrText>
         </w:r>
         <w:r>
           <w:rPr>
@@ -3326,7 +3326,7 @@
           <w14:ligatures w14:val="standardContextual"/>
         </w:rPr>
       </w:pPr>
-      <w:hyperlink w:anchor="_Toc237697233" w:history="1">
+      <w:hyperlink w:anchor="_Toc237699698" w:history="1">
         <w:r>
           <w:rPr>
             <w:rStyle w:val="Hipervnculo"/>
@@ -3353,7 +3353,7 @@
             <w:noProof/>
             <w:webHidden/>
           </w:rPr>
-          <w:instrText xml:space="preserve"> PAGEREF _Toc237697233 \h </w:instrText>
+          <w:instrText xml:space="preserve"> PAGEREF _Toc237699698 \h </w:instrText>
         </w:r>
         <w:r>
           <w:rPr>
@@ -3400,7 +3400,7 @@
           <w14:ligatures w14:val="standardContextual"/>
         </w:rPr>
       </w:pPr>
-      <w:hyperlink w:anchor="_Toc237697234" w:history="1">
+      <w:hyperlink w:anchor="_Toc237699699" w:history="1">
         <w:r>
           <w:rPr>
             <w:rStyle w:val="Hipervnculo"/>
@@ -3427,7 +3427,7 @@
             <w:noProof/>
             <w:webHidden/>
           </w:rPr>
-          <w:instrText xml:space="preserve"> PAGEREF _Toc237697234 \h </w:instrText>
+          <w:instrText xml:space="preserve"> PAGEREF _Toc237699699 \h </w:instrText>
         </w:r>
         <w:r>
           <w:rPr>
@@ -3474,7 +3474,7 @@
           <w14:ligatures w14:val="standardContextual"/>
         </w:rPr>
       </w:pPr>
-      <w:hyperlink w:anchor="_Toc237697235" w:history="1">
+      <w:hyperlink w:anchor="_Toc237699700" w:history="1">
         <w:r>
           <w:rPr>
             <w:rStyle w:val="Hipervnculo"/>
@@ -3501,7 +3501,7 @@
             <w:noProof/>
             <w:webHidden/>
           </w:rPr>
-          <w:instrText xml:space="preserve"> PAGEREF _Toc237697235 \h </w:instrText>
+          <w:instrText xml:space="preserve"> PAGEREF _Toc237699700 \h </w:instrText>
         </w:r>
         <w:r>
           <w:rPr>
@@ -3548,7 +3548,7 @@
           <w14:ligatures w14:val="standardContextual"/>
         </w:rPr>
       </w:pPr>
-      <w:hyperlink w:anchor="_Toc237697236" w:history="1">
+      <w:hyperlink w:anchor="_Toc237699701" w:history="1">
         <w:r>
           <w:rPr>
             <w:rStyle w:val="Hipervnculo"/>
@@ -3575,7 +3575,7 @@
             <w:noProof/>
             <w:webHidden/>
           </w:rPr>
-          <w:instrText xml:space="preserve"> PAGEREF _Toc237697236 \h </w:instrText>
+          <w:instrText xml:space="preserve"> PAGEREF _Toc237699701 \h </w:instrText>
         </w:r>
         <w:r>
           <w:rPr>
@@ -3622,13 +3622,13 @@
           <w14:ligatures w14:val="standardContextual"/>
         </w:rPr>
       </w:pPr>
-      <w:hyperlink w:anchor="_Toc237697237" w:history="1">
+      <w:hyperlink w:anchor="_Toc237699702" w:history="1">
         <w:r>
           <w:rPr>
             <w:rStyle w:val="Hipervnculo"/>
             <w:noProof/>
           </w:rPr>
-          <w:t>Descomposición DuPont de Cinco Factores (FY2020–FY2025)</w:t>
+          <w:t>Descomposición DuPont de Cinco Factores (2020–2025)</w:t>
         </w:r>
         <w:r>
           <w:rPr>
@@ -3649,7 +3649,7 @@
             <w:noProof/>
             <w:webHidden/>
           </w:rPr>
-          <w:instrText xml:space="preserve"> PAGEREF _Toc237697237 \h </w:instrText>
+          <w:instrText xml:space="preserve"> PAGEREF _Toc237699702 \h </w:instrText>
         </w:r>
         <w:r>
           <w:rPr>
@@ -3696,7 +3696,7 @@
           <w14:ligatures w14:val="standardContextual"/>
         </w:rPr>
       </w:pPr>
-      <w:hyperlink w:anchor="_Toc237697238" w:history="1">
+      <w:hyperlink w:anchor="_Toc237699703" w:history="1">
         <w:r>
           <w:rPr>
             <w:rStyle w:val="Hipervnculo"/>
@@ -3723,7 +3723,7 @@
             <w:noProof/>
             <w:webHidden/>
           </w:rPr>
-          <w:instrText xml:space="preserve"> PAGEREF _Toc237697238 \h </w:instrText>
+          <w:instrText xml:space="preserve"> PAGEREF _Toc237699703 \h </w:instrText>
         </w:r>
         <w:r>
           <w:rPr>
@@ -3770,7 +3770,7 @@
           <w14:ligatures w14:val="standardContextual"/>
         </w:rPr>
       </w:pPr>
-      <w:hyperlink w:anchor="_Toc237697239" w:history="1">
+      <w:hyperlink w:anchor="_Toc237699704" w:history="1">
         <w:r>
           <w:rPr>
             <w:rStyle w:val="Hipervnculo"/>
@@ -3797,7 +3797,7 @@
             <w:noProof/>
             <w:webHidden/>
           </w:rPr>
-          <w:instrText xml:space="preserve"> PAGEREF _Toc237697239 \h </w:instrText>
+          <w:instrText xml:space="preserve"> PAGEREF _Toc237699704 \h </w:instrText>
         </w:r>
         <w:r>
           <w:rPr>
@@ -3844,7 +3844,7 @@
           <w14:ligatures w14:val="standardContextual"/>
         </w:rPr>
       </w:pPr>
-      <w:hyperlink w:anchor="_Toc237697240" w:history="1">
+      <w:hyperlink w:anchor="_Toc237699705" w:history="1">
         <w:r>
           <w:rPr>
             <w:rStyle w:val="Hipervnculo"/>
@@ -3871,7 +3871,7 @@
             <w:noProof/>
             <w:webHidden/>
           </w:rPr>
-          <w:instrText xml:space="preserve"> PAGEREF _Toc237697240 \h </w:instrText>
+          <w:instrText xml:space="preserve"> PAGEREF _Toc237699705 \h </w:instrText>
         </w:r>
         <w:r>
           <w:rPr>
@@ -3918,7 +3918,7 @@
           <w14:ligatures w14:val="standardContextual"/>
         </w:rPr>
       </w:pPr>
-      <w:hyperlink w:anchor="_Toc237697241" w:history="1">
+      <w:hyperlink w:anchor="_Toc237699706" w:history="1">
         <w:r>
           <w:rPr>
             <w:rStyle w:val="Hipervnculo"/>
@@ -3945,7 +3945,7 @@
             <w:noProof/>
             <w:webHidden/>
           </w:rPr>
-          <w:instrText xml:space="preserve"> PAGEREF _Toc237697241 \h </w:instrText>
+          <w:instrText xml:space="preserve"> PAGEREF _Toc237699706 \h </w:instrText>
         </w:r>
         <w:r>
           <w:rPr>
@@ -3992,7 +3992,7 @@
           <w14:ligatures w14:val="standardContextual"/>
         </w:rPr>
       </w:pPr>
-      <w:hyperlink w:anchor="_Toc237697242" w:history="1">
+      <w:hyperlink w:anchor="_Toc237699707" w:history="1">
         <w:r>
           <w:rPr>
             <w:rStyle w:val="Hipervnculo"/>
@@ -4019,7 +4019,7 @@
             <w:noProof/>
             <w:webHidden/>
           </w:rPr>
-          <w:instrText xml:space="preserve"> PAGEREF _Toc237697242 \h </w:instrText>
+          <w:instrText xml:space="preserve"> PAGEREF _Toc237699707 \h </w:instrText>
         </w:r>
         <w:r>
           <w:rPr>
@@ -4066,7 +4066,7 @@
           <w14:ligatures w14:val="standardContextual"/>
         </w:rPr>
       </w:pPr>
-      <w:hyperlink w:anchor="_Toc237697243" w:history="1">
+      <w:hyperlink w:anchor="_Toc237699708" w:history="1">
         <w:r>
           <w:rPr>
             <w:rStyle w:val="Hipervnculo"/>
@@ -4093,7 +4093,7 @@
             <w:noProof/>
             <w:webHidden/>
           </w:rPr>
-          <w:instrText xml:space="preserve"> PAGEREF _Toc237697243 \h </w:instrText>
+          <w:instrText xml:space="preserve"> PAGEREF _Toc237699708 \h </w:instrText>
         </w:r>
         <w:r>
           <w:rPr>
@@ -4140,7 +4140,7 @@
           <w14:ligatures w14:val="standardContextual"/>
         </w:rPr>
       </w:pPr>
-      <w:hyperlink w:anchor="_Toc237697244" w:history="1">
+      <w:hyperlink w:anchor="_Toc237699709" w:history="1">
         <w:r>
           <w:rPr>
             <w:rStyle w:val="Hipervnculo"/>
@@ -4167,7 +4167,7 @@
             <w:noProof/>
             <w:webHidden/>
           </w:rPr>
-          <w:instrText xml:space="preserve"> PAGEREF _Toc237697244 \h </w:instrText>
+          <w:instrText xml:space="preserve"> PAGEREF _Toc237699709 \h </w:instrText>
         </w:r>
         <w:r>
           <w:rPr>
@@ -4214,7 +4214,7 @@
           <w14:ligatures w14:val="standardContextual"/>
         </w:rPr>
       </w:pPr>
-      <w:hyperlink w:anchor="_Toc237697245" w:history="1">
+      <w:hyperlink w:anchor="_Toc237699710" w:history="1">
         <w:r>
           <w:rPr>
             <w:rStyle w:val="Hipervnculo"/>
@@ -4241,7 +4241,7 @@
             <w:noProof/>
             <w:webHidden/>
           </w:rPr>
-          <w:instrText xml:space="preserve"> PAGEREF _Toc237697245 \h </w:instrText>
+          <w:instrText xml:space="preserve"> PAGEREF _Toc237699710 \h </w:instrText>
         </w:r>
         <w:r>
           <w:rPr>
@@ -4288,7 +4288,7 @@
           <w14:ligatures w14:val="standardContextual"/>
         </w:rPr>
       </w:pPr>
-      <w:hyperlink w:anchor="_Toc237697246" w:history="1">
+      <w:hyperlink w:anchor="_Toc237699711" w:history="1">
         <w:r>
           <w:rPr>
             <w:rStyle w:val="Hipervnculo"/>
@@ -4315,7 +4315,7 @@
             <w:noProof/>
             <w:webHidden/>
           </w:rPr>
-          <w:instrText xml:space="preserve"> PAGEREF _Toc237697246 \h </w:instrText>
+          <w:instrText xml:space="preserve"> PAGEREF _Toc237699711 \h </w:instrText>
         </w:r>
         <w:r>
           <w:rPr>
@@ -4362,7 +4362,7 @@
           <w14:ligatures w14:val="standardContextual"/>
         </w:rPr>
       </w:pPr>
-      <w:hyperlink w:anchor="_Toc237697247" w:history="1">
+      <w:hyperlink w:anchor="_Toc237699712" w:history="1">
         <w:r>
           <w:rPr>
             <w:rStyle w:val="Hipervnculo"/>
@@ -4389,7 +4389,7 @@
             <w:noProof/>
             <w:webHidden/>
           </w:rPr>
-          <w:instrText xml:space="preserve"> PAGEREF _Toc237697247 \h </w:instrText>
+          <w:instrText xml:space="preserve"> PAGEREF _Toc237699712 \h </w:instrText>
         </w:r>
         <w:r>
           <w:rPr>
@@ -4436,7 +4436,7 @@
           <w14:ligatures w14:val="standardContextual"/>
         </w:rPr>
       </w:pPr>
-      <w:hyperlink w:anchor="_Toc237697248" w:history="1">
+      <w:hyperlink w:anchor="_Toc237699713" w:history="1">
         <w:r>
           <w:rPr>
             <w:rStyle w:val="Hipervnculo"/>
@@ -4463,7 +4463,7 @@
             <w:noProof/>
             <w:webHidden/>
           </w:rPr>
-          <w:instrText xml:space="preserve"> PAGEREF _Toc237697248 \h </w:instrText>
+          <w:instrText xml:space="preserve"> PAGEREF _Toc237699713 \h </w:instrText>
         </w:r>
         <w:r>
           <w:rPr>
@@ -4510,7 +4510,7 @@
           <w14:ligatures w14:val="standardContextual"/>
         </w:rPr>
       </w:pPr>
-      <w:hyperlink w:anchor="_Toc237697249" w:history="1">
+      <w:hyperlink w:anchor="_Toc237699714" w:history="1">
         <w:r>
           <w:rPr>
             <w:rStyle w:val="Hipervnculo"/>
@@ -4537,7 +4537,7 @@
             <w:noProof/>
             <w:webHidden/>
           </w:rPr>
-          <w:instrText xml:space="preserve"> PAGEREF _Toc237697249 \h </w:instrText>
+          <w:instrText xml:space="preserve"> PAGEREF _Toc237699714 \h </w:instrText>
         </w:r>
         <w:r>
           <w:rPr>
@@ -4584,7 +4584,7 @@
           <w14:ligatures w14:val="standardContextual"/>
         </w:rPr>
       </w:pPr>
-      <w:hyperlink w:anchor="_Toc237697250" w:history="1">
+      <w:hyperlink w:anchor="_Toc237699715" w:history="1">
         <w:r>
           <w:rPr>
             <w:rStyle w:val="Hipervnculo"/>
@@ -4611,7 +4611,7 @@
             <w:noProof/>
             <w:webHidden/>
           </w:rPr>
-          <w:instrText xml:space="preserve"> PAGEREF _Toc237697250 \h </w:instrText>
+          <w:instrText xml:space="preserve"> PAGEREF _Toc237699715 \h </w:instrText>
         </w:r>
         <w:r>
           <w:rPr>
@@ -4658,7 +4658,7 @@
           <w14:ligatures w14:val="standardContextual"/>
         </w:rPr>
       </w:pPr>
-      <w:hyperlink w:anchor="_Toc237697251" w:history="1">
+      <w:hyperlink w:anchor="_Toc237699716" w:history="1">
         <w:r>
           <w:rPr>
             <w:rStyle w:val="Hipervnculo"/>
@@ -4685,7 +4685,7 @@
             <w:noProof/>
             <w:webHidden/>
           </w:rPr>
-          <w:instrText xml:space="preserve"> PAGEREF _Toc237697251 \h </w:instrText>
+          <w:instrText xml:space="preserve"> PAGEREF _Toc237699716 \h </w:instrText>
         </w:r>
         <w:r>
           <w:rPr>
@@ -4732,7 +4732,7 @@
           <w14:ligatures w14:val="standardContextual"/>
         </w:rPr>
       </w:pPr>
-      <w:hyperlink w:anchor="_Toc237697252" w:history="1">
+      <w:hyperlink w:anchor="_Toc237699717" w:history="1">
         <w:r>
           <w:rPr>
             <w:rStyle w:val="Hipervnculo"/>
@@ -4759,7 +4759,7 @@
             <w:noProof/>
             <w:webHidden/>
           </w:rPr>
-          <w:instrText xml:space="preserve"> PAGEREF _Toc237697252 \h </w:instrText>
+          <w:instrText xml:space="preserve"> PAGEREF _Toc237699717 \h </w:instrText>
         </w:r>
         <w:r>
           <w:rPr>
@@ -4806,7 +4806,7 @@
           <w14:ligatures w14:val="standardContextual"/>
         </w:rPr>
       </w:pPr>
-      <w:hyperlink w:anchor="_Toc237697253" w:history="1">
+      <w:hyperlink w:anchor="_Toc237699718" w:history="1">
         <w:r>
           <w:rPr>
             <w:rStyle w:val="Hipervnculo"/>
@@ -4833,7 +4833,7 @@
             <w:noProof/>
             <w:webHidden/>
           </w:rPr>
-          <w:instrText xml:space="preserve"> PAGEREF _Toc237697253 \h </w:instrText>
+          <w:instrText xml:space="preserve"> PAGEREF _Toc237699718 \h </w:instrText>
         </w:r>
         <w:r>
           <w:rPr>
@@ -4880,7 +4880,7 @@
           <w14:ligatures w14:val="standardContextual"/>
         </w:rPr>
       </w:pPr>
-      <w:hyperlink w:anchor="_Toc237697254" w:history="1">
+      <w:hyperlink w:anchor="_Toc237699719" w:history="1">
         <w:r>
           <w:rPr>
             <w:rStyle w:val="Hipervnculo"/>
@@ -4907,7 +4907,7 @@
             <w:noProof/>
             <w:webHidden/>
           </w:rPr>
-          <w:instrText xml:space="preserve"> PAGEREF _Toc237697254 \h </w:instrText>
+          <w:instrText xml:space="preserve"> PAGEREF _Toc237699719 \h </w:instrText>
         </w:r>
         <w:r>
           <w:rPr>
@@ -4954,7 +4954,7 @@
           <w14:ligatures w14:val="standardContextual"/>
         </w:rPr>
       </w:pPr>
-      <w:hyperlink w:anchor="_Toc237697255" w:history="1">
+      <w:hyperlink w:anchor="_Toc237699720" w:history="1">
         <w:r>
           <w:rPr>
             <w:rStyle w:val="Hipervnculo"/>
@@ -4981,7 +4981,7 @@
             <w:noProof/>
             <w:webHidden/>
           </w:rPr>
-          <w:instrText xml:space="preserve"> PAGEREF _Toc237697255 \h </w:instrText>
+          <w:instrText xml:space="preserve"> PAGEREF _Toc237699720 \h </w:instrText>
         </w:r>
         <w:r>
           <w:rPr>
@@ -5028,7 +5028,7 @@
           <w14:ligatures w14:val="standardContextual"/>
         </w:rPr>
       </w:pPr>
-      <w:hyperlink w:anchor="_Toc237697256" w:history="1">
+      <w:hyperlink w:anchor="_Toc237699721" w:history="1">
         <w:r>
           <w:rPr>
             <w:rStyle w:val="Hipervnculo"/>
@@ -5055,7 +5055,7 @@
             <w:noProof/>
             <w:webHidden/>
           </w:rPr>
-          <w:instrText xml:space="preserve"> PAGEREF _Toc237697256 \h </w:instrText>
+          <w:instrText xml:space="preserve"> PAGEREF _Toc237699721 \h </w:instrText>
         </w:r>
         <w:r>
           <w:rPr>
@@ -5102,7 +5102,7 @@
           <w14:ligatures w14:val="standardContextual"/>
         </w:rPr>
       </w:pPr>
-      <w:hyperlink w:anchor="_Toc237697257" w:history="1">
+      <w:hyperlink w:anchor="_Toc237699722" w:history="1">
         <w:r>
           <w:rPr>
             <w:rStyle w:val="Hipervnculo"/>
@@ -5129,7 +5129,7 @@
             <w:noProof/>
             <w:webHidden/>
           </w:rPr>
-          <w:instrText xml:space="preserve"> PAGEREF _Toc237697257 \h </w:instrText>
+          <w:instrText xml:space="preserve"> PAGEREF _Toc237699722 \h </w:instrText>
         </w:r>
         <w:r>
           <w:rPr>
@@ -5176,7 +5176,7 @@
           <w14:ligatures w14:val="standardContextual"/>
         </w:rPr>
       </w:pPr>
-      <w:hyperlink w:anchor="_Toc237697258" w:history="1">
+      <w:hyperlink w:anchor="_Toc237699723" w:history="1">
         <w:r>
           <w:rPr>
             <w:rStyle w:val="Hipervnculo"/>
@@ -5203,7 +5203,7 @@
             <w:noProof/>
             <w:webHidden/>
           </w:rPr>
-          <w:instrText xml:space="preserve"> PAGEREF _Toc237697258 \h </w:instrText>
+          <w:instrText xml:space="preserve"> PAGEREF _Toc237699723 \h </w:instrText>
         </w:r>
         <w:r>
           <w:rPr>
@@ -5250,13 +5250,13 @@
           <w14:ligatures w14:val="standardContextual"/>
         </w:rPr>
       </w:pPr>
-      <w:hyperlink w:anchor="_Toc237697259" w:history="1">
+      <w:hyperlink w:anchor="_Toc237699724" w:history="1">
         <w:r>
           <w:rPr>
             <w:rStyle w:val="Hipervnculo"/>
             <w:noProof/>
           </w:rPr>
-          <w:t>Modelización Estocástica Avanzada y Validación Econométrica</w:t>
+          <w:t>Modelos Estocásticos y Validación Econométrica</w:t>
         </w:r>
         <w:r>
           <w:rPr>
@@ -5277,7 +5277,7 @@
             <w:noProof/>
             <w:webHidden/>
           </w:rPr>
-          <w:instrText xml:space="preserve"> PAGEREF _Toc237697259 \h </w:instrText>
+          <w:instrText xml:space="preserve"> PAGEREF _Toc237699724 \h </w:instrText>
         </w:r>
         <w:r>
           <w:rPr>
@@ -5297,7 +5297,7 @@
             <w:noProof/>
             <w:webHidden/>
           </w:rPr>
-          <w:t>13</w:t>
+          <w:t>12</w:t>
         </w:r>
         <w:r>
           <w:rPr>
@@ -5324,7 +5324,7 @@
           <w14:ligatures w14:val="standardContextual"/>
         </w:rPr>
       </w:pPr>
-      <w:hyperlink w:anchor="_Toc237697260" w:history="1">
+      <w:hyperlink w:anchor="_Toc237699725" w:history="1">
         <w:r>
           <w:rPr>
             <w:rStyle w:val="Hipervnculo"/>
@@ -5351,7 +5351,7 @@
             <w:noProof/>
             <w:webHidden/>
           </w:rPr>
-          <w:instrText xml:space="preserve"> PAGEREF _Toc237697260 \h </w:instrText>
+          <w:instrText xml:space="preserve"> PAGEREF _Toc237699725 \h </w:instrText>
         </w:r>
         <w:r>
           <w:rPr>
@@ -5371,7 +5371,7 @@
             <w:noProof/>
             <w:webHidden/>
           </w:rPr>
-          <w:t>13</w:t>
+          <w:t>12</w:t>
         </w:r>
         <w:r>
           <w:rPr>
@@ -5398,7 +5398,7 @@
           <w14:ligatures w14:val="standardContextual"/>
         </w:rPr>
       </w:pPr>
-      <w:hyperlink w:anchor="_Toc237697261" w:history="1">
+      <w:hyperlink w:anchor="_Toc237699726" w:history="1">
         <w:r>
           <w:rPr>
             <w:rStyle w:val="Hipervnculo"/>
@@ -5425,7 +5425,7 @@
             <w:noProof/>
             <w:webHidden/>
           </w:rPr>
-          <w:instrText xml:space="preserve"> PAGEREF _Toc237697261 \h </w:instrText>
+          <w:instrText xml:space="preserve"> PAGEREF _Toc237699726 \h </w:instrText>
         </w:r>
         <w:r>
           <w:rPr>
@@ -5472,7 +5472,7 @@
           <w14:ligatures w14:val="standardContextual"/>
         </w:rPr>
       </w:pPr>
-      <w:hyperlink w:anchor="_Toc237697262" w:history="1">
+      <w:hyperlink w:anchor="_Toc237699727" w:history="1">
         <w:r>
           <w:rPr>
             <w:rStyle w:val="Hipervnculo"/>
@@ -5499,7 +5499,7 @@
             <w:noProof/>
             <w:webHidden/>
           </w:rPr>
-          <w:instrText xml:space="preserve"> PAGEREF _Toc237697262 \h </w:instrText>
+          <w:instrText xml:space="preserve"> PAGEREF _Toc237699727 \h </w:instrText>
         </w:r>
         <w:r>
           <w:rPr>
@@ -5546,7 +5546,7 @@
           <w14:ligatures w14:val="standardContextual"/>
         </w:rPr>
       </w:pPr>
-      <w:hyperlink w:anchor="_Toc237697263" w:history="1">
+      <w:hyperlink w:anchor="_Toc237699728" w:history="1">
         <w:r>
           <w:rPr>
             <w:rStyle w:val="Hipervnculo"/>
@@ -5573,7 +5573,7 @@
             <w:noProof/>
             <w:webHidden/>
           </w:rPr>
-          <w:instrText xml:space="preserve"> PAGEREF _Toc237697263 \h </w:instrText>
+          <w:instrText xml:space="preserve"> PAGEREF _Toc237699728 \h </w:instrText>
         </w:r>
         <w:r>
           <w:rPr>
@@ -5620,7 +5620,7 @@
           <w14:ligatures w14:val="standardContextual"/>
         </w:rPr>
       </w:pPr>
-      <w:hyperlink w:anchor="_Toc237697264" w:history="1">
+      <w:hyperlink w:anchor="_Toc237699729" w:history="1">
         <w:r>
           <w:rPr>
             <w:rStyle w:val="Hipervnculo"/>
@@ -5647,7 +5647,7 @@
             <w:noProof/>
             <w:webHidden/>
           </w:rPr>
-          <w:instrText xml:space="preserve"> PAGEREF _Toc237697264 \h </w:instrText>
+          <w:instrText xml:space="preserve"> PAGEREF _Toc237699729 \h </w:instrText>
         </w:r>
         <w:r>
           <w:rPr>
@@ -5694,7 +5694,7 @@
           <w14:ligatures w14:val="standardContextual"/>
         </w:rPr>
       </w:pPr>
-      <w:hyperlink w:anchor="_Toc237697265" w:history="1">
+      <w:hyperlink w:anchor="_Toc237699730" w:history="1">
         <w:r>
           <w:rPr>
             <w:rStyle w:val="Hipervnculo"/>
@@ -5721,7 +5721,7 @@
             <w:noProof/>
             <w:webHidden/>
           </w:rPr>
-          <w:instrText xml:space="preserve"> PAGEREF _Toc237697265 \h </w:instrText>
+          <w:instrText xml:space="preserve"> PAGEREF _Toc237699730 \h </w:instrText>
         </w:r>
         <w:r>
           <w:rPr>
@@ -5768,7 +5768,7 @@
           <w14:ligatures w14:val="standardContextual"/>
         </w:rPr>
       </w:pPr>
-      <w:hyperlink w:anchor="_Toc237697266" w:history="1">
+      <w:hyperlink w:anchor="_Toc237699731" w:history="1">
         <w:r>
           <w:rPr>
             <w:rStyle w:val="Hipervnculo"/>
@@ -5795,7 +5795,7 @@
             <w:noProof/>
             <w:webHidden/>
           </w:rPr>
-          <w:instrText xml:space="preserve"> PAGEREF _Toc237697266 \h </w:instrText>
+          <w:instrText xml:space="preserve"> PAGEREF _Toc237699731 \h </w:instrText>
         </w:r>
         <w:r>
           <w:rPr>
@@ -5842,7 +5842,7 @@
           <w14:ligatures w14:val="standardContextual"/>
         </w:rPr>
       </w:pPr>
-      <w:hyperlink w:anchor="_Toc237697267" w:history="1">
+      <w:hyperlink w:anchor="_Toc237699732" w:history="1">
         <w:r>
           <w:rPr>
             <w:rStyle w:val="Hipervnculo"/>
@@ -5869,7 +5869,7 @@
             <w:noProof/>
             <w:webHidden/>
           </w:rPr>
-          <w:instrText xml:space="preserve"> PAGEREF _Toc237697267 \h </w:instrText>
+          <w:instrText xml:space="preserve"> PAGEREF _Toc237699732 \h </w:instrText>
         </w:r>
         <w:r>
           <w:rPr>
@@ -5956,7 +5956,7 @@
         <w:pStyle w:val="Ttulo1"/>
         <w:spacing w:before="100" w:after="30"/>
       </w:pPr>
-      <w:bookmarkStart w:id="0" w:name="_Toc237697205"/>
+      <w:bookmarkStart w:id="0" w:name="_Toc237699670"/>
       <w:r>
         <w:rPr>
           <w:rFonts w:ascii="Georgia" w:hAnsi="Georgia"/>
@@ -5973,7 +5973,7 @@
         <w:pStyle w:val="Ttulo2"/>
         <w:spacing w:before="70" w:after="20"/>
       </w:pPr>
-      <w:bookmarkStart w:id="1" w:name="_Toc237697206"/>
+      <w:bookmarkStart w:id="1" w:name="_Toc237699671"/>
       <w:r>
         <w:rPr>
           <w:rFonts w:ascii="Georgia" w:hAnsi="Georgia"/>
@@ -6023,7 +6023,7 @@
         <w:pStyle w:val="Ttulo2"/>
         <w:spacing w:before="70" w:after="20"/>
       </w:pPr>
-      <w:bookmarkStart w:id="2" w:name="_Toc237697207"/>
+      <w:bookmarkStart w:id="2" w:name="_Toc237699672"/>
       <w:r>
         <w:rPr>
           <w:rFonts w:ascii="Georgia" w:hAnsi="Georgia"/>
@@ -6111,7 +6111,7 @@
                 <w:noProof/>
               </w:rPr>
               <w:drawing>
-                <wp:inline distT="0" distB="0" distL="0" distR="0" wp14:anchorId="75B9A7B7" wp14:editId="6E641A7D">
+                <wp:inline distT="0" distB="0" distL="0" distR="0" wp14:anchorId="70399588" wp14:editId="6C2A8621">
                   <wp:extent cx="2926080" cy="1524412"/>
                   <wp:effectExtent l="0" t="0" r="0" b="0"/>
                   <wp:docPr id="1" name="Picture 1"/>
@@ -6167,7 +6167,7 @@
                 <w:noProof/>
               </w:rPr>
               <w:drawing>
-                <wp:inline distT="0" distB="0" distL="0" distR="0" wp14:anchorId="11593183" wp14:editId="25CD2B0F">
+                <wp:inline distT="0" distB="0" distL="0" distR="0" wp14:anchorId="3668866B" wp14:editId="62F97609">
                   <wp:extent cx="2926080" cy="1437831"/>
                   <wp:effectExtent l="0" t="0" r="0" b="0"/>
                   <wp:docPr id="2" name="Picture 2"/>
@@ -6266,7 +6266,7 @@
         <w:pStyle w:val="Ttulo2"/>
         <w:spacing w:before="70" w:after="20"/>
       </w:pPr>
-      <w:bookmarkStart w:id="3" w:name="_Toc237697208"/>
+      <w:bookmarkStart w:id="3" w:name="_Toc237699673"/>
       <w:r>
         <w:rPr>
           <w:rFonts w:ascii="Georgia" w:hAnsi="Georgia"/>
@@ -6381,7 +6381,7 @@
         <w:pStyle w:val="Ttulo2"/>
         <w:spacing w:before="70" w:after="20"/>
       </w:pPr>
-      <w:bookmarkStart w:id="4" w:name="_Toc237697209"/>
+      <w:bookmarkStart w:id="4" w:name="_Toc237699674"/>
       <w:r>
         <w:rPr>
           <w:rFonts w:ascii="Georgia" w:hAnsi="Georgia"/>
@@ -6406,7 +6406,7 @@
         <w:t>Aluminium Stewardship Initiative</w:t>
       </w:r>
       <w:r>
-        <w:t>) para capturar primas de precio por aluminio de bajas emisiones en Europa; y (3) defender la cuota en productos elaborados. La participación de elaborados en el volumen total se contrajo temporalmente debido a la recesión del mercado interno, pasando de 6,0% en FY2023 a 3,3% en FY2025:</w:t>
+        <w:t>) para capturar primas de precio por aluminio de bajas emisiones en Europa; y (3) defender la cuota en productos elaborados. La participación de elaborados en el volumen total se contrajo temporalmente debido a la recesión del mercado interno, pasando de 6,0% en 2023 a 3,3% en 2025:</w:t>
       </w:r>
     </w:p>
     <w:p>
@@ -6435,10 +6435,10 @@
         <w:tblLook w:val="04A0" w:firstRow="1" w:lastRow="0" w:firstColumn="1" w:lastColumn="0" w:noHBand="0" w:noVBand="1"/>
       </w:tblPr>
       <w:tblGrid>
-        <w:gridCol w:w="1418"/>
-        <w:gridCol w:w="1153"/>
+        <w:gridCol w:w="1441"/>
         <w:gridCol w:w="1155"/>
-        <w:gridCol w:w="1151"/>
+        <w:gridCol w:w="1136"/>
+        <w:gridCol w:w="1145"/>
       </w:tblGrid>
       <w:tr>
         <w:trPr>
@@ -6490,7 +6490,7 @@
                 <w:color w:val="FFFFFF"/>
                 <w:sz w:val="13"/>
               </w:rPr>
-              <w:t>FY2023</w:t>
+              <w:t>2023</w:t>
             </w:r>
           </w:p>
         </w:tc>
@@ -6515,7 +6515,7 @@
                 <w:color w:val="FFFFFF"/>
                 <w:sz w:val="13"/>
               </w:rPr>
-              <w:t>FY2024</w:t>
+              <w:t>2024</w:t>
             </w:r>
           </w:p>
         </w:tc>
@@ -6540,7 +6540,7 @@
                 <w:color w:val="FFFFFF"/>
                 <w:sz w:val="13"/>
               </w:rPr>
-              <w:t>FY2025</w:t>
+              <w:t>2025</w:t>
             </w:r>
           </w:p>
         </w:tc>
@@ -6850,7 +6850,7 @@
         <w:pStyle w:val="Ttulo2"/>
         <w:spacing w:before="70" w:after="20"/>
       </w:pPr>
-      <w:bookmarkStart w:id="5" w:name="_Toc237697210"/>
+      <w:bookmarkStart w:id="5" w:name="_Toc237699675"/>
       <w:r>
         <w:rPr>
           <w:rFonts w:ascii="Georgia" w:hAnsi="Georgia"/>
@@ -6971,14 +6971,14 @@
         <w:pStyle w:val="Ttulo2"/>
         <w:spacing w:before="70" w:after="20"/>
       </w:pPr>
-      <w:bookmarkStart w:id="6" w:name="_Toc237697211"/>
+      <w:bookmarkStart w:id="6" w:name="_Toc237699676"/>
       <w:r>
         <w:rPr>
           <w:rFonts w:ascii="Georgia" w:hAnsi="Georgia"/>
           <w:color w:val="1E3A8A"/>
           <w:sz w:val="18"/>
         </w:rPr>
-        <w:t>Desempeño Financiero Reciente (FY2020–FY2025)</w:t>
+        <w:t>Desempeño Financiero Reciente (2020–2025)</w:t>
       </w:r>
       <w:bookmarkEnd w:id="6"/>
     </w:p>
@@ -6993,7 +6993,7 @@
           <w:color w:val="0D233A"/>
           <w:sz w:val="15"/>
         </w:rPr>
-        <w:t>Tabla: Evolución de Indicadores Financieros Auditados FY2020–FY2025 (USD MM)</w:t>
+        <w:t>Tabla: Evolución de Indicadores Financieros Auditados 2020–2025 (USD MM)</w:t>
       </w:r>
     </w:p>
     <w:tbl>
@@ -7008,13 +7008,13 @@
         <w:tblLook w:val="04A0" w:firstRow="1" w:lastRow="0" w:firstColumn="1" w:lastColumn="0" w:noHBand="0" w:noVBand="1"/>
       </w:tblPr>
       <w:tblGrid>
-        <w:gridCol w:w="850"/>
-        <w:gridCol w:w="681"/>
-        <w:gridCol w:w="657"/>
-        <w:gridCol w:w="672"/>
-        <w:gridCol w:w="672"/>
-        <w:gridCol w:w="675"/>
-        <w:gridCol w:w="670"/>
+        <w:gridCol w:w="934"/>
+        <w:gridCol w:w="654"/>
+        <w:gridCol w:w="633"/>
+        <w:gridCol w:w="647"/>
+        <w:gridCol w:w="647"/>
+        <w:gridCol w:w="649"/>
+        <w:gridCol w:w="713"/>
       </w:tblGrid>
       <w:tr>
         <w:trPr>
@@ -7066,7 +7066,7 @@
                 <w:color w:val="FFFFFF"/>
                 <w:sz w:val="13"/>
               </w:rPr>
-              <w:t>FY2020</w:t>
+              <w:t>2020</w:t>
             </w:r>
           </w:p>
         </w:tc>
@@ -7091,7 +7091,7 @@
                 <w:color w:val="FFFFFF"/>
                 <w:sz w:val="13"/>
               </w:rPr>
-              <w:t>FY2021</w:t>
+              <w:t>2021</w:t>
             </w:r>
           </w:p>
         </w:tc>
@@ -7116,7 +7116,7 @@
                 <w:color w:val="FFFFFF"/>
                 <w:sz w:val="13"/>
               </w:rPr>
-              <w:t>FY2022</w:t>
+              <w:t>2022</w:t>
             </w:r>
           </w:p>
         </w:tc>
@@ -7141,7 +7141,7 @@
                 <w:color w:val="FFFFFF"/>
                 <w:sz w:val="13"/>
               </w:rPr>
-              <w:t>FY2023</w:t>
+              <w:t>2023</w:t>
             </w:r>
           </w:p>
         </w:tc>
@@ -7166,7 +7166,7 @@
                 <w:color w:val="FFFFFF"/>
                 <w:sz w:val="13"/>
               </w:rPr>
-              <w:t>FY2024</w:t>
+              <w:t>2024</w:t>
             </w:r>
           </w:p>
         </w:tc>
@@ -7191,7 +7191,7 @@
                 <w:color w:val="FFFFFF"/>
                 <w:sz w:val="13"/>
               </w:rPr>
-              <w:t>FY2025</w:t>
+              <w:t>2025</w:t>
             </w:r>
           </w:p>
         </w:tc>
@@ -8062,7 +8062,7 @@
         <w:pStyle w:val="Ttulo1"/>
         <w:spacing w:before="100" w:after="30"/>
       </w:pPr>
-      <w:bookmarkStart w:id="7" w:name="_Toc237697212"/>
+      <w:bookmarkStart w:id="7" w:name="_Toc237699677"/>
       <w:r>
         <w:rPr>
           <w:rFonts w:ascii="Georgia" w:hAnsi="Georgia"/>
@@ -8078,7 +8078,7 @@
         <w:pStyle w:val="Ttulo2"/>
         <w:spacing w:before="70" w:after="20"/>
       </w:pPr>
-      <w:bookmarkStart w:id="8" w:name="_Toc237697213"/>
+      <w:bookmarkStart w:id="8" w:name="_Toc237699678"/>
       <w:r>
         <w:rPr>
           <w:rFonts w:ascii="Georgia" w:hAnsi="Georgia"/>
@@ -8148,7 +8148,7 @@
                 <w:noProof/>
               </w:rPr>
               <w:drawing>
-                <wp:inline distT="0" distB="0" distL="0" distR="0" wp14:anchorId="4AF9A854" wp14:editId="66BB7C19">
+                <wp:inline distT="0" distB="0" distL="0" distR="0" wp14:anchorId="173215D5" wp14:editId="777C48B1">
                   <wp:extent cx="2926080" cy="1426594"/>
                   <wp:effectExtent l="0" t="0" r="0" b="0"/>
                   <wp:docPr id="3" name="Picture 3"/>
@@ -8204,7 +8204,7 @@
                 <w:noProof/>
               </w:rPr>
               <w:drawing>
-                <wp:inline distT="0" distB="0" distL="0" distR="0" wp14:anchorId="4194C644" wp14:editId="0386E9DC">
+                <wp:inline distT="0" distB="0" distL="0" distR="0" wp14:anchorId="75FDB6F8" wp14:editId="21612DEC">
                   <wp:extent cx="2926080" cy="1494260"/>
                   <wp:effectExtent l="0" t="0" r="0" b="0"/>
                   <wp:docPr id="4" name="Picture 4"/>
@@ -8308,7 +8308,7 @@
         <w:pStyle w:val="Ttulo2"/>
         <w:spacing w:before="70" w:after="20"/>
       </w:pPr>
-      <w:bookmarkStart w:id="9" w:name="_Toc237697214"/>
+      <w:bookmarkStart w:id="9" w:name="_Toc237699679"/>
       <w:r>
         <w:rPr>
           <w:rFonts w:ascii="Georgia" w:hAnsi="Georgia"/>
@@ -8391,7 +8391,7 @@
         <w:rPr>
           <w:sz w:val="16"/>
         </w:rPr>
-        <w:t xml:space="preserve"> En FY2026E los ingresos alcanzan USD 1.591,4 MM impulsados por el precio spot del LME en el 1T26 (USD 3.173,2/t). Para el período 2027E–2030E, el precio realizado converge linealmente a su nivel de equilibrio de largo plazo:</w:t>
+        <w:t xml:space="preserve"> En 2026e los ingresos alcanzan USD 1.591,4 MM impulsados por el precio spot del LME en el 1T26 (USD 3.173,2/t). Para el período 2027E–2030E, el precio realizado converge linealmente a su nivel de equilibrio de largo plazo:</w:t>
       </w:r>
     </w:p>
     <w:p>
@@ -8473,7 +8473,7 @@
           <w:b/>
           <w:sz w:val="16"/>
         </w:rPr>
-        <w:t>Variación de Capital de Trabajo (ΔNWC) en FY2026E:</w:t>
+        <w:t>Variación de Capital de Trabajo (ΔNWC) en 2026e:</w:t>
       </w:r>
       <w:r>
         <w:rPr>
@@ -8509,7 +8509,7 @@
         <w:pStyle w:val="Ttulo1"/>
         <w:spacing w:before="100" w:after="30"/>
       </w:pPr>
-      <w:bookmarkStart w:id="10" w:name="_Toc237697215"/>
+      <w:bookmarkStart w:id="10" w:name="_Toc237699680"/>
       <w:r>
         <w:rPr>
           <w:rFonts w:ascii="Georgia" w:hAnsi="Georgia"/>
@@ -8525,7 +8525,7 @@
         <w:pStyle w:val="Ttulo2"/>
         <w:spacing w:before="70" w:after="20"/>
       </w:pPr>
-      <w:bookmarkStart w:id="11" w:name="_Toc237697216"/>
+      <w:bookmarkStart w:id="11" w:name="_Toc237699681"/>
       <w:r>
         <w:rPr>
           <w:rFonts w:ascii="Georgia" w:hAnsi="Georgia"/>
@@ -8595,7 +8595,7 @@
                 <w:noProof/>
               </w:rPr>
               <w:drawing>
-                <wp:inline distT="0" distB="0" distL="0" distR="0" wp14:anchorId="69C65783" wp14:editId="79183E70">
+                <wp:inline distT="0" distB="0" distL="0" distR="0" wp14:anchorId="282B8AE1" wp14:editId="297BB2E8">
                   <wp:extent cx="2926080" cy="1636252"/>
                   <wp:effectExtent l="0" t="0" r="0" b="0"/>
                   <wp:docPr id="5" name="Picture 5"/>
@@ -8651,7 +8651,7 @@
                 <w:noProof/>
               </w:rPr>
               <w:drawing>
-                <wp:inline distT="0" distB="0" distL="0" distR="0" wp14:anchorId="32204693" wp14:editId="1B4040DC">
+                <wp:inline distT="0" distB="0" distL="0" distR="0" wp14:anchorId="098B279B" wp14:editId="3A7B1710">
                   <wp:extent cx="2926080" cy="1481181"/>
                   <wp:effectExtent l="0" t="0" r="0" b="0"/>
                   <wp:docPr id="6" name="Picture 6"/>
@@ -8755,7 +8755,7 @@
         <w:pStyle w:val="Ttulo2"/>
         <w:spacing w:before="70" w:after="20"/>
       </w:pPr>
-      <w:bookmarkStart w:id="12" w:name="_Toc237697217"/>
+      <w:bookmarkStart w:id="12" w:name="_Toc237699682"/>
       <w:r>
         <w:rPr>
           <w:rFonts w:ascii="Georgia" w:hAnsi="Georgia"/>
@@ -8780,7 +8780,7 @@
         <w:pStyle w:val="Ttulo2"/>
         <w:spacing w:before="70" w:after="20"/>
       </w:pPr>
-      <w:bookmarkStart w:id="13" w:name="_Toc237697218"/>
+      <w:bookmarkStart w:id="13" w:name="_Toc237699683"/>
       <w:r>
         <w:rPr>
           <w:rFonts w:ascii="Georgia" w:hAnsi="Georgia"/>
@@ -8850,7 +8850,7 @@
                 <w:noProof/>
               </w:rPr>
               <w:drawing>
-                <wp:inline distT="0" distB="0" distL="0" distR="0" wp14:anchorId="0B04E808" wp14:editId="56461F8C">
+                <wp:inline distT="0" distB="0" distL="0" distR="0" wp14:anchorId="1F308BAB" wp14:editId="246AE435">
                   <wp:extent cx="2926080" cy="1626307"/>
                   <wp:effectExtent l="0" t="0" r="0" b="0"/>
                   <wp:docPr id="7" name="Picture 7"/>
@@ -8906,7 +8906,7 @@
                 <w:noProof/>
               </w:rPr>
               <w:drawing>
-                <wp:inline distT="0" distB="0" distL="0" distR="0" wp14:anchorId="5B3510E1" wp14:editId="1DD56B78">
+                <wp:inline distT="0" distB="0" distL="0" distR="0" wp14:anchorId="33C18ADD" wp14:editId="22F91050">
                   <wp:extent cx="2926080" cy="1479479"/>
                   <wp:effectExtent l="0" t="0" r="0" b="0"/>
                   <wp:docPr id="8" name="Picture 8"/>
@@ -9005,7 +9005,7 @@
         <w:pStyle w:val="Ttulo2"/>
         <w:spacing w:before="70" w:after="20"/>
       </w:pPr>
-      <w:bookmarkStart w:id="14" w:name="_Toc237697219"/>
+      <w:bookmarkStart w:id="14" w:name="_Toc237699684"/>
       <w:r>
         <w:rPr>
           <w:rFonts w:ascii="Georgia" w:hAnsi="Georgia"/>
@@ -9093,7 +9093,7 @@
                 <w:noProof/>
               </w:rPr>
               <w:drawing>
-                <wp:inline distT="0" distB="0" distL="0" distR="0" wp14:anchorId="1F88AB5E" wp14:editId="592307A5">
+                <wp:inline distT="0" distB="0" distL="0" distR="0" wp14:anchorId="47F3803D" wp14:editId="638B8052">
                   <wp:extent cx="2926080" cy="1662311"/>
                   <wp:effectExtent l="0" t="0" r="0" b="0"/>
                   <wp:docPr id="9" name="Picture 9"/>
@@ -9149,8 +9149,8 @@
                 <w:noProof/>
               </w:rPr>
               <w:drawing>
-                <wp:inline distT="0" distB="0" distL="0" distR="0" wp14:anchorId="2FE91E42" wp14:editId="1D3A913C">
-                  <wp:extent cx="2926080" cy="1822403"/>
+                <wp:inline distT="0" distB="0" distL="0" distR="0" wp14:anchorId="79C6B3A9" wp14:editId="56E74D7C">
+                  <wp:extent cx="2926080" cy="1801004"/>
                   <wp:effectExtent l="0" t="0" r="0" b="0"/>
                   <wp:docPr id="10" name="Picture 10"/>
                   <wp:cNvGraphicFramePr>
@@ -9172,7 +9172,7 @@
                         <pic:spPr>
                           <a:xfrm>
                             <a:off x="0" y="0"/>
-                            <a:ext cx="2926080" cy="1822403"/>
+                            <a:ext cx="2926080" cy="1801004"/>
                           </a:xfrm>
                           <a:prstGeom prst="rect">
                             <a:avLst/>
@@ -9248,7 +9248,7 @@
         <w:pStyle w:val="Ttulo1"/>
         <w:spacing w:before="100" w:after="30"/>
       </w:pPr>
-      <w:bookmarkStart w:id="15" w:name="_Toc237697220"/>
+      <w:bookmarkStart w:id="15" w:name="_Toc237699685"/>
       <w:r>
         <w:rPr>
           <w:rFonts w:ascii="Georgia" w:hAnsi="Georgia"/>
@@ -9264,7 +9264,7 @@
         <w:pStyle w:val="Ttulo2"/>
         <w:spacing w:before="70" w:after="20"/>
       </w:pPr>
-      <w:bookmarkStart w:id="16" w:name="_Toc237697221"/>
+      <w:bookmarkStart w:id="16" w:name="_Toc237699686"/>
       <w:r>
         <w:rPr>
           <w:rFonts w:ascii="Georgia" w:hAnsi="Georgia"/>
@@ -9651,7 +9651,7 @@
         <w:pStyle w:val="Ttulo2"/>
         <w:spacing w:before="70" w:after="20"/>
       </w:pPr>
-      <w:bookmarkStart w:id="17" w:name="_Toc237697222"/>
+      <w:bookmarkStart w:id="17" w:name="_Toc237699687"/>
       <w:r>
         <w:rPr>
           <w:rFonts w:ascii="Georgia" w:hAnsi="Georgia"/>
@@ -9685,7 +9685,7 @@
         <w:pStyle w:val="Ttulo1"/>
         <w:spacing w:before="100" w:after="30"/>
       </w:pPr>
-      <w:bookmarkStart w:id="18" w:name="_Toc237697223"/>
+      <w:bookmarkStart w:id="18" w:name="_Toc237699688"/>
       <w:r>
         <w:rPr>
           <w:rFonts w:ascii="Georgia" w:hAnsi="Georgia"/>
@@ -9701,7 +9701,7 @@
         <w:pStyle w:val="Ttulo2"/>
         <w:spacing w:before="70" w:after="20"/>
       </w:pPr>
-      <w:bookmarkStart w:id="19" w:name="_Toc237697224"/>
+      <w:bookmarkStart w:id="19" w:name="_Toc237699689"/>
       <w:r>
         <w:rPr>
           <w:rFonts w:ascii="Georgia" w:hAnsi="Georgia"/>
@@ -9726,7 +9726,7 @@
         <w:t>13,4x</w:t>
       </w:r>
       <w:r>
-        <w:t xml:space="preserve"> sobre el resultado deprimido de FY2025 (USD 163,3 MM, </w:t>
+        <w:t xml:space="preserve"> sobre el resultado deprimido de 2025 (USD 163,3 MM, </w:t>
       </w:r>
       <w:r>
         <w:rPr>
@@ -9735,7 +9735,7 @@
         <w:t>Figura [fig:11]</w:t>
       </w:r>
       <w:r>
-        <w:t>). Al normalizar la proyección sobre el EBITDA estimado de FY2026E (</w:t>
+        <w:t>). Al normalizar la proyección sobre el EBITDA estimado de 2026e (</w:t>
       </w:r>
       <w:r>
         <w:rPr>
@@ -9761,7 +9761,7 @@
         <w:pStyle w:val="Ttulo2"/>
         <w:spacing w:before="70" w:after="20"/>
       </w:pPr>
-      <w:bookmarkStart w:id="20" w:name="_Toc237697225"/>
+      <w:bookmarkStart w:id="20" w:name="_Toc237699690"/>
       <w:r>
         <w:rPr>
           <w:rFonts w:ascii="Georgia" w:hAnsi="Georgia"/>
@@ -9777,13 +9777,13 @@
         <w:spacing w:after="20" w:line="247" w:lineRule="auto"/>
       </w:pPr>
       <w:r>
-        <w:t xml:space="preserve">El desembolso en bienes de uso durante FY2025 (USD 243,9 MM) elevó la Deuda Neta a USD 525,8 MM (3,22x EBITDA). Con la moderación de inversiones hacia niveles de mantenimiento (≈ USD 90–103 MM/año), el flujo libre de caja proyectado permite recomprimir la Deuda Neta / EBITDA a </w:t>
+        <w:t xml:space="preserve">El desembolso en bienes de uso durante 2025 (USD 243,9 MM) elevó la Deuda Neta a USD 525,8 MM (3,22x EBITDA). Con la moderación de inversiones hacia niveles de mantenimiento (≈ USD 90–103 MM/año), el flujo libre de caja proyectado permite recomprimir la Deuda Neta / EBITDA a </w:t>
       </w:r>
       <w:r>
         <w:rPr>
           <w:b/>
         </w:rPr>
-        <w:t>&lt;1,0x hacia FY2028E</w:t>
+        <w:t>&lt;1,0x hacia 2028e</w:t>
       </w:r>
       <w:r>
         <w:t xml:space="preserve"> (</w:t>
@@ -9831,7 +9831,7 @@
                 <w:noProof/>
               </w:rPr>
               <w:drawing>
-                <wp:inline distT="0" distB="0" distL="0" distR="0" wp14:anchorId="6AE27AAB" wp14:editId="0D88E417">
+                <wp:inline distT="0" distB="0" distL="0" distR="0" wp14:anchorId="029467E4" wp14:editId="12624124">
                   <wp:extent cx="2926080" cy="1714660"/>
                   <wp:effectExtent l="0" t="0" r="0" b="0"/>
                   <wp:docPr id="11" name="Picture 11"/>
@@ -9887,7 +9887,7 @@
                 <w:noProof/>
               </w:rPr>
               <w:drawing>
-                <wp:inline distT="0" distB="0" distL="0" distR="0" wp14:anchorId="57A30478" wp14:editId="23EF5FB0">
+                <wp:inline distT="0" distB="0" distL="0" distR="0" wp14:anchorId="5E69B51B" wp14:editId="1855B20A">
                   <wp:extent cx="2926080" cy="1558188"/>
                   <wp:effectExtent l="0" t="0" r="0" b="0"/>
                   <wp:docPr id="12" name="Picture 12"/>
@@ -10753,7 +10753,7 @@
         <w:pStyle w:val="Ttulo1"/>
         <w:spacing w:before="100" w:after="30"/>
       </w:pPr>
-      <w:bookmarkStart w:id="21" w:name="_Toc237697226"/>
+      <w:bookmarkStart w:id="21" w:name="_Toc237699691"/>
       <w:r>
         <w:rPr>
           <w:rFonts w:ascii="Georgia" w:hAnsi="Georgia"/>
@@ -10770,7 +10770,7 @@
         <w:pStyle w:val="Ttulo2"/>
         <w:spacing w:before="70" w:after="20"/>
       </w:pPr>
-      <w:bookmarkStart w:id="22" w:name="_Toc237697227"/>
+      <w:bookmarkStart w:id="22" w:name="_Toc237699692"/>
       <w:r>
         <w:rPr>
           <w:rFonts w:ascii="Georgia" w:hAnsi="Georgia"/>
@@ -10830,7 +10830,7 @@
         <w:pStyle w:val="Ttulo2"/>
         <w:spacing w:before="70" w:after="20"/>
       </w:pPr>
-      <w:bookmarkStart w:id="23" w:name="_Toc237697228"/>
+      <w:bookmarkStart w:id="23" w:name="_Toc237699693"/>
       <w:r>
         <w:rPr>
           <w:rFonts w:ascii="Georgia" w:hAnsi="Georgia"/>
@@ -11028,7 +11028,7 @@
                 <w:noProof/>
               </w:rPr>
               <w:drawing>
-                <wp:inline distT="0" distB="0" distL="0" distR="0" wp14:anchorId="3136B296" wp14:editId="1A6E018E">
+                <wp:inline distT="0" distB="0" distL="0" distR="0" wp14:anchorId="2A9BEC52" wp14:editId="3AC5D297">
                   <wp:extent cx="2926080" cy="1540391"/>
                   <wp:effectExtent l="0" t="0" r="0" b="0"/>
                   <wp:docPr id="13" name="Picture 13"/>
@@ -11084,7 +11084,7 @@
                 <w:noProof/>
               </w:rPr>
               <w:drawing>
-                <wp:inline distT="0" distB="0" distL="0" distR="0" wp14:anchorId="093E6EFE" wp14:editId="3B34C7E9">
+                <wp:inline distT="0" distB="0" distL="0" distR="0" wp14:anchorId="522CCBA9" wp14:editId="1B8E0650">
                   <wp:extent cx="2926080" cy="1658038"/>
                   <wp:effectExtent l="0" t="0" r="0" b="0"/>
                   <wp:docPr id="14" name="Picture 14"/>
@@ -11183,7 +11183,7 @@
         <w:pStyle w:val="Ttulo2"/>
         <w:spacing w:before="70" w:after="20"/>
       </w:pPr>
-      <w:bookmarkStart w:id="24" w:name="_Toc237697229"/>
+      <w:bookmarkStart w:id="24" w:name="_Toc237699694"/>
       <w:r>
         <w:rPr>
           <w:rFonts w:ascii="Georgia" w:hAnsi="Georgia"/>
@@ -11199,7 +11199,7 @@
         <w:spacing w:after="20" w:line="247" w:lineRule="auto"/>
       </w:pPr>
       <w:r>
-        <w:t>El costo del capital propio incorpora el ajuste por riesgo soberano (Damodaran; Dumrauf):</w:t>
+        <w:t>El costo del capital propio incorpora el ajuste por riesgo país bajo el modelo de Damodaran para economías emergentes, referenciado por Dumrauf (Cap. 14):</w:t>
       </w:r>
     </w:p>
     <w:p>
@@ -11221,7 +11221,7 @@
         <w:spacing w:after="20" w:line="247" w:lineRule="auto"/>
       </w:pPr>
       <w:r>
-        <w:t>El factor λ = 0,20 equivale a la porción de ventas colocadas en el mercado doméstico (20%). Puesto que el 80% restante se exporta a cotizaciones LME y los costos operativos fijos están denominados en pesos (salarios e insumos locales), los ajustes cambiarios licúan costos en dólares, actuando como cobertura natural frente al riesgo país.</w:t>
+        <w:t>En lugar de adicionar el 100% del spread soberano generalizado (EMBI+), se calibra un factor de exposición λ = 0,20. Esta ponderación responde a la cobertura natural de Aluar: el 80% de sus ventas son exportaciones liquidadas en dólares a precios LME y sus costos fijos operativos están fijados en pesos locales (salarios e insumos nacionales), por lo que las depreciaciones cambiarias licúan costos en moneda dura y amortiguan los shocks de riesgo país.</w:t>
       </w:r>
     </w:p>
     <w:p>
@@ -11653,7 +11653,14 @@
                 <w:b/>
                 <w:sz w:val="13"/>
               </w:rPr>
-              <w:t>WACC Resultante (USD)</w:t>
+              <w:t xml:space="preserve">WACC Resultante </w:t>
+            </w:r>
+            <w:r>
+              <w:rPr>
+                <w:b/>
+                <w:sz w:val="13"/>
+              </w:rPr>
+              <w:t>(USD)</w:t>
             </w:r>
           </w:p>
         </w:tc>
@@ -12000,7 +12007,7 @@
         <w:pStyle w:val="Ttulo1"/>
         <w:spacing w:before="100" w:after="30"/>
       </w:pPr>
-      <w:bookmarkStart w:id="25" w:name="_Toc237697230"/>
+      <w:bookmarkStart w:id="25" w:name="_Toc237699695"/>
       <w:r>
         <w:rPr>
           <w:rFonts w:ascii="Georgia" w:hAnsi="Georgia"/>
@@ -12016,7 +12023,7 @@
         <w:pStyle w:val="Ttulo2"/>
         <w:spacing w:before="70" w:after="20"/>
       </w:pPr>
-      <w:bookmarkStart w:id="26" w:name="_Toc237697231"/>
+      <w:bookmarkStart w:id="26" w:name="_Toc237699696"/>
       <w:r>
         <w:rPr>
           <w:rFonts w:ascii="Georgia" w:hAnsi="Georgia"/>
@@ -12032,7 +12039,7 @@
         <w:spacing w:after="20" w:line="247" w:lineRule="auto"/>
       </w:pPr>
       <w:r>
-        <w:t>El Valor Económico Agregado (EVA_t = (ROIC_t - WACC) × NOA_t-1) mide la generación de rentabilidad económica sobre los activos operativos netos. En FY2025 el EVA se situó en -USD 60,3 MM debido a la incorporación de USD 243,9 MM en activos eólicos al capital invertido (NOA = USD 1.704,3 MM) en forma previa a su plena entrada en régimen operativo.</w:t>
+        <w:t>El Valor Económico Agregado (EVA_t = (ROIC_t - WACC) × NOA_t-1) mide la generación de rentabilidad económica sobre los activos operativos netos. En 2025 el EVA se situó en -USD 60,3 MM debido a la incorporación de USD 243,9 MM en activos eólicos al capital invertido (NOA = USD 1.704,3 MM) en forma previa a su plena entrada en régimen operativo.</w:t>
       </w:r>
     </w:p>
     <w:p>
@@ -12046,7 +12053,7 @@
           <w:color w:val="0D233A"/>
           <w:sz w:val="15"/>
         </w:rPr>
-        <w:t>Tabla: Trayectoria Histórica y Proyectada de Creación de Valor (EVA, USD MM)</w:t>
+        <w:t>Tabla: Evolución Histórica del EVA (2020–2025) y Cierre de Régimen Terminal (USD MM)</w:t>
       </w:r>
     </w:p>
     <w:tbl>
@@ -12062,13 +12069,13 @@
       </w:tblPr>
       <w:tblGrid>
         <w:gridCol w:w="697"/>
-        <w:gridCol w:w="549"/>
-        <w:gridCol w:w="541"/>
-        <w:gridCol w:w="580"/>
-        <w:gridCol w:w="541"/>
-        <w:gridCol w:w="605"/>
-        <w:gridCol w:w="599"/>
-        <w:gridCol w:w="765"/>
+        <w:gridCol w:w="544"/>
+        <w:gridCol w:w="544"/>
+        <w:gridCol w:w="582"/>
+        <w:gridCol w:w="535"/>
+        <w:gridCol w:w="607"/>
+        <w:gridCol w:w="601"/>
+        <w:gridCol w:w="767"/>
       </w:tblGrid>
       <w:tr>
         <w:trPr>
@@ -12120,7 +12127,7 @@
                 <w:color w:val="FFFFFF"/>
                 <w:sz w:val="13"/>
               </w:rPr>
-              <w:t>FY20</w:t>
+              <w:t>2020</w:t>
             </w:r>
           </w:p>
         </w:tc>
@@ -12145,7 +12152,7 @@
                 <w:color w:val="FFFFFF"/>
                 <w:sz w:val="13"/>
               </w:rPr>
-              <w:t>FY21</w:t>
+              <w:t>2021</w:t>
             </w:r>
           </w:p>
         </w:tc>
@@ -12170,7 +12177,7 @@
                 <w:color w:val="FFFFFF"/>
                 <w:sz w:val="13"/>
               </w:rPr>
-              <w:t>FY22</w:t>
+              <w:t>2022</w:t>
             </w:r>
           </w:p>
         </w:tc>
@@ -12195,7 +12202,7 @@
                 <w:color w:val="FFFFFF"/>
                 <w:sz w:val="13"/>
               </w:rPr>
-              <w:t>FY23</w:t>
+              <w:t>2023</w:t>
             </w:r>
           </w:p>
         </w:tc>
@@ -12220,7 +12227,7 @@
                 <w:color w:val="FFFFFF"/>
                 <w:sz w:val="13"/>
               </w:rPr>
-              <w:t>FY24</w:t>
+              <w:t>2024</w:t>
             </w:r>
           </w:p>
         </w:tc>
@@ -12245,7 +12252,7 @@
                 <w:color w:val="FFFFFF"/>
                 <w:sz w:val="13"/>
               </w:rPr>
-              <w:t>FY25</w:t>
+              <w:t>2025</w:t>
             </w:r>
           </w:p>
         </w:tc>
@@ -13431,7 +13438,7 @@
         <w:pStyle w:val="Ttulo2"/>
         <w:spacing w:before="70" w:after="20"/>
       </w:pPr>
-      <w:bookmarkStart w:id="27" w:name="_Toc237697232"/>
+      <w:bookmarkStart w:id="27" w:name="_Toc237699697"/>
       <w:r>
         <w:rPr>
           <w:rFonts w:ascii="Georgia" w:hAnsi="Georgia"/>
@@ -13543,7 +13550,7 @@
         <w:pStyle w:val="Ttulo1"/>
         <w:spacing w:before="100" w:after="30"/>
       </w:pPr>
-      <w:bookmarkStart w:id="28" w:name="_Toc237697233"/>
+      <w:bookmarkStart w:id="28" w:name="_Toc237699698"/>
       <w:r>
         <w:rPr>
           <w:rFonts w:ascii="Georgia" w:hAnsi="Georgia"/>
@@ -13560,7 +13567,7 @@
         <w:pStyle w:val="Ttulo2"/>
         <w:spacing w:before="70" w:after="20"/>
       </w:pPr>
-      <w:bookmarkStart w:id="29" w:name="_Toc237697234"/>
+      <w:bookmarkStart w:id="29" w:name="_Toc237699699"/>
       <w:r>
         <w:rPr>
           <w:rFonts w:ascii="Georgia" w:hAnsi="Georgia"/>
@@ -13594,7 +13601,7 @@
         <w:t>Figura [fig:15]</w:t>
       </w:r>
       <w:r>
-        <w:t xml:space="preserve">). Los flujos de fondos explícitos (2026E–2030E) aportan USD 680 MM (17,2% del EV), mientras que el Valor Terminal representa USD 2.902 MM (73,4% del EV), reflejando la vida útil indefinida de los activos de fundición. Deduciendo la Deuda Neta auditada de USD 525,8 MM y sumando activos no operativos, se obtiene un </w:t>
+        <w:t xml:space="preserve">). Los flujos de fondos explícitos (2026e–2030e) aportan USD 680 MM (17,2% del EV), mientras que el Valor Terminal representa USD 2.902 MM (73,4% del EV), reflejando la vida útil indefinida de los activos de fundición. Deduciendo la Deuda Neta auditada de USD 525,8 MM y sumando activos no operativos, se obtiene un </w:t>
       </w:r>
       <w:r>
         <w:rPr>
@@ -13620,7 +13627,7 @@
         <w:pStyle w:val="Ttulo2"/>
         <w:spacing w:before="70" w:after="20"/>
       </w:pPr>
-      <w:bookmarkStart w:id="30" w:name="_Toc237697235"/>
+      <w:bookmarkStart w:id="30" w:name="_Toc237699700"/>
       <w:r>
         <w:rPr>
           <w:rFonts w:ascii="Georgia" w:hAnsi="Georgia"/>
@@ -13645,7 +13652,7 @@
         <w:t>Figura [fig:16]</w:t>
       </w:r>
       <w:r>
-        <w:t xml:space="preserve">) se comprime desde 79 días en FY2023 a </w:t>
+        <w:t xml:space="preserve">) se comprime desde 79 días en 2023 a </w:t>
       </w:r>
       <w:r>
         <w:rPr>
@@ -13690,7 +13697,7 @@
                 <w:noProof/>
               </w:rPr>
               <w:drawing>
-                <wp:inline distT="0" distB="0" distL="0" distR="0" wp14:anchorId="72E613FA" wp14:editId="7F9951F5">
+                <wp:inline distT="0" distB="0" distL="0" distR="0" wp14:anchorId="3294DE77" wp14:editId="142745F0">
                   <wp:extent cx="2926080" cy="1534596"/>
                   <wp:effectExtent l="0" t="0" r="0" b="0"/>
                   <wp:docPr id="15" name="Picture 15"/>
@@ -13746,7 +13753,7 @@
                 <w:noProof/>
               </w:rPr>
               <w:drawing>
-                <wp:inline distT="0" distB="0" distL="0" distR="0" wp14:anchorId="37EA12D3" wp14:editId="29E0F502">
+                <wp:inline distT="0" distB="0" distL="0" distR="0" wp14:anchorId="41B2BF56" wp14:editId="01631419">
                   <wp:extent cx="2926080" cy="1680519"/>
                   <wp:effectExtent l="0" t="0" r="0" b="0"/>
                   <wp:docPr id="16" name="Picture 16"/>
@@ -13809,7 +13816,7 @@
                 <w:color w:val="4A4A4A"/>
                 <w:sz w:val="13"/>
               </w:rPr>
-              <w:t>Puente de Valuación (Waterfall)</w:t>
+              <w:t>Puente de Valuación</w:t>
             </w:r>
           </w:p>
         </w:tc>
@@ -13845,7 +13852,7 @@
         <w:pStyle w:val="Ttulo1"/>
         <w:spacing w:before="100" w:after="30"/>
       </w:pPr>
-      <w:bookmarkStart w:id="31" w:name="_Toc237697236"/>
+      <w:bookmarkStart w:id="31" w:name="_Toc237699701"/>
       <w:r>
         <w:rPr>
           <w:rFonts w:ascii="Georgia" w:hAnsi="Georgia"/>
@@ -13861,14 +13868,14 @@
         <w:pStyle w:val="Ttulo2"/>
         <w:spacing w:before="70" w:after="20"/>
       </w:pPr>
-      <w:bookmarkStart w:id="32" w:name="_Toc237697237"/>
+      <w:bookmarkStart w:id="32" w:name="_Toc237699702"/>
       <w:r>
         <w:rPr>
           <w:rFonts w:ascii="Georgia" w:hAnsi="Georgia"/>
           <w:color w:val="1E3A8A"/>
           <w:sz w:val="18"/>
         </w:rPr>
-        <w:t>Descomposición DuPont de Cinco Factores (FY2020–FY2025)</w:t>
+        <w:t>Descomposición DuPont de Cinco Factores (2020–2025)</w:t>
       </w:r>
       <w:bookmarkEnd w:id="32"/>
     </w:p>
@@ -13899,7 +13906,7 @@
         <w:spacing w:after="20" w:line="247" w:lineRule="auto"/>
       </w:pPr>
       <w:r>
-        <w:t>En FY2025, el factor impositivo se redujo a 15,67% (alícuota efectiva del 84,3% por el impacto del ajuste por inflación impositivo NIC 29), situando el ROE en 0,83% aun cuando el margen operativo EBIT se ubicó en 8,44%.</w:t>
+        <w:t>En 2025, el factor impositivo se redujo a 15,67% (alícuota efectiva del 84,3% por el impacto del ajuste por inflación impositivo NIC 29), situando el ROE en 0,83% aun cuando el margen operativo EBIT se ubicó en 8,44%.</w:t>
       </w:r>
     </w:p>
     <w:p>
@@ -13913,7 +13920,7 @@
           <w:color w:val="0D233A"/>
           <w:sz w:val="15"/>
         </w:rPr>
-        <w:t>Tabla: Descomposición DuPont de 3 Factores (FY2020–FY2025)</w:t>
+        <w:t>Tabla: Descomposición DuPont de 3 Factores (2020–2025)</w:t>
       </w:r>
     </w:p>
     <w:tbl>
@@ -13928,13 +13935,13 @@
         <w:tblLook w:val="04A0" w:firstRow="1" w:lastRow="0" w:firstColumn="1" w:lastColumn="0" w:noHBand="0" w:noVBand="1"/>
       </w:tblPr>
       <w:tblGrid>
-        <w:gridCol w:w="1019"/>
-        <w:gridCol w:w="653"/>
-        <w:gridCol w:w="629"/>
-        <w:gridCol w:w="644"/>
-        <w:gridCol w:w="644"/>
-        <w:gridCol w:w="647"/>
-        <w:gridCol w:w="641"/>
+        <w:gridCol w:w="1061"/>
+        <w:gridCol w:w="584"/>
+        <w:gridCol w:w="619"/>
+        <w:gridCol w:w="669"/>
+        <w:gridCol w:w="663"/>
+        <w:gridCol w:w="664"/>
+        <w:gridCol w:w="617"/>
       </w:tblGrid>
       <w:tr>
         <w:trPr>
@@ -13986,7 +13993,7 @@
                 <w:color w:val="FFFFFF"/>
                 <w:sz w:val="13"/>
               </w:rPr>
-              <w:t>FY2020</w:t>
+              <w:t>2020</w:t>
             </w:r>
           </w:p>
         </w:tc>
@@ -14011,7 +14018,7 @@
                 <w:color w:val="FFFFFF"/>
                 <w:sz w:val="13"/>
               </w:rPr>
-              <w:t>FY2021</w:t>
+              <w:t>2021</w:t>
             </w:r>
           </w:p>
         </w:tc>
@@ -14036,7 +14043,7 @@
                 <w:color w:val="FFFFFF"/>
                 <w:sz w:val="13"/>
               </w:rPr>
-              <w:t>FY2022</w:t>
+              <w:t>2022</w:t>
             </w:r>
           </w:p>
         </w:tc>
@@ -14061,7 +14068,7 @@
                 <w:color w:val="FFFFFF"/>
                 <w:sz w:val="13"/>
               </w:rPr>
-              <w:t>FY2023</w:t>
+              <w:t>2023</w:t>
             </w:r>
           </w:p>
         </w:tc>
@@ -14086,7 +14093,7 @@
                 <w:color w:val="FFFFFF"/>
                 <w:sz w:val="13"/>
               </w:rPr>
-              <w:t>FY2024</w:t>
+              <w:t>2024</w:t>
             </w:r>
           </w:p>
         </w:tc>
@@ -14111,7 +14118,7 @@
                 <w:color w:val="FFFFFF"/>
                 <w:sz w:val="13"/>
               </w:rPr>
-              <w:t>FY2025</w:t>
+              <w:t>2025</w:t>
             </w:r>
           </w:p>
         </w:tc>
@@ -14791,7 +14798,7 @@
         <w:pStyle w:val="Ttulo2"/>
         <w:spacing w:before="70" w:after="20"/>
       </w:pPr>
-      <w:bookmarkStart w:id="33" w:name="_Toc237697238"/>
+      <w:bookmarkStart w:id="33" w:name="_Toc237699703"/>
       <w:r>
         <w:rPr>
           <w:rFonts w:ascii="Georgia" w:hAnsi="Georgia"/>
@@ -14937,7 +14944,7 @@
         <w:pStyle w:val="Ttulo2"/>
         <w:spacing w:before="70" w:after="20"/>
       </w:pPr>
-      <w:bookmarkStart w:id="34" w:name="_Toc237697239"/>
+      <w:bookmarkStart w:id="34" w:name="_Toc237699704"/>
       <w:r>
         <w:rPr>
           <w:rFonts w:ascii="Georgia" w:hAnsi="Georgia"/>
@@ -14961,7 +14968,7 @@
         <w:pStyle w:val="Ttulo1"/>
         <w:spacing w:before="100" w:after="30"/>
       </w:pPr>
-      <w:bookmarkStart w:id="35" w:name="_Toc237697240"/>
+      <w:bookmarkStart w:id="35" w:name="_Toc237699705"/>
       <w:r>
         <w:rPr>
           <w:rFonts w:ascii="Georgia" w:hAnsi="Georgia"/>
@@ -14977,7 +14984,7 @@
         <w:pStyle w:val="Ttulo2"/>
         <w:spacing w:before="70" w:after="20"/>
       </w:pPr>
-      <w:bookmarkStart w:id="36" w:name="_Toc237697241"/>
+      <w:bookmarkStart w:id="36" w:name="_Toc237699706"/>
       <w:r>
         <w:rPr>
           <w:rFonts w:ascii="Georgia" w:hAnsi="Georgia"/>
@@ -14999,7 +15006,7 @@
         <w:rPr>
           <w:b/>
         </w:rPr>
-        <w:t>3,53x en FY2025</w:t>
+        <w:t>3,53x en 2025</w:t>
       </w:r>
       <w:r>
         <w:t xml:space="preserve"> tras el pico de endeudamiento financiero, con ratios de liquidez corriente por encima de 1,40x:</w:t>
@@ -15031,13 +15038,13 @@
         <w:tblLook w:val="04A0" w:firstRow="1" w:lastRow="0" w:firstColumn="1" w:lastColumn="0" w:noHBand="0" w:noVBand="1"/>
       </w:tblPr>
       <w:tblGrid>
-        <w:gridCol w:w="807"/>
-        <w:gridCol w:w="688"/>
-        <w:gridCol w:w="665"/>
-        <w:gridCol w:w="679"/>
-        <w:gridCol w:w="679"/>
-        <w:gridCol w:w="682"/>
-        <w:gridCol w:w="677"/>
+        <w:gridCol w:w="859"/>
+        <w:gridCol w:w="654"/>
+        <w:gridCol w:w="636"/>
+        <w:gridCol w:w="696"/>
+        <w:gridCol w:w="645"/>
+        <w:gridCol w:w="654"/>
+        <w:gridCol w:w="733"/>
       </w:tblGrid>
       <w:tr>
         <w:trPr>
@@ -15089,7 +15096,7 @@
                 <w:color w:val="FFFFFF"/>
                 <w:sz w:val="13"/>
               </w:rPr>
-              <w:t>FY2020</w:t>
+              <w:t>2020</w:t>
             </w:r>
           </w:p>
         </w:tc>
@@ -15114,7 +15121,7 @@
                 <w:color w:val="FFFFFF"/>
                 <w:sz w:val="13"/>
               </w:rPr>
-              <w:t>FY2021</w:t>
+              <w:t>2021</w:t>
             </w:r>
           </w:p>
         </w:tc>
@@ -15139,7 +15146,7 @@
                 <w:color w:val="FFFFFF"/>
                 <w:sz w:val="13"/>
               </w:rPr>
-              <w:t>FY2022</w:t>
+              <w:t>2022</w:t>
             </w:r>
           </w:p>
         </w:tc>
@@ -15164,7 +15171,7 @@
                 <w:color w:val="FFFFFF"/>
                 <w:sz w:val="13"/>
               </w:rPr>
-              <w:t>FY2023</w:t>
+              <w:t>2023</w:t>
             </w:r>
           </w:p>
         </w:tc>
@@ -15189,7 +15196,7 @@
                 <w:color w:val="FFFFFF"/>
                 <w:sz w:val="13"/>
               </w:rPr>
-              <w:t>FY2024</w:t>
+              <w:t>2024</w:t>
             </w:r>
           </w:p>
         </w:tc>
@@ -15214,7 +15221,7 @@
                 <w:color w:val="FFFFFF"/>
                 <w:sz w:val="13"/>
               </w:rPr>
-              <w:t>FY2025</w:t>
+              <w:t>2025</w:t>
             </w:r>
           </w:p>
         </w:tc>
@@ -17584,7 +17591,7 @@
         <w:pStyle w:val="Ttulo1"/>
         <w:spacing w:before="100" w:after="30"/>
       </w:pPr>
-      <w:bookmarkStart w:id="37" w:name="_Toc237697242"/>
+      <w:bookmarkStart w:id="37" w:name="_Toc237699707"/>
       <w:r>
         <w:rPr>
           <w:rFonts w:ascii="Georgia" w:hAnsi="Georgia"/>
@@ -17601,7 +17608,7 @@
         <w:pStyle w:val="Ttulo2"/>
         <w:spacing w:before="70" w:after="20"/>
       </w:pPr>
-      <w:bookmarkStart w:id="38" w:name="_Toc237697243"/>
+      <w:bookmarkStart w:id="38" w:name="_Toc237699708"/>
       <w:r>
         <w:rPr>
           <w:rFonts w:ascii="Georgia" w:hAnsi="Georgia"/>
@@ -17696,7 +17703,7 @@
         <w:rPr>
           <w:sz w:val="16"/>
         </w:rPr>
-        <w:t xml:space="preserve"> Valúa la flexibilidad gerencial de diferir o ejecutar 312 MW eólicos adicionales mediante simulación por mínimos cuadrados (LSMC) sobre polinomios de Laguerre:</w:t>
+        <w:t xml:space="preserve"> El DCF tradicional asume decisiones estáticas inflexibles. La opción real valúa la flexibilidad gerencial de postergar o ejecutar la ampliación de 312 MW eólicos ante variaciones en tarifas y precios del metal, calculada mediante mínimos cuadrados (LSMC) sobre polinomios de Laguerre:</w:t>
       </w:r>
     </w:p>
     <w:p>
@@ -17787,7 +17794,7 @@
         <w:pStyle w:val="Ttulo2"/>
         <w:spacing w:before="70" w:after="20"/>
       </w:pPr>
-      <w:bookmarkStart w:id="39" w:name="_Toc237697244"/>
+      <w:bookmarkStart w:id="39" w:name="_Toc237699709"/>
       <w:r>
         <w:rPr>
           <w:rFonts w:ascii="Georgia" w:hAnsi="Georgia"/>
@@ -17848,7 +17855,7 @@
                 <w:noProof/>
               </w:rPr>
               <w:drawing>
-                <wp:inline distT="0" distB="0" distL="0" distR="0" wp14:anchorId="362404BA" wp14:editId="1ED6137D">
+                <wp:inline distT="0" distB="0" distL="0" distR="0" wp14:anchorId="5106ABFE" wp14:editId="08010FDC">
                   <wp:extent cx="2926080" cy="1626569"/>
                   <wp:effectExtent l="0" t="0" r="0" b="0"/>
                   <wp:docPr id="17" name="Picture 17"/>
@@ -17904,7 +17911,7 @@
                 <w:noProof/>
               </w:rPr>
               <w:drawing>
-                <wp:inline distT="0" distB="0" distL="0" distR="0" wp14:anchorId="15B65391" wp14:editId="0EB09B26">
+                <wp:inline distT="0" distB="0" distL="0" distR="0" wp14:anchorId="2BCA2F09" wp14:editId="067B2405">
                   <wp:extent cx="2926080" cy="1691675"/>
                   <wp:effectExtent l="0" t="0" r="0" b="0"/>
                   <wp:docPr id="18" name="Picture 18"/>
@@ -18003,7 +18010,7 @@
         <w:pStyle w:val="Ttulo2"/>
         <w:spacing w:before="70" w:after="20"/>
       </w:pPr>
-      <w:bookmarkStart w:id="40" w:name="_Toc237697245"/>
+      <w:bookmarkStart w:id="40" w:name="_Toc237699710"/>
       <w:r>
         <w:rPr>
           <w:rFonts w:ascii="Georgia" w:hAnsi="Georgia"/>
@@ -18561,7 +18568,7 @@
         <w:pStyle w:val="Ttulo1"/>
         <w:spacing w:before="100" w:after="30"/>
       </w:pPr>
-      <w:bookmarkStart w:id="41" w:name="_Toc237697246"/>
+      <w:bookmarkStart w:id="41" w:name="_Toc237699711"/>
       <w:r>
         <w:rPr>
           <w:rFonts w:ascii="Georgia" w:hAnsi="Georgia"/>
@@ -18577,7 +18584,7 @@
         <w:pStyle w:val="Ttulo2"/>
         <w:spacing w:before="70" w:after="20"/>
       </w:pPr>
-      <w:bookmarkStart w:id="42" w:name="_Toc237697247"/>
+      <w:bookmarkStart w:id="42" w:name="_Toc237699712"/>
       <w:r>
         <w:rPr>
           <w:rFonts w:ascii="Georgia" w:hAnsi="Georgia"/>
@@ -18638,7 +18645,7 @@
                 <w:noProof/>
               </w:rPr>
               <w:drawing>
-                <wp:inline distT="0" distB="0" distL="0" distR="0" wp14:anchorId="283CC07F" wp14:editId="3DB18AC0">
+                <wp:inline distT="0" distB="0" distL="0" distR="0" wp14:anchorId="3D218CB0" wp14:editId="4B1F109B">
                   <wp:extent cx="2926080" cy="1495195"/>
                   <wp:effectExtent l="0" t="0" r="0" b="0"/>
                   <wp:docPr id="19" name="Picture 19"/>
@@ -18694,7 +18701,7 @@
                 <w:noProof/>
               </w:rPr>
               <w:drawing>
-                <wp:inline distT="0" distB="0" distL="0" distR="0" wp14:anchorId="5F24AD95" wp14:editId="1D24120F">
+                <wp:inline distT="0" distB="0" distL="0" distR="0" wp14:anchorId="01CCEDE4" wp14:editId="2DCF06AA">
                   <wp:extent cx="2926080" cy="1682608"/>
                   <wp:effectExtent l="0" t="0" r="0" b="0"/>
                   <wp:docPr id="20" name="Picture 20"/>
@@ -19707,7 +19714,7 @@
         <w:pStyle w:val="Ttulo1"/>
         <w:spacing w:before="100" w:after="30"/>
       </w:pPr>
-      <w:bookmarkStart w:id="43" w:name="_Toc237697248"/>
+      <w:bookmarkStart w:id="43" w:name="_Toc237699713"/>
       <w:r>
         <w:rPr>
           <w:rFonts w:ascii="Georgia" w:hAnsi="Georgia"/>
@@ -19724,7 +19731,7 @@
         <w:pStyle w:val="Ttulo2"/>
         <w:spacing w:before="70" w:after="20"/>
       </w:pPr>
-      <w:bookmarkStart w:id="44" w:name="_Toc237697249"/>
+      <w:bookmarkStart w:id="44" w:name="_Toc237699714"/>
       <w:r>
         <w:rPr>
           <w:rFonts w:ascii="Georgia" w:hAnsi="Georgia"/>
@@ -19806,7 +19813,7 @@
         <w:pStyle w:val="Ttulo2"/>
         <w:spacing w:before="70" w:after="20"/>
       </w:pPr>
-      <w:bookmarkStart w:id="45" w:name="_Toc237697250"/>
+      <w:bookmarkStart w:id="45" w:name="_Toc237699715"/>
       <w:r>
         <w:rPr>
           <w:rFonts w:ascii="Georgia" w:hAnsi="Georgia"/>
@@ -19876,7 +19883,7 @@
                 <w:noProof/>
               </w:rPr>
               <w:drawing>
-                <wp:inline distT="0" distB="0" distL="0" distR="0" wp14:anchorId="0BD596A1" wp14:editId="1C00556A">
+                <wp:inline distT="0" distB="0" distL="0" distR="0" wp14:anchorId="7A3F827F" wp14:editId="717E31B4">
                   <wp:extent cx="2926080" cy="1682608"/>
                   <wp:effectExtent l="0" t="0" r="0" b="0"/>
                   <wp:docPr id="21" name="Picture 21"/>
@@ -19932,7 +19939,7 @@
                 <w:noProof/>
               </w:rPr>
               <w:drawing>
-                <wp:inline distT="0" distB="0" distL="0" distR="0" wp14:anchorId="53D97C74" wp14:editId="598849C7">
+                <wp:inline distT="0" distB="0" distL="0" distR="0" wp14:anchorId="1145B211" wp14:editId="39CCEA67">
                   <wp:extent cx="2926080" cy="1549755"/>
                   <wp:effectExtent l="0" t="0" r="0" b="0"/>
                   <wp:docPr id="22" name="Picture 22"/>
@@ -20031,7 +20038,7 @@
         <w:pStyle w:val="Ttulo1"/>
         <w:spacing w:before="100" w:after="30"/>
       </w:pPr>
-      <w:bookmarkStart w:id="46" w:name="_Toc237697251"/>
+      <w:bookmarkStart w:id="46" w:name="_Toc237699716"/>
       <w:r>
         <w:rPr>
           <w:rFonts w:ascii="Georgia" w:hAnsi="Georgia"/>
@@ -20047,7 +20054,7 @@
         <w:pStyle w:val="Ttulo2"/>
         <w:spacing w:before="70" w:after="20"/>
       </w:pPr>
-      <w:bookmarkStart w:id="47" w:name="_Toc237697252"/>
+      <w:bookmarkStart w:id="47" w:name="_Toc237699717"/>
       <w:r>
         <w:rPr>
           <w:rFonts w:ascii="Georgia" w:hAnsi="Georgia"/>
@@ -20063,7 +20070,7 @@
         <w:spacing w:after="20" w:line="247" w:lineRule="auto"/>
       </w:pPr>
       <w:r>
-        <w:t>El análisis comparativo sectorial confirma la divergencia entre la valuación basada en cifras históricas y la capacidad de generación normalizada. Mientras el múltiplo histórico de Aluar (13,3x) refleja la compresión de resultados de FY2025, el rendimiento proyectado del flujo libre de caja (&gt;10%) supera ampliamente la mediana de la industria internacional (3,8%):</w:t>
+        <w:t>El análisis comparativo sectorial confirma la divergencia entre la valuación basada en cifras históricas y la capacidad de generación normalizada. Mientras el múltiplo histórico de Aluar (13,3x) refleja la compresión de resultados de 2025, el rendimiento proyectado del flujo libre de caja (&gt;10%) supera ampliamente la mediana de la industria internacional (3,8%):</w:t>
       </w:r>
     </w:p>
     <w:p>
@@ -20092,12 +20099,12 @@
         <w:tblLook w:val="04A0" w:firstRow="1" w:lastRow="0" w:firstColumn="1" w:lastColumn="0" w:noHBand="0" w:noVBand="1"/>
       </w:tblPr>
       <w:tblGrid>
-        <w:gridCol w:w="893"/>
-        <w:gridCol w:w="978"/>
-        <w:gridCol w:w="695"/>
-        <w:gridCol w:w="768"/>
-        <w:gridCol w:w="615"/>
-        <w:gridCol w:w="928"/>
+        <w:gridCol w:w="897"/>
+        <w:gridCol w:w="982"/>
+        <w:gridCol w:w="701"/>
+        <w:gridCol w:w="774"/>
+        <w:gridCol w:w="622"/>
+        <w:gridCol w:w="901"/>
       </w:tblGrid>
       <w:tr>
         <w:trPr>
@@ -20249,7 +20256,7 @@
                 <w:color w:val="FFFFFF"/>
                 <w:sz w:val="13"/>
               </w:rPr>
-              <w:t>FCF Yield 2026E/27E</w:t>
+              <w:t>FCF Yield 2026e/27e</w:t>
             </w:r>
           </w:p>
         </w:tc>
@@ -21422,7 +21429,7 @@
         <w:pStyle w:val="Ttulo1"/>
         <w:spacing w:before="100" w:after="30"/>
       </w:pPr>
-      <w:bookmarkStart w:id="48" w:name="_Toc237697253"/>
+      <w:bookmarkStart w:id="48" w:name="_Toc237699718"/>
       <w:r>
         <w:rPr>
           <w:rFonts w:ascii="Georgia" w:hAnsi="Georgia"/>
@@ -21439,7 +21446,7 @@
         <w:pStyle w:val="Ttulo2"/>
         <w:spacing w:before="70" w:after="20"/>
       </w:pPr>
-      <w:bookmarkStart w:id="49" w:name="_Toc237697254"/>
+      <w:bookmarkStart w:id="49" w:name="_Toc237699719"/>
       <w:r>
         <w:rPr>
           <w:rFonts w:ascii="Georgia" w:hAnsi="Georgia"/>
@@ -21571,7 +21578,7 @@
                 <w:noProof/>
               </w:rPr>
               <w:drawing>
-                <wp:inline distT="0" distB="0" distL="0" distR="0" wp14:anchorId="5C8336C0" wp14:editId="30D84D53">
+                <wp:inline distT="0" distB="0" distL="0" distR="0" wp14:anchorId="05493C0D" wp14:editId="65916EE6">
                   <wp:extent cx="2926080" cy="1695124"/>
                   <wp:effectExtent l="0" t="0" r="0" b="0"/>
                   <wp:docPr id="23" name="Picture 23"/>
@@ -21627,7 +21634,7 @@
                 <w:noProof/>
               </w:rPr>
               <w:drawing>
-                <wp:inline distT="0" distB="0" distL="0" distR="0" wp14:anchorId="751B405E" wp14:editId="31814079">
+                <wp:inline distT="0" distB="0" distL="0" distR="0" wp14:anchorId="175865E4" wp14:editId="3549AABB">
                   <wp:extent cx="2926080" cy="1572627"/>
                   <wp:effectExtent l="0" t="0" r="0" b="0"/>
                   <wp:docPr id="24" name="Picture 24"/>
@@ -21726,7 +21733,7 @@
         <w:pStyle w:val="Ttulo2"/>
         <w:spacing w:before="70" w:after="20"/>
       </w:pPr>
-      <w:bookmarkStart w:id="50" w:name="_Toc237697255"/>
+      <w:bookmarkStart w:id="50" w:name="_Toc237699720"/>
       <w:r>
         <w:rPr>
           <w:rFonts w:ascii="Georgia" w:hAnsi="Georgia"/>
@@ -22383,7 +22390,7 @@
         <w:pStyle w:val="Ttulo2"/>
         <w:spacing w:before="70" w:after="20"/>
       </w:pPr>
-      <w:bookmarkStart w:id="51" w:name="_Toc237697256"/>
+      <w:bookmarkStart w:id="51" w:name="_Toc237699721"/>
       <w:r>
         <w:rPr>
           <w:rFonts w:ascii="Georgia" w:hAnsi="Georgia"/>
@@ -22430,7 +22437,7 @@
         <w:pStyle w:val="Ttulo2"/>
         <w:spacing w:before="70" w:after="20"/>
       </w:pPr>
-      <w:bookmarkStart w:id="52" w:name="_Toc237697257"/>
+      <w:bookmarkStart w:id="52" w:name="_Toc237699722"/>
       <w:r>
         <w:rPr>
           <w:rFonts w:ascii="Georgia" w:hAnsi="Georgia"/>
@@ -22505,7 +22512,7 @@
                 <w:noProof/>
               </w:rPr>
               <w:drawing>
-                <wp:inline distT="0" distB="0" distL="0" distR="0" wp14:anchorId="46933235" wp14:editId="17F9E356">
+                <wp:inline distT="0" distB="0" distL="0" distR="0" wp14:anchorId="662785AC" wp14:editId="15400B1A">
                   <wp:extent cx="2926080" cy="1696900"/>
                   <wp:effectExtent l="0" t="0" r="0" b="0"/>
                   <wp:docPr id="25" name="Picture 25"/>
@@ -22561,7 +22568,7 @@
                 <w:noProof/>
               </w:rPr>
               <w:drawing>
-                <wp:inline distT="0" distB="0" distL="0" distR="0" wp14:anchorId="68932A0A" wp14:editId="70C0ACA1">
+                <wp:inline distT="0" distB="0" distL="0" distR="0" wp14:anchorId="54F6A256" wp14:editId="14BE986F">
                   <wp:extent cx="2926080" cy="1614092"/>
                   <wp:effectExtent l="0" t="0" r="0" b="0"/>
                   <wp:docPr id="26" name="Picture 26"/>
@@ -23204,9 +23211,10 @@
             </w:pPr>
             <w:r>
               <w:rPr>
-                <w:sz w:val="13"/>
-              </w:rPr>
-              <w:t>CVaR / Expected Shortfall (paramétrico)</w:t>
+                <w:b/>
+                <w:sz w:val="13"/>
+              </w:rPr>
+              <w:t>EVT-GPD (Valores Extremos / Pareto)</w:t>
             </w:r>
           </w:p>
         </w:tc>
@@ -23224,13 +23232,12 @@
           <w:p>
             <w:pPr>
               <w:spacing w:after="0"/>
-              <w:jc w:val="right"/>
-            </w:pPr>
-            <w:r>
-              <w:rPr>
-                <w:sz w:val="13"/>
-              </w:rPr>
-              <w:t>-5,67</w:t>
+            </w:pPr>
+            <w:r>
+              <w:rPr>
+                <w:sz w:val="13"/>
+              </w:rPr>
+              <w:t>**-3,47</w:t>
             </w:r>
           </w:p>
         </w:tc>
@@ -23248,13 +23255,12 @@
           <w:p>
             <w:pPr>
               <w:spacing w:after="0"/>
-              <w:jc w:val="right"/>
-            </w:pPr>
-            <w:r>
-              <w:rPr>
-                <w:sz w:val="13"/>
-              </w:rPr>
-              <w:t>-6,68</w:t>
+            </w:pPr>
+            <w:r>
+              <w:rPr>
+                <w:sz w:val="13"/>
+              </w:rPr>
+              <w:t>**-4,73</w:t>
             </w:r>
           </w:p>
         </w:tc>
@@ -23272,13 +23278,12 @@
           <w:p>
             <w:pPr>
               <w:spacing w:after="0"/>
-              <w:jc w:val="right"/>
-            </w:pPr>
-            <w:r>
-              <w:rPr>
-                <w:sz w:val="13"/>
-              </w:rPr>
-              <w:t>-8,65</w:t>
+            </w:pPr>
+            <w:r>
+              <w:rPr>
+                <w:sz w:val="13"/>
+              </w:rPr>
+              <w:t>**-8,20</w:t>
             </w:r>
           </w:p>
         </w:tc>
@@ -23305,7 +23310,7 @@
               <w:rPr>
                 <w:sz w:val="13"/>
               </w:rPr>
-              <w:t>CVaR Cornish-Fisher (Simulado)</w:t>
+              <w:t>CVaR / Expected Shortfall (Normal)</w:t>
             </w:r>
           </w:p>
         </w:tc>
@@ -23328,7 +23333,7 @@
               <w:rPr>
                 <w:sz w:val="13"/>
               </w:rPr>
-              <w:t>-7,12</w:t>
+              <w:t>-5,67</w:t>
             </w:r>
           </w:p>
         </w:tc>
@@ -23351,7 +23356,7 @@
               <w:rPr>
                 <w:sz w:val="13"/>
               </w:rPr>
-              <w:t>-10,49</w:t>
+              <w:t>-6,68</w:t>
             </w:r>
           </w:p>
         </w:tc>
@@ -23374,7 +23379,105 @@
               <w:rPr>
                 <w:sz w:val="13"/>
               </w:rPr>
-              <w:t>-20,35</w:t>
+              <w:t>-8,65</w:t>
+            </w:r>
+          </w:p>
+        </w:tc>
+      </w:tr>
+      <w:tr>
+        <w:trPr>
+          <w:jc w:val="center"/>
+        </w:trPr>
+        <w:tc>
+          <w:tcPr>
+            <w:tcW w:w="2524" w:type="dxa"/>
+            <w:shd w:val="clear" w:color="auto" w:fill="F8FAFC"/>
+            <w:tcMar>
+              <w:top w:w="6" w:type="dxa"/>
+              <w:left w:w="15" w:type="dxa"/>
+              <w:bottom w:w="6" w:type="dxa"/>
+              <w:right w:w="15" w:type="dxa"/>
+            </w:tcMar>
+          </w:tcPr>
+          <w:p>
+            <w:pPr>
+              <w:spacing w:after="0"/>
+            </w:pPr>
+            <w:r>
+              <w:rPr>
+                <w:b/>
+                <w:sz w:val="13"/>
+              </w:rPr>
+              <w:t>CVaR EVT-GPD (Pérdida Esperada Extrema)</w:t>
+            </w:r>
+          </w:p>
+        </w:tc>
+        <w:tc>
+          <w:tcPr>
+            <w:tcW w:w="2524" w:type="dxa"/>
+            <w:shd w:val="clear" w:color="auto" w:fill="F8FAFC"/>
+            <w:tcMar>
+              <w:top w:w="6" w:type="dxa"/>
+              <w:left w:w="15" w:type="dxa"/>
+              <w:bottom w:w="6" w:type="dxa"/>
+              <w:right w:w="15" w:type="dxa"/>
+            </w:tcMar>
+          </w:tcPr>
+          <w:p>
+            <w:pPr>
+              <w:spacing w:after="0"/>
+            </w:pPr>
+            <w:r>
+              <w:rPr>
+                <w:sz w:val="13"/>
+              </w:rPr>
+              <w:t>**-5,80</w:t>
+            </w:r>
+          </w:p>
+        </w:tc>
+        <w:tc>
+          <w:tcPr>
+            <w:tcW w:w="2524" w:type="dxa"/>
+            <w:shd w:val="clear" w:color="auto" w:fill="F8FAFC"/>
+            <w:tcMar>
+              <w:top w:w="6" w:type="dxa"/>
+              <w:left w:w="15" w:type="dxa"/>
+              <w:bottom w:w="6" w:type="dxa"/>
+              <w:right w:w="15" w:type="dxa"/>
+            </w:tcMar>
+          </w:tcPr>
+          <w:p>
+            <w:pPr>
+              <w:spacing w:after="0"/>
+            </w:pPr>
+            <w:r>
+              <w:rPr>
+                <w:sz w:val="13"/>
+              </w:rPr>
+              <w:t>**-7,15</w:t>
+            </w:r>
+          </w:p>
+        </w:tc>
+        <w:tc>
+          <w:tcPr>
+            <w:tcW w:w="2524" w:type="dxa"/>
+            <w:shd w:val="clear" w:color="auto" w:fill="F8FAFC"/>
+            <w:tcMar>
+              <w:top w:w="6" w:type="dxa"/>
+              <w:left w:w="15" w:type="dxa"/>
+              <w:bottom w:w="6" w:type="dxa"/>
+              <w:right w:w="15" w:type="dxa"/>
+            </w:tcMar>
+          </w:tcPr>
+          <w:p>
+            <w:pPr>
+              <w:spacing w:after="0"/>
+            </w:pPr>
+            <w:r>
+              <w:rPr>
+                <w:sz w:val="13"/>
+              </w:rPr>
+              <w:t>**-10,35</w:t>
             </w:r>
           </w:p>
         </w:tc>
@@ -23385,7 +23488,7 @@
         <w:pStyle w:val="Ttulo2"/>
         <w:spacing w:before="70" w:after="20"/>
       </w:pPr>
-      <w:bookmarkStart w:id="53" w:name="_Toc237697258"/>
+      <w:bookmarkStart w:id="53" w:name="_Toc237699723"/>
       <w:r>
         <w:rPr>
           <w:rFonts w:ascii="Georgia" w:hAnsi="Georgia"/>
@@ -23455,7 +23558,7 @@
                 <w:noProof/>
               </w:rPr>
               <w:drawing>
-                <wp:inline distT="0" distB="0" distL="0" distR="0" wp14:anchorId="2AAB8504" wp14:editId="111AACEB">
+                <wp:inline distT="0" distB="0" distL="0" distR="0" wp14:anchorId="6EEA8FF8" wp14:editId="37A21F65">
                   <wp:extent cx="2926080" cy="1654733"/>
                   <wp:effectExtent l="0" t="0" r="0" b="0"/>
                   <wp:docPr id="27" name="Picture 27"/>
@@ -23511,7 +23614,7 @@
                 <w:noProof/>
               </w:rPr>
               <w:drawing>
-                <wp:inline distT="0" distB="0" distL="0" distR="0" wp14:anchorId="47686B44" wp14:editId="0BE7FCE1">
+                <wp:inline distT="0" distB="0" distL="0" distR="0" wp14:anchorId="619B3ABC" wp14:editId="1B291E5C">
                   <wp:extent cx="2926080" cy="1698212"/>
                   <wp:effectExtent l="0" t="0" r="0" b="0"/>
                   <wp:docPr id="28" name="Picture 28"/>
@@ -23606,24 +23709,18 @@
       </w:tr>
     </w:tbl>
     <w:p>
-      <w:r>
-        <w:br w:type="page"/>
-      </w:r>
-    </w:p>
-    <w:p>
       <w:pPr>
         <w:pStyle w:val="Ttulo1"/>
         <w:spacing w:before="100" w:after="30"/>
       </w:pPr>
-      <w:bookmarkStart w:id="54" w:name="_Toc237697259"/>
+      <w:bookmarkStart w:id="54" w:name="_Toc237699724"/>
       <w:r>
         <w:rPr>
           <w:rFonts w:ascii="Georgia" w:hAnsi="Georgia"/>
           <w:color w:val="0D233A"/>
           <w:sz w:val="21"/>
         </w:rPr>
-        <w:lastRenderedPageBreak/>
-        <w:t>Modelización Estocástica Avanzada y Validación Econométrica</w:t>
+        <w:t>Modelos Estocásticos y Validación Econométrica</w:t>
       </w:r>
       <w:bookmarkEnd w:id="54"/>
     </w:p>
@@ -23632,7 +23729,7 @@
         <w:pStyle w:val="Ttulo2"/>
         <w:spacing w:before="70" w:after="20"/>
       </w:pPr>
-      <w:bookmarkStart w:id="55" w:name="_Toc237697260"/>
+      <w:bookmarkStart w:id="55" w:name="_Toc237699725"/>
       <w:r>
         <w:rPr>
           <w:rFonts w:ascii="Georgia" w:hAnsi="Georgia"/>
@@ -23687,13 +23784,14 @@
         <w:pStyle w:val="Ttulo2"/>
         <w:spacing w:before="70" w:after="20"/>
       </w:pPr>
-      <w:bookmarkStart w:id="56" w:name="_Toc237697261"/>
+      <w:bookmarkStart w:id="56" w:name="_Toc237699726"/>
       <w:r>
         <w:rPr>
           <w:rFonts w:ascii="Georgia" w:hAnsi="Georgia"/>
           <w:color w:val="1E3A8A"/>
           <w:sz w:val="18"/>
         </w:rPr>
+        <w:lastRenderedPageBreak/>
         <w:t>Volatilidad Condicional y Beta GARCH(1,1)</w:t>
       </w:r>
       <w:bookmarkEnd w:id="56"/>
@@ -23762,7 +23860,7 @@
                 <w:noProof/>
               </w:rPr>
               <w:drawing>
-                <wp:inline distT="0" distB="0" distL="0" distR="0" wp14:anchorId="5DDCE9CD" wp14:editId="7F0241CC">
+                <wp:inline distT="0" distB="0" distL="0" distR="0" wp14:anchorId="137E5DA8" wp14:editId="71DBAC47">
                   <wp:extent cx="2926080" cy="1650045"/>
                   <wp:effectExtent l="0" t="0" r="0" b="0"/>
                   <wp:docPr id="29" name="Picture 29"/>
@@ -23818,7 +23916,7 @@
                 <w:noProof/>
               </w:rPr>
               <w:drawing>
-                <wp:inline distT="0" distB="0" distL="0" distR="0" wp14:anchorId="14A337A2" wp14:editId="5499F387">
+                <wp:inline distT="0" distB="0" distL="0" distR="0" wp14:anchorId="136D0D1E" wp14:editId="599CEBF9">
                   <wp:extent cx="2926080" cy="1611196"/>
                   <wp:effectExtent l="0" t="0" r="0" b="0"/>
                   <wp:docPr id="30" name="Picture 30"/>
@@ -24256,7 +24354,7 @@
         <w:pStyle w:val="Ttulo2"/>
         <w:spacing w:before="70" w:after="20"/>
       </w:pPr>
-      <w:bookmarkStart w:id="57" w:name="_Toc237697262"/>
+      <w:bookmarkStart w:id="57" w:name="_Toc237699727"/>
       <w:r>
         <w:rPr>
           <w:rFonts w:ascii="Georgia" w:hAnsi="Georgia"/>
@@ -24327,7 +24425,7 @@
                 <w:noProof/>
               </w:rPr>
               <w:drawing>
-                <wp:inline distT="0" distB="0" distL="0" distR="0" wp14:anchorId="31206C4B" wp14:editId="43E74273">
+                <wp:inline distT="0" distB="0" distL="0" distR="0" wp14:anchorId="74159282" wp14:editId="7AA28A5F">
                   <wp:extent cx="2926080" cy="1687777"/>
                   <wp:effectExtent l="0" t="0" r="0" b="0"/>
                   <wp:docPr id="31" name="Picture 31"/>
@@ -24850,7 +24948,7 @@
         <w:pStyle w:val="Ttulo2"/>
         <w:spacing w:before="70" w:after="20"/>
       </w:pPr>
-      <w:bookmarkStart w:id="58" w:name="_Toc237697263"/>
+      <w:bookmarkStart w:id="58" w:name="_Toc237699728"/>
       <w:r>
         <w:rPr>
           <w:rFonts w:ascii="Georgia" w:hAnsi="Georgia"/>
@@ -25971,7 +26069,7 @@
         <w:pStyle w:val="Ttulo1"/>
         <w:spacing w:before="100" w:after="30"/>
       </w:pPr>
-      <w:bookmarkStart w:id="59" w:name="_Toc237697264"/>
+      <w:bookmarkStart w:id="59" w:name="_Toc237699729"/>
       <w:r>
         <w:rPr>
           <w:rFonts w:ascii="Georgia" w:hAnsi="Georgia"/>
@@ -26178,7 +26276,7 @@
         <w:pStyle w:val="Ttulo1"/>
         <w:spacing w:before="100" w:after="30"/>
       </w:pPr>
-      <w:bookmarkStart w:id="60" w:name="_Toc237697265"/>
+      <w:bookmarkStart w:id="60" w:name="_Toc237699730"/>
       <w:r>
         <w:rPr>
           <w:rFonts w:ascii="Georgia" w:hAnsi="Georgia"/>
@@ -26209,7 +26307,7 @@
           <w:color w:val="0D233A"/>
           <w:sz w:val="13"/>
         </w:rPr>
-        <w:t>Tabla: Conciliación de la Tasa Efectiva del Impuesto a las Ganancias FY2025</w:t>
+        <w:t>Tabla: Conciliación de la Tasa Efectiva del Impuesto a las Ganancias 2025</w:t>
       </w:r>
     </w:p>
     <w:tbl>
@@ -26683,7 +26781,7 @@
           <w:color w:val="0D233A"/>
           <w:sz w:val="13"/>
         </w:rPr>
-        <w:t>Tabla: Estado de Resultados Consolidado Auditado (FY2020–FY2025, USD MM)</w:t>
+        <w:t>Tabla: Estado de Resultados Consolidado Auditado (2020–2025, USD MM)</w:t>
       </w:r>
     </w:p>
     <w:tbl>
@@ -26698,14 +26796,14 @@
         <w:tblLook w:val="04A0" w:firstRow="1" w:lastRow="0" w:firstColumn="1" w:lastColumn="0" w:noHBand="0" w:noVBand="1"/>
       </w:tblPr>
       <w:tblGrid>
-        <w:gridCol w:w="969"/>
-        <w:gridCol w:w="588"/>
-        <w:gridCol w:w="565"/>
-        <w:gridCol w:w="580"/>
-        <w:gridCol w:w="579"/>
-        <w:gridCol w:w="582"/>
-        <w:gridCol w:w="577"/>
-        <w:gridCol w:w="427"/>
+        <w:gridCol w:w="993"/>
+        <w:gridCol w:w="554"/>
+        <w:gridCol w:w="554"/>
+        <w:gridCol w:w="569"/>
+        <w:gridCol w:w="567"/>
+        <w:gridCol w:w="566"/>
+        <w:gridCol w:w="567"/>
+        <w:gridCol w:w="497"/>
       </w:tblGrid>
       <w:tr>
         <w:trPr>
@@ -26757,7 +26855,7 @@
                 <w:color w:val="FFFFFF"/>
                 <w:sz w:val="12"/>
               </w:rPr>
-              <w:t>FY2020</w:t>
+              <w:t>2020</w:t>
             </w:r>
           </w:p>
         </w:tc>
@@ -26782,7 +26880,7 @@
                 <w:color w:val="FFFFFF"/>
                 <w:sz w:val="12"/>
               </w:rPr>
-              <w:t>FY2021</w:t>
+              <w:t>2021</w:t>
             </w:r>
           </w:p>
         </w:tc>
@@ -26807,7 +26905,7 @@
                 <w:color w:val="FFFFFF"/>
                 <w:sz w:val="12"/>
               </w:rPr>
-              <w:t>FY2022</w:t>
+              <w:t>2022</w:t>
             </w:r>
           </w:p>
         </w:tc>
@@ -26832,7 +26930,7 @@
                 <w:color w:val="FFFFFF"/>
                 <w:sz w:val="12"/>
               </w:rPr>
-              <w:t>FY2023</w:t>
+              <w:t>2023</w:t>
             </w:r>
           </w:p>
         </w:tc>
@@ -26857,7 +26955,7 @@
                 <w:color w:val="FFFFFF"/>
                 <w:sz w:val="12"/>
               </w:rPr>
-              <w:t>FY2024</w:t>
+              <w:t>2024</w:t>
             </w:r>
           </w:p>
         </w:tc>
@@ -26882,7 +26980,7 @@
                 <w:color w:val="FFFFFF"/>
                 <w:sz w:val="12"/>
               </w:rPr>
-              <w:t>FY2025</w:t>
+              <w:t>2025</w:t>
             </w:r>
           </w:p>
         </w:tc>
@@ -29309,7 +29407,7 @@
           <w:color w:val="0D233A"/>
           <w:sz w:val="13"/>
         </w:rPr>
-        <w:t>Tabla: Estado de Situación Patrimonial / Balance Consolidado Auditado (FY2020–FY2025, USD MM)</w:t>
+        <w:t>Tabla: Estado de Situación Patrimonial / Balance Consolidado Auditado (2020–2025, USD MM)</w:t>
       </w:r>
     </w:p>
     <w:tbl>
@@ -29324,13 +29422,13 @@
         <w:tblLook w:val="04A0" w:firstRow="1" w:lastRow="0" w:firstColumn="1" w:lastColumn="0" w:noHBand="0" w:noVBand="1"/>
       </w:tblPr>
       <w:tblGrid>
-        <w:gridCol w:w="885"/>
-        <w:gridCol w:w="673"/>
-        <w:gridCol w:w="651"/>
-        <w:gridCol w:w="665"/>
-        <w:gridCol w:w="664"/>
-        <w:gridCol w:w="667"/>
-        <w:gridCol w:w="662"/>
+        <w:gridCol w:w="922"/>
+        <w:gridCol w:w="698"/>
+        <w:gridCol w:w="627"/>
+        <w:gridCol w:w="618"/>
+        <w:gridCol w:w="608"/>
+        <w:gridCol w:w="695"/>
+        <w:gridCol w:w="699"/>
       </w:tblGrid>
       <w:tr>
         <w:trPr>
@@ -29382,7 +29480,7 @@
                 <w:color w:val="FFFFFF"/>
                 <w:sz w:val="12"/>
               </w:rPr>
-              <w:t>FY2020</w:t>
+              <w:t>2020</w:t>
             </w:r>
           </w:p>
         </w:tc>
@@ -29407,7 +29505,7 @@
                 <w:color w:val="FFFFFF"/>
                 <w:sz w:val="12"/>
               </w:rPr>
-              <w:t>FY2021</w:t>
+              <w:t>2021</w:t>
             </w:r>
           </w:p>
         </w:tc>
@@ -29432,7 +29530,7 @@
                 <w:color w:val="FFFFFF"/>
                 <w:sz w:val="12"/>
               </w:rPr>
-              <w:t>FY2022</w:t>
+              <w:t>2022</w:t>
             </w:r>
           </w:p>
         </w:tc>
@@ -29457,7 +29555,7 @@
                 <w:color w:val="FFFFFF"/>
                 <w:sz w:val="12"/>
               </w:rPr>
-              <w:t>FY2023</w:t>
+              <w:t>2023</w:t>
             </w:r>
           </w:p>
         </w:tc>
@@ -29482,7 +29580,7 @@
                 <w:color w:val="FFFFFF"/>
                 <w:sz w:val="12"/>
               </w:rPr>
-              <w:t>FY2024</w:t>
+              <w:t>2024</w:t>
             </w:r>
           </w:p>
         </w:tc>
@@ -29507,7 +29605,7 @@
                 <w:color w:val="FFFFFF"/>
                 <w:sz w:val="12"/>
               </w:rPr>
-              <w:t>FY2025</w:t>
+              <w:t>2025</w:t>
             </w:r>
           </w:p>
         </w:tc>
@@ -31386,7 +31484,7 @@
           <w:color w:val="0D233A"/>
           <w:sz w:val="13"/>
         </w:rPr>
-        <w:t>Tabla: Estado de Flujos de Efectivo Consolidado Auditado (FY2020–FY2025, USD MM)</w:t>
+        <w:t>Tabla: Estado de Flujos de Efectivo Consolidado Auditado (2020–2025, USD MM)</w:t>
       </w:r>
     </w:p>
     <w:tbl>
@@ -31401,13 +31499,13 @@
         <w:tblLook w:val="04A0" w:firstRow="1" w:lastRow="0" w:firstColumn="1" w:lastColumn="0" w:noHBand="0" w:noVBand="1"/>
       </w:tblPr>
       <w:tblGrid>
-        <w:gridCol w:w="840"/>
-        <w:gridCol w:w="680"/>
-        <w:gridCol w:w="659"/>
-        <w:gridCol w:w="673"/>
-        <w:gridCol w:w="672"/>
-        <w:gridCol w:w="674"/>
-        <w:gridCol w:w="669"/>
+        <w:gridCol w:w="901"/>
+        <w:gridCol w:w="684"/>
+        <w:gridCol w:w="624"/>
+        <w:gridCol w:w="638"/>
+        <w:gridCol w:w="661"/>
+        <w:gridCol w:w="635"/>
+        <w:gridCol w:w="724"/>
       </w:tblGrid>
       <w:tr>
         <w:trPr>
@@ -31459,7 +31557,7 @@
                 <w:color w:val="FFFFFF"/>
                 <w:sz w:val="12"/>
               </w:rPr>
-              <w:t>FY2020</w:t>
+              <w:t>2020</w:t>
             </w:r>
           </w:p>
         </w:tc>
@@ -31484,7 +31582,7 @@
                 <w:color w:val="FFFFFF"/>
                 <w:sz w:val="12"/>
               </w:rPr>
-              <w:t>FY2021</w:t>
+              <w:t>2021</w:t>
             </w:r>
           </w:p>
         </w:tc>
@@ -31509,7 +31607,7 @@
                 <w:color w:val="FFFFFF"/>
                 <w:sz w:val="12"/>
               </w:rPr>
-              <w:t>FY2022</w:t>
+              <w:t>2022</w:t>
             </w:r>
           </w:p>
         </w:tc>
@@ -31534,7 +31632,7 @@
                 <w:color w:val="FFFFFF"/>
                 <w:sz w:val="12"/>
               </w:rPr>
-              <w:t>FY2023</w:t>
+              <w:t>2023</w:t>
             </w:r>
           </w:p>
         </w:tc>
@@ -31559,7 +31657,7 @@
                 <w:color w:val="FFFFFF"/>
                 <w:sz w:val="12"/>
               </w:rPr>
-              <w:t>FY2024</w:t>
+              <w:t>2024</w:t>
             </w:r>
           </w:p>
         </w:tc>
@@ -31584,7 +31682,7 @@
                 <w:color w:val="FFFFFF"/>
                 <w:sz w:val="12"/>
               </w:rPr>
-              <w:t>FY2025</w:t>
+              <w:t>2025</w:t>
             </w:r>
           </w:p>
         </w:tc>
@@ -31783,7 +31881,13 @@
               <w:rPr>
                 <w:sz w:val="12"/>
               </w:rPr>
-              <w:t>Inversiones en Bienes de Uso (CAPEX)</w:t>
+              <w:t xml:space="preserve">Inversiones en </w:t>
+            </w:r>
+            <w:r>
+              <w:rPr>
+                <w:sz w:val="12"/>
+              </w:rPr>
+              <w:t>Bienes de Uso (CAPEX)</w:t>
             </w:r>
           </w:p>
         </w:tc>
@@ -32432,7 +32536,7 @@
           <w:color w:val="0D233A"/>
           <w:sz w:val="13"/>
         </w:rPr>
-        <w:t>Tabla: Proyecciones del Free Cash Flow to the Firm (FCFF, FY2026E–FY2030E, USD MM)</w:t>
+        <w:t>Tabla: Proyecciones del Free Cash Flow to the Firm (FCFF, 2026e–2030e, USD MM)</w:t>
       </w:r>
     </w:p>
     <w:tbl>
@@ -34260,7 +34364,7 @@
         <w:pStyle w:val="Ttulo1"/>
         <w:spacing w:before="100" w:after="30"/>
       </w:pPr>
-      <w:bookmarkStart w:id="61" w:name="_Toc237697266"/>
+      <w:bookmarkStart w:id="61" w:name="_Toc237699731"/>
       <w:r>
         <w:rPr>
           <w:rFonts w:ascii="Georgia" w:hAnsi="Georgia"/>
@@ -34693,7 +34797,7 @@
         <w:pStyle w:val="Ttulo1"/>
         <w:spacing w:before="100" w:after="30"/>
       </w:pPr>
-      <w:bookmarkStart w:id="62" w:name="_Toc237697267"/>
+      <w:bookmarkStart w:id="62" w:name="_Toc237699732"/>
       <w:r>
         <w:rPr>
           <w:rFonts w:ascii="Georgia" w:hAnsi="Georgia"/>
@@ -35155,31 +35259,31 @@
       </w:rPr>
     </w:lvl>
   </w:abstractNum>
-  <w:num w:numId="1" w16cid:durableId="1022318538">
+  <w:num w:numId="1" w16cid:durableId="1046566997">
     <w:abstractNumId w:val="8"/>
   </w:num>
-  <w:num w:numId="2" w16cid:durableId="1393116892">
+  <w:num w:numId="2" w16cid:durableId="1398211193">
     <w:abstractNumId w:val="6"/>
   </w:num>
-  <w:num w:numId="3" w16cid:durableId="927082207">
+  <w:num w:numId="3" w16cid:durableId="272055989">
     <w:abstractNumId w:val="5"/>
   </w:num>
-  <w:num w:numId="4" w16cid:durableId="1478376227">
+  <w:num w:numId="4" w16cid:durableId="204566339">
     <w:abstractNumId w:val="4"/>
   </w:num>
-  <w:num w:numId="5" w16cid:durableId="757598473">
+  <w:num w:numId="5" w16cid:durableId="1903253429">
     <w:abstractNumId w:val="7"/>
   </w:num>
-  <w:num w:numId="6" w16cid:durableId="397747681">
+  <w:num w:numId="6" w16cid:durableId="2114981739">
     <w:abstractNumId w:val="3"/>
   </w:num>
-  <w:num w:numId="7" w16cid:durableId="648487090">
+  <w:num w:numId="7" w16cid:durableId="1454667031">
     <w:abstractNumId w:val="2"/>
   </w:num>
-  <w:num w:numId="8" w16cid:durableId="916591185">
+  <w:num w:numId="8" w16cid:durableId="748697834">
     <w:abstractNumId w:val="1"/>
   </w:num>
-  <w:num w:numId="9" w16cid:durableId="1924561476">
+  <w:num w:numId="9" w16cid:durableId="2072918739">
     <w:abstractNumId w:val="0"/>
   </w:num>
 </w:numbering>
@@ -46611,7 +46715,7 @@
     <w:autoRedefine/>
     <w:uiPriority w:val="39"/>
     <w:unhideWhenUsed/>
-    <w:rsid w:val="00F46D8B"/>
+    <w:rsid w:val="007909C0"/>
     <w:pPr>
       <w:spacing w:before="10" w:after="10" w:line="240" w:lineRule="auto"/>
     </w:pPr>
@@ -46626,7 +46730,7 @@
     <w:autoRedefine/>
     <w:uiPriority w:val="39"/>
     <w:unhideWhenUsed/>
-    <w:rsid w:val="00F46D8B"/>
+    <w:rsid w:val="007909C0"/>
     <w:pPr>
       <w:spacing w:after="0" w:line="240" w:lineRule="auto"/>
       <w:ind w:left="170"/>
@@ -46640,7 +46744,7 @@
     <w:basedOn w:val="Fuentedeprrafopredeter"/>
     <w:uiPriority w:val="99"/>
     <w:unhideWhenUsed/>
-    <w:rsid w:val="00F46D8B"/>
+    <w:rsid w:val="007909C0"/>
     <w:rPr>
       <w:color w:val="0000FF" w:themeColor="hyperlink"/>
       <w:u w:val="single"/>

</xml_diff>

<commit_message>
docs: Rotulado explicito de justificaciones metodologicas (Por que Blume, Hamada, Lambda Damodaran, Opciones Reales, EVT, CIR, Clayton) y depuracion total de muletillas
</commit_message>
<xml_diff>
--- a/01_Reporte_PDF/Informe_Valuacion_Aluar_UNCuyo.docx
+++ b/01_Reporte_PDF/Informe_Valuacion_Aluar_UNCuyo.docx
@@ -304,7 +304,7 @@
               <w:rPr>
                 <w:sz w:val="16"/>
               </w:rPr>
-              <w:t xml:space="preserve"> La caída del spread EMBI+ (441 pb) sitúa el WACC en 7,06% (λ = 0,20), y el cese de inversiones intensivas reduce la deuda neta a &lt;1,0x EBITDA hacia FY2028E.</w:t>
+              <w:t xml:space="preserve"> La caída del spread EMBI+ (441 pb) sitúa el WACC en 7,06% (λ = 0,20), y el cese de inversiones intensivas reduce la deuda neta a &lt;1,0x EBITDA hacia 2028e.</w:t>
             </w:r>
           </w:p>
         </w:tc>
@@ -1224,7 +1224,7 @@
       <w:r>
         <w:fldChar w:fldCharType="separate"/>
       </w:r>
-      <w:hyperlink w:anchor="_Toc237699670" w:history="1">
+      <w:hyperlink w:anchor="_Toc237700187" w:history="1">
         <w:r>
           <w:rPr>
             <w:rStyle w:val="Hipervnculo"/>
@@ -1251,7 +1251,7 @@
             <w:noProof/>
             <w:webHidden/>
           </w:rPr>
-          <w:instrText xml:space="preserve"> PAGEREF _Toc237699670 \h </w:instrText>
+          <w:instrText xml:space="preserve"> PAGEREF _Toc237700187 \h </w:instrText>
         </w:r>
         <w:r>
           <w:rPr>
@@ -1298,7 +1298,7 @@
           <w14:ligatures w14:val="standardContextual"/>
         </w:rPr>
       </w:pPr>
-      <w:hyperlink w:anchor="_Toc237699671" w:history="1">
+      <w:hyperlink w:anchor="_Toc237700188" w:history="1">
         <w:r>
           <w:rPr>
             <w:rStyle w:val="Hipervnculo"/>
@@ -1325,7 +1325,7 @@
             <w:noProof/>
             <w:webHidden/>
           </w:rPr>
-          <w:instrText xml:space="preserve"> PAGEREF _Toc237699671 \h </w:instrText>
+          <w:instrText xml:space="preserve"> PAGEREF _Toc237700188 \h </w:instrText>
         </w:r>
         <w:r>
           <w:rPr>
@@ -1372,7 +1372,7 @@
           <w14:ligatures w14:val="standardContextual"/>
         </w:rPr>
       </w:pPr>
-      <w:hyperlink w:anchor="_Toc237699672" w:history="1">
+      <w:hyperlink w:anchor="_Toc237700189" w:history="1">
         <w:r>
           <w:rPr>
             <w:rStyle w:val="Hipervnculo"/>
@@ -1399,7 +1399,7 @@
             <w:noProof/>
             <w:webHidden/>
           </w:rPr>
-          <w:instrText xml:space="preserve"> PAGEREF _Toc237699672 \h </w:instrText>
+          <w:instrText xml:space="preserve"> PAGEREF _Toc237700189 \h </w:instrText>
         </w:r>
         <w:r>
           <w:rPr>
@@ -1446,7 +1446,7 @@
           <w14:ligatures w14:val="standardContextual"/>
         </w:rPr>
       </w:pPr>
-      <w:hyperlink w:anchor="_Toc237699673" w:history="1">
+      <w:hyperlink w:anchor="_Toc237700190" w:history="1">
         <w:r>
           <w:rPr>
             <w:rStyle w:val="Hipervnculo"/>
@@ -1473,7 +1473,7 @@
             <w:noProof/>
             <w:webHidden/>
           </w:rPr>
-          <w:instrText xml:space="preserve"> PAGEREF _Toc237699673 \h </w:instrText>
+          <w:instrText xml:space="preserve"> PAGEREF _Toc237700190 \h </w:instrText>
         </w:r>
         <w:r>
           <w:rPr>
@@ -1520,7 +1520,7 @@
           <w14:ligatures w14:val="standardContextual"/>
         </w:rPr>
       </w:pPr>
-      <w:hyperlink w:anchor="_Toc237699674" w:history="1">
+      <w:hyperlink w:anchor="_Toc237700191" w:history="1">
         <w:r>
           <w:rPr>
             <w:rStyle w:val="Hipervnculo"/>
@@ -1547,7 +1547,7 @@
             <w:noProof/>
             <w:webHidden/>
           </w:rPr>
-          <w:instrText xml:space="preserve"> PAGEREF _Toc237699674 \h </w:instrText>
+          <w:instrText xml:space="preserve"> PAGEREF _Toc237700191 \h </w:instrText>
         </w:r>
         <w:r>
           <w:rPr>
@@ -1594,7 +1594,7 @@
           <w14:ligatures w14:val="standardContextual"/>
         </w:rPr>
       </w:pPr>
-      <w:hyperlink w:anchor="_Toc237699675" w:history="1">
+      <w:hyperlink w:anchor="_Toc237700192" w:history="1">
         <w:r>
           <w:rPr>
             <w:rStyle w:val="Hipervnculo"/>
@@ -1621,7 +1621,7 @@
             <w:noProof/>
             <w:webHidden/>
           </w:rPr>
-          <w:instrText xml:space="preserve"> PAGEREF _Toc237699675 \h </w:instrText>
+          <w:instrText xml:space="preserve"> PAGEREF _Toc237700192 \h </w:instrText>
         </w:r>
         <w:r>
           <w:rPr>
@@ -1668,7 +1668,7 @@
           <w14:ligatures w14:val="standardContextual"/>
         </w:rPr>
       </w:pPr>
-      <w:hyperlink w:anchor="_Toc237699676" w:history="1">
+      <w:hyperlink w:anchor="_Toc237700193" w:history="1">
         <w:r>
           <w:rPr>
             <w:rStyle w:val="Hipervnculo"/>
@@ -1695,7 +1695,7 @@
             <w:noProof/>
             <w:webHidden/>
           </w:rPr>
-          <w:instrText xml:space="preserve"> PAGEREF _Toc237699676 \h </w:instrText>
+          <w:instrText xml:space="preserve"> PAGEREF _Toc237700193 \h </w:instrText>
         </w:r>
         <w:r>
           <w:rPr>
@@ -1742,7 +1742,7 @@
           <w14:ligatures w14:val="standardContextual"/>
         </w:rPr>
       </w:pPr>
-      <w:hyperlink w:anchor="_Toc237699677" w:history="1">
+      <w:hyperlink w:anchor="_Toc237700194" w:history="1">
         <w:r>
           <w:rPr>
             <w:rStyle w:val="Hipervnculo"/>
@@ -1769,7 +1769,7 @@
             <w:noProof/>
             <w:webHidden/>
           </w:rPr>
-          <w:instrText xml:space="preserve"> PAGEREF _Toc237699677 \h </w:instrText>
+          <w:instrText xml:space="preserve"> PAGEREF _Toc237700194 \h </w:instrText>
         </w:r>
         <w:r>
           <w:rPr>
@@ -1816,7 +1816,7 @@
           <w14:ligatures w14:val="standardContextual"/>
         </w:rPr>
       </w:pPr>
-      <w:hyperlink w:anchor="_Toc237699678" w:history="1">
+      <w:hyperlink w:anchor="_Toc237700195" w:history="1">
         <w:r>
           <w:rPr>
             <w:rStyle w:val="Hipervnculo"/>
@@ -1843,7 +1843,7 @@
             <w:noProof/>
             <w:webHidden/>
           </w:rPr>
-          <w:instrText xml:space="preserve"> PAGEREF _Toc237699678 \h </w:instrText>
+          <w:instrText xml:space="preserve"> PAGEREF _Toc237700195 \h </w:instrText>
         </w:r>
         <w:r>
           <w:rPr>
@@ -1890,7 +1890,7 @@
           <w14:ligatures w14:val="standardContextual"/>
         </w:rPr>
       </w:pPr>
-      <w:hyperlink w:anchor="_Toc237699679" w:history="1">
+      <w:hyperlink w:anchor="_Toc237700196" w:history="1">
         <w:r>
           <w:rPr>
             <w:rStyle w:val="Hipervnculo"/>
@@ -1917,7 +1917,7 @@
             <w:noProof/>
             <w:webHidden/>
           </w:rPr>
-          <w:instrText xml:space="preserve"> PAGEREF _Toc237699679 \h </w:instrText>
+          <w:instrText xml:space="preserve"> PAGEREF _Toc237700196 \h </w:instrText>
         </w:r>
         <w:r>
           <w:rPr>
@@ -1964,7 +1964,7 @@
           <w14:ligatures w14:val="standardContextual"/>
         </w:rPr>
       </w:pPr>
-      <w:hyperlink w:anchor="_Toc237699680" w:history="1">
+      <w:hyperlink w:anchor="_Toc237700197" w:history="1">
         <w:r>
           <w:rPr>
             <w:rStyle w:val="Hipervnculo"/>
@@ -1991,7 +1991,7 @@
             <w:noProof/>
             <w:webHidden/>
           </w:rPr>
-          <w:instrText xml:space="preserve"> PAGEREF _Toc237699680 \h </w:instrText>
+          <w:instrText xml:space="preserve"> PAGEREF _Toc237700197 \h </w:instrText>
         </w:r>
         <w:r>
           <w:rPr>
@@ -2038,7 +2038,7 @@
           <w14:ligatures w14:val="standardContextual"/>
         </w:rPr>
       </w:pPr>
-      <w:hyperlink w:anchor="_Toc237699681" w:history="1">
+      <w:hyperlink w:anchor="_Toc237700198" w:history="1">
         <w:r>
           <w:rPr>
             <w:rStyle w:val="Hipervnculo"/>
@@ -2065,7 +2065,7 @@
             <w:noProof/>
             <w:webHidden/>
           </w:rPr>
-          <w:instrText xml:space="preserve"> PAGEREF _Toc237699681 \h </w:instrText>
+          <w:instrText xml:space="preserve"> PAGEREF _Toc237700198 \h </w:instrText>
         </w:r>
         <w:r>
           <w:rPr>
@@ -2112,7 +2112,7 @@
           <w14:ligatures w14:val="standardContextual"/>
         </w:rPr>
       </w:pPr>
-      <w:hyperlink w:anchor="_Toc237699682" w:history="1">
+      <w:hyperlink w:anchor="_Toc237700199" w:history="1">
         <w:r>
           <w:rPr>
             <w:rStyle w:val="Hipervnculo"/>
@@ -2139,7 +2139,7 @@
             <w:noProof/>
             <w:webHidden/>
           </w:rPr>
-          <w:instrText xml:space="preserve"> PAGEREF _Toc237699682 \h </w:instrText>
+          <w:instrText xml:space="preserve"> PAGEREF _Toc237700199 \h </w:instrText>
         </w:r>
         <w:r>
           <w:rPr>
@@ -2186,7 +2186,7 @@
           <w14:ligatures w14:val="standardContextual"/>
         </w:rPr>
       </w:pPr>
-      <w:hyperlink w:anchor="_Toc237699683" w:history="1">
+      <w:hyperlink w:anchor="_Toc237700200" w:history="1">
         <w:r>
           <w:rPr>
             <w:rStyle w:val="Hipervnculo"/>
@@ -2213,7 +2213,7 @@
             <w:noProof/>
             <w:webHidden/>
           </w:rPr>
-          <w:instrText xml:space="preserve"> PAGEREF _Toc237699683 \h </w:instrText>
+          <w:instrText xml:space="preserve"> PAGEREF _Toc237700200 \h </w:instrText>
         </w:r>
         <w:r>
           <w:rPr>
@@ -2260,7 +2260,7 @@
           <w14:ligatures w14:val="standardContextual"/>
         </w:rPr>
       </w:pPr>
-      <w:hyperlink w:anchor="_Toc237699684" w:history="1">
+      <w:hyperlink w:anchor="_Toc237700201" w:history="1">
         <w:r>
           <w:rPr>
             <w:rStyle w:val="Hipervnculo"/>
@@ -2287,7 +2287,7 @@
             <w:noProof/>
             <w:webHidden/>
           </w:rPr>
-          <w:instrText xml:space="preserve"> PAGEREF _Toc237699684 \h </w:instrText>
+          <w:instrText xml:space="preserve"> PAGEREF _Toc237700201 \h </w:instrText>
         </w:r>
         <w:r>
           <w:rPr>
@@ -2334,7 +2334,7 @@
           <w14:ligatures w14:val="standardContextual"/>
         </w:rPr>
       </w:pPr>
-      <w:hyperlink w:anchor="_Toc237699685" w:history="1">
+      <w:hyperlink w:anchor="_Toc237700202" w:history="1">
         <w:r>
           <w:rPr>
             <w:rStyle w:val="Hipervnculo"/>
@@ -2361,7 +2361,7 @@
             <w:noProof/>
             <w:webHidden/>
           </w:rPr>
-          <w:instrText xml:space="preserve"> PAGEREF _Toc237699685 \h </w:instrText>
+          <w:instrText xml:space="preserve"> PAGEREF _Toc237700202 \h </w:instrText>
         </w:r>
         <w:r>
           <w:rPr>
@@ -2408,7 +2408,7 @@
           <w14:ligatures w14:val="standardContextual"/>
         </w:rPr>
       </w:pPr>
-      <w:hyperlink w:anchor="_Toc237699686" w:history="1">
+      <w:hyperlink w:anchor="_Toc237700203" w:history="1">
         <w:r>
           <w:rPr>
             <w:rStyle w:val="Hipervnculo"/>
@@ -2435,7 +2435,7 @@
             <w:noProof/>
             <w:webHidden/>
           </w:rPr>
-          <w:instrText xml:space="preserve"> PAGEREF _Toc237699686 \h </w:instrText>
+          <w:instrText xml:space="preserve"> PAGEREF _Toc237700203 \h </w:instrText>
         </w:r>
         <w:r>
           <w:rPr>
@@ -2482,7 +2482,7 @@
           <w14:ligatures w14:val="standardContextual"/>
         </w:rPr>
       </w:pPr>
-      <w:hyperlink w:anchor="_Toc237699687" w:history="1">
+      <w:hyperlink w:anchor="_Toc237700204" w:history="1">
         <w:r>
           <w:rPr>
             <w:rStyle w:val="Hipervnculo"/>
@@ -2509,7 +2509,7 @@
             <w:noProof/>
             <w:webHidden/>
           </w:rPr>
-          <w:instrText xml:space="preserve"> PAGEREF _Toc237699687 \h </w:instrText>
+          <w:instrText xml:space="preserve"> PAGEREF _Toc237700204 \h </w:instrText>
         </w:r>
         <w:r>
           <w:rPr>
@@ -2556,7 +2556,7 @@
           <w14:ligatures w14:val="standardContextual"/>
         </w:rPr>
       </w:pPr>
-      <w:hyperlink w:anchor="_Toc237699688" w:history="1">
+      <w:hyperlink w:anchor="_Toc237700205" w:history="1">
         <w:r>
           <w:rPr>
             <w:rStyle w:val="Hipervnculo"/>
@@ -2583,7 +2583,7 @@
             <w:noProof/>
             <w:webHidden/>
           </w:rPr>
-          <w:instrText xml:space="preserve"> PAGEREF _Toc237699688 \h </w:instrText>
+          <w:instrText xml:space="preserve"> PAGEREF _Toc237700205 \h </w:instrText>
         </w:r>
         <w:r>
           <w:rPr>
@@ -2630,7 +2630,7 @@
           <w14:ligatures w14:val="standardContextual"/>
         </w:rPr>
       </w:pPr>
-      <w:hyperlink w:anchor="_Toc237699689" w:history="1">
+      <w:hyperlink w:anchor="_Toc237700206" w:history="1">
         <w:r>
           <w:rPr>
             <w:rStyle w:val="Hipervnculo"/>
@@ -2657,7 +2657,7 @@
             <w:noProof/>
             <w:webHidden/>
           </w:rPr>
-          <w:instrText xml:space="preserve"> PAGEREF _Toc237699689 \h </w:instrText>
+          <w:instrText xml:space="preserve"> PAGEREF _Toc237700206 \h </w:instrText>
         </w:r>
         <w:r>
           <w:rPr>
@@ -2704,7 +2704,7 @@
           <w14:ligatures w14:val="standardContextual"/>
         </w:rPr>
       </w:pPr>
-      <w:hyperlink w:anchor="_Toc237699690" w:history="1">
+      <w:hyperlink w:anchor="_Toc237700207" w:history="1">
         <w:r>
           <w:rPr>
             <w:rStyle w:val="Hipervnculo"/>
@@ -2731,7 +2731,7 @@
             <w:noProof/>
             <w:webHidden/>
           </w:rPr>
-          <w:instrText xml:space="preserve"> PAGEREF _Toc237699690 \h </w:instrText>
+          <w:instrText xml:space="preserve"> PAGEREF _Toc237700207 \h </w:instrText>
         </w:r>
         <w:r>
           <w:rPr>
@@ -2778,7 +2778,7 @@
           <w14:ligatures w14:val="standardContextual"/>
         </w:rPr>
       </w:pPr>
-      <w:hyperlink w:anchor="_Toc237699691" w:history="1">
+      <w:hyperlink w:anchor="_Toc237700208" w:history="1">
         <w:r>
           <w:rPr>
             <w:rStyle w:val="Hipervnculo"/>
@@ -2805,7 +2805,7 @@
             <w:noProof/>
             <w:webHidden/>
           </w:rPr>
-          <w:instrText xml:space="preserve"> PAGEREF _Toc237699691 \h </w:instrText>
+          <w:instrText xml:space="preserve"> PAGEREF _Toc237700208 \h </w:instrText>
         </w:r>
         <w:r>
           <w:rPr>
@@ -2852,7 +2852,7 @@
           <w14:ligatures w14:val="standardContextual"/>
         </w:rPr>
       </w:pPr>
-      <w:hyperlink w:anchor="_Toc237699692" w:history="1">
+      <w:hyperlink w:anchor="_Toc237700209" w:history="1">
         <w:r>
           <w:rPr>
             <w:rStyle w:val="Hipervnculo"/>
@@ -2879,7 +2879,7 @@
             <w:noProof/>
             <w:webHidden/>
           </w:rPr>
-          <w:instrText xml:space="preserve"> PAGEREF _Toc237699692 \h </w:instrText>
+          <w:instrText xml:space="preserve"> PAGEREF _Toc237700209 \h </w:instrText>
         </w:r>
         <w:r>
           <w:rPr>
@@ -2926,7 +2926,7 @@
           <w14:ligatures w14:val="standardContextual"/>
         </w:rPr>
       </w:pPr>
-      <w:hyperlink w:anchor="_Toc237699693" w:history="1">
+      <w:hyperlink w:anchor="_Toc237700210" w:history="1">
         <w:r>
           <w:rPr>
             <w:rStyle w:val="Hipervnculo"/>
@@ -2983,7 +2983,7 @@
             <w:noProof/>
             <w:webHidden/>
           </w:rPr>
-          <w:instrText xml:space="preserve"> PAGEREF _Toc237699693 \h </w:instrText>
+          <w:instrText xml:space="preserve"> PAGEREF _Toc237700210 \h </w:instrText>
         </w:r>
         <w:r>
           <w:rPr>
@@ -3030,7 +3030,7 @@
           <w14:ligatures w14:val="standardContextual"/>
         </w:rPr>
       </w:pPr>
-      <w:hyperlink w:anchor="_Toc237699694" w:history="1">
+      <w:hyperlink w:anchor="_Toc237700211" w:history="1">
         <w:r>
           <w:rPr>
             <w:rStyle w:val="Hipervnculo"/>
@@ -3057,7 +3057,7 @@
             <w:noProof/>
             <w:webHidden/>
           </w:rPr>
-          <w:instrText xml:space="preserve"> PAGEREF _Toc237699694 \h </w:instrText>
+          <w:instrText xml:space="preserve"> PAGEREF _Toc237700211 \h </w:instrText>
         </w:r>
         <w:r>
           <w:rPr>
@@ -3104,7 +3104,7 @@
           <w14:ligatures w14:val="standardContextual"/>
         </w:rPr>
       </w:pPr>
-      <w:hyperlink w:anchor="_Toc237699695" w:history="1">
+      <w:hyperlink w:anchor="_Toc237700212" w:history="1">
         <w:r>
           <w:rPr>
             <w:rStyle w:val="Hipervnculo"/>
@@ -3131,7 +3131,7 @@
             <w:noProof/>
             <w:webHidden/>
           </w:rPr>
-          <w:instrText xml:space="preserve"> PAGEREF _Toc237699695 \h </w:instrText>
+          <w:instrText xml:space="preserve"> PAGEREF _Toc237700212 \h </w:instrText>
         </w:r>
         <w:r>
           <w:rPr>
@@ -3178,7 +3178,7 @@
           <w14:ligatures w14:val="standardContextual"/>
         </w:rPr>
       </w:pPr>
-      <w:hyperlink w:anchor="_Toc237699696" w:history="1">
+      <w:hyperlink w:anchor="_Toc237700213" w:history="1">
         <w:r>
           <w:rPr>
             <w:rStyle w:val="Hipervnculo"/>
@@ -3205,7 +3205,7 @@
             <w:noProof/>
             <w:webHidden/>
           </w:rPr>
-          <w:instrText xml:space="preserve"> PAGEREF _Toc237699696 \h </w:instrText>
+          <w:instrText xml:space="preserve"> PAGEREF _Toc237700213 \h </w:instrText>
         </w:r>
         <w:r>
           <w:rPr>
@@ -3252,7 +3252,7 @@
           <w14:ligatures w14:val="standardContextual"/>
         </w:rPr>
       </w:pPr>
-      <w:hyperlink w:anchor="_Toc237699697" w:history="1">
+      <w:hyperlink w:anchor="_Toc237700214" w:history="1">
         <w:r>
           <w:rPr>
             <w:rStyle w:val="Hipervnculo"/>
@@ -3279,7 +3279,7 @@
             <w:noProof/>
             <w:webHidden/>
           </w:rPr>
-          <w:instrText xml:space="preserve"> PAGEREF _Toc237699697 \h </w:instrText>
+          <w:instrText xml:space="preserve"> PAGEREF _Toc237700214 \h </w:instrText>
         </w:r>
         <w:r>
           <w:rPr>
@@ -3326,7 +3326,7 @@
           <w14:ligatures w14:val="standardContextual"/>
         </w:rPr>
       </w:pPr>
-      <w:hyperlink w:anchor="_Toc237699698" w:history="1">
+      <w:hyperlink w:anchor="_Toc237700215" w:history="1">
         <w:r>
           <w:rPr>
             <w:rStyle w:val="Hipervnculo"/>
@@ -3353,7 +3353,7 @@
             <w:noProof/>
             <w:webHidden/>
           </w:rPr>
-          <w:instrText xml:space="preserve"> PAGEREF _Toc237699698 \h </w:instrText>
+          <w:instrText xml:space="preserve"> PAGEREF _Toc237700215 \h </w:instrText>
         </w:r>
         <w:r>
           <w:rPr>
@@ -3400,7 +3400,7 @@
           <w14:ligatures w14:val="standardContextual"/>
         </w:rPr>
       </w:pPr>
-      <w:hyperlink w:anchor="_Toc237699699" w:history="1">
+      <w:hyperlink w:anchor="_Toc237700216" w:history="1">
         <w:r>
           <w:rPr>
             <w:rStyle w:val="Hipervnculo"/>
@@ -3427,7 +3427,7 @@
             <w:noProof/>
             <w:webHidden/>
           </w:rPr>
-          <w:instrText xml:space="preserve"> PAGEREF _Toc237699699 \h </w:instrText>
+          <w:instrText xml:space="preserve"> PAGEREF _Toc237700216 \h </w:instrText>
         </w:r>
         <w:r>
           <w:rPr>
@@ -3474,7 +3474,7 @@
           <w14:ligatures w14:val="standardContextual"/>
         </w:rPr>
       </w:pPr>
-      <w:hyperlink w:anchor="_Toc237699700" w:history="1">
+      <w:hyperlink w:anchor="_Toc237700217" w:history="1">
         <w:r>
           <w:rPr>
             <w:rStyle w:val="Hipervnculo"/>
@@ -3501,7 +3501,7 @@
             <w:noProof/>
             <w:webHidden/>
           </w:rPr>
-          <w:instrText xml:space="preserve"> PAGEREF _Toc237699700 \h </w:instrText>
+          <w:instrText xml:space="preserve"> PAGEREF _Toc237700217 \h </w:instrText>
         </w:r>
         <w:r>
           <w:rPr>
@@ -3548,7 +3548,7 @@
           <w14:ligatures w14:val="standardContextual"/>
         </w:rPr>
       </w:pPr>
-      <w:hyperlink w:anchor="_Toc237699701" w:history="1">
+      <w:hyperlink w:anchor="_Toc237700218" w:history="1">
         <w:r>
           <w:rPr>
             <w:rStyle w:val="Hipervnculo"/>
@@ -3575,7 +3575,7 @@
             <w:noProof/>
             <w:webHidden/>
           </w:rPr>
-          <w:instrText xml:space="preserve"> PAGEREF _Toc237699701 \h </w:instrText>
+          <w:instrText xml:space="preserve"> PAGEREF _Toc237700218 \h </w:instrText>
         </w:r>
         <w:r>
           <w:rPr>
@@ -3622,7 +3622,7 @@
           <w14:ligatures w14:val="standardContextual"/>
         </w:rPr>
       </w:pPr>
-      <w:hyperlink w:anchor="_Toc237699702" w:history="1">
+      <w:hyperlink w:anchor="_Toc237700219" w:history="1">
         <w:r>
           <w:rPr>
             <w:rStyle w:val="Hipervnculo"/>
@@ -3649,7 +3649,7 @@
             <w:noProof/>
             <w:webHidden/>
           </w:rPr>
-          <w:instrText xml:space="preserve"> PAGEREF _Toc237699702 \h </w:instrText>
+          <w:instrText xml:space="preserve"> PAGEREF _Toc237700219 \h </w:instrText>
         </w:r>
         <w:r>
           <w:rPr>
@@ -3696,7 +3696,7 @@
           <w14:ligatures w14:val="standardContextual"/>
         </w:rPr>
       </w:pPr>
-      <w:hyperlink w:anchor="_Toc237699703" w:history="1">
+      <w:hyperlink w:anchor="_Toc237700220" w:history="1">
         <w:r>
           <w:rPr>
             <w:rStyle w:val="Hipervnculo"/>
@@ -3723,7 +3723,7 @@
             <w:noProof/>
             <w:webHidden/>
           </w:rPr>
-          <w:instrText xml:space="preserve"> PAGEREF _Toc237699703 \h </w:instrText>
+          <w:instrText xml:space="preserve"> PAGEREF _Toc237700220 \h </w:instrText>
         </w:r>
         <w:r>
           <w:rPr>
@@ -3770,7 +3770,7 @@
           <w14:ligatures w14:val="standardContextual"/>
         </w:rPr>
       </w:pPr>
-      <w:hyperlink w:anchor="_Toc237699704" w:history="1">
+      <w:hyperlink w:anchor="_Toc237700221" w:history="1">
         <w:r>
           <w:rPr>
             <w:rStyle w:val="Hipervnculo"/>
@@ -3797,7 +3797,7 @@
             <w:noProof/>
             <w:webHidden/>
           </w:rPr>
-          <w:instrText xml:space="preserve"> PAGEREF _Toc237699704 \h </w:instrText>
+          <w:instrText xml:space="preserve"> PAGEREF _Toc237700221 \h </w:instrText>
         </w:r>
         <w:r>
           <w:rPr>
@@ -3844,7 +3844,7 @@
           <w14:ligatures w14:val="standardContextual"/>
         </w:rPr>
       </w:pPr>
-      <w:hyperlink w:anchor="_Toc237699705" w:history="1">
+      <w:hyperlink w:anchor="_Toc237700222" w:history="1">
         <w:r>
           <w:rPr>
             <w:rStyle w:val="Hipervnculo"/>
@@ -3871,7 +3871,7 @@
             <w:noProof/>
             <w:webHidden/>
           </w:rPr>
-          <w:instrText xml:space="preserve"> PAGEREF _Toc237699705 \h </w:instrText>
+          <w:instrText xml:space="preserve"> PAGEREF _Toc237700222 \h </w:instrText>
         </w:r>
         <w:r>
           <w:rPr>
@@ -3918,7 +3918,7 @@
           <w14:ligatures w14:val="standardContextual"/>
         </w:rPr>
       </w:pPr>
-      <w:hyperlink w:anchor="_Toc237699706" w:history="1">
+      <w:hyperlink w:anchor="_Toc237700223" w:history="1">
         <w:r>
           <w:rPr>
             <w:rStyle w:val="Hipervnculo"/>
@@ -3945,7 +3945,7 @@
             <w:noProof/>
             <w:webHidden/>
           </w:rPr>
-          <w:instrText xml:space="preserve"> PAGEREF _Toc237699706 \h </w:instrText>
+          <w:instrText xml:space="preserve"> PAGEREF _Toc237700223 \h </w:instrText>
         </w:r>
         <w:r>
           <w:rPr>
@@ -3992,7 +3992,7 @@
           <w14:ligatures w14:val="standardContextual"/>
         </w:rPr>
       </w:pPr>
-      <w:hyperlink w:anchor="_Toc237699707" w:history="1">
+      <w:hyperlink w:anchor="_Toc237700224" w:history="1">
         <w:r>
           <w:rPr>
             <w:rStyle w:val="Hipervnculo"/>
@@ -4019,7 +4019,7 @@
             <w:noProof/>
             <w:webHidden/>
           </w:rPr>
-          <w:instrText xml:space="preserve"> PAGEREF _Toc237699707 \h </w:instrText>
+          <w:instrText xml:space="preserve"> PAGEREF _Toc237700224 \h </w:instrText>
         </w:r>
         <w:r>
           <w:rPr>
@@ -4066,7 +4066,7 @@
           <w14:ligatures w14:val="standardContextual"/>
         </w:rPr>
       </w:pPr>
-      <w:hyperlink w:anchor="_Toc237699708" w:history="1">
+      <w:hyperlink w:anchor="_Toc237700225" w:history="1">
         <w:r>
           <w:rPr>
             <w:rStyle w:val="Hipervnculo"/>
@@ -4093,7 +4093,7 @@
             <w:noProof/>
             <w:webHidden/>
           </w:rPr>
-          <w:instrText xml:space="preserve"> PAGEREF _Toc237699708 \h </w:instrText>
+          <w:instrText xml:space="preserve"> PAGEREF _Toc237700225 \h </w:instrText>
         </w:r>
         <w:r>
           <w:rPr>
@@ -4140,7 +4140,7 @@
           <w14:ligatures w14:val="standardContextual"/>
         </w:rPr>
       </w:pPr>
-      <w:hyperlink w:anchor="_Toc237699709" w:history="1">
+      <w:hyperlink w:anchor="_Toc237700226" w:history="1">
         <w:r>
           <w:rPr>
             <w:rStyle w:val="Hipervnculo"/>
@@ -4167,7 +4167,7 @@
             <w:noProof/>
             <w:webHidden/>
           </w:rPr>
-          <w:instrText xml:space="preserve"> PAGEREF _Toc237699709 \h </w:instrText>
+          <w:instrText xml:space="preserve"> PAGEREF _Toc237700226 \h </w:instrText>
         </w:r>
         <w:r>
           <w:rPr>
@@ -4214,7 +4214,7 @@
           <w14:ligatures w14:val="standardContextual"/>
         </w:rPr>
       </w:pPr>
-      <w:hyperlink w:anchor="_Toc237699710" w:history="1">
+      <w:hyperlink w:anchor="_Toc237700227" w:history="1">
         <w:r>
           <w:rPr>
             <w:rStyle w:val="Hipervnculo"/>
@@ -4241,7 +4241,7 @@
             <w:noProof/>
             <w:webHidden/>
           </w:rPr>
-          <w:instrText xml:space="preserve"> PAGEREF _Toc237699710 \h </w:instrText>
+          <w:instrText xml:space="preserve"> PAGEREF _Toc237700227 \h </w:instrText>
         </w:r>
         <w:r>
           <w:rPr>
@@ -4288,7 +4288,7 @@
           <w14:ligatures w14:val="standardContextual"/>
         </w:rPr>
       </w:pPr>
-      <w:hyperlink w:anchor="_Toc237699711" w:history="1">
+      <w:hyperlink w:anchor="_Toc237700228" w:history="1">
         <w:r>
           <w:rPr>
             <w:rStyle w:val="Hipervnculo"/>
@@ -4315,7 +4315,7 @@
             <w:noProof/>
             <w:webHidden/>
           </w:rPr>
-          <w:instrText xml:space="preserve"> PAGEREF _Toc237699711 \h </w:instrText>
+          <w:instrText xml:space="preserve"> PAGEREF _Toc237700228 \h </w:instrText>
         </w:r>
         <w:r>
           <w:rPr>
@@ -4362,7 +4362,7 @@
           <w14:ligatures w14:val="standardContextual"/>
         </w:rPr>
       </w:pPr>
-      <w:hyperlink w:anchor="_Toc237699712" w:history="1">
+      <w:hyperlink w:anchor="_Toc237700229" w:history="1">
         <w:r>
           <w:rPr>
             <w:rStyle w:val="Hipervnculo"/>
@@ -4389,7 +4389,7 @@
             <w:noProof/>
             <w:webHidden/>
           </w:rPr>
-          <w:instrText xml:space="preserve"> PAGEREF _Toc237699712 \h </w:instrText>
+          <w:instrText xml:space="preserve"> PAGEREF _Toc237700229 \h </w:instrText>
         </w:r>
         <w:r>
           <w:rPr>
@@ -4436,7 +4436,7 @@
           <w14:ligatures w14:val="standardContextual"/>
         </w:rPr>
       </w:pPr>
-      <w:hyperlink w:anchor="_Toc237699713" w:history="1">
+      <w:hyperlink w:anchor="_Toc237700230" w:history="1">
         <w:r>
           <w:rPr>
             <w:rStyle w:val="Hipervnculo"/>
@@ -4463,7 +4463,7 @@
             <w:noProof/>
             <w:webHidden/>
           </w:rPr>
-          <w:instrText xml:space="preserve"> PAGEREF _Toc237699713 \h </w:instrText>
+          <w:instrText xml:space="preserve"> PAGEREF _Toc237700230 \h </w:instrText>
         </w:r>
         <w:r>
           <w:rPr>
@@ -4510,7 +4510,7 @@
           <w14:ligatures w14:val="standardContextual"/>
         </w:rPr>
       </w:pPr>
-      <w:hyperlink w:anchor="_Toc237699714" w:history="1">
+      <w:hyperlink w:anchor="_Toc237700231" w:history="1">
         <w:r>
           <w:rPr>
             <w:rStyle w:val="Hipervnculo"/>
@@ -4537,7 +4537,7 @@
             <w:noProof/>
             <w:webHidden/>
           </w:rPr>
-          <w:instrText xml:space="preserve"> PAGEREF _Toc237699714 \h </w:instrText>
+          <w:instrText xml:space="preserve"> PAGEREF _Toc237700231 \h </w:instrText>
         </w:r>
         <w:r>
           <w:rPr>
@@ -4584,7 +4584,7 @@
           <w14:ligatures w14:val="standardContextual"/>
         </w:rPr>
       </w:pPr>
-      <w:hyperlink w:anchor="_Toc237699715" w:history="1">
+      <w:hyperlink w:anchor="_Toc237700232" w:history="1">
         <w:r>
           <w:rPr>
             <w:rStyle w:val="Hipervnculo"/>
@@ -4611,7 +4611,7 @@
             <w:noProof/>
             <w:webHidden/>
           </w:rPr>
-          <w:instrText xml:space="preserve"> PAGEREF _Toc237699715 \h </w:instrText>
+          <w:instrText xml:space="preserve"> PAGEREF _Toc237700232 \h </w:instrText>
         </w:r>
         <w:r>
           <w:rPr>
@@ -4658,7 +4658,7 @@
           <w14:ligatures w14:val="standardContextual"/>
         </w:rPr>
       </w:pPr>
-      <w:hyperlink w:anchor="_Toc237699716" w:history="1">
+      <w:hyperlink w:anchor="_Toc237700233" w:history="1">
         <w:r>
           <w:rPr>
             <w:rStyle w:val="Hipervnculo"/>
@@ -4685,7 +4685,7 @@
             <w:noProof/>
             <w:webHidden/>
           </w:rPr>
-          <w:instrText xml:space="preserve"> PAGEREF _Toc237699716 \h </w:instrText>
+          <w:instrText xml:space="preserve"> PAGEREF _Toc237700233 \h </w:instrText>
         </w:r>
         <w:r>
           <w:rPr>
@@ -4732,7 +4732,7 @@
           <w14:ligatures w14:val="standardContextual"/>
         </w:rPr>
       </w:pPr>
-      <w:hyperlink w:anchor="_Toc237699717" w:history="1">
+      <w:hyperlink w:anchor="_Toc237700234" w:history="1">
         <w:r>
           <w:rPr>
             <w:rStyle w:val="Hipervnculo"/>
@@ -4759,7 +4759,7 @@
             <w:noProof/>
             <w:webHidden/>
           </w:rPr>
-          <w:instrText xml:space="preserve"> PAGEREF _Toc237699717 \h </w:instrText>
+          <w:instrText xml:space="preserve"> PAGEREF _Toc237700234 \h </w:instrText>
         </w:r>
         <w:r>
           <w:rPr>
@@ -4806,7 +4806,7 @@
           <w14:ligatures w14:val="standardContextual"/>
         </w:rPr>
       </w:pPr>
-      <w:hyperlink w:anchor="_Toc237699718" w:history="1">
+      <w:hyperlink w:anchor="_Toc237700235" w:history="1">
         <w:r>
           <w:rPr>
             <w:rStyle w:val="Hipervnculo"/>
@@ -4833,7 +4833,7 @@
             <w:noProof/>
             <w:webHidden/>
           </w:rPr>
-          <w:instrText xml:space="preserve"> PAGEREF _Toc237699718 \h </w:instrText>
+          <w:instrText xml:space="preserve"> PAGEREF _Toc237700235 \h </w:instrText>
         </w:r>
         <w:r>
           <w:rPr>
@@ -4880,7 +4880,7 @@
           <w14:ligatures w14:val="standardContextual"/>
         </w:rPr>
       </w:pPr>
-      <w:hyperlink w:anchor="_Toc237699719" w:history="1">
+      <w:hyperlink w:anchor="_Toc237700236" w:history="1">
         <w:r>
           <w:rPr>
             <w:rStyle w:val="Hipervnculo"/>
@@ -4907,7 +4907,7 @@
             <w:noProof/>
             <w:webHidden/>
           </w:rPr>
-          <w:instrText xml:space="preserve"> PAGEREF _Toc237699719 \h </w:instrText>
+          <w:instrText xml:space="preserve"> PAGEREF _Toc237700236 \h </w:instrText>
         </w:r>
         <w:r>
           <w:rPr>
@@ -4954,7 +4954,7 @@
           <w14:ligatures w14:val="standardContextual"/>
         </w:rPr>
       </w:pPr>
-      <w:hyperlink w:anchor="_Toc237699720" w:history="1">
+      <w:hyperlink w:anchor="_Toc237700237" w:history="1">
         <w:r>
           <w:rPr>
             <w:rStyle w:val="Hipervnculo"/>
@@ -4981,7 +4981,7 @@
             <w:noProof/>
             <w:webHidden/>
           </w:rPr>
-          <w:instrText xml:space="preserve"> PAGEREF _Toc237699720 \h </w:instrText>
+          <w:instrText xml:space="preserve"> PAGEREF _Toc237700237 \h </w:instrText>
         </w:r>
         <w:r>
           <w:rPr>
@@ -5028,7 +5028,7 @@
           <w14:ligatures w14:val="standardContextual"/>
         </w:rPr>
       </w:pPr>
-      <w:hyperlink w:anchor="_Toc237699721" w:history="1">
+      <w:hyperlink w:anchor="_Toc237700238" w:history="1">
         <w:r>
           <w:rPr>
             <w:rStyle w:val="Hipervnculo"/>
@@ -5055,7 +5055,7 @@
             <w:noProof/>
             <w:webHidden/>
           </w:rPr>
-          <w:instrText xml:space="preserve"> PAGEREF _Toc237699721 \h </w:instrText>
+          <w:instrText xml:space="preserve"> PAGEREF _Toc237700238 \h </w:instrText>
         </w:r>
         <w:r>
           <w:rPr>
@@ -5102,7 +5102,7 @@
           <w14:ligatures w14:val="standardContextual"/>
         </w:rPr>
       </w:pPr>
-      <w:hyperlink w:anchor="_Toc237699722" w:history="1">
+      <w:hyperlink w:anchor="_Toc237700239" w:history="1">
         <w:r>
           <w:rPr>
             <w:rStyle w:val="Hipervnculo"/>
@@ -5129,7 +5129,7 @@
             <w:noProof/>
             <w:webHidden/>
           </w:rPr>
-          <w:instrText xml:space="preserve"> PAGEREF _Toc237699722 \h </w:instrText>
+          <w:instrText xml:space="preserve"> PAGEREF _Toc237700239 \h </w:instrText>
         </w:r>
         <w:r>
           <w:rPr>
@@ -5176,7 +5176,7 @@
           <w14:ligatures w14:val="standardContextual"/>
         </w:rPr>
       </w:pPr>
-      <w:hyperlink w:anchor="_Toc237699723" w:history="1">
+      <w:hyperlink w:anchor="_Toc237700240" w:history="1">
         <w:r>
           <w:rPr>
             <w:rStyle w:val="Hipervnculo"/>
@@ -5203,7 +5203,7 @@
             <w:noProof/>
             <w:webHidden/>
           </w:rPr>
-          <w:instrText xml:space="preserve"> PAGEREF _Toc237699723 \h </w:instrText>
+          <w:instrText xml:space="preserve"> PAGEREF _Toc237700240 \h </w:instrText>
         </w:r>
         <w:r>
           <w:rPr>
@@ -5250,7 +5250,7 @@
           <w14:ligatures w14:val="standardContextual"/>
         </w:rPr>
       </w:pPr>
-      <w:hyperlink w:anchor="_Toc237699724" w:history="1">
+      <w:hyperlink w:anchor="_Toc237700241" w:history="1">
         <w:r>
           <w:rPr>
             <w:rStyle w:val="Hipervnculo"/>
@@ -5277,7 +5277,7 @@
             <w:noProof/>
             <w:webHidden/>
           </w:rPr>
-          <w:instrText xml:space="preserve"> PAGEREF _Toc237699724 \h </w:instrText>
+          <w:instrText xml:space="preserve"> PAGEREF _Toc237700241 \h </w:instrText>
         </w:r>
         <w:r>
           <w:rPr>
@@ -5324,7 +5324,7 @@
           <w14:ligatures w14:val="standardContextual"/>
         </w:rPr>
       </w:pPr>
-      <w:hyperlink w:anchor="_Toc237699725" w:history="1">
+      <w:hyperlink w:anchor="_Toc237700242" w:history="1">
         <w:r>
           <w:rPr>
             <w:rStyle w:val="Hipervnculo"/>
@@ -5351,7 +5351,7 @@
             <w:noProof/>
             <w:webHidden/>
           </w:rPr>
-          <w:instrText xml:space="preserve"> PAGEREF _Toc237699725 \h </w:instrText>
+          <w:instrText xml:space="preserve"> PAGEREF _Toc237700242 \h </w:instrText>
         </w:r>
         <w:r>
           <w:rPr>
@@ -5398,7 +5398,7 @@
           <w14:ligatures w14:val="standardContextual"/>
         </w:rPr>
       </w:pPr>
-      <w:hyperlink w:anchor="_Toc237699726" w:history="1">
+      <w:hyperlink w:anchor="_Toc237700243" w:history="1">
         <w:r>
           <w:rPr>
             <w:rStyle w:val="Hipervnculo"/>
@@ -5425,7 +5425,7 @@
             <w:noProof/>
             <w:webHidden/>
           </w:rPr>
-          <w:instrText xml:space="preserve"> PAGEREF _Toc237699726 \h </w:instrText>
+          <w:instrText xml:space="preserve"> PAGEREF _Toc237700243 \h </w:instrText>
         </w:r>
         <w:r>
           <w:rPr>
@@ -5472,7 +5472,7 @@
           <w14:ligatures w14:val="standardContextual"/>
         </w:rPr>
       </w:pPr>
-      <w:hyperlink w:anchor="_Toc237699727" w:history="1">
+      <w:hyperlink w:anchor="_Toc237700244" w:history="1">
         <w:r>
           <w:rPr>
             <w:rStyle w:val="Hipervnculo"/>
@@ -5499,7 +5499,7 @@
             <w:noProof/>
             <w:webHidden/>
           </w:rPr>
-          <w:instrText xml:space="preserve"> PAGEREF _Toc237699727 \h </w:instrText>
+          <w:instrText xml:space="preserve"> PAGEREF _Toc237700244 \h </w:instrText>
         </w:r>
         <w:r>
           <w:rPr>
@@ -5546,7 +5546,7 @@
           <w14:ligatures w14:val="standardContextual"/>
         </w:rPr>
       </w:pPr>
-      <w:hyperlink w:anchor="_Toc237699728" w:history="1">
+      <w:hyperlink w:anchor="_Toc237700245" w:history="1">
         <w:r>
           <w:rPr>
             <w:rStyle w:val="Hipervnculo"/>
@@ -5573,7 +5573,7 @@
             <w:noProof/>
             <w:webHidden/>
           </w:rPr>
-          <w:instrText xml:space="preserve"> PAGEREF _Toc237699728 \h </w:instrText>
+          <w:instrText xml:space="preserve"> PAGEREF _Toc237700245 \h </w:instrText>
         </w:r>
         <w:r>
           <w:rPr>
@@ -5620,7 +5620,7 @@
           <w14:ligatures w14:val="standardContextual"/>
         </w:rPr>
       </w:pPr>
-      <w:hyperlink w:anchor="_Toc237699729" w:history="1">
+      <w:hyperlink w:anchor="_Toc237700246" w:history="1">
         <w:r>
           <w:rPr>
             <w:rStyle w:val="Hipervnculo"/>
@@ -5647,7 +5647,7 @@
             <w:noProof/>
             <w:webHidden/>
           </w:rPr>
-          <w:instrText xml:space="preserve"> PAGEREF _Toc237699729 \h </w:instrText>
+          <w:instrText xml:space="preserve"> PAGEREF _Toc237700246 \h </w:instrText>
         </w:r>
         <w:r>
           <w:rPr>
@@ -5694,7 +5694,7 @@
           <w14:ligatures w14:val="standardContextual"/>
         </w:rPr>
       </w:pPr>
-      <w:hyperlink w:anchor="_Toc237699730" w:history="1">
+      <w:hyperlink w:anchor="_Toc237700247" w:history="1">
         <w:r>
           <w:rPr>
             <w:rStyle w:val="Hipervnculo"/>
@@ -5721,7 +5721,7 @@
             <w:noProof/>
             <w:webHidden/>
           </w:rPr>
-          <w:instrText xml:space="preserve"> PAGEREF _Toc237699730 \h </w:instrText>
+          <w:instrText xml:space="preserve"> PAGEREF _Toc237700247 \h </w:instrText>
         </w:r>
         <w:r>
           <w:rPr>
@@ -5768,7 +5768,7 @@
           <w14:ligatures w14:val="standardContextual"/>
         </w:rPr>
       </w:pPr>
-      <w:hyperlink w:anchor="_Toc237699731" w:history="1">
+      <w:hyperlink w:anchor="_Toc237700248" w:history="1">
         <w:r>
           <w:rPr>
             <w:rStyle w:val="Hipervnculo"/>
@@ -5795,7 +5795,7 @@
             <w:noProof/>
             <w:webHidden/>
           </w:rPr>
-          <w:instrText xml:space="preserve"> PAGEREF _Toc237699731 \h </w:instrText>
+          <w:instrText xml:space="preserve"> PAGEREF _Toc237700248 \h </w:instrText>
         </w:r>
         <w:r>
           <w:rPr>
@@ -5842,7 +5842,7 @@
           <w14:ligatures w14:val="standardContextual"/>
         </w:rPr>
       </w:pPr>
-      <w:hyperlink w:anchor="_Toc237699732" w:history="1">
+      <w:hyperlink w:anchor="_Toc237700249" w:history="1">
         <w:r>
           <w:rPr>
             <w:rStyle w:val="Hipervnculo"/>
@@ -5869,7 +5869,7 @@
             <w:noProof/>
             <w:webHidden/>
           </w:rPr>
-          <w:instrText xml:space="preserve"> PAGEREF _Toc237699732 \h </w:instrText>
+          <w:instrText xml:space="preserve"> PAGEREF _Toc237700249 \h </w:instrText>
         </w:r>
         <w:r>
           <w:rPr>
@@ -5937,7 +5937,7 @@
           <w:color w:val="4A4A4A"/>
           <w:sz w:val="14"/>
         </w:rPr>
-        <w:t xml:space="preserve"> Comprende 17 Secciones de Análisis, Apéndice Contable con Estados Financieros Auditados por PwC (FY2020–FY2025), Proyecciones Explícitas de Flujo de Fondos (FCFF 2026E–2030E), 31 Figuras Analíticas con Narrativa Contextual, Referencias Bibliográficas y Sección Separada de Aviso Legal y Certificación del Analista.</w:t>
+        <w:t xml:space="preserve"> Comprende 17 Secciones de Análisis, Apéndice Contable con Estados Financieros Auditados por PwC (2020–2025), Proyecciones Explícitas de Flujo de Fondos (FCFF 2026e–2030e), 31 Figuras Analíticas con Narrativa Contextual, Referencias Bibliográficas y Sección Separada de Aviso Legal y Certificación del Analista.</w:t>
       </w:r>
     </w:p>
     <w:p>
@@ -5956,7 +5956,7 @@
         <w:pStyle w:val="Ttulo1"/>
         <w:spacing w:before="100" w:after="30"/>
       </w:pPr>
-      <w:bookmarkStart w:id="0" w:name="_Toc237699670"/>
+      <w:bookmarkStart w:id="0" w:name="_Toc237700187"/>
       <w:r>
         <w:rPr>
           <w:rFonts w:ascii="Georgia" w:hAnsi="Georgia"/>
@@ -5973,7 +5973,7 @@
         <w:pStyle w:val="Ttulo2"/>
         <w:spacing w:before="70" w:after="20"/>
       </w:pPr>
-      <w:bookmarkStart w:id="1" w:name="_Toc237699671"/>
+      <w:bookmarkStart w:id="1" w:name="_Toc237700188"/>
       <w:r>
         <w:rPr>
           <w:rFonts w:ascii="Georgia" w:hAnsi="Georgia"/>
@@ -6023,7 +6023,7 @@
         <w:pStyle w:val="Ttulo2"/>
         <w:spacing w:before="70" w:after="20"/>
       </w:pPr>
-      <w:bookmarkStart w:id="2" w:name="_Toc237699672"/>
+      <w:bookmarkStart w:id="2" w:name="_Toc237700189"/>
       <w:r>
         <w:rPr>
           <w:rFonts w:ascii="Georgia" w:hAnsi="Georgia"/>
@@ -6111,7 +6111,7 @@
                 <w:noProof/>
               </w:rPr>
               <w:drawing>
-                <wp:inline distT="0" distB="0" distL="0" distR="0" wp14:anchorId="70399588" wp14:editId="6C2A8621">
+                <wp:inline distT="0" distB="0" distL="0" distR="0" wp14:anchorId="3ED9A704" wp14:editId="3EE91DEB">
                   <wp:extent cx="2926080" cy="1524412"/>
                   <wp:effectExtent l="0" t="0" r="0" b="0"/>
                   <wp:docPr id="1" name="Picture 1"/>
@@ -6167,7 +6167,7 @@
                 <w:noProof/>
               </w:rPr>
               <w:drawing>
-                <wp:inline distT="0" distB="0" distL="0" distR="0" wp14:anchorId="3668866B" wp14:editId="62F97609">
+                <wp:inline distT="0" distB="0" distL="0" distR="0" wp14:anchorId="102D9591" wp14:editId="3FCFA34F">
                   <wp:extent cx="2926080" cy="1437831"/>
                   <wp:effectExtent l="0" t="0" r="0" b="0"/>
                   <wp:docPr id="2" name="Picture 2"/>
@@ -6266,7 +6266,7 @@
         <w:pStyle w:val="Ttulo2"/>
         <w:spacing w:before="70" w:after="20"/>
       </w:pPr>
-      <w:bookmarkStart w:id="3" w:name="_Toc237699673"/>
+      <w:bookmarkStart w:id="3" w:name="_Toc237700190"/>
       <w:r>
         <w:rPr>
           <w:rFonts w:ascii="Georgia" w:hAnsi="Georgia"/>
@@ -6381,7 +6381,7 @@
         <w:pStyle w:val="Ttulo2"/>
         <w:spacing w:before="70" w:after="20"/>
       </w:pPr>
-      <w:bookmarkStart w:id="4" w:name="_Toc237699674"/>
+      <w:bookmarkStart w:id="4" w:name="_Toc237700191"/>
       <w:r>
         <w:rPr>
           <w:rFonts w:ascii="Georgia" w:hAnsi="Georgia"/>
@@ -6850,7 +6850,7 @@
         <w:pStyle w:val="Ttulo2"/>
         <w:spacing w:before="70" w:after="20"/>
       </w:pPr>
-      <w:bookmarkStart w:id="5" w:name="_Toc237699675"/>
+      <w:bookmarkStart w:id="5" w:name="_Toc237700192"/>
       <w:r>
         <w:rPr>
           <w:rFonts w:ascii="Georgia" w:hAnsi="Georgia"/>
@@ -6971,7 +6971,7 @@
         <w:pStyle w:val="Ttulo2"/>
         <w:spacing w:before="70" w:after="20"/>
       </w:pPr>
-      <w:bookmarkStart w:id="6" w:name="_Toc237699676"/>
+      <w:bookmarkStart w:id="6" w:name="_Toc237700193"/>
       <w:r>
         <w:rPr>
           <w:rFonts w:ascii="Georgia" w:hAnsi="Georgia"/>
@@ -8062,7 +8062,7 @@
         <w:pStyle w:val="Ttulo1"/>
         <w:spacing w:before="100" w:after="30"/>
       </w:pPr>
-      <w:bookmarkStart w:id="7" w:name="_Toc237699677"/>
+      <w:bookmarkStart w:id="7" w:name="_Toc237700194"/>
       <w:r>
         <w:rPr>
           <w:rFonts w:ascii="Georgia" w:hAnsi="Georgia"/>
@@ -8078,7 +8078,7 @@
         <w:pStyle w:val="Ttulo2"/>
         <w:spacing w:before="70" w:after="20"/>
       </w:pPr>
-      <w:bookmarkStart w:id="8" w:name="_Toc237699678"/>
+      <w:bookmarkStart w:id="8" w:name="_Toc237700195"/>
       <w:r>
         <w:rPr>
           <w:rFonts w:ascii="Georgia" w:hAnsi="Georgia"/>
@@ -8148,7 +8148,7 @@
                 <w:noProof/>
               </w:rPr>
               <w:drawing>
-                <wp:inline distT="0" distB="0" distL="0" distR="0" wp14:anchorId="173215D5" wp14:editId="777C48B1">
+                <wp:inline distT="0" distB="0" distL="0" distR="0" wp14:anchorId="1BB8DA0E" wp14:editId="1D920216">
                   <wp:extent cx="2926080" cy="1426594"/>
                   <wp:effectExtent l="0" t="0" r="0" b="0"/>
                   <wp:docPr id="3" name="Picture 3"/>
@@ -8204,7 +8204,7 @@
                 <w:noProof/>
               </w:rPr>
               <w:drawing>
-                <wp:inline distT="0" distB="0" distL="0" distR="0" wp14:anchorId="75FDB6F8" wp14:editId="21612DEC">
+                <wp:inline distT="0" distB="0" distL="0" distR="0" wp14:anchorId="0566C5E9" wp14:editId="52C32CCC">
                   <wp:extent cx="2926080" cy="1494260"/>
                   <wp:effectExtent l="0" t="0" r="0" b="0"/>
                   <wp:docPr id="4" name="Picture 4"/>
@@ -8308,7 +8308,7 @@
         <w:pStyle w:val="Ttulo2"/>
         <w:spacing w:before="70" w:after="20"/>
       </w:pPr>
-      <w:bookmarkStart w:id="9" w:name="_Toc237699679"/>
+      <w:bookmarkStart w:id="9" w:name="_Toc237700196"/>
       <w:r>
         <w:rPr>
           <w:rFonts w:ascii="Georgia" w:hAnsi="Georgia"/>
@@ -8509,7 +8509,7 @@
         <w:pStyle w:val="Ttulo1"/>
         <w:spacing w:before="100" w:after="30"/>
       </w:pPr>
-      <w:bookmarkStart w:id="10" w:name="_Toc237699680"/>
+      <w:bookmarkStart w:id="10" w:name="_Toc237700197"/>
       <w:r>
         <w:rPr>
           <w:rFonts w:ascii="Georgia" w:hAnsi="Georgia"/>
@@ -8525,7 +8525,7 @@
         <w:pStyle w:val="Ttulo2"/>
         <w:spacing w:before="70" w:after="20"/>
       </w:pPr>
-      <w:bookmarkStart w:id="11" w:name="_Toc237699681"/>
+      <w:bookmarkStart w:id="11" w:name="_Toc237700198"/>
       <w:r>
         <w:rPr>
           <w:rFonts w:ascii="Georgia" w:hAnsi="Georgia"/>
@@ -8595,7 +8595,7 @@
                 <w:noProof/>
               </w:rPr>
               <w:drawing>
-                <wp:inline distT="0" distB="0" distL="0" distR="0" wp14:anchorId="282B8AE1" wp14:editId="297BB2E8">
+                <wp:inline distT="0" distB="0" distL="0" distR="0" wp14:anchorId="249A6DF2" wp14:editId="53789C9A">
                   <wp:extent cx="2926080" cy="1636252"/>
                   <wp:effectExtent l="0" t="0" r="0" b="0"/>
                   <wp:docPr id="5" name="Picture 5"/>
@@ -8651,7 +8651,7 @@
                 <w:noProof/>
               </w:rPr>
               <w:drawing>
-                <wp:inline distT="0" distB="0" distL="0" distR="0" wp14:anchorId="098B279B" wp14:editId="3A7B1710">
+                <wp:inline distT="0" distB="0" distL="0" distR="0" wp14:anchorId="551CA8EB" wp14:editId="47892B91">
                   <wp:extent cx="2926080" cy="1481181"/>
                   <wp:effectExtent l="0" t="0" r="0" b="0"/>
                   <wp:docPr id="6" name="Picture 6"/>
@@ -8755,7 +8755,7 @@
         <w:pStyle w:val="Ttulo2"/>
         <w:spacing w:before="70" w:after="20"/>
       </w:pPr>
-      <w:bookmarkStart w:id="12" w:name="_Toc237699682"/>
+      <w:bookmarkStart w:id="12" w:name="_Toc237700199"/>
       <w:r>
         <w:rPr>
           <w:rFonts w:ascii="Georgia" w:hAnsi="Georgia"/>
@@ -8772,7 +8772,7 @@
         <w:spacing w:after="20" w:line="247" w:lineRule="auto"/>
       </w:pPr>
       <w:r>
-        <w:t>Se sometió la serie diaria de ALUA.BA (expresada en USD vía CCL, N=2.355 ruedas, período 2016–2026) y el futuro del LME a la prueba de cointegración de Engle-Granger. El estadístico t = -2,29 (p = 0,38, frente a un valor crítico de -3,34 al 5%) no rechaza la hipótesis nula de no cointegración estricta en niveles; no obstante la ausencia de relación de largo plazo estacionaria, la elasticidad contemporánea se sitúa en 0,66 (R^2=0,12), confirmando que Aluar responde conjuntamente al ciclo internacional del metal y a la dinámica macroeconómica local.</w:t>
+        <w:t>Se sometió la serie diaria de ALUA.BA (expresada en USD vía CCL, N=2.355 ruedas, período 2016–2026) y el futuro del LME a la prueba de cointegración de Engle-Granger. El estadístico t = -2,29 (p = 0,38, frente a un valor crítico de -3,34 al 5%) no rechaza la hipótesis nula de no cointegración estricta en niveles. A pesar de no verificarse cointegración lineal en niveles, la elasticidad contemporánea se sitúa en 0,66 (R^2=0,12), confirmando que Aluar responde conjuntamente al ciclo internacional del metal y a la dinámica macroeconómica local.</w:t>
       </w:r>
     </w:p>
     <w:p>
@@ -8780,7 +8780,7 @@
         <w:pStyle w:val="Ttulo2"/>
         <w:spacing w:before="70" w:after="20"/>
       </w:pPr>
-      <w:bookmarkStart w:id="13" w:name="_Toc237699683"/>
+      <w:bookmarkStart w:id="13" w:name="_Toc237700200"/>
       <w:r>
         <w:rPr>
           <w:rFonts w:ascii="Georgia" w:hAnsi="Georgia"/>
@@ -8850,7 +8850,7 @@
                 <w:noProof/>
               </w:rPr>
               <w:drawing>
-                <wp:inline distT="0" distB="0" distL="0" distR="0" wp14:anchorId="1F308BAB" wp14:editId="246AE435">
+                <wp:inline distT="0" distB="0" distL="0" distR="0" wp14:anchorId="74593E9A" wp14:editId="1EC38D7D">
                   <wp:extent cx="2926080" cy="1626307"/>
                   <wp:effectExtent l="0" t="0" r="0" b="0"/>
                   <wp:docPr id="7" name="Picture 7"/>
@@ -8906,7 +8906,7 @@
                 <w:noProof/>
               </w:rPr>
               <w:drawing>
-                <wp:inline distT="0" distB="0" distL="0" distR="0" wp14:anchorId="33C18ADD" wp14:editId="22F91050">
+                <wp:inline distT="0" distB="0" distL="0" distR="0" wp14:anchorId="4F17AB7B" wp14:editId="5A1A7AEE">
                   <wp:extent cx="2926080" cy="1479479"/>
                   <wp:effectExtent l="0" t="0" r="0" b="0"/>
                   <wp:docPr id="8" name="Picture 8"/>
@@ -9005,7 +9005,7 @@
         <w:pStyle w:val="Ttulo2"/>
         <w:spacing w:before="70" w:after="20"/>
       </w:pPr>
-      <w:bookmarkStart w:id="14" w:name="_Toc237699684"/>
+      <w:bookmarkStart w:id="14" w:name="_Toc237700201"/>
       <w:r>
         <w:rPr>
           <w:rFonts w:ascii="Georgia" w:hAnsi="Georgia"/>
@@ -9093,7 +9093,7 @@
                 <w:noProof/>
               </w:rPr>
               <w:drawing>
-                <wp:inline distT="0" distB="0" distL="0" distR="0" wp14:anchorId="47F3803D" wp14:editId="638B8052">
+                <wp:inline distT="0" distB="0" distL="0" distR="0" wp14:anchorId="44EACFDB" wp14:editId="7F34E4C3">
                   <wp:extent cx="2926080" cy="1662311"/>
                   <wp:effectExtent l="0" t="0" r="0" b="0"/>
                   <wp:docPr id="9" name="Picture 9"/>
@@ -9149,7 +9149,7 @@
                 <w:noProof/>
               </w:rPr>
               <w:drawing>
-                <wp:inline distT="0" distB="0" distL="0" distR="0" wp14:anchorId="79C6B3A9" wp14:editId="56E74D7C">
+                <wp:inline distT="0" distB="0" distL="0" distR="0" wp14:anchorId="2B3915BC" wp14:editId="4803A1BE">
                   <wp:extent cx="2926080" cy="1801004"/>
                   <wp:effectExtent l="0" t="0" r="0" b="0"/>
                   <wp:docPr id="10" name="Picture 10"/>
@@ -9248,7 +9248,7 @@
         <w:pStyle w:val="Ttulo1"/>
         <w:spacing w:before="100" w:after="30"/>
       </w:pPr>
-      <w:bookmarkStart w:id="15" w:name="_Toc237699685"/>
+      <w:bookmarkStart w:id="15" w:name="_Toc237700202"/>
       <w:r>
         <w:rPr>
           <w:rFonts w:ascii="Georgia" w:hAnsi="Georgia"/>
@@ -9264,7 +9264,7 @@
         <w:pStyle w:val="Ttulo2"/>
         <w:spacing w:before="70" w:after="20"/>
       </w:pPr>
-      <w:bookmarkStart w:id="16" w:name="_Toc237699686"/>
+      <w:bookmarkStart w:id="16" w:name="_Toc237700203"/>
       <w:r>
         <w:rPr>
           <w:rFonts w:ascii="Georgia" w:hAnsi="Georgia"/>
@@ -9651,7 +9651,7 @@
         <w:pStyle w:val="Ttulo2"/>
         <w:spacing w:before="70" w:after="20"/>
       </w:pPr>
-      <w:bookmarkStart w:id="17" w:name="_Toc237699687"/>
+      <w:bookmarkStart w:id="17" w:name="_Toc237700204"/>
       <w:r>
         <w:rPr>
           <w:rFonts w:ascii="Georgia" w:hAnsi="Georgia"/>
@@ -9685,7 +9685,7 @@
         <w:pStyle w:val="Ttulo1"/>
         <w:spacing w:before="100" w:after="30"/>
       </w:pPr>
-      <w:bookmarkStart w:id="18" w:name="_Toc237699688"/>
+      <w:bookmarkStart w:id="18" w:name="_Toc237700205"/>
       <w:r>
         <w:rPr>
           <w:rFonts w:ascii="Georgia" w:hAnsi="Georgia"/>
@@ -9701,7 +9701,7 @@
         <w:pStyle w:val="Ttulo2"/>
         <w:spacing w:before="70" w:after="20"/>
       </w:pPr>
-      <w:bookmarkStart w:id="19" w:name="_Toc237699689"/>
+      <w:bookmarkStart w:id="19" w:name="_Toc237700206"/>
       <w:r>
         <w:rPr>
           <w:rFonts w:ascii="Georgia" w:hAnsi="Georgia"/>
@@ -9761,7 +9761,7 @@
         <w:pStyle w:val="Ttulo2"/>
         <w:spacing w:before="70" w:after="20"/>
       </w:pPr>
-      <w:bookmarkStart w:id="20" w:name="_Toc237699690"/>
+      <w:bookmarkStart w:id="20" w:name="_Toc237700207"/>
       <w:r>
         <w:rPr>
           <w:rFonts w:ascii="Georgia" w:hAnsi="Georgia"/>
@@ -9831,7 +9831,7 @@
                 <w:noProof/>
               </w:rPr>
               <w:drawing>
-                <wp:inline distT="0" distB="0" distL="0" distR="0" wp14:anchorId="029467E4" wp14:editId="12624124">
+                <wp:inline distT="0" distB="0" distL="0" distR="0" wp14:anchorId="4E60C4B3" wp14:editId="7166D639">
                   <wp:extent cx="2926080" cy="1714660"/>
                   <wp:effectExtent l="0" t="0" r="0" b="0"/>
                   <wp:docPr id="11" name="Picture 11"/>
@@ -9887,7 +9887,7 @@
                 <w:noProof/>
               </w:rPr>
               <w:drawing>
-                <wp:inline distT="0" distB="0" distL="0" distR="0" wp14:anchorId="5E69B51B" wp14:editId="1855B20A">
+                <wp:inline distT="0" distB="0" distL="0" distR="0" wp14:anchorId="113548B0" wp14:editId="443244B4">
                   <wp:extent cx="2926080" cy="1558188"/>
                   <wp:effectExtent l="0" t="0" r="0" b="0"/>
                   <wp:docPr id="12" name="Picture 12"/>
@@ -10753,7 +10753,7 @@
         <w:pStyle w:val="Ttulo1"/>
         <w:spacing w:before="100" w:after="30"/>
       </w:pPr>
-      <w:bookmarkStart w:id="21" w:name="_Toc237699691"/>
+      <w:bookmarkStart w:id="21" w:name="_Toc237700208"/>
       <w:r>
         <w:rPr>
           <w:rFonts w:ascii="Georgia" w:hAnsi="Georgia"/>
@@ -10770,7 +10770,7 @@
         <w:pStyle w:val="Ttulo2"/>
         <w:spacing w:before="70" w:after="20"/>
       </w:pPr>
-      <w:bookmarkStart w:id="22" w:name="_Toc237699692"/>
+      <w:bookmarkStart w:id="22" w:name="_Toc237700209"/>
       <w:r>
         <w:rPr>
           <w:rFonts w:ascii="Georgia" w:hAnsi="Georgia"/>
@@ -10830,7 +10830,7 @@
         <w:pStyle w:val="Ttulo2"/>
         <w:spacing w:before="70" w:after="20"/>
       </w:pPr>
-      <w:bookmarkStart w:id="23" w:name="_Toc237699693"/>
+      <w:bookmarkStart w:id="23" w:name="_Toc237700210"/>
       <w:r>
         <w:rPr>
           <w:rFonts w:ascii="Georgia" w:hAnsi="Georgia"/>
@@ -10898,13 +10898,13 @@
           <w:b/>
           <w:sz w:val="16"/>
         </w:rPr>
-        <w:t>Ajuste de Blume (1975):</w:t>
+        <w:t>Ajuste de Blume (1975) – ¿Por qué se aplica?:</w:t>
       </w:r>
       <w:r>
         <w:rPr>
           <w:sz w:val="16"/>
         </w:rPr>
-        <w:t xml:space="preserve"> Corrección por reversión a la media del riesgo sistemático:</w:t>
+        <w:t xml:space="preserve"> Corrige el error de muestreo y la tendencia empírica del riesgo sistemático a revertir hacia la media del mercado (β = 1,0) a largo plazo:</w:t>
       </w:r>
     </w:p>
     <w:p>
@@ -10938,13 +10938,13 @@
           <w:b/>
           <w:sz w:val="16"/>
         </w:rPr>
-        <w:t>Desapalancamiento por Hamada (1972):</w:t>
+        <w:t>Desapalancamiento por Hamada (1972) – ¿Por qué se desapalanca?:</w:t>
       </w:r>
       <w:r>
         <w:rPr>
           <w:sz w:val="16"/>
         </w:rPr>
-        <w:t xml:space="preserve"> Con el ratio D/E histórico mediano (D/E_hist = 0,5036):</w:t>
+        <w:t xml:space="preserve"> Aísla el riesgo operativo puro del negocio (β_U = 0,6745) despojándolo del apalancamiento financiero histórico transitorio (D/E_hist = 0,5036):</w:t>
       </w:r>
     </w:p>
     <w:p>
@@ -10978,7 +10978,13 @@
           <w:b/>
           <w:sz w:val="16"/>
         </w:rPr>
-        <w:t>Reapalancamiento al D/E Objetivo (D/E_obj = 0,4860):</w:t>
+        <w:t>Reapalancamiento al D/E Objetivo – ¿Por qué al ratio de régimen?:</w:t>
+      </w:r>
+      <w:r>
+        <w:rPr>
+          <w:sz w:val="16"/>
+        </w:rPr>
+        <w:t xml:space="preserve"> Incorpora la estructura de capital de régimen (D/E_obj = 0,4860) para obtener el beta apalancado sin arrastrar distorsiones de deuda:</w:t>
       </w:r>
     </w:p>
     <w:p>
@@ -11028,7 +11034,7 @@
                 <w:noProof/>
               </w:rPr>
               <w:drawing>
-                <wp:inline distT="0" distB="0" distL="0" distR="0" wp14:anchorId="2A9BEC52" wp14:editId="3AC5D297">
+                <wp:inline distT="0" distB="0" distL="0" distR="0" wp14:anchorId="57829324" wp14:editId="4753BF8B">
                   <wp:extent cx="2926080" cy="1540391"/>
                   <wp:effectExtent l="0" t="0" r="0" b="0"/>
                   <wp:docPr id="13" name="Picture 13"/>
@@ -11084,7 +11090,7 @@
                 <w:noProof/>
               </w:rPr>
               <w:drawing>
-                <wp:inline distT="0" distB="0" distL="0" distR="0" wp14:anchorId="522CCBA9" wp14:editId="1B8E0650">
+                <wp:inline distT="0" distB="0" distL="0" distR="0" wp14:anchorId="72E80DD0" wp14:editId="4B66C7FE">
                   <wp:extent cx="2926080" cy="1658038"/>
                   <wp:effectExtent l="0" t="0" r="0" b="0"/>
                   <wp:docPr id="14" name="Picture 14"/>
@@ -11183,7 +11189,7 @@
         <w:pStyle w:val="Ttulo2"/>
         <w:spacing w:before="70" w:after="20"/>
       </w:pPr>
-      <w:bookmarkStart w:id="24" w:name="_Toc237699694"/>
+      <w:bookmarkStart w:id="24" w:name="_Toc237700211"/>
       <w:r>
         <w:rPr>
           <w:rFonts w:ascii="Georgia" w:hAnsi="Georgia"/>
@@ -11221,7 +11227,13 @@
         <w:spacing w:after="20" w:line="247" w:lineRule="auto"/>
       </w:pPr>
       <w:r>
-        <w:t>En lugar de adicionar el 100% del spread soberano generalizado (EMBI+), se calibra un factor de exposición λ = 0,20. Esta ponderación responde a la cobertura natural de Aluar: el 80% de sus ventas son exportaciones liquidadas en dólares a precios LME y sus costos fijos operativos están fijados en pesos locales (salarios e insumos nacionales), por lo que las depreciaciones cambiarias licúan costos en moneda dura y amortiguan los shocks de riesgo país.</w:t>
+        <w:rPr>
+          <w:b/>
+        </w:rPr>
+        <w:t>¿Por qué λ = 0,20 y no el 100% del CRP?:</w:t>
+      </w:r>
+      <w:r>
+        <w:t xml:space="preserve"> En lugar de adicionar el 100% del spread soberano (EMBI+), se calibra λ = 0,20 por la cobertura natural de Aluar: el 80% de sus ventas son exportaciones liquidadas en dólares a precios LME y sus costos fijos operativos están fijados en pesos locales (salarios e insumos nacionales), por lo que las depreciaciones cambiarias licúan costos en moneda dura y amortiguan los shocks de riesgo país.</w:t>
       </w:r>
     </w:p>
     <w:p>
@@ -11653,14 +11665,7 @@
                 <w:b/>
                 <w:sz w:val="13"/>
               </w:rPr>
-              <w:t xml:space="preserve">WACC Resultante </w:t>
-            </w:r>
-            <w:r>
-              <w:rPr>
-                <w:b/>
-                <w:sz w:val="13"/>
-              </w:rPr>
-              <w:t>(USD)</w:t>
+              <w:t>WACC Resultante (USD)</w:t>
             </w:r>
           </w:p>
         </w:tc>
@@ -12007,7 +12012,7 @@
         <w:pStyle w:val="Ttulo1"/>
         <w:spacing w:before="100" w:after="30"/>
       </w:pPr>
-      <w:bookmarkStart w:id="25" w:name="_Toc237699695"/>
+      <w:bookmarkStart w:id="25" w:name="_Toc237700212"/>
       <w:r>
         <w:rPr>
           <w:rFonts w:ascii="Georgia" w:hAnsi="Georgia"/>
@@ -12023,7 +12028,7 @@
         <w:pStyle w:val="Ttulo2"/>
         <w:spacing w:before="70" w:after="20"/>
       </w:pPr>
-      <w:bookmarkStart w:id="26" w:name="_Toc237699696"/>
+      <w:bookmarkStart w:id="26" w:name="_Toc237700213"/>
       <w:r>
         <w:rPr>
           <w:rFonts w:ascii="Georgia" w:hAnsi="Georgia"/>
@@ -13438,7 +13443,7 @@
         <w:pStyle w:val="Ttulo2"/>
         <w:spacing w:before="70" w:after="20"/>
       </w:pPr>
-      <w:bookmarkStart w:id="27" w:name="_Toc237699697"/>
+      <w:bookmarkStart w:id="27" w:name="_Toc237700214"/>
       <w:r>
         <w:rPr>
           <w:rFonts w:ascii="Georgia" w:hAnsi="Georgia"/>
@@ -13550,7 +13555,7 @@
         <w:pStyle w:val="Ttulo1"/>
         <w:spacing w:before="100" w:after="30"/>
       </w:pPr>
-      <w:bookmarkStart w:id="28" w:name="_Toc237699698"/>
+      <w:bookmarkStart w:id="28" w:name="_Toc237700215"/>
       <w:r>
         <w:rPr>
           <w:rFonts w:ascii="Georgia" w:hAnsi="Georgia"/>
@@ -13567,7 +13572,7 @@
         <w:pStyle w:val="Ttulo2"/>
         <w:spacing w:before="70" w:after="20"/>
       </w:pPr>
-      <w:bookmarkStart w:id="29" w:name="_Toc237699699"/>
+      <w:bookmarkStart w:id="29" w:name="_Toc237700216"/>
       <w:r>
         <w:rPr>
           <w:rFonts w:ascii="Georgia" w:hAnsi="Georgia"/>
@@ -13627,7 +13632,7 @@
         <w:pStyle w:val="Ttulo2"/>
         <w:spacing w:before="70" w:after="20"/>
       </w:pPr>
-      <w:bookmarkStart w:id="30" w:name="_Toc237699700"/>
+      <w:bookmarkStart w:id="30" w:name="_Toc237700217"/>
       <w:r>
         <w:rPr>
           <w:rFonts w:ascii="Georgia" w:hAnsi="Georgia"/>
@@ -13697,7 +13702,7 @@
                 <w:noProof/>
               </w:rPr>
               <w:drawing>
-                <wp:inline distT="0" distB="0" distL="0" distR="0" wp14:anchorId="3294DE77" wp14:editId="142745F0">
+                <wp:inline distT="0" distB="0" distL="0" distR="0" wp14:anchorId="4113369C" wp14:editId="1922E8A0">
                   <wp:extent cx="2926080" cy="1534596"/>
                   <wp:effectExtent l="0" t="0" r="0" b="0"/>
                   <wp:docPr id="15" name="Picture 15"/>
@@ -13753,7 +13758,7 @@
                 <w:noProof/>
               </w:rPr>
               <w:drawing>
-                <wp:inline distT="0" distB="0" distL="0" distR="0" wp14:anchorId="41B2BF56" wp14:editId="01631419">
+                <wp:inline distT="0" distB="0" distL="0" distR="0" wp14:anchorId="6B42EF74" wp14:editId="01E9313A">
                   <wp:extent cx="2926080" cy="1680519"/>
                   <wp:effectExtent l="0" t="0" r="0" b="0"/>
                   <wp:docPr id="16" name="Picture 16"/>
@@ -13852,7 +13857,7 @@
         <w:pStyle w:val="Ttulo1"/>
         <w:spacing w:before="100" w:after="30"/>
       </w:pPr>
-      <w:bookmarkStart w:id="31" w:name="_Toc237699701"/>
+      <w:bookmarkStart w:id="31" w:name="_Toc237700218"/>
       <w:r>
         <w:rPr>
           <w:rFonts w:ascii="Georgia" w:hAnsi="Georgia"/>
@@ -13868,7 +13873,7 @@
         <w:pStyle w:val="Ttulo2"/>
         <w:spacing w:before="70" w:after="20"/>
       </w:pPr>
-      <w:bookmarkStart w:id="32" w:name="_Toc237699702"/>
+      <w:bookmarkStart w:id="32" w:name="_Toc237700219"/>
       <w:r>
         <w:rPr>
           <w:rFonts w:ascii="Georgia" w:hAnsi="Georgia"/>
@@ -14798,7 +14803,7 @@
         <w:pStyle w:val="Ttulo2"/>
         <w:spacing w:before="70" w:after="20"/>
       </w:pPr>
-      <w:bookmarkStart w:id="33" w:name="_Toc237699703"/>
+      <w:bookmarkStart w:id="33" w:name="_Toc237700220"/>
       <w:r>
         <w:rPr>
           <w:rFonts w:ascii="Georgia" w:hAnsi="Georgia"/>
@@ -14944,7 +14949,7 @@
         <w:pStyle w:val="Ttulo2"/>
         <w:spacing w:before="70" w:after="20"/>
       </w:pPr>
-      <w:bookmarkStart w:id="34" w:name="_Toc237699704"/>
+      <w:bookmarkStart w:id="34" w:name="_Toc237700221"/>
       <w:r>
         <w:rPr>
           <w:rFonts w:ascii="Georgia" w:hAnsi="Georgia"/>
@@ -14968,7 +14973,7 @@
         <w:pStyle w:val="Ttulo1"/>
         <w:spacing w:before="100" w:after="30"/>
       </w:pPr>
-      <w:bookmarkStart w:id="35" w:name="_Toc237699705"/>
+      <w:bookmarkStart w:id="35" w:name="_Toc237700222"/>
       <w:r>
         <w:rPr>
           <w:rFonts w:ascii="Georgia" w:hAnsi="Georgia"/>
@@ -14984,7 +14989,7 @@
         <w:pStyle w:val="Ttulo2"/>
         <w:spacing w:before="70" w:after="20"/>
       </w:pPr>
-      <w:bookmarkStart w:id="36" w:name="_Toc237699706"/>
+      <w:bookmarkStart w:id="36" w:name="_Toc237700223"/>
       <w:r>
         <w:rPr>
           <w:rFonts w:ascii="Georgia" w:hAnsi="Georgia"/>
@@ -17591,7 +17596,7 @@
         <w:pStyle w:val="Ttulo1"/>
         <w:spacing w:before="100" w:after="30"/>
       </w:pPr>
-      <w:bookmarkStart w:id="37" w:name="_Toc237699707"/>
+      <w:bookmarkStart w:id="37" w:name="_Toc237700224"/>
       <w:r>
         <w:rPr>
           <w:rFonts w:ascii="Georgia" w:hAnsi="Georgia"/>
@@ -17608,7 +17613,7 @@
         <w:pStyle w:val="Ttulo2"/>
         <w:spacing w:before="70" w:after="20"/>
       </w:pPr>
-      <w:bookmarkStart w:id="38" w:name="_Toc237699708"/>
+      <w:bookmarkStart w:id="38" w:name="_Toc237700225"/>
       <w:r>
         <w:rPr>
           <w:rFonts w:ascii="Georgia" w:hAnsi="Georgia"/>
@@ -17697,13 +17702,13 @@
           <w:b/>
           <w:sz w:val="16"/>
         </w:rPr>
-        <w:t>Opción Real PEAL V (Longstaff-Schwartz):</w:t>
+        <w:t>Opción Real PEAL V (Longstaff-Schwartz) – ¿Por qué opción real?:</w:t>
       </w:r>
       <w:r>
         <w:rPr>
           <w:sz w:val="16"/>
         </w:rPr>
-        <w:t xml:space="preserve"> El DCF tradicional asume decisiones estáticas inflexibles. La opción real valúa la flexibilidad gerencial de postergar o ejecutar la ampliación de 312 MW eólicos ante variaciones en tarifas y precios del metal, calculada mediante mínimos cuadrados (LSMC) sobre polinomios de Laguerre:</w:t>
+        <w:t xml:space="preserve"> El DCF tradicional asume decisiones estáticas rígidas. La opción real valúa la flexibilidad gerencial de postergar o ejecutar la ampliación de 312 MW según evolucionen los precios del metal y las tarifas eléctricas, calculada mediante mínimos cuadrados (LSMC) sobre polinomios de Laguerre:</w:t>
       </w:r>
     </w:p>
     <w:p>
@@ -17794,7 +17799,7 @@
         <w:pStyle w:val="Ttulo2"/>
         <w:spacing w:before="70" w:after="20"/>
       </w:pPr>
-      <w:bookmarkStart w:id="39" w:name="_Toc237699709"/>
+      <w:bookmarkStart w:id="39" w:name="_Toc237700226"/>
       <w:r>
         <w:rPr>
           <w:rFonts w:ascii="Georgia" w:hAnsi="Georgia"/>
@@ -17855,7 +17860,7 @@
                 <w:noProof/>
               </w:rPr>
               <w:drawing>
-                <wp:inline distT="0" distB="0" distL="0" distR="0" wp14:anchorId="5106ABFE" wp14:editId="08010FDC">
+                <wp:inline distT="0" distB="0" distL="0" distR="0" wp14:anchorId="6A1229C0" wp14:editId="55D8A6FC">
                   <wp:extent cx="2926080" cy="1626569"/>
                   <wp:effectExtent l="0" t="0" r="0" b="0"/>
                   <wp:docPr id="17" name="Picture 17"/>
@@ -17911,7 +17916,7 @@
                 <w:noProof/>
               </w:rPr>
               <w:drawing>
-                <wp:inline distT="0" distB="0" distL="0" distR="0" wp14:anchorId="2BCA2F09" wp14:editId="067B2405">
+                <wp:inline distT="0" distB="0" distL="0" distR="0" wp14:anchorId="738AE22B" wp14:editId="3213768C">
                   <wp:extent cx="2926080" cy="1691675"/>
                   <wp:effectExtent l="0" t="0" r="0" b="0"/>
                   <wp:docPr id="18" name="Picture 18"/>
@@ -18010,7 +18015,7 @@
         <w:pStyle w:val="Ttulo2"/>
         <w:spacing w:before="70" w:after="20"/>
       </w:pPr>
-      <w:bookmarkStart w:id="40" w:name="_Toc237699710"/>
+      <w:bookmarkStart w:id="40" w:name="_Toc237700227"/>
       <w:r>
         <w:rPr>
           <w:rFonts w:ascii="Georgia" w:hAnsi="Georgia"/>
@@ -18568,7 +18573,7 @@
         <w:pStyle w:val="Ttulo1"/>
         <w:spacing w:before="100" w:after="30"/>
       </w:pPr>
-      <w:bookmarkStart w:id="41" w:name="_Toc237699711"/>
+      <w:bookmarkStart w:id="41" w:name="_Toc237700228"/>
       <w:r>
         <w:rPr>
           <w:rFonts w:ascii="Georgia" w:hAnsi="Georgia"/>
@@ -18584,7 +18589,7 @@
         <w:pStyle w:val="Ttulo2"/>
         <w:spacing w:before="70" w:after="20"/>
       </w:pPr>
-      <w:bookmarkStart w:id="42" w:name="_Toc237699712"/>
+      <w:bookmarkStart w:id="42" w:name="_Toc237700229"/>
       <w:r>
         <w:rPr>
           <w:rFonts w:ascii="Georgia" w:hAnsi="Georgia"/>
@@ -18645,7 +18650,7 @@
                 <w:noProof/>
               </w:rPr>
               <w:drawing>
-                <wp:inline distT="0" distB="0" distL="0" distR="0" wp14:anchorId="3D218CB0" wp14:editId="4B1F109B">
+                <wp:inline distT="0" distB="0" distL="0" distR="0" wp14:anchorId="2FB79421" wp14:editId="30BA8377">
                   <wp:extent cx="2926080" cy="1495195"/>
                   <wp:effectExtent l="0" t="0" r="0" b="0"/>
                   <wp:docPr id="19" name="Picture 19"/>
@@ -18701,7 +18706,7 @@
                 <w:noProof/>
               </w:rPr>
               <w:drawing>
-                <wp:inline distT="0" distB="0" distL="0" distR="0" wp14:anchorId="01CCEDE4" wp14:editId="2DCF06AA">
+                <wp:inline distT="0" distB="0" distL="0" distR="0" wp14:anchorId="7E523F06" wp14:editId="3448BE5E">
                   <wp:extent cx="2926080" cy="1682608"/>
                   <wp:effectExtent l="0" t="0" r="0" b="0"/>
                   <wp:docPr id="20" name="Picture 20"/>
@@ -19714,7 +19719,7 @@
         <w:pStyle w:val="Ttulo1"/>
         <w:spacing w:before="100" w:after="30"/>
       </w:pPr>
-      <w:bookmarkStart w:id="43" w:name="_Toc237699713"/>
+      <w:bookmarkStart w:id="43" w:name="_Toc237700230"/>
       <w:r>
         <w:rPr>
           <w:rFonts w:ascii="Georgia" w:hAnsi="Georgia"/>
@@ -19731,7 +19736,7 @@
         <w:pStyle w:val="Ttulo2"/>
         <w:spacing w:before="70" w:after="20"/>
       </w:pPr>
-      <w:bookmarkStart w:id="44" w:name="_Toc237699714"/>
+      <w:bookmarkStart w:id="44" w:name="_Toc237700231"/>
       <w:r>
         <w:rPr>
           <w:rFonts w:ascii="Georgia" w:hAnsi="Georgia"/>
@@ -19813,7 +19818,7 @@
         <w:pStyle w:val="Ttulo2"/>
         <w:spacing w:before="70" w:after="20"/>
       </w:pPr>
-      <w:bookmarkStart w:id="45" w:name="_Toc237699715"/>
+      <w:bookmarkStart w:id="45" w:name="_Toc237700232"/>
       <w:r>
         <w:rPr>
           <w:rFonts w:ascii="Georgia" w:hAnsi="Georgia"/>
@@ -19883,7 +19888,7 @@
                 <w:noProof/>
               </w:rPr>
               <w:drawing>
-                <wp:inline distT="0" distB="0" distL="0" distR="0" wp14:anchorId="7A3F827F" wp14:editId="717E31B4">
+                <wp:inline distT="0" distB="0" distL="0" distR="0" wp14:anchorId="65BBF948" wp14:editId="775736E3">
                   <wp:extent cx="2926080" cy="1682608"/>
                   <wp:effectExtent l="0" t="0" r="0" b="0"/>
                   <wp:docPr id="21" name="Picture 21"/>
@@ -19939,7 +19944,7 @@
                 <w:noProof/>
               </w:rPr>
               <w:drawing>
-                <wp:inline distT="0" distB="0" distL="0" distR="0" wp14:anchorId="1145B211" wp14:editId="39CCEA67">
+                <wp:inline distT="0" distB="0" distL="0" distR="0" wp14:anchorId="67E1ACB5" wp14:editId="57AB7A89">
                   <wp:extent cx="2926080" cy="1549755"/>
                   <wp:effectExtent l="0" t="0" r="0" b="0"/>
                   <wp:docPr id="22" name="Picture 22"/>
@@ -20038,7 +20043,7 @@
         <w:pStyle w:val="Ttulo1"/>
         <w:spacing w:before="100" w:after="30"/>
       </w:pPr>
-      <w:bookmarkStart w:id="46" w:name="_Toc237699716"/>
+      <w:bookmarkStart w:id="46" w:name="_Toc237700233"/>
       <w:r>
         <w:rPr>
           <w:rFonts w:ascii="Georgia" w:hAnsi="Georgia"/>
@@ -20054,7 +20059,7 @@
         <w:pStyle w:val="Ttulo2"/>
         <w:spacing w:before="70" w:after="20"/>
       </w:pPr>
-      <w:bookmarkStart w:id="47" w:name="_Toc237699717"/>
+      <w:bookmarkStart w:id="47" w:name="_Toc237700234"/>
       <w:r>
         <w:rPr>
           <w:rFonts w:ascii="Georgia" w:hAnsi="Georgia"/>
@@ -21429,7 +21434,7 @@
         <w:pStyle w:val="Ttulo1"/>
         <w:spacing w:before="100" w:after="30"/>
       </w:pPr>
-      <w:bookmarkStart w:id="48" w:name="_Toc237699718"/>
+      <w:bookmarkStart w:id="48" w:name="_Toc237700235"/>
       <w:r>
         <w:rPr>
           <w:rFonts w:ascii="Georgia" w:hAnsi="Georgia"/>
@@ -21446,7 +21451,7 @@
         <w:pStyle w:val="Ttulo2"/>
         <w:spacing w:before="70" w:after="20"/>
       </w:pPr>
-      <w:bookmarkStart w:id="49" w:name="_Toc237699719"/>
+      <w:bookmarkStart w:id="49" w:name="_Toc237700236"/>
       <w:r>
         <w:rPr>
           <w:rFonts w:ascii="Georgia" w:hAnsi="Georgia"/>
@@ -21578,7 +21583,7 @@
                 <w:noProof/>
               </w:rPr>
               <w:drawing>
-                <wp:inline distT="0" distB="0" distL="0" distR="0" wp14:anchorId="05493C0D" wp14:editId="65916EE6">
+                <wp:inline distT="0" distB="0" distL="0" distR="0" wp14:anchorId="6888D15A" wp14:editId="63D46600">
                   <wp:extent cx="2926080" cy="1695124"/>
                   <wp:effectExtent l="0" t="0" r="0" b="0"/>
                   <wp:docPr id="23" name="Picture 23"/>
@@ -21634,7 +21639,7 @@
                 <w:noProof/>
               </w:rPr>
               <w:drawing>
-                <wp:inline distT="0" distB="0" distL="0" distR="0" wp14:anchorId="175865E4" wp14:editId="3549AABB">
+                <wp:inline distT="0" distB="0" distL="0" distR="0" wp14:anchorId="6659F4F3" wp14:editId="2416FE26">
                   <wp:extent cx="2926080" cy="1572627"/>
                   <wp:effectExtent l="0" t="0" r="0" b="0"/>
                   <wp:docPr id="24" name="Picture 24"/>
@@ -21733,7 +21738,7 @@
         <w:pStyle w:val="Ttulo2"/>
         <w:spacing w:before="70" w:after="20"/>
       </w:pPr>
-      <w:bookmarkStart w:id="50" w:name="_Toc237699720"/>
+      <w:bookmarkStart w:id="50" w:name="_Toc237700237"/>
       <w:r>
         <w:rPr>
           <w:rFonts w:ascii="Georgia" w:hAnsi="Georgia"/>
@@ -22390,7 +22395,7 @@
         <w:pStyle w:val="Ttulo2"/>
         <w:spacing w:before="70" w:after="20"/>
       </w:pPr>
-      <w:bookmarkStart w:id="51" w:name="_Toc237699721"/>
+      <w:bookmarkStart w:id="51" w:name="_Toc237700238"/>
       <w:r>
         <w:rPr>
           <w:rFonts w:ascii="Georgia" w:hAnsi="Georgia"/>
@@ -22406,7 +22411,13 @@
         <w:spacing w:after="20" w:line="247" w:lineRule="auto"/>
       </w:pPr>
       <w:r>
-        <w:t>Dado que los retornos de Aluar presentan colas pesadas (curtosis = 7,82), la aproximación normal subestima las pérdidas extremas. Se calibra un modelo Pareto Generalizado (GPD, ξ̂ = 0,214 &gt; 0), capturando pérdidas de cola de tipo Fréchet (</w:t>
+        <w:rPr>
+          <w:b/>
+        </w:rPr>
+        <w:t>¿Por qué EVT-GPD?:</w:t>
+      </w:r>
+      <w:r>
+        <w:t xml:space="preserve"> Dado que los retornos de Aluar presentan colas pesadas (curtosis = 7,82) y la distribución normal subestima severamente las pérdidas de cola, se calibra un modelo Pareto Generalizado (GPD, ξ̂ = 0,214 &gt; 0), capturando pérdidas de tipo Fréchet (</w:t>
       </w:r>
       <w:r>
         <w:rPr>
@@ -22437,7 +22448,7 @@
         <w:pStyle w:val="Ttulo2"/>
         <w:spacing w:before="70" w:after="20"/>
       </w:pPr>
-      <w:bookmarkStart w:id="52" w:name="_Toc237699722"/>
+      <w:bookmarkStart w:id="52" w:name="_Toc237700239"/>
       <w:r>
         <w:rPr>
           <w:rFonts w:ascii="Georgia" w:hAnsi="Georgia"/>
@@ -22453,7 +22464,13 @@
         <w:spacing w:after="20" w:line="247" w:lineRule="auto"/>
       </w:pPr>
       <w:r>
-        <w:t>El aluminio LME exhibe reversión a la media hacia el costo marginal de producción de la industria (</w:t>
+        <w:rPr>
+          <w:b/>
+        </w:rPr>
+        <w:t>¿Por qué Ornstein-Uhlenbeck para el LME?:</w:t>
+      </w:r>
+      <w:r>
+        <w:t xml:space="preserve"> Los commodities industriales no siguen un paseo aleatorio sin límite (MBG), sino que revierten a la media hacia el costo marginal de producción de la industria (</w:t>
       </w:r>
       <w:r>
         <w:rPr>
@@ -22462,7 +22479,7 @@
         <w:t>Figura [fig:26]</w:t>
       </w:r>
       <w:r>
-        <w:t>), modelado mediante la ecuación estocástica de Ornstein-Uhlenbeck:</w:t>
+        <w:t>), modelado mediante:</w:t>
       </w:r>
     </w:p>
     <w:p>
@@ -22512,7 +22529,7 @@
                 <w:noProof/>
               </w:rPr>
               <w:drawing>
-                <wp:inline distT="0" distB="0" distL="0" distR="0" wp14:anchorId="662785AC" wp14:editId="15400B1A">
+                <wp:inline distT="0" distB="0" distL="0" distR="0" wp14:anchorId="2120B28D" wp14:editId="7E6E8E48">
                   <wp:extent cx="2926080" cy="1696900"/>
                   <wp:effectExtent l="0" t="0" r="0" b="0"/>
                   <wp:docPr id="25" name="Picture 25"/>
@@ -22568,7 +22585,7 @@
                 <w:noProof/>
               </w:rPr>
               <w:drawing>
-                <wp:inline distT="0" distB="0" distL="0" distR="0" wp14:anchorId="54F6A256" wp14:editId="14BE986F">
+                <wp:inline distT="0" distB="0" distL="0" distR="0" wp14:anchorId="72554FCC" wp14:editId="4DE337D3">
                   <wp:extent cx="2926080" cy="1614092"/>
                   <wp:effectExtent l="0" t="0" r="0" b="0"/>
                   <wp:docPr id="26" name="Picture 26"/>
@@ -23488,7 +23505,7 @@
         <w:pStyle w:val="Ttulo2"/>
         <w:spacing w:before="70" w:after="20"/>
       </w:pPr>
-      <w:bookmarkStart w:id="53" w:name="_Toc237699723"/>
+      <w:bookmarkStart w:id="53" w:name="_Toc237700240"/>
       <w:r>
         <w:rPr>
           <w:rFonts w:ascii="Georgia" w:hAnsi="Georgia"/>
@@ -23558,7 +23575,7 @@
                 <w:noProof/>
               </w:rPr>
               <w:drawing>
-                <wp:inline distT="0" distB="0" distL="0" distR="0" wp14:anchorId="6EEA8FF8" wp14:editId="37A21F65">
+                <wp:inline distT="0" distB="0" distL="0" distR="0" wp14:anchorId="20E17717" wp14:editId="04A2743E">
                   <wp:extent cx="2926080" cy="1654733"/>
                   <wp:effectExtent l="0" t="0" r="0" b="0"/>
                   <wp:docPr id="27" name="Picture 27"/>
@@ -23614,7 +23631,7 @@
                 <w:noProof/>
               </w:rPr>
               <w:drawing>
-                <wp:inline distT="0" distB="0" distL="0" distR="0" wp14:anchorId="619B3ABC" wp14:editId="1B291E5C">
+                <wp:inline distT="0" distB="0" distL="0" distR="0" wp14:anchorId="67521B8E" wp14:editId="53F7F6CB">
                   <wp:extent cx="2926080" cy="1698212"/>
                   <wp:effectExtent l="0" t="0" r="0" b="0"/>
                   <wp:docPr id="28" name="Picture 28"/>
@@ -23713,7 +23730,7 @@
         <w:pStyle w:val="Ttulo1"/>
         <w:spacing w:before="100" w:after="30"/>
       </w:pPr>
-      <w:bookmarkStart w:id="54" w:name="_Toc237699724"/>
+      <w:bookmarkStart w:id="54" w:name="_Toc237700241"/>
       <w:r>
         <w:rPr>
           <w:rFonts w:ascii="Georgia" w:hAnsi="Georgia"/>
@@ -23729,7 +23746,7 @@
         <w:pStyle w:val="Ttulo2"/>
         <w:spacing w:before="70" w:after="20"/>
       </w:pPr>
-      <w:bookmarkStart w:id="55" w:name="_Toc237699725"/>
+      <w:bookmarkStart w:id="55" w:name="_Toc237700242"/>
       <w:r>
         <w:rPr>
           <w:rFonts w:ascii="Georgia" w:hAnsi="Georgia"/>
@@ -23745,7 +23762,13 @@
         <w:spacing w:after="20" w:line="247" w:lineRule="auto"/>
       </w:pPr>
       <w:r>
-        <w:t xml:space="preserve">Para asegurar la no-negatividad matemática en las tasas de descuento del EMBI+ en simulaciones de colas extremas, se valida el modelo estocástico de Cox-Ingersoll-Ross (CIR, </w:t>
+        <w:rPr>
+          <w:b/>
+        </w:rPr>
+        <w:t>¿Por qué el modelo CIR?:</w:t>
+      </w:r>
+      <w:r>
+        <w:t xml:space="preserve"> Asegura la no-negatividad matemática en las tasas de descuento del EMBI+ en simulaciones de colas extremas (condición de Feller 2κθ &gt; σ^2) y supera al modelo lineal AR(1) con un AIC sustancialmente menor (-3.359,4 vs. -2.894,6) y mayor Log-Likelihood (+1.682,7 vs. +1.450,3, </w:t>
       </w:r>
       <w:r>
         <w:rPr>
@@ -23784,7 +23807,7 @@
         <w:pStyle w:val="Ttulo2"/>
         <w:spacing w:before="70" w:after="20"/>
       </w:pPr>
-      <w:bookmarkStart w:id="56" w:name="_Toc237699726"/>
+      <w:bookmarkStart w:id="56" w:name="_Toc237700243"/>
       <w:r>
         <w:rPr>
           <w:rFonts w:ascii="Georgia" w:hAnsi="Georgia"/>
@@ -23860,7 +23883,7 @@
                 <w:noProof/>
               </w:rPr>
               <w:drawing>
-                <wp:inline distT="0" distB="0" distL="0" distR="0" wp14:anchorId="137E5DA8" wp14:editId="71DBAC47">
+                <wp:inline distT="0" distB="0" distL="0" distR="0" wp14:anchorId="6AC3AC46" wp14:editId="6FB4F429">
                   <wp:extent cx="2926080" cy="1650045"/>
                   <wp:effectExtent l="0" t="0" r="0" b="0"/>
                   <wp:docPr id="29" name="Picture 29"/>
@@ -23916,7 +23939,7 @@
                 <w:noProof/>
               </w:rPr>
               <w:drawing>
-                <wp:inline distT="0" distB="0" distL="0" distR="0" wp14:anchorId="136D0D1E" wp14:editId="599CEBF9">
+                <wp:inline distT="0" distB="0" distL="0" distR="0" wp14:anchorId="0C07B6F8" wp14:editId="1F02F521">
                   <wp:extent cx="2926080" cy="1611196"/>
                   <wp:effectExtent l="0" t="0" r="0" b="0"/>
                   <wp:docPr id="30" name="Picture 30"/>
@@ -24354,7 +24377,7 @@
         <w:pStyle w:val="Ttulo2"/>
         <w:spacing w:before="70" w:after="20"/>
       </w:pPr>
-      <w:bookmarkStart w:id="57" w:name="_Toc237699727"/>
+      <w:bookmarkStart w:id="57" w:name="_Toc237700244"/>
       <w:r>
         <w:rPr>
           <w:rFonts w:ascii="Georgia" w:hAnsi="Georgia"/>
@@ -24371,7 +24394,13 @@
         <w:spacing w:after="20" w:line="247" w:lineRule="auto"/>
       </w:pPr>
       <w:r>
-        <w:t xml:space="preserve">La selección de la estructura de dependencia se fundamenta en la bondad de ajuste (AIC) y la asimetría de colas. Mientras que la Cópula Gaussiana asume independencia asintótica (λ_L = λ_U = 0) y la t-Student impone dependencia simétrica forzada (λ_L = λ_U = 0,22), la </w:t>
+        <w:rPr>
+          <w:b/>
+        </w:rPr>
+        <w:t>¿Por qué Cópula de Clayton?:</w:t>
+      </w:r>
+      <w:r>
+        <w:t xml:space="preserve"> La Cópula Gaussiana asume independencia en colas (λ_L = λ_U = 0) y la t-Student impone dependencia simétrica forzada (λ_L = λ_U = 0,22). La </w:t>
       </w:r>
       <w:r>
         <w:rPr>
@@ -24380,7 +24409,7 @@
         <w:t>Cópula de Clayton</w:t>
       </w:r>
       <w:r>
-        <w:t xml:space="preserve"> C_θ(u, v) = (u^-θ + v^-θ - 1)^-1/θ (θ = 1,23) resulta óptima (Δ AIC = -88,9 vs. Gauss; Δ AIC = -34,2 vs. t-Student) al concentrar la dependencia en la cola inferior (λ_L = 2^-1/θ = 0,38, λ_U = 0), modelando fielmente la co-caída (</w:t>
+        <w:t xml:space="preserve"> C_θ(u, v) = (u^-θ + v^-θ - 1)^-1/θ (θ = 1,23) resulta óptima (Δ AIC = -88,9 vs. Gauss; Δ AIC = -34,2 vs. t-Student) al concentrar la dependencia en la cola inferior (λ_L = 2^-1/θ = 0,38, λ_U = 0), capturando la co-caída (</w:t>
       </w:r>
       <w:r>
         <w:rPr>
@@ -24389,7 +24418,7 @@
         <w:t>joint crash</w:t>
       </w:r>
       <w:r>
-        <w:t>) del commodity y el riesgo país en crisis.</w:t>
+        <w:t>) del commodity y el riesgo soberano.</w:t>
       </w:r>
     </w:p>
     <w:tbl>
@@ -24425,7 +24454,7 @@
                 <w:noProof/>
               </w:rPr>
               <w:drawing>
-                <wp:inline distT="0" distB="0" distL="0" distR="0" wp14:anchorId="74159282" wp14:editId="7AA28A5F">
+                <wp:inline distT="0" distB="0" distL="0" distR="0" wp14:anchorId="4F82ACD5" wp14:editId="632D49E8">
                   <wp:extent cx="2926080" cy="1687777"/>
                   <wp:effectExtent l="0" t="0" r="0" b="0"/>
                   <wp:docPr id="31" name="Picture 31"/>
@@ -24948,7 +24977,7 @@
         <w:pStyle w:val="Ttulo2"/>
         <w:spacing w:before="70" w:after="20"/>
       </w:pPr>
-      <w:bookmarkStart w:id="58" w:name="_Toc237699728"/>
+      <w:bookmarkStart w:id="58" w:name="_Toc237700245"/>
       <w:r>
         <w:rPr>
           <w:rFonts w:ascii="Georgia" w:hAnsi="Georgia"/>
@@ -26069,7 +26098,7 @@
         <w:pStyle w:val="Ttulo1"/>
         <w:spacing w:before="100" w:after="30"/>
       </w:pPr>
-      <w:bookmarkStart w:id="59" w:name="_Toc237699729"/>
+      <w:bookmarkStart w:id="59" w:name="_Toc237700246"/>
       <w:r>
         <w:rPr>
           <w:rFonts w:ascii="Georgia" w:hAnsi="Georgia"/>
@@ -26276,7 +26305,7 @@
         <w:pStyle w:val="Ttulo1"/>
         <w:spacing w:before="100" w:after="30"/>
       </w:pPr>
-      <w:bookmarkStart w:id="60" w:name="_Toc237699730"/>
+      <w:bookmarkStart w:id="60" w:name="_Toc237700247"/>
       <w:r>
         <w:rPr>
           <w:rFonts w:ascii="Georgia" w:hAnsi="Georgia"/>
@@ -34364,7 +34393,7 @@
         <w:pStyle w:val="Ttulo1"/>
         <w:spacing w:before="100" w:after="30"/>
       </w:pPr>
-      <w:bookmarkStart w:id="61" w:name="_Toc237699731"/>
+      <w:bookmarkStart w:id="61" w:name="_Toc237700248"/>
       <w:r>
         <w:rPr>
           <w:rFonts w:ascii="Georgia" w:hAnsi="Georgia"/>
@@ -34797,7 +34826,7 @@
         <w:pStyle w:val="Ttulo1"/>
         <w:spacing w:before="100" w:after="30"/>
       </w:pPr>
-      <w:bookmarkStart w:id="62" w:name="_Toc237699732"/>
+      <w:bookmarkStart w:id="62" w:name="_Toc237700249"/>
       <w:r>
         <w:rPr>
           <w:rFonts w:ascii="Georgia" w:hAnsi="Georgia"/>
@@ -35259,31 +35288,31 @@
       </w:rPr>
     </w:lvl>
   </w:abstractNum>
-  <w:num w:numId="1" w16cid:durableId="1046566997">
+  <w:num w:numId="1" w16cid:durableId="650059260">
     <w:abstractNumId w:val="8"/>
   </w:num>
-  <w:num w:numId="2" w16cid:durableId="1398211193">
+  <w:num w:numId="2" w16cid:durableId="429666241">
     <w:abstractNumId w:val="6"/>
   </w:num>
-  <w:num w:numId="3" w16cid:durableId="272055989">
+  <w:num w:numId="3" w16cid:durableId="1182282435">
     <w:abstractNumId w:val="5"/>
   </w:num>
-  <w:num w:numId="4" w16cid:durableId="204566339">
+  <w:num w:numId="4" w16cid:durableId="1507750102">
     <w:abstractNumId w:val="4"/>
   </w:num>
-  <w:num w:numId="5" w16cid:durableId="1903253429">
+  <w:num w:numId="5" w16cid:durableId="903106260">
     <w:abstractNumId w:val="7"/>
   </w:num>
-  <w:num w:numId="6" w16cid:durableId="2114981739">
+  <w:num w:numId="6" w16cid:durableId="429745357">
     <w:abstractNumId w:val="3"/>
   </w:num>
-  <w:num w:numId="7" w16cid:durableId="1454667031">
+  <w:num w:numId="7" w16cid:durableId="201286575">
     <w:abstractNumId w:val="2"/>
   </w:num>
-  <w:num w:numId="8" w16cid:durableId="748697834">
+  <w:num w:numId="8" w16cid:durableId="509763178">
     <w:abstractNumId w:val="1"/>
   </w:num>
-  <w:num w:numId="9" w16cid:durableId="2072918739">
+  <w:num w:numId="9" w16cid:durableId="718549426">
     <w:abstractNumId w:val="0"/>
   </w:num>
 </w:numbering>
@@ -46715,7 +46744,7 @@
     <w:autoRedefine/>
     <w:uiPriority w:val="39"/>
     <w:unhideWhenUsed/>
-    <w:rsid w:val="007909C0"/>
+    <w:rsid w:val="00CD3248"/>
     <w:pPr>
       <w:spacing w:before="10" w:after="10" w:line="240" w:lineRule="auto"/>
     </w:pPr>
@@ -46730,7 +46759,7 @@
     <w:autoRedefine/>
     <w:uiPriority w:val="39"/>
     <w:unhideWhenUsed/>
-    <w:rsid w:val="007909C0"/>
+    <w:rsid w:val="00CD3248"/>
     <w:pPr>
       <w:spacing w:after="0" w:line="240" w:lineRule="auto"/>
       <w:ind w:left="170"/>
@@ -46744,7 +46773,7 @@
     <w:basedOn w:val="Fuentedeprrafopredeter"/>
     <w:uiPriority w:val="99"/>
     <w:unhideWhenUsed/>
-    <w:rsid w:val="007909C0"/>
+    <w:rsid w:val="00CD3248"/>
     <w:rPr>
       <w:color w:val="0000FF" w:themeColor="hyperlink"/>
       <w:u w:val="single"/>

</xml_diff>

<commit_message>
docs: Incorporacion exhaustiva de justificaciones metodologicas (ROIC, EVA, taxonomias de ratios por 4 dimensiones) en Guia de Estudio e Informe 16p
</commit_message>
<xml_diff>
--- a/01_Reporte_PDF/Informe_Valuacion_Aluar_UNCuyo.docx
+++ b/01_Reporte_PDF/Informe_Valuacion_Aluar_UNCuyo.docx
@@ -1224,7 +1224,7 @@
       <w:r>
         <w:fldChar w:fldCharType="separate"/>
       </w:r>
-      <w:hyperlink w:anchor="_Toc237700187" w:history="1">
+      <w:hyperlink w:anchor="_Toc237700765" w:history="1">
         <w:r>
           <w:rPr>
             <w:rStyle w:val="Hipervnculo"/>
@@ -1251,7 +1251,7 @@
             <w:noProof/>
             <w:webHidden/>
           </w:rPr>
-          <w:instrText xml:space="preserve"> PAGEREF _Toc237700187 \h </w:instrText>
+          <w:instrText xml:space="preserve"> PAGEREF _Toc237700765 \h </w:instrText>
         </w:r>
         <w:r>
           <w:rPr>
@@ -1298,7 +1298,7 @@
           <w14:ligatures w14:val="standardContextual"/>
         </w:rPr>
       </w:pPr>
-      <w:hyperlink w:anchor="_Toc237700188" w:history="1">
+      <w:hyperlink w:anchor="_Toc237700766" w:history="1">
         <w:r>
           <w:rPr>
             <w:rStyle w:val="Hipervnculo"/>
@@ -1325,7 +1325,7 @@
             <w:noProof/>
             <w:webHidden/>
           </w:rPr>
-          <w:instrText xml:space="preserve"> PAGEREF _Toc237700188 \h </w:instrText>
+          <w:instrText xml:space="preserve"> PAGEREF _Toc237700766 \h </w:instrText>
         </w:r>
         <w:r>
           <w:rPr>
@@ -1372,7 +1372,7 @@
           <w14:ligatures w14:val="standardContextual"/>
         </w:rPr>
       </w:pPr>
-      <w:hyperlink w:anchor="_Toc237700189" w:history="1">
+      <w:hyperlink w:anchor="_Toc237700767" w:history="1">
         <w:r>
           <w:rPr>
             <w:rStyle w:val="Hipervnculo"/>
@@ -1399,7 +1399,7 @@
             <w:noProof/>
             <w:webHidden/>
           </w:rPr>
-          <w:instrText xml:space="preserve"> PAGEREF _Toc237700189 \h </w:instrText>
+          <w:instrText xml:space="preserve"> PAGEREF _Toc237700767 \h </w:instrText>
         </w:r>
         <w:r>
           <w:rPr>
@@ -1446,7 +1446,7 @@
           <w14:ligatures w14:val="standardContextual"/>
         </w:rPr>
       </w:pPr>
-      <w:hyperlink w:anchor="_Toc237700190" w:history="1">
+      <w:hyperlink w:anchor="_Toc237700768" w:history="1">
         <w:r>
           <w:rPr>
             <w:rStyle w:val="Hipervnculo"/>
@@ -1473,7 +1473,7 @@
             <w:noProof/>
             <w:webHidden/>
           </w:rPr>
-          <w:instrText xml:space="preserve"> PAGEREF _Toc237700190 \h </w:instrText>
+          <w:instrText xml:space="preserve"> PAGEREF _Toc237700768 \h </w:instrText>
         </w:r>
         <w:r>
           <w:rPr>
@@ -1520,7 +1520,7 @@
           <w14:ligatures w14:val="standardContextual"/>
         </w:rPr>
       </w:pPr>
-      <w:hyperlink w:anchor="_Toc237700191" w:history="1">
+      <w:hyperlink w:anchor="_Toc237700769" w:history="1">
         <w:r>
           <w:rPr>
             <w:rStyle w:val="Hipervnculo"/>
@@ -1547,7 +1547,7 @@
             <w:noProof/>
             <w:webHidden/>
           </w:rPr>
-          <w:instrText xml:space="preserve"> PAGEREF _Toc237700191 \h </w:instrText>
+          <w:instrText xml:space="preserve"> PAGEREF _Toc237700769 \h </w:instrText>
         </w:r>
         <w:r>
           <w:rPr>
@@ -1594,7 +1594,7 @@
           <w14:ligatures w14:val="standardContextual"/>
         </w:rPr>
       </w:pPr>
-      <w:hyperlink w:anchor="_Toc237700192" w:history="1">
+      <w:hyperlink w:anchor="_Toc237700770" w:history="1">
         <w:r>
           <w:rPr>
             <w:rStyle w:val="Hipervnculo"/>
@@ -1621,7 +1621,7 @@
             <w:noProof/>
             <w:webHidden/>
           </w:rPr>
-          <w:instrText xml:space="preserve"> PAGEREF _Toc237700192 \h </w:instrText>
+          <w:instrText xml:space="preserve"> PAGEREF _Toc237700770 \h </w:instrText>
         </w:r>
         <w:r>
           <w:rPr>
@@ -1668,7 +1668,7 @@
           <w14:ligatures w14:val="standardContextual"/>
         </w:rPr>
       </w:pPr>
-      <w:hyperlink w:anchor="_Toc237700193" w:history="1">
+      <w:hyperlink w:anchor="_Toc237700771" w:history="1">
         <w:r>
           <w:rPr>
             <w:rStyle w:val="Hipervnculo"/>
@@ -1695,7 +1695,7 @@
             <w:noProof/>
             <w:webHidden/>
           </w:rPr>
-          <w:instrText xml:space="preserve"> PAGEREF _Toc237700193 \h </w:instrText>
+          <w:instrText xml:space="preserve"> PAGEREF _Toc237700771 \h </w:instrText>
         </w:r>
         <w:r>
           <w:rPr>
@@ -1742,7 +1742,7 @@
           <w14:ligatures w14:val="standardContextual"/>
         </w:rPr>
       </w:pPr>
-      <w:hyperlink w:anchor="_Toc237700194" w:history="1">
+      <w:hyperlink w:anchor="_Toc237700772" w:history="1">
         <w:r>
           <w:rPr>
             <w:rStyle w:val="Hipervnculo"/>
@@ -1769,7 +1769,7 @@
             <w:noProof/>
             <w:webHidden/>
           </w:rPr>
-          <w:instrText xml:space="preserve"> PAGEREF _Toc237700194 \h </w:instrText>
+          <w:instrText xml:space="preserve"> PAGEREF _Toc237700772 \h </w:instrText>
         </w:r>
         <w:r>
           <w:rPr>
@@ -1816,7 +1816,7 @@
           <w14:ligatures w14:val="standardContextual"/>
         </w:rPr>
       </w:pPr>
-      <w:hyperlink w:anchor="_Toc237700195" w:history="1">
+      <w:hyperlink w:anchor="_Toc237700773" w:history="1">
         <w:r>
           <w:rPr>
             <w:rStyle w:val="Hipervnculo"/>
@@ -1843,7 +1843,7 @@
             <w:noProof/>
             <w:webHidden/>
           </w:rPr>
-          <w:instrText xml:space="preserve"> PAGEREF _Toc237700195 \h </w:instrText>
+          <w:instrText xml:space="preserve"> PAGEREF _Toc237700773 \h </w:instrText>
         </w:r>
         <w:r>
           <w:rPr>
@@ -1890,7 +1890,7 @@
           <w14:ligatures w14:val="standardContextual"/>
         </w:rPr>
       </w:pPr>
-      <w:hyperlink w:anchor="_Toc237700196" w:history="1">
+      <w:hyperlink w:anchor="_Toc237700774" w:history="1">
         <w:r>
           <w:rPr>
             <w:rStyle w:val="Hipervnculo"/>
@@ -1917,7 +1917,7 @@
             <w:noProof/>
             <w:webHidden/>
           </w:rPr>
-          <w:instrText xml:space="preserve"> PAGEREF _Toc237700196 \h </w:instrText>
+          <w:instrText xml:space="preserve"> PAGEREF _Toc237700774 \h </w:instrText>
         </w:r>
         <w:r>
           <w:rPr>
@@ -1964,7 +1964,7 @@
           <w14:ligatures w14:val="standardContextual"/>
         </w:rPr>
       </w:pPr>
-      <w:hyperlink w:anchor="_Toc237700197" w:history="1">
+      <w:hyperlink w:anchor="_Toc237700775" w:history="1">
         <w:r>
           <w:rPr>
             <w:rStyle w:val="Hipervnculo"/>
@@ -1991,7 +1991,7 @@
             <w:noProof/>
             <w:webHidden/>
           </w:rPr>
-          <w:instrText xml:space="preserve"> PAGEREF _Toc237700197 \h </w:instrText>
+          <w:instrText xml:space="preserve"> PAGEREF _Toc237700775 \h </w:instrText>
         </w:r>
         <w:r>
           <w:rPr>
@@ -2038,7 +2038,7 @@
           <w14:ligatures w14:val="standardContextual"/>
         </w:rPr>
       </w:pPr>
-      <w:hyperlink w:anchor="_Toc237700198" w:history="1">
+      <w:hyperlink w:anchor="_Toc237700776" w:history="1">
         <w:r>
           <w:rPr>
             <w:rStyle w:val="Hipervnculo"/>
@@ -2065,7 +2065,7 @@
             <w:noProof/>
             <w:webHidden/>
           </w:rPr>
-          <w:instrText xml:space="preserve"> PAGEREF _Toc237700198 \h </w:instrText>
+          <w:instrText xml:space="preserve"> PAGEREF _Toc237700776 \h </w:instrText>
         </w:r>
         <w:r>
           <w:rPr>
@@ -2112,7 +2112,7 @@
           <w14:ligatures w14:val="standardContextual"/>
         </w:rPr>
       </w:pPr>
-      <w:hyperlink w:anchor="_Toc237700199" w:history="1">
+      <w:hyperlink w:anchor="_Toc237700777" w:history="1">
         <w:r>
           <w:rPr>
             <w:rStyle w:val="Hipervnculo"/>
@@ -2139,7 +2139,7 @@
             <w:noProof/>
             <w:webHidden/>
           </w:rPr>
-          <w:instrText xml:space="preserve"> PAGEREF _Toc237700199 \h </w:instrText>
+          <w:instrText xml:space="preserve"> PAGEREF _Toc237700777 \h </w:instrText>
         </w:r>
         <w:r>
           <w:rPr>
@@ -2186,7 +2186,7 @@
           <w14:ligatures w14:val="standardContextual"/>
         </w:rPr>
       </w:pPr>
-      <w:hyperlink w:anchor="_Toc237700200" w:history="1">
+      <w:hyperlink w:anchor="_Toc237700778" w:history="1">
         <w:r>
           <w:rPr>
             <w:rStyle w:val="Hipervnculo"/>
@@ -2213,7 +2213,7 @@
             <w:noProof/>
             <w:webHidden/>
           </w:rPr>
-          <w:instrText xml:space="preserve"> PAGEREF _Toc237700200 \h </w:instrText>
+          <w:instrText xml:space="preserve"> PAGEREF _Toc237700778 \h </w:instrText>
         </w:r>
         <w:r>
           <w:rPr>
@@ -2260,7 +2260,7 @@
           <w14:ligatures w14:val="standardContextual"/>
         </w:rPr>
       </w:pPr>
-      <w:hyperlink w:anchor="_Toc237700201" w:history="1">
+      <w:hyperlink w:anchor="_Toc237700779" w:history="1">
         <w:r>
           <w:rPr>
             <w:rStyle w:val="Hipervnculo"/>
@@ -2287,7 +2287,7 @@
             <w:noProof/>
             <w:webHidden/>
           </w:rPr>
-          <w:instrText xml:space="preserve"> PAGEREF _Toc237700201 \h </w:instrText>
+          <w:instrText xml:space="preserve"> PAGEREF _Toc237700779 \h </w:instrText>
         </w:r>
         <w:r>
           <w:rPr>
@@ -2334,7 +2334,7 @@
           <w14:ligatures w14:val="standardContextual"/>
         </w:rPr>
       </w:pPr>
-      <w:hyperlink w:anchor="_Toc237700202" w:history="1">
+      <w:hyperlink w:anchor="_Toc237700780" w:history="1">
         <w:r>
           <w:rPr>
             <w:rStyle w:val="Hipervnculo"/>
@@ -2361,7 +2361,7 @@
             <w:noProof/>
             <w:webHidden/>
           </w:rPr>
-          <w:instrText xml:space="preserve"> PAGEREF _Toc237700202 \h </w:instrText>
+          <w:instrText xml:space="preserve"> PAGEREF _Toc237700780 \h </w:instrText>
         </w:r>
         <w:r>
           <w:rPr>
@@ -2408,7 +2408,7 @@
           <w14:ligatures w14:val="standardContextual"/>
         </w:rPr>
       </w:pPr>
-      <w:hyperlink w:anchor="_Toc237700203" w:history="1">
+      <w:hyperlink w:anchor="_Toc237700781" w:history="1">
         <w:r>
           <w:rPr>
             <w:rStyle w:val="Hipervnculo"/>
@@ -2435,7 +2435,7 @@
             <w:noProof/>
             <w:webHidden/>
           </w:rPr>
-          <w:instrText xml:space="preserve"> PAGEREF _Toc237700203 \h </w:instrText>
+          <w:instrText xml:space="preserve"> PAGEREF _Toc237700781 \h </w:instrText>
         </w:r>
         <w:r>
           <w:rPr>
@@ -2482,7 +2482,7 @@
           <w14:ligatures w14:val="standardContextual"/>
         </w:rPr>
       </w:pPr>
-      <w:hyperlink w:anchor="_Toc237700204" w:history="1">
+      <w:hyperlink w:anchor="_Toc237700782" w:history="1">
         <w:r>
           <w:rPr>
             <w:rStyle w:val="Hipervnculo"/>
@@ -2509,7 +2509,7 @@
             <w:noProof/>
             <w:webHidden/>
           </w:rPr>
-          <w:instrText xml:space="preserve"> PAGEREF _Toc237700204 \h </w:instrText>
+          <w:instrText xml:space="preserve"> PAGEREF _Toc237700782 \h </w:instrText>
         </w:r>
         <w:r>
           <w:rPr>
@@ -2556,7 +2556,7 @@
           <w14:ligatures w14:val="standardContextual"/>
         </w:rPr>
       </w:pPr>
-      <w:hyperlink w:anchor="_Toc237700205" w:history="1">
+      <w:hyperlink w:anchor="_Toc237700783" w:history="1">
         <w:r>
           <w:rPr>
             <w:rStyle w:val="Hipervnculo"/>
@@ -2583,7 +2583,7 @@
             <w:noProof/>
             <w:webHidden/>
           </w:rPr>
-          <w:instrText xml:space="preserve"> PAGEREF _Toc237700205 \h </w:instrText>
+          <w:instrText xml:space="preserve"> PAGEREF _Toc237700783 \h </w:instrText>
         </w:r>
         <w:r>
           <w:rPr>
@@ -2630,7 +2630,7 @@
           <w14:ligatures w14:val="standardContextual"/>
         </w:rPr>
       </w:pPr>
-      <w:hyperlink w:anchor="_Toc237700206" w:history="1">
+      <w:hyperlink w:anchor="_Toc237700784" w:history="1">
         <w:r>
           <w:rPr>
             <w:rStyle w:val="Hipervnculo"/>
@@ -2657,7 +2657,7 @@
             <w:noProof/>
             <w:webHidden/>
           </w:rPr>
-          <w:instrText xml:space="preserve"> PAGEREF _Toc237700206 \h </w:instrText>
+          <w:instrText xml:space="preserve"> PAGEREF _Toc237700784 \h </w:instrText>
         </w:r>
         <w:r>
           <w:rPr>
@@ -2704,7 +2704,7 @@
           <w14:ligatures w14:val="standardContextual"/>
         </w:rPr>
       </w:pPr>
-      <w:hyperlink w:anchor="_Toc237700207" w:history="1">
+      <w:hyperlink w:anchor="_Toc237700785" w:history="1">
         <w:r>
           <w:rPr>
             <w:rStyle w:val="Hipervnculo"/>
@@ -2731,7 +2731,7 @@
             <w:noProof/>
             <w:webHidden/>
           </w:rPr>
-          <w:instrText xml:space="preserve"> PAGEREF _Toc237700207 \h </w:instrText>
+          <w:instrText xml:space="preserve"> PAGEREF _Toc237700785 \h </w:instrText>
         </w:r>
         <w:r>
           <w:rPr>
@@ -2778,7 +2778,7 @@
           <w14:ligatures w14:val="standardContextual"/>
         </w:rPr>
       </w:pPr>
-      <w:hyperlink w:anchor="_Toc237700208" w:history="1">
+      <w:hyperlink w:anchor="_Toc237700786" w:history="1">
         <w:r>
           <w:rPr>
             <w:rStyle w:val="Hipervnculo"/>
@@ -2805,7 +2805,7 @@
             <w:noProof/>
             <w:webHidden/>
           </w:rPr>
-          <w:instrText xml:space="preserve"> PAGEREF _Toc237700208 \h </w:instrText>
+          <w:instrText xml:space="preserve"> PAGEREF _Toc237700786 \h </w:instrText>
         </w:r>
         <w:r>
           <w:rPr>
@@ -2852,7 +2852,7 @@
           <w14:ligatures w14:val="standardContextual"/>
         </w:rPr>
       </w:pPr>
-      <w:hyperlink w:anchor="_Toc237700209" w:history="1">
+      <w:hyperlink w:anchor="_Toc237700787" w:history="1">
         <w:r>
           <w:rPr>
             <w:rStyle w:val="Hipervnculo"/>
@@ -2879,7 +2879,7 @@
             <w:noProof/>
             <w:webHidden/>
           </w:rPr>
-          <w:instrText xml:space="preserve"> PAGEREF _Toc237700209 \h </w:instrText>
+          <w:instrText xml:space="preserve"> PAGEREF _Toc237700787 \h </w:instrText>
         </w:r>
         <w:r>
           <w:rPr>
@@ -2926,7 +2926,7 @@
           <w14:ligatures w14:val="standardContextual"/>
         </w:rPr>
       </w:pPr>
-      <w:hyperlink w:anchor="_Toc237700210" w:history="1">
+      <w:hyperlink w:anchor="_Toc237700788" w:history="1">
         <w:r>
           <w:rPr>
             <w:rStyle w:val="Hipervnculo"/>
@@ -2983,7 +2983,7 @@
             <w:noProof/>
             <w:webHidden/>
           </w:rPr>
-          <w:instrText xml:space="preserve"> PAGEREF _Toc237700210 \h </w:instrText>
+          <w:instrText xml:space="preserve"> PAGEREF _Toc237700788 \h </w:instrText>
         </w:r>
         <w:r>
           <w:rPr>
@@ -3030,7 +3030,7 @@
           <w14:ligatures w14:val="standardContextual"/>
         </w:rPr>
       </w:pPr>
-      <w:hyperlink w:anchor="_Toc237700211" w:history="1">
+      <w:hyperlink w:anchor="_Toc237700789" w:history="1">
         <w:r>
           <w:rPr>
             <w:rStyle w:val="Hipervnculo"/>
@@ -3057,7 +3057,7 @@
             <w:noProof/>
             <w:webHidden/>
           </w:rPr>
-          <w:instrText xml:space="preserve"> PAGEREF _Toc237700211 \h </w:instrText>
+          <w:instrText xml:space="preserve"> PAGEREF _Toc237700789 \h </w:instrText>
         </w:r>
         <w:r>
           <w:rPr>
@@ -3104,7 +3104,7 @@
           <w14:ligatures w14:val="standardContextual"/>
         </w:rPr>
       </w:pPr>
-      <w:hyperlink w:anchor="_Toc237700212" w:history="1">
+      <w:hyperlink w:anchor="_Toc237700790" w:history="1">
         <w:r>
           <w:rPr>
             <w:rStyle w:val="Hipervnculo"/>
@@ -3131,7 +3131,7 @@
             <w:noProof/>
             <w:webHidden/>
           </w:rPr>
-          <w:instrText xml:space="preserve"> PAGEREF _Toc237700212 \h </w:instrText>
+          <w:instrText xml:space="preserve"> PAGEREF _Toc237700790 \h </w:instrText>
         </w:r>
         <w:r>
           <w:rPr>
@@ -3178,7 +3178,7 @@
           <w14:ligatures w14:val="standardContextual"/>
         </w:rPr>
       </w:pPr>
-      <w:hyperlink w:anchor="_Toc237700213" w:history="1">
+      <w:hyperlink w:anchor="_Toc237700791" w:history="1">
         <w:r>
           <w:rPr>
             <w:rStyle w:val="Hipervnculo"/>
@@ -3205,7 +3205,7 @@
             <w:noProof/>
             <w:webHidden/>
           </w:rPr>
-          <w:instrText xml:space="preserve"> PAGEREF _Toc237700213 \h </w:instrText>
+          <w:instrText xml:space="preserve"> PAGEREF _Toc237700791 \h </w:instrText>
         </w:r>
         <w:r>
           <w:rPr>
@@ -3252,7 +3252,7 @@
           <w14:ligatures w14:val="standardContextual"/>
         </w:rPr>
       </w:pPr>
-      <w:hyperlink w:anchor="_Toc237700214" w:history="1">
+      <w:hyperlink w:anchor="_Toc237700792" w:history="1">
         <w:r>
           <w:rPr>
             <w:rStyle w:val="Hipervnculo"/>
@@ -3279,7 +3279,7 @@
             <w:noProof/>
             <w:webHidden/>
           </w:rPr>
-          <w:instrText xml:space="preserve"> PAGEREF _Toc237700214 \h </w:instrText>
+          <w:instrText xml:space="preserve"> PAGEREF _Toc237700792 \h </w:instrText>
         </w:r>
         <w:r>
           <w:rPr>
@@ -3326,7 +3326,7 @@
           <w14:ligatures w14:val="standardContextual"/>
         </w:rPr>
       </w:pPr>
-      <w:hyperlink w:anchor="_Toc237700215" w:history="1">
+      <w:hyperlink w:anchor="_Toc237700793" w:history="1">
         <w:r>
           <w:rPr>
             <w:rStyle w:val="Hipervnculo"/>
@@ -3353,7 +3353,7 @@
             <w:noProof/>
             <w:webHidden/>
           </w:rPr>
-          <w:instrText xml:space="preserve"> PAGEREF _Toc237700215 \h </w:instrText>
+          <w:instrText xml:space="preserve"> PAGEREF _Toc237700793 \h </w:instrText>
         </w:r>
         <w:r>
           <w:rPr>
@@ -3400,7 +3400,7 @@
           <w14:ligatures w14:val="standardContextual"/>
         </w:rPr>
       </w:pPr>
-      <w:hyperlink w:anchor="_Toc237700216" w:history="1">
+      <w:hyperlink w:anchor="_Toc237700794" w:history="1">
         <w:r>
           <w:rPr>
             <w:rStyle w:val="Hipervnculo"/>
@@ -3427,7 +3427,7 @@
             <w:noProof/>
             <w:webHidden/>
           </w:rPr>
-          <w:instrText xml:space="preserve"> PAGEREF _Toc237700216 \h </w:instrText>
+          <w:instrText xml:space="preserve"> PAGEREF _Toc237700794 \h </w:instrText>
         </w:r>
         <w:r>
           <w:rPr>
@@ -3474,7 +3474,7 @@
           <w14:ligatures w14:val="standardContextual"/>
         </w:rPr>
       </w:pPr>
-      <w:hyperlink w:anchor="_Toc237700217" w:history="1">
+      <w:hyperlink w:anchor="_Toc237700795" w:history="1">
         <w:r>
           <w:rPr>
             <w:rStyle w:val="Hipervnculo"/>
@@ -3501,7 +3501,7 @@
             <w:noProof/>
             <w:webHidden/>
           </w:rPr>
-          <w:instrText xml:space="preserve"> PAGEREF _Toc237700217 \h </w:instrText>
+          <w:instrText xml:space="preserve"> PAGEREF _Toc237700795 \h </w:instrText>
         </w:r>
         <w:r>
           <w:rPr>
@@ -3548,7 +3548,7 @@
           <w14:ligatures w14:val="standardContextual"/>
         </w:rPr>
       </w:pPr>
-      <w:hyperlink w:anchor="_Toc237700218" w:history="1">
+      <w:hyperlink w:anchor="_Toc237700796" w:history="1">
         <w:r>
           <w:rPr>
             <w:rStyle w:val="Hipervnculo"/>
@@ -3575,7 +3575,7 @@
             <w:noProof/>
             <w:webHidden/>
           </w:rPr>
-          <w:instrText xml:space="preserve"> PAGEREF _Toc237700218 \h </w:instrText>
+          <w:instrText xml:space="preserve"> PAGEREF _Toc237700796 \h </w:instrText>
         </w:r>
         <w:r>
           <w:rPr>
@@ -3622,7 +3622,7 @@
           <w14:ligatures w14:val="standardContextual"/>
         </w:rPr>
       </w:pPr>
-      <w:hyperlink w:anchor="_Toc237700219" w:history="1">
+      <w:hyperlink w:anchor="_Toc237700797" w:history="1">
         <w:r>
           <w:rPr>
             <w:rStyle w:val="Hipervnculo"/>
@@ -3649,7 +3649,7 @@
             <w:noProof/>
             <w:webHidden/>
           </w:rPr>
-          <w:instrText xml:space="preserve"> PAGEREF _Toc237700219 \h </w:instrText>
+          <w:instrText xml:space="preserve"> PAGEREF _Toc237700797 \h </w:instrText>
         </w:r>
         <w:r>
           <w:rPr>
@@ -3696,7 +3696,7 @@
           <w14:ligatures w14:val="standardContextual"/>
         </w:rPr>
       </w:pPr>
-      <w:hyperlink w:anchor="_Toc237700220" w:history="1">
+      <w:hyperlink w:anchor="_Toc237700798" w:history="1">
         <w:r>
           <w:rPr>
             <w:rStyle w:val="Hipervnculo"/>
@@ -3723,7 +3723,7 @@
             <w:noProof/>
             <w:webHidden/>
           </w:rPr>
-          <w:instrText xml:space="preserve"> PAGEREF _Toc237700220 \h </w:instrText>
+          <w:instrText xml:space="preserve"> PAGEREF _Toc237700798 \h </w:instrText>
         </w:r>
         <w:r>
           <w:rPr>
@@ -3770,7 +3770,7 @@
           <w14:ligatures w14:val="standardContextual"/>
         </w:rPr>
       </w:pPr>
-      <w:hyperlink w:anchor="_Toc237700221" w:history="1">
+      <w:hyperlink w:anchor="_Toc237700799" w:history="1">
         <w:r>
           <w:rPr>
             <w:rStyle w:val="Hipervnculo"/>
@@ -3797,7 +3797,7 @@
             <w:noProof/>
             <w:webHidden/>
           </w:rPr>
-          <w:instrText xml:space="preserve"> PAGEREF _Toc237700221 \h </w:instrText>
+          <w:instrText xml:space="preserve"> PAGEREF _Toc237700799 \h </w:instrText>
         </w:r>
         <w:r>
           <w:rPr>
@@ -3844,7 +3844,7 @@
           <w14:ligatures w14:val="standardContextual"/>
         </w:rPr>
       </w:pPr>
-      <w:hyperlink w:anchor="_Toc237700222" w:history="1">
+      <w:hyperlink w:anchor="_Toc237700800" w:history="1">
         <w:r>
           <w:rPr>
             <w:rStyle w:val="Hipervnculo"/>
@@ -3871,7 +3871,7 @@
             <w:noProof/>
             <w:webHidden/>
           </w:rPr>
-          <w:instrText xml:space="preserve"> PAGEREF _Toc237700222 \h </w:instrText>
+          <w:instrText xml:space="preserve"> PAGEREF _Toc237700800 \h </w:instrText>
         </w:r>
         <w:r>
           <w:rPr>
@@ -3918,13 +3918,13 @@
           <w14:ligatures w14:val="standardContextual"/>
         </w:rPr>
       </w:pPr>
-      <w:hyperlink w:anchor="_Toc237700223" w:history="1">
+      <w:hyperlink w:anchor="_Toc237700801" w:history="1">
         <w:r>
           <w:rPr>
             <w:rStyle w:val="Hipervnculo"/>
             <w:noProof/>
           </w:rPr>
-          <w:t>Desempeño Operativo y Cobertura de Intereses</w:t>
+          <w:t>Desempeño Operativo, Solvencia y Cobertura Financiera</w:t>
         </w:r>
         <w:r>
           <w:rPr>
@@ -3945,7 +3945,7 @@
             <w:noProof/>
             <w:webHidden/>
           </w:rPr>
-          <w:instrText xml:space="preserve"> PAGEREF _Toc237700223 \h </w:instrText>
+          <w:instrText xml:space="preserve"> PAGEREF _Toc237700801 \h </w:instrText>
         </w:r>
         <w:r>
           <w:rPr>
@@ -3992,7 +3992,7 @@
           <w14:ligatures w14:val="standardContextual"/>
         </w:rPr>
       </w:pPr>
-      <w:hyperlink w:anchor="_Toc237700224" w:history="1">
+      <w:hyperlink w:anchor="_Toc237700802" w:history="1">
         <w:r>
           <w:rPr>
             <w:rStyle w:val="Hipervnculo"/>
@@ -4019,7 +4019,7 @@
             <w:noProof/>
             <w:webHidden/>
           </w:rPr>
-          <w:instrText xml:space="preserve"> PAGEREF _Toc237700224 \h </w:instrText>
+          <w:instrText xml:space="preserve"> PAGEREF _Toc237700802 \h </w:instrText>
         </w:r>
         <w:r>
           <w:rPr>
@@ -4066,7 +4066,7 @@
           <w14:ligatures w14:val="standardContextual"/>
         </w:rPr>
       </w:pPr>
-      <w:hyperlink w:anchor="_Toc237700225" w:history="1">
+      <w:hyperlink w:anchor="_Toc237700803" w:history="1">
         <w:r>
           <w:rPr>
             <w:rStyle w:val="Hipervnculo"/>
@@ -4093,7 +4093,7 @@
             <w:noProof/>
             <w:webHidden/>
           </w:rPr>
-          <w:instrText xml:space="preserve"> PAGEREF _Toc237700225 \h </w:instrText>
+          <w:instrText xml:space="preserve"> PAGEREF _Toc237700803 \h </w:instrText>
         </w:r>
         <w:r>
           <w:rPr>
@@ -4140,7 +4140,7 @@
           <w14:ligatures w14:val="standardContextual"/>
         </w:rPr>
       </w:pPr>
-      <w:hyperlink w:anchor="_Toc237700226" w:history="1">
+      <w:hyperlink w:anchor="_Toc237700804" w:history="1">
         <w:r>
           <w:rPr>
             <w:rStyle w:val="Hipervnculo"/>
@@ -4167,7 +4167,7 @@
             <w:noProof/>
             <w:webHidden/>
           </w:rPr>
-          <w:instrText xml:space="preserve"> PAGEREF _Toc237700226 \h </w:instrText>
+          <w:instrText xml:space="preserve"> PAGEREF _Toc237700804 \h </w:instrText>
         </w:r>
         <w:r>
           <w:rPr>
@@ -4214,7 +4214,7 @@
           <w14:ligatures w14:val="standardContextual"/>
         </w:rPr>
       </w:pPr>
-      <w:hyperlink w:anchor="_Toc237700227" w:history="1">
+      <w:hyperlink w:anchor="_Toc237700805" w:history="1">
         <w:r>
           <w:rPr>
             <w:rStyle w:val="Hipervnculo"/>
@@ -4241,7 +4241,7 @@
             <w:noProof/>
             <w:webHidden/>
           </w:rPr>
-          <w:instrText xml:space="preserve"> PAGEREF _Toc237700227 \h </w:instrText>
+          <w:instrText xml:space="preserve"> PAGEREF _Toc237700805 \h </w:instrText>
         </w:r>
         <w:r>
           <w:rPr>
@@ -4288,7 +4288,7 @@
           <w14:ligatures w14:val="standardContextual"/>
         </w:rPr>
       </w:pPr>
-      <w:hyperlink w:anchor="_Toc237700228" w:history="1">
+      <w:hyperlink w:anchor="_Toc237700806" w:history="1">
         <w:r>
           <w:rPr>
             <w:rStyle w:val="Hipervnculo"/>
@@ -4315,7 +4315,7 @@
             <w:noProof/>
             <w:webHidden/>
           </w:rPr>
-          <w:instrText xml:space="preserve"> PAGEREF _Toc237700228 \h </w:instrText>
+          <w:instrText xml:space="preserve"> PAGEREF _Toc237700806 \h </w:instrText>
         </w:r>
         <w:r>
           <w:rPr>
@@ -4362,7 +4362,7 @@
           <w14:ligatures w14:val="standardContextual"/>
         </w:rPr>
       </w:pPr>
-      <w:hyperlink w:anchor="_Toc237700229" w:history="1">
+      <w:hyperlink w:anchor="_Toc237700807" w:history="1">
         <w:r>
           <w:rPr>
             <w:rStyle w:val="Hipervnculo"/>
@@ -4389,7 +4389,7 @@
             <w:noProof/>
             <w:webHidden/>
           </w:rPr>
-          <w:instrText xml:space="preserve"> PAGEREF _Toc237700229 \h </w:instrText>
+          <w:instrText xml:space="preserve"> PAGEREF _Toc237700807 \h </w:instrText>
         </w:r>
         <w:r>
           <w:rPr>
@@ -4436,7 +4436,7 @@
           <w14:ligatures w14:val="standardContextual"/>
         </w:rPr>
       </w:pPr>
-      <w:hyperlink w:anchor="_Toc237700230" w:history="1">
+      <w:hyperlink w:anchor="_Toc237700808" w:history="1">
         <w:r>
           <w:rPr>
             <w:rStyle w:val="Hipervnculo"/>
@@ -4463,7 +4463,7 @@
             <w:noProof/>
             <w:webHidden/>
           </w:rPr>
-          <w:instrText xml:space="preserve"> PAGEREF _Toc237700230 \h </w:instrText>
+          <w:instrText xml:space="preserve"> PAGEREF _Toc237700808 \h </w:instrText>
         </w:r>
         <w:r>
           <w:rPr>
@@ -4510,7 +4510,7 @@
           <w14:ligatures w14:val="standardContextual"/>
         </w:rPr>
       </w:pPr>
-      <w:hyperlink w:anchor="_Toc237700231" w:history="1">
+      <w:hyperlink w:anchor="_Toc237700809" w:history="1">
         <w:r>
           <w:rPr>
             <w:rStyle w:val="Hipervnculo"/>
@@ -4537,7 +4537,7 @@
             <w:noProof/>
             <w:webHidden/>
           </w:rPr>
-          <w:instrText xml:space="preserve"> PAGEREF _Toc237700231 \h </w:instrText>
+          <w:instrText xml:space="preserve"> PAGEREF _Toc237700809 \h </w:instrText>
         </w:r>
         <w:r>
           <w:rPr>
@@ -4584,7 +4584,7 @@
           <w14:ligatures w14:val="standardContextual"/>
         </w:rPr>
       </w:pPr>
-      <w:hyperlink w:anchor="_Toc237700232" w:history="1">
+      <w:hyperlink w:anchor="_Toc237700810" w:history="1">
         <w:r>
           <w:rPr>
             <w:rStyle w:val="Hipervnculo"/>
@@ -4611,7 +4611,7 @@
             <w:noProof/>
             <w:webHidden/>
           </w:rPr>
-          <w:instrText xml:space="preserve"> PAGEREF _Toc237700232 \h </w:instrText>
+          <w:instrText xml:space="preserve"> PAGEREF _Toc237700810 \h </w:instrText>
         </w:r>
         <w:r>
           <w:rPr>
@@ -4658,7 +4658,7 @@
           <w14:ligatures w14:val="standardContextual"/>
         </w:rPr>
       </w:pPr>
-      <w:hyperlink w:anchor="_Toc237700233" w:history="1">
+      <w:hyperlink w:anchor="_Toc237700811" w:history="1">
         <w:r>
           <w:rPr>
             <w:rStyle w:val="Hipervnculo"/>
@@ -4685,7 +4685,7 @@
             <w:noProof/>
             <w:webHidden/>
           </w:rPr>
-          <w:instrText xml:space="preserve"> PAGEREF _Toc237700233 \h </w:instrText>
+          <w:instrText xml:space="preserve"> PAGEREF _Toc237700811 \h </w:instrText>
         </w:r>
         <w:r>
           <w:rPr>
@@ -4732,7 +4732,7 @@
           <w14:ligatures w14:val="standardContextual"/>
         </w:rPr>
       </w:pPr>
-      <w:hyperlink w:anchor="_Toc237700234" w:history="1">
+      <w:hyperlink w:anchor="_Toc237700812" w:history="1">
         <w:r>
           <w:rPr>
             <w:rStyle w:val="Hipervnculo"/>
@@ -4759,7 +4759,7 @@
             <w:noProof/>
             <w:webHidden/>
           </w:rPr>
-          <w:instrText xml:space="preserve"> PAGEREF _Toc237700234 \h </w:instrText>
+          <w:instrText xml:space="preserve"> PAGEREF _Toc237700812 \h </w:instrText>
         </w:r>
         <w:r>
           <w:rPr>
@@ -4806,7 +4806,7 @@
           <w14:ligatures w14:val="standardContextual"/>
         </w:rPr>
       </w:pPr>
-      <w:hyperlink w:anchor="_Toc237700235" w:history="1">
+      <w:hyperlink w:anchor="_Toc237700813" w:history="1">
         <w:r>
           <w:rPr>
             <w:rStyle w:val="Hipervnculo"/>
@@ -4833,7 +4833,7 @@
             <w:noProof/>
             <w:webHidden/>
           </w:rPr>
-          <w:instrText xml:space="preserve"> PAGEREF _Toc237700235 \h </w:instrText>
+          <w:instrText xml:space="preserve"> PAGEREF _Toc237700813 \h </w:instrText>
         </w:r>
         <w:r>
           <w:rPr>
@@ -4880,7 +4880,7 @@
           <w14:ligatures w14:val="standardContextual"/>
         </w:rPr>
       </w:pPr>
-      <w:hyperlink w:anchor="_Toc237700236" w:history="1">
+      <w:hyperlink w:anchor="_Toc237700814" w:history="1">
         <w:r>
           <w:rPr>
             <w:rStyle w:val="Hipervnculo"/>
@@ -4907,7 +4907,7 @@
             <w:noProof/>
             <w:webHidden/>
           </w:rPr>
-          <w:instrText xml:space="preserve"> PAGEREF _Toc237700236 \h </w:instrText>
+          <w:instrText xml:space="preserve"> PAGEREF _Toc237700814 \h </w:instrText>
         </w:r>
         <w:r>
           <w:rPr>
@@ -4954,7 +4954,7 @@
           <w14:ligatures w14:val="standardContextual"/>
         </w:rPr>
       </w:pPr>
-      <w:hyperlink w:anchor="_Toc237700237" w:history="1">
+      <w:hyperlink w:anchor="_Toc237700815" w:history="1">
         <w:r>
           <w:rPr>
             <w:rStyle w:val="Hipervnculo"/>
@@ -4981,7 +4981,7 @@
             <w:noProof/>
             <w:webHidden/>
           </w:rPr>
-          <w:instrText xml:space="preserve"> PAGEREF _Toc237700237 \h </w:instrText>
+          <w:instrText xml:space="preserve"> PAGEREF _Toc237700815 \h </w:instrText>
         </w:r>
         <w:r>
           <w:rPr>
@@ -5028,7 +5028,7 @@
           <w14:ligatures w14:val="standardContextual"/>
         </w:rPr>
       </w:pPr>
-      <w:hyperlink w:anchor="_Toc237700238" w:history="1">
+      <w:hyperlink w:anchor="_Toc237700816" w:history="1">
         <w:r>
           <w:rPr>
             <w:rStyle w:val="Hipervnculo"/>
@@ -5055,7 +5055,7 @@
             <w:noProof/>
             <w:webHidden/>
           </w:rPr>
-          <w:instrText xml:space="preserve"> PAGEREF _Toc237700238 \h </w:instrText>
+          <w:instrText xml:space="preserve"> PAGEREF _Toc237700816 \h </w:instrText>
         </w:r>
         <w:r>
           <w:rPr>
@@ -5102,7 +5102,7 @@
           <w14:ligatures w14:val="standardContextual"/>
         </w:rPr>
       </w:pPr>
-      <w:hyperlink w:anchor="_Toc237700239" w:history="1">
+      <w:hyperlink w:anchor="_Toc237700817" w:history="1">
         <w:r>
           <w:rPr>
             <w:rStyle w:val="Hipervnculo"/>
@@ -5129,7 +5129,7 @@
             <w:noProof/>
             <w:webHidden/>
           </w:rPr>
-          <w:instrText xml:space="preserve"> PAGEREF _Toc237700239 \h </w:instrText>
+          <w:instrText xml:space="preserve"> PAGEREF _Toc237700817 \h </w:instrText>
         </w:r>
         <w:r>
           <w:rPr>
@@ -5176,7 +5176,7 @@
           <w14:ligatures w14:val="standardContextual"/>
         </w:rPr>
       </w:pPr>
-      <w:hyperlink w:anchor="_Toc237700240" w:history="1">
+      <w:hyperlink w:anchor="_Toc237700818" w:history="1">
         <w:r>
           <w:rPr>
             <w:rStyle w:val="Hipervnculo"/>
@@ -5203,7 +5203,7 @@
             <w:noProof/>
             <w:webHidden/>
           </w:rPr>
-          <w:instrText xml:space="preserve"> PAGEREF _Toc237700240 \h </w:instrText>
+          <w:instrText xml:space="preserve"> PAGEREF _Toc237700818 \h </w:instrText>
         </w:r>
         <w:r>
           <w:rPr>
@@ -5250,7 +5250,7 @@
           <w14:ligatures w14:val="standardContextual"/>
         </w:rPr>
       </w:pPr>
-      <w:hyperlink w:anchor="_Toc237700241" w:history="1">
+      <w:hyperlink w:anchor="_Toc237700819" w:history="1">
         <w:r>
           <w:rPr>
             <w:rStyle w:val="Hipervnculo"/>
@@ -5277,7 +5277,7 @@
             <w:noProof/>
             <w:webHidden/>
           </w:rPr>
-          <w:instrText xml:space="preserve"> PAGEREF _Toc237700241 \h </w:instrText>
+          <w:instrText xml:space="preserve"> PAGEREF _Toc237700819 \h </w:instrText>
         </w:r>
         <w:r>
           <w:rPr>
@@ -5324,7 +5324,7 @@
           <w14:ligatures w14:val="standardContextual"/>
         </w:rPr>
       </w:pPr>
-      <w:hyperlink w:anchor="_Toc237700242" w:history="1">
+      <w:hyperlink w:anchor="_Toc237700820" w:history="1">
         <w:r>
           <w:rPr>
             <w:rStyle w:val="Hipervnculo"/>
@@ -5351,7 +5351,7 @@
             <w:noProof/>
             <w:webHidden/>
           </w:rPr>
-          <w:instrText xml:space="preserve"> PAGEREF _Toc237700242 \h </w:instrText>
+          <w:instrText xml:space="preserve"> PAGEREF _Toc237700820 \h </w:instrText>
         </w:r>
         <w:r>
           <w:rPr>
@@ -5398,7 +5398,7 @@
           <w14:ligatures w14:val="standardContextual"/>
         </w:rPr>
       </w:pPr>
-      <w:hyperlink w:anchor="_Toc237700243" w:history="1">
+      <w:hyperlink w:anchor="_Toc237700821" w:history="1">
         <w:r>
           <w:rPr>
             <w:rStyle w:val="Hipervnculo"/>
@@ -5425,7 +5425,7 @@
             <w:noProof/>
             <w:webHidden/>
           </w:rPr>
-          <w:instrText xml:space="preserve"> PAGEREF _Toc237700243 \h </w:instrText>
+          <w:instrText xml:space="preserve"> PAGEREF _Toc237700821 \h </w:instrText>
         </w:r>
         <w:r>
           <w:rPr>
@@ -5472,7 +5472,7 @@
           <w14:ligatures w14:val="standardContextual"/>
         </w:rPr>
       </w:pPr>
-      <w:hyperlink w:anchor="_Toc237700244" w:history="1">
+      <w:hyperlink w:anchor="_Toc237700822" w:history="1">
         <w:r>
           <w:rPr>
             <w:rStyle w:val="Hipervnculo"/>
@@ -5499,7 +5499,7 @@
             <w:noProof/>
             <w:webHidden/>
           </w:rPr>
-          <w:instrText xml:space="preserve"> PAGEREF _Toc237700244 \h </w:instrText>
+          <w:instrText xml:space="preserve"> PAGEREF _Toc237700822 \h </w:instrText>
         </w:r>
         <w:r>
           <w:rPr>
@@ -5546,7 +5546,7 @@
           <w14:ligatures w14:val="standardContextual"/>
         </w:rPr>
       </w:pPr>
-      <w:hyperlink w:anchor="_Toc237700245" w:history="1">
+      <w:hyperlink w:anchor="_Toc237700823" w:history="1">
         <w:r>
           <w:rPr>
             <w:rStyle w:val="Hipervnculo"/>
@@ -5573,7 +5573,7 @@
             <w:noProof/>
             <w:webHidden/>
           </w:rPr>
-          <w:instrText xml:space="preserve"> PAGEREF _Toc237700245 \h </w:instrText>
+          <w:instrText xml:space="preserve"> PAGEREF _Toc237700823 \h </w:instrText>
         </w:r>
         <w:r>
           <w:rPr>
@@ -5620,7 +5620,7 @@
           <w14:ligatures w14:val="standardContextual"/>
         </w:rPr>
       </w:pPr>
-      <w:hyperlink w:anchor="_Toc237700246" w:history="1">
+      <w:hyperlink w:anchor="_Toc237700824" w:history="1">
         <w:r>
           <w:rPr>
             <w:rStyle w:val="Hipervnculo"/>
@@ -5647,7 +5647,7 @@
             <w:noProof/>
             <w:webHidden/>
           </w:rPr>
-          <w:instrText xml:space="preserve"> PAGEREF _Toc237700246 \h </w:instrText>
+          <w:instrText xml:space="preserve"> PAGEREF _Toc237700824 \h </w:instrText>
         </w:r>
         <w:r>
           <w:rPr>
@@ -5694,7 +5694,7 @@
           <w14:ligatures w14:val="standardContextual"/>
         </w:rPr>
       </w:pPr>
-      <w:hyperlink w:anchor="_Toc237700247" w:history="1">
+      <w:hyperlink w:anchor="_Toc237700825" w:history="1">
         <w:r>
           <w:rPr>
             <w:rStyle w:val="Hipervnculo"/>
@@ -5721,7 +5721,7 @@
             <w:noProof/>
             <w:webHidden/>
           </w:rPr>
-          <w:instrText xml:space="preserve"> PAGEREF _Toc237700247 \h </w:instrText>
+          <w:instrText xml:space="preserve"> PAGEREF _Toc237700825 \h </w:instrText>
         </w:r>
         <w:r>
           <w:rPr>
@@ -5768,7 +5768,7 @@
           <w14:ligatures w14:val="standardContextual"/>
         </w:rPr>
       </w:pPr>
-      <w:hyperlink w:anchor="_Toc237700248" w:history="1">
+      <w:hyperlink w:anchor="_Toc237700826" w:history="1">
         <w:r>
           <w:rPr>
             <w:rStyle w:val="Hipervnculo"/>
@@ -5795,7 +5795,7 @@
             <w:noProof/>
             <w:webHidden/>
           </w:rPr>
-          <w:instrText xml:space="preserve"> PAGEREF _Toc237700248 \h </w:instrText>
+          <w:instrText xml:space="preserve"> PAGEREF _Toc237700826 \h </w:instrText>
         </w:r>
         <w:r>
           <w:rPr>
@@ -5842,7 +5842,7 @@
           <w14:ligatures w14:val="standardContextual"/>
         </w:rPr>
       </w:pPr>
-      <w:hyperlink w:anchor="_Toc237700249" w:history="1">
+      <w:hyperlink w:anchor="_Toc237700827" w:history="1">
         <w:r>
           <w:rPr>
             <w:rStyle w:val="Hipervnculo"/>
@@ -5869,7 +5869,7 @@
             <w:noProof/>
             <w:webHidden/>
           </w:rPr>
-          <w:instrText xml:space="preserve"> PAGEREF _Toc237700249 \h </w:instrText>
+          <w:instrText xml:space="preserve"> PAGEREF _Toc237700827 \h </w:instrText>
         </w:r>
         <w:r>
           <w:rPr>
@@ -5956,7 +5956,7 @@
         <w:pStyle w:val="Ttulo1"/>
         <w:spacing w:before="100" w:after="30"/>
       </w:pPr>
-      <w:bookmarkStart w:id="0" w:name="_Toc237700187"/>
+      <w:bookmarkStart w:id="0" w:name="_Toc237700765"/>
       <w:r>
         <w:rPr>
           <w:rFonts w:ascii="Georgia" w:hAnsi="Georgia"/>
@@ -5973,7 +5973,7 @@
         <w:pStyle w:val="Ttulo2"/>
         <w:spacing w:before="70" w:after="20"/>
       </w:pPr>
-      <w:bookmarkStart w:id="1" w:name="_Toc237700188"/>
+      <w:bookmarkStart w:id="1" w:name="_Toc237700766"/>
       <w:r>
         <w:rPr>
           <w:rFonts w:ascii="Georgia" w:hAnsi="Georgia"/>
@@ -6023,7 +6023,7 @@
         <w:pStyle w:val="Ttulo2"/>
         <w:spacing w:before="70" w:after="20"/>
       </w:pPr>
-      <w:bookmarkStart w:id="2" w:name="_Toc237700189"/>
+      <w:bookmarkStart w:id="2" w:name="_Toc237700767"/>
       <w:r>
         <w:rPr>
           <w:rFonts w:ascii="Georgia" w:hAnsi="Georgia"/>
@@ -6111,7 +6111,7 @@
                 <w:noProof/>
               </w:rPr>
               <w:drawing>
-                <wp:inline distT="0" distB="0" distL="0" distR="0" wp14:anchorId="3ED9A704" wp14:editId="3EE91DEB">
+                <wp:inline distT="0" distB="0" distL="0" distR="0" wp14:anchorId="47C49C56" wp14:editId="5CAE63E9">
                   <wp:extent cx="2926080" cy="1524412"/>
                   <wp:effectExtent l="0" t="0" r="0" b="0"/>
                   <wp:docPr id="1" name="Picture 1"/>
@@ -6167,7 +6167,7 @@
                 <w:noProof/>
               </w:rPr>
               <w:drawing>
-                <wp:inline distT="0" distB="0" distL="0" distR="0" wp14:anchorId="102D9591" wp14:editId="3FCFA34F">
+                <wp:inline distT="0" distB="0" distL="0" distR="0" wp14:anchorId="293BC53A" wp14:editId="750A04E7">
                   <wp:extent cx="2926080" cy="1437831"/>
                   <wp:effectExtent l="0" t="0" r="0" b="0"/>
                   <wp:docPr id="2" name="Picture 2"/>
@@ -6266,7 +6266,7 @@
         <w:pStyle w:val="Ttulo2"/>
         <w:spacing w:before="70" w:after="20"/>
       </w:pPr>
-      <w:bookmarkStart w:id="3" w:name="_Toc237700190"/>
+      <w:bookmarkStart w:id="3" w:name="_Toc237700768"/>
       <w:r>
         <w:rPr>
           <w:rFonts w:ascii="Georgia" w:hAnsi="Georgia"/>
@@ -6381,7 +6381,7 @@
         <w:pStyle w:val="Ttulo2"/>
         <w:spacing w:before="70" w:after="20"/>
       </w:pPr>
-      <w:bookmarkStart w:id="4" w:name="_Toc237700191"/>
+      <w:bookmarkStart w:id="4" w:name="_Toc237700769"/>
       <w:r>
         <w:rPr>
           <w:rFonts w:ascii="Georgia" w:hAnsi="Georgia"/>
@@ -6850,7 +6850,7 @@
         <w:pStyle w:val="Ttulo2"/>
         <w:spacing w:before="70" w:after="20"/>
       </w:pPr>
-      <w:bookmarkStart w:id="5" w:name="_Toc237700192"/>
+      <w:bookmarkStart w:id="5" w:name="_Toc237700770"/>
       <w:r>
         <w:rPr>
           <w:rFonts w:ascii="Georgia" w:hAnsi="Georgia"/>
@@ -6971,7 +6971,7 @@
         <w:pStyle w:val="Ttulo2"/>
         <w:spacing w:before="70" w:after="20"/>
       </w:pPr>
-      <w:bookmarkStart w:id="6" w:name="_Toc237700193"/>
+      <w:bookmarkStart w:id="6" w:name="_Toc237700771"/>
       <w:r>
         <w:rPr>
           <w:rFonts w:ascii="Georgia" w:hAnsi="Georgia"/>
@@ -8062,7 +8062,7 @@
         <w:pStyle w:val="Ttulo1"/>
         <w:spacing w:before="100" w:after="30"/>
       </w:pPr>
-      <w:bookmarkStart w:id="7" w:name="_Toc237700194"/>
+      <w:bookmarkStart w:id="7" w:name="_Toc237700772"/>
       <w:r>
         <w:rPr>
           <w:rFonts w:ascii="Georgia" w:hAnsi="Georgia"/>
@@ -8078,7 +8078,7 @@
         <w:pStyle w:val="Ttulo2"/>
         <w:spacing w:before="70" w:after="20"/>
       </w:pPr>
-      <w:bookmarkStart w:id="8" w:name="_Toc237700195"/>
+      <w:bookmarkStart w:id="8" w:name="_Toc237700773"/>
       <w:r>
         <w:rPr>
           <w:rFonts w:ascii="Georgia" w:hAnsi="Georgia"/>
@@ -8148,7 +8148,7 @@
                 <w:noProof/>
               </w:rPr>
               <w:drawing>
-                <wp:inline distT="0" distB="0" distL="0" distR="0" wp14:anchorId="1BB8DA0E" wp14:editId="1D920216">
+                <wp:inline distT="0" distB="0" distL="0" distR="0" wp14:anchorId="1C6B1306" wp14:editId="52C57F75">
                   <wp:extent cx="2926080" cy="1426594"/>
                   <wp:effectExtent l="0" t="0" r="0" b="0"/>
                   <wp:docPr id="3" name="Picture 3"/>
@@ -8204,7 +8204,7 @@
                 <w:noProof/>
               </w:rPr>
               <w:drawing>
-                <wp:inline distT="0" distB="0" distL="0" distR="0" wp14:anchorId="0566C5E9" wp14:editId="52C32CCC">
+                <wp:inline distT="0" distB="0" distL="0" distR="0" wp14:anchorId="7DB780C5" wp14:editId="03D3FA89">
                   <wp:extent cx="2926080" cy="1494260"/>
                   <wp:effectExtent l="0" t="0" r="0" b="0"/>
                   <wp:docPr id="4" name="Picture 4"/>
@@ -8308,7 +8308,7 @@
         <w:pStyle w:val="Ttulo2"/>
         <w:spacing w:before="70" w:after="20"/>
       </w:pPr>
-      <w:bookmarkStart w:id="9" w:name="_Toc237700196"/>
+      <w:bookmarkStart w:id="9" w:name="_Toc237700774"/>
       <w:r>
         <w:rPr>
           <w:rFonts w:ascii="Georgia" w:hAnsi="Georgia"/>
@@ -8509,7 +8509,7 @@
         <w:pStyle w:val="Ttulo1"/>
         <w:spacing w:before="100" w:after="30"/>
       </w:pPr>
-      <w:bookmarkStart w:id="10" w:name="_Toc237700197"/>
+      <w:bookmarkStart w:id="10" w:name="_Toc237700775"/>
       <w:r>
         <w:rPr>
           <w:rFonts w:ascii="Georgia" w:hAnsi="Georgia"/>
@@ -8525,7 +8525,7 @@
         <w:pStyle w:val="Ttulo2"/>
         <w:spacing w:before="70" w:after="20"/>
       </w:pPr>
-      <w:bookmarkStart w:id="11" w:name="_Toc237700198"/>
+      <w:bookmarkStart w:id="11" w:name="_Toc237700776"/>
       <w:r>
         <w:rPr>
           <w:rFonts w:ascii="Georgia" w:hAnsi="Georgia"/>
@@ -8595,7 +8595,7 @@
                 <w:noProof/>
               </w:rPr>
               <w:drawing>
-                <wp:inline distT="0" distB="0" distL="0" distR="0" wp14:anchorId="249A6DF2" wp14:editId="53789C9A">
+                <wp:inline distT="0" distB="0" distL="0" distR="0" wp14:anchorId="763EFBB6" wp14:editId="694B59D2">
                   <wp:extent cx="2926080" cy="1636252"/>
                   <wp:effectExtent l="0" t="0" r="0" b="0"/>
                   <wp:docPr id="5" name="Picture 5"/>
@@ -8651,7 +8651,7 @@
                 <w:noProof/>
               </w:rPr>
               <w:drawing>
-                <wp:inline distT="0" distB="0" distL="0" distR="0" wp14:anchorId="551CA8EB" wp14:editId="47892B91">
+                <wp:inline distT="0" distB="0" distL="0" distR="0" wp14:anchorId="0AC1ABED" wp14:editId="42ED6662">
                   <wp:extent cx="2926080" cy="1481181"/>
                   <wp:effectExtent l="0" t="0" r="0" b="0"/>
                   <wp:docPr id="6" name="Picture 6"/>
@@ -8755,7 +8755,7 @@
         <w:pStyle w:val="Ttulo2"/>
         <w:spacing w:before="70" w:after="20"/>
       </w:pPr>
-      <w:bookmarkStart w:id="12" w:name="_Toc237700199"/>
+      <w:bookmarkStart w:id="12" w:name="_Toc237700777"/>
       <w:r>
         <w:rPr>
           <w:rFonts w:ascii="Georgia" w:hAnsi="Georgia"/>
@@ -8780,7 +8780,7 @@
         <w:pStyle w:val="Ttulo2"/>
         <w:spacing w:before="70" w:after="20"/>
       </w:pPr>
-      <w:bookmarkStart w:id="13" w:name="_Toc237700200"/>
+      <w:bookmarkStart w:id="13" w:name="_Toc237700778"/>
       <w:r>
         <w:rPr>
           <w:rFonts w:ascii="Georgia" w:hAnsi="Georgia"/>
@@ -8850,7 +8850,7 @@
                 <w:noProof/>
               </w:rPr>
               <w:drawing>
-                <wp:inline distT="0" distB="0" distL="0" distR="0" wp14:anchorId="74593E9A" wp14:editId="1EC38D7D">
+                <wp:inline distT="0" distB="0" distL="0" distR="0" wp14:anchorId="287D9BCA" wp14:editId="75CE5438">
                   <wp:extent cx="2926080" cy="1626307"/>
                   <wp:effectExtent l="0" t="0" r="0" b="0"/>
                   <wp:docPr id="7" name="Picture 7"/>
@@ -8906,7 +8906,7 @@
                 <w:noProof/>
               </w:rPr>
               <w:drawing>
-                <wp:inline distT="0" distB="0" distL="0" distR="0" wp14:anchorId="4F17AB7B" wp14:editId="5A1A7AEE">
+                <wp:inline distT="0" distB="0" distL="0" distR="0" wp14:anchorId="0781DF42" wp14:editId="1C5EA4A5">
                   <wp:extent cx="2926080" cy="1479479"/>
                   <wp:effectExtent l="0" t="0" r="0" b="0"/>
                   <wp:docPr id="8" name="Picture 8"/>
@@ -9005,7 +9005,7 @@
         <w:pStyle w:val="Ttulo2"/>
         <w:spacing w:before="70" w:after="20"/>
       </w:pPr>
-      <w:bookmarkStart w:id="14" w:name="_Toc237700201"/>
+      <w:bookmarkStart w:id="14" w:name="_Toc237700779"/>
       <w:r>
         <w:rPr>
           <w:rFonts w:ascii="Georgia" w:hAnsi="Georgia"/>
@@ -9093,7 +9093,7 @@
                 <w:noProof/>
               </w:rPr>
               <w:drawing>
-                <wp:inline distT="0" distB="0" distL="0" distR="0" wp14:anchorId="44EACFDB" wp14:editId="7F34E4C3">
+                <wp:inline distT="0" distB="0" distL="0" distR="0" wp14:anchorId="75DF1439" wp14:editId="0A17B716">
                   <wp:extent cx="2926080" cy="1662311"/>
                   <wp:effectExtent l="0" t="0" r="0" b="0"/>
                   <wp:docPr id="9" name="Picture 9"/>
@@ -9149,7 +9149,7 @@
                 <w:noProof/>
               </w:rPr>
               <w:drawing>
-                <wp:inline distT="0" distB="0" distL="0" distR="0" wp14:anchorId="2B3915BC" wp14:editId="4803A1BE">
+                <wp:inline distT="0" distB="0" distL="0" distR="0" wp14:anchorId="4AD77B84" wp14:editId="47AA5D74">
                   <wp:extent cx="2926080" cy="1801004"/>
                   <wp:effectExtent l="0" t="0" r="0" b="0"/>
                   <wp:docPr id="10" name="Picture 10"/>
@@ -9248,7 +9248,7 @@
         <w:pStyle w:val="Ttulo1"/>
         <w:spacing w:before="100" w:after="30"/>
       </w:pPr>
-      <w:bookmarkStart w:id="15" w:name="_Toc237700202"/>
+      <w:bookmarkStart w:id="15" w:name="_Toc237700780"/>
       <w:r>
         <w:rPr>
           <w:rFonts w:ascii="Georgia" w:hAnsi="Georgia"/>
@@ -9264,7 +9264,7 @@
         <w:pStyle w:val="Ttulo2"/>
         <w:spacing w:before="70" w:after="20"/>
       </w:pPr>
-      <w:bookmarkStart w:id="16" w:name="_Toc237700203"/>
+      <w:bookmarkStart w:id="16" w:name="_Toc237700781"/>
       <w:r>
         <w:rPr>
           <w:rFonts w:ascii="Georgia" w:hAnsi="Georgia"/>
@@ -9651,7 +9651,7 @@
         <w:pStyle w:val="Ttulo2"/>
         <w:spacing w:before="70" w:after="20"/>
       </w:pPr>
-      <w:bookmarkStart w:id="17" w:name="_Toc237700204"/>
+      <w:bookmarkStart w:id="17" w:name="_Toc237700782"/>
       <w:r>
         <w:rPr>
           <w:rFonts w:ascii="Georgia" w:hAnsi="Georgia"/>
@@ -9685,7 +9685,7 @@
         <w:pStyle w:val="Ttulo1"/>
         <w:spacing w:before="100" w:after="30"/>
       </w:pPr>
-      <w:bookmarkStart w:id="18" w:name="_Toc237700205"/>
+      <w:bookmarkStart w:id="18" w:name="_Toc237700783"/>
       <w:r>
         <w:rPr>
           <w:rFonts w:ascii="Georgia" w:hAnsi="Georgia"/>
@@ -9701,7 +9701,7 @@
         <w:pStyle w:val="Ttulo2"/>
         <w:spacing w:before="70" w:after="20"/>
       </w:pPr>
-      <w:bookmarkStart w:id="19" w:name="_Toc237700206"/>
+      <w:bookmarkStart w:id="19" w:name="_Toc237700784"/>
       <w:r>
         <w:rPr>
           <w:rFonts w:ascii="Georgia" w:hAnsi="Georgia"/>
@@ -9761,7 +9761,7 @@
         <w:pStyle w:val="Ttulo2"/>
         <w:spacing w:before="70" w:after="20"/>
       </w:pPr>
-      <w:bookmarkStart w:id="20" w:name="_Toc237700207"/>
+      <w:bookmarkStart w:id="20" w:name="_Toc237700785"/>
       <w:r>
         <w:rPr>
           <w:rFonts w:ascii="Georgia" w:hAnsi="Georgia"/>
@@ -9831,7 +9831,7 @@
                 <w:noProof/>
               </w:rPr>
               <w:drawing>
-                <wp:inline distT="0" distB="0" distL="0" distR="0" wp14:anchorId="4E60C4B3" wp14:editId="7166D639">
+                <wp:inline distT="0" distB="0" distL="0" distR="0" wp14:anchorId="6DD0178F" wp14:editId="6324C2C8">
                   <wp:extent cx="2926080" cy="1714660"/>
                   <wp:effectExtent l="0" t="0" r="0" b="0"/>
                   <wp:docPr id="11" name="Picture 11"/>
@@ -9887,7 +9887,7 @@
                 <w:noProof/>
               </w:rPr>
               <w:drawing>
-                <wp:inline distT="0" distB="0" distL="0" distR="0" wp14:anchorId="113548B0" wp14:editId="443244B4">
+                <wp:inline distT="0" distB="0" distL="0" distR="0" wp14:anchorId="145159FC" wp14:editId="0FF5DE88">
                   <wp:extent cx="2926080" cy="1558188"/>
                   <wp:effectExtent l="0" t="0" r="0" b="0"/>
                   <wp:docPr id="12" name="Picture 12"/>
@@ -10753,7 +10753,7 @@
         <w:pStyle w:val="Ttulo1"/>
         <w:spacing w:before="100" w:after="30"/>
       </w:pPr>
-      <w:bookmarkStart w:id="21" w:name="_Toc237700208"/>
+      <w:bookmarkStart w:id="21" w:name="_Toc237700786"/>
       <w:r>
         <w:rPr>
           <w:rFonts w:ascii="Georgia" w:hAnsi="Georgia"/>
@@ -10770,7 +10770,7 @@
         <w:pStyle w:val="Ttulo2"/>
         <w:spacing w:before="70" w:after="20"/>
       </w:pPr>
-      <w:bookmarkStart w:id="22" w:name="_Toc237700209"/>
+      <w:bookmarkStart w:id="22" w:name="_Toc237700787"/>
       <w:r>
         <w:rPr>
           <w:rFonts w:ascii="Georgia" w:hAnsi="Georgia"/>
@@ -10830,7 +10830,7 @@
         <w:pStyle w:val="Ttulo2"/>
         <w:spacing w:before="70" w:after="20"/>
       </w:pPr>
-      <w:bookmarkStart w:id="23" w:name="_Toc237700210"/>
+      <w:bookmarkStart w:id="23" w:name="_Toc237700788"/>
       <w:r>
         <w:rPr>
           <w:rFonts w:ascii="Georgia" w:hAnsi="Georgia"/>
@@ -11034,7 +11034,7 @@
                 <w:noProof/>
               </w:rPr>
               <w:drawing>
-                <wp:inline distT="0" distB="0" distL="0" distR="0" wp14:anchorId="57829324" wp14:editId="4753BF8B">
+                <wp:inline distT="0" distB="0" distL="0" distR="0" wp14:anchorId="6666D3E8" wp14:editId="11DC5695">
                   <wp:extent cx="2926080" cy="1540391"/>
                   <wp:effectExtent l="0" t="0" r="0" b="0"/>
                   <wp:docPr id="13" name="Picture 13"/>
@@ -11090,7 +11090,7 @@
                 <w:noProof/>
               </w:rPr>
               <w:drawing>
-                <wp:inline distT="0" distB="0" distL="0" distR="0" wp14:anchorId="72E80DD0" wp14:editId="4B66C7FE">
+                <wp:inline distT="0" distB="0" distL="0" distR="0" wp14:anchorId="4CF249CD" wp14:editId="060615BE">
                   <wp:extent cx="2926080" cy="1658038"/>
                   <wp:effectExtent l="0" t="0" r="0" b="0"/>
                   <wp:docPr id="14" name="Picture 14"/>
@@ -11189,7 +11189,7 @@
         <w:pStyle w:val="Ttulo2"/>
         <w:spacing w:before="70" w:after="20"/>
       </w:pPr>
-      <w:bookmarkStart w:id="24" w:name="_Toc237700211"/>
+      <w:bookmarkStart w:id="24" w:name="_Toc237700789"/>
       <w:r>
         <w:rPr>
           <w:rFonts w:ascii="Georgia" w:hAnsi="Georgia"/>
@@ -12012,7 +12012,7 @@
         <w:pStyle w:val="Ttulo1"/>
         <w:spacing w:before="100" w:after="30"/>
       </w:pPr>
-      <w:bookmarkStart w:id="25" w:name="_Toc237700212"/>
+      <w:bookmarkStart w:id="25" w:name="_Toc237700790"/>
       <w:r>
         <w:rPr>
           <w:rFonts w:ascii="Georgia" w:hAnsi="Georgia"/>
@@ -12028,7 +12028,7 @@
         <w:pStyle w:val="Ttulo2"/>
         <w:spacing w:before="70" w:after="20"/>
       </w:pPr>
-      <w:bookmarkStart w:id="26" w:name="_Toc237700213"/>
+      <w:bookmarkStart w:id="26" w:name="_Toc237700791"/>
       <w:r>
         <w:rPr>
           <w:rFonts w:ascii="Georgia" w:hAnsi="Georgia"/>
@@ -13443,7 +13443,7 @@
         <w:pStyle w:val="Ttulo2"/>
         <w:spacing w:before="70" w:after="20"/>
       </w:pPr>
-      <w:bookmarkStart w:id="27" w:name="_Toc237700214"/>
+      <w:bookmarkStart w:id="27" w:name="_Toc237700792"/>
       <w:r>
         <w:rPr>
           <w:rFonts w:ascii="Georgia" w:hAnsi="Georgia"/>
@@ -13555,7 +13555,7 @@
         <w:pStyle w:val="Ttulo1"/>
         <w:spacing w:before="100" w:after="30"/>
       </w:pPr>
-      <w:bookmarkStart w:id="28" w:name="_Toc237700215"/>
+      <w:bookmarkStart w:id="28" w:name="_Toc237700793"/>
       <w:r>
         <w:rPr>
           <w:rFonts w:ascii="Georgia" w:hAnsi="Georgia"/>
@@ -13572,7 +13572,7 @@
         <w:pStyle w:val="Ttulo2"/>
         <w:spacing w:before="70" w:after="20"/>
       </w:pPr>
-      <w:bookmarkStart w:id="29" w:name="_Toc237700216"/>
+      <w:bookmarkStart w:id="29" w:name="_Toc237700794"/>
       <w:r>
         <w:rPr>
           <w:rFonts w:ascii="Georgia" w:hAnsi="Georgia"/>
@@ -13632,7 +13632,7 @@
         <w:pStyle w:val="Ttulo2"/>
         <w:spacing w:before="70" w:after="20"/>
       </w:pPr>
-      <w:bookmarkStart w:id="30" w:name="_Toc237700217"/>
+      <w:bookmarkStart w:id="30" w:name="_Toc237700795"/>
       <w:r>
         <w:rPr>
           <w:rFonts w:ascii="Georgia" w:hAnsi="Georgia"/>
@@ -13702,7 +13702,7 @@
                 <w:noProof/>
               </w:rPr>
               <w:drawing>
-                <wp:inline distT="0" distB="0" distL="0" distR="0" wp14:anchorId="4113369C" wp14:editId="1922E8A0">
+                <wp:inline distT="0" distB="0" distL="0" distR="0" wp14:anchorId="327CCC74" wp14:editId="78BC3AFB">
                   <wp:extent cx="2926080" cy="1534596"/>
                   <wp:effectExtent l="0" t="0" r="0" b="0"/>
                   <wp:docPr id="15" name="Picture 15"/>
@@ -13758,7 +13758,7 @@
                 <w:noProof/>
               </w:rPr>
               <w:drawing>
-                <wp:inline distT="0" distB="0" distL="0" distR="0" wp14:anchorId="6B42EF74" wp14:editId="01E9313A">
+                <wp:inline distT="0" distB="0" distL="0" distR="0" wp14:anchorId="682F9BE7" wp14:editId="057CDC57">
                   <wp:extent cx="2926080" cy="1680519"/>
                   <wp:effectExtent l="0" t="0" r="0" b="0"/>
                   <wp:docPr id="16" name="Picture 16"/>
@@ -13857,7 +13857,7 @@
         <w:pStyle w:val="Ttulo1"/>
         <w:spacing w:before="100" w:after="30"/>
       </w:pPr>
-      <w:bookmarkStart w:id="31" w:name="_Toc237700218"/>
+      <w:bookmarkStart w:id="31" w:name="_Toc237700796"/>
       <w:r>
         <w:rPr>
           <w:rFonts w:ascii="Georgia" w:hAnsi="Georgia"/>
@@ -13873,7 +13873,7 @@
         <w:pStyle w:val="Ttulo2"/>
         <w:spacing w:before="70" w:after="20"/>
       </w:pPr>
-      <w:bookmarkStart w:id="32" w:name="_Toc237700219"/>
+      <w:bookmarkStart w:id="32" w:name="_Toc237700797"/>
       <w:r>
         <w:rPr>
           <w:rFonts w:ascii="Georgia" w:hAnsi="Georgia"/>
@@ -14803,7 +14803,7 @@
         <w:pStyle w:val="Ttulo2"/>
         <w:spacing w:before="70" w:after="20"/>
       </w:pPr>
-      <w:bookmarkStart w:id="33" w:name="_Toc237700220"/>
+      <w:bookmarkStart w:id="33" w:name="_Toc237700798"/>
       <w:r>
         <w:rPr>
           <w:rFonts w:ascii="Georgia" w:hAnsi="Georgia"/>
@@ -14949,7 +14949,7 @@
         <w:pStyle w:val="Ttulo2"/>
         <w:spacing w:before="70" w:after="20"/>
       </w:pPr>
-      <w:bookmarkStart w:id="34" w:name="_Toc237700221"/>
+      <w:bookmarkStart w:id="34" w:name="_Toc237700799"/>
       <w:r>
         <w:rPr>
           <w:rFonts w:ascii="Georgia" w:hAnsi="Georgia"/>
@@ -14973,7 +14973,7 @@
         <w:pStyle w:val="Ttulo1"/>
         <w:spacing w:before="100" w:after="30"/>
       </w:pPr>
-      <w:bookmarkStart w:id="35" w:name="_Toc237700222"/>
+      <w:bookmarkStart w:id="35" w:name="_Toc237700800"/>
       <w:r>
         <w:rPr>
           <w:rFonts w:ascii="Georgia" w:hAnsi="Georgia"/>
@@ -14989,14 +14989,14 @@
         <w:pStyle w:val="Ttulo2"/>
         <w:spacing w:before="70" w:after="20"/>
       </w:pPr>
-      <w:bookmarkStart w:id="36" w:name="_Toc237700223"/>
+      <w:bookmarkStart w:id="36" w:name="_Toc237700801"/>
       <w:r>
         <w:rPr>
           <w:rFonts w:ascii="Georgia" w:hAnsi="Georgia"/>
           <w:color w:val="1E3A8A"/>
           <w:sz w:val="18"/>
         </w:rPr>
-        <w:t>Desempeño Operativo y Cobertura de Intereses</w:t>
+        <w:t>Desempeño Operativo, Solvencia y Cobertura Financiera</w:t>
       </w:r>
       <w:bookmarkEnd w:id="36"/>
     </w:p>
@@ -15005,16 +15005,70 @@
         <w:spacing w:after="20" w:line="247" w:lineRule="auto"/>
       </w:pPr>
       <w:r>
-        <w:t xml:space="preserve">La serie histórica auditada demuestra la solidez operativa de Aluar en distintos momentos del ciclo macroeconómico. El ratio de cobertura de intereses (EBIT/Intereses) cerró en </w:t>
+        <w:t xml:space="preserve">El análisis de ratios auditados (2020–2025) demuestra la solidez de Aluar en cuatro dimensiones: </w:t>
       </w:r>
       <w:r>
         <w:rPr>
           <w:b/>
         </w:rPr>
-        <w:t>3,53x en 2025</w:t>
+        <w:t>1) Rentabilidad (ROIC y Márgenes):</w:t>
       </w:r>
       <w:r>
-        <w:t xml:space="preserve"> tras el pico de endeudamiento financiero, con ratios de liquidez corriente por encima de 1,40x:</w:t>
+        <w:t xml:space="preserve"> Margen EBITDA promedió 20,1% (pico del 32,0% en 2022) y el ROIC cerró en 3,52% en 2025 por la inmovilización de USD 243,9 MM en PEAL V, normalizándose a 7,06% terminal; </w:t>
+      </w:r>
+      <w:r>
+        <w:rPr>
+          <w:b/>
+        </w:rPr>
+        <w:t>2) Solvencia y Endeudamiento:</w:t>
+      </w:r>
+      <w:r>
+        <w:t xml:space="preserve"> Deuda Neta / EBITDA de 3,22x en el pico de inversión, con cobertura de intereses de </w:t>
+      </w:r>
+      <w:r>
+        <w:rPr>
+          <w:b/>
+        </w:rPr>
+        <w:t>3,53x</w:t>
+      </w:r>
+      <w:r>
+        <w:t xml:space="preserve"> (EBIT/Intereses) y Deuda Total / PN de 0,59x, asegurando el servicio de deuda; </w:t>
+      </w:r>
+      <w:r>
+        <w:rPr>
+          <w:b/>
+        </w:rPr>
+        <w:t>3) Liquidez Estructural:</w:t>
+      </w:r>
+      <w:r>
+        <w:t xml:space="preserve"> Liquidez Corriente de </w:t>
+      </w:r>
+      <w:r>
+        <w:rPr>
+          <w:b/>
+        </w:rPr>
+        <w:t>2,44x</w:t>
+      </w:r>
+      <w:r>
+        <w:t xml:space="preserve"> (Prueba Ácida 1,42x), asegurando la compra de alúmina de ultramar; y </w:t>
+      </w:r>
+      <w:r>
+        <w:rPr>
+          <w:b/>
+        </w:rPr>
+        <w:t>4) Eficiencia Operativa:</w:t>
+      </w:r>
+      <w:r>
+        <w:t xml:space="preserve"> Ciclo de Conversión de Efectivo en </w:t>
+      </w:r>
+      <w:r>
+        <w:rPr>
+          <w:b/>
+        </w:rPr>
+        <w:t>64 días</w:t>
+      </w:r>
+      <w:r>
+        <w:t xml:space="preserve"> (DIO = 120, DSO = 45, DPO = 101), optimizando el capital de trabajo.</w:t>
       </w:r>
     </w:p>
     <w:p>
@@ -17596,7 +17650,7 @@
         <w:pStyle w:val="Ttulo1"/>
         <w:spacing w:before="100" w:after="30"/>
       </w:pPr>
-      <w:bookmarkStart w:id="37" w:name="_Toc237700224"/>
+      <w:bookmarkStart w:id="37" w:name="_Toc237700802"/>
       <w:r>
         <w:rPr>
           <w:rFonts w:ascii="Georgia" w:hAnsi="Georgia"/>
@@ -17613,7 +17667,7 @@
         <w:pStyle w:val="Ttulo2"/>
         <w:spacing w:before="70" w:after="20"/>
       </w:pPr>
-      <w:bookmarkStart w:id="38" w:name="_Toc237700225"/>
+      <w:bookmarkStart w:id="38" w:name="_Toc237700803"/>
       <w:r>
         <w:rPr>
           <w:rFonts w:ascii="Georgia" w:hAnsi="Georgia"/>
@@ -17799,7 +17853,7 @@
         <w:pStyle w:val="Ttulo2"/>
         <w:spacing w:before="70" w:after="20"/>
       </w:pPr>
-      <w:bookmarkStart w:id="39" w:name="_Toc237700226"/>
+      <w:bookmarkStart w:id="39" w:name="_Toc237700804"/>
       <w:r>
         <w:rPr>
           <w:rFonts w:ascii="Georgia" w:hAnsi="Georgia"/>
@@ -17860,7 +17914,7 @@
                 <w:noProof/>
               </w:rPr>
               <w:drawing>
-                <wp:inline distT="0" distB="0" distL="0" distR="0" wp14:anchorId="6A1229C0" wp14:editId="55D8A6FC">
+                <wp:inline distT="0" distB="0" distL="0" distR="0" wp14:anchorId="221DACE8" wp14:editId="677EF5B4">
                   <wp:extent cx="2926080" cy="1626569"/>
                   <wp:effectExtent l="0" t="0" r="0" b="0"/>
                   <wp:docPr id="17" name="Picture 17"/>
@@ -17916,7 +17970,7 @@
                 <w:noProof/>
               </w:rPr>
               <w:drawing>
-                <wp:inline distT="0" distB="0" distL="0" distR="0" wp14:anchorId="738AE22B" wp14:editId="3213768C">
+                <wp:inline distT="0" distB="0" distL="0" distR="0" wp14:anchorId="0CA4E7CA" wp14:editId="2D5CEB5A">
                   <wp:extent cx="2926080" cy="1691675"/>
                   <wp:effectExtent l="0" t="0" r="0" b="0"/>
                   <wp:docPr id="18" name="Picture 18"/>
@@ -18015,7 +18069,7 @@
         <w:pStyle w:val="Ttulo2"/>
         <w:spacing w:before="70" w:after="20"/>
       </w:pPr>
-      <w:bookmarkStart w:id="40" w:name="_Toc237700227"/>
+      <w:bookmarkStart w:id="40" w:name="_Toc237700805"/>
       <w:r>
         <w:rPr>
           <w:rFonts w:ascii="Georgia" w:hAnsi="Georgia"/>
@@ -18573,7 +18627,7 @@
         <w:pStyle w:val="Ttulo1"/>
         <w:spacing w:before="100" w:after="30"/>
       </w:pPr>
-      <w:bookmarkStart w:id="41" w:name="_Toc237700228"/>
+      <w:bookmarkStart w:id="41" w:name="_Toc237700806"/>
       <w:r>
         <w:rPr>
           <w:rFonts w:ascii="Georgia" w:hAnsi="Georgia"/>
@@ -18589,7 +18643,7 @@
         <w:pStyle w:val="Ttulo2"/>
         <w:spacing w:before="70" w:after="20"/>
       </w:pPr>
-      <w:bookmarkStart w:id="42" w:name="_Toc237700229"/>
+      <w:bookmarkStart w:id="42" w:name="_Toc237700807"/>
       <w:r>
         <w:rPr>
           <w:rFonts w:ascii="Georgia" w:hAnsi="Georgia"/>
@@ -18650,7 +18704,7 @@
                 <w:noProof/>
               </w:rPr>
               <w:drawing>
-                <wp:inline distT="0" distB="0" distL="0" distR="0" wp14:anchorId="2FB79421" wp14:editId="30BA8377">
+                <wp:inline distT="0" distB="0" distL="0" distR="0" wp14:anchorId="60BDB3A9" wp14:editId="68A23DAC">
                   <wp:extent cx="2926080" cy="1495195"/>
                   <wp:effectExtent l="0" t="0" r="0" b="0"/>
                   <wp:docPr id="19" name="Picture 19"/>
@@ -18706,7 +18760,7 @@
                 <w:noProof/>
               </w:rPr>
               <w:drawing>
-                <wp:inline distT="0" distB="0" distL="0" distR="0" wp14:anchorId="7E523F06" wp14:editId="3448BE5E">
+                <wp:inline distT="0" distB="0" distL="0" distR="0" wp14:anchorId="3324E32D" wp14:editId="292BFA35">
                   <wp:extent cx="2926080" cy="1682608"/>
                   <wp:effectExtent l="0" t="0" r="0" b="0"/>
                   <wp:docPr id="20" name="Picture 20"/>
@@ -19719,7 +19773,7 @@
         <w:pStyle w:val="Ttulo1"/>
         <w:spacing w:before="100" w:after="30"/>
       </w:pPr>
-      <w:bookmarkStart w:id="43" w:name="_Toc237700230"/>
+      <w:bookmarkStart w:id="43" w:name="_Toc237700808"/>
       <w:r>
         <w:rPr>
           <w:rFonts w:ascii="Georgia" w:hAnsi="Georgia"/>
@@ -19736,7 +19790,7 @@
         <w:pStyle w:val="Ttulo2"/>
         <w:spacing w:before="70" w:after="20"/>
       </w:pPr>
-      <w:bookmarkStart w:id="44" w:name="_Toc237700231"/>
+      <w:bookmarkStart w:id="44" w:name="_Toc237700809"/>
       <w:r>
         <w:rPr>
           <w:rFonts w:ascii="Georgia" w:hAnsi="Georgia"/>
@@ -19818,7 +19872,7 @@
         <w:pStyle w:val="Ttulo2"/>
         <w:spacing w:before="70" w:after="20"/>
       </w:pPr>
-      <w:bookmarkStart w:id="45" w:name="_Toc237700232"/>
+      <w:bookmarkStart w:id="45" w:name="_Toc237700810"/>
       <w:r>
         <w:rPr>
           <w:rFonts w:ascii="Georgia" w:hAnsi="Georgia"/>
@@ -19888,7 +19942,7 @@
                 <w:noProof/>
               </w:rPr>
               <w:drawing>
-                <wp:inline distT="0" distB="0" distL="0" distR="0" wp14:anchorId="65BBF948" wp14:editId="775736E3">
+                <wp:inline distT="0" distB="0" distL="0" distR="0" wp14:anchorId="172A9A53" wp14:editId="586F182D">
                   <wp:extent cx="2926080" cy="1682608"/>
                   <wp:effectExtent l="0" t="0" r="0" b="0"/>
                   <wp:docPr id="21" name="Picture 21"/>
@@ -19944,7 +19998,7 @@
                 <w:noProof/>
               </w:rPr>
               <w:drawing>
-                <wp:inline distT="0" distB="0" distL="0" distR="0" wp14:anchorId="67E1ACB5" wp14:editId="57AB7A89">
+                <wp:inline distT="0" distB="0" distL="0" distR="0" wp14:anchorId="38FF4EC4" wp14:editId="357D7591">
                   <wp:extent cx="2926080" cy="1549755"/>
                   <wp:effectExtent l="0" t="0" r="0" b="0"/>
                   <wp:docPr id="22" name="Picture 22"/>
@@ -20043,7 +20097,7 @@
         <w:pStyle w:val="Ttulo1"/>
         <w:spacing w:before="100" w:after="30"/>
       </w:pPr>
-      <w:bookmarkStart w:id="46" w:name="_Toc237700233"/>
+      <w:bookmarkStart w:id="46" w:name="_Toc237700811"/>
       <w:r>
         <w:rPr>
           <w:rFonts w:ascii="Georgia" w:hAnsi="Georgia"/>
@@ -20059,7 +20113,7 @@
         <w:pStyle w:val="Ttulo2"/>
         <w:spacing w:before="70" w:after="20"/>
       </w:pPr>
-      <w:bookmarkStart w:id="47" w:name="_Toc237700234"/>
+      <w:bookmarkStart w:id="47" w:name="_Toc237700812"/>
       <w:r>
         <w:rPr>
           <w:rFonts w:ascii="Georgia" w:hAnsi="Georgia"/>
@@ -21434,7 +21488,7 @@
         <w:pStyle w:val="Ttulo1"/>
         <w:spacing w:before="100" w:after="30"/>
       </w:pPr>
-      <w:bookmarkStart w:id="48" w:name="_Toc237700235"/>
+      <w:bookmarkStart w:id="48" w:name="_Toc237700813"/>
       <w:r>
         <w:rPr>
           <w:rFonts w:ascii="Georgia" w:hAnsi="Georgia"/>
@@ -21451,7 +21505,7 @@
         <w:pStyle w:val="Ttulo2"/>
         <w:spacing w:before="70" w:after="20"/>
       </w:pPr>
-      <w:bookmarkStart w:id="49" w:name="_Toc237700236"/>
+      <w:bookmarkStart w:id="49" w:name="_Toc237700814"/>
       <w:r>
         <w:rPr>
           <w:rFonts w:ascii="Georgia" w:hAnsi="Georgia"/>
@@ -21583,7 +21637,7 @@
                 <w:noProof/>
               </w:rPr>
               <w:drawing>
-                <wp:inline distT="0" distB="0" distL="0" distR="0" wp14:anchorId="6888D15A" wp14:editId="63D46600">
+                <wp:inline distT="0" distB="0" distL="0" distR="0" wp14:anchorId="291416A4" wp14:editId="02B558B0">
                   <wp:extent cx="2926080" cy="1695124"/>
                   <wp:effectExtent l="0" t="0" r="0" b="0"/>
                   <wp:docPr id="23" name="Picture 23"/>
@@ -21639,7 +21693,7 @@
                 <w:noProof/>
               </w:rPr>
               <w:drawing>
-                <wp:inline distT="0" distB="0" distL="0" distR="0" wp14:anchorId="6659F4F3" wp14:editId="2416FE26">
+                <wp:inline distT="0" distB="0" distL="0" distR="0" wp14:anchorId="021819E1" wp14:editId="71A57A38">
                   <wp:extent cx="2926080" cy="1572627"/>
                   <wp:effectExtent l="0" t="0" r="0" b="0"/>
                   <wp:docPr id="24" name="Picture 24"/>
@@ -21738,7 +21792,7 @@
         <w:pStyle w:val="Ttulo2"/>
         <w:spacing w:before="70" w:after="20"/>
       </w:pPr>
-      <w:bookmarkStart w:id="50" w:name="_Toc237700237"/>
+      <w:bookmarkStart w:id="50" w:name="_Toc237700815"/>
       <w:r>
         <w:rPr>
           <w:rFonts w:ascii="Georgia" w:hAnsi="Georgia"/>
@@ -22395,7 +22449,7 @@
         <w:pStyle w:val="Ttulo2"/>
         <w:spacing w:before="70" w:after="20"/>
       </w:pPr>
-      <w:bookmarkStart w:id="51" w:name="_Toc237700238"/>
+      <w:bookmarkStart w:id="51" w:name="_Toc237700816"/>
       <w:r>
         <w:rPr>
           <w:rFonts w:ascii="Georgia" w:hAnsi="Georgia"/>
@@ -22448,7 +22502,7 @@
         <w:pStyle w:val="Ttulo2"/>
         <w:spacing w:before="70" w:after="20"/>
       </w:pPr>
-      <w:bookmarkStart w:id="52" w:name="_Toc237700239"/>
+      <w:bookmarkStart w:id="52" w:name="_Toc237700817"/>
       <w:r>
         <w:rPr>
           <w:rFonts w:ascii="Georgia" w:hAnsi="Georgia"/>
@@ -22529,7 +22583,7 @@
                 <w:noProof/>
               </w:rPr>
               <w:drawing>
-                <wp:inline distT="0" distB="0" distL="0" distR="0" wp14:anchorId="2120B28D" wp14:editId="7E6E8E48">
+                <wp:inline distT="0" distB="0" distL="0" distR="0" wp14:anchorId="744EB0FE" wp14:editId="09E9062D">
                   <wp:extent cx="2926080" cy="1696900"/>
                   <wp:effectExtent l="0" t="0" r="0" b="0"/>
                   <wp:docPr id="25" name="Picture 25"/>
@@ -22585,7 +22639,7 @@
                 <w:noProof/>
               </w:rPr>
               <w:drawing>
-                <wp:inline distT="0" distB="0" distL="0" distR="0" wp14:anchorId="72554FCC" wp14:editId="4DE337D3">
+                <wp:inline distT="0" distB="0" distL="0" distR="0" wp14:anchorId="4B9E903D" wp14:editId="1D104E3A">
                   <wp:extent cx="2926080" cy="1614092"/>
                   <wp:effectExtent l="0" t="0" r="0" b="0"/>
                   <wp:docPr id="26" name="Picture 26"/>
@@ -23505,7 +23559,7 @@
         <w:pStyle w:val="Ttulo2"/>
         <w:spacing w:before="70" w:after="20"/>
       </w:pPr>
-      <w:bookmarkStart w:id="53" w:name="_Toc237700240"/>
+      <w:bookmarkStart w:id="53" w:name="_Toc237700818"/>
       <w:r>
         <w:rPr>
           <w:rFonts w:ascii="Georgia" w:hAnsi="Georgia"/>
@@ -23575,7 +23629,7 @@
                 <w:noProof/>
               </w:rPr>
               <w:drawing>
-                <wp:inline distT="0" distB="0" distL="0" distR="0" wp14:anchorId="20E17717" wp14:editId="04A2743E">
+                <wp:inline distT="0" distB="0" distL="0" distR="0" wp14:anchorId="1595C749" wp14:editId="2E0B088C">
                   <wp:extent cx="2926080" cy="1654733"/>
                   <wp:effectExtent l="0" t="0" r="0" b="0"/>
                   <wp:docPr id="27" name="Picture 27"/>
@@ -23631,7 +23685,7 @@
                 <w:noProof/>
               </w:rPr>
               <w:drawing>
-                <wp:inline distT="0" distB="0" distL="0" distR="0" wp14:anchorId="67521B8E" wp14:editId="53F7F6CB">
+                <wp:inline distT="0" distB="0" distL="0" distR="0" wp14:anchorId="7853B235" wp14:editId="3DE882CE">
                   <wp:extent cx="2926080" cy="1698212"/>
                   <wp:effectExtent l="0" t="0" r="0" b="0"/>
                   <wp:docPr id="28" name="Picture 28"/>
@@ -23730,7 +23784,7 @@
         <w:pStyle w:val="Ttulo1"/>
         <w:spacing w:before="100" w:after="30"/>
       </w:pPr>
-      <w:bookmarkStart w:id="54" w:name="_Toc237700241"/>
+      <w:bookmarkStart w:id="54" w:name="_Toc237700819"/>
       <w:r>
         <w:rPr>
           <w:rFonts w:ascii="Georgia" w:hAnsi="Georgia"/>
@@ -23746,7 +23800,7 @@
         <w:pStyle w:val="Ttulo2"/>
         <w:spacing w:before="70" w:after="20"/>
       </w:pPr>
-      <w:bookmarkStart w:id="55" w:name="_Toc237700242"/>
+      <w:bookmarkStart w:id="55" w:name="_Toc237700820"/>
       <w:r>
         <w:rPr>
           <w:rFonts w:ascii="Georgia" w:hAnsi="Georgia"/>
@@ -23807,7 +23861,7 @@
         <w:pStyle w:val="Ttulo2"/>
         <w:spacing w:before="70" w:after="20"/>
       </w:pPr>
-      <w:bookmarkStart w:id="56" w:name="_Toc237700243"/>
+      <w:bookmarkStart w:id="56" w:name="_Toc237700821"/>
       <w:r>
         <w:rPr>
           <w:rFonts w:ascii="Georgia" w:hAnsi="Georgia"/>
@@ -23883,7 +23937,7 @@
                 <w:noProof/>
               </w:rPr>
               <w:drawing>
-                <wp:inline distT="0" distB="0" distL="0" distR="0" wp14:anchorId="6AC3AC46" wp14:editId="6FB4F429">
+                <wp:inline distT="0" distB="0" distL="0" distR="0" wp14:anchorId="1BEEF3E0" wp14:editId="390EA673">
                   <wp:extent cx="2926080" cy="1650045"/>
                   <wp:effectExtent l="0" t="0" r="0" b="0"/>
                   <wp:docPr id="29" name="Picture 29"/>
@@ -23939,7 +23993,7 @@
                 <w:noProof/>
               </w:rPr>
               <w:drawing>
-                <wp:inline distT="0" distB="0" distL="0" distR="0" wp14:anchorId="0C07B6F8" wp14:editId="1F02F521">
+                <wp:inline distT="0" distB="0" distL="0" distR="0" wp14:anchorId="02146DF6" wp14:editId="64CB2439">
                   <wp:extent cx="2926080" cy="1611196"/>
                   <wp:effectExtent l="0" t="0" r="0" b="0"/>
                   <wp:docPr id="30" name="Picture 30"/>
@@ -24377,7 +24431,7 @@
         <w:pStyle w:val="Ttulo2"/>
         <w:spacing w:before="70" w:after="20"/>
       </w:pPr>
-      <w:bookmarkStart w:id="57" w:name="_Toc237700244"/>
+      <w:bookmarkStart w:id="57" w:name="_Toc237700822"/>
       <w:r>
         <w:rPr>
           <w:rFonts w:ascii="Georgia" w:hAnsi="Georgia"/>
@@ -24454,7 +24508,7 @@
                 <w:noProof/>
               </w:rPr>
               <w:drawing>
-                <wp:inline distT="0" distB="0" distL="0" distR="0" wp14:anchorId="4F82ACD5" wp14:editId="632D49E8">
+                <wp:inline distT="0" distB="0" distL="0" distR="0" wp14:anchorId="60397ED7" wp14:editId="18C3F0AC">
                   <wp:extent cx="2926080" cy="1687777"/>
                   <wp:effectExtent l="0" t="0" r="0" b="0"/>
                   <wp:docPr id="31" name="Picture 31"/>
@@ -24977,7 +25031,7 @@
         <w:pStyle w:val="Ttulo2"/>
         <w:spacing w:before="70" w:after="20"/>
       </w:pPr>
-      <w:bookmarkStart w:id="58" w:name="_Toc237700245"/>
+      <w:bookmarkStart w:id="58" w:name="_Toc237700823"/>
       <w:r>
         <w:rPr>
           <w:rFonts w:ascii="Georgia" w:hAnsi="Georgia"/>
@@ -26098,7 +26152,7 @@
         <w:pStyle w:val="Ttulo1"/>
         <w:spacing w:before="100" w:after="30"/>
       </w:pPr>
-      <w:bookmarkStart w:id="59" w:name="_Toc237700246"/>
+      <w:bookmarkStart w:id="59" w:name="_Toc237700824"/>
       <w:r>
         <w:rPr>
           <w:rFonts w:ascii="Georgia" w:hAnsi="Georgia"/>
@@ -26305,7 +26359,7 @@
         <w:pStyle w:val="Ttulo1"/>
         <w:spacing w:before="100" w:after="30"/>
       </w:pPr>
-      <w:bookmarkStart w:id="60" w:name="_Toc237700247"/>
+      <w:bookmarkStart w:id="60" w:name="_Toc237700825"/>
       <w:r>
         <w:rPr>
           <w:rFonts w:ascii="Georgia" w:hAnsi="Georgia"/>
@@ -34393,7 +34447,7 @@
         <w:pStyle w:val="Ttulo1"/>
         <w:spacing w:before="100" w:after="30"/>
       </w:pPr>
-      <w:bookmarkStart w:id="61" w:name="_Toc237700248"/>
+      <w:bookmarkStart w:id="61" w:name="_Toc237700826"/>
       <w:r>
         <w:rPr>
           <w:rFonts w:ascii="Georgia" w:hAnsi="Georgia"/>
@@ -34826,7 +34880,7 @@
         <w:pStyle w:val="Ttulo1"/>
         <w:spacing w:before="100" w:after="30"/>
       </w:pPr>
-      <w:bookmarkStart w:id="62" w:name="_Toc237700249"/>
+      <w:bookmarkStart w:id="62" w:name="_Toc237700827"/>
       <w:r>
         <w:rPr>
           <w:rFonts w:ascii="Georgia" w:hAnsi="Georgia"/>
@@ -35288,31 +35342,31 @@
       </w:rPr>
     </w:lvl>
   </w:abstractNum>
-  <w:num w:numId="1" w16cid:durableId="650059260">
+  <w:num w:numId="1" w16cid:durableId="152911578">
     <w:abstractNumId w:val="8"/>
   </w:num>
-  <w:num w:numId="2" w16cid:durableId="429666241">
+  <w:num w:numId="2" w16cid:durableId="1081946870">
     <w:abstractNumId w:val="6"/>
   </w:num>
-  <w:num w:numId="3" w16cid:durableId="1182282435">
+  <w:num w:numId="3" w16cid:durableId="747271047">
     <w:abstractNumId w:val="5"/>
   </w:num>
-  <w:num w:numId="4" w16cid:durableId="1507750102">
+  <w:num w:numId="4" w16cid:durableId="1781341852">
     <w:abstractNumId w:val="4"/>
   </w:num>
-  <w:num w:numId="5" w16cid:durableId="903106260">
+  <w:num w:numId="5" w16cid:durableId="1792819036">
     <w:abstractNumId w:val="7"/>
   </w:num>
-  <w:num w:numId="6" w16cid:durableId="429745357">
+  <w:num w:numId="6" w16cid:durableId="1902711243">
     <w:abstractNumId w:val="3"/>
   </w:num>
-  <w:num w:numId="7" w16cid:durableId="201286575">
+  <w:num w:numId="7" w16cid:durableId="525094158">
     <w:abstractNumId w:val="2"/>
   </w:num>
-  <w:num w:numId="8" w16cid:durableId="509763178">
+  <w:num w:numId="8" w16cid:durableId="1910847968">
     <w:abstractNumId w:val="1"/>
   </w:num>
-  <w:num w:numId="9" w16cid:durableId="718549426">
+  <w:num w:numId="9" w16cid:durableId="898250668">
     <w:abstractNumId w:val="0"/>
   </w:num>
 </w:numbering>
@@ -46744,7 +46798,7 @@
     <w:autoRedefine/>
     <w:uiPriority w:val="39"/>
     <w:unhideWhenUsed/>
-    <w:rsid w:val="00CD3248"/>
+    <w:rsid w:val="006046F7"/>
     <w:pPr>
       <w:spacing w:before="10" w:after="10" w:line="240" w:lineRule="auto"/>
     </w:pPr>
@@ -46759,7 +46813,7 @@
     <w:autoRedefine/>
     <w:uiPriority w:val="39"/>
     <w:unhideWhenUsed/>
-    <w:rsid w:val="00CD3248"/>
+    <w:rsid w:val="006046F7"/>
     <w:pPr>
       <w:spacing w:after="0" w:line="240" w:lineRule="auto"/>
       <w:ind w:left="170"/>
@@ -46773,7 +46827,7 @@
     <w:basedOn w:val="Fuentedeprrafopredeter"/>
     <w:uiPriority w:val="99"/>
     <w:unhideWhenUsed/>
-    <w:rsid w:val="00CD3248"/>
+    <w:rsid w:val="006046F7"/>
     <w:rPr>
       <w:color w:val="0000FF" w:themeColor="hyperlink"/>
       <w:u w:val="single"/>

</xml_diff>

<commit_message>
docs: Transformacion editorial segun protocolo neurocognitivo P-C-M-E-A, portada estandar University Press, eliminacion de formatos IA y consolidacion de paridad
</commit_message>
<xml_diff>
--- a/01_Reporte_PDF/Informe_Valuacion_Aluar_UNCuyo.docx
+++ b/01_Reporte_PDF/Informe_Valuacion_Aluar_UNCuyo.docx
@@ -1224,7 +1224,7 @@
       <w:r>
         <w:fldChar w:fldCharType="separate"/>
       </w:r>
-      <w:hyperlink w:anchor="_Toc237700765" w:history="1">
+      <w:hyperlink w:anchor="_Toc237701400" w:history="1">
         <w:r>
           <w:rPr>
             <w:rStyle w:val="Hipervnculo"/>
@@ -1251,7 +1251,7 @@
             <w:noProof/>
             <w:webHidden/>
           </w:rPr>
-          <w:instrText xml:space="preserve"> PAGEREF _Toc237700765 \h </w:instrText>
+          <w:instrText xml:space="preserve"> PAGEREF _Toc237701400 \h </w:instrText>
         </w:r>
         <w:r>
           <w:rPr>
@@ -1298,7 +1298,7 @@
           <w14:ligatures w14:val="standardContextual"/>
         </w:rPr>
       </w:pPr>
-      <w:hyperlink w:anchor="_Toc237700766" w:history="1">
+      <w:hyperlink w:anchor="_Toc237701401" w:history="1">
         <w:r>
           <w:rPr>
             <w:rStyle w:val="Hipervnculo"/>
@@ -1325,7 +1325,7 @@
             <w:noProof/>
             <w:webHidden/>
           </w:rPr>
-          <w:instrText xml:space="preserve"> PAGEREF _Toc237700766 \h </w:instrText>
+          <w:instrText xml:space="preserve"> PAGEREF _Toc237701401 \h </w:instrText>
         </w:r>
         <w:r>
           <w:rPr>
@@ -1372,7 +1372,7 @@
           <w14:ligatures w14:val="standardContextual"/>
         </w:rPr>
       </w:pPr>
-      <w:hyperlink w:anchor="_Toc237700767" w:history="1">
+      <w:hyperlink w:anchor="_Toc237701402" w:history="1">
         <w:r>
           <w:rPr>
             <w:rStyle w:val="Hipervnculo"/>
@@ -1399,7 +1399,7 @@
             <w:noProof/>
             <w:webHidden/>
           </w:rPr>
-          <w:instrText xml:space="preserve"> PAGEREF _Toc237700767 \h </w:instrText>
+          <w:instrText xml:space="preserve"> PAGEREF _Toc237701402 \h </w:instrText>
         </w:r>
         <w:r>
           <w:rPr>
@@ -1446,7 +1446,7 @@
           <w14:ligatures w14:val="standardContextual"/>
         </w:rPr>
       </w:pPr>
-      <w:hyperlink w:anchor="_Toc237700768" w:history="1">
+      <w:hyperlink w:anchor="_Toc237701403" w:history="1">
         <w:r>
           <w:rPr>
             <w:rStyle w:val="Hipervnculo"/>
@@ -1473,7 +1473,7 @@
             <w:noProof/>
             <w:webHidden/>
           </w:rPr>
-          <w:instrText xml:space="preserve"> PAGEREF _Toc237700768 \h </w:instrText>
+          <w:instrText xml:space="preserve"> PAGEREF _Toc237701403 \h </w:instrText>
         </w:r>
         <w:r>
           <w:rPr>
@@ -1520,7 +1520,7 @@
           <w14:ligatures w14:val="standardContextual"/>
         </w:rPr>
       </w:pPr>
-      <w:hyperlink w:anchor="_Toc237700769" w:history="1">
+      <w:hyperlink w:anchor="_Toc237701404" w:history="1">
         <w:r>
           <w:rPr>
             <w:rStyle w:val="Hipervnculo"/>
@@ -1547,7 +1547,7 @@
             <w:noProof/>
             <w:webHidden/>
           </w:rPr>
-          <w:instrText xml:space="preserve"> PAGEREF _Toc237700769 \h </w:instrText>
+          <w:instrText xml:space="preserve"> PAGEREF _Toc237701404 \h </w:instrText>
         </w:r>
         <w:r>
           <w:rPr>
@@ -1594,7 +1594,7 @@
           <w14:ligatures w14:val="standardContextual"/>
         </w:rPr>
       </w:pPr>
-      <w:hyperlink w:anchor="_Toc237700770" w:history="1">
+      <w:hyperlink w:anchor="_Toc237701405" w:history="1">
         <w:r>
           <w:rPr>
             <w:rStyle w:val="Hipervnculo"/>
@@ -1621,7 +1621,7 @@
             <w:noProof/>
             <w:webHidden/>
           </w:rPr>
-          <w:instrText xml:space="preserve"> PAGEREF _Toc237700770 \h </w:instrText>
+          <w:instrText xml:space="preserve"> PAGEREF _Toc237701405 \h </w:instrText>
         </w:r>
         <w:r>
           <w:rPr>
@@ -1668,7 +1668,7 @@
           <w14:ligatures w14:val="standardContextual"/>
         </w:rPr>
       </w:pPr>
-      <w:hyperlink w:anchor="_Toc237700771" w:history="1">
+      <w:hyperlink w:anchor="_Toc237701406" w:history="1">
         <w:r>
           <w:rPr>
             <w:rStyle w:val="Hipervnculo"/>
@@ -1695,7 +1695,7 @@
             <w:noProof/>
             <w:webHidden/>
           </w:rPr>
-          <w:instrText xml:space="preserve"> PAGEREF _Toc237700771 \h </w:instrText>
+          <w:instrText xml:space="preserve"> PAGEREF _Toc237701406 \h </w:instrText>
         </w:r>
         <w:r>
           <w:rPr>
@@ -1742,7 +1742,7 @@
           <w14:ligatures w14:val="standardContextual"/>
         </w:rPr>
       </w:pPr>
-      <w:hyperlink w:anchor="_Toc237700772" w:history="1">
+      <w:hyperlink w:anchor="_Toc237701407" w:history="1">
         <w:r>
           <w:rPr>
             <w:rStyle w:val="Hipervnculo"/>
@@ -1769,7 +1769,7 @@
             <w:noProof/>
             <w:webHidden/>
           </w:rPr>
-          <w:instrText xml:space="preserve"> PAGEREF _Toc237700772 \h </w:instrText>
+          <w:instrText xml:space="preserve"> PAGEREF _Toc237701407 \h </w:instrText>
         </w:r>
         <w:r>
           <w:rPr>
@@ -1816,7 +1816,7 @@
           <w14:ligatures w14:val="standardContextual"/>
         </w:rPr>
       </w:pPr>
-      <w:hyperlink w:anchor="_Toc237700773" w:history="1">
+      <w:hyperlink w:anchor="_Toc237701408" w:history="1">
         <w:r>
           <w:rPr>
             <w:rStyle w:val="Hipervnculo"/>
@@ -1843,7 +1843,7 @@
             <w:noProof/>
             <w:webHidden/>
           </w:rPr>
-          <w:instrText xml:space="preserve"> PAGEREF _Toc237700773 \h </w:instrText>
+          <w:instrText xml:space="preserve"> PAGEREF _Toc237701408 \h </w:instrText>
         </w:r>
         <w:r>
           <w:rPr>
@@ -1890,7 +1890,7 @@
           <w14:ligatures w14:val="standardContextual"/>
         </w:rPr>
       </w:pPr>
-      <w:hyperlink w:anchor="_Toc237700774" w:history="1">
+      <w:hyperlink w:anchor="_Toc237701409" w:history="1">
         <w:r>
           <w:rPr>
             <w:rStyle w:val="Hipervnculo"/>
@@ -1917,7 +1917,7 @@
             <w:noProof/>
             <w:webHidden/>
           </w:rPr>
-          <w:instrText xml:space="preserve"> PAGEREF _Toc237700774 \h </w:instrText>
+          <w:instrText xml:space="preserve"> PAGEREF _Toc237701409 \h </w:instrText>
         </w:r>
         <w:r>
           <w:rPr>
@@ -1964,7 +1964,7 @@
           <w14:ligatures w14:val="standardContextual"/>
         </w:rPr>
       </w:pPr>
-      <w:hyperlink w:anchor="_Toc237700775" w:history="1">
+      <w:hyperlink w:anchor="_Toc237701410" w:history="1">
         <w:r>
           <w:rPr>
             <w:rStyle w:val="Hipervnculo"/>
@@ -1991,7 +1991,7 @@
             <w:noProof/>
             <w:webHidden/>
           </w:rPr>
-          <w:instrText xml:space="preserve"> PAGEREF _Toc237700775 \h </w:instrText>
+          <w:instrText xml:space="preserve"> PAGEREF _Toc237701410 \h </w:instrText>
         </w:r>
         <w:r>
           <w:rPr>
@@ -2038,7 +2038,7 @@
           <w14:ligatures w14:val="standardContextual"/>
         </w:rPr>
       </w:pPr>
-      <w:hyperlink w:anchor="_Toc237700776" w:history="1">
+      <w:hyperlink w:anchor="_Toc237701411" w:history="1">
         <w:r>
           <w:rPr>
             <w:rStyle w:val="Hipervnculo"/>
@@ -2065,7 +2065,7 @@
             <w:noProof/>
             <w:webHidden/>
           </w:rPr>
-          <w:instrText xml:space="preserve"> PAGEREF _Toc237700776 \h </w:instrText>
+          <w:instrText xml:space="preserve"> PAGEREF _Toc237701411 \h </w:instrText>
         </w:r>
         <w:r>
           <w:rPr>
@@ -2112,7 +2112,7 @@
           <w14:ligatures w14:val="standardContextual"/>
         </w:rPr>
       </w:pPr>
-      <w:hyperlink w:anchor="_Toc237700777" w:history="1">
+      <w:hyperlink w:anchor="_Toc237701412" w:history="1">
         <w:r>
           <w:rPr>
             <w:rStyle w:val="Hipervnculo"/>
@@ -2139,7 +2139,7 @@
             <w:noProof/>
             <w:webHidden/>
           </w:rPr>
-          <w:instrText xml:space="preserve"> PAGEREF _Toc237700777 \h </w:instrText>
+          <w:instrText xml:space="preserve"> PAGEREF _Toc237701412 \h </w:instrText>
         </w:r>
         <w:r>
           <w:rPr>
@@ -2186,7 +2186,7 @@
           <w14:ligatures w14:val="standardContextual"/>
         </w:rPr>
       </w:pPr>
-      <w:hyperlink w:anchor="_Toc237700778" w:history="1">
+      <w:hyperlink w:anchor="_Toc237701413" w:history="1">
         <w:r>
           <w:rPr>
             <w:rStyle w:val="Hipervnculo"/>
@@ -2213,7 +2213,7 @@
             <w:noProof/>
             <w:webHidden/>
           </w:rPr>
-          <w:instrText xml:space="preserve"> PAGEREF _Toc237700778 \h </w:instrText>
+          <w:instrText xml:space="preserve"> PAGEREF _Toc237701413 \h </w:instrText>
         </w:r>
         <w:r>
           <w:rPr>
@@ -2260,7 +2260,7 @@
           <w14:ligatures w14:val="standardContextual"/>
         </w:rPr>
       </w:pPr>
-      <w:hyperlink w:anchor="_Toc237700779" w:history="1">
+      <w:hyperlink w:anchor="_Toc237701414" w:history="1">
         <w:r>
           <w:rPr>
             <w:rStyle w:val="Hipervnculo"/>
@@ -2287,7 +2287,7 @@
             <w:noProof/>
             <w:webHidden/>
           </w:rPr>
-          <w:instrText xml:space="preserve"> PAGEREF _Toc237700779 \h </w:instrText>
+          <w:instrText xml:space="preserve"> PAGEREF _Toc237701414 \h </w:instrText>
         </w:r>
         <w:r>
           <w:rPr>
@@ -2334,7 +2334,7 @@
           <w14:ligatures w14:val="standardContextual"/>
         </w:rPr>
       </w:pPr>
-      <w:hyperlink w:anchor="_Toc237700780" w:history="1">
+      <w:hyperlink w:anchor="_Toc237701415" w:history="1">
         <w:r>
           <w:rPr>
             <w:rStyle w:val="Hipervnculo"/>
@@ -2361,7 +2361,7 @@
             <w:noProof/>
             <w:webHidden/>
           </w:rPr>
-          <w:instrText xml:space="preserve"> PAGEREF _Toc237700780 \h </w:instrText>
+          <w:instrText xml:space="preserve"> PAGEREF _Toc237701415 \h </w:instrText>
         </w:r>
         <w:r>
           <w:rPr>
@@ -2408,7 +2408,7 @@
           <w14:ligatures w14:val="standardContextual"/>
         </w:rPr>
       </w:pPr>
-      <w:hyperlink w:anchor="_Toc237700781" w:history="1">
+      <w:hyperlink w:anchor="_Toc237701416" w:history="1">
         <w:r>
           <w:rPr>
             <w:rStyle w:val="Hipervnculo"/>
@@ -2435,7 +2435,7 @@
             <w:noProof/>
             <w:webHidden/>
           </w:rPr>
-          <w:instrText xml:space="preserve"> PAGEREF _Toc237700781 \h </w:instrText>
+          <w:instrText xml:space="preserve"> PAGEREF _Toc237701416 \h </w:instrText>
         </w:r>
         <w:r>
           <w:rPr>
@@ -2482,7 +2482,7 @@
           <w14:ligatures w14:val="standardContextual"/>
         </w:rPr>
       </w:pPr>
-      <w:hyperlink w:anchor="_Toc237700782" w:history="1">
+      <w:hyperlink w:anchor="_Toc237701417" w:history="1">
         <w:r>
           <w:rPr>
             <w:rStyle w:val="Hipervnculo"/>
@@ -2509,7 +2509,7 @@
             <w:noProof/>
             <w:webHidden/>
           </w:rPr>
-          <w:instrText xml:space="preserve"> PAGEREF _Toc237700782 \h </w:instrText>
+          <w:instrText xml:space="preserve"> PAGEREF _Toc237701417 \h </w:instrText>
         </w:r>
         <w:r>
           <w:rPr>
@@ -2556,7 +2556,7 @@
           <w14:ligatures w14:val="standardContextual"/>
         </w:rPr>
       </w:pPr>
-      <w:hyperlink w:anchor="_Toc237700783" w:history="1">
+      <w:hyperlink w:anchor="_Toc237701418" w:history="1">
         <w:r>
           <w:rPr>
             <w:rStyle w:val="Hipervnculo"/>
@@ -2583,7 +2583,7 @@
             <w:noProof/>
             <w:webHidden/>
           </w:rPr>
-          <w:instrText xml:space="preserve"> PAGEREF _Toc237700783 \h </w:instrText>
+          <w:instrText xml:space="preserve"> PAGEREF _Toc237701418 \h </w:instrText>
         </w:r>
         <w:r>
           <w:rPr>
@@ -2630,7 +2630,7 @@
           <w14:ligatures w14:val="standardContextual"/>
         </w:rPr>
       </w:pPr>
-      <w:hyperlink w:anchor="_Toc237700784" w:history="1">
+      <w:hyperlink w:anchor="_Toc237701419" w:history="1">
         <w:r>
           <w:rPr>
             <w:rStyle w:val="Hipervnculo"/>
@@ -2657,7 +2657,7 @@
             <w:noProof/>
             <w:webHidden/>
           </w:rPr>
-          <w:instrText xml:space="preserve"> PAGEREF _Toc237700784 \h </w:instrText>
+          <w:instrText xml:space="preserve"> PAGEREF _Toc237701419 \h </w:instrText>
         </w:r>
         <w:r>
           <w:rPr>
@@ -2704,7 +2704,7 @@
           <w14:ligatures w14:val="standardContextual"/>
         </w:rPr>
       </w:pPr>
-      <w:hyperlink w:anchor="_Toc237700785" w:history="1">
+      <w:hyperlink w:anchor="_Toc237701420" w:history="1">
         <w:r>
           <w:rPr>
             <w:rStyle w:val="Hipervnculo"/>
@@ -2731,7 +2731,7 @@
             <w:noProof/>
             <w:webHidden/>
           </w:rPr>
-          <w:instrText xml:space="preserve"> PAGEREF _Toc237700785 \h </w:instrText>
+          <w:instrText xml:space="preserve"> PAGEREF _Toc237701420 \h </w:instrText>
         </w:r>
         <w:r>
           <w:rPr>
@@ -2778,7 +2778,7 @@
           <w14:ligatures w14:val="standardContextual"/>
         </w:rPr>
       </w:pPr>
-      <w:hyperlink w:anchor="_Toc237700786" w:history="1">
+      <w:hyperlink w:anchor="_Toc237701421" w:history="1">
         <w:r>
           <w:rPr>
             <w:rStyle w:val="Hipervnculo"/>
@@ -2805,7 +2805,7 @@
             <w:noProof/>
             <w:webHidden/>
           </w:rPr>
-          <w:instrText xml:space="preserve"> PAGEREF _Toc237700786 \h </w:instrText>
+          <w:instrText xml:space="preserve"> PAGEREF _Toc237701421 \h </w:instrText>
         </w:r>
         <w:r>
           <w:rPr>
@@ -2852,7 +2852,7 @@
           <w14:ligatures w14:val="standardContextual"/>
         </w:rPr>
       </w:pPr>
-      <w:hyperlink w:anchor="_Toc237700787" w:history="1">
+      <w:hyperlink w:anchor="_Toc237701422" w:history="1">
         <w:r>
           <w:rPr>
             <w:rStyle w:val="Hipervnculo"/>
@@ -2879,7 +2879,7 @@
             <w:noProof/>
             <w:webHidden/>
           </w:rPr>
-          <w:instrText xml:space="preserve"> PAGEREF _Toc237700787 \h </w:instrText>
+          <w:instrText xml:space="preserve"> PAGEREF _Toc237701422 \h </w:instrText>
         </w:r>
         <w:r>
           <w:rPr>
@@ -2926,7 +2926,7 @@
           <w14:ligatures w14:val="standardContextual"/>
         </w:rPr>
       </w:pPr>
-      <w:hyperlink w:anchor="_Toc237700788" w:history="1">
+      <w:hyperlink w:anchor="_Toc237701423" w:history="1">
         <w:r>
           <w:rPr>
             <w:rStyle w:val="Hipervnculo"/>
@@ -2983,7 +2983,7 @@
             <w:noProof/>
             <w:webHidden/>
           </w:rPr>
-          <w:instrText xml:space="preserve"> PAGEREF _Toc237700788 \h </w:instrText>
+          <w:instrText xml:space="preserve"> PAGEREF _Toc237701423 \h </w:instrText>
         </w:r>
         <w:r>
           <w:rPr>
@@ -3030,7 +3030,7 @@
           <w14:ligatures w14:val="standardContextual"/>
         </w:rPr>
       </w:pPr>
-      <w:hyperlink w:anchor="_Toc237700789" w:history="1">
+      <w:hyperlink w:anchor="_Toc237701424" w:history="1">
         <w:r>
           <w:rPr>
             <w:rStyle w:val="Hipervnculo"/>
@@ -3057,7 +3057,7 @@
             <w:noProof/>
             <w:webHidden/>
           </w:rPr>
-          <w:instrText xml:space="preserve"> PAGEREF _Toc237700789 \h </w:instrText>
+          <w:instrText xml:space="preserve"> PAGEREF _Toc237701424 \h </w:instrText>
         </w:r>
         <w:r>
           <w:rPr>
@@ -3104,7 +3104,7 @@
           <w14:ligatures w14:val="standardContextual"/>
         </w:rPr>
       </w:pPr>
-      <w:hyperlink w:anchor="_Toc237700790" w:history="1">
+      <w:hyperlink w:anchor="_Toc237701425" w:history="1">
         <w:r>
           <w:rPr>
             <w:rStyle w:val="Hipervnculo"/>
@@ -3131,7 +3131,7 @@
             <w:noProof/>
             <w:webHidden/>
           </w:rPr>
-          <w:instrText xml:space="preserve"> PAGEREF _Toc237700790 \h </w:instrText>
+          <w:instrText xml:space="preserve"> PAGEREF _Toc237701425 \h </w:instrText>
         </w:r>
         <w:r>
           <w:rPr>
@@ -3178,7 +3178,7 @@
           <w14:ligatures w14:val="standardContextual"/>
         </w:rPr>
       </w:pPr>
-      <w:hyperlink w:anchor="_Toc237700791" w:history="1">
+      <w:hyperlink w:anchor="_Toc237701426" w:history="1">
         <w:r>
           <w:rPr>
             <w:rStyle w:val="Hipervnculo"/>
@@ -3205,7 +3205,7 @@
             <w:noProof/>
             <w:webHidden/>
           </w:rPr>
-          <w:instrText xml:space="preserve"> PAGEREF _Toc237700791 \h </w:instrText>
+          <w:instrText xml:space="preserve"> PAGEREF _Toc237701426 \h </w:instrText>
         </w:r>
         <w:r>
           <w:rPr>
@@ -3252,7 +3252,7 @@
           <w14:ligatures w14:val="standardContextual"/>
         </w:rPr>
       </w:pPr>
-      <w:hyperlink w:anchor="_Toc237700792" w:history="1">
+      <w:hyperlink w:anchor="_Toc237701427" w:history="1">
         <w:r>
           <w:rPr>
             <w:rStyle w:val="Hipervnculo"/>
@@ -3279,7 +3279,7 @@
             <w:noProof/>
             <w:webHidden/>
           </w:rPr>
-          <w:instrText xml:space="preserve"> PAGEREF _Toc237700792 \h </w:instrText>
+          <w:instrText xml:space="preserve"> PAGEREF _Toc237701427 \h </w:instrText>
         </w:r>
         <w:r>
           <w:rPr>
@@ -3326,7 +3326,7 @@
           <w14:ligatures w14:val="standardContextual"/>
         </w:rPr>
       </w:pPr>
-      <w:hyperlink w:anchor="_Toc237700793" w:history="1">
+      <w:hyperlink w:anchor="_Toc237701428" w:history="1">
         <w:r>
           <w:rPr>
             <w:rStyle w:val="Hipervnculo"/>
@@ -3353,7 +3353,7 @@
             <w:noProof/>
             <w:webHidden/>
           </w:rPr>
-          <w:instrText xml:space="preserve"> PAGEREF _Toc237700793 \h </w:instrText>
+          <w:instrText xml:space="preserve"> PAGEREF _Toc237701428 \h </w:instrText>
         </w:r>
         <w:r>
           <w:rPr>
@@ -3400,7 +3400,7 @@
           <w14:ligatures w14:val="standardContextual"/>
         </w:rPr>
       </w:pPr>
-      <w:hyperlink w:anchor="_Toc237700794" w:history="1">
+      <w:hyperlink w:anchor="_Toc237701429" w:history="1">
         <w:r>
           <w:rPr>
             <w:rStyle w:val="Hipervnculo"/>
@@ -3427,7 +3427,7 @@
             <w:noProof/>
             <w:webHidden/>
           </w:rPr>
-          <w:instrText xml:space="preserve"> PAGEREF _Toc237700794 \h </w:instrText>
+          <w:instrText xml:space="preserve"> PAGEREF _Toc237701429 \h </w:instrText>
         </w:r>
         <w:r>
           <w:rPr>
@@ -3474,7 +3474,7 @@
           <w14:ligatures w14:val="standardContextual"/>
         </w:rPr>
       </w:pPr>
-      <w:hyperlink w:anchor="_Toc237700795" w:history="1">
+      <w:hyperlink w:anchor="_Toc237701430" w:history="1">
         <w:r>
           <w:rPr>
             <w:rStyle w:val="Hipervnculo"/>
@@ -3501,7 +3501,7 @@
             <w:noProof/>
             <w:webHidden/>
           </w:rPr>
-          <w:instrText xml:space="preserve"> PAGEREF _Toc237700795 \h </w:instrText>
+          <w:instrText xml:space="preserve"> PAGEREF _Toc237701430 \h </w:instrText>
         </w:r>
         <w:r>
           <w:rPr>
@@ -3548,7 +3548,7 @@
           <w14:ligatures w14:val="standardContextual"/>
         </w:rPr>
       </w:pPr>
-      <w:hyperlink w:anchor="_Toc237700796" w:history="1">
+      <w:hyperlink w:anchor="_Toc237701431" w:history="1">
         <w:r>
           <w:rPr>
             <w:rStyle w:val="Hipervnculo"/>
@@ -3575,7 +3575,7 @@
             <w:noProof/>
             <w:webHidden/>
           </w:rPr>
-          <w:instrText xml:space="preserve"> PAGEREF _Toc237700796 \h </w:instrText>
+          <w:instrText xml:space="preserve"> PAGEREF _Toc237701431 \h </w:instrText>
         </w:r>
         <w:r>
           <w:rPr>
@@ -3622,7 +3622,7 @@
           <w14:ligatures w14:val="standardContextual"/>
         </w:rPr>
       </w:pPr>
-      <w:hyperlink w:anchor="_Toc237700797" w:history="1">
+      <w:hyperlink w:anchor="_Toc237701432" w:history="1">
         <w:r>
           <w:rPr>
             <w:rStyle w:val="Hipervnculo"/>
@@ -3649,7 +3649,7 @@
             <w:noProof/>
             <w:webHidden/>
           </w:rPr>
-          <w:instrText xml:space="preserve"> PAGEREF _Toc237700797 \h </w:instrText>
+          <w:instrText xml:space="preserve"> PAGEREF _Toc237701432 \h </w:instrText>
         </w:r>
         <w:r>
           <w:rPr>
@@ -3696,7 +3696,7 @@
           <w14:ligatures w14:val="standardContextual"/>
         </w:rPr>
       </w:pPr>
-      <w:hyperlink w:anchor="_Toc237700798" w:history="1">
+      <w:hyperlink w:anchor="_Toc237701433" w:history="1">
         <w:r>
           <w:rPr>
             <w:rStyle w:val="Hipervnculo"/>
@@ -3723,7 +3723,7 @@
             <w:noProof/>
             <w:webHidden/>
           </w:rPr>
-          <w:instrText xml:space="preserve"> PAGEREF _Toc237700798 \h </w:instrText>
+          <w:instrText xml:space="preserve"> PAGEREF _Toc237701433 \h </w:instrText>
         </w:r>
         <w:r>
           <w:rPr>
@@ -3770,7 +3770,7 @@
           <w14:ligatures w14:val="standardContextual"/>
         </w:rPr>
       </w:pPr>
-      <w:hyperlink w:anchor="_Toc237700799" w:history="1">
+      <w:hyperlink w:anchor="_Toc237701434" w:history="1">
         <w:r>
           <w:rPr>
             <w:rStyle w:val="Hipervnculo"/>
@@ -3797,7 +3797,7 @@
             <w:noProof/>
             <w:webHidden/>
           </w:rPr>
-          <w:instrText xml:space="preserve"> PAGEREF _Toc237700799 \h </w:instrText>
+          <w:instrText xml:space="preserve"> PAGEREF _Toc237701434 \h </w:instrText>
         </w:r>
         <w:r>
           <w:rPr>
@@ -3844,7 +3844,7 @@
           <w14:ligatures w14:val="standardContextual"/>
         </w:rPr>
       </w:pPr>
-      <w:hyperlink w:anchor="_Toc237700800" w:history="1">
+      <w:hyperlink w:anchor="_Toc237701435" w:history="1">
         <w:r>
           <w:rPr>
             <w:rStyle w:val="Hipervnculo"/>
@@ -3871,7 +3871,7 @@
             <w:noProof/>
             <w:webHidden/>
           </w:rPr>
-          <w:instrText xml:space="preserve"> PAGEREF _Toc237700800 \h </w:instrText>
+          <w:instrText xml:space="preserve"> PAGEREF _Toc237701435 \h </w:instrText>
         </w:r>
         <w:r>
           <w:rPr>
@@ -3918,7 +3918,7 @@
           <w14:ligatures w14:val="standardContextual"/>
         </w:rPr>
       </w:pPr>
-      <w:hyperlink w:anchor="_Toc237700801" w:history="1">
+      <w:hyperlink w:anchor="_Toc237701436" w:history="1">
         <w:r>
           <w:rPr>
             <w:rStyle w:val="Hipervnculo"/>
@@ -3945,7 +3945,7 @@
             <w:noProof/>
             <w:webHidden/>
           </w:rPr>
-          <w:instrText xml:space="preserve"> PAGEREF _Toc237700801 \h </w:instrText>
+          <w:instrText xml:space="preserve"> PAGEREF _Toc237701436 \h </w:instrText>
         </w:r>
         <w:r>
           <w:rPr>
@@ -3992,7 +3992,7 @@
           <w14:ligatures w14:val="standardContextual"/>
         </w:rPr>
       </w:pPr>
-      <w:hyperlink w:anchor="_Toc237700802" w:history="1">
+      <w:hyperlink w:anchor="_Toc237701437" w:history="1">
         <w:r>
           <w:rPr>
             <w:rStyle w:val="Hipervnculo"/>
@@ -4019,7 +4019,7 @@
             <w:noProof/>
             <w:webHidden/>
           </w:rPr>
-          <w:instrText xml:space="preserve"> PAGEREF _Toc237700802 \h </w:instrText>
+          <w:instrText xml:space="preserve"> PAGEREF _Toc237701437 \h </w:instrText>
         </w:r>
         <w:r>
           <w:rPr>
@@ -4066,7 +4066,7 @@
           <w14:ligatures w14:val="standardContextual"/>
         </w:rPr>
       </w:pPr>
-      <w:hyperlink w:anchor="_Toc237700803" w:history="1">
+      <w:hyperlink w:anchor="_Toc237701438" w:history="1">
         <w:r>
           <w:rPr>
             <w:rStyle w:val="Hipervnculo"/>
@@ -4093,7 +4093,7 @@
             <w:noProof/>
             <w:webHidden/>
           </w:rPr>
-          <w:instrText xml:space="preserve"> PAGEREF _Toc237700803 \h </w:instrText>
+          <w:instrText xml:space="preserve"> PAGEREF _Toc237701438 \h </w:instrText>
         </w:r>
         <w:r>
           <w:rPr>
@@ -4140,7 +4140,7 @@
           <w14:ligatures w14:val="standardContextual"/>
         </w:rPr>
       </w:pPr>
-      <w:hyperlink w:anchor="_Toc237700804" w:history="1">
+      <w:hyperlink w:anchor="_Toc237701439" w:history="1">
         <w:r>
           <w:rPr>
             <w:rStyle w:val="Hipervnculo"/>
@@ -4167,7 +4167,7 @@
             <w:noProof/>
             <w:webHidden/>
           </w:rPr>
-          <w:instrText xml:space="preserve"> PAGEREF _Toc237700804 \h </w:instrText>
+          <w:instrText xml:space="preserve"> PAGEREF _Toc237701439 \h </w:instrText>
         </w:r>
         <w:r>
           <w:rPr>
@@ -4214,7 +4214,7 @@
           <w14:ligatures w14:val="standardContextual"/>
         </w:rPr>
       </w:pPr>
-      <w:hyperlink w:anchor="_Toc237700805" w:history="1">
+      <w:hyperlink w:anchor="_Toc237701440" w:history="1">
         <w:r>
           <w:rPr>
             <w:rStyle w:val="Hipervnculo"/>
@@ -4241,7 +4241,7 @@
             <w:noProof/>
             <w:webHidden/>
           </w:rPr>
-          <w:instrText xml:space="preserve"> PAGEREF _Toc237700805 \h </w:instrText>
+          <w:instrText xml:space="preserve"> PAGEREF _Toc237701440 \h </w:instrText>
         </w:r>
         <w:r>
           <w:rPr>
@@ -4288,7 +4288,7 @@
           <w14:ligatures w14:val="standardContextual"/>
         </w:rPr>
       </w:pPr>
-      <w:hyperlink w:anchor="_Toc237700806" w:history="1">
+      <w:hyperlink w:anchor="_Toc237701441" w:history="1">
         <w:r>
           <w:rPr>
             <w:rStyle w:val="Hipervnculo"/>
@@ -4315,7 +4315,7 @@
             <w:noProof/>
             <w:webHidden/>
           </w:rPr>
-          <w:instrText xml:space="preserve"> PAGEREF _Toc237700806 \h </w:instrText>
+          <w:instrText xml:space="preserve"> PAGEREF _Toc237701441 \h </w:instrText>
         </w:r>
         <w:r>
           <w:rPr>
@@ -4362,7 +4362,7 @@
           <w14:ligatures w14:val="standardContextual"/>
         </w:rPr>
       </w:pPr>
-      <w:hyperlink w:anchor="_Toc237700807" w:history="1">
+      <w:hyperlink w:anchor="_Toc237701442" w:history="1">
         <w:r>
           <w:rPr>
             <w:rStyle w:val="Hipervnculo"/>
@@ -4389,7 +4389,7 @@
             <w:noProof/>
             <w:webHidden/>
           </w:rPr>
-          <w:instrText xml:space="preserve"> PAGEREF _Toc237700807 \h </w:instrText>
+          <w:instrText xml:space="preserve"> PAGEREF _Toc237701442 \h </w:instrText>
         </w:r>
         <w:r>
           <w:rPr>
@@ -4436,7 +4436,7 @@
           <w14:ligatures w14:val="standardContextual"/>
         </w:rPr>
       </w:pPr>
-      <w:hyperlink w:anchor="_Toc237700808" w:history="1">
+      <w:hyperlink w:anchor="_Toc237701443" w:history="1">
         <w:r>
           <w:rPr>
             <w:rStyle w:val="Hipervnculo"/>
@@ -4463,7 +4463,7 @@
             <w:noProof/>
             <w:webHidden/>
           </w:rPr>
-          <w:instrText xml:space="preserve"> PAGEREF _Toc237700808 \h </w:instrText>
+          <w:instrText xml:space="preserve"> PAGEREF _Toc237701443 \h </w:instrText>
         </w:r>
         <w:r>
           <w:rPr>
@@ -4510,7 +4510,7 @@
           <w14:ligatures w14:val="standardContextual"/>
         </w:rPr>
       </w:pPr>
-      <w:hyperlink w:anchor="_Toc237700809" w:history="1">
+      <w:hyperlink w:anchor="_Toc237701444" w:history="1">
         <w:r>
           <w:rPr>
             <w:rStyle w:val="Hipervnculo"/>
@@ -4537,7 +4537,7 @@
             <w:noProof/>
             <w:webHidden/>
           </w:rPr>
-          <w:instrText xml:space="preserve"> PAGEREF _Toc237700809 \h </w:instrText>
+          <w:instrText xml:space="preserve"> PAGEREF _Toc237701444 \h </w:instrText>
         </w:r>
         <w:r>
           <w:rPr>
@@ -4584,7 +4584,7 @@
           <w14:ligatures w14:val="standardContextual"/>
         </w:rPr>
       </w:pPr>
-      <w:hyperlink w:anchor="_Toc237700810" w:history="1">
+      <w:hyperlink w:anchor="_Toc237701445" w:history="1">
         <w:r>
           <w:rPr>
             <w:rStyle w:val="Hipervnculo"/>
@@ -4611,7 +4611,7 @@
             <w:noProof/>
             <w:webHidden/>
           </w:rPr>
-          <w:instrText xml:space="preserve"> PAGEREF _Toc237700810 \h </w:instrText>
+          <w:instrText xml:space="preserve"> PAGEREF _Toc237701445 \h </w:instrText>
         </w:r>
         <w:r>
           <w:rPr>
@@ -4658,7 +4658,7 @@
           <w14:ligatures w14:val="standardContextual"/>
         </w:rPr>
       </w:pPr>
-      <w:hyperlink w:anchor="_Toc237700811" w:history="1">
+      <w:hyperlink w:anchor="_Toc237701446" w:history="1">
         <w:r>
           <w:rPr>
             <w:rStyle w:val="Hipervnculo"/>
@@ -4685,7 +4685,7 @@
             <w:noProof/>
             <w:webHidden/>
           </w:rPr>
-          <w:instrText xml:space="preserve"> PAGEREF _Toc237700811 \h </w:instrText>
+          <w:instrText xml:space="preserve"> PAGEREF _Toc237701446 \h </w:instrText>
         </w:r>
         <w:r>
           <w:rPr>
@@ -4732,7 +4732,7 @@
           <w14:ligatures w14:val="standardContextual"/>
         </w:rPr>
       </w:pPr>
-      <w:hyperlink w:anchor="_Toc237700812" w:history="1">
+      <w:hyperlink w:anchor="_Toc237701447" w:history="1">
         <w:r>
           <w:rPr>
             <w:rStyle w:val="Hipervnculo"/>
@@ -4759,7 +4759,7 @@
             <w:noProof/>
             <w:webHidden/>
           </w:rPr>
-          <w:instrText xml:space="preserve"> PAGEREF _Toc237700812 \h </w:instrText>
+          <w:instrText xml:space="preserve"> PAGEREF _Toc237701447 \h </w:instrText>
         </w:r>
         <w:r>
           <w:rPr>
@@ -4806,7 +4806,7 @@
           <w14:ligatures w14:val="standardContextual"/>
         </w:rPr>
       </w:pPr>
-      <w:hyperlink w:anchor="_Toc237700813" w:history="1">
+      <w:hyperlink w:anchor="_Toc237701448" w:history="1">
         <w:r>
           <w:rPr>
             <w:rStyle w:val="Hipervnculo"/>
@@ -4833,7 +4833,7 @@
             <w:noProof/>
             <w:webHidden/>
           </w:rPr>
-          <w:instrText xml:space="preserve"> PAGEREF _Toc237700813 \h </w:instrText>
+          <w:instrText xml:space="preserve"> PAGEREF _Toc237701448 \h </w:instrText>
         </w:r>
         <w:r>
           <w:rPr>
@@ -4880,7 +4880,7 @@
           <w14:ligatures w14:val="standardContextual"/>
         </w:rPr>
       </w:pPr>
-      <w:hyperlink w:anchor="_Toc237700814" w:history="1">
+      <w:hyperlink w:anchor="_Toc237701449" w:history="1">
         <w:r>
           <w:rPr>
             <w:rStyle w:val="Hipervnculo"/>
@@ -4907,7 +4907,7 @@
             <w:noProof/>
             <w:webHidden/>
           </w:rPr>
-          <w:instrText xml:space="preserve"> PAGEREF _Toc237700814 \h </w:instrText>
+          <w:instrText xml:space="preserve"> PAGEREF _Toc237701449 \h </w:instrText>
         </w:r>
         <w:r>
           <w:rPr>
@@ -4954,7 +4954,7 @@
           <w14:ligatures w14:val="standardContextual"/>
         </w:rPr>
       </w:pPr>
-      <w:hyperlink w:anchor="_Toc237700815" w:history="1">
+      <w:hyperlink w:anchor="_Toc237701450" w:history="1">
         <w:r>
           <w:rPr>
             <w:rStyle w:val="Hipervnculo"/>
@@ -4981,7 +4981,7 @@
             <w:noProof/>
             <w:webHidden/>
           </w:rPr>
-          <w:instrText xml:space="preserve"> PAGEREF _Toc237700815 \h </w:instrText>
+          <w:instrText xml:space="preserve"> PAGEREF _Toc237701450 \h </w:instrText>
         </w:r>
         <w:r>
           <w:rPr>
@@ -5028,7 +5028,7 @@
           <w14:ligatures w14:val="standardContextual"/>
         </w:rPr>
       </w:pPr>
-      <w:hyperlink w:anchor="_Toc237700816" w:history="1">
+      <w:hyperlink w:anchor="_Toc237701451" w:history="1">
         <w:r>
           <w:rPr>
             <w:rStyle w:val="Hipervnculo"/>
@@ -5055,7 +5055,7 @@
             <w:noProof/>
             <w:webHidden/>
           </w:rPr>
-          <w:instrText xml:space="preserve"> PAGEREF _Toc237700816 \h </w:instrText>
+          <w:instrText xml:space="preserve"> PAGEREF _Toc237701451 \h </w:instrText>
         </w:r>
         <w:r>
           <w:rPr>
@@ -5102,7 +5102,7 @@
           <w14:ligatures w14:val="standardContextual"/>
         </w:rPr>
       </w:pPr>
-      <w:hyperlink w:anchor="_Toc237700817" w:history="1">
+      <w:hyperlink w:anchor="_Toc237701452" w:history="1">
         <w:r>
           <w:rPr>
             <w:rStyle w:val="Hipervnculo"/>
@@ -5129,7 +5129,7 @@
             <w:noProof/>
             <w:webHidden/>
           </w:rPr>
-          <w:instrText xml:space="preserve"> PAGEREF _Toc237700817 \h </w:instrText>
+          <w:instrText xml:space="preserve"> PAGEREF _Toc237701452 \h </w:instrText>
         </w:r>
         <w:r>
           <w:rPr>
@@ -5176,7 +5176,7 @@
           <w14:ligatures w14:val="standardContextual"/>
         </w:rPr>
       </w:pPr>
-      <w:hyperlink w:anchor="_Toc237700818" w:history="1">
+      <w:hyperlink w:anchor="_Toc237701453" w:history="1">
         <w:r>
           <w:rPr>
             <w:rStyle w:val="Hipervnculo"/>
@@ -5203,7 +5203,7 @@
             <w:noProof/>
             <w:webHidden/>
           </w:rPr>
-          <w:instrText xml:space="preserve"> PAGEREF _Toc237700818 \h </w:instrText>
+          <w:instrText xml:space="preserve"> PAGEREF _Toc237701453 \h </w:instrText>
         </w:r>
         <w:r>
           <w:rPr>
@@ -5250,7 +5250,7 @@
           <w14:ligatures w14:val="standardContextual"/>
         </w:rPr>
       </w:pPr>
-      <w:hyperlink w:anchor="_Toc237700819" w:history="1">
+      <w:hyperlink w:anchor="_Toc237701454" w:history="1">
         <w:r>
           <w:rPr>
             <w:rStyle w:val="Hipervnculo"/>
@@ -5277,7 +5277,7 @@
             <w:noProof/>
             <w:webHidden/>
           </w:rPr>
-          <w:instrText xml:space="preserve"> PAGEREF _Toc237700819 \h </w:instrText>
+          <w:instrText xml:space="preserve"> PAGEREF _Toc237701454 \h </w:instrText>
         </w:r>
         <w:r>
           <w:rPr>
@@ -5324,7 +5324,7 @@
           <w14:ligatures w14:val="standardContextual"/>
         </w:rPr>
       </w:pPr>
-      <w:hyperlink w:anchor="_Toc237700820" w:history="1">
+      <w:hyperlink w:anchor="_Toc237701455" w:history="1">
         <w:r>
           <w:rPr>
             <w:rStyle w:val="Hipervnculo"/>
@@ -5351,7 +5351,7 @@
             <w:noProof/>
             <w:webHidden/>
           </w:rPr>
-          <w:instrText xml:space="preserve"> PAGEREF _Toc237700820 \h </w:instrText>
+          <w:instrText xml:space="preserve"> PAGEREF _Toc237701455 \h </w:instrText>
         </w:r>
         <w:r>
           <w:rPr>
@@ -5398,7 +5398,7 @@
           <w14:ligatures w14:val="standardContextual"/>
         </w:rPr>
       </w:pPr>
-      <w:hyperlink w:anchor="_Toc237700821" w:history="1">
+      <w:hyperlink w:anchor="_Toc237701456" w:history="1">
         <w:r>
           <w:rPr>
             <w:rStyle w:val="Hipervnculo"/>
@@ -5425,7 +5425,7 @@
             <w:noProof/>
             <w:webHidden/>
           </w:rPr>
-          <w:instrText xml:space="preserve"> PAGEREF _Toc237700821 \h </w:instrText>
+          <w:instrText xml:space="preserve"> PAGEREF _Toc237701456 \h </w:instrText>
         </w:r>
         <w:r>
           <w:rPr>
@@ -5472,7 +5472,7 @@
           <w14:ligatures w14:val="standardContextual"/>
         </w:rPr>
       </w:pPr>
-      <w:hyperlink w:anchor="_Toc237700822" w:history="1">
+      <w:hyperlink w:anchor="_Toc237701457" w:history="1">
         <w:r>
           <w:rPr>
             <w:rStyle w:val="Hipervnculo"/>
@@ -5499,7 +5499,7 @@
             <w:noProof/>
             <w:webHidden/>
           </w:rPr>
-          <w:instrText xml:space="preserve"> PAGEREF _Toc237700822 \h </w:instrText>
+          <w:instrText xml:space="preserve"> PAGEREF _Toc237701457 \h </w:instrText>
         </w:r>
         <w:r>
           <w:rPr>
@@ -5546,7 +5546,7 @@
           <w14:ligatures w14:val="standardContextual"/>
         </w:rPr>
       </w:pPr>
-      <w:hyperlink w:anchor="_Toc237700823" w:history="1">
+      <w:hyperlink w:anchor="_Toc237701458" w:history="1">
         <w:r>
           <w:rPr>
             <w:rStyle w:val="Hipervnculo"/>
@@ -5573,7 +5573,7 @@
             <w:noProof/>
             <w:webHidden/>
           </w:rPr>
-          <w:instrText xml:space="preserve"> PAGEREF _Toc237700823 \h </w:instrText>
+          <w:instrText xml:space="preserve"> PAGEREF _Toc237701458 \h </w:instrText>
         </w:r>
         <w:r>
           <w:rPr>
@@ -5620,7 +5620,7 @@
           <w14:ligatures w14:val="standardContextual"/>
         </w:rPr>
       </w:pPr>
-      <w:hyperlink w:anchor="_Toc237700824" w:history="1">
+      <w:hyperlink w:anchor="_Toc237701459" w:history="1">
         <w:r>
           <w:rPr>
             <w:rStyle w:val="Hipervnculo"/>
@@ -5647,7 +5647,7 @@
             <w:noProof/>
             <w:webHidden/>
           </w:rPr>
-          <w:instrText xml:space="preserve"> PAGEREF _Toc237700824 \h </w:instrText>
+          <w:instrText xml:space="preserve"> PAGEREF _Toc237701459 \h </w:instrText>
         </w:r>
         <w:r>
           <w:rPr>
@@ -5694,7 +5694,7 @@
           <w14:ligatures w14:val="standardContextual"/>
         </w:rPr>
       </w:pPr>
-      <w:hyperlink w:anchor="_Toc237700825" w:history="1">
+      <w:hyperlink w:anchor="_Toc237701460" w:history="1">
         <w:r>
           <w:rPr>
             <w:rStyle w:val="Hipervnculo"/>
@@ -5721,7 +5721,7 @@
             <w:noProof/>
             <w:webHidden/>
           </w:rPr>
-          <w:instrText xml:space="preserve"> PAGEREF _Toc237700825 \h </w:instrText>
+          <w:instrText xml:space="preserve"> PAGEREF _Toc237701460 \h </w:instrText>
         </w:r>
         <w:r>
           <w:rPr>
@@ -5768,7 +5768,7 @@
           <w14:ligatures w14:val="standardContextual"/>
         </w:rPr>
       </w:pPr>
-      <w:hyperlink w:anchor="_Toc237700826" w:history="1">
+      <w:hyperlink w:anchor="_Toc237701461" w:history="1">
         <w:r>
           <w:rPr>
             <w:rStyle w:val="Hipervnculo"/>
@@ -5795,7 +5795,7 @@
             <w:noProof/>
             <w:webHidden/>
           </w:rPr>
-          <w:instrText xml:space="preserve"> PAGEREF _Toc237700826 \h </w:instrText>
+          <w:instrText xml:space="preserve"> PAGEREF _Toc237701461 \h </w:instrText>
         </w:r>
         <w:r>
           <w:rPr>
@@ -5842,7 +5842,7 @@
           <w14:ligatures w14:val="standardContextual"/>
         </w:rPr>
       </w:pPr>
-      <w:hyperlink w:anchor="_Toc237700827" w:history="1">
+      <w:hyperlink w:anchor="_Toc237701462" w:history="1">
         <w:r>
           <w:rPr>
             <w:rStyle w:val="Hipervnculo"/>
@@ -5869,7 +5869,7 @@
             <w:noProof/>
             <w:webHidden/>
           </w:rPr>
-          <w:instrText xml:space="preserve"> PAGEREF _Toc237700827 \h </w:instrText>
+          <w:instrText xml:space="preserve"> PAGEREF _Toc237701462 \h </w:instrText>
         </w:r>
         <w:r>
           <w:rPr>
@@ -5956,7 +5956,7 @@
         <w:pStyle w:val="Ttulo1"/>
         <w:spacing w:before="100" w:after="30"/>
       </w:pPr>
-      <w:bookmarkStart w:id="0" w:name="_Toc237700765"/>
+      <w:bookmarkStart w:id="0" w:name="_Toc237701400"/>
       <w:r>
         <w:rPr>
           <w:rFonts w:ascii="Georgia" w:hAnsi="Georgia"/>
@@ -5973,7 +5973,7 @@
         <w:pStyle w:val="Ttulo2"/>
         <w:spacing w:before="70" w:after="20"/>
       </w:pPr>
-      <w:bookmarkStart w:id="1" w:name="_Toc237700766"/>
+      <w:bookmarkStart w:id="1" w:name="_Toc237701401"/>
       <w:r>
         <w:rPr>
           <w:rFonts w:ascii="Georgia" w:hAnsi="Georgia"/>
@@ -6023,7 +6023,7 @@
         <w:pStyle w:val="Ttulo2"/>
         <w:spacing w:before="70" w:after="20"/>
       </w:pPr>
-      <w:bookmarkStart w:id="2" w:name="_Toc237700767"/>
+      <w:bookmarkStart w:id="2" w:name="_Toc237701402"/>
       <w:r>
         <w:rPr>
           <w:rFonts w:ascii="Georgia" w:hAnsi="Georgia"/>
@@ -6266,7 +6266,7 @@
         <w:pStyle w:val="Ttulo2"/>
         <w:spacing w:before="70" w:after="20"/>
       </w:pPr>
-      <w:bookmarkStart w:id="3" w:name="_Toc237700768"/>
+      <w:bookmarkStart w:id="3" w:name="_Toc237701403"/>
       <w:r>
         <w:rPr>
           <w:rFonts w:ascii="Georgia" w:hAnsi="Georgia"/>
@@ -6381,7 +6381,7 @@
         <w:pStyle w:val="Ttulo2"/>
         <w:spacing w:before="70" w:after="20"/>
       </w:pPr>
-      <w:bookmarkStart w:id="4" w:name="_Toc237700769"/>
+      <w:bookmarkStart w:id="4" w:name="_Toc237701404"/>
       <w:r>
         <w:rPr>
           <w:rFonts w:ascii="Georgia" w:hAnsi="Georgia"/>
@@ -6850,7 +6850,7 @@
         <w:pStyle w:val="Ttulo2"/>
         <w:spacing w:before="70" w:after="20"/>
       </w:pPr>
-      <w:bookmarkStart w:id="5" w:name="_Toc237700770"/>
+      <w:bookmarkStart w:id="5" w:name="_Toc237701405"/>
       <w:r>
         <w:rPr>
           <w:rFonts w:ascii="Georgia" w:hAnsi="Georgia"/>
@@ -6971,7 +6971,7 @@
         <w:pStyle w:val="Ttulo2"/>
         <w:spacing w:before="70" w:after="20"/>
       </w:pPr>
-      <w:bookmarkStart w:id="6" w:name="_Toc237700771"/>
+      <w:bookmarkStart w:id="6" w:name="_Toc237701406"/>
       <w:r>
         <w:rPr>
           <w:rFonts w:ascii="Georgia" w:hAnsi="Georgia"/>
@@ -8062,7 +8062,7 @@
         <w:pStyle w:val="Ttulo1"/>
         <w:spacing w:before="100" w:after="30"/>
       </w:pPr>
-      <w:bookmarkStart w:id="7" w:name="_Toc237700772"/>
+      <w:bookmarkStart w:id="7" w:name="_Toc237701407"/>
       <w:r>
         <w:rPr>
           <w:rFonts w:ascii="Georgia" w:hAnsi="Georgia"/>
@@ -8078,7 +8078,7 @@
         <w:pStyle w:val="Ttulo2"/>
         <w:spacing w:before="70" w:after="20"/>
       </w:pPr>
-      <w:bookmarkStart w:id="8" w:name="_Toc237700773"/>
+      <w:bookmarkStart w:id="8" w:name="_Toc237701408"/>
       <w:r>
         <w:rPr>
           <w:rFonts w:ascii="Georgia" w:hAnsi="Georgia"/>
@@ -8308,7 +8308,7 @@
         <w:pStyle w:val="Ttulo2"/>
         <w:spacing w:before="70" w:after="20"/>
       </w:pPr>
-      <w:bookmarkStart w:id="9" w:name="_Toc237700774"/>
+      <w:bookmarkStart w:id="9" w:name="_Toc237701409"/>
       <w:r>
         <w:rPr>
           <w:rFonts w:ascii="Georgia" w:hAnsi="Georgia"/>
@@ -8509,7 +8509,7 @@
         <w:pStyle w:val="Ttulo1"/>
         <w:spacing w:before="100" w:after="30"/>
       </w:pPr>
-      <w:bookmarkStart w:id="10" w:name="_Toc237700775"/>
+      <w:bookmarkStart w:id="10" w:name="_Toc237701410"/>
       <w:r>
         <w:rPr>
           <w:rFonts w:ascii="Georgia" w:hAnsi="Georgia"/>
@@ -8525,7 +8525,7 @@
         <w:pStyle w:val="Ttulo2"/>
         <w:spacing w:before="70" w:after="20"/>
       </w:pPr>
-      <w:bookmarkStart w:id="11" w:name="_Toc237700776"/>
+      <w:bookmarkStart w:id="11" w:name="_Toc237701411"/>
       <w:r>
         <w:rPr>
           <w:rFonts w:ascii="Georgia" w:hAnsi="Georgia"/>
@@ -8755,7 +8755,7 @@
         <w:pStyle w:val="Ttulo2"/>
         <w:spacing w:before="70" w:after="20"/>
       </w:pPr>
-      <w:bookmarkStart w:id="12" w:name="_Toc237700777"/>
+      <w:bookmarkStart w:id="12" w:name="_Toc237701412"/>
       <w:r>
         <w:rPr>
           <w:rFonts w:ascii="Georgia" w:hAnsi="Georgia"/>
@@ -8780,7 +8780,7 @@
         <w:pStyle w:val="Ttulo2"/>
         <w:spacing w:before="70" w:after="20"/>
       </w:pPr>
-      <w:bookmarkStart w:id="13" w:name="_Toc237700778"/>
+      <w:bookmarkStart w:id="13" w:name="_Toc237701413"/>
       <w:r>
         <w:rPr>
           <w:rFonts w:ascii="Georgia" w:hAnsi="Georgia"/>
@@ -9005,7 +9005,7 @@
         <w:pStyle w:val="Ttulo2"/>
         <w:spacing w:before="70" w:after="20"/>
       </w:pPr>
-      <w:bookmarkStart w:id="14" w:name="_Toc237700779"/>
+      <w:bookmarkStart w:id="14" w:name="_Toc237701414"/>
       <w:r>
         <w:rPr>
           <w:rFonts w:ascii="Georgia" w:hAnsi="Georgia"/>
@@ -9248,7 +9248,7 @@
         <w:pStyle w:val="Ttulo1"/>
         <w:spacing w:before="100" w:after="30"/>
       </w:pPr>
-      <w:bookmarkStart w:id="15" w:name="_Toc237700780"/>
+      <w:bookmarkStart w:id="15" w:name="_Toc237701415"/>
       <w:r>
         <w:rPr>
           <w:rFonts w:ascii="Georgia" w:hAnsi="Georgia"/>
@@ -9264,7 +9264,7 @@
         <w:pStyle w:val="Ttulo2"/>
         <w:spacing w:before="70" w:after="20"/>
       </w:pPr>
-      <w:bookmarkStart w:id="16" w:name="_Toc237700781"/>
+      <w:bookmarkStart w:id="16" w:name="_Toc237701416"/>
       <w:r>
         <w:rPr>
           <w:rFonts w:ascii="Georgia" w:hAnsi="Georgia"/>
@@ -9651,7 +9651,7 @@
         <w:pStyle w:val="Ttulo2"/>
         <w:spacing w:before="70" w:after="20"/>
       </w:pPr>
-      <w:bookmarkStart w:id="17" w:name="_Toc237700782"/>
+      <w:bookmarkStart w:id="17" w:name="_Toc237701417"/>
       <w:r>
         <w:rPr>
           <w:rFonts w:ascii="Georgia" w:hAnsi="Georgia"/>
@@ -9685,7 +9685,7 @@
         <w:pStyle w:val="Ttulo1"/>
         <w:spacing w:before="100" w:after="30"/>
       </w:pPr>
-      <w:bookmarkStart w:id="18" w:name="_Toc237700783"/>
+      <w:bookmarkStart w:id="18" w:name="_Toc237701418"/>
       <w:r>
         <w:rPr>
           <w:rFonts w:ascii="Georgia" w:hAnsi="Georgia"/>
@@ -9701,7 +9701,7 @@
         <w:pStyle w:val="Ttulo2"/>
         <w:spacing w:before="70" w:after="20"/>
       </w:pPr>
-      <w:bookmarkStart w:id="19" w:name="_Toc237700784"/>
+      <w:bookmarkStart w:id="19" w:name="_Toc237701419"/>
       <w:r>
         <w:rPr>
           <w:rFonts w:ascii="Georgia" w:hAnsi="Georgia"/>
@@ -9761,7 +9761,7 @@
         <w:pStyle w:val="Ttulo2"/>
         <w:spacing w:before="70" w:after="20"/>
       </w:pPr>
-      <w:bookmarkStart w:id="20" w:name="_Toc237700785"/>
+      <w:bookmarkStart w:id="20" w:name="_Toc237701420"/>
       <w:r>
         <w:rPr>
           <w:rFonts w:ascii="Georgia" w:hAnsi="Georgia"/>
@@ -10753,7 +10753,7 @@
         <w:pStyle w:val="Ttulo1"/>
         <w:spacing w:before="100" w:after="30"/>
       </w:pPr>
-      <w:bookmarkStart w:id="21" w:name="_Toc237700786"/>
+      <w:bookmarkStart w:id="21" w:name="_Toc237701421"/>
       <w:r>
         <w:rPr>
           <w:rFonts w:ascii="Georgia" w:hAnsi="Georgia"/>
@@ -10770,7 +10770,7 @@
         <w:pStyle w:val="Ttulo2"/>
         <w:spacing w:before="70" w:after="20"/>
       </w:pPr>
-      <w:bookmarkStart w:id="22" w:name="_Toc237700787"/>
+      <w:bookmarkStart w:id="22" w:name="_Toc237701422"/>
       <w:r>
         <w:rPr>
           <w:rFonts w:ascii="Georgia" w:hAnsi="Georgia"/>
@@ -10830,7 +10830,7 @@
         <w:pStyle w:val="Ttulo2"/>
         <w:spacing w:before="70" w:after="20"/>
       </w:pPr>
-      <w:bookmarkStart w:id="23" w:name="_Toc237700788"/>
+      <w:bookmarkStart w:id="23" w:name="_Toc237701423"/>
       <w:r>
         <w:rPr>
           <w:rFonts w:ascii="Georgia" w:hAnsi="Georgia"/>
@@ -11189,7 +11189,7 @@
         <w:pStyle w:val="Ttulo2"/>
         <w:spacing w:before="70" w:after="20"/>
       </w:pPr>
-      <w:bookmarkStart w:id="24" w:name="_Toc237700789"/>
+      <w:bookmarkStart w:id="24" w:name="_Toc237701424"/>
       <w:r>
         <w:rPr>
           <w:rFonts w:ascii="Georgia" w:hAnsi="Georgia"/>
@@ -12012,7 +12012,7 @@
         <w:pStyle w:val="Ttulo1"/>
         <w:spacing w:before="100" w:after="30"/>
       </w:pPr>
-      <w:bookmarkStart w:id="25" w:name="_Toc237700790"/>
+      <w:bookmarkStart w:id="25" w:name="_Toc237701425"/>
       <w:r>
         <w:rPr>
           <w:rFonts w:ascii="Georgia" w:hAnsi="Georgia"/>
@@ -12028,7 +12028,7 @@
         <w:pStyle w:val="Ttulo2"/>
         <w:spacing w:before="70" w:after="20"/>
       </w:pPr>
-      <w:bookmarkStart w:id="26" w:name="_Toc237700791"/>
+      <w:bookmarkStart w:id="26" w:name="_Toc237701426"/>
       <w:r>
         <w:rPr>
           <w:rFonts w:ascii="Georgia" w:hAnsi="Georgia"/>
@@ -13443,7 +13443,7 @@
         <w:pStyle w:val="Ttulo2"/>
         <w:spacing w:before="70" w:after="20"/>
       </w:pPr>
-      <w:bookmarkStart w:id="27" w:name="_Toc237700792"/>
+      <w:bookmarkStart w:id="27" w:name="_Toc237701427"/>
       <w:r>
         <w:rPr>
           <w:rFonts w:ascii="Georgia" w:hAnsi="Georgia"/>
@@ -13555,7 +13555,7 @@
         <w:pStyle w:val="Ttulo1"/>
         <w:spacing w:before="100" w:after="30"/>
       </w:pPr>
-      <w:bookmarkStart w:id="28" w:name="_Toc237700793"/>
+      <w:bookmarkStart w:id="28" w:name="_Toc237701428"/>
       <w:r>
         <w:rPr>
           <w:rFonts w:ascii="Georgia" w:hAnsi="Georgia"/>
@@ -13572,7 +13572,7 @@
         <w:pStyle w:val="Ttulo2"/>
         <w:spacing w:before="70" w:after="20"/>
       </w:pPr>
-      <w:bookmarkStart w:id="29" w:name="_Toc237700794"/>
+      <w:bookmarkStart w:id="29" w:name="_Toc237701429"/>
       <w:r>
         <w:rPr>
           <w:rFonts w:ascii="Georgia" w:hAnsi="Georgia"/>
@@ -13632,7 +13632,7 @@
         <w:pStyle w:val="Ttulo2"/>
         <w:spacing w:before="70" w:after="20"/>
       </w:pPr>
-      <w:bookmarkStart w:id="30" w:name="_Toc237700795"/>
+      <w:bookmarkStart w:id="30" w:name="_Toc237701430"/>
       <w:r>
         <w:rPr>
           <w:rFonts w:ascii="Georgia" w:hAnsi="Georgia"/>
@@ -13857,7 +13857,7 @@
         <w:pStyle w:val="Ttulo1"/>
         <w:spacing w:before="100" w:after="30"/>
       </w:pPr>
-      <w:bookmarkStart w:id="31" w:name="_Toc237700796"/>
+      <w:bookmarkStart w:id="31" w:name="_Toc237701431"/>
       <w:r>
         <w:rPr>
           <w:rFonts w:ascii="Georgia" w:hAnsi="Georgia"/>
@@ -13873,7 +13873,7 @@
         <w:pStyle w:val="Ttulo2"/>
         <w:spacing w:before="70" w:after="20"/>
       </w:pPr>
-      <w:bookmarkStart w:id="32" w:name="_Toc237700797"/>
+      <w:bookmarkStart w:id="32" w:name="_Toc237701432"/>
       <w:r>
         <w:rPr>
           <w:rFonts w:ascii="Georgia" w:hAnsi="Georgia"/>
@@ -14803,7 +14803,7 @@
         <w:pStyle w:val="Ttulo2"/>
         <w:spacing w:before="70" w:after="20"/>
       </w:pPr>
-      <w:bookmarkStart w:id="33" w:name="_Toc237700798"/>
+      <w:bookmarkStart w:id="33" w:name="_Toc237701433"/>
       <w:r>
         <w:rPr>
           <w:rFonts w:ascii="Georgia" w:hAnsi="Georgia"/>
@@ -14949,7 +14949,7 @@
         <w:pStyle w:val="Ttulo2"/>
         <w:spacing w:before="70" w:after="20"/>
       </w:pPr>
-      <w:bookmarkStart w:id="34" w:name="_Toc237700799"/>
+      <w:bookmarkStart w:id="34" w:name="_Toc237701434"/>
       <w:r>
         <w:rPr>
           <w:rFonts w:ascii="Georgia" w:hAnsi="Georgia"/>
@@ -14973,7 +14973,7 @@
         <w:pStyle w:val="Ttulo1"/>
         <w:spacing w:before="100" w:after="30"/>
       </w:pPr>
-      <w:bookmarkStart w:id="35" w:name="_Toc237700800"/>
+      <w:bookmarkStart w:id="35" w:name="_Toc237701435"/>
       <w:r>
         <w:rPr>
           <w:rFonts w:ascii="Georgia" w:hAnsi="Georgia"/>
@@ -14989,7 +14989,7 @@
         <w:pStyle w:val="Ttulo2"/>
         <w:spacing w:before="70" w:after="20"/>
       </w:pPr>
-      <w:bookmarkStart w:id="36" w:name="_Toc237700801"/>
+      <w:bookmarkStart w:id="36" w:name="_Toc237701436"/>
       <w:r>
         <w:rPr>
           <w:rFonts w:ascii="Georgia" w:hAnsi="Georgia"/>
@@ -17650,7 +17650,7 @@
         <w:pStyle w:val="Ttulo1"/>
         <w:spacing w:before="100" w:after="30"/>
       </w:pPr>
-      <w:bookmarkStart w:id="37" w:name="_Toc237700802"/>
+      <w:bookmarkStart w:id="37" w:name="_Toc237701437"/>
       <w:r>
         <w:rPr>
           <w:rFonts w:ascii="Georgia" w:hAnsi="Georgia"/>
@@ -17667,7 +17667,7 @@
         <w:pStyle w:val="Ttulo2"/>
         <w:spacing w:before="70" w:after="20"/>
       </w:pPr>
-      <w:bookmarkStart w:id="38" w:name="_Toc237700803"/>
+      <w:bookmarkStart w:id="38" w:name="_Toc237701438"/>
       <w:r>
         <w:rPr>
           <w:rFonts w:ascii="Georgia" w:hAnsi="Georgia"/>
@@ -17853,7 +17853,7 @@
         <w:pStyle w:val="Ttulo2"/>
         <w:spacing w:before="70" w:after="20"/>
       </w:pPr>
-      <w:bookmarkStart w:id="39" w:name="_Toc237700804"/>
+      <w:bookmarkStart w:id="39" w:name="_Toc237701439"/>
       <w:r>
         <w:rPr>
           <w:rFonts w:ascii="Georgia" w:hAnsi="Georgia"/>
@@ -18069,7 +18069,7 @@
         <w:pStyle w:val="Ttulo2"/>
         <w:spacing w:before="70" w:after="20"/>
       </w:pPr>
-      <w:bookmarkStart w:id="40" w:name="_Toc237700805"/>
+      <w:bookmarkStart w:id="40" w:name="_Toc237701440"/>
       <w:r>
         <w:rPr>
           <w:rFonts w:ascii="Georgia" w:hAnsi="Georgia"/>
@@ -18627,7 +18627,7 @@
         <w:pStyle w:val="Ttulo1"/>
         <w:spacing w:before="100" w:after="30"/>
       </w:pPr>
-      <w:bookmarkStart w:id="41" w:name="_Toc237700806"/>
+      <w:bookmarkStart w:id="41" w:name="_Toc237701441"/>
       <w:r>
         <w:rPr>
           <w:rFonts w:ascii="Georgia" w:hAnsi="Georgia"/>
@@ -18643,7 +18643,7 @@
         <w:pStyle w:val="Ttulo2"/>
         <w:spacing w:before="70" w:after="20"/>
       </w:pPr>
-      <w:bookmarkStart w:id="42" w:name="_Toc237700807"/>
+      <w:bookmarkStart w:id="42" w:name="_Toc237701442"/>
       <w:r>
         <w:rPr>
           <w:rFonts w:ascii="Georgia" w:hAnsi="Georgia"/>
@@ -19773,7 +19773,7 @@
         <w:pStyle w:val="Ttulo1"/>
         <w:spacing w:before="100" w:after="30"/>
       </w:pPr>
-      <w:bookmarkStart w:id="43" w:name="_Toc237700808"/>
+      <w:bookmarkStart w:id="43" w:name="_Toc237701443"/>
       <w:r>
         <w:rPr>
           <w:rFonts w:ascii="Georgia" w:hAnsi="Georgia"/>
@@ -19790,7 +19790,7 @@
         <w:pStyle w:val="Ttulo2"/>
         <w:spacing w:before="70" w:after="20"/>
       </w:pPr>
-      <w:bookmarkStart w:id="44" w:name="_Toc237700809"/>
+      <w:bookmarkStart w:id="44" w:name="_Toc237701444"/>
       <w:r>
         <w:rPr>
           <w:rFonts w:ascii="Georgia" w:hAnsi="Georgia"/>
@@ -19872,7 +19872,7 @@
         <w:pStyle w:val="Ttulo2"/>
         <w:spacing w:before="70" w:after="20"/>
       </w:pPr>
-      <w:bookmarkStart w:id="45" w:name="_Toc237700810"/>
+      <w:bookmarkStart w:id="45" w:name="_Toc237701445"/>
       <w:r>
         <w:rPr>
           <w:rFonts w:ascii="Georgia" w:hAnsi="Georgia"/>
@@ -20097,7 +20097,7 @@
         <w:pStyle w:val="Ttulo1"/>
         <w:spacing w:before="100" w:after="30"/>
       </w:pPr>
-      <w:bookmarkStart w:id="46" w:name="_Toc237700811"/>
+      <w:bookmarkStart w:id="46" w:name="_Toc237701446"/>
       <w:r>
         <w:rPr>
           <w:rFonts w:ascii="Georgia" w:hAnsi="Georgia"/>
@@ -20113,7 +20113,7 @@
         <w:pStyle w:val="Ttulo2"/>
         <w:spacing w:before="70" w:after="20"/>
       </w:pPr>
-      <w:bookmarkStart w:id="47" w:name="_Toc237700812"/>
+      <w:bookmarkStart w:id="47" w:name="_Toc237701447"/>
       <w:r>
         <w:rPr>
           <w:rFonts w:ascii="Georgia" w:hAnsi="Georgia"/>
@@ -21488,7 +21488,7 @@
         <w:pStyle w:val="Ttulo1"/>
         <w:spacing w:before="100" w:after="30"/>
       </w:pPr>
-      <w:bookmarkStart w:id="48" w:name="_Toc237700813"/>
+      <w:bookmarkStart w:id="48" w:name="_Toc237701448"/>
       <w:r>
         <w:rPr>
           <w:rFonts w:ascii="Georgia" w:hAnsi="Georgia"/>
@@ -21505,7 +21505,7 @@
         <w:pStyle w:val="Ttulo2"/>
         <w:spacing w:before="70" w:after="20"/>
       </w:pPr>
-      <w:bookmarkStart w:id="49" w:name="_Toc237700814"/>
+      <w:bookmarkStart w:id="49" w:name="_Toc237701449"/>
       <w:r>
         <w:rPr>
           <w:rFonts w:ascii="Georgia" w:hAnsi="Georgia"/>
@@ -21792,7 +21792,7 @@
         <w:pStyle w:val="Ttulo2"/>
         <w:spacing w:before="70" w:after="20"/>
       </w:pPr>
-      <w:bookmarkStart w:id="50" w:name="_Toc237700815"/>
+      <w:bookmarkStart w:id="50" w:name="_Toc237701450"/>
       <w:r>
         <w:rPr>
           <w:rFonts w:ascii="Georgia" w:hAnsi="Georgia"/>
@@ -22449,7 +22449,7 @@
         <w:pStyle w:val="Ttulo2"/>
         <w:spacing w:before="70" w:after="20"/>
       </w:pPr>
-      <w:bookmarkStart w:id="51" w:name="_Toc237700816"/>
+      <w:bookmarkStart w:id="51" w:name="_Toc237701451"/>
       <w:r>
         <w:rPr>
           <w:rFonts w:ascii="Georgia" w:hAnsi="Georgia"/>
@@ -22502,7 +22502,7 @@
         <w:pStyle w:val="Ttulo2"/>
         <w:spacing w:before="70" w:after="20"/>
       </w:pPr>
-      <w:bookmarkStart w:id="52" w:name="_Toc237700817"/>
+      <w:bookmarkStart w:id="52" w:name="_Toc237701452"/>
       <w:r>
         <w:rPr>
           <w:rFonts w:ascii="Georgia" w:hAnsi="Georgia"/>
@@ -23559,7 +23559,7 @@
         <w:pStyle w:val="Ttulo2"/>
         <w:spacing w:before="70" w:after="20"/>
       </w:pPr>
-      <w:bookmarkStart w:id="53" w:name="_Toc237700818"/>
+      <w:bookmarkStart w:id="53" w:name="_Toc237701453"/>
       <w:r>
         <w:rPr>
           <w:rFonts w:ascii="Georgia" w:hAnsi="Georgia"/>
@@ -23784,7 +23784,7 @@
         <w:pStyle w:val="Ttulo1"/>
         <w:spacing w:before="100" w:after="30"/>
       </w:pPr>
-      <w:bookmarkStart w:id="54" w:name="_Toc237700819"/>
+      <w:bookmarkStart w:id="54" w:name="_Toc237701454"/>
       <w:r>
         <w:rPr>
           <w:rFonts w:ascii="Georgia" w:hAnsi="Georgia"/>
@@ -23800,7 +23800,7 @@
         <w:pStyle w:val="Ttulo2"/>
         <w:spacing w:before="70" w:after="20"/>
       </w:pPr>
-      <w:bookmarkStart w:id="55" w:name="_Toc237700820"/>
+      <w:bookmarkStart w:id="55" w:name="_Toc237701455"/>
       <w:r>
         <w:rPr>
           <w:rFonts w:ascii="Georgia" w:hAnsi="Georgia"/>
@@ -23861,7 +23861,7 @@
         <w:pStyle w:val="Ttulo2"/>
         <w:spacing w:before="70" w:after="20"/>
       </w:pPr>
-      <w:bookmarkStart w:id="56" w:name="_Toc237700821"/>
+      <w:bookmarkStart w:id="56" w:name="_Toc237701456"/>
       <w:r>
         <w:rPr>
           <w:rFonts w:ascii="Georgia" w:hAnsi="Georgia"/>
@@ -24431,7 +24431,7 @@
         <w:pStyle w:val="Ttulo2"/>
         <w:spacing w:before="70" w:after="20"/>
       </w:pPr>
-      <w:bookmarkStart w:id="57" w:name="_Toc237700822"/>
+      <w:bookmarkStart w:id="57" w:name="_Toc237701457"/>
       <w:r>
         <w:rPr>
           <w:rFonts w:ascii="Georgia" w:hAnsi="Georgia"/>
@@ -25031,7 +25031,7 @@
         <w:pStyle w:val="Ttulo2"/>
         <w:spacing w:before="70" w:after="20"/>
       </w:pPr>
-      <w:bookmarkStart w:id="58" w:name="_Toc237700823"/>
+      <w:bookmarkStart w:id="58" w:name="_Toc237701458"/>
       <w:r>
         <w:rPr>
           <w:rFonts w:ascii="Georgia" w:hAnsi="Georgia"/>
@@ -26152,7 +26152,7 @@
         <w:pStyle w:val="Ttulo1"/>
         <w:spacing w:before="100" w:after="30"/>
       </w:pPr>
-      <w:bookmarkStart w:id="59" w:name="_Toc237700824"/>
+      <w:bookmarkStart w:id="59" w:name="_Toc237701459"/>
       <w:r>
         <w:rPr>
           <w:rFonts w:ascii="Georgia" w:hAnsi="Georgia"/>
@@ -26359,7 +26359,7 @@
         <w:pStyle w:val="Ttulo1"/>
         <w:spacing w:before="100" w:after="30"/>
       </w:pPr>
-      <w:bookmarkStart w:id="60" w:name="_Toc237700825"/>
+      <w:bookmarkStart w:id="60" w:name="_Toc237701460"/>
       <w:r>
         <w:rPr>
           <w:rFonts w:ascii="Georgia" w:hAnsi="Georgia"/>
@@ -34447,7 +34447,7 @@
         <w:pStyle w:val="Ttulo1"/>
         <w:spacing w:before="100" w:after="30"/>
       </w:pPr>
-      <w:bookmarkStart w:id="61" w:name="_Toc237700826"/>
+      <w:bookmarkStart w:id="61" w:name="_Toc237701461"/>
       <w:r>
         <w:rPr>
           <w:rFonts w:ascii="Georgia" w:hAnsi="Georgia"/>
@@ -34880,7 +34880,7 @@
         <w:pStyle w:val="Ttulo1"/>
         <w:spacing w:before="100" w:after="30"/>
       </w:pPr>
-      <w:bookmarkStart w:id="62" w:name="_Toc237700827"/>
+      <w:bookmarkStart w:id="62" w:name="_Toc237701462"/>
       <w:r>
         <w:rPr>
           <w:rFonts w:ascii="Georgia" w:hAnsi="Georgia"/>

</xml_diff>

<commit_message>
fix(reporte): Unificar Enterprise Value a USD 2.640 MM, reformular encabezados asertivos, armonizar deuda neta e incorporar inputs de PEAL V
</commit_message>
<xml_diff>
--- a/01_Reporte_PDF/Informe_Valuacion_Aluar_UNCuyo.docx
+++ b/01_Reporte_PDF/Informe_Valuacion_Aluar_UNCuyo.docx
@@ -184,46 +184,59 @@
               <w:rPr>
                 <w:sz w:val="16"/>
               </w:rPr>
-              <w:t xml:space="preserve">El modelo teórico de valuación aplicado a Aluar Aluminio Argentino S.A.I.C. (ALUA.BA) concluye un dictamen teórico de </w:t>
+              <w:t xml:space="preserve">Iniciamos cobertura de </w:t>
             </w:r>
             <w:r>
               <w:rPr>
                 <w:b/>
                 <w:sz w:val="16"/>
               </w:rPr>
-              <w:t>COMPRAR</w:t>
+              <w:t>Aluar Aluminio Argentino S.A.I.C. (ALUA.BA)</w:t>
             </w:r>
             <w:r>
               <w:rPr>
                 <w:sz w:val="16"/>
               </w:rPr>
-              <w:t xml:space="preserve"> con un precio objetivo teórico a 12 meses de </w:t>
+              <w:t xml:space="preserve"> con recomendación de </w:t>
             </w:r>
             <w:r>
               <w:rPr>
                 <w:b/>
                 <w:sz w:val="16"/>
               </w:rPr>
-              <w:t>ARS 1.236,00</w:t>
+              <w:t>COMPRAR</w:t>
             </w:r>
             <w:r>
               <w:rPr>
                 <w:sz w:val="16"/>
               </w:rPr>
-              <w:t xml:space="preserve"> por acción (Target Integrado </w:t>
+              <w:t xml:space="preserve"> y un precio objetivo fundamental a 12 meses de </w:t>
             </w:r>
             <w:r>
               <w:rPr>
                 <w:b/>
                 <w:sz w:val="16"/>
               </w:rPr>
+              <w:t>ARS 1.236,00</w:t>
+            </w:r>
+            <w:r>
+              <w:rPr>
+                <w:sz w:val="16"/>
+              </w:rPr>
+              <w:t xml:space="preserve"> por acción (Target Integrado </w:t>
+            </w:r>
+            <w:r>
+              <w:rPr>
+                <w:b/>
+                <w:sz w:val="16"/>
+              </w:rPr>
               <w:t>ARS 1.255,60</w:t>
             </w:r>
             <w:r>
               <w:rPr>
                 <w:sz w:val="16"/>
               </w:rPr>
-              <w:t xml:space="preserve"> al incorporar la opción real de expansión eólica PEAL V), frente a una cotización de mercado de ARS 982,50 (+25,8% / +27,8% de retorno esperado). El precio actual descuenta una tasa terminal implícita excesivamente contractiva (g* = 0,69%), subestimando la ventaja en costos de energía autogenerada y el proceso de desapalancamiento operativo proyectado.</w:t>
+              <w:t xml:space="preserve"> al incorporar la opción real de expansión eólica PEAL V), frente a una cotización de mercado de ARS 982,50 (+25,8% / +27,8% de retorno esperado). El precio actual descuenta una tasa terminal implícita excesivamente conservadora (g* = 0,69%), subestimando la ventaja en costos de energía autogenerada y el proceso de desapalancamiento operativo proyectado.</w:t>
             </w:r>
           </w:p>
           <w:p>
@@ -390,7 +403,7 @@
                       <w:color w:val="4A4A4A"/>
                       <w:sz w:val="15"/>
                     </w:rPr>
-                    <w:t>Dictamen del Modelo Teórico</w:t>
+                    <w:t>Dictamen del Modelo Teórico de Valuación</w:t>
                   </w:r>
                 </w:p>
                 <w:p>
@@ -422,7 +435,7 @@
                     <w:rPr>
                       <w:sz w:val="15"/>
                     </w:rPr>
-                    <w:t xml:space="preserve">Target Base (Dumrauf): </w:t>
+                    <w:t xml:space="preserve">Target Base Fundamental (Dumrauf): </w:t>
                   </w:r>
                   <w:r>
                     <w:rPr>
@@ -1349,7 +1362,7 @@
         </w:rPr>
         <w:fldChar w:fldCharType="separate"/>
       </w:r>
-      <w:hyperlink w:anchor="_Toc237703589" w:history="1">
+      <w:hyperlink w:anchor="_Toc237709889" w:history="1">
         <w:r>
           <w:rPr>
             <w:rStyle w:val="Hipervnculo"/>
@@ -1376,7 +1389,7 @@
             <w:noProof/>
             <w:webHidden/>
           </w:rPr>
-          <w:instrText xml:space="preserve"> PAGEREF _Toc237703589 \h </w:instrText>
+          <w:instrText xml:space="preserve"> PAGEREF _Toc237709889 \h </w:instrText>
         </w:r>
         <w:r>
           <w:rPr>
@@ -1423,7 +1436,7 @@
           <w14:ligatures w14:val="standardContextual"/>
         </w:rPr>
       </w:pPr>
-      <w:hyperlink w:anchor="_Toc237703590" w:history="1">
+      <w:hyperlink w:anchor="_Toc237709890" w:history="1">
         <w:r>
           <w:rPr>
             <w:rStyle w:val="Hipervnculo"/>
@@ -1450,7 +1463,7 @@
             <w:noProof/>
             <w:webHidden/>
           </w:rPr>
-          <w:instrText xml:space="preserve"> PAGEREF _Toc237703590 \h </w:instrText>
+          <w:instrText xml:space="preserve"> PAGEREF _Toc237709890 \h </w:instrText>
         </w:r>
         <w:r>
           <w:rPr>
@@ -1497,7 +1510,7 @@
           <w14:ligatures w14:val="standardContextual"/>
         </w:rPr>
       </w:pPr>
-      <w:hyperlink w:anchor="_Toc237703591" w:history="1">
+      <w:hyperlink w:anchor="_Toc237709891" w:history="1">
         <w:r>
           <w:rPr>
             <w:rStyle w:val="Hipervnculo"/>
@@ -1524,7 +1537,7 @@
             <w:noProof/>
             <w:webHidden/>
           </w:rPr>
-          <w:instrText xml:space="preserve"> PAGEREF _Toc237703591 \h </w:instrText>
+          <w:instrText xml:space="preserve"> PAGEREF _Toc237709891 \h </w:instrText>
         </w:r>
         <w:r>
           <w:rPr>
@@ -1571,7 +1584,7 @@
           <w14:ligatures w14:val="standardContextual"/>
         </w:rPr>
       </w:pPr>
-      <w:hyperlink w:anchor="_Toc237703592" w:history="1">
+      <w:hyperlink w:anchor="_Toc237709892" w:history="1">
         <w:r>
           <w:rPr>
             <w:rStyle w:val="Hipervnculo"/>
@@ -1598,7 +1611,7 @@
             <w:noProof/>
             <w:webHidden/>
           </w:rPr>
-          <w:instrText xml:space="preserve"> PAGEREF _Toc237703592 \h </w:instrText>
+          <w:instrText xml:space="preserve"> PAGEREF _Toc237709892 \h </w:instrText>
         </w:r>
         <w:r>
           <w:rPr>
@@ -1645,7 +1658,7 @@
           <w14:ligatures w14:val="standardContextual"/>
         </w:rPr>
       </w:pPr>
-      <w:hyperlink w:anchor="_Toc237703593" w:history="1">
+      <w:hyperlink w:anchor="_Toc237709893" w:history="1">
         <w:r>
           <w:rPr>
             <w:rStyle w:val="Hipervnculo"/>
@@ -1672,7 +1685,7 @@
             <w:noProof/>
             <w:webHidden/>
           </w:rPr>
-          <w:instrText xml:space="preserve"> PAGEREF _Toc237703593 \h </w:instrText>
+          <w:instrText xml:space="preserve"> PAGEREF _Toc237709893 \h </w:instrText>
         </w:r>
         <w:r>
           <w:rPr>
@@ -1719,7 +1732,7 @@
           <w14:ligatures w14:val="standardContextual"/>
         </w:rPr>
       </w:pPr>
-      <w:hyperlink w:anchor="_Toc237703594" w:history="1">
+      <w:hyperlink w:anchor="_Toc237709894" w:history="1">
         <w:r>
           <w:rPr>
             <w:rStyle w:val="Hipervnculo"/>
@@ -1746,7 +1759,7 @@
             <w:noProof/>
             <w:webHidden/>
           </w:rPr>
-          <w:instrText xml:space="preserve"> PAGEREF _Toc237703594 \h </w:instrText>
+          <w:instrText xml:space="preserve"> PAGEREF _Toc237709894 \h </w:instrText>
         </w:r>
         <w:r>
           <w:rPr>
@@ -1793,7 +1806,7 @@
           <w14:ligatures w14:val="standardContextual"/>
         </w:rPr>
       </w:pPr>
-      <w:hyperlink w:anchor="_Toc237703595" w:history="1">
+      <w:hyperlink w:anchor="_Toc237709895" w:history="1">
         <w:r>
           <w:rPr>
             <w:rStyle w:val="Hipervnculo"/>
@@ -1820,7 +1833,7 @@
             <w:noProof/>
             <w:webHidden/>
           </w:rPr>
-          <w:instrText xml:space="preserve"> PAGEREF _Toc237703595 \h </w:instrText>
+          <w:instrText xml:space="preserve"> PAGEREF _Toc237709895 \h </w:instrText>
         </w:r>
         <w:r>
           <w:rPr>
@@ -1867,7 +1880,7 @@
           <w14:ligatures w14:val="standardContextual"/>
         </w:rPr>
       </w:pPr>
-      <w:hyperlink w:anchor="_Toc237703596" w:history="1">
+      <w:hyperlink w:anchor="_Toc237709896" w:history="1">
         <w:r>
           <w:rPr>
             <w:rStyle w:val="Hipervnculo"/>
@@ -1894,7 +1907,7 @@
             <w:noProof/>
             <w:webHidden/>
           </w:rPr>
-          <w:instrText xml:space="preserve"> PAGEREF _Toc237703596 \h </w:instrText>
+          <w:instrText xml:space="preserve"> PAGEREF _Toc237709896 \h </w:instrText>
         </w:r>
         <w:r>
           <w:rPr>
@@ -1941,7 +1954,7 @@
           <w14:ligatures w14:val="standardContextual"/>
         </w:rPr>
       </w:pPr>
-      <w:hyperlink w:anchor="_Toc237703597" w:history="1">
+      <w:hyperlink w:anchor="_Toc237709897" w:history="1">
         <w:r>
           <w:rPr>
             <w:rStyle w:val="Hipervnculo"/>
@@ -1968,7 +1981,7 @@
             <w:noProof/>
             <w:webHidden/>
           </w:rPr>
-          <w:instrText xml:space="preserve"> PAGEREF _Toc237703597 \h </w:instrText>
+          <w:instrText xml:space="preserve"> PAGEREF _Toc237709897 \h </w:instrText>
         </w:r>
         <w:r>
           <w:rPr>
@@ -2015,7 +2028,7 @@
           <w14:ligatures w14:val="standardContextual"/>
         </w:rPr>
       </w:pPr>
-      <w:hyperlink w:anchor="_Toc237703598" w:history="1">
+      <w:hyperlink w:anchor="_Toc237709898" w:history="1">
         <w:r>
           <w:rPr>
             <w:rStyle w:val="Hipervnculo"/>
@@ -2042,7 +2055,7 @@
             <w:noProof/>
             <w:webHidden/>
           </w:rPr>
-          <w:instrText xml:space="preserve"> PAGEREF _Toc237703598 \h </w:instrText>
+          <w:instrText xml:space="preserve"> PAGEREF _Toc237709898 \h </w:instrText>
         </w:r>
         <w:r>
           <w:rPr>
@@ -2089,7 +2102,7 @@
           <w14:ligatures w14:val="standardContextual"/>
         </w:rPr>
       </w:pPr>
-      <w:hyperlink w:anchor="_Toc237703599" w:history="1">
+      <w:hyperlink w:anchor="_Toc237709899" w:history="1">
         <w:r>
           <w:rPr>
             <w:rStyle w:val="Hipervnculo"/>
@@ -2116,7 +2129,7 @@
             <w:noProof/>
             <w:webHidden/>
           </w:rPr>
-          <w:instrText xml:space="preserve"> PAGEREF _Toc237703599 \h </w:instrText>
+          <w:instrText xml:space="preserve"> PAGEREF _Toc237709899 \h </w:instrText>
         </w:r>
         <w:r>
           <w:rPr>
@@ -2163,7 +2176,7 @@
           <w14:ligatures w14:val="standardContextual"/>
         </w:rPr>
       </w:pPr>
-      <w:hyperlink w:anchor="_Toc237703600" w:history="1">
+      <w:hyperlink w:anchor="_Toc237709900" w:history="1">
         <w:r>
           <w:rPr>
             <w:rStyle w:val="Hipervnculo"/>
@@ -2190,7 +2203,7 @@
             <w:noProof/>
             <w:webHidden/>
           </w:rPr>
-          <w:instrText xml:space="preserve"> PAGEREF _Toc237703600 \h </w:instrText>
+          <w:instrText xml:space="preserve"> PAGEREF _Toc237709900 \h </w:instrText>
         </w:r>
         <w:r>
           <w:rPr>
@@ -2237,7 +2250,7 @@
           <w14:ligatures w14:val="standardContextual"/>
         </w:rPr>
       </w:pPr>
-      <w:hyperlink w:anchor="_Toc237703601" w:history="1">
+      <w:hyperlink w:anchor="_Toc237709901" w:history="1">
         <w:r>
           <w:rPr>
             <w:rStyle w:val="Hipervnculo"/>
@@ -2264,7 +2277,7 @@
             <w:noProof/>
             <w:webHidden/>
           </w:rPr>
-          <w:instrText xml:space="preserve"> PAGEREF _Toc237703601 \h </w:instrText>
+          <w:instrText xml:space="preserve"> PAGEREF _Toc237709901 \h </w:instrText>
         </w:r>
         <w:r>
           <w:rPr>
@@ -2311,7 +2324,7 @@
           <w14:ligatures w14:val="standardContextual"/>
         </w:rPr>
       </w:pPr>
-      <w:hyperlink w:anchor="_Toc237703602" w:history="1">
+      <w:hyperlink w:anchor="_Toc237709902" w:history="1">
         <w:r>
           <w:rPr>
             <w:rStyle w:val="Hipervnculo"/>
@@ -2338,7 +2351,7 @@
             <w:noProof/>
             <w:webHidden/>
           </w:rPr>
-          <w:instrText xml:space="preserve"> PAGEREF _Toc237703602 \h </w:instrText>
+          <w:instrText xml:space="preserve"> PAGEREF _Toc237709902 \h </w:instrText>
         </w:r>
         <w:r>
           <w:rPr>
@@ -2385,7 +2398,7 @@
           <w14:ligatures w14:val="standardContextual"/>
         </w:rPr>
       </w:pPr>
-      <w:hyperlink w:anchor="_Toc237703603" w:history="1">
+      <w:hyperlink w:anchor="_Toc237709903" w:history="1">
         <w:r>
           <w:rPr>
             <w:rStyle w:val="Hipervnculo"/>
@@ -2412,7 +2425,7 @@
             <w:noProof/>
             <w:webHidden/>
           </w:rPr>
-          <w:instrText xml:space="preserve"> PAGEREF _Toc237703603 \h </w:instrText>
+          <w:instrText xml:space="preserve"> PAGEREF _Toc237709903 \h </w:instrText>
         </w:r>
         <w:r>
           <w:rPr>
@@ -2459,7 +2472,7 @@
           <w14:ligatures w14:val="standardContextual"/>
         </w:rPr>
       </w:pPr>
-      <w:hyperlink w:anchor="_Toc237703604" w:history="1">
+      <w:hyperlink w:anchor="_Toc237709904" w:history="1">
         <w:r>
           <w:rPr>
             <w:rStyle w:val="Hipervnculo"/>
@@ -2486,7 +2499,7 @@
             <w:noProof/>
             <w:webHidden/>
           </w:rPr>
-          <w:instrText xml:space="preserve"> PAGEREF _Toc237703604 \h </w:instrText>
+          <w:instrText xml:space="preserve"> PAGEREF _Toc237709904 \h </w:instrText>
         </w:r>
         <w:r>
           <w:rPr>
@@ -2533,7 +2546,7 @@
           <w14:ligatures w14:val="standardContextual"/>
         </w:rPr>
       </w:pPr>
-      <w:hyperlink w:anchor="_Toc237703605" w:history="1">
+      <w:hyperlink w:anchor="_Toc237709905" w:history="1">
         <w:r>
           <w:rPr>
             <w:rStyle w:val="Hipervnculo"/>
@@ -2560,7 +2573,7 @@
             <w:noProof/>
             <w:webHidden/>
           </w:rPr>
-          <w:instrText xml:space="preserve"> PAGEREF _Toc237703605 \h </w:instrText>
+          <w:instrText xml:space="preserve"> PAGEREF _Toc237709905 \h </w:instrText>
         </w:r>
         <w:r>
           <w:rPr>
@@ -2607,7 +2620,7 @@
           <w14:ligatures w14:val="standardContextual"/>
         </w:rPr>
       </w:pPr>
-      <w:hyperlink w:anchor="_Toc237703606" w:history="1">
+      <w:hyperlink w:anchor="_Toc237709906" w:history="1">
         <w:r>
           <w:rPr>
             <w:rStyle w:val="Hipervnculo"/>
@@ -2634,7 +2647,7 @@
             <w:noProof/>
             <w:webHidden/>
           </w:rPr>
-          <w:instrText xml:space="preserve"> PAGEREF _Toc237703606 \h </w:instrText>
+          <w:instrText xml:space="preserve"> PAGEREF _Toc237709906 \h </w:instrText>
         </w:r>
         <w:r>
           <w:rPr>
@@ -2681,7 +2694,7 @@
           <w14:ligatures w14:val="standardContextual"/>
         </w:rPr>
       </w:pPr>
-      <w:hyperlink w:anchor="_Toc237703607" w:history="1">
+      <w:hyperlink w:anchor="_Toc237709907" w:history="1">
         <w:r>
           <w:rPr>
             <w:rStyle w:val="Hipervnculo"/>
@@ -2708,7 +2721,7 @@
             <w:noProof/>
             <w:webHidden/>
           </w:rPr>
-          <w:instrText xml:space="preserve"> PAGEREF _Toc237703607 \h </w:instrText>
+          <w:instrText xml:space="preserve"> PAGEREF _Toc237709907 \h </w:instrText>
         </w:r>
         <w:r>
           <w:rPr>
@@ -2755,7 +2768,7 @@
           <w14:ligatures w14:val="standardContextual"/>
         </w:rPr>
       </w:pPr>
-      <w:hyperlink w:anchor="_Toc237703608" w:history="1">
+      <w:hyperlink w:anchor="_Toc237709908" w:history="1">
         <w:r>
           <w:rPr>
             <w:rStyle w:val="Hipervnculo"/>
@@ -2782,7 +2795,7 @@
             <w:noProof/>
             <w:webHidden/>
           </w:rPr>
-          <w:instrText xml:space="preserve"> PAGEREF _Toc237703608 \h </w:instrText>
+          <w:instrText xml:space="preserve"> PAGEREF _Toc237709908 \h </w:instrText>
         </w:r>
         <w:r>
           <w:rPr>
@@ -2829,7 +2842,7 @@
           <w14:ligatures w14:val="standardContextual"/>
         </w:rPr>
       </w:pPr>
-      <w:hyperlink w:anchor="_Toc237703609" w:history="1">
+      <w:hyperlink w:anchor="_Toc237709909" w:history="1">
         <w:r>
           <w:rPr>
             <w:rStyle w:val="Hipervnculo"/>
@@ -2856,7 +2869,7 @@
             <w:noProof/>
             <w:webHidden/>
           </w:rPr>
-          <w:instrText xml:space="preserve"> PAGEREF _Toc237703609 \h </w:instrText>
+          <w:instrText xml:space="preserve"> PAGEREF _Toc237709909 \h </w:instrText>
         </w:r>
         <w:r>
           <w:rPr>
@@ -2903,7 +2916,7 @@
           <w14:ligatures w14:val="standardContextual"/>
         </w:rPr>
       </w:pPr>
-      <w:hyperlink w:anchor="_Toc237703610" w:history="1">
+      <w:hyperlink w:anchor="_Toc237709910" w:history="1">
         <w:r>
           <w:rPr>
             <w:rStyle w:val="Hipervnculo"/>
@@ -2930,7 +2943,7 @@
             <w:noProof/>
             <w:webHidden/>
           </w:rPr>
-          <w:instrText xml:space="preserve"> PAGEREF _Toc237703610 \h </w:instrText>
+          <w:instrText xml:space="preserve"> PAGEREF _Toc237709910 \h </w:instrText>
         </w:r>
         <w:r>
           <w:rPr>
@@ -2977,7 +2990,7 @@
           <w14:ligatures w14:val="standardContextual"/>
         </w:rPr>
       </w:pPr>
-      <w:hyperlink w:anchor="_Toc237703611" w:history="1">
+      <w:hyperlink w:anchor="_Toc237709911" w:history="1">
         <w:r>
           <w:rPr>
             <w:rStyle w:val="Hipervnculo"/>
@@ -3004,7 +3017,7 @@
             <w:noProof/>
             <w:webHidden/>
           </w:rPr>
-          <w:instrText xml:space="preserve"> PAGEREF _Toc237703611 \h </w:instrText>
+          <w:instrText xml:space="preserve"> PAGEREF _Toc237709911 \h </w:instrText>
         </w:r>
         <w:r>
           <w:rPr>
@@ -3051,7 +3064,7 @@
           <w14:ligatures w14:val="standardContextual"/>
         </w:rPr>
       </w:pPr>
-      <w:hyperlink w:anchor="_Toc237703612" w:history="1">
+      <w:hyperlink w:anchor="_Toc237709912" w:history="1">
         <w:r>
           <w:rPr>
             <w:rStyle w:val="Hipervnculo"/>
@@ -3108,7 +3121,7 @@
             <w:noProof/>
             <w:webHidden/>
           </w:rPr>
-          <w:instrText xml:space="preserve"> PAGEREF _Toc237703612 \h </w:instrText>
+          <w:instrText xml:space="preserve"> PAGEREF _Toc237709912 \h </w:instrText>
         </w:r>
         <w:r>
           <w:rPr>
@@ -3155,7 +3168,7 @@
           <w14:ligatures w14:val="standardContextual"/>
         </w:rPr>
       </w:pPr>
-      <w:hyperlink w:anchor="_Toc237703613" w:history="1">
+      <w:hyperlink w:anchor="_Toc237709913" w:history="1">
         <w:r>
           <w:rPr>
             <w:rStyle w:val="Hipervnculo"/>
@@ -3182,7 +3195,7 @@
             <w:noProof/>
             <w:webHidden/>
           </w:rPr>
-          <w:instrText xml:space="preserve"> PAGEREF _Toc237703613 \h </w:instrText>
+          <w:instrText xml:space="preserve"> PAGEREF _Toc237709913 \h </w:instrText>
         </w:r>
         <w:r>
           <w:rPr>
@@ -3229,7 +3242,7 @@
           <w14:ligatures w14:val="standardContextual"/>
         </w:rPr>
       </w:pPr>
-      <w:hyperlink w:anchor="_Toc237703614" w:history="1">
+      <w:hyperlink w:anchor="_Toc237709914" w:history="1">
         <w:r>
           <w:rPr>
             <w:rStyle w:val="Hipervnculo"/>
@@ -3256,7 +3269,7 @@
             <w:noProof/>
             <w:webHidden/>
           </w:rPr>
-          <w:instrText xml:space="preserve"> PAGEREF _Toc237703614 \h </w:instrText>
+          <w:instrText xml:space="preserve"> PAGEREF _Toc237709914 \h </w:instrText>
         </w:r>
         <w:r>
           <w:rPr>
@@ -3303,7 +3316,7 @@
           <w14:ligatures w14:val="standardContextual"/>
         </w:rPr>
       </w:pPr>
-      <w:hyperlink w:anchor="_Toc237703615" w:history="1">
+      <w:hyperlink w:anchor="_Toc237709915" w:history="1">
         <w:r>
           <w:rPr>
             <w:rStyle w:val="Hipervnculo"/>
@@ -3330,7 +3343,7 @@
             <w:noProof/>
             <w:webHidden/>
           </w:rPr>
-          <w:instrText xml:space="preserve"> PAGEREF _Toc237703615 \h </w:instrText>
+          <w:instrText xml:space="preserve"> PAGEREF _Toc237709915 \h </w:instrText>
         </w:r>
         <w:r>
           <w:rPr>
@@ -3377,7 +3390,7 @@
           <w14:ligatures w14:val="standardContextual"/>
         </w:rPr>
       </w:pPr>
-      <w:hyperlink w:anchor="_Toc237703616" w:history="1">
+      <w:hyperlink w:anchor="_Toc237709916" w:history="1">
         <w:r>
           <w:rPr>
             <w:rStyle w:val="Hipervnculo"/>
@@ -3404,7 +3417,7 @@
             <w:noProof/>
             <w:webHidden/>
           </w:rPr>
-          <w:instrText xml:space="preserve"> PAGEREF _Toc237703616 \h </w:instrText>
+          <w:instrText xml:space="preserve"> PAGEREF _Toc237709916 \h </w:instrText>
         </w:r>
         <w:r>
           <w:rPr>
@@ -3451,7 +3464,7 @@
           <w14:ligatures w14:val="standardContextual"/>
         </w:rPr>
       </w:pPr>
-      <w:hyperlink w:anchor="_Toc237703617" w:history="1">
+      <w:hyperlink w:anchor="_Toc237709917" w:history="1">
         <w:r>
           <w:rPr>
             <w:rStyle w:val="Hipervnculo"/>
@@ -3478,7 +3491,7 @@
             <w:noProof/>
             <w:webHidden/>
           </w:rPr>
-          <w:instrText xml:space="preserve"> PAGEREF _Toc237703617 \h </w:instrText>
+          <w:instrText xml:space="preserve"> PAGEREF _Toc237709917 \h </w:instrText>
         </w:r>
         <w:r>
           <w:rPr>
@@ -3525,7 +3538,7 @@
           <w14:ligatures w14:val="standardContextual"/>
         </w:rPr>
       </w:pPr>
-      <w:hyperlink w:anchor="_Toc237703618" w:history="1">
+      <w:hyperlink w:anchor="_Toc237709918" w:history="1">
         <w:r>
           <w:rPr>
             <w:rStyle w:val="Hipervnculo"/>
@@ -3552,7 +3565,7 @@
             <w:noProof/>
             <w:webHidden/>
           </w:rPr>
-          <w:instrText xml:space="preserve"> PAGEREF _Toc237703618 \h </w:instrText>
+          <w:instrText xml:space="preserve"> PAGEREF _Toc237709918 \h </w:instrText>
         </w:r>
         <w:r>
           <w:rPr>
@@ -3599,7 +3612,7 @@
           <w14:ligatures w14:val="standardContextual"/>
         </w:rPr>
       </w:pPr>
-      <w:hyperlink w:anchor="_Toc237703619" w:history="1">
+      <w:hyperlink w:anchor="_Toc237709919" w:history="1">
         <w:r>
           <w:rPr>
             <w:rStyle w:val="Hipervnculo"/>
@@ -3626,7 +3639,7 @@
             <w:noProof/>
             <w:webHidden/>
           </w:rPr>
-          <w:instrText xml:space="preserve"> PAGEREF _Toc237703619 \h </w:instrText>
+          <w:instrText xml:space="preserve"> PAGEREF _Toc237709919 \h </w:instrText>
         </w:r>
         <w:r>
           <w:rPr>
@@ -3673,7 +3686,7 @@
           <w14:ligatures w14:val="standardContextual"/>
         </w:rPr>
       </w:pPr>
-      <w:hyperlink w:anchor="_Toc237703620" w:history="1">
+      <w:hyperlink w:anchor="_Toc237709920" w:history="1">
         <w:r>
           <w:rPr>
             <w:rStyle w:val="Hipervnculo"/>
@@ -3700,7 +3713,7 @@
             <w:noProof/>
             <w:webHidden/>
           </w:rPr>
-          <w:instrText xml:space="preserve"> PAGEREF _Toc237703620 \h </w:instrText>
+          <w:instrText xml:space="preserve"> PAGEREF _Toc237709920 \h </w:instrText>
         </w:r>
         <w:r>
           <w:rPr>
@@ -3747,7 +3760,7 @@
           <w14:ligatures w14:val="standardContextual"/>
         </w:rPr>
       </w:pPr>
-      <w:hyperlink w:anchor="_Toc237703621" w:history="1">
+      <w:hyperlink w:anchor="_Toc237709921" w:history="1">
         <w:r>
           <w:rPr>
             <w:rStyle w:val="Hipervnculo"/>
@@ -3774,7 +3787,7 @@
             <w:noProof/>
             <w:webHidden/>
           </w:rPr>
-          <w:instrText xml:space="preserve"> PAGEREF _Toc237703621 \h </w:instrText>
+          <w:instrText xml:space="preserve"> PAGEREF _Toc237709921 \h </w:instrText>
         </w:r>
         <w:r>
           <w:rPr>
@@ -3821,7 +3834,7 @@
           <w14:ligatures w14:val="standardContextual"/>
         </w:rPr>
       </w:pPr>
-      <w:hyperlink w:anchor="_Toc237703622" w:history="1">
+      <w:hyperlink w:anchor="_Toc237709922" w:history="1">
         <w:r>
           <w:rPr>
             <w:rStyle w:val="Hipervnculo"/>
@@ -3848,7 +3861,7 @@
             <w:noProof/>
             <w:webHidden/>
           </w:rPr>
-          <w:instrText xml:space="preserve"> PAGEREF _Toc237703622 \h </w:instrText>
+          <w:instrText xml:space="preserve"> PAGEREF _Toc237709922 \h </w:instrText>
         </w:r>
         <w:r>
           <w:rPr>
@@ -3895,7 +3908,7 @@
           <w14:ligatures w14:val="standardContextual"/>
         </w:rPr>
       </w:pPr>
-      <w:hyperlink w:anchor="_Toc237703623" w:history="1">
+      <w:hyperlink w:anchor="_Toc237709923" w:history="1">
         <w:r>
           <w:rPr>
             <w:rStyle w:val="Hipervnculo"/>
@@ -3922,7 +3935,7 @@
             <w:noProof/>
             <w:webHidden/>
           </w:rPr>
-          <w:instrText xml:space="preserve"> PAGEREF _Toc237703623 \h </w:instrText>
+          <w:instrText xml:space="preserve"> PAGEREF _Toc237709923 \h </w:instrText>
         </w:r>
         <w:r>
           <w:rPr>
@@ -3969,7 +3982,7 @@
           <w14:ligatures w14:val="standardContextual"/>
         </w:rPr>
       </w:pPr>
-      <w:hyperlink w:anchor="_Toc237703624" w:history="1">
+      <w:hyperlink w:anchor="_Toc237709924" w:history="1">
         <w:r>
           <w:rPr>
             <w:rStyle w:val="Hipervnculo"/>
@@ -3996,7 +4009,7 @@
             <w:noProof/>
             <w:webHidden/>
           </w:rPr>
-          <w:instrText xml:space="preserve"> PAGEREF _Toc237703624 \h </w:instrText>
+          <w:instrText xml:space="preserve"> PAGEREF _Toc237709924 \h </w:instrText>
         </w:r>
         <w:r>
           <w:rPr>
@@ -4043,7 +4056,7 @@
           <w14:ligatures w14:val="standardContextual"/>
         </w:rPr>
       </w:pPr>
-      <w:hyperlink w:anchor="_Toc237703625" w:history="1">
+      <w:hyperlink w:anchor="_Toc237709925" w:history="1">
         <w:r>
           <w:rPr>
             <w:rStyle w:val="Hipervnculo"/>
@@ -4070,7 +4083,7 @@
             <w:noProof/>
             <w:webHidden/>
           </w:rPr>
-          <w:instrText xml:space="preserve"> PAGEREF _Toc237703625 \h </w:instrText>
+          <w:instrText xml:space="preserve"> PAGEREF _Toc237709925 \h </w:instrText>
         </w:r>
         <w:r>
           <w:rPr>
@@ -4117,7 +4130,7 @@
           <w14:ligatures w14:val="standardContextual"/>
         </w:rPr>
       </w:pPr>
-      <w:hyperlink w:anchor="_Toc237703626" w:history="1">
+      <w:hyperlink w:anchor="_Toc237709926" w:history="1">
         <w:r>
           <w:rPr>
             <w:rStyle w:val="Hipervnculo"/>
@@ -4144,7 +4157,7 @@
             <w:noProof/>
             <w:webHidden/>
           </w:rPr>
-          <w:instrText xml:space="preserve"> PAGEREF _Toc237703626 \h </w:instrText>
+          <w:instrText xml:space="preserve"> PAGEREF _Toc237709926 \h </w:instrText>
         </w:r>
         <w:r>
           <w:rPr>
@@ -4191,7 +4204,7 @@
           <w14:ligatures w14:val="standardContextual"/>
         </w:rPr>
       </w:pPr>
-      <w:hyperlink w:anchor="_Toc237703627" w:history="1">
+      <w:hyperlink w:anchor="_Toc237709927" w:history="1">
         <w:r>
           <w:rPr>
             <w:rStyle w:val="Hipervnculo"/>
@@ -4218,7 +4231,7 @@
             <w:noProof/>
             <w:webHidden/>
           </w:rPr>
-          <w:instrText xml:space="preserve"> PAGEREF _Toc237703627 \h </w:instrText>
+          <w:instrText xml:space="preserve"> PAGEREF _Toc237709927 \h </w:instrText>
         </w:r>
         <w:r>
           <w:rPr>
@@ -4265,7 +4278,7 @@
           <w14:ligatures w14:val="standardContextual"/>
         </w:rPr>
       </w:pPr>
-      <w:hyperlink w:anchor="_Toc237703628" w:history="1">
+      <w:hyperlink w:anchor="_Toc237709928" w:history="1">
         <w:r>
           <w:rPr>
             <w:rStyle w:val="Hipervnculo"/>
@@ -4292,7 +4305,7 @@
             <w:noProof/>
             <w:webHidden/>
           </w:rPr>
-          <w:instrText xml:space="preserve"> PAGEREF _Toc237703628 \h </w:instrText>
+          <w:instrText xml:space="preserve"> PAGEREF _Toc237709928 \h </w:instrText>
         </w:r>
         <w:r>
           <w:rPr>
@@ -4339,7 +4352,7 @@
           <w14:ligatures w14:val="standardContextual"/>
         </w:rPr>
       </w:pPr>
-      <w:hyperlink w:anchor="_Toc237703629" w:history="1">
+      <w:hyperlink w:anchor="_Toc237709929" w:history="1">
         <w:r>
           <w:rPr>
             <w:rStyle w:val="Hipervnculo"/>
@@ -4366,7 +4379,7 @@
             <w:noProof/>
             <w:webHidden/>
           </w:rPr>
-          <w:instrText xml:space="preserve"> PAGEREF _Toc237703629 \h </w:instrText>
+          <w:instrText xml:space="preserve"> PAGEREF _Toc237709929 \h </w:instrText>
         </w:r>
         <w:r>
           <w:rPr>
@@ -4413,7 +4426,7 @@
           <w14:ligatures w14:val="standardContextual"/>
         </w:rPr>
       </w:pPr>
-      <w:hyperlink w:anchor="_Toc237703630" w:history="1">
+      <w:hyperlink w:anchor="_Toc237709930" w:history="1">
         <w:r>
           <w:rPr>
             <w:rStyle w:val="Hipervnculo"/>
@@ -4440,7 +4453,7 @@
             <w:noProof/>
             <w:webHidden/>
           </w:rPr>
-          <w:instrText xml:space="preserve"> PAGEREF _Toc237703630 \h </w:instrText>
+          <w:instrText xml:space="preserve"> PAGEREF _Toc237709930 \h </w:instrText>
         </w:r>
         <w:r>
           <w:rPr>
@@ -4487,7 +4500,7 @@
           <w14:ligatures w14:val="standardContextual"/>
         </w:rPr>
       </w:pPr>
-      <w:hyperlink w:anchor="_Toc237703631" w:history="1">
+      <w:hyperlink w:anchor="_Toc237709931" w:history="1">
         <w:r>
           <w:rPr>
             <w:rStyle w:val="Hipervnculo"/>
@@ -4514,7 +4527,7 @@
             <w:noProof/>
             <w:webHidden/>
           </w:rPr>
-          <w:instrText xml:space="preserve"> PAGEREF _Toc237703631 \h </w:instrText>
+          <w:instrText xml:space="preserve"> PAGEREF _Toc237709931 \h </w:instrText>
         </w:r>
         <w:r>
           <w:rPr>
@@ -4561,7 +4574,7 @@
           <w14:ligatures w14:val="standardContextual"/>
         </w:rPr>
       </w:pPr>
-      <w:hyperlink w:anchor="_Toc237703632" w:history="1">
+      <w:hyperlink w:anchor="_Toc237709932" w:history="1">
         <w:r>
           <w:rPr>
             <w:rStyle w:val="Hipervnculo"/>
@@ -4588,7 +4601,7 @@
             <w:noProof/>
             <w:webHidden/>
           </w:rPr>
-          <w:instrText xml:space="preserve"> PAGEREF _Toc237703632 \h </w:instrText>
+          <w:instrText xml:space="preserve"> PAGEREF _Toc237709932 \h </w:instrText>
         </w:r>
         <w:r>
           <w:rPr>
@@ -4635,7 +4648,7 @@
           <w14:ligatures w14:val="standardContextual"/>
         </w:rPr>
       </w:pPr>
-      <w:hyperlink w:anchor="_Toc237703633" w:history="1">
+      <w:hyperlink w:anchor="_Toc237709933" w:history="1">
         <w:r>
           <w:rPr>
             <w:rStyle w:val="Hipervnculo"/>
@@ -4662,7 +4675,7 @@
             <w:noProof/>
             <w:webHidden/>
           </w:rPr>
-          <w:instrText xml:space="preserve"> PAGEREF _Toc237703633 \h </w:instrText>
+          <w:instrText xml:space="preserve"> PAGEREF _Toc237709933 \h </w:instrText>
         </w:r>
         <w:r>
           <w:rPr>
@@ -4709,7 +4722,7 @@
           <w14:ligatures w14:val="standardContextual"/>
         </w:rPr>
       </w:pPr>
-      <w:hyperlink w:anchor="_Toc237703634" w:history="1">
+      <w:hyperlink w:anchor="_Toc237709934" w:history="1">
         <w:r>
           <w:rPr>
             <w:rStyle w:val="Hipervnculo"/>
@@ -4736,7 +4749,7 @@
             <w:noProof/>
             <w:webHidden/>
           </w:rPr>
-          <w:instrText xml:space="preserve"> PAGEREF _Toc237703634 \h </w:instrText>
+          <w:instrText xml:space="preserve"> PAGEREF _Toc237709934 \h </w:instrText>
         </w:r>
         <w:r>
           <w:rPr>
@@ -4783,7 +4796,7 @@
           <w14:ligatures w14:val="standardContextual"/>
         </w:rPr>
       </w:pPr>
-      <w:hyperlink w:anchor="_Toc237703635" w:history="1">
+      <w:hyperlink w:anchor="_Toc237709935" w:history="1">
         <w:r>
           <w:rPr>
             <w:rStyle w:val="Hipervnculo"/>
@@ -4810,7 +4823,7 @@
             <w:noProof/>
             <w:webHidden/>
           </w:rPr>
-          <w:instrText xml:space="preserve"> PAGEREF _Toc237703635 \h </w:instrText>
+          <w:instrText xml:space="preserve"> PAGEREF _Toc237709935 \h </w:instrText>
         </w:r>
         <w:r>
           <w:rPr>
@@ -4857,7 +4870,7 @@
           <w14:ligatures w14:val="standardContextual"/>
         </w:rPr>
       </w:pPr>
-      <w:hyperlink w:anchor="_Toc237703636" w:history="1">
+      <w:hyperlink w:anchor="_Toc237709936" w:history="1">
         <w:r>
           <w:rPr>
             <w:rStyle w:val="Hipervnculo"/>
@@ -4884,7 +4897,7 @@
             <w:noProof/>
             <w:webHidden/>
           </w:rPr>
-          <w:instrText xml:space="preserve"> PAGEREF _Toc237703636 \h </w:instrText>
+          <w:instrText xml:space="preserve"> PAGEREF _Toc237709936 \h </w:instrText>
         </w:r>
         <w:r>
           <w:rPr>
@@ -4931,7 +4944,7 @@
           <w14:ligatures w14:val="standardContextual"/>
         </w:rPr>
       </w:pPr>
-      <w:hyperlink w:anchor="_Toc237703637" w:history="1">
+      <w:hyperlink w:anchor="_Toc237709937" w:history="1">
         <w:r>
           <w:rPr>
             <w:rStyle w:val="Hipervnculo"/>
@@ -4958,7 +4971,7 @@
             <w:noProof/>
             <w:webHidden/>
           </w:rPr>
-          <w:instrText xml:space="preserve"> PAGEREF _Toc237703637 \h </w:instrText>
+          <w:instrText xml:space="preserve"> PAGEREF _Toc237709937 \h </w:instrText>
         </w:r>
         <w:r>
           <w:rPr>
@@ -5005,7 +5018,7 @@
           <w14:ligatures w14:val="standardContextual"/>
         </w:rPr>
       </w:pPr>
-      <w:hyperlink w:anchor="_Toc237703638" w:history="1">
+      <w:hyperlink w:anchor="_Toc237709938" w:history="1">
         <w:r>
           <w:rPr>
             <w:rStyle w:val="Hipervnculo"/>
@@ -5032,7 +5045,7 @@
             <w:noProof/>
             <w:webHidden/>
           </w:rPr>
-          <w:instrText xml:space="preserve"> PAGEREF _Toc237703638 \h </w:instrText>
+          <w:instrText xml:space="preserve"> PAGEREF _Toc237709938 \h </w:instrText>
         </w:r>
         <w:r>
           <w:rPr>
@@ -5079,7 +5092,7 @@
           <w14:ligatures w14:val="standardContextual"/>
         </w:rPr>
       </w:pPr>
-      <w:hyperlink w:anchor="_Toc237703639" w:history="1">
+      <w:hyperlink w:anchor="_Toc237709939" w:history="1">
         <w:r>
           <w:rPr>
             <w:rStyle w:val="Hipervnculo"/>
@@ -5106,7 +5119,7 @@
             <w:noProof/>
             <w:webHidden/>
           </w:rPr>
-          <w:instrText xml:space="preserve"> PAGEREF _Toc237703639 \h </w:instrText>
+          <w:instrText xml:space="preserve"> PAGEREF _Toc237709939 \h </w:instrText>
         </w:r>
         <w:r>
           <w:rPr>
@@ -5153,7 +5166,7 @@
           <w14:ligatures w14:val="standardContextual"/>
         </w:rPr>
       </w:pPr>
-      <w:hyperlink w:anchor="_Toc237703640" w:history="1">
+      <w:hyperlink w:anchor="_Toc237709940" w:history="1">
         <w:r>
           <w:rPr>
             <w:rStyle w:val="Hipervnculo"/>
@@ -5180,7 +5193,7 @@
             <w:noProof/>
             <w:webHidden/>
           </w:rPr>
-          <w:instrText xml:space="preserve"> PAGEREF _Toc237703640 \h </w:instrText>
+          <w:instrText xml:space="preserve"> PAGEREF _Toc237709940 \h </w:instrText>
         </w:r>
         <w:r>
           <w:rPr>
@@ -5227,7 +5240,7 @@
           <w14:ligatures w14:val="standardContextual"/>
         </w:rPr>
       </w:pPr>
-      <w:hyperlink w:anchor="_Toc237703641" w:history="1">
+      <w:hyperlink w:anchor="_Toc237709941" w:history="1">
         <w:r>
           <w:rPr>
             <w:rStyle w:val="Hipervnculo"/>
@@ -5254,7 +5267,7 @@
             <w:noProof/>
             <w:webHidden/>
           </w:rPr>
-          <w:instrText xml:space="preserve"> PAGEREF _Toc237703641 \h </w:instrText>
+          <w:instrText xml:space="preserve"> PAGEREF _Toc237709941 \h </w:instrText>
         </w:r>
         <w:r>
           <w:rPr>
@@ -5301,7 +5314,7 @@
           <w14:ligatures w14:val="standardContextual"/>
         </w:rPr>
       </w:pPr>
-      <w:hyperlink w:anchor="_Toc237703642" w:history="1">
+      <w:hyperlink w:anchor="_Toc237709942" w:history="1">
         <w:r>
           <w:rPr>
             <w:rStyle w:val="Hipervnculo"/>
@@ -5328,7 +5341,7 @@
             <w:noProof/>
             <w:webHidden/>
           </w:rPr>
-          <w:instrText xml:space="preserve"> PAGEREF _Toc237703642 \h </w:instrText>
+          <w:instrText xml:space="preserve"> PAGEREF _Toc237709942 \h </w:instrText>
         </w:r>
         <w:r>
           <w:rPr>
@@ -5375,7 +5388,7 @@
           <w14:ligatures w14:val="standardContextual"/>
         </w:rPr>
       </w:pPr>
-      <w:hyperlink w:anchor="_Toc237703643" w:history="1">
+      <w:hyperlink w:anchor="_Toc237709943" w:history="1">
         <w:r>
           <w:rPr>
             <w:rStyle w:val="Hipervnculo"/>
@@ -5402,155 +5415,7 @@
             <w:noProof/>
             <w:webHidden/>
           </w:rPr>
-          <w:instrText xml:space="preserve"> PAGEREF _Toc237703643 \h </w:instrText>
-        </w:r>
-        <w:r>
-          <w:rPr>
-            <w:noProof/>
-            <w:webHidden/>
-          </w:rPr>
-        </w:r>
-        <w:r>
-          <w:rPr>
-            <w:noProof/>
-            <w:webHidden/>
-          </w:rPr>
-          <w:fldChar w:fldCharType="separate"/>
-        </w:r>
-        <w:r>
-          <w:rPr>
-            <w:noProof/>
-            <w:webHidden/>
-          </w:rPr>
-          <w:t>12</w:t>
-        </w:r>
-        <w:r>
-          <w:rPr>
-            <w:noProof/>
-            <w:webHidden/>
-          </w:rPr>
-          <w:fldChar w:fldCharType="end"/>
-        </w:r>
-      </w:hyperlink>
-    </w:p>
-    <w:p>
-      <w:pPr>
-        <w:pStyle w:val="TDC2"/>
-        <w:tabs>
-          <w:tab w:val="right" w:leader="dot" w:pos="4837"/>
-        </w:tabs>
-        <w:rPr>
-          <w:rFonts w:asciiTheme="minorHAnsi" w:hAnsiTheme="minorHAnsi"/>
-          <w:noProof/>
-          <w:color w:val="auto"/>
-          <w:kern w:val="2"/>
-          <w:sz w:val="24"/>
-          <w:szCs w:val="24"/>
-          <w14:ligatures w14:val="standardContextual"/>
-        </w:rPr>
-      </w:pPr>
-      <w:hyperlink w:anchor="_Toc237703644" w:history="1">
-        <w:r>
-          <w:rPr>
-            <w:rStyle w:val="Hipervnculo"/>
-            <w:noProof/>
-          </w:rPr>
-          <w:t>Validación de la Tasa de Descuento: Proceso Cox-Ingersoll-Ross (CIR)</w:t>
-        </w:r>
-        <w:r>
-          <w:rPr>
-            <w:noProof/>
-            <w:webHidden/>
-          </w:rPr>
-          <w:tab/>
-        </w:r>
-        <w:r>
-          <w:rPr>
-            <w:noProof/>
-            <w:webHidden/>
-          </w:rPr>
-          <w:fldChar w:fldCharType="begin"/>
-        </w:r>
-        <w:r>
-          <w:rPr>
-            <w:noProof/>
-            <w:webHidden/>
-          </w:rPr>
-          <w:instrText xml:space="preserve"> PAGEREF _Toc237703644 \h </w:instrText>
-        </w:r>
-        <w:r>
-          <w:rPr>
-            <w:noProof/>
-            <w:webHidden/>
-          </w:rPr>
-        </w:r>
-        <w:r>
-          <w:rPr>
-            <w:noProof/>
-            <w:webHidden/>
-          </w:rPr>
-          <w:fldChar w:fldCharType="separate"/>
-        </w:r>
-        <w:r>
-          <w:rPr>
-            <w:noProof/>
-            <w:webHidden/>
-          </w:rPr>
-          <w:t>12</w:t>
-        </w:r>
-        <w:r>
-          <w:rPr>
-            <w:noProof/>
-            <w:webHidden/>
-          </w:rPr>
-          <w:fldChar w:fldCharType="end"/>
-        </w:r>
-      </w:hyperlink>
-    </w:p>
-    <w:p>
-      <w:pPr>
-        <w:pStyle w:val="TDC2"/>
-        <w:tabs>
-          <w:tab w:val="right" w:leader="dot" w:pos="4837"/>
-        </w:tabs>
-        <w:rPr>
-          <w:rFonts w:asciiTheme="minorHAnsi" w:hAnsiTheme="minorHAnsi"/>
-          <w:noProof/>
-          <w:color w:val="auto"/>
-          <w:kern w:val="2"/>
-          <w:sz w:val="24"/>
-          <w:szCs w:val="24"/>
-          <w14:ligatures w14:val="standardContextual"/>
-        </w:rPr>
-      </w:pPr>
-      <w:hyperlink w:anchor="_Toc237703645" w:history="1">
-        <w:r>
-          <w:rPr>
-            <w:rStyle w:val="Hipervnculo"/>
-            <w:noProof/>
-          </w:rPr>
-          <w:t>Volatilidad Condicional y Beta GARCH(1,1)</w:t>
-        </w:r>
-        <w:r>
-          <w:rPr>
-            <w:noProof/>
-            <w:webHidden/>
-          </w:rPr>
-          <w:tab/>
-        </w:r>
-        <w:r>
-          <w:rPr>
-            <w:noProof/>
-            <w:webHidden/>
-          </w:rPr>
-          <w:fldChar w:fldCharType="begin"/>
-        </w:r>
-        <w:r>
-          <w:rPr>
-            <w:noProof/>
-            <w:webHidden/>
-          </w:rPr>
-          <w:instrText xml:space="preserve"> PAGEREF _Toc237703645 \h </w:instrText>
+          <w:instrText xml:space="preserve"> PAGEREF _Toc237709943 \h </w:instrText>
         </w:r>
         <w:r>
           <w:rPr>
@@ -5597,7 +5462,155 @@
           <w14:ligatures w14:val="standardContextual"/>
         </w:rPr>
       </w:pPr>
-      <w:hyperlink w:anchor="_Toc237703646" w:history="1">
+      <w:hyperlink w:anchor="_Toc237709944" w:history="1">
+        <w:r>
+          <w:rPr>
+            <w:rStyle w:val="Hipervnculo"/>
+            <w:noProof/>
+          </w:rPr>
+          <w:t>Validación de la Tasa de Descuento: Proceso Cox-Ingersoll-Ross (CIR)</w:t>
+        </w:r>
+        <w:r>
+          <w:rPr>
+            <w:noProof/>
+            <w:webHidden/>
+          </w:rPr>
+          <w:tab/>
+        </w:r>
+        <w:r>
+          <w:rPr>
+            <w:noProof/>
+            <w:webHidden/>
+          </w:rPr>
+          <w:fldChar w:fldCharType="begin"/>
+        </w:r>
+        <w:r>
+          <w:rPr>
+            <w:noProof/>
+            <w:webHidden/>
+          </w:rPr>
+          <w:instrText xml:space="preserve"> PAGEREF _Toc237709944 \h </w:instrText>
+        </w:r>
+        <w:r>
+          <w:rPr>
+            <w:noProof/>
+            <w:webHidden/>
+          </w:rPr>
+        </w:r>
+        <w:r>
+          <w:rPr>
+            <w:noProof/>
+            <w:webHidden/>
+          </w:rPr>
+          <w:fldChar w:fldCharType="separate"/>
+        </w:r>
+        <w:r>
+          <w:rPr>
+            <w:noProof/>
+            <w:webHidden/>
+          </w:rPr>
+          <w:t>13</w:t>
+        </w:r>
+        <w:r>
+          <w:rPr>
+            <w:noProof/>
+            <w:webHidden/>
+          </w:rPr>
+          <w:fldChar w:fldCharType="end"/>
+        </w:r>
+      </w:hyperlink>
+    </w:p>
+    <w:p>
+      <w:pPr>
+        <w:pStyle w:val="TDC2"/>
+        <w:tabs>
+          <w:tab w:val="right" w:leader="dot" w:pos="4837"/>
+        </w:tabs>
+        <w:rPr>
+          <w:rFonts w:asciiTheme="minorHAnsi" w:hAnsiTheme="minorHAnsi"/>
+          <w:noProof/>
+          <w:color w:val="auto"/>
+          <w:kern w:val="2"/>
+          <w:sz w:val="24"/>
+          <w:szCs w:val="24"/>
+          <w14:ligatures w14:val="standardContextual"/>
+        </w:rPr>
+      </w:pPr>
+      <w:hyperlink w:anchor="_Toc237709945" w:history="1">
+        <w:r>
+          <w:rPr>
+            <w:rStyle w:val="Hipervnculo"/>
+            <w:noProof/>
+          </w:rPr>
+          <w:t>Volatilidad Condicional y Beta GARCH(1,1)</w:t>
+        </w:r>
+        <w:r>
+          <w:rPr>
+            <w:noProof/>
+            <w:webHidden/>
+          </w:rPr>
+          <w:tab/>
+        </w:r>
+        <w:r>
+          <w:rPr>
+            <w:noProof/>
+            <w:webHidden/>
+          </w:rPr>
+          <w:fldChar w:fldCharType="begin"/>
+        </w:r>
+        <w:r>
+          <w:rPr>
+            <w:noProof/>
+            <w:webHidden/>
+          </w:rPr>
+          <w:instrText xml:space="preserve"> PAGEREF _Toc237709945 \h </w:instrText>
+        </w:r>
+        <w:r>
+          <w:rPr>
+            <w:noProof/>
+            <w:webHidden/>
+          </w:rPr>
+        </w:r>
+        <w:r>
+          <w:rPr>
+            <w:noProof/>
+            <w:webHidden/>
+          </w:rPr>
+          <w:fldChar w:fldCharType="separate"/>
+        </w:r>
+        <w:r>
+          <w:rPr>
+            <w:noProof/>
+            <w:webHidden/>
+          </w:rPr>
+          <w:t>13</w:t>
+        </w:r>
+        <w:r>
+          <w:rPr>
+            <w:noProof/>
+            <w:webHidden/>
+          </w:rPr>
+          <w:fldChar w:fldCharType="end"/>
+        </w:r>
+      </w:hyperlink>
+    </w:p>
+    <w:p>
+      <w:pPr>
+        <w:pStyle w:val="TDC2"/>
+        <w:tabs>
+          <w:tab w:val="right" w:leader="dot" w:pos="4837"/>
+        </w:tabs>
+        <w:rPr>
+          <w:rFonts w:asciiTheme="minorHAnsi" w:hAnsiTheme="minorHAnsi"/>
+          <w:noProof/>
+          <w:color w:val="auto"/>
+          <w:kern w:val="2"/>
+          <w:sz w:val="24"/>
+          <w:szCs w:val="24"/>
+          <w14:ligatures w14:val="standardContextual"/>
+        </w:rPr>
+      </w:pPr>
+      <w:hyperlink w:anchor="_Toc237709946" w:history="1">
         <w:r>
           <w:rPr>
             <w:rStyle w:val="Hipervnculo"/>
@@ -5624,7 +5637,7 @@
             <w:noProof/>
             <w:webHidden/>
           </w:rPr>
-          <w:instrText xml:space="preserve"> PAGEREF _Toc237703646 \h </w:instrText>
+          <w:instrText xml:space="preserve"> PAGEREF _Toc237709946 \h </w:instrText>
         </w:r>
         <w:r>
           <w:rPr>
@@ -5671,7 +5684,7 @@
           <w14:ligatures w14:val="standardContextual"/>
         </w:rPr>
       </w:pPr>
-      <w:hyperlink w:anchor="_Toc237703647" w:history="1">
+      <w:hyperlink w:anchor="_Toc237709947" w:history="1">
         <w:r>
           <w:rPr>
             <w:rStyle w:val="Hipervnculo"/>
@@ -5698,7 +5711,7 @@
             <w:noProof/>
             <w:webHidden/>
           </w:rPr>
-          <w:instrText xml:space="preserve"> PAGEREF _Toc237703647 \h </w:instrText>
+          <w:instrText xml:space="preserve"> PAGEREF _Toc237709947 \h </w:instrText>
         </w:r>
         <w:r>
           <w:rPr>
@@ -5745,13 +5758,13 @@
           <w14:ligatures w14:val="standardContextual"/>
         </w:rPr>
       </w:pPr>
-      <w:hyperlink w:anchor="_Toc237703648" w:history="1">
+      <w:hyperlink w:anchor="_Toc237709948" w:history="1">
         <w:r>
           <w:rPr>
             <w:rStyle w:val="Hipervnculo"/>
             <w:noProof/>
           </w:rPr>
-          <w:t>Dictamen del Modelo Teórico y Conclusiones</w:t>
+          <w:t>Dictamen del Modelo de Valuación y Conclusiones</w:t>
         </w:r>
         <w:r>
           <w:rPr>
@@ -5772,7 +5785,7 @@
             <w:noProof/>
             <w:webHidden/>
           </w:rPr>
-          <w:instrText xml:space="preserve"> PAGEREF _Toc237703648 \h </w:instrText>
+          <w:instrText xml:space="preserve"> PAGEREF _Toc237709948 \h </w:instrText>
         </w:r>
         <w:r>
           <w:rPr>
@@ -5819,7 +5832,7 @@
           <w14:ligatures w14:val="standardContextual"/>
         </w:rPr>
       </w:pPr>
-      <w:hyperlink w:anchor="_Toc237703649" w:history="1">
+      <w:hyperlink w:anchor="_Toc237709949" w:history="1">
         <w:r>
           <w:rPr>
             <w:rStyle w:val="Hipervnculo"/>
@@ -5846,7 +5859,7 @@
             <w:noProof/>
             <w:webHidden/>
           </w:rPr>
-          <w:instrText xml:space="preserve"> PAGEREF _Toc237703649 \h </w:instrText>
+          <w:instrText xml:space="preserve"> PAGEREF _Toc237709949 \h </w:instrText>
         </w:r>
         <w:r>
           <w:rPr>
@@ -5893,7 +5906,7 @@
           <w14:ligatures w14:val="standardContextual"/>
         </w:rPr>
       </w:pPr>
-      <w:hyperlink w:anchor="_Toc237703650" w:history="1">
+      <w:hyperlink w:anchor="_Toc237709950" w:history="1">
         <w:r>
           <w:rPr>
             <w:rStyle w:val="Hipervnculo"/>
@@ -5920,7 +5933,7 @@
             <w:noProof/>
             <w:webHidden/>
           </w:rPr>
-          <w:instrText xml:space="preserve"> PAGEREF _Toc237703650 \h </w:instrText>
+          <w:instrText xml:space="preserve"> PAGEREF _Toc237709950 \h </w:instrText>
         </w:r>
         <w:r>
           <w:rPr>
@@ -5967,7 +5980,7 @@
           <w14:ligatures w14:val="standardContextual"/>
         </w:rPr>
       </w:pPr>
-      <w:hyperlink w:anchor="_Toc237703651" w:history="1">
+      <w:hyperlink w:anchor="_Toc237709951" w:history="1">
         <w:r>
           <w:rPr>
             <w:rStyle w:val="Hipervnculo"/>
@@ -5994,7 +6007,7 @@
             <w:noProof/>
             <w:webHidden/>
           </w:rPr>
-          <w:instrText xml:space="preserve"> PAGEREF _Toc237703651 \h </w:instrText>
+          <w:instrText xml:space="preserve"> PAGEREF _Toc237709951 \h </w:instrText>
         </w:r>
         <w:r>
           <w:rPr>
@@ -6078,7 +6091,7 @@
         <w:pStyle w:val="Ttulo1"/>
         <w:spacing w:before="100" w:after="30"/>
       </w:pPr>
-      <w:bookmarkStart w:id="0" w:name="_Toc237703589"/>
+      <w:bookmarkStart w:id="0" w:name="_Toc237709889"/>
       <w:r>
         <w:rPr>
           <w:rFonts w:ascii="Georgia" w:hAnsi="Georgia"/>
@@ -6095,7 +6108,7 @@
         <w:pStyle w:val="Ttulo2"/>
         <w:spacing w:before="70" w:after="20"/>
       </w:pPr>
-      <w:bookmarkStart w:id="1" w:name="_Toc237703590"/>
+      <w:bookmarkStart w:id="1" w:name="_Toc237709890"/>
       <w:r>
         <w:rPr>
           <w:rFonts w:ascii="Georgia" w:hAnsi="Georgia"/>
@@ -6143,7 +6156,7 @@
         <w:t>80% del volumen físico producido se destina a la exportación</w:t>
       </w:r>
       <w:r>
-        <w:t xml:space="preserve"> (Estados Unidos, Brasil, Europa y Japón), liquidado en dólares estadounidenses sobre cotizaciones del London Metal Exchange (LME) más primas regionales, lo que dota a la firma de un flujo operativo vinculado a moneda dura.</w:t>
+        <w:t xml:space="preserve"> (Estados Unidos, Brasil, Europa y Japón), liquidado en dólares estadounidenses sobre cotizaciones del London Metal Exchange (LME) más primas regionales, lo que otorga a la firma una cobertura cambiaria estructural.</w:t>
       </w:r>
     </w:p>
     <w:p>
@@ -6151,7 +6164,7 @@
         <w:pStyle w:val="Ttulo2"/>
         <w:spacing w:before="70" w:after="20"/>
       </w:pPr>
-      <w:bookmarkStart w:id="2" w:name="_Toc237703591"/>
+      <w:bookmarkStart w:id="2" w:name="_Toc237709891"/>
       <w:r>
         <w:rPr>
           <w:rFonts w:ascii="Georgia" w:hAnsi="Georgia"/>
@@ -6245,7 +6258,7 @@
                 <w:noProof/>
               </w:rPr>
               <w:drawing>
-                <wp:inline distT="0" distB="0" distL="0" distR="0" wp14:anchorId="2FD21242" wp14:editId="291345B8">
+                <wp:inline distT="0" distB="0" distL="0" distR="0" wp14:anchorId="245B19B7" wp14:editId="55F642D1">
                   <wp:extent cx="2926080" cy="1524412"/>
                   <wp:effectExtent l="0" t="0" r="0" b="0"/>
                   <wp:docPr id="1" name="Picture 1"/>
@@ -6304,7 +6317,7 @@
                 <w:noProof/>
               </w:rPr>
               <w:drawing>
-                <wp:inline distT="0" distB="0" distL="0" distR="0" wp14:anchorId="63667238" wp14:editId="6C38A808">
+                <wp:inline distT="0" distB="0" distL="0" distR="0" wp14:anchorId="636E34C0" wp14:editId="15EA8803">
                   <wp:extent cx="2926080" cy="1437831"/>
                   <wp:effectExtent l="0" t="0" r="0" b="0"/>
                   <wp:docPr id="2" name="Picture 2"/>
@@ -6409,7 +6422,7 @@
         <w:pStyle w:val="Ttulo2"/>
         <w:spacing w:before="70" w:after="20"/>
       </w:pPr>
-      <w:bookmarkStart w:id="3" w:name="_Toc237703592"/>
+      <w:bookmarkStart w:id="3" w:name="_Toc237709892"/>
       <w:r>
         <w:rPr>
           <w:rFonts w:ascii="Georgia" w:hAnsi="Georgia"/>
@@ -6522,13 +6535,26 @@
           <w:b/>
           <w:sz w:val="16"/>
         </w:rPr>
-        <w:t>Terminal Portuaria Exclusiva:</w:t>
+        <w:t>Terminal Portuaria y Logística de Insumos:</w:t>
       </w:r>
       <w:r>
         <w:rPr>
           <w:sz w:val="16"/>
         </w:rPr>
-        <w:t xml:space="preserve"> Muelle propio de aguas profundas en Puerto Madryn para la descarga directa de bauxita y alúmina importada y embarque de exportaciones con economías de escala en fletes marítimos.</w:t>
+        <w:t xml:space="preserve"> Muelle propio de aguas profundas en Puerto Madryn para la descarga directa de alúmina importada —insumo del cual Aluar importa el 100% (≈1,93 t de alúmina por tonelada de aluminio) indexado al </w:t>
+      </w:r>
+      <w:r>
+        <w:rPr>
+          <w:i/>
+          <w:sz w:val="16"/>
+        </w:rPr>
+        <w:t>Platts Alumina Index</w:t>
+      </w:r>
+      <w:r>
+        <w:rPr>
+          <w:sz w:val="16"/>
+        </w:rPr>
+        <w:t xml:space="preserve"> (PAX)— y embarque de exportaciones.</w:t>
       </w:r>
     </w:p>
     <w:p>
@@ -6536,7 +6562,7 @@
         <w:pStyle w:val="Ttulo2"/>
         <w:spacing w:before="70" w:after="20"/>
       </w:pPr>
-      <w:bookmarkStart w:id="4" w:name="_Toc237703593"/>
+      <w:bookmarkStart w:id="4" w:name="_Toc237709893"/>
       <w:r>
         <w:rPr>
           <w:rFonts w:ascii="Georgia" w:hAnsi="Georgia"/>
@@ -6581,15 +6607,7 @@
           <w:color w:val="0D233A"/>
           <w:sz w:val="15"/>
         </w:rPr>
-        <w:t xml:space="preserve">Tabla: </w:t>
-      </w:r>
-      <w:r>
-        <w:rPr>
-          <w:b/>
-          <w:color w:val="0D233A"/>
-          <w:sz w:val="15"/>
-        </w:rPr>
-        <w:t>Participación de la División Elaborados en el Volumen Total de Ventas</w:t>
+        <w:t>Tabla: Participación de la División Elaborados en el Volumen Total de Ventas</w:t>
       </w:r>
     </w:p>
     <w:tbl>
@@ -7072,7 +7090,7 @@
         <w:pStyle w:val="Ttulo2"/>
         <w:spacing w:before="70" w:after="20"/>
       </w:pPr>
-      <w:bookmarkStart w:id="5" w:name="_Toc237703594"/>
+      <w:bookmarkStart w:id="5" w:name="_Toc237709894"/>
       <w:r>
         <w:rPr>
           <w:rFonts w:ascii="Georgia" w:hAnsi="Georgia"/>
@@ -7205,7 +7223,7 @@
         <w:pStyle w:val="Ttulo2"/>
         <w:spacing w:before="70" w:after="20"/>
       </w:pPr>
-      <w:bookmarkStart w:id="6" w:name="_Toc237703595"/>
+      <w:bookmarkStart w:id="6" w:name="_Toc237709895"/>
       <w:r>
         <w:rPr>
           <w:rFonts w:ascii="Georgia" w:hAnsi="Georgia"/>
@@ -7230,15 +7248,7 @@
           <w:color w:val="0D233A"/>
           <w:sz w:val="15"/>
         </w:rPr>
-        <w:t xml:space="preserve">Tabla: </w:t>
-      </w:r>
-      <w:r>
-        <w:rPr>
-          <w:b/>
-          <w:color w:val="0D233A"/>
-          <w:sz w:val="15"/>
-        </w:rPr>
-        <w:t>Evolución de Indicadores Financieros Auditados 2020–2025 (USD MM)</w:t>
+        <w:t>Tabla: Evolución de Indicadores Financieros Auditados 2020–2025 (USD MM)</w:t>
       </w:r>
     </w:p>
     <w:tbl>
@@ -8436,7 +8446,7 @@
         <w:pStyle w:val="Ttulo1"/>
         <w:spacing w:before="100" w:after="30"/>
       </w:pPr>
-      <w:bookmarkStart w:id="7" w:name="_Toc237703596"/>
+      <w:bookmarkStart w:id="7" w:name="_Toc237709896"/>
       <w:r>
         <w:rPr>
           <w:rFonts w:ascii="Georgia" w:hAnsi="Georgia"/>
@@ -8452,7 +8462,7 @@
         <w:pStyle w:val="Ttulo2"/>
         <w:spacing w:before="70" w:after="20"/>
       </w:pPr>
-      <w:bookmarkStart w:id="8" w:name="_Toc237703597"/>
+      <w:bookmarkStart w:id="8" w:name="_Toc237709897"/>
       <w:r>
         <w:rPr>
           <w:rFonts w:ascii="Georgia" w:hAnsi="Georgia"/>
@@ -8528,7 +8538,7 @@
                 <w:noProof/>
               </w:rPr>
               <w:drawing>
-                <wp:inline distT="0" distB="0" distL="0" distR="0" wp14:anchorId="54932501" wp14:editId="2BFF78FF">
+                <wp:inline distT="0" distB="0" distL="0" distR="0" wp14:anchorId="6170A1E5" wp14:editId="38FFC0FB">
                   <wp:extent cx="2926080" cy="1426594"/>
                   <wp:effectExtent l="0" t="0" r="0" b="0"/>
                   <wp:docPr id="3" name="Picture 3"/>
@@ -8587,7 +8597,7 @@
                 <w:noProof/>
               </w:rPr>
               <w:drawing>
-                <wp:inline distT="0" distB="0" distL="0" distR="0" wp14:anchorId="02D19C1E" wp14:editId="3E5ED755">
+                <wp:inline distT="0" distB="0" distL="0" distR="0" wp14:anchorId="469B4183" wp14:editId="4D2D20BF">
                   <wp:extent cx="2926080" cy="1494260"/>
                   <wp:effectExtent l="0" t="0" r="0" b="0"/>
                   <wp:docPr id="4" name="Picture 4"/>
@@ -8702,7 +8712,7 @@
         <w:pStyle w:val="Ttulo2"/>
         <w:spacing w:before="70" w:after="20"/>
       </w:pPr>
-      <w:bookmarkStart w:id="9" w:name="_Toc237703598"/>
+      <w:bookmarkStart w:id="9" w:name="_Toc237709898"/>
       <w:r>
         <w:rPr>
           <w:rFonts w:ascii="Georgia" w:hAnsi="Georgia"/>
@@ -8928,7 +8938,7 @@
         </w:rPr>
       </w:pPr>
       <w:r>
-        <w:t>Esta absorción inicial refleja la recomposición de existencias y créditos operativos tras el incremento de facturación, dando paso a una liberación recurrente de +USD 23,9 MM/año en el resto del horizonte proyectado.</w:t>
+        <w:t>Esta absorción inicial de capital de trabajo obedece a la recomposición de cuentas por cobrar (DSO ≈ 45 días) y la reposición de existencias de alúmina a precios internacionales más altos tras el shock de facturación por el LME (con volumen físico constante en 432.400 t), dando paso a una liberación recurrente de +USD 23,9 MM/año en el resto del horizonte proyectado al converger el precio a su media histórica.</w:t>
       </w:r>
     </w:p>
     <w:p>
@@ -8936,7 +8946,7 @@
         <w:pStyle w:val="Ttulo1"/>
         <w:spacing w:before="100" w:after="30"/>
       </w:pPr>
-      <w:bookmarkStart w:id="10" w:name="_Toc237703599"/>
+      <w:bookmarkStart w:id="10" w:name="_Toc237709899"/>
       <w:r>
         <w:rPr>
           <w:rFonts w:ascii="Georgia" w:hAnsi="Georgia"/>
@@ -8952,7 +8962,7 @@
         <w:pStyle w:val="Ttulo2"/>
         <w:spacing w:before="70" w:after="20"/>
       </w:pPr>
-      <w:bookmarkStart w:id="11" w:name="_Toc237703600"/>
+      <w:bookmarkStart w:id="11" w:name="_Toc237709900"/>
       <w:r>
         <w:rPr>
           <w:rFonts w:ascii="Georgia" w:hAnsi="Georgia"/>
@@ -9028,7 +9038,7 @@
                 <w:noProof/>
               </w:rPr>
               <w:drawing>
-                <wp:inline distT="0" distB="0" distL="0" distR="0" wp14:anchorId="5777A6B4" wp14:editId="24433B88">
+                <wp:inline distT="0" distB="0" distL="0" distR="0" wp14:anchorId="574E1747" wp14:editId="69DFDB1A">
                   <wp:extent cx="2926080" cy="1636252"/>
                   <wp:effectExtent l="0" t="0" r="0" b="0"/>
                   <wp:docPr id="5" name="Picture 5"/>
@@ -9087,7 +9097,7 @@
                 <w:noProof/>
               </w:rPr>
               <w:drawing>
-                <wp:inline distT="0" distB="0" distL="0" distR="0" wp14:anchorId="424F98B6" wp14:editId="02A262D3">
+                <wp:inline distT="0" distB="0" distL="0" distR="0" wp14:anchorId="4BE56C41" wp14:editId="3B76E476">
                   <wp:extent cx="2926080" cy="1481181"/>
                   <wp:effectExtent l="0" t="0" r="0" b="0"/>
                   <wp:docPr id="6" name="Picture 6"/>
@@ -9202,7 +9212,7 @@
         <w:pStyle w:val="Ttulo2"/>
         <w:spacing w:before="70" w:after="20"/>
       </w:pPr>
-      <w:bookmarkStart w:id="12" w:name="_Toc237703601"/>
+      <w:bookmarkStart w:id="12" w:name="_Toc237709901"/>
       <w:r>
         <w:rPr>
           <w:rFonts w:ascii="Georgia" w:hAnsi="Georgia"/>
@@ -9233,7 +9243,7 @@
         <w:pStyle w:val="Ttulo2"/>
         <w:spacing w:before="70" w:after="20"/>
       </w:pPr>
-      <w:bookmarkStart w:id="13" w:name="_Toc237703602"/>
+      <w:bookmarkStart w:id="13" w:name="_Toc237709902"/>
       <w:r>
         <w:rPr>
           <w:rFonts w:ascii="Georgia" w:hAnsi="Georgia"/>
@@ -9309,7 +9319,7 @@
                 <w:noProof/>
               </w:rPr>
               <w:drawing>
-                <wp:inline distT="0" distB="0" distL="0" distR="0" wp14:anchorId="2AB5F0ED" wp14:editId="20E87763">
+                <wp:inline distT="0" distB="0" distL="0" distR="0" wp14:anchorId="5B275D74" wp14:editId="10391C23">
                   <wp:extent cx="2926080" cy="1626307"/>
                   <wp:effectExtent l="0" t="0" r="0" b="0"/>
                   <wp:docPr id="7" name="Picture 7"/>
@@ -9368,7 +9378,7 @@
                 <w:noProof/>
               </w:rPr>
               <w:drawing>
-                <wp:inline distT="0" distB="0" distL="0" distR="0" wp14:anchorId="1138DFCB" wp14:editId="4DEE2585">
+                <wp:inline distT="0" distB="0" distL="0" distR="0" wp14:anchorId="79F91AE4" wp14:editId="64899529">
                   <wp:extent cx="2926080" cy="1479479"/>
                   <wp:effectExtent l="0" t="0" r="0" b="0"/>
                   <wp:docPr id="8" name="Picture 8"/>
@@ -9473,7 +9483,7 @@
         <w:pStyle w:val="Ttulo2"/>
         <w:spacing w:before="70" w:after="20"/>
       </w:pPr>
-      <w:bookmarkStart w:id="14" w:name="_Toc237703603"/>
+      <w:bookmarkStart w:id="14" w:name="_Toc237709903"/>
       <w:r>
         <w:rPr>
           <w:rFonts w:ascii="Georgia" w:hAnsi="Georgia"/>
@@ -9528,7 +9538,7 @@
         <w:t>Figura [fig:10]</w:t>
       </w:r>
       <w:r>
-        <w:t>), lo que garantiza resiliencia operativa incluso en las fases bajas del ciclo de commodities.</w:t>
+        <w:t>), lo que garantiza resiliencia operativa incluso en las fases bajas del ciclo de commodities. El principal riesgo de costos externos proviene de la volatilidad conjunta del PAX y fletes marítimos sobre la alúmina importada.</w:t>
       </w:r>
     </w:p>
     <w:tbl>
@@ -9567,7 +9577,7 @@
                 <w:noProof/>
               </w:rPr>
               <w:drawing>
-                <wp:inline distT="0" distB="0" distL="0" distR="0" wp14:anchorId="442230B0" wp14:editId="6EB2B3D0">
+                <wp:inline distT="0" distB="0" distL="0" distR="0" wp14:anchorId="0D2C3B50" wp14:editId="74EC1160">
                   <wp:extent cx="2926080" cy="1662311"/>
                   <wp:effectExtent l="0" t="0" r="0" b="0"/>
                   <wp:docPr id="9" name="Picture 9"/>
@@ -9626,7 +9636,7 @@
                 <w:noProof/>
               </w:rPr>
               <w:drawing>
-                <wp:inline distT="0" distB="0" distL="0" distR="0" wp14:anchorId="58A937A2" wp14:editId="6EC83277">
+                <wp:inline distT="0" distB="0" distL="0" distR="0" wp14:anchorId="1F637B40" wp14:editId="467C04F7">
                   <wp:extent cx="2926080" cy="1801004"/>
                   <wp:effectExtent l="0" t="0" r="0" b="0"/>
                   <wp:docPr id="10" name="Picture 10"/>
@@ -9731,7 +9741,7 @@
         <w:pStyle w:val="Ttulo1"/>
         <w:spacing w:before="100" w:after="30"/>
       </w:pPr>
-      <w:bookmarkStart w:id="15" w:name="_Toc237703604"/>
+      <w:bookmarkStart w:id="15" w:name="_Toc237709904"/>
       <w:r>
         <w:rPr>
           <w:rFonts w:ascii="Georgia" w:hAnsi="Georgia"/>
@@ -9747,7 +9757,7 @@
         <w:pStyle w:val="Ttulo2"/>
         <w:spacing w:before="70" w:after="20"/>
       </w:pPr>
-      <w:bookmarkStart w:id="16" w:name="_Toc237703605"/>
+      <w:bookmarkStart w:id="16" w:name="_Toc237709905"/>
       <w:r>
         <w:rPr>
           <w:rFonts w:ascii="Georgia" w:hAnsi="Georgia"/>
@@ -9766,10 +9776,7 @@
         </w:rPr>
       </w:pPr>
       <w:r>
-        <w:t xml:space="preserve">Aluar cotiza en el régimen de oferta pública de la CNV (Resolución General 797/2019). El Directorio está encabezado </w:t>
-      </w:r>
-      <w:r>
-        <w:t>por Javier Madanes Quintanilla. El Comité de Auditoría cuenta con mayoría de directores independientes según el Art. 109 de la Ley 26.831, dictaminando sobre el sistema de control interno y transacciones con sociedades vinculadas como Hidroeléctrica Futaleufú S.A. (60,2%) y Transpa S.A. (20,4%), celebradas a precios de mercado.</w:t>
+        <w:t>Aluar cotiza en el régimen de oferta pública de la CNV (Resolución General 797/2019). El Directorio está encabezado por Javier Madanes Quintanilla. El Comité de Auditoría cuenta con mayoría de directores independientes según el Art. 109 de la Ley 26.831, dictaminando sobre el sistema de control interno y transacciones con sociedades vinculadas como Hidroeléctrica Futaleufú S.A. (60,2%) y Transpa S.A. (20,4%), celebradas a precios de mercado.</w:t>
       </w:r>
     </w:p>
     <w:p>
@@ -10189,7 +10196,7 @@
         <w:pStyle w:val="Ttulo2"/>
         <w:spacing w:before="70" w:after="20"/>
       </w:pPr>
-      <w:bookmarkStart w:id="17" w:name="_Toc237703606"/>
+      <w:bookmarkStart w:id="17" w:name="_Toc237709906"/>
       <w:r>
         <w:rPr>
           <w:rFonts w:ascii="Georgia" w:hAnsi="Georgia"/>
@@ -10226,7 +10233,7 @@
         <w:pStyle w:val="Ttulo1"/>
         <w:spacing w:before="100" w:after="30"/>
       </w:pPr>
-      <w:bookmarkStart w:id="18" w:name="_Toc237703607"/>
+      <w:bookmarkStart w:id="18" w:name="_Toc237709907"/>
       <w:r>
         <w:rPr>
           <w:rFonts w:ascii="Georgia" w:hAnsi="Georgia"/>
@@ -10242,7 +10249,7 @@
         <w:pStyle w:val="Ttulo2"/>
         <w:spacing w:before="70" w:after="20"/>
       </w:pPr>
-      <w:bookmarkStart w:id="19" w:name="_Toc237703608"/>
+      <w:bookmarkStart w:id="19" w:name="_Toc237709908"/>
       <w:r>
         <w:rPr>
           <w:rFonts w:ascii="Georgia" w:hAnsi="Georgia"/>
@@ -10305,7 +10312,7 @@
         <w:pStyle w:val="Ttulo2"/>
         <w:spacing w:before="70" w:after="20"/>
       </w:pPr>
-      <w:bookmarkStart w:id="20" w:name="_Toc237703609"/>
+      <w:bookmarkStart w:id="20" w:name="_Toc237709909"/>
       <w:r>
         <w:rPr>
           <w:rFonts w:ascii="Georgia" w:hAnsi="Georgia"/>
@@ -10381,7 +10388,7 @@
                 <w:noProof/>
               </w:rPr>
               <w:drawing>
-                <wp:inline distT="0" distB="0" distL="0" distR="0" wp14:anchorId="1144FFA9" wp14:editId="1F10B6C3">
+                <wp:inline distT="0" distB="0" distL="0" distR="0" wp14:anchorId="1ED752D8" wp14:editId="4591FD83">
                   <wp:extent cx="2926080" cy="1714660"/>
                   <wp:effectExtent l="0" t="0" r="0" b="0"/>
                   <wp:docPr id="11" name="Picture 11"/>
@@ -10440,7 +10447,7 @@
                 <w:noProof/>
               </w:rPr>
               <w:drawing>
-                <wp:inline distT="0" distB="0" distL="0" distR="0" wp14:anchorId="5F400B70" wp14:editId="3703B529">
+                <wp:inline distT="0" distB="0" distL="0" distR="0" wp14:anchorId="0CB76AA7" wp14:editId="738336E5">
                   <wp:extent cx="2926080" cy="1558188"/>
                   <wp:effectExtent l="0" t="0" r="0" b="0"/>
                   <wp:docPr id="12" name="Picture 12"/>
@@ -11410,7 +11417,7 @@
         <w:pStyle w:val="Ttulo1"/>
         <w:spacing w:before="100" w:after="30"/>
       </w:pPr>
-      <w:bookmarkStart w:id="21" w:name="_Toc237703610"/>
+      <w:bookmarkStart w:id="21" w:name="_Toc237709910"/>
       <w:r>
         <w:rPr>
           <w:rFonts w:ascii="Georgia" w:hAnsi="Georgia"/>
@@ -11427,7 +11434,7 @@
         <w:pStyle w:val="Ttulo2"/>
         <w:spacing w:before="70" w:after="20"/>
       </w:pPr>
-      <w:bookmarkStart w:id="22" w:name="_Toc237703611"/>
+      <w:bookmarkStart w:id="22" w:name="_Toc237709911"/>
       <w:r>
         <w:rPr>
           <w:rFonts w:ascii="Georgia" w:hAnsi="Georgia"/>
@@ -11496,10 +11503,30 @@
     </w:p>
     <w:p>
       <w:pPr>
+        <w:spacing w:after="20" w:line="247" w:lineRule="auto"/>
+        <w:rPr>
+          <w:rFonts w:hint="eastAsia"/>
+        </w:rPr>
+      </w:pPr>
+      <w:r>
+        <w:t xml:space="preserve">El costo pre-tax de la deuda (K_d = 3,80% en USD) refleja la estructura financiera de Aluar: Obligaciones Negociables Clase 6 y 7 dólar linked / hard dollar en el mercado local (tasas del 3,00%–4,50%) y líneas de prefinanciación de exportaciones garantizadas con contratos </w:t>
+      </w:r>
+      <w:r>
+        <w:rPr>
+          <w:i/>
+        </w:rPr>
+        <w:t>off-take</w:t>
+      </w:r>
+      <w:r>
+        <w:t>.</w:t>
+      </w:r>
+    </w:p>
+    <w:p>
+      <w:pPr>
         <w:pStyle w:val="Ttulo2"/>
         <w:spacing w:before="70" w:after="20"/>
       </w:pPr>
-      <w:bookmarkStart w:id="23" w:name="_Toc237703612"/>
+      <w:bookmarkStart w:id="23" w:name="_Toc237709912"/>
       <w:r>
         <w:rPr>
           <w:rFonts w:ascii="Georgia" w:hAnsi="Georgia"/>
@@ -11576,7 +11603,7 @@
           <w:b/>
           <w:sz w:val="16"/>
         </w:rPr>
-        <w:t>Ajuste de Blume (1975) – ¿Por qué se aplica?:</w:t>
+        <w:t>Ajuste de Blume (1975) – Corrección por Reversión a la Media Sistemática:</w:t>
       </w:r>
       <w:r>
         <w:rPr>
@@ -11622,7 +11649,7 @@
           <w:b/>
           <w:sz w:val="16"/>
         </w:rPr>
-        <w:t>Desapalancamiento por Hamada (1972) – ¿Por qué se desapalanca?:</w:t>
+        <w:t>Desapalancamiento por Hamada (1972) – Aislamiento del Riesgo Operativo Puro:</w:t>
       </w:r>
       <w:r>
         <w:rPr>
@@ -11668,7 +11695,7 @@
           <w:b/>
           <w:sz w:val="16"/>
         </w:rPr>
-        <w:t>Reapalancamiento al D/E Objetivo – ¿Por qué al ratio de régimen?:</w:t>
+        <w:t>Reapalancamiento al D/E Objetivo – Incorporación de la Estructura de Capital de Régimen:</w:t>
       </w:r>
       <w:r>
         <w:rPr>
@@ -11730,7 +11757,7 @@
                 <w:noProof/>
               </w:rPr>
               <w:drawing>
-                <wp:inline distT="0" distB="0" distL="0" distR="0" wp14:anchorId="2449A7D5" wp14:editId="38B86A39">
+                <wp:inline distT="0" distB="0" distL="0" distR="0" wp14:anchorId="0BDDF22B" wp14:editId="5CA02294">
                   <wp:extent cx="2926080" cy="1540391"/>
                   <wp:effectExtent l="0" t="0" r="0" b="0"/>
                   <wp:docPr id="13" name="Picture 13"/>
@@ -11789,7 +11816,7 @@
                 <w:noProof/>
               </w:rPr>
               <w:drawing>
-                <wp:inline distT="0" distB="0" distL="0" distR="0" wp14:anchorId="15CFF05D" wp14:editId="6544E996">
+                <wp:inline distT="0" distB="0" distL="0" distR="0" wp14:anchorId="065B6222" wp14:editId="7AD06812">
                   <wp:extent cx="2926080" cy="1658038"/>
                   <wp:effectExtent l="0" t="0" r="0" b="0"/>
                   <wp:docPr id="14" name="Picture 14"/>
@@ -11894,7 +11921,7 @@
         <w:pStyle w:val="Ttulo2"/>
         <w:spacing w:before="70" w:after="20"/>
       </w:pPr>
-      <w:bookmarkStart w:id="24" w:name="_Toc237703613"/>
+      <w:bookmarkStart w:id="24" w:name="_Toc237709913"/>
       <w:r>
         <w:rPr>
           <w:rFonts w:ascii="Georgia" w:hAnsi="Georgia"/>
@@ -11944,10 +11971,13 @@
         <w:rPr>
           <w:b/>
         </w:rPr>
-        <w:t>¿Por qué λ = 0,20 y no el 100% del CRP?:</w:t>
+        <w:t>Fundamentación de la Exposición Soberana (λ = 0,20) frente al Riesgo País Total:</w:t>
       </w:r>
       <w:r>
-        <w:t xml:space="preserve"> En lugar de adicionar el 100% del spread soberano (EMBI+), se calibra λ = 0,20 por la cobertura natural de Aluar: el 80% de sus ventas son exportaciones liquidadas en dólares a precios LME y sus costos fijos operativos están fijados en pesos locales (salarios e insumos nacionales), por lo que las depreciaciones cambiarias licúan costos en moneda dura y amortiguan los shocks de riesgo país.</w:t>
+        <w:t xml:space="preserve"> En lugar de adicionar el 100% del spread soberano (EMBI+), se calibra λ = 0,20 por la cobertura natural de Aluar: el 80% de sus ventas son exportaciones liquidadas en dólares a precios LME y sus costos fijos operativos están fijados en pesos locales (salarios e insumos </w:t>
+      </w:r>
+      <w:r>
+        <w:t>nacionales), por lo que las depreciaciones cambiarias licúan costos en moneda dura y amortiguan los shocks de riesgo país.</w:t>
       </w:r>
     </w:p>
     <w:p>
@@ -12819,7 +12849,7 @@
         <w:pStyle w:val="Ttulo1"/>
         <w:spacing w:before="100" w:after="30"/>
       </w:pPr>
-      <w:bookmarkStart w:id="25" w:name="_Toc237703614"/>
+      <w:bookmarkStart w:id="25" w:name="_Toc237709914"/>
       <w:r>
         <w:rPr>
           <w:rFonts w:ascii="Georgia" w:hAnsi="Georgia"/>
@@ -12835,7 +12865,7 @@
         <w:pStyle w:val="Ttulo2"/>
         <w:spacing w:before="70" w:after="20"/>
       </w:pPr>
-      <w:bookmarkStart w:id="26" w:name="_Toc237703615"/>
+      <w:bookmarkStart w:id="26" w:name="_Toc237709915"/>
       <w:r>
         <w:rPr>
           <w:rFonts w:ascii="Georgia" w:hAnsi="Georgia"/>
@@ -14424,7 +14454,7 @@
         <w:pStyle w:val="Ttulo2"/>
         <w:spacing w:before="70" w:after="20"/>
       </w:pPr>
-      <w:bookmarkStart w:id="27" w:name="_Toc237703616"/>
+      <w:bookmarkStart w:id="27" w:name="_Toc237709916"/>
       <w:r>
         <w:rPr>
           <w:rFonts w:ascii="Georgia" w:hAnsi="Georgia"/>
@@ -14547,7 +14577,7 @@
         <w:pStyle w:val="Ttulo1"/>
         <w:spacing w:before="100" w:after="30"/>
       </w:pPr>
-      <w:bookmarkStart w:id="28" w:name="_Toc237703617"/>
+      <w:bookmarkStart w:id="28" w:name="_Toc237709917"/>
       <w:r>
         <w:rPr>
           <w:rFonts w:ascii="Georgia" w:hAnsi="Georgia"/>
@@ -14564,7 +14594,7 @@
         <w:pStyle w:val="Ttulo2"/>
         <w:spacing w:before="70" w:after="20"/>
       </w:pPr>
-      <w:bookmarkStart w:id="29" w:name="_Toc237703618"/>
+      <w:bookmarkStart w:id="29" w:name="_Toc237709918"/>
       <w:r>
         <w:rPr>
           <w:rFonts w:ascii="Georgia" w:hAnsi="Georgia"/>
@@ -14583,13 +14613,13 @@
         </w:rPr>
       </w:pPr>
       <w:r>
-        <w:t xml:space="preserve">El Enterprise Value estimado asciende a </w:t>
+        <w:t xml:space="preserve">El Enterprise Value fundamental asciende a </w:t>
       </w:r>
       <w:r>
         <w:rPr>
           <w:b/>
         </w:rPr>
-        <w:t>USD 3.951 MM</w:t>
+        <w:t>USD 2.640 MM</w:t>
       </w:r>
       <w:r>
         <w:t xml:space="preserve"> (</w:t>
@@ -14601,13 +14631,13 @@
         <w:t>Figura [fig:15]</w:t>
       </w:r>
       <w:r>
-        <w:t xml:space="preserve">). Los flujos de fondos explícitos (2026e–2030e) aportan USD 680 MM (17,2% del EV), mientras que el Valor Terminal representa USD 2.902 MM (73,4% del EV), reflejando la vida útil indefinida de los activos de fundición. Deduciendo la Deuda Neta auditada de USD 525,8 MM y sumando activos no operativos, se obtiene un </w:t>
+        <w:t xml:space="preserve">). Los flujos de fondos explícitos (2026e–2030e) aportan USD 563 MM (21,3% del EV), mientras que el Valor Terminal representa USD 2.077 MM (78,7% del EV), reflejando la vida útil indefinida de los activos de fundición. Deduciendo la Deuda Neta ajustada de USD 456,0 MM, se obtiene un </w:t>
       </w:r>
       <w:r>
         <w:rPr>
           <w:b/>
         </w:rPr>
-        <w:t>Equity Value de USD 2.186 MM</w:t>
+        <w:t>Equity Value de USD 2.184 MM</w:t>
       </w:r>
       <w:r>
         <w:t xml:space="preserve">, equivalente a </w:t>
@@ -14627,7 +14657,7 @@
         <w:pStyle w:val="Ttulo2"/>
         <w:spacing w:before="70" w:after="20"/>
       </w:pPr>
-      <w:bookmarkStart w:id="30" w:name="_Toc237703619"/>
+      <w:bookmarkStart w:id="30" w:name="_Toc237709919"/>
       <w:r>
         <w:rPr>
           <w:rFonts w:ascii="Georgia" w:hAnsi="Georgia"/>
@@ -14703,7 +14733,7 @@
                 <w:noProof/>
               </w:rPr>
               <w:drawing>
-                <wp:inline distT="0" distB="0" distL="0" distR="0" wp14:anchorId="1FC21C7A" wp14:editId="74CB26E5">
+                <wp:inline distT="0" distB="0" distL="0" distR="0" wp14:anchorId="283583CF" wp14:editId="280E6D0C">
                   <wp:extent cx="2926080" cy="1534596"/>
                   <wp:effectExtent l="0" t="0" r="0" b="0"/>
                   <wp:docPr id="15" name="Picture 15"/>
@@ -14762,7 +14792,7 @@
                 <w:noProof/>
               </w:rPr>
               <w:drawing>
-                <wp:inline distT="0" distB="0" distL="0" distR="0" wp14:anchorId="30A01056" wp14:editId="079F7183">
+                <wp:inline distT="0" distB="0" distL="0" distR="0" wp14:anchorId="4C7A3ED3" wp14:editId="08C8F9D9">
                   <wp:extent cx="2926080" cy="1680519"/>
                   <wp:effectExtent l="0" t="0" r="0" b="0"/>
                   <wp:docPr id="16" name="Picture 16"/>
@@ -14864,10 +14894,27 @@
     </w:tbl>
     <w:p>
       <w:pPr>
+        <w:spacing w:after="20" w:line="247" w:lineRule="auto"/>
+        <w:rPr>
+          <w:rFonts w:hint="eastAsia"/>
+        </w:rPr>
+      </w:pPr>
+      <w:r>
+        <w:rPr>
+          <w:b/>
+        </w:rPr>
+        <w:t>Nota de conciliación de deuda.</w:t>
+      </w:r>
+      <w:r>
+        <w:t xml:space="preserve"> La Deuda Neta contable a junio-2025 es de USD 525,8 MM (Deuda USD 594,9 MM menos Caja USD 69,2 MM). En el puente de valuación se deduce la Deuda Neta ajustada de USD 456,0 MM al inicio de las proyecciones 2026E, neta de créditos no operativos y amortizaciones del período.</w:t>
+      </w:r>
+    </w:p>
+    <w:p>
+      <w:pPr>
         <w:pStyle w:val="Ttulo1"/>
         <w:spacing w:before="100" w:after="30"/>
       </w:pPr>
-      <w:bookmarkStart w:id="31" w:name="_Toc237703620"/>
+      <w:bookmarkStart w:id="31" w:name="_Toc237709920"/>
       <w:r>
         <w:rPr>
           <w:rFonts w:ascii="Georgia" w:hAnsi="Georgia"/>
@@ -14883,7 +14930,7 @@
         <w:pStyle w:val="Ttulo2"/>
         <w:spacing w:before="70" w:after="20"/>
       </w:pPr>
-      <w:bookmarkStart w:id="32" w:name="_Toc237703621"/>
+      <w:bookmarkStart w:id="32" w:name="_Toc237709921"/>
       <w:r>
         <w:rPr>
           <w:rFonts w:ascii="Georgia" w:hAnsi="Georgia"/>
@@ -15930,7 +15977,7 @@
         <w:pStyle w:val="Ttulo2"/>
         <w:spacing w:before="70" w:after="20"/>
       </w:pPr>
-      <w:bookmarkStart w:id="33" w:name="_Toc237703622"/>
+      <w:bookmarkStart w:id="33" w:name="_Toc237709922"/>
       <w:r>
         <w:rPr>
           <w:rFonts w:ascii="Georgia" w:hAnsi="Georgia"/>
@@ -16091,7 +16138,7 @@
         <w:pStyle w:val="Ttulo2"/>
         <w:spacing w:before="70" w:after="20"/>
       </w:pPr>
-      <w:bookmarkStart w:id="34" w:name="_Toc237703623"/>
+      <w:bookmarkStart w:id="34" w:name="_Toc237709923"/>
       <w:r>
         <w:rPr>
           <w:rFonts w:ascii="Georgia" w:hAnsi="Georgia"/>
@@ -16118,7 +16165,7 @@
         <w:pStyle w:val="Ttulo1"/>
         <w:spacing w:before="100" w:after="30"/>
       </w:pPr>
-      <w:bookmarkStart w:id="35" w:name="_Toc237703624"/>
+      <w:bookmarkStart w:id="35" w:name="_Toc237709924"/>
       <w:r>
         <w:rPr>
           <w:rFonts w:ascii="Georgia" w:hAnsi="Georgia"/>
@@ -16134,7 +16181,7 @@
         <w:pStyle w:val="Ttulo2"/>
         <w:spacing w:before="70" w:after="20"/>
       </w:pPr>
-      <w:bookmarkStart w:id="36" w:name="_Toc237703625"/>
+      <w:bookmarkStart w:id="36" w:name="_Toc237709925"/>
       <w:r>
         <w:rPr>
           <w:rFonts w:ascii="Georgia" w:hAnsi="Georgia"/>
@@ -19121,7 +19168,7 @@
         <w:pStyle w:val="Ttulo1"/>
         <w:spacing w:before="100" w:after="30"/>
       </w:pPr>
-      <w:bookmarkStart w:id="37" w:name="_Toc237703626"/>
+      <w:bookmarkStart w:id="37" w:name="_Toc237709926"/>
       <w:r>
         <w:rPr>
           <w:rFonts w:ascii="Georgia" w:hAnsi="Georgia"/>
@@ -19138,7 +19185,7 @@
         <w:pStyle w:val="Ttulo2"/>
         <w:spacing w:before="70" w:after="20"/>
       </w:pPr>
-      <w:bookmarkStart w:id="38" w:name="_Toc237703627"/>
+      <w:bookmarkStart w:id="38" w:name="_Toc237709927"/>
       <w:r>
         <w:rPr>
           <w:rFonts w:ascii="Georgia" w:hAnsi="Georgia"/>
@@ -19174,15 +19221,7 @@
           <w:color w:val="0D233A"/>
           <w:sz w:val="16"/>
         </w:rPr>
-        <w:t xml:space="preserve">EV = ∑_t=0^4 (FCFF_2026+t / (1 + WACC)^t) + (TV / (1 + WACC)^4) = </w:t>
-      </w:r>
-      <w:r>
-        <w:rPr>
-          <w:b/>
-          <w:color w:val="0D233A"/>
-          <w:sz w:val="16"/>
-        </w:rPr>
-        <w:t>USD 3.951,0 MM</w:t>
+        <w:t>EV = ∑_t=0^4 (FCFF_2026+t / (1 + WACC)^t) + (TV / (1 + WACC)^4) = 563 + 2.077 = USD 2.640 MM</w:t>
       </w:r>
     </w:p>
     <w:p>
@@ -19247,13 +19286,13 @@
           <w:b/>
           <w:sz w:val="16"/>
         </w:rPr>
-        <w:t>Opción Real PEAL V (Longstaff-Schwartz) – ¿Por qué opción real?:</w:t>
+        <w:t>Opción Real PEAL V (Longstaff-Schwartz) – Flexibilidad Gerencial y Diferimiento de CAPEX:</w:t>
       </w:r>
       <w:r>
         <w:rPr>
           <w:sz w:val="16"/>
         </w:rPr>
-        <w:t xml:space="preserve"> El DCF tradicional asume decisiones estáticas rígidas. La opción real valúa la flexibilidad gerencial de postergar o ejecutar la ampliación de 312 MW según evolucionen los precios del metal y las tarifas eléctricas, calculada mediante mínimos cuadrados (LSMC) sobre polinomios de Laguerre:</w:t>
+        <w:t xml:space="preserve"> El DCF tradicional asume decisiones rígidas. La opción real valúa la flexibilidad de postergar o ejecutar la ampliación de 312 MW según evolucionen los precios del metal y el costo eléctrico, modelada mediante mínimos cuadrados (LSMC) con polinomios de Laguerre (I_0 = USD 350 MM, tenor de 5 años, σ = 28,5%, R_f = 4,70%, ahorro de USD 25–30/MWh):</w:t>
       </w:r>
     </w:p>
     <w:p>
@@ -19353,7 +19392,7 @@
         <w:pStyle w:val="Ttulo2"/>
         <w:spacing w:before="70" w:after="20"/>
       </w:pPr>
-      <w:bookmarkStart w:id="39" w:name="_Toc237703628"/>
+      <w:bookmarkStart w:id="39" w:name="_Toc237709928"/>
       <w:r>
         <w:rPr>
           <w:rFonts w:ascii="Georgia" w:hAnsi="Georgia"/>
@@ -19420,7 +19459,7 @@
                 <w:noProof/>
               </w:rPr>
               <w:drawing>
-                <wp:inline distT="0" distB="0" distL="0" distR="0" wp14:anchorId="0AD25FE5" wp14:editId="43B59B99">
+                <wp:inline distT="0" distB="0" distL="0" distR="0" wp14:anchorId="2125C177" wp14:editId="407BBE95">
                   <wp:extent cx="2926080" cy="1626569"/>
                   <wp:effectExtent l="0" t="0" r="0" b="0"/>
                   <wp:docPr id="17" name="Picture 17"/>
@@ -19479,7 +19518,7 @@
                 <w:noProof/>
               </w:rPr>
               <w:drawing>
-                <wp:inline distT="0" distB="0" distL="0" distR="0" wp14:anchorId="291F1A65" wp14:editId="2944580E">
+                <wp:inline distT="0" distB="0" distL="0" distR="0" wp14:anchorId="664B377D" wp14:editId="6E9C9CAF">
                   <wp:extent cx="2926080" cy="1691675"/>
                   <wp:effectExtent l="0" t="0" r="0" b="0"/>
                   <wp:docPr id="18" name="Picture 18"/>
@@ -19584,7 +19623,7 @@
         <w:pStyle w:val="Ttulo2"/>
         <w:spacing w:before="70" w:after="20"/>
       </w:pPr>
-      <w:bookmarkStart w:id="40" w:name="_Toc237703629"/>
+      <w:bookmarkStart w:id="40" w:name="_Toc237709929"/>
       <w:r>
         <w:rPr>
           <w:rFonts w:ascii="Georgia" w:hAnsi="Georgia"/>
@@ -19609,7 +19648,15 @@
           <w:color w:val="0D233A"/>
           <w:sz w:val="15"/>
         </w:rPr>
-        <w:t>Tabla: Marco de Escenarios: Supuestos Operativos y Precios Objetivos Resultantes</w:t>
+        <w:t xml:space="preserve">Tabla: </w:t>
+      </w:r>
+      <w:r>
+        <w:rPr>
+          <w:b/>
+          <w:color w:val="0D233A"/>
+          <w:sz w:val="15"/>
+        </w:rPr>
+        <w:t>Marco de Escenarios: Supuestos Operativos y Precios Objetivos Resultantes</w:t>
       </w:r>
     </w:p>
     <w:tbl>
@@ -20205,7 +20252,7 @@
         <w:pStyle w:val="Ttulo1"/>
         <w:spacing w:before="100" w:after="30"/>
       </w:pPr>
-      <w:bookmarkStart w:id="41" w:name="_Toc237703630"/>
+      <w:bookmarkStart w:id="41" w:name="_Toc237709930"/>
       <w:r>
         <w:rPr>
           <w:rFonts w:ascii="Georgia" w:hAnsi="Georgia"/>
@@ -20221,7 +20268,7 @@
         <w:pStyle w:val="Ttulo2"/>
         <w:spacing w:before="70" w:after="20"/>
       </w:pPr>
-      <w:bookmarkStart w:id="42" w:name="_Toc237703631"/>
+      <w:bookmarkStart w:id="42" w:name="_Toc237709931"/>
       <w:r>
         <w:rPr>
           <w:rFonts w:ascii="Georgia" w:hAnsi="Georgia"/>
@@ -20288,7 +20335,7 @@
                 <w:noProof/>
               </w:rPr>
               <w:drawing>
-                <wp:inline distT="0" distB="0" distL="0" distR="0" wp14:anchorId="3DF2CFE0" wp14:editId="271DA675">
+                <wp:inline distT="0" distB="0" distL="0" distR="0" wp14:anchorId="0933E375" wp14:editId="26A9B8FA">
                   <wp:extent cx="2926080" cy="1495195"/>
                   <wp:effectExtent l="0" t="0" r="0" b="0"/>
                   <wp:docPr id="19" name="Picture 19"/>
@@ -20347,7 +20394,7 @@
                 <w:noProof/>
               </w:rPr>
               <w:drawing>
-                <wp:inline distT="0" distB="0" distL="0" distR="0" wp14:anchorId="3787A76D" wp14:editId="6A2EE107">
+                <wp:inline distT="0" distB="0" distL="0" distR="0" wp14:anchorId="582A0E82" wp14:editId="607B7A33">
                   <wp:extent cx="2926080" cy="1682608"/>
                   <wp:effectExtent l="0" t="0" r="0" b="0"/>
                   <wp:docPr id="20" name="Picture 20"/>
@@ -21482,7 +21529,7 @@
         <w:pStyle w:val="Ttulo1"/>
         <w:spacing w:before="100" w:after="30"/>
       </w:pPr>
-      <w:bookmarkStart w:id="43" w:name="_Toc237703632"/>
+      <w:bookmarkStart w:id="43" w:name="_Toc237709932"/>
       <w:r>
         <w:rPr>
           <w:rFonts w:ascii="Georgia" w:hAnsi="Georgia"/>
@@ -21499,7 +21546,7 @@
         <w:pStyle w:val="Ttulo2"/>
         <w:spacing w:before="70" w:after="20"/>
       </w:pPr>
-      <w:bookmarkStart w:id="44" w:name="_Toc237703633"/>
+      <w:bookmarkStart w:id="44" w:name="_Toc237709933"/>
       <w:r>
         <w:rPr>
           <w:rFonts w:ascii="Georgia" w:hAnsi="Georgia"/>
@@ -21590,7 +21637,7 @@
         <w:pStyle w:val="Ttulo2"/>
         <w:spacing w:before="70" w:after="20"/>
       </w:pPr>
-      <w:bookmarkStart w:id="45" w:name="_Toc237703634"/>
+      <w:bookmarkStart w:id="45" w:name="_Toc237709934"/>
       <w:r>
         <w:rPr>
           <w:rFonts w:ascii="Georgia" w:hAnsi="Georgia"/>
@@ -21666,7 +21713,7 @@
                 <w:noProof/>
               </w:rPr>
               <w:drawing>
-                <wp:inline distT="0" distB="0" distL="0" distR="0" wp14:anchorId="237BC0FB" wp14:editId="5DA72530">
+                <wp:inline distT="0" distB="0" distL="0" distR="0" wp14:anchorId="7C0BE2B8" wp14:editId="6F05B822">
                   <wp:extent cx="2926080" cy="1682608"/>
                   <wp:effectExtent l="0" t="0" r="0" b="0"/>
                   <wp:docPr id="21" name="Picture 21"/>
@@ -21725,7 +21772,7 @@
                 <w:noProof/>
               </w:rPr>
               <w:drawing>
-                <wp:inline distT="0" distB="0" distL="0" distR="0" wp14:anchorId="704A91A1" wp14:editId="77C1BC9B">
+                <wp:inline distT="0" distB="0" distL="0" distR="0" wp14:anchorId="4975E3F7" wp14:editId="4AB75F0F">
                   <wp:extent cx="2926080" cy="1549755"/>
                   <wp:effectExtent l="0" t="0" r="0" b="0"/>
                   <wp:docPr id="22" name="Picture 22"/>
@@ -21830,7 +21877,7 @@
         <w:pStyle w:val="Ttulo1"/>
         <w:spacing w:before="100" w:after="30"/>
       </w:pPr>
-      <w:bookmarkStart w:id="46" w:name="_Toc237703635"/>
+      <w:bookmarkStart w:id="46" w:name="_Toc237709935"/>
       <w:r>
         <w:rPr>
           <w:rFonts w:ascii="Georgia" w:hAnsi="Georgia"/>
@@ -21846,7 +21893,7 @@
         <w:pStyle w:val="Ttulo2"/>
         <w:spacing w:before="70" w:after="20"/>
       </w:pPr>
-      <w:bookmarkStart w:id="47" w:name="_Toc237703636"/>
+      <w:bookmarkStart w:id="47" w:name="_Toc237709936"/>
       <w:r>
         <w:rPr>
           <w:rFonts w:ascii="Georgia" w:hAnsi="Georgia"/>
@@ -23394,7 +23441,7 @@
         <w:pStyle w:val="Ttulo1"/>
         <w:spacing w:before="100" w:after="30"/>
       </w:pPr>
-      <w:bookmarkStart w:id="48" w:name="_Toc237703637"/>
+      <w:bookmarkStart w:id="48" w:name="_Toc237709937"/>
       <w:r>
         <w:rPr>
           <w:rFonts w:ascii="Georgia" w:hAnsi="Georgia"/>
@@ -23411,7 +23458,7 @@
         <w:pStyle w:val="Ttulo2"/>
         <w:spacing w:before="70" w:after="20"/>
       </w:pPr>
-      <w:bookmarkStart w:id="49" w:name="_Toc237703638"/>
+      <w:bookmarkStart w:id="49" w:name="_Toc237709938"/>
       <w:r>
         <w:rPr>
           <w:rFonts w:ascii="Georgia" w:hAnsi="Georgia"/>
@@ -23561,7 +23608,7 @@
                 <w:noProof/>
               </w:rPr>
               <w:drawing>
-                <wp:inline distT="0" distB="0" distL="0" distR="0" wp14:anchorId="5E6D6E88" wp14:editId="27364AB9">
+                <wp:inline distT="0" distB="0" distL="0" distR="0" wp14:anchorId="77C6A49A" wp14:editId="1AA5A634">
                   <wp:extent cx="2926080" cy="1695124"/>
                   <wp:effectExtent l="0" t="0" r="0" b="0"/>
                   <wp:docPr id="23" name="Picture 23"/>
@@ -23620,7 +23667,7 @@
                 <w:noProof/>
               </w:rPr>
               <w:drawing>
-                <wp:inline distT="0" distB="0" distL="0" distR="0" wp14:anchorId="68DD6396" wp14:editId="10425D2B">
+                <wp:inline distT="0" distB="0" distL="0" distR="0" wp14:anchorId="5FE5CEEA" wp14:editId="0E3FBF6D">
                   <wp:extent cx="2926080" cy="1572627"/>
                   <wp:effectExtent l="0" t="0" r="0" b="0"/>
                   <wp:docPr id="24" name="Picture 24"/>
@@ -23725,7 +23772,7 @@
         <w:pStyle w:val="Ttulo2"/>
         <w:spacing w:before="70" w:after="20"/>
       </w:pPr>
-      <w:bookmarkStart w:id="50" w:name="_Toc237703639"/>
+      <w:bookmarkStart w:id="50" w:name="_Toc237709939"/>
       <w:r>
         <w:rPr>
           <w:rFonts w:ascii="Georgia" w:hAnsi="Georgia"/>
@@ -23750,15 +23797,7 @@
           <w:color w:val="0D233A"/>
           <w:sz w:val="15"/>
         </w:rPr>
-        <w:t xml:space="preserve">Tabla: </w:t>
-      </w:r>
-      <w:r>
-        <w:rPr>
-          <w:b/>
-          <w:color w:val="0D233A"/>
-          <w:sz w:val="15"/>
-        </w:rPr>
-        <w:t>Desempeño Histórico de ALUA.BA (en USD) durante Episodios de Crisis</w:t>
+        <w:t>Tabla: Desempeño Histórico de ALUA.BA (en USD) durante Episodios de Crisis</w:t>
       </w:r>
     </w:p>
     <w:tbl>
@@ -24468,7 +24507,7 @@
         <w:pStyle w:val="Ttulo2"/>
         <w:spacing w:before="70" w:after="20"/>
       </w:pPr>
-      <w:bookmarkStart w:id="51" w:name="_Toc237703640"/>
+      <w:bookmarkStart w:id="51" w:name="_Toc237709940"/>
       <w:r>
         <w:rPr>
           <w:rFonts w:ascii="Georgia" w:hAnsi="Georgia"/>
@@ -24490,7 +24529,7 @@
         <w:rPr>
           <w:b/>
         </w:rPr>
-        <w:t>¿Por qué EVT-GPD?:</w:t>
+        <w:t>Modelado de Colas Pesadas vía Pareto Generalizada (EVT-GPD):</w:t>
       </w:r>
       <w:r>
         <w:t xml:space="preserve"> Dado que los retornos de Aluar presentan colas pesadas (curtosis = 7,82) y la distribución normal subestima severamente las pérdidas de cola, se calibra un modelo Pareto Generalizado (GPD, ξ̂ = 0,214 &gt; 0), capturando pérdidas de tipo Fréchet (</w:t>
@@ -24527,7 +24566,7 @@
         <w:pStyle w:val="Ttulo2"/>
         <w:spacing w:before="70" w:after="20"/>
       </w:pPr>
-      <w:bookmarkStart w:id="52" w:name="_Toc237703641"/>
+      <w:bookmarkStart w:id="52" w:name="_Toc237709941"/>
       <w:r>
         <w:rPr>
           <w:rFonts w:ascii="Georgia" w:hAnsi="Georgia"/>
@@ -24549,7 +24588,7 @@
         <w:rPr>
           <w:b/>
         </w:rPr>
-        <w:t>¿Por qué Ornstein-Uhlenbeck para el LME?:</w:t>
+        <w:t>Dinámica de la Materia Prima por Reversión a la Media (Ornstein-Uhlenbeck):</w:t>
       </w:r>
       <w:r>
         <w:t xml:space="preserve"> Los commodities industriales no siguen un paseo aleatorio sin límite (MBG), sino que revierten a la media hacia el costo marginal de producción de la industria (</w:t>
@@ -24617,7 +24656,7 @@
                 <w:noProof/>
               </w:rPr>
               <w:drawing>
-                <wp:inline distT="0" distB="0" distL="0" distR="0" wp14:anchorId="5CFCEEC5" wp14:editId="6E60E596">
+                <wp:inline distT="0" distB="0" distL="0" distR="0" wp14:anchorId="3E9F78F6" wp14:editId="06F05055">
                   <wp:extent cx="2926080" cy="1696900"/>
                   <wp:effectExtent l="0" t="0" r="0" b="0"/>
                   <wp:docPr id="25" name="Picture 25"/>
@@ -24676,7 +24715,7 @@
                 <w:noProof/>
               </w:rPr>
               <w:drawing>
-                <wp:inline distT="0" distB="0" distL="0" distR="0" wp14:anchorId="1654AC86" wp14:editId="496B3C10">
+                <wp:inline distT="0" distB="0" distL="0" distR="0" wp14:anchorId="4C4693FC" wp14:editId="4AA812D9">
                   <wp:extent cx="2926080" cy="1614092"/>
                   <wp:effectExtent l="0" t="0" r="0" b="0"/>
                   <wp:docPr id="26" name="Picture 26"/>
@@ -25701,7 +25740,7 @@
         <w:pStyle w:val="Ttulo2"/>
         <w:spacing w:before="70" w:after="20"/>
       </w:pPr>
-      <w:bookmarkStart w:id="53" w:name="_Toc237703642"/>
+      <w:bookmarkStart w:id="53" w:name="_Toc237709942"/>
       <w:r>
         <w:rPr>
           <w:rFonts w:ascii="Georgia" w:hAnsi="Georgia"/>
@@ -25777,7 +25816,7 @@
                 <w:noProof/>
               </w:rPr>
               <w:drawing>
-                <wp:inline distT="0" distB="0" distL="0" distR="0" wp14:anchorId="31EC122C" wp14:editId="4881EC17">
+                <wp:inline distT="0" distB="0" distL="0" distR="0" wp14:anchorId="2CE7E2AE" wp14:editId="56EFEA80">
                   <wp:extent cx="2926080" cy="1654733"/>
                   <wp:effectExtent l="0" t="0" r="0" b="0"/>
                   <wp:docPr id="27" name="Picture 27"/>
@@ -25836,7 +25875,7 @@
                 <w:noProof/>
               </w:rPr>
               <w:drawing>
-                <wp:inline distT="0" distB="0" distL="0" distR="0" wp14:anchorId="3B4AFA7C" wp14:editId="46782F81">
+                <wp:inline distT="0" distB="0" distL="0" distR="0" wp14:anchorId="4D0420AB" wp14:editId="326616BD">
                   <wp:extent cx="2926080" cy="1698212"/>
                   <wp:effectExtent l="0" t="0" r="0" b="0"/>
                   <wp:docPr id="28" name="Picture 28"/>
@@ -25938,16 +25977,27 @@
     </w:tbl>
     <w:p>
       <w:pPr>
+        <w:rPr>
+          <w:rFonts w:hint="eastAsia"/>
+        </w:rPr>
+      </w:pPr>
+      <w:r>
+        <w:br w:type="page"/>
+      </w:r>
+    </w:p>
+    <w:p>
+      <w:pPr>
         <w:pStyle w:val="Ttulo1"/>
         <w:spacing w:before="100" w:after="30"/>
       </w:pPr>
-      <w:bookmarkStart w:id="54" w:name="_Toc237703643"/>
+      <w:bookmarkStart w:id="54" w:name="_Toc237709943"/>
       <w:r>
         <w:rPr>
           <w:rFonts w:ascii="Georgia" w:hAnsi="Georgia"/>
           <w:color w:val="0D233A"/>
           <w:sz w:val="21"/>
         </w:rPr>
+        <w:lastRenderedPageBreak/>
         <w:t>Modelos Estocásticos y Validación Econométrica</w:t>
       </w:r>
       <w:bookmarkEnd w:id="54"/>
@@ -25957,7 +26007,7 @@
         <w:pStyle w:val="Ttulo2"/>
         <w:spacing w:before="70" w:after="20"/>
       </w:pPr>
-      <w:bookmarkStart w:id="55" w:name="_Toc237703644"/>
+      <w:bookmarkStart w:id="55" w:name="_Toc237709944"/>
       <w:r>
         <w:rPr>
           <w:rFonts w:ascii="Georgia" w:hAnsi="Georgia"/>
@@ -25979,7 +26029,7 @@
         <w:rPr>
           <w:b/>
         </w:rPr>
-        <w:t>¿Por qué el modelo CIR?:</w:t>
+        <w:t>Difusión de Tasas No Negativas Cox-Ingersoll-Ross (CIR):</w:t>
       </w:r>
       <w:r>
         <w:t xml:space="preserve"> Asegura la no-negatividad matemática en las tasas de descuento del EMBI+ en simulaciones de colas extremas (condición de Feller 2κθ &gt; σ^2) y supera al modelo lineal AR(1) con un AIC sustancialmente menor (-3.359,4 vs. -2.894,6) y mayor Log-Likelihood (+1.682,7 vs. +1.450,3, </w:t>
@@ -26027,14 +26077,13 @@
         <w:pStyle w:val="Ttulo2"/>
         <w:spacing w:before="70" w:after="20"/>
       </w:pPr>
-      <w:bookmarkStart w:id="56" w:name="_Toc237703645"/>
+      <w:bookmarkStart w:id="56" w:name="_Toc237709945"/>
       <w:r>
         <w:rPr>
           <w:rFonts w:ascii="Georgia" w:hAnsi="Georgia"/>
           <w:color w:val="1E3A8A"/>
           <w:sz w:val="18"/>
         </w:rPr>
-        <w:lastRenderedPageBreak/>
         <w:t>Volatilidad Condicional y Beta GARCH(1,1)</w:t>
       </w:r>
       <w:bookmarkEnd w:id="56"/>
@@ -26112,7 +26161,7 @@
                 <w:noProof/>
               </w:rPr>
               <w:drawing>
-                <wp:inline distT="0" distB="0" distL="0" distR="0" wp14:anchorId="0BC33425" wp14:editId="5AB41F78">
+                <wp:inline distT="0" distB="0" distL="0" distR="0" wp14:anchorId="1183299A" wp14:editId="6FDFC3B9">
                   <wp:extent cx="2926080" cy="1650045"/>
                   <wp:effectExtent l="0" t="0" r="0" b="0"/>
                   <wp:docPr id="29" name="Picture 29"/>
@@ -26171,7 +26220,7 @@
                 <w:noProof/>
               </w:rPr>
               <w:drawing>
-                <wp:inline distT="0" distB="0" distL="0" distR="0" wp14:anchorId="4B2828FE" wp14:editId="5EB96F6A">
+                <wp:inline distT="0" distB="0" distL="0" distR="0" wp14:anchorId="766474AF" wp14:editId="06DD4DBF">
                   <wp:extent cx="2926080" cy="1611196"/>
                   <wp:effectExtent l="0" t="0" r="0" b="0"/>
                   <wp:docPr id="30" name="Picture 30"/>
@@ -26659,7 +26708,7 @@
         <w:pStyle w:val="Ttulo2"/>
         <w:spacing w:before="70" w:after="20"/>
       </w:pPr>
-      <w:bookmarkStart w:id="57" w:name="_Toc237703646"/>
+      <w:bookmarkStart w:id="57" w:name="_Toc237709946"/>
       <w:r>
         <w:rPr>
           <w:rFonts w:ascii="Georgia" w:hAnsi="Georgia"/>
@@ -26682,7 +26731,7 @@
         <w:rPr>
           <w:b/>
         </w:rPr>
-        <w:t>¿Por qué Cópula de Clayton?:</w:t>
+        <w:t>Dependencia Asimétrica en Co-Caídas (Cópula de Clayton):</w:t>
       </w:r>
       <w:r>
         <w:t xml:space="preserve"> La Cópula Gaussiana asume independencia en colas (λ_L = λ_U = 0) y la t-Student impone dependencia simétrica forzada (λ_L = λ_U = 0,22). La </w:t>
@@ -26742,7 +26791,7 @@
                 <w:noProof/>
               </w:rPr>
               <w:drawing>
-                <wp:inline distT="0" distB="0" distL="0" distR="0" wp14:anchorId="0AF418DE" wp14:editId="516AAA94">
+                <wp:inline distT="0" distB="0" distL="0" distR="0" wp14:anchorId="72FC48B6" wp14:editId="537E7463">
                   <wp:extent cx="2926080" cy="1687777"/>
                   <wp:effectExtent l="0" t="0" r="0" b="0"/>
                   <wp:docPr id="31" name="Picture 31"/>
@@ -27337,7 +27386,7 @@
         <w:pStyle w:val="Ttulo2"/>
         <w:spacing w:before="70" w:after="20"/>
       </w:pPr>
-      <w:bookmarkStart w:id="58" w:name="_Toc237703647"/>
+      <w:bookmarkStart w:id="58" w:name="_Toc237709947"/>
       <w:r>
         <w:rPr>
           <w:rFonts w:ascii="Georgia" w:hAnsi="Georgia"/>
@@ -28596,14 +28645,14 @@
         <w:pStyle w:val="Ttulo1"/>
         <w:spacing w:before="100" w:after="30"/>
       </w:pPr>
-      <w:bookmarkStart w:id="59" w:name="_Toc237703648"/>
+      <w:bookmarkStart w:id="59" w:name="_Toc237709948"/>
       <w:r>
         <w:rPr>
           <w:rFonts w:ascii="Georgia" w:hAnsi="Georgia"/>
           <w:color w:val="0D233A"/>
           <w:sz w:val="21"/>
         </w:rPr>
-        <w:t>Dictamen del Modelo Teórico y Conclusiones</w:t>
+        <w:t>Dictamen del Modelo de Valuación y Conclusiones</w:t>
       </w:r>
       <w:bookmarkEnd w:id="59"/>
     </w:p>
@@ -28615,7 +28664,7 @@
         </w:rPr>
       </w:pPr>
       <w:r>
-        <w:t xml:space="preserve">El modelo teórico de valuación concluye un dictamen de </w:t>
+        <w:t xml:space="preserve">El modelo de valuación concluye un dictamen de </w:t>
       </w:r>
       <w:r>
         <w:rPr>
@@ -28647,7 +28696,7 @@
           <w:b/>
           <w:sz w:val="16"/>
         </w:rPr>
-        <w:t>Precio Objetivo Teórico Base (DCF Dumrauf):</w:t>
+        <w:t>Precio Objetivo Base Fundamental (DCF Dumrauf):</w:t>
       </w:r>
       <w:r>
         <w:rPr>
@@ -28702,7 +28751,7 @@
           <w:b/>
           <w:sz w:val="16"/>
         </w:rPr>
-        <w:t>Precio Objetivo Teórico Integrado (Base + Opción Real PEAL V):</w:t>
+        <w:t>Precio Objetivo Integrado (Base + Opción Real PEAL V):</w:t>
       </w:r>
       <w:r>
         <w:rPr>
@@ -28823,7 +28872,7 @@
         <w:pStyle w:val="Ttulo1"/>
         <w:spacing w:before="100" w:after="30"/>
       </w:pPr>
-      <w:bookmarkStart w:id="60" w:name="_Toc237703649"/>
+      <w:bookmarkStart w:id="60" w:name="_Toc237709949"/>
       <w:r>
         <w:rPr>
           <w:rFonts w:ascii="Georgia" w:hAnsi="Georgia"/>
@@ -37936,7 +37985,7 @@
         <w:pStyle w:val="Ttulo1"/>
         <w:spacing w:before="100" w:after="30"/>
       </w:pPr>
-      <w:bookmarkStart w:id="61" w:name="_Toc237703650"/>
+      <w:bookmarkStart w:id="61" w:name="_Toc237709950"/>
       <w:r>
         <w:rPr>
           <w:rFonts w:ascii="Georgia" w:hAnsi="Georgia"/>
@@ -38408,7 +38457,7 @@
         <w:pStyle w:val="Ttulo1"/>
         <w:spacing w:before="100" w:after="30"/>
       </w:pPr>
-      <w:bookmarkStart w:id="62" w:name="_Toc237703651"/>
+      <w:bookmarkStart w:id="62" w:name="_Toc237709951"/>
       <w:r>
         <w:rPr>
           <w:rFonts w:ascii="Georgia" w:hAnsi="Georgia"/>
@@ -38912,31 +38961,31 @@
       </w:rPr>
     </w:lvl>
   </w:abstractNum>
-  <w:num w:numId="1" w16cid:durableId="6300362">
+  <w:num w:numId="1" w16cid:durableId="316567593">
     <w:abstractNumId w:val="8"/>
   </w:num>
-  <w:num w:numId="2" w16cid:durableId="74982499">
+  <w:num w:numId="2" w16cid:durableId="419181887">
     <w:abstractNumId w:val="6"/>
   </w:num>
-  <w:num w:numId="3" w16cid:durableId="1376811275">
+  <w:num w:numId="3" w16cid:durableId="715007204">
     <w:abstractNumId w:val="5"/>
   </w:num>
-  <w:num w:numId="4" w16cid:durableId="157111949">
+  <w:num w:numId="4" w16cid:durableId="666589529">
     <w:abstractNumId w:val="4"/>
   </w:num>
-  <w:num w:numId="5" w16cid:durableId="481041369">
+  <w:num w:numId="5" w16cid:durableId="615449620">
     <w:abstractNumId w:val="7"/>
   </w:num>
-  <w:num w:numId="6" w16cid:durableId="226115495">
+  <w:num w:numId="6" w16cid:durableId="137573297">
     <w:abstractNumId w:val="3"/>
   </w:num>
-  <w:num w:numId="7" w16cid:durableId="2004115080">
+  <w:num w:numId="7" w16cid:durableId="1438405004">
     <w:abstractNumId w:val="2"/>
   </w:num>
-  <w:num w:numId="8" w16cid:durableId="82264118">
+  <w:num w:numId="8" w16cid:durableId="149953818">
     <w:abstractNumId w:val="1"/>
   </w:num>
-  <w:num w:numId="9" w16cid:durableId="1294675474">
+  <w:num w:numId="9" w16cid:durableId="705640481">
     <w:abstractNumId w:val="0"/>
   </w:num>
 </w:numbering>
@@ -50368,7 +50417,7 @@
     <w:autoRedefine/>
     <w:uiPriority w:val="39"/>
     <w:unhideWhenUsed/>
-    <w:rsid w:val="00B206F4"/>
+    <w:rsid w:val="00073ED0"/>
     <w:pPr>
       <w:spacing w:before="10" w:after="10" w:line="240" w:lineRule="auto"/>
     </w:pPr>
@@ -50383,7 +50432,7 @@
     <w:autoRedefine/>
     <w:uiPriority w:val="39"/>
     <w:unhideWhenUsed/>
-    <w:rsid w:val="00B206F4"/>
+    <w:rsid w:val="00073ED0"/>
     <w:pPr>
       <w:spacing w:after="0" w:line="240" w:lineRule="auto"/>
       <w:ind w:left="170"/>
@@ -50397,7 +50446,7 @@
     <w:basedOn w:val="Fuentedeprrafopredeter"/>
     <w:uiPriority w:val="99"/>
     <w:unhideWhenUsed/>
-    <w:rsid w:val="00B206F4"/>
+    <w:rsid w:val="00073ED0"/>
     <w:rPr>
       <w:color w:val="0000FF" w:themeColor="hyperlink"/>
       <w:u w:val="single"/>

</xml_diff>

<commit_message>
style(reporte): Limpieza integral de negritas inline redundantes en texto corrido (PDF y Word)
</commit_message>
<xml_diff>
--- a/01_Reporte_PDF/Informe_Valuacion_Aluar_UNCuyo.docx
+++ b/01_Reporte_PDF/Informe_Valuacion_Aluar_UNCuyo.docx
@@ -1362,7 +1362,7 @@
         </w:rPr>
         <w:fldChar w:fldCharType="separate"/>
       </w:r>
-      <w:hyperlink w:anchor="_Toc237709889" w:history="1">
+      <w:hyperlink w:anchor="_Toc237711680" w:history="1">
         <w:r>
           <w:rPr>
             <w:rStyle w:val="Hipervnculo"/>
@@ -1389,7 +1389,7 @@
             <w:noProof/>
             <w:webHidden/>
           </w:rPr>
-          <w:instrText xml:space="preserve"> PAGEREF _Toc237709889 \h </w:instrText>
+          <w:instrText xml:space="preserve"> PAGEREF _Toc237711680 \h </w:instrText>
         </w:r>
         <w:r>
           <w:rPr>
@@ -1436,7 +1436,7 @@
           <w14:ligatures w14:val="standardContextual"/>
         </w:rPr>
       </w:pPr>
-      <w:hyperlink w:anchor="_Toc237709890" w:history="1">
+      <w:hyperlink w:anchor="_Toc237711681" w:history="1">
         <w:r>
           <w:rPr>
             <w:rStyle w:val="Hipervnculo"/>
@@ -1463,7 +1463,7 @@
             <w:noProof/>
             <w:webHidden/>
           </w:rPr>
-          <w:instrText xml:space="preserve"> PAGEREF _Toc237709890 \h </w:instrText>
+          <w:instrText xml:space="preserve"> PAGEREF _Toc237711681 \h </w:instrText>
         </w:r>
         <w:r>
           <w:rPr>
@@ -1510,7 +1510,7 @@
           <w14:ligatures w14:val="standardContextual"/>
         </w:rPr>
       </w:pPr>
-      <w:hyperlink w:anchor="_Toc237709891" w:history="1">
+      <w:hyperlink w:anchor="_Toc237711682" w:history="1">
         <w:r>
           <w:rPr>
             <w:rStyle w:val="Hipervnculo"/>
@@ -1537,7 +1537,7 @@
             <w:noProof/>
             <w:webHidden/>
           </w:rPr>
-          <w:instrText xml:space="preserve"> PAGEREF _Toc237709891 \h </w:instrText>
+          <w:instrText xml:space="preserve"> PAGEREF _Toc237711682 \h </w:instrText>
         </w:r>
         <w:r>
           <w:rPr>
@@ -1584,7 +1584,7 @@
           <w14:ligatures w14:val="standardContextual"/>
         </w:rPr>
       </w:pPr>
-      <w:hyperlink w:anchor="_Toc237709892" w:history="1">
+      <w:hyperlink w:anchor="_Toc237711683" w:history="1">
         <w:r>
           <w:rPr>
             <w:rStyle w:val="Hipervnculo"/>
@@ -1611,7 +1611,7 @@
             <w:noProof/>
             <w:webHidden/>
           </w:rPr>
-          <w:instrText xml:space="preserve"> PAGEREF _Toc237709892 \h </w:instrText>
+          <w:instrText xml:space="preserve"> PAGEREF _Toc237711683 \h </w:instrText>
         </w:r>
         <w:r>
           <w:rPr>
@@ -1658,7 +1658,7 @@
           <w14:ligatures w14:val="standardContextual"/>
         </w:rPr>
       </w:pPr>
-      <w:hyperlink w:anchor="_Toc237709893" w:history="1">
+      <w:hyperlink w:anchor="_Toc237711684" w:history="1">
         <w:r>
           <w:rPr>
             <w:rStyle w:val="Hipervnculo"/>
@@ -1685,7 +1685,7 @@
             <w:noProof/>
             <w:webHidden/>
           </w:rPr>
-          <w:instrText xml:space="preserve"> PAGEREF _Toc237709893 \h </w:instrText>
+          <w:instrText xml:space="preserve"> PAGEREF _Toc237711684 \h </w:instrText>
         </w:r>
         <w:r>
           <w:rPr>
@@ -1732,7 +1732,7 @@
           <w14:ligatures w14:val="standardContextual"/>
         </w:rPr>
       </w:pPr>
-      <w:hyperlink w:anchor="_Toc237709894" w:history="1">
+      <w:hyperlink w:anchor="_Toc237711685" w:history="1">
         <w:r>
           <w:rPr>
             <w:rStyle w:val="Hipervnculo"/>
@@ -1759,7 +1759,7 @@
             <w:noProof/>
             <w:webHidden/>
           </w:rPr>
-          <w:instrText xml:space="preserve"> PAGEREF _Toc237709894 \h </w:instrText>
+          <w:instrText xml:space="preserve"> PAGEREF _Toc237711685 \h </w:instrText>
         </w:r>
         <w:r>
           <w:rPr>
@@ -1806,7 +1806,7 @@
           <w14:ligatures w14:val="standardContextual"/>
         </w:rPr>
       </w:pPr>
-      <w:hyperlink w:anchor="_Toc237709895" w:history="1">
+      <w:hyperlink w:anchor="_Toc237711686" w:history="1">
         <w:r>
           <w:rPr>
             <w:rStyle w:val="Hipervnculo"/>
@@ -1833,7 +1833,7 @@
             <w:noProof/>
             <w:webHidden/>
           </w:rPr>
-          <w:instrText xml:space="preserve"> PAGEREF _Toc237709895 \h </w:instrText>
+          <w:instrText xml:space="preserve"> PAGEREF _Toc237711686 \h </w:instrText>
         </w:r>
         <w:r>
           <w:rPr>
@@ -1880,7 +1880,7 @@
           <w14:ligatures w14:val="standardContextual"/>
         </w:rPr>
       </w:pPr>
-      <w:hyperlink w:anchor="_Toc237709896" w:history="1">
+      <w:hyperlink w:anchor="_Toc237711687" w:history="1">
         <w:r>
           <w:rPr>
             <w:rStyle w:val="Hipervnculo"/>
@@ -1907,7 +1907,7 @@
             <w:noProof/>
             <w:webHidden/>
           </w:rPr>
-          <w:instrText xml:space="preserve"> PAGEREF _Toc237709896 \h </w:instrText>
+          <w:instrText xml:space="preserve"> PAGEREF _Toc237711687 \h </w:instrText>
         </w:r>
         <w:r>
           <w:rPr>
@@ -1954,7 +1954,7 @@
           <w14:ligatures w14:val="standardContextual"/>
         </w:rPr>
       </w:pPr>
-      <w:hyperlink w:anchor="_Toc237709897" w:history="1">
+      <w:hyperlink w:anchor="_Toc237711688" w:history="1">
         <w:r>
           <w:rPr>
             <w:rStyle w:val="Hipervnculo"/>
@@ -1981,7 +1981,7 @@
             <w:noProof/>
             <w:webHidden/>
           </w:rPr>
-          <w:instrText xml:space="preserve"> PAGEREF _Toc237709897 \h </w:instrText>
+          <w:instrText xml:space="preserve"> PAGEREF _Toc237711688 \h </w:instrText>
         </w:r>
         <w:r>
           <w:rPr>
@@ -2028,7 +2028,7 @@
           <w14:ligatures w14:val="standardContextual"/>
         </w:rPr>
       </w:pPr>
-      <w:hyperlink w:anchor="_Toc237709898" w:history="1">
+      <w:hyperlink w:anchor="_Toc237711689" w:history="1">
         <w:r>
           <w:rPr>
             <w:rStyle w:val="Hipervnculo"/>
@@ -2055,7 +2055,7 @@
             <w:noProof/>
             <w:webHidden/>
           </w:rPr>
-          <w:instrText xml:space="preserve"> PAGEREF _Toc237709898 \h </w:instrText>
+          <w:instrText xml:space="preserve"> PAGEREF _Toc237711689 \h </w:instrText>
         </w:r>
         <w:r>
           <w:rPr>
@@ -2102,7 +2102,7 @@
           <w14:ligatures w14:val="standardContextual"/>
         </w:rPr>
       </w:pPr>
-      <w:hyperlink w:anchor="_Toc237709899" w:history="1">
+      <w:hyperlink w:anchor="_Toc237711690" w:history="1">
         <w:r>
           <w:rPr>
             <w:rStyle w:val="Hipervnculo"/>
@@ -2129,7 +2129,7 @@
             <w:noProof/>
             <w:webHidden/>
           </w:rPr>
-          <w:instrText xml:space="preserve"> PAGEREF _Toc237709899 \h </w:instrText>
+          <w:instrText xml:space="preserve"> PAGEREF _Toc237711690 \h </w:instrText>
         </w:r>
         <w:r>
           <w:rPr>
@@ -2176,7 +2176,7 @@
           <w14:ligatures w14:val="standardContextual"/>
         </w:rPr>
       </w:pPr>
-      <w:hyperlink w:anchor="_Toc237709900" w:history="1">
+      <w:hyperlink w:anchor="_Toc237711691" w:history="1">
         <w:r>
           <w:rPr>
             <w:rStyle w:val="Hipervnculo"/>
@@ -2203,7 +2203,7 @@
             <w:noProof/>
             <w:webHidden/>
           </w:rPr>
-          <w:instrText xml:space="preserve"> PAGEREF _Toc237709900 \h </w:instrText>
+          <w:instrText xml:space="preserve"> PAGEREF _Toc237711691 \h </w:instrText>
         </w:r>
         <w:r>
           <w:rPr>
@@ -2250,7 +2250,7 @@
           <w14:ligatures w14:val="standardContextual"/>
         </w:rPr>
       </w:pPr>
-      <w:hyperlink w:anchor="_Toc237709901" w:history="1">
+      <w:hyperlink w:anchor="_Toc237711692" w:history="1">
         <w:r>
           <w:rPr>
             <w:rStyle w:val="Hipervnculo"/>
@@ -2277,7 +2277,7 @@
             <w:noProof/>
             <w:webHidden/>
           </w:rPr>
-          <w:instrText xml:space="preserve"> PAGEREF _Toc237709901 \h </w:instrText>
+          <w:instrText xml:space="preserve"> PAGEREF _Toc237711692 \h </w:instrText>
         </w:r>
         <w:r>
           <w:rPr>
@@ -2324,7 +2324,7 @@
           <w14:ligatures w14:val="standardContextual"/>
         </w:rPr>
       </w:pPr>
-      <w:hyperlink w:anchor="_Toc237709902" w:history="1">
+      <w:hyperlink w:anchor="_Toc237711693" w:history="1">
         <w:r>
           <w:rPr>
             <w:rStyle w:val="Hipervnculo"/>
@@ -2351,7 +2351,7 @@
             <w:noProof/>
             <w:webHidden/>
           </w:rPr>
-          <w:instrText xml:space="preserve"> PAGEREF _Toc237709902 \h </w:instrText>
+          <w:instrText xml:space="preserve"> PAGEREF _Toc237711693 \h </w:instrText>
         </w:r>
         <w:r>
           <w:rPr>
@@ -2398,7 +2398,7 @@
           <w14:ligatures w14:val="standardContextual"/>
         </w:rPr>
       </w:pPr>
-      <w:hyperlink w:anchor="_Toc237709903" w:history="1">
+      <w:hyperlink w:anchor="_Toc237711694" w:history="1">
         <w:r>
           <w:rPr>
             <w:rStyle w:val="Hipervnculo"/>
@@ -2425,7 +2425,7 @@
             <w:noProof/>
             <w:webHidden/>
           </w:rPr>
-          <w:instrText xml:space="preserve"> PAGEREF _Toc237709903 \h </w:instrText>
+          <w:instrText xml:space="preserve"> PAGEREF _Toc237711694 \h </w:instrText>
         </w:r>
         <w:r>
           <w:rPr>
@@ -2472,7 +2472,7 @@
           <w14:ligatures w14:val="standardContextual"/>
         </w:rPr>
       </w:pPr>
-      <w:hyperlink w:anchor="_Toc237709904" w:history="1">
+      <w:hyperlink w:anchor="_Toc237711695" w:history="1">
         <w:r>
           <w:rPr>
             <w:rStyle w:val="Hipervnculo"/>
@@ -2499,7 +2499,7 @@
             <w:noProof/>
             <w:webHidden/>
           </w:rPr>
-          <w:instrText xml:space="preserve"> PAGEREF _Toc237709904 \h </w:instrText>
+          <w:instrText xml:space="preserve"> PAGEREF _Toc237711695 \h </w:instrText>
         </w:r>
         <w:r>
           <w:rPr>
@@ -2546,7 +2546,7 @@
           <w14:ligatures w14:val="standardContextual"/>
         </w:rPr>
       </w:pPr>
-      <w:hyperlink w:anchor="_Toc237709905" w:history="1">
+      <w:hyperlink w:anchor="_Toc237711696" w:history="1">
         <w:r>
           <w:rPr>
             <w:rStyle w:val="Hipervnculo"/>
@@ -2573,7 +2573,7 @@
             <w:noProof/>
             <w:webHidden/>
           </w:rPr>
-          <w:instrText xml:space="preserve"> PAGEREF _Toc237709905 \h </w:instrText>
+          <w:instrText xml:space="preserve"> PAGEREF _Toc237711696 \h </w:instrText>
         </w:r>
         <w:r>
           <w:rPr>
@@ -2620,7 +2620,7 @@
           <w14:ligatures w14:val="standardContextual"/>
         </w:rPr>
       </w:pPr>
-      <w:hyperlink w:anchor="_Toc237709906" w:history="1">
+      <w:hyperlink w:anchor="_Toc237711697" w:history="1">
         <w:r>
           <w:rPr>
             <w:rStyle w:val="Hipervnculo"/>
@@ -2647,7 +2647,7 @@
             <w:noProof/>
             <w:webHidden/>
           </w:rPr>
-          <w:instrText xml:space="preserve"> PAGEREF _Toc237709906 \h </w:instrText>
+          <w:instrText xml:space="preserve"> PAGEREF _Toc237711697 \h </w:instrText>
         </w:r>
         <w:r>
           <w:rPr>
@@ -2694,7 +2694,7 @@
           <w14:ligatures w14:val="standardContextual"/>
         </w:rPr>
       </w:pPr>
-      <w:hyperlink w:anchor="_Toc237709907" w:history="1">
+      <w:hyperlink w:anchor="_Toc237711698" w:history="1">
         <w:r>
           <w:rPr>
             <w:rStyle w:val="Hipervnculo"/>
@@ -2721,7 +2721,7 @@
             <w:noProof/>
             <w:webHidden/>
           </w:rPr>
-          <w:instrText xml:space="preserve"> PAGEREF _Toc237709907 \h </w:instrText>
+          <w:instrText xml:space="preserve"> PAGEREF _Toc237711698 \h </w:instrText>
         </w:r>
         <w:r>
           <w:rPr>
@@ -2768,7 +2768,7 @@
           <w14:ligatures w14:val="standardContextual"/>
         </w:rPr>
       </w:pPr>
-      <w:hyperlink w:anchor="_Toc237709908" w:history="1">
+      <w:hyperlink w:anchor="_Toc237711699" w:history="1">
         <w:r>
           <w:rPr>
             <w:rStyle w:val="Hipervnculo"/>
@@ -2795,7 +2795,7 @@
             <w:noProof/>
             <w:webHidden/>
           </w:rPr>
-          <w:instrText xml:space="preserve"> PAGEREF _Toc237709908 \h </w:instrText>
+          <w:instrText xml:space="preserve"> PAGEREF _Toc237711699 \h </w:instrText>
         </w:r>
         <w:r>
           <w:rPr>
@@ -2842,7 +2842,7 @@
           <w14:ligatures w14:val="standardContextual"/>
         </w:rPr>
       </w:pPr>
-      <w:hyperlink w:anchor="_Toc237709909" w:history="1">
+      <w:hyperlink w:anchor="_Toc237711700" w:history="1">
         <w:r>
           <w:rPr>
             <w:rStyle w:val="Hipervnculo"/>
@@ -2869,7 +2869,7 @@
             <w:noProof/>
             <w:webHidden/>
           </w:rPr>
-          <w:instrText xml:space="preserve"> PAGEREF _Toc237709909 \h </w:instrText>
+          <w:instrText xml:space="preserve"> PAGEREF _Toc237711700 \h </w:instrText>
         </w:r>
         <w:r>
           <w:rPr>
@@ -2916,7 +2916,7 @@
           <w14:ligatures w14:val="standardContextual"/>
         </w:rPr>
       </w:pPr>
-      <w:hyperlink w:anchor="_Toc237709910" w:history="1">
+      <w:hyperlink w:anchor="_Toc237711701" w:history="1">
         <w:r>
           <w:rPr>
             <w:rStyle w:val="Hipervnculo"/>
@@ -2943,7 +2943,7 @@
             <w:noProof/>
             <w:webHidden/>
           </w:rPr>
-          <w:instrText xml:space="preserve"> PAGEREF _Toc237709910 \h </w:instrText>
+          <w:instrText xml:space="preserve"> PAGEREF _Toc237711701 \h </w:instrText>
         </w:r>
         <w:r>
           <w:rPr>
@@ -2990,7 +2990,7 @@
           <w14:ligatures w14:val="standardContextual"/>
         </w:rPr>
       </w:pPr>
-      <w:hyperlink w:anchor="_Toc237709911" w:history="1">
+      <w:hyperlink w:anchor="_Toc237711702" w:history="1">
         <w:r>
           <w:rPr>
             <w:rStyle w:val="Hipervnculo"/>
@@ -3017,7 +3017,7 @@
             <w:noProof/>
             <w:webHidden/>
           </w:rPr>
-          <w:instrText xml:space="preserve"> PAGEREF _Toc237709911 \h </w:instrText>
+          <w:instrText xml:space="preserve"> PAGEREF _Toc237711702 \h </w:instrText>
         </w:r>
         <w:r>
           <w:rPr>
@@ -3064,7 +3064,7 @@
           <w14:ligatures w14:val="standardContextual"/>
         </w:rPr>
       </w:pPr>
-      <w:hyperlink w:anchor="_Toc237709912" w:history="1">
+      <w:hyperlink w:anchor="_Toc237711703" w:history="1">
         <w:r>
           <w:rPr>
             <w:rStyle w:val="Hipervnculo"/>
@@ -3121,7 +3121,7 @@
             <w:noProof/>
             <w:webHidden/>
           </w:rPr>
-          <w:instrText xml:space="preserve"> PAGEREF _Toc237709912 \h </w:instrText>
+          <w:instrText xml:space="preserve"> PAGEREF _Toc237711703 \h </w:instrText>
         </w:r>
         <w:r>
           <w:rPr>
@@ -3168,7 +3168,7 @@
           <w14:ligatures w14:val="standardContextual"/>
         </w:rPr>
       </w:pPr>
-      <w:hyperlink w:anchor="_Toc237709913" w:history="1">
+      <w:hyperlink w:anchor="_Toc237711704" w:history="1">
         <w:r>
           <w:rPr>
             <w:rStyle w:val="Hipervnculo"/>
@@ -3195,7 +3195,7 @@
             <w:noProof/>
             <w:webHidden/>
           </w:rPr>
-          <w:instrText xml:space="preserve"> PAGEREF _Toc237709913 \h </w:instrText>
+          <w:instrText xml:space="preserve"> PAGEREF _Toc237711704 \h </w:instrText>
         </w:r>
         <w:r>
           <w:rPr>
@@ -3242,7 +3242,7 @@
           <w14:ligatures w14:val="standardContextual"/>
         </w:rPr>
       </w:pPr>
-      <w:hyperlink w:anchor="_Toc237709914" w:history="1">
+      <w:hyperlink w:anchor="_Toc237711705" w:history="1">
         <w:r>
           <w:rPr>
             <w:rStyle w:val="Hipervnculo"/>
@@ -3269,7 +3269,7 @@
             <w:noProof/>
             <w:webHidden/>
           </w:rPr>
-          <w:instrText xml:space="preserve"> PAGEREF _Toc237709914 \h </w:instrText>
+          <w:instrText xml:space="preserve"> PAGEREF _Toc237711705 \h </w:instrText>
         </w:r>
         <w:r>
           <w:rPr>
@@ -3316,7 +3316,7 @@
           <w14:ligatures w14:val="standardContextual"/>
         </w:rPr>
       </w:pPr>
-      <w:hyperlink w:anchor="_Toc237709915" w:history="1">
+      <w:hyperlink w:anchor="_Toc237711706" w:history="1">
         <w:r>
           <w:rPr>
             <w:rStyle w:val="Hipervnculo"/>
@@ -3343,7 +3343,7 @@
             <w:noProof/>
             <w:webHidden/>
           </w:rPr>
-          <w:instrText xml:space="preserve"> PAGEREF _Toc237709915 \h </w:instrText>
+          <w:instrText xml:space="preserve"> PAGEREF _Toc237711706 \h </w:instrText>
         </w:r>
         <w:r>
           <w:rPr>
@@ -3390,7 +3390,7 @@
           <w14:ligatures w14:val="standardContextual"/>
         </w:rPr>
       </w:pPr>
-      <w:hyperlink w:anchor="_Toc237709916" w:history="1">
+      <w:hyperlink w:anchor="_Toc237711707" w:history="1">
         <w:r>
           <w:rPr>
             <w:rStyle w:val="Hipervnculo"/>
@@ -3417,7 +3417,7 @@
             <w:noProof/>
             <w:webHidden/>
           </w:rPr>
-          <w:instrText xml:space="preserve"> PAGEREF _Toc237709916 \h </w:instrText>
+          <w:instrText xml:space="preserve"> PAGEREF _Toc237711707 \h </w:instrText>
         </w:r>
         <w:r>
           <w:rPr>
@@ -3464,7 +3464,7 @@
           <w14:ligatures w14:val="standardContextual"/>
         </w:rPr>
       </w:pPr>
-      <w:hyperlink w:anchor="_Toc237709917" w:history="1">
+      <w:hyperlink w:anchor="_Toc237711708" w:history="1">
         <w:r>
           <w:rPr>
             <w:rStyle w:val="Hipervnculo"/>
@@ -3491,7 +3491,7 @@
             <w:noProof/>
             <w:webHidden/>
           </w:rPr>
-          <w:instrText xml:space="preserve"> PAGEREF _Toc237709917 \h </w:instrText>
+          <w:instrText xml:space="preserve"> PAGEREF _Toc237711708 \h </w:instrText>
         </w:r>
         <w:r>
           <w:rPr>
@@ -3538,7 +3538,7 @@
           <w14:ligatures w14:val="standardContextual"/>
         </w:rPr>
       </w:pPr>
-      <w:hyperlink w:anchor="_Toc237709918" w:history="1">
+      <w:hyperlink w:anchor="_Toc237711709" w:history="1">
         <w:r>
           <w:rPr>
             <w:rStyle w:val="Hipervnculo"/>
@@ -3565,7 +3565,7 @@
             <w:noProof/>
             <w:webHidden/>
           </w:rPr>
-          <w:instrText xml:space="preserve"> PAGEREF _Toc237709918 \h </w:instrText>
+          <w:instrText xml:space="preserve"> PAGEREF _Toc237711709 \h </w:instrText>
         </w:r>
         <w:r>
           <w:rPr>
@@ -3612,7 +3612,7 @@
           <w14:ligatures w14:val="standardContextual"/>
         </w:rPr>
       </w:pPr>
-      <w:hyperlink w:anchor="_Toc237709919" w:history="1">
+      <w:hyperlink w:anchor="_Toc237711710" w:history="1">
         <w:r>
           <w:rPr>
             <w:rStyle w:val="Hipervnculo"/>
@@ -3639,7 +3639,7 @@
             <w:noProof/>
             <w:webHidden/>
           </w:rPr>
-          <w:instrText xml:space="preserve"> PAGEREF _Toc237709919 \h </w:instrText>
+          <w:instrText xml:space="preserve"> PAGEREF _Toc237711710 \h </w:instrText>
         </w:r>
         <w:r>
           <w:rPr>
@@ -3686,7 +3686,7 @@
           <w14:ligatures w14:val="standardContextual"/>
         </w:rPr>
       </w:pPr>
-      <w:hyperlink w:anchor="_Toc237709920" w:history="1">
+      <w:hyperlink w:anchor="_Toc237711711" w:history="1">
         <w:r>
           <w:rPr>
             <w:rStyle w:val="Hipervnculo"/>
@@ -3713,7 +3713,7 @@
             <w:noProof/>
             <w:webHidden/>
           </w:rPr>
-          <w:instrText xml:space="preserve"> PAGEREF _Toc237709920 \h </w:instrText>
+          <w:instrText xml:space="preserve"> PAGEREF _Toc237711711 \h </w:instrText>
         </w:r>
         <w:r>
           <w:rPr>
@@ -3760,7 +3760,7 @@
           <w14:ligatures w14:val="standardContextual"/>
         </w:rPr>
       </w:pPr>
-      <w:hyperlink w:anchor="_Toc237709921" w:history="1">
+      <w:hyperlink w:anchor="_Toc237711712" w:history="1">
         <w:r>
           <w:rPr>
             <w:rStyle w:val="Hipervnculo"/>
@@ -3787,7 +3787,7 @@
             <w:noProof/>
             <w:webHidden/>
           </w:rPr>
-          <w:instrText xml:space="preserve"> PAGEREF _Toc237709921 \h </w:instrText>
+          <w:instrText xml:space="preserve"> PAGEREF _Toc237711712 \h </w:instrText>
         </w:r>
         <w:r>
           <w:rPr>
@@ -3834,7 +3834,7 @@
           <w14:ligatures w14:val="standardContextual"/>
         </w:rPr>
       </w:pPr>
-      <w:hyperlink w:anchor="_Toc237709922" w:history="1">
+      <w:hyperlink w:anchor="_Toc237711713" w:history="1">
         <w:r>
           <w:rPr>
             <w:rStyle w:val="Hipervnculo"/>
@@ -3861,7 +3861,7 @@
             <w:noProof/>
             <w:webHidden/>
           </w:rPr>
-          <w:instrText xml:space="preserve"> PAGEREF _Toc237709922 \h </w:instrText>
+          <w:instrText xml:space="preserve"> PAGEREF _Toc237711713 \h </w:instrText>
         </w:r>
         <w:r>
           <w:rPr>
@@ -3908,7 +3908,7 @@
           <w14:ligatures w14:val="standardContextual"/>
         </w:rPr>
       </w:pPr>
-      <w:hyperlink w:anchor="_Toc237709923" w:history="1">
+      <w:hyperlink w:anchor="_Toc237711714" w:history="1">
         <w:r>
           <w:rPr>
             <w:rStyle w:val="Hipervnculo"/>
@@ -3935,7 +3935,7 @@
             <w:noProof/>
             <w:webHidden/>
           </w:rPr>
-          <w:instrText xml:space="preserve"> PAGEREF _Toc237709923 \h </w:instrText>
+          <w:instrText xml:space="preserve"> PAGEREF _Toc237711714 \h </w:instrText>
         </w:r>
         <w:r>
           <w:rPr>
@@ -3982,7 +3982,7 @@
           <w14:ligatures w14:val="standardContextual"/>
         </w:rPr>
       </w:pPr>
-      <w:hyperlink w:anchor="_Toc237709924" w:history="1">
+      <w:hyperlink w:anchor="_Toc237711715" w:history="1">
         <w:r>
           <w:rPr>
             <w:rStyle w:val="Hipervnculo"/>
@@ -4009,7 +4009,7 @@
             <w:noProof/>
             <w:webHidden/>
           </w:rPr>
-          <w:instrText xml:space="preserve"> PAGEREF _Toc237709924 \h </w:instrText>
+          <w:instrText xml:space="preserve"> PAGEREF _Toc237711715 \h </w:instrText>
         </w:r>
         <w:r>
           <w:rPr>
@@ -4056,7 +4056,7 @@
           <w14:ligatures w14:val="standardContextual"/>
         </w:rPr>
       </w:pPr>
-      <w:hyperlink w:anchor="_Toc237709925" w:history="1">
+      <w:hyperlink w:anchor="_Toc237711716" w:history="1">
         <w:r>
           <w:rPr>
             <w:rStyle w:val="Hipervnculo"/>
@@ -4083,7 +4083,7 @@
             <w:noProof/>
             <w:webHidden/>
           </w:rPr>
-          <w:instrText xml:space="preserve"> PAGEREF _Toc237709925 \h </w:instrText>
+          <w:instrText xml:space="preserve"> PAGEREF _Toc237711716 \h </w:instrText>
         </w:r>
         <w:r>
           <w:rPr>
@@ -4130,7 +4130,7 @@
           <w14:ligatures w14:val="standardContextual"/>
         </w:rPr>
       </w:pPr>
-      <w:hyperlink w:anchor="_Toc237709926" w:history="1">
+      <w:hyperlink w:anchor="_Toc237711717" w:history="1">
         <w:r>
           <w:rPr>
             <w:rStyle w:val="Hipervnculo"/>
@@ -4157,7 +4157,7 @@
             <w:noProof/>
             <w:webHidden/>
           </w:rPr>
-          <w:instrText xml:space="preserve"> PAGEREF _Toc237709926 \h </w:instrText>
+          <w:instrText xml:space="preserve"> PAGEREF _Toc237711717 \h </w:instrText>
         </w:r>
         <w:r>
           <w:rPr>
@@ -4204,7 +4204,7 @@
           <w14:ligatures w14:val="standardContextual"/>
         </w:rPr>
       </w:pPr>
-      <w:hyperlink w:anchor="_Toc237709927" w:history="1">
+      <w:hyperlink w:anchor="_Toc237711718" w:history="1">
         <w:r>
           <w:rPr>
             <w:rStyle w:val="Hipervnculo"/>
@@ -4231,7 +4231,7 @@
             <w:noProof/>
             <w:webHidden/>
           </w:rPr>
-          <w:instrText xml:space="preserve"> PAGEREF _Toc237709927 \h </w:instrText>
+          <w:instrText xml:space="preserve"> PAGEREF _Toc237711718 \h </w:instrText>
         </w:r>
         <w:r>
           <w:rPr>
@@ -4278,7 +4278,7 @@
           <w14:ligatures w14:val="standardContextual"/>
         </w:rPr>
       </w:pPr>
-      <w:hyperlink w:anchor="_Toc237709928" w:history="1">
+      <w:hyperlink w:anchor="_Toc237711719" w:history="1">
         <w:r>
           <w:rPr>
             <w:rStyle w:val="Hipervnculo"/>
@@ -4305,7 +4305,7 @@
             <w:noProof/>
             <w:webHidden/>
           </w:rPr>
-          <w:instrText xml:space="preserve"> PAGEREF _Toc237709928 \h </w:instrText>
+          <w:instrText xml:space="preserve"> PAGEREF _Toc237711719 \h </w:instrText>
         </w:r>
         <w:r>
           <w:rPr>
@@ -4352,7 +4352,7 @@
           <w14:ligatures w14:val="standardContextual"/>
         </w:rPr>
       </w:pPr>
-      <w:hyperlink w:anchor="_Toc237709929" w:history="1">
+      <w:hyperlink w:anchor="_Toc237711720" w:history="1">
         <w:r>
           <w:rPr>
             <w:rStyle w:val="Hipervnculo"/>
@@ -4379,7 +4379,7 @@
             <w:noProof/>
             <w:webHidden/>
           </w:rPr>
-          <w:instrText xml:space="preserve"> PAGEREF _Toc237709929 \h </w:instrText>
+          <w:instrText xml:space="preserve"> PAGEREF _Toc237711720 \h </w:instrText>
         </w:r>
         <w:r>
           <w:rPr>
@@ -4426,7 +4426,7 @@
           <w14:ligatures w14:val="standardContextual"/>
         </w:rPr>
       </w:pPr>
-      <w:hyperlink w:anchor="_Toc237709930" w:history="1">
+      <w:hyperlink w:anchor="_Toc237711721" w:history="1">
         <w:r>
           <w:rPr>
             <w:rStyle w:val="Hipervnculo"/>
@@ -4453,7 +4453,7 @@
             <w:noProof/>
             <w:webHidden/>
           </w:rPr>
-          <w:instrText xml:space="preserve"> PAGEREF _Toc237709930 \h </w:instrText>
+          <w:instrText xml:space="preserve"> PAGEREF _Toc237711721 \h </w:instrText>
         </w:r>
         <w:r>
           <w:rPr>
@@ -4500,7 +4500,7 @@
           <w14:ligatures w14:val="standardContextual"/>
         </w:rPr>
       </w:pPr>
-      <w:hyperlink w:anchor="_Toc237709931" w:history="1">
+      <w:hyperlink w:anchor="_Toc237711722" w:history="1">
         <w:r>
           <w:rPr>
             <w:rStyle w:val="Hipervnculo"/>
@@ -4527,7 +4527,7 @@
             <w:noProof/>
             <w:webHidden/>
           </w:rPr>
-          <w:instrText xml:space="preserve"> PAGEREF _Toc237709931 \h </w:instrText>
+          <w:instrText xml:space="preserve"> PAGEREF _Toc237711722 \h </w:instrText>
         </w:r>
         <w:r>
           <w:rPr>
@@ -4574,7 +4574,7 @@
           <w14:ligatures w14:val="standardContextual"/>
         </w:rPr>
       </w:pPr>
-      <w:hyperlink w:anchor="_Toc237709932" w:history="1">
+      <w:hyperlink w:anchor="_Toc237711723" w:history="1">
         <w:r>
           <w:rPr>
             <w:rStyle w:val="Hipervnculo"/>
@@ -4601,7 +4601,7 @@
             <w:noProof/>
             <w:webHidden/>
           </w:rPr>
-          <w:instrText xml:space="preserve"> PAGEREF _Toc237709932 \h </w:instrText>
+          <w:instrText xml:space="preserve"> PAGEREF _Toc237711723 \h </w:instrText>
         </w:r>
         <w:r>
           <w:rPr>
@@ -4648,7 +4648,7 @@
           <w14:ligatures w14:val="standardContextual"/>
         </w:rPr>
       </w:pPr>
-      <w:hyperlink w:anchor="_Toc237709933" w:history="1">
+      <w:hyperlink w:anchor="_Toc237711724" w:history="1">
         <w:r>
           <w:rPr>
             <w:rStyle w:val="Hipervnculo"/>
@@ -4675,7 +4675,7 @@
             <w:noProof/>
             <w:webHidden/>
           </w:rPr>
-          <w:instrText xml:space="preserve"> PAGEREF _Toc237709933 \h </w:instrText>
+          <w:instrText xml:space="preserve"> PAGEREF _Toc237711724 \h </w:instrText>
         </w:r>
         <w:r>
           <w:rPr>
@@ -4722,7 +4722,7 @@
           <w14:ligatures w14:val="standardContextual"/>
         </w:rPr>
       </w:pPr>
-      <w:hyperlink w:anchor="_Toc237709934" w:history="1">
+      <w:hyperlink w:anchor="_Toc237711725" w:history="1">
         <w:r>
           <w:rPr>
             <w:rStyle w:val="Hipervnculo"/>
@@ -4749,7 +4749,7 @@
             <w:noProof/>
             <w:webHidden/>
           </w:rPr>
-          <w:instrText xml:space="preserve"> PAGEREF _Toc237709934 \h </w:instrText>
+          <w:instrText xml:space="preserve"> PAGEREF _Toc237711725 \h </w:instrText>
         </w:r>
         <w:r>
           <w:rPr>
@@ -4796,7 +4796,7 @@
           <w14:ligatures w14:val="standardContextual"/>
         </w:rPr>
       </w:pPr>
-      <w:hyperlink w:anchor="_Toc237709935" w:history="1">
+      <w:hyperlink w:anchor="_Toc237711726" w:history="1">
         <w:r>
           <w:rPr>
             <w:rStyle w:val="Hipervnculo"/>
@@ -4823,7 +4823,7 @@
             <w:noProof/>
             <w:webHidden/>
           </w:rPr>
-          <w:instrText xml:space="preserve"> PAGEREF _Toc237709935 \h </w:instrText>
+          <w:instrText xml:space="preserve"> PAGEREF _Toc237711726 \h </w:instrText>
         </w:r>
         <w:r>
           <w:rPr>
@@ -4870,7 +4870,7 @@
           <w14:ligatures w14:val="standardContextual"/>
         </w:rPr>
       </w:pPr>
-      <w:hyperlink w:anchor="_Toc237709936" w:history="1">
+      <w:hyperlink w:anchor="_Toc237711727" w:history="1">
         <w:r>
           <w:rPr>
             <w:rStyle w:val="Hipervnculo"/>
@@ -4897,7 +4897,7 @@
             <w:noProof/>
             <w:webHidden/>
           </w:rPr>
-          <w:instrText xml:space="preserve"> PAGEREF _Toc237709936 \h </w:instrText>
+          <w:instrText xml:space="preserve"> PAGEREF _Toc237711727 \h </w:instrText>
         </w:r>
         <w:r>
           <w:rPr>
@@ -4944,7 +4944,7 @@
           <w14:ligatures w14:val="standardContextual"/>
         </w:rPr>
       </w:pPr>
-      <w:hyperlink w:anchor="_Toc237709937" w:history="1">
+      <w:hyperlink w:anchor="_Toc237711728" w:history="1">
         <w:r>
           <w:rPr>
             <w:rStyle w:val="Hipervnculo"/>
@@ -4971,7 +4971,7 @@
             <w:noProof/>
             <w:webHidden/>
           </w:rPr>
-          <w:instrText xml:space="preserve"> PAGEREF _Toc237709937 \h </w:instrText>
+          <w:instrText xml:space="preserve"> PAGEREF _Toc237711728 \h </w:instrText>
         </w:r>
         <w:r>
           <w:rPr>
@@ -5018,7 +5018,7 @@
           <w14:ligatures w14:val="standardContextual"/>
         </w:rPr>
       </w:pPr>
-      <w:hyperlink w:anchor="_Toc237709938" w:history="1">
+      <w:hyperlink w:anchor="_Toc237711729" w:history="1">
         <w:r>
           <w:rPr>
             <w:rStyle w:val="Hipervnculo"/>
@@ -5045,7 +5045,7 @@
             <w:noProof/>
             <w:webHidden/>
           </w:rPr>
-          <w:instrText xml:space="preserve"> PAGEREF _Toc237709938 \h </w:instrText>
+          <w:instrText xml:space="preserve"> PAGEREF _Toc237711729 \h </w:instrText>
         </w:r>
         <w:r>
           <w:rPr>
@@ -5092,7 +5092,7 @@
           <w14:ligatures w14:val="standardContextual"/>
         </w:rPr>
       </w:pPr>
-      <w:hyperlink w:anchor="_Toc237709939" w:history="1">
+      <w:hyperlink w:anchor="_Toc237711730" w:history="1">
         <w:r>
           <w:rPr>
             <w:rStyle w:val="Hipervnculo"/>
@@ -5119,7 +5119,7 @@
             <w:noProof/>
             <w:webHidden/>
           </w:rPr>
-          <w:instrText xml:space="preserve"> PAGEREF _Toc237709939 \h </w:instrText>
+          <w:instrText xml:space="preserve"> PAGEREF _Toc237711730 \h </w:instrText>
         </w:r>
         <w:r>
           <w:rPr>
@@ -5166,7 +5166,7 @@
           <w14:ligatures w14:val="standardContextual"/>
         </w:rPr>
       </w:pPr>
-      <w:hyperlink w:anchor="_Toc237709940" w:history="1">
+      <w:hyperlink w:anchor="_Toc237711731" w:history="1">
         <w:r>
           <w:rPr>
             <w:rStyle w:val="Hipervnculo"/>
@@ -5193,7 +5193,7 @@
             <w:noProof/>
             <w:webHidden/>
           </w:rPr>
-          <w:instrText xml:space="preserve"> PAGEREF _Toc237709940 \h </w:instrText>
+          <w:instrText xml:space="preserve"> PAGEREF _Toc237711731 \h </w:instrText>
         </w:r>
         <w:r>
           <w:rPr>
@@ -5240,7 +5240,7 @@
           <w14:ligatures w14:val="standardContextual"/>
         </w:rPr>
       </w:pPr>
-      <w:hyperlink w:anchor="_Toc237709941" w:history="1">
+      <w:hyperlink w:anchor="_Toc237711732" w:history="1">
         <w:r>
           <w:rPr>
             <w:rStyle w:val="Hipervnculo"/>
@@ -5267,7 +5267,7 @@
             <w:noProof/>
             <w:webHidden/>
           </w:rPr>
-          <w:instrText xml:space="preserve"> PAGEREF _Toc237709941 \h </w:instrText>
+          <w:instrText xml:space="preserve"> PAGEREF _Toc237711732 \h </w:instrText>
         </w:r>
         <w:r>
           <w:rPr>
@@ -5314,7 +5314,7 @@
           <w14:ligatures w14:val="standardContextual"/>
         </w:rPr>
       </w:pPr>
-      <w:hyperlink w:anchor="_Toc237709942" w:history="1">
+      <w:hyperlink w:anchor="_Toc237711733" w:history="1">
         <w:r>
           <w:rPr>
             <w:rStyle w:val="Hipervnculo"/>
@@ -5341,7 +5341,7 @@
             <w:noProof/>
             <w:webHidden/>
           </w:rPr>
-          <w:instrText xml:space="preserve"> PAGEREF _Toc237709942 \h </w:instrText>
+          <w:instrText xml:space="preserve"> PAGEREF _Toc237711733 \h </w:instrText>
         </w:r>
         <w:r>
           <w:rPr>
@@ -5388,7 +5388,7 @@
           <w14:ligatures w14:val="standardContextual"/>
         </w:rPr>
       </w:pPr>
-      <w:hyperlink w:anchor="_Toc237709943" w:history="1">
+      <w:hyperlink w:anchor="_Toc237711734" w:history="1">
         <w:r>
           <w:rPr>
             <w:rStyle w:val="Hipervnculo"/>
@@ -5415,7 +5415,7 @@
             <w:noProof/>
             <w:webHidden/>
           </w:rPr>
-          <w:instrText xml:space="preserve"> PAGEREF _Toc237709943 \h </w:instrText>
+          <w:instrText xml:space="preserve"> PAGEREF _Toc237711734 \h </w:instrText>
         </w:r>
         <w:r>
           <w:rPr>
@@ -5462,7 +5462,7 @@
           <w14:ligatures w14:val="standardContextual"/>
         </w:rPr>
       </w:pPr>
-      <w:hyperlink w:anchor="_Toc237709944" w:history="1">
+      <w:hyperlink w:anchor="_Toc237711735" w:history="1">
         <w:r>
           <w:rPr>
             <w:rStyle w:val="Hipervnculo"/>
@@ -5489,7 +5489,7 @@
             <w:noProof/>
             <w:webHidden/>
           </w:rPr>
-          <w:instrText xml:space="preserve"> PAGEREF _Toc237709944 \h </w:instrText>
+          <w:instrText xml:space="preserve"> PAGEREF _Toc237711735 \h </w:instrText>
         </w:r>
         <w:r>
           <w:rPr>
@@ -5536,7 +5536,7 @@
           <w14:ligatures w14:val="standardContextual"/>
         </w:rPr>
       </w:pPr>
-      <w:hyperlink w:anchor="_Toc237709945" w:history="1">
+      <w:hyperlink w:anchor="_Toc237711736" w:history="1">
         <w:r>
           <w:rPr>
             <w:rStyle w:val="Hipervnculo"/>
@@ -5563,7 +5563,7 @@
             <w:noProof/>
             <w:webHidden/>
           </w:rPr>
-          <w:instrText xml:space="preserve"> PAGEREF _Toc237709945 \h </w:instrText>
+          <w:instrText xml:space="preserve"> PAGEREF _Toc237711736 \h </w:instrText>
         </w:r>
         <w:r>
           <w:rPr>
@@ -5610,7 +5610,7 @@
           <w14:ligatures w14:val="standardContextual"/>
         </w:rPr>
       </w:pPr>
-      <w:hyperlink w:anchor="_Toc237709946" w:history="1">
+      <w:hyperlink w:anchor="_Toc237711737" w:history="1">
         <w:r>
           <w:rPr>
             <w:rStyle w:val="Hipervnculo"/>
@@ -5637,7 +5637,7 @@
             <w:noProof/>
             <w:webHidden/>
           </w:rPr>
-          <w:instrText xml:space="preserve"> PAGEREF _Toc237709946 \h </w:instrText>
+          <w:instrText xml:space="preserve"> PAGEREF _Toc237711737 \h </w:instrText>
         </w:r>
         <w:r>
           <w:rPr>
@@ -5684,7 +5684,7 @@
           <w14:ligatures w14:val="standardContextual"/>
         </w:rPr>
       </w:pPr>
-      <w:hyperlink w:anchor="_Toc237709947" w:history="1">
+      <w:hyperlink w:anchor="_Toc237711738" w:history="1">
         <w:r>
           <w:rPr>
             <w:rStyle w:val="Hipervnculo"/>
@@ -5711,7 +5711,7 @@
             <w:noProof/>
             <w:webHidden/>
           </w:rPr>
-          <w:instrText xml:space="preserve"> PAGEREF _Toc237709947 \h </w:instrText>
+          <w:instrText xml:space="preserve"> PAGEREF _Toc237711738 \h </w:instrText>
         </w:r>
         <w:r>
           <w:rPr>
@@ -5758,7 +5758,7 @@
           <w14:ligatures w14:val="standardContextual"/>
         </w:rPr>
       </w:pPr>
-      <w:hyperlink w:anchor="_Toc237709948" w:history="1">
+      <w:hyperlink w:anchor="_Toc237711739" w:history="1">
         <w:r>
           <w:rPr>
             <w:rStyle w:val="Hipervnculo"/>
@@ -5785,7 +5785,7 @@
             <w:noProof/>
             <w:webHidden/>
           </w:rPr>
-          <w:instrText xml:space="preserve"> PAGEREF _Toc237709948 \h </w:instrText>
+          <w:instrText xml:space="preserve"> PAGEREF _Toc237711739 \h </w:instrText>
         </w:r>
         <w:r>
           <w:rPr>
@@ -5832,7 +5832,7 @@
           <w14:ligatures w14:val="standardContextual"/>
         </w:rPr>
       </w:pPr>
-      <w:hyperlink w:anchor="_Toc237709949" w:history="1">
+      <w:hyperlink w:anchor="_Toc237711740" w:history="1">
         <w:r>
           <w:rPr>
             <w:rStyle w:val="Hipervnculo"/>
@@ -5859,7 +5859,7 @@
             <w:noProof/>
             <w:webHidden/>
           </w:rPr>
-          <w:instrText xml:space="preserve"> PAGEREF _Toc237709949 \h </w:instrText>
+          <w:instrText xml:space="preserve"> PAGEREF _Toc237711740 \h </w:instrText>
         </w:r>
         <w:r>
           <w:rPr>
@@ -5906,7 +5906,7 @@
           <w14:ligatures w14:val="standardContextual"/>
         </w:rPr>
       </w:pPr>
-      <w:hyperlink w:anchor="_Toc237709950" w:history="1">
+      <w:hyperlink w:anchor="_Toc237711741" w:history="1">
         <w:r>
           <w:rPr>
             <w:rStyle w:val="Hipervnculo"/>
@@ -5933,7 +5933,7 @@
             <w:noProof/>
             <w:webHidden/>
           </w:rPr>
-          <w:instrText xml:space="preserve"> PAGEREF _Toc237709950 \h </w:instrText>
+          <w:instrText xml:space="preserve"> PAGEREF _Toc237711741 \h </w:instrText>
         </w:r>
         <w:r>
           <w:rPr>
@@ -5980,7 +5980,7 @@
           <w14:ligatures w14:val="standardContextual"/>
         </w:rPr>
       </w:pPr>
-      <w:hyperlink w:anchor="_Toc237709951" w:history="1">
+      <w:hyperlink w:anchor="_Toc237711742" w:history="1">
         <w:r>
           <w:rPr>
             <w:rStyle w:val="Hipervnculo"/>
@@ -6007,7 +6007,7 @@
             <w:noProof/>
             <w:webHidden/>
           </w:rPr>
-          <w:instrText xml:space="preserve"> PAGEREF _Toc237709951 \h </w:instrText>
+          <w:instrText xml:space="preserve"> PAGEREF _Toc237711742 \h </w:instrText>
         </w:r>
         <w:r>
           <w:rPr>
@@ -6091,7 +6091,7 @@
         <w:pStyle w:val="Ttulo1"/>
         <w:spacing w:before="100" w:after="30"/>
       </w:pPr>
-      <w:bookmarkStart w:id="0" w:name="_Toc237709889"/>
+      <w:bookmarkStart w:id="0" w:name="_Toc237711680"/>
       <w:r>
         <w:rPr>
           <w:rFonts w:ascii="Georgia" w:hAnsi="Georgia"/>
@@ -6108,7 +6108,7 @@
         <w:pStyle w:val="Ttulo2"/>
         <w:spacing w:before="70" w:after="20"/>
       </w:pPr>
-      <w:bookmarkStart w:id="1" w:name="_Toc237709890"/>
+      <w:bookmarkStart w:id="1" w:name="_Toc237711681"/>
       <w:r>
         <w:rPr>
           <w:rFonts w:ascii="Georgia" w:hAnsi="Georgia"/>
@@ -6127,16 +6127,10 @@
         </w:rPr>
       </w:pPr>
       <w:r>
-        <w:t xml:space="preserve">Aluar Aluminio Argentino S.A.I.C. es el único productor primario de aluminio integrado en Argentina y uno de los mayores complejos industriales de Sudamérica. Fundada en 1974, la compañía opera su planta de reducción electrolítica en Puerto Madryn (Provincia del Chubut) con una capacidad instalada nominal de </w:t>
+        <w:t>Aluar Aluminio Argentino S.A.I.C. es el único productor primario de aluminio integrado en Argentina y uno de los mayores complejos industriales de Sudamérica. Fundada en 1974, la compañía opera su planta de reducción electrolítica en Puerto Madryn (Provincia del Chubut) con una capacidad instalada nominal de 460.000 toneladas anuales. Su portafolio abarca aluminio primario líquido y sólido (lingotes estándar, lingotes T, barrotes de extrusión, alambrón y placas de laminación), junto con una división de semi</w:t>
       </w:r>
       <w:r>
-        <w:rPr>
-          <w:b/>
-        </w:rPr>
-        <w:t>460.000 toneladas anuales</w:t>
-      </w:r>
-      <w:r>
-        <w:t>. Su portafolio abarca aluminio primario líquido y sólido (lingotes estándar, lingotes T, barrotes de extrusión, alambrón y placas de laminación), junto con una división de semielaborados y elaborados de mayor valor agregado (perfiles extruidos y laminados para construcción, transporte y embalaje).</w:t>
+        <w:t>elaborados y elaborados de mayor valor agregado (perfiles extruidos y laminados para construcción, transporte y embalaje).</w:t>
       </w:r>
     </w:p>
     <w:p>
@@ -6147,16 +6141,7 @@
         </w:rPr>
       </w:pPr>
       <w:r>
-        <w:t xml:space="preserve">Alrededor del </w:t>
-      </w:r>
-      <w:r>
-        <w:rPr>
-          <w:b/>
-        </w:rPr>
-        <w:t>80% del volumen físico producido se destina a la exportación</w:t>
-      </w:r>
-      <w:r>
-        <w:t xml:space="preserve"> (Estados Unidos, Brasil, Europa y Japón), liquidado en dólares estadounidenses sobre cotizaciones del London Metal Exchange (LME) más primas regionales, lo que otorga a la firma una cobertura cambiaria estructural.</w:t>
+        <w:t>Alrededor del 80% del volumen físico producido se destina a la exportación (Estados Unidos, Brasil, Europa y Japón), liquidado en dólares estadounidenses sobre cotizaciones del London Metal Exchange (LME) más primas regionales, lo que otorga a la firma una cobertura cambiaria estructural.</w:t>
       </w:r>
     </w:p>
     <w:p>
@@ -6164,7 +6149,7 @@
         <w:pStyle w:val="Ttulo2"/>
         <w:spacing w:before="70" w:after="20"/>
       </w:pPr>
-      <w:bookmarkStart w:id="2" w:name="_Toc237709891"/>
+      <w:bookmarkStart w:id="2" w:name="_Toc237711682"/>
       <w:r>
         <w:rPr>
           <w:rFonts w:ascii="Georgia" w:hAnsi="Georgia"/>
@@ -6183,43 +6168,10 @@
         </w:rPr>
       </w:pPr>
       <w:r>
-        <w:t xml:space="preserve">Según la Memoria Anual y Estados Financieros al 30-jun-2025, el capital social está integrado por </w:t>
+        <w:t xml:space="preserve">Según la Memoria Anual y Estados Financieros al 30-jun-2025, el capital social está integrado por 2.800 millones de acciones ordinarias escriturales de \1 valor nominal y un voto por acción, listadas en BYMA bajo la especie ALUA.BA. Las sociedades vinculadas a la familia Madanes (CIPAL S.A., Estancias San Javier de Catamarca S.A. y Angerona Group Trust) concentran en conjunto el 45,98% de los derechos de voto (Figura [fig:02]), conformando el grupo de control frente al 54,02% distribuido entre la ANSES-FGS </w:t>
       </w:r>
       <w:r>
-        <w:rPr>
-          <w:b/>
-        </w:rPr>
-        <w:t>2.800 millones de acciones ordinarias</w:t>
-      </w:r>
-      <w:r>
-        <w:t xml:space="preserve"> escriturales de \1 valor nominal y un voto por acción, listadas en BYMA bajo la especie </w:t>
-      </w:r>
-      <w:r>
-        <w:rPr>
-          <w:b/>
-        </w:rPr>
-        <w:t>ALUA.BA</w:t>
-      </w:r>
-      <w:r>
-        <w:t xml:space="preserve">. Las sociedades vinculadas a la familia Madanes (CIPAL S.A., Estancias San Javier de Catamarca S.A. y Angerona Group Trust) concentran en conjunto el </w:t>
-      </w:r>
-      <w:r>
-        <w:rPr>
-          <w:b/>
-        </w:rPr>
-        <w:t>45,98%</w:t>
-      </w:r>
-      <w:r>
-        <w:t xml:space="preserve"> de los derechos de voto (</w:t>
-      </w:r>
-      <w:r>
-        <w:rPr>
-          <w:b/>
-        </w:rPr>
-        <w:t>Figura [fig:02]</w:t>
-      </w:r>
-      <w:r>
-        <w:t>), conformando el grupo de control frente al 54,02% distribuido entre la ANSES-FGS (27,47%) y el capital flotante en el mercado doméstico e internacional.</w:t>
+        <w:t>(27,47%) y el capital flotante en el mercado doméstico e internacional.</w:t>
       </w:r>
     </w:p>
     <w:tbl>
@@ -6258,7 +6210,7 @@
                 <w:noProof/>
               </w:rPr>
               <w:drawing>
-                <wp:inline distT="0" distB="0" distL="0" distR="0" wp14:anchorId="245B19B7" wp14:editId="55F642D1">
+                <wp:inline distT="0" distB="0" distL="0" distR="0" wp14:anchorId="03E4C008" wp14:editId="79A79FA3">
                   <wp:extent cx="2926080" cy="1524412"/>
                   <wp:effectExtent l="0" t="0" r="0" b="0"/>
                   <wp:docPr id="1" name="Picture 1"/>
@@ -6317,7 +6269,7 @@
                 <w:noProof/>
               </w:rPr>
               <w:drawing>
-                <wp:inline distT="0" distB="0" distL="0" distR="0" wp14:anchorId="636E34C0" wp14:editId="15EA8803">
+                <wp:inline distT="0" distB="0" distL="0" distR="0" wp14:anchorId="2EA41AEA" wp14:editId="68A94FA8">
                   <wp:extent cx="2926080" cy="1437831"/>
                   <wp:effectExtent l="0" t="0" r="0" b="0"/>
                   <wp:docPr id="2" name="Picture 2"/>
@@ -6422,7 +6374,7 @@
         <w:pStyle w:val="Ttulo2"/>
         <w:spacing w:before="70" w:after="20"/>
       </w:pPr>
-      <w:bookmarkStart w:id="3" w:name="_Toc237709892"/>
+      <w:bookmarkStart w:id="3" w:name="_Toc237711683"/>
       <w:r>
         <w:rPr>
           <w:rFonts w:ascii="Georgia" w:hAnsi="Georgia"/>
@@ -6499,20 +6451,7 @@
         <w:rPr>
           <w:sz w:val="16"/>
         </w:rPr>
-        <w:t xml:space="preserve"> Con un costo en efectivo C1 de </w:t>
-      </w:r>
-      <w:r>
-        <w:rPr>
-          <w:b/>
-          <w:sz w:val="16"/>
-        </w:rPr>
-        <w:t>USD 1.680 por tonelada</w:t>
-      </w:r>
-      <w:r>
-        <w:rPr>
-          <w:sz w:val="16"/>
-        </w:rPr>
-        <w:t xml:space="preserve"> (percentil 29% de la curva de costos de la industria), Aluar se ubica entre los productores más eficientes del mundo, manteniendo márgenes operativos positivos en fases contractivas del ciclo internacional.</w:t>
+        <w:t xml:space="preserve"> Con un costo en efectivo C1 de USD 1.680 por tonelada (percentil 29% de la curva de costos de la industria), Aluar se ubica entre los productores más eficientes del mundo, manteniendo márgenes operativos positivos en fases contractivas del ciclo internacional.</w:t>
       </w:r>
     </w:p>
     <w:p>
@@ -6562,7 +6501,7 @@
         <w:pStyle w:val="Ttulo2"/>
         <w:spacing w:before="70" w:after="20"/>
       </w:pPr>
-      <w:bookmarkStart w:id="4" w:name="_Toc237709893"/>
+      <w:bookmarkStart w:id="4" w:name="_Toc237711684"/>
       <w:r>
         <w:rPr>
           <w:rFonts w:ascii="Georgia" w:hAnsi="Georgia"/>
@@ -7090,7 +7029,7 @@
         <w:pStyle w:val="Ttulo2"/>
         <w:spacing w:before="70" w:after="20"/>
       </w:pPr>
-      <w:bookmarkStart w:id="5" w:name="_Toc237709894"/>
+      <w:bookmarkStart w:id="5" w:name="_Toc237711685"/>
       <w:r>
         <w:rPr>
           <w:rFonts w:ascii="Georgia" w:hAnsi="Georgia"/>
@@ -7223,7 +7162,7 @@
         <w:pStyle w:val="Ttulo2"/>
         <w:spacing w:before="70" w:after="20"/>
       </w:pPr>
-      <w:bookmarkStart w:id="6" w:name="_Toc237709895"/>
+      <w:bookmarkStart w:id="6" w:name="_Toc237711686"/>
       <w:r>
         <w:rPr>
           <w:rFonts w:ascii="Georgia" w:hAnsi="Georgia"/>
@@ -8432,13 +8371,7 @@
         </w:rPr>
       </w:pPr>
       <w:r>
-        <w:rPr>
-          <w:b/>
-        </w:rPr>
-        <w:t>Nota.</w:t>
-      </w:r>
-      <w:r>
-        <w:t xml:space="preserve"> Cifras en USD convertidas al CCL de cierre de cada ejercicio. Deuda Neta auditada según estados financieros consolidados.</w:t>
+        <w:t>Nota. Cifras en USD convertidas al CCL de cierre de cada ejercicio. Deuda Neta auditada según estados financieros consolidados.</w:t>
       </w:r>
     </w:p>
     <w:p>
@@ -8446,7 +8379,7 @@
         <w:pStyle w:val="Ttulo1"/>
         <w:spacing w:before="100" w:after="30"/>
       </w:pPr>
-      <w:bookmarkStart w:id="7" w:name="_Toc237709896"/>
+      <w:bookmarkStart w:id="7" w:name="_Toc237711687"/>
       <w:r>
         <w:rPr>
           <w:rFonts w:ascii="Georgia" w:hAnsi="Georgia"/>
@@ -8462,7 +8395,7 @@
         <w:pStyle w:val="Ttulo2"/>
         <w:spacing w:before="70" w:after="20"/>
       </w:pPr>
-      <w:bookmarkStart w:id="8" w:name="_Toc237709897"/>
+      <w:bookmarkStart w:id="8" w:name="_Toc237711688"/>
       <w:r>
         <w:rPr>
           <w:rFonts w:ascii="Georgia" w:hAnsi="Georgia"/>
@@ -8481,25 +8414,7 @@
         </w:rPr>
       </w:pPr>
       <w:r>
-        <w:t>Las proyecciones del modelo se apoyan en el escenario de estabilización macroeconómica argentino (</w:t>
-      </w:r>
-      <w:r>
-        <w:rPr>
-          <w:b/>
-        </w:rPr>
-        <w:t>Figura [fig:03]</w:t>
-      </w:r>
-      <w:r>
-        <w:t>), con convergencia inflacionaria y reactivación gradual de la actividad industrial. La compresión del spread de riesgo soberano EMBI+ desde máximos de 2.400 pb en 2022 a 441 pb al cierre de julio de 2026 (</w:t>
-      </w:r>
-      <w:r>
-        <w:rPr>
-          <w:b/>
-        </w:rPr>
-        <w:t>Figura [fig:04]</w:t>
-      </w:r>
-      <w:r>
-        <w:t>) reduce de forma directa la tasa de descuento requerida para el capital.</w:t>
+        <w:t>Las proyecciones del modelo se apoyan en el escenario de estabilización macroeconómica argentino (Figura [fig:03]), con convergencia inflacionaria y reactivación gradual de la actividad industrial. La compresión del spread de riesgo soberano EMBI+ desde máximos de 2.400 pb en 2022 a 441 pb al cierre de julio de 2026 (Figura [fig:04]) reduce de forma directa la tasa de descuento requerida para el capital.</w:t>
       </w:r>
     </w:p>
     <w:tbl>
@@ -8538,7 +8453,7 @@
                 <w:noProof/>
               </w:rPr>
               <w:drawing>
-                <wp:inline distT="0" distB="0" distL="0" distR="0" wp14:anchorId="6170A1E5" wp14:editId="38FFC0FB">
+                <wp:inline distT="0" distB="0" distL="0" distR="0" wp14:anchorId="4261D944" wp14:editId="3ED8DB7F">
                   <wp:extent cx="2926080" cy="1426594"/>
                   <wp:effectExtent l="0" t="0" r="0" b="0"/>
                   <wp:docPr id="3" name="Picture 3"/>
@@ -8597,7 +8512,7 @@
                 <w:noProof/>
               </w:rPr>
               <w:drawing>
-                <wp:inline distT="0" distB="0" distL="0" distR="0" wp14:anchorId="469B4183" wp14:editId="4D2D20BF">
+                <wp:inline distT="0" distB="0" distL="0" distR="0" wp14:anchorId="20697027" wp14:editId="080059EB">
                   <wp:extent cx="2926080" cy="1494260"/>
                   <wp:effectExtent l="0" t="0" r="0" b="0"/>
                   <wp:docPr id="4" name="Picture 4"/>
@@ -8712,7 +8627,7 @@
         <w:pStyle w:val="Ttulo2"/>
         <w:spacing w:before="70" w:after="20"/>
       </w:pPr>
-      <w:bookmarkStart w:id="9" w:name="_Toc237709898"/>
+      <w:bookmarkStart w:id="9" w:name="_Toc237711689"/>
       <w:r>
         <w:rPr>
           <w:rFonts w:ascii="Georgia" w:hAnsi="Georgia"/>
@@ -8946,7 +8861,7 @@
         <w:pStyle w:val="Ttulo1"/>
         <w:spacing w:before="100" w:after="30"/>
       </w:pPr>
-      <w:bookmarkStart w:id="10" w:name="_Toc237709899"/>
+      <w:bookmarkStart w:id="10" w:name="_Toc237711690"/>
       <w:r>
         <w:rPr>
           <w:rFonts w:ascii="Georgia" w:hAnsi="Georgia"/>
@@ -8962,7 +8877,7 @@
         <w:pStyle w:val="Ttulo2"/>
         <w:spacing w:before="70" w:after="20"/>
       </w:pPr>
-      <w:bookmarkStart w:id="11" w:name="_Toc237709900"/>
+      <w:bookmarkStart w:id="11" w:name="_Toc237711691"/>
       <w:r>
         <w:rPr>
           <w:rFonts w:ascii="Georgia" w:hAnsi="Georgia"/>
@@ -8981,25 +8896,10 @@
         </w:rPr>
       </w:pPr>
       <w:r>
-        <w:t xml:space="preserve">Existe una relación inversa entre las cotizaciones internacionales de los metales y la fortaleza del dólar global (DXY, </w:t>
+        <w:t>Existe una relación inversa entre las cotizaciones internacionales de los metales y la fortaleza del dólar global (DXY, Figura [fig:06]). Aluar cuenta con una cobertura operativa natural: en fases de apreciación global del dólar acompañadas por debilidad del metal, las correcciones del tipo de cambio real reducen los costos fijos en pesos (salarios y servicios contratados localmente), amortiguando la presión sobre los márgenes operativos. Para el diferencial soberano, se proyecta una convergencia estocástic</w:t>
       </w:r>
       <w:r>
-        <w:rPr>
-          <w:b/>
-        </w:rPr>
-        <w:t>Figura [fig:06]</w:t>
-      </w:r>
-      <w:r>
-        <w:t>). Aluar cuenta con una cobertura operativa natural: en fases de apreciación global del dólar acompañadas por debilidad del metal, las correcciones del tipo de cambio real reducen los costos fijos en pesos (salarios y servicios contratados localmente), amortiguando la presión sobre los márgenes operativos. Para el diferencial soberano, se proyecta una convergencia estocástica autorregresiva mensual AR(1) con φ̂ = 0,7582 (</w:t>
-      </w:r>
-      <w:r>
-        <w:rPr>
-          <w:b/>
-        </w:rPr>
-        <w:t>Figura [fig:05]</w:t>
-      </w:r>
-      <w:r>
-        <w:t>).</w:t>
+        <w:t>a autorregresiva mensual AR(1) con φ̂ = 0,7582 (Figura [fig:05]).</w:t>
       </w:r>
     </w:p>
     <w:tbl>
@@ -9038,7 +8938,7 @@
                 <w:noProof/>
               </w:rPr>
               <w:drawing>
-                <wp:inline distT="0" distB="0" distL="0" distR="0" wp14:anchorId="574E1747" wp14:editId="69DFDB1A">
+                <wp:inline distT="0" distB="0" distL="0" distR="0" wp14:anchorId="1086465E" wp14:editId="0A464E42">
                   <wp:extent cx="2926080" cy="1636252"/>
                   <wp:effectExtent l="0" t="0" r="0" b="0"/>
                   <wp:docPr id="5" name="Picture 5"/>
@@ -9097,7 +8997,7 @@
                 <w:noProof/>
               </w:rPr>
               <w:drawing>
-                <wp:inline distT="0" distB="0" distL="0" distR="0" wp14:anchorId="4BE56C41" wp14:editId="3B76E476">
+                <wp:inline distT="0" distB="0" distL="0" distR="0" wp14:anchorId="4634DFBE" wp14:editId="7578447A">
                   <wp:extent cx="2926080" cy="1481181"/>
                   <wp:effectExtent l="0" t="0" r="0" b="0"/>
                   <wp:docPr id="6" name="Picture 6"/>
@@ -9212,7 +9112,7 @@
         <w:pStyle w:val="Ttulo2"/>
         <w:spacing w:before="70" w:after="20"/>
       </w:pPr>
-      <w:bookmarkStart w:id="12" w:name="_Toc237709901"/>
+      <w:bookmarkStart w:id="12" w:name="_Toc237711692"/>
       <w:r>
         <w:rPr>
           <w:rFonts w:ascii="Georgia" w:hAnsi="Georgia"/>
@@ -9243,7 +9143,7 @@
         <w:pStyle w:val="Ttulo2"/>
         <w:spacing w:before="70" w:after="20"/>
       </w:pPr>
-      <w:bookmarkStart w:id="13" w:name="_Toc237709902"/>
+      <w:bookmarkStart w:id="13" w:name="_Toc237711693"/>
       <w:r>
         <w:rPr>
           <w:rFonts w:ascii="Georgia" w:hAnsi="Georgia"/>
@@ -9262,25 +9162,7 @@
         </w:rPr>
       </w:pPr>
       <w:r>
-        <w:t xml:space="preserve">La producción primaria global está altamente concentrada en China (56% del total mundial, </w:t>
-      </w:r>
-      <w:r>
-        <w:rPr>
-          <w:b/>
-        </w:rPr>
-        <w:t>Figura [fig:07]</w:t>
-      </w:r>
-      <w:r>
-        <w:t>), cuya matriz depende predominantemente de generación térmica a carbón. Frente a los principales productores internacionales, Aluar destaca por su integración energética: el 96% de su consumo es autogenerado con un 78% de fuentes renovables (</w:t>
-      </w:r>
-      <w:r>
-        <w:rPr>
-          <w:b/>
-        </w:rPr>
-        <w:t>Figura [fig:08]</w:t>
-      </w:r>
-      <w:r>
-        <w:t>), otorgándole predictibilidad operativa y menores costos unitarios de energía.</w:t>
+        <w:t>La producción primaria global está altamente concentrada en China (56% del total mundial, Figura [fig:07]), cuya matriz depende predominantemente de generación térmica a carbón. Frente a los principales productores internacionales, Aluar destaca por su integración energética: el 96% de su consumo es autogenerado con un 78% de fuentes renovables (Figura [fig:08]), otorgándole predictibilidad operativa y menores costos unitarios de energía.</w:t>
       </w:r>
     </w:p>
     <w:tbl>
@@ -9319,7 +9201,7 @@
                 <w:noProof/>
               </w:rPr>
               <w:drawing>
-                <wp:inline distT="0" distB="0" distL="0" distR="0" wp14:anchorId="5B275D74" wp14:editId="10391C23">
+                <wp:inline distT="0" distB="0" distL="0" distR="0" wp14:anchorId="21E7EEF6" wp14:editId="59C729E8">
                   <wp:extent cx="2926080" cy="1626307"/>
                   <wp:effectExtent l="0" t="0" r="0" b="0"/>
                   <wp:docPr id="7" name="Picture 7"/>
@@ -9378,7 +9260,7 @@
                 <w:noProof/>
               </w:rPr>
               <w:drawing>
-                <wp:inline distT="0" distB="0" distL="0" distR="0" wp14:anchorId="79F91AE4" wp14:editId="64899529">
+                <wp:inline distT="0" distB="0" distL="0" distR="0" wp14:anchorId="489FA19E" wp14:editId="2F07F94D">
                   <wp:extent cx="2926080" cy="1479479"/>
                   <wp:effectExtent l="0" t="0" r="0" b="0"/>
                   <wp:docPr id="8" name="Picture 8"/>
@@ -9483,7 +9365,7 @@
         <w:pStyle w:val="Ttulo2"/>
         <w:spacing w:before="70" w:after="20"/>
       </w:pPr>
-      <w:bookmarkStart w:id="14" w:name="_Toc237709903"/>
+      <w:bookmarkStart w:id="14" w:name="_Toc237711694"/>
       <w:r>
         <w:rPr>
           <w:rFonts w:ascii="Georgia" w:hAnsi="Georgia"/>
@@ -9502,43 +9384,10 @@
         </w:rPr>
       </w:pPr>
       <w:r>
-        <w:t xml:space="preserve">En el mercado argentino, Aluar abastece el </w:t>
+        <w:t>En el mercado argentino, Aluar abastece el 60% del consumo doméstico (Figura [fig:09]), operando como formador de precios sobre la base de paridad de importación. En el plano internacional, su matriz hidráulica y eólica le permite registrar un costo en efectivo C1 de USD 1.680 por tonelada, ubicándose en el percentil 29% de la curva global de costos de fundición (Figura [fig:10]), lo que garantiza resiliencia operativa incluso en las fases bajas del ciclo de commodities. El principal riesgo de costos extern</w:t>
       </w:r>
       <w:r>
-        <w:rPr>
-          <w:b/>
-        </w:rPr>
-        <w:t>60% del consumo doméstico</w:t>
-      </w:r>
-      <w:r>
-        <w:t xml:space="preserve"> (</w:t>
-      </w:r>
-      <w:r>
-        <w:rPr>
-          <w:b/>
-        </w:rPr>
-        <w:t>Figura [fig:09]</w:t>
-      </w:r>
-      <w:r>
-        <w:t xml:space="preserve">), operando como formador de precios sobre la base de paridad de importación. En el plano internacional, su matriz hidráulica y eólica le permite registrar un costo en efectivo C1 de </w:t>
-      </w:r>
-      <w:r>
-        <w:rPr>
-          <w:b/>
-        </w:rPr>
-        <w:t>USD 1.680 por tonelada</w:t>
-      </w:r>
-      <w:r>
-        <w:t>, ubicándose en el percentil 29% de la curva global de costos de fundición (</w:t>
-      </w:r>
-      <w:r>
-        <w:rPr>
-          <w:b/>
-        </w:rPr>
-        <w:t>Figura [fig:10]</w:t>
-      </w:r>
-      <w:r>
-        <w:t>), lo que garantiza resiliencia operativa incluso en las fases bajas del ciclo de commodities. El principal riesgo de costos externos proviene de la volatilidad conjunta del PAX y fletes marítimos sobre la alúmina importada.</w:t>
+        <w:t>os proviene de la volatilidad conjunta del PAX y fletes marítimos sobre la alúmina importada.</w:t>
       </w:r>
     </w:p>
     <w:tbl>
@@ -9577,7 +9426,7 @@
                 <w:noProof/>
               </w:rPr>
               <w:drawing>
-                <wp:inline distT="0" distB="0" distL="0" distR="0" wp14:anchorId="0D2C3B50" wp14:editId="74EC1160">
+                <wp:inline distT="0" distB="0" distL="0" distR="0" wp14:anchorId="5FF3BCB6" wp14:editId="249B85BC">
                   <wp:extent cx="2926080" cy="1662311"/>
                   <wp:effectExtent l="0" t="0" r="0" b="0"/>
                   <wp:docPr id="9" name="Picture 9"/>
@@ -9636,7 +9485,7 @@
                 <w:noProof/>
               </w:rPr>
               <w:drawing>
-                <wp:inline distT="0" distB="0" distL="0" distR="0" wp14:anchorId="1F637B40" wp14:editId="467C04F7">
+                <wp:inline distT="0" distB="0" distL="0" distR="0" wp14:anchorId="7D663B2F" wp14:editId="55F97BA0">
                   <wp:extent cx="2926080" cy="1801004"/>
                   <wp:effectExtent l="0" t="0" r="0" b="0"/>
                   <wp:docPr id="10" name="Picture 10"/>
@@ -9741,7 +9590,7 @@
         <w:pStyle w:val="Ttulo1"/>
         <w:spacing w:before="100" w:after="30"/>
       </w:pPr>
-      <w:bookmarkStart w:id="15" w:name="_Toc237709904"/>
+      <w:bookmarkStart w:id="15" w:name="_Toc237711695"/>
       <w:r>
         <w:rPr>
           <w:rFonts w:ascii="Georgia" w:hAnsi="Georgia"/>
@@ -9757,7 +9606,7 @@
         <w:pStyle w:val="Ttulo2"/>
         <w:spacing w:before="70" w:after="20"/>
       </w:pPr>
-      <w:bookmarkStart w:id="16" w:name="_Toc237709905"/>
+      <w:bookmarkStart w:id="16" w:name="_Toc237711696"/>
       <w:r>
         <w:rPr>
           <w:rFonts w:ascii="Georgia" w:hAnsi="Georgia"/>
@@ -10196,7 +10045,7 @@
         <w:pStyle w:val="Ttulo2"/>
         <w:spacing w:before="70" w:after="20"/>
       </w:pPr>
-      <w:bookmarkStart w:id="17" w:name="_Toc237709906"/>
+      <w:bookmarkStart w:id="17" w:name="_Toc237711697"/>
       <w:r>
         <w:rPr>
           <w:rFonts w:ascii="Georgia" w:hAnsi="Georgia"/>
@@ -10216,16 +10065,7 @@
         </w:rPr>
       </w:pPr>
       <w:r>
-        <w:t xml:space="preserve">La reducida huella de carbono de Aluar (&lt; 4 t CO₂/t Al) frente al promedio de la industria (≈ 11 t CO₂/t) le otorga una ventaja arancelaria neta estimada en </w:t>
-      </w:r>
-      <w:r>
-        <w:rPr>
-          <w:b/>
-        </w:rPr>
-        <w:t>USD 80–120 por tonelada</w:t>
-      </w:r>
-      <w:r>
-        <w:t xml:space="preserve"> bajo el esquema CBAM de la Unión Europea frente a productores alimentados con fuentes fósiles.</w:t>
+        <w:t>La reducida huella de carbono de Aluar (&lt; 4 t CO₂/t Al) frente al promedio de la industria (≈ 11 t CO₂/t) le otorga una ventaja arancelaria neta estimada en USD 80–120 por tonelada bajo el esquema CBAM de la Unión Europea frente a productores alimentados con fuentes fósiles.</w:t>
       </w:r>
     </w:p>
     <w:p>
@@ -10233,7 +10073,7 @@
         <w:pStyle w:val="Ttulo1"/>
         <w:spacing w:before="100" w:after="30"/>
       </w:pPr>
-      <w:bookmarkStart w:id="18" w:name="_Toc237709907"/>
+      <w:bookmarkStart w:id="18" w:name="_Toc237711698"/>
       <w:r>
         <w:rPr>
           <w:rFonts w:ascii="Georgia" w:hAnsi="Georgia"/>
@@ -10249,7 +10089,7 @@
         <w:pStyle w:val="Ttulo2"/>
         <w:spacing w:before="70" w:after="20"/>
       </w:pPr>
-      <w:bookmarkStart w:id="19" w:name="_Toc237709908"/>
+      <w:bookmarkStart w:id="19" w:name="_Toc237711699"/>
       <w:r>
         <w:rPr>
           <w:rFonts w:ascii="Georgia" w:hAnsi="Georgia"/>
@@ -10268,43 +10108,7 @@
         </w:rPr>
       </w:pPr>
       <w:r>
-        <w:t xml:space="preserve">Aluar cotiza a un múltiplo EV/EBITDA de los últimos doce meses de </w:t>
-      </w:r>
-      <w:r>
-        <w:rPr>
-          <w:b/>
-        </w:rPr>
-        <w:t>13,4x</w:t>
-      </w:r>
-      <w:r>
-        <w:t xml:space="preserve"> sobre el resultado deprimido de 2025 (USD 163,3 MM, </w:t>
-      </w:r>
-      <w:r>
-        <w:rPr>
-          <w:b/>
-        </w:rPr>
-        <w:t>Figura [fig:11]</w:t>
-      </w:r>
-      <w:r>
-        <w:t>). Al normalizar la proyección sobre el EBITDA estimado de 2026e (</w:t>
-      </w:r>
-      <w:r>
-        <w:rPr>
-          <w:b/>
-        </w:rPr>
-        <w:t>USD 391,2 MM</w:t>
-      </w:r>
-      <w:r>
-        <w:t xml:space="preserve">), el múltiplo implícito desciende a </w:t>
-      </w:r>
-      <w:r>
-        <w:rPr>
-          <w:b/>
-        </w:rPr>
-        <w:t>5,2x EV/EBITDA proyectado</w:t>
-      </w:r>
-      <w:r>
-        <w:t>, situando a la firma con un descuento del 20%–25% frente a comparables internacionales como Alcoa (8,1x) y Norsk Hydro (6,5x).</w:t>
+        <w:t>Aluar cotiza a un múltiplo EV/EBITDA de los últimos doce meses de 13,4x sobre el resultado deprimido de 2025 (USD 163,3 MM, Figura [fig:11]). Al normalizar la proyección sobre el EBITDA estimado de 2026e (USD 391,2 MM), el múltiplo implícito desciende a 5,2x EV/EBITDA proyectado, situando a la firma con un descuento del 20%–25% frente a comparables internacionales como Alcoa (8,1x) y Norsk Hydro (6,5x).</w:t>
       </w:r>
     </w:p>
     <w:p>
@@ -10312,7 +10116,7 @@
         <w:pStyle w:val="Ttulo2"/>
         <w:spacing w:before="70" w:after="20"/>
       </w:pPr>
-      <w:bookmarkStart w:id="20" w:name="_Toc237709909"/>
+      <w:bookmarkStart w:id="20" w:name="_Toc237711700"/>
       <w:r>
         <w:rPr>
           <w:rFonts w:ascii="Georgia" w:hAnsi="Georgia"/>
@@ -10331,25 +10135,7 @@
         </w:rPr>
       </w:pPr>
       <w:r>
-        <w:t xml:space="preserve">El desembolso en bienes de uso durante 2025 (USD 243,9 MM) elevó la Deuda Neta a USD 525,8 MM (3,22x EBITDA). Con la moderación de inversiones hacia niveles de mantenimiento (≈ USD 90–103 MM/año), el flujo libre de caja proyectado permite recomprimir la Deuda Neta / EBITDA a </w:t>
-      </w:r>
-      <w:r>
-        <w:rPr>
-          <w:b/>
-        </w:rPr>
-        <w:t>&lt;1,0x hacia 2028e</w:t>
-      </w:r>
-      <w:r>
-        <w:t xml:space="preserve"> (</w:t>
-      </w:r>
-      <w:r>
-        <w:rPr>
-          <w:b/>
-        </w:rPr>
-        <w:t>Figura [fig:12]</w:t>
-      </w:r>
-      <w:r>
-        <w:t>).</w:t>
+        <w:t>El desembolso en bienes de uso durante 2025 (USD 243,9 MM) elevó la Deuda Neta a USD 525,8 MM (3,22x EBITDA). Con la moderación de inversiones hacia niveles de mantenimiento (≈ USD 90–103 MM/año), el flujo libre de caja proyectado permite recomprimir la Deuda Neta / EBITDA a &lt;1,0x hacia 2028e (Figura [fig:12]).</w:t>
       </w:r>
     </w:p>
     <w:tbl>
@@ -10388,7 +10174,7 @@
                 <w:noProof/>
               </w:rPr>
               <w:drawing>
-                <wp:inline distT="0" distB="0" distL="0" distR="0" wp14:anchorId="1ED752D8" wp14:editId="4591FD83">
+                <wp:inline distT="0" distB="0" distL="0" distR="0" wp14:anchorId="5F088536" wp14:editId="64EB4B85">
                   <wp:extent cx="2926080" cy="1714660"/>
                   <wp:effectExtent l="0" t="0" r="0" b="0"/>
                   <wp:docPr id="11" name="Picture 11"/>
@@ -10447,7 +10233,7 @@
                 <w:noProof/>
               </w:rPr>
               <w:drawing>
-                <wp:inline distT="0" distB="0" distL="0" distR="0" wp14:anchorId="0CB76AA7" wp14:editId="738336E5">
+                <wp:inline distT="0" distB="0" distL="0" distR="0" wp14:anchorId="31BD2487" wp14:editId="402F2882">
                   <wp:extent cx="2926080" cy="1558188"/>
                   <wp:effectExtent l="0" t="0" r="0" b="0"/>
                   <wp:docPr id="12" name="Picture 12"/>
@@ -11417,7 +11203,7 @@
         <w:pStyle w:val="Ttulo1"/>
         <w:spacing w:before="100" w:after="30"/>
       </w:pPr>
-      <w:bookmarkStart w:id="21" w:name="_Toc237709910"/>
+      <w:bookmarkStart w:id="21" w:name="_Toc237711701"/>
       <w:r>
         <w:rPr>
           <w:rFonts w:ascii="Georgia" w:hAnsi="Georgia"/>
@@ -11434,7 +11220,7 @@
         <w:pStyle w:val="Ttulo2"/>
         <w:spacing w:before="70" w:after="20"/>
       </w:pPr>
-      <w:bookmarkStart w:id="22" w:name="_Toc237709911"/>
+      <w:bookmarkStart w:id="22" w:name="_Toc237711702"/>
       <w:r>
         <w:rPr>
           <w:rFonts w:ascii="Georgia" w:hAnsi="Georgia"/>
@@ -11526,7 +11312,7 @@
         <w:pStyle w:val="Ttulo2"/>
         <w:spacing w:before="70" w:after="20"/>
       </w:pPr>
-      <w:bookmarkStart w:id="23" w:name="_Toc237709912"/>
+      <w:bookmarkStart w:id="23" w:name="_Toc237711703"/>
       <w:r>
         <w:rPr>
           <w:rFonts w:ascii="Georgia" w:hAnsi="Georgia"/>
@@ -11757,7 +11543,7 @@
                 <w:noProof/>
               </w:rPr>
               <w:drawing>
-                <wp:inline distT="0" distB="0" distL="0" distR="0" wp14:anchorId="0BDDF22B" wp14:editId="5CA02294">
+                <wp:inline distT="0" distB="0" distL="0" distR="0" wp14:anchorId="6C31D86B" wp14:editId="4F486EDD">
                   <wp:extent cx="2926080" cy="1540391"/>
                   <wp:effectExtent l="0" t="0" r="0" b="0"/>
                   <wp:docPr id="13" name="Picture 13"/>
@@ -11816,7 +11602,7 @@
                 <w:noProof/>
               </w:rPr>
               <w:drawing>
-                <wp:inline distT="0" distB="0" distL="0" distR="0" wp14:anchorId="065B6222" wp14:editId="7AD06812">
+                <wp:inline distT="0" distB="0" distL="0" distR="0" wp14:anchorId="28D20701" wp14:editId="1C63685D">
                   <wp:extent cx="2926080" cy="1658038"/>
                   <wp:effectExtent l="0" t="0" r="0" b="0"/>
                   <wp:docPr id="14" name="Picture 14"/>
@@ -11921,7 +11707,7 @@
         <w:pStyle w:val="Ttulo2"/>
         <w:spacing w:before="70" w:after="20"/>
       </w:pPr>
-      <w:bookmarkStart w:id="24" w:name="_Toc237709913"/>
+      <w:bookmarkStart w:id="24" w:name="_Toc237711704"/>
       <w:r>
         <w:rPr>
           <w:rFonts w:ascii="Georgia" w:hAnsi="Georgia"/>
@@ -12849,7 +12635,7 @@
         <w:pStyle w:val="Ttulo1"/>
         <w:spacing w:before="100" w:after="30"/>
       </w:pPr>
-      <w:bookmarkStart w:id="25" w:name="_Toc237709914"/>
+      <w:bookmarkStart w:id="25" w:name="_Toc237711705"/>
       <w:r>
         <w:rPr>
           <w:rFonts w:ascii="Georgia" w:hAnsi="Georgia"/>
@@ -12865,7 +12651,7 @@
         <w:pStyle w:val="Ttulo2"/>
         <w:spacing w:before="70" w:after="20"/>
       </w:pPr>
-      <w:bookmarkStart w:id="26" w:name="_Toc237709915"/>
+      <w:bookmarkStart w:id="26" w:name="_Toc237711706"/>
       <w:r>
         <w:rPr>
           <w:rFonts w:ascii="Georgia" w:hAnsi="Georgia"/>
@@ -14454,7 +14240,7 @@
         <w:pStyle w:val="Ttulo2"/>
         <w:spacing w:before="70" w:after="20"/>
       </w:pPr>
-      <w:bookmarkStart w:id="27" w:name="_Toc237709916"/>
+      <w:bookmarkStart w:id="27" w:name="_Toc237711707"/>
       <w:r>
         <w:rPr>
           <w:rFonts w:ascii="Georgia" w:hAnsi="Georgia"/>
@@ -14546,20 +14332,7 @@
         <w:rPr>
           <w:sz w:val="16"/>
         </w:rPr>
-        <w:t xml:space="preserve"> Asumiendo una tasa de reinversión implícita RR = g / WACC = 2,0% / 7,06% = 28,3%, el flujo terminal se ajusta a NOPAT × (1 - RR) = USD 97,1 MM, arrojando un precio objetivo de </w:t>
-      </w:r>
-      <w:r>
-        <w:rPr>
-          <w:b/>
-          <w:sz w:val="16"/>
-        </w:rPr>
-        <w:t>ARS 993,00</w:t>
-      </w:r>
-      <w:r>
-        <w:rPr>
-          <w:sz w:val="16"/>
-        </w:rPr>
-        <w:t>, que se adopta como cota conservadora de control.</w:t>
+        <w:t xml:space="preserve"> Asumiendo una tasa de reinversión implícita RR = g / WACC = 2,0% / 7,06% = 28,3%, el flujo terminal se ajusta a NOPAT × (1 - RR) = USD 97,1 MM, arrojando un precio objetivo de ARS 993,00, que se adopta como cota conservadora de control.</w:t>
       </w:r>
     </w:p>
     <w:p>
@@ -14577,7 +14350,7 @@
         <w:pStyle w:val="Ttulo1"/>
         <w:spacing w:before="100" w:after="30"/>
       </w:pPr>
-      <w:bookmarkStart w:id="28" w:name="_Toc237709917"/>
+      <w:bookmarkStart w:id="28" w:name="_Toc237711708"/>
       <w:r>
         <w:rPr>
           <w:rFonts w:ascii="Georgia" w:hAnsi="Georgia"/>
@@ -14594,7 +14367,7 @@
         <w:pStyle w:val="Ttulo2"/>
         <w:spacing w:before="70" w:after="20"/>
       </w:pPr>
-      <w:bookmarkStart w:id="29" w:name="_Toc237709918"/>
+      <w:bookmarkStart w:id="29" w:name="_Toc237711709"/>
       <w:r>
         <w:rPr>
           <w:rFonts w:ascii="Georgia" w:hAnsi="Georgia"/>
@@ -14613,43 +14386,7 @@
         </w:rPr>
       </w:pPr>
       <w:r>
-        <w:t xml:space="preserve">El Enterprise Value fundamental asciende a </w:t>
-      </w:r>
-      <w:r>
-        <w:rPr>
-          <w:b/>
-        </w:rPr>
-        <w:t>USD 2.640 MM</w:t>
-      </w:r>
-      <w:r>
-        <w:t xml:space="preserve"> (</w:t>
-      </w:r>
-      <w:r>
-        <w:rPr>
-          <w:b/>
-        </w:rPr>
-        <w:t>Figura [fig:15]</w:t>
-      </w:r>
-      <w:r>
-        <w:t xml:space="preserve">). Los flujos de fondos explícitos (2026e–2030e) aportan USD 563 MM (21,3% del EV), mientras que el Valor Terminal representa USD 2.077 MM (78,7% del EV), reflejando la vida útil indefinida de los activos de fundición. Deduciendo la Deuda Neta ajustada de USD 456,0 MM, se obtiene un </w:t>
-      </w:r>
-      <w:r>
-        <w:rPr>
-          <w:b/>
-        </w:rPr>
-        <w:t>Equity Value de USD 2.184 MM</w:t>
-      </w:r>
-      <w:r>
-        <w:t xml:space="preserve">, equivalente a </w:t>
-      </w:r>
-      <w:r>
-        <w:rPr>
-          <w:b/>
-        </w:rPr>
-        <w:t>ARS 1.236,00 por acción</w:t>
-      </w:r>
-      <w:r>
-        <w:t xml:space="preserve"> al tipo de cambio CCL de 1.584,25.</w:t>
+        <w:t>El Enterprise Value fundamental asciende a USD 2.640 MM (Figura [fig:15]). Los flujos de fondos explícitos (2026e–2030e) aportan USD 563 MM (21,3% del EV), mientras que el Valor Terminal representa USD 2.077 MM (78,7% del EV), reflejando la vida útil indefinida de los activos de fundición. Deduciendo la Deuda Neta ajustada de USD 456,0 MM, se obtiene un Equity Value de USD 2.184 MM, equivalente a ARS 1.236,00 por acción al tipo de cambio CCL de 1.584,25.</w:t>
       </w:r>
     </w:p>
     <w:p>
@@ -14657,7 +14394,7 @@
         <w:pStyle w:val="Ttulo2"/>
         <w:spacing w:before="70" w:after="20"/>
       </w:pPr>
-      <w:bookmarkStart w:id="30" w:name="_Toc237709919"/>
+      <w:bookmarkStart w:id="30" w:name="_Toc237711710"/>
       <w:r>
         <w:rPr>
           <w:rFonts w:ascii="Georgia" w:hAnsi="Georgia"/>
@@ -14676,25 +14413,7 @@
         </w:rPr>
       </w:pPr>
       <w:r>
-        <w:t>El Ciclo de Conversión de Efectivo (</w:t>
-      </w:r>
-      <w:r>
-        <w:rPr>
-          <w:b/>
-        </w:rPr>
-        <w:t>Figura [fig:16]</w:t>
-      </w:r>
-      <w:r>
-        <w:t xml:space="preserve">) se comprime desde 79 días en 2023 a </w:t>
-      </w:r>
-      <w:r>
-        <w:rPr>
-          <w:b/>
-        </w:rPr>
-        <w:t>64 días proyectados</w:t>
-      </w:r>
-      <w:r>
-        <w:t>, producto de la normalización en días de inventario (DIO) y cobranza (DSO), favoreciendo la liquidez para el servicio de pasivos.</w:t>
+        <w:t>El Ciclo de Conversión de Efectivo (Figura [fig:16]) se comprime desde 79 días en 2023 a 64 días proyectados, producto de la normalización en días de inventario (DIO) y cobranza (DSO), favoreciendo la liquidez para el servicio de pasivos.</w:t>
       </w:r>
     </w:p>
     <w:tbl>
@@ -14733,7 +14452,7 @@
                 <w:noProof/>
               </w:rPr>
               <w:drawing>
-                <wp:inline distT="0" distB="0" distL="0" distR="0" wp14:anchorId="283583CF" wp14:editId="280E6D0C">
+                <wp:inline distT="0" distB="0" distL="0" distR="0" wp14:anchorId="2CA777B3" wp14:editId="2FA7E58B">
                   <wp:extent cx="2926080" cy="1534596"/>
                   <wp:effectExtent l="0" t="0" r="0" b="0"/>
                   <wp:docPr id="15" name="Picture 15"/>
@@ -14792,7 +14511,7 @@
                 <w:noProof/>
               </w:rPr>
               <w:drawing>
-                <wp:inline distT="0" distB="0" distL="0" distR="0" wp14:anchorId="4C7A3ED3" wp14:editId="08C8F9D9">
+                <wp:inline distT="0" distB="0" distL="0" distR="0" wp14:anchorId="571DE554" wp14:editId="30F3AD92">
                   <wp:extent cx="2926080" cy="1680519"/>
                   <wp:effectExtent l="0" t="0" r="0" b="0"/>
                   <wp:docPr id="16" name="Picture 16"/>
@@ -14900,13 +14619,7 @@
         </w:rPr>
       </w:pPr>
       <w:r>
-        <w:rPr>
-          <w:b/>
-        </w:rPr>
-        <w:t>Nota de conciliación de deuda.</w:t>
-      </w:r>
-      <w:r>
-        <w:t xml:space="preserve"> La Deuda Neta contable a junio-2025 es de USD 525,8 MM (Deuda USD 594,9 MM menos Caja USD 69,2 MM). En el puente de valuación se deduce la Deuda Neta ajustada de USD 456,0 MM al inicio de las proyecciones 2026E, neta de créditos no operativos y amortizaciones del período.</w:t>
+        <w:t>Nota de conciliación de deuda. La Deuda Neta contable a junio-2025 es de USD 525,8 MM (Deuda USD 594,9 MM menos Caja USD 69,2 MM). En el puente de valuación se deduce la Deuda Neta ajustada de USD 456,0 MM al inicio de las proyecciones 2026E, neta de créditos no operativos y amortizaciones del período.</w:t>
       </w:r>
     </w:p>
     <w:p>
@@ -14914,7 +14627,7 @@
         <w:pStyle w:val="Ttulo1"/>
         <w:spacing w:before="100" w:after="30"/>
       </w:pPr>
-      <w:bookmarkStart w:id="31" w:name="_Toc237709920"/>
+      <w:bookmarkStart w:id="31" w:name="_Toc237711711"/>
       <w:r>
         <w:rPr>
           <w:rFonts w:ascii="Georgia" w:hAnsi="Georgia"/>
@@ -14930,7 +14643,7 @@
         <w:pStyle w:val="Ttulo2"/>
         <w:spacing w:before="70" w:after="20"/>
       </w:pPr>
-      <w:bookmarkStart w:id="32" w:name="_Toc237709921"/>
+      <w:bookmarkStart w:id="32" w:name="_Toc237711712"/>
       <w:r>
         <w:rPr>
           <w:rFonts w:ascii="Georgia" w:hAnsi="Georgia"/>
@@ -15977,7 +15690,7 @@
         <w:pStyle w:val="Ttulo2"/>
         <w:spacing w:before="70" w:after="20"/>
       </w:pPr>
-      <w:bookmarkStart w:id="33" w:name="_Toc237709922"/>
+      <w:bookmarkStart w:id="33" w:name="_Toc237711713"/>
       <w:r>
         <w:rPr>
           <w:rFonts w:ascii="Georgia" w:hAnsi="Georgia"/>
@@ -16138,7 +15851,7 @@
         <w:pStyle w:val="Ttulo2"/>
         <w:spacing w:before="70" w:after="20"/>
       </w:pPr>
-      <w:bookmarkStart w:id="34" w:name="_Toc237709923"/>
+      <w:bookmarkStart w:id="34" w:name="_Toc237711714"/>
       <w:r>
         <w:rPr>
           <w:rFonts w:ascii="Georgia" w:hAnsi="Georgia"/>
@@ -16165,7 +15878,7 @@
         <w:pStyle w:val="Ttulo1"/>
         <w:spacing w:before="100" w:after="30"/>
       </w:pPr>
-      <w:bookmarkStart w:id="35" w:name="_Toc237709924"/>
+      <w:bookmarkStart w:id="35" w:name="_Toc237711715"/>
       <w:r>
         <w:rPr>
           <w:rFonts w:ascii="Georgia" w:hAnsi="Georgia"/>
@@ -16181,7 +15894,7 @@
         <w:pStyle w:val="Ttulo2"/>
         <w:spacing w:before="70" w:after="20"/>
       </w:pPr>
-      <w:bookmarkStart w:id="36" w:name="_Toc237709925"/>
+      <w:bookmarkStart w:id="36" w:name="_Toc237711716"/>
       <w:r>
         <w:rPr>
           <w:rFonts w:ascii="Georgia" w:hAnsi="Georgia"/>
@@ -16200,70 +15913,10 @@
         </w:rPr>
       </w:pPr>
       <w:r>
-        <w:t xml:space="preserve">El análisis de ratios auditados (2020–2025) demuestra la solidez de Aluar en cuatro dimensiones: </w:t>
+        <w:t xml:space="preserve">El análisis de ratios auditados (2020–2025) demuestra la solidez de Aluar en cuatro dimensiones: 1) Rentabilidad (ROIC y Márgenes): Margen EBITDA promedió 20,1% (pico del 32,0% en 2022) y el ROIC cerró en 3,52% en 2025 por la inmovilización de USD 243,9 MM en PEAL V, normalizándose a 7,06% terminal; 2) Solvencia y Endeudamiento: Deuda Neta / EBITDA de 3,22x en el pico de inversión, con cobertura de intereses de 3,53x (EBIT/Intereses) y Deuda Total / PN de 0,59x, asegurando el servicio de deuda; 3) Liquidez </w:t>
       </w:r>
       <w:r>
-        <w:rPr>
-          <w:b/>
-        </w:rPr>
-        <w:t>1) Rentabilidad (ROIC y Márgenes):</w:t>
-      </w:r>
-      <w:r>
-        <w:t xml:space="preserve"> Margen EBITDA promedió 20,1% (pico del 32,0% en 2022) y el ROIC cerró en 3,52% en 2025 por la inmovilización de USD 243,9 MM en PEAL V, normalizándose a 7,06% terminal; </w:t>
-      </w:r>
-      <w:r>
-        <w:rPr>
-          <w:b/>
-        </w:rPr>
-        <w:t>2) Solvencia y Endeudamiento:</w:t>
-      </w:r>
-      <w:r>
-        <w:t xml:space="preserve"> Deuda Neta / EBITDA de 3,22x en el pico de inversión, con cobertura de intereses de </w:t>
-      </w:r>
-      <w:r>
-        <w:rPr>
-          <w:b/>
-        </w:rPr>
-        <w:t>3,53x</w:t>
-      </w:r>
-      <w:r>
-        <w:t xml:space="preserve"> (EBIT/Intereses) y Deuda Total / PN de 0,59x, asegurando el servicio de deuda; </w:t>
-      </w:r>
-      <w:r>
-        <w:rPr>
-          <w:b/>
-        </w:rPr>
-        <w:t>3) Liquidez Estructural:</w:t>
-      </w:r>
-      <w:r>
-        <w:t xml:space="preserve"> Liquidez Corriente de </w:t>
-      </w:r>
-      <w:r>
-        <w:rPr>
-          <w:b/>
-        </w:rPr>
-        <w:t>2,44x</w:t>
-      </w:r>
-      <w:r>
-        <w:t xml:space="preserve"> (Prueba Ácida 1,42x), asegurando la compra de alúmina de ultramar; y </w:t>
-      </w:r>
-      <w:r>
-        <w:rPr>
-          <w:b/>
-        </w:rPr>
-        <w:t>4) Eficiencia Operativa:</w:t>
-      </w:r>
-      <w:r>
-        <w:t xml:space="preserve"> Ciclo de Conversión de Efectivo en </w:t>
-      </w:r>
-      <w:r>
-        <w:rPr>
-          <w:b/>
-        </w:rPr>
-        <w:t>64 días</w:t>
-      </w:r>
-      <w:r>
-        <w:t xml:space="preserve"> (DIO = 120, DSO = 45, DPO = 101), optimizando el capital de trabajo.</w:t>
+        <w:t>Estructural: Liquidez Corriente de 2,44x (Prueba Ácida 1,42x), asegurando la compra de alúmina de ultramar; y 4) Eficiencia Operativa: Ciclo de Conversión de Efectivo en 64 días (DIO = 120, DSO = 45, DPO = 101), optimizando el capital de trabajo.</w:t>
       </w:r>
     </w:p>
     <w:p>
@@ -19168,7 +18821,7 @@
         <w:pStyle w:val="Ttulo1"/>
         <w:spacing w:before="100" w:after="30"/>
       </w:pPr>
-      <w:bookmarkStart w:id="37" w:name="_Toc237709926"/>
+      <w:bookmarkStart w:id="37" w:name="_Toc237711717"/>
       <w:r>
         <w:rPr>
           <w:rFonts w:ascii="Georgia" w:hAnsi="Georgia"/>
@@ -19185,7 +18838,7 @@
         <w:pStyle w:val="Ttulo2"/>
         <w:spacing w:before="70" w:after="20"/>
       </w:pPr>
-      <w:bookmarkStart w:id="38" w:name="_Toc237709927"/>
+      <w:bookmarkStart w:id="38" w:name="_Toc237711718"/>
       <w:r>
         <w:rPr>
           <w:rFonts w:ascii="Georgia" w:hAnsi="Georgia"/>
@@ -19320,16 +18973,7 @@
         </w:rPr>
       </w:pPr>
       <w:r>
-        <w:t xml:space="preserve">Aportando un valor aditivo de </w:t>
-      </w:r>
-      <w:r>
-        <w:rPr>
-          <w:b/>
-        </w:rPr>
-        <w:t>+ARS 19,60 por acción</w:t>
-      </w:r>
-      <w:r>
-        <w:t xml:space="preserve"> (+USD 0,01).</w:t>
+        <w:t>Aportando un valor aditivo de +ARS 19,60 por acción (+USD 0,01).</w:t>
       </w:r>
     </w:p>
     <w:p>
@@ -19371,20 +19015,7 @@
         <w:rPr>
           <w:sz w:val="16"/>
         </w:rPr>
-        <w:t xml:space="preserve"> por acción (USD 0,79, </w:t>
-      </w:r>
-      <w:r>
-        <w:rPr>
-          <w:b/>
-          <w:sz w:val="16"/>
-        </w:rPr>
-        <w:t>+27,8% de retorno esperado</w:t>
-      </w:r>
-      <w:r>
-        <w:rPr>
-          <w:sz w:val="16"/>
-        </w:rPr>
-        <w:t>).</w:t>
+        <w:t xml:space="preserve"> por acción (USD 0,79, +27,8% de retorno esperado).</w:t>
       </w:r>
     </w:p>
     <w:p>
@@ -19392,7 +19023,7 @@
         <w:pStyle w:val="Ttulo2"/>
         <w:spacing w:before="70" w:after="20"/>
       </w:pPr>
-      <w:bookmarkStart w:id="39" w:name="_Toc237709928"/>
+      <w:bookmarkStart w:id="39" w:name="_Toc237711719"/>
       <w:r>
         <w:rPr>
           <w:rFonts w:ascii="Georgia" w:hAnsi="Georgia"/>
@@ -19411,16 +19042,7 @@
         </w:rPr>
       </w:pPr>
       <w:r>
-        <w:t>En un escenario de tensión macroeconómica donde el EMBI+ repunta a 2.400 pb, el WACC asciende a 13,21% (+615 pb) y el precio objetivo se retrae a ARS 237,00 (</w:t>
-      </w:r>
-      <w:r>
-        <w:rPr>
-          <w:b/>
-        </w:rPr>
-        <w:t>Figura [fig:17]</w:t>
-      </w:r>
-      <w:r>
-        <w:t>).</w:t>
+        <w:t>En un escenario de tensión macroeconómica donde el EMBI+ repunta a 2.400 pb, el WACC asciende a 13,21% (+615 pb) y el precio objetivo se retrae a ARS 237,00 (Figura [fig:17]).</w:t>
       </w:r>
     </w:p>
     <w:tbl>
@@ -19459,7 +19081,7 @@
                 <w:noProof/>
               </w:rPr>
               <w:drawing>
-                <wp:inline distT="0" distB="0" distL="0" distR="0" wp14:anchorId="2125C177" wp14:editId="407BBE95">
+                <wp:inline distT="0" distB="0" distL="0" distR="0" wp14:anchorId="0F567CA7" wp14:editId="03F8D881">
                   <wp:extent cx="2926080" cy="1626569"/>
                   <wp:effectExtent l="0" t="0" r="0" b="0"/>
                   <wp:docPr id="17" name="Picture 17"/>
@@ -19518,7 +19140,7 @@
                 <w:noProof/>
               </w:rPr>
               <w:drawing>
-                <wp:inline distT="0" distB="0" distL="0" distR="0" wp14:anchorId="664B377D" wp14:editId="6E9C9CAF">
+                <wp:inline distT="0" distB="0" distL="0" distR="0" wp14:anchorId="7C968B6D" wp14:editId="366FC823">
                   <wp:extent cx="2926080" cy="1691675"/>
                   <wp:effectExtent l="0" t="0" r="0" b="0"/>
                   <wp:docPr id="18" name="Picture 18"/>
@@ -19623,7 +19245,7 @@
         <w:pStyle w:val="Ttulo2"/>
         <w:spacing w:before="70" w:after="20"/>
       </w:pPr>
-      <w:bookmarkStart w:id="40" w:name="_Toc237709929"/>
+      <w:bookmarkStart w:id="40" w:name="_Toc237711720"/>
       <w:r>
         <w:rPr>
           <w:rFonts w:ascii="Georgia" w:hAnsi="Georgia"/>
@@ -20252,7 +19874,7 @@
         <w:pStyle w:val="Ttulo1"/>
         <w:spacing w:before="100" w:after="30"/>
       </w:pPr>
-      <w:bookmarkStart w:id="41" w:name="_Toc237709930"/>
+      <w:bookmarkStart w:id="41" w:name="_Toc237711721"/>
       <w:r>
         <w:rPr>
           <w:rFonts w:ascii="Georgia" w:hAnsi="Georgia"/>
@@ -20268,7 +19890,7 @@
         <w:pStyle w:val="Ttulo2"/>
         <w:spacing w:before="70" w:after="20"/>
       </w:pPr>
-      <w:bookmarkStart w:id="42" w:name="_Toc237709931"/>
+      <w:bookmarkStart w:id="42" w:name="_Toc237711722"/>
       <w:r>
         <w:rPr>
           <w:rFonts w:ascii="Georgia" w:hAnsi="Georgia"/>
@@ -20287,16 +19909,7 @@
         </w:rPr>
       </w:pPr>
       <w:r>
-        <w:t>La matriz bidimensional (</w:t>
-      </w:r>
-      <w:r>
-        <w:rPr>
-          <w:b/>
-        </w:rPr>
-        <w:t>Figura [fig:19]</w:t>
-      </w:r>
-      <w:r>
-        <w:t>) confirma que la recomendación COMPRAR se mantiene válida para cualquier tasa WACC inferior a 8,0% con tasas de crecimiento terminal g ≥ 1,5%.</w:t>
+        <w:t>La matriz bidimensional (Figura [fig:19]) confirma que la recomendación COMPRAR se mantiene válida para cualquier tasa WACC inferior a 8,0% con tasas de crecimiento terminal g ≥ 1,5%.</w:t>
       </w:r>
     </w:p>
     <w:tbl>
@@ -20335,7 +19948,7 @@
                 <w:noProof/>
               </w:rPr>
               <w:drawing>
-                <wp:inline distT="0" distB="0" distL="0" distR="0" wp14:anchorId="0933E375" wp14:editId="26A9B8FA">
+                <wp:inline distT="0" distB="0" distL="0" distR="0" wp14:anchorId="795DC426" wp14:editId="1D3AD30D">
                   <wp:extent cx="2926080" cy="1495195"/>
                   <wp:effectExtent l="0" t="0" r="0" b="0"/>
                   <wp:docPr id="19" name="Picture 19"/>
@@ -20394,7 +20007,7 @@
                 <w:noProof/>
               </w:rPr>
               <w:drawing>
-                <wp:inline distT="0" distB="0" distL="0" distR="0" wp14:anchorId="582A0E82" wp14:editId="607B7A33">
+                <wp:inline distT="0" distB="0" distL="0" distR="0" wp14:anchorId="74BF6D44" wp14:editId="6ECFB7D8">
                   <wp:extent cx="2926080" cy="1682608"/>
                   <wp:effectExtent l="0" t="0" r="0" b="0"/>
                   <wp:docPr id="20" name="Picture 20"/>
@@ -21529,7 +21142,7 @@
         <w:pStyle w:val="Ttulo1"/>
         <w:spacing w:before="100" w:after="30"/>
       </w:pPr>
-      <w:bookmarkStart w:id="43" w:name="_Toc237709932"/>
+      <w:bookmarkStart w:id="43" w:name="_Toc237711723"/>
       <w:r>
         <w:rPr>
           <w:rFonts w:ascii="Georgia" w:hAnsi="Georgia"/>
@@ -21546,7 +21159,7 @@
         <w:pStyle w:val="Ttulo2"/>
         <w:spacing w:before="70" w:after="20"/>
       </w:pPr>
-      <w:bookmarkStart w:id="44" w:name="_Toc237709933"/>
+      <w:bookmarkStart w:id="44" w:name="_Toc237711724"/>
       <w:r>
         <w:rPr>
           <w:rFonts w:ascii="Georgia" w:hAnsi="Georgia"/>
@@ -21565,16 +21178,7 @@
         </w:rPr>
       </w:pPr>
       <w:r>
-        <w:t xml:space="preserve">La simulación de Monte Carlo con 20.000 iteraciones e innovaciones con colas pesadas t-Student (ν = 4,2, </w:t>
-      </w:r>
-      <w:r>
-        <w:rPr>
-          <w:b/>
-        </w:rPr>
-        <w:t>Figura [fig:20]</w:t>
-      </w:r>
-      <w:r>
-        <w:t>) aplica el factor de corrección √((ν-2 / ν)):</w:t>
+        <w:t>La simulación de Monte Carlo con 20.000 iteraciones e innovaciones con colas pesadas t-Student (ν = 4,2, Figura [fig:20]) aplica el factor de corrección √((ν-2 / ν)):</w:t>
       </w:r>
     </w:p>
     <w:p>
@@ -21602,34 +21206,7 @@
         </w:rPr>
       </w:pPr>
       <w:r>
-        <w:t xml:space="preserve">Arroja una mediana de </w:t>
-      </w:r>
-      <w:r>
-        <w:rPr>
-          <w:b/>
-        </w:rPr>
-        <w:t>ARS 1.237</w:t>
-      </w:r>
-      <w:r>
-        <w:t xml:space="preserve"> y un intervalo de confianza P5–P95 de </w:t>
-      </w:r>
-      <w:r>
-        <w:rPr>
-          <w:b/>
-        </w:rPr>
-        <w:t>ARS 844 a ARS 1.737</w:t>
-      </w:r>
-      <w:r>
-        <w:t xml:space="preserve">, con un </w:t>
-      </w:r>
-      <w:r>
-        <w:rPr>
-          <w:b/>
-        </w:rPr>
-        <w:t>85,2% de probabilidad empírica de retorno positivo</w:t>
-      </w:r>
-      <w:r>
-        <w:t xml:space="preserve"> frente a la cotización de mercado.</w:t>
+        <w:t>Arroja una mediana de ARS 1.237 y un intervalo de confianza P5–P95 de ARS 844 a ARS 1.737, con un 85,2% de probabilidad empírica de retorno positivo frente a la cotización de mercado.</w:t>
       </w:r>
     </w:p>
     <w:p>
@@ -21637,7 +21214,7 @@
         <w:pStyle w:val="Ttulo2"/>
         <w:spacing w:before="70" w:after="20"/>
       </w:pPr>
-      <w:bookmarkStart w:id="45" w:name="_Toc237709934"/>
+      <w:bookmarkStart w:id="45" w:name="_Toc237711725"/>
       <w:r>
         <w:rPr>
           <w:rFonts w:ascii="Georgia" w:hAnsi="Georgia"/>
@@ -21656,25 +21233,7 @@
         </w:rPr>
       </w:pPr>
       <w:r>
-        <w:t>Despejando la tasa de crecimiento terminal implícita en la cotización de mercado (</w:t>
-      </w:r>
-      <w:r>
-        <w:rPr>
-          <w:b/>
-        </w:rPr>
-        <w:t>Figura [fig:21]</w:t>
-      </w:r>
-      <w:r>
-        <w:t>), se comprueba que el precio actual descuenta un crecimiento a perpetuidad de apenas *</w:t>
-      </w:r>
-      <w:r>
-        <w:rPr>
-          <w:i/>
-        </w:rPr>
-        <w:t>g^</w:t>
-      </w:r>
-      <w:r>
-        <w:t xml:space="preserve"> = 0,69%**, muy por debajo del 2,0% fundamental de largo plazo.</w:t>
+        <w:t>Despejando la tasa de crecimiento terminal implícita en la cotización de mercado (Figura [fig:21]), se comprueba que el precio actual descuenta un crecimiento a perpetuidad de apenas g^* = 0,69%, muy por debajo del 2,0% fundamental de largo plazo.</w:t>
       </w:r>
     </w:p>
     <w:tbl>
@@ -21713,7 +21272,7 @@
                 <w:noProof/>
               </w:rPr>
               <w:drawing>
-                <wp:inline distT="0" distB="0" distL="0" distR="0" wp14:anchorId="7C0BE2B8" wp14:editId="6F05B822">
+                <wp:inline distT="0" distB="0" distL="0" distR="0" wp14:anchorId="31CCDA46" wp14:editId="1ADE6C33">
                   <wp:extent cx="2926080" cy="1682608"/>
                   <wp:effectExtent l="0" t="0" r="0" b="0"/>
                   <wp:docPr id="21" name="Picture 21"/>
@@ -21772,7 +21331,7 @@
                 <w:noProof/>
               </w:rPr>
               <w:drawing>
-                <wp:inline distT="0" distB="0" distL="0" distR="0" wp14:anchorId="4975E3F7" wp14:editId="4AB75F0F">
+                <wp:inline distT="0" distB="0" distL="0" distR="0" wp14:anchorId="61E99FEA" wp14:editId="5AA8C779">
                   <wp:extent cx="2926080" cy="1549755"/>
                   <wp:effectExtent l="0" t="0" r="0" b="0"/>
                   <wp:docPr id="22" name="Picture 22"/>
@@ -21877,7 +21436,7 @@
         <w:pStyle w:val="Ttulo1"/>
         <w:spacing w:before="100" w:after="30"/>
       </w:pPr>
-      <w:bookmarkStart w:id="46" w:name="_Toc237709935"/>
+      <w:bookmarkStart w:id="46" w:name="_Toc237711726"/>
       <w:r>
         <w:rPr>
           <w:rFonts w:ascii="Georgia" w:hAnsi="Georgia"/>
@@ -21893,7 +21452,7 @@
         <w:pStyle w:val="Ttulo2"/>
         <w:spacing w:before="70" w:after="20"/>
       </w:pPr>
-      <w:bookmarkStart w:id="47" w:name="_Toc237709936"/>
+      <w:bookmarkStart w:id="47" w:name="_Toc237711727"/>
       <w:r>
         <w:rPr>
           <w:rFonts w:ascii="Georgia" w:hAnsi="Georgia"/>
@@ -23441,7 +23000,7 @@
         <w:pStyle w:val="Ttulo1"/>
         <w:spacing w:before="100" w:after="30"/>
       </w:pPr>
-      <w:bookmarkStart w:id="48" w:name="_Toc237709937"/>
+      <w:bookmarkStart w:id="48" w:name="_Toc237711728"/>
       <w:r>
         <w:rPr>
           <w:rFonts w:ascii="Georgia" w:hAnsi="Georgia"/>
@@ -23458,7 +23017,7 @@
         <w:pStyle w:val="Ttulo2"/>
         <w:spacing w:before="70" w:after="20"/>
       </w:pPr>
-      <w:bookmarkStart w:id="49" w:name="_Toc237709938"/>
+      <w:bookmarkStart w:id="49" w:name="_Toc237711729"/>
       <w:r>
         <w:rPr>
           <w:rFonts w:ascii="Georgia" w:hAnsi="Georgia"/>
@@ -23514,34 +23073,7 @@
         </w:rPr>
       </w:pPr>
       <w:r>
-        <w:t xml:space="preserve">Para la gestión prudencial de carteras se adopta un </w:t>
-      </w:r>
-      <w:r>
-        <w:rPr>
-          <w:b/>
-        </w:rPr>
-        <w:t>límite de exposición del 20,0%</w:t>
-      </w:r>
-      <w:r>
-        <w:t xml:space="preserve"> (</w:t>
-      </w:r>
-      <w:r>
-        <w:rPr>
-          <w:b/>
-        </w:rPr>
-        <w:t>Figura [fig:23]</w:t>
-      </w:r>
-      <w:r>
-        <w:t>), acotado por el Conditional Value-at-Risk mensual al 95% (-32,80%). El Filtro de Kalman dinámico (</w:t>
-      </w:r>
-      <w:r>
-        <w:rPr>
-          <w:b/>
-        </w:rPr>
-        <w:t>Figura [fig:24]</w:t>
-      </w:r>
-      <w:r>
-        <w:t>) indica que el Beta de corto plazo converge a 0,764:</w:t>
+        <w:t>Para la gestión prudencial de carteras se adopta un límite de exposición del 20,0% (Figura [fig:23]), acotado por el Conditional Value-at-Risk mensual al 95% (-32,80%). El Filtro de Kalman dinámico (Figura [fig:24]) indica que el Beta de corto plazo converge a 0,764:</w:t>
       </w:r>
     </w:p>
     <w:p>
@@ -23608,7 +23140,7 @@
                 <w:noProof/>
               </w:rPr>
               <w:drawing>
-                <wp:inline distT="0" distB="0" distL="0" distR="0" wp14:anchorId="77C6A49A" wp14:editId="1AA5A634">
+                <wp:inline distT="0" distB="0" distL="0" distR="0" wp14:anchorId="17F94347" wp14:editId="5096B7DC">
                   <wp:extent cx="2926080" cy="1695124"/>
                   <wp:effectExtent l="0" t="0" r="0" b="0"/>
                   <wp:docPr id="23" name="Picture 23"/>
@@ -23667,7 +23199,7 @@
                 <w:noProof/>
               </w:rPr>
               <w:drawing>
-                <wp:inline distT="0" distB="0" distL="0" distR="0" wp14:anchorId="5FE5CEEA" wp14:editId="0E3FBF6D">
+                <wp:inline distT="0" distB="0" distL="0" distR="0" wp14:anchorId="41184E2F" wp14:editId="5C7C440E">
                   <wp:extent cx="2926080" cy="1572627"/>
                   <wp:effectExtent l="0" t="0" r="0" b="0"/>
                   <wp:docPr id="24" name="Picture 24"/>
@@ -23772,7 +23304,7 @@
         <w:pStyle w:val="Ttulo2"/>
         <w:spacing w:before="70" w:after="20"/>
       </w:pPr>
-      <w:bookmarkStart w:id="50" w:name="_Toc237709939"/>
+      <w:bookmarkStart w:id="50" w:name="_Toc237711730"/>
       <w:r>
         <w:rPr>
           <w:rFonts w:ascii="Georgia" w:hAnsi="Georgia"/>
@@ -24507,7 +24039,7 @@
         <w:pStyle w:val="Ttulo2"/>
         <w:spacing w:before="70" w:after="20"/>
       </w:pPr>
-      <w:bookmarkStart w:id="51" w:name="_Toc237709940"/>
+      <w:bookmarkStart w:id="51" w:name="_Toc237711731"/>
       <w:r>
         <w:rPr>
           <w:rFonts w:ascii="Georgia" w:hAnsi="Georgia"/>
@@ -24532,16 +24064,7 @@
         <w:t>Modelado de Colas Pesadas vía Pareto Generalizada (EVT-GPD):</w:t>
       </w:r>
       <w:r>
-        <w:t xml:space="preserve"> Dado que los retornos de Aluar presentan colas pesadas (curtosis = 7,82) y la distribución normal subestima severamente las pérdidas de cola, se calibra un modelo Pareto Generalizado (GPD, ξ̂ = 0,214 &gt; 0), capturando pérdidas de tipo Fréchet (</w:t>
-      </w:r>
-      <w:r>
-        <w:rPr>
-          <w:b/>
-        </w:rPr>
-        <w:t>Figura [fig:25]</w:t>
-      </w:r>
-      <w:r>
-        <w:t>):</w:t>
+        <w:t xml:space="preserve"> Dado que los retornos de Aluar presentan colas pesadas (curtosis = 7,82) y la distribución normal subestima severamente las pérdidas de cola, se calibra un modelo Pareto Generalizado (GPD, ξ̂ = 0,214 &gt; 0), capturando pérdidas de tipo Fréchet (Figura [fig:25]):</w:t>
       </w:r>
     </w:p>
     <w:p>
@@ -24566,7 +24089,7 @@
         <w:pStyle w:val="Ttulo2"/>
         <w:spacing w:before="70" w:after="20"/>
       </w:pPr>
-      <w:bookmarkStart w:id="52" w:name="_Toc237709941"/>
+      <w:bookmarkStart w:id="52" w:name="_Toc237711732"/>
       <w:r>
         <w:rPr>
           <w:rFonts w:ascii="Georgia" w:hAnsi="Georgia"/>
@@ -24591,16 +24114,7 @@
         <w:t>Dinámica de la Materia Prima por Reversión a la Media (Ornstein-Uhlenbeck):</w:t>
       </w:r>
       <w:r>
-        <w:t xml:space="preserve"> Los commodities industriales no siguen un paseo aleatorio sin límite (MBG), sino que revierten a la media hacia el costo marginal de producción de la industria (</w:t>
-      </w:r>
-      <w:r>
-        <w:rPr>
-          <w:b/>
-        </w:rPr>
-        <w:t>Figura [fig:26]</w:t>
-      </w:r>
-      <w:r>
-        <w:t>), modelado mediante:</w:t>
+        <w:t xml:space="preserve"> Los commodities industriales no siguen un paseo aleatorio sin límite (MBG), sino que revierten a la media hacia el costo marginal de producción de la industria (Figura [fig:26]), modelado mediante:</w:t>
       </w:r>
     </w:p>
     <w:p>
@@ -24656,7 +24170,7 @@
                 <w:noProof/>
               </w:rPr>
               <w:drawing>
-                <wp:inline distT="0" distB="0" distL="0" distR="0" wp14:anchorId="3E9F78F6" wp14:editId="06F05055">
+                <wp:inline distT="0" distB="0" distL="0" distR="0" wp14:anchorId="264BA4E7" wp14:editId="3F020743">
                   <wp:extent cx="2926080" cy="1696900"/>
                   <wp:effectExtent l="0" t="0" r="0" b="0"/>
                   <wp:docPr id="25" name="Picture 25"/>
@@ -24715,7 +24229,7 @@
                 <w:noProof/>
               </w:rPr>
               <w:drawing>
-                <wp:inline distT="0" distB="0" distL="0" distR="0" wp14:anchorId="4C4693FC" wp14:editId="4AA812D9">
+                <wp:inline distT="0" distB="0" distL="0" distR="0" wp14:anchorId="4BDD6AE8" wp14:editId="085B30C2">
                   <wp:extent cx="2926080" cy="1614092"/>
                   <wp:effectExtent l="0" t="0" r="0" b="0"/>
                   <wp:docPr id="26" name="Picture 26"/>
@@ -25740,7 +25254,7 @@
         <w:pStyle w:val="Ttulo2"/>
         <w:spacing w:before="70" w:after="20"/>
       </w:pPr>
-      <w:bookmarkStart w:id="53" w:name="_Toc237709942"/>
+      <w:bookmarkStart w:id="53" w:name="_Toc237711733"/>
       <w:r>
         <w:rPr>
           <w:rFonts w:ascii="Georgia" w:hAnsi="Georgia"/>
@@ -25759,25 +25273,7 @@
         </w:rPr>
       </w:pPr>
       <w:r>
-        <w:t>La integración de 10.000 trayectorias de precios y costos en tiempo continuo (</w:t>
-      </w:r>
-      <w:r>
-        <w:rPr>
-          <w:b/>
-        </w:rPr>
-        <w:t>Figura [fig:27]</w:t>
-      </w:r>
-      <w:r>
-        <w:t>) produce una distribución suave del valor de la firma, cuyos riesgos operativos y financieros se sintetizan en la Matriz de Probabilidad vs. Impacto (</w:t>
-      </w:r>
-      <w:r>
-        <w:rPr>
-          <w:b/>
-        </w:rPr>
-        <w:t>Figura [fig:28]</w:t>
-      </w:r>
-      <w:r>
-        <w:t>).</w:t>
+        <w:t>La integración de 10.000 trayectorias de precios y costos en tiempo continuo (Figura [fig:27]) produce una distribución suave del valor de la firma, cuyos riesgos operativos y financieros se sintetizan en la Matriz de Probabilidad vs. Impacto (Figura [fig:28]).</w:t>
       </w:r>
     </w:p>
     <w:tbl>
@@ -25816,7 +25312,7 @@
                 <w:noProof/>
               </w:rPr>
               <w:drawing>
-                <wp:inline distT="0" distB="0" distL="0" distR="0" wp14:anchorId="2CE7E2AE" wp14:editId="56EFEA80">
+                <wp:inline distT="0" distB="0" distL="0" distR="0" wp14:anchorId="2D6A3A3A" wp14:editId="5F487BF0">
                   <wp:extent cx="2926080" cy="1654733"/>
                   <wp:effectExtent l="0" t="0" r="0" b="0"/>
                   <wp:docPr id="27" name="Picture 27"/>
@@ -25875,7 +25371,7 @@
                 <w:noProof/>
               </w:rPr>
               <w:drawing>
-                <wp:inline distT="0" distB="0" distL="0" distR="0" wp14:anchorId="4D0420AB" wp14:editId="326616BD">
+                <wp:inline distT="0" distB="0" distL="0" distR="0" wp14:anchorId="7AC7A137" wp14:editId="5780C4EC">
                   <wp:extent cx="2926080" cy="1698212"/>
                   <wp:effectExtent l="0" t="0" r="0" b="0"/>
                   <wp:docPr id="28" name="Picture 28"/>
@@ -25990,7 +25486,7 @@
         <w:pStyle w:val="Ttulo1"/>
         <w:spacing w:before="100" w:after="30"/>
       </w:pPr>
-      <w:bookmarkStart w:id="54" w:name="_Toc237709943"/>
+      <w:bookmarkStart w:id="54" w:name="_Toc237711734"/>
       <w:r>
         <w:rPr>
           <w:rFonts w:ascii="Georgia" w:hAnsi="Georgia"/>
@@ -26007,7 +25503,7 @@
         <w:pStyle w:val="Ttulo2"/>
         <w:spacing w:before="70" w:after="20"/>
       </w:pPr>
-      <w:bookmarkStart w:id="55" w:name="_Toc237709944"/>
+      <w:bookmarkStart w:id="55" w:name="_Toc237711735"/>
       <w:r>
         <w:rPr>
           <w:rFonts w:ascii="Georgia" w:hAnsi="Georgia"/>
@@ -26032,16 +25528,7 @@
         <w:t>Difusión de Tasas No Negativas Cox-Ingersoll-Ross (CIR):</w:t>
       </w:r>
       <w:r>
-        <w:t xml:space="preserve"> Asegura la no-negatividad matemática en las tasas de descuento del EMBI+ en simulaciones de colas extremas (condición de Feller 2κθ &gt; σ^2) y supera al modelo lineal AR(1) con un AIC sustancialmente menor (-3.359,4 vs. -2.894,6) y mayor Log-Likelihood (+1.682,7 vs. +1.450,3, </w:t>
-      </w:r>
-      <w:r>
-        <w:rPr>
-          <w:b/>
-        </w:rPr>
-        <w:t>Figura [fig:29]</w:t>
-      </w:r>
-      <w:r>
-        <w:t>):</w:t>
+        <w:t xml:space="preserve"> Asegura la no-negatividad matemática en las tasas de descuento del EMBI+ en simulaciones de colas extremas (condición de Feller 2κθ &gt; σ^2) y supera al modelo lineal AR(1) con un AIC sustancialmente menor (-3.359,4 vs. -2.894,6) y mayor Log-Likelihood (+1.682,7 vs. +1.450,3, Figura [fig:29]):</w:t>
       </w:r>
     </w:p>
     <w:p>
@@ -26077,7 +25564,7 @@
         <w:pStyle w:val="Ttulo2"/>
         <w:spacing w:before="70" w:after="20"/>
       </w:pPr>
-      <w:bookmarkStart w:id="56" w:name="_Toc237709945"/>
+      <w:bookmarkStart w:id="56" w:name="_Toc237711736"/>
       <w:r>
         <w:rPr>
           <w:rFonts w:ascii="Georgia" w:hAnsi="Georgia"/>
@@ -26096,16 +25583,7 @@
         </w:rPr>
       </w:pPr>
       <w:r>
-        <w:t>El modelo GARCH(1,1) (</w:t>
-      </w:r>
-      <w:r>
-        <w:rPr>
-          <w:b/>
-        </w:rPr>
-        <w:t>Figura [fig:30]</w:t>
-      </w:r>
-      <w:r>
-        <w:t>) describe la persistencia de varianza condicional:</w:t>
+        <w:t>El modelo GARCH(1,1) (Figura [fig:30]) describe la persistencia de varianza condicional:</w:t>
       </w:r>
     </w:p>
     <w:p>
@@ -26161,7 +25639,7 @@
                 <w:noProof/>
               </w:rPr>
               <w:drawing>
-                <wp:inline distT="0" distB="0" distL="0" distR="0" wp14:anchorId="1183299A" wp14:editId="6FDFC3B9">
+                <wp:inline distT="0" distB="0" distL="0" distR="0" wp14:anchorId="020F7B03" wp14:editId="26EEDD6F">
                   <wp:extent cx="2926080" cy="1650045"/>
                   <wp:effectExtent l="0" t="0" r="0" b="0"/>
                   <wp:docPr id="29" name="Picture 29"/>
@@ -26220,7 +25698,7 @@
                 <w:noProof/>
               </w:rPr>
               <w:drawing>
-                <wp:inline distT="0" distB="0" distL="0" distR="0" wp14:anchorId="766474AF" wp14:editId="06DD4DBF">
+                <wp:inline distT="0" distB="0" distL="0" distR="0" wp14:anchorId="34B1BFC6" wp14:editId="2216CE3F">
                   <wp:extent cx="2926080" cy="1611196"/>
                   <wp:effectExtent l="0" t="0" r="0" b="0"/>
                   <wp:docPr id="30" name="Picture 30"/>
@@ -26708,7 +26186,7 @@
         <w:pStyle w:val="Ttulo2"/>
         <w:spacing w:before="70" w:after="20"/>
       </w:pPr>
-      <w:bookmarkStart w:id="57" w:name="_Toc237709946"/>
+      <w:bookmarkStart w:id="57" w:name="_Toc237711737"/>
       <w:r>
         <w:rPr>
           <w:rFonts w:ascii="Georgia" w:hAnsi="Georgia"/>
@@ -26734,16 +26212,7 @@
         <w:t>Dependencia Asimétrica en Co-Caídas (Cópula de Clayton):</w:t>
       </w:r>
       <w:r>
-        <w:t xml:space="preserve"> La Cópula Gaussiana asume independencia en colas (λ_L = λ_U = 0) y la t-Student impone dependencia simétrica forzada (λ_L = λ_U = 0,22). La </w:t>
-      </w:r>
-      <w:r>
-        <w:rPr>
-          <w:b/>
-        </w:rPr>
-        <w:t>Cópula de Clayton</w:t>
-      </w:r>
-      <w:r>
-        <w:t xml:space="preserve"> C_θ(u, v) = (u^-θ + v^-θ - 1)^-1/θ (θ = 1,23) resulta óptima (Δ AIC = -88,9 vs. Gauss; Δ AIC = -34,2 vs. t-Student) al concentrar la dependencia en la cola inferior (λ_L = 2^-1/θ = 0,38, λ_U = 0), capturando la co-caída (</w:t>
+        <w:t xml:space="preserve"> La Cópula Gaussiana asume independencia en colas (λ_L = λ_U = 0) y la t-Student impone dependencia simétrica forzada (λ_L = λ_U = 0,22). La Cópula de Clayton C_θ(u, v) = (u^-θ + v^-θ - 1)^-1/θ (θ = 1,23) resulta óptima (Δ AIC = -88,9 vs. Gauss; Δ AIC = -34,2 vs. t-Student) al concentrar la dependencia en la cola inferior (λ_L = 2^-1/θ = 0,38, λ_U = 0), capturando la co-caída (</w:t>
       </w:r>
       <w:r>
         <w:rPr>
@@ -26791,7 +26260,7 @@
                 <w:noProof/>
               </w:rPr>
               <w:drawing>
-                <wp:inline distT="0" distB="0" distL="0" distR="0" wp14:anchorId="72FC48B6" wp14:editId="537E7463">
+                <wp:inline distT="0" distB="0" distL="0" distR="0" wp14:anchorId="5FF30D05" wp14:editId="0A475342">
                   <wp:extent cx="2926080" cy="1687777"/>
                   <wp:effectExtent l="0" t="0" r="0" b="0"/>
                   <wp:docPr id="31" name="Picture 31"/>
@@ -27386,7 +26855,7 @@
         <w:pStyle w:val="Ttulo2"/>
         <w:spacing w:before="70" w:after="20"/>
       </w:pPr>
-      <w:bookmarkStart w:id="58" w:name="_Toc237709947"/>
+      <w:bookmarkStart w:id="58" w:name="_Toc237711738"/>
       <w:r>
         <w:rPr>
           <w:rFonts w:ascii="Georgia" w:hAnsi="Georgia"/>
@@ -28645,7 +28114,7 @@
         <w:pStyle w:val="Ttulo1"/>
         <w:spacing w:before="100" w:after="30"/>
       </w:pPr>
-      <w:bookmarkStart w:id="59" w:name="_Toc237709948"/>
+      <w:bookmarkStart w:id="59" w:name="_Toc237711739"/>
       <w:r>
         <w:rPr>
           <w:rFonts w:ascii="Georgia" w:hAnsi="Georgia"/>
@@ -28715,20 +28184,7 @@
         <w:rPr>
           <w:sz w:val="16"/>
         </w:rPr>
-        <w:t xml:space="preserve"> por acción (USD 0,78, retorno esperado de </w:t>
-      </w:r>
-      <w:r>
-        <w:rPr>
-          <w:b/>
-          <w:sz w:val="16"/>
-        </w:rPr>
-        <w:t>+25,8%</w:t>
-      </w:r>
-      <w:r>
-        <w:rPr>
-          <w:sz w:val="16"/>
-        </w:rPr>
-        <w:t>).</w:t>
+        <w:t xml:space="preserve"> por acción (USD 0,78, retorno esperado de +25,8%).</w:t>
       </w:r>
     </w:p>
     <w:p>
@@ -28770,20 +28226,7 @@
         <w:rPr>
           <w:sz w:val="16"/>
         </w:rPr>
-        <w:t xml:space="preserve"> por acción (USD 0,79, retorno esperado de </w:t>
-      </w:r>
-      <w:r>
-        <w:rPr>
-          <w:b/>
-          <w:sz w:val="16"/>
-        </w:rPr>
-        <w:t>+27,8%</w:t>
-      </w:r>
-      <w:r>
-        <w:rPr>
-          <w:sz w:val="16"/>
-        </w:rPr>
-        <w:t>).</w:t>
+        <w:t xml:space="preserve"> por acción (USD 0,79, retorno esperado de +27,8%).</w:t>
       </w:r>
     </w:p>
     <w:p>
@@ -28812,20 +28255,7 @@
         <w:rPr>
           <w:sz w:val="16"/>
         </w:rPr>
-        <w:t xml:space="preserve"> ARS 844 a ARS 1.737 por acción, con un </w:t>
-      </w:r>
-      <w:r>
-        <w:rPr>
-          <w:b/>
-          <w:sz w:val="16"/>
-        </w:rPr>
-        <w:t>85,2% de probabilidad empírica de retorno positivo</w:t>
-      </w:r>
-      <w:r>
-        <w:rPr>
-          <w:sz w:val="16"/>
-        </w:rPr>
-        <w:t>.</w:t>
+        <w:t xml:space="preserve"> ARS 844 a ARS 1.737 por acción, con un 85,2% de probabilidad empírica de retorno positivo.</w:t>
       </w:r>
     </w:p>
     <w:p>
@@ -28872,7 +28302,7 @@
         <w:pStyle w:val="Ttulo1"/>
         <w:spacing w:before="100" w:after="30"/>
       </w:pPr>
-      <w:bookmarkStart w:id="60" w:name="_Toc237709949"/>
+      <w:bookmarkStart w:id="60" w:name="_Toc237711740"/>
       <w:r>
         <w:rPr>
           <w:rFonts w:ascii="Georgia" w:hAnsi="Georgia"/>
@@ -28909,7 +28339,15 @@
           <w:color w:val="0D233A"/>
           <w:sz w:val="13"/>
         </w:rPr>
-        <w:t>Tabla: Conciliación de la Tasa Efectiva del Impuesto a las Ganancias 2025</w:t>
+        <w:t xml:space="preserve">Tabla: </w:t>
+      </w:r>
+      <w:r>
+        <w:rPr>
+          <w:b/>
+          <w:color w:val="0D233A"/>
+          <w:sz w:val="13"/>
+        </w:rPr>
+        <w:t>Conciliación de la Tasa Efectiva del Impuesto a las Ganancias 2025</w:t>
       </w:r>
     </w:p>
     <w:tbl>
@@ -32405,7 +31843,15 @@
           <w:color w:val="0D233A"/>
           <w:sz w:val="13"/>
         </w:rPr>
-        <w:t>Tabla: Estado de Situación Patrimonial / Balance Consolidado Auditado (2020–2025, USD MM)</w:t>
+        <w:t xml:space="preserve">Tabla: </w:t>
+      </w:r>
+      <w:r>
+        <w:rPr>
+          <w:b/>
+          <w:color w:val="0D233A"/>
+          <w:sz w:val="13"/>
+        </w:rPr>
+        <w:t>Estado de Situación Patrimonial / Balance Consolidado Auditado (2020–2025, USD MM)</w:t>
       </w:r>
     </w:p>
     <w:tbl>
@@ -37985,7 +37431,7 @@
         <w:pStyle w:val="Ttulo1"/>
         <w:spacing w:before="100" w:after="30"/>
       </w:pPr>
-      <w:bookmarkStart w:id="61" w:name="_Toc237709950"/>
+      <w:bookmarkStart w:id="61" w:name="_Toc237711741"/>
       <w:r>
         <w:rPr>
           <w:rFonts w:ascii="Georgia" w:hAnsi="Georgia"/>
@@ -38457,7 +37903,7 @@
         <w:pStyle w:val="Ttulo1"/>
         <w:spacing w:before="100" w:after="30"/>
       </w:pPr>
-      <w:bookmarkStart w:id="62" w:name="_Toc237709951"/>
+      <w:bookmarkStart w:id="62" w:name="_Toc237711742"/>
       <w:r>
         <w:rPr>
           <w:rFonts w:ascii="Georgia" w:hAnsi="Georgia"/>
@@ -38961,31 +38407,31 @@
       </w:rPr>
     </w:lvl>
   </w:abstractNum>
-  <w:num w:numId="1" w16cid:durableId="316567593">
+  <w:num w:numId="1" w16cid:durableId="2039694692">
     <w:abstractNumId w:val="8"/>
   </w:num>
-  <w:num w:numId="2" w16cid:durableId="419181887">
+  <w:num w:numId="2" w16cid:durableId="1877768788">
     <w:abstractNumId w:val="6"/>
   </w:num>
-  <w:num w:numId="3" w16cid:durableId="715007204">
+  <w:num w:numId="3" w16cid:durableId="640578039">
     <w:abstractNumId w:val="5"/>
   </w:num>
-  <w:num w:numId="4" w16cid:durableId="666589529">
+  <w:num w:numId="4" w16cid:durableId="1652518962">
     <w:abstractNumId w:val="4"/>
   </w:num>
-  <w:num w:numId="5" w16cid:durableId="615449620">
+  <w:num w:numId="5" w16cid:durableId="1512992261">
     <w:abstractNumId w:val="7"/>
   </w:num>
-  <w:num w:numId="6" w16cid:durableId="137573297">
+  <w:num w:numId="6" w16cid:durableId="1297444625">
     <w:abstractNumId w:val="3"/>
   </w:num>
-  <w:num w:numId="7" w16cid:durableId="1438405004">
+  <w:num w:numId="7" w16cid:durableId="1846706000">
     <w:abstractNumId w:val="2"/>
   </w:num>
-  <w:num w:numId="8" w16cid:durableId="149953818">
+  <w:num w:numId="8" w16cid:durableId="1123963031">
     <w:abstractNumId w:val="1"/>
   </w:num>
-  <w:num w:numId="9" w16cid:durableId="705640481">
+  <w:num w:numId="9" w16cid:durableId="1374498728">
     <w:abstractNumId w:val="0"/>
   </w:num>
 </w:numbering>
@@ -50417,7 +49863,7 @@
     <w:autoRedefine/>
     <w:uiPriority w:val="39"/>
     <w:unhideWhenUsed/>
-    <w:rsid w:val="00073ED0"/>
+    <w:rsid w:val="0094730E"/>
     <w:pPr>
       <w:spacing w:before="10" w:after="10" w:line="240" w:lineRule="auto"/>
     </w:pPr>
@@ -50432,7 +49878,7 @@
     <w:autoRedefine/>
     <w:uiPriority w:val="39"/>
     <w:unhideWhenUsed/>
-    <w:rsid w:val="00073ED0"/>
+    <w:rsid w:val="0094730E"/>
     <w:pPr>
       <w:spacing w:after="0" w:line="240" w:lineRule="auto"/>
       <w:ind w:left="170"/>
@@ -50446,7 +49892,7 @@
     <w:basedOn w:val="Fuentedeprrafopredeter"/>
     <w:uiPriority w:val="99"/>
     <w:unhideWhenUsed/>
-    <w:rsid w:val="00073ED0"/>
+    <w:rsid w:val="0094730E"/>
     <w:rPr>
       <w:color w:val="0000FF" w:themeColor="hyperlink"/>
       <w:u w:val="single"/>

</xml_diff>

<commit_message>
style(reporte): Reemplazar FCE UNCuyo por Analisis Independiente en encabezados y portada
</commit_message>
<xml_diff>
--- a/01_Reporte_PDF/Informe_Valuacion_Aluar_UNCuyo.docx
+++ b/01_Reporte_PDF/Informe_Valuacion_Aluar_UNCuyo.docx
@@ -80,14 +80,14 @@
               <w:rPr>
                 <w:color w:val="4A4A4A"/>
               </w:rPr>
-              <w:t>Análisis Financiero</w:t>
+              <w:t>Equity Research</w:t>
             </w:r>
             <w:r>
               <w:rPr>
                 <w:color w:val="4A4A4A"/>
               </w:rPr>
               <w:br/>
-              <w:t>FCE · UNCuyo</w:t>
+              <w:t>Análisis Independiente</w:t>
             </w:r>
             <w:r>
               <w:rPr>
@@ -1362,7 +1362,7 @@
         </w:rPr>
         <w:fldChar w:fldCharType="separate"/>
       </w:r>
-      <w:hyperlink w:anchor="_Toc237711680" w:history="1">
+      <w:hyperlink w:anchor="_Toc237713150" w:history="1">
         <w:r>
           <w:rPr>
             <w:rStyle w:val="Hipervnculo"/>
@@ -1389,7 +1389,7 @@
             <w:noProof/>
             <w:webHidden/>
           </w:rPr>
-          <w:instrText xml:space="preserve"> PAGEREF _Toc237711680 \h </w:instrText>
+          <w:instrText xml:space="preserve"> PAGEREF _Toc237713150 \h </w:instrText>
         </w:r>
         <w:r>
           <w:rPr>
@@ -1436,7 +1436,7 @@
           <w14:ligatures w14:val="standardContextual"/>
         </w:rPr>
       </w:pPr>
-      <w:hyperlink w:anchor="_Toc237711681" w:history="1">
+      <w:hyperlink w:anchor="_Toc237713151" w:history="1">
         <w:r>
           <w:rPr>
             <w:rStyle w:val="Hipervnculo"/>
@@ -1463,7 +1463,7 @@
             <w:noProof/>
             <w:webHidden/>
           </w:rPr>
-          <w:instrText xml:space="preserve"> PAGEREF _Toc237711681 \h </w:instrText>
+          <w:instrText xml:space="preserve"> PAGEREF _Toc237713151 \h </w:instrText>
         </w:r>
         <w:r>
           <w:rPr>
@@ -1510,7 +1510,7 @@
           <w14:ligatures w14:val="standardContextual"/>
         </w:rPr>
       </w:pPr>
-      <w:hyperlink w:anchor="_Toc237711682" w:history="1">
+      <w:hyperlink w:anchor="_Toc237713152" w:history="1">
         <w:r>
           <w:rPr>
             <w:rStyle w:val="Hipervnculo"/>
@@ -1537,7 +1537,7 @@
             <w:noProof/>
             <w:webHidden/>
           </w:rPr>
-          <w:instrText xml:space="preserve"> PAGEREF _Toc237711682 \h </w:instrText>
+          <w:instrText xml:space="preserve"> PAGEREF _Toc237713152 \h </w:instrText>
         </w:r>
         <w:r>
           <w:rPr>
@@ -1584,7 +1584,7 @@
           <w14:ligatures w14:val="standardContextual"/>
         </w:rPr>
       </w:pPr>
-      <w:hyperlink w:anchor="_Toc237711683" w:history="1">
+      <w:hyperlink w:anchor="_Toc237713153" w:history="1">
         <w:r>
           <w:rPr>
             <w:rStyle w:val="Hipervnculo"/>
@@ -1611,7 +1611,7 @@
             <w:noProof/>
             <w:webHidden/>
           </w:rPr>
-          <w:instrText xml:space="preserve"> PAGEREF _Toc237711683 \h </w:instrText>
+          <w:instrText xml:space="preserve"> PAGEREF _Toc237713153 \h </w:instrText>
         </w:r>
         <w:r>
           <w:rPr>
@@ -1658,7 +1658,7 @@
           <w14:ligatures w14:val="standardContextual"/>
         </w:rPr>
       </w:pPr>
-      <w:hyperlink w:anchor="_Toc237711684" w:history="1">
+      <w:hyperlink w:anchor="_Toc237713154" w:history="1">
         <w:r>
           <w:rPr>
             <w:rStyle w:val="Hipervnculo"/>
@@ -1685,7 +1685,7 @@
             <w:noProof/>
             <w:webHidden/>
           </w:rPr>
-          <w:instrText xml:space="preserve"> PAGEREF _Toc237711684 \h </w:instrText>
+          <w:instrText xml:space="preserve"> PAGEREF _Toc237713154 \h </w:instrText>
         </w:r>
         <w:r>
           <w:rPr>
@@ -1732,7 +1732,7 @@
           <w14:ligatures w14:val="standardContextual"/>
         </w:rPr>
       </w:pPr>
-      <w:hyperlink w:anchor="_Toc237711685" w:history="1">
+      <w:hyperlink w:anchor="_Toc237713155" w:history="1">
         <w:r>
           <w:rPr>
             <w:rStyle w:val="Hipervnculo"/>
@@ -1759,7 +1759,7 @@
             <w:noProof/>
             <w:webHidden/>
           </w:rPr>
-          <w:instrText xml:space="preserve"> PAGEREF _Toc237711685 \h </w:instrText>
+          <w:instrText xml:space="preserve"> PAGEREF _Toc237713155 \h </w:instrText>
         </w:r>
         <w:r>
           <w:rPr>
@@ -1806,7 +1806,7 @@
           <w14:ligatures w14:val="standardContextual"/>
         </w:rPr>
       </w:pPr>
-      <w:hyperlink w:anchor="_Toc237711686" w:history="1">
+      <w:hyperlink w:anchor="_Toc237713156" w:history="1">
         <w:r>
           <w:rPr>
             <w:rStyle w:val="Hipervnculo"/>
@@ -1833,7 +1833,7 @@
             <w:noProof/>
             <w:webHidden/>
           </w:rPr>
-          <w:instrText xml:space="preserve"> PAGEREF _Toc237711686 \h </w:instrText>
+          <w:instrText xml:space="preserve"> PAGEREF _Toc237713156 \h </w:instrText>
         </w:r>
         <w:r>
           <w:rPr>
@@ -1880,7 +1880,7 @@
           <w14:ligatures w14:val="standardContextual"/>
         </w:rPr>
       </w:pPr>
-      <w:hyperlink w:anchor="_Toc237711687" w:history="1">
+      <w:hyperlink w:anchor="_Toc237713157" w:history="1">
         <w:r>
           <w:rPr>
             <w:rStyle w:val="Hipervnculo"/>
@@ -1907,7 +1907,7 @@
             <w:noProof/>
             <w:webHidden/>
           </w:rPr>
-          <w:instrText xml:space="preserve"> PAGEREF _Toc237711687 \h </w:instrText>
+          <w:instrText xml:space="preserve"> PAGEREF _Toc237713157 \h </w:instrText>
         </w:r>
         <w:r>
           <w:rPr>
@@ -1954,7 +1954,7 @@
           <w14:ligatures w14:val="standardContextual"/>
         </w:rPr>
       </w:pPr>
-      <w:hyperlink w:anchor="_Toc237711688" w:history="1">
+      <w:hyperlink w:anchor="_Toc237713158" w:history="1">
         <w:r>
           <w:rPr>
             <w:rStyle w:val="Hipervnculo"/>
@@ -1981,7 +1981,7 @@
             <w:noProof/>
             <w:webHidden/>
           </w:rPr>
-          <w:instrText xml:space="preserve"> PAGEREF _Toc237711688 \h </w:instrText>
+          <w:instrText xml:space="preserve"> PAGEREF _Toc237713158 \h </w:instrText>
         </w:r>
         <w:r>
           <w:rPr>
@@ -2028,7 +2028,7 @@
           <w14:ligatures w14:val="standardContextual"/>
         </w:rPr>
       </w:pPr>
-      <w:hyperlink w:anchor="_Toc237711689" w:history="1">
+      <w:hyperlink w:anchor="_Toc237713159" w:history="1">
         <w:r>
           <w:rPr>
             <w:rStyle w:val="Hipervnculo"/>
@@ -2055,7 +2055,7 @@
             <w:noProof/>
             <w:webHidden/>
           </w:rPr>
-          <w:instrText xml:space="preserve"> PAGEREF _Toc237711689 \h </w:instrText>
+          <w:instrText xml:space="preserve"> PAGEREF _Toc237713159 \h </w:instrText>
         </w:r>
         <w:r>
           <w:rPr>
@@ -2102,7 +2102,7 @@
           <w14:ligatures w14:val="standardContextual"/>
         </w:rPr>
       </w:pPr>
-      <w:hyperlink w:anchor="_Toc237711690" w:history="1">
+      <w:hyperlink w:anchor="_Toc237713160" w:history="1">
         <w:r>
           <w:rPr>
             <w:rStyle w:val="Hipervnculo"/>
@@ -2129,7 +2129,7 @@
             <w:noProof/>
             <w:webHidden/>
           </w:rPr>
-          <w:instrText xml:space="preserve"> PAGEREF _Toc237711690 \h </w:instrText>
+          <w:instrText xml:space="preserve"> PAGEREF _Toc237713160 \h </w:instrText>
         </w:r>
         <w:r>
           <w:rPr>
@@ -2176,7 +2176,7 @@
           <w14:ligatures w14:val="standardContextual"/>
         </w:rPr>
       </w:pPr>
-      <w:hyperlink w:anchor="_Toc237711691" w:history="1">
+      <w:hyperlink w:anchor="_Toc237713161" w:history="1">
         <w:r>
           <w:rPr>
             <w:rStyle w:val="Hipervnculo"/>
@@ -2203,7 +2203,7 @@
             <w:noProof/>
             <w:webHidden/>
           </w:rPr>
-          <w:instrText xml:space="preserve"> PAGEREF _Toc237711691 \h </w:instrText>
+          <w:instrText xml:space="preserve"> PAGEREF _Toc237713161 \h </w:instrText>
         </w:r>
         <w:r>
           <w:rPr>
@@ -2250,7 +2250,7 @@
           <w14:ligatures w14:val="standardContextual"/>
         </w:rPr>
       </w:pPr>
-      <w:hyperlink w:anchor="_Toc237711692" w:history="1">
+      <w:hyperlink w:anchor="_Toc237713162" w:history="1">
         <w:r>
           <w:rPr>
             <w:rStyle w:val="Hipervnculo"/>
@@ -2277,7 +2277,7 @@
             <w:noProof/>
             <w:webHidden/>
           </w:rPr>
-          <w:instrText xml:space="preserve"> PAGEREF _Toc237711692 \h </w:instrText>
+          <w:instrText xml:space="preserve"> PAGEREF _Toc237713162 \h </w:instrText>
         </w:r>
         <w:r>
           <w:rPr>
@@ -2324,7 +2324,7 @@
           <w14:ligatures w14:val="standardContextual"/>
         </w:rPr>
       </w:pPr>
-      <w:hyperlink w:anchor="_Toc237711693" w:history="1">
+      <w:hyperlink w:anchor="_Toc237713163" w:history="1">
         <w:r>
           <w:rPr>
             <w:rStyle w:val="Hipervnculo"/>
@@ -2351,7 +2351,7 @@
             <w:noProof/>
             <w:webHidden/>
           </w:rPr>
-          <w:instrText xml:space="preserve"> PAGEREF _Toc237711693 \h </w:instrText>
+          <w:instrText xml:space="preserve"> PAGEREF _Toc237713163 \h </w:instrText>
         </w:r>
         <w:r>
           <w:rPr>
@@ -2398,7 +2398,7 @@
           <w14:ligatures w14:val="standardContextual"/>
         </w:rPr>
       </w:pPr>
-      <w:hyperlink w:anchor="_Toc237711694" w:history="1">
+      <w:hyperlink w:anchor="_Toc237713164" w:history="1">
         <w:r>
           <w:rPr>
             <w:rStyle w:val="Hipervnculo"/>
@@ -2425,7 +2425,7 @@
             <w:noProof/>
             <w:webHidden/>
           </w:rPr>
-          <w:instrText xml:space="preserve"> PAGEREF _Toc237711694 \h </w:instrText>
+          <w:instrText xml:space="preserve"> PAGEREF _Toc237713164 \h </w:instrText>
         </w:r>
         <w:r>
           <w:rPr>
@@ -2472,7 +2472,7 @@
           <w14:ligatures w14:val="standardContextual"/>
         </w:rPr>
       </w:pPr>
-      <w:hyperlink w:anchor="_Toc237711695" w:history="1">
+      <w:hyperlink w:anchor="_Toc237713165" w:history="1">
         <w:r>
           <w:rPr>
             <w:rStyle w:val="Hipervnculo"/>
@@ -2499,7 +2499,7 @@
             <w:noProof/>
             <w:webHidden/>
           </w:rPr>
-          <w:instrText xml:space="preserve"> PAGEREF _Toc237711695 \h </w:instrText>
+          <w:instrText xml:space="preserve"> PAGEREF _Toc237713165 \h </w:instrText>
         </w:r>
         <w:r>
           <w:rPr>
@@ -2546,7 +2546,7 @@
           <w14:ligatures w14:val="standardContextual"/>
         </w:rPr>
       </w:pPr>
-      <w:hyperlink w:anchor="_Toc237711696" w:history="1">
+      <w:hyperlink w:anchor="_Toc237713166" w:history="1">
         <w:r>
           <w:rPr>
             <w:rStyle w:val="Hipervnculo"/>
@@ -2573,7 +2573,7 @@
             <w:noProof/>
             <w:webHidden/>
           </w:rPr>
-          <w:instrText xml:space="preserve"> PAGEREF _Toc237711696 \h </w:instrText>
+          <w:instrText xml:space="preserve"> PAGEREF _Toc237713166 \h </w:instrText>
         </w:r>
         <w:r>
           <w:rPr>
@@ -2620,7 +2620,7 @@
           <w14:ligatures w14:val="standardContextual"/>
         </w:rPr>
       </w:pPr>
-      <w:hyperlink w:anchor="_Toc237711697" w:history="1">
+      <w:hyperlink w:anchor="_Toc237713167" w:history="1">
         <w:r>
           <w:rPr>
             <w:rStyle w:val="Hipervnculo"/>
@@ -2647,7 +2647,7 @@
             <w:noProof/>
             <w:webHidden/>
           </w:rPr>
-          <w:instrText xml:space="preserve"> PAGEREF _Toc237711697 \h </w:instrText>
+          <w:instrText xml:space="preserve"> PAGEREF _Toc237713167 \h </w:instrText>
         </w:r>
         <w:r>
           <w:rPr>
@@ -2694,7 +2694,7 @@
           <w14:ligatures w14:val="standardContextual"/>
         </w:rPr>
       </w:pPr>
-      <w:hyperlink w:anchor="_Toc237711698" w:history="1">
+      <w:hyperlink w:anchor="_Toc237713168" w:history="1">
         <w:r>
           <w:rPr>
             <w:rStyle w:val="Hipervnculo"/>
@@ -2721,7 +2721,7 @@
             <w:noProof/>
             <w:webHidden/>
           </w:rPr>
-          <w:instrText xml:space="preserve"> PAGEREF _Toc237711698 \h </w:instrText>
+          <w:instrText xml:space="preserve"> PAGEREF _Toc237713168 \h </w:instrText>
         </w:r>
         <w:r>
           <w:rPr>
@@ -2768,7 +2768,7 @@
           <w14:ligatures w14:val="standardContextual"/>
         </w:rPr>
       </w:pPr>
-      <w:hyperlink w:anchor="_Toc237711699" w:history="1">
+      <w:hyperlink w:anchor="_Toc237713169" w:history="1">
         <w:r>
           <w:rPr>
             <w:rStyle w:val="Hipervnculo"/>
@@ -2795,7 +2795,7 @@
             <w:noProof/>
             <w:webHidden/>
           </w:rPr>
-          <w:instrText xml:space="preserve"> PAGEREF _Toc237711699 \h </w:instrText>
+          <w:instrText xml:space="preserve"> PAGEREF _Toc237713169 \h </w:instrText>
         </w:r>
         <w:r>
           <w:rPr>
@@ -2842,7 +2842,7 @@
           <w14:ligatures w14:val="standardContextual"/>
         </w:rPr>
       </w:pPr>
-      <w:hyperlink w:anchor="_Toc237711700" w:history="1">
+      <w:hyperlink w:anchor="_Toc237713170" w:history="1">
         <w:r>
           <w:rPr>
             <w:rStyle w:val="Hipervnculo"/>
@@ -2869,7 +2869,7 @@
             <w:noProof/>
             <w:webHidden/>
           </w:rPr>
-          <w:instrText xml:space="preserve"> PAGEREF _Toc237711700 \h </w:instrText>
+          <w:instrText xml:space="preserve"> PAGEREF _Toc237713170 \h </w:instrText>
         </w:r>
         <w:r>
           <w:rPr>
@@ -2916,7 +2916,7 @@
           <w14:ligatures w14:val="standardContextual"/>
         </w:rPr>
       </w:pPr>
-      <w:hyperlink w:anchor="_Toc237711701" w:history="1">
+      <w:hyperlink w:anchor="_Toc237713171" w:history="1">
         <w:r>
           <w:rPr>
             <w:rStyle w:val="Hipervnculo"/>
@@ -2943,7 +2943,7 @@
             <w:noProof/>
             <w:webHidden/>
           </w:rPr>
-          <w:instrText xml:space="preserve"> PAGEREF _Toc237711701 \h </w:instrText>
+          <w:instrText xml:space="preserve"> PAGEREF _Toc237713171 \h </w:instrText>
         </w:r>
         <w:r>
           <w:rPr>
@@ -2990,7 +2990,7 @@
           <w14:ligatures w14:val="standardContextual"/>
         </w:rPr>
       </w:pPr>
-      <w:hyperlink w:anchor="_Toc237711702" w:history="1">
+      <w:hyperlink w:anchor="_Toc237713172" w:history="1">
         <w:r>
           <w:rPr>
             <w:rStyle w:val="Hipervnculo"/>
@@ -3017,7 +3017,7 @@
             <w:noProof/>
             <w:webHidden/>
           </w:rPr>
-          <w:instrText xml:space="preserve"> PAGEREF _Toc237711702 \h </w:instrText>
+          <w:instrText xml:space="preserve"> PAGEREF _Toc237713172 \h </w:instrText>
         </w:r>
         <w:r>
           <w:rPr>
@@ -3064,7 +3064,7 @@
           <w14:ligatures w14:val="standardContextual"/>
         </w:rPr>
       </w:pPr>
-      <w:hyperlink w:anchor="_Toc237711703" w:history="1">
+      <w:hyperlink w:anchor="_Toc237713173" w:history="1">
         <w:r>
           <w:rPr>
             <w:rStyle w:val="Hipervnculo"/>
@@ -3121,7 +3121,7 @@
             <w:noProof/>
             <w:webHidden/>
           </w:rPr>
-          <w:instrText xml:space="preserve"> PAGEREF _Toc237711703 \h </w:instrText>
+          <w:instrText xml:space="preserve"> PAGEREF _Toc237713173 \h </w:instrText>
         </w:r>
         <w:r>
           <w:rPr>
@@ -3168,7 +3168,7 @@
           <w14:ligatures w14:val="standardContextual"/>
         </w:rPr>
       </w:pPr>
-      <w:hyperlink w:anchor="_Toc237711704" w:history="1">
+      <w:hyperlink w:anchor="_Toc237713174" w:history="1">
         <w:r>
           <w:rPr>
             <w:rStyle w:val="Hipervnculo"/>
@@ -3195,7 +3195,7 @@
             <w:noProof/>
             <w:webHidden/>
           </w:rPr>
-          <w:instrText xml:space="preserve"> PAGEREF _Toc237711704 \h </w:instrText>
+          <w:instrText xml:space="preserve"> PAGEREF _Toc237713174 \h </w:instrText>
         </w:r>
         <w:r>
           <w:rPr>
@@ -3242,7 +3242,7 @@
           <w14:ligatures w14:val="standardContextual"/>
         </w:rPr>
       </w:pPr>
-      <w:hyperlink w:anchor="_Toc237711705" w:history="1">
+      <w:hyperlink w:anchor="_Toc237713175" w:history="1">
         <w:r>
           <w:rPr>
             <w:rStyle w:val="Hipervnculo"/>
@@ -3269,7 +3269,7 @@
             <w:noProof/>
             <w:webHidden/>
           </w:rPr>
-          <w:instrText xml:space="preserve"> PAGEREF _Toc237711705 \h </w:instrText>
+          <w:instrText xml:space="preserve"> PAGEREF _Toc237713175 \h </w:instrText>
         </w:r>
         <w:r>
           <w:rPr>
@@ -3316,7 +3316,7 @@
           <w14:ligatures w14:val="standardContextual"/>
         </w:rPr>
       </w:pPr>
-      <w:hyperlink w:anchor="_Toc237711706" w:history="1">
+      <w:hyperlink w:anchor="_Toc237713176" w:history="1">
         <w:r>
           <w:rPr>
             <w:rStyle w:val="Hipervnculo"/>
@@ -3343,7 +3343,7 @@
             <w:noProof/>
             <w:webHidden/>
           </w:rPr>
-          <w:instrText xml:space="preserve"> PAGEREF _Toc237711706 \h </w:instrText>
+          <w:instrText xml:space="preserve"> PAGEREF _Toc237713176 \h </w:instrText>
         </w:r>
         <w:r>
           <w:rPr>
@@ -3390,7 +3390,7 @@
           <w14:ligatures w14:val="standardContextual"/>
         </w:rPr>
       </w:pPr>
-      <w:hyperlink w:anchor="_Toc237711707" w:history="1">
+      <w:hyperlink w:anchor="_Toc237713177" w:history="1">
         <w:r>
           <w:rPr>
             <w:rStyle w:val="Hipervnculo"/>
@@ -3417,7 +3417,7 @@
             <w:noProof/>
             <w:webHidden/>
           </w:rPr>
-          <w:instrText xml:space="preserve"> PAGEREF _Toc237711707 \h </w:instrText>
+          <w:instrText xml:space="preserve"> PAGEREF _Toc237713177 \h </w:instrText>
         </w:r>
         <w:r>
           <w:rPr>
@@ -3464,7 +3464,7 @@
           <w14:ligatures w14:val="standardContextual"/>
         </w:rPr>
       </w:pPr>
-      <w:hyperlink w:anchor="_Toc237711708" w:history="1">
+      <w:hyperlink w:anchor="_Toc237713178" w:history="1">
         <w:r>
           <w:rPr>
             <w:rStyle w:val="Hipervnculo"/>
@@ -3491,7 +3491,7 @@
             <w:noProof/>
             <w:webHidden/>
           </w:rPr>
-          <w:instrText xml:space="preserve"> PAGEREF _Toc237711708 \h </w:instrText>
+          <w:instrText xml:space="preserve"> PAGEREF _Toc237713178 \h </w:instrText>
         </w:r>
         <w:r>
           <w:rPr>
@@ -3538,7 +3538,7 @@
           <w14:ligatures w14:val="standardContextual"/>
         </w:rPr>
       </w:pPr>
-      <w:hyperlink w:anchor="_Toc237711709" w:history="1">
+      <w:hyperlink w:anchor="_Toc237713179" w:history="1">
         <w:r>
           <w:rPr>
             <w:rStyle w:val="Hipervnculo"/>
@@ -3565,7 +3565,7 @@
             <w:noProof/>
             <w:webHidden/>
           </w:rPr>
-          <w:instrText xml:space="preserve"> PAGEREF _Toc237711709 \h </w:instrText>
+          <w:instrText xml:space="preserve"> PAGEREF _Toc237713179 \h </w:instrText>
         </w:r>
         <w:r>
           <w:rPr>
@@ -3612,7 +3612,7 @@
           <w14:ligatures w14:val="standardContextual"/>
         </w:rPr>
       </w:pPr>
-      <w:hyperlink w:anchor="_Toc237711710" w:history="1">
+      <w:hyperlink w:anchor="_Toc237713180" w:history="1">
         <w:r>
           <w:rPr>
             <w:rStyle w:val="Hipervnculo"/>
@@ -3639,7 +3639,7 @@
             <w:noProof/>
             <w:webHidden/>
           </w:rPr>
-          <w:instrText xml:space="preserve"> PAGEREF _Toc237711710 \h </w:instrText>
+          <w:instrText xml:space="preserve"> PAGEREF _Toc237713180 \h </w:instrText>
         </w:r>
         <w:r>
           <w:rPr>
@@ -3686,7 +3686,7 @@
           <w14:ligatures w14:val="standardContextual"/>
         </w:rPr>
       </w:pPr>
-      <w:hyperlink w:anchor="_Toc237711711" w:history="1">
+      <w:hyperlink w:anchor="_Toc237713181" w:history="1">
         <w:r>
           <w:rPr>
             <w:rStyle w:val="Hipervnculo"/>
@@ -3713,7 +3713,7 @@
             <w:noProof/>
             <w:webHidden/>
           </w:rPr>
-          <w:instrText xml:space="preserve"> PAGEREF _Toc237711711 \h </w:instrText>
+          <w:instrText xml:space="preserve"> PAGEREF _Toc237713181 \h </w:instrText>
         </w:r>
         <w:r>
           <w:rPr>
@@ -3760,7 +3760,7 @@
           <w14:ligatures w14:val="standardContextual"/>
         </w:rPr>
       </w:pPr>
-      <w:hyperlink w:anchor="_Toc237711712" w:history="1">
+      <w:hyperlink w:anchor="_Toc237713182" w:history="1">
         <w:r>
           <w:rPr>
             <w:rStyle w:val="Hipervnculo"/>
@@ -3787,7 +3787,7 @@
             <w:noProof/>
             <w:webHidden/>
           </w:rPr>
-          <w:instrText xml:space="preserve"> PAGEREF _Toc237711712 \h </w:instrText>
+          <w:instrText xml:space="preserve"> PAGEREF _Toc237713182 \h </w:instrText>
         </w:r>
         <w:r>
           <w:rPr>
@@ -3834,7 +3834,7 @@
           <w14:ligatures w14:val="standardContextual"/>
         </w:rPr>
       </w:pPr>
-      <w:hyperlink w:anchor="_Toc237711713" w:history="1">
+      <w:hyperlink w:anchor="_Toc237713183" w:history="1">
         <w:r>
           <w:rPr>
             <w:rStyle w:val="Hipervnculo"/>
@@ -3861,7 +3861,7 @@
             <w:noProof/>
             <w:webHidden/>
           </w:rPr>
-          <w:instrText xml:space="preserve"> PAGEREF _Toc237711713 \h </w:instrText>
+          <w:instrText xml:space="preserve"> PAGEREF _Toc237713183 \h </w:instrText>
         </w:r>
         <w:r>
           <w:rPr>
@@ -3908,7 +3908,7 @@
           <w14:ligatures w14:val="standardContextual"/>
         </w:rPr>
       </w:pPr>
-      <w:hyperlink w:anchor="_Toc237711714" w:history="1">
+      <w:hyperlink w:anchor="_Toc237713184" w:history="1">
         <w:r>
           <w:rPr>
             <w:rStyle w:val="Hipervnculo"/>
@@ -3935,7 +3935,7 @@
             <w:noProof/>
             <w:webHidden/>
           </w:rPr>
-          <w:instrText xml:space="preserve"> PAGEREF _Toc237711714 \h </w:instrText>
+          <w:instrText xml:space="preserve"> PAGEREF _Toc237713184 \h </w:instrText>
         </w:r>
         <w:r>
           <w:rPr>
@@ -3982,7 +3982,7 @@
           <w14:ligatures w14:val="standardContextual"/>
         </w:rPr>
       </w:pPr>
-      <w:hyperlink w:anchor="_Toc237711715" w:history="1">
+      <w:hyperlink w:anchor="_Toc237713185" w:history="1">
         <w:r>
           <w:rPr>
             <w:rStyle w:val="Hipervnculo"/>
@@ -4009,7 +4009,7 @@
             <w:noProof/>
             <w:webHidden/>
           </w:rPr>
-          <w:instrText xml:space="preserve"> PAGEREF _Toc237711715 \h </w:instrText>
+          <w:instrText xml:space="preserve"> PAGEREF _Toc237713185 \h </w:instrText>
         </w:r>
         <w:r>
           <w:rPr>
@@ -4056,7 +4056,7 @@
           <w14:ligatures w14:val="standardContextual"/>
         </w:rPr>
       </w:pPr>
-      <w:hyperlink w:anchor="_Toc237711716" w:history="1">
+      <w:hyperlink w:anchor="_Toc237713186" w:history="1">
         <w:r>
           <w:rPr>
             <w:rStyle w:val="Hipervnculo"/>
@@ -4083,7 +4083,7 @@
             <w:noProof/>
             <w:webHidden/>
           </w:rPr>
-          <w:instrText xml:space="preserve"> PAGEREF _Toc237711716 \h </w:instrText>
+          <w:instrText xml:space="preserve"> PAGEREF _Toc237713186 \h </w:instrText>
         </w:r>
         <w:r>
           <w:rPr>
@@ -4130,7 +4130,7 @@
           <w14:ligatures w14:val="standardContextual"/>
         </w:rPr>
       </w:pPr>
-      <w:hyperlink w:anchor="_Toc237711717" w:history="1">
+      <w:hyperlink w:anchor="_Toc237713187" w:history="1">
         <w:r>
           <w:rPr>
             <w:rStyle w:val="Hipervnculo"/>
@@ -4157,7 +4157,7 @@
             <w:noProof/>
             <w:webHidden/>
           </w:rPr>
-          <w:instrText xml:space="preserve"> PAGEREF _Toc237711717 \h </w:instrText>
+          <w:instrText xml:space="preserve"> PAGEREF _Toc237713187 \h </w:instrText>
         </w:r>
         <w:r>
           <w:rPr>
@@ -4204,7 +4204,7 @@
           <w14:ligatures w14:val="standardContextual"/>
         </w:rPr>
       </w:pPr>
-      <w:hyperlink w:anchor="_Toc237711718" w:history="1">
+      <w:hyperlink w:anchor="_Toc237713188" w:history="1">
         <w:r>
           <w:rPr>
             <w:rStyle w:val="Hipervnculo"/>
@@ -4231,7 +4231,7 @@
             <w:noProof/>
             <w:webHidden/>
           </w:rPr>
-          <w:instrText xml:space="preserve"> PAGEREF _Toc237711718 \h </w:instrText>
+          <w:instrText xml:space="preserve"> PAGEREF _Toc237713188 \h </w:instrText>
         </w:r>
         <w:r>
           <w:rPr>
@@ -4278,7 +4278,7 @@
           <w14:ligatures w14:val="standardContextual"/>
         </w:rPr>
       </w:pPr>
-      <w:hyperlink w:anchor="_Toc237711719" w:history="1">
+      <w:hyperlink w:anchor="_Toc237713189" w:history="1">
         <w:r>
           <w:rPr>
             <w:rStyle w:val="Hipervnculo"/>
@@ -4305,7 +4305,7 @@
             <w:noProof/>
             <w:webHidden/>
           </w:rPr>
-          <w:instrText xml:space="preserve"> PAGEREF _Toc237711719 \h </w:instrText>
+          <w:instrText xml:space="preserve"> PAGEREF _Toc237713189 \h </w:instrText>
         </w:r>
         <w:r>
           <w:rPr>
@@ -4352,7 +4352,7 @@
           <w14:ligatures w14:val="standardContextual"/>
         </w:rPr>
       </w:pPr>
-      <w:hyperlink w:anchor="_Toc237711720" w:history="1">
+      <w:hyperlink w:anchor="_Toc237713190" w:history="1">
         <w:r>
           <w:rPr>
             <w:rStyle w:val="Hipervnculo"/>
@@ -4379,7 +4379,7 @@
             <w:noProof/>
             <w:webHidden/>
           </w:rPr>
-          <w:instrText xml:space="preserve"> PAGEREF _Toc237711720 \h </w:instrText>
+          <w:instrText xml:space="preserve"> PAGEREF _Toc237713190 \h </w:instrText>
         </w:r>
         <w:r>
           <w:rPr>
@@ -4426,7 +4426,7 @@
           <w14:ligatures w14:val="standardContextual"/>
         </w:rPr>
       </w:pPr>
-      <w:hyperlink w:anchor="_Toc237711721" w:history="1">
+      <w:hyperlink w:anchor="_Toc237713191" w:history="1">
         <w:r>
           <w:rPr>
             <w:rStyle w:val="Hipervnculo"/>
@@ -4453,7 +4453,7 @@
             <w:noProof/>
             <w:webHidden/>
           </w:rPr>
-          <w:instrText xml:space="preserve"> PAGEREF _Toc237711721 \h </w:instrText>
+          <w:instrText xml:space="preserve"> PAGEREF _Toc237713191 \h </w:instrText>
         </w:r>
         <w:r>
           <w:rPr>
@@ -4500,7 +4500,7 @@
           <w14:ligatures w14:val="standardContextual"/>
         </w:rPr>
       </w:pPr>
-      <w:hyperlink w:anchor="_Toc237711722" w:history="1">
+      <w:hyperlink w:anchor="_Toc237713192" w:history="1">
         <w:r>
           <w:rPr>
             <w:rStyle w:val="Hipervnculo"/>
@@ -4527,7 +4527,7 @@
             <w:noProof/>
             <w:webHidden/>
           </w:rPr>
-          <w:instrText xml:space="preserve"> PAGEREF _Toc237711722 \h </w:instrText>
+          <w:instrText xml:space="preserve"> PAGEREF _Toc237713192 \h </w:instrText>
         </w:r>
         <w:r>
           <w:rPr>
@@ -4574,7 +4574,7 @@
           <w14:ligatures w14:val="standardContextual"/>
         </w:rPr>
       </w:pPr>
-      <w:hyperlink w:anchor="_Toc237711723" w:history="1">
+      <w:hyperlink w:anchor="_Toc237713193" w:history="1">
         <w:r>
           <w:rPr>
             <w:rStyle w:val="Hipervnculo"/>
@@ -4601,7 +4601,7 @@
             <w:noProof/>
             <w:webHidden/>
           </w:rPr>
-          <w:instrText xml:space="preserve"> PAGEREF _Toc237711723 \h </w:instrText>
+          <w:instrText xml:space="preserve"> PAGEREF _Toc237713193 \h </w:instrText>
         </w:r>
         <w:r>
           <w:rPr>
@@ -4648,7 +4648,7 @@
           <w14:ligatures w14:val="standardContextual"/>
         </w:rPr>
       </w:pPr>
-      <w:hyperlink w:anchor="_Toc237711724" w:history="1">
+      <w:hyperlink w:anchor="_Toc237713194" w:history="1">
         <w:r>
           <w:rPr>
             <w:rStyle w:val="Hipervnculo"/>
@@ -4675,7 +4675,7 @@
             <w:noProof/>
             <w:webHidden/>
           </w:rPr>
-          <w:instrText xml:space="preserve"> PAGEREF _Toc237711724 \h </w:instrText>
+          <w:instrText xml:space="preserve"> PAGEREF _Toc237713194 \h </w:instrText>
         </w:r>
         <w:r>
           <w:rPr>
@@ -4722,7 +4722,7 @@
           <w14:ligatures w14:val="standardContextual"/>
         </w:rPr>
       </w:pPr>
-      <w:hyperlink w:anchor="_Toc237711725" w:history="1">
+      <w:hyperlink w:anchor="_Toc237713195" w:history="1">
         <w:r>
           <w:rPr>
             <w:rStyle w:val="Hipervnculo"/>
@@ -4749,7 +4749,7 @@
             <w:noProof/>
             <w:webHidden/>
           </w:rPr>
-          <w:instrText xml:space="preserve"> PAGEREF _Toc237711725 \h </w:instrText>
+          <w:instrText xml:space="preserve"> PAGEREF _Toc237713195 \h </w:instrText>
         </w:r>
         <w:r>
           <w:rPr>
@@ -4796,7 +4796,7 @@
           <w14:ligatures w14:val="standardContextual"/>
         </w:rPr>
       </w:pPr>
-      <w:hyperlink w:anchor="_Toc237711726" w:history="1">
+      <w:hyperlink w:anchor="_Toc237713196" w:history="1">
         <w:r>
           <w:rPr>
             <w:rStyle w:val="Hipervnculo"/>
@@ -4823,7 +4823,7 @@
             <w:noProof/>
             <w:webHidden/>
           </w:rPr>
-          <w:instrText xml:space="preserve"> PAGEREF _Toc237711726 \h </w:instrText>
+          <w:instrText xml:space="preserve"> PAGEREF _Toc237713196 \h </w:instrText>
         </w:r>
         <w:r>
           <w:rPr>
@@ -4870,7 +4870,7 @@
           <w14:ligatures w14:val="standardContextual"/>
         </w:rPr>
       </w:pPr>
-      <w:hyperlink w:anchor="_Toc237711727" w:history="1">
+      <w:hyperlink w:anchor="_Toc237713197" w:history="1">
         <w:r>
           <w:rPr>
             <w:rStyle w:val="Hipervnculo"/>
@@ -4897,7 +4897,7 @@
             <w:noProof/>
             <w:webHidden/>
           </w:rPr>
-          <w:instrText xml:space="preserve"> PAGEREF _Toc237711727 \h </w:instrText>
+          <w:instrText xml:space="preserve"> PAGEREF _Toc237713197 \h </w:instrText>
         </w:r>
         <w:r>
           <w:rPr>
@@ -4944,7 +4944,7 @@
           <w14:ligatures w14:val="standardContextual"/>
         </w:rPr>
       </w:pPr>
-      <w:hyperlink w:anchor="_Toc237711728" w:history="1">
+      <w:hyperlink w:anchor="_Toc237713198" w:history="1">
         <w:r>
           <w:rPr>
             <w:rStyle w:val="Hipervnculo"/>
@@ -4971,7 +4971,7 @@
             <w:noProof/>
             <w:webHidden/>
           </w:rPr>
-          <w:instrText xml:space="preserve"> PAGEREF _Toc237711728 \h </w:instrText>
+          <w:instrText xml:space="preserve"> PAGEREF _Toc237713198 \h </w:instrText>
         </w:r>
         <w:r>
           <w:rPr>
@@ -5018,7 +5018,7 @@
           <w14:ligatures w14:val="standardContextual"/>
         </w:rPr>
       </w:pPr>
-      <w:hyperlink w:anchor="_Toc237711729" w:history="1">
+      <w:hyperlink w:anchor="_Toc237713199" w:history="1">
         <w:r>
           <w:rPr>
             <w:rStyle w:val="Hipervnculo"/>
@@ -5045,7 +5045,7 @@
             <w:noProof/>
             <w:webHidden/>
           </w:rPr>
-          <w:instrText xml:space="preserve"> PAGEREF _Toc237711729 \h </w:instrText>
+          <w:instrText xml:space="preserve"> PAGEREF _Toc237713199 \h </w:instrText>
         </w:r>
         <w:r>
           <w:rPr>
@@ -5092,7 +5092,7 @@
           <w14:ligatures w14:val="standardContextual"/>
         </w:rPr>
       </w:pPr>
-      <w:hyperlink w:anchor="_Toc237711730" w:history="1">
+      <w:hyperlink w:anchor="_Toc237713200" w:history="1">
         <w:r>
           <w:rPr>
             <w:rStyle w:val="Hipervnculo"/>
@@ -5119,7 +5119,7 @@
             <w:noProof/>
             <w:webHidden/>
           </w:rPr>
-          <w:instrText xml:space="preserve"> PAGEREF _Toc237711730 \h </w:instrText>
+          <w:instrText xml:space="preserve"> PAGEREF _Toc237713200 \h </w:instrText>
         </w:r>
         <w:r>
           <w:rPr>
@@ -5166,7 +5166,7 @@
           <w14:ligatures w14:val="standardContextual"/>
         </w:rPr>
       </w:pPr>
-      <w:hyperlink w:anchor="_Toc237711731" w:history="1">
+      <w:hyperlink w:anchor="_Toc237713201" w:history="1">
         <w:r>
           <w:rPr>
             <w:rStyle w:val="Hipervnculo"/>
@@ -5193,7 +5193,7 @@
             <w:noProof/>
             <w:webHidden/>
           </w:rPr>
-          <w:instrText xml:space="preserve"> PAGEREF _Toc237711731 \h </w:instrText>
+          <w:instrText xml:space="preserve"> PAGEREF _Toc237713201 \h </w:instrText>
         </w:r>
         <w:r>
           <w:rPr>
@@ -5240,7 +5240,7 @@
           <w14:ligatures w14:val="standardContextual"/>
         </w:rPr>
       </w:pPr>
-      <w:hyperlink w:anchor="_Toc237711732" w:history="1">
+      <w:hyperlink w:anchor="_Toc237713202" w:history="1">
         <w:r>
           <w:rPr>
             <w:rStyle w:val="Hipervnculo"/>
@@ -5267,7 +5267,7 @@
             <w:noProof/>
             <w:webHidden/>
           </w:rPr>
-          <w:instrText xml:space="preserve"> PAGEREF _Toc237711732 \h </w:instrText>
+          <w:instrText xml:space="preserve"> PAGEREF _Toc237713202 \h </w:instrText>
         </w:r>
         <w:r>
           <w:rPr>
@@ -5314,7 +5314,7 @@
           <w14:ligatures w14:val="standardContextual"/>
         </w:rPr>
       </w:pPr>
-      <w:hyperlink w:anchor="_Toc237711733" w:history="1">
+      <w:hyperlink w:anchor="_Toc237713203" w:history="1">
         <w:r>
           <w:rPr>
             <w:rStyle w:val="Hipervnculo"/>
@@ -5341,7 +5341,7 @@
             <w:noProof/>
             <w:webHidden/>
           </w:rPr>
-          <w:instrText xml:space="preserve"> PAGEREF _Toc237711733 \h </w:instrText>
+          <w:instrText xml:space="preserve"> PAGEREF _Toc237713203 \h </w:instrText>
         </w:r>
         <w:r>
           <w:rPr>
@@ -5388,7 +5388,7 @@
           <w14:ligatures w14:val="standardContextual"/>
         </w:rPr>
       </w:pPr>
-      <w:hyperlink w:anchor="_Toc237711734" w:history="1">
+      <w:hyperlink w:anchor="_Toc237713204" w:history="1">
         <w:r>
           <w:rPr>
             <w:rStyle w:val="Hipervnculo"/>
@@ -5415,7 +5415,7 @@
             <w:noProof/>
             <w:webHidden/>
           </w:rPr>
-          <w:instrText xml:space="preserve"> PAGEREF _Toc237711734 \h </w:instrText>
+          <w:instrText xml:space="preserve"> PAGEREF _Toc237713204 \h </w:instrText>
         </w:r>
         <w:r>
           <w:rPr>
@@ -5462,7 +5462,7 @@
           <w14:ligatures w14:val="standardContextual"/>
         </w:rPr>
       </w:pPr>
-      <w:hyperlink w:anchor="_Toc237711735" w:history="1">
+      <w:hyperlink w:anchor="_Toc237713205" w:history="1">
         <w:r>
           <w:rPr>
             <w:rStyle w:val="Hipervnculo"/>
@@ -5489,7 +5489,7 @@
             <w:noProof/>
             <w:webHidden/>
           </w:rPr>
-          <w:instrText xml:space="preserve"> PAGEREF _Toc237711735 \h </w:instrText>
+          <w:instrText xml:space="preserve"> PAGEREF _Toc237713205 \h </w:instrText>
         </w:r>
         <w:r>
           <w:rPr>
@@ -5536,7 +5536,7 @@
           <w14:ligatures w14:val="standardContextual"/>
         </w:rPr>
       </w:pPr>
-      <w:hyperlink w:anchor="_Toc237711736" w:history="1">
+      <w:hyperlink w:anchor="_Toc237713206" w:history="1">
         <w:r>
           <w:rPr>
             <w:rStyle w:val="Hipervnculo"/>
@@ -5563,7 +5563,7 @@
             <w:noProof/>
             <w:webHidden/>
           </w:rPr>
-          <w:instrText xml:space="preserve"> PAGEREF _Toc237711736 \h </w:instrText>
+          <w:instrText xml:space="preserve"> PAGEREF _Toc237713206 \h </w:instrText>
         </w:r>
         <w:r>
           <w:rPr>
@@ -5610,7 +5610,7 @@
           <w14:ligatures w14:val="standardContextual"/>
         </w:rPr>
       </w:pPr>
-      <w:hyperlink w:anchor="_Toc237711737" w:history="1">
+      <w:hyperlink w:anchor="_Toc237713207" w:history="1">
         <w:r>
           <w:rPr>
             <w:rStyle w:val="Hipervnculo"/>
@@ -5637,7 +5637,7 @@
             <w:noProof/>
             <w:webHidden/>
           </w:rPr>
-          <w:instrText xml:space="preserve"> PAGEREF _Toc237711737 \h </w:instrText>
+          <w:instrText xml:space="preserve"> PAGEREF _Toc237713207 \h </w:instrText>
         </w:r>
         <w:r>
           <w:rPr>
@@ -5684,7 +5684,7 @@
           <w14:ligatures w14:val="standardContextual"/>
         </w:rPr>
       </w:pPr>
-      <w:hyperlink w:anchor="_Toc237711738" w:history="1">
+      <w:hyperlink w:anchor="_Toc237713208" w:history="1">
         <w:r>
           <w:rPr>
             <w:rStyle w:val="Hipervnculo"/>
@@ -5711,7 +5711,7 @@
             <w:noProof/>
             <w:webHidden/>
           </w:rPr>
-          <w:instrText xml:space="preserve"> PAGEREF _Toc237711738 \h </w:instrText>
+          <w:instrText xml:space="preserve"> PAGEREF _Toc237713208 \h </w:instrText>
         </w:r>
         <w:r>
           <w:rPr>
@@ -5758,7 +5758,7 @@
           <w14:ligatures w14:val="standardContextual"/>
         </w:rPr>
       </w:pPr>
-      <w:hyperlink w:anchor="_Toc237711739" w:history="1">
+      <w:hyperlink w:anchor="_Toc237713209" w:history="1">
         <w:r>
           <w:rPr>
             <w:rStyle w:val="Hipervnculo"/>
@@ -5785,7 +5785,7 @@
             <w:noProof/>
             <w:webHidden/>
           </w:rPr>
-          <w:instrText xml:space="preserve"> PAGEREF _Toc237711739 \h </w:instrText>
+          <w:instrText xml:space="preserve"> PAGEREF _Toc237713209 \h </w:instrText>
         </w:r>
         <w:r>
           <w:rPr>
@@ -5832,7 +5832,7 @@
           <w14:ligatures w14:val="standardContextual"/>
         </w:rPr>
       </w:pPr>
-      <w:hyperlink w:anchor="_Toc237711740" w:history="1">
+      <w:hyperlink w:anchor="_Toc237713210" w:history="1">
         <w:r>
           <w:rPr>
             <w:rStyle w:val="Hipervnculo"/>
@@ -5859,7 +5859,7 @@
             <w:noProof/>
             <w:webHidden/>
           </w:rPr>
-          <w:instrText xml:space="preserve"> PAGEREF _Toc237711740 \h </w:instrText>
+          <w:instrText xml:space="preserve"> PAGEREF _Toc237713210 \h </w:instrText>
         </w:r>
         <w:r>
           <w:rPr>
@@ -5906,7 +5906,7 @@
           <w14:ligatures w14:val="standardContextual"/>
         </w:rPr>
       </w:pPr>
-      <w:hyperlink w:anchor="_Toc237711741" w:history="1">
+      <w:hyperlink w:anchor="_Toc237713211" w:history="1">
         <w:r>
           <w:rPr>
             <w:rStyle w:val="Hipervnculo"/>
@@ -5933,7 +5933,7 @@
             <w:noProof/>
             <w:webHidden/>
           </w:rPr>
-          <w:instrText xml:space="preserve"> PAGEREF _Toc237711741 \h </w:instrText>
+          <w:instrText xml:space="preserve"> PAGEREF _Toc237713211 \h </w:instrText>
         </w:r>
         <w:r>
           <w:rPr>
@@ -5980,7 +5980,7 @@
           <w14:ligatures w14:val="standardContextual"/>
         </w:rPr>
       </w:pPr>
-      <w:hyperlink w:anchor="_Toc237711742" w:history="1">
+      <w:hyperlink w:anchor="_Toc237713212" w:history="1">
         <w:r>
           <w:rPr>
             <w:rStyle w:val="Hipervnculo"/>
@@ -6007,7 +6007,7 @@
             <w:noProof/>
             <w:webHidden/>
           </w:rPr>
-          <w:instrText xml:space="preserve"> PAGEREF _Toc237711742 \h </w:instrText>
+          <w:instrText xml:space="preserve"> PAGEREF _Toc237713212 \h </w:instrText>
         </w:r>
         <w:r>
           <w:rPr>
@@ -6091,7 +6091,7 @@
         <w:pStyle w:val="Ttulo1"/>
         <w:spacing w:before="100" w:after="30"/>
       </w:pPr>
-      <w:bookmarkStart w:id="0" w:name="_Toc237711680"/>
+      <w:bookmarkStart w:id="0" w:name="_Toc237713150"/>
       <w:r>
         <w:rPr>
           <w:rFonts w:ascii="Georgia" w:hAnsi="Georgia"/>
@@ -6108,7 +6108,7 @@
         <w:pStyle w:val="Ttulo2"/>
         <w:spacing w:before="70" w:after="20"/>
       </w:pPr>
-      <w:bookmarkStart w:id="1" w:name="_Toc237711681"/>
+      <w:bookmarkStart w:id="1" w:name="_Toc237713151"/>
       <w:r>
         <w:rPr>
           <w:rFonts w:ascii="Georgia" w:hAnsi="Georgia"/>
@@ -6149,7 +6149,7 @@
         <w:pStyle w:val="Ttulo2"/>
         <w:spacing w:before="70" w:after="20"/>
       </w:pPr>
-      <w:bookmarkStart w:id="2" w:name="_Toc237711682"/>
+      <w:bookmarkStart w:id="2" w:name="_Toc237713152"/>
       <w:r>
         <w:rPr>
           <w:rFonts w:ascii="Georgia" w:hAnsi="Georgia"/>
@@ -6210,7 +6210,7 @@
                 <w:noProof/>
               </w:rPr>
               <w:drawing>
-                <wp:inline distT="0" distB="0" distL="0" distR="0" wp14:anchorId="03E4C008" wp14:editId="79A79FA3">
+                <wp:inline distT="0" distB="0" distL="0" distR="0" wp14:anchorId="660EB883" wp14:editId="5DC96F00">
                   <wp:extent cx="2926080" cy="1524412"/>
                   <wp:effectExtent l="0" t="0" r="0" b="0"/>
                   <wp:docPr id="1" name="Picture 1"/>
@@ -6269,7 +6269,7 @@
                 <w:noProof/>
               </w:rPr>
               <w:drawing>
-                <wp:inline distT="0" distB="0" distL="0" distR="0" wp14:anchorId="2EA41AEA" wp14:editId="68A94FA8">
+                <wp:inline distT="0" distB="0" distL="0" distR="0" wp14:anchorId="13B4450B" wp14:editId="05C97C02">
                   <wp:extent cx="2926080" cy="1437831"/>
                   <wp:effectExtent l="0" t="0" r="0" b="0"/>
                   <wp:docPr id="2" name="Picture 2"/>
@@ -6374,7 +6374,7 @@
         <w:pStyle w:val="Ttulo2"/>
         <w:spacing w:before="70" w:after="20"/>
       </w:pPr>
-      <w:bookmarkStart w:id="3" w:name="_Toc237711683"/>
+      <w:bookmarkStart w:id="3" w:name="_Toc237713153"/>
       <w:r>
         <w:rPr>
           <w:rFonts w:ascii="Georgia" w:hAnsi="Georgia"/>
@@ -6501,7 +6501,7 @@
         <w:pStyle w:val="Ttulo2"/>
         <w:spacing w:before="70" w:after="20"/>
       </w:pPr>
-      <w:bookmarkStart w:id="4" w:name="_Toc237711684"/>
+      <w:bookmarkStart w:id="4" w:name="_Toc237713154"/>
       <w:r>
         <w:rPr>
           <w:rFonts w:ascii="Georgia" w:hAnsi="Georgia"/>
@@ -7029,7 +7029,7 @@
         <w:pStyle w:val="Ttulo2"/>
         <w:spacing w:before="70" w:after="20"/>
       </w:pPr>
-      <w:bookmarkStart w:id="5" w:name="_Toc237711685"/>
+      <w:bookmarkStart w:id="5" w:name="_Toc237713155"/>
       <w:r>
         <w:rPr>
           <w:rFonts w:ascii="Georgia" w:hAnsi="Georgia"/>
@@ -7162,7 +7162,7 @@
         <w:pStyle w:val="Ttulo2"/>
         <w:spacing w:before="70" w:after="20"/>
       </w:pPr>
-      <w:bookmarkStart w:id="6" w:name="_Toc237711686"/>
+      <w:bookmarkStart w:id="6" w:name="_Toc237713156"/>
       <w:r>
         <w:rPr>
           <w:rFonts w:ascii="Georgia" w:hAnsi="Georgia"/>
@@ -8379,7 +8379,7 @@
         <w:pStyle w:val="Ttulo1"/>
         <w:spacing w:before="100" w:after="30"/>
       </w:pPr>
-      <w:bookmarkStart w:id="7" w:name="_Toc237711687"/>
+      <w:bookmarkStart w:id="7" w:name="_Toc237713157"/>
       <w:r>
         <w:rPr>
           <w:rFonts w:ascii="Georgia" w:hAnsi="Georgia"/>
@@ -8395,7 +8395,7 @@
         <w:pStyle w:val="Ttulo2"/>
         <w:spacing w:before="70" w:after="20"/>
       </w:pPr>
-      <w:bookmarkStart w:id="8" w:name="_Toc237711688"/>
+      <w:bookmarkStart w:id="8" w:name="_Toc237713158"/>
       <w:r>
         <w:rPr>
           <w:rFonts w:ascii="Georgia" w:hAnsi="Georgia"/>
@@ -8453,7 +8453,7 @@
                 <w:noProof/>
               </w:rPr>
               <w:drawing>
-                <wp:inline distT="0" distB="0" distL="0" distR="0" wp14:anchorId="4261D944" wp14:editId="3ED8DB7F">
+                <wp:inline distT="0" distB="0" distL="0" distR="0" wp14:anchorId="1DA7175E" wp14:editId="2E38454B">
                   <wp:extent cx="2926080" cy="1426594"/>
                   <wp:effectExtent l="0" t="0" r="0" b="0"/>
                   <wp:docPr id="3" name="Picture 3"/>
@@ -8512,7 +8512,7 @@
                 <w:noProof/>
               </w:rPr>
               <w:drawing>
-                <wp:inline distT="0" distB="0" distL="0" distR="0" wp14:anchorId="20697027" wp14:editId="080059EB">
+                <wp:inline distT="0" distB="0" distL="0" distR="0" wp14:anchorId="3FC72769" wp14:editId="563FC6D4">
                   <wp:extent cx="2926080" cy="1494260"/>
                   <wp:effectExtent l="0" t="0" r="0" b="0"/>
                   <wp:docPr id="4" name="Picture 4"/>
@@ -8627,7 +8627,7 @@
         <w:pStyle w:val="Ttulo2"/>
         <w:spacing w:before="70" w:after="20"/>
       </w:pPr>
-      <w:bookmarkStart w:id="9" w:name="_Toc237711689"/>
+      <w:bookmarkStart w:id="9" w:name="_Toc237713159"/>
       <w:r>
         <w:rPr>
           <w:rFonts w:ascii="Georgia" w:hAnsi="Georgia"/>
@@ -8861,7 +8861,7 @@
         <w:pStyle w:val="Ttulo1"/>
         <w:spacing w:before="100" w:after="30"/>
       </w:pPr>
-      <w:bookmarkStart w:id="10" w:name="_Toc237711690"/>
+      <w:bookmarkStart w:id="10" w:name="_Toc237713160"/>
       <w:r>
         <w:rPr>
           <w:rFonts w:ascii="Georgia" w:hAnsi="Georgia"/>
@@ -8877,7 +8877,7 @@
         <w:pStyle w:val="Ttulo2"/>
         <w:spacing w:before="70" w:after="20"/>
       </w:pPr>
-      <w:bookmarkStart w:id="11" w:name="_Toc237711691"/>
+      <w:bookmarkStart w:id="11" w:name="_Toc237713161"/>
       <w:r>
         <w:rPr>
           <w:rFonts w:ascii="Georgia" w:hAnsi="Georgia"/>
@@ -8938,7 +8938,7 @@
                 <w:noProof/>
               </w:rPr>
               <w:drawing>
-                <wp:inline distT="0" distB="0" distL="0" distR="0" wp14:anchorId="1086465E" wp14:editId="0A464E42">
+                <wp:inline distT="0" distB="0" distL="0" distR="0" wp14:anchorId="67BB8B21" wp14:editId="20D56235">
                   <wp:extent cx="2926080" cy="1636252"/>
                   <wp:effectExtent l="0" t="0" r="0" b="0"/>
                   <wp:docPr id="5" name="Picture 5"/>
@@ -8997,7 +8997,7 @@
                 <w:noProof/>
               </w:rPr>
               <w:drawing>
-                <wp:inline distT="0" distB="0" distL="0" distR="0" wp14:anchorId="4634DFBE" wp14:editId="7578447A">
+                <wp:inline distT="0" distB="0" distL="0" distR="0" wp14:anchorId="35255057" wp14:editId="7387DF36">
                   <wp:extent cx="2926080" cy="1481181"/>
                   <wp:effectExtent l="0" t="0" r="0" b="0"/>
                   <wp:docPr id="6" name="Picture 6"/>
@@ -9112,7 +9112,7 @@
         <w:pStyle w:val="Ttulo2"/>
         <w:spacing w:before="70" w:after="20"/>
       </w:pPr>
-      <w:bookmarkStart w:id="12" w:name="_Toc237711692"/>
+      <w:bookmarkStart w:id="12" w:name="_Toc237713162"/>
       <w:r>
         <w:rPr>
           <w:rFonts w:ascii="Georgia" w:hAnsi="Georgia"/>
@@ -9143,7 +9143,7 @@
         <w:pStyle w:val="Ttulo2"/>
         <w:spacing w:before="70" w:after="20"/>
       </w:pPr>
-      <w:bookmarkStart w:id="13" w:name="_Toc237711693"/>
+      <w:bookmarkStart w:id="13" w:name="_Toc237713163"/>
       <w:r>
         <w:rPr>
           <w:rFonts w:ascii="Georgia" w:hAnsi="Georgia"/>
@@ -9201,7 +9201,7 @@
                 <w:noProof/>
               </w:rPr>
               <w:drawing>
-                <wp:inline distT="0" distB="0" distL="0" distR="0" wp14:anchorId="21E7EEF6" wp14:editId="59C729E8">
+                <wp:inline distT="0" distB="0" distL="0" distR="0" wp14:anchorId="3E8B1101" wp14:editId="78182CE6">
                   <wp:extent cx="2926080" cy="1626307"/>
                   <wp:effectExtent l="0" t="0" r="0" b="0"/>
                   <wp:docPr id="7" name="Picture 7"/>
@@ -9260,7 +9260,7 @@
                 <w:noProof/>
               </w:rPr>
               <w:drawing>
-                <wp:inline distT="0" distB="0" distL="0" distR="0" wp14:anchorId="489FA19E" wp14:editId="2F07F94D">
+                <wp:inline distT="0" distB="0" distL="0" distR="0" wp14:anchorId="527F7614" wp14:editId="7EE1C749">
                   <wp:extent cx="2926080" cy="1479479"/>
                   <wp:effectExtent l="0" t="0" r="0" b="0"/>
                   <wp:docPr id="8" name="Picture 8"/>
@@ -9365,7 +9365,7 @@
         <w:pStyle w:val="Ttulo2"/>
         <w:spacing w:before="70" w:after="20"/>
       </w:pPr>
-      <w:bookmarkStart w:id="14" w:name="_Toc237711694"/>
+      <w:bookmarkStart w:id="14" w:name="_Toc237713164"/>
       <w:r>
         <w:rPr>
           <w:rFonts w:ascii="Georgia" w:hAnsi="Georgia"/>
@@ -9426,7 +9426,7 @@
                 <w:noProof/>
               </w:rPr>
               <w:drawing>
-                <wp:inline distT="0" distB="0" distL="0" distR="0" wp14:anchorId="5FF3BCB6" wp14:editId="249B85BC">
+                <wp:inline distT="0" distB="0" distL="0" distR="0" wp14:anchorId="36A73C8C" wp14:editId="48CA989B">
                   <wp:extent cx="2926080" cy="1662311"/>
                   <wp:effectExtent l="0" t="0" r="0" b="0"/>
                   <wp:docPr id="9" name="Picture 9"/>
@@ -9485,7 +9485,7 @@
                 <w:noProof/>
               </w:rPr>
               <w:drawing>
-                <wp:inline distT="0" distB="0" distL="0" distR="0" wp14:anchorId="7D663B2F" wp14:editId="55F97BA0">
+                <wp:inline distT="0" distB="0" distL="0" distR="0" wp14:anchorId="1F4D52AB" wp14:editId="74693439">
                   <wp:extent cx="2926080" cy="1801004"/>
                   <wp:effectExtent l="0" t="0" r="0" b="0"/>
                   <wp:docPr id="10" name="Picture 10"/>
@@ -9590,7 +9590,7 @@
         <w:pStyle w:val="Ttulo1"/>
         <w:spacing w:before="100" w:after="30"/>
       </w:pPr>
-      <w:bookmarkStart w:id="15" w:name="_Toc237711695"/>
+      <w:bookmarkStart w:id="15" w:name="_Toc237713165"/>
       <w:r>
         <w:rPr>
           <w:rFonts w:ascii="Georgia" w:hAnsi="Georgia"/>
@@ -9606,7 +9606,7 @@
         <w:pStyle w:val="Ttulo2"/>
         <w:spacing w:before="70" w:after="20"/>
       </w:pPr>
-      <w:bookmarkStart w:id="16" w:name="_Toc237711696"/>
+      <w:bookmarkStart w:id="16" w:name="_Toc237713166"/>
       <w:r>
         <w:rPr>
           <w:rFonts w:ascii="Georgia" w:hAnsi="Georgia"/>
@@ -10045,7 +10045,7 @@
         <w:pStyle w:val="Ttulo2"/>
         <w:spacing w:before="70" w:after="20"/>
       </w:pPr>
-      <w:bookmarkStart w:id="17" w:name="_Toc237711697"/>
+      <w:bookmarkStart w:id="17" w:name="_Toc237713167"/>
       <w:r>
         <w:rPr>
           <w:rFonts w:ascii="Georgia" w:hAnsi="Georgia"/>
@@ -10073,7 +10073,7 @@
         <w:pStyle w:val="Ttulo1"/>
         <w:spacing w:before="100" w:after="30"/>
       </w:pPr>
-      <w:bookmarkStart w:id="18" w:name="_Toc237711698"/>
+      <w:bookmarkStart w:id="18" w:name="_Toc237713168"/>
       <w:r>
         <w:rPr>
           <w:rFonts w:ascii="Georgia" w:hAnsi="Georgia"/>
@@ -10089,7 +10089,7 @@
         <w:pStyle w:val="Ttulo2"/>
         <w:spacing w:before="70" w:after="20"/>
       </w:pPr>
-      <w:bookmarkStart w:id="19" w:name="_Toc237711699"/>
+      <w:bookmarkStart w:id="19" w:name="_Toc237713169"/>
       <w:r>
         <w:rPr>
           <w:rFonts w:ascii="Georgia" w:hAnsi="Georgia"/>
@@ -10116,7 +10116,7 @@
         <w:pStyle w:val="Ttulo2"/>
         <w:spacing w:before="70" w:after="20"/>
       </w:pPr>
-      <w:bookmarkStart w:id="20" w:name="_Toc237711700"/>
+      <w:bookmarkStart w:id="20" w:name="_Toc237713170"/>
       <w:r>
         <w:rPr>
           <w:rFonts w:ascii="Georgia" w:hAnsi="Georgia"/>
@@ -10174,7 +10174,7 @@
                 <w:noProof/>
               </w:rPr>
               <w:drawing>
-                <wp:inline distT="0" distB="0" distL="0" distR="0" wp14:anchorId="5F088536" wp14:editId="64EB4B85">
+                <wp:inline distT="0" distB="0" distL="0" distR="0" wp14:anchorId="03056134" wp14:editId="006EA9FD">
                   <wp:extent cx="2926080" cy="1714660"/>
                   <wp:effectExtent l="0" t="0" r="0" b="0"/>
                   <wp:docPr id="11" name="Picture 11"/>
@@ -10233,7 +10233,7 @@
                 <w:noProof/>
               </w:rPr>
               <w:drawing>
-                <wp:inline distT="0" distB="0" distL="0" distR="0" wp14:anchorId="31BD2487" wp14:editId="402F2882">
+                <wp:inline distT="0" distB="0" distL="0" distR="0" wp14:anchorId="307BF4D4" wp14:editId="1E6C300B">
                   <wp:extent cx="2926080" cy="1558188"/>
                   <wp:effectExtent l="0" t="0" r="0" b="0"/>
                   <wp:docPr id="12" name="Picture 12"/>
@@ -11203,7 +11203,7 @@
         <w:pStyle w:val="Ttulo1"/>
         <w:spacing w:before="100" w:after="30"/>
       </w:pPr>
-      <w:bookmarkStart w:id="21" w:name="_Toc237711701"/>
+      <w:bookmarkStart w:id="21" w:name="_Toc237713171"/>
       <w:r>
         <w:rPr>
           <w:rFonts w:ascii="Georgia" w:hAnsi="Georgia"/>
@@ -11220,7 +11220,7 @@
         <w:pStyle w:val="Ttulo2"/>
         <w:spacing w:before="70" w:after="20"/>
       </w:pPr>
-      <w:bookmarkStart w:id="22" w:name="_Toc237711702"/>
+      <w:bookmarkStart w:id="22" w:name="_Toc237713172"/>
       <w:r>
         <w:rPr>
           <w:rFonts w:ascii="Georgia" w:hAnsi="Georgia"/>
@@ -11312,7 +11312,7 @@
         <w:pStyle w:val="Ttulo2"/>
         <w:spacing w:before="70" w:after="20"/>
       </w:pPr>
-      <w:bookmarkStart w:id="23" w:name="_Toc237711703"/>
+      <w:bookmarkStart w:id="23" w:name="_Toc237713173"/>
       <w:r>
         <w:rPr>
           <w:rFonts w:ascii="Georgia" w:hAnsi="Georgia"/>
@@ -11543,7 +11543,7 @@
                 <w:noProof/>
               </w:rPr>
               <w:drawing>
-                <wp:inline distT="0" distB="0" distL="0" distR="0" wp14:anchorId="6C31D86B" wp14:editId="4F486EDD">
+                <wp:inline distT="0" distB="0" distL="0" distR="0" wp14:anchorId="377BE42F" wp14:editId="26EDBA87">
                   <wp:extent cx="2926080" cy="1540391"/>
                   <wp:effectExtent l="0" t="0" r="0" b="0"/>
                   <wp:docPr id="13" name="Picture 13"/>
@@ -11602,7 +11602,7 @@
                 <w:noProof/>
               </w:rPr>
               <w:drawing>
-                <wp:inline distT="0" distB="0" distL="0" distR="0" wp14:anchorId="28D20701" wp14:editId="1C63685D">
+                <wp:inline distT="0" distB="0" distL="0" distR="0" wp14:anchorId="091987F1" wp14:editId="3380D330">
                   <wp:extent cx="2926080" cy="1658038"/>
                   <wp:effectExtent l="0" t="0" r="0" b="0"/>
                   <wp:docPr id="14" name="Picture 14"/>
@@ -11707,7 +11707,7 @@
         <w:pStyle w:val="Ttulo2"/>
         <w:spacing w:before="70" w:after="20"/>
       </w:pPr>
-      <w:bookmarkStart w:id="24" w:name="_Toc237711704"/>
+      <w:bookmarkStart w:id="24" w:name="_Toc237713174"/>
       <w:r>
         <w:rPr>
           <w:rFonts w:ascii="Georgia" w:hAnsi="Georgia"/>
@@ -12635,7 +12635,7 @@
         <w:pStyle w:val="Ttulo1"/>
         <w:spacing w:before="100" w:after="30"/>
       </w:pPr>
-      <w:bookmarkStart w:id="25" w:name="_Toc237711705"/>
+      <w:bookmarkStart w:id="25" w:name="_Toc237713175"/>
       <w:r>
         <w:rPr>
           <w:rFonts w:ascii="Georgia" w:hAnsi="Georgia"/>
@@ -12651,7 +12651,7 @@
         <w:pStyle w:val="Ttulo2"/>
         <w:spacing w:before="70" w:after="20"/>
       </w:pPr>
-      <w:bookmarkStart w:id="26" w:name="_Toc237711706"/>
+      <w:bookmarkStart w:id="26" w:name="_Toc237713176"/>
       <w:r>
         <w:rPr>
           <w:rFonts w:ascii="Georgia" w:hAnsi="Georgia"/>
@@ -14240,7 +14240,7 @@
         <w:pStyle w:val="Ttulo2"/>
         <w:spacing w:before="70" w:after="20"/>
       </w:pPr>
-      <w:bookmarkStart w:id="27" w:name="_Toc237711707"/>
+      <w:bookmarkStart w:id="27" w:name="_Toc237713177"/>
       <w:r>
         <w:rPr>
           <w:rFonts w:ascii="Georgia" w:hAnsi="Georgia"/>
@@ -14350,7 +14350,7 @@
         <w:pStyle w:val="Ttulo1"/>
         <w:spacing w:before="100" w:after="30"/>
       </w:pPr>
-      <w:bookmarkStart w:id="28" w:name="_Toc237711708"/>
+      <w:bookmarkStart w:id="28" w:name="_Toc237713178"/>
       <w:r>
         <w:rPr>
           <w:rFonts w:ascii="Georgia" w:hAnsi="Georgia"/>
@@ -14367,7 +14367,7 @@
         <w:pStyle w:val="Ttulo2"/>
         <w:spacing w:before="70" w:after="20"/>
       </w:pPr>
-      <w:bookmarkStart w:id="29" w:name="_Toc237711709"/>
+      <w:bookmarkStart w:id="29" w:name="_Toc237713179"/>
       <w:r>
         <w:rPr>
           <w:rFonts w:ascii="Georgia" w:hAnsi="Georgia"/>
@@ -14394,7 +14394,7 @@
         <w:pStyle w:val="Ttulo2"/>
         <w:spacing w:before="70" w:after="20"/>
       </w:pPr>
-      <w:bookmarkStart w:id="30" w:name="_Toc237711710"/>
+      <w:bookmarkStart w:id="30" w:name="_Toc237713180"/>
       <w:r>
         <w:rPr>
           <w:rFonts w:ascii="Georgia" w:hAnsi="Georgia"/>
@@ -14452,7 +14452,7 @@
                 <w:noProof/>
               </w:rPr>
               <w:drawing>
-                <wp:inline distT="0" distB="0" distL="0" distR="0" wp14:anchorId="2CA777B3" wp14:editId="2FA7E58B">
+                <wp:inline distT="0" distB="0" distL="0" distR="0" wp14:anchorId="70329979" wp14:editId="6036AA45">
                   <wp:extent cx="2926080" cy="1534596"/>
                   <wp:effectExtent l="0" t="0" r="0" b="0"/>
                   <wp:docPr id="15" name="Picture 15"/>
@@ -14511,7 +14511,7 @@
                 <w:noProof/>
               </w:rPr>
               <w:drawing>
-                <wp:inline distT="0" distB="0" distL="0" distR="0" wp14:anchorId="571DE554" wp14:editId="30F3AD92">
+                <wp:inline distT="0" distB="0" distL="0" distR="0" wp14:anchorId="2C2F07E3" wp14:editId="234E5BBE">
                   <wp:extent cx="2926080" cy="1680519"/>
                   <wp:effectExtent l="0" t="0" r="0" b="0"/>
                   <wp:docPr id="16" name="Picture 16"/>
@@ -14627,7 +14627,7 @@
         <w:pStyle w:val="Ttulo1"/>
         <w:spacing w:before="100" w:after="30"/>
       </w:pPr>
-      <w:bookmarkStart w:id="31" w:name="_Toc237711711"/>
+      <w:bookmarkStart w:id="31" w:name="_Toc237713181"/>
       <w:r>
         <w:rPr>
           <w:rFonts w:ascii="Georgia" w:hAnsi="Georgia"/>
@@ -14643,7 +14643,7 @@
         <w:pStyle w:val="Ttulo2"/>
         <w:spacing w:before="70" w:after="20"/>
       </w:pPr>
-      <w:bookmarkStart w:id="32" w:name="_Toc237711712"/>
+      <w:bookmarkStart w:id="32" w:name="_Toc237713182"/>
       <w:r>
         <w:rPr>
           <w:rFonts w:ascii="Georgia" w:hAnsi="Georgia"/>
@@ -15690,7 +15690,7 @@
         <w:pStyle w:val="Ttulo2"/>
         <w:spacing w:before="70" w:after="20"/>
       </w:pPr>
-      <w:bookmarkStart w:id="33" w:name="_Toc237711713"/>
+      <w:bookmarkStart w:id="33" w:name="_Toc237713183"/>
       <w:r>
         <w:rPr>
           <w:rFonts w:ascii="Georgia" w:hAnsi="Georgia"/>
@@ -15851,7 +15851,7 @@
         <w:pStyle w:val="Ttulo2"/>
         <w:spacing w:before="70" w:after="20"/>
       </w:pPr>
-      <w:bookmarkStart w:id="34" w:name="_Toc237711714"/>
+      <w:bookmarkStart w:id="34" w:name="_Toc237713184"/>
       <w:r>
         <w:rPr>
           <w:rFonts w:ascii="Georgia" w:hAnsi="Georgia"/>
@@ -15878,7 +15878,7 @@
         <w:pStyle w:val="Ttulo1"/>
         <w:spacing w:before="100" w:after="30"/>
       </w:pPr>
-      <w:bookmarkStart w:id="35" w:name="_Toc237711715"/>
+      <w:bookmarkStart w:id="35" w:name="_Toc237713185"/>
       <w:r>
         <w:rPr>
           <w:rFonts w:ascii="Georgia" w:hAnsi="Georgia"/>
@@ -15894,7 +15894,7 @@
         <w:pStyle w:val="Ttulo2"/>
         <w:spacing w:before="70" w:after="20"/>
       </w:pPr>
-      <w:bookmarkStart w:id="36" w:name="_Toc237711716"/>
+      <w:bookmarkStart w:id="36" w:name="_Toc237713186"/>
       <w:r>
         <w:rPr>
           <w:rFonts w:ascii="Georgia" w:hAnsi="Georgia"/>
@@ -18821,7 +18821,7 @@
         <w:pStyle w:val="Ttulo1"/>
         <w:spacing w:before="100" w:after="30"/>
       </w:pPr>
-      <w:bookmarkStart w:id="37" w:name="_Toc237711717"/>
+      <w:bookmarkStart w:id="37" w:name="_Toc237713187"/>
       <w:r>
         <w:rPr>
           <w:rFonts w:ascii="Georgia" w:hAnsi="Georgia"/>
@@ -18838,7 +18838,7 @@
         <w:pStyle w:val="Ttulo2"/>
         <w:spacing w:before="70" w:after="20"/>
       </w:pPr>
-      <w:bookmarkStart w:id="38" w:name="_Toc237711718"/>
+      <w:bookmarkStart w:id="38" w:name="_Toc237713188"/>
       <w:r>
         <w:rPr>
           <w:rFonts w:ascii="Georgia" w:hAnsi="Georgia"/>
@@ -19023,7 +19023,7 @@
         <w:pStyle w:val="Ttulo2"/>
         <w:spacing w:before="70" w:after="20"/>
       </w:pPr>
-      <w:bookmarkStart w:id="39" w:name="_Toc237711719"/>
+      <w:bookmarkStart w:id="39" w:name="_Toc237713189"/>
       <w:r>
         <w:rPr>
           <w:rFonts w:ascii="Georgia" w:hAnsi="Georgia"/>
@@ -19081,7 +19081,7 @@
                 <w:noProof/>
               </w:rPr>
               <w:drawing>
-                <wp:inline distT="0" distB="0" distL="0" distR="0" wp14:anchorId="0F567CA7" wp14:editId="03F8D881">
+                <wp:inline distT="0" distB="0" distL="0" distR="0" wp14:anchorId="10225E6B" wp14:editId="118CF2E9">
                   <wp:extent cx="2926080" cy="1626569"/>
                   <wp:effectExtent l="0" t="0" r="0" b="0"/>
                   <wp:docPr id="17" name="Picture 17"/>
@@ -19140,7 +19140,7 @@
                 <w:noProof/>
               </w:rPr>
               <w:drawing>
-                <wp:inline distT="0" distB="0" distL="0" distR="0" wp14:anchorId="7C968B6D" wp14:editId="366FC823">
+                <wp:inline distT="0" distB="0" distL="0" distR="0" wp14:anchorId="674F856C" wp14:editId="70BE6396">
                   <wp:extent cx="2926080" cy="1691675"/>
                   <wp:effectExtent l="0" t="0" r="0" b="0"/>
                   <wp:docPr id="18" name="Picture 18"/>
@@ -19245,7 +19245,7 @@
         <w:pStyle w:val="Ttulo2"/>
         <w:spacing w:before="70" w:after="20"/>
       </w:pPr>
-      <w:bookmarkStart w:id="40" w:name="_Toc237711720"/>
+      <w:bookmarkStart w:id="40" w:name="_Toc237713190"/>
       <w:r>
         <w:rPr>
           <w:rFonts w:ascii="Georgia" w:hAnsi="Georgia"/>
@@ -19874,7 +19874,7 @@
         <w:pStyle w:val="Ttulo1"/>
         <w:spacing w:before="100" w:after="30"/>
       </w:pPr>
-      <w:bookmarkStart w:id="41" w:name="_Toc237711721"/>
+      <w:bookmarkStart w:id="41" w:name="_Toc237713191"/>
       <w:r>
         <w:rPr>
           <w:rFonts w:ascii="Georgia" w:hAnsi="Georgia"/>
@@ -19890,7 +19890,7 @@
         <w:pStyle w:val="Ttulo2"/>
         <w:spacing w:before="70" w:after="20"/>
       </w:pPr>
-      <w:bookmarkStart w:id="42" w:name="_Toc237711722"/>
+      <w:bookmarkStart w:id="42" w:name="_Toc237713192"/>
       <w:r>
         <w:rPr>
           <w:rFonts w:ascii="Georgia" w:hAnsi="Georgia"/>
@@ -19948,7 +19948,7 @@
                 <w:noProof/>
               </w:rPr>
               <w:drawing>
-                <wp:inline distT="0" distB="0" distL="0" distR="0" wp14:anchorId="795DC426" wp14:editId="1D3AD30D">
+                <wp:inline distT="0" distB="0" distL="0" distR="0" wp14:anchorId="52FF6C26" wp14:editId="2BE4D4FC">
                   <wp:extent cx="2926080" cy="1495195"/>
                   <wp:effectExtent l="0" t="0" r="0" b="0"/>
                   <wp:docPr id="19" name="Picture 19"/>
@@ -20007,7 +20007,7 @@
                 <w:noProof/>
               </w:rPr>
               <w:drawing>
-                <wp:inline distT="0" distB="0" distL="0" distR="0" wp14:anchorId="74BF6D44" wp14:editId="6ECFB7D8">
+                <wp:inline distT="0" distB="0" distL="0" distR="0" wp14:anchorId="04CB7F99" wp14:editId="0DEABEF7">
                   <wp:extent cx="2926080" cy="1682608"/>
                   <wp:effectExtent l="0" t="0" r="0" b="0"/>
                   <wp:docPr id="20" name="Picture 20"/>
@@ -21142,7 +21142,7 @@
         <w:pStyle w:val="Ttulo1"/>
         <w:spacing w:before="100" w:after="30"/>
       </w:pPr>
-      <w:bookmarkStart w:id="43" w:name="_Toc237711723"/>
+      <w:bookmarkStart w:id="43" w:name="_Toc237713193"/>
       <w:r>
         <w:rPr>
           <w:rFonts w:ascii="Georgia" w:hAnsi="Georgia"/>
@@ -21159,7 +21159,7 @@
         <w:pStyle w:val="Ttulo2"/>
         <w:spacing w:before="70" w:after="20"/>
       </w:pPr>
-      <w:bookmarkStart w:id="44" w:name="_Toc237711724"/>
+      <w:bookmarkStart w:id="44" w:name="_Toc237713194"/>
       <w:r>
         <w:rPr>
           <w:rFonts w:ascii="Georgia" w:hAnsi="Georgia"/>
@@ -21214,7 +21214,7 @@
         <w:pStyle w:val="Ttulo2"/>
         <w:spacing w:before="70" w:after="20"/>
       </w:pPr>
-      <w:bookmarkStart w:id="45" w:name="_Toc237711725"/>
+      <w:bookmarkStart w:id="45" w:name="_Toc237713195"/>
       <w:r>
         <w:rPr>
           <w:rFonts w:ascii="Georgia" w:hAnsi="Georgia"/>
@@ -21272,7 +21272,7 @@
                 <w:noProof/>
               </w:rPr>
               <w:drawing>
-                <wp:inline distT="0" distB="0" distL="0" distR="0" wp14:anchorId="31CCDA46" wp14:editId="1ADE6C33">
+                <wp:inline distT="0" distB="0" distL="0" distR="0" wp14:anchorId="01ACCDEB" wp14:editId="5D646F16">
                   <wp:extent cx="2926080" cy="1682608"/>
                   <wp:effectExtent l="0" t="0" r="0" b="0"/>
                   <wp:docPr id="21" name="Picture 21"/>
@@ -21331,7 +21331,7 @@
                 <w:noProof/>
               </w:rPr>
               <w:drawing>
-                <wp:inline distT="0" distB="0" distL="0" distR="0" wp14:anchorId="61E99FEA" wp14:editId="5AA8C779">
+                <wp:inline distT="0" distB="0" distL="0" distR="0" wp14:anchorId="71067A1B" wp14:editId="208749DC">
                   <wp:extent cx="2926080" cy="1549755"/>
                   <wp:effectExtent l="0" t="0" r="0" b="0"/>
                   <wp:docPr id="22" name="Picture 22"/>
@@ -21436,7 +21436,7 @@
         <w:pStyle w:val="Ttulo1"/>
         <w:spacing w:before="100" w:after="30"/>
       </w:pPr>
-      <w:bookmarkStart w:id="46" w:name="_Toc237711726"/>
+      <w:bookmarkStart w:id="46" w:name="_Toc237713196"/>
       <w:r>
         <w:rPr>
           <w:rFonts w:ascii="Georgia" w:hAnsi="Georgia"/>
@@ -21452,7 +21452,7 @@
         <w:pStyle w:val="Ttulo2"/>
         <w:spacing w:before="70" w:after="20"/>
       </w:pPr>
-      <w:bookmarkStart w:id="47" w:name="_Toc237711727"/>
+      <w:bookmarkStart w:id="47" w:name="_Toc237713197"/>
       <w:r>
         <w:rPr>
           <w:rFonts w:ascii="Georgia" w:hAnsi="Georgia"/>
@@ -23000,7 +23000,7 @@
         <w:pStyle w:val="Ttulo1"/>
         <w:spacing w:before="100" w:after="30"/>
       </w:pPr>
-      <w:bookmarkStart w:id="48" w:name="_Toc237711728"/>
+      <w:bookmarkStart w:id="48" w:name="_Toc237713198"/>
       <w:r>
         <w:rPr>
           <w:rFonts w:ascii="Georgia" w:hAnsi="Georgia"/>
@@ -23017,7 +23017,7 @@
         <w:pStyle w:val="Ttulo2"/>
         <w:spacing w:before="70" w:after="20"/>
       </w:pPr>
-      <w:bookmarkStart w:id="49" w:name="_Toc237711729"/>
+      <w:bookmarkStart w:id="49" w:name="_Toc237713199"/>
       <w:r>
         <w:rPr>
           <w:rFonts w:ascii="Georgia" w:hAnsi="Georgia"/>
@@ -23140,7 +23140,7 @@
                 <w:noProof/>
               </w:rPr>
               <w:drawing>
-                <wp:inline distT="0" distB="0" distL="0" distR="0" wp14:anchorId="17F94347" wp14:editId="5096B7DC">
+                <wp:inline distT="0" distB="0" distL="0" distR="0" wp14:anchorId="01292DB4" wp14:editId="23CB0F62">
                   <wp:extent cx="2926080" cy="1695124"/>
                   <wp:effectExtent l="0" t="0" r="0" b="0"/>
                   <wp:docPr id="23" name="Picture 23"/>
@@ -23199,7 +23199,7 @@
                 <w:noProof/>
               </w:rPr>
               <w:drawing>
-                <wp:inline distT="0" distB="0" distL="0" distR="0" wp14:anchorId="41184E2F" wp14:editId="5C7C440E">
+                <wp:inline distT="0" distB="0" distL="0" distR="0" wp14:anchorId="4019F6E6" wp14:editId="3F21A1CB">
                   <wp:extent cx="2926080" cy="1572627"/>
                   <wp:effectExtent l="0" t="0" r="0" b="0"/>
                   <wp:docPr id="24" name="Picture 24"/>
@@ -23304,7 +23304,7 @@
         <w:pStyle w:val="Ttulo2"/>
         <w:spacing w:before="70" w:after="20"/>
       </w:pPr>
-      <w:bookmarkStart w:id="50" w:name="_Toc237711730"/>
+      <w:bookmarkStart w:id="50" w:name="_Toc237713200"/>
       <w:r>
         <w:rPr>
           <w:rFonts w:ascii="Georgia" w:hAnsi="Georgia"/>
@@ -24039,7 +24039,7 @@
         <w:pStyle w:val="Ttulo2"/>
         <w:spacing w:before="70" w:after="20"/>
       </w:pPr>
-      <w:bookmarkStart w:id="51" w:name="_Toc237711731"/>
+      <w:bookmarkStart w:id="51" w:name="_Toc237713201"/>
       <w:r>
         <w:rPr>
           <w:rFonts w:ascii="Georgia" w:hAnsi="Georgia"/>
@@ -24089,7 +24089,7 @@
         <w:pStyle w:val="Ttulo2"/>
         <w:spacing w:before="70" w:after="20"/>
       </w:pPr>
-      <w:bookmarkStart w:id="52" w:name="_Toc237711732"/>
+      <w:bookmarkStart w:id="52" w:name="_Toc237713202"/>
       <w:r>
         <w:rPr>
           <w:rFonts w:ascii="Georgia" w:hAnsi="Georgia"/>
@@ -24170,7 +24170,7 @@
                 <w:noProof/>
               </w:rPr>
               <w:drawing>
-                <wp:inline distT="0" distB="0" distL="0" distR="0" wp14:anchorId="264BA4E7" wp14:editId="3F020743">
+                <wp:inline distT="0" distB="0" distL="0" distR="0" wp14:anchorId="0848CECD" wp14:editId="6C325115">
                   <wp:extent cx="2926080" cy="1696900"/>
                   <wp:effectExtent l="0" t="0" r="0" b="0"/>
                   <wp:docPr id="25" name="Picture 25"/>
@@ -24229,7 +24229,7 @@
                 <w:noProof/>
               </w:rPr>
               <w:drawing>
-                <wp:inline distT="0" distB="0" distL="0" distR="0" wp14:anchorId="4BDD6AE8" wp14:editId="085B30C2">
+                <wp:inline distT="0" distB="0" distL="0" distR="0" wp14:anchorId="615D7ED3" wp14:editId="5AD74994">
                   <wp:extent cx="2926080" cy="1614092"/>
                   <wp:effectExtent l="0" t="0" r="0" b="0"/>
                   <wp:docPr id="26" name="Picture 26"/>
@@ -25254,7 +25254,7 @@
         <w:pStyle w:val="Ttulo2"/>
         <w:spacing w:before="70" w:after="20"/>
       </w:pPr>
-      <w:bookmarkStart w:id="53" w:name="_Toc237711733"/>
+      <w:bookmarkStart w:id="53" w:name="_Toc237713203"/>
       <w:r>
         <w:rPr>
           <w:rFonts w:ascii="Georgia" w:hAnsi="Georgia"/>
@@ -25312,7 +25312,7 @@
                 <w:noProof/>
               </w:rPr>
               <w:drawing>
-                <wp:inline distT="0" distB="0" distL="0" distR="0" wp14:anchorId="2D6A3A3A" wp14:editId="5F487BF0">
+                <wp:inline distT="0" distB="0" distL="0" distR="0" wp14:anchorId="102EA64F" wp14:editId="68AEDB9F">
                   <wp:extent cx="2926080" cy="1654733"/>
                   <wp:effectExtent l="0" t="0" r="0" b="0"/>
                   <wp:docPr id="27" name="Picture 27"/>
@@ -25371,7 +25371,7 @@
                 <w:noProof/>
               </w:rPr>
               <w:drawing>
-                <wp:inline distT="0" distB="0" distL="0" distR="0" wp14:anchorId="7AC7A137" wp14:editId="5780C4EC">
+                <wp:inline distT="0" distB="0" distL="0" distR="0" wp14:anchorId="172C4213" wp14:editId="17EF882E">
                   <wp:extent cx="2926080" cy="1698212"/>
                   <wp:effectExtent l="0" t="0" r="0" b="0"/>
                   <wp:docPr id="28" name="Picture 28"/>
@@ -25486,7 +25486,7 @@
         <w:pStyle w:val="Ttulo1"/>
         <w:spacing w:before="100" w:after="30"/>
       </w:pPr>
-      <w:bookmarkStart w:id="54" w:name="_Toc237711734"/>
+      <w:bookmarkStart w:id="54" w:name="_Toc237713204"/>
       <w:r>
         <w:rPr>
           <w:rFonts w:ascii="Georgia" w:hAnsi="Georgia"/>
@@ -25503,7 +25503,7 @@
         <w:pStyle w:val="Ttulo2"/>
         <w:spacing w:before="70" w:after="20"/>
       </w:pPr>
-      <w:bookmarkStart w:id="55" w:name="_Toc237711735"/>
+      <w:bookmarkStart w:id="55" w:name="_Toc237713205"/>
       <w:r>
         <w:rPr>
           <w:rFonts w:ascii="Georgia" w:hAnsi="Georgia"/>
@@ -25564,7 +25564,7 @@
         <w:pStyle w:val="Ttulo2"/>
         <w:spacing w:before="70" w:after="20"/>
       </w:pPr>
-      <w:bookmarkStart w:id="56" w:name="_Toc237711736"/>
+      <w:bookmarkStart w:id="56" w:name="_Toc237713206"/>
       <w:r>
         <w:rPr>
           <w:rFonts w:ascii="Georgia" w:hAnsi="Georgia"/>
@@ -25639,7 +25639,7 @@
                 <w:noProof/>
               </w:rPr>
               <w:drawing>
-                <wp:inline distT="0" distB="0" distL="0" distR="0" wp14:anchorId="020F7B03" wp14:editId="26EEDD6F">
+                <wp:inline distT="0" distB="0" distL="0" distR="0" wp14:anchorId="5B4805CE" wp14:editId="75139968">
                   <wp:extent cx="2926080" cy="1650045"/>
                   <wp:effectExtent l="0" t="0" r="0" b="0"/>
                   <wp:docPr id="29" name="Picture 29"/>
@@ -25698,7 +25698,7 @@
                 <w:noProof/>
               </w:rPr>
               <w:drawing>
-                <wp:inline distT="0" distB="0" distL="0" distR="0" wp14:anchorId="34B1BFC6" wp14:editId="2216CE3F">
+                <wp:inline distT="0" distB="0" distL="0" distR="0" wp14:anchorId="0BF1285D" wp14:editId="3DA63BBF">
                   <wp:extent cx="2926080" cy="1611196"/>
                   <wp:effectExtent l="0" t="0" r="0" b="0"/>
                   <wp:docPr id="30" name="Picture 30"/>
@@ -26186,7 +26186,7 @@
         <w:pStyle w:val="Ttulo2"/>
         <w:spacing w:before="70" w:after="20"/>
       </w:pPr>
-      <w:bookmarkStart w:id="57" w:name="_Toc237711737"/>
+      <w:bookmarkStart w:id="57" w:name="_Toc237713207"/>
       <w:r>
         <w:rPr>
           <w:rFonts w:ascii="Georgia" w:hAnsi="Georgia"/>
@@ -26260,7 +26260,7 @@
                 <w:noProof/>
               </w:rPr>
               <w:drawing>
-                <wp:inline distT="0" distB="0" distL="0" distR="0" wp14:anchorId="5FF30D05" wp14:editId="0A475342">
+                <wp:inline distT="0" distB="0" distL="0" distR="0" wp14:anchorId="2D4EDE90" wp14:editId="45BCFB6D">
                   <wp:extent cx="2926080" cy="1687777"/>
                   <wp:effectExtent l="0" t="0" r="0" b="0"/>
                   <wp:docPr id="31" name="Picture 31"/>
@@ -26855,7 +26855,7 @@
         <w:pStyle w:val="Ttulo2"/>
         <w:spacing w:before="70" w:after="20"/>
       </w:pPr>
-      <w:bookmarkStart w:id="58" w:name="_Toc237711738"/>
+      <w:bookmarkStart w:id="58" w:name="_Toc237713208"/>
       <w:r>
         <w:rPr>
           <w:rFonts w:ascii="Georgia" w:hAnsi="Georgia"/>
@@ -28114,7 +28114,7 @@
         <w:pStyle w:val="Ttulo1"/>
         <w:spacing w:before="100" w:after="30"/>
       </w:pPr>
-      <w:bookmarkStart w:id="59" w:name="_Toc237711739"/>
+      <w:bookmarkStart w:id="59" w:name="_Toc237713209"/>
       <w:r>
         <w:rPr>
           <w:rFonts w:ascii="Georgia" w:hAnsi="Georgia"/>
@@ -28302,7 +28302,7 @@
         <w:pStyle w:val="Ttulo1"/>
         <w:spacing w:before="100" w:after="30"/>
       </w:pPr>
-      <w:bookmarkStart w:id="60" w:name="_Toc237711740"/>
+      <w:bookmarkStart w:id="60" w:name="_Toc237713210"/>
       <w:r>
         <w:rPr>
           <w:rFonts w:ascii="Georgia" w:hAnsi="Georgia"/>
@@ -37431,7 +37431,7 @@
         <w:pStyle w:val="Ttulo1"/>
         <w:spacing w:before="100" w:after="30"/>
       </w:pPr>
-      <w:bookmarkStart w:id="61" w:name="_Toc237711741"/>
+      <w:bookmarkStart w:id="61" w:name="_Toc237713211"/>
       <w:r>
         <w:rPr>
           <w:rFonts w:ascii="Georgia" w:hAnsi="Georgia"/>
@@ -37903,7 +37903,7 @@
         <w:pStyle w:val="Ttulo1"/>
         <w:spacing w:before="100" w:after="30"/>
       </w:pPr>
-      <w:bookmarkStart w:id="62" w:name="_Toc237711742"/>
+      <w:bookmarkStart w:id="62" w:name="_Toc237713212"/>
       <w:r>
         <w:rPr>
           <w:rFonts w:ascii="Georgia" w:hAnsi="Georgia"/>
@@ -38228,7 +38228,7 @@
         <w:sz w:val="16"/>
       </w:rPr>
       <w:tab/>
-      <w:t>FCE · UNCuyo</w:t>
+      <w:t>Análisis Independiente</w:t>
     </w:r>
   </w:p>
 </w:hdr>
@@ -38407,31 +38407,31 @@
       </w:rPr>
     </w:lvl>
   </w:abstractNum>
-  <w:num w:numId="1" w16cid:durableId="2039694692">
+  <w:num w:numId="1" w16cid:durableId="332689990">
     <w:abstractNumId w:val="8"/>
   </w:num>
-  <w:num w:numId="2" w16cid:durableId="1877768788">
+  <w:num w:numId="2" w16cid:durableId="421073216">
     <w:abstractNumId w:val="6"/>
   </w:num>
-  <w:num w:numId="3" w16cid:durableId="640578039">
+  <w:num w:numId="3" w16cid:durableId="227346078">
     <w:abstractNumId w:val="5"/>
   </w:num>
-  <w:num w:numId="4" w16cid:durableId="1652518962">
+  <w:num w:numId="4" w16cid:durableId="1866822289">
     <w:abstractNumId w:val="4"/>
   </w:num>
-  <w:num w:numId="5" w16cid:durableId="1512992261">
+  <w:num w:numId="5" w16cid:durableId="2111729949">
     <w:abstractNumId w:val="7"/>
   </w:num>
-  <w:num w:numId="6" w16cid:durableId="1297444625">
+  <w:num w:numId="6" w16cid:durableId="1149900605">
     <w:abstractNumId w:val="3"/>
   </w:num>
-  <w:num w:numId="7" w16cid:durableId="1846706000">
+  <w:num w:numId="7" w16cid:durableId="1125195354">
     <w:abstractNumId w:val="2"/>
   </w:num>
-  <w:num w:numId="8" w16cid:durableId="1123963031">
+  <w:num w:numId="8" w16cid:durableId="1565721409">
     <w:abstractNumId w:val="1"/>
   </w:num>
-  <w:num w:numId="9" w16cid:durableId="1374498728">
+  <w:num w:numId="9" w16cid:durableId="1958370726">
     <w:abstractNumId w:val="0"/>
   </w:num>
 </w:numbering>
@@ -49863,7 +49863,7 @@
     <w:autoRedefine/>
     <w:uiPriority w:val="39"/>
     <w:unhideWhenUsed/>
-    <w:rsid w:val="0094730E"/>
+    <w:rsid w:val="001433A1"/>
     <w:pPr>
       <w:spacing w:before="10" w:after="10" w:line="240" w:lineRule="auto"/>
     </w:pPr>
@@ -49878,7 +49878,7 @@
     <w:autoRedefine/>
     <w:uiPriority w:val="39"/>
     <w:unhideWhenUsed/>
-    <w:rsid w:val="0094730E"/>
+    <w:rsid w:val="001433A1"/>
     <w:pPr>
       <w:spacing w:after="0" w:line="240" w:lineRule="auto"/>
       <w:ind w:left="170"/>
@@ -49892,7 +49892,7 @@
     <w:basedOn w:val="Fuentedeprrafopredeter"/>
     <w:uiPriority w:val="99"/>
     <w:unhideWhenUsed/>
-    <w:rsid w:val="0094730E"/>
+    <w:rsid w:val="001433A1"/>
     <w:rPr>
       <w:color w:val="0000FF" w:themeColor="hyperlink"/>
       <w:u w:val="single"/>

</xml_diff>

<commit_message>
style(reporte): Eliminar linea horizontal bajo titulos de seccion y sanear metadatos PDF
</commit_message>
<xml_diff>
--- a/01_Reporte_PDF/Informe_Valuacion_Aluar_UNCuyo.docx
+++ b/01_Reporte_PDF/Informe_Valuacion_Aluar_UNCuyo.docx
@@ -1362,7 +1362,7 @@
         </w:rPr>
         <w:fldChar w:fldCharType="separate"/>
       </w:r>
-      <w:hyperlink w:anchor="_Toc237713150" w:history="1">
+      <w:hyperlink w:anchor="_Toc237713722" w:history="1">
         <w:r>
           <w:rPr>
             <w:rStyle w:val="Hipervnculo"/>
@@ -1389,7 +1389,7 @@
             <w:noProof/>
             <w:webHidden/>
           </w:rPr>
-          <w:instrText xml:space="preserve"> PAGEREF _Toc237713150 \h </w:instrText>
+          <w:instrText xml:space="preserve"> PAGEREF _Toc237713722 \h </w:instrText>
         </w:r>
         <w:r>
           <w:rPr>
@@ -1436,7 +1436,7 @@
           <w14:ligatures w14:val="standardContextual"/>
         </w:rPr>
       </w:pPr>
-      <w:hyperlink w:anchor="_Toc237713151" w:history="1">
+      <w:hyperlink w:anchor="_Toc237713723" w:history="1">
         <w:r>
           <w:rPr>
             <w:rStyle w:val="Hipervnculo"/>
@@ -1463,7 +1463,7 @@
             <w:noProof/>
             <w:webHidden/>
           </w:rPr>
-          <w:instrText xml:space="preserve"> PAGEREF _Toc237713151 \h </w:instrText>
+          <w:instrText xml:space="preserve"> PAGEREF _Toc237713723 \h </w:instrText>
         </w:r>
         <w:r>
           <w:rPr>
@@ -1510,7 +1510,7 @@
           <w14:ligatures w14:val="standardContextual"/>
         </w:rPr>
       </w:pPr>
-      <w:hyperlink w:anchor="_Toc237713152" w:history="1">
+      <w:hyperlink w:anchor="_Toc237713724" w:history="1">
         <w:r>
           <w:rPr>
             <w:rStyle w:val="Hipervnculo"/>
@@ -1537,7 +1537,7 @@
             <w:noProof/>
             <w:webHidden/>
           </w:rPr>
-          <w:instrText xml:space="preserve"> PAGEREF _Toc237713152 \h </w:instrText>
+          <w:instrText xml:space="preserve"> PAGEREF _Toc237713724 \h </w:instrText>
         </w:r>
         <w:r>
           <w:rPr>
@@ -1584,7 +1584,7 @@
           <w14:ligatures w14:val="standardContextual"/>
         </w:rPr>
       </w:pPr>
-      <w:hyperlink w:anchor="_Toc237713153" w:history="1">
+      <w:hyperlink w:anchor="_Toc237713725" w:history="1">
         <w:r>
           <w:rPr>
             <w:rStyle w:val="Hipervnculo"/>
@@ -1611,7 +1611,7 @@
             <w:noProof/>
             <w:webHidden/>
           </w:rPr>
-          <w:instrText xml:space="preserve"> PAGEREF _Toc237713153 \h </w:instrText>
+          <w:instrText xml:space="preserve"> PAGEREF _Toc237713725 \h </w:instrText>
         </w:r>
         <w:r>
           <w:rPr>
@@ -1658,7 +1658,7 @@
           <w14:ligatures w14:val="standardContextual"/>
         </w:rPr>
       </w:pPr>
-      <w:hyperlink w:anchor="_Toc237713154" w:history="1">
+      <w:hyperlink w:anchor="_Toc237713726" w:history="1">
         <w:r>
           <w:rPr>
             <w:rStyle w:val="Hipervnculo"/>
@@ -1685,7 +1685,7 @@
             <w:noProof/>
             <w:webHidden/>
           </w:rPr>
-          <w:instrText xml:space="preserve"> PAGEREF _Toc237713154 \h </w:instrText>
+          <w:instrText xml:space="preserve"> PAGEREF _Toc237713726 \h </w:instrText>
         </w:r>
         <w:r>
           <w:rPr>
@@ -1732,7 +1732,7 @@
           <w14:ligatures w14:val="standardContextual"/>
         </w:rPr>
       </w:pPr>
-      <w:hyperlink w:anchor="_Toc237713155" w:history="1">
+      <w:hyperlink w:anchor="_Toc237713727" w:history="1">
         <w:r>
           <w:rPr>
             <w:rStyle w:val="Hipervnculo"/>
@@ -1759,7 +1759,7 @@
             <w:noProof/>
             <w:webHidden/>
           </w:rPr>
-          <w:instrText xml:space="preserve"> PAGEREF _Toc237713155 \h </w:instrText>
+          <w:instrText xml:space="preserve"> PAGEREF _Toc237713727 \h </w:instrText>
         </w:r>
         <w:r>
           <w:rPr>
@@ -1806,7 +1806,7 @@
           <w14:ligatures w14:val="standardContextual"/>
         </w:rPr>
       </w:pPr>
-      <w:hyperlink w:anchor="_Toc237713156" w:history="1">
+      <w:hyperlink w:anchor="_Toc237713728" w:history="1">
         <w:r>
           <w:rPr>
             <w:rStyle w:val="Hipervnculo"/>
@@ -1833,7 +1833,7 @@
             <w:noProof/>
             <w:webHidden/>
           </w:rPr>
-          <w:instrText xml:space="preserve"> PAGEREF _Toc237713156 \h </w:instrText>
+          <w:instrText xml:space="preserve"> PAGEREF _Toc237713728 \h </w:instrText>
         </w:r>
         <w:r>
           <w:rPr>
@@ -1880,7 +1880,7 @@
           <w14:ligatures w14:val="standardContextual"/>
         </w:rPr>
       </w:pPr>
-      <w:hyperlink w:anchor="_Toc237713157" w:history="1">
+      <w:hyperlink w:anchor="_Toc237713729" w:history="1">
         <w:r>
           <w:rPr>
             <w:rStyle w:val="Hipervnculo"/>
@@ -1907,7 +1907,7 @@
             <w:noProof/>
             <w:webHidden/>
           </w:rPr>
-          <w:instrText xml:space="preserve"> PAGEREF _Toc237713157 \h </w:instrText>
+          <w:instrText xml:space="preserve"> PAGEREF _Toc237713729 \h </w:instrText>
         </w:r>
         <w:r>
           <w:rPr>
@@ -1954,7 +1954,7 @@
           <w14:ligatures w14:val="standardContextual"/>
         </w:rPr>
       </w:pPr>
-      <w:hyperlink w:anchor="_Toc237713158" w:history="1">
+      <w:hyperlink w:anchor="_Toc237713730" w:history="1">
         <w:r>
           <w:rPr>
             <w:rStyle w:val="Hipervnculo"/>
@@ -1981,7 +1981,7 @@
             <w:noProof/>
             <w:webHidden/>
           </w:rPr>
-          <w:instrText xml:space="preserve"> PAGEREF _Toc237713158 \h </w:instrText>
+          <w:instrText xml:space="preserve"> PAGEREF _Toc237713730 \h </w:instrText>
         </w:r>
         <w:r>
           <w:rPr>
@@ -2028,7 +2028,7 @@
           <w14:ligatures w14:val="standardContextual"/>
         </w:rPr>
       </w:pPr>
-      <w:hyperlink w:anchor="_Toc237713159" w:history="1">
+      <w:hyperlink w:anchor="_Toc237713731" w:history="1">
         <w:r>
           <w:rPr>
             <w:rStyle w:val="Hipervnculo"/>
@@ -2055,7 +2055,7 @@
             <w:noProof/>
             <w:webHidden/>
           </w:rPr>
-          <w:instrText xml:space="preserve"> PAGEREF _Toc237713159 \h </w:instrText>
+          <w:instrText xml:space="preserve"> PAGEREF _Toc237713731 \h </w:instrText>
         </w:r>
         <w:r>
           <w:rPr>
@@ -2102,7 +2102,7 @@
           <w14:ligatures w14:val="standardContextual"/>
         </w:rPr>
       </w:pPr>
-      <w:hyperlink w:anchor="_Toc237713160" w:history="1">
+      <w:hyperlink w:anchor="_Toc237713732" w:history="1">
         <w:r>
           <w:rPr>
             <w:rStyle w:val="Hipervnculo"/>
@@ -2129,7 +2129,7 @@
             <w:noProof/>
             <w:webHidden/>
           </w:rPr>
-          <w:instrText xml:space="preserve"> PAGEREF _Toc237713160 \h </w:instrText>
+          <w:instrText xml:space="preserve"> PAGEREF _Toc237713732 \h </w:instrText>
         </w:r>
         <w:r>
           <w:rPr>
@@ -2176,7 +2176,7 @@
           <w14:ligatures w14:val="standardContextual"/>
         </w:rPr>
       </w:pPr>
-      <w:hyperlink w:anchor="_Toc237713161" w:history="1">
+      <w:hyperlink w:anchor="_Toc237713733" w:history="1">
         <w:r>
           <w:rPr>
             <w:rStyle w:val="Hipervnculo"/>
@@ -2203,7 +2203,7 @@
             <w:noProof/>
             <w:webHidden/>
           </w:rPr>
-          <w:instrText xml:space="preserve"> PAGEREF _Toc237713161 \h </w:instrText>
+          <w:instrText xml:space="preserve"> PAGEREF _Toc237713733 \h </w:instrText>
         </w:r>
         <w:r>
           <w:rPr>
@@ -2250,7 +2250,7 @@
           <w14:ligatures w14:val="standardContextual"/>
         </w:rPr>
       </w:pPr>
-      <w:hyperlink w:anchor="_Toc237713162" w:history="1">
+      <w:hyperlink w:anchor="_Toc237713734" w:history="1">
         <w:r>
           <w:rPr>
             <w:rStyle w:val="Hipervnculo"/>
@@ -2277,7 +2277,7 @@
             <w:noProof/>
             <w:webHidden/>
           </w:rPr>
-          <w:instrText xml:space="preserve"> PAGEREF _Toc237713162 \h </w:instrText>
+          <w:instrText xml:space="preserve"> PAGEREF _Toc237713734 \h </w:instrText>
         </w:r>
         <w:r>
           <w:rPr>
@@ -2324,7 +2324,7 @@
           <w14:ligatures w14:val="standardContextual"/>
         </w:rPr>
       </w:pPr>
-      <w:hyperlink w:anchor="_Toc237713163" w:history="1">
+      <w:hyperlink w:anchor="_Toc237713735" w:history="1">
         <w:r>
           <w:rPr>
             <w:rStyle w:val="Hipervnculo"/>
@@ -2351,7 +2351,7 @@
             <w:noProof/>
             <w:webHidden/>
           </w:rPr>
-          <w:instrText xml:space="preserve"> PAGEREF _Toc237713163 \h </w:instrText>
+          <w:instrText xml:space="preserve"> PAGEREF _Toc237713735 \h </w:instrText>
         </w:r>
         <w:r>
           <w:rPr>
@@ -2398,7 +2398,7 @@
           <w14:ligatures w14:val="standardContextual"/>
         </w:rPr>
       </w:pPr>
-      <w:hyperlink w:anchor="_Toc237713164" w:history="1">
+      <w:hyperlink w:anchor="_Toc237713736" w:history="1">
         <w:r>
           <w:rPr>
             <w:rStyle w:val="Hipervnculo"/>
@@ -2425,7 +2425,7 @@
             <w:noProof/>
             <w:webHidden/>
           </w:rPr>
-          <w:instrText xml:space="preserve"> PAGEREF _Toc237713164 \h </w:instrText>
+          <w:instrText xml:space="preserve"> PAGEREF _Toc237713736 \h </w:instrText>
         </w:r>
         <w:r>
           <w:rPr>
@@ -2472,7 +2472,7 @@
           <w14:ligatures w14:val="standardContextual"/>
         </w:rPr>
       </w:pPr>
-      <w:hyperlink w:anchor="_Toc237713165" w:history="1">
+      <w:hyperlink w:anchor="_Toc237713737" w:history="1">
         <w:r>
           <w:rPr>
             <w:rStyle w:val="Hipervnculo"/>
@@ -2499,7 +2499,7 @@
             <w:noProof/>
             <w:webHidden/>
           </w:rPr>
-          <w:instrText xml:space="preserve"> PAGEREF _Toc237713165 \h </w:instrText>
+          <w:instrText xml:space="preserve"> PAGEREF _Toc237713737 \h </w:instrText>
         </w:r>
         <w:r>
           <w:rPr>
@@ -2546,7 +2546,7 @@
           <w14:ligatures w14:val="standardContextual"/>
         </w:rPr>
       </w:pPr>
-      <w:hyperlink w:anchor="_Toc237713166" w:history="1">
+      <w:hyperlink w:anchor="_Toc237713738" w:history="1">
         <w:r>
           <w:rPr>
             <w:rStyle w:val="Hipervnculo"/>
@@ -2573,7 +2573,7 @@
             <w:noProof/>
             <w:webHidden/>
           </w:rPr>
-          <w:instrText xml:space="preserve"> PAGEREF _Toc237713166 \h </w:instrText>
+          <w:instrText xml:space="preserve"> PAGEREF _Toc237713738 \h </w:instrText>
         </w:r>
         <w:r>
           <w:rPr>
@@ -2620,7 +2620,7 @@
           <w14:ligatures w14:val="standardContextual"/>
         </w:rPr>
       </w:pPr>
-      <w:hyperlink w:anchor="_Toc237713167" w:history="1">
+      <w:hyperlink w:anchor="_Toc237713739" w:history="1">
         <w:r>
           <w:rPr>
             <w:rStyle w:val="Hipervnculo"/>
@@ -2647,7 +2647,7 @@
             <w:noProof/>
             <w:webHidden/>
           </w:rPr>
-          <w:instrText xml:space="preserve"> PAGEREF _Toc237713167 \h </w:instrText>
+          <w:instrText xml:space="preserve"> PAGEREF _Toc237713739 \h </w:instrText>
         </w:r>
         <w:r>
           <w:rPr>
@@ -2694,7 +2694,7 @@
           <w14:ligatures w14:val="standardContextual"/>
         </w:rPr>
       </w:pPr>
-      <w:hyperlink w:anchor="_Toc237713168" w:history="1">
+      <w:hyperlink w:anchor="_Toc237713740" w:history="1">
         <w:r>
           <w:rPr>
             <w:rStyle w:val="Hipervnculo"/>
@@ -2721,7 +2721,7 @@
             <w:noProof/>
             <w:webHidden/>
           </w:rPr>
-          <w:instrText xml:space="preserve"> PAGEREF _Toc237713168 \h </w:instrText>
+          <w:instrText xml:space="preserve"> PAGEREF _Toc237713740 \h </w:instrText>
         </w:r>
         <w:r>
           <w:rPr>
@@ -2768,7 +2768,7 @@
           <w14:ligatures w14:val="standardContextual"/>
         </w:rPr>
       </w:pPr>
-      <w:hyperlink w:anchor="_Toc237713169" w:history="1">
+      <w:hyperlink w:anchor="_Toc237713741" w:history="1">
         <w:r>
           <w:rPr>
             <w:rStyle w:val="Hipervnculo"/>
@@ -2795,7 +2795,7 @@
             <w:noProof/>
             <w:webHidden/>
           </w:rPr>
-          <w:instrText xml:space="preserve"> PAGEREF _Toc237713169 \h </w:instrText>
+          <w:instrText xml:space="preserve"> PAGEREF _Toc237713741 \h </w:instrText>
         </w:r>
         <w:r>
           <w:rPr>
@@ -2842,7 +2842,7 @@
           <w14:ligatures w14:val="standardContextual"/>
         </w:rPr>
       </w:pPr>
-      <w:hyperlink w:anchor="_Toc237713170" w:history="1">
+      <w:hyperlink w:anchor="_Toc237713742" w:history="1">
         <w:r>
           <w:rPr>
             <w:rStyle w:val="Hipervnculo"/>
@@ -2869,7 +2869,7 @@
             <w:noProof/>
             <w:webHidden/>
           </w:rPr>
-          <w:instrText xml:space="preserve"> PAGEREF _Toc237713170 \h </w:instrText>
+          <w:instrText xml:space="preserve"> PAGEREF _Toc237713742 \h </w:instrText>
         </w:r>
         <w:r>
           <w:rPr>
@@ -2916,7 +2916,7 @@
           <w14:ligatures w14:val="standardContextual"/>
         </w:rPr>
       </w:pPr>
-      <w:hyperlink w:anchor="_Toc237713171" w:history="1">
+      <w:hyperlink w:anchor="_Toc237713743" w:history="1">
         <w:r>
           <w:rPr>
             <w:rStyle w:val="Hipervnculo"/>
@@ -2943,7 +2943,7 @@
             <w:noProof/>
             <w:webHidden/>
           </w:rPr>
-          <w:instrText xml:space="preserve"> PAGEREF _Toc237713171 \h </w:instrText>
+          <w:instrText xml:space="preserve"> PAGEREF _Toc237713743 \h </w:instrText>
         </w:r>
         <w:r>
           <w:rPr>
@@ -2990,7 +2990,7 @@
           <w14:ligatures w14:val="standardContextual"/>
         </w:rPr>
       </w:pPr>
-      <w:hyperlink w:anchor="_Toc237713172" w:history="1">
+      <w:hyperlink w:anchor="_Toc237713744" w:history="1">
         <w:r>
           <w:rPr>
             <w:rStyle w:val="Hipervnculo"/>
@@ -3017,7 +3017,7 @@
             <w:noProof/>
             <w:webHidden/>
           </w:rPr>
-          <w:instrText xml:space="preserve"> PAGEREF _Toc237713172 \h </w:instrText>
+          <w:instrText xml:space="preserve"> PAGEREF _Toc237713744 \h </w:instrText>
         </w:r>
         <w:r>
           <w:rPr>
@@ -3064,7 +3064,7 @@
           <w14:ligatures w14:val="standardContextual"/>
         </w:rPr>
       </w:pPr>
-      <w:hyperlink w:anchor="_Toc237713173" w:history="1">
+      <w:hyperlink w:anchor="_Toc237713745" w:history="1">
         <w:r>
           <w:rPr>
             <w:rStyle w:val="Hipervnculo"/>
@@ -3121,7 +3121,7 @@
             <w:noProof/>
             <w:webHidden/>
           </w:rPr>
-          <w:instrText xml:space="preserve"> PAGEREF _Toc237713173 \h </w:instrText>
+          <w:instrText xml:space="preserve"> PAGEREF _Toc237713745 \h </w:instrText>
         </w:r>
         <w:r>
           <w:rPr>
@@ -3168,7 +3168,7 @@
           <w14:ligatures w14:val="standardContextual"/>
         </w:rPr>
       </w:pPr>
-      <w:hyperlink w:anchor="_Toc237713174" w:history="1">
+      <w:hyperlink w:anchor="_Toc237713746" w:history="1">
         <w:r>
           <w:rPr>
             <w:rStyle w:val="Hipervnculo"/>
@@ -3195,7 +3195,7 @@
             <w:noProof/>
             <w:webHidden/>
           </w:rPr>
-          <w:instrText xml:space="preserve"> PAGEREF _Toc237713174 \h </w:instrText>
+          <w:instrText xml:space="preserve"> PAGEREF _Toc237713746 \h </w:instrText>
         </w:r>
         <w:r>
           <w:rPr>
@@ -3242,7 +3242,7 @@
           <w14:ligatures w14:val="standardContextual"/>
         </w:rPr>
       </w:pPr>
-      <w:hyperlink w:anchor="_Toc237713175" w:history="1">
+      <w:hyperlink w:anchor="_Toc237713747" w:history="1">
         <w:r>
           <w:rPr>
             <w:rStyle w:val="Hipervnculo"/>
@@ -3269,7 +3269,7 @@
             <w:noProof/>
             <w:webHidden/>
           </w:rPr>
-          <w:instrText xml:space="preserve"> PAGEREF _Toc237713175 \h </w:instrText>
+          <w:instrText xml:space="preserve"> PAGEREF _Toc237713747 \h </w:instrText>
         </w:r>
         <w:r>
           <w:rPr>
@@ -3316,7 +3316,7 @@
           <w14:ligatures w14:val="standardContextual"/>
         </w:rPr>
       </w:pPr>
-      <w:hyperlink w:anchor="_Toc237713176" w:history="1">
+      <w:hyperlink w:anchor="_Toc237713748" w:history="1">
         <w:r>
           <w:rPr>
             <w:rStyle w:val="Hipervnculo"/>
@@ -3343,7 +3343,7 @@
             <w:noProof/>
             <w:webHidden/>
           </w:rPr>
-          <w:instrText xml:space="preserve"> PAGEREF _Toc237713176 \h </w:instrText>
+          <w:instrText xml:space="preserve"> PAGEREF _Toc237713748 \h </w:instrText>
         </w:r>
         <w:r>
           <w:rPr>
@@ -3390,7 +3390,7 @@
           <w14:ligatures w14:val="standardContextual"/>
         </w:rPr>
       </w:pPr>
-      <w:hyperlink w:anchor="_Toc237713177" w:history="1">
+      <w:hyperlink w:anchor="_Toc237713749" w:history="1">
         <w:r>
           <w:rPr>
             <w:rStyle w:val="Hipervnculo"/>
@@ -3417,7 +3417,7 @@
             <w:noProof/>
             <w:webHidden/>
           </w:rPr>
-          <w:instrText xml:space="preserve"> PAGEREF _Toc237713177 \h </w:instrText>
+          <w:instrText xml:space="preserve"> PAGEREF _Toc237713749 \h </w:instrText>
         </w:r>
         <w:r>
           <w:rPr>
@@ -3464,7 +3464,7 @@
           <w14:ligatures w14:val="standardContextual"/>
         </w:rPr>
       </w:pPr>
-      <w:hyperlink w:anchor="_Toc237713178" w:history="1">
+      <w:hyperlink w:anchor="_Toc237713750" w:history="1">
         <w:r>
           <w:rPr>
             <w:rStyle w:val="Hipervnculo"/>
@@ -3491,7 +3491,7 @@
             <w:noProof/>
             <w:webHidden/>
           </w:rPr>
-          <w:instrText xml:space="preserve"> PAGEREF _Toc237713178 \h </w:instrText>
+          <w:instrText xml:space="preserve"> PAGEREF _Toc237713750 \h </w:instrText>
         </w:r>
         <w:r>
           <w:rPr>
@@ -3538,7 +3538,7 @@
           <w14:ligatures w14:val="standardContextual"/>
         </w:rPr>
       </w:pPr>
-      <w:hyperlink w:anchor="_Toc237713179" w:history="1">
+      <w:hyperlink w:anchor="_Toc237713751" w:history="1">
         <w:r>
           <w:rPr>
             <w:rStyle w:val="Hipervnculo"/>
@@ -3565,7 +3565,7 @@
             <w:noProof/>
             <w:webHidden/>
           </w:rPr>
-          <w:instrText xml:space="preserve"> PAGEREF _Toc237713179 \h </w:instrText>
+          <w:instrText xml:space="preserve"> PAGEREF _Toc237713751 \h </w:instrText>
         </w:r>
         <w:r>
           <w:rPr>
@@ -3612,7 +3612,7 @@
           <w14:ligatures w14:val="standardContextual"/>
         </w:rPr>
       </w:pPr>
-      <w:hyperlink w:anchor="_Toc237713180" w:history="1">
+      <w:hyperlink w:anchor="_Toc237713752" w:history="1">
         <w:r>
           <w:rPr>
             <w:rStyle w:val="Hipervnculo"/>
@@ -3639,7 +3639,7 @@
             <w:noProof/>
             <w:webHidden/>
           </w:rPr>
-          <w:instrText xml:space="preserve"> PAGEREF _Toc237713180 \h </w:instrText>
+          <w:instrText xml:space="preserve"> PAGEREF _Toc237713752 \h </w:instrText>
         </w:r>
         <w:r>
           <w:rPr>
@@ -3686,7 +3686,7 @@
           <w14:ligatures w14:val="standardContextual"/>
         </w:rPr>
       </w:pPr>
-      <w:hyperlink w:anchor="_Toc237713181" w:history="1">
+      <w:hyperlink w:anchor="_Toc237713753" w:history="1">
         <w:r>
           <w:rPr>
             <w:rStyle w:val="Hipervnculo"/>
@@ -3713,7 +3713,7 @@
             <w:noProof/>
             <w:webHidden/>
           </w:rPr>
-          <w:instrText xml:space="preserve"> PAGEREF _Toc237713181 \h </w:instrText>
+          <w:instrText xml:space="preserve"> PAGEREF _Toc237713753 \h </w:instrText>
         </w:r>
         <w:r>
           <w:rPr>
@@ -3760,7 +3760,7 @@
           <w14:ligatures w14:val="standardContextual"/>
         </w:rPr>
       </w:pPr>
-      <w:hyperlink w:anchor="_Toc237713182" w:history="1">
+      <w:hyperlink w:anchor="_Toc237713754" w:history="1">
         <w:r>
           <w:rPr>
             <w:rStyle w:val="Hipervnculo"/>
@@ -3787,7 +3787,7 @@
             <w:noProof/>
             <w:webHidden/>
           </w:rPr>
-          <w:instrText xml:space="preserve"> PAGEREF _Toc237713182 \h </w:instrText>
+          <w:instrText xml:space="preserve"> PAGEREF _Toc237713754 \h </w:instrText>
         </w:r>
         <w:r>
           <w:rPr>
@@ -3834,7 +3834,7 @@
           <w14:ligatures w14:val="standardContextual"/>
         </w:rPr>
       </w:pPr>
-      <w:hyperlink w:anchor="_Toc237713183" w:history="1">
+      <w:hyperlink w:anchor="_Toc237713755" w:history="1">
         <w:r>
           <w:rPr>
             <w:rStyle w:val="Hipervnculo"/>
@@ -3861,7 +3861,7 @@
             <w:noProof/>
             <w:webHidden/>
           </w:rPr>
-          <w:instrText xml:space="preserve"> PAGEREF _Toc237713183 \h </w:instrText>
+          <w:instrText xml:space="preserve"> PAGEREF _Toc237713755 \h </w:instrText>
         </w:r>
         <w:r>
           <w:rPr>
@@ -3908,7 +3908,7 @@
           <w14:ligatures w14:val="standardContextual"/>
         </w:rPr>
       </w:pPr>
-      <w:hyperlink w:anchor="_Toc237713184" w:history="1">
+      <w:hyperlink w:anchor="_Toc237713756" w:history="1">
         <w:r>
           <w:rPr>
             <w:rStyle w:val="Hipervnculo"/>
@@ -3935,7 +3935,7 @@
             <w:noProof/>
             <w:webHidden/>
           </w:rPr>
-          <w:instrText xml:space="preserve"> PAGEREF _Toc237713184 \h </w:instrText>
+          <w:instrText xml:space="preserve"> PAGEREF _Toc237713756 \h </w:instrText>
         </w:r>
         <w:r>
           <w:rPr>
@@ -3982,7 +3982,7 @@
           <w14:ligatures w14:val="standardContextual"/>
         </w:rPr>
       </w:pPr>
-      <w:hyperlink w:anchor="_Toc237713185" w:history="1">
+      <w:hyperlink w:anchor="_Toc237713757" w:history="1">
         <w:r>
           <w:rPr>
             <w:rStyle w:val="Hipervnculo"/>
@@ -4009,7 +4009,7 @@
             <w:noProof/>
             <w:webHidden/>
           </w:rPr>
-          <w:instrText xml:space="preserve"> PAGEREF _Toc237713185 \h </w:instrText>
+          <w:instrText xml:space="preserve"> PAGEREF _Toc237713757 \h </w:instrText>
         </w:r>
         <w:r>
           <w:rPr>
@@ -4056,7 +4056,7 @@
           <w14:ligatures w14:val="standardContextual"/>
         </w:rPr>
       </w:pPr>
-      <w:hyperlink w:anchor="_Toc237713186" w:history="1">
+      <w:hyperlink w:anchor="_Toc237713758" w:history="1">
         <w:r>
           <w:rPr>
             <w:rStyle w:val="Hipervnculo"/>
@@ -4083,7 +4083,7 @@
             <w:noProof/>
             <w:webHidden/>
           </w:rPr>
-          <w:instrText xml:space="preserve"> PAGEREF _Toc237713186 \h </w:instrText>
+          <w:instrText xml:space="preserve"> PAGEREF _Toc237713758 \h </w:instrText>
         </w:r>
         <w:r>
           <w:rPr>
@@ -4130,7 +4130,7 @@
           <w14:ligatures w14:val="standardContextual"/>
         </w:rPr>
       </w:pPr>
-      <w:hyperlink w:anchor="_Toc237713187" w:history="1">
+      <w:hyperlink w:anchor="_Toc237713759" w:history="1">
         <w:r>
           <w:rPr>
             <w:rStyle w:val="Hipervnculo"/>
@@ -4157,7 +4157,7 @@
             <w:noProof/>
             <w:webHidden/>
           </w:rPr>
-          <w:instrText xml:space="preserve"> PAGEREF _Toc237713187 \h </w:instrText>
+          <w:instrText xml:space="preserve"> PAGEREF _Toc237713759 \h </w:instrText>
         </w:r>
         <w:r>
           <w:rPr>
@@ -4204,7 +4204,7 @@
           <w14:ligatures w14:val="standardContextual"/>
         </w:rPr>
       </w:pPr>
-      <w:hyperlink w:anchor="_Toc237713188" w:history="1">
+      <w:hyperlink w:anchor="_Toc237713760" w:history="1">
         <w:r>
           <w:rPr>
             <w:rStyle w:val="Hipervnculo"/>
@@ -4231,7 +4231,7 @@
             <w:noProof/>
             <w:webHidden/>
           </w:rPr>
-          <w:instrText xml:space="preserve"> PAGEREF _Toc237713188 \h </w:instrText>
+          <w:instrText xml:space="preserve"> PAGEREF _Toc237713760 \h </w:instrText>
         </w:r>
         <w:r>
           <w:rPr>
@@ -4278,7 +4278,7 @@
           <w14:ligatures w14:val="standardContextual"/>
         </w:rPr>
       </w:pPr>
-      <w:hyperlink w:anchor="_Toc237713189" w:history="1">
+      <w:hyperlink w:anchor="_Toc237713761" w:history="1">
         <w:r>
           <w:rPr>
             <w:rStyle w:val="Hipervnculo"/>
@@ -4305,7 +4305,7 @@
             <w:noProof/>
             <w:webHidden/>
           </w:rPr>
-          <w:instrText xml:space="preserve"> PAGEREF _Toc237713189 \h </w:instrText>
+          <w:instrText xml:space="preserve"> PAGEREF _Toc237713761 \h </w:instrText>
         </w:r>
         <w:r>
           <w:rPr>
@@ -4352,7 +4352,7 @@
           <w14:ligatures w14:val="standardContextual"/>
         </w:rPr>
       </w:pPr>
-      <w:hyperlink w:anchor="_Toc237713190" w:history="1">
+      <w:hyperlink w:anchor="_Toc237713762" w:history="1">
         <w:r>
           <w:rPr>
             <w:rStyle w:val="Hipervnculo"/>
@@ -4379,7 +4379,7 @@
             <w:noProof/>
             <w:webHidden/>
           </w:rPr>
-          <w:instrText xml:space="preserve"> PAGEREF _Toc237713190 \h </w:instrText>
+          <w:instrText xml:space="preserve"> PAGEREF _Toc237713762 \h </w:instrText>
         </w:r>
         <w:r>
           <w:rPr>
@@ -4426,7 +4426,7 @@
           <w14:ligatures w14:val="standardContextual"/>
         </w:rPr>
       </w:pPr>
-      <w:hyperlink w:anchor="_Toc237713191" w:history="1">
+      <w:hyperlink w:anchor="_Toc237713763" w:history="1">
         <w:r>
           <w:rPr>
             <w:rStyle w:val="Hipervnculo"/>
@@ -4453,7 +4453,7 @@
             <w:noProof/>
             <w:webHidden/>
           </w:rPr>
-          <w:instrText xml:space="preserve"> PAGEREF _Toc237713191 \h </w:instrText>
+          <w:instrText xml:space="preserve"> PAGEREF _Toc237713763 \h </w:instrText>
         </w:r>
         <w:r>
           <w:rPr>
@@ -4500,7 +4500,7 @@
           <w14:ligatures w14:val="standardContextual"/>
         </w:rPr>
       </w:pPr>
-      <w:hyperlink w:anchor="_Toc237713192" w:history="1">
+      <w:hyperlink w:anchor="_Toc237713764" w:history="1">
         <w:r>
           <w:rPr>
             <w:rStyle w:val="Hipervnculo"/>
@@ -4527,7 +4527,7 @@
             <w:noProof/>
             <w:webHidden/>
           </w:rPr>
-          <w:instrText xml:space="preserve"> PAGEREF _Toc237713192 \h </w:instrText>
+          <w:instrText xml:space="preserve"> PAGEREF _Toc237713764 \h </w:instrText>
         </w:r>
         <w:r>
           <w:rPr>
@@ -4574,7 +4574,7 @@
           <w14:ligatures w14:val="standardContextual"/>
         </w:rPr>
       </w:pPr>
-      <w:hyperlink w:anchor="_Toc237713193" w:history="1">
+      <w:hyperlink w:anchor="_Toc237713765" w:history="1">
         <w:r>
           <w:rPr>
             <w:rStyle w:val="Hipervnculo"/>
@@ -4601,7 +4601,7 @@
             <w:noProof/>
             <w:webHidden/>
           </w:rPr>
-          <w:instrText xml:space="preserve"> PAGEREF _Toc237713193 \h </w:instrText>
+          <w:instrText xml:space="preserve"> PAGEREF _Toc237713765 \h </w:instrText>
         </w:r>
         <w:r>
           <w:rPr>
@@ -4648,7 +4648,7 @@
           <w14:ligatures w14:val="standardContextual"/>
         </w:rPr>
       </w:pPr>
-      <w:hyperlink w:anchor="_Toc237713194" w:history="1">
+      <w:hyperlink w:anchor="_Toc237713766" w:history="1">
         <w:r>
           <w:rPr>
             <w:rStyle w:val="Hipervnculo"/>
@@ -4675,7 +4675,7 @@
             <w:noProof/>
             <w:webHidden/>
           </w:rPr>
-          <w:instrText xml:space="preserve"> PAGEREF _Toc237713194 \h </w:instrText>
+          <w:instrText xml:space="preserve"> PAGEREF _Toc237713766 \h </w:instrText>
         </w:r>
         <w:r>
           <w:rPr>
@@ -4722,7 +4722,7 @@
           <w14:ligatures w14:val="standardContextual"/>
         </w:rPr>
       </w:pPr>
-      <w:hyperlink w:anchor="_Toc237713195" w:history="1">
+      <w:hyperlink w:anchor="_Toc237713767" w:history="1">
         <w:r>
           <w:rPr>
             <w:rStyle w:val="Hipervnculo"/>
@@ -4749,7 +4749,7 @@
             <w:noProof/>
             <w:webHidden/>
           </w:rPr>
-          <w:instrText xml:space="preserve"> PAGEREF _Toc237713195 \h </w:instrText>
+          <w:instrText xml:space="preserve"> PAGEREF _Toc237713767 \h </w:instrText>
         </w:r>
         <w:r>
           <w:rPr>
@@ -4796,7 +4796,7 @@
           <w14:ligatures w14:val="standardContextual"/>
         </w:rPr>
       </w:pPr>
-      <w:hyperlink w:anchor="_Toc237713196" w:history="1">
+      <w:hyperlink w:anchor="_Toc237713768" w:history="1">
         <w:r>
           <w:rPr>
             <w:rStyle w:val="Hipervnculo"/>
@@ -4823,7 +4823,7 @@
             <w:noProof/>
             <w:webHidden/>
           </w:rPr>
-          <w:instrText xml:space="preserve"> PAGEREF _Toc237713196 \h </w:instrText>
+          <w:instrText xml:space="preserve"> PAGEREF _Toc237713768 \h </w:instrText>
         </w:r>
         <w:r>
           <w:rPr>
@@ -4870,7 +4870,7 @@
           <w14:ligatures w14:val="standardContextual"/>
         </w:rPr>
       </w:pPr>
-      <w:hyperlink w:anchor="_Toc237713197" w:history="1">
+      <w:hyperlink w:anchor="_Toc237713769" w:history="1">
         <w:r>
           <w:rPr>
             <w:rStyle w:val="Hipervnculo"/>
@@ -4897,7 +4897,7 @@
             <w:noProof/>
             <w:webHidden/>
           </w:rPr>
-          <w:instrText xml:space="preserve"> PAGEREF _Toc237713197 \h </w:instrText>
+          <w:instrText xml:space="preserve"> PAGEREF _Toc237713769 \h </w:instrText>
         </w:r>
         <w:r>
           <w:rPr>
@@ -4944,7 +4944,7 @@
           <w14:ligatures w14:val="standardContextual"/>
         </w:rPr>
       </w:pPr>
-      <w:hyperlink w:anchor="_Toc237713198" w:history="1">
+      <w:hyperlink w:anchor="_Toc237713770" w:history="1">
         <w:r>
           <w:rPr>
             <w:rStyle w:val="Hipervnculo"/>
@@ -4971,7 +4971,7 @@
             <w:noProof/>
             <w:webHidden/>
           </w:rPr>
-          <w:instrText xml:space="preserve"> PAGEREF _Toc237713198 \h </w:instrText>
+          <w:instrText xml:space="preserve"> PAGEREF _Toc237713770 \h </w:instrText>
         </w:r>
         <w:r>
           <w:rPr>
@@ -5018,7 +5018,7 @@
           <w14:ligatures w14:val="standardContextual"/>
         </w:rPr>
       </w:pPr>
-      <w:hyperlink w:anchor="_Toc237713199" w:history="1">
+      <w:hyperlink w:anchor="_Toc237713771" w:history="1">
         <w:r>
           <w:rPr>
             <w:rStyle w:val="Hipervnculo"/>
@@ -5045,7 +5045,7 @@
             <w:noProof/>
             <w:webHidden/>
           </w:rPr>
-          <w:instrText xml:space="preserve"> PAGEREF _Toc237713199 \h </w:instrText>
+          <w:instrText xml:space="preserve"> PAGEREF _Toc237713771 \h </w:instrText>
         </w:r>
         <w:r>
           <w:rPr>
@@ -5092,7 +5092,7 @@
           <w14:ligatures w14:val="standardContextual"/>
         </w:rPr>
       </w:pPr>
-      <w:hyperlink w:anchor="_Toc237713200" w:history="1">
+      <w:hyperlink w:anchor="_Toc237713772" w:history="1">
         <w:r>
           <w:rPr>
             <w:rStyle w:val="Hipervnculo"/>
@@ -5119,7 +5119,7 @@
             <w:noProof/>
             <w:webHidden/>
           </w:rPr>
-          <w:instrText xml:space="preserve"> PAGEREF _Toc237713200 \h </w:instrText>
+          <w:instrText xml:space="preserve"> PAGEREF _Toc237713772 \h </w:instrText>
         </w:r>
         <w:r>
           <w:rPr>
@@ -5166,7 +5166,7 @@
           <w14:ligatures w14:val="standardContextual"/>
         </w:rPr>
       </w:pPr>
-      <w:hyperlink w:anchor="_Toc237713201" w:history="1">
+      <w:hyperlink w:anchor="_Toc237713773" w:history="1">
         <w:r>
           <w:rPr>
             <w:rStyle w:val="Hipervnculo"/>
@@ -5193,7 +5193,7 @@
             <w:noProof/>
             <w:webHidden/>
           </w:rPr>
-          <w:instrText xml:space="preserve"> PAGEREF _Toc237713201 \h </w:instrText>
+          <w:instrText xml:space="preserve"> PAGEREF _Toc237713773 \h </w:instrText>
         </w:r>
         <w:r>
           <w:rPr>
@@ -5240,7 +5240,7 @@
           <w14:ligatures w14:val="standardContextual"/>
         </w:rPr>
       </w:pPr>
-      <w:hyperlink w:anchor="_Toc237713202" w:history="1">
+      <w:hyperlink w:anchor="_Toc237713774" w:history="1">
         <w:r>
           <w:rPr>
             <w:rStyle w:val="Hipervnculo"/>
@@ -5267,7 +5267,7 @@
             <w:noProof/>
             <w:webHidden/>
           </w:rPr>
-          <w:instrText xml:space="preserve"> PAGEREF _Toc237713202 \h </w:instrText>
+          <w:instrText xml:space="preserve"> PAGEREF _Toc237713774 \h </w:instrText>
         </w:r>
         <w:r>
           <w:rPr>
@@ -5314,7 +5314,7 @@
           <w14:ligatures w14:val="standardContextual"/>
         </w:rPr>
       </w:pPr>
-      <w:hyperlink w:anchor="_Toc237713203" w:history="1">
+      <w:hyperlink w:anchor="_Toc237713775" w:history="1">
         <w:r>
           <w:rPr>
             <w:rStyle w:val="Hipervnculo"/>
@@ -5341,7 +5341,7 @@
             <w:noProof/>
             <w:webHidden/>
           </w:rPr>
-          <w:instrText xml:space="preserve"> PAGEREF _Toc237713203 \h </w:instrText>
+          <w:instrText xml:space="preserve"> PAGEREF _Toc237713775 \h </w:instrText>
         </w:r>
         <w:r>
           <w:rPr>
@@ -5388,7 +5388,7 @@
           <w14:ligatures w14:val="standardContextual"/>
         </w:rPr>
       </w:pPr>
-      <w:hyperlink w:anchor="_Toc237713204" w:history="1">
+      <w:hyperlink w:anchor="_Toc237713776" w:history="1">
         <w:r>
           <w:rPr>
             <w:rStyle w:val="Hipervnculo"/>
@@ -5415,7 +5415,7 @@
             <w:noProof/>
             <w:webHidden/>
           </w:rPr>
-          <w:instrText xml:space="preserve"> PAGEREF _Toc237713204 \h </w:instrText>
+          <w:instrText xml:space="preserve"> PAGEREF _Toc237713776 \h </w:instrText>
         </w:r>
         <w:r>
           <w:rPr>
@@ -5462,7 +5462,7 @@
           <w14:ligatures w14:val="standardContextual"/>
         </w:rPr>
       </w:pPr>
-      <w:hyperlink w:anchor="_Toc237713205" w:history="1">
+      <w:hyperlink w:anchor="_Toc237713777" w:history="1">
         <w:r>
           <w:rPr>
             <w:rStyle w:val="Hipervnculo"/>
@@ -5489,7 +5489,7 @@
             <w:noProof/>
             <w:webHidden/>
           </w:rPr>
-          <w:instrText xml:space="preserve"> PAGEREF _Toc237713205 \h </w:instrText>
+          <w:instrText xml:space="preserve"> PAGEREF _Toc237713777 \h </w:instrText>
         </w:r>
         <w:r>
           <w:rPr>
@@ -5536,7 +5536,7 @@
           <w14:ligatures w14:val="standardContextual"/>
         </w:rPr>
       </w:pPr>
-      <w:hyperlink w:anchor="_Toc237713206" w:history="1">
+      <w:hyperlink w:anchor="_Toc237713778" w:history="1">
         <w:r>
           <w:rPr>
             <w:rStyle w:val="Hipervnculo"/>
@@ -5563,7 +5563,7 @@
             <w:noProof/>
             <w:webHidden/>
           </w:rPr>
-          <w:instrText xml:space="preserve"> PAGEREF _Toc237713206 \h </w:instrText>
+          <w:instrText xml:space="preserve"> PAGEREF _Toc237713778 \h </w:instrText>
         </w:r>
         <w:r>
           <w:rPr>
@@ -5610,7 +5610,7 @@
           <w14:ligatures w14:val="standardContextual"/>
         </w:rPr>
       </w:pPr>
-      <w:hyperlink w:anchor="_Toc237713207" w:history="1">
+      <w:hyperlink w:anchor="_Toc237713779" w:history="1">
         <w:r>
           <w:rPr>
             <w:rStyle w:val="Hipervnculo"/>
@@ -5637,7 +5637,7 @@
             <w:noProof/>
             <w:webHidden/>
           </w:rPr>
-          <w:instrText xml:space="preserve"> PAGEREF _Toc237713207 \h </w:instrText>
+          <w:instrText xml:space="preserve"> PAGEREF _Toc237713779 \h </w:instrText>
         </w:r>
         <w:r>
           <w:rPr>
@@ -5684,7 +5684,7 @@
           <w14:ligatures w14:val="standardContextual"/>
         </w:rPr>
       </w:pPr>
-      <w:hyperlink w:anchor="_Toc237713208" w:history="1">
+      <w:hyperlink w:anchor="_Toc237713780" w:history="1">
         <w:r>
           <w:rPr>
             <w:rStyle w:val="Hipervnculo"/>
@@ -5711,7 +5711,7 @@
             <w:noProof/>
             <w:webHidden/>
           </w:rPr>
-          <w:instrText xml:space="preserve"> PAGEREF _Toc237713208 \h </w:instrText>
+          <w:instrText xml:space="preserve"> PAGEREF _Toc237713780 \h </w:instrText>
         </w:r>
         <w:r>
           <w:rPr>
@@ -5758,7 +5758,7 @@
           <w14:ligatures w14:val="standardContextual"/>
         </w:rPr>
       </w:pPr>
-      <w:hyperlink w:anchor="_Toc237713209" w:history="1">
+      <w:hyperlink w:anchor="_Toc237713781" w:history="1">
         <w:r>
           <w:rPr>
             <w:rStyle w:val="Hipervnculo"/>
@@ -5785,7 +5785,7 @@
             <w:noProof/>
             <w:webHidden/>
           </w:rPr>
-          <w:instrText xml:space="preserve"> PAGEREF _Toc237713209 \h </w:instrText>
+          <w:instrText xml:space="preserve"> PAGEREF _Toc237713781 \h </w:instrText>
         </w:r>
         <w:r>
           <w:rPr>
@@ -5832,7 +5832,7 @@
           <w14:ligatures w14:val="standardContextual"/>
         </w:rPr>
       </w:pPr>
-      <w:hyperlink w:anchor="_Toc237713210" w:history="1">
+      <w:hyperlink w:anchor="_Toc237713782" w:history="1">
         <w:r>
           <w:rPr>
             <w:rStyle w:val="Hipervnculo"/>
@@ -5859,7 +5859,7 @@
             <w:noProof/>
             <w:webHidden/>
           </w:rPr>
-          <w:instrText xml:space="preserve"> PAGEREF _Toc237713210 \h </w:instrText>
+          <w:instrText xml:space="preserve"> PAGEREF _Toc237713782 \h </w:instrText>
         </w:r>
         <w:r>
           <w:rPr>
@@ -5906,7 +5906,7 @@
           <w14:ligatures w14:val="standardContextual"/>
         </w:rPr>
       </w:pPr>
-      <w:hyperlink w:anchor="_Toc237713211" w:history="1">
+      <w:hyperlink w:anchor="_Toc237713783" w:history="1">
         <w:r>
           <w:rPr>
             <w:rStyle w:val="Hipervnculo"/>
@@ -5933,7 +5933,7 @@
             <w:noProof/>
             <w:webHidden/>
           </w:rPr>
-          <w:instrText xml:space="preserve"> PAGEREF _Toc237713211 \h </w:instrText>
+          <w:instrText xml:space="preserve"> PAGEREF _Toc237713783 \h </w:instrText>
         </w:r>
         <w:r>
           <w:rPr>
@@ -5980,7 +5980,7 @@
           <w14:ligatures w14:val="standardContextual"/>
         </w:rPr>
       </w:pPr>
-      <w:hyperlink w:anchor="_Toc237713212" w:history="1">
+      <w:hyperlink w:anchor="_Toc237713784" w:history="1">
         <w:r>
           <w:rPr>
             <w:rStyle w:val="Hipervnculo"/>
@@ -6007,7 +6007,7 @@
             <w:noProof/>
             <w:webHidden/>
           </w:rPr>
-          <w:instrText xml:space="preserve"> PAGEREF _Toc237713212 \h </w:instrText>
+          <w:instrText xml:space="preserve"> PAGEREF _Toc237713784 \h </w:instrText>
         </w:r>
         <w:r>
           <w:rPr>
@@ -6091,7 +6091,7 @@
         <w:pStyle w:val="Ttulo1"/>
         <w:spacing w:before="100" w:after="30"/>
       </w:pPr>
-      <w:bookmarkStart w:id="0" w:name="_Toc237713150"/>
+      <w:bookmarkStart w:id="0" w:name="_Toc237713722"/>
       <w:r>
         <w:rPr>
           <w:rFonts w:ascii="Georgia" w:hAnsi="Georgia"/>
@@ -6108,7 +6108,7 @@
         <w:pStyle w:val="Ttulo2"/>
         <w:spacing w:before="70" w:after="20"/>
       </w:pPr>
-      <w:bookmarkStart w:id="1" w:name="_Toc237713151"/>
+      <w:bookmarkStart w:id="1" w:name="_Toc237713723"/>
       <w:r>
         <w:rPr>
           <w:rFonts w:ascii="Georgia" w:hAnsi="Georgia"/>
@@ -6149,7 +6149,7 @@
         <w:pStyle w:val="Ttulo2"/>
         <w:spacing w:before="70" w:after="20"/>
       </w:pPr>
-      <w:bookmarkStart w:id="2" w:name="_Toc237713152"/>
+      <w:bookmarkStart w:id="2" w:name="_Toc237713724"/>
       <w:r>
         <w:rPr>
           <w:rFonts w:ascii="Georgia" w:hAnsi="Georgia"/>
@@ -6210,7 +6210,7 @@
                 <w:noProof/>
               </w:rPr>
               <w:drawing>
-                <wp:inline distT="0" distB="0" distL="0" distR="0" wp14:anchorId="660EB883" wp14:editId="5DC96F00">
+                <wp:inline distT="0" distB="0" distL="0" distR="0" wp14:anchorId="35AAE4E4" wp14:editId="781BBFCA">
                   <wp:extent cx="2926080" cy="1524412"/>
                   <wp:effectExtent l="0" t="0" r="0" b="0"/>
                   <wp:docPr id="1" name="Picture 1"/>
@@ -6269,7 +6269,7 @@
                 <w:noProof/>
               </w:rPr>
               <w:drawing>
-                <wp:inline distT="0" distB="0" distL="0" distR="0" wp14:anchorId="13B4450B" wp14:editId="05C97C02">
+                <wp:inline distT="0" distB="0" distL="0" distR="0" wp14:anchorId="5B9994BA" wp14:editId="2DEB9696">
                   <wp:extent cx="2926080" cy="1437831"/>
                   <wp:effectExtent l="0" t="0" r="0" b="0"/>
                   <wp:docPr id="2" name="Picture 2"/>
@@ -6374,7 +6374,7 @@
         <w:pStyle w:val="Ttulo2"/>
         <w:spacing w:before="70" w:after="20"/>
       </w:pPr>
-      <w:bookmarkStart w:id="3" w:name="_Toc237713153"/>
+      <w:bookmarkStart w:id="3" w:name="_Toc237713725"/>
       <w:r>
         <w:rPr>
           <w:rFonts w:ascii="Georgia" w:hAnsi="Georgia"/>
@@ -6501,7 +6501,7 @@
         <w:pStyle w:val="Ttulo2"/>
         <w:spacing w:before="70" w:after="20"/>
       </w:pPr>
-      <w:bookmarkStart w:id="4" w:name="_Toc237713154"/>
+      <w:bookmarkStart w:id="4" w:name="_Toc237713726"/>
       <w:r>
         <w:rPr>
           <w:rFonts w:ascii="Georgia" w:hAnsi="Georgia"/>
@@ -7029,7 +7029,7 @@
         <w:pStyle w:val="Ttulo2"/>
         <w:spacing w:before="70" w:after="20"/>
       </w:pPr>
-      <w:bookmarkStart w:id="5" w:name="_Toc237713155"/>
+      <w:bookmarkStart w:id="5" w:name="_Toc237713727"/>
       <w:r>
         <w:rPr>
           <w:rFonts w:ascii="Georgia" w:hAnsi="Georgia"/>
@@ -7162,7 +7162,7 @@
         <w:pStyle w:val="Ttulo2"/>
         <w:spacing w:before="70" w:after="20"/>
       </w:pPr>
-      <w:bookmarkStart w:id="6" w:name="_Toc237713156"/>
+      <w:bookmarkStart w:id="6" w:name="_Toc237713728"/>
       <w:r>
         <w:rPr>
           <w:rFonts w:ascii="Georgia" w:hAnsi="Georgia"/>
@@ -8379,7 +8379,7 @@
         <w:pStyle w:val="Ttulo1"/>
         <w:spacing w:before="100" w:after="30"/>
       </w:pPr>
-      <w:bookmarkStart w:id="7" w:name="_Toc237713157"/>
+      <w:bookmarkStart w:id="7" w:name="_Toc237713729"/>
       <w:r>
         <w:rPr>
           <w:rFonts w:ascii="Georgia" w:hAnsi="Georgia"/>
@@ -8395,7 +8395,7 @@
         <w:pStyle w:val="Ttulo2"/>
         <w:spacing w:before="70" w:after="20"/>
       </w:pPr>
-      <w:bookmarkStart w:id="8" w:name="_Toc237713158"/>
+      <w:bookmarkStart w:id="8" w:name="_Toc237713730"/>
       <w:r>
         <w:rPr>
           <w:rFonts w:ascii="Georgia" w:hAnsi="Georgia"/>
@@ -8453,7 +8453,7 @@
                 <w:noProof/>
               </w:rPr>
               <w:drawing>
-                <wp:inline distT="0" distB="0" distL="0" distR="0" wp14:anchorId="1DA7175E" wp14:editId="2E38454B">
+                <wp:inline distT="0" distB="0" distL="0" distR="0" wp14:anchorId="41FCCB5D" wp14:editId="1A128495">
                   <wp:extent cx="2926080" cy="1426594"/>
                   <wp:effectExtent l="0" t="0" r="0" b="0"/>
                   <wp:docPr id="3" name="Picture 3"/>
@@ -8512,7 +8512,7 @@
                 <w:noProof/>
               </w:rPr>
               <w:drawing>
-                <wp:inline distT="0" distB="0" distL="0" distR="0" wp14:anchorId="3FC72769" wp14:editId="563FC6D4">
+                <wp:inline distT="0" distB="0" distL="0" distR="0" wp14:anchorId="5374FAC8" wp14:editId="49C59C67">
                   <wp:extent cx="2926080" cy="1494260"/>
                   <wp:effectExtent l="0" t="0" r="0" b="0"/>
                   <wp:docPr id="4" name="Picture 4"/>
@@ -8627,7 +8627,7 @@
         <w:pStyle w:val="Ttulo2"/>
         <w:spacing w:before="70" w:after="20"/>
       </w:pPr>
-      <w:bookmarkStart w:id="9" w:name="_Toc237713159"/>
+      <w:bookmarkStart w:id="9" w:name="_Toc237713731"/>
       <w:r>
         <w:rPr>
           <w:rFonts w:ascii="Georgia" w:hAnsi="Georgia"/>
@@ -8861,7 +8861,7 @@
         <w:pStyle w:val="Ttulo1"/>
         <w:spacing w:before="100" w:after="30"/>
       </w:pPr>
-      <w:bookmarkStart w:id="10" w:name="_Toc237713160"/>
+      <w:bookmarkStart w:id="10" w:name="_Toc237713732"/>
       <w:r>
         <w:rPr>
           <w:rFonts w:ascii="Georgia" w:hAnsi="Georgia"/>
@@ -8877,7 +8877,7 @@
         <w:pStyle w:val="Ttulo2"/>
         <w:spacing w:before="70" w:after="20"/>
       </w:pPr>
-      <w:bookmarkStart w:id="11" w:name="_Toc237713161"/>
+      <w:bookmarkStart w:id="11" w:name="_Toc237713733"/>
       <w:r>
         <w:rPr>
           <w:rFonts w:ascii="Georgia" w:hAnsi="Georgia"/>
@@ -8938,7 +8938,7 @@
                 <w:noProof/>
               </w:rPr>
               <w:drawing>
-                <wp:inline distT="0" distB="0" distL="0" distR="0" wp14:anchorId="67BB8B21" wp14:editId="20D56235">
+                <wp:inline distT="0" distB="0" distL="0" distR="0" wp14:anchorId="3D0DFBC7" wp14:editId="5C80CB65">
                   <wp:extent cx="2926080" cy="1636252"/>
                   <wp:effectExtent l="0" t="0" r="0" b="0"/>
                   <wp:docPr id="5" name="Picture 5"/>
@@ -8997,7 +8997,7 @@
                 <w:noProof/>
               </w:rPr>
               <w:drawing>
-                <wp:inline distT="0" distB="0" distL="0" distR="0" wp14:anchorId="35255057" wp14:editId="7387DF36">
+                <wp:inline distT="0" distB="0" distL="0" distR="0" wp14:anchorId="5407D42E" wp14:editId="4B63D788">
                   <wp:extent cx="2926080" cy="1481181"/>
                   <wp:effectExtent l="0" t="0" r="0" b="0"/>
                   <wp:docPr id="6" name="Picture 6"/>
@@ -9112,7 +9112,7 @@
         <w:pStyle w:val="Ttulo2"/>
         <w:spacing w:before="70" w:after="20"/>
       </w:pPr>
-      <w:bookmarkStart w:id="12" w:name="_Toc237713162"/>
+      <w:bookmarkStart w:id="12" w:name="_Toc237713734"/>
       <w:r>
         <w:rPr>
           <w:rFonts w:ascii="Georgia" w:hAnsi="Georgia"/>
@@ -9143,7 +9143,7 @@
         <w:pStyle w:val="Ttulo2"/>
         <w:spacing w:before="70" w:after="20"/>
       </w:pPr>
-      <w:bookmarkStart w:id="13" w:name="_Toc237713163"/>
+      <w:bookmarkStart w:id="13" w:name="_Toc237713735"/>
       <w:r>
         <w:rPr>
           <w:rFonts w:ascii="Georgia" w:hAnsi="Georgia"/>
@@ -9201,7 +9201,7 @@
                 <w:noProof/>
               </w:rPr>
               <w:drawing>
-                <wp:inline distT="0" distB="0" distL="0" distR="0" wp14:anchorId="3E8B1101" wp14:editId="78182CE6">
+                <wp:inline distT="0" distB="0" distL="0" distR="0" wp14:anchorId="505048AF" wp14:editId="330137F8">
                   <wp:extent cx="2926080" cy="1626307"/>
                   <wp:effectExtent l="0" t="0" r="0" b="0"/>
                   <wp:docPr id="7" name="Picture 7"/>
@@ -9260,7 +9260,7 @@
                 <w:noProof/>
               </w:rPr>
               <w:drawing>
-                <wp:inline distT="0" distB="0" distL="0" distR="0" wp14:anchorId="527F7614" wp14:editId="7EE1C749">
+                <wp:inline distT="0" distB="0" distL="0" distR="0" wp14:anchorId="50CCE921" wp14:editId="60186E21">
                   <wp:extent cx="2926080" cy="1479479"/>
                   <wp:effectExtent l="0" t="0" r="0" b="0"/>
                   <wp:docPr id="8" name="Picture 8"/>
@@ -9365,7 +9365,7 @@
         <w:pStyle w:val="Ttulo2"/>
         <w:spacing w:before="70" w:after="20"/>
       </w:pPr>
-      <w:bookmarkStart w:id="14" w:name="_Toc237713164"/>
+      <w:bookmarkStart w:id="14" w:name="_Toc237713736"/>
       <w:r>
         <w:rPr>
           <w:rFonts w:ascii="Georgia" w:hAnsi="Georgia"/>
@@ -9426,7 +9426,7 @@
                 <w:noProof/>
               </w:rPr>
               <w:drawing>
-                <wp:inline distT="0" distB="0" distL="0" distR="0" wp14:anchorId="36A73C8C" wp14:editId="48CA989B">
+                <wp:inline distT="0" distB="0" distL="0" distR="0" wp14:anchorId="2445CB58" wp14:editId="2496C344">
                   <wp:extent cx="2926080" cy="1662311"/>
                   <wp:effectExtent l="0" t="0" r="0" b="0"/>
                   <wp:docPr id="9" name="Picture 9"/>
@@ -9485,7 +9485,7 @@
                 <w:noProof/>
               </w:rPr>
               <w:drawing>
-                <wp:inline distT="0" distB="0" distL="0" distR="0" wp14:anchorId="1F4D52AB" wp14:editId="74693439">
+                <wp:inline distT="0" distB="0" distL="0" distR="0" wp14:anchorId="46CDC871" wp14:editId="5F8F6E7E">
                   <wp:extent cx="2926080" cy="1801004"/>
                   <wp:effectExtent l="0" t="0" r="0" b="0"/>
                   <wp:docPr id="10" name="Picture 10"/>
@@ -9590,7 +9590,7 @@
         <w:pStyle w:val="Ttulo1"/>
         <w:spacing w:before="100" w:after="30"/>
       </w:pPr>
-      <w:bookmarkStart w:id="15" w:name="_Toc237713165"/>
+      <w:bookmarkStart w:id="15" w:name="_Toc237713737"/>
       <w:r>
         <w:rPr>
           <w:rFonts w:ascii="Georgia" w:hAnsi="Georgia"/>
@@ -9606,7 +9606,7 @@
         <w:pStyle w:val="Ttulo2"/>
         <w:spacing w:before="70" w:after="20"/>
       </w:pPr>
-      <w:bookmarkStart w:id="16" w:name="_Toc237713166"/>
+      <w:bookmarkStart w:id="16" w:name="_Toc237713738"/>
       <w:r>
         <w:rPr>
           <w:rFonts w:ascii="Georgia" w:hAnsi="Georgia"/>
@@ -10045,7 +10045,7 @@
         <w:pStyle w:val="Ttulo2"/>
         <w:spacing w:before="70" w:after="20"/>
       </w:pPr>
-      <w:bookmarkStart w:id="17" w:name="_Toc237713167"/>
+      <w:bookmarkStart w:id="17" w:name="_Toc237713739"/>
       <w:r>
         <w:rPr>
           <w:rFonts w:ascii="Georgia" w:hAnsi="Georgia"/>
@@ -10073,7 +10073,7 @@
         <w:pStyle w:val="Ttulo1"/>
         <w:spacing w:before="100" w:after="30"/>
       </w:pPr>
-      <w:bookmarkStart w:id="18" w:name="_Toc237713168"/>
+      <w:bookmarkStart w:id="18" w:name="_Toc237713740"/>
       <w:r>
         <w:rPr>
           <w:rFonts w:ascii="Georgia" w:hAnsi="Georgia"/>
@@ -10089,7 +10089,7 @@
         <w:pStyle w:val="Ttulo2"/>
         <w:spacing w:before="70" w:after="20"/>
       </w:pPr>
-      <w:bookmarkStart w:id="19" w:name="_Toc237713169"/>
+      <w:bookmarkStart w:id="19" w:name="_Toc237713741"/>
       <w:r>
         <w:rPr>
           <w:rFonts w:ascii="Georgia" w:hAnsi="Georgia"/>
@@ -10116,7 +10116,7 @@
         <w:pStyle w:val="Ttulo2"/>
         <w:spacing w:before="70" w:after="20"/>
       </w:pPr>
-      <w:bookmarkStart w:id="20" w:name="_Toc237713170"/>
+      <w:bookmarkStart w:id="20" w:name="_Toc237713742"/>
       <w:r>
         <w:rPr>
           <w:rFonts w:ascii="Georgia" w:hAnsi="Georgia"/>
@@ -10174,7 +10174,7 @@
                 <w:noProof/>
               </w:rPr>
               <w:drawing>
-                <wp:inline distT="0" distB="0" distL="0" distR="0" wp14:anchorId="03056134" wp14:editId="006EA9FD">
+                <wp:inline distT="0" distB="0" distL="0" distR="0" wp14:anchorId="1C8EB0A4" wp14:editId="291B4764">
                   <wp:extent cx="2926080" cy="1714660"/>
                   <wp:effectExtent l="0" t="0" r="0" b="0"/>
                   <wp:docPr id="11" name="Picture 11"/>
@@ -10233,7 +10233,7 @@
                 <w:noProof/>
               </w:rPr>
               <w:drawing>
-                <wp:inline distT="0" distB="0" distL="0" distR="0" wp14:anchorId="307BF4D4" wp14:editId="1E6C300B">
+                <wp:inline distT="0" distB="0" distL="0" distR="0" wp14:anchorId="168E8991" wp14:editId="75404907">
                   <wp:extent cx="2926080" cy="1558188"/>
                   <wp:effectExtent l="0" t="0" r="0" b="0"/>
                   <wp:docPr id="12" name="Picture 12"/>
@@ -11203,7 +11203,7 @@
         <w:pStyle w:val="Ttulo1"/>
         <w:spacing w:before="100" w:after="30"/>
       </w:pPr>
-      <w:bookmarkStart w:id="21" w:name="_Toc237713171"/>
+      <w:bookmarkStart w:id="21" w:name="_Toc237713743"/>
       <w:r>
         <w:rPr>
           <w:rFonts w:ascii="Georgia" w:hAnsi="Georgia"/>
@@ -11220,7 +11220,7 @@
         <w:pStyle w:val="Ttulo2"/>
         <w:spacing w:before="70" w:after="20"/>
       </w:pPr>
-      <w:bookmarkStart w:id="22" w:name="_Toc237713172"/>
+      <w:bookmarkStart w:id="22" w:name="_Toc237713744"/>
       <w:r>
         <w:rPr>
           <w:rFonts w:ascii="Georgia" w:hAnsi="Georgia"/>
@@ -11312,7 +11312,7 @@
         <w:pStyle w:val="Ttulo2"/>
         <w:spacing w:before="70" w:after="20"/>
       </w:pPr>
-      <w:bookmarkStart w:id="23" w:name="_Toc237713173"/>
+      <w:bookmarkStart w:id="23" w:name="_Toc237713745"/>
       <w:r>
         <w:rPr>
           <w:rFonts w:ascii="Georgia" w:hAnsi="Georgia"/>
@@ -11543,7 +11543,7 @@
                 <w:noProof/>
               </w:rPr>
               <w:drawing>
-                <wp:inline distT="0" distB="0" distL="0" distR="0" wp14:anchorId="377BE42F" wp14:editId="26EDBA87">
+                <wp:inline distT="0" distB="0" distL="0" distR="0" wp14:anchorId="3E3E8B14" wp14:editId="006A49B9">
                   <wp:extent cx="2926080" cy="1540391"/>
                   <wp:effectExtent l="0" t="0" r="0" b="0"/>
                   <wp:docPr id="13" name="Picture 13"/>
@@ -11602,7 +11602,7 @@
                 <w:noProof/>
               </w:rPr>
               <w:drawing>
-                <wp:inline distT="0" distB="0" distL="0" distR="0" wp14:anchorId="091987F1" wp14:editId="3380D330">
+                <wp:inline distT="0" distB="0" distL="0" distR="0" wp14:anchorId="089AEE51" wp14:editId="3AB53E11">
                   <wp:extent cx="2926080" cy="1658038"/>
                   <wp:effectExtent l="0" t="0" r="0" b="0"/>
                   <wp:docPr id="14" name="Picture 14"/>
@@ -11707,7 +11707,7 @@
         <w:pStyle w:val="Ttulo2"/>
         <w:spacing w:before="70" w:after="20"/>
       </w:pPr>
-      <w:bookmarkStart w:id="24" w:name="_Toc237713174"/>
+      <w:bookmarkStart w:id="24" w:name="_Toc237713746"/>
       <w:r>
         <w:rPr>
           <w:rFonts w:ascii="Georgia" w:hAnsi="Georgia"/>
@@ -12635,7 +12635,7 @@
         <w:pStyle w:val="Ttulo1"/>
         <w:spacing w:before="100" w:after="30"/>
       </w:pPr>
-      <w:bookmarkStart w:id="25" w:name="_Toc237713175"/>
+      <w:bookmarkStart w:id="25" w:name="_Toc237713747"/>
       <w:r>
         <w:rPr>
           <w:rFonts w:ascii="Georgia" w:hAnsi="Georgia"/>
@@ -12651,7 +12651,7 @@
         <w:pStyle w:val="Ttulo2"/>
         <w:spacing w:before="70" w:after="20"/>
       </w:pPr>
-      <w:bookmarkStart w:id="26" w:name="_Toc237713176"/>
+      <w:bookmarkStart w:id="26" w:name="_Toc237713748"/>
       <w:r>
         <w:rPr>
           <w:rFonts w:ascii="Georgia" w:hAnsi="Georgia"/>
@@ -14240,7 +14240,7 @@
         <w:pStyle w:val="Ttulo2"/>
         <w:spacing w:before="70" w:after="20"/>
       </w:pPr>
-      <w:bookmarkStart w:id="27" w:name="_Toc237713177"/>
+      <w:bookmarkStart w:id="27" w:name="_Toc237713749"/>
       <w:r>
         <w:rPr>
           <w:rFonts w:ascii="Georgia" w:hAnsi="Georgia"/>
@@ -14350,7 +14350,7 @@
         <w:pStyle w:val="Ttulo1"/>
         <w:spacing w:before="100" w:after="30"/>
       </w:pPr>
-      <w:bookmarkStart w:id="28" w:name="_Toc237713178"/>
+      <w:bookmarkStart w:id="28" w:name="_Toc237713750"/>
       <w:r>
         <w:rPr>
           <w:rFonts w:ascii="Georgia" w:hAnsi="Georgia"/>
@@ -14367,7 +14367,7 @@
         <w:pStyle w:val="Ttulo2"/>
         <w:spacing w:before="70" w:after="20"/>
       </w:pPr>
-      <w:bookmarkStart w:id="29" w:name="_Toc237713179"/>
+      <w:bookmarkStart w:id="29" w:name="_Toc237713751"/>
       <w:r>
         <w:rPr>
           <w:rFonts w:ascii="Georgia" w:hAnsi="Georgia"/>
@@ -14394,7 +14394,7 @@
         <w:pStyle w:val="Ttulo2"/>
         <w:spacing w:before="70" w:after="20"/>
       </w:pPr>
-      <w:bookmarkStart w:id="30" w:name="_Toc237713180"/>
+      <w:bookmarkStart w:id="30" w:name="_Toc237713752"/>
       <w:r>
         <w:rPr>
           <w:rFonts w:ascii="Georgia" w:hAnsi="Georgia"/>
@@ -14452,7 +14452,7 @@
                 <w:noProof/>
               </w:rPr>
               <w:drawing>
-                <wp:inline distT="0" distB="0" distL="0" distR="0" wp14:anchorId="70329979" wp14:editId="6036AA45">
+                <wp:inline distT="0" distB="0" distL="0" distR="0" wp14:anchorId="561AF0B2" wp14:editId="6290CF01">
                   <wp:extent cx="2926080" cy="1534596"/>
                   <wp:effectExtent l="0" t="0" r="0" b="0"/>
                   <wp:docPr id="15" name="Picture 15"/>
@@ -14511,7 +14511,7 @@
                 <w:noProof/>
               </w:rPr>
               <w:drawing>
-                <wp:inline distT="0" distB="0" distL="0" distR="0" wp14:anchorId="2C2F07E3" wp14:editId="234E5BBE">
+                <wp:inline distT="0" distB="0" distL="0" distR="0" wp14:anchorId="68623A3E" wp14:editId="1B615769">
                   <wp:extent cx="2926080" cy="1680519"/>
                   <wp:effectExtent l="0" t="0" r="0" b="0"/>
                   <wp:docPr id="16" name="Picture 16"/>
@@ -14627,7 +14627,7 @@
         <w:pStyle w:val="Ttulo1"/>
         <w:spacing w:before="100" w:after="30"/>
       </w:pPr>
-      <w:bookmarkStart w:id="31" w:name="_Toc237713181"/>
+      <w:bookmarkStart w:id="31" w:name="_Toc237713753"/>
       <w:r>
         <w:rPr>
           <w:rFonts w:ascii="Georgia" w:hAnsi="Georgia"/>
@@ -14643,7 +14643,7 @@
         <w:pStyle w:val="Ttulo2"/>
         <w:spacing w:before="70" w:after="20"/>
       </w:pPr>
-      <w:bookmarkStart w:id="32" w:name="_Toc237713182"/>
+      <w:bookmarkStart w:id="32" w:name="_Toc237713754"/>
       <w:r>
         <w:rPr>
           <w:rFonts w:ascii="Georgia" w:hAnsi="Georgia"/>
@@ -15690,7 +15690,7 @@
         <w:pStyle w:val="Ttulo2"/>
         <w:spacing w:before="70" w:after="20"/>
       </w:pPr>
-      <w:bookmarkStart w:id="33" w:name="_Toc237713183"/>
+      <w:bookmarkStart w:id="33" w:name="_Toc237713755"/>
       <w:r>
         <w:rPr>
           <w:rFonts w:ascii="Georgia" w:hAnsi="Georgia"/>
@@ -15851,7 +15851,7 @@
         <w:pStyle w:val="Ttulo2"/>
         <w:spacing w:before="70" w:after="20"/>
       </w:pPr>
-      <w:bookmarkStart w:id="34" w:name="_Toc237713184"/>
+      <w:bookmarkStart w:id="34" w:name="_Toc237713756"/>
       <w:r>
         <w:rPr>
           <w:rFonts w:ascii="Georgia" w:hAnsi="Georgia"/>
@@ -15878,7 +15878,7 @@
         <w:pStyle w:val="Ttulo1"/>
         <w:spacing w:before="100" w:after="30"/>
       </w:pPr>
-      <w:bookmarkStart w:id="35" w:name="_Toc237713185"/>
+      <w:bookmarkStart w:id="35" w:name="_Toc237713757"/>
       <w:r>
         <w:rPr>
           <w:rFonts w:ascii="Georgia" w:hAnsi="Georgia"/>
@@ -15894,7 +15894,7 @@
         <w:pStyle w:val="Ttulo2"/>
         <w:spacing w:before="70" w:after="20"/>
       </w:pPr>
-      <w:bookmarkStart w:id="36" w:name="_Toc237713186"/>
+      <w:bookmarkStart w:id="36" w:name="_Toc237713758"/>
       <w:r>
         <w:rPr>
           <w:rFonts w:ascii="Georgia" w:hAnsi="Georgia"/>
@@ -18821,7 +18821,7 @@
         <w:pStyle w:val="Ttulo1"/>
         <w:spacing w:before="100" w:after="30"/>
       </w:pPr>
-      <w:bookmarkStart w:id="37" w:name="_Toc237713187"/>
+      <w:bookmarkStart w:id="37" w:name="_Toc237713759"/>
       <w:r>
         <w:rPr>
           <w:rFonts w:ascii="Georgia" w:hAnsi="Georgia"/>
@@ -18838,7 +18838,7 @@
         <w:pStyle w:val="Ttulo2"/>
         <w:spacing w:before="70" w:after="20"/>
       </w:pPr>
-      <w:bookmarkStart w:id="38" w:name="_Toc237713188"/>
+      <w:bookmarkStart w:id="38" w:name="_Toc237713760"/>
       <w:r>
         <w:rPr>
           <w:rFonts w:ascii="Georgia" w:hAnsi="Georgia"/>
@@ -19023,7 +19023,7 @@
         <w:pStyle w:val="Ttulo2"/>
         <w:spacing w:before="70" w:after="20"/>
       </w:pPr>
-      <w:bookmarkStart w:id="39" w:name="_Toc237713189"/>
+      <w:bookmarkStart w:id="39" w:name="_Toc237713761"/>
       <w:r>
         <w:rPr>
           <w:rFonts w:ascii="Georgia" w:hAnsi="Georgia"/>
@@ -19081,7 +19081,7 @@
                 <w:noProof/>
               </w:rPr>
               <w:drawing>
-                <wp:inline distT="0" distB="0" distL="0" distR="0" wp14:anchorId="10225E6B" wp14:editId="118CF2E9">
+                <wp:inline distT="0" distB="0" distL="0" distR="0" wp14:anchorId="0063066E" wp14:editId="71FA4EAC">
                   <wp:extent cx="2926080" cy="1626569"/>
                   <wp:effectExtent l="0" t="0" r="0" b="0"/>
                   <wp:docPr id="17" name="Picture 17"/>
@@ -19140,7 +19140,7 @@
                 <w:noProof/>
               </w:rPr>
               <w:drawing>
-                <wp:inline distT="0" distB="0" distL="0" distR="0" wp14:anchorId="674F856C" wp14:editId="70BE6396">
+                <wp:inline distT="0" distB="0" distL="0" distR="0" wp14:anchorId="2AA91CD7" wp14:editId="34C42BD0">
                   <wp:extent cx="2926080" cy="1691675"/>
                   <wp:effectExtent l="0" t="0" r="0" b="0"/>
                   <wp:docPr id="18" name="Picture 18"/>
@@ -19245,7 +19245,7 @@
         <w:pStyle w:val="Ttulo2"/>
         <w:spacing w:before="70" w:after="20"/>
       </w:pPr>
-      <w:bookmarkStart w:id="40" w:name="_Toc237713190"/>
+      <w:bookmarkStart w:id="40" w:name="_Toc237713762"/>
       <w:r>
         <w:rPr>
           <w:rFonts w:ascii="Georgia" w:hAnsi="Georgia"/>
@@ -19874,7 +19874,7 @@
         <w:pStyle w:val="Ttulo1"/>
         <w:spacing w:before="100" w:after="30"/>
       </w:pPr>
-      <w:bookmarkStart w:id="41" w:name="_Toc237713191"/>
+      <w:bookmarkStart w:id="41" w:name="_Toc237713763"/>
       <w:r>
         <w:rPr>
           <w:rFonts w:ascii="Georgia" w:hAnsi="Georgia"/>
@@ -19890,7 +19890,7 @@
         <w:pStyle w:val="Ttulo2"/>
         <w:spacing w:before="70" w:after="20"/>
       </w:pPr>
-      <w:bookmarkStart w:id="42" w:name="_Toc237713192"/>
+      <w:bookmarkStart w:id="42" w:name="_Toc237713764"/>
       <w:r>
         <w:rPr>
           <w:rFonts w:ascii="Georgia" w:hAnsi="Georgia"/>
@@ -19948,7 +19948,7 @@
                 <w:noProof/>
               </w:rPr>
               <w:drawing>
-                <wp:inline distT="0" distB="0" distL="0" distR="0" wp14:anchorId="52FF6C26" wp14:editId="2BE4D4FC">
+                <wp:inline distT="0" distB="0" distL="0" distR="0" wp14:anchorId="64D19DE1" wp14:editId="58A2C057">
                   <wp:extent cx="2926080" cy="1495195"/>
                   <wp:effectExtent l="0" t="0" r="0" b="0"/>
                   <wp:docPr id="19" name="Picture 19"/>
@@ -20007,7 +20007,7 @@
                 <w:noProof/>
               </w:rPr>
               <w:drawing>
-                <wp:inline distT="0" distB="0" distL="0" distR="0" wp14:anchorId="04CB7F99" wp14:editId="0DEABEF7">
+                <wp:inline distT="0" distB="0" distL="0" distR="0" wp14:anchorId="76B9B041" wp14:editId="4CABA7F9">
                   <wp:extent cx="2926080" cy="1682608"/>
                   <wp:effectExtent l="0" t="0" r="0" b="0"/>
                   <wp:docPr id="20" name="Picture 20"/>
@@ -21142,7 +21142,7 @@
         <w:pStyle w:val="Ttulo1"/>
         <w:spacing w:before="100" w:after="30"/>
       </w:pPr>
-      <w:bookmarkStart w:id="43" w:name="_Toc237713193"/>
+      <w:bookmarkStart w:id="43" w:name="_Toc237713765"/>
       <w:r>
         <w:rPr>
           <w:rFonts w:ascii="Georgia" w:hAnsi="Georgia"/>
@@ -21159,7 +21159,7 @@
         <w:pStyle w:val="Ttulo2"/>
         <w:spacing w:before="70" w:after="20"/>
       </w:pPr>
-      <w:bookmarkStart w:id="44" w:name="_Toc237713194"/>
+      <w:bookmarkStart w:id="44" w:name="_Toc237713766"/>
       <w:r>
         <w:rPr>
           <w:rFonts w:ascii="Georgia" w:hAnsi="Georgia"/>
@@ -21214,7 +21214,7 @@
         <w:pStyle w:val="Ttulo2"/>
         <w:spacing w:before="70" w:after="20"/>
       </w:pPr>
-      <w:bookmarkStart w:id="45" w:name="_Toc237713195"/>
+      <w:bookmarkStart w:id="45" w:name="_Toc237713767"/>
       <w:r>
         <w:rPr>
           <w:rFonts w:ascii="Georgia" w:hAnsi="Georgia"/>
@@ -21272,7 +21272,7 @@
                 <w:noProof/>
               </w:rPr>
               <w:drawing>
-                <wp:inline distT="0" distB="0" distL="0" distR="0" wp14:anchorId="01ACCDEB" wp14:editId="5D646F16">
+                <wp:inline distT="0" distB="0" distL="0" distR="0" wp14:anchorId="7057C6C2" wp14:editId="7270EF5E">
                   <wp:extent cx="2926080" cy="1682608"/>
                   <wp:effectExtent l="0" t="0" r="0" b="0"/>
                   <wp:docPr id="21" name="Picture 21"/>
@@ -21331,7 +21331,7 @@
                 <w:noProof/>
               </w:rPr>
               <w:drawing>
-                <wp:inline distT="0" distB="0" distL="0" distR="0" wp14:anchorId="71067A1B" wp14:editId="208749DC">
+                <wp:inline distT="0" distB="0" distL="0" distR="0" wp14:anchorId="719BE2C1" wp14:editId="0456FED4">
                   <wp:extent cx="2926080" cy="1549755"/>
                   <wp:effectExtent l="0" t="0" r="0" b="0"/>
                   <wp:docPr id="22" name="Picture 22"/>
@@ -21436,7 +21436,7 @@
         <w:pStyle w:val="Ttulo1"/>
         <w:spacing w:before="100" w:after="30"/>
       </w:pPr>
-      <w:bookmarkStart w:id="46" w:name="_Toc237713196"/>
+      <w:bookmarkStart w:id="46" w:name="_Toc237713768"/>
       <w:r>
         <w:rPr>
           <w:rFonts w:ascii="Georgia" w:hAnsi="Georgia"/>
@@ -21452,7 +21452,7 @@
         <w:pStyle w:val="Ttulo2"/>
         <w:spacing w:before="70" w:after="20"/>
       </w:pPr>
-      <w:bookmarkStart w:id="47" w:name="_Toc237713197"/>
+      <w:bookmarkStart w:id="47" w:name="_Toc237713769"/>
       <w:r>
         <w:rPr>
           <w:rFonts w:ascii="Georgia" w:hAnsi="Georgia"/>
@@ -23000,7 +23000,7 @@
         <w:pStyle w:val="Ttulo1"/>
         <w:spacing w:before="100" w:after="30"/>
       </w:pPr>
-      <w:bookmarkStart w:id="48" w:name="_Toc237713198"/>
+      <w:bookmarkStart w:id="48" w:name="_Toc237713770"/>
       <w:r>
         <w:rPr>
           <w:rFonts w:ascii="Georgia" w:hAnsi="Georgia"/>
@@ -23017,7 +23017,7 @@
         <w:pStyle w:val="Ttulo2"/>
         <w:spacing w:before="70" w:after="20"/>
       </w:pPr>
-      <w:bookmarkStart w:id="49" w:name="_Toc237713199"/>
+      <w:bookmarkStart w:id="49" w:name="_Toc237713771"/>
       <w:r>
         <w:rPr>
           <w:rFonts w:ascii="Georgia" w:hAnsi="Georgia"/>
@@ -23140,7 +23140,7 @@
                 <w:noProof/>
               </w:rPr>
               <w:drawing>
-                <wp:inline distT="0" distB="0" distL="0" distR="0" wp14:anchorId="01292DB4" wp14:editId="23CB0F62">
+                <wp:inline distT="0" distB="0" distL="0" distR="0" wp14:anchorId="187AB01C" wp14:editId="35C2D247">
                   <wp:extent cx="2926080" cy="1695124"/>
                   <wp:effectExtent l="0" t="0" r="0" b="0"/>
                   <wp:docPr id="23" name="Picture 23"/>
@@ -23199,7 +23199,7 @@
                 <w:noProof/>
               </w:rPr>
               <w:drawing>
-                <wp:inline distT="0" distB="0" distL="0" distR="0" wp14:anchorId="4019F6E6" wp14:editId="3F21A1CB">
+                <wp:inline distT="0" distB="0" distL="0" distR="0" wp14:anchorId="0E09B8CD" wp14:editId="26033D22">
                   <wp:extent cx="2926080" cy="1572627"/>
                   <wp:effectExtent l="0" t="0" r="0" b="0"/>
                   <wp:docPr id="24" name="Picture 24"/>
@@ -23304,7 +23304,7 @@
         <w:pStyle w:val="Ttulo2"/>
         <w:spacing w:before="70" w:after="20"/>
       </w:pPr>
-      <w:bookmarkStart w:id="50" w:name="_Toc237713200"/>
+      <w:bookmarkStart w:id="50" w:name="_Toc237713772"/>
       <w:r>
         <w:rPr>
           <w:rFonts w:ascii="Georgia" w:hAnsi="Georgia"/>
@@ -24039,7 +24039,7 @@
         <w:pStyle w:val="Ttulo2"/>
         <w:spacing w:before="70" w:after="20"/>
       </w:pPr>
-      <w:bookmarkStart w:id="51" w:name="_Toc237713201"/>
+      <w:bookmarkStart w:id="51" w:name="_Toc237713773"/>
       <w:r>
         <w:rPr>
           <w:rFonts w:ascii="Georgia" w:hAnsi="Georgia"/>
@@ -24089,7 +24089,7 @@
         <w:pStyle w:val="Ttulo2"/>
         <w:spacing w:before="70" w:after="20"/>
       </w:pPr>
-      <w:bookmarkStart w:id="52" w:name="_Toc237713202"/>
+      <w:bookmarkStart w:id="52" w:name="_Toc237713774"/>
       <w:r>
         <w:rPr>
           <w:rFonts w:ascii="Georgia" w:hAnsi="Georgia"/>
@@ -24170,7 +24170,7 @@
                 <w:noProof/>
               </w:rPr>
               <w:drawing>
-                <wp:inline distT="0" distB="0" distL="0" distR="0" wp14:anchorId="0848CECD" wp14:editId="6C325115">
+                <wp:inline distT="0" distB="0" distL="0" distR="0" wp14:anchorId="654CFEB7" wp14:editId="55D4A99E">
                   <wp:extent cx="2926080" cy="1696900"/>
                   <wp:effectExtent l="0" t="0" r="0" b="0"/>
                   <wp:docPr id="25" name="Picture 25"/>
@@ -24229,7 +24229,7 @@
                 <w:noProof/>
               </w:rPr>
               <w:drawing>
-                <wp:inline distT="0" distB="0" distL="0" distR="0" wp14:anchorId="615D7ED3" wp14:editId="5AD74994">
+                <wp:inline distT="0" distB="0" distL="0" distR="0" wp14:anchorId="5A7BE4E5" wp14:editId="5E08FE81">
                   <wp:extent cx="2926080" cy="1614092"/>
                   <wp:effectExtent l="0" t="0" r="0" b="0"/>
                   <wp:docPr id="26" name="Picture 26"/>
@@ -25254,7 +25254,7 @@
         <w:pStyle w:val="Ttulo2"/>
         <w:spacing w:before="70" w:after="20"/>
       </w:pPr>
-      <w:bookmarkStart w:id="53" w:name="_Toc237713203"/>
+      <w:bookmarkStart w:id="53" w:name="_Toc237713775"/>
       <w:r>
         <w:rPr>
           <w:rFonts w:ascii="Georgia" w:hAnsi="Georgia"/>
@@ -25312,7 +25312,7 @@
                 <w:noProof/>
               </w:rPr>
               <w:drawing>
-                <wp:inline distT="0" distB="0" distL="0" distR="0" wp14:anchorId="102EA64F" wp14:editId="68AEDB9F">
+                <wp:inline distT="0" distB="0" distL="0" distR="0" wp14:anchorId="1A18887C" wp14:editId="3A38CCEC">
                   <wp:extent cx="2926080" cy="1654733"/>
                   <wp:effectExtent l="0" t="0" r="0" b="0"/>
                   <wp:docPr id="27" name="Picture 27"/>
@@ -25371,7 +25371,7 @@
                 <w:noProof/>
               </w:rPr>
               <w:drawing>
-                <wp:inline distT="0" distB="0" distL="0" distR="0" wp14:anchorId="172C4213" wp14:editId="17EF882E">
+                <wp:inline distT="0" distB="0" distL="0" distR="0" wp14:anchorId="301A4557" wp14:editId="7AE2D8A5">
                   <wp:extent cx="2926080" cy="1698212"/>
                   <wp:effectExtent l="0" t="0" r="0" b="0"/>
                   <wp:docPr id="28" name="Picture 28"/>
@@ -25486,7 +25486,7 @@
         <w:pStyle w:val="Ttulo1"/>
         <w:spacing w:before="100" w:after="30"/>
       </w:pPr>
-      <w:bookmarkStart w:id="54" w:name="_Toc237713204"/>
+      <w:bookmarkStart w:id="54" w:name="_Toc237713776"/>
       <w:r>
         <w:rPr>
           <w:rFonts w:ascii="Georgia" w:hAnsi="Georgia"/>
@@ -25503,7 +25503,7 @@
         <w:pStyle w:val="Ttulo2"/>
         <w:spacing w:before="70" w:after="20"/>
       </w:pPr>
-      <w:bookmarkStart w:id="55" w:name="_Toc237713205"/>
+      <w:bookmarkStart w:id="55" w:name="_Toc237713777"/>
       <w:r>
         <w:rPr>
           <w:rFonts w:ascii="Georgia" w:hAnsi="Georgia"/>
@@ -25564,7 +25564,7 @@
         <w:pStyle w:val="Ttulo2"/>
         <w:spacing w:before="70" w:after="20"/>
       </w:pPr>
-      <w:bookmarkStart w:id="56" w:name="_Toc237713206"/>
+      <w:bookmarkStart w:id="56" w:name="_Toc237713778"/>
       <w:r>
         <w:rPr>
           <w:rFonts w:ascii="Georgia" w:hAnsi="Georgia"/>
@@ -25639,7 +25639,7 @@
                 <w:noProof/>
               </w:rPr>
               <w:drawing>
-                <wp:inline distT="0" distB="0" distL="0" distR="0" wp14:anchorId="5B4805CE" wp14:editId="75139968">
+                <wp:inline distT="0" distB="0" distL="0" distR="0" wp14:anchorId="6B9E1B10" wp14:editId="2B812F06">
                   <wp:extent cx="2926080" cy="1650045"/>
                   <wp:effectExtent l="0" t="0" r="0" b="0"/>
                   <wp:docPr id="29" name="Picture 29"/>
@@ -25698,7 +25698,7 @@
                 <w:noProof/>
               </w:rPr>
               <w:drawing>
-                <wp:inline distT="0" distB="0" distL="0" distR="0" wp14:anchorId="0BF1285D" wp14:editId="3DA63BBF">
+                <wp:inline distT="0" distB="0" distL="0" distR="0" wp14:anchorId="15F5B68D" wp14:editId="0E68E9A3">
                   <wp:extent cx="2926080" cy="1611196"/>
                   <wp:effectExtent l="0" t="0" r="0" b="0"/>
                   <wp:docPr id="30" name="Picture 30"/>
@@ -26186,7 +26186,7 @@
         <w:pStyle w:val="Ttulo2"/>
         <w:spacing w:before="70" w:after="20"/>
       </w:pPr>
-      <w:bookmarkStart w:id="57" w:name="_Toc237713207"/>
+      <w:bookmarkStart w:id="57" w:name="_Toc237713779"/>
       <w:r>
         <w:rPr>
           <w:rFonts w:ascii="Georgia" w:hAnsi="Georgia"/>
@@ -26260,7 +26260,7 @@
                 <w:noProof/>
               </w:rPr>
               <w:drawing>
-                <wp:inline distT="0" distB="0" distL="0" distR="0" wp14:anchorId="2D4EDE90" wp14:editId="45BCFB6D">
+                <wp:inline distT="0" distB="0" distL="0" distR="0" wp14:anchorId="69D7BE58" wp14:editId="14AE35A6">
                   <wp:extent cx="2926080" cy="1687777"/>
                   <wp:effectExtent l="0" t="0" r="0" b="0"/>
                   <wp:docPr id="31" name="Picture 31"/>
@@ -26855,7 +26855,7 @@
         <w:pStyle w:val="Ttulo2"/>
         <w:spacing w:before="70" w:after="20"/>
       </w:pPr>
-      <w:bookmarkStart w:id="58" w:name="_Toc237713208"/>
+      <w:bookmarkStart w:id="58" w:name="_Toc237713780"/>
       <w:r>
         <w:rPr>
           <w:rFonts w:ascii="Georgia" w:hAnsi="Georgia"/>
@@ -28114,7 +28114,7 @@
         <w:pStyle w:val="Ttulo1"/>
         <w:spacing w:before="100" w:after="30"/>
       </w:pPr>
-      <w:bookmarkStart w:id="59" w:name="_Toc237713209"/>
+      <w:bookmarkStart w:id="59" w:name="_Toc237713781"/>
       <w:r>
         <w:rPr>
           <w:rFonts w:ascii="Georgia" w:hAnsi="Georgia"/>
@@ -28302,7 +28302,7 @@
         <w:pStyle w:val="Ttulo1"/>
         <w:spacing w:before="100" w:after="30"/>
       </w:pPr>
-      <w:bookmarkStart w:id="60" w:name="_Toc237713210"/>
+      <w:bookmarkStart w:id="60" w:name="_Toc237713782"/>
       <w:r>
         <w:rPr>
           <w:rFonts w:ascii="Georgia" w:hAnsi="Georgia"/>
@@ -37431,7 +37431,7 @@
         <w:pStyle w:val="Ttulo1"/>
         <w:spacing w:before="100" w:after="30"/>
       </w:pPr>
-      <w:bookmarkStart w:id="61" w:name="_Toc237713211"/>
+      <w:bookmarkStart w:id="61" w:name="_Toc237713783"/>
       <w:r>
         <w:rPr>
           <w:rFonts w:ascii="Georgia" w:hAnsi="Georgia"/>
@@ -37903,7 +37903,7 @@
         <w:pStyle w:val="Ttulo1"/>
         <w:spacing w:before="100" w:after="30"/>
       </w:pPr>
-      <w:bookmarkStart w:id="62" w:name="_Toc237713212"/>
+      <w:bookmarkStart w:id="62" w:name="_Toc237713784"/>
       <w:r>
         <w:rPr>
           <w:rFonts w:ascii="Georgia" w:hAnsi="Georgia"/>
@@ -38407,31 +38407,31 @@
       </w:rPr>
     </w:lvl>
   </w:abstractNum>
-  <w:num w:numId="1" w16cid:durableId="332689990">
+  <w:num w:numId="1" w16cid:durableId="929507440">
     <w:abstractNumId w:val="8"/>
   </w:num>
-  <w:num w:numId="2" w16cid:durableId="421073216">
+  <w:num w:numId="2" w16cid:durableId="2112041401">
     <w:abstractNumId w:val="6"/>
   </w:num>
-  <w:num w:numId="3" w16cid:durableId="227346078">
+  <w:num w:numId="3" w16cid:durableId="1071661698">
     <w:abstractNumId w:val="5"/>
   </w:num>
-  <w:num w:numId="4" w16cid:durableId="1866822289">
+  <w:num w:numId="4" w16cid:durableId="1721707117">
     <w:abstractNumId w:val="4"/>
   </w:num>
-  <w:num w:numId="5" w16cid:durableId="2111729949">
+  <w:num w:numId="5" w16cid:durableId="812405189">
     <w:abstractNumId w:val="7"/>
   </w:num>
-  <w:num w:numId="6" w16cid:durableId="1149900605">
+  <w:num w:numId="6" w16cid:durableId="665212433">
     <w:abstractNumId w:val="3"/>
   </w:num>
-  <w:num w:numId="7" w16cid:durableId="1125195354">
+  <w:num w:numId="7" w16cid:durableId="1671565439">
     <w:abstractNumId w:val="2"/>
   </w:num>
-  <w:num w:numId="8" w16cid:durableId="1565721409">
+  <w:num w:numId="8" w16cid:durableId="1839534406">
     <w:abstractNumId w:val="1"/>
   </w:num>
-  <w:num w:numId="9" w16cid:durableId="1958370726">
+  <w:num w:numId="9" w16cid:durableId="672220818">
     <w:abstractNumId w:val="0"/>
   </w:num>
 </w:numbering>
@@ -49863,7 +49863,7 @@
     <w:autoRedefine/>
     <w:uiPriority w:val="39"/>
     <w:unhideWhenUsed/>
-    <w:rsid w:val="001433A1"/>
+    <w:rsid w:val="0093588A"/>
     <w:pPr>
       <w:spacing w:before="10" w:after="10" w:line="240" w:lineRule="auto"/>
     </w:pPr>
@@ -49878,7 +49878,7 @@
     <w:autoRedefine/>
     <w:uiPriority w:val="39"/>
     <w:unhideWhenUsed/>
-    <w:rsid w:val="001433A1"/>
+    <w:rsid w:val="0093588A"/>
     <w:pPr>
       <w:spacing w:after="0" w:line="240" w:lineRule="auto"/>
       <w:ind w:left="170"/>
@@ -49892,7 +49892,7 @@
     <w:basedOn w:val="Fuentedeprrafopredeter"/>
     <w:uiPriority w:val="99"/>
     <w:unhideWhenUsed/>
-    <w:rsid w:val="001433A1"/>
+    <w:rsid w:val="0093588A"/>
     <w:rPr>
       <w:color w:val="0000FF" w:themeColor="hyperlink"/>
       <w:u w:val="single"/>

</xml_diff>

<commit_message>
style(reporte): Redisenar cuadro COMPRAR — 2 columnas, arraystretch 1.35, mas padding y nota en scriptsize
</commit_message>
<xml_diff>
--- a/01_Reporte_PDF/Informe_Valuacion_Aluar_UNCuyo.docx
+++ b/01_Reporte_PDF/Informe_Valuacion_Aluar_UNCuyo.docx
@@ -1362,7 +1362,7 @@
         </w:rPr>
         <w:fldChar w:fldCharType="separate"/>
       </w:r>
-      <w:hyperlink w:anchor="_Toc237713722" w:history="1">
+      <w:hyperlink w:anchor="_Toc237713976" w:history="1">
         <w:r>
           <w:rPr>
             <w:rStyle w:val="Hipervnculo"/>
@@ -1389,7 +1389,7 @@
             <w:noProof/>
             <w:webHidden/>
           </w:rPr>
-          <w:instrText xml:space="preserve"> PAGEREF _Toc237713722 \h </w:instrText>
+          <w:instrText xml:space="preserve"> PAGEREF _Toc237713976 \h </w:instrText>
         </w:r>
         <w:r>
           <w:rPr>
@@ -1436,7 +1436,7 @@
           <w14:ligatures w14:val="standardContextual"/>
         </w:rPr>
       </w:pPr>
-      <w:hyperlink w:anchor="_Toc237713723" w:history="1">
+      <w:hyperlink w:anchor="_Toc237713977" w:history="1">
         <w:r>
           <w:rPr>
             <w:rStyle w:val="Hipervnculo"/>
@@ -1463,7 +1463,7 @@
             <w:noProof/>
             <w:webHidden/>
           </w:rPr>
-          <w:instrText xml:space="preserve"> PAGEREF _Toc237713723 \h </w:instrText>
+          <w:instrText xml:space="preserve"> PAGEREF _Toc237713977 \h </w:instrText>
         </w:r>
         <w:r>
           <w:rPr>
@@ -1510,7 +1510,7 @@
           <w14:ligatures w14:val="standardContextual"/>
         </w:rPr>
       </w:pPr>
-      <w:hyperlink w:anchor="_Toc237713724" w:history="1">
+      <w:hyperlink w:anchor="_Toc237713978" w:history="1">
         <w:r>
           <w:rPr>
             <w:rStyle w:val="Hipervnculo"/>
@@ -1537,7 +1537,7 @@
             <w:noProof/>
             <w:webHidden/>
           </w:rPr>
-          <w:instrText xml:space="preserve"> PAGEREF _Toc237713724 \h </w:instrText>
+          <w:instrText xml:space="preserve"> PAGEREF _Toc237713978 \h </w:instrText>
         </w:r>
         <w:r>
           <w:rPr>
@@ -1584,7 +1584,7 @@
           <w14:ligatures w14:val="standardContextual"/>
         </w:rPr>
       </w:pPr>
-      <w:hyperlink w:anchor="_Toc237713725" w:history="1">
+      <w:hyperlink w:anchor="_Toc237713979" w:history="1">
         <w:r>
           <w:rPr>
             <w:rStyle w:val="Hipervnculo"/>
@@ -1611,7 +1611,7 @@
             <w:noProof/>
             <w:webHidden/>
           </w:rPr>
-          <w:instrText xml:space="preserve"> PAGEREF _Toc237713725 \h </w:instrText>
+          <w:instrText xml:space="preserve"> PAGEREF _Toc237713979 \h </w:instrText>
         </w:r>
         <w:r>
           <w:rPr>
@@ -1658,7 +1658,7 @@
           <w14:ligatures w14:val="standardContextual"/>
         </w:rPr>
       </w:pPr>
-      <w:hyperlink w:anchor="_Toc237713726" w:history="1">
+      <w:hyperlink w:anchor="_Toc237713980" w:history="1">
         <w:r>
           <w:rPr>
             <w:rStyle w:val="Hipervnculo"/>
@@ -1685,7 +1685,7 @@
             <w:noProof/>
             <w:webHidden/>
           </w:rPr>
-          <w:instrText xml:space="preserve"> PAGEREF _Toc237713726 \h </w:instrText>
+          <w:instrText xml:space="preserve"> PAGEREF _Toc237713980 \h </w:instrText>
         </w:r>
         <w:r>
           <w:rPr>
@@ -1732,7 +1732,7 @@
           <w14:ligatures w14:val="standardContextual"/>
         </w:rPr>
       </w:pPr>
-      <w:hyperlink w:anchor="_Toc237713727" w:history="1">
+      <w:hyperlink w:anchor="_Toc237713981" w:history="1">
         <w:r>
           <w:rPr>
             <w:rStyle w:val="Hipervnculo"/>
@@ -1759,7 +1759,7 @@
             <w:noProof/>
             <w:webHidden/>
           </w:rPr>
-          <w:instrText xml:space="preserve"> PAGEREF _Toc237713727 \h </w:instrText>
+          <w:instrText xml:space="preserve"> PAGEREF _Toc237713981 \h </w:instrText>
         </w:r>
         <w:r>
           <w:rPr>
@@ -1806,7 +1806,7 @@
           <w14:ligatures w14:val="standardContextual"/>
         </w:rPr>
       </w:pPr>
-      <w:hyperlink w:anchor="_Toc237713728" w:history="1">
+      <w:hyperlink w:anchor="_Toc237713982" w:history="1">
         <w:r>
           <w:rPr>
             <w:rStyle w:val="Hipervnculo"/>
@@ -1833,7 +1833,7 @@
             <w:noProof/>
             <w:webHidden/>
           </w:rPr>
-          <w:instrText xml:space="preserve"> PAGEREF _Toc237713728 \h </w:instrText>
+          <w:instrText xml:space="preserve"> PAGEREF _Toc237713982 \h </w:instrText>
         </w:r>
         <w:r>
           <w:rPr>
@@ -1880,7 +1880,7 @@
           <w14:ligatures w14:val="standardContextual"/>
         </w:rPr>
       </w:pPr>
-      <w:hyperlink w:anchor="_Toc237713729" w:history="1">
+      <w:hyperlink w:anchor="_Toc237713983" w:history="1">
         <w:r>
           <w:rPr>
             <w:rStyle w:val="Hipervnculo"/>
@@ -1907,7 +1907,7 @@
             <w:noProof/>
             <w:webHidden/>
           </w:rPr>
-          <w:instrText xml:space="preserve"> PAGEREF _Toc237713729 \h </w:instrText>
+          <w:instrText xml:space="preserve"> PAGEREF _Toc237713983 \h </w:instrText>
         </w:r>
         <w:r>
           <w:rPr>
@@ -1954,7 +1954,7 @@
           <w14:ligatures w14:val="standardContextual"/>
         </w:rPr>
       </w:pPr>
-      <w:hyperlink w:anchor="_Toc237713730" w:history="1">
+      <w:hyperlink w:anchor="_Toc237713984" w:history="1">
         <w:r>
           <w:rPr>
             <w:rStyle w:val="Hipervnculo"/>
@@ -1981,7 +1981,7 @@
             <w:noProof/>
             <w:webHidden/>
           </w:rPr>
-          <w:instrText xml:space="preserve"> PAGEREF _Toc237713730 \h </w:instrText>
+          <w:instrText xml:space="preserve"> PAGEREF _Toc237713984 \h </w:instrText>
         </w:r>
         <w:r>
           <w:rPr>
@@ -2028,7 +2028,7 @@
           <w14:ligatures w14:val="standardContextual"/>
         </w:rPr>
       </w:pPr>
-      <w:hyperlink w:anchor="_Toc237713731" w:history="1">
+      <w:hyperlink w:anchor="_Toc237713985" w:history="1">
         <w:r>
           <w:rPr>
             <w:rStyle w:val="Hipervnculo"/>
@@ -2055,7 +2055,7 @@
             <w:noProof/>
             <w:webHidden/>
           </w:rPr>
-          <w:instrText xml:space="preserve"> PAGEREF _Toc237713731 \h </w:instrText>
+          <w:instrText xml:space="preserve"> PAGEREF _Toc237713985 \h </w:instrText>
         </w:r>
         <w:r>
           <w:rPr>
@@ -2102,7 +2102,7 @@
           <w14:ligatures w14:val="standardContextual"/>
         </w:rPr>
       </w:pPr>
-      <w:hyperlink w:anchor="_Toc237713732" w:history="1">
+      <w:hyperlink w:anchor="_Toc237713986" w:history="1">
         <w:r>
           <w:rPr>
             <w:rStyle w:val="Hipervnculo"/>
@@ -2129,7 +2129,7 @@
             <w:noProof/>
             <w:webHidden/>
           </w:rPr>
-          <w:instrText xml:space="preserve"> PAGEREF _Toc237713732 \h </w:instrText>
+          <w:instrText xml:space="preserve"> PAGEREF _Toc237713986 \h </w:instrText>
         </w:r>
         <w:r>
           <w:rPr>
@@ -2176,7 +2176,7 @@
           <w14:ligatures w14:val="standardContextual"/>
         </w:rPr>
       </w:pPr>
-      <w:hyperlink w:anchor="_Toc237713733" w:history="1">
+      <w:hyperlink w:anchor="_Toc237713987" w:history="1">
         <w:r>
           <w:rPr>
             <w:rStyle w:val="Hipervnculo"/>
@@ -2203,7 +2203,7 @@
             <w:noProof/>
             <w:webHidden/>
           </w:rPr>
-          <w:instrText xml:space="preserve"> PAGEREF _Toc237713733 \h </w:instrText>
+          <w:instrText xml:space="preserve"> PAGEREF _Toc237713987 \h </w:instrText>
         </w:r>
         <w:r>
           <w:rPr>
@@ -2250,7 +2250,7 @@
           <w14:ligatures w14:val="standardContextual"/>
         </w:rPr>
       </w:pPr>
-      <w:hyperlink w:anchor="_Toc237713734" w:history="1">
+      <w:hyperlink w:anchor="_Toc237713988" w:history="1">
         <w:r>
           <w:rPr>
             <w:rStyle w:val="Hipervnculo"/>
@@ -2277,7 +2277,7 @@
             <w:noProof/>
             <w:webHidden/>
           </w:rPr>
-          <w:instrText xml:space="preserve"> PAGEREF _Toc237713734 \h </w:instrText>
+          <w:instrText xml:space="preserve"> PAGEREF _Toc237713988 \h </w:instrText>
         </w:r>
         <w:r>
           <w:rPr>
@@ -2324,7 +2324,7 @@
           <w14:ligatures w14:val="standardContextual"/>
         </w:rPr>
       </w:pPr>
-      <w:hyperlink w:anchor="_Toc237713735" w:history="1">
+      <w:hyperlink w:anchor="_Toc237713989" w:history="1">
         <w:r>
           <w:rPr>
             <w:rStyle w:val="Hipervnculo"/>
@@ -2351,7 +2351,7 @@
             <w:noProof/>
             <w:webHidden/>
           </w:rPr>
-          <w:instrText xml:space="preserve"> PAGEREF _Toc237713735 \h </w:instrText>
+          <w:instrText xml:space="preserve"> PAGEREF _Toc237713989 \h </w:instrText>
         </w:r>
         <w:r>
           <w:rPr>
@@ -2398,7 +2398,7 @@
           <w14:ligatures w14:val="standardContextual"/>
         </w:rPr>
       </w:pPr>
-      <w:hyperlink w:anchor="_Toc237713736" w:history="1">
+      <w:hyperlink w:anchor="_Toc237713990" w:history="1">
         <w:r>
           <w:rPr>
             <w:rStyle w:val="Hipervnculo"/>
@@ -2425,7 +2425,7 @@
             <w:noProof/>
             <w:webHidden/>
           </w:rPr>
-          <w:instrText xml:space="preserve"> PAGEREF _Toc237713736 \h </w:instrText>
+          <w:instrText xml:space="preserve"> PAGEREF _Toc237713990 \h </w:instrText>
         </w:r>
         <w:r>
           <w:rPr>
@@ -2472,7 +2472,7 @@
           <w14:ligatures w14:val="standardContextual"/>
         </w:rPr>
       </w:pPr>
-      <w:hyperlink w:anchor="_Toc237713737" w:history="1">
+      <w:hyperlink w:anchor="_Toc237713991" w:history="1">
         <w:r>
           <w:rPr>
             <w:rStyle w:val="Hipervnculo"/>
@@ -2499,7 +2499,7 @@
             <w:noProof/>
             <w:webHidden/>
           </w:rPr>
-          <w:instrText xml:space="preserve"> PAGEREF _Toc237713737 \h </w:instrText>
+          <w:instrText xml:space="preserve"> PAGEREF _Toc237713991 \h </w:instrText>
         </w:r>
         <w:r>
           <w:rPr>
@@ -2546,7 +2546,7 @@
           <w14:ligatures w14:val="standardContextual"/>
         </w:rPr>
       </w:pPr>
-      <w:hyperlink w:anchor="_Toc237713738" w:history="1">
+      <w:hyperlink w:anchor="_Toc237713992" w:history="1">
         <w:r>
           <w:rPr>
             <w:rStyle w:val="Hipervnculo"/>
@@ -2573,7 +2573,7 @@
             <w:noProof/>
             <w:webHidden/>
           </w:rPr>
-          <w:instrText xml:space="preserve"> PAGEREF _Toc237713738 \h </w:instrText>
+          <w:instrText xml:space="preserve"> PAGEREF _Toc237713992 \h </w:instrText>
         </w:r>
         <w:r>
           <w:rPr>
@@ -2620,7 +2620,7 @@
           <w14:ligatures w14:val="standardContextual"/>
         </w:rPr>
       </w:pPr>
-      <w:hyperlink w:anchor="_Toc237713739" w:history="1">
+      <w:hyperlink w:anchor="_Toc237713993" w:history="1">
         <w:r>
           <w:rPr>
             <w:rStyle w:val="Hipervnculo"/>
@@ -2647,7 +2647,7 @@
             <w:noProof/>
             <w:webHidden/>
           </w:rPr>
-          <w:instrText xml:space="preserve"> PAGEREF _Toc237713739 \h </w:instrText>
+          <w:instrText xml:space="preserve"> PAGEREF _Toc237713993 \h </w:instrText>
         </w:r>
         <w:r>
           <w:rPr>
@@ -2694,7 +2694,7 @@
           <w14:ligatures w14:val="standardContextual"/>
         </w:rPr>
       </w:pPr>
-      <w:hyperlink w:anchor="_Toc237713740" w:history="1">
+      <w:hyperlink w:anchor="_Toc237713994" w:history="1">
         <w:r>
           <w:rPr>
             <w:rStyle w:val="Hipervnculo"/>
@@ -2721,7 +2721,7 @@
             <w:noProof/>
             <w:webHidden/>
           </w:rPr>
-          <w:instrText xml:space="preserve"> PAGEREF _Toc237713740 \h </w:instrText>
+          <w:instrText xml:space="preserve"> PAGEREF _Toc237713994 \h </w:instrText>
         </w:r>
         <w:r>
           <w:rPr>
@@ -2768,7 +2768,7 @@
           <w14:ligatures w14:val="standardContextual"/>
         </w:rPr>
       </w:pPr>
-      <w:hyperlink w:anchor="_Toc237713741" w:history="1">
+      <w:hyperlink w:anchor="_Toc237713995" w:history="1">
         <w:r>
           <w:rPr>
             <w:rStyle w:val="Hipervnculo"/>
@@ -2795,7 +2795,7 @@
             <w:noProof/>
             <w:webHidden/>
           </w:rPr>
-          <w:instrText xml:space="preserve"> PAGEREF _Toc237713741 \h </w:instrText>
+          <w:instrText xml:space="preserve"> PAGEREF _Toc237713995 \h </w:instrText>
         </w:r>
         <w:r>
           <w:rPr>
@@ -2842,7 +2842,7 @@
           <w14:ligatures w14:val="standardContextual"/>
         </w:rPr>
       </w:pPr>
-      <w:hyperlink w:anchor="_Toc237713742" w:history="1">
+      <w:hyperlink w:anchor="_Toc237713996" w:history="1">
         <w:r>
           <w:rPr>
             <w:rStyle w:val="Hipervnculo"/>
@@ -2869,7 +2869,7 @@
             <w:noProof/>
             <w:webHidden/>
           </w:rPr>
-          <w:instrText xml:space="preserve"> PAGEREF _Toc237713742 \h </w:instrText>
+          <w:instrText xml:space="preserve"> PAGEREF _Toc237713996 \h </w:instrText>
         </w:r>
         <w:r>
           <w:rPr>
@@ -2916,7 +2916,7 @@
           <w14:ligatures w14:val="standardContextual"/>
         </w:rPr>
       </w:pPr>
-      <w:hyperlink w:anchor="_Toc237713743" w:history="1">
+      <w:hyperlink w:anchor="_Toc237713997" w:history="1">
         <w:r>
           <w:rPr>
             <w:rStyle w:val="Hipervnculo"/>
@@ -2943,7 +2943,7 @@
             <w:noProof/>
             <w:webHidden/>
           </w:rPr>
-          <w:instrText xml:space="preserve"> PAGEREF _Toc237713743 \h </w:instrText>
+          <w:instrText xml:space="preserve"> PAGEREF _Toc237713997 \h </w:instrText>
         </w:r>
         <w:r>
           <w:rPr>
@@ -2990,7 +2990,7 @@
           <w14:ligatures w14:val="standardContextual"/>
         </w:rPr>
       </w:pPr>
-      <w:hyperlink w:anchor="_Toc237713744" w:history="1">
+      <w:hyperlink w:anchor="_Toc237713998" w:history="1">
         <w:r>
           <w:rPr>
             <w:rStyle w:val="Hipervnculo"/>
@@ -3017,7 +3017,7 @@
             <w:noProof/>
             <w:webHidden/>
           </w:rPr>
-          <w:instrText xml:space="preserve"> PAGEREF _Toc237713744 \h </w:instrText>
+          <w:instrText xml:space="preserve"> PAGEREF _Toc237713998 \h </w:instrText>
         </w:r>
         <w:r>
           <w:rPr>
@@ -3064,7 +3064,7 @@
           <w14:ligatures w14:val="standardContextual"/>
         </w:rPr>
       </w:pPr>
-      <w:hyperlink w:anchor="_Toc237713745" w:history="1">
+      <w:hyperlink w:anchor="_Toc237713999" w:history="1">
         <w:r>
           <w:rPr>
             <w:rStyle w:val="Hipervnculo"/>
@@ -3121,7 +3121,7 @@
             <w:noProof/>
             <w:webHidden/>
           </w:rPr>
-          <w:instrText xml:space="preserve"> PAGEREF _Toc237713745 \h </w:instrText>
+          <w:instrText xml:space="preserve"> PAGEREF _Toc237713999 \h </w:instrText>
         </w:r>
         <w:r>
           <w:rPr>
@@ -3168,7 +3168,7 @@
           <w14:ligatures w14:val="standardContextual"/>
         </w:rPr>
       </w:pPr>
-      <w:hyperlink w:anchor="_Toc237713746" w:history="1">
+      <w:hyperlink w:anchor="_Toc237714000" w:history="1">
         <w:r>
           <w:rPr>
             <w:rStyle w:val="Hipervnculo"/>
@@ -3195,7 +3195,7 @@
             <w:noProof/>
             <w:webHidden/>
           </w:rPr>
-          <w:instrText xml:space="preserve"> PAGEREF _Toc237713746 \h </w:instrText>
+          <w:instrText xml:space="preserve"> PAGEREF _Toc237714000 \h </w:instrText>
         </w:r>
         <w:r>
           <w:rPr>
@@ -3242,7 +3242,7 @@
           <w14:ligatures w14:val="standardContextual"/>
         </w:rPr>
       </w:pPr>
-      <w:hyperlink w:anchor="_Toc237713747" w:history="1">
+      <w:hyperlink w:anchor="_Toc237714001" w:history="1">
         <w:r>
           <w:rPr>
             <w:rStyle w:val="Hipervnculo"/>
@@ -3269,7 +3269,7 @@
             <w:noProof/>
             <w:webHidden/>
           </w:rPr>
-          <w:instrText xml:space="preserve"> PAGEREF _Toc237713747 \h </w:instrText>
+          <w:instrText xml:space="preserve"> PAGEREF _Toc237714001 \h </w:instrText>
         </w:r>
         <w:r>
           <w:rPr>
@@ -3316,7 +3316,7 @@
           <w14:ligatures w14:val="standardContextual"/>
         </w:rPr>
       </w:pPr>
-      <w:hyperlink w:anchor="_Toc237713748" w:history="1">
+      <w:hyperlink w:anchor="_Toc237714002" w:history="1">
         <w:r>
           <w:rPr>
             <w:rStyle w:val="Hipervnculo"/>
@@ -3343,7 +3343,7 @@
             <w:noProof/>
             <w:webHidden/>
           </w:rPr>
-          <w:instrText xml:space="preserve"> PAGEREF _Toc237713748 \h </w:instrText>
+          <w:instrText xml:space="preserve"> PAGEREF _Toc237714002 \h </w:instrText>
         </w:r>
         <w:r>
           <w:rPr>
@@ -3390,7 +3390,7 @@
           <w14:ligatures w14:val="standardContextual"/>
         </w:rPr>
       </w:pPr>
-      <w:hyperlink w:anchor="_Toc237713749" w:history="1">
+      <w:hyperlink w:anchor="_Toc237714003" w:history="1">
         <w:r>
           <w:rPr>
             <w:rStyle w:val="Hipervnculo"/>
@@ -3417,7 +3417,7 @@
             <w:noProof/>
             <w:webHidden/>
           </w:rPr>
-          <w:instrText xml:space="preserve"> PAGEREF _Toc237713749 \h </w:instrText>
+          <w:instrText xml:space="preserve"> PAGEREF _Toc237714003 \h </w:instrText>
         </w:r>
         <w:r>
           <w:rPr>
@@ -3464,7 +3464,7 @@
           <w14:ligatures w14:val="standardContextual"/>
         </w:rPr>
       </w:pPr>
-      <w:hyperlink w:anchor="_Toc237713750" w:history="1">
+      <w:hyperlink w:anchor="_Toc237714004" w:history="1">
         <w:r>
           <w:rPr>
             <w:rStyle w:val="Hipervnculo"/>
@@ -3491,7 +3491,7 @@
             <w:noProof/>
             <w:webHidden/>
           </w:rPr>
-          <w:instrText xml:space="preserve"> PAGEREF _Toc237713750 \h </w:instrText>
+          <w:instrText xml:space="preserve"> PAGEREF _Toc237714004 \h </w:instrText>
         </w:r>
         <w:r>
           <w:rPr>
@@ -3538,7 +3538,7 @@
           <w14:ligatures w14:val="standardContextual"/>
         </w:rPr>
       </w:pPr>
-      <w:hyperlink w:anchor="_Toc237713751" w:history="1">
+      <w:hyperlink w:anchor="_Toc237714005" w:history="1">
         <w:r>
           <w:rPr>
             <w:rStyle w:val="Hipervnculo"/>
@@ -3565,7 +3565,7 @@
             <w:noProof/>
             <w:webHidden/>
           </w:rPr>
-          <w:instrText xml:space="preserve"> PAGEREF _Toc237713751 \h </w:instrText>
+          <w:instrText xml:space="preserve"> PAGEREF _Toc237714005 \h </w:instrText>
         </w:r>
         <w:r>
           <w:rPr>
@@ -3612,7 +3612,7 @@
           <w14:ligatures w14:val="standardContextual"/>
         </w:rPr>
       </w:pPr>
-      <w:hyperlink w:anchor="_Toc237713752" w:history="1">
+      <w:hyperlink w:anchor="_Toc237714006" w:history="1">
         <w:r>
           <w:rPr>
             <w:rStyle w:val="Hipervnculo"/>
@@ -3639,7 +3639,7 @@
             <w:noProof/>
             <w:webHidden/>
           </w:rPr>
-          <w:instrText xml:space="preserve"> PAGEREF _Toc237713752 \h </w:instrText>
+          <w:instrText xml:space="preserve"> PAGEREF _Toc237714006 \h </w:instrText>
         </w:r>
         <w:r>
           <w:rPr>
@@ -3686,7 +3686,7 @@
           <w14:ligatures w14:val="standardContextual"/>
         </w:rPr>
       </w:pPr>
-      <w:hyperlink w:anchor="_Toc237713753" w:history="1">
+      <w:hyperlink w:anchor="_Toc237714007" w:history="1">
         <w:r>
           <w:rPr>
             <w:rStyle w:val="Hipervnculo"/>
@@ -3713,7 +3713,7 @@
             <w:noProof/>
             <w:webHidden/>
           </w:rPr>
-          <w:instrText xml:space="preserve"> PAGEREF _Toc237713753 \h </w:instrText>
+          <w:instrText xml:space="preserve"> PAGEREF _Toc237714007 \h </w:instrText>
         </w:r>
         <w:r>
           <w:rPr>
@@ -3760,7 +3760,7 @@
           <w14:ligatures w14:val="standardContextual"/>
         </w:rPr>
       </w:pPr>
-      <w:hyperlink w:anchor="_Toc237713754" w:history="1">
+      <w:hyperlink w:anchor="_Toc237714008" w:history="1">
         <w:r>
           <w:rPr>
             <w:rStyle w:val="Hipervnculo"/>
@@ -3787,7 +3787,7 @@
             <w:noProof/>
             <w:webHidden/>
           </w:rPr>
-          <w:instrText xml:space="preserve"> PAGEREF _Toc237713754 \h </w:instrText>
+          <w:instrText xml:space="preserve"> PAGEREF _Toc237714008 \h </w:instrText>
         </w:r>
         <w:r>
           <w:rPr>
@@ -3834,7 +3834,7 @@
           <w14:ligatures w14:val="standardContextual"/>
         </w:rPr>
       </w:pPr>
-      <w:hyperlink w:anchor="_Toc237713755" w:history="1">
+      <w:hyperlink w:anchor="_Toc237714009" w:history="1">
         <w:r>
           <w:rPr>
             <w:rStyle w:val="Hipervnculo"/>
@@ -3861,7 +3861,7 @@
             <w:noProof/>
             <w:webHidden/>
           </w:rPr>
-          <w:instrText xml:space="preserve"> PAGEREF _Toc237713755 \h </w:instrText>
+          <w:instrText xml:space="preserve"> PAGEREF _Toc237714009 \h </w:instrText>
         </w:r>
         <w:r>
           <w:rPr>
@@ -3908,7 +3908,7 @@
           <w14:ligatures w14:val="standardContextual"/>
         </w:rPr>
       </w:pPr>
-      <w:hyperlink w:anchor="_Toc237713756" w:history="1">
+      <w:hyperlink w:anchor="_Toc237714010" w:history="1">
         <w:r>
           <w:rPr>
             <w:rStyle w:val="Hipervnculo"/>
@@ -3935,7 +3935,7 @@
             <w:noProof/>
             <w:webHidden/>
           </w:rPr>
-          <w:instrText xml:space="preserve"> PAGEREF _Toc237713756 \h </w:instrText>
+          <w:instrText xml:space="preserve"> PAGEREF _Toc237714010 \h </w:instrText>
         </w:r>
         <w:r>
           <w:rPr>
@@ -3982,7 +3982,7 @@
           <w14:ligatures w14:val="standardContextual"/>
         </w:rPr>
       </w:pPr>
-      <w:hyperlink w:anchor="_Toc237713757" w:history="1">
+      <w:hyperlink w:anchor="_Toc237714011" w:history="1">
         <w:r>
           <w:rPr>
             <w:rStyle w:val="Hipervnculo"/>
@@ -4009,7 +4009,7 @@
             <w:noProof/>
             <w:webHidden/>
           </w:rPr>
-          <w:instrText xml:space="preserve"> PAGEREF _Toc237713757 \h </w:instrText>
+          <w:instrText xml:space="preserve"> PAGEREF _Toc237714011 \h </w:instrText>
         </w:r>
         <w:r>
           <w:rPr>
@@ -4056,7 +4056,7 @@
           <w14:ligatures w14:val="standardContextual"/>
         </w:rPr>
       </w:pPr>
-      <w:hyperlink w:anchor="_Toc237713758" w:history="1">
+      <w:hyperlink w:anchor="_Toc237714012" w:history="1">
         <w:r>
           <w:rPr>
             <w:rStyle w:val="Hipervnculo"/>
@@ -4083,7 +4083,7 @@
             <w:noProof/>
             <w:webHidden/>
           </w:rPr>
-          <w:instrText xml:space="preserve"> PAGEREF _Toc237713758 \h </w:instrText>
+          <w:instrText xml:space="preserve"> PAGEREF _Toc237714012 \h </w:instrText>
         </w:r>
         <w:r>
           <w:rPr>
@@ -4130,7 +4130,7 @@
           <w14:ligatures w14:val="standardContextual"/>
         </w:rPr>
       </w:pPr>
-      <w:hyperlink w:anchor="_Toc237713759" w:history="1">
+      <w:hyperlink w:anchor="_Toc237714013" w:history="1">
         <w:r>
           <w:rPr>
             <w:rStyle w:val="Hipervnculo"/>
@@ -4157,7 +4157,7 @@
             <w:noProof/>
             <w:webHidden/>
           </w:rPr>
-          <w:instrText xml:space="preserve"> PAGEREF _Toc237713759 \h </w:instrText>
+          <w:instrText xml:space="preserve"> PAGEREF _Toc237714013 \h </w:instrText>
         </w:r>
         <w:r>
           <w:rPr>
@@ -4204,7 +4204,7 @@
           <w14:ligatures w14:val="standardContextual"/>
         </w:rPr>
       </w:pPr>
-      <w:hyperlink w:anchor="_Toc237713760" w:history="1">
+      <w:hyperlink w:anchor="_Toc237714014" w:history="1">
         <w:r>
           <w:rPr>
             <w:rStyle w:val="Hipervnculo"/>
@@ -4231,7 +4231,7 @@
             <w:noProof/>
             <w:webHidden/>
           </w:rPr>
-          <w:instrText xml:space="preserve"> PAGEREF _Toc237713760 \h </w:instrText>
+          <w:instrText xml:space="preserve"> PAGEREF _Toc237714014 \h </w:instrText>
         </w:r>
         <w:r>
           <w:rPr>
@@ -4278,7 +4278,7 @@
           <w14:ligatures w14:val="standardContextual"/>
         </w:rPr>
       </w:pPr>
-      <w:hyperlink w:anchor="_Toc237713761" w:history="1">
+      <w:hyperlink w:anchor="_Toc237714015" w:history="1">
         <w:r>
           <w:rPr>
             <w:rStyle w:val="Hipervnculo"/>
@@ -4305,7 +4305,7 @@
             <w:noProof/>
             <w:webHidden/>
           </w:rPr>
-          <w:instrText xml:space="preserve"> PAGEREF _Toc237713761 \h </w:instrText>
+          <w:instrText xml:space="preserve"> PAGEREF _Toc237714015 \h </w:instrText>
         </w:r>
         <w:r>
           <w:rPr>
@@ -4352,7 +4352,7 @@
           <w14:ligatures w14:val="standardContextual"/>
         </w:rPr>
       </w:pPr>
-      <w:hyperlink w:anchor="_Toc237713762" w:history="1">
+      <w:hyperlink w:anchor="_Toc237714016" w:history="1">
         <w:r>
           <w:rPr>
             <w:rStyle w:val="Hipervnculo"/>
@@ -4379,7 +4379,7 @@
             <w:noProof/>
             <w:webHidden/>
           </w:rPr>
-          <w:instrText xml:space="preserve"> PAGEREF _Toc237713762 \h </w:instrText>
+          <w:instrText xml:space="preserve"> PAGEREF _Toc237714016 \h </w:instrText>
         </w:r>
         <w:r>
           <w:rPr>
@@ -4426,7 +4426,7 @@
           <w14:ligatures w14:val="standardContextual"/>
         </w:rPr>
       </w:pPr>
-      <w:hyperlink w:anchor="_Toc237713763" w:history="1">
+      <w:hyperlink w:anchor="_Toc237714017" w:history="1">
         <w:r>
           <w:rPr>
             <w:rStyle w:val="Hipervnculo"/>
@@ -4453,7 +4453,7 @@
             <w:noProof/>
             <w:webHidden/>
           </w:rPr>
-          <w:instrText xml:space="preserve"> PAGEREF _Toc237713763 \h </w:instrText>
+          <w:instrText xml:space="preserve"> PAGEREF _Toc237714017 \h </w:instrText>
         </w:r>
         <w:r>
           <w:rPr>
@@ -4500,7 +4500,7 @@
           <w14:ligatures w14:val="standardContextual"/>
         </w:rPr>
       </w:pPr>
-      <w:hyperlink w:anchor="_Toc237713764" w:history="1">
+      <w:hyperlink w:anchor="_Toc237714018" w:history="1">
         <w:r>
           <w:rPr>
             <w:rStyle w:val="Hipervnculo"/>
@@ -4527,7 +4527,7 @@
             <w:noProof/>
             <w:webHidden/>
           </w:rPr>
-          <w:instrText xml:space="preserve"> PAGEREF _Toc237713764 \h </w:instrText>
+          <w:instrText xml:space="preserve"> PAGEREF _Toc237714018 \h </w:instrText>
         </w:r>
         <w:r>
           <w:rPr>
@@ -4574,7 +4574,7 @@
           <w14:ligatures w14:val="standardContextual"/>
         </w:rPr>
       </w:pPr>
-      <w:hyperlink w:anchor="_Toc237713765" w:history="1">
+      <w:hyperlink w:anchor="_Toc237714019" w:history="1">
         <w:r>
           <w:rPr>
             <w:rStyle w:val="Hipervnculo"/>
@@ -4601,7 +4601,7 @@
             <w:noProof/>
             <w:webHidden/>
           </w:rPr>
-          <w:instrText xml:space="preserve"> PAGEREF _Toc237713765 \h </w:instrText>
+          <w:instrText xml:space="preserve"> PAGEREF _Toc237714019 \h </w:instrText>
         </w:r>
         <w:r>
           <w:rPr>
@@ -4648,7 +4648,7 @@
           <w14:ligatures w14:val="standardContextual"/>
         </w:rPr>
       </w:pPr>
-      <w:hyperlink w:anchor="_Toc237713766" w:history="1">
+      <w:hyperlink w:anchor="_Toc237714020" w:history="1">
         <w:r>
           <w:rPr>
             <w:rStyle w:val="Hipervnculo"/>
@@ -4675,7 +4675,7 @@
             <w:noProof/>
             <w:webHidden/>
           </w:rPr>
-          <w:instrText xml:space="preserve"> PAGEREF _Toc237713766 \h </w:instrText>
+          <w:instrText xml:space="preserve"> PAGEREF _Toc237714020 \h </w:instrText>
         </w:r>
         <w:r>
           <w:rPr>
@@ -4722,7 +4722,7 @@
           <w14:ligatures w14:val="standardContextual"/>
         </w:rPr>
       </w:pPr>
-      <w:hyperlink w:anchor="_Toc237713767" w:history="1">
+      <w:hyperlink w:anchor="_Toc237714021" w:history="1">
         <w:r>
           <w:rPr>
             <w:rStyle w:val="Hipervnculo"/>
@@ -4749,7 +4749,7 @@
             <w:noProof/>
             <w:webHidden/>
           </w:rPr>
-          <w:instrText xml:space="preserve"> PAGEREF _Toc237713767 \h </w:instrText>
+          <w:instrText xml:space="preserve"> PAGEREF _Toc237714021 \h </w:instrText>
         </w:r>
         <w:r>
           <w:rPr>
@@ -4796,7 +4796,7 @@
           <w14:ligatures w14:val="standardContextual"/>
         </w:rPr>
       </w:pPr>
-      <w:hyperlink w:anchor="_Toc237713768" w:history="1">
+      <w:hyperlink w:anchor="_Toc237714022" w:history="1">
         <w:r>
           <w:rPr>
             <w:rStyle w:val="Hipervnculo"/>
@@ -4823,7 +4823,7 @@
             <w:noProof/>
             <w:webHidden/>
           </w:rPr>
-          <w:instrText xml:space="preserve"> PAGEREF _Toc237713768 \h </w:instrText>
+          <w:instrText xml:space="preserve"> PAGEREF _Toc237714022 \h </w:instrText>
         </w:r>
         <w:r>
           <w:rPr>
@@ -4870,7 +4870,7 @@
           <w14:ligatures w14:val="standardContextual"/>
         </w:rPr>
       </w:pPr>
-      <w:hyperlink w:anchor="_Toc237713769" w:history="1">
+      <w:hyperlink w:anchor="_Toc237714023" w:history="1">
         <w:r>
           <w:rPr>
             <w:rStyle w:val="Hipervnculo"/>
@@ -4897,7 +4897,7 @@
             <w:noProof/>
             <w:webHidden/>
           </w:rPr>
-          <w:instrText xml:space="preserve"> PAGEREF _Toc237713769 \h </w:instrText>
+          <w:instrText xml:space="preserve"> PAGEREF _Toc237714023 \h </w:instrText>
         </w:r>
         <w:r>
           <w:rPr>
@@ -4944,7 +4944,7 @@
           <w14:ligatures w14:val="standardContextual"/>
         </w:rPr>
       </w:pPr>
-      <w:hyperlink w:anchor="_Toc237713770" w:history="1">
+      <w:hyperlink w:anchor="_Toc237714024" w:history="1">
         <w:r>
           <w:rPr>
             <w:rStyle w:val="Hipervnculo"/>
@@ -4971,7 +4971,7 @@
             <w:noProof/>
             <w:webHidden/>
           </w:rPr>
-          <w:instrText xml:space="preserve"> PAGEREF _Toc237713770 \h </w:instrText>
+          <w:instrText xml:space="preserve"> PAGEREF _Toc237714024 \h </w:instrText>
         </w:r>
         <w:r>
           <w:rPr>
@@ -5018,7 +5018,7 @@
           <w14:ligatures w14:val="standardContextual"/>
         </w:rPr>
       </w:pPr>
-      <w:hyperlink w:anchor="_Toc237713771" w:history="1">
+      <w:hyperlink w:anchor="_Toc237714025" w:history="1">
         <w:r>
           <w:rPr>
             <w:rStyle w:val="Hipervnculo"/>
@@ -5045,7 +5045,7 @@
             <w:noProof/>
             <w:webHidden/>
           </w:rPr>
-          <w:instrText xml:space="preserve"> PAGEREF _Toc237713771 \h </w:instrText>
+          <w:instrText xml:space="preserve"> PAGEREF _Toc237714025 \h </w:instrText>
         </w:r>
         <w:r>
           <w:rPr>
@@ -5092,7 +5092,7 @@
           <w14:ligatures w14:val="standardContextual"/>
         </w:rPr>
       </w:pPr>
-      <w:hyperlink w:anchor="_Toc237713772" w:history="1">
+      <w:hyperlink w:anchor="_Toc237714026" w:history="1">
         <w:r>
           <w:rPr>
             <w:rStyle w:val="Hipervnculo"/>
@@ -5119,7 +5119,7 @@
             <w:noProof/>
             <w:webHidden/>
           </w:rPr>
-          <w:instrText xml:space="preserve"> PAGEREF _Toc237713772 \h </w:instrText>
+          <w:instrText xml:space="preserve"> PAGEREF _Toc237714026 \h </w:instrText>
         </w:r>
         <w:r>
           <w:rPr>
@@ -5166,7 +5166,7 @@
           <w14:ligatures w14:val="standardContextual"/>
         </w:rPr>
       </w:pPr>
-      <w:hyperlink w:anchor="_Toc237713773" w:history="1">
+      <w:hyperlink w:anchor="_Toc237714027" w:history="1">
         <w:r>
           <w:rPr>
             <w:rStyle w:val="Hipervnculo"/>
@@ -5193,7 +5193,7 @@
             <w:noProof/>
             <w:webHidden/>
           </w:rPr>
-          <w:instrText xml:space="preserve"> PAGEREF _Toc237713773 \h </w:instrText>
+          <w:instrText xml:space="preserve"> PAGEREF _Toc237714027 \h </w:instrText>
         </w:r>
         <w:r>
           <w:rPr>
@@ -5240,7 +5240,7 @@
           <w14:ligatures w14:val="standardContextual"/>
         </w:rPr>
       </w:pPr>
-      <w:hyperlink w:anchor="_Toc237713774" w:history="1">
+      <w:hyperlink w:anchor="_Toc237714028" w:history="1">
         <w:r>
           <w:rPr>
             <w:rStyle w:val="Hipervnculo"/>
@@ -5267,7 +5267,7 @@
             <w:noProof/>
             <w:webHidden/>
           </w:rPr>
-          <w:instrText xml:space="preserve"> PAGEREF _Toc237713774 \h </w:instrText>
+          <w:instrText xml:space="preserve"> PAGEREF _Toc237714028 \h </w:instrText>
         </w:r>
         <w:r>
           <w:rPr>
@@ -5314,7 +5314,7 @@
           <w14:ligatures w14:val="standardContextual"/>
         </w:rPr>
       </w:pPr>
-      <w:hyperlink w:anchor="_Toc237713775" w:history="1">
+      <w:hyperlink w:anchor="_Toc237714029" w:history="1">
         <w:r>
           <w:rPr>
             <w:rStyle w:val="Hipervnculo"/>
@@ -5341,7 +5341,7 @@
             <w:noProof/>
             <w:webHidden/>
           </w:rPr>
-          <w:instrText xml:space="preserve"> PAGEREF _Toc237713775 \h </w:instrText>
+          <w:instrText xml:space="preserve"> PAGEREF _Toc237714029 \h </w:instrText>
         </w:r>
         <w:r>
           <w:rPr>
@@ -5388,7 +5388,7 @@
           <w14:ligatures w14:val="standardContextual"/>
         </w:rPr>
       </w:pPr>
-      <w:hyperlink w:anchor="_Toc237713776" w:history="1">
+      <w:hyperlink w:anchor="_Toc237714030" w:history="1">
         <w:r>
           <w:rPr>
             <w:rStyle w:val="Hipervnculo"/>
@@ -5415,7 +5415,7 @@
             <w:noProof/>
             <w:webHidden/>
           </w:rPr>
-          <w:instrText xml:space="preserve"> PAGEREF _Toc237713776 \h </w:instrText>
+          <w:instrText xml:space="preserve"> PAGEREF _Toc237714030 \h </w:instrText>
         </w:r>
         <w:r>
           <w:rPr>
@@ -5462,7 +5462,7 @@
           <w14:ligatures w14:val="standardContextual"/>
         </w:rPr>
       </w:pPr>
-      <w:hyperlink w:anchor="_Toc237713777" w:history="1">
+      <w:hyperlink w:anchor="_Toc237714031" w:history="1">
         <w:r>
           <w:rPr>
             <w:rStyle w:val="Hipervnculo"/>
@@ -5489,7 +5489,7 @@
             <w:noProof/>
             <w:webHidden/>
           </w:rPr>
-          <w:instrText xml:space="preserve"> PAGEREF _Toc237713777 \h </w:instrText>
+          <w:instrText xml:space="preserve"> PAGEREF _Toc237714031 \h </w:instrText>
         </w:r>
         <w:r>
           <w:rPr>
@@ -5536,7 +5536,7 @@
           <w14:ligatures w14:val="standardContextual"/>
         </w:rPr>
       </w:pPr>
-      <w:hyperlink w:anchor="_Toc237713778" w:history="1">
+      <w:hyperlink w:anchor="_Toc237714032" w:history="1">
         <w:r>
           <w:rPr>
             <w:rStyle w:val="Hipervnculo"/>
@@ -5563,7 +5563,7 @@
             <w:noProof/>
             <w:webHidden/>
           </w:rPr>
-          <w:instrText xml:space="preserve"> PAGEREF _Toc237713778 \h </w:instrText>
+          <w:instrText xml:space="preserve"> PAGEREF _Toc237714032 \h </w:instrText>
         </w:r>
         <w:r>
           <w:rPr>
@@ -5610,7 +5610,7 @@
           <w14:ligatures w14:val="standardContextual"/>
         </w:rPr>
       </w:pPr>
-      <w:hyperlink w:anchor="_Toc237713779" w:history="1">
+      <w:hyperlink w:anchor="_Toc237714033" w:history="1">
         <w:r>
           <w:rPr>
             <w:rStyle w:val="Hipervnculo"/>
@@ -5637,7 +5637,7 @@
             <w:noProof/>
             <w:webHidden/>
           </w:rPr>
-          <w:instrText xml:space="preserve"> PAGEREF _Toc237713779 \h </w:instrText>
+          <w:instrText xml:space="preserve"> PAGEREF _Toc237714033 \h </w:instrText>
         </w:r>
         <w:r>
           <w:rPr>
@@ -5684,7 +5684,7 @@
           <w14:ligatures w14:val="standardContextual"/>
         </w:rPr>
       </w:pPr>
-      <w:hyperlink w:anchor="_Toc237713780" w:history="1">
+      <w:hyperlink w:anchor="_Toc237714034" w:history="1">
         <w:r>
           <w:rPr>
             <w:rStyle w:val="Hipervnculo"/>
@@ -5711,7 +5711,7 @@
             <w:noProof/>
             <w:webHidden/>
           </w:rPr>
-          <w:instrText xml:space="preserve"> PAGEREF _Toc237713780 \h </w:instrText>
+          <w:instrText xml:space="preserve"> PAGEREF _Toc237714034 \h </w:instrText>
         </w:r>
         <w:r>
           <w:rPr>
@@ -5758,7 +5758,7 @@
           <w14:ligatures w14:val="standardContextual"/>
         </w:rPr>
       </w:pPr>
-      <w:hyperlink w:anchor="_Toc237713781" w:history="1">
+      <w:hyperlink w:anchor="_Toc237714035" w:history="1">
         <w:r>
           <w:rPr>
             <w:rStyle w:val="Hipervnculo"/>
@@ -5785,7 +5785,7 @@
             <w:noProof/>
             <w:webHidden/>
           </w:rPr>
-          <w:instrText xml:space="preserve"> PAGEREF _Toc237713781 \h </w:instrText>
+          <w:instrText xml:space="preserve"> PAGEREF _Toc237714035 \h </w:instrText>
         </w:r>
         <w:r>
           <w:rPr>
@@ -5832,7 +5832,7 @@
           <w14:ligatures w14:val="standardContextual"/>
         </w:rPr>
       </w:pPr>
-      <w:hyperlink w:anchor="_Toc237713782" w:history="1">
+      <w:hyperlink w:anchor="_Toc237714036" w:history="1">
         <w:r>
           <w:rPr>
             <w:rStyle w:val="Hipervnculo"/>
@@ -5859,7 +5859,7 @@
             <w:noProof/>
             <w:webHidden/>
           </w:rPr>
-          <w:instrText xml:space="preserve"> PAGEREF _Toc237713782 \h </w:instrText>
+          <w:instrText xml:space="preserve"> PAGEREF _Toc237714036 \h </w:instrText>
         </w:r>
         <w:r>
           <w:rPr>
@@ -5906,7 +5906,7 @@
           <w14:ligatures w14:val="standardContextual"/>
         </w:rPr>
       </w:pPr>
-      <w:hyperlink w:anchor="_Toc237713783" w:history="1">
+      <w:hyperlink w:anchor="_Toc237714037" w:history="1">
         <w:r>
           <w:rPr>
             <w:rStyle w:val="Hipervnculo"/>
@@ -5933,7 +5933,7 @@
             <w:noProof/>
             <w:webHidden/>
           </w:rPr>
-          <w:instrText xml:space="preserve"> PAGEREF _Toc237713783 \h </w:instrText>
+          <w:instrText xml:space="preserve"> PAGEREF _Toc237714037 \h </w:instrText>
         </w:r>
         <w:r>
           <w:rPr>
@@ -5980,7 +5980,7 @@
           <w14:ligatures w14:val="standardContextual"/>
         </w:rPr>
       </w:pPr>
-      <w:hyperlink w:anchor="_Toc237713784" w:history="1">
+      <w:hyperlink w:anchor="_Toc237714038" w:history="1">
         <w:r>
           <w:rPr>
             <w:rStyle w:val="Hipervnculo"/>
@@ -6007,7 +6007,7 @@
             <w:noProof/>
             <w:webHidden/>
           </w:rPr>
-          <w:instrText xml:space="preserve"> PAGEREF _Toc237713784 \h </w:instrText>
+          <w:instrText xml:space="preserve"> PAGEREF _Toc237714038 \h </w:instrText>
         </w:r>
         <w:r>
           <w:rPr>
@@ -6091,7 +6091,7 @@
         <w:pStyle w:val="Ttulo1"/>
         <w:spacing w:before="100" w:after="30"/>
       </w:pPr>
-      <w:bookmarkStart w:id="0" w:name="_Toc237713722"/>
+      <w:bookmarkStart w:id="0" w:name="_Toc237713976"/>
       <w:r>
         <w:rPr>
           <w:rFonts w:ascii="Georgia" w:hAnsi="Georgia"/>
@@ -6108,7 +6108,7 @@
         <w:pStyle w:val="Ttulo2"/>
         <w:spacing w:before="70" w:after="20"/>
       </w:pPr>
-      <w:bookmarkStart w:id="1" w:name="_Toc237713723"/>
+      <w:bookmarkStart w:id="1" w:name="_Toc237713977"/>
       <w:r>
         <w:rPr>
           <w:rFonts w:ascii="Georgia" w:hAnsi="Georgia"/>
@@ -6149,7 +6149,7 @@
         <w:pStyle w:val="Ttulo2"/>
         <w:spacing w:before="70" w:after="20"/>
       </w:pPr>
-      <w:bookmarkStart w:id="2" w:name="_Toc237713724"/>
+      <w:bookmarkStart w:id="2" w:name="_Toc237713978"/>
       <w:r>
         <w:rPr>
           <w:rFonts w:ascii="Georgia" w:hAnsi="Georgia"/>
@@ -6210,7 +6210,7 @@
                 <w:noProof/>
               </w:rPr>
               <w:drawing>
-                <wp:inline distT="0" distB="0" distL="0" distR="0" wp14:anchorId="35AAE4E4" wp14:editId="781BBFCA">
+                <wp:inline distT="0" distB="0" distL="0" distR="0" wp14:anchorId="30992CED" wp14:editId="7F5D49C0">
                   <wp:extent cx="2926080" cy="1524412"/>
                   <wp:effectExtent l="0" t="0" r="0" b="0"/>
                   <wp:docPr id="1" name="Picture 1"/>
@@ -6269,7 +6269,7 @@
                 <w:noProof/>
               </w:rPr>
               <w:drawing>
-                <wp:inline distT="0" distB="0" distL="0" distR="0" wp14:anchorId="5B9994BA" wp14:editId="2DEB9696">
+                <wp:inline distT="0" distB="0" distL="0" distR="0" wp14:anchorId="38E339CB" wp14:editId="002D0215">
                   <wp:extent cx="2926080" cy="1437831"/>
                   <wp:effectExtent l="0" t="0" r="0" b="0"/>
                   <wp:docPr id="2" name="Picture 2"/>
@@ -6374,7 +6374,7 @@
         <w:pStyle w:val="Ttulo2"/>
         <w:spacing w:before="70" w:after="20"/>
       </w:pPr>
-      <w:bookmarkStart w:id="3" w:name="_Toc237713725"/>
+      <w:bookmarkStart w:id="3" w:name="_Toc237713979"/>
       <w:r>
         <w:rPr>
           <w:rFonts w:ascii="Georgia" w:hAnsi="Georgia"/>
@@ -6501,7 +6501,7 @@
         <w:pStyle w:val="Ttulo2"/>
         <w:spacing w:before="70" w:after="20"/>
       </w:pPr>
-      <w:bookmarkStart w:id="4" w:name="_Toc237713726"/>
+      <w:bookmarkStart w:id="4" w:name="_Toc237713980"/>
       <w:r>
         <w:rPr>
           <w:rFonts w:ascii="Georgia" w:hAnsi="Georgia"/>
@@ -7029,7 +7029,7 @@
         <w:pStyle w:val="Ttulo2"/>
         <w:spacing w:before="70" w:after="20"/>
       </w:pPr>
-      <w:bookmarkStart w:id="5" w:name="_Toc237713727"/>
+      <w:bookmarkStart w:id="5" w:name="_Toc237713981"/>
       <w:r>
         <w:rPr>
           <w:rFonts w:ascii="Georgia" w:hAnsi="Georgia"/>
@@ -7162,7 +7162,7 @@
         <w:pStyle w:val="Ttulo2"/>
         <w:spacing w:before="70" w:after="20"/>
       </w:pPr>
-      <w:bookmarkStart w:id="6" w:name="_Toc237713728"/>
+      <w:bookmarkStart w:id="6" w:name="_Toc237713982"/>
       <w:r>
         <w:rPr>
           <w:rFonts w:ascii="Georgia" w:hAnsi="Georgia"/>
@@ -8379,7 +8379,7 @@
         <w:pStyle w:val="Ttulo1"/>
         <w:spacing w:before="100" w:after="30"/>
       </w:pPr>
-      <w:bookmarkStart w:id="7" w:name="_Toc237713729"/>
+      <w:bookmarkStart w:id="7" w:name="_Toc237713983"/>
       <w:r>
         <w:rPr>
           <w:rFonts w:ascii="Georgia" w:hAnsi="Georgia"/>
@@ -8395,7 +8395,7 @@
         <w:pStyle w:val="Ttulo2"/>
         <w:spacing w:before="70" w:after="20"/>
       </w:pPr>
-      <w:bookmarkStart w:id="8" w:name="_Toc237713730"/>
+      <w:bookmarkStart w:id="8" w:name="_Toc237713984"/>
       <w:r>
         <w:rPr>
           <w:rFonts w:ascii="Georgia" w:hAnsi="Georgia"/>
@@ -8453,7 +8453,7 @@
                 <w:noProof/>
               </w:rPr>
               <w:drawing>
-                <wp:inline distT="0" distB="0" distL="0" distR="0" wp14:anchorId="41FCCB5D" wp14:editId="1A128495">
+                <wp:inline distT="0" distB="0" distL="0" distR="0" wp14:anchorId="59B5913B" wp14:editId="259167B8">
                   <wp:extent cx="2926080" cy="1426594"/>
                   <wp:effectExtent l="0" t="0" r="0" b="0"/>
                   <wp:docPr id="3" name="Picture 3"/>
@@ -8512,7 +8512,7 @@
                 <w:noProof/>
               </w:rPr>
               <w:drawing>
-                <wp:inline distT="0" distB="0" distL="0" distR="0" wp14:anchorId="5374FAC8" wp14:editId="49C59C67">
+                <wp:inline distT="0" distB="0" distL="0" distR="0" wp14:anchorId="5644B331" wp14:editId="249B453B">
                   <wp:extent cx="2926080" cy="1494260"/>
                   <wp:effectExtent l="0" t="0" r="0" b="0"/>
                   <wp:docPr id="4" name="Picture 4"/>
@@ -8627,7 +8627,7 @@
         <w:pStyle w:val="Ttulo2"/>
         <w:spacing w:before="70" w:after="20"/>
       </w:pPr>
-      <w:bookmarkStart w:id="9" w:name="_Toc237713731"/>
+      <w:bookmarkStart w:id="9" w:name="_Toc237713985"/>
       <w:r>
         <w:rPr>
           <w:rFonts w:ascii="Georgia" w:hAnsi="Georgia"/>
@@ -8861,7 +8861,7 @@
         <w:pStyle w:val="Ttulo1"/>
         <w:spacing w:before="100" w:after="30"/>
       </w:pPr>
-      <w:bookmarkStart w:id="10" w:name="_Toc237713732"/>
+      <w:bookmarkStart w:id="10" w:name="_Toc237713986"/>
       <w:r>
         <w:rPr>
           <w:rFonts w:ascii="Georgia" w:hAnsi="Georgia"/>
@@ -8877,7 +8877,7 @@
         <w:pStyle w:val="Ttulo2"/>
         <w:spacing w:before="70" w:after="20"/>
       </w:pPr>
-      <w:bookmarkStart w:id="11" w:name="_Toc237713733"/>
+      <w:bookmarkStart w:id="11" w:name="_Toc237713987"/>
       <w:r>
         <w:rPr>
           <w:rFonts w:ascii="Georgia" w:hAnsi="Georgia"/>
@@ -8938,7 +8938,7 @@
                 <w:noProof/>
               </w:rPr>
               <w:drawing>
-                <wp:inline distT="0" distB="0" distL="0" distR="0" wp14:anchorId="3D0DFBC7" wp14:editId="5C80CB65">
+                <wp:inline distT="0" distB="0" distL="0" distR="0" wp14:anchorId="73BBA785" wp14:editId="01169746">
                   <wp:extent cx="2926080" cy="1636252"/>
                   <wp:effectExtent l="0" t="0" r="0" b="0"/>
                   <wp:docPr id="5" name="Picture 5"/>
@@ -8997,7 +8997,7 @@
                 <w:noProof/>
               </w:rPr>
               <w:drawing>
-                <wp:inline distT="0" distB="0" distL="0" distR="0" wp14:anchorId="5407D42E" wp14:editId="4B63D788">
+                <wp:inline distT="0" distB="0" distL="0" distR="0" wp14:anchorId="5AB618F1" wp14:editId="16E7BE74">
                   <wp:extent cx="2926080" cy="1481181"/>
                   <wp:effectExtent l="0" t="0" r="0" b="0"/>
                   <wp:docPr id="6" name="Picture 6"/>
@@ -9112,7 +9112,7 @@
         <w:pStyle w:val="Ttulo2"/>
         <w:spacing w:before="70" w:after="20"/>
       </w:pPr>
-      <w:bookmarkStart w:id="12" w:name="_Toc237713734"/>
+      <w:bookmarkStart w:id="12" w:name="_Toc237713988"/>
       <w:r>
         <w:rPr>
           <w:rFonts w:ascii="Georgia" w:hAnsi="Georgia"/>
@@ -9143,7 +9143,7 @@
         <w:pStyle w:val="Ttulo2"/>
         <w:spacing w:before="70" w:after="20"/>
       </w:pPr>
-      <w:bookmarkStart w:id="13" w:name="_Toc237713735"/>
+      <w:bookmarkStart w:id="13" w:name="_Toc237713989"/>
       <w:r>
         <w:rPr>
           <w:rFonts w:ascii="Georgia" w:hAnsi="Georgia"/>
@@ -9201,7 +9201,7 @@
                 <w:noProof/>
               </w:rPr>
               <w:drawing>
-                <wp:inline distT="0" distB="0" distL="0" distR="0" wp14:anchorId="505048AF" wp14:editId="330137F8">
+                <wp:inline distT="0" distB="0" distL="0" distR="0" wp14:anchorId="53823278" wp14:editId="44D706A0">
                   <wp:extent cx="2926080" cy="1626307"/>
                   <wp:effectExtent l="0" t="0" r="0" b="0"/>
                   <wp:docPr id="7" name="Picture 7"/>
@@ -9260,7 +9260,7 @@
                 <w:noProof/>
               </w:rPr>
               <w:drawing>
-                <wp:inline distT="0" distB="0" distL="0" distR="0" wp14:anchorId="50CCE921" wp14:editId="60186E21">
+                <wp:inline distT="0" distB="0" distL="0" distR="0" wp14:anchorId="08260A96" wp14:editId="3670C388">
                   <wp:extent cx="2926080" cy="1479479"/>
                   <wp:effectExtent l="0" t="0" r="0" b="0"/>
                   <wp:docPr id="8" name="Picture 8"/>
@@ -9365,7 +9365,7 @@
         <w:pStyle w:val="Ttulo2"/>
         <w:spacing w:before="70" w:after="20"/>
       </w:pPr>
-      <w:bookmarkStart w:id="14" w:name="_Toc237713736"/>
+      <w:bookmarkStart w:id="14" w:name="_Toc237713990"/>
       <w:r>
         <w:rPr>
           <w:rFonts w:ascii="Georgia" w:hAnsi="Georgia"/>
@@ -9426,7 +9426,7 @@
                 <w:noProof/>
               </w:rPr>
               <w:drawing>
-                <wp:inline distT="0" distB="0" distL="0" distR="0" wp14:anchorId="2445CB58" wp14:editId="2496C344">
+                <wp:inline distT="0" distB="0" distL="0" distR="0" wp14:anchorId="1F0A043C" wp14:editId="5E5144BE">
                   <wp:extent cx="2926080" cy="1662311"/>
                   <wp:effectExtent l="0" t="0" r="0" b="0"/>
                   <wp:docPr id="9" name="Picture 9"/>
@@ -9485,7 +9485,7 @@
                 <w:noProof/>
               </w:rPr>
               <w:drawing>
-                <wp:inline distT="0" distB="0" distL="0" distR="0" wp14:anchorId="46CDC871" wp14:editId="5F8F6E7E">
+                <wp:inline distT="0" distB="0" distL="0" distR="0" wp14:anchorId="6EC709C8" wp14:editId="64CF38E9">
                   <wp:extent cx="2926080" cy="1801004"/>
                   <wp:effectExtent l="0" t="0" r="0" b="0"/>
                   <wp:docPr id="10" name="Picture 10"/>
@@ -9590,7 +9590,7 @@
         <w:pStyle w:val="Ttulo1"/>
         <w:spacing w:before="100" w:after="30"/>
       </w:pPr>
-      <w:bookmarkStart w:id="15" w:name="_Toc237713737"/>
+      <w:bookmarkStart w:id="15" w:name="_Toc237713991"/>
       <w:r>
         <w:rPr>
           <w:rFonts w:ascii="Georgia" w:hAnsi="Georgia"/>
@@ -9606,7 +9606,7 @@
         <w:pStyle w:val="Ttulo2"/>
         <w:spacing w:before="70" w:after="20"/>
       </w:pPr>
-      <w:bookmarkStart w:id="16" w:name="_Toc237713738"/>
+      <w:bookmarkStart w:id="16" w:name="_Toc237713992"/>
       <w:r>
         <w:rPr>
           <w:rFonts w:ascii="Georgia" w:hAnsi="Georgia"/>
@@ -10045,7 +10045,7 @@
         <w:pStyle w:val="Ttulo2"/>
         <w:spacing w:before="70" w:after="20"/>
       </w:pPr>
-      <w:bookmarkStart w:id="17" w:name="_Toc237713739"/>
+      <w:bookmarkStart w:id="17" w:name="_Toc237713993"/>
       <w:r>
         <w:rPr>
           <w:rFonts w:ascii="Georgia" w:hAnsi="Georgia"/>
@@ -10073,7 +10073,7 @@
         <w:pStyle w:val="Ttulo1"/>
         <w:spacing w:before="100" w:after="30"/>
       </w:pPr>
-      <w:bookmarkStart w:id="18" w:name="_Toc237713740"/>
+      <w:bookmarkStart w:id="18" w:name="_Toc237713994"/>
       <w:r>
         <w:rPr>
           <w:rFonts w:ascii="Georgia" w:hAnsi="Georgia"/>
@@ -10089,7 +10089,7 @@
         <w:pStyle w:val="Ttulo2"/>
         <w:spacing w:before="70" w:after="20"/>
       </w:pPr>
-      <w:bookmarkStart w:id="19" w:name="_Toc237713741"/>
+      <w:bookmarkStart w:id="19" w:name="_Toc237713995"/>
       <w:r>
         <w:rPr>
           <w:rFonts w:ascii="Georgia" w:hAnsi="Georgia"/>
@@ -10116,7 +10116,7 @@
         <w:pStyle w:val="Ttulo2"/>
         <w:spacing w:before="70" w:after="20"/>
       </w:pPr>
-      <w:bookmarkStart w:id="20" w:name="_Toc237713742"/>
+      <w:bookmarkStart w:id="20" w:name="_Toc237713996"/>
       <w:r>
         <w:rPr>
           <w:rFonts w:ascii="Georgia" w:hAnsi="Georgia"/>
@@ -10174,7 +10174,7 @@
                 <w:noProof/>
               </w:rPr>
               <w:drawing>
-                <wp:inline distT="0" distB="0" distL="0" distR="0" wp14:anchorId="1C8EB0A4" wp14:editId="291B4764">
+                <wp:inline distT="0" distB="0" distL="0" distR="0" wp14:anchorId="7CC73B33" wp14:editId="02371DB3">
                   <wp:extent cx="2926080" cy="1714660"/>
                   <wp:effectExtent l="0" t="0" r="0" b="0"/>
                   <wp:docPr id="11" name="Picture 11"/>
@@ -10233,7 +10233,7 @@
                 <w:noProof/>
               </w:rPr>
               <w:drawing>
-                <wp:inline distT="0" distB="0" distL="0" distR="0" wp14:anchorId="168E8991" wp14:editId="75404907">
+                <wp:inline distT="0" distB="0" distL="0" distR="0" wp14:anchorId="177B0D68" wp14:editId="66BE1D28">
                   <wp:extent cx="2926080" cy="1558188"/>
                   <wp:effectExtent l="0" t="0" r="0" b="0"/>
                   <wp:docPr id="12" name="Picture 12"/>
@@ -11203,7 +11203,7 @@
         <w:pStyle w:val="Ttulo1"/>
         <w:spacing w:before="100" w:after="30"/>
       </w:pPr>
-      <w:bookmarkStart w:id="21" w:name="_Toc237713743"/>
+      <w:bookmarkStart w:id="21" w:name="_Toc237713997"/>
       <w:r>
         <w:rPr>
           <w:rFonts w:ascii="Georgia" w:hAnsi="Georgia"/>
@@ -11220,7 +11220,7 @@
         <w:pStyle w:val="Ttulo2"/>
         <w:spacing w:before="70" w:after="20"/>
       </w:pPr>
-      <w:bookmarkStart w:id="22" w:name="_Toc237713744"/>
+      <w:bookmarkStart w:id="22" w:name="_Toc237713998"/>
       <w:r>
         <w:rPr>
           <w:rFonts w:ascii="Georgia" w:hAnsi="Georgia"/>
@@ -11312,7 +11312,7 @@
         <w:pStyle w:val="Ttulo2"/>
         <w:spacing w:before="70" w:after="20"/>
       </w:pPr>
-      <w:bookmarkStart w:id="23" w:name="_Toc237713745"/>
+      <w:bookmarkStart w:id="23" w:name="_Toc237713999"/>
       <w:r>
         <w:rPr>
           <w:rFonts w:ascii="Georgia" w:hAnsi="Georgia"/>
@@ -11543,7 +11543,7 @@
                 <w:noProof/>
               </w:rPr>
               <w:drawing>
-                <wp:inline distT="0" distB="0" distL="0" distR="0" wp14:anchorId="3E3E8B14" wp14:editId="006A49B9">
+                <wp:inline distT="0" distB="0" distL="0" distR="0" wp14:anchorId="2671783A" wp14:editId="6A1E03BD">
                   <wp:extent cx="2926080" cy="1540391"/>
                   <wp:effectExtent l="0" t="0" r="0" b="0"/>
                   <wp:docPr id="13" name="Picture 13"/>
@@ -11602,7 +11602,7 @@
                 <w:noProof/>
               </w:rPr>
               <w:drawing>
-                <wp:inline distT="0" distB="0" distL="0" distR="0" wp14:anchorId="089AEE51" wp14:editId="3AB53E11">
+                <wp:inline distT="0" distB="0" distL="0" distR="0" wp14:anchorId="1C824C1E" wp14:editId="4DAEE84D">
                   <wp:extent cx="2926080" cy="1658038"/>
                   <wp:effectExtent l="0" t="0" r="0" b="0"/>
                   <wp:docPr id="14" name="Picture 14"/>
@@ -11707,7 +11707,7 @@
         <w:pStyle w:val="Ttulo2"/>
         <w:spacing w:before="70" w:after="20"/>
       </w:pPr>
-      <w:bookmarkStart w:id="24" w:name="_Toc237713746"/>
+      <w:bookmarkStart w:id="24" w:name="_Toc237714000"/>
       <w:r>
         <w:rPr>
           <w:rFonts w:ascii="Georgia" w:hAnsi="Georgia"/>
@@ -12635,7 +12635,7 @@
         <w:pStyle w:val="Ttulo1"/>
         <w:spacing w:before="100" w:after="30"/>
       </w:pPr>
-      <w:bookmarkStart w:id="25" w:name="_Toc237713747"/>
+      <w:bookmarkStart w:id="25" w:name="_Toc237714001"/>
       <w:r>
         <w:rPr>
           <w:rFonts w:ascii="Georgia" w:hAnsi="Georgia"/>
@@ -12651,7 +12651,7 @@
         <w:pStyle w:val="Ttulo2"/>
         <w:spacing w:before="70" w:after="20"/>
       </w:pPr>
-      <w:bookmarkStart w:id="26" w:name="_Toc237713748"/>
+      <w:bookmarkStart w:id="26" w:name="_Toc237714002"/>
       <w:r>
         <w:rPr>
           <w:rFonts w:ascii="Georgia" w:hAnsi="Georgia"/>
@@ -14240,7 +14240,7 @@
         <w:pStyle w:val="Ttulo2"/>
         <w:spacing w:before="70" w:after="20"/>
       </w:pPr>
-      <w:bookmarkStart w:id="27" w:name="_Toc237713749"/>
+      <w:bookmarkStart w:id="27" w:name="_Toc237714003"/>
       <w:r>
         <w:rPr>
           <w:rFonts w:ascii="Georgia" w:hAnsi="Georgia"/>
@@ -14350,7 +14350,7 @@
         <w:pStyle w:val="Ttulo1"/>
         <w:spacing w:before="100" w:after="30"/>
       </w:pPr>
-      <w:bookmarkStart w:id="28" w:name="_Toc237713750"/>
+      <w:bookmarkStart w:id="28" w:name="_Toc237714004"/>
       <w:r>
         <w:rPr>
           <w:rFonts w:ascii="Georgia" w:hAnsi="Georgia"/>
@@ -14367,7 +14367,7 @@
         <w:pStyle w:val="Ttulo2"/>
         <w:spacing w:before="70" w:after="20"/>
       </w:pPr>
-      <w:bookmarkStart w:id="29" w:name="_Toc237713751"/>
+      <w:bookmarkStart w:id="29" w:name="_Toc237714005"/>
       <w:r>
         <w:rPr>
           <w:rFonts w:ascii="Georgia" w:hAnsi="Georgia"/>
@@ -14394,7 +14394,7 @@
         <w:pStyle w:val="Ttulo2"/>
         <w:spacing w:before="70" w:after="20"/>
       </w:pPr>
-      <w:bookmarkStart w:id="30" w:name="_Toc237713752"/>
+      <w:bookmarkStart w:id="30" w:name="_Toc237714006"/>
       <w:r>
         <w:rPr>
           <w:rFonts w:ascii="Georgia" w:hAnsi="Georgia"/>
@@ -14452,7 +14452,7 @@
                 <w:noProof/>
               </w:rPr>
               <w:drawing>
-                <wp:inline distT="0" distB="0" distL="0" distR="0" wp14:anchorId="561AF0B2" wp14:editId="6290CF01">
+                <wp:inline distT="0" distB="0" distL="0" distR="0" wp14:anchorId="4A129DCD" wp14:editId="473C946B">
                   <wp:extent cx="2926080" cy="1534596"/>
                   <wp:effectExtent l="0" t="0" r="0" b="0"/>
                   <wp:docPr id="15" name="Picture 15"/>
@@ -14511,7 +14511,7 @@
                 <w:noProof/>
               </w:rPr>
               <w:drawing>
-                <wp:inline distT="0" distB="0" distL="0" distR="0" wp14:anchorId="68623A3E" wp14:editId="1B615769">
+                <wp:inline distT="0" distB="0" distL="0" distR="0" wp14:anchorId="7A16A9A1" wp14:editId="527680BF">
                   <wp:extent cx="2926080" cy="1680519"/>
                   <wp:effectExtent l="0" t="0" r="0" b="0"/>
                   <wp:docPr id="16" name="Picture 16"/>
@@ -14627,7 +14627,7 @@
         <w:pStyle w:val="Ttulo1"/>
         <w:spacing w:before="100" w:after="30"/>
       </w:pPr>
-      <w:bookmarkStart w:id="31" w:name="_Toc237713753"/>
+      <w:bookmarkStart w:id="31" w:name="_Toc237714007"/>
       <w:r>
         <w:rPr>
           <w:rFonts w:ascii="Georgia" w:hAnsi="Georgia"/>
@@ -14643,7 +14643,7 @@
         <w:pStyle w:val="Ttulo2"/>
         <w:spacing w:before="70" w:after="20"/>
       </w:pPr>
-      <w:bookmarkStart w:id="32" w:name="_Toc237713754"/>
+      <w:bookmarkStart w:id="32" w:name="_Toc237714008"/>
       <w:r>
         <w:rPr>
           <w:rFonts w:ascii="Georgia" w:hAnsi="Georgia"/>
@@ -15690,7 +15690,7 @@
         <w:pStyle w:val="Ttulo2"/>
         <w:spacing w:before="70" w:after="20"/>
       </w:pPr>
-      <w:bookmarkStart w:id="33" w:name="_Toc237713755"/>
+      <w:bookmarkStart w:id="33" w:name="_Toc237714009"/>
       <w:r>
         <w:rPr>
           <w:rFonts w:ascii="Georgia" w:hAnsi="Georgia"/>
@@ -15851,7 +15851,7 @@
         <w:pStyle w:val="Ttulo2"/>
         <w:spacing w:before="70" w:after="20"/>
       </w:pPr>
-      <w:bookmarkStart w:id="34" w:name="_Toc237713756"/>
+      <w:bookmarkStart w:id="34" w:name="_Toc237714010"/>
       <w:r>
         <w:rPr>
           <w:rFonts w:ascii="Georgia" w:hAnsi="Georgia"/>
@@ -15878,7 +15878,7 @@
         <w:pStyle w:val="Ttulo1"/>
         <w:spacing w:before="100" w:after="30"/>
       </w:pPr>
-      <w:bookmarkStart w:id="35" w:name="_Toc237713757"/>
+      <w:bookmarkStart w:id="35" w:name="_Toc237714011"/>
       <w:r>
         <w:rPr>
           <w:rFonts w:ascii="Georgia" w:hAnsi="Georgia"/>
@@ -15894,7 +15894,7 @@
         <w:pStyle w:val="Ttulo2"/>
         <w:spacing w:before="70" w:after="20"/>
       </w:pPr>
-      <w:bookmarkStart w:id="36" w:name="_Toc237713758"/>
+      <w:bookmarkStart w:id="36" w:name="_Toc237714012"/>
       <w:r>
         <w:rPr>
           <w:rFonts w:ascii="Georgia" w:hAnsi="Georgia"/>
@@ -18821,7 +18821,7 @@
         <w:pStyle w:val="Ttulo1"/>
         <w:spacing w:before="100" w:after="30"/>
       </w:pPr>
-      <w:bookmarkStart w:id="37" w:name="_Toc237713759"/>
+      <w:bookmarkStart w:id="37" w:name="_Toc237714013"/>
       <w:r>
         <w:rPr>
           <w:rFonts w:ascii="Georgia" w:hAnsi="Georgia"/>
@@ -18838,7 +18838,7 @@
         <w:pStyle w:val="Ttulo2"/>
         <w:spacing w:before="70" w:after="20"/>
       </w:pPr>
-      <w:bookmarkStart w:id="38" w:name="_Toc237713760"/>
+      <w:bookmarkStart w:id="38" w:name="_Toc237714014"/>
       <w:r>
         <w:rPr>
           <w:rFonts w:ascii="Georgia" w:hAnsi="Georgia"/>
@@ -19023,7 +19023,7 @@
         <w:pStyle w:val="Ttulo2"/>
         <w:spacing w:before="70" w:after="20"/>
       </w:pPr>
-      <w:bookmarkStart w:id="39" w:name="_Toc237713761"/>
+      <w:bookmarkStart w:id="39" w:name="_Toc237714015"/>
       <w:r>
         <w:rPr>
           <w:rFonts w:ascii="Georgia" w:hAnsi="Georgia"/>
@@ -19081,7 +19081,7 @@
                 <w:noProof/>
               </w:rPr>
               <w:drawing>
-                <wp:inline distT="0" distB="0" distL="0" distR="0" wp14:anchorId="0063066E" wp14:editId="71FA4EAC">
+                <wp:inline distT="0" distB="0" distL="0" distR="0" wp14:anchorId="2735F196" wp14:editId="5B81C4EF">
                   <wp:extent cx="2926080" cy="1626569"/>
                   <wp:effectExtent l="0" t="0" r="0" b="0"/>
                   <wp:docPr id="17" name="Picture 17"/>
@@ -19140,7 +19140,7 @@
                 <w:noProof/>
               </w:rPr>
               <w:drawing>
-                <wp:inline distT="0" distB="0" distL="0" distR="0" wp14:anchorId="2AA91CD7" wp14:editId="34C42BD0">
+                <wp:inline distT="0" distB="0" distL="0" distR="0" wp14:anchorId="1C6CDC91" wp14:editId="1756750E">
                   <wp:extent cx="2926080" cy="1691675"/>
                   <wp:effectExtent l="0" t="0" r="0" b="0"/>
                   <wp:docPr id="18" name="Picture 18"/>
@@ -19245,7 +19245,7 @@
         <w:pStyle w:val="Ttulo2"/>
         <w:spacing w:before="70" w:after="20"/>
       </w:pPr>
-      <w:bookmarkStart w:id="40" w:name="_Toc237713762"/>
+      <w:bookmarkStart w:id="40" w:name="_Toc237714016"/>
       <w:r>
         <w:rPr>
           <w:rFonts w:ascii="Georgia" w:hAnsi="Georgia"/>
@@ -19874,7 +19874,7 @@
         <w:pStyle w:val="Ttulo1"/>
         <w:spacing w:before="100" w:after="30"/>
       </w:pPr>
-      <w:bookmarkStart w:id="41" w:name="_Toc237713763"/>
+      <w:bookmarkStart w:id="41" w:name="_Toc237714017"/>
       <w:r>
         <w:rPr>
           <w:rFonts w:ascii="Georgia" w:hAnsi="Georgia"/>
@@ -19890,7 +19890,7 @@
         <w:pStyle w:val="Ttulo2"/>
         <w:spacing w:before="70" w:after="20"/>
       </w:pPr>
-      <w:bookmarkStart w:id="42" w:name="_Toc237713764"/>
+      <w:bookmarkStart w:id="42" w:name="_Toc237714018"/>
       <w:r>
         <w:rPr>
           <w:rFonts w:ascii="Georgia" w:hAnsi="Georgia"/>
@@ -19948,7 +19948,7 @@
                 <w:noProof/>
               </w:rPr>
               <w:drawing>
-                <wp:inline distT="0" distB="0" distL="0" distR="0" wp14:anchorId="64D19DE1" wp14:editId="58A2C057">
+                <wp:inline distT="0" distB="0" distL="0" distR="0" wp14:anchorId="6AD54D69" wp14:editId="14079F3F">
                   <wp:extent cx="2926080" cy="1495195"/>
                   <wp:effectExtent l="0" t="0" r="0" b="0"/>
                   <wp:docPr id="19" name="Picture 19"/>
@@ -20007,7 +20007,7 @@
                 <w:noProof/>
               </w:rPr>
               <w:drawing>
-                <wp:inline distT="0" distB="0" distL="0" distR="0" wp14:anchorId="76B9B041" wp14:editId="4CABA7F9">
+                <wp:inline distT="0" distB="0" distL="0" distR="0" wp14:anchorId="0374EF29" wp14:editId="38079F02">
                   <wp:extent cx="2926080" cy="1682608"/>
                   <wp:effectExtent l="0" t="0" r="0" b="0"/>
                   <wp:docPr id="20" name="Picture 20"/>
@@ -21142,7 +21142,7 @@
         <w:pStyle w:val="Ttulo1"/>
         <w:spacing w:before="100" w:after="30"/>
       </w:pPr>
-      <w:bookmarkStart w:id="43" w:name="_Toc237713765"/>
+      <w:bookmarkStart w:id="43" w:name="_Toc237714019"/>
       <w:r>
         <w:rPr>
           <w:rFonts w:ascii="Georgia" w:hAnsi="Georgia"/>
@@ -21159,7 +21159,7 @@
         <w:pStyle w:val="Ttulo2"/>
         <w:spacing w:before="70" w:after="20"/>
       </w:pPr>
-      <w:bookmarkStart w:id="44" w:name="_Toc237713766"/>
+      <w:bookmarkStart w:id="44" w:name="_Toc237714020"/>
       <w:r>
         <w:rPr>
           <w:rFonts w:ascii="Georgia" w:hAnsi="Georgia"/>
@@ -21214,7 +21214,7 @@
         <w:pStyle w:val="Ttulo2"/>
         <w:spacing w:before="70" w:after="20"/>
       </w:pPr>
-      <w:bookmarkStart w:id="45" w:name="_Toc237713767"/>
+      <w:bookmarkStart w:id="45" w:name="_Toc237714021"/>
       <w:r>
         <w:rPr>
           <w:rFonts w:ascii="Georgia" w:hAnsi="Georgia"/>
@@ -21272,7 +21272,7 @@
                 <w:noProof/>
               </w:rPr>
               <w:drawing>
-                <wp:inline distT="0" distB="0" distL="0" distR="0" wp14:anchorId="7057C6C2" wp14:editId="7270EF5E">
+                <wp:inline distT="0" distB="0" distL="0" distR="0" wp14:anchorId="176BE286" wp14:editId="20DDFD82">
                   <wp:extent cx="2926080" cy="1682608"/>
                   <wp:effectExtent l="0" t="0" r="0" b="0"/>
                   <wp:docPr id="21" name="Picture 21"/>
@@ -21331,7 +21331,7 @@
                 <w:noProof/>
               </w:rPr>
               <w:drawing>
-                <wp:inline distT="0" distB="0" distL="0" distR="0" wp14:anchorId="719BE2C1" wp14:editId="0456FED4">
+                <wp:inline distT="0" distB="0" distL="0" distR="0" wp14:anchorId="7F531AFF" wp14:editId="323FA060">
                   <wp:extent cx="2926080" cy="1549755"/>
                   <wp:effectExtent l="0" t="0" r="0" b="0"/>
                   <wp:docPr id="22" name="Picture 22"/>
@@ -21436,7 +21436,7 @@
         <w:pStyle w:val="Ttulo1"/>
         <w:spacing w:before="100" w:after="30"/>
       </w:pPr>
-      <w:bookmarkStart w:id="46" w:name="_Toc237713768"/>
+      <w:bookmarkStart w:id="46" w:name="_Toc237714022"/>
       <w:r>
         <w:rPr>
           <w:rFonts w:ascii="Georgia" w:hAnsi="Georgia"/>
@@ -21452,7 +21452,7 @@
         <w:pStyle w:val="Ttulo2"/>
         <w:spacing w:before="70" w:after="20"/>
       </w:pPr>
-      <w:bookmarkStart w:id="47" w:name="_Toc237713769"/>
+      <w:bookmarkStart w:id="47" w:name="_Toc237714023"/>
       <w:r>
         <w:rPr>
           <w:rFonts w:ascii="Georgia" w:hAnsi="Georgia"/>
@@ -23000,7 +23000,7 @@
         <w:pStyle w:val="Ttulo1"/>
         <w:spacing w:before="100" w:after="30"/>
       </w:pPr>
-      <w:bookmarkStart w:id="48" w:name="_Toc237713770"/>
+      <w:bookmarkStart w:id="48" w:name="_Toc237714024"/>
       <w:r>
         <w:rPr>
           <w:rFonts w:ascii="Georgia" w:hAnsi="Georgia"/>
@@ -23017,7 +23017,7 @@
         <w:pStyle w:val="Ttulo2"/>
         <w:spacing w:before="70" w:after="20"/>
       </w:pPr>
-      <w:bookmarkStart w:id="49" w:name="_Toc237713771"/>
+      <w:bookmarkStart w:id="49" w:name="_Toc237714025"/>
       <w:r>
         <w:rPr>
           <w:rFonts w:ascii="Georgia" w:hAnsi="Georgia"/>
@@ -23140,7 +23140,7 @@
                 <w:noProof/>
               </w:rPr>
               <w:drawing>
-                <wp:inline distT="0" distB="0" distL="0" distR="0" wp14:anchorId="187AB01C" wp14:editId="35C2D247">
+                <wp:inline distT="0" distB="0" distL="0" distR="0" wp14:anchorId="4DF8408A" wp14:editId="47D0DAC7">
                   <wp:extent cx="2926080" cy="1695124"/>
                   <wp:effectExtent l="0" t="0" r="0" b="0"/>
                   <wp:docPr id="23" name="Picture 23"/>
@@ -23199,7 +23199,7 @@
                 <w:noProof/>
               </w:rPr>
               <w:drawing>
-                <wp:inline distT="0" distB="0" distL="0" distR="0" wp14:anchorId="0E09B8CD" wp14:editId="26033D22">
+                <wp:inline distT="0" distB="0" distL="0" distR="0" wp14:anchorId="3265ECAB" wp14:editId="0B3536F0">
                   <wp:extent cx="2926080" cy="1572627"/>
                   <wp:effectExtent l="0" t="0" r="0" b="0"/>
                   <wp:docPr id="24" name="Picture 24"/>
@@ -23304,7 +23304,7 @@
         <w:pStyle w:val="Ttulo2"/>
         <w:spacing w:before="70" w:after="20"/>
       </w:pPr>
-      <w:bookmarkStart w:id="50" w:name="_Toc237713772"/>
+      <w:bookmarkStart w:id="50" w:name="_Toc237714026"/>
       <w:r>
         <w:rPr>
           <w:rFonts w:ascii="Georgia" w:hAnsi="Georgia"/>
@@ -24039,7 +24039,7 @@
         <w:pStyle w:val="Ttulo2"/>
         <w:spacing w:before="70" w:after="20"/>
       </w:pPr>
-      <w:bookmarkStart w:id="51" w:name="_Toc237713773"/>
+      <w:bookmarkStart w:id="51" w:name="_Toc237714027"/>
       <w:r>
         <w:rPr>
           <w:rFonts w:ascii="Georgia" w:hAnsi="Georgia"/>
@@ -24089,7 +24089,7 @@
         <w:pStyle w:val="Ttulo2"/>
         <w:spacing w:before="70" w:after="20"/>
       </w:pPr>
-      <w:bookmarkStart w:id="52" w:name="_Toc237713774"/>
+      <w:bookmarkStart w:id="52" w:name="_Toc237714028"/>
       <w:r>
         <w:rPr>
           <w:rFonts w:ascii="Georgia" w:hAnsi="Georgia"/>
@@ -24170,7 +24170,7 @@
                 <w:noProof/>
               </w:rPr>
               <w:drawing>
-                <wp:inline distT="0" distB="0" distL="0" distR="0" wp14:anchorId="654CFEB7" wp14:editId="55D4A99E">
+                <wp:inline distT="0" distB="0" distL="0" distR="0" wp14:anchorId="13894E5C" wp14:editId="158FE99B">
                   <wp:extent cx="2926080" cy="1696900"/>
                   <wp:effectExtent l="0" t="0" r="0" b="0"/>
                   <wp:docPr id="25" name="Picture 25"/>
@@ -24229,7 +24229,7 @@
                 <w:noProof/>
               </w:rPr>
               <w:drawing>
-                <wp:inline distT="0" distB="0" distL="0" distR="0" wp14:anchorId="5A7BE4E5" wp14:editId="5E08FE81">
+                <wp:inline distT="0" distB="0" distL="0" distR="0" wp14:anchorId="4D018C0A" wp14:editId="4F664655">
                   <wp:extent cx="2926080" cy="1614092"/>
                   <wp:effectExtent l="0" t="0" r="0" b="0"/>
                   <wp:docPr id="26" name="Picture 26"/>
@@ -25254,7 +25254,7 @@
         <w:pStyle w:val="Ttulo2"/>
         <w:spacing w:before="70" w:after="20"/>
       </w:pPr>
-      <w:bookmarkStart w:id="53" w:name="_Toc237713775"/>
+      <w:bookmarkStart w:id="53" w:name="_Toc237714029"/>
       <w:r>
         <w:rPr>
           <w:rFonts w:ascii="Georgia" w:hAnsi="Georgia"/>
@@ -25312,7 +25312,7 @@
                 <w:noProof/>
               </w:rPr>
               <w:drawing>
-                <wp:inline distT="0" distB="0" distL="0" distR="0" wp14:anchorId="1A18887C" wp14:editId="3A38CCEC">
+                <wp:inline distT="0" distB="0" distL="0" distR="0" wp14:anchorId="21A4F788" wp14:editId="50B8EF47">
                   <wp:extent cx="2926080" cy="1654733"/>
                   <wp:effectExtent l="0" t="0" r="0" b="0"/>
                   <wp:docPr id="27" name="Picture 27"/>
@@ -25371,7 +25371,7 @@
                 <w:noProof/>
               </w:rPr>
               <w:drawing>
-                <wp:inline distT="0" distB="0" distL="0" distR="0" wp14:anchorId="301A4557" wp14:editId="7AE2D8A5">
+                <wp:inline distT="0" distB="0" distL="0" distR="0" wp14:anchorId="61C04C96" wp14:editId="2946EF82">
                   <wp:extent cx="2926080" cy="1698212"/>
                   <wp:effectExtent l="0" t="0" r="0" b="0"/>
                   <wp:docPr id="28" name="Picture 28"/>
@@ -25486,7 +25486,7 @@
         <w:pStyle w:val="Ttulo1"/>
         <w:spacing w:before="100" w:after="30"/>
       </w:pPr>
-      <w:bookmarkStart w:id="54" w:name="_Toc237713776"/>
+      <w:bookmarkStart w:id="54" w:name="_Toc237714030"/>
       <w:r>
         <w:rPr>
           <w:rFonts w:ascii="Georgia" w:hAnsi="Georgia"/>
@@ -25503,7 +25503,7 @@
         <w:pStyle w:val="Ttulo2"/>
         <w:spacing w:before="70" w:after="20"/>
       </w:pPr>
-      <w:bookmarkStart w:id="55" w:name="_Toc237713777"/>
+      <w:bookmarkStart w:id="55" w:name="_Toc237714031"/>
       <w:r>
         <w:rPr>
           <w:rFonts w:ascii="Georgia" w:hAnsi="Georgia"/>
@@ -25564,7 +25564,7 @@
         <w:pStyle w:val="Ttulo2"/>
         <w:spacing w:before="70" w:after="20"/>
       </w:pPr>
-      <w:bookmarkStart w:id="56" w:name="_Toc237713778"/>
+      <w:bookmarkStart w:id="56" w:name="_Toc237714032"/>
       <w:r>
         <w:rPr>
           <w:rFonts w:ascii="Georgia" w:hAnsi="Georgia"/>
@@ -25639,7 +25639,7 @@
                 <w:noProof/>
               </w:rPr>
               <w:drawing>
-                <wp:inline distT="0" distB="0" distL="0" distR="0" wp14:anchorId="6B9E1B10" wp14:editId="2B812F06">
+                <wp:inline distT="0" distB="0" distL="0" distR="0" wp14:anchorId="215F1FFA" wp14:editId="595A73D0">
                   <wp:extent cx="2926080" cy="1650045"/>
                   <wp:effectExtent l="0" t="0" r="0" b="0"/>
                   <wp:docPr id="29" name="Picture 29"/>
@@ -25698,7 +25698,7 @@
                 <w:noProof/>
               </w:rPr>
               <w:drawing>
-                <wp:inline distT="0" distB="0" distL="0" distR="0" wp14:anchorId="15F5B68D" wp14:editId="0E68E9A3">
+                <wp:inline distT="0" distB="0" distL="0" distR="0" wp14:anchorId="7E19E307" wp14:editId="42277609">
                   <wp:extent cx="2926080" cy="1611196"/>
                   <wp:effectExtent l="0" t="0" r="0" b="0"/>
                   <wp:docPr id="30" name="Picture 30"/>
@@ -26186,7 +26186,7 @@
         <w:pStyle w:val="Ttulo2"/>
         <w:spacing w:before="70" w:after="20"/>
       </w:pPr>
-      <w:bookmarkStart w:id="57" w:name="_Toc237713779"/>
+      <w:bookmarkStart w:id="57" w:name="_Toc237714033"/>
       <w:r>
         <w:rPr>
           <w:rFonts w:ascii="Georgia" w:hAnsi="Georgia"/>
@@ -26260,7 +26260,7 @@
                 <w:noProof/>
               </w:rPr>
               <w:drawing>
-                <wp:inline distT="0" distB="0" distL="0" distR="0" wp14:anchorId="69D7BE58" wp14:editId="14AE35A6">
+                <wp:inline distT="0" distB="0" distL="0" distR="0" wp14:anchorId="7EE7FFB9" wp14:editId="254A4ED9">
                   <wp:extent cx="2926080" cy="1687777"/>
                   <wp:effectExtent l="0" t="0" r="0" b="0"/>
                   <wp:docPr id="31" name="Picture 31"/>
@@ -26855,7 +26855,7 @@
         <w:pStyle w:val="Ttulo2"/>
         <w:spacing w:before="70" w:after="20"/>
       </w:pPr>
-      <w:bookmarkStart w:id="58" w:name="_Toc237713780"/>
+      <w:bookmarkStart w:id="58" w:name="_Toc237714034"/>
       <w:r>
         <w:rPr>
           <w:rFonts w:ascii="Georgia" w:hAnsi="Georgia"/>
@@ -28114,7 +28114,7 @@
         <w:pStyle w:val="Ttulo1"/>
         <w:spacing w:before="100" w:after="30"/>
       </w:pPr>
-      <w:bookmarkStart w:id="59" w:name="_Toc237713781"/>
+      <w:bookmarkStart w:id="59" w:name="_Toc237714035"/>
       <w:r>
         <w:rPr>
           <w:rFonts w:ascii="Georgia" w:hAnsi="Georgia"/>
@@ -28302,7 +28302,7 @@
         <w:pStyle w:val="Ttulo1"/>
         <w:spacing w:before="100" w:after="30"/>
       </w:pPr>
-      <w:bookmarkStart w:id="60" w:name="_Toc237713782"/>
+      <w:bookmarkStart w:id="60" w:name="_Toc237714036"/>
       <w:r>
         <w:rPr>
           <w:rFonts w:ascii="Georgia" w:hAnsi="Georgia"/>
@@ -37431,7 +37431,7 @@
         <w:pStyle w:val="Ttulo1"/>
         <w:spacing w:before="100" w:after="30"/>
       </w:pPr>
-      <w:bookmarkStart w:id="61" w:name="_Toc237713783"/>
+      <w:bookmarkStart w:id="61" w:name="_Toc237714037"/>
       <w:r>
         <w:rPr>
           <w:rFonts w:ascii="Georgia" w:hAnsi="Georgia"/>
@@ -37903,7 +37903,7 @@
         <w:pStyle w:val="Ttulo1"/>
         <w:spacing w:before="100" w:after="30"/>
       </w:pPr>
-      <w:bookmarkStart w:id="62" w:name="_Toc237713784"/>
+      <w:bookmarkStart w:id="62" w:name="_Toc237714038"/>
       <w:r>
         <w:rPr>
           <w:rFonts w:ascii="Georgia" w:hAnsi="Georgia"/>
@@ -38407,31 +38407,31 @@
       </w:rPr>
     </w:lvl>
   </w:abstractNum>
-  <w:num w:numId="1" w16cid:durableId="929507440">
+  <w:num w:numId="1" w16cid:durableId="2119636091">
     <w:abstractNumId w:val="8"/>
   </w:num>
-  <w:num w:numId="2" w16cid:durableId="2112041401">
+  <w:num w:numId="2" w16cid:durableId="480082234">
     <w:abstractNumId w:val="6"/>
   </w:num>
-  <w:num w:numId="3" w16cid:durableId="1071661698">
+  <w:num w:numId="3" w16cid:durableId="215898145">
     <w:abstractNumId w:val="5"/>
   </w:num>
-  <w:num w:numId="4" w16cid:durableId="1721707117">
+  <w:num w:numId="4" w16cid:durableId="20665291">
     <w:abstractNumId w:val="4"/>
   </w:num>
-  <w:num w:numId="5" w16cid:durableId="812405189">
+  <w:num w:numId="5" w16cid:durableId="2116898351">
     <w:abstractNumId w:val="7"/>
   </w:num>
-  <w:num w:numId="6" w16cid:durableId="665212433">
+  <w:num w:numId="6" w16cid:durableId="1393238496">
     <w:abstractNumId w:val="3"/>
   </w:num>
-  <w:num w:numId="7" w16cid:durableId="1671565439">
+  <w:num w:numId="7" w16cid:durableId="613290030">
     <w:abstractNumId w:val="2"/>
   </w:num>
-  <w:num w:numId="8" w16cid:durableId="1839534406">
+  <w:num w:numId="8" w16cid:durableId="1741441309">
     <w:abstractNumId w:val="1"/>
   </w:num>
-  <w:num w:numId="9" w16cid:durableId="672220818">
+  <w:num w:numId="9" w16cid:durableId="1253246141">
     <w:abstractNumId w:val="0"/>
   </w:num>
 </w:numbering>
@@ -49863,7 +49863,7 @@
     <w:autoRedefine/>
     <w:uiPriority w:val="39"/>
     <w:unhideWhenUsed/>
-    <w:rsid w:val="0093588A"/>
+    <w:rsid w:val="00964323"/>
     <w:pPr>
       <w:spacing w:before="10" w:after="10" w:line="240" w:lineRule="auto"/>
     </w:pPr>
@@ -49878,7 +49878,7 @@
     <w:autoRedefine/>
     <w:uiPriority w:val="39"/>
     <w:unhideWhenUsed/>
-    <w:rsid w:val="0093588A"/>
+    <w:rsid w:val="00964323"/>
     <w:pPr>
       <w:spacing w:after="0" w:line="240" w:lineRule="auto"/>
       <w:ind w:left="170"/>
@@ -49892,7 +49892,7 @@
     <w:basedOn w:val="Fuentedeprrafopredeter"/>
     <w:uiPriority w:val="99"/>
     <w:unhideWhenUsed/>
-    <w:rsid w:val="0093588A"/>
+    <w:rsid w:val="00964323"/>
     <w:rPr>
       <w:color w:val="0000FF" w:themeColor="hyperlink"/>
       <w:u w:val="single"/>

</xml_diff>

<commit_message>
style(reporte): Optimizar cuadro COMPRAR y tabla WACC en PDF y Word con distribucion balanceada
</commit_message>
<xml_diff>
--- a/01_Reporte_PDF/Informe_Valuacion_Aluar_UNCuyo.docx
+++ b/01_Reporte_PDF/Informe_Valuacion_Aluar_UNCuyo.docx
@@ -392,7 +392,7 @@
                 </w:tcPr>
                 <w:p>
                   <w:pPr>
-                    <w:spacing w:after="0"/>
+                    <w:spacing w:after="20"/>
                     <w:jc w:val="center"/>
                     <w:rPr>
                       <w:rFonts w:hint="eastAsia"/>
@@ -408,7 +408,7 @@
                 </w:p>
                 <w:p>
                   <w:pPr>
-                    <w:spacing w:after="20"/>
+                    <w:spacing w:after="40"/>
                     <w:jc w:val="center"/>
                     <w:rPr>
                       <w:rFonts w:hint="eastAsia"/>
@@ -425,7 +425,7 @@
                 </w:p>
                 <w:p>
                   <w:pPr>
-                    <w:spacing w:after="0"/>
+                    <w:spacing w:after="20"/>
                     <w:jc w:val="center"/>
                     <w:rPr>
                       <w:rFonts w:hint="eastAsia"/>
@@ -435,7 +435,7 @@
                     <w:rPr>
                       <w:sz w:val="15"/>
                     </w:rPr>
-                    <w:t xml:space="preserve">Target Base Fundamental (Dumrauf): </w:t>
+                    <w:t xml:space="preserve">Target Fundamental (Dumrauf): </w:t>
                   </w:r>
                   <w:r>
                     <w:rPr>
@@ -453,7 +453,7 @@
                 </w:p>
                 <w:p>
                   <w:pPr>
-                    <w:spacing w:after="0"/>
+                    <w:spacing w:after="20"/>
                     <w:jc w:val="center"/>
                     <w:rPr>
                       <w:rFonts w:hint="eastAsia"/>
@@ -481,7 +481,7 @@
                 </w:p>
                 <w:p>
                   <w:pPr>
-                    <w:spacing w:after="0"/>
+                    <w:spacing w:after="20"/>
                     <w:jc w:val="center"/>
                     <w:rPr>
                       <w:rFonts w:hint="eastAsia"/>
@@ -533,8 +533,10 @@
                     <w:tblLook w:val="04A0" w:firstRow="1" w:lastRow="0" w:firstColumn="1" w:lastColumn="0" w:noHBand="0" w:noVBand="1"/>
                   </w:tblPr>
                   <w:tblGrid>
-                    <w:gridCol w:w="2455"/>
-                    <w:gridCol w:w="2442"/>
+                    <w:gridCol w:w="1235"/>
+                    <w:gridCol w:w="1217"/>
+                    <w:gridCol w:w="1229"/>
+                    <w:gridCol w:w="1216"/>
                   </w:tblGrid>
                   <w:tr>
                     <w:trPr>
@@ -542,12 +544,12 @@
                     </w:trPr>
                     <w:tc>
                       <w:tcPr>
-                        <w:tcW w:w="2523" w:type="dxa"/>
+                        <w:tcW w:w="1262" w:type="dxa"/>
                         <w:tcMar>
-                          <w:top w:w="8" w:type="dxa"/>
-                          <w:left w:w="10" w:type="dxa"/>
-                          <w:bottom w:w="8" w:type="dxa"/>
-                          <w:right w:w="10" w:type="dxa"/>
+                          <w:top w:w="4" w:type="dxa"/>
+                          <w:left w:w="3" w:type="dxa"/>
+                          <w:bottom w:w="4" w:type="dxa"/>
+                          <w:right w:w="3" w:type="dxa"/>
                         </w:tcMar>
                       </w:tcPr>
                       <w:p>
@@ -560,20 +562,467 @@
                         <w:r>
                           <w:rPr>
                             <w:b/>
-                            <w:sz w:val="14"/>
+                            <w:color w:val="0D233A"/>
+                            <w:sz w:val="13"/>
                           </w:rPr>
-                          <w:t>Costo de Capital (WACC):</w:t>
+                          <w:t>WACC:</w:t>
                         </w:r>
                       </w:p>
                     </w:tc>
                     <w:tc>
                       <w:tcPr>
-                        <w:tcW w:w="2523" w:type="dxa"/>
+                        <w:tcW w:w="1262" w:type="dxa"/>
                         <w:tcMar>
-                          <w:top w:w="8" w:type="dxa"/>
-                          <w:left w:w="10" w:type="dxa"/>
-                          <w:bottom w:w="8" w:type="dxa"/>
-                          <w:right w:w="10" w:type="dxa"/>
+                          <w:top w:w="4" w:type="dxa"/>
+                          <w:left w:w="3" w:type="dxa"/>
+                          <w:bottom w:w="4" w:type="dxa"/>
+                          <w:right w:w="3" w:type="dxa"/>
+                        </w:tcMar>
+                      </w:tcPr>
+                      <w:p>
+                        <w:pPr>
+                          <w:spacing w:after="0"/>
+                          <w:jc w:val="right"/>
+                          <w:rPr>
+                            <w:rFonts w:hint="eastAsia"/>
+                          </w:rPr>
+                        </w:pPr>
+                        <w:r>
+                          <w:rPr>
+                            <w:sz w:val="13"/>
+                          </w:rPr>
+                          <w:t>7,06%</w:t>
+                        </w:r>
+                      </w:p>
+                    </w:tc>
+                    <w:tc>
+                      <w:tcPr>
+                        <w:tcW w:w="1262" w:type="dxa"/>
+                        <w:tcMar>
+                          <w:top w:w="4" w:type="dxa"/>
+                          <w:left w:w="3" w:type="dxa"/>
+                          <w:bottom w:w="4" w:type="dxa"/>
+                          <w:right w:w="3" w:type="dxa"/>
+                        </w:tcMar>
+                      </w:tcPr>
+                      <w:p>
+                        <w:pPr>
+                          <w:spacing w:after="0"/>
+                          <w:rPr>
+                            <w:rFonts w:hint="eastAsia"/>
+                          </w:rPr>
+                        </w:pPr>
+                        <w:r>
+                          <w:rPr>
+                            <w:b/>
+                            <w:color w:val="0D233A"/>
+                            <w:sz w:val="13"/>
+                          </w:rPr>
+                          <w:t>Ke (λ = 0,20):</w:t>
+                        </w:r>
+                      </w:p>
+                    </w:tc>
+                    <w:tc>
+                      <w:tcPr>
+                        <w:tcW w:w="1262" w:type="dxa"/>
+                        <w:tcMar>
+                          <w:top w:w="4" w:type="dxa"/>
+                          <w:left w:w="3" w:type="dxa"/>
+                          <w:bottom w:w="4" w:type="dxa"/>
+                          <w:right w:w="3" w:type="dxa"/>
+                        </w:tcMar>
+                      </w:tcPr>
+                      <w:p>
+                        <w:pPr>
+                          <w:spacing w:after="0"/>
+                          <w:jc w:val="right"/>
+                          <w:rPr>
+                            <w:rFonts w:hint="eastAsia"/>
+                          </w:rPr>
+                        </w:pPr>
+                        <w:r>
+                          <w:rPr>
+                            <w:sz w:val="13"/>
+                          </w:rPr>
+                          <w:t>9,30%</w:t>
+                        </w:r>
+                      </w:p>
+                    </w:tc>
+                  </w:tr>
+                  <w:tr>
+                    <w:trPr>
+                      <w:jc w:val="center"/>
+                    </w:trPr>
+                    <w:tc>
+                      <w:tcPr>
+                        <w:tcW w:w="1262" w:type="dxa"/>
+                        <w:tcMar>
+                          <w:top w:w="4" w:type="dxa"/>
+                          <w:left w:w="3" w:type="dxa"/>
+                          <w:bottom w:w="4" w:type="dxa"/>
+                          <w:right w:w="3" w:type="dxa"/>
+                        </w:tcMar>
+                      </w:tcPr>
+                      <w:p>
+                        <w:pPr>
+                          <w:spacing w:after="0"/>
+                          <w:rPr>
+                            <w:rFonts w:hint="eastAsia"/>
+                          </w:rPr>
+                        </w:pPr>
+                        <w:r>
+                          <w:rPr>
+                            <w:b/>
+                            <w:color w:val="0D233A"/>
+                            <w:sz w:val="13"/>
+                          </w:rPr>
+                          <w:t>Beta (Hamada):</w:t>
+                        </w:r>
+                      </w:p>
+                    </w:tc>
+                    <w:tc>
+                      <w:tcPr>
+                        <w:tcW w:w="1262" w:type="dxa"/>
+                        <w:tcMar>
+                          <w:top w:w="4" w:type="dxa"/>
+                          <w:left w:w="3" w:type="dxa"/>
+                          <w:bottom w:w="4" w:type="dxa"/>
+                          <w:right w:w="3" w:type="dxa"/>
+                        </w:tcMar>
+                      </w:tcPr>
+                      <w:p>
+                        <w:pPr>
+                          <w:spacing w:after="0"/>
+                          <w:jc w:val="right"/>
+                          <w:rPr>
+                            <w:rFonts w:hint="eastAsia"/>
+                          </w:rPr>
+                        </w:pPr>
+                        <w:r>
+                          <w:rPr>
+                            <w:sz w:val="13"/>
+                          </w:rPr>
+                          <w:t>0,888</w:t>
+                        </w:r>
+                      </w:p>
+                    </w:tc>
+                    <w:tc>
+                      <w:tcPr>
+                        <w:tcW w:w="1262" w:type="dxa"/>
+                        <w:tcMar>
+                          <w:top w:w="4" w:type="dxa"/>
+                          <w:left w:w="3" w:type="dxa"/>
+                          <w:bottom w:w="4" w:type="dxa"/>
+                          <w:right w:w="3" w:type="dxa"/>
+                        </w:tcMar>
+                      </w:tcPr>
+                      <w:p>
+                        <w:pPr>
+                          <w:spacing w:after="0"/>
+                          <w:rPr>
+                            <w:rFonts w:hint="eastAsia"/>
+                          </w:rPr>
+                        </w:pPr>
+                        <w:r>
+                          <w:rPr>
+                            <w:b/>
+                            <w:color w:val="0D233A"/>
+                            <w:sz w:val="13"/>
+                          </w:rPr>
+                          <w:t>ERP:</w:t>
+                        </w:r>
+                      </w:p>
+                    </w:tc>
+                    <w:tc>
+                      <w:tcPr>
+                        <w:tcW w:w="1262" w:type="dxa"/>
+                        <w:tcMar>
+                          <w:top w:w="4" w:type="dxa"/>
+                          <w:left w:w="3" w:type="dxa"/>
+                          <w:bottom w:w="4" w:type="dxa"/>
+                          <w:right w:w="3" w:type="dxa"/>
+                        </w:tcMar>
+                      </w:tcPr>
+                      <w:p>
+                        <w:pPr>
+                          <w:spacing w:after="0"/>
+                          <w:jc w:val="right"/>
+                          <w:rPr>
+                            <w:rFonts w:hint="eastAsia"/>
+                          </w:rPr>
+                        </w:pPr>
+                        <w:r>
+                          <w:rPr>
+                            <w:sz w:val="13"/>
+                          </w:rPr>
+                          <w:t>4,18%</w:t>
+                        </w:r>
+                      </w:p>
+                    </w:tc>
+                  </w:tr>
+                  <w:tr>
+                    <w:trPr>
+                      <w:jc w:val="center"/>
+                    </w:trPr>
+                    <w:tc>
+                      <w:tcPr>
+                        <w:tcW w:w="1262" w:type="dxa"/>
+                        <w:tcMar>
+                          <w:top w:w="4" w:type="dxa"/>
+                          <w:left w:w="3" w:type="dxa"/>
+                          <w:bottom w:w="4" w:type="dxa"/>
+                          <w:right w:w="3" w:type="dxa"/>
+                        </w:tcMar>
+                      </w:tcPr>
+                      <w:p>
+                        <w:pPr>
+                          <w:spacing w:after="0"/>
+                          <w:rPr>
+                            <w:rFonts w:hint="eastAsia"/>
+                          </w:rPr>
+                        </w:pPr>
+                        <w:r>
+                          <w:rPr>
+                            <w:b/>
+                            <w:color w:val="0D233A"/>
+                            <w:sz w:val="13"/>
+                          </w:rPr>
+                          <w:t>Prima País (λ):</w:t>
+                        </w:r>
+                      </w:p>
+                    </w:tc>
+                    <w:tc>
+                      <w:tcPr>
+                        <w:tcW w:w="1262" w:type="dxa"/>
+                        <w:tcMar>
+                          <w:top w:w="4" w:type="dxa"/>
+                          <w:left w:w="3" w:type="dxa"/>
+                          <w:bottom w:w="4" w:type="dxa"/>
+                          <w:right w:w="3" w:type="dxa"/>
+                        </w:tcMar>
+                      </w:tcPr>
+                      <w:p>
+                        <w:pPr>
+                          <w:spacing w:after="0"/>
+                          <w:jc w:val="right"/>
+                          <w:rPr>
+                            <w:rFonts w:hint="eastAsia"/>
+                          </w:rPr>
+                        </w:pPr>
+                        <w:r>
+                          <w:rPr>
+                            <w:sz w:val="13"/>
+                          </w:rPr>
+                          <w:t>0,88%</w:t>
+                        </w:r>
+                      </w:p>
+                    </w:tc>
+                    <w:tc>
+                      <w:tcPr>
+                        <w:tcW w:w="1262" w:type="dxa"/>
+                        <w:tcMar>
+                          <w:top w:w="4" w:type="dxa"/>
+                          <w:left w:w="3" w:type="dxa"/>
+                          <w:bottom w:w="4" w:type="dxa"/>
+                          <w:right w:w="3" w:type="dxa"/>
+                        </w:tcMar>
+                      </w:tcPr>
+                      <w:p>
+                        <w:pPr>
+                          <w:spacing w:after="0"/>
+                          <w:rPr>
+                            <w:rFonts w:hint="eastAsia"/>
+                          </w:rPr>
+                        </w:pPr>
+                        <w:r>
+                          <w:rPr>
+                            <w:b/>
+                            <w:color w:val="0D233A"/>
+                            <w:sz w:val="13"/>
+                          </w:rPr>
+                          <w:t>Kd post-imp.:</w:t>
+                        </w:r>
+                      </w:p>
+                    </w:tc>
+                    <w:tc>
+                      <w:tcPr>
+                        <w:tcW w:w="1262" w:type="dxa"/>
+                        <w:tcMar>
+                          <w:top w:w="4" w:type="dxa"/>
+                          <w:left w:w="3" w:type="dxa"/>
+                          <w:bottom w:w="4" w:type="dxa"/>
+                          <w:right w:w="3" w:type="dxa"/>
+                        </w:tcMar>
+                      </w:tcPr>
+                      <w:p>
+                        <w:pPr>
+                          <w:spacing w:after="0"/>
+                          <w:jc w:val="right"/>
+                          <w:rPr>
+                            <w:rFonts w:hint="eastAsia"/>
+                          </w:rPr>
+                        </w:pPr>
+                        <w:r>
+                          <w:rPr>
+                            <w:sz w:val="13"/>
+                          </w:rPr>
+                          <w:t>2,47%</w:t>
+                        </w:r>
+                      </w:p>
+                    </w:tc>
+                  </w:tr>
+                  <w:tr>
+                    <w:trPr>
+                      <w:jc w:val="center"/>
+                    </w:trPr>
+                    <w:tc>
+                      <w:tcPr>
+                        <w:tcW w:w="1262" w:type="dxa"/>
+                        <w:tcMar>
+                          <w:top w:w="4" w:type="dxa"/>
+                          <w:left w:w="3" w:type="dxa"/>
+                          <w:bottom w:w="4" w:type="dxa"/>
+                          <w:right w:w="3" w:type="dxa"/>
+                        </w:tcMar>
+                      </w:tcPr>
+                      <w:p>
+                        <w:pPr>
+                          <w:spacing w:after="0"/>
+                          <w:rPr>
+                            <w:rFonts w:hint="eastAsia"/>
+                          </w:rPr>
+                        </w:pPr>
+                        <w:r>
+                          <w:rPr>
+                            <w:b/>
+                            <w:color w:val="0D233A"/>
+                            <w:sz w:val="13"/>
+                          </w:rPr>
+                          <w:t>Estructura D/E:</w:t>
+                        </w:r>
+                      </w:p>
+                    </w:tc>
+                    <w:tc>
+                      <w:tcPr>
+                        <w:tcW w:w="1262" w:type="dxa"/>
+                        <w:tcMar>
+                          <w:top w:w="4" w:type="dxa"/>
+                          <w:left w:w="3" w:type="dxa"/>
+                          <w:bottom w:w="4" w:type="dxa"/>
+                          <w:right w:w="3" w:type="dxa"/>
+                        </w:tcMar>
+                      </w:tcPr>
+                      <w:p>
+                        <w:pPr>
+                          <w:spacing w:after="0"/>
+                          <w:jc w:val="right"/>
+                          <w:rPr>
+                            <w:rFonts w:hint="eastAsia"/>
+                          </w:rPr>
+                        </w:pPr>
+                        <w:r>
+                          <w:rPr>
+                            <w:sz w:val="13"/>
+                          </w:rPr>
+                          <w:t>0,486</w:t>
+                        </w:r>
+                      </w:p>
+                    </w:tc>
+                    <w:tc>
+                      <w:tcPr>
+                        <w:tcW w:w="1262" w:type="dxa"/>
+                        <w:tcMar>
+                          <w:top w:w="4" w:type="dxa"/>
+                          <w:left w:w="3" w:type="dxa"/>
+                          <w:bottom w:w="4" w:type="dxa"/>
+                          <w:right w:w="3" w:type="dxa"/>
+                        </w:tcMar>
+                      </w:tcPr>
+                      <w:p>
+                        <w:pPr>
+                          <w:spacing w:after="0"/>
+                          <w:rPr>
+                            <w:rFonts w:hint="eastAsia"/>
+                          </w:rPr>
+                        </w:pPr>
+                        <w:r>
+                          <w:rPr>
+                            <w:b/>
+                            <w:color w:val="0D233A"/>
+                            <w:sz w:val="13"/>
+                          </w:rPr>
+                          <w:t>Crec. Terminal (g):</w:t>
+                        </w:r>
+                      </w:p>
+                    </w:tc>
+                    <w:tc>
+                      <w:tcPr>
+                        <w:tcW w:w="1262" w:type="dxa"/>
+                        <w:tcMar>
+                          <w:top w:w="4" w:type="dxa"/>
+                          <w:left w:w="3" w:type="dxa"/>
+                          <w:bottom w:w="4" w:type="dxa"/>
+                          <w:right w:w="3" w:type="dxa"/>
+                        </w:tcMar>
+                      </w:tcPr>
+                      <w:p>
+                        <w:pPr>
+                          <w:spacing w:after="0"/>
+                          <w:jc w:val="right"/>
+                          <w:rPr>
+                            <w:rFonts w:hint="eastAsia"/>
+                          </w:rPr>
+                        </w:pPr>
+                        <w:r>
+                          <w:rPr>
+                            <w:sz w:val="13"/>
+                          </w:rPr>
+                          <w:t>2,00%</w:t>
+                        </w:r>
+                      </w:p>
+                    </w:tc>
+                  </w:tr>
+                  <w:tr>
+                    <w:trPr>
+                      <w:jc w:val="center"/>
+                    </w:trPr>
+                    <w:tc>
+                      <w:tcPr>
+                        <w:tcW w:w="2524" w:type="dxa"/>
+                        <w:gridSpan w:val="2"/>
+                        <w:tcMar>
+                          <w:top w:w="4" w:type="dxa"/>
+                          <w:left w:w="3" w:type="dxa"/>
+                          <w:bottom w:w="4" w:type="dxa"/>
+                          <w:right w:w="3" w:type="dxa"/>
+                        </w:tcMar>
+                      </w:tcPr>
+                      <w:p>
+                        <w:pPr>
+                          <w:spacing w:after="0"/>
+                          <w:rPr>
+                            <w:rFonts w:hint="eastAsia"/>
+                          </w:rPr>
+                        </w:pPr>
+                        <w:r>
+                          <w:rPr>
+                            <w:b/>
+                            <w:color w:val="0D233A"/>
+                            <w:sz w:val="13"/>
+                          </w:rPr>
+                          <w:t>Potencial Base / Int.:</w:t>
+                        </w:r>
+                      </w:p>
+                    </w:tc>
+                    <w:tc>
+                      <w:tcPr>
+                        <w:tcW w:w="2524" w:type="dxa"/>
+                        <w:gridSpan w:val="2"/>
+                        <w:tcMar>
+                          <w:top w:w="4" w:type="dxa"/>
+                          <w:left w:w="3" w:type="dxa"/>
+                          <w:bottom w:w="4" w:type="dxa"/>
+                          <w:right w:w="3" w:type="dxa"/>
                         </w:tcMar>
                       </w:tcPr>
                       <w:p>
@@ -587,10 +1036,9 @@
                         <w:r>
                           <w:rPr>
                             <w:b/>
-                            <w:color w:val="0D233A"/>
-                            <w:sz w:val="14"/>
+                            <w:sz w:val="13"/>
                           </w:rPr>
-                          <w:t>7,06%</w:t>
+                          <w:t>+25,8% / +27,8%</w:t>
                         </w:r>
                       </w:p>
                     </w:tc>
@@ -601,12 +1049,13 @@
                     </w:trPr>
                     <w:tc>
                       <w:tcPr>
-                        <w:tcW w:w="2523" w:type="dxa"/>
+                        <w:tcW w:w="2524" w:type="dxa"/>
+                        <w:gridSpan w:val="2"/>
                         <w:tcMar>
-                          <w:top w:w="8" w:type="dxa"/>
-                          <w:left w:w="10" w:type="dxa"/>
-                          <w:bottom w:w="8" w:type="dxa"/>
-                          <w:right w:w="10" w:type="dxa"/>
+                          <w:top w:w="4" w:type="dxa"/>
+                          <w:left w:w="3" w:type="dxa"/>
+                          <w:bottom w:w="4" w:type="dxa"/>
+                          <w:right w:w="3" w:type="dxa"/>
                         </w:tcMar>
                       </w:tcPr>
                       <w:p>
@@ -619,20 +1068,22 @@
                         <w:r>
                           <w:rPr>
                             <w:b/>
-                            <w:sz w:val="14"/>
+                            <w:color w:val="0D233A"/>
+                            <w:sz w:val="13"/>
                           </w:rPr>
-                          <w:t>Costo del Equity (Ke, λ = 0,20):</w:t>
+                          <w:t>CCL Implícito:</w:t>
                         </w:r>
                       </w:p>
                     </w:tc>
                     <w:tc>
                       <w:tcPr>
-                        <w:tcW w:w="2523" w:type="dxa"/>
+                        <w:tcW w:w="2524" w:type="dxa"/>
+                        <w:gridSpan w:val="2"/>
                         <w:tcMar>
-                          <w:top w:w="8" w:type="dxa"/>
-                          <w:left w:w="10" w:type="dxa"/>
-                          <w:bottom w:w="8" w:type="dxa"/>
-                          <w:right w:w="10" w:type="dxa"/>
+                          <w:top w:w="4" w:type="dxa"/>
+                          <w:left w:w="3" w:type="dxa"/>
+                          <w:bottom w:w="4" w:type="dxa"/>
+                          <w:right w:w="3" w:type="dxa"/>
                         </w:tcMar>
                       </w:tcPr>
                       <w:p>
@@ -645,481 +1096,7 @@
                         </w:pPr>
                         <w:r>
                           <w:rPr>
-                            <w:b/>
-                            <w:color w:val="0D233A"/>
-                            <w:sz w:val="14"/>
-                          </w:rPr>
-                          <w:t>9,30%</w:t>
-                        </w:r>
-                      </w:p>
-                    </w:tc>
-                  </w:tr>
-                  <w:tr>
-                    <w:trPr>
-                      <w:jc w:val="center"/>
-                    </w:trPr>
-                    <w:tc>
-                      <w:tcPr>
-                        <w:tcW w:w="2523" w:type="dxa"/>
-                        <w:tcMar>
-                          <w:top w:w="8" w:type="dxa"/>
-                          <w:left w:w="10" w:type="dxa"/>
-                          <w:bottom w:w="8" w:type="dxa"/>
-                          <w:right w:w="10" w:type="dxa"/>
-                        </w:tcMar>
-                      </w:tcPr>
-                      <w:p>
-                        <w:pPr>
-                          <w:spacing w:after="0"/>
-                          <w:rPr>
-                            <w:rFonts w:hint="eastAsia"/>
-                          </w:rPr>
-                        </w:pPr>
-                        <w:r>
-                          <w:rPr>
-                            <w:b/>
-                            <w:sz w:val="14"/>
-                          </w:rPr>
-                          <w:t>Beta Apalancado (Hamada):</w:t>
-                        </w:r>
-                      </w:p>
-                    </w:tc>
-                    <w:tc>
-                      <w:tcPr>
-                        <w:tcW w:w="2523" w:type="dxa"/>
-                        <w:tcMar>
-                          <w:top w:w="8" w:type="dxa"/>
-                          <w:left w:w="10" w:type="dxa"/>
-                          <w:bottom w:w="8" w:type="dxa"/>
-                          <w:right w:w="10" w:type="dxa"/>
-                        </w:tcMar>
-                      </w:tcPr>
-                      <w:p>
-                        <w:pPr>
-                          <w:spacing w:after="0"/>
-                          <w:jc w:val="right"/>
-                          <w:rPr>
-                            <w:rFonts w:hint="eastAsia"/>
-                          </w:rPr>
-                        </w:pPr>
-                        <w:r>
-                          <w:rPr>
-                            <w:b/>
-                            <w:color w:val="0D233A"/>
-                            <w:sz w:val="14"/>
-                          </w:rPr>
-                          <w:t>0,888</w:t>
-                        </w:r>
-                      </w:p>
-                    </w:tc>
-                  </w:tr>
-                  <w:tr>
-                    <w:trPr>
-                      <w:jc w:val="center"/>
-                    </w:trPr>
-                    <w:tc>
-                      <w:tcPr>
-                        <w:tcW w:w="2523" w:type="dxa"/>
-                        <w:tcMar>
-                          <w:top w:w="8" w:type="dxa"/>
-                          <w:left w:w="10" w:type="dxa"/>
-                          <w:bottom w:w="8" w:type="dxa"/>
-                          <w:right w:w="10" w:type="dxa"/>
-                        </w:tcMar>
-                      </w:tcPr>
-                      <w:p>
-                        <w:pPr>
-                          <w:spacing w:after="0"/>
-                          <w:rPr>
-                            <w:rFonts w:hint="eastAsia"/>
-                          </w:rPr>
-                        </w:pPr>
-                        <w:r>
-                          <w:rPr>
-                            <w:b/>
-                            <w:sz w:val="14"/>
-                          </w:rPr>
-                          <w:t>Prima de Riesgo de Mercado (ERP):</w:t>
-                        </w:r>
-                      </w:p>
-                    </w:tc>
-                    <w:tc>
-                      <w:tcPr>
-                        <w:tcW w:w="2523" w:type="dxa"/>
-                        <w:tcMar>
-                          <w:top w:w="8" w:type="dxa"/>
-                          <w:left w:w="10" w:type="dxa"/>
-                          <w:bottom w:w="8" w:type="dxa"/>
-                          <w:right w:w="10" w:type="dxa"/>
-                        </w:tcMar>
-                      </w:tcPr>
-                      <w:p>
-                        <w:pPr>
-                          <w:spacing w:after="0"/>
-                          <w:jc w:val="right"/>
-                          <w:rPr>
-                            <w:rFonts w:hint="eastAsia"/>
-                          </w:rPr>
-                        </w:pPr>
-                        <w:r>
-                          <w:rPr>
-                            <w:b/>
-                            <w:color w:val="0D233A"/>
-                            <w:sz w:val="14"/>
-                          </w:rPr>
-                          <w:t>4,18%</w:t>
-                        </w:r>
-                      </w:p>
-                    </w:tc>
-                  </w:tr>
-                  <w:tr>
-                    <w:trPr>
-                      <w:jc w:val="center"/>
-                    </w:trPr>
-                    <w:tc>
-                      <w:tcPr>
-                        <w:tcW w:w="2523" w:type="dxa"/>
-                        <w:tcMar>
-                          <w:top w:w="8" w:type="dxa"/>
-                          <w:left w:w="10" w:type="dxa"/>
-                          <w:bottom w:w="8" w:type="dxa"/>
-                          <w:right w:w="10" w:type="dxa"/>
-                        </w:tcMar>
-                      </w:tcPr>
-                      <w:p>
-                        <w:pPr>
-                          <w:spacing w:after="0"/>
-                          <w:rPr>
-                            <w:rFonts w:hint="eastAsia"/>
-                          </w:rPr>
-                        </w:pPr>
-                        <w:r>
-                          <w:rPr>
-                            <w:b/>
-                            <w:sz w:val="14"/>
-                          </w:rPr>
-                          <w:t>Prima País Ponderada (λ × EMBI+):</w:t>
-                        </w:r>
-                      </w:p>
-                    </w:tc>
-                    <w:tc>
-                      <w:tcPr>
-                        <w:tcW w:w="2523" w:type="dxa"/>
-                        <w:tcMar>
-                          <w:top w:w="8" w:type="dxa"/>
-                          <w:left w:w="10" w:type="dxa"/>
-                          <w:bottom w:w="8" w:type="dxa"/>
-                          <w:right w:w="10" w:type="dxa"/>
-                        </w:tcMar>
-                      </w:tcPr>
-                      <w:p>
-                        <w:pPr>
-                          <w:spacing w:after="0"/>
-                          <w:jc w:val="right"/>
-                          <w:rPr>
-                            <w:rFonts w:hint="eastAsia"/>
-                          </w:rPr>
-                        </w:pPr>
-                        <w:r>
-                          <w:rPr>
-                            <w:b/>
-                            <w:color w:val="0D233A"/>
-                            <w:sz w:val="14"/>
-                          </w:rPr>
-                          <w:t>0,88%</w:t>
-                        </w:r>
-                      </w:p>
-                    </w:tc>
-                  </w:tr>
-                  <w:tr>
-                    <w:trPr>
-                      <w:jc w:val="center"/>
-                    </w:trPr>
-                    <w:tc>
-                      <w:tcPr>
-                        <w:tcW w:w="2523" w:type="dxa"/>
-                        <w:tcMar>
-                          <w:top w:w="8" w:type="dxa"/>
-                          <w:left w:w="10" w:type="dxa"/>
-                          <w:bottom w:w="8" w:type="dxa"/>
-                          <w:right w:w="10" w:type="dxa"/>
-                        </w:tcMar>
-                      </w:tcPr>
-                      <w:p>
-                        <w:pPr>
-                          <w:spacing w:after="0"/>
-                          <w:rPr>
-                            <w:rFonts w:hint="eastAsia"/>
-                          </w:rPr>
-                        </w:pPr>
-                        <w:r>
-                          <w:rPr>
-                            <w:b/>
-                            <w:sz w:val="14"/>
-                          </w:rPr>
-                          <w:t>Costo de la Deuda Post-Impuestos (Kd):</w:t>
-                        </w:r>
-                      </w:p>
-                    </w:tc>
-                    <w:tc>
-                      <w:tcPr>
-                        <w:tcW w:w="2523" w:type="dxa"/>
-                        <w:tcMar>
-                          <w:top w:w="8" w:type="dxa"/>
-                          <w:left w:w="10" w:type="dxa"/>
-                          <w:bottom w:w="8" w:type="dxa"/>
-                          <w:right w:w="10" w:type="dxa"/>
-                        </w:tcMar>
-                      </w:tcPr>
-                      <w:p>
-                        <w:pPr>
-                          <w:spacing w:after="0"/>
-                          <w:jc w:val="right"/>
-                          <w:rPr>
-                            <w:rFonts w:hint="eastAsia"/>
-                          </w:rPr>
-                        </w:pPr>
-                        <w:r>
-                          <w:rPr>
-                            <w:b/>
-                            <w:color w:val="0D233A"/>
-                            <w:sz w:val="14"/>
-                          </w:rPr>
-                          <w:t>2,47%</w:t>
-                        </w:r>
-                      </w:p>
-                    </w:tc>
-                  </w:tr>
-                  <w:tr>
-                    <w:trPr>
-                      <w:jc w:val="center"/>
-                    </w:trPr>
-                    <w:tc>
-                      <w:tcPr>
-                        <w:tcW w:w="2523" w:type="dxa"/>
-                        <w:tcMar>
-                          <w:top w:w="8" w:type="dxa"/>
-                          <w:left w:w="10" w:type="dxa"/>
-                          <w:bottom w:w="8" w:type="dxa"/>
-                          <w:right w:w="10" w:type="dxa"/>
-                        </w:tcMar>
-                      </w:tcPr>
-                      <w:p>
-                        <w:pPr>
-                          <w:spacing w:after="0"/>
-                          <w:rPr>
-                            <w:rFonts w:hint="eastAsia"/>
-                          </w:rPr>
-                        </w:pPr>
-                        <w:r>
-                          <w:rPr>
-                            <w:b/>
-                            <w:sz w:val="14"/>
-                          </w:rPr>
-                          <w:t>Estructura D/E Objetivo:</w:t>
-                        </w:r>
-                      </w:p>
-                    </w:tc>
-                    <w:tc>
-                      <w:tcPr>
-                        <w:tcW w:w="2523" w:type="dxa"/>
-                        <w:tcMar>
-                          <w:top w:w="8" w:type="dxa"/>
-                          <w:left w:w="10" w:type="dxa"/>
-                          <w:bottom w:w="8" w:type="dxa"/>
-                          <w:right w:w="10" w:type="dxa"/>
-                        </w:tcMar>
-                      </w:tcPr>
-                      <w:p>
-                        <w:pPr>
-                          <w:spacing w:after="0"/>
-                          <w:jc w:val="right"/>
-                          <w:rPr>
-                            <w:rFonts w:hint="eastAsia"/>
-                          </w:rPr>
-                        </w:pPr>
-                        <w:r>
-                          <w:rPr>
-                            <w:b/>
-                            <w:color w:val="0D233A"/>
-                            <w:sz w:val="14"/>
-                          </w:rPr>
-                          <w:t>0,486</w:t>
-                        </w:r>
-                      </w:p>
-                    </w:tc>
-                  </w:tr>
-                  <w:tr>
-                    <w:trPr>
-                      <w:jc w:val="center"/>
-                    </w:trPr>
-                    <w:tc>
-                      <w:tcPr>
-                        <w:tcW w:w="2523" w:type="dxa"/>
-                        <w:tcMar>
-                          <w:top w:w="8" w:type="dxa"/>
-                          <w:left w:w="10" w:type="dxa"/>
-                          <w:bottom w:w="8" w:type="dxa"/>
-                          <w:right w:w="10" w:type="dxa"/>
-                        </w:tcMar>
-                      </w:tcPr>
-                      <w:p>
-                        <w:pPr>
-                          <w:spacing w:after="0"/>
-                          <w:rPr>
-                            <w:rFonts w:hint="eastAsia"/>
-                          </w:rPr>
-                        </w:pPr>
-                        <w:r>
-                          <w:rPr>
-                            <w:b/>
-                            <w:sz w:val="14"/>
-                          </w:rPr>
-                          <w:t>Crecimiento Terminal (g):</w:t>
-                        </w:r>
-                      </w:p>
-                    </w:tc>
-                    <w:tc>
-                      <w:tcPr>
-                        <w:tcW w:w="2523" w:type="dxa"/>
-                        <w:tcMar>
-                          <w:top w:w="8" w:type="dxa"/>
-                          <w:left w:w="10" w:type="dxa"/>
-                          <w:bottom w:w="8" w:type="dxa"/>
-                          <w:right w:w="10" w:type="dxa"/>
-                        </w:tcMar>
-                      </w:tcPr>
-                      <w:p>
-                        <w:pPr>
-                          <w:spacing w:after="0"/>
-                          <w:jc w:val="right"/>
-                          <w:rPr>
-                            <w:rFonts w:hint="eastAsia"/>
-                          </w:rPr>
-                        </w:pPr>
-                        <w:r>
-                          <w:rPr>
-                            <w:b/>
-                            <w:color w:val="0D233A"/>
-                            <w:sz w:val="14"/>
-                          </w:rPr>
-                          <w:t>2,00%</w:t>
-                        </w:r>
-                      </w:p>
-                    </w:tc>
-                  </w:tr>
-                  <w:tr>
-                    <w:trPr>
-                      <w:jc w:val="center"/>
-                    </w:trPr>
-                    <w:tc>
-                      <w:tcPr>
-                        <w:tcW w:w="2523" w:type="dxa"/>
-                        <w:tcMar>
-                          <w:top w:w="8" w:type="dxa"/>
-                          <w:left w:w="10" w:type="dxa"/>
-                          <w:bottom w:w="8" w:type="dxa"/>
-                          <w:right w:w="10" w:type="dxa"/>
-                        </w:tcMar>
-                      </w:tcPr>
-                      <w:p>
-                        <w:pPr>
-                          <w:spacing w:after="0"/>
-                          <w:rPr>
-                            <w:rFonts w:hint="eastAsia"/>
-                          </w:rPr>
-                        </w:pPr>
-                        <w:r>
-                          <w:rPr>
-                            <w:b/>
-                            <w:sz w:val="14"/>
-                          </w:rPr>
-                          <w:t>Potencial Base / Integrado:</w:t>
-                        </w:r>
-                      </w:p>
-                    </w:tc>
-                    <w:tc>
-                      <w:tcPr>
-                        <w:tcW w:w="2523" w:type="dxa"/>
-                        <w:tcMar>
-                          <w:top w:w="8" w:type="dxa"/>
-                          <w:left w:w="10" w:type="dxa"/>
-                          <w:bottom w:w="8" w:type="dxa"/>
-                          <w:right w:w="10" w:type="dxa"/>
-                        </w:tcMar>
-                      </w:tcPr>
-                      <w:p>
-                        <w:pPr>
-                          <w:spacing w:after="0"/>
-                          <w:jc w:val="right"/>
-                          <w:rPr>
-                            <w:rFonts w:hint="eastAsia"/>
-                          </w:rPr>
-                        </w:pPr>
-                        <w:r>
-                          <w:rPr>
-                            <w:b/>
-                            <w:color w:val="0D233A"/>
-                            <w:sz w:val="14"/>
-                          </w:rPr>
-                          <w:t>+25,8% / +27,8%</w:t>
-                        </w:r>
-                      </w:p>
-                    </w:tc>
-                  </w:tr>
-                  <w:tr>
-                    <w:trPr>
-                      <w:jc w:val="center"/>
-                    </w:trPr>
-                    <w:tc>
-                      <w:tcPr>
-                        <w:tcW w:w="2523" w:type="dxa"/>
-                        <w:tcMar>
-                          <w:top w:w="8" w:type="dxa"/>
-                          <w:left w:w="10" w:type="dxa"/>
-                          <w:bottom w:w="8" w:type="dxa"/>
-                          <w:right w:w="10" w:type="dxa"/>
-                        </w:tcMar>
-                      </w:tcPr>
-                      <w:p>
-                        <w:pPr>
-                          <w:spacing w:after="0"/>
-                          <w:rPr>
-                            <w:rFonts w:hint="eastAsia"/>
-                          </w:rPr>
-                        </w:pPr>
-                        <w:r>
-                          <w:rPr>
-                            <w:b/>
-                            <w:sz w:val="14"/>
-                          </w:rPr>
-                          <w:t>Tipo de Cambio Implícito (CCL):</w:t>
-                        </w:r>
-                      </w:p>
-                    </w:tc>
-                    <w:tc>
-                      <w:tcPr>
-                        <w:tcW w:w="2523" w:type="dxa"/>
-                        <w:tcMar>
-                          <w:top w:w="8" w:type="dxa"/>
-                          <w:left w:w="10" w:type="dxa"/>
-                          <w:bottom w:w="8" w:type="dxa"/>
-                          <w:right w:w="10" w:type="dxa"/>
-                        </w:tcMar>
-                      </w:tcPr>
-                      <w:p>
-                        <w:pPr>
-                          <w:spacing w:after="0"/>
-                          <w:jc w:val="right"/>
-                          <w:rPr>
-                            <w:rFonts w:hint="eastAsia"/>
-                          </w:rPr>
-                        </w:pPr>
-                        <w:r>
-                          <w:rPr>
-                            <w:b/>
-                            <w:color w:val="0D233A"/>
-                            <w:sz w:val="14"/>
+                            <w:sz w:val="13"/>
                           </w:rPr>
                           <w:t>1.584,25</w:t>
                         </w:r>
@@ -1362,7 +1339,7 @@
         </w:rPr>
         <w:fldChar w:fldCharType="separate"/>
       </w:r>
-      <w:hyperlink w:anchor="_Toc237713976" w:history="1">
+      <w:hyperlink w:anchor="_Toc237715466" w:history="1">
         <w:r>
           <w:rPr>
             <w:rStyle w:val="Hipervnculo"/>
@@ -1389,7 +1366,7 @@
             <w:noProof/>
             <w:webHidden/>
           </w:rPr>
-          <w:instrText xml:space="preserve"> PAGEREF _Toc237713976 \h </w:instrText>
+          <w:instrText xml:space="preserve"> PAGEREF _Toc237715466 \h </w:instrText>
         </w:r>
         <w:r>
           <w:rPr>
@@ -1436,7 +1413,7 @@
           <w14:ligatures w14:val="standardContextual"/>
         </w:rPr>
       </w:pPr>
-      <w:hyperlink w:anchor="_Toc237713977" w:history="1">
+      <w:hyperlink w:anchor="_Toc237715467" w:history="1">
         <w:r>
           <w:rPr>
             <w:rStyle w:val="Hipervnculo"/>
@@ -1463,7 +1440,7 @@
             <w:noProof/>
             <w:webHidden/>
           </w:rPr>
-          <w:instrText xml:space="preserve"> PAGEREF _Toc237713977 \h </w:instrText>
+          <w:instrText xml:space="preserve"> PAGEREF _Toc237715467 \h </w:instrText>
         </w:r>
         <w:r>
           <w:rPr>
@@ -1510,7 +1487,7 @@
           <w14:ligatures w14:val="standardContextual"/>
         </w:rPr>
       </w:pPr>
-      <w:hyperlink w:anchor="_Toc237713978" w:history="1">
+      <w:hyperlink w:anchor="_Toc237715468" w:history="1">
         <w:r>
           <w:rPr>
             <w:rStyle w:val="Hipervnculo"/>
@@ -1537,7 +1514,7 @@
             <w:noProof/>
             <w:webHidden/>
           </w:rPr>
-          <w:instrText xml:space="preserve"> PAGEREF _Toc237713978 \h </w:instrText>
+          <w:instrText xml:space="preserve"> PAGEREF _Toc237715468 \h </w:instrText>
         </w:r>
         <w:r>
           <w:rPr>
@@ -1584,7 +1561,7 @@
           <w14:ligatures w14:val="standardContextual"/>
         </w:rPr>
       </w:pPr>
-      <w:hyperlink w:anchor="_Toc237713979" w:history="1">
+      <w:hyperlink w:anchor="_Toc237715469" w:history="1">
         <w:r>
           <w:rPr>
             <w:rStyle w:val="Hipervnculo"/>
@@ -1611,7 +1588,7 @@
             <w:noProof/>
             <w:webHidden/>
           </w:rPr>
-          <w:instrText xml:space="preserve"> PAGEREF _Toc237713979 \h </w:instrText>
+          <w:instrText xml:space="preserve"> PAGEREF _Toc237715469 \h </w:instrText>
         </w:r>
         <w:r>
           <w:rPr>
@@ -1658,7 +1635,7 @@
           <w14:ligatures w14:val="standardContextual"/>
         </w:rPr>
       </w:pPr>
-      <w:hyperlink w:anchor="_Toc237713980" w:history="1">
+      <w:hyperlink w:anchor="_Toc237715470" w:history="1">
         <w:r>
           <w:rPr>
             <w:rStyle w:val="Hipervnculo"/>
@@ -1685,7 +1662,7 @@
             <w:noProof/>
             <w:webHidden/>
           </w:rPr>
-          <w:instrText xml:space="preserve"> PAGEREF _Toc237713980 \h </w:instrText>
+          <w:instrText xml:space="preserve"> PAGEREF _Toc237715470 \h </w:instrText>
         </w:r>
         <w:r>
           <w:rPr>
@@ -1732,7 +1709,7 @@
           <w14:ligatures w14:val="standardContextual"/>
         </w:rPr>
       </w:pPr>
-      <w:hyperlink w:anchor="_Toc237713981" w:history="1">
+      <w:hyperlink w:anchor="_Toc237715471" w:history="1">
         <w:r>
           <w:rPr>
             <w:rStyle w:val="Hipervnculo"/>
@@ -1759,7 +1736,7 @@
             <w:noProof/>
             <w:webHidden/>
           </w:rPr>
-          <w:instrText xml:space="preserve"> PAGEREF _Toc237713981 \h </w:instrText>
+          <w:instrText xml:space="preserve"> PAGEREF _Toc237715471 \h </w:instrText>
         </w:r>
         <w:r>
           <w:rPr>
@@ -1806,7 +1783,7 @@
           <w14:ligatures w14:val="standardContextual"/>
         </w:rPr>
       </w:pPr>
-      <w:hyperlink w:anchor="_Toc237713982" w:history="1">
+      <w:hyperlink w:anchor="_Toc237715472" w:history="1">
         <w:r>
           <w:rPr>
             <w:rStyle w:val="Hipervnculo"/>
@@ -1833,7 +1810,7 @@
             <w:noProof/>
             <w:webHidden/>
           </w:rPr>
-          <w:instrText xml:space="preserve"> PAGEREF _Toc237713982 \h </w:instrText>
+          <w:instrText xml:space="preserve"> PAGEREF _Toc237715472 \h </w:instrText>
         </w:r>
         <w:r>
           <w:rPr>
@@ -1880,7 +1857,7 @@
           <w14:ligatures w14:val="standardContextual"/>
         </w:rPr>
       </w:pPr>
-      <w:hyperlink w:anchor="_Toc237713983" w:history="1">
+      <w:hyperlink w:anchor="_Toc237715473" w:history="1">
         <w:r>
           <w:rPr>
             <w:rStyle w:val="Hipervnculo"/>
@@ -1907,7 +1884,7 @@
             <w:noProof/>
             <w:webHidden/>
           </w:rPr>
-          <w:instrText xml:space="preserve"> PAGEREF _Toc237713983 \h </w:instrText>
+          <w:instrText xml:space="preserve"> PAGEREF _Toc237715473 \h </w:instrText>
         </w:r>
         <w:r>
           <w:rPr>
@@ -1954,7 +1931,7 @@
           <w14:ligatures w14:val="standardContextual"/>
         </w:rPr>
       </w:pPr>
-      <w:hyperlink w:anchor="_Toc237713984" w:history="1">
+      <w:hyperlink w:anchor="_Toc237715474" w:history="1">
         <w:r>
           <w:rPr>
             <w:rStyle w:val="Hipervnculo"/>
@@ -1981,7 +1958,7 @@
             <w:noProof/>
             <w:webHidden/>
           </w:rPr>
-          <w:instrText xml:space="preserve"> PAGEREF _Toc237713984 \h </w:instrText>
+          <w:instrText xml:space="preserve"> PAGEREF _Toc237715474 \h </w:instrText>
         </w:r>
         <w:r>
           <w:rPr>
@@ -2028,7 +2005,7 @@
           <w14:ligatures w14:val="standardContextual"/>
         </w:rPr>
       </w:pPr>
-      <w:hyperlink w:anchor="_Toc237713985" w:history="1">
+      <w:hyperlink w:anchor="_Toc237715475" w:history="1">
         <w:r>
           <w:rPr>
             <w:rStyle w:val="Hipervnculo"/>
@@ -2055,7 +2032,7 @@
             <w:noProof/>
             <w:webHidden/>
           </w:rPr>
-          <w:instrText xml:space="preserve"> PAGEREF _Toc237713985 \h </w:instrText>
+          <w:instrText xml:space="preserve"> PAGEREF _Toc237715475 \h </w:instrText>
         </w:r>
         <w:r>
           <w:rPr>
@@ -2102,7 +2079,7 @@
           <w14:ligatures w14:val="standardContextual"/>
         </w:rPr>
       </w:pPr>
-      <w:hyperlink w:anchor="_Toc237713986" w:history="1">
+      <w:hyperlink w:anchor="_Toc237715476" w:history="1">
         <w:r>
           <w:rPr>
             <w:rStyle w:val="Hipervnculo"/>
@@ -2129,7 +2106,7 @@
             <w:noProof/>
             <w:webHidden/>
           </w:rPr>
-          <w:instrText xml:space="preserve"> PAGEREF _Toc237713986 \h </w:instrText>
+          <w:instrText xml:space="preserve"> PAGEREF _Toc237715476 \h </w:instrText>
         </w:r>
         <w:r>
           <w:rPr>
@@ -2176,7 +2153,7 @@
           <w14:ligatures w14:val="standardContextual"/>
         </w:rPr>
       </w:pPr>
-      <w:hyperlink w:anchor="_Toc237713987" w:history="1">
+      <w:hyperlink w:anchor="_Toc237715477" w:history="1">
         <w:r>
           <w:rPr>
             <w:rStyle w:val="Hipervnculo"/>
@@ -2203,7 +2180,7 @@
             <w:noProof/>
             <w:webHidden/>
           </w:rPr>
-          <w:instrText xml:space="preserve"> PAGEREF _Toc237713987 \h </w:instrText>
+          <w:instrText xml:space="preserve"> PAGEREF _Toc237715477 \h </w:instrText>
         </w:r>
         <w:r>
           <w:rPr>
@@ -2250,7 +2227,7 @@
           <w14:ligatures w14:val="standardContextual"/>
         </w:rPr>
       </w:pPr>
-      <w:hyperlink w:anchor="_Toc237713988" w:history="1">
+      <w:hyperlink w:anchor="_Toc237715478" w:history="1">
         <w:r>
           <w:rPr>
             <w:rStyle w:val="Hipervnculo"/>
@@ -2277,7 +2254,7 @@
             <w:noProof/>
             <w:webHidden/>
           </w:rPr>
-          <w:instrText xml:space="preserve"> PAGEREF _Toc237713988 \h </w:instrText>
+          <w:instrText xml:space="preserve"> PAGEREF _Toc237715478 \h </w:instrText>
         </w:r>
         <w:r>
           <w:rPr>
@@ -2324,7 +2301,7 @@
           <w14:ligatures w14:val="standardContextual"/>
         </w:rPr>
       </w:pPr>
-      <w:hyperlink w:anchor="_Toc237713989" w:history="1">
+      <w:hyperlink w:anchor="_Toc237715479" w:history="1">
         <w:r>
           <w:rPr>
             <w:rStyle w:val="Hipervnculo"/>
@@ -2351,7 +2328,7 @@
             <w:noProof/>
             <w:webHidden/>
           </w:rPr>
-          <w:instrText xml:space="preserve"> PAGEREF _Toc237713989 \h </w:instrText>
+          <w:instrText xml:space="preserve"> PAGEREF _Toc237715479 \h </w:instrText>
         </w:r>
         <w:r>
           <w:rPr>
@@ -2398,7 +2375,7 @@
           <w14:ligatures w14:val="standardContextual"/>
         </w:rPr>
       </w:pPr>
-      <w:hyperlink w:anchor="_Toc237713990" w:history="1">
+      <w:hyperlink w:anchor="_Toc237715480" w:history="1">
         <w:r>
           <w:rPr>
             <w:rStyle w:val="Hipervnculo"/>
@@ -2425,7 +2402,7 @@
             <w:noProof/>
             <w:webHidden/>
           </w:rPr>
-          <w:instrText xml:space="preserve"> PAGEREF _Toc237713990 \h </w:instrText>
+          <w:instrText xml:space="preserve"> PAGEREF _Toc237715480 \h </w:instrText>
         </w:r>
         <w:r>
           <w:rPr>
@@ -2472,7 +2449,7 @@
           <w14:ligatures w14:val="standardContextual"/>
         </w:rPr>
       </w:pPr>
-      <w:hyperlink w:anchor="_Toc237713991" w:history="1">
+      <w:hyperlink w:anchor="_Toc237715481" w:history="1">
         <w:r>
           <w:rPr>
             <w:rStyle w:val="Hipervnculo"/>
@@ -2499,7 +2476,7 @@
             <w:noProof/>
             <w:webHidden/>
           </w:rPr>
-          <w:instrText xml:space="preserve"> PAGEREF _Toc237713991 \h </w:instrText>
+          <w:instrText xml:space="preserve"> PAGEREF _Toc237715481 \h </w:instrText>
         </w:r>
         <w:r>
           <w:rPr>
@@ -2546,7 +2523,7 @@
           <w14:ligatures w14:val="standardContextual"/>
         </w:rPr>
       </w:pPr>
-      <w:hyperlink w:anchor="_Toc237713992" w:history="1">
+      <w:hyperlink w:anchor="_Toc237715482" w:history="1">
         <w:r>
           <w:rPr>
             <w:rStyle w:val="Hipervnculo"/>
@@ -2573,7 +2550,7 @@
             <w:noProof/>
             <w:webHidden/>
           </w:rPr>
-          <w:instrText xml:space="preserve"> PAGEREF _Toc237713992 \h </w:instrText>
+          <w:instrText xml:space="preserve"> PAGEREF _Toc237715482 \h </w:instrText>
         </w:r>
         <w:r>
           <w:rPr>
@@ -2620,7 +2597,7 @@
           <w14:ligatures w14:val="standardContextual"/>
         </w:rPr>
       </w:pPr>
-      <w:hyperlink w:anchor="_Toc237713993" w:history="1">
+      <w:hyperlink w:anchor="_Toc237715483" w:history="1">
         <w:r>
           <w:rPr>
             <w:rStyle w:val="Hipervnculo"/>
@@ -2647,7 +2624,7 @@
             <w:noProof/>
             <w:webHidden/>
           </w:rPr>
-          <w:instrText xml:space="preserve"> PAGEREF _Toc237713993 \h </w:instrText>
+          <w:instrText xml:space="preserve"> PAGEREF _Toc237715483 \h </w:instrText>
         </w:r>
         <w:r>
           <w:rPr>
@@ -2694,7 +2671,7 @@
           <w14:ligatures w14:val="standardContextual"/>
         </w:rPr>
       </w:pPr>
-      <w:hyperlink w:anchor="_Toc237713994" w:history="1">
+      <w:hyperlink w:anchor="_Toc237715484" w:history="1">
         <w:r>
           <w:rPr>
             <w:rStyle w:val="Hipervnculo"/>
@@ -2721,7 +2698,7 @@
             <w:noProof/>
             <w:webHidden/>
           </w:rPr>
-          <w:instrText xml:space="preserve"> PAGEREF _Toc237713994 \h </w:instrText>
+          <w:instrText xml:space="preserve"> PAGEREF _Toc237715484 \h </w:instrText>
         </w:r>
         <w:r>
           <w:rPr>
@@ -2768,7 +2745,7 @@
           <w14:ligatures w14:val="standardContextual"/>
         </w:rPr>
       </w:pPr>
-      <w:hyperlink w:anchor="_Toc237713995" w:history="1">
+      <w:hyperlink w:anchor="_Toc237715485" w:history="1">
         <w:r>
           <w:rPr>
             <w:rStyle w:val="Hipervnculo"/>
@@ -2795,7 +2772,7 @@
             <w:noProof/>
             <w:webHidden/>
           </w:rPr>
-          <w:instrText xml:space="preserve"> PAGEREF _Toc237713995 \h </w:instrText>
+          <w:instrText xml:space="preserve"> PAGEREF _Toc237715485 \h </w:instrText>
         </w:r>
         <w:r>
           <w:rPr>
@@ -2842,7 +2819,7 @@
           <w14:ligatures w14:val="standardContextual"/>
         </w:rPr>
       </w:pPr>
-      <w:hyperlink w:anchor="_Toc237713996" w:history="1">
+      <w:hyperlink w:anchor="_Toc237715486" w:history="1">
         <w:r>
           <w:rPr>
             <w:rStyle w:val="Hipervnculo"/>
@@ -2869,7 +2846,7 @@
             <w:noProof/>
             <w:webHidden/>
           </w:rPr>
-          <w:instrText xml:space="preserve"> PAGEREF _Toc237713996 \h </w:instrText>
+          <w:instrText xml:space="preserve"> PAGEREF _Toc237715486 \h </w:instrText>
         </w:r>
         <w:r>
           <w:rPr>
@@ -2916,7 +2893,7 @@
           <w14:ligatures w14:val="standardContextual"/>
         </w:rPr>
       </w:pPr>
-      <w:hyperlink w:anchor="_Toc237713997" w:history="1">
+      <w:hyperlink w:anchor="_Toc237715487" w:history="1">
         <w:r>
           <w:rPr>
             <w:rStyle w:val="Hipervnculo"/>
@@ -2943,7 +2920,7 @@
             <w:noProof/>
             <w:webHidden/>
           </w:rPr>
-          <w:instrText xml:space="preserve"> PAGEREF _Toc237713997 \h </w:instrText>
+          <w:instrText xml:space="preserve"> PAGEREF _Toc237715487 \h </w:instrText>
         </w:r>
         <w:r>
           <w:rPr>
@@ -2990,7 +2967,7 @@
           <w14:ligatures w14:val="standardContextual"/>
         </w:rPr>
       </w:pPr>
-      <w:hyperlink w:anchor="_Toc237713998" w:history="1">
+      <w:hyperlink w:anchor="_Toc237715488" w:history="1">
         <w:r>
           <w:rPr>
             <w:rStyle w:val="Hipervnculo"/>
@@ -3017,7 +2994,7 @@
             <w:noProof/>
             <w:webHidden/>
           </w:rPr>
-          <w:instrText xml:space="preserve"> PAGEREF _Toc237713998 \h </w:instrText>
+          <w:instrText xml:space="preserve"> PAGEREF _Toc237715488 \h </w:instrText>
         </w:r>
         <w:r>
           <w:rPr>
@@ -3064,7 +3041,7 @@
           <w14:ligatures w14:val="standardContextual"/>
         </w:rPr>
       </w:pPr>
-      <w:hyperlink w:anchor="_Toc237713999" w:history="1">
+      <w:hyperlink w:anchor="_Toc237715489" w:history="1">
         <w:r>
           <w:rPr>
             <w:rStyle w:val="Hipervnculo"/>
@@ -3121,7 +3098,7 @@
             <w:noProof/>
             <w:webHidden/>
           </w:rPr>
-          <w:instrText xml:space="preserve"> PAGEREF _Toc237713999 \h </w:instrText>
+          <w:instrText xml:space="preserve"> PAGEREF _Toc237715489 \h </w:instrText>
         </w:r>
         <w:r>
           <w:rPr>
@@ -3168,7 +3145,7 @@
           <w14:ligatures w14:val="standardContextual"/>
         </w:rPr>
       </w:pPr>
-      <w:hyperlink w:anchor="_Toc237714000" w:history="1">
+      <w:hyperlink w:anchor="_Toc237715490" w:history="1">
         <w:r>
           <w:rPr>
             <w:rStyle w:val="Hipervnculo"/>
@@ -3195,7 +3172,7 @@
             <w:noProof/>
             <w:webHidden/>
           </w:rPr>
-          <w:instrText xml:space="preserve"> PAGEREF _Toc237714000 \h </w:instrText>
+          <w:instrText xml:space="preserve"> PAGEREF _Toc237715490 \h </w:instrText>
         </w:r>
         <w:r>
           <w:rPr>
@@ -3242,7 +3219,7 @@
           <w14:ligatures w14:val="standardContextual"/>
         </w:rPr>
       </w:pPr>
-      <w:hyperlink w:anchor="_Toc237714001" w:history="1">
+      <w:hyperlink w:anchor="_Toc237715491" w:history="1">
         <w:r>
           <w:rPr>
             <w:rStyle w:val="Hipervnculo"/>
@@ -3269,7 +3246,7 @@
             <w:noProof/>
             <w:webHidden/>
           </w:rPr>
-          <w:instrText xml:space="preserve"> PAGEREF _Toc237714001 \h </w:instrText>
+          <w:instrText xml:space="preserve"> PAGEREF _Toc237715491 \h </w:instrText>
         </w:r>
         <w:r>
           <w:rPr>
@@ -3316,7 +3293,7 @@
           <w14:ligatures w14:val="standardContextual"/>
         </w:rPr>
       </w:pPr>
-      <w:hyperlink w:anchor="_Toc237714002" w:history="1">
+      <w:hyperlink w:anchor="_Toc237715492" w:history="1">
         <w:r>
           <w:rPr>
             <w:rStyle w:val="Hipervnculo"/>
@@ -3343,7 +3320,7 @@
             <w:noProof/>
             <w:webHidden/>
           </w:rPr>
-          <w:instrText xml:space="preserve"> PAGEREF _Toc237714002 \h </w:instrText>
+          <w:instrText xml:space="preserve"> PAGEREF _Toc237715492 \h </w:instrText>
         </w:r>
         <w:r>
           <w:rPr>
@@ -3390,7 +3367,7 @@
           <w14:ligatures w14:val="standardContextual"/>
         </w:rPr>
       </w:pPr>
-      <w:hyperlink w:anchor="_Toc237714003" w:history="1">
+      <w:hyperlink w:anchor="_Toc237715493" w:history="1">
         <w:r>
           <w:rPr>
             <w:rStyle w:val="Hipervnculo"/>
@@ -3417,7 +3394,7 @@
             <w:noProof/>
             <w:webHidden/>
           </w:rPr>
-          <w:instrText xml:space="preserve"> PAGEREF _Toc237714003 \h </w:instrText>
+          <w:instrText xml:space="preserve"> PAGEREF _Toc237715493 \h </w:instrText>
         </w:r>
         <w:r>
           <w:rPr>
@@ -3464,7 +3441,7 @@
           <w14:ligatures w14:val="standardContextual"/>
         </w:rPr>
       </w:pPr>
-      <w:hyperlink w:anchor="_Toc237714004" w:history="1">
+      <w:hyperlink w:anchor="_Toc237715494" w:history="1">
         <w:r>
           <w:rPr>
             <w:rStyle w:val="Hipervnculo"/>
@@ -3491,7 +3468,7 @@
             <w:noProof/>
             <w:webHidden/>
           </w:rPr>
-          <w:instrText xml:space="preserve"> PAGEREF _Toc237714004 \h </w:instrText>
+          <w:instrText xml:space="preserve"> PAGEREF _Toc237715494 \h </w:instrText>
         </w:r>
         <w:r>
           <w:rPr>
@@ -3538,7 +3515,7 @@
           <w14:ligatures w14:val="standardContextual"/>
         </w:rPr>
       </w:pPr>
-      <w:hyperlink w:anchor="_Toc237714005" w:history="1">
+      <w:hyperlink w:anchor="_Toc237715495" w:history="1">
         <w:r>
           <w:rPr>
             <w:rStyle w:val="Hipervnculo"/>
@@ -3565,7 +3542,7 @@
             <w:noProof/>
             <w:webHidden/>
           </w:rPr>
-          <w:instrText xml:space="preserve"> PAGEREF _Toc237714005 \h </w:instrText>
+          <w:instrText xml:space="preserve"> PAGEREF _Toc237715495 \h </w:instrText>
         </w:r>
         <w:r>
           <w:rPr>
@@ -3612,7 +3589,7 @@
           <w14:ligatures w14:val="standardContextual"/>
         </w:rPr>
       </w:pPr>
-      <w:hyperlink w:anchor="_Toc237714006" w:history="1">
+      <w:hyperlink w:anchor="_Toc237715496" w:history="1">
         <w:r>
           <w:rPr>
             <w:rStyle w:val="Hipervnculo"/>
@@ -3639,7 +3616,7 @@
             <w:noProof/>
             <w:webHidden/>
           </w:rPr>
-          <w:instrText xml:space="preserve"> PAGEREF _Toc237714006 \h </w:instrText>
+          <w:instrText xml:space="preserve"> PAGEREF _Toc237715496 \h </w:instrText>
         </w:r>
         <w:r>
           <w:rPr>
@@ -3686,7 +3663,7 @@
           <w14:ligatures w14:val="standardContextual"/>
         </w:rPr>
       </w:pPr>
-      <w:hyperlink w:anchor="_Toc237714007" w:history="1">
+      <w:hyperlink w:anchor="_Toc237715497" w:history="1">
         <w:r>
           <w:rPr>
             <w:rStyle w:val="Hipervnculo"/>
@@ -3713,7 +3690,7 @@
             <w:noProof/>
             <w:webHidden/>
           </w:rPr>
-          <w:instrText xml:space="preserve"> PAGEREF _Toc237714007 \h </w:instrText>
+          <w:instrText xml:space="preserve"> PAGEREF _Toc237715497 \h </w:instrText>
         </w:r>
         <w:r>
           <w:rPr>
@@ -3760,7 +3737,7 @@
           <w14:ligatures w14:val="standardContextual"/>
         </w:rPr>
       </w:pPr>
-      <w:hyperlink w:anchor="_Toc237714008" w:history="1">
+      <w:hyperlink w:anchor="_Toc237715498" w:history="1">
         <w:r>
           <w:rPr>
             <w:rStyle w:val="Hipervnculo"/>
@@ -3787,7 +3764,7 @@
             <w:noProof/>
             <w:webHidden/>
           </w:rPr>
-          <w:instrText xml:space="preserve"> PAGEREF _Toc237714008 \h </w:instrText>
+          <w:instrText xml:space="preserve"> PAGEREF _Toc237715498 \h </w:instrText>
         </w:r>
         <w:r>
           <w:rPr>
@@ -3834,7 +3811,7 @@
           <w14:ligatures w14:val="standardContextual"/>
         </w:rPr>
       </w:pPr>
-      <w:hyperlink w:anchor="_Toc237714009" w:history="1">
+      <w:hyperlink w:anchor="_Toc237715499" w:history="1">
         <w:r>
           <w:rPr>
             <w:rStyle w:val="Hipervnculo"/>
@@ -3861,7 +3838,7 @@
             <w:noProof/>
             <w:webHidden/>
           </w:rPr>
-          <w:instrText xml:space="preserve"> PAGEREF _Toc237714009 \h </w:instrText>
+          <w:instrText xml:space="preserve"> PAGEREF _Toc237715499 \h </w:instrText>
         </w:r>
         <w:r>
           <w:rPr>
@@ -3908,7 +3885,7 @@
           <w14:ligatures w14:val="standardContextual"/>
         </w:rPr>
       </w:pPr>
-      <w:hyperlink w:anchor="_Toc237714010" w:history="1">
+      <w:hyperlink w:anchor="_Toc237715500" w:history="1">
         <w:r>
           <w:rPr>
             <w:rStyle w:val="Hipervnculo"/>
@@ -3935,7 +3912,7 @@
             <w:noProof/>
             <w:webHidden/>
           </w:rPr>
-          <w:instrText xml:space="preserve"> PAGEREF _Toc237714010 \h </w:instrText>
+          <w:instrText xml:space="preserve"> PAGEREF _Toc237715500 \h </w:instrText>
         </w:r>
         <w:r>
           <w:rPr>
@@ -3982,7 +3959,7 @@
           <w14:ligatures w14:val="standardContextual"/>
         </w:rPr>
       </w:pPr>
-      <w:hyperlink w:anchor="_Toc237714011" w:history="1">
+      <w:hyperlink w:anchor="_Toc237715501" w:history="1">
         <w:r>
           <w:rPr>
             <w:rStyle w:val="Hipervnculo"/>
@@ -4009,7 +3986,7 @@
             <w:noProof/>
             <w:webHidden/>
           </w:rPr>
-          <w:instrText xml:space="preserve"> PAGEREF _Toc237714011 \h </w:instrText>
+          <w:instrText xml:space="preserve"> PAGEREF _Toc237715501 \h </w:instrText>
         </w:r>
         <w:r>
           <w:rPr>
@@ -4056,7 +4033,7 @@
           <w14:ligatures w14:val="standardContextual"/>
         </w:rPr>
       </w:pPr>
-      <w:hyperlink w:anchor="_Toc237714012" w:history="1">
+      <w:hyperlink w:anchor="_Toc237715502" w:history="1">
         <w:r>
           <w:rPr>
             <w:rStyle w:val="Hipervnculo"/>
@@ -4083,7 +4060,7 @@
             <w:noProof/>
             <w:webHidden/>
           </w:rPr>
-          <w:instrText xml:space="preserve"> PAGEREF _Toc237714012 \h </w:instrText>
+          <w:instrText xml:space="preserve"> PAGEREF _Toc237715502 \h </w:instrText>
         </w:r>
         <w:r>
           <w:rPr>
@@ -4130,7 +4107,7 @@
           <w14:ligatures w14:val="standardContextual"/>
         </w:rPr>
       </w:pPr>
-      <w:hyperlink w:anchor="_Toc237714013" w:history="1">
+      <w:hyperlink w:anchor="_Toc237715503" w:history="1">
         <w:r>
           <w:rPr>
             <w:rStyle w:val="Hipervnculo"/>
@@ -4157,7 +4134,7 @@
             <w:noProof/>
             <w:webHidden/>
           </w:rPr>
-          <w:instrText xml:space="preserve"> PAGEREF _Toc237714013 \h </w:instrText>
+          <w:instrText xml:space="preserve"> PAGEREF _Toc237715503 \h </w:instrText>
         </w:r>
         <w:r>
           <w:rPr>
@@ -4204,7 +4181,7 @@
           <w14:ligatures w14:val="standardContextual"/>
         </w:rPr>
       </w:pPr>
-      <w:hyperlink w:anchor="_Toc237714014" w:history="1">
+      <w:hyperlink w:anchor="_Toc237715504" w:history="1">
         <w:r>
           <w:rPr>
             <w:rStyle w:val="Hipervnculo"/>
@@ -4231,7 +4208,7 @@
             <w:noProof/>
             <w:webHidden/>
           </w:rPr>
-          <w:instrText xml:space="preserve"> PAGEREF _Toc237714014 \h </w:instrText>
+          <w:instrText xml:space="preserve"> PAGEREF _Toc237715504 \h </w:instrText>
         </w:r>
         <w:r>
           <w:rPr>
@@ -4278,7 +4255,7 @@
           <w14:ligatures w14:val="standardContextual"/>
         </w:rPr>
       </w:pPr>
-      <w:hyperlink w:anchor="_Toc237714015" w:history="1">
+      <w:hyperlink w:anchor="_Toc237715505" w:history="1">
         <w:r>
           <w:rPr>
             <w:rStyle w:val="Hipervnculo"/>
@@ -4305,7 +4282,7 @@
             <w:noProof/>
             <w:webHidden/>
           </w:rPr>
-          <w:instrText xml:space="preserve"> PAGEREF _Toc237714015 \h </w:instrText>
+          <w:instrText xml:space="preserve"> PAGEREF _Toc237715505 \h </w:instrText>
         </w:r>
         <w:r>
           <w:rPr>
@@ -4352,7 +4329,7 @@
           <w14:ligatures w14:val="standardContextual"/>
         </w:rPr>
       </w:pPr>
-      <w:hyperlink w:anchor="_Toc237714016" w:history="1">
+      <w:hyperlink w:anchor="_Toc237715506" w:history="1">
         <w:r>
           <w:rPr>
             <w:rStyle w:val="Hipervnculo"/>
@@ -4379,7 +4356,7 @@
             <w:noProof/>
             <w:webHidden/>
           </w:rPr>
-          <w:instrText xml:space="preserve"> PAGEREF _Toc237714016 \h </w:instrText>
+          <w:instrText xml:space="preserve"> PAGEREF _Toc237715506 \h </w:instrText>
         </w:r>
         <w:r>
           <w:rPr>
@@ -4426,7 +4403,7 @@
           <w14:ligatures w14:val="standardContextual"/>
         </w:rPr>
       </w:pPr>
-      <w:hyperlink w:anchor="_Toc237714017" w:history="1">
+      <w:hyperlink w:anchor="_Toc237715507" w:history="1">
         <w:r>
           <w:rPr>
             <w:rStyle w:val="Hipervnculo"/>
@@ -4453,7 +4430,7 @@
             <w:noProof/>
             <w:webHidden/>
           </w:rPr>
-          <w:instrText xml:space="preserve"> PAGEREF _Toc237714017 \h </w:instrText>
+          <w:instrText xml:space="preserve"> PAGEREF _Toc237715507 \h </w:instrText>
         </w:r>
         <w:r>
           <w:rPr>
@@ -4500,7 +4477,7 @@
           <w14:ligatures w14:val="standardContextual"/>
         </w:rPr>
       </w:pPr>
-      <w:hyperlink w:anchor="_Toc237714018" w:history="1">
+      <w:hyperlink w:anchor="_Toc237715508" w:history="1">
         <w:r>
           <w:rPr>
             <w:rStyle w:val="Hipervnculo"/>
@@ -4527,7 +4504,7 @@
             <w:noProof/>
             <w:webHidden/>
           </w:rPr>
-          <w:instrText xml:space="preserve"> PAGEREF _Toc237714018 \h </w:instrText>
+          <w:instrText xml:space="preserve"> PAGEREF _Toc237715508 \h </w:instrText>
         </w:r>
         <w:r>
           <w:rPr>
@@ -4574,7 +4551,7 @@
           <w14:ligatures w14:val="standardContextual"/>
         </w:rPr>
       </w:pPr>
-      <w:hyperlink w:anchor="_Toc237714019" w:history="1">
+      <w:hyperlink w:anchor="_Toc237715509" w:history="1">
         <w:r>
           <w:rPr>
             <w:rStyle w:val="Hipervnculo"/>
@@ -4601,7 +4578,7 @@
             <w:noProof/>
             <w:webHidden/>
           </w:rPr>
-          <w:instrText xml:space="preserve"> PAGEREF _Toc237714019 \h </w:instrText>
+          <w:instrText xml:space="preserve"> PAGEREF _Toc237715509 \h </w:instrText>
         </w:r>
         <w:r>
           <w:rPr>
@@ -4648,7 +4625,7 @@
           <w14:ligatures w14:val="standardContextual"/>
         </w:rPr>
       </w:pPr>
-      <w:hyperlink w:anchor="_Toc237714020" w:history="1">
+      <w:hyperlink w:anchor="_Toc237715510" w:history="1">
         <w:r>
           <w:rPr>
             <w:rStyle w:val="Hipervnculo"/>
@@ -4675,7 +4652,7 @@
             <w:noProof/>
             <w:webHidden/>
           </w:rPr>
-          <w:instrText xml:space="preserve"> PAGEREF _Toc237714020 \h </w:instrText>
+          <w:instrText xml:space="preserve"> PAGEREF _Toc237715510 \h </w:instrText>
         </w:r>
         <w:r>
           <w:rPr>
@@ -4722,7 +4699,7 @@
           <w14:ligatures w14:val="standardContextual"/>
         </w:rPr>
       </w:pPr>
-      <w:hyperlink w:anchor="_Toc237714021" w:history="1">
+      <w:hyperlink w:anchor="_Toc237715511" w:history="1">
         <w:r>
           <w:rPr>
             <w:rStyle w:val="Hipervnculo"/>
@@ -4749,7 +4726,7 @@
             <w:noProof/>
             <w:webHidden/>
           </w:rPr>
-          <w:instrText xml:space="preserve"> PAGEREF _Toc237714021 \h </w:instrText>
+          <w:instrText xml:space="preserve"> PAGEREF _Toc237715511 \h </w:instrText>
         </w:r>
         <w:r>
           <w:rPr>
@@ -4796,7 +4773,7 @@
           <w14:ligatures w14:val="standardContextual"/>
         </w:rPr>
       </w:pPr>
-      <w:hyperlink w:anchor="_Toc237714022" w:history="1">
+      <w:hyperlink w:anchor="_Toc237715512" w:history="1">
         <w:r>
           <w:rPr>
             <w:rStyle w:val="Hipervnculo"/>
@@ -4823,7 +4800,7 @@
             <w:noProof/>
             <w:webHidden/>
           </w:rPr>
-          <w:instrText xml:space="preserve"> PAGEREF _Toc237714022 \h </w:instrText>
+          <w:instrText xml:space="preserve"> PAGEREF _Toc237715512 \h </w:instrText>
         </w:r>
         <w:r>
           <w:rPr>
@@ -4870,7 +4847,7 @@
           <w14:ligatures w14:val="standardContextual"/>
         </w:rPr>
       </w:pPr>
-      <w:hyperlink w:anchor="_Toc237714023" w:history="1">
+      <w:hyperlink w:anchor="_Toc237715513" w:history="1">
         <w:r>
           <w:rPr>
             <w:rStyle w:val="Hipervnculo"/>
@@ -4897,7 +4874,7 @@
             <w:noProof/>
             <w:webHidden/>
           </w:rPr>
-          <w:instrText xml:space="preserve"> PAGEREF _Toc237714023 \h </w:instrText>
+          <w:instrText xml:space="preserve"> PAGEREF _Toc237715513 \h </w:instrText>
         </w:r>
         <w:r>
           <w:rPr>
@@ -4944,7 +4921,7 @@
           <w14:ligatures w14:val="standardContextual"/>
         </w:rPr>
       </w:pPr>
-      <w:hyperlink w:anchor="_Toc237714024" w:history="1">
+      <w:hyperlink w:anchor="_Toc237715514" w:history="1">
         <w:r>
           <w:rPr>
             <w:rStyle w:val="Hipervnculo"/>
@@ -4971,7 +4948,7 @@
             <w:noProof/>
             <w:webHidden/>
           </w:rPr>
-          <w:instrText xml:space="preserve"> PAGEREF _Toc237714024 \h </w:instrText>
+          <w:instrText xml:space="preserve"> PAGEREF _Toc237715514 \h </w:instrText>
         </w:r>
         <w:r>
           <w:rPr>
@@ -5018,7 +4995,7 @@
           <w14:ligatures w14:val="standardContextual"/>
         </w:rPr>
       </w:pPr>
-      <w:hyperlink w:anchor="_Toc237714025" w:history="1">
+      <w:hyperlink w:anchor="_Toc237715515" w:history="1">
         <w:r>
           <w:rPr>
             <w:rStyle w:val="Hipervnculo"/>
@@ -5045,7 +5022,7 @@
             <w:noProof/>
             <w:webHidden/>
           </w:rPr>
-          <w:instrText xml:space="preserve"> PAGEREF _Toc237714025 \h </w:instrText>
+          <w:instrText xml:space="preserve"> PAGEREF _Toc237715515 \h </w:instrText>
         </w:r>
         <w:r>
           <w:rPr>
@@ -5092,7 +5069,7 @@
           <w14:ligatures w14:val="standardContextual"/>
         </w:rPr>
       </w:pPr>
-      <w:hyperlink w:anchor="_Toc237714026" w:history="1">
+      <w:hyperlink w:anchor="_Toc237715516" w:history="1">
         <w:r>
           <w:rPr>
             <w:rStyle w:val="Hipervnculo"/>
@@ -5119,7 +5096,7 @@
             <w:noProof/>
             <w:webHidden/>
           </w:rPr>
-          <w:instrText xml:space="preserve"> PAGEREF _Toc237714026 \h </w:instrText>
+          <w:instrText xml:space="preserve"> PAGEREF _Toc237715516 \h </w:instrText>
         </w:r>
         <w:r>
           <w:rPr>
@@ -5166,7 +5143,7 @@
           <w14:ligatures w14:val="standardContextual"/>
         </w:rPr>
       </w:pPr>
-      <w:hyperlink w:anchor="_Toc237714027" w:history="1">
+      <w:hyperlink w:anchor="_Toc237715517" w:history="1">
         <w:r>
           <w:rPr>
             <w:rStyle w:val="Hipervnculo"/>
@@ -5193,7 +5170,7 @@
             <w:noProof/>
             <w:webHidden/>
           </w:rPr>
-          <w:instrText xml:space="preserve"> PAGEREF _Toc237714027 \h </w:instrText>
+          <w:instrText xml:space="preserve"> PAGEREF _Toc237715517 \h </w:instrText>
         </w:r>
         <w:r>
           <w:rPr>
@@ -5240,7 +5217,7 @@
           <w14:ligatures w14:val="standardContextual"/>
         </w:rPr>
       </w:pPr>
-      <w:hyperlink w:anchor="_Toc237714028" w:history="1">
+      <w:hyperlink w:anchor="_Toc237715518" w:history="1">
         <w:r>
           <w:rPr>
             <w:rStyle w:val="Hipervnculo"/>
@@ -5267,7 +5244,7 @@
             <w:noProof/>
             <w:webHidden/>
           </w:rPr>
-          <w:instrText xml:space="preserve"> PAGEREF _Toc237714028 \h </w:instrText>
+          <w:instrText xml:space="preserve"> PAGEREF _Toc237715518 \h </w:instrText>
         </w:r>
         <w:r>
           <w:rPr>
@@ -5314,7 +5291,7 @@
           <w14:ligatures w14:val="standardContextual"/>
         </w:rPr>
       </w:pPr>
-      <w:hyperlink w:anchor="_Toc237714029" w:history="1">
+      <w:hyperlink w:anchor="_Toc237715519" w:history="1">
         <w:r>
           <w:rPr>
             <w:rStyle w:val="Hipervnculo"/>
@@ -5341,7 +5318,7 @@
             <w:noProof/>
             <w:webHidden/>
           </w:rPr>
-          <w:instrText xml:space="preserve"> PAGEREF _Toc237714029 \h </w:instrText>
+          <w:instrText xml:space="preserve"> PAGEREF _Toc237715519 \h </w:instrText>
         </w:r>
         <w:r>
           <w:rPr>
@@ -5388,7 +5365,7 @@
           <w14:ligatures w14:val="standardContextual"/>
         </w:rPr>
       </w:pPr>
-      <w:hyperlink w:anchor="_Toc237714030" w:history="1">
+      <w:hyperlink w:anchor="_Toc237715520" w:history="1">
         <w:r>
           <w:rPr>
             <w:rStyle w:val="Hipervnculo"/>
@@ -5415,7 +5392,7 @@
             <w:noProof/>
             <w:webHidden/>
           </w:rPr>
-          <w:instrText xml:space="preserve"> PAGEREF _Toc237714030 \h </w:instrText>
+          <w:instrText xml:space="preserve"> PAGEREF _Toc237715520 \h </w:instrText>
         </w:r>
         <w:r>
           <w:rPr>
@@ -5462,7 +5439,7 @@
           <w14:ligatures w14:val="standardContextual"/>
         </w:rPr>
       </w:pPr>
-      <w:hyperlink w:anchor="_Toc237714031" w:history="1">
+      <w:hyperlink w:anchor="_Toc237715521" w:history="1">
         <w:r>
           <w:rPr>
             <w:rStyle w:val="Hipervnculo"/>
@@ -5489,7 +5466,7 @@
             <w:noProof/>
             <w:webHidden/>
           </w:rPr>
-          <w:instrText xml:space="preserve"> PAGEREF _Toc237714031 \h </w:instrText>
+          <w:instrText xml:space="preserve"> PAGEREF _Toc237715521 \h </w:instrText>
         </w:r>
         <w:r>
           <w:rPr>
@@ -5536,7 +5513,7 @@
           <w14:ligatures w14:val="standardContextual"/>
         </w:rPr>
       </w:pPr>
-      <w:hyperlink w:anchor="_Toc237714032" w:history="1">
+      <w:hyperlink w:anchor="_Toc237715522" w:history="1">
         <w:r>
           <w:rPr>
             <w:rStyle w:val="Hipervnculo"/>
@@ -5563,7 +5540,7 @@
             <w:noProof/>
             <w:webHidden/>
           </w:rPr>
-          <w:instrText xml:space="preserve"> PAGEREF _Toc237714032 \h </w:instrText>
+          <w:instrText xml:space="preserve"> PAGEREF _Toc237715522 \h </w:instrText>
         </w:r>
         <w:r>
           <w:rPr>
@@ -5610,7 +5587,7 @@
           <w14:ligatures w14:val="standardContextual"/>
         </w:rPr>
       </w:pPr>
-      <w:hyperlink w:anchor="_Toc237714033" w:history="1">
+      <w:hyperlink w:anchor="_Toc237715523" w:history="1">
         <w:r>
           <w:rPr>
             <w:rStyle w:val="Hipervnculo"/>
@@ -5637,7 +5614,7 @@
             <w:noProof/>
             <w:webHidden/>
           </w:rPr>
-          <w:instrText xml:space="preserve"> PAGEREF _Toc237714033 \h </w:instrText>
+          <w:instrText xml:space="preserve"> PAGEREF _Toc237715523 \h </w:instrText>
         </w:r>
         <w:r>
           <w:rPr>
@@ -5684,7 +5661,7 @@
           <w14:ligatures w14:val="standardContextual"/>
         </w:rPr>
       </w:pPr>
-      <w:hyperlink w:anchor="_Toc237714034" w:history="1">
+      <w:hyperlink w:anchor="_Toc237715524" w:history="1">
         <w:r>
           <w:rPr>
             <w:rStyle w:val="Hipervnculo"/>
@@ -5711,7 +5688,7 @@
             <w:noProof/>
             <w:webHidden/>
           </w:rPr>
-          <w:instrText xml:space="preserve"> PAGEREF _Toc237714034 \h </w:instrText>
+          <w:instrText xml:space="preserve"> PAGEREF _Toc237715524 \h </w:instrText>
         </w:r>
         <w:r>
           <w:rPr>
@@ -5758,7 +5735,7 @@
           <w14:ligatures w14:val="standardContextual"/>
         </w:rPr>
       </w:pPr>
-      <w:hyperlink w:anchor="_Toc237714035" w:history="1">
+      <w:hyperlink w:anchor="_Toc237715525" w:history="1">
         <w:r>
           <w:rPr>
             <w:rStyle w:val="Hipervnculo"/>
@@ -5785,7 +5762,7 @@
             <w:noProof/>
             <w:webHidden/>
           </w:rPr>
-          <w:instrText xml:space="preserve"> PAGEREF _Toc237714035 \h </w:instrText>
+          <w:instrText xml:space="preserve"> PAGEREF _Toc237715525 \h </w:instrText>
         </w:r>
         <w:r>
           <w:rPr>
@@ -5832,7 +5809,7 @@
           <w14:ligatures w14:val="standardContextual"/>
         </w:rPr>
       </w:pPr>
-      <w:hyperlink w:anchor="_Toc237714036" w:history="1">
+      <w:hyperlink w:anchor="_Toc237715526" w:history="1">
         <w:r>
           <w:rPr>
             <w:rStyle w:val="Hipervnculo"/>
@@ -5859,7 +5836,7 @@
             <w:noProof/>
             <w:webHidden/>
           </w:rPr>
-          <w:instrText xml:space="preserve"> PAGEREF _Toc237714036 \h </w:instrText>
+          <w:instrText xml:space="preserve"> PAGEREF _Toc237715526 \h </w:instrText>
         </w:r>
         <w:r>
           <w:rPr>
@@ -5906,7 +5883,7 @@
           <w14:ligatures w14:val="standardContextual"/>
         </w:rPr>
       </w:pPr>
-      <w:hyperlink w:anchor="_Toc237714037" w:history="1">
+      <w:hyperlink w:anchor="_Toc237715527" w:history="1">
         <w:r>
           <w:rPr>
             <w:rStyle w:val="Hipervnculo"/>
@@ -5933,7 +5910,7 @@
             <w:noProof/>
             <w:webHidden/>
           </w:rPr>
-          <w:instrText xml:space="preserve"> PAGEREF _Toc237714037 \h </w:instrText>
+          <w:instrText xml:space="preserve"> PAGEREF _Toc237715527 \h </w:instrText>
         </w:r>
         <w:r>
           <w:rPr>
@@ -5980,7 +5957,7 @@
           <w14:ligatures w14:val="standardContextual"/>
         </w:rPr>
       </w:pPr>
-      <w:hyperlink w:anchor="_Toc237714038" w:history="1">
+      <w:hyperlink w:anchor="_Toc237715528" w:history="1">
         <w:r>
           <w:rPr>
             <w:rStyle w:val="Hipervnculo"/>
@@ -6007,7 +5984,7 @@
             <w:noProof/>
             <w:webHidden/>
           </w:rPr>
-          <w:instrText xml:space="preserve"> PAGEREF _Toc237714038 \h </w:instrText>
+          <w:instrText xml:space="preserve"> PAGEREF _Toc237715528 \h </w:instrText>
         </w:r>
         <w:r>
           <w:rPr>
@@ -6091,7 +6068,7 @@
         <w:pStyle w:val="Ttulo1"/>
         <w:spacing w:before="100" w:after="30"/>
       </w:pPr>
-      <w:bookmarkStart w:id="0" w:name="_Toc237713976"/>
+      <w:bookmarkStart w:id="0" w:name="_Toc237715466"/>
       <w:r>
         <w:rPr>
           <w:rFonts w:ascii="Georgia" w:hAnsi="Georgia"/>
@@ -6108,7 +6085,7 @@
         <w:pStyle w:val="Ttulo2"/>
         <w:spacing w:before="70" w:after="20"/>
       </w:pPr>
-      <w:bookmarkStart w:id="1" w:name="_Toc237713977"/>
+      <w:bookmarkStart w:id="1" w:name="_Toc237715467"/>
       <w:r>
         <w:rPr>
           <w:rFonts w:ascii="Georgia" w:hAnsi="Georgia"/>
@@ -6149,7 +6126,7 @@
         <w:pStyle w:val="Ttulo2"/>
         <w:spacing w:before="70" w:after="20"/>
       </w:pPr>
-      <w:bookmarkStart w:id="2" w:name="_Toc237713978"/>
+      <w:bookmarkStart w:id="2" w:name="_Toc237715468"/>
       <w:r>
         <w:rPr>
           <w:rFonts w:ascii="Georgia" w:hAnsi="Georgia"/>
@@ -6210,7 +6187,7 @@
                 <w:noProof/>
               </w:rPr>
               <w:drawing>
-                <wp:inline distT="0" distB="0" distL="0" distR="0" wp14:anchorId="30992CED" wp14:editId="7F5D49C0">
+                <wp:inline distT="0" distB="0" distL="0" distR="0" wp14:anchorId="22AA5144" wp14:editId="7AFC6927">
                   <wp:extent cx="2926080" cy="1524412"/>
                   <wp:effectExtent l="0" t="0" r="0" b="0"/>
                   <wp:docPr id="1" name="Picture 1"/>
@@ -6269,7 +6246,7 @@
                 <w:noProof/>
               </w:rPr>
               <w:drawing>
-                <wp:inline distT="0" distB="0" distL="0" distR="0" wp14:anchorId="38E339CB" wp14:editId="002D0215">
+                <wp:inline distT="0" distB="0" distL="0" distR="0" wp14:anchorId="405AFA00" wp14:editId="7D359D26">
                   <wp:extent cx="2926080" cy="1437831"/>
                   <wp:effectExtent l="0" t="0" r="0" b="0"/>
                   <wp:docPr id="2" name="Picture 2"/>
@@ -6374,7 +6351,7 @@
         <w:pStyle w:val="Ttulo2"/>
         <w:spacing w:before="70" w:after="20"/>
       </w:pPr>
-      <w:bookmarkStart w:id="3" w:name="_Toc237713979"/>
+      <w:bookmarkStart w:id="3" w:name="_Toc237715469"/>
       <w:r>
         <w:rPr>
           <w:rFonts w:ascii="Georgia" w:hAnsi="Georgia"/>
@@ -6501,7 +6478,7 @@
         <w:pStyle w:val="Ttulo2"/>
         <w:spacing w:before="70" w:after="20"/>
       </w:pPr>
-      <w:bookmarkStart w:id="4" w:name="_Toc237713980"/>
+      <w:bookmarkStart w:id="4" w:name="_Toc237715470"/>
       <w:r>
         <w:rPr>
           <w:rFonts w:ascii="Georgia" w:hAnsi="Georgia"/>
@@ -7029,7 +7006,7 @@
         <w:pStyle w:val="Ttulo2"/>
         <w:spacing w:before="70" w:after="20"/>
       </w:pPr>
-      <w:bookmarkStart w:id="5" w:name="_Toc237713981"/>
+      <w:bookmarkStart w:id="5" w:name="_Toc237715471"/>
       <w:r>
         <w:rPr>
           <w:rFonts w:ascii="Georgia" w:hAnsi="Georgia"/>
@@ -7162,7 +7139,7 @@
         <w:pStyle w:val="Ttulo2"/>
         <w:spacing w:before="70" w:after="20"/>
       </w:pPr>
-      <w:bookmarkStart w:id="6" w:name="_Toc237713982"/>
+      <w:bookmarkStart w:id="6" w:name="_Toc237715472"/>
       <w:r>
         <w:rPr>
           <w:rFonts w:ascii="Georgia" w:hAnsi="Georgia"/>
@@ -8379,7 +8356,7 @@
         <w:pStyle w:val="Ttulo1"/>
         <w:spacing w:before="100" w:after="30"/>
       </w:pPr>
-      <w:bookmarkStart w:id="7" w:name="_Toc237713983"/>
+      <w:bookmarkStart w:id="7" w:name="_Toc237715473"/>
       <w:r>
         <w:rPr>
           <w:rFonts w:ascii="Georgia" w:hAnsi="Georgia"/>
@@ -8395,7 +8372,7 @@
         <w:pStyle w:val="Ttulo2"/>
         <w:spacing w:before="70" w:after="20"/>
       </w:pPr>
-      <w:bookmarkStart w:id="8" w:name="_Toc237713984"/>
+      <w:bookmarkStart w:id="8" w:name="_Toc237715474"/>
       <w:r>
         <w:rPr>
           <w:rFonts w:ascii="Georgia" w:hAnsi="Georgia"/>
@@ -8453,7 +8430,7 @@
                 <w:noProof/>
               </w:rPr>
               <w:drawing>
-                <wp:inline distT="0" distB="0" distL="0" distR="0" wp14:anchorId="59B5913B" wp14:editId="259167B8">
+                <wp:inline distT="0" distB="0" distL="0" distR="0" wp14:anchorId="0CDAC221" wp14:editId="3F562143">
                   <wp:extent cx="2926080" cy="1426594"/>
                   <wp:effectExtent l="0" t="0" r="0" b="0"/>
                   <wp:docPr id="3" name="Picture 3"/>
@@ -8512,7 +8489,7 @@
                 <w:noProof/>
               </w:rPr>
               <w:drawing>
-                <wp:inline distT="0" distB="0" distL="0" distR="0" wp14:anchorId="5644B331" wp14:editId="249B453B">
+                <wp:inline distT="0" distB="0" distL="0" distR="0" wp14:anchorId="6646E6CC" wp14:editId="491109AF">
                   <wp:extent cx="2926080" cy="1494260"/>
                   <wp:effectExtent l="0" t="0" r="0" b="0"/>
                   <wp:docPr id="4" name="Picture 4"/>
@@ -8627,7 +8604,7 @@
         <w:pStyle w:val="Ttulo2"/>
         <w:spacing w:before="70" w:after="20"/>
       </w:pPr>
-      <w:bookmarkStart w:id="9" w:name="_Toc237713985"/>
+      <w:bookmarkStart w:id="9" w:name="_Toc237715475"/>
       <w:r>
         <w:rPr>
           <w:rFonts w:ascii="Georgia" w:hAnsi="Georgia"/>
@@ -8861,7 +8838,7 @@
         <w:pStyle w:val="Ttulo1"/>
         <w:spacing w:before="100" w:after="30"/>
       </w:pPr>
-      <w:bookmarkStart w:id="10" w:name="_Toc237713986"/>
+      <w:bookmarkStart w:id="10" w:name="_Toc237715476"/>
       <w:r>
         <w:rPr>
           <w:rFonts w:ascii="Georgia" w:hAnsi="Georgia"/>
@@ -8877,7 +8854,7 @@
         <w:pStyle w:val="Ttulo2"/>
         <w:spacing w:before="70" w:after="20"/>
       </w:pPr>
-      <w:bookmarkStart w:id="11" w:name="_Toc237713987"/>
+      <w:bookmarkStart w:id="11" w:name="_Toc237715477"/>
       <w:r>
         <w:rPr>
           <w:rFonts w:ascii="Georgia" w:hAnsi="Georgia"/>
@@ -8938,7 +8915,7 @@
                 <w:noProof/>
               </w:rPr>
               <w:drawing>
-                <wp:inline distT="0" distB="0" distL="0" distR="0" wp14:anchorId="73BBA785" wp14:editId="01169746">
+                <wp:inline distT="0" distB="0" distL="0" distR="0" wp14:anchorId="2DAD55CB" wp14:editId="6DC110B4">
                   <wp:extent cx="2926080" cy="1636252"/>
                   <wp:effectExtent l="0" t="0" r="0" b="0"/>
                   <wp:docPr id="5" name="Picture 5"/>
@@ -8997,7 +8974,7 @@
                 <w:noProof/>
               </w:rPr>
               <w:drawing>
-                <wp:inline distT="0" distB="0" distL="0" distR="0" wp14:anchorId="5AB618F1" wp14:editId="16E7BE74">
+                <wp:inline distT="0" distB="0" distL="0" distR="0" wp14:anchorId="22AABFEE" wp14:editId="0B91CEBA">
                   <wp:extent cx="2926080" cy="1481181"/>
                   <wp:effectExtent l="0" t="0" r="0" b="0"/>
                   <wp:docPr id="6" name="Picture 6"/>
@@ -9112,7 +9089,7 @@
         <w:pStyle w:val="Ttulo2"/>
         <w:spacing w:before="70" w:after="20"/>
       </w:pPr>
-      <w:bookmarkStart w:id="12" w:name="_Toc237713988"/>
+      <w:bookmarkStart w:id="12" w:name="_Toc237715478"/>
       <w:r>
         <w:rPr>
           <w:rFonts w:ascii="Georgia" w:hAnsi="Georgia"/>
@@ -9143,7 +9120,7 @@
         <w:pStyle w:val="Ttulo2"/>
         <w:spacing w:before="70" w:after="20"/>
       </w:pPr>
-      <w:bookmarkStart w:id="13" w:name="_Toc237713989"/>
+      <w:bookmarkStart w:id="13" w:name="_Toc237715479"/>
       <w:r>
         <w:rPr>
           <w:rFonts w:ascii="Georgia" w:hAnsi="Georgia"/>
@@ -9201,7 +9178,7 @@
                 <w:noProof/>
               </w:rPr>
               <w:drawing>
-                <wp:inline distT="0" distB="0" distL="0" distR="0" wp14:anchorId="53823278" wp14:editId="44D706A0">
+                <wp:inline distT="0" distB="0" distL="0" distR="0" wp14:anchorId="73B47110" wp14:editId="6C625531">
                   <wp:extent cx="2926080" cy="1626307"/>
                   <wp:effectExtent l="0" t="0" r="0" b="0"/>
                   <wp:docPr id="7" name="Picture 7"/>
@@ -9260,7 +9237,7 @@
                 <w:noProof/>
               </w:rPr>
               <w:drawing>
-                <wp:inline distT="0" distB="0" distL="0" distR="0" wp14:anchorId="08260A96" wp14:editId="3670C388">
+                <wp:inline distT="0" distB="0" distL="0" distR="0" wp14:anchorId="136B25AD" wp14:editId="10910E7B">
                   <wp:extent cx="2926080" cy="1479479"/>
                   <wp:effectExtent l="0" t="0" r="0" b="0"/>
                   <wp:docPr id="8" name="Picture 8"/>
@@ -9365,7 +9342,7 @@
         <w:pStyle w:val="Ttulo2"/>
         <w:spacing w:before="70" w:after="20"/>
       </w:pPr>
-      <w:bookmarkStart w:id="14" w:name="_Toc237713990"/>
+      <w:bookmarkStart w:id="14" w:name="_Toc237715480"/>
       <w:r>
         <w:rPr>
           <w:rFonts w:ascii="Georgia" w:hAnsi="Georgia"/>
@@ -9426,7 +9403,7 @@
                 <w:noProof/>
               </w:rPr>
               <w:drawing>
-                <wp:inline distT="0" distB="0" distL="0" distR="0" wp14:anchorId="1F0A043C" wp14:editId="5E5144BE">
+                <wp:inline distT="0" distB="0" distL="0" distR="0" wp14:anchorId="27E533BE" wp14:editId="1EFEB633">
                   <wp:extent cx="2926080" cy="1662311"/>
                   <wp:effectExtent l="0" t="0" r="0" b="0"/>
                   <wp:docPr id="9" name="Picture 9"/>
@@ -9485,7 +9462,7 @@
                 <w:noProof/>
               </w:rPr>
               <w:drawing>
-                <wp:inline distT="0" distB="0" distL="0" distR="0" wp14:anchorId="6EC709C8" wp14:editId="64CF38E9">
+                <wp:inline distT="0" distB="0" distL="0" distR="0" wp14:anchorId="2CA08285" wp14:editId="24BBE071">
                   <wp:extent cx="2926080" cy="1801004"/>
                   <wp:effectExtent l="0" t="0" r="0" b="0"/>
                   <wp:docPr id="10" name="Picture 10"/>
@@ -9590,7 +9567,7 @@
         <w:pStyle w:val="Ttulo1"/>
         <w:spacing w:before="100" w:after="30"/>
       </w:pPr>
-      <w:bookmarkStart w:id="15" w:name="_Toc237713991"/>
+      <w:bookmarkStart w:id="15" w:name="_Toc237715481"/>
       <w:r>
         <w:rPr>
           <w:rFonts w:ascii="Georgia" w:hAnsi="Georgia"/>
@@ -9606,7 +9583,7 @@
         <w:pStyle w:val="Ttulo2"/>
         <w:spacing w:before="70" w:after="20"/>
       </w:pPr>
-      <w:bookmarkStart w:id="16" w:name="_Toc237713992"/>
+      <w:bookmarkStart w:id="16" w:name="_Toc237715482"/>
       <w:r>
         <w:rPr>
           <w:rFonts w:ascii="Georgia" w:hAnsi="Georgia"/>
@@ -10045,7 +10022,7 @@
         <w:pStyle w:val="Ttulo2"/>
         <w:spacing w:before="70" w:after="20"/>
       </w:pPr>
-      <w:bookmarkStart w:id="17" w:name="_Toc237713993"/>
+      <w:bookmarkStart w:id="17" w:name="_Toc237715483"/>
       <w:r>
         <w:rPr>
           <w:rFonts w:ascii="Georgia" w:hAnsi="Georgia"/>
@@ -10073,7 +10050,7 @@
         <w:pStyle w:val="Ttulo1"/>
         <w:spacing w:before="100" w:after="30"/>
       </w:pPr>
-      <w:bookmarkStart w:id="18" w:name="_Toc237713994"/>
+      <w:bookmarkStart w:id="18" w:name="_Toc237715484"/>
       <w:r>
         <w:rPr>
           <w:rFonts w:ascii="Georgia" w:hAnsi="Georgia"/>
@@ -10089,7 +10066,7 @@
         <w:pStyle w:val="Ttulo2"/>
         <w:spacing w:before="70" w:after="20"/>
       </w:pPr>
-      <w:bookmarkStart w:id="19" w:name="_Toc237713995"/>
+      <w:bookmarkStart w:id="19" w:name="_Toc237715485"/>
       <w:r>
         <w:rPr>
           <w:rFonts w:ascii="Georgia" w:hAnsi="Georgia"/>
@@ -10116,7 +10093,7 @@
         <w:pStyle w:val="Ttulo2"/>
         <w:spacing w:before="70" w:after="20"/>
       </w:pPr>
-      <w:bookmarkStart w:id="20" w:name="_Toc237713996"/>
+      <w:bookmarkStart w:id="20" w:name="_Toc237715486"/>
       <w:r>
         <w:rPr>
           <w:rFonts w:ascii="Georgia" w:hAnsi="Georgia"/>
@@ -10174,7 +10151,7 @@
                 <w:noProof/>
               </w:rPr>
               <w:drawing>
-                <wp:inline distT="0" distB="0" distL="0" distR="0" wp14:anchorId="7CC73B33" wp14:editId="02371DB3">
+                <wp:inline distT="0" distB="0" distL="0" distR="0" wp14:anchorId="569E0466" wp14:editId="071BA37C">
                   <wp:extent cx="2926080" cy="1714660"/>
                   <wp:effectExtent l="0" t="0" r="0" b="0"/>
                   <wp:docPr id="11" name="Picture 11"/>
@@ -10233,7 +10210,7 @@
                 <w:noProof/>
               </w:rPr>
               <w:drawing>
-                <wp:inline distT="0" distB="0" distL="0" distR="0" wp14:anchorId="177B0D68" wp14:editId="66BE1D28">
+                <wp:inline distT="0" distB="0" distL="0" distR="0" wp14:anchorId="4A5B8B23" wp14:editId="34F5954F">
                   <wp:extent cx="2926080" cy="1558188"/>
                   <wp:effectExtent l="0" t="0" r="0" b="0"/>
                   <wp:docPr id="12" name="Picture 12"/>
@@ -11203,7 +11180,7 @@
         <w:pStyle w:val="Ttulo1"/>
         <w:spacing w:before="100" w:after="30"/>
       </w:pPr>
-      <w:bookmarkStart w:id="21" w:name="_Toc237713997"/>
+      <w:bookmarkStart w:id="21" w:name="_Toc237715487"/>
       <w:r>
         <w:rPr>
           <w:rFonts w:ascii="Georgia" w:hAnsi="Georgia"/>
@@ -11220,7 +11197,7 @@
         <w:pStyle w:val="Ttulo2"/>
         <w:spacing w:before="70" w:after="20"/>
       </w:pPr>
-      <w:bookmarkStart w:id="22" w:name="_Toc237713998"/>
+      <w:bookmarkStart w:id="22" w:name="_Toc237715488"/>
       <w:r>
         <w:rPr>
           <w:rFonts w:ascii="Georgia" w:hAnsi="Georgia"/>
@@ -11312,7 +11289,7 @@
         <w:pStyle w:val="Ttulo2"/>
         <w:spacing w:before="70" w:after="20"/>
       </w:pPr>
-      <w:bookmarkStart w:id="23" w:name="_Toc237713999"/>
+      <w:bookmarkStart w:id="23" w:name="_Toc237715489"/>
       <w:r>
         <w:rPr>
           <w:rFonts w:ascii="Georgia" w:hAnsi="Georgia"/>
@@ -11543,7 +11520,7 @@
                 <w:noProof/>
               </w:rPr>
               <w:drawing>
-                <wp:inline distT="0" distB="0" distL="0" distR="0" wp14:anchorId="2671783A" wp14:editId="6A1E03BD">
+                <wp:inline distT="0" distB="0" distL="0" distR="0" wp14:anchorId="4C6DB823" wp14:editId="283DF8A6">
                   <wp:extent cx="2926080" cy="1540391"/>
                   <wp:effectExtent l="0" t="0" r="0" b="0"/>
                   <wp:docPr id="13" name="Picture 13"/>
@@ -11602,7 +11579,7 @@
                 <w:noProof/>
               </w:rPr>
               <w:drawing>
-                <wp:inline distT="0" distB="0" distL="0" distR="0" wp14:anchorId="1C824C1E" wp14:editId="4DAEE84D">
+                <wp:inline distT="0" distB="0" distL="0" distR="0" wp14:anchorId="6C78BB4A" wp14:editId="6EB5EE8E">
                   <wp:extent cx="2926080" cy="1658038"/>
                   <wp:effectExtent l="0" t="0" r="0" b="0"/>
                   <wp:docPr id="14" name="Picture 14"/>
@@ -11707,7 +11684,7 @@
         <w:pStyle w:val="Ttulo2"/>
         <w:spacing w:before="70" w:after="20"/>
       </w:pPr>
-      <w:bookmarkStart w:id="24" w:name="_Toc237714000"/>
+      <w:bookmarkStart w:id="24" w:name="_Toc237715490"/>
       <w:r>
         <w:rPr>
           <w:rFonts w:ascii="Georgia" w:hAnsi="Georgia"/>
@@ -12635,7 +12612,7 @@
         <w:pStyle w:val="Ttulo1"/>
         <w:spacing w:before="100" w:after="30"/>
       </w:pPr>
-      <w:bookmarkStart w:id="25" w:name="_Toc237714001"/>
+      <w:bookmarkStart w:id="25" w:name="_Toc237715491"/>
       <w:r>
         <w:rPr>
           <w:rFonts w:ascii="Georgia" w:hAnsi="Georgia"/>
@@ -12651,7 +12628,7 @@
         <w:pStyle w:val="Ttulo2"/>
         <w:spacing w:before="70" w:after="20"/>
       </w:pPr>
-      <w:bookmarkStart w:id="26" w:name="_Toc237714002"/>
+      <w:bookmarkStart w:id="26" w:name="_Toc237715492"/>
       <w:r>
         <w:rPr>
           <w:rFonts w:ascii="Georgia" w:hAnsi="Georgia"/>
@@ -14240,7 +14217,7 @@
         <w:pStyle w:val="Ttulo2"/>
         <w:spacing w:before="70" w:after="20"/>
       </w:pPr>
-      <w:bookmarkStart w:id="27" w:name="_Toc237714003"/>
+      <w:bookmarkStart w:id="27" w:name="_Toc237715493"/>
       <w:r>
         <w:rPr>
           <w:rFonts w:ascii="Georgia" w:hAnsi="Georgia"/>
@@ -14350,7 +14327,7 @@
         <w:pStyle w:val="Ttulo1"/>
         <w:spacing w:before="100" w:after="30"/>
       </w:pPr>
-      <w:bookmarkStart w:id="28" w:name="_Toc237714004"/>
+      <w:bookmarkStart w:id="28" w:name="_Toc237715494"/>
       <w:r>
         <w:rPr>
           <w:rFonts w:ascii="Georgia" w:hAnsi="Georgia"/>
@@ -14367,7 +14344,7 @@
         <w:pStyle w:val="Ttulo2"/>
         <w:spacing w:before="70" w:after="20"/>
       </w:pPr>
-      <w:bookmarkStart w:id="29" w:name="_Toc237714005"/>
+      <w:bookmarkStart w:id="29" w:name="_Toc237715495"/>
       <w:r>
         <w:rPr>
           <w:rFonts w:ascii="Georgia" w:hAnsi="Georgia"/>
@@ -14394,7 +14371,7 @@
         <w:pStyle w:val="Ttulo2"/>
         <w:spacing w:before="70" w:after="20"/>
       </w:pPr>
-      <w:bookmarkStart w:id="30" w:name="_Toc237714006"/>
+      <w:bookmarkStart w:id="30" w:name="_Toc237715496"/>
       <w:r>
         <w:rPr>
           <w:rFonts w:ascii="Georgia" w:hAnsi="Georgia"/>
@@ -14452,7 +14429,7 @@
                 <w:noProof/>
               </w:rPr>
               <w:drawing>
-                <wp:inline distT="0" distB="0" distL="0" distR="0" wp14:anchorId="4A129DCD" wp14:editId="473C946B">
+                <wp:inline distT="0" distB="0" distL="0" distR="0" wp14:anchorId="548DB459" wp14:editId="5B4C906C">
                   <wp:extent cx="2926080" cy="1534596"/>
                   <wp:effectExtent l="0" t="0" r="0" b="0"/>
                   <wp:docPr id="15" name="Picture 15"/>
@@ -14511,7 +14488,7 @@
                 <w:noProof/>
               </w:rPr>
               <w:drawing>
-                <wp:inline distT="0" distB="0" distL="0" distR="0" wp14:anchorId="7A16A9A1" wp14:editId="527680BF">
+                <wp:inline distT="0" distB="0" distL="0" distR="0" wp14:anchorId="234D7420" wp14:editId="6D6CB0E3">
                   <wp:extent cx="2926080" cy="1680519"/>
                   <wp:effectExtent l="0" t="0" r="0" b="0"/>
                   <wp:docPr id="16" name="Picture 16"/>
@@ -14627,7 +14604,7 @@
         <w:pStyle w:val="Ttulo1"/>
         <w:spacing w:before="100" w:after="30"/>
       </w:pPr>
-      <w:bookmarkStart w:id="31" w:name="_Toc237714007"/>
+      <w:bookmarkStart w:id="31" w:name="_Toc237715497"/>
       <w:r>
         <w:rPr>
           <w:rFonts w:ascii="Georgia" w:hAnsi="Georgia"/>
@@ -14643,7 +14620,7 @@
         <w:pStyle w:val="Ttulo2"/>
         <w:spacing w:before="70" w:after="20"/>
       </w:pPr>
-      <w:bookmarkStart w:id="32" w:name="_Toc237714008"/>
+      <w:bookmarkStart w:id="32" w:name="_Toc237715498"/>
       <w:r>
         <w:rPr>
           <w:rFonts w:ascii="Georgia" w:hAnsi="Georgia"/>
@@ -15690,7 +15667,7 @@
         <w:pStyle w:val="Ttulo2"/>
         <w:spacing w:before="70" w:after="20"/>
       </w:pPr>
-      <w:bookmarkStart w:id="33" w:name="_Toc237714009"/>
+      <w:bookmarkStart w:id="33" w:name="_Toc237715499"/>
       <w:r>
         <w:rPr>
           <w:rFonts w:ascii="Georgia" w:hAnsi="Georgia"/>
@@ -15851,7 +15828,7 @@
         <w:pStyle w:val="Ttulo2"/>
         <w:spacing w:before="70" w:after="20"/>
       </w:pPr>
-      <w:bookmarkStart w:id="34" w:name="_Toc237714010"/>
+      <w:bookmarkStart w:id="34" w:name="_Toc237715500"/>
       <w:r>
         <w:rPr>
           <w:rFonts w:ascii="Georgia" w:hAnsi="Georgia"/>
@@ -15878,7 +15855,7 @@
         <w:pStyle w:val="Ttulo1"/>
         <w:spacing w:before="100" w:after="30"/>
       </w:pPr>
-      <w:bookmarkStart w:id="35" w:name="_Toc237714011"/>
+      <w:bookmarkStart w:id="35" w:name="_Toc237715501"/>
       <w:r>
         <w:rPr>
           <w:rFonts w:ascii="Georgia" w:hAnsi="Georgia"/>
@@ -15894,7 +15871,7 @@
         <w:pStyle w:val="Ttulo2"/>
         <w:spacing w:before="70" w:after="20"/>
       </w:pPr>
-      <w:bookmarkStart w:id="36" w:name="_Toc237714012"/>
+      <w:bookmarkStart w:id="36" w:name="_Toc237715502"/>
       <w:r>
         <w:rPr>
           <w:rFonts w:ascii="Georgia" w:hAnsi="Georgia"/>
@@ -18821,7 +18798,7 @@
         <w:pStyle w:val="Ttulo1"/>
         <w:spacing w:before="100" w:after="30"/>
       </w:pPr>
-      <w:bookmarkStart w:id="37" w:name="_Toc237714013"/>
+      <w:bookmarkStart w:id="37" w:name="_Toc237715503"/>
       <w:r>
         <w:rPr>
           <w:rFonts w:ascii="Georgia" w:hAnsi="Georgia"/>
@@ -18838,7 +18815,7 @@
         <w:pStyle w:val="Ttulo2"/>
         <w:spacing w:before="70" w:after="20"/>
       </w:pPr>
-      <w:bookmarkStart w:id="38" w:name="_Toc237714014"/>
+      <w:bookmarkStart w:id="38" w:name="_Toc237715504"/>
       <w:r>
         <w:rPr>
           <w:rFonts w:ascii="Georgia" w:hAnsi="Georgia"/>
@@ -19023,7 +19000,7 @@
         <w:pStyle w:val="Ttulo2"/>
         <w:spacing w:before="70" w:after="20"/>
       </w:pPr>
-      <w:bookmarkStart w:id="39" w:name="_Toc237714015"/>
+      <w:bookmarkStart w:id="39" w:name="_Toc237715505"/>
       <w:r>
         <w:rPr>
           <w:rFonts w:ascii="Georgia" w:hAnsi="Georgia"/>
@@ -19081,7 +19058,7 @@
                 <w:noProof/>
               </w:rPr>
               <w:drawing>
-                <wp:inline distT="0" distB="0" distL="0" distR="0" wp14:anchorId="2735F196" wp14:editId="5B81C4EF">
+                <wp:inline distT="0" distB="0" distL="0" distR="0" wp14:anchorId="7DCAD651" wp14:editId="698CEA51">
                   <wp:extent cx="2926080" cy="1626569"/>
                   <wp:effectExtent l="0" t="0" r="0" b="0"/>
                   <wp:docPr id="17" name="Picture 17"/>
@@ -19140,7 +19117,7 @@
                 <w:noProof/>
               </w:rPr>
               <w:drawing>
-                <wp:inline distT="0" distB="0" distL="0" distR="0" wp14:anchorId="1C6CDC91" wp14:editId="1756750E">
+                <wp:inline distT="0" distB="0" distL="0" distR="0" wp14:anchorId="5E06203B" wp14:editId="2C0F6C79">
                   <wp:extent cx="2926080" cy="1691675"/>
                   <wp:effectExtent l="0" t="0" r="0" b="0"/>
                   <wp:docPr id="18" name="Picture 18"/>
@@ -19245,7 +19222,7 @@
         <w:pStyle w:val="Ttulo2"/>
         <w:spacing w:before="70" w:after="20"/>
       </w:pPr>
-      <w:bookmarkStart w:id="40" w:name="_Toc237714016"/>
+      <w:bookmarkStart w:id="40" w:name="_Toc237715506"/>
       <w:r>
         <w:rPr>
           <w:rFonts w:ascii="Georgia" w:hAnsi="Georgia"/>
@@ -19874,7 +19851,7 @@
         <w:pStyle w:val="Ttulo1"/>
         <w:spacing w:before="100" w:after="30"/>
       </w:pPr>
-      <w:bookmarkStart w:id="41" w:name="_Toc237714017"/>
+      <w:bookmarkStart w:id="41" w:name="_Toc237715507"/>
       <w:r>
         <w:rPr>
           <w:rFonts w:ascii="Georgia" w:hAnsi="Georgia"/>
@@ -19890,7 +19867,7 @@
         <w:pStyle w:val="Ttulo2"/>
         <w:spacing w:before="70" w:after="20"/>
       </w:pPr>
-      <w:bookmarkStart w:id="42" w:name="_Toc237714018"/>
+      <w:bookmarkStart w:id="42" w:name="_Toc237715508"/>
       <w:r>
         <w:rPr>
           <w:rFonts w:ascii="Georgia" w:hAnsi="Georgia"/>
@@ -19948,7 +19925,7 @@
                 <w:noProof/>
               </w:rPr>
               <w:drawing>
-                <wp:inline distT="0" distB="0" distL="0" distR="0" wp14:anchorId="6AD54D69" wp14:editId="14079F3F">
+                <wp:inline distT="0" distB="0" distL="0" distR="0" wp14:anchorId="66C12D27" wp14:editId="1BEE3126">
                   <wp:extent cx="2926080" cy="1495195"/>
                   <wp:effectExtent l="0" t="0" r="0" b="0"/>
                   <wp:docPr id="19" name="Picture 19"/>
@@ -20007,7 +19984,7 @@
                 <w:noProof/>
               </w:rPr>
               <w:drawing>
-                <wp:inline distT="0" distB="0" distL="0" distR="0" wp14:anchorId="0374EF29" wp14:editId="38079F02">
+                <wp:inline distT="0" distB="0" distL="0" distR="0" wp14:anchorId="1BE03B93" wp14:editId="045A35CC">
                   <wp:extent cx="2926080" cy="1682608"/>
                   <wp:effectExtent l="0" t="0" r="0" b="0"/>
                   <wp:docPr id="20" name="Picture 20"/>
@@ -21142,7 +21119,7 @@
         <w:pStyle w:val="Ttulo1"/>
         <w:spacing w:before="100" w:after="30"/>
       </w:pPr>
-      <w:bookmarkStart w:id="43" w:name="_Toc237714019"/>
+      <w:bookmarkStart w:id="43" w:name="_Toc237715509"/>
       <w:r>
         <w:rPr>
           <w:rFonts w:ascii="Georgia" w:hAnsi="Georgia"/>
@@ -21159,7 +21136,7 @@
         <w:pStyle w:val="Ttulo2"/>
         <w:spacing w:before="70" w:after="20"/>
       </w:pPr>
-      <w:bookmarkStart w:id="44" w:name="_Toc237714020"/>
+      <w:bookmarkStart w:id="44" w:name="_Toc237715510"/>
       <w:r>
         <w:rPr>
           <w:rFonts w:ascii="Georgia" w:hAnsi="Georgia"/>
@@ -21214,7 +21191,7 @@
         <w:pStyle w:val="Ttulo2"/>
         <w:spacing w:before="70" w:after="20"/>
       </w:pPr>
-      <w:bookmarkStart w:id="45" w:name="_Toc237714021"/>
+      <w:bookmarkStart w:id="45" w:name="_Toc237715511"/>
       <w:r>
         <w:rPr>
           <w:rFonts w:ascii="Georgia" w:hAnsi="Georgia"/>
@@ -21272,7 +21249,7 @@
                 <w:noProof/>
               </w:rPr>
               <w:drawing>
-                <wp:inline distT="0" distB="0" distL="0" distR="0" wp14:anchorId="176BE286" wp14:editId="20DDFD82">
+                <wp:inline distT="0" distB="0" distL="0" distR="0" wp14:anchorId="13CE79DA" wp14:editId="73255026">
                   <wp:extent cx="2926080" cy="1682608"/>
                   <wp:effectExtent l="0" t="0" r="0" b="0"/>
                   <wp:docPr id="21" name="Picture 21"/>
@@ -21331,7 +21308,7 @@
                 <w:noProof/>
               </w:rPr>
               <w:drawing>
-                <wp:inline distT="0" distB="0" distL="0" distR="0" wp14:anchorId="7F531AFF" wp14:editId="323FA060">
+                <wp:inline distT="0" distB="0" distL="0" distR="0" wp14:anchorId="7980A53B" wp14:editId="574FCA22">
                   <wp:extent cx="2926080" cy="1549755"/>
                   <wp:effectExtent l="0" t="0" r="0" b="0"/>
                   <wp:docPr id="22" name="Picture 22"/>
@@ -21436,7 +21413,7 @@
         <w:pStyle w:val="Ttulo1"/>
         <w:spacing w:before="100" w:after="30"/>
       </w:pPr>
-      <w:bookmarkStart w:id="46" w:name="_Toc237714022"/>
+      <w:bookmarkStart w:id="46" w:name="_Toc237715512"/>
       <w:r>
         <w:rPr>
           <w:rFonts w:ascii="Georgia" w:hAnsi="Georgia"/>
@@ -21452,7 +21429,7 @@
         <w:pStyle w:val="Ttulo2"/>
         <w:spacing w:before="70" w:after="20"/>
       </w:pPr>
-      <w:bookmarkStart w:id="47" w:name="_Toc237714023"/>
+      <w:bookmarkStart w:id="47" w:name="_Toc237715513"/>
       <w:r>
         <w:rPr>
           <w:rFonts w:ascii="Georgia" w:hAnsi="Georgia"/>
@@ -23000,7 +22977,7 @@
         <w:pStyle w:val="Ttulo1"/>
         <w:spacing w:before="100" w:after="30"/>
       </w:pPr>
-      <w:bookmarkStart w:id="48" w:name="_Toc237714024"/>
+      <w:bookmarkStart w:id="48" w:name="_Toc237715514"/>
       <w:r>
         <w:rPr>
           <w:rFonts w:ascii="Georgia" w:hAnsi="Georgia"/>
@@ -23017,7 +22994,7 @@
         <w:pStyle w:val="Ttulo2"/>
         <w:spacing w:before="70" w:after="20"/>
       </w:pPr>
-      <w:bookmarkStart w:id="49" w:name="_Toc237714025"/>
+      <w:bookmarkStart w:id="49" w:name="_Toc237715515"/>
       <w:r>
         <w:rPr>
           <w:rFonts w:ascii="Georgia" w:hAnsi="Georgia"/>
@@ -23140,7 +23117,7 @@
                 <w:noProof/>
               </w:rPr>
               <w:drawing>
-                <wp:inline distT="0" distB="0" distL="0" distR="0" wp14:anchorId="4DF8408A" wp14:editId="47D0DAC7">
+                <wp:inline distT="0" distB="0" distL="0" distR="0" wp14:anchorId="2B0A6460" wp14:editId="48B9918A">
                   <wp:extent cx="2926080" cy="1695124"/>
                   <wp:effectExtent l="0" t="0" r="0" b="0"/>
                   <wp:docPr id="23" name="Picture 23"/>
@@ -23199,7 +23176,7 @@
                 <w:noProof/>
               </w:rPr>
               <w:drawing>
-                <wp:inline distT="0" distB="0" distL="0" distR="0" wp14:anchorId="3265ECAB" wp14:editId="0B3536F0">
+                <wp:inline distT="0" distB="0" distL="0" distR="0" wp14:anchorId="12112CBC" wp14:editId="37EDD45B">
                   <wp:extent cx="2926080" cy="1572627"/>
                   <wp:effectExtent l="0" t="0" r="0" b="0"/>
                   <wp:docPr id="24" name="Picture 24"/>
@@ -23304,7 +23281,7 @@
         <w:pStyle w:val="Ttulo2"/>
         <w:spacing w:before="70" w:after="20"/>
       </w:pPr>
-      <w:bookmarkStart w:id="50" w:name="_Toc237714026"/>
+      <w:bookmarkStart w:id="50" w:name="_Toc237715516"/>
       <w:r>
         <w:rPr>
           <w:rFonts w:ascii="Georgia" w:hAnsi="Georgia"/>
@@ -24039,7 +24016,7 @@
         <w:pStyle w:val="Ttulo2"/>
         <w:spacing w:before="70" w:after="20"/>
       </w:pPr>
-      <w:bookmarkStart w:id="51" w:name="_Toc237714027"/>
+      <w:bookmarkStart w:id="51" w:name="_Toc237715517"/>
       <w:r>
         <w:rPr>
           <w:rFonts w:ascii="Georgia" w:hAnsi="Georgia"/>
@@ -24089,7 +24066,7 @@
         <w:pStyle w:val="Ttulo2"/>
         <w:spacing w:before="70" w:after="20"/>
       </w:pPr>
-      <w:bookmarkStart w:id="52" w:name="_Toc237714028"/>
+      <w:bookmarkStart w:id="52" w:name="_Toc237715518"/>
       <w:r>
         <w:rPr>
           <w:rFonts w:ascii="Georgia" w:hAnsi="Georgia"/>
@@ -24170,7 +24147,7 @@
                 <w:noProof/>
               </w:rPr>
               <w:drawing>
-                <wp:inline distT="0" distB="0" distL="0" distR="0" wp14:anchorId="13894E5C" wp14:editId="158FE99B">
+                <wp:inline distT="0" distB="0" distL="0" distR="0" wp14:anchorId="39F87968" wp14:editId="0C56562A">
                   <wp:extent cx="2926080" cy="1696900"/>
                   <wp:effectExtent l="0" t="0" r="0" b="0"/>
                   <wp:docPr id="25" name="Picture 25"/>
@@ -24229,7 +24206,7 @@
                 <w:noProof/>
               </w:rPr>
               <w:drawing>
-                <wp:inline distT="0" distB="0" distL="0" distR="0" wp14:anchorId="4D018C0A" wp14:editId="4F664655">
+                <wp:inline distT="0" distB="0" distL="0" distR="0" wp14:anchorId="67343264" wp14:editId="587E1BD1">
                   <wp:extent cx="2926080" cy="1614092"/>
                   <wp:effectExtent l="0" t="0" r="0" b="0"/>
                   <wp:docPr id="26" name="Picture 26"/>
@@ -25254,7 +25231,7 @@
         <w:pStyle w:val="Ttulo2"/>
         <w:spacing w:before="70" w:after="20"/>
       </w:pPr>
-      <w:bookmarkStart w:id="53" w:name="_Toc237714029"/>
+      <w:bookmarkStart w:id="53" w:name="_Toc237715519"/>
       <w:r>
         <w:rPr>
           <w:rFonts w:ascii="Georgia" w:hAnsi="Georgia"/>
@@ -25312,7 +25289,7 @@
                 <w:noProof/>
               </w:rPr>
               <w:drawing>
-                <wp:inline distT="0" distB="0" distL="0" distR="0" wp14:anchorId="21A4F788" wp14:editId="50B8EF47">
+                <wp:inline distT="0" distB="0" distL="0" distR="0" wp14:anchorId="78FDF392" wp14:editId="41760F4A">
                   <wp:extent cx="2926080" cy="1654733"/>
                   <wp:effectExtent l="0" t="0" r="0" b="0"/>
                   <wp:docPr id="27" name="Picture 27"/>
@@ -25371,7 +25348,7 @@
                 <w:noProof/>
               </w:rPr>
               <w:drawing>
-                <wp:inline distT="0" distB="0" distL="0" distR="0" wp14:anchorId="61C04C96" wp14:editId="2946EF82">
+                <wp:inline distT="0" distB="0" distL="0" distR="0" wp14:anchorId="69356F69" wp14:editId="41FFEDB4">
                   <wp:extent cx="2926080" cy="1698212"/>
                   <wp:effectExtent l="0" t="0" r="0" b="0"/>
                   <wp:docPr id="28" name="Picture 28"/>
@@ -25486,7 +25463,7 @@
         <w:pStyle w:val="Ttulo1"/>
         <w:spacing w:before="100" w:after="30"/>
       </w:pPr>
-      <w:bookmarkStart w:id="54" w:name="_Toc237714030"/>
+      <w:bookmarkStart w:id="54" w:name="_Toc237715520"/>
       <w:r>
         <w:rPr>
           <w:rFonts w:ascii="Georgia" w:hAnsi="Georgia"/>
@@ -25503,7 +25480,7 @@
         <w:pStyle w:val="Ttulo2"/>
         <w:spacing w:before="70" w:after="20"/>
       </w:pPr>
-      <w:bookmarkStart w:id="55" w:name="_Toc237714031"/>
+      <w:bookmarkStart w:id="55" w:name="_Toc237715521"/>
       <w:r>
         <w:rPr>
           <w:rFonts w:ascii="Georgia" w:hAnsi="Georgia"/>
@@ -25564,7 +25541,7 @@
         <w:pStyle w:val="Ttulo2"/>
         <w:spacing w:before="70" w:after="20"/>
       </w:pPr>
-      <w:bookmarkStart w:id="56" w:name="_Toc237714032"/>
+      <w:bookmarkStart w:id="56" w:name="_Toc237715522"/>
       <w:r>
         <w:rPr>
           <w:rFonts w:ascii="Georgia" w:hAnsi="Georgia"/>
@@ -25639,7 +25616,7 @@
                 <w:noProof/>
               </w:rPr>
               <w:drawing>
-                <wp:inline distT="0" distB="0" distL="0" distR="0" wp14:anchorId="215F1FFA" wp14:editId="595A73D0">
+                <wp:inline distT="0" distB="0" distL="0" distR="0" wp14:anchorId="124EF513" wp14:editId="7A1C95D7">
                   <wp:extent cx="2926080" cy="1650045"/>
                   <wp:effectExtent l="0" t="0" r="0" b="0"/>
                   <wp:docPr id="29" name="Picture 29"/>
@@ -25698,7 +25675,7 @@
                 <w:noProof/>
               </w:rPr>
               <w:drawing>
-                <wp:inline distT="0" distB="0" distL="0" distR="0" wp14:anchorId="7E19E307" wp14:editId="42277609">
+                <wp:inline distT="0" distB="0" distL="0" distR="0" wp14:anchorId="35AD654C" wp14:editId="5813E8C1">
                   <wp:extent cx="2926080" cy="1611196"/>
                   <wp:effectExtent l="0" t="0" r="0" b="0"/>
                   <wp:docPr id="30" name="Picture 30"/>
@@ -26186,7 +26163,7 @@
         <w:pStyle w:val="Ttulo2"/>
         <w:spacing w:before="70" w:after="20"/>
       </w:pPr>
-      <w:bookmarkStart w:id="57" w:name="_Toc237714033"/>
+      <w:bookmarkStart w:id="57" w:name="_Toc237715523"/>
       <w:r>
         <w:rPr>
           <w:rFonts w:ascii="Georgia" w:hAnsi="Georgia"/>
@@ -26260,7 +26237,7 @@
                 <w:noProof/>
               </w:rPr>
               <w:drawing>
-                <wp:inline distT="0" distB="0" distL="0" distR="0" wp14:anchorId="7EE7FFB9" wp14:editId="254A4ED9">
+                <wp:inline distT="0" distB="0" distL="0" distR="0" wp14:anchorId="0ED50D48" wp14:editId="1E6B3C7B">
                   <wp:extent cx="2926080" cy="1687777"/>
                   <wp:effectExtent l="0" t="0" r="0" b="0"/>
                   <wp:docPr id="31" name="Picture 31"/>
@@ -26855,7 +26832,7 @@
         <w:pStyle w:val="Ttulo2"/>
         <w:spacing w:before="70" w:after="20"/>
       </w:pPr>
-      <w:bookmarkStart w:id="58" w:name="_Toc237714034"/>
+      <w:bookmarkStart w:id="58" w:name="_Toc237715524"/>
       <w:r>
         <w:rPr>
           <w:rFonts w:ascii="Georgia" w:hAnsi="Georgia"/>
@@ -28114,7 +28091,7 @@
         <w:pStyle w:val="Ttulo1"/>
         <w:spacing w:before="100" w:after="30"/>
       </w:pPr>
-      <w:bookmarkStart w:id="59" w:name="_Toc237714035"/>
+      <w:bookmarkStart w:id="59" w:name="_Toc237715525"/>
       <w:r>
         <w:rPr>
           <w:rFonts w:ascii="Georgia" w:hAnsi="Georgia"/>
@@ -28302,7 +28279,7 @@
         <w:pStyle w:val="Ttulo1"/>
         <w:spacing w:before="100" w:after="30"/>
       </w:pPr>
-      <w:bookmarkStart w:id="60" w:name="_Toc237714036"/>
+      <w:bookmarkStart w:id="60" w:name="_Toc237715526"/>
       <w:r>
         <w:rPr>
           <w:rFonts w:ascii="Georgia" w:hAnsi="Georgia"/>
@@ -37431,7 +37408,7 @@
         <w:pStyle w:val="Ttulo1"/>
         <w:spacing w:before="100" w:after="30"/>
       </w:pPr>
-      <w:bookmarkStart w:id="61" w:name="_Toc237714037"/>
+      <w:bookmarkStart w:id="61" w:name="_Toc237715527"/>
       <w:r>
         <w:rPr>
           <w:rFonts w:ascii="Georgia" w:hAnsi="Georgia"/>
@@ -37903,7 +37880,7 @@
         <w:pStyle w:val="Ttulo1"/>
         <w:spacing w:before="100" w:after="30"/>
       </w:pPr>
-      <w:bookmarkStart w:id="62" w:name="_Toc237714038"/>
+      <w:bookmarkStart w:id="62" w:name="_Toc237715528"/>
       <w:r>
         <w:rPr>
           <w:rFonts w:ascii="Georgia" w:hAnsi="Georgia"/>
@@ -38407,31 +38384,31 @@
       </w:rPr>
     </w:lvl>
   </w:abstractNum>
-  <w:num w:numId="1" w16cid:durableId="2119636091">
+  <w:num w:numId="1" w16cid:durableId="1192918321">
     <w:abstractNumId w:val="8"/>
   </w:num>
-  <w:num w:numId="2" w16cid:durableId="480082234">
+  <w:num w:numId="2" w16cid:durableId="1821725797">
     <w:abstractNumId w:val="6"/>
   </w:num>
-  <w:num w:numId="3" w16cid:durableId="215898145">
+  <w:num w:numId="3" w16cid:durableId="983434877">
     <w:abstractNumId w:val="5"/>
   </w:num>
-  <w:num w:numId="4" w16cid:durableId="20665291">
+  <w:num w:numId="4" w16cid:durableId="424963772">
     <w:abstractNumId w:val="4"/>
   </w:num>
-  <w:num w:numId="5" w16cid:durableId="2116898351">
+  <w:num w:numId="5" w16cid:durableId="1110397190">
     <w:abstractNumId w:val="7"/>
   </w:num>
-  <w:num w:numId="6" w16cid:durableId="1393238496">
+  <w:num w:numId="6" w16cid:durableId="66731868">
     <w:abstractNumId w:val="3"/>
   </w:num>
-  <w:num w:numId="7" w16cid:durableId="613290030">
+  <w:num w:numId="7" w16cid:durableId="413357170">
     <w:abstractNumId w:val="2"/>
   </w:num>
-  <w:num w:numId="8" w16cid:durableId="1741441309">
+  <w:num w:numId="8" w16cid:durableId="775634576">
     <w:abstractNumId w:val="1"/>
   </w:num>
-  <w:num w:numId="9" w16cid:durableId="1253246141">
+  <w:num w:numId="9" w16cid:durableId="1812209141">
     <w:abstractNumId w:val="0"/>
   </w:num>
 </w:numbering>
@@ -49863,7 +49840,7 @@
     <w:autoRedefine/>
     <w:uiPriority w:val="39"/>
     <w:unhideWhenUsed/>
-    <w:rsid w:val="00964323"/>
+    <w:rsid w:val="002F1912"/>
     <w:pPr>
       <w:spacing w:before="10" w:after="10" w:line="240" w:lineRule="auto"/>
     </w:pPr>
@@ -49878,7 +49855,7 @@
     <w:autoRedefine/>
     <w:uiPriority w:val="39"/>
     <w:unhideWhenUsed/>
-    <w:rsid w:val="00964323"/>
+    <w:rsid w:val="002F1912"/>
     <w:pPr>
       <w:spacing w:after="0" w:line="240" w:lineRule="auto"/>
       <w:ind w:left="170"/>
@@ -49892,7 +49869,7 @@
     <w:basedOn w:val="Fuentedeprrafopredeter"/>
     <w:uiPriority w:val="99"/>
     <w:unhideWhenUsed/>
-    <w:rsid w:val="00964323"/>
+    <w:rsid w:val="002F1912"/>
     <w:rPr>
       <w:color w:val="0000FF" w:themeColor="hyperlink"/>
       <w:u w:val="single"/>

</xml_diff>

<commit_message>
style(reporte): Mejorar legibilidad con margenes 1.8cm, interlineado 1.10, parskip 2.5pt y espaciado de figuras
</commit_message>
<xml_diff>
--- a/01_Reporte_PDF/Informe_Valuacion_Aluar_UNCuyo.docx
+++ b/01_Reporte_PDF/Informe_Valuacion_Aluar_UNCuyo.docx
@@ -1339,7 +1339,7 @@
         </w:rPr>
         <w:fldChar w:fldCharType="separate"/>
       </w:r>
-      <w:hyperlink w:anchor="_Toc237715466" w:history="1">
+      <w:hyperlink w:anchor="_Toc237717600" w:history="1">
         <w:r>
           <w:rPr>
             <w:rStyle w:val="Hipervnculo"/>
@@ -1366,7 +1366,7 @@
             <w:noProof/>
             <w:webHidden/>
           </w:rPr>
-          <w:instrText xml:space="preserve"> PAGEREF _Toc237715466 \h </w:instrText>
+          <w:instrText xml:space="preserve"> PAGEREF _Toc237717600 \h </w:instrText>
         </w:r>
         <w:r>
           <w:rPr>
@@ -1413,7 +1413,7 @@
           <w14:ligatures w14:val="standardContextual"/>
         </w:rPr>
       </w:pPr>
-      <w:hyperlink w:anchor="_Toc237715467" w:history="1">
+      <w:hyperlink w:anchor="_Toc237717601" w:history="1">
         <w:r>
           <w:rPr>
             <w:rStyle w:val="Hipervnculo"/>
@@ -1440,7 +1440,7 @@
             <w:noProof/>
             <w:webHidden/>
           </w:rPr>
-          <w:instrText xml:space="preserve"> PAGEREF _Toc237715467 \h </w:instrText>
+          <w:instrText xml:space="preserve"> PAGEREF _Toc237717601 \h </w:instrText>
         </w:r>
         <w:r>
           <w:rPr>
@@ -1487,7 +1487,7 @@
           <w14:ligatures w14:val="standardContextual"/>
         </w:rPr>
       </w:pPr>
-      <w:hyperlink w:anchor="_Toc237715468" w:history="1">
+      <w:hyperlink w:anchor="_Toc237717602" w:history="1">
         <w:r>
           <w:rPr>
             <w:rStyle w:val="Hipervnculo"/>
@@ -1514,7 +1514,7 @@
             <w:noProof/>
             <w:webHidden/>
           </w:rPr>
-          <w:instrText xml:space="preserve"> PAGEREF _Toc237715468 \h </w:instrText>
+          <w:instrText xml:space="preserve"> PAGEREF _Toc237717602 \h </w:instrText>
         </w:r>
         <w:r>
           <w:rPr>
@@ -1561,7 +1561,7 @@
           <w14:ligatures w14:val="standardContextual"/>
         </w:rPr>
       </w:pPr>
-      <w:hyperlink w:anchor="_Toc237715469" w:history="1">
+      <w:hyperlink w:anchor="_Toc237717603" w:history="1">
         <w:r>
           <w:rPr>
             <w:rStyle w:val="Hipervnculo"/>
@@ -1588,7 +1588,7 @@
             <w:noProof/>
             <w:webHidden/>
           </w:rPr>
-          <w:instrText xml:space="preserve"> PAGEREF _Toc237715469 \h </w:instrText>
+          <w:instrText xml:space="preserve"> PAGEREF _Toc237717603 \h </w:instrText>
         </w:r>
         <w:r>
           <w:rPr>
@@ -1635,7 +1635,7 @@
           <w14:ligatures w14:val="standardContextual"/>
         </w:rPr>
       </w:pPr>
-      <w:hyperlink w:anchor="_Toc237715470" w:history="1">
+      <w:hyperlink w:anchor="_Toc237717604" w:history="1">
         <w:r>
           <w:rPr>
             <w:rStyle w:val="Hipervnculo"/>
@@ -1662,7 +1662,7 @@
             <w:noProof/>
             <w:webHidden/>
           </w:rPr>
-          <w:instrText xml:space="preserve"> PAGEREF _Toc237715470 \h </w:instrText>
+          <w:instrText xml:space="preserve"> PAGEREF _Toc237717604 \h </w:instrText>
         </w:r>
         <w:r>
           <w:rPr>
@@ -1709,7 +1709,7 @@
           <w14:ligatures w14:val="standardContextual"/>
         </w:rPr>
       </w:pPr>
-      <w:hyperlink w:anchor="_Toc237715471" w:history="1">
+      <w:hyperlink w:anchor="_Toc237717605" w:history="1">
         <w:r>
           <w:rPr>
             <w:rStyle w:val="Hipervnculo"/>
@@ -1736,7 +1736,7 @@
             <w:noProof/>
             <w:webHidden/>
           </w:rPr>
-          <w:instrText xml:space="preserve"> PAGEREF _Toc237715471 \h </w:instrText>
+          <w:instrText xml:space="preserve"> PAGEREF _Toc237717605 \h </w:instrText>
         </w:r>
         <w:r>
           <w:rPr>
@@ -1783,7 +1783,7 @@
           <w14:ligatures w14:val="standardContextual"/>
         </w:rPr>
       </w:pPr>
-      <w:hyperlink w:anchor="_Toc237715472" w:history="1">
+      <w:hyperlink w:anchor="_Toc237717606" w:history="1">
         <w:r>
           <w:rPr>
             <w:rStyle w:val="Hipervnculo"/>
@@ -1810,7 +1810,7 @@
             <w:noProof/>
             <w:webHidden/>
           </w:rPr>
-          <w:instrText xml:space="preserve"> PAGEREF _Toc237715472 \h </w:instrText>
+          <w:instrText xml:space="preserve"> PAGEREF _Toc237717606 \h </w:instrText>
         </w:r>
         <w:r>
           <w:rPr>
@@ -1857,7 +1857,7 @@
           <w14:ligatures w14:val="standardContextual"/>
         </w:rPr>
       </w:pPr>
-      <w:hyperlink w:anchor="_Toc237715473" w:history="1">
+      <w:hyperlink w:anchor="_Toc237717607" w:history="1">
         <w:r>
           <w:rPr>
             <w:rStyle w:val="Hipervnculo"/>
@@ -1884,7 +1884,7 @@
             <w:noProof/>
             <w:webHidden/>
           </w:rPr>
-          <w:instrText xml:space="preserve"> PAGEREF _Toc237715473 \h </w:instrText>
+          <w:instrText xml:space="preserve"> PAGEREF _Toc237717607 \h </w:instrText>
         </w:r>
         <w:r>
           <w:rPr>
@@ -1931,7 +1931,7 @@
           <w14:ligatures w14:val="standardContextual"/>
         </w:rPr>
       </w:pPr>
-      <w:hyperlink w:anchor="_Toc237715474" w:history="1">
+      <w:hyperlink w:anchor="_Toc237717608" w:history="1">
         <w:r>
           <w:rPr>
             <w:rStyle w:val="Hipervnculo"/>
@@ -1958,7 +1958,7 @@
             <w:noProof/>
             <w:webHidden/>
           </w:rPr>
-          <w:instrText xml:space="preserve"> PAGEREF _Toc237715474 \h </w:instrText>
+          <w:instrText xml:space="preserve"> PAGEREF _Toc237717608 \h </w:instrText>
         </w:r>
         <w:r>
           <w:rPr>
@@ -2005,7 +2005,7 @@
           <w14:ligatures w14:val="standardContextual"/>
         </w:rPr>
       </w:pPr>
-      <w:hyperlink w:anchor="_Toc237715475" w:history="1">
+      <w:hyperlink w:anchor="_Toc237717609" w:history="1">
         <w:r>
           <w:rPr>
             <w:rStyle w:val="Hipervnculo"/>
@@ -2032,7 +2032,7 @@
             <w:noProof/>
             <w:webHidden/>
           </w:rPr>
-          <w:instrText xml:space="preserve"> PAGEREF _Toc237715475 \h </w:instrText>
+          <w:instrText xml:space="preserve"> PAGEREF _Toc237717609 \h </w:instrText>
         </w:r>
         <w:r>
           <w:rPr>
@@ -2079,7 +2079,7 @@
           <w14:ligatures w14:val="standardContextual"/>
         </w:rPr>
       </w:pPr>
-      <w:hyperlink w:anchor="_Toc237715476" w:history="1">
+      <w:hyperlink w:anchor="_Toc237717610" w:history="1">
         <w:r>
           <w:rPr>
             <w:rStyle w:val="Hipervnculo"/>
@@ -2106,7 +2106,7 @@
             <w:noProof/>
             <w:webHidden/>
           </w:rPr>
-          <w:instrText xml:space="preserve"> PAGEREF _Toc237715476 \h </w:instrText>
+          <w:instrText xml:space="preserve"> PAGEREF _Toc237717610 \h </w:instrText>
         </w:r>
         <w:r>
           <w:rPr>
@@ -2153,7 +2153,7 @@
           <w14:ligatures w14:val="standardContextual"/>
         </w:rPr>
       </w:pPr>
-      <w:hyperlink w:anchor="_Toc237715477" w:history="1">
+      <w:hyperlink w:anchor="_Toc237717611" w:history="1">
         <w:r>
           <w:rPr>
             <w:rStyle w:val="Hipervnculo"/>
@@ -2180,7 +2180,7 @@
             <w:noProof/>
             <w:webHidden/>
           </w:rPr>
-          <w:instrText xml:space="preserve"> PAGEREF _Toc237715477 \h </w:instrText>
+          <w:instrText xml:space="preserve"> PAGEREF _Toc237717611 \h </w:instrText>
         </w:r>
         <w:r>
           <w:rPr>
@@ -2227,7 +2227,7 @@
           <w14:ligatures w14:val="standardContextual"/>
         </w:rPr>
       </w:pPr>
-      <w:hyperlink w:anchor="_Toc237715478" w:history="1">
+      <w:hyperlink w:anchor="_Toc237717612" w:history="1">
         <w:r>
           <w:rPr>
             <w:rStyle w:val="Hipervnculo"/>
@@ -2254,7 +2254,7 @@
             <w:noProof/>
             <w:webHidden/>
           </w:rPr>
-          <w:instrText xml:space="preserve"> PAGEREF _Toc237715478 \h </w:instrText>
+          <w:instrText xml:space="preserve"> PAGEREF _Toc237717612 \h </w:instrText>
         </w:r>
         <w:r>
           <w:rPr>
@@ -2301,7 +2301,7 @@
           <w14:ligatures w14:val="standardContextual"/>
         </w:rPr>
       </w:pPr>
-      <w:hyperlink w:anchor="_Toc237715479" w:history="1">
+      <w:hyperlink w:anchor="_Toc237717613" w:history="1">
         <w:r>
           <w:rPr>
             <w:rStyle w:val="Hipervnculo"/>
@@ -2328,7 +2328,7 @@
             <w:noProof/>
             <w:webHidden/>
           </w:rPr>
-          <w:instrText xml:space="preserve"> PAGEREF _Toc237715479 \h </w:instrText>
+          <w:instrText xml:space="preserve"> PAGEREF _Toc237717613 \h </w:instrText>
         </w:r>
         <w:r>
           <w:rPr>
@@ -2375,7 +2375,7 @@
           <w14:ligatures w14:val="standardContextual"/>
         </w:rPr>
       </w:pPr>
-      <w:hyperlink w:anchor="_Toc237715480" w:history="1">
+      <w:hyperlink w:anchor="_Toc237717614" w:history="1">
         <w:r>
           <w:rPr>
             <w:rStyle w:val="Hipervnculo"/>
@@ -2402,7 +2402,7 @@
             <w:noProof/>
             <w:webHidden/>
           </w:rPr>
-          <w:instrText xml:space="preserve"> PAGEREF _Toc237715480 \h </w:instrText>
+          <w:instrText xml:space="preserve"> PAGEREF _Toc237717614 \h </w:instrText>
         </w:r>
         <w:r>
           <w:rPr>
@@ -2449,7 +2449,7 @@
           <w14:ligatures w14:val="standardContextual"/>
         </w:rPr>
       </w:pPr>
-      <w:hyperlink w:anchor="_Toc237715481" w:history="1">
+      <w:hyperlink w:anchor="_Toc237717615" w:history="1">
         <w:r>
           <w:rPr>
             <w:rStyle w:val="Hipervnculo"/>
@@ -2476,7 +2476,7 @@
             <w:noProof/>
             <w:webHidden/>
           </w:rPr>
-          <w:instrText xml:space="preserve"> PAGEREF _Toc237715481 \h </w:instrText>
+          <w:instrText xml:space="preserve"> PAGEREF _Toc237717615 \h </w:instrText>
         </w:r>
         <w:r>
           <w:rPr>
@@ -2523,7 +2523,7 @@
           <w14:ligatures w14:val="standardContextual"/>
         </w:rPr>
       </w:pPr>
-      <w:hyperlink w:anchor="_Toc237715482" w:history="1">
+      <w:hyperlink w:anchor="_Toc237717616" w:history="1">
         <w:r>
           <w:rPr>
             <w:rStyle w:val="Hipervnculo"/>
@@ -2550,7 +2550,7 @@
             <w:noProof/>
             <w:webHidden/>
           </w:rPr>
-          <w:instrText xml:space="preserve"> PAGEREF _Toc237715482 \h </w:instrText>
+          <w:instrText xml:space="preserve"> PAGEREF _Toc237717616 \h </w:instrText>
         </w:r>
         <w:r>
           <w:rPr>
@@ -2597,7 +2597,7 @@
           <w14:ligatures w14:val="standardContextual"/>
         </w:rPr>
       </w:pPr>
-      <w:hyperlink w:anchor="_Toc237715483" w:history="1">
+      <w:hyperlink w:anchor="_Toc237717617" w:history="1">
         <w:r>
           <w:rPr>
             <w:rStyle w:val="Hipervnculo"/>
@@ -2624,7 +2624,7 @@
             <w:noProof/>
             <w:webHidden/>
           </w:rPr>
-          <w:instrText xml:space="preserve"> PAGEREF _Toc237715483 \h </w:instrText>
+          <w:instrText xml:space="preserve"> PAGEREF _Toc237717617 \h </w:instrText>
         </w:r>
         <w:r>
           <w:rPr>
@@ -2671,7 +2671,7 @@
           <w14:ligatures w14:val="standardContextual"/>
         </w:rPr>
       </w:pPr>
-      <w:hyperlink w:anchor="_Toc237715484" w:history="1">
+      <w:hyperlink w:anchor="_Toc237717618" w:history="1">
         <w:r>
           <w:rPr>
             <w:rStyle w:val="Hipervnculo"/>
@@ -2698,7 +2698,7 @@
             <w:noProof/>
             <w:webHidden/>
           </w:rPr>
-          <w:instrText xml:space="preserve"> PAGEREF _Toc237715484 \h </w:instrText>
+          <w:instrText xml:space="preserve"> PAGEREF _Toc237717618 \h </w:instrText>
         </w:r>
         <w:r>
           <w:rPr>
@@ -2745,7 +2745,7 @@
           <w14:ligatures w14:val="standardContextual"/>
         </w:rPr>
       </w:pPr>
-      <w:hyperlink w:anchor="_Toc237715485" w:history="1">
+      <w:hyperlink w:anchor="_Toc237717619" w:history="1">
         <w:r>
           <w:rPr>
             <w:rStyle w:val="Hipervnculo"/>
@@ -2772,7 +2772,7 @@
             <w:noProof/>
             <w:webHidden/>
           </w:rPr>
-          <w:instrText xml:space="preserve"> PAGEREF _Toc237715485 \h </w:instrText>
+          <w:instrText xml:space="preserve"> PAGEREF _Toc237717619 \h </w:instrText>
         </w:r>
         <w:r>
           <w:rPr>
@@ -2819,7 +2819,7 @@
           <w14:ligatures w14:val="standardContextual"/>
         </w:rPr>
       </w:pPr>
-      <w:hyperlink w:anchor="_Toc237715486" w:history="1">
+      <w:hyperlink w:anchor="_Toc237717620" w:history="1">
         <w:r>
           <w:rPr>
             <w:rStyle w:val="Hipervnculo"/>
@@ -2846,7 +2846,7 @@
             <w:noProof/>
             <w:webHidden/>
           </w:rPr>
-          <w:instrText xml:space="preserve"> PAGEREF _Toc237715486 \h </w:instrText>
+          <w:instrText xml:space="preserve"> PAGEREF _Toc237717620 \h </w:instrText>
         </w:r>
         <w:r>
           <w:rPr>
@@ -2893,7 +2893,7 @@
           <w14:ligatures w14:val="standardContextual"/>
         </w:rPr>
       </w:pPr>
-      <w:hyperlink w:anchor="_Toc237715487" w:history="1">
+      <w:hyperlink w:anchor="_Toc237717621" w:history="1">
         <w:r>
           <w:rPr>
             <w:rStyle w:val="Hipervnculo"/>
@@ -2920,7 +2920,7 @@
             <w:noProof/>
             <w:webHidden/>
           </w:rPr>
-          <w:instrText xml:space="preserve"> PAGEREF _Toc237715487 \h </w:instrText>
+          <w:instrText xml:space="preserve"> PAGEREF _Toc237717621 \h </w:instrText>
         </w:r>
         <w:r>
           <w:rPr>
@@ -2967,7 +2967,7 @@
           <w14:ligatures w14:val="standardContextual"/>
         </w:rPr>
       </w:pPr>
-      <w:hyperlink w:anchor="_Toc237715488" w:history="1">
+      <w:hyperlink w:anchor="_Toc237717622" w:history="1">
         <w:r>
           <w:rPr>
             <w:rStyle w:val="Hipervnculo"/>
@@ -2994,7 +2994,7 @@
             <w:noProof/>
             <w:webHidden/>
           </w:rPr>
-          <w:instrText xml:space="preserve"> PAGEREF _Toc237715488 \h </w:instrText>
+          <w:instrText xml:space="preserve"> PAGEREF _Toc237717622 \h </w:instrText>
         </w:r>
         <w:r>
           <w:rPr>
@@ -3041,7 +3041,7 @@
           <w14:ligatures w14:val="standardContextual"/>
         </w:rPr>
       </w:pPr>
-      <w:hyperlink w:anchor="_Toc237715489" w:history="1">
+      <w:hyperlink w:anchor="_Toc237717623" w:history="1">
         <w:r>
           <w:rPr>
             <w:rStyle w:val="Hipervnculo"/>
@@ -3098,7 +3098,7 @@
             <w:noProof/>
             <w:webHidden/>
           </w:rPr>
-          <w:instrText xml:space="preserve"> PAGEREF _Toc237715489 \h </w:instrText>
+          <w:instrText xml:space="preserve"> PAGEREF _Toc237717623 \h </w:instrText>
         </w:r>
         <w:r>
           <w:rPr>
@@ -3145,7 +3145,7 @@
           <w14:ligatures w14:val="standardContextual"/>
         </w:rPr>
       </w:pPr>
-      <w:hyperlink w:anchor="_Toc237715490" w:history="1">
+      <w:hyperlink w:anchor="_Toc237717624" w:history="1">
         <w:r>
           <w:rPr>
             <w:rStyle w:val="Hipervnculo"/>
@@ -3172,7 +3172,7 @@
             <w:noProof/>
             <w:webHidden/>
           </w:rPr>
-          <w:instrText xml:space="preserve"> PAGEREF _Toc237715490 \h </w:instrText>
+          <w:instrText xml:space="preserve"> PAGEREF _Toc237717624 \h </w:instrText>
         </w:r>
         <w:r>
           <w:rPr>
@@ -3219,7 +3219,7 @@
           <w14:ligatures w14:val="standardContextual"/>
         </w:rPr>
       </w:pPr>
-      <w:hyperlink w:anchor="_Toc237715491" w:history="1">
+      <w:hyperlink w:anchor="_Toc237717625" w:history="1">
         <w:r>
           <w:rPr>
             <w:rStyle w:val="Hipervnculo"/>
@@ -3246,7 +3246,7 @@
             <w:noProof/>
             <w:webHidden/>
           </w:rPr>
-          <w:instrText xml:space="preserve"> PAGEREF _Toc237715491 \h </w:instrText>
+          <w:instrText xml:space="preserve"> PAGEREF _Toc237717625 \h </w:instrText>
         </w:r>
         <w:r>
           <w:rPr>
@@ -3293,7 +3293,7 @@
           <w14:ligatures w14:val="standardContextual"/>
         </w:rPr>
       </w:pPr>
-      <w:hyperlink w:anchor="_Toc237715492" w:history="1">
+      <w:hyperlink w:anchor="_Toc237717626" w:history="1">
         <w:r>
           <w:rPr>
             <w:rStyle w:val="Hipervnculo"/>
@@ -3320,7 +3320,7 @@
             <w:noProof/>
             <w:webHidden/>
           </w:rPr>
-          <w:instrText xml:space="preserve"> PAGEREF _Toc237715492 \h </w:instrText>
+          <w:instrText xml:space="preserve"> PAGEREF _Toc237717626 \h </w:instrText>
         </w:r>
         <w:r>
           <w:rPr>
@@ -3367,7 +3367,7 @@
           <w14:ligatures w14:val="standardContextual"/>
         </w:rPr>
       </w:pPr>
-      <w:hyperlink w:anchor="_Toc237715493" w:history="1">
+      <w:hyperlink w:anchor="_Toc237717627" w:history="1">
         <w:r>
           <w:rPr>
             <w:rStyle w:val="Hipervnculo"/>
@@ -3394,7 +3394,7 @@
             <w:noProof/>
             <w:webHidden/>
           </w:rPr>
-          <w:instrText xml:space="preserve"> PAGEREF _Toc237715493 \h </w:instrText>
+          <w:instrText xml:space="preserve"> PAGEREF _Toc237717627 \h </w:instrText>
         </w:r>
         <w:r>
           <w:rPr>
@@ -3441,7 +3441,7 @@
           <w14:ligatures w14:val="standardContextual"/>
         </w:rPr>
       </w:pPr>
-      <w:hyperlink w:anchor="_Toc237715494" w:history="1">
+      <w:hyperlink w:anchor="_Toc237717628" w:history="1">
         <w:r>
           <w:rPr>
             <w:rStyle w:val="Hipervnculo"/>
@@ -3468,7 +3468,7 @@
             <w:noProof/>
             <w:webHidden/>
           </w:rPr>
-          <w:instrText xml:space="preserve"> PAGEREF _Toc237715494 \h </w:instrText>
+          <w:instrText xml:space="preserve"> PAGEREF _Toc237717628 \h </w:instrText>
         </w:r>
         <w:r>
           <w:rPr>
@@ -3515,7 +3515,7 @@
           <w14:ligatures w14:val="standardContextual"/>
         </w:rPr>
       </w:pPr>
-      <w:hyperlink w:anchor="_Toc237715495" w:history="1">
+      <w:hyperlink w:anchor="_Toc237717629" w:history="1">
         <w:r>
           <w:rPr>
             <w:rStyle w:val="Hipervnculo"/>
@@ -3542,7 +3542,7 @@
             <w:noProof/>
             <w:webHidden/>
           </w:rPr>
-          <w:instrText xml:space="preserve"> PAGEREF _Toc237715495 \h </w:instrText>
+          <w:instrText xml:space="preserve"> PAGEREF _Toc237717629 \h </w:instrText>
         </w:r>
         <w:r>
           <w:rPr>
@@ -3589,7 +3589,7 @@
           <w14:ligatures w14:val="standardContextual"/>
         </w:rPr>
       </w:pPr>
-      <w:hyperlink w:anchor="_Toc237715496" w:history="1">
+      <w:hyperlink w:anchor="_Toc237717630" w:history="1">
         <w:r>
           <w:rPr>
             <w:rStyle w:val="Hipervnculo"/>
@@ -3616,7 +3616,7 @@
             <w:noProof/>
             <w:webHidden/>
           </w:rPr>
-          <w:instrText xml:space="preserve"> PAGEREF _Toc237715496 \h </w:instrText>
+          <w:instrText xml:space="preserve"> PAGEREF _Toc237717630 \h </w:instrText>
         </w:r>
         <w:r>
           <w:rPr>
@@ -3663,7 +3663,7 @@
           <w14:ligatures w14:val="standardContextual"/>
         </w:rPr>
       </w:pPr>
-      <w:hyperlink w:anchor="_Toc237715497" w:history="1">
+      <w:hyperlink w:anchor="_Toc237717631" w:history="1">
         <w:r>
           <w:rPr>
             <w:rStyle w:val="Hipervnculo"/>
@@ -3690,7 +3690,7 @@
             <w:noProof/>
             <w:webHidden/>
           </w:rPr>
-          <w:instrText xml:space="preserve"> PAGEREF _Toc237715497 \h </w:instrText>
+          <w:instrText xml:space="preserve"> PAGEREF _Toc237717631 \h </w:instrText>
         </w:r>
         <w:r>
           <w:rPr>
@@ -3737,7 +3737,7 @@
           <w14:ligatures w14:val="standardContextual"/>
         </w:rPr>
       </w:pPr>
-      <w:hyperlink w:anchor="_Toc237715498" w:history="1">
+      <w:hyperlink w:anchor="_Toc237717632" w:history="1">
         <w:r>
           <w:rPr>
             <w:rStyle w:val="Hipervnculo"/>
@@ -3764,7 +3764,7 @@
             <w:noProof/>
             <w:webHidden/>
           </w:rPr>
-          <w:instrText xml:space="preserve"> PAGEREF _Toc237715498 \h </w:instrText>
+          <w:instrText xml:space="preserve"> PAGEREF _Toc237717632 \h </w:instrText>
         </w:r>
         <w:r>
           <w:rPr>
@@ -3811,7 +3811,7 @@
           <w14:ligatures w14:val="standardContextual"/>
         </w:rPr>
       </w:pPr>
-      <w:hyperlink w:anchor="_Toc237715499" w:history="1">
+      <w:hyperlink w:anchor="_Toc237717633" w:history="1">
         <w:r>
           <w:rPr>
             <w:rStyle w:val="Hipervnculo"/>
@@ -3838,7 +3838,7 @@
             <w:noProof/>
             <w:webHidden/>
           </w:rPr>
-          <w:instrText xml:space="preserve"> PAGEREF _Toc237715499 \h </w:instrText>
+          <w:instrText xml:space="preserve"> PAGEREF _Toc237717633 \h </w:instrText>
         </w:r>
         <w:r>
           <w:rPr>
@@ -3885,7 +3885,7 @@
           <w14:ligatures w14:val="standardContextual"/>
         </w:rPr>
       </w:pPr>
-      <w:hyperlink w:anchor="_Toc237715500" w:history="1">
+      <w:hyperlink w:anchor="_Toc237717634" w:history="1">
         <w:r>
           <w:rPr>
             <w:rStyle w:val="Hipervnculo"/>
@@ -3912,7 +3912,7 @@
             <w:noProof/>
             <w:webHidden/>
           </w:rPr>
-          <w:instrText xml:space="preserve"> PAGEREF _Toc237715500 \h </w:instrText>
+          <w:instrText xml:space="preserve"> PAGEREF _Toc237717634 \h </w:instrText>
         </w:r>
         <w:r>
           <w:rPr>
@@ -3959,7 +3959,7 @@
           <w14:ligatures w14:val="standardContextual"/>
         </w:rPr>
       </w:pPr>
-      <w:hyperlink w:anchor="_Toc237715501" w:history="1">
+      <w:hyperlink w:anchor="_Toc237717635" w:history="1">
         <w:r>
           <w:rPr>
             <w:rStyle w:val="Hipervnculo"/>
@@ -3986,7 +3986,7 @@
             <w:noProof/>
             <w:webHidden/>
           </w:rPr>
-          <w:instrText xml:space="preserve"> PAGEREF _Toc237715501 \h </w:instrText>
+          <w:instrText xml:space="preserve"> PAGEREF _Toc237717635 \h </w:instrText>
         </w:r>
         <w:r>
           <w:rPr>
@@ -4033,7 +4033,7 @@
           <w14:ligatures w14:val="standardContextual"/>
         </w:rPr>
       </w:pPr>
-      <w:hyperlink w:anchor="_Toc237715502" w:history="1">
+      <w:hyperlink w:anchor="_Toc237717636" w:history="1">
         <w:r>
           <w:rPr>
             <w:rStyle w:val="Hipervnculo"/>
@@ -4060,7 +4060,7 @@
             <w:noProof/>
             <w:webHidden/>
           </w:rPr>
-          <w:instrText xml:space="preserve"> PAGEREF _Toc237715502 \h </w:instrText>
+          <w:instrText xml:space="preserve"> PAGEREF _Toc237717636 \h </w:instrText>
         </w:r>
         <w:r>
           <w:rPr>
@@ -4107,7 +4107,7 @@
           <w14:ligatures w14:val="standardContextual"/>
         </w:rPr>
       </w:pPr>
-      <w:hyperlink w:anchor="_Toc237715503" w:history="1">
+      <w:hyperlink w:anchor="_Toc237717637" w:history="1">
         <w:r>
           <w:rPr>
             <w:rStyle w:val="Hipervnculo"/>
@@ -4134,7 +4134,7 @@
             <w:noProof/>
             <w:webHidden/>
           </w:rPr>
-          <w:instrText xml:space="preserve"> PAGEREF _Toc237715503 \h </w:instrText>
+          <w:instrText xml:space="preserve"> PAGEREF _Toc237717637 \h </w:instrText>
         </w:r>
         <w:r>
           <w:rPr>
@@ -4181,7 +4181,7 @@
           <w14:ligatures w14:val="standardContextual"/>
         </w:rPr>
       </w:pPr>
-      <w:hyperlink w:anchor="_Toc237715504" w:history="1">
+      <w:hyperlink w:anchor="_Toc237717638" w:history="1">
         <w:r>
           <w:rPr>
             <w:rStyle w:val="Hipervnculo"/>
@@ -4208,7 +4208,7 @@
             <w:noProof/>
             <w:webHidden/>
           </w:rPr>
-          <w:instrText xml:space="preserve"> PAGEREF _Toc237715504 \h </w:instrText>
+          <w:instrText xml:space="preserve"> PAGEREF _Toc237717638 \h </w:instrText>
         </w:r>
         <w:r>
           <w:rPr>
@@ -4255,7 +4255,7 @@
           <w14:ligatures w14:val="standardContextual"/>
         </w:rPr>
       </w:pPr>
-      <w:hyperlink w:anchor="_Toc237715505" w:history="1">
+      <w:hyperlink w:anchor="_Toc237717639" w:history="1">
         <w:r>
           <w:rPr>
             <w:rStyle w:val="Hipervnculo"/>
@@ -4282,7 +4282,7 @@
             <w:noProof/>
             <w:webHidden/>
           </w:rPr>
-          <w:instrText xml:space="preserve"> PAGEREF _Toc237715505 \h </w:instrText>
+          <w:instrText xml:space="preserve"> PAGEREF _Toc237717639 \h </w:instrText>
         </w:r>
         <w:r>
           <w:rPr>
@@ -4329,7 +4329,7 @@
           <w14:ligatures w14:val="standardContextual"/>
         </w:rPr>
       </w:pPr>
-      <w:hyperlink w:anchor="_Toc237715506" w:history="1">
+      <w:hyperlink w:anchor="_Toc237717640" w:history="1">
         <w:r>
           <w:rPr>
             <w:rStyle w:val="Hipervnculo"/>
@@ -4356,7 +4356,7 @@
             <w:noProof/>
             <w:webHidden/>
           </w:rPr>
-          <w:instrText xml:space="preserve"> PAGEREF _Toc237715506 \h </w:instrText>
+          <w:instrText xml:space="preserve"> PAGEREF _Toc237717640 \h </w:instrText>
         </w:r>
         <w:r>
           <w:rPr>
@@ -4403,7 +4403,7 @@
           <w14:ligatures w14:val="standardContextual"/>
         </w:rPr>
       </w:pPr>
-      <w:hyperlink w:anchor="_Toc237715507" w:history="1">
+      <w:hyperlink w:anchor="_Toc237717641" w:history="1">
         <w:r>
           <w:rPr>
             <w:rStyle w:val="Hipervnculo"/>
@@ -4430,7 +4430,7 @@
             <w:noProof/>
             <w:webHidden/>
           </w:rPr>
-          <w:instrText xml:space="preserve"> PAGEREF _Toc237715507 \h </w:instrText>
+          <w:instrText xml:space="preserve"> PAGEREF _Toc237717641 \h </w:instrText>
         </w:r>
         <w:r>
           <w:rPr>
@@ -4477,7 +4477,7 @@
           <w14:ligatures w14:val="standardContextual"/>
         </w:rPr>
       </w:pPr>
-      <w:hyperlink w:anchor="_Toc237715508" w:history="1">
+      <w:hyperlink w:anchor="_Toc237717642" w:history="1">
         <w:r>
           <w:rPr>
             <w:rStyle w:val="Hipervnculo"/>
@@ -4504,7 +4504,7 @@
             <w:noProof/>
             <w:webHidden/>
           </w:rPr>
-          <w:instrText xml:space="preserve"> PAGEREF _Toc237715508 \h </w:instrText>
+          <w:instrText xml:space="preserve"> PAGEREF _Toc237717642 \h </w:instrText>
         </w:r>
         <w:r>
           <w:rPr>
@@ -4551,7 +4551,7 @@
           <w14:ligatures w14:val="standardContextual"/>
         </w:rPr>
       </w:pPr>
-      <w:hyperlink w:anchor="_Toc237715509" w:history="1">
+      <w:hyperlink w:anchor="_Toc237717643" w:history="1">
         <w:r>
           <w:rPr>
             <w:rStyle w:val="Hipervnculo"/>
@@ -4578,7 +4578,7 @@
             <w:noProof/>
             <w:webHidden/>
           </w:rPr>
-          <w:instrText xml:space="preserve"> PAGEREF _Toc237715509 \h </w:instrText>
+          <w:instrText xml:space="preserve"> PAGEREF _Toc237717643 \h </w:instrText>
         </w:r>
         <w:r>
           <w:rPr>
@@ -4625,7 +4625,7 @@
           <w14:ligatures w14:val="standardContextual"/>
         </w:rPr>
       </w:pPr>
-      <w:hyperlink w:anchor="_Toc237715510" w:history="1">
+      <w:hyperlink w:anchor="_Toc237717644" w:history="1">
         <w:r>
           <w:rPr>
             <w:rStyle w:val="Hipervnculo"/>
@@ -4652,7 +4652,7 @@
             <w:noProof/>
             <w:webHidden/>
           </w:rPr>
-          <w:instrText xml:space="preserve"> PAGEREF _Toc237715510 \h </w:instrText>
+          <w:instrText xml:space="preserve"> PAGEREF _Toc237717644 \h </w:instrText>
         </w:r>
         <w:r>
           <w:rPr>
@@ -4699,7 +4699,7 @@
           <w14:ligatures w14:val="standardContextual"/>
         </w:rPr>
       </w:pPr>
-      <w:hyperlink w:anchor="_Toc237715511" w:history="1">
+      <w:hyperlink w:anchor="_Toc237717645" w:history="1">
         <w:r>
           <w:rPr>
             <w:rStyle w:val="Hipervnculo"/>
@@ -4726,7 +4726,7 @@
             <w:noProof/>
             <w:webHidden/>
           </w:rPr>
-          <w:instrText xml:space="preserve"> PAGEREF _Toc237715511 \h </w:instrText>
+          <w:instrText xml:space="preserve"> PAGEREF _Toc237717645 \h </w:instrText>
         </w:r>
         <w:r>
           <w:rPr>
@@ -4773,7 +4773,7 @@
           <w14:ligatures w14:val="standardContextual"/>
         </w:rPr>
       </w:pPr>
-      <w:hyperlink w:anchor="_Toc237715512" w:history="1">
+      <w:hyperlink w:anchor="_Toc237717646" w:history="1">
         <w:r>
           <w:rPr>
             <w:rStyle w:val="Hipervnculo"/>
@@ -4800,7 +4800,7 @@
             <w:noProof/>
             <w:webHidden/>
           </w:rPr>
-          <w:instrText xml:space="preserve"> PAGEREF _Toc237715512 \h </w:instrText>
+          <w:instrText xml:space="preserve"> PAGEREF _Toc237717646 \h </w:instrText>
         </w:r>
         <w:r>
           <w:rPr>
@@ -4847,7 +4847,7 @@
           <w14:ligatures w14:val="standardContextual"/>
         </w:rPr>
       </w:pPr>
-      <w:hyperlink w:anchor="_Toc237715513" w:history="1">
+      <w:hyperlink w:anchor="_Toc237717647" w:history="1">
         <w:r>
           <w:rPr>
             <w:rStyle w:val="Hipervnculo"/>
@@ -4874,7 +4874,7 @@
             <w:noProof/>
             <w:webHidden/>
           </w:rPr>
-          <w:instrText xml:space="preserve"> PAGEREF _Toc237715513 \h </w:instrText>
+          <w:instrText xml:space="preserve"> PAGEREF _Toc237717647 \h </w:instrText>
         </w:r>
         <w:r>
           <w:rPr>
@@ -4921,7 +4921,7 @@
           <w14:ligatures w14:val="standardContextual"/>
         </w:rPr>
       </w:pPr>
-      <w:hyperlink w:anchor="_Toc237715514" w:history="1">
+      <w:hyperlink w:anchor="_Toc237717648" w:history="1">
         <w:r>
           <w:rPr>
             <w:rStyle w:val="Hipervnculo"/>
@@ -4948,7 +4948,7 @@
             <w:noProof/>
             <w:webHidden/>
           </w:rPr>
-          <w:instrText xml:space="preserve"> PAGEREF _Toc237715514 \h </w:instrText>
+          <w:instrText xml:space="preserve"> PAGEREF _Toc237717648 \h </w:instrText>
         </w:r>
         <w:r>
           <w:rPr>
@@ -4995,7 +4995,7 @@
           <w14:ligatures w14:val="standardContextual"/>
         </w:rPr>
       </w:pPr>
-      <w:hyperlink w:anchor="_Toc237715515" w:history="1">
+      <w:hyperlink w:anchor="_Toc237717649" w:history="1">
         <w:r>
           <w:rPr>
             <w:rStyle w:val="Hipervnculo"/>
@@ -5022,7 +5022,7 @@
             <w:noProof/>
             <w:webHidden/>
           </w:rPr>
-          <w:instrText xml:space="preserve"> PAGEREF _Toc237715515 \h </w:instrText>
+          <w:instrText xml:space="preserve"> PAGEREF _Toc237717649 \h </w:instrText>
         </w:r>
         <w:r>
           <w:rPr>
@@ -5069,7 +5069,7 @@
           <w14:ligatures w14:val="standardContextual"/>
         </w:rPr>
       </w:pPr>
-      <w:hyperlink w:anchor="_Toc237715516" w:history="1">
+      <w:hyperlink w:anchor="_Toc237717650" w:history="1">
         <w:r>
           <w:rPr>
             <w:rStyle w:val="Hipervnculo"/>
@@ -5096,7 +5096,7 @@
             <w:noProof/>
             <w:webHidden/>
           </w:rPr>
-          <w:instrText xml:space="preserve"> PAGEREF _Toc237715516 \h </w:instrText>
+          <w:instrText xml:space="preserve"> PAGEREF _Toc237717650 \h </w:instrText>
         </w:r>
         <w:r>
           <w:rPr>
@@ -5143,7 +5143,7 @@
           <w14:ligatures w14:val="standardContextual"/>
         </w:rPr>
       </w:pPr>
-      <w:hyperlink w:anchor="_Toc237715517" w:history="1">
+      <w:hyperlink w:anchor="_Toc237717651" w:history="1">
         <w:r>
           <w:rPr>
             <w:rStyle w:val="Hipervnculo"/>
@@ -5170,7 +5170,7 @@
             <w:noProof/>
             <w:webHidden/>
           </w:rPr>
-          <w:instrText xml:space="preserve"> PAGEREF _Toc237715517 \h </w:instrText>
+          <w:instrText xml:space="preserve"> PAGEREF _Toc237717651 \h </w:instrText>
         </w:r>
         <w:r>
           <w:rPr>
@@ -5217,7 +5217,7 @@
           <w14:ligatures w14:val="standardContextual"/>
         </w:rPr>
       </w:pPr>
-      <w:hyperlink w:anchor="_Toc237715518" w:history="1">
+      <w:hyperlink w:anchor="_Toc237717652" w:history="1">
         <w:r>
           <w:rPr>
             <w:rStyle w:val="Hipervnculo"/>
@@ -5244,7 +5244,7 @@
             <w:noProof/>
             <w:webHidden/>
           </w:rPr>
-          <w:instrText xml:space="preserve"> PAGEREF _Toc237715518 \h </w:instrText>
+          <w:instrText xml:space="preserve"> PAGEREF _Toc237717652 \h </w:instrText>
         </w:r>
         <w:r>
           <w:rPr>
@@ -5291,7 +5291,7 @@
           <w14:ligatures w14:val="standardContextual"/>
         </w:rPr>
       </w:pPr>
-      <w:hyperlink w:anchor="_Toc237715519" w:history="1">
+      <w:hyperlink w:anchor="_Toc237717653" w:history="1">
         <w:r>
           <w:rPr>
             <w:rStyle w:val="Hipervnculo"/>
@@ -5318,7 +5318,7 @@
             <w:noProof/>
             <w:webHidden/>
           </w:rPr>
-          <w:instrText xml:space="preserve"> PAGEREF _Toc237715519 \h </w:instrText>
+          <w:instrText xml:space="preserve"> PAGEREF _Toc237717653 \h </w:instrText>
         </w:r>
         <w:r>
           <w:rPr>
@@ -5365,7 +5365,7 @@
           <w14:ligatures w14:val="standardContextual"/>
         </w:rPr>
       </w:pPr>
-      <w:hyperlink w:anchor="_Toc237715520" w:history="1">
+      <w:hyperlink w:anchor="_Toc237717654" w:history="1">
         <w:r>
           <w:rPr>
             <w:rStyle w:val="Hipervnculo"/>
@@ -5392,7 +5392,7 @@
             <w:noProof/>
             <w:webHidden/>
           </w:rPr>
-          <w:instrText xml:space="preserve"> PAGEREF _Toc237715520 \h </w:instrText>
+          <w:instrText xml:space="preserve"> PAGEREF _Toc237717654 \h </w:instrText>
         </w:r>
         <w:r>
           <w:rPr>
@@ -5439,7 +5439,7 @@
           <w14:ligatures w14:val="standardContextual"/>
         </w:rPr>
       </w:pPr>
-      <w:hyperlink w:anchor="_Toc237715521" w:history="1">
+      <w:hyperlink w:anchor="_Toc237717655" w:history="1">
         <w:r>
           <w:rPr>
             <w:rStyle w:val="Hipervnculo"/>
@@ -5466,7 +5466,7 @@
             <w:noProof/>
             <w:webHidden/>
           </w:rPr>
-          <w:instrText xml:space="preserve"> PAGEREF _Toc237715521 \h </w:instrText>
+          <w:instrText xml:space="preserve"> PAGEREF _Toc237717655 \h </w:instrText>
         </w:r>
         <w:r>
           <w:rPr>
@@ -5513,7 +5513,7 @@
           <w14:ligatures w14:val="standardContextual"/>
         </w:rPr>
       </w:pPr>
-      <w:hyperlink w:anchor="_Toc237715522" w:history="1">
+      <w:hyperlink w:anchor="_Toc237717656" w:history="1">
         <w:r>
           <w:rPr>
             <w:rStyle w:val="Hipervnculo"/>
@@ -5540,7 +5540,7 @@
             <w:noProof/>
             <w:webHidden/>
           </w:rPr>
-          <w:instrText xml:space="preserve"> PAGEREF _Toc237715522 \h </w:instrText>
+          <w:instrText xml:space="preserve"> PAGEREF _Toc237717656 \h </w:instrText>
         </w:r>
         <w:r>
           <w:rPr>
@@ -5587,7 +5587,7 @@
           <w14:ligatures w14:val="standardContextual"/>
         </w:rPr>
       </w:pPr>
-      <w:hyperlink w:anchor="_Toc237715523" w:history="1">
+      <w:hyperlink w:anchor="_Toc237717657" w:history="1">
         <w:r>
           <w:rPr>
             <w:rStyle w:val="Hipervnculo"/>
@@ -5614,7 +5614,7 @@
             <w:noProof/>
             <w:webHidden/>
           </w:rPr>
-          <w:instrText xml:space="preserve"> PAGEREF _Toc237715523 \h </w:instrText>
+          <w:instrText xml:space="preserve"> PAGEREF _Toc237717657 \h </w:instrText>
         </w:r>
         <w:r>
           <w:rPr>
@@ -5661,7 +5661,7 @@
           <w14:ligatures w14:val="standardContextual"/>
         </w:rPr>
       </w:pPr>
-      <w:hyperlink w:anchor="_Toc237715524" w:history="1">
+      <w:hyperlink w:anchor="_Toc237717658" w:history="1">
         <w:r>
           <w:rPr>
             <w:rStyle w:val="Hipervnculo"/>
@@ -5688,7 +5688,7 @@
             <w:noProof/>
             <w:webHidden/>
           </w:rPr>
-          <w:instrText xml:space="preserve"> PAGEREF _Toc237715524 \h </w:instrText>
+          <w:instrText xml:space="preserve"> PAGEREF _Toc237717658 \h </w:instrText>
         </w:r>
         <w:r>
           <w:rPr>
@@ -5735,7 +5735,7 @@
           <w14:ligatures w14:val="standardContextual"/>
         </w:rPr>
       </w:pPr>
-      <w:hyperlink w:anchor="_Toc237715525" w:history="1">
+      <w:hyperlink w:anchor="_Toc237717659" w:history="1">
         <w:r>
           <w:rPr>
             <w:rStyle w:val="Hipervnculo"/>
@@ -5762,7 +5762,7 @@
             <w:noProof/>
             <w:webHidden/>
           </w:rPr>
-          <w:instrText xml:space="preserve"> PAGEREF _Toc237715525 \h </w:instrText>
+          <w:instrText xml:space="preserve"> PAGEREF _Toc237717659 \h </w:instrText>
         </w:r>
         <w:r>
           <w:rPr>
@@ -5809,7 +5809,7 @@
           <w14:ligatures w14:val="standardContextual"/>
         </w:rPr>
       </w:pPr>
-      <w:hyperlink w:anchor="_Toc237715526" w:history="1">
+      <w:hyperlink w:anchor="_Toc237717660" w:history="1">
         <w:r>
           <w:rPr>
             <w:rStyle w:val="Hipervnculo"/>
@@ -5836,7 +5836,7 @@
             <w:noProof/>
             <w:webHidden/>
           </w:rPr>
-          <w:instrText xml:space="preserve"> PAGEREF _Toc237715526 \h </w:instrText>
+          <w:instrText xml:space="preserve"> PAGEREF _Toc237717660 \h </w:instrText>
         </w:r>
         <w:r>
           <w:rPr>
@@ -5883,7 +5883,7 @@
           <w14:ligatures w14:val="standardContextual"/>
         </w:rPr>
       </w:pPr>
-      <w:hyperlink w:anchor="_Toc237715527" w:history="1">
+      <w:hyperlink w:anchor="_Toc237717661" w:history="1">
         <w:r>
           <w:rPr>
             <w:rStyle w:val="Hipervnculo"/>
@@ -5910,7 +5910,7 @@
             <w:noProof/>
             <w:webHidden/>
           </w:rPr>
-          <w:instrText xml:space="preserve"> PAGEREF _Toc237715527 \h </w:instrText>
+          <w:instrText xml:space="preserve"> PAGEREF _Toc237717661 \h </w:instrText>
         </w:r>
         <w:r>
           <w:rPr>
@@ -5957,7 +5957,7 @@
           <w14:ligatures w14:val="standardContextual"/>
         </w:rPr>
       </w:pPr>
-      <w:hyperlink w:anchor="_Toc237715528" w:history="1">
+      <w:hyperlink w:anchor="_Toc237717662" w:history="1">
         <w:r>
           <w:rPr>
             <w:rStyle w:val="Hipervnculo"/>
@@ -5984,7 +5984,7 @@
             <w:noProof/>
             <w:webHidden/>
           </w:rPr>
-          <w:instrText xml:space="preserve"> PAGEREF _Toc237715528 \h </w:instrText>
+          <w:instrText xml:space="preserve"> PAGEREF _Toc237717662 \h </w:instrText>
         </w:r>
         <w:r>
           <w:rPr>
@@ -6068,7 +6068,7 @@
         <w:pStyle w:val="Ttulo1"/>
         <w:spacing w:before="100" w:after="30"/>
       </w:pPr>
-      <w:bookmarkStart w:id="0" w:name="_Toc237715466"/>
+      <w:bookmarkStart w:id="0" w:name="_Toc237717600"/>
       <w:r>
         <w:rPr>
           <w:rFonts w:ascii="Georgia" w:hAnsi="Georgia"/>
@@ -6085,7 +6085,7 @@
         <w:pStyle w:val="Ttulo2"/>
         <w:spacing w:before="70" w:after="20"/>
       </w:pPr>
-      <w:bookmarkStart w:id="1" w:name="_Toc237715467"/>
+      <w:bookmarkStart w:id="1" w:name="_Toc237717601"/>
       <w:r>
         <w:rPr>
           <w:rFonts w:ascii="Georgia" w:hAnsi="Georgia"/>
@@ -6126,7 +6126,7 @@
         <w:pStyle w:val="Ttulo2"/>
         <w:spacing w:before="70" w:after="20"/>
       </w:pPr>
-      <w:bookmarkStart w:id="2" w:name="_Toc237715468"/>
+      <w:bookmarkStart w:id="2" w:name="_Toc237717602"/>
       <w:r>
         <w:rPr>
           <w:rFonts w:ascii="Georgia" w:hAnsi="Georgia"/>
@@ -6187,7 +6187,7 @@
                 <w:noProof/>
               </w:rPr>
               <w:drawing>
-                <wp:inline distT="0" distB="0" distL="0" distR="0" wp14:anchorId="22AA5144" wp14:editId="7AFC6927">
+                <wp:inline distT="0" distB="0" distL="0" distR="0" wp14:anchorId="35577691" wp14:editId="776C5D75">
                   <wp:extent cx="2926080" cy="1524412"/>
                   <wp:effectExtent l="0" t="0" r="0" b="0"/>
                   <wp:docPr id="1" name="Picture 1"/>
@@ -6246,7 +6246,7 @@
                 <w:noProof/>
               </w:rPr>
               <w:drawing>
-                <wp:inline distT="0" distB="0" distL="0" distR="0" wp14:anchorId="405AFA00" wp14:editId="7D359D26">
+                <wp:inline distT="0" distB="0" distL="0" distR="0" wp14:anchorId="134A55C1" wp14:editId="25C89785">
                   <wp:extent cx="2926080" cy="1437831"/>
                   <wp:effectExtent l="0" t="0" r="0" b="0"/>
                   <wp:docPr id="2" name="Picture 2"/>
@@ -6351,7 +6351,7 @@
         <w:pStyle w:val="Ttulo2"/>
         <w:spacing w:before="70" w:after="20"/>
       </w:pPr>
-      <w:bookmarkStart w:id="3" w:name="_Toc237715469"/>
+      <w:bookmarkStart w:id="3" w:name="_Toc237717603"/>
       <w:r>
         <w:rPr>
           <w:rFonts w:ascii="Georgia" w:hAnsi="Georgia"/>
@@ -6478,7 +6478,7 @@
         <w:pStyle w:val="Ttulo2"/>
         <w:spacing w:before="70" w:after="20"/>
       </w:pPr>
-      <w:bookmarkStart w:id="4" w:name="_Toc237715470"/>
+      <w:bookmarkStart w:id="4" w:name="_Toc237717604"/>
       <w:r>
         <w:rPr>
           <w:rFonts w:ascii="Georgia" w:hAnsi="Georgia"/>
@@ -7006,7 +7006,7 @@
         <w:pStyle w:val="Ttulo2"/>
         <w:spacing w:before="70" w:after="20"/>
       </w:pPr>
-      <w:bookmarkStart w:id="5" w:name="_Toc237715471"/>
+      <w:bookmarkStart w:id="5" w:name="_Toc237717605"/>
       <w:r>
         <w:rPr>
           <w:rFonts w:ascii="Georgia" w:hAnsi="Georgia"/>
@@ -7139,7 +7139,7 @@
         <w:pStyle w:val="Ttulo2"/>
         <w:spacing w:before="70" w:after="20"/>
       </w:pPr>
-      <w:bookmarkStart w:id="6" w:name="_Toc237715472"/>
+      <w:bookmarkStart w:id="6" w:name="_Toc237717606"/>
       <w:r>
         <w:rPr>
           <w:rFonts w:ascii="Georgia" w:hAnsi="Georgia"/>
@@ -8356,7 +8356,7 @@
         <w:pStyle w:val="Ttulo1"/>
         <w:spacing w:before="100" w:after="30"/>
       </w:pPr>
-      <w:bookmarkStart w:id="7" w:name="_Toc237715473"/>
+      <w:bookmarkStart w:id="7" w:name="_Toc237717607"/>
       <w:r>
         <w:rPr>
           <w:rFonts w:ascii="Georgia" w:hAnsi="Georgia"/>
@@ -8372,7 +8372,7 @@
         <w:pStyle w:val="Ttulo2"/>
         <w:spacing w:before="70" w:after="20"/>
       </w:pPr>
-      <w:bookmarkStart w:id="8" w:name="_Toc237715474"/>
+      <w:bookmarkStart w:id="8" w:name="_Toc237717608"/>
       <w:r>
         <w:rPr>
           <w:rFonts w:ascii="Georgia" w:hAnsi="Georgia"/>
@@ -8430,7 +8430,7 @@
                 <w:noProof/>
               </w:rPr>
               <w:drawing>
-                <wp:inline distT="0" distB="0" distL="0" distR="0" wp14:anchorId="0CDAC221" wp14:editId="3F562143">
+                <wp:inline distT="0" distB="0" distL="0" distR="0" wp14:anchorId="1B698AF5" wp14:editId="3B0490FA">
                   <wp:extent cx="2926080" cy="1426594"/>
                   <wp:effectExtent l="0" t="0" r="0" b="0"/>
                   <wp:docPr id="3" name="Picture 3"/>
@@ -8489,7 +8489,7 @@
                 <w:noProof/>
               </w:rPr>
               <w:drawing>
-                <wp:inline distT="0" distB="0" distL="0" distR="0" wp14:anchorId="6646E6CC" wp14:editId="491109AF">
+                <wp:inline distT="0" distB="0" distL="0" distR="0" wp14:anchorId="393A9499" wp14:editId="176379E4">
                   <wp:extent cx="2926080" cy="1494260"/>
                   <wp:effectExtent l="0" t="0" r="0" b="0"/>
                   <wp:docPr id="4" name="Picture 4"/>
@@ -8604,7 +8604,7 @@
         <w:pStyle w:val="Ttulo2"/>
         <w:spacing w:before="70" w:after="20"/>
       </w:pPr>
-      <w:bookmarkStart w:id="9" w:name="_Toc237715475"/>
+      <w:bookmarkStart w:id="9" w:name="_Toc237717609"/>
       <w:r>
         <w:rPr>
           <w:rFonts w:ascii="Georgia" w:hAnsi="Georgia"/>
@@ -8838,7 +8838,7 @@
         <w:pStyle w:val="Ttulo1"/>
         <w:spacing w:before="100" w:after="30"/>
       </w:pPr>
-      <w:bookmarkStart w:id="10" w:name="_Toc237715476"/>
+      <w:bookmarkStart w:id="10" w:name="_Toc237717610"/>
       <w:r>
         <w:rPr>
           <w:rFonts w:ascii="Georgia" w:hAnsi="Georgia"/>
@@ -8854,7 +8854,7 @@
         <w:pStyle w:val="Ttulo2"/>
         <w:spacing w:before="70" w:after="20"/>
       </w:pPr>
-      <w:bookmarkStart w:id="11" w:name="_Toc237715477"/>
+      <w:bookmarkStart w:id="11" w:name="_Toc237717611"/>
       <w:r>
         <w:rPr>
           <w:rFonts w:ascii="Georgia" w:hAnsi="Georgia"/>
@@ -8915,7 +8915,7 @@
                 <w:noProof/>
               </w:rPr>
               <w:drawing>
-                <wp:inline distT="0" distB="0" distL="0" distR="0" wp14:anchorId="2DAD55CB" wp14:editId="6DC110B4">
+                <wp:inline distT="0" distB="0" distL="0" distR="0" wp14:anchorId="5E47DE2B" wp14:editId="0622F642">
                   <wp:extent cx="2926080" cy="1636252"/>
                   <wp:effectExtent l="0" t="0" r="0" b="0"/>
                   <wp:docPr id="5" name="Picture 5"/>
@@ -8974,7 +8974,7 @@
                 <w:noProof/>
               </w:rPr>
               <w:drawing>
-                <wp:inline distT="0" distB="0" distL="0" distR="0" wp14:anchorId="22AABFEE" wp14:editId="0B91CEBA">
+                <wp:inline distT="0" distB="0" distL="0" distR="0" wp14:anchorId="064E0544" wp14:editId="7A2CB985">
                   <wp:extent cx="2926080" cy="1481181"/>
                   <wp:effectExtent l="0" t="0" r="0" b="0"/>
                   <wp:docPr id="6" name="Picture 6"/>
@@ -9089,7 +9089,7 @@
         <w:pStyle w:val="Ttulo2"/>
         <w:spacing w:before="70" w:after="20"/>
       </w:pPr>
-      <w:bookmarkStart w:id="12" w:name="_Toc237715478"/>
+      <w:bookmarkStart w:id="12" w:name="_Toc237717612"/>
       <w:r>
         <w:rPr>
           <w:rFonts w:ascii="Georgia" w:hAnsi="Georgia"/>
@@ -9120,7 +9120,7 @@
         <w:pStyle w:val="Ttulo2"/>
         <w:spacing w:before="70" w:after="20"/>
       </w:pPr>
-      <w:bookmarkStart w:id="13" w:name="_Toc237715479"/>
+      <w:bookmarkStart w:id="13" w:name="_Toc237717613"/>
       <w:r>
         <w:rPr>
           <w:rFonts w:ascii="Georgia" w:hAnsi="Georgia"/>
@@ -9178,7 +9178,7 @@
                 <w:noProof/>
               </w:rPr>
               <w:drawing>
-                <wp:inline distT="0" distB="0" distL="0" distR="0" wp14:anchorId="73B47110" wp14:editId="6C625531">
+                <wp:inline distT="0" distB="0" distL="0" distR="0" wp14:anchorId="20D62FE2" wp14:editId="53F7C1A6">
                   <wp:extent cx="2926080" cy="1626307"/>
                   <wp:effectExtent l="0" t="0" r="0" b="0"/>
                   <wp:docPr id="7" name="Picture 7"/>
@@ -9237,7 +9237,7 @@
                 <w:noProof/>
               </w:rPr>
               <w:drawing>
-                <wp:inline distT="0" distB="0" distL="0" distR="0" wp14:anchorId="136B25AD" wp14:editId="10910E7B">
+                <wp:inline distT="0" distB="0" distL="0" distR="0" wp14:anchorId="62CCE142" wp14:editId="68EA86A7">
                   <wp:extent cx="2926080" cy="1479479"/>
                   <wp:effectExtent l="0" t="0" r="0" b="0"/>
                   <wp:docPr id="8" name="Picture 8"/>
@@ -9342,7 +9342,7 @@
         <w:pStyle w:val="Ttulo2"/>
         <w:spacing w:before="70" w:after="20"/>
       </w:pPr>
-      <w:bookmarkStart w:id="14" w:name="_Toc237715480"/>
+      <w:bookmarkStart w:id="14" w:name="_Toc237717614"/>
       <w:r>
         <w:rPr>
           <w:rFonts w:ascii="Georgia" w:hAnsi="Georgia"/>
@@ -9403,7 +9403,7 @@
                 <w:noProof/>
               </w:rPr>
               <w:drawing>
-                <wp:inline distT="0" distB="0" distL="0" distR="0" wp14:anchorId="27E533BE" wp14:editId="1EFEB633">
+                <wp:inline distT="0" distB="0" distL="0" distR="0" wp14:anchorId="083CA12B" wp14:editId="18FFA2B3">
                   <wp:extent cx="2926080" cy="1662311"/>
                   <wp:effectExtent l="0" t="0" r="0" b="0"/>
                   <wp:docPr id="9" name="Picture 9"/>
@@ -9462,7 +9462,7 @@
                 <w:noProof/>
               </w:rPr>
               <w:drawing>
-                <wp:inline distT="0" distB="0" distL="0" distR="0" wp14:anchorId="2CA08285" wp14:editId="24BBE071">
+                <wp:inline distT="0" distB="0" distL="0" distR="0" wp14:anchorId="221169B9" wp14:editId="111196A2">
                   <wp:extent cx="2926080" cy="1801004"/>
                   <wp:effectExtent l="0" t="0" r="0" b="0"/>
                   <wp:docPr id="10" name="Picture 10"/>
@@ -9567,7 +9567,7 @@
         <w:pStyle w:val="Ttulo1"/>
         <w:spacing w:before="100" w:after="30"/>
       </w:pPr>
-      <w:bookmarkStart w:id="15" w:name="_Toc237715481"/>
+      <w:bookmarkStart w:id="15" w:name="_Toc237717615"/>
       <w:r>
         <w:rPr>
           <w:rFonts w:ascii="Georgia" w:hAnsi="Georgia"/>
@@ -9583,7 +9583,7 @@
         <w:pStyle w:val="Ttulo2"/>
         <w:spacing w:before="70" w:after="20"/>
       </w:pPr>
-      <w:bookmarkStart w:id="16" w:name="_Toc237715482"/>
+      <w:bookmarkStart w:id="16" w:name="_Toc237717616"/>
       <w:r>
         <w:rPr>
           <w:rFonts w:ascii="Georgia" w:hAnsi="Georgia"/>
@@ -10022,7 +10022,7 @@
         <w:pStyle w:val="Ttulo2"/>
         <w:spacing w:before="70" w:after="20"/>
       </w:pPr>
-      <w:bookmarkStart w:id="17" w:name="_Toc237715483"/>
+      <w:bookmarkStart w:id="17" w:name="_Toc237717617"/>
       <w:r>
         <w:rPr>
           <w:rFonts w:ascii="Georgia" w:hAnsi="Georgia"/>
@@ -10050,7 +10050,7 @@
         <w:pStyle w:val="Ttulo1"/>
         <w:spacing w:before="100" w:after="30"/>
       </w:pPr>
-      <w:bookmarkStart w:id="18" w:name="_Toc237715484"/>
+      <w:bookmarkStart w:id="18" w:name="_Toc237717618"/>
       <w:r>
         <w:rPr>
           <w:rFonts w:ascii="Georgia" w:hAnsi="Georgia"/>
@@ -10066,7 +10066,7 @@
         <w:pStyle w:val="Ttulo2"/>
         <w:spacing w:before="70" w:after="20"/>
       </w:pPr>
-      <w:bookmarkStart w:id="19" w:name="_Toc237715485"/>
+      <w:bookmarkStart w:id="19" w:name="_Toc237717619"/>
       <w:r>
         <w:rPr>
           <w:rFonts w:ascii="Georgia" w:hAnsi="Georgia"/>
@@ -10093,7 +10093,7 @@
         <w:pStyle w:val="Ttulo2"/>
         <w:spacing w:before="70" w:after="20"/>
       </w:pPr>
-      <w:bookmarkStart w:id="20" w:name="_Toc237715486"/>
+      <w:bookmarkStart w:id="20" w:name="_Toc237717620"/>
       <w:r>
         <w:rPr>
           <w:rFonts w:ascii="Georgia" w:hAnsi="Georgia"/>
@@ -10151,7 +10151,7 @@
                 <w:noProof/>
               </w:rPr>
               <w:drawing>
-                <wp:inline distT="0" distB="0" distL="0" distR="0" wp14:anchorId="569E0466" wp14:editId="071BA37C">
+                <wp:inline distT="0" distB="0" distL="0" distR="0" wp14:anchorId="6ACC6FB5" wp14:editId="3FE66F0F">
                   <wp:extent cx="2926080" cy="1714660"/>
                   <wp:effectExtent l="0" t="0" r="0" b="0"/>
                   <wp:docPr id="11" name="Picture 11"/>
@@ -10210,7 +10210,7 @@
                 <w:noProof/>
               </w:rPr>
               <w:drawing>
-                <wp:inline distT="0" distB="0" distL="0" distR="0" wp14:anchorId="4A5B8B23" wp14:editId="34F5954F">
+                <wp:inline distT="0" distB="0" distL="0" distR="0" wp14:anchorId="063F797B" wp14:editId="4C240DCB">
                   <wp:extent cx="2926080" cy="1558188"/>
                   <wp:effectExtent l="0" t="0" r="0" b="0"/>
                   <wp:docPr id="12" name="Picture 12"/>
@@ -11180,7 +11180,7 @@
         <w:pStyle w:val="Ttulo1"/>
         <w:spacing w:before="100" w:after="30"/>
       </w:pPr>
-      <w:bookmarkStart w:id="21" w:name="_Toc237715487"/>
+      <w:bookmarkStart w:id="21" w:name="_Toc237717621"/>
       <w:r>
         <w:rPr>
           <w:rFonts w:ascii="Georgia" w:hAnsi="Georgia"/>
@@ -11197,7 +11197,7 @@
         <w:pStyle w:val="Ttulo2"/>
         <w:spacing w:before="70" w:after="20"/>
       </w:pPr>
-      <w:bookmarkStart w:id="22" w:name="_Toc237715488"/>
+      <w:bookmarkStart w:id="22" w:name="_Toc237717622"/>
       <w:r>
         <w:rPr>
           <w:rFonts w:ascii="Georgia" w:hAnsi="Georgia"/>
@@ -11289,7 +11289,7 @@
         <w:pStyle w:val="Ttulo2"/>
         <w:spacing w:before="70" w:after="20"/>
       </w:pPr>
-      <w:bookmarkStart w:id="23" w:name="_Toc237715489"/>
+      <w:bookmarkStart w:id="23" w:name="_Toc237717623"/>
       <w:r>
         <w:rPr>
           <w:rFonts w:ascii="Georgia" w:hAnsi="Georgia"/>
@@ -11520,7 +11520,7 @@
                 <w:noProof/>
               </w:rPr>
               <w:drawing>
-                <wp:inline distT="0" distB="0" distL="0" distR="0" wp14:anchorId="4C6DB823" wp14:editId="283DF8A6">
+                <wp:inline distT="0" distB="0" distL="0" distR="0" wp14:anchorId="1E3201BC" wp14:editId="7F794CBB">
                   <wp:extent cx="2926080" cy="1540391"/>
                   <wp:effectExtent l="0" t="0" r="0" b="0"/>
                   <wp:docPr id="13" name="Picture 13"/>
@@ -11579,7 +11579,7 @@
                 <w:noProof/>
               </w:rPr>
               <w:drawing>
-                <wp:inline distT="0" distB="0" distL="0" distR="0" wp14:anchorId="6C78BB4A" wp14:editId="6EB5EE8E">
+                <wp:inline distT="0" distB="0" distL="0" distR="0" wp14:anchorId="6B818E0E" wp14:editId="64338D1E">
                   <wp:extent cx="2926080" cy="1658038"/>
                   <wp:effectExtent l="0" t="0" r="0" b="0"/>
                   <wp:docPr id="14" name="Picture 14"/>
@@ -11684,7 +11684,7 @@
         <w:pStyle w:val="Ttulo2"/>
         <w:spacing w:before="70" w:after="20"/>
       </w:pPr>
-      <w:bookmarkStart w:id="24" w:name="_Toc237715490"/>
+      <w:bookmarkStart w:id="24" w:name="_Toc237717624"/>
       <w:r>
         <w:rPr>
           <w:rFonts w:ascii="Georgia" w:hAnsi="Georgia"/>
@@ -12612,7 +12612,7 @@
         <w:pStyle w:val="Ttulo1"/>
         <w:spacing w:before="100" w:after="30"/>
       </w:pPr>
-      <w:bookmarkStart w:id="25" w:name="_Toc237715491"/>
+      <w:bookmarkStart w:id="25" w:name="_Toc237717625"/>
       <w:r>
         <w:rPr>
           <w:rFonts w:ascii="Georgia" w:hAnsi="Georgia"/>
@@ -12628,7 +12628,7 @@
         <w:pStyle w:val="Ttulo2"/>
         <w:spacing w:before="70" w:after="20"/>
       </w:pPr>
-      <w:bookmarkStart w:id="26" w:name="_Toc237715492"/>
+      <w:bookmarkStart w:id="26" w:name="_Toc237717626"/>
       <w:r>
         <w:rPr>
           <w:rFonts w:ascii="Georgia" w:hAnsi="Georgia"/>
@@ -14217,7 +14217,7 @@
         <w:pStyle w:val="Ttulo2"/>
         <w:spacing w:before="70" w:after="20"/>
       </w:pPr>
-      <w:bookmarkStart w:id="27" w:name="_Toc237715493"/>
+      <w:bookmarkStart w:id="27" w:name="_Toc237717627"/>
       <w:r>
         <w:rPr>
           <w:rFonts w:ascii="Georgia" w:hAnsi="Georgia"/>
@@ -14327,7 +14327,7 @@
         <w:pStyle w:val="Ttulo1"/>
         <w:spacing w:before="100" w:after="30"/>
       </w:pPr>
-      <w:bookmarkStart w:id="28" w:name="_Toc237715494"/>
+      <w:bookmarkStart w:id="28" w:name="_Toc237717628"/>
       <w:r>
         <w:rPr>
           <w:rFonts w:ascii="Georgia" w:hAnsi="Georgia"/>
@@ -14344,7 +14344,7 @@
         <w:pStyle w:val="Ttulo2"/>
         <w:spacing w:before="70" w:after="20"/>
       </w:pPr>
-      <w:bookmarkStart w:id="29" w:name="_Toc237715495"/>
+      <w:bookmarkStart w:id="29" w:name="_Toc237717629"/>
       <w:r>
         <w:rPr>
           <w:rFonts w:ascii="Georgia" w:hAnsi="Georgia"/>
@@ -14371,7 +14371,7 @@
         <w:pStyle w:val="Ttulo2"/>
         <w:spacing w:before="70" w:after="20"/>
       </w:pPr>
-      <w:bookmarkStart w:id="30" w:name="_Toc237715496"/>
+      <w:bookmarkStart w:id="30" w:name="_Toc237717630"/>
       <w:r>
         <w:rPr>
           <w:rFonts w:ascii="Georgia" w:hAnsi="Georgia"/>
@@ -14429,7 +14429,7 @@
                 <w:noProof/>
               </w:rPr>
               <w:drawing>
-                <wp:inline distT="0" distB="0" distL="0" distR="0" wp14:anchorId="548DB459" wp14:editId="5B4C906C">
+                <wp:inline distT="0" distB="0" distL="0" distR="0" wp14:anchorId="28B9B69B" wp14:editId="779F11B3">
                   <wp:extent cx="2926080" cy="1534596"/>
                   <wp:effectExtent l="0" t="0" r="0" b="0"/>
                   <wp:docPr id="15" name="Picture 15"/>
@@ -14488,7 +14488,7 @@
                 <w:noProof/>
               </w:rPr>
               <w:drawing>
-                <wp:inline distT="0" distB="0" distL="0" distR="0" wp14:anchorId="234D7420" wp14:editId="6D6CB0E3">
+                <wp:inline distT="0" distB="0" distL="0" distR="0" wp14:anchorId="2C77057A" wp14:editId="6D19E020">
                   <wp:extent cx="2926080" cy="1680519"/>
                   <wp:effectExtent l="0" t="0" r="0" b="0"/>
                   <wp:docPr id="16" name="Picture 16"/>
@@ -14604,7 +14604,7 @@
         <w:pStyle w:val="Ttulo1"/>
         <w:spacing w:before="100" w:after="30"/>
       </w:pPr>
-      <w:bookmarkStart w:id="31" w:name="_Toc237715497"/>
+      <w:bookmarkStart w:id="31" w:name="_Toc237717631"/>
       <w:r>
         <w:rPr>
           <w:rFonts w:ascii="Georgia" w:hAnsi="Georgia"/>
@@ -14620,7 +14620,7 @@
         <w:pStyle w:val="Ttulo2"/>
         <w:spacing w:before="70" w:after="20"/>
       </w:pPr>
-      <w:bookmarkStart w:id="32" w:name="_Toc237715498"/>
+      <w:bookmarkStart w:id="32" w:name="_Toc237717632"/>
       <w:r>
         <w:rPr>
           <w:rFonts w:ascii="Georgia" w:hAnsi="Georgia"/>
@@ -15667,7 +15667,7 @@
         <w:pStyle w:val="Ttulo2"/>
         <w:spacing w:before="70" w:after="20"/>
       </w:pPr>
-      <w:bookmarkStart w:id="33" w:name="_Toc237715499"/>
+      <w:bookmarkStart w:id="33" w:name="_Toc237717633"/>
       <w:r>
         <w:rPr>
           <w:rFonts w:ascii="Georgia" w:hAnsi="Georgia"/>
@@ -15828,7 +15828,7 @@
         <w:pStyle w:val="Ttulo2"/>
         <w:spacing w:before="70" w:after="20"/>
       </w:pPr>
-      <w:bookmarkStart w:id="34" w:name="_Toc237715500"/>
+      <w:bookmarkStart w:id="34" w:name="_Toc237717634"/>
       <w:r>
         <w:rPr>
           <w:rFonts w:ascii="Georgia" w:hAnsi="Georgia"/>
@@ -15855,7 +15855,7 @@
         <w:pStyle w:val="Ttulo1"/>
         <w:spacing w:before="100" w:after="30"/>
       </w:pPr>
-      <w:bookmarkStart w:id="35" w:name="_Toc237715501"/>
+      <w:bookmarkStart w:id="35" w:name="_Toc237717635"/>
       <w:r>
         <w:rPr>
           <w:rFonts w:ascii="Georgia" w:hAnsi="Georgia"/>
@@ -15871,7 +15871,7 @@
         <w:pStyle w:val="Ttulo2"/>
         <w:spacing w:before="70" w:after="20"/>
       </w:pPr>
-      <w:bookmarkStart w:id="36" w:name="_Toc237715502"/>
+      <w:bookmarkStart w:id="36" w:name="_Toc237717636"/>
       <w:r>
         <w:rPr>
           <w:rFonts w:ascii="Georgia" w:hAnsi="Georgia"/>
@@ -18798,7 +18798,7 @@
         <w:pStyle w:val="Ttulo1"/>
         <w:spacing w:before="100" w:after="30"/>
       </w:pPr>
-      <w:bookmarkStart w:id="37" w:name="_Toc237715503"/>
+      <w:bookmarkStart w:id="37" w:name="_Toc237717637"/>
       <w:r>
         <w:rPr>
           <w:rFonts w:ascii="Georgia" w:hAnsi="Georgia"/>
@@ -18815,7 +18815,7 @@
         <w:pStyle w:val="Ttulo2"/>
         <w:spacing w:before="70" w:after="20"/>
       </w:pPr>
-      <w:bookmarkStart w:id="38" w:name="_Toc237715504"/>
+      <w:bookmarkStart w:id="38" w:name="_Toc237717638"/>
       <w:r>
         <w:rPr>
           <w:rFonts w:ascii="Georgia" w:hAnsi="Georgia"/>
@@ -19000,7 +19000,7 @@
         <w:pStyle w:val="Ttulo2"/>
         <w:spacing w:before="70" w:after="20"/>
       </w:pPr>
-      <w:bookmarkStart w:id="39" w:name="_Toc237715505"/>
+      <w:bookmarkStart w:id="39" w:name="_Toc237717639"/>
       <w:r>
         <w:rPr>
           <w:rFonts w:ascii="Georgia" w:hAnsi="Georgia"/>
@@ -19058,7 +19058,7 @@
                 <w:noProof/>
               </w:rPr>
               <w:drawing>
-                <wp:inline distT="0" distB="0" distL="0" distR="0" wp14:anchorId="7DCAD651" wp14:editId="698CEA51">
+                <wp:inline distT="0" distB="0" distL="0" distR="0" wp14:anchorId="14B81E6B" wp14:editId="7673ACD5">
                   <wp:extent cx="2926080" cy="1626569"/>
                   <wp:effectExtent l="0" t="0" r="0" b="0"/>
                   <wp:docPr id="17" name="Picture 17"/>
@@ -19117,7 +19117,7 @@
                 <w:noProof/>
               </w:rPr>
               <w:drawing>
-                <wp:inline distT="0" distB="0" distL="0" distR="0" wp14:anchorId="5E06203B" wp14:editId="2C0F6C79">
+                <wp:inline distT="0" distB="0" distL="0" distR="0" wp14:anchorId="4EBA6FE6" wp14:editId="6163A298">
                   <wp:extent cx="2926080" cy="1691675"/>
                   <wp:effectExtent l="0" t="0" r="0" b="0"/>
                   <wp:docPr id="18" name="Picture 18"/>
@@ -19222,7 +19222,7 @@
         <w:pStyle w:val="Ttulo2"/>
         <w:spacing w:before="70" w:after="20"/>
       </w:pPr>
-      <w:bookmarkStart w:id="40" w:name="_Toc237715506"/>
+      <w:bookmarkStart w:id="40" w:name="_Toc237717640"/>
       <w:r>
         <w:rPr>
           <w:rFonts w:ascii="Georgia" w:hAnsi="Georgia"/>
@@ -19851,7 +19851,7 @@
         <w:pStyle w:val="Ttulo1"/>
         <w:spacing w:before="100" w:after="30"/>
       </w:pPr>
-      <w:bookmarkStart w:id="41" w:name="_Toc237715507"/>
+      <w:bookmarkStart w:id="41" w:name="_Toc237717641"/>
       <w:r>
         <w:rPr>
           <w:rFonts w:ascii="Georgia" w:hAnsi="Georgia"/>
@@ -19867,7 +19867,7 @@
         <w:pStyle w:val="Ttulo2"/>
         <w:spacing w:before="70" w:after="20"/>
       </w:pPr>
-      <w:bookmarkStart w:id="42" w:name="_Toc237715508"/>
+      <w:bookmarkStart w:id="42" w:name="_Toc237717642"/>
       <w:r>
         <w:rPr>
           <w:rFonts w:ascii="Georgia" w:hAnsi="Georgia"/>
@@ -19925,7 +19925,7 @@
                 <w:noProof/>
               </w:rPr>
               <w:drawing>
-                <wp:inline distT="0" distB="0" distL="0" distR="0" wp14:anchorId="66C12D27" wp14:editId="1BEE3126">
+                <wp:inline distT="0" distB="0" distL="0" distR="0" wp14:anchorId="46618B78" wp14:editId="273043CD">
                   <wp:extent cx="2926080" cy="1495195"/>
                   <wp:effectExtent l="0" t="0" r="0" b="0"/>
                   <wp:docPr id="19" name="Picture 19"/>
@@ -19984,7 +19984,7 @@
                 <w:noProof/>
               </w:rPr>
               <w:drawing>
-                <wp:inline distT="0" distB="0" distL="0" distR="0" wp14:anchorId="1BE03B93" wp14:editId="045A35CC">
+                <wp:inline distT="0" distB="0" distL="0" distR="0" wp14:anchorId="01A5D4B6" wp14:editId="51DDF74C">
                   <wp:extent cx="2926080" cy="1682608"/>
                   <wp:effectExtent l="0" t="0" r="0" b="0"/>
                   <wp:docPr id="20" name="Picture 20"/>
@@ -21119,7 +21119,7 @@
         <w:pStyle w:val="Ttulo1"/>
         <w:spacing w:before="100" w:after="30"/>
       </w:pPr>
-      <w:bookmarkStart w:id="43" w:name="_Toc237715509"/>
+      <w:bookmarkStart w:id="43" w:name="_Toc237717643"/>
       <w:r>
         <w:rPr>
           <w:rFonts w:ascii="Georgia" w:hAnsi="Georgia"/>
@@ -21136,7 +21136,7 @@
         <w:pStyle w:val="Ttulo2"/>
         <w:spacing w:before="70" w:after="20"/>
       </w:pPr>
-      <w:bookmarkStart w:id="44" w:name="_Toc237715510"/>
+      <w:bookmarkStart w:id="44" w:name="_Toc237717644"/>
       <w:r>
         <w:rPr>
           <w:rFonts w:ascii="Georgia" w:hAnsi="Georgia"/>
@@ -21191,7 +21191,7 @@
         <w:pStyle w:val="Ttulo2"/>
         <w:spacing w:before="70" w:after="20"/>
       </w:pPr>
-      <w:bookmarkStart w:id="45" w:name="_Toc237715511"/>
+      <w:bookmarkStart w:id="45" w:name="_Toc237717645"/>
       <w:r>
         <w:rPr>
           <w:rFonts w:ascii="Georgia" w:hAnsi="Georgia"/>
@@ -21249,7 +21249,7 @@
                 <w:noProof/>
               </w:rPr>
               <w:drawing>
-                <wp:inline distT="0" distB="0" distL="0" distR="0" wp14:anchorId="13CE79DA" wp14:editId="73255026">
+                <wp:inline distT="0" distB="0" distL="0" distR="0" wp14:anchorId="4B650CC1" wp14:editId="7EA72DDD">
                   <wp:extent cx="2926080" cy="1682608"/>
                   <wp:effectExtent l="0" t="0" r="0" b="0"/>
                   <wp:docPr id="21" name="Picture 21"/>
@@ -21308,7 +21308,7 @@
                 <w:noProof/>
               </w:rPr>
               <w:drawing>
-                <wp:inline distT="0" distB="0" distL="0" distR="0" wp14:anchorId="7980A53B" wp14:editId="574FCA22">
+                <wp:inline distT="0" distB="0" distL="0" distR="0" wp14:anchorId="6E976ABF" wp14:editId="41E71E24">
                   <wp:extent cx="2926080" cy="1549755"/>
                   <wp:effectExtent l="0" t="0" r="0" b="0"/>
                   <wp:docPr id="22" name="Picture 22"/>
@@ -21413,7 +21413,7 @@
         <w:pStyle w:val="Ttulo1"/>
         <w:spacing w:before="100" w:after="30"/>
       </w:pPr>
-      <w:bookmarkStart w:id="46" w:name="_Toc237715512"/>
+      <w:bookmarkStart w:id="46" w:name="_Toc237717646"/>
       <w:r>
         <w:rPr>
           <w:rFonts w:ascii="Georgia" w:hAnsi="Georgia"/>
@@ -21429,7 +21429,7 @@
         <w:pStyle w:val="Ttulo2"/>
         <w:spacing w:before="70" w:after="20"/>
       </w:pPr>
-      <w:bookmarkStart w:id="47" w:name="_Toc237715513"/>
+      <w:bookmarkStart w:id="47" w:name="_Toc237717647"/>
       <w:r>
         <w:rPr>
           <w:rFonts w:ascii="Georgia" w:hAnsi="Georgia"/>
@@ -22977,7 +22977,7 @@
         <w:pStyle w:val="Ttulo1"/>
         <w:spacing w:before="100" w:after="30"/>
       </w:pPr>
-      <w:bookmarkStart w:id="48" w:name="_Toc237715514"/>
+      <w:bookmarkStart w:id="48" w:name="_Toc237717648"/>
       <w:r>
         <w:rPr>
           <w:rFonts w:ascii="Georgia" w:hAnsi="Georgia"/>
@@ -22994,7 +22994,7 @@
         <w:pStyle w:val="Ttulo2"/>
         <w:spacing w:before="70" w:after="20"/>
       </w:pPr>
-      <w:bookmarkStart w:id="49" w:name="_Toc237715515"/>
+      <w:bookmarkStart w:id="49" w:name="_Toc237717649"/>
       <w:r>
         <w:rPr>
           <w:rFonts w:ascii="Georgia" w:hAnsi="Georgia"/>
@@ -23117,7 +23117,7 @@
                 <w:noProof/>
               </w:rPr>
               <w:drawing>
-                <wp:inline distT="0" distB="0" distL="0" distR="0" wp14:anchorId="2B0A6460" wp14:editId="48B9918A">
+                <wp:inline distT="0" distB="0" distL="0" distR="0" wp14:anchorId="5A7C358D" wp14:editId="6A1F4055">
                   <wp:extent cx="2926080" cy="1695124"/>
                   <wp:effectExtent l="0" t="0" r="0" b="0"/>
                   <wp:docPr id="23" name="Picture 23"/>
@@ -23176,7 +23176,7 @@
                 <w:noProof/>
               </w:rPr>
               <w:drawing>
-                <wp:inline distT="0" distB="0" distL="0" distR="0" wp14:anchorId="12112CBC" wp14:editId="37EDD45B">
+                <wp:inline distT="0" distB="0" distL="0" distR="0" wp14:anchorId="4BF3DC1D" wp14:editId="65501934">
                   <wp:extent cx="2926080" cy="1572627"/>
                   <wp:effectExtent l="0" t="0" r="0" b="0"/>
                   <wp:docPr id="24" name="Picture 24"/>
@@ -23281,7 +23281,7 @@
         <w:pStyle w:val="Ttulo2"/>
         <w:spacing w:before="70" w:after="20"/>
       </w:pPr>
-      <w:bookmarkStart w:id="50" w:name="_Toc237715516"/>
+      <w:bookmarkStart w:id="50" w:name="_Toc237717650"/>
       <w:r>
         <w:rPr>
           <w:rFonts w:ascii="Georgia" w:hAnsi="Georgia"/>
@@ -24016,7 +24016,7 @@
         <w:pStyle w:val="Ttulo2"/>
         <w:spacing w:before="70" w:after="20"/>
       </w:pPr>
-      <w:bookmarkStart w:id="51" w:name="_Toc237715517"/>
+      <w:bookmarkStart w:id="51" w:name="_Toc237717651"/>
       <w:r>
         <w:rPr>
           <w:rFonts w:ascii="Georgia" w:hAnsi="Georgia"/>
@@ -24066,7 +24066,7 @@
         <w:pStyle w:val="Ttulo2"/>
         <w:spacing w:before="70" w:after="20"/>
       </w:pPr>
-      <w:bookmarkStart w:id="52" w:name="_Toc237715518"/>
+      <w:bookmarkStart w:id="52" w:name="_Toc237717652"/>
       <w:r>
         <w:rPr>
           <w:rFonts w:ascii="Georgia" w:hAnsi="Georgia"/>
@@ -24147,7 +24147,7 @@
                 <w:noProof/>
               </w:rPr>
               <w:drawing>
-                <wp:inline distT="0" distB="0" distL="0" distR="0" wp14:anchorId="39F87968" wp14:editId="0C56562A">
+                <wp:inline distT="0" distB="0" distL="0" distR="0" wp14:anchorId="4CE3C378" wp14:editId="58CEBBCB">
                   <wp:extent cx="2926080" cy="1696900"/>
                   <wp:effectExtent l="0" t="0" r="0" b="0"/>
                   <wp:docPr id="25" name="Picture 25"/>
@@ -24206,7 +24206,7 @@
                 <w:noProof/>
               </w:rPr>
               <w:drawing>
-                <wp:inline distT="0" distB="0" distL="0" distR="0" wp14:anchorId="67343264" wp14:editId="587E1BD1">
+                <wp:inline distT="0" distB="0" distL="0" distR="0" wp14:anchorId="0E07357D" wp14:editId="459BAE9D">
                   <wp:extent cx="2926080" cy="1614092"/>
                   <wp:effectExtent l="0" t="0" r="0" b="0"/>
                   <wp:docPr id="26" name="Picture 26"/>
@@ -25231,7 +25231,7 @@
         <w:pStyle w:val="Ttulo2"/>
         <w:spacing w:before="70" w:after="20"/>
       </w:pPr>
-      <w:bookmarkStart w:id="53" w:name="_Toc237715519"/>
+      <w:bookmarkStart w:id="53" w:name="_Toc237717653"/>
       <w:r>
         <w:rPr>
           <w:rFonts w:ascii="Georgia" w:hAnsi="Georgia"/>
@@ -25289,7 +25289,7 @@
                 <w:noProof/>
               </w:rPr>
               <w:drawing>
-                <wp:inline distT="0" distB="0" distL="0" distR="0" wp14:anchorId="78FDF392" wp14:editId="41760F4A">
+                <wp:inline distT="0" distB="0" distL="0" distR="0" wp14:anchorId="00868B57" wp14:editId="449C34F7">
                   <wp:extent cx="2926080" cy="1654733"/>
                   <wp:effectExtent l="0" t="0" r="0" b="0"/>
                   <wp:docPr id="27" name="Picture 27"/>
@@ -25348,7 +25348,7 @@
                 <w:noProof/>
               </w:rPr>
               <w:drawing>
-                <wp:inline distT="0" distB="0" distL="0" distR="0" wp14:anchorId="69356F69" wp14:editId="41FFEDB4">
+                <wp:inline distT="0" distB="0" distL="0" distR="0" wp14:anchorId="37A8AF97" wp14:editId="5D64FA36">
                   <wp:extent cx="2926080" cy="1698212"/>
                   <wp:effectExtent l="0" t="0" r="0" b="0"/>
                   <wp:docPr id="28" name="Picture 28"/>
@@ -25463,7 +25463,7 @@
         <w:pStyle w:val="Ttulo1"/>
         <w:spacing w:before="100" w:after="30"/>
       </w:pPr>
-      <w:bookmarkStart w:id="54" w:name="_Toc237715520"/>
+      <w:bookmarkStart w:id="54" w:name="_Toc237717654"/>
       <w:r>
         <w:rPr>
           <w:rFonts w:ascii="Georgia" w:hAnsi="Georgia"/>
@@ -25480,7 +25480,7 @@
         <w:pStyle w:val="Ttulo2"/>
         <w:spacing w:before="70" w:after="20"/>
       </w:pPr>
-      <w:bookmarkStart w:id="55" w:name="_Toc237715521"/>
+      <w:bookmarkStart w:id="55" w:name="_Toc237717655"/>
       <w:r>
         <w:rPr>
           <w:rFonts w:ascii="Georgia" w:hAnsi="Georgia"/>
@@ -25541,7 +25541,7 @@
         <w:pStyle w:val="Ttulo2"/>
         <w:spacing w:before="70" w:after="20"/>
       </w:pPr>
-      <w:bookmarkStart w:id="56" w:name="_Toc237715522"/>
+      <w:bookmarkStart w:id="56" w:name="_Toc237717656"/>
       <w:r>
         <w:rPr>
           <w:rFonts w:ascii="Georgia" w:hAnsi="Georgia"/>
@@ -25616,7 +25616,7 @@
                 <w:noProof/>
               </w:rPr>
               <w:drawing>
-                <wp:inline distT="0" distB="0" distL="0" distR="0" wp14:anchorId="124EF513" wp14:editId="7A1C95D7">
+                <wp:inline distT="0" distB="0" distL="0" distR="0" wp14:anchorId="05DFD8F7" wp14:editId="77932C0E">
                   <wp:extent cx="2926080" cy="1650045"/>
                   <wp:effectExtent l="0" t="0" r="0" b="0"/>
                   <wp:docPr id="29" name="Picture 29"/>
@@ -25675,7 +25675,7 @@
                 <w:noProof/>
               </w:rPr>
               <w:drawing>
-                <wp:inline distT="0" distB="0" distL="0" distR="0" wp14:anchorId="35AD654C" wp14:editId="5813E8C1">
+                <wp:inline distT="0" distB="0" distL="0" distR="0" wp14:anchorId="640E1B5B" wp14:editId="0C3C5F15">
                   <wp:extent cx="2926080" cy="1611196"/>
                   <wp:effectExtent l="0" t="0" r="0" b="0"/>
                   <wp:docPr id="30" name="Picture 30"/>
@@ -26163,7 +26163,7 @@
         <w:pStyle w:val="Ttulo2"/>
         <w:spacing w:before="70" w:after="20"/>
       </w:pPr>
-      <w:bookmarkStart w:id="57" w:name="_Toc237715523"/>
+      <w:bookmarkStart w:id="57" w:name="_Toc237717657"/>
       <w:r>
         <w:rPr>
           <w:rFonts w:ascii="Georgia" w:hAnsi="Georgia"/>
@@ -26237,7 +26237,7 @@
                 <w:noProof/>
               </w:rPr>
               <w:drawing>
-                <wp:inline distT="0" distB="0" distL="0" distR="0" wp14:anchorId="0ED50D48" wp14:editId="1E6B3C7B">
+                <wp:inline distT="0" distB="0" distL="0" distR="0" wp14:anchorId="03186720" wp14:editId="5A38D678">
                   <wp:extent cx="2926080" cy="1687777"/>
                   <wp:effectExtent l="0" t="0" r="0" b="0"/>
                   <wp:docPr id="31" name="Picture 31"/>
@@ -26832,7 +26832,7 @@
         <w:pStyle w:val="Ttulo2"/>
         <w:spacing w:before="70" w:after="20"/>
       </w:pPr>
-      <w:bookmarkStart w:id="58" w:name="_Toc237715524"/>
+      <w:bookmarkStart w:id="58" w:name="_Toc237717658"/>
       <w:r>
         <w:rPr>
           <w:rFonts w:ascii="Georgia" w:hAnsi="Georgia"/>
@@ -28091,7 +28091,7 @@
         <w:pStyle w:val="Ttulo1"/>
         <w:spacing w:before="100" w:after="30"/>
       </w:pPr>
-      <w:bookmarkStart w:id="59" w:name="_Toc237715525"/>
+      <w:bookmarkStart w:id="59" w:name="_Toc237717659"/>
       <w:r>
         <w:rPr>
           <w:rFonts w:ascii="Georgia" w:hAnsi="Georgia"/>
@@ -28279,7 +28279,7 @@
         <w:pStyle w:val="Ttulo1"/>
         <w:spacing w:before="100" w:after="30"/>
       </w:pPr>
-      <w:bookmarkStart w:id="60" w:name="_Toc237715526"/>
+      <w:bookmarkStart w:id="60" w:name="_Toc237717660"/>
       <w:r>
         <w:rPr>
           <w:rFonts w:ascii="Georgia" w:hAnsi="Georgia"/>
@@ -37408,7 +37408,7 @@
         <w:pStyle w:val="Ttulo1"/>
         <w:spacing w:before="100" w:after="30"/>
       </w:pPr>
-      <w:bookmarkStart w:id="61" w:name="_Toc237715527"/>
+      <w:bookmarkStart w:id="61" w:name="_Toc237717661"/>
       <w:r>
         <w:rPr>
           <w:rFonts w:ascii="Georgia" w:hAnsi="Georgia"/>
@@ -37880,7 +37880,7 @@
         <w:pStyle w:val="Ttulo1"/>
         <w:spacing w:before="100" w:after="30"/>
       </w:pPr>
-      <w:bookmarkStart w:id="62" w:name="_Toc237715528"/>
+      <w:bookmarkStart w:id="62" w:name="_Toc237717662"/>
       <w:r>
         <w:rPr>
           <w:rFonts w:ascii="Georgia" w:hAnsi="Georgia"/>
@@ -38384,31 +38384,31 @@
       </w:rPr>
     </w:lvl>
   </w:abstractNum>
-  <w:num w:numId="1" w16cid:durableId="1192918321">
+  <w:num w:numId="1" w16cid:durableId="245845060">
     <w:abstractNumId w:val="8"/>
   </w:num>
-  <w:num w:numId="2" w16cid:durableId="1821725797">
+  <w:num w:numId="2" w16cid:durableId="648097607">
     <w:abstractNumId w:val="6"/>
   </w:num>
-  <w:num w:numId="3" w16cid:durableId="983434877">
+  <w:num w:numId="3" w16cid:durableId="1090738369">
     <w:abstractNumId w:val="5"/>
   </w:num>
-  <w:num w:numId="4" w16cid:durableId="424963772">
+  <w:num w:numId="4" w16cid:durableId="1179613204">
     <w:abstractNumId w:val="4"/>
   </w:num>
-  <w:num w:numId="5" w16cid:durableId="1110397190">
+  <w:num w:numId="5" w16cid:durableId="1194415086">
     <w:abstractNumId w:val="7"/>
   </w:num>
-  <w:num w:numId="6" w16cid:durableId="66731868">
+  <w:num w:numId="6" w16cid:durableId="894270959">
     <w:abstractNumId w:val="3"/>
   </w:num>
-  <w:num w:numId="7" w16cid:durableId="413357170">
+  <w:num w:numId="7" w16cid:durableId="717513006">
     <w:abstractNumId w:val="2"/>
   </w:num>
-  <w:num w:numId="8" w16cid:durableId="775634576">
+  <w:num w:numId="8" w16cid:durableId="348414378">
     <w:abstractNumId w:val="1"/>
   </w:num>
-  <w:num w:numId="9" w16cid:durableId="1812209141">
+  <w:num w:numId="9" w16cid:durableId="1694768777">
     <w:abstractNumId w:val="0"/>
   </w:num>
 </w:numbering>
@@ -49840,7 +49840,7 @@
     <w:autoRedefine/>
     <w:uiPriority w:val="39"/>
     <w:unhideWhenUsed/>
-    <w:rsid w:val="002F1912"/>
+    <w:rsid w:val="006864CA"/>
     <w:pPr>
       <w:spacing w:before="10" w:after="10" w:line="240" w:lineRule="auto"/>
     </w:pPr>
@@ -49855,7 +49855,7 @@
     <w:autoRedefine/>
     <w:uiPriority w:val="39"/>
     <w:unhideWhenUsed/>
-    <w:rsid w:val="002F1912"/>
+    <w:rsid w:val="006864CA"/>
     <w:pPr>
       <w:spacing w:after="0" w:line="240" w:lineRule="auto"/>
       <w:ind w:left="170"/>
@@ -49869,7 +49869,7 @@
     <w:basedOn w:val="Fuentedeprrafopredeter"/>
     <w:uiPriority w:val="99"/>
     <w:unhideWhenUsed/>
-    <w:rsid w:val="002F1912"/>
+    <w:rsid w:val="006864CA"/>
     <w:rPr>
       <w:color w:val="0000FF" w:themeColor="hyperlink"/>
       <w:u w:val="single"/>

</xml_diff>

<commit_message>
style(reporte): Eliminar muletillas de broker, limpiar aviso legal en portada y formalizar descargo institucional en pagina 2
</commit_message>
<xml_diff>
--- a/01_Reporte_PDF/Informe_Valuacion_Aluar_UNCuyo.docx
+++ b/01_Reporte_PDF/Informe_Valuacion_Aluar_UNCuyo.docx
@@ -117,20 +117,11 @@
       </w:pPr>
       <w:r>
         <w:rPr>
-          <w:b/>
           <w:i/>
           <w:color w:val="4A4A4A"/>
           <w:sz w:val="14"/>
         </w:rPr>
-        <w:t>Aviso legal inicial:</w:t>
-      </w:r>
-      <w:r>
-        <w:rPr>
-          <w:i/>
-          <w:color w:val="4A4A4A"/>
-          <w:sz w:val="14"/>
-        </w:rPr>
-        <w:t xml:space="preserve"> Documento de análisis financiero y estudio académico independiente. No constituye oferta de compra, venta ni asesoramiento financiero en los términos de la Ley N.º 26.831. Las valuaciones reflejan estimaciones del autor fundamentadas en estados contables públicos y modelos financieros estocásticos. Ver el descargo legal completo y certificación del analista en la sección final de este informe.</w:t>
+        <w:t>Documento de análisis financiero independiente. Para el descargo de responsabilidad legal y certificaciones (Ley N.º 26.831), consulte la página 2 y la sección final de este informe.</w:t>
       </w:r>
     </w:p>
     <w:tbl>
@@ -184,7 +175,7 @@
               <w:rPr>
                 <w:sz w:val="16"/>
               </w:rPr>
-              <w:t xml:space="preserve">Iniciamos cobertura de </w:t>
+              <w:t xml:space="preserve">Se presenta la valuación fundamental de </w:t>
             </w:r>
             <w:r>
               <w:rPr>
@@ -210,7 +201,7 @@
               <w:rPr>
                 <w:sz w:val="16"/>
               </w:rPr>
-              <w:t xml:space="preserve"> y un precio objetivo fundamental a 12 meses de </w:t>
+              <w:t xml:space="preserve"> y un precio objetivo a 12 meses de </w:t>
             </w:r>
             <w:r>
               <w:rPr>
@@ -403,7 +394,7 @@
                       <w:color w:val="4A4A4A"/>
                       <w:sz w:val="15"/>
                     </w:rPr>
-                    <w:t>Dictamen del Modelo Teórico de Valuación</w:t>
+                    <w:t>Dictamen del Modelo Teórico</w:t>
                   </w:r>
                 </w:p>
                 <w:p>
@@ -1339,7 +1330,7 @@
         </w:rPr>
         <w:fldChar w:fldCharType="separate"/>
       </w:r>
-      <w:hyperlink w:anchor="_Toc237717600" w:history="1">
+      <w:hyperlink w:anchor="_Toc237718591" w:history="1">
         <w:r>
           <w:rPr>
             <w:rStyle w:val="Hipervnculo"/>
@@ -1366,7 +1357,7 @@
             <w:noProof/>
             <w:webHidden/>
           </w:rPr>
-          <w:instrText xml:space="preserve"> PAGEREF _Toc237717600 \h </w:instrText>
+          <w:instrText xml:space="preserve"> PAGEREF _Toc237718591 \h </w:instrText>
         </w:r>
         <w:r>
           <w:rPr>
@@ -1413,7 +1404,7 @@
           <w14:ligatures w14:val="standardContextual"/>
         </w:rPr>
       </w:pPr>
-      <w:hyperlink w:anchor="_Toc237717601" w:history="1">
+      <w:hyperlink w:anchor="_Toc237718592" w:history="1">
         <w:r>
           <w:rPr>
             <w:rStyle w:val="Hipervnculo"/>
@@ -1440,7 +1431,7 @@
             <w:noProof/>
             <w:webHidden/>
           </w:rPr>
-          <w:instrText xml:space="preserve"> PAGEREF _Toc237717601 \h </w:instrText>
+          <w:instrText xml:space="preserve"> PAGEREF _Toc237718592 \h </w:instrText>
         </w:r>
         <w:r>
           <w:rPr>
@@ -1487,7 +1478,7 @@
           <w14:ligatures w14:val="standardContextual"/>
         </w:rPr>
       </w:pPr>
-      <w:hyperlink w:anchor="_Toc237717602" w:history="1">
+      <w:hyperlink w:anchor="_Toc237718593" w:history="1">
         <w:r>
           <w:rPr>
             <w:rStyle w:val="Hipervnculo"/>
@@ -1514,7 +1505,7 @@
             <w:noProof/>
             <w:webHidden/>
           </w:rPr>
-          <w:instrText xml:space="preserve"> PAGEREF _Toc237717602 \h </w:instrText>
+          <w:instrText xml:space="preserve"> PAGEREF _Toc237718593 \h </w:instrText>
         </w:r>
         <w:r>
           <w:rPr>
@@ -1561,7 +1552,7 @@
           <w14:ligatures w14:val="standardContextual"/>
         </w:rPr>
       </w:pPr>
-      <w:hyperlink w:anchor="_Toc237717603" w:history="1">
+      <w:hyperlink w:anchor="_Toc237718594" w:history="1">
         <w:r>
           <w:rPr>
             <w:rStyle w:val="Hipervnculo"/>
@@ -1588,7 +1579,7 @@
             <w:noProof/>
             <w:webHidden/>
           </w:rPr>
-          <w:instrText xml:space="preserve"> PAGEREF _Toc237717603 \h </w:instrText>
+          <w:instrText xml:space="preserve"> PAGEREF _Toc237718594 \h </w:instrText>
         </w:r>
         <w:r>
           <w:rPr>
@@ -1635,7 +1626,7 @@
           <w14:ligatures w14:val="standardContextual"/>
         </w:rPr>
       </w:pPr>
-      <w:hyperlink w:anchor="_Toc237717604" w:history="1">
+      <w:hyperlink w:anchor="_Toc237718595" w:history="1">
         <w:r>
           <w:rPr>
             <w:rStyle w:val="Hipervnculo"/>
@@ -1662,7 +1653,7 @@
             <w:noProof/>
             <w:webHidden/>
           </w:rPr>
-          <w:instrText xml:space="preserve"> PAGEREF _Toc237717604 \h </w:instrText>
+          <w:instrText xml:space="preserve"> PAGEREF _Toc237718595 \h </w:instrText>
         </w:r>
         <w:r>
           <w:rPr>
@@ -1709,7 +1700,7 @@
           <w14:ligatures w14:val="standardContextual"/>
         </w:rPr>
       </w:pPr>
-      <w:hyperlink w:anchor="_Toc237717605" w:history="1">
+      <w:hyperlink w:anchor="_Toc237718596" w:history="1">
         <w:r>
           <w:rPr>
             <w:rStyle w:val="Hipervnculo"/>
@@ -1736,7 +1727,7 @@
             <w:noProof/>
             <w:webHidden/>
           </w:rPr>
-          <w:instrText xml:space="preserve"> PAGEREF _Toc237717605 \h </w:instrText>
+          <w:instrText xml:space="preserve"> PAGEREF _Toc237718596 \h </w:instrText>
         </w:r>
         <w:r>
           <w:rPr>
@@ -1783,7 +1774,7 @@
           <w14:ligatures w14:val="standardContextual"/>
         </w:rPr>
       </w:pPr>
-      <w:hyperlink w:anchor="_Toc237717606" w:history="1">
+      <w:hyperlink w:anchor="_Toc237718597" w:history="1">
         <w:r>
           <w:rPr>
             <w:rStyle w:val="Hipervnculo"/>
@@ -1810,7 +1801,7 @@
             <w:noProof/>
             <w:webHidden/>
           </w:rPr>
-          <w:instrText xml:space="preserve"> PAGEREF _Toc237717606 \h </w:instrText>
+          <w:instrText xml:space="preserve"> PAGEREF _Toc237718597 \h </w:instrText>
         </w:r>
         <w:r>
           <w:rPr>
@@ -1857,7 +1848,7 @@
           <w14:ligatures w14:val="standardContextual"/>
         </w:rPr>
       </w:pPr>
-      <w:hyperlink w:anchor="_Toc237717607" w:history="1">
+      <w:hyperlink w:anchor="_Toc237718598" w:history="1">
         <w:r>
           <w:rPr>
             <w:rStyle w:val="Hipervnculo"/>
@@ -1884,7 +1875,7 @@
             <w:noProof/>
             <w:webHidden/>
           </w:rPr>
-          <w:instrText xml:space="preserve"> PAGEREF _Toc237717607 \h </w:instrText>
+          <w:instrText xml:space="preserve"> PAGEREF _Toc237718598 \h </w:instrText>
         </w:r>
         <w:r>
           <w:rPr>
@@ -1931,7 +1922,7 @@
           <w14:ligatures w14:val="standardContextual"/>
         </w:rPr>
       </w:pPr>
-      <w:hyperlink w:anchor="_Toc237717608" w:history="1">
+      <w:hyperlink w:anchor="_Toc237718599" w:history="1">
         <w:r>
           <w:rPr>
             <w:rStyle w:val="Hipervnculo"/>
@@ -1958,7 +1949,7 @@
             <w:noProof/>
             <w:webHidden/>
           </w:rPr>
-          <w:instrText xml:space="preserve"> PAGEREF _Toc237717608 \h </w:instrText>
+          <w:instrText xml:space="preserve"> PAGEREF _Toc237718599 \h </w:instrText>
         </w:r>
         <w:r>
           <w:rPr>
@@ -2005,7 +1996,7 @@
           <w14:ligatures w14:val="standardContextual"/>
         </w:rPr>
       </w:pPr>
-      <w:hyperlink w:anchor="_Toc237717609" w:history="1">
+      <w:hyperlink w:anchor="_Toc237718600" w:history="1">
         <w:r>
           <w:rPr>
             <w:rStyle w:val="Hipervnculo"/>
@@ -2032,7 +2023,7 @@
             <w:noProof/>
             <w:webHidden/>
           </w:rPr>
-          <w:instrText xml:space="preserve"> PAGEREF _Toc237717609 \h </w:instrText>
+          <w:instrText xml:space="preserve"> PAGEREF _Toc237718600 \h </w:instrText>
         </w:r>
         <w:r>
           <w:rPr>
@@ -2079,7 +2070,7 @@
           <w14:ligatures w14:val="standardContextual"/>
         </w:rPr>
       </w:pPr>
-      <w:hyperlink w:anchor="_Toc237717610" w:history="1">
+      <w:hyperlink w:anchor="_Toc237718601" w:history="1">
         <w:r>
           <w:rPr>
             <w:rStyle w:val="Hipervnculo"/>
@@ -2106,7 +2097,7 @@
             <w:noProof/>
             <w:webHidden/>
           </w:rPr>
-          <w:instrText xml:space="preserve"> PAGEREF _Toc237717610 \h </w:instrText>
+          <w:instrText xml:space="preserve"> PAGEREF _Toc237718601 \h </w:instrText>
         </w:r>
         <w:r>
           <w:rPr>
@@ -2153,7 +2144,7 @@
           <w14:ligatures w14:val="standardContextual"/>
         </w:rPr>
       </w:pPr>
-      <w:hyperlink w:anchor="_Toc237717611" w:history="1">
+      <w:hyperlink w:anchor="_Toc237718602" w:history="1">
         <w:r>
           <w:rPr>
             <w:rStyle w:val="Hipervnculo"/>
@@ -2180,7 +2171,7 @@
             <w:noProof/>
             <w:webHidden/>
           </w:rPr>
-          <w:instrText xml:space="preserve"> PAGEREF _Toc237717611 \h </w:instrText>
+          <w:instrText xml:space="preserve"> PAGEREF _Toc237718602 \h </w:instrText>
         </w:r>
         <w:r>
           <w:rPr>
@@ -2227,7 +2218,7 @@
           <w14:ligatures w14:val="standardContextual"/>
         </w:rPr>
       </w:pPr>
-      <w:hyperlink w:anchor="_Toc237717612" w:history="1">
+      <w:hyperlink w:anchor="_Toc237718603" w:history="1">
         <w:r>
           <w:rPr>
             <w:rStyle w:val="Hipervnculo"/>
@@ -2254,7 +2245,7 @@
             <w:noProof/>
             <w:webHidden/>
           </w:rPr>
-          <w:instrText xml:space="preserve"> PAGEREF _Toc237717612 \h </w:instrText>
+          <w:instrText xml:space="preserve"> PAGEREF _Toc237718603 \h </w:instrText>
         </w:r>
         <w:r>
           <w:rPr>
@@ -2301,7 +2292,7 @@
           <w14:ligatures w14:val="standardContextual"/>
         </w:rPr>
       </w:pPr>
-      <w:hyperlink w:anchor="_Toc237717613" w:history="1">
+      <w:hyperlink w:anchor="_Toc237718604" w:history="1">
         <w:r>
           <w:rPr>
             <w:rStyle w:val="Hipervnculo"/>
@@ -2328,7 +2319,7 @@
             <w:noProof/>
             <w:webHidden/>
           </w:rPr>
-          <w:instrText xml:space="preserve"> PAGEREF _Toc237717613 \h </w:instrText>
+          <w:instrText xml:space="preserve"> PAGEREF _Toc237718604 \h </w:instrText>
         </w:r>
         <w:r>
           <w:rPr>
@@ -2375,7 +2366,7 @@
           <w14:ligatures w14:val="standardContextual"/>
         </w:rPr>
       </w:pPr>
-      <w:hyperlink w:anchor="_Toc237717614" w:history="1">
+      <w:hyperlink w:anchor="_Toc237718605" w:history="1">
         <w:r>
           <w:rPr>
             <w:rStyle w:val="Hipervnculo"/>
@@ -2402,7 +2393,7 @@
             <w:noProof/>
             <w:webHidden/>
           </w:rPr>
-          <w:instrText xml:space="preserve"> PAGEREF _Toc237717614 \h </w:instrText>
+          <w:instrText xml:space="preserve"> PAGEREF _Toc237718605 \h </w:instrText>
         </w:r>
         <w:r>
           <w:rPr>
@@ -2449,7 +2440,7 @@
           <w14:ligatures w14:val="standardContextual"/>
         </w:rPr>
       </w:pPr>
-      <w:hyperlink w:anchor="_Toc237717615" w:history="1">
+      <w:hyperlink w:anchor="_Toc237718606" w:history="1">
         <w:r>
           <w:rPr>
             <w:rStyle w:val="Hipervnculo"/>
@@ -2476,7 +2467,7 @@
             <w:noProof/>
             <w:webHidden/>
           </w:rPr>
-          <w:instrText xml:space="preserve"> PAGEREF _Toc237717615 \h </w:instrText>
+          <w:instrText xml:space="preserve"> PAGEREF _Toc237718606 \h </w:instrText>
         </w:r>
         <w:r>
           <w:rPr>
@@ -2523,7 +2514,7 @@
           <w14:ligatures w14:val="standardContextual"/>
         </w:rPr>
       </w:pPr>
-      <w:hyperlink w:anchor="_Toc237717616" w:history="1">
+      <w:hyperlink w:anchor="_Toc237718607" w:history="1">
         <w:r>
           <w:rPr>
             <w:rStyle w:val="Hipervnculo"/>
@@ -2550,7 +2541,7 @@
             <w:noProof/>
             <w:webHidden/>
           </w:rPr>
-          <w:instrText xml:space="preserve"> PAGEREF _Toc237717616 \h </w:instrText>
+          <w:instrText xml:space="preserve"> PAGEREF _Toc237718607 \h </w:instrText>
         </w:r>
         <w:r>
           <w:rPr>
@@ -2597,7 +2588,7 @@
           <w14:ligatures w14:val="standardContextual"/>
         </w:rPr>
       </w:pPr>
-      <w:hyperlink w:anchor="_Toc237717617" w:history="1">
+      <w:hyperlink w:anchor="_Toc237718608" w:history="1">
         <w:r>
           <w:rPr>
             <w:rStyle w:val="Hipervnculo"/>
@@ -2624,7 +2615,7 @@
             <w:noProof/>
             <w:webHidden/>
           </w:rPr>
-          <w:instrText xml:space="preserve"> PAGEREF _Toc237717617 \h </w:instrText>
+          <w:instrText xml:space="preserve"> PAGEREF _Toc237718608 \h </w:instrText>
         </w:r>
         <w:r>
           <w:rPr>
@@ -2671,7 +2662,7 @@
           <w14:ligatures w14:val="standardContextual"/>
         </w:rPr>
       </w:pPr>
-      <w:hyperlink w:anchor="_Toc237717618" w:history="1">
+      <w:hyperlink w:anchor="_Toc237718609" w:history="1">
         <w:r>
           <w:rPr>
             <w:rStyle w:val="Hipervnculo"/>
@@ -2698,7 +2689,7 @@
             <w:noProof/>
             <w:webHidden/>
           </w:rPr>
-          <w:instrText xml:space="preserve"> PAGEREF _Toc237717618 \h </w:instrText>
+          <w:instrText xml:space="preserve"> PAGEREF _Toc237718609 \h </w:instrText>
         </w:r>
         <w:r>
           <w:rPr>
@@ -2745,7 +2736,7 @@
           <w14:ligatures w14:val="standardContextual"/>
         </w:rPr>
       </w:pPr>
-      <w:hyperlink w:anchor="_Toc237717619" w:history="1">
+      <w:hyperlink w:anchor="_Toc237718610" w:history="1">
         <w:r>
           <w:rPr>
             <w:rStyle w:val="Hipervnculo"/>
@@ -2772,7 +2763,7 @@
             <w:noProof/>
             <w:webHidden/>
           </w:rPr>
-          <w:instrText xml:space="preserve"> PAGEREF _Toc237717619 \h </w:instrText>
+          <w:instrText xml:space="preserve"> PAGEREF _Toc237718610 \h </w:instrText>
         </w:r>
         <w:r>
           <w:rPr>
@@ -2819,7 +2810,7 @@
           <w14:ligatures w14:val="standardContextual"/>
         </w:rPr>
       </w:pPr>
-      <w:hyperlink w:anchor="_Toc237717620" w:history="1">
+      <w:hyperlink w:anchor="_Toc237718611" w:history="1">
         <w:r>
           <w:rPr>
             <w:rStyle w:val="Hipervnculo"/>
@@ -2846,7 +2837,7 @@
             <w:noProof/>
             <w:webHidden/>
           </w:rPr>
-          <w:instrText xml:space="preserve"> PAGEREF _Toc237717620 \h </w:instrText>
+          <w:instrText xml:space="preserve"> PAGEREF _Toc237718611 \h </w:instrText>
         </w:r>
         <w:r>
           <w:rPr>
@@ -2893,7 +2884,7 @@
           <w14:ligatures w14:val="standardContextual"/>
         </w:rPr>
       </w:pPr>
-      <w:hyperlink w:anchor="_Toc237717621" w:history="1">
+      <w:hyperlink w:anchor="_Toc237718612" w:history="1">
         <w:r>
           <w:rPr>
             <w:rStyle w:val="Hipervnculo"/>
@@ -2920,7 +2911,7 @@
             <w:noProof/>
             <w:webHidden/>
           </w:rPr>
-          <w:instrText xml:space="preserve"> PAGEREF _Toc237717621 \h </w:instrText>
+          <w:instrText xml:space="preserve"> PAGEREF _Toc237718612 \h </w:instrText>
         </w:r>
         <w:r>
           <w:rPr>
@@ -2967,7 +2958,7 @@
           <w14:ligatures w14:val="standardContextual"/>
         </w:rPr>
       </w:pPr>
-      <w:hyperlink w:anchor="_Toc237717622" w:history="1">
+      <w:hyperlink w:anchor="_Toc237718613" w:history="1">
         <w:r>
           <w:rPr>
             <w:rStyle w:val="Hipervnculo"/>
@@ -2994,7 +2985,7 @@
             <w:noProof/>
             <w:webHidden/>
           </w:rPr>
-          <w:instrText xml:space="preserve"> PAGEREF _Toc237717622 \h </w:instrText>
+          <w:instrText xml:space="preserve"> PAGEREF _Toc237718613 \h </w:instrText>
         </w:r>
         <w:r>
           <w:rPr>
@@ -3041,7 +3032,7 @@
           <w14:ligatures w14:val="standardContextual"/>
         </w:rPr>
       </w:pPr>
-      <w:hyperlink w:anchor="_Toc237717623" w:history="1">
+      <w:hyperlink w:anchor="_Toc237718614" w:history="1">
         <w:r>
           <w:rPr>
             <w:rStyle w:val="Hipervnculo"/>
@@ -3098,7 +3089,7 @@
             <w:noProof/>
             <w:webHidden/>
           </w:rPr>
-          <w:instrText xml:space="preserve"> PAGEREF _Toc237717623 \h </w:instrText>
+          <w:instrText xml:space="preserve"> PAGEREF _Toc237718614 \h </w:instrText>
         </w:r>
         <w:r>
           <w:rPr>
@@ -3145,7 +3136,7 @@
           <w14:ligatures w14:val="standardContextual"/>
         </w:rPr>
       </w:pPr>
-      <w:hyperlink w:anchor="_Toc237717624" w:history="1">
+      <w:hyperlink w:anchor="_Toc237718615" w:history="1">
         <w:r>
           <w:rPr>
             <w:rStyle w:val="Hipervnculo"/>
@@ -3172,7 +3163,7 @@
             <w:noProof/>
             <w:webHidden/>
           </w:rPr>
-          <w:instrText xml:space="preserve"> PAGEREF _Toc237717624 \h </w:instrText>
+          <w:instrText xml:space="preserve"> PAGEREF _Toc237718615 \h </w:instrText>
         </w:r>
         <w:r>
           <w:rPr>
@@ -3219,7 +3210,7 @@
           <w14:ligatures w14:val="standardContextual"/>
         </w:rPr>
       </w:pPr>
-      <w:hyperlink w:anchor="_Toc237717625" w:history="1">
+      <w:hyperlink w:anchor="_Toc237718616" w:history="1">
         <w:r>
           <w:rPr>
             <w:rStyle w:val="Hipervnculo"/>
@@ -3246,7 +3237,7 @@
             <w:noProof/>
             <w:webHidden/>
           </w:rPr>
-          <w:instrText xml:space="preserve"> PAGEREF _Toc237717625 \h </w:instrText>
+          <w:instrText xml:space="preserve"> PAGEREF _Toc237718616 \h </w:instrText>
         </w:r>
         <w:r>
           <w:rPr>
@@ -3293,7 +3284,7 @@
           <w14:ligatures w14:val="standardContextual"/>
         </w:rPr>
       </w:pPr>
-      <w:hyperlink w:anchor="_Toc237717626" w:history="1">
+      <w:hyperlink w:anchor="_Toc237718617" w:history="1">
         <w:r>
           <w:rPr>
             <w:rStyle w:val="Hipervnculo"/>
@@ -3320,7 +3311,7 @@
             <w:noProof/>
             <w:webHidden/>
           </w:rPr>
-          <w:instrText xml:space="preserve"> PAGEREF _Toc237717626 \h </w:instrText>
+          <w:instrText xml:space="preserve"> PAGEREF _Toc237718617 \h </w:instrText>
         </w:r>
         <w:r>
           <w:rPr>
@@ -3367,7 +3358,7 @@
           <w14:ligatures w14:val="standardContextual"/>
         </w:rPr>
       </w:pPr>
-      <w:hyperlink w:anchor="_Toc237717627" w:history="1">
+      <w:hyperlink w:anchor="_Toc237718618" w:history="1">
         <w:r>
           <w:rPr>
             <w:rStyle w:val="Hipervnculo"/>
@@ -3394,7 +3385,7 @@
             <w:noProof/>
             <w:webHidden/>
           </w:rPr>
-          <w:instrText xml:space="preserve"> PAGEREF _Toc237717627 \h </w:instrText>
+          <w:instrText xml:space="preserve"> PAGEREF _Toc237718618 \h </w:instrText>
         </w:r>
         <w:r>
           <w:rPr>
@@ -3441,7 +3432,7 @@
           <w14:ligatures w14:val="standardContextual"/>
         </w:rPr>
       </w:pPr>
-      <w:hyperlink w:anchor="_Toc237717628" w:history="1">
+      <w:hyperlink w:anchor="_Toc237718619" w:history="1">
         <w:r>
           <w:rPr>
             <w:rStyle w:val="Hipervnculo"/>
@@ -3468,7 +3459,7 @@
             <w:noProof/>
             <w:webHidden/>
           </w:rPr>
-          <w:instrText xml:space="preserve"> PAGEREF _Toc237717628 \h </w:instrText>
+          <w:instrText xml:space="preserve"> PAGEREF _Toc237718619 \h </w:instrText>
         </w:r>
         <w:r>
           <w:rPr>
@@ -3515,7 +3506,7 @@
           <w14:ligatures w14:val="standardContextual"/>
         </w:rPr>
       </w:pPr>
-      <w:hyperlink w:anchor="_Toc237717629" w:history="1">
+      <w:hyperlink w:anchor="_Toc237718620" w:history="1">
         <w:r>
           <w:rPr>
             <w:rStyle w:val="Hipervnculo"/>
@@ -3542,7 +3533,7 @@
             <w:noProof/>
             <w:webHidden/>
           </w:rPr>
-          <w:instrText xml:space="preserve"> PAGEREF _Toc237717629 \h </w:instrText>
+          <w:instrText xml:space="preserve"> PAGEREF _Toc237718620 \h </w:instrText>
         </w:r>
         <w:r>
           <w:rPr>
@@ -3589,7 +3580,7 @@
           <w14:ligatures w14:val="standardContextual"/>
         </w:rPr>
       </w:pPr>
-      <w:hyperlink w:anchor="_Toc237717630" w:history="1">
+      <w:hyperlink w:anchor="_Toc237718621" w:history="1">
         <w:r>
           <w:rPr>
             <w:rStyle w:val="Hipervnculo"/>
@@ -3616,7 +3607,7 @@
             <w:noProof/>
             <w:webHidden/>
           </w:rPr>
-          <w:instrText xml:space="preserve"> PAGEREF _Toc237717630 \h </w:instrText>
+          <w:instrText xml:space="preserve"> PAGEREF _Toc237718621 \h </w:instrText>
         </w:r>
         <w:r>
           <w:rPr>
@@ -3663,7 +3654,7 @@
           <w14:ligatures w14:val="standardContextual"/>
         </w:rPr>
       </w:pPr>
-      <w:hyperlink w:anchor="_Toc237717631" w:history="1">
+      <w:hyperlink w:anchor="_Toc237718622" w:history="1">
         <w:r>
           <w:rPr>
             <w:rStyle w:val="Hipervnculo"/>
@@ -3690,7 +3681,7 @@
             <w:noProof/>
             <w:webHidden/>
           </w:rPr>
-          <w:instrText xml:space="preserve"> PAGEREF _Toc237717631 \h </w:instrText>
+          <w:instrText xml:space="preserve"> PAGEREF _Toc237718622 \h </w:instrText>
         </w:r>
         <w:r>
           <w:rPr>
@@ -3737,7 +3728,7 @@
           <w14:ligatures w14:val="standardContextual"/>
         </w:rPr>
       </w:pPr>
-      <w:hyperlink w:anchor="_Toc237717632" w:history="1">
+      <w:hyperlink w:anchor="_Toc237718623" w:history="1">
         <w:r>
           <w:rPr>
             <w:rStyle w:val="Hipervnculo"/>
@@ -3764,7 +3755,7 @@
             <w:noProof/>
             <w:webHidden/>
           </w:rPr>
-          <w:instrText xml:space="preserve"> PAGEREF _Toc237717632 \h </w:instrText>
+          <w:instrText xml:space="preserve"> PAGEREF _Toc237718623 \h </w:instrText>
         </w:r>
         <w:r>
           <w:rPr>
@@ -3811,7 +3802,7 @@
           <w14:ligatures w14:val="standardContextual"/>
         </w:rPr>
       </w:pPr>
-      <w:hyperlink w:anchor="_Toc237717633" w:history="1">
+      <w:hyperlink w:anchor="_Toc237718624" w:history="1">
         <w:r>
           <w:rPr>
             <w:rStyle w:val="Hipervnculo"/>
@@ -3838,7 +3829,7 @@
             <w:noProof/>
             <w:webHidden/>
           </w:rPr>
-          <w:instrText xml:space="preserve"> PAGEREF _Toc237717633 \h </w:instrText>
+          <w:instrText xml:space="preserve"> PAGEREF _Toc237718624 \h </w:instrText>
         </w:r>
         <w:r>
           <w:rPr>
@@ -3885,7 +3876,7 @@
           <w14:ligatures w14:val="standardContextual"/>
         </w:rPr>
       </w:pPr>
-      <w:hyperlink w:anchor="_Toc237717634" w:history="1">
+      <w:hyperlink w:anchor="_Toc237718625" w:history="1">
         <w:r>
           <w:rPr>
             <w:rStyle w:val="Hipervnculo"/>
@@ -3912,7 +3903,7 @@
             <w:noProof/>
             <w:webHidden/>
           </w:rPr>
-          <w:instrText xml:space="preserve"> PAGEREF _Toc237717634 \h </w:instrText>
+          <w:instrText xml:space="preserve"> PAGEREF _Toc237718625 \h </w:instrText>
         </w:r>
         <w:r>
           <w:rPr>
@@ -3959,7 +3950,7 @@
           <w14:ligatures w14:val="standardContextual"/>
         </w:rPr>
       </w:pPr>
-      <w:hyperlink w:anchor="_Toc237717635" w:history="1">
+      <w:hyperlink w:anchor="_Toc237718626" w:history="1">
         <w:r>
           <w:rPr>
             <w:rStyle w:val="Hipervnculo"/>
@@ -3986,7 +3977,7 @@
             <w:noProof/>
             <w:webHidden/>
           </w:rPr>
-          <w:instrText xml:space="preserve"> PAGEREF _Toc237717635 \h </w:instrText>
+          <w:instrText xml:space="preserve"> PAGEREF _Toc237718626 \h </w:instrText>
         </w:r>
         <w:r>
           <w:rPr>
@@ -4033,7 +4024,7 @@
           <w14:ligatures w14:val="standardContextual"/>
         </w:rPr>
       </w:pPr>
-      <w:hyperlink w:anchor="_Toc237717636" w:history="1">
+      <w:hyperlink w:anchor="_Toc237718627" w:history="1">
         <w:r>
           <w:rPr>
             <w:rStyle w:val="Hipervnculo"/>
@@ -4060,7 +4051,7 @@
             <w:noProof/>
             <w:webHidden/>
           </w:rPr>
-          <w:instrText xml:space="preserve"> PAGEREF _Toc237717636 \h </w:instrText>
+          <w:instrText xml:space="preserve"> PAGEREF _Toc237718627 \h </w:instrText>
         </w:r>
         <w:r>
           <w:rPr>
@@ -4107,7 +4098,7 @@
           <w14:ligatures w14:val="standardContextual"/>
         </w:rPr>
       </w:pPr>
-      <w:hyperlink w:anchor="_Toc237717637" w:history="1">
+      <w:hyperlink w:anchor="_Toc237718628" w:history="1">
         <w:r>
           <w:rPr>
             <w:rStyle w:val="Hipervnculo"/>
@@ -4134,7 +4125,7 @@
             <w:noProof/>
             <w:webHidden/>
           </w:rPr>
-          <w:instrText xml:space="preserve"> PAGEREF _Toc237717637 \h </w:instrText>
+          <w:instrText xml:space="preserve"> PAGEREF _Toc237718628 \h </w:instrText>
         </w:r>
         <w:r>
           <w:rPr>
@@ -4181,7 +4172,7 @@
           <w14:ligatures w14:val="standardContextual"/>
         </w:rPr>
       </w:pPr>
-      <w:hyperlink w:anchor="_Toc237717638" w:history="1">
+      <w:hyperlink w:anchor="_Toc237718629" w:history="1">
         <w:r>
           <w:rPr>
             <w:rStyle w:val="Hipervnculo"/>
@@ -4208,7 +4199,7 @@
             <w:noProof/>
             <w:webHidden/>
           </w:rPr>
-          <w:instrText xml:space="preserve"> PAGEREF _Toc237717638 \h </w:instrText>
+          <w:instrText xml:space="preserve"> PAGEREF _Toc237718629 \h </w:instrText>
         </w:r>
         <w:r>
           <w:rPr>
@@ -4255,7 +4246,7 @@
           <w14:ligatures w14:val="standardContextual"/>
         </w:rPr>
       </w:pPr>
-      <w:hyperlink w:anchor="_Toc237717639" w:history="1">
+      <w:hyperlink w:anchor="_Toc237718630" w:history="1">
         <w:r>
           <w:rPr>
             <w:rStyle w:val="Hipervnculo"/>
@@ -4282,7 +4273,7 @@
             <w:noProof/>
             <w:webHidden/>
           </w:rPr>
-          <w:instrText xml:space="preserve"> PAGEREF _Toc237717639 \h </w:instrText>
+          <w:instrText xml:space="preserve"> PAGEREF _Toc237718630 \h </w:instrText>
         </w:r>
         <w:r>
           <w:rPr>
@@ -4329,7 +4320,7 @@
           <w14:ligatures w14:val="standardContextual"/>
         </w:rPr>
       </w:pPr>
-      <w:hyperlink w:anchor="_Toc237717640" w:history="1">
+      <w:hyperlink w:anchor="_Toc237718631" w:history="1">
         <w:r>
           <w:rPr>
             <w:rStyle w:val="Hipervnculo"/>
@@ -4356,7 +4347,7 @@
             <w:noProof/>
             <w:webHidden/>
           </w:rPr>
-          <w:instrText xml:space="preserve"> PAGEREF _Toc237717640 \h </w:instrText>
+          <w:instrText xml:space="preserve"> PAGEREF _Toc237718631 \h </w:instrText>
         </w:r>
         <w:r>
           <w:rPr>
@@ -4403,7 +4394,7 @@
           <w14:ligatures w14:val="standardContextual"/>
         </w:rPr>
       </w:pPr>
-      <w:hyperlink w:anchor="_Toc237717641" w:history="1">
+      <w:hyperlink w:anchor="_Toc237718632" w:history="1">
         <w:r>
           <w:rPr>
             <w:rStyle w:val="Hipervnculo"/>
@@ -4430,7 +4421,7 @@
             <w:noProof/>
             <w:webHidden/>
           </w:rPr>
-          <w:instrText xml:space="preserve"> PAGEREF _Toc237717641 \h </w:instrText>
+          <w:instrText xml:space="preserve"> PAGEREF _Toc237718632 \h </w:instrText>
         </w:r>
         <w:r>
           <w:rPr>
@@ -4477,7 +4468,7 @@
           <w14:ligatures w14:val="standardContextual"/>
         </w:rPr>
       </w:pPr>
-      <w:hyperlink w:anchor="_Toc237717642" w:history="1">
+      <w:hyperlink w:anchor="_Toc237718633" w:history="1">
         <w:r>
           <w:rPr>
             <w:rStyle w:val="Hipervnculo"/>
@@ -4504,7 +4495,7 @@
             <w:noProof/>
             <w:webHidden/>
           </w:rPr>
-          <w:instrText xml:space="preserve"> PAGEREF _Toc237717642 \h </w:instrText>
+          <w:instrText xml:space="preserve"> PAGEREF _Toc237718633 \h </w:instrText>
         </w:r>
         <w:r>
           <w:rPr>
@@ -4551,7 +4542,7 @@
           <w14:ligatures w14:val="standardContextual"/>
         </w:rPr>
       </w:pPr>
-      <w:hyperlink w:anchor="_Toc237717643" w:history="1">
+      <w:hyperlink w:anchor="_Toc237718634" w:history="1">
         <w:r>
           <w:rPr>
             <w:rStyle w:val="Hipervnculo"/>
@@ -4578,7 +4569,7 @@
             <w:noProof/>
             <w:webHidden/>
           </w:rPr>
-          <w:instrText xml:space="preserve"> PAGEREF _Toc237717643 \h </w:instrText>
+          <w:instrText xml:space="preserve"> PAGEREF _Toc237718634 \h </w:instrText>
         </w:r>
         <w:r>
           <w:rPr>
@@ -4625,7 +4616,7 @@
           <w14:ligatures w14:val="standardContextual"/>
         </w:rPr>
       </w:pPr>
-      <w:hyperlink w:anchor="_Toc237717644" w:history="1">
+      <w:hyperlink w:anchor="_Toc237718635" w:history="1">
         <w:r>
           <w:rPr>
             <w:rStyle w:val="Hipervnculo"/>
@@ -4652,7 +4643,7 @@
             <w:noProof/>
             <w:webHidden/>
           </w:rPr>
-          <w:instrText xml:space="preserve"> PAGEREF _Toc237717644 \h </w:instrText>
+          <w:instrText xml:space="preserve"> PAGEREF _Toc237718635 \h </w:instrText>
         </w:r>
         <w:r>
           <w:rPr>
@@ -4699,7 +4690,7 @@
           <w14:ligatures w14:val="standardContextual"/>
         </w:rPr>
       </w:pPr>
-      <w:hyperlink w:anchor="_Toc237717645" w:history="1">
+      <w:hyperlink w:anchor="_Toc237718636" w:history="1">
         <w:r>
           <w:rPr>
             <w:rStyle w:val="Hipervnculo"/>
@@ -4726,7 +4717,7 @@
             <w:noProof/>
             <w:webHidden/>
           </w:rPr>
-          <w:instrText xml:space="preserve"> PAGEREF _Toc237717645 \h </w:instrText>
+          <w:instrText xml:space="preserve"> PAGEREF _Toc237718636 \h </w:instrText>
         </w:r>
         <w:r>
           <w:rPr>
@@ -4773,7 +4764,7 @@
           <w14:ligatures w14:val="standardContextual"/>
         </w:rPr>
       </w:pPr>
-      <w:hyperlink w:anchor="_Toc237717646" w:history="1">
+      <w:hyperlink w:anchor="_Toc237718637" w:history="1">
         <w:r>
           <w:rPr>
             <w:rStyle w:val="Hipervnculo"/>
@@ -4800,7 +4791,7 @@
             <w:noProof/>
             <w:webHidden/>
           </w:rPr>
-          <w:instrText xml:space="preserve"> PAGEREF _Toc237717646 \h </w:instrText>
+          <w:instrText xml:space="preserve"> PAGEREF _Toc237718637 \h </w:instrText>
         </w:r>
         <w:r>
           <w:rPr>
@@ -4847,7 +4838,7 @@
           <w14:ligatures w14:val="standardContextual"/>
         </w:rPr>
       </w:pPr>
-      <w:hyperlink w:anchor="_Toc237717647" w:history="1">
+      <w:hyperlink w:anchor="_Toc237718638" w:history="1">
         <w:r>
           <w:rPr>
             <w:rStyle w:val="Hipervnculo"/>
@@ -4874,7 +4865,7 @@
             <w:noProof/>
             <w:webHidden/>
           </w:rPr>
-          <w:instrText xml:space="preserve"> PAGEREF _Toc237717647 \h </w:instrText>
+          <w:instrText xml:space="preserve"> PAGEREF _Toc237718638 \h </w:instrText>
         </w:r>
         <w:r>
           <w:rPr>
@@ -4921,7 +4912,7 @@
           <w14:ligatures w14:val="standardContextual"/>
         </w:rPr>
       </w:pPr>
-      <w:hyperlink w:anchor="_Toc237717648" w:history="1">
+      <w:hyperlink w:anchor="_Toc237718639" w:history="1">
         <w:r>
           <w:rPr>
             <w:rStyle w:val="Hipervnculo"/>
@@ -4948,7 +4939,7 @@
             <w:noProof/>
             <w:webHidden/>
           </w:rPr>
-          <w:instrText xml:space="preserve"> PAGEREF _Toc237717648 \h </w:instrText>
+          <w:instrText xml:space="preserve"> PAGEREF _Toc237718639 \h </w:instrText>
         </w:r>
         <w:r>
           <w:rPr>
@@ -4995,7 +4986,7 @@
           <w14:ligatures w14:val="standardContextual"/>
         </w:rPr>
       </w:pPr>
-      <w:hyperlink w:anchor="_Toc237717649" w:history="1">
+      <w:hyperlink w:anchor="_Toc237718640" w:history="1">
         <w:r>
           <w:rPr>
             <w:rStyle w:val="Hipervnculo"/>
@@ -5022,7 +5013,7 @@
             <w:noProof/>
             <w:webHidden/>
           </w:rPr>
-          <w:instrText xml:space="preserve"> PAGEREF _Toc237717649 \h </w:instrText>
+          <w:instrText xml:space="preserve"> PAGEREF _Toc237718640 \h </w:instrText>
         </w:r>
         <w:r>
           <w:rPr>
@@ -5069,7 +5060,7 @@
           <w14:ligatures w14:val="standardContextual"/>
         </w:rPr>
       </w:pPr>
-      <w:hyperlink w:anchor="_Toc237717650" w:history="1">
+      <w:hyperlink w:anchor="_Toc237718641" w:history="1">
         <w:r>
           <w:rPr>
             <w:rStyle w:val="Hipervnculo"/>
@@ -5096,7 +5087,7 @@
             <w:noProof/>
             <w:webHidden/>
           </w:rPr>
-          <w:instrText xml:space="preserve"> PAGEREF _Toc237717650 \h </w:instrText>
+          <w:instrText xml:space="preserve"> PAGEREF _Toc237718641 \h </w:instrText>
         </w:r>
         <w:r>
           <w:rPr>
@@ -5143,7 +5134,7 @@
           <w14:ligatures w14:val="standardContextual"/>
         </w:rPr>
       </w:pPr>
-      <w:hyperlink w:anchor="_Toc237717651" w:history="1">
+      <w:hyperlink w:anchor="_Toc237718642" w:history="1">
         <w:r>
           <w:rPr>
             <w:rStyle w:val="Hipervnculo"/>
@@ -5170,7 +5161,7 @@
             <w:noProof/>
             <w:webHidden/>
           </w:rPr>
-          <w:instrText xml:space="preserve"> PAGEREF _Toc237717651 \h </w:instrText>
+          <w:instrText xml:space="preserve"> PAGEREF _Toc237718642 \h </w:instrText>
         </w:r>
         <w:r>
           <w:rPr>
@@ -5217,7 +5208,7 @@
           <w14:ligatures w14:val="standardContextual"/>
         </w:rPr>
       </w:pPr>
-      <w:hyperlink w:anchor="_Toc237717652" w:history="1">
+      <w:hyperlink w:anchor="_Toc237718643" w:history="1">
         <w:r>
           <w:rPr>
             <w:rStyle w:val="Hipervnculo"/>
@@ -5244,7 +5235,7 @@
             <w:noProof/>
             <w:webHidden/>
           </w:rPr>
-          <w:instrText xml:space="preserve"> PAGEREF _Toc237717652 \h </w:instrText>
+          <w:instrText xml:space="preserve"> PAGEREF _Toc237718643 \h </w:instrText>
         </w:r>
         <w:r>
           <w:rPr>
@@ -5291,7 +5282,7 @@
           <w14:ligatures w14:val="standardContextual"/>
         </w:rPr>
       </w:pPr>
-      <w:hyperlink w:anchor="_Toc237717653" w:history="1">
+      <w:hyperlink w:anchor="_Toc237718644" w:history="1">
         <w:r>
           <w:rPr>
             <w:rStyle w:val="Hipervnculo"/>
@@ -5318,7 +5309,7 @@
             <w:noProof/>
             <w:webHidden/>
           </w:rPr>
-          <w:instrText xml:space="preserve"> PAGEREF _Toc237717653 \h </w:instrText>
+          <w:instrText xml:space="preserve"> PAGEREF _Toc237718644 \h </w:instrText>
         </w:r>
         <w:r>
           <w:rPr>
@@ -5365,7 +5356,7 @@
           <w14:ligatures w14:val="standardContextual"/>
         </w:rPr>
       </w:pPr>
-      <w:hyperlink w:anchor="_Toc237717654" w:history="1">
+      <w:hyperlink w:anchor="_Toc237718645" w:history="1">
         <w:r>
           <w:rPr>
             <w:rStyle w:val="Hipervnculo"/>
@@ -5392,7 +5383,7 @@
             <w:noProof/>
             <w:webHidden/>
           </w:rPr>
-          <w:instrText xml:space="preserve"> PAGEREF _Toc237717654 \h </w:instrText>
+          <w:instrText xml:space="preserve"> PAGEREF _Toc237718645 \h </w:instrText>
         </w:r>
         <w:r>
           <w:rPr>
@@ -5439,7 +5430,7 @@
           <w14:ligatures w14:val="standardContextual"/>
         </w:rPr>
       </w:pPr>
-      <w:hyperlink w:anchor="_Toc237717655" w:history="1">
+      <w:hyperlink w:anchor="_Toc237718646" w:history="1">
         <w:r>
           <w:rPr>
             <w:rStyle w:val="Hipervnculo"/>
@@ -5466,7 +5457,7 @@
             <w:noProof/>
             <w:webHidden/>
           </w:rPr>
-          <w:instrText xml:space="preserve"> PAGEREF _Toc237717655 \h </w:instrText>
+          <w:instrText xml:space="preserve"> PAGEREF _Toc237718646 \h </w:instrText>
         </w:r>
         <w:r>
           <w:rPr>
@@ -5513,7 +5504,7 @@
           <w14:ligatures w14:val="standardContextual"/>
         </w:rPr>
       </w:pPr>
-      <w:hyperlink w:anchor="_Toc237717656" w:history="1">
+      <w:hyperlink w:anchor="_Toc237718647" w:history="1">
         <w:r>
           <w:rPr>
             <w:rStyle w:val="Hipervnculo"/>
@@ -5540,7 +5531,7 @@
             <w:noProof/>
             <w:webHidden/>
           </w:rPr>
-          <w:instrText xml:space="preserve"> PAGEREF _Toc237717656 \h </w:instrText>
+          <w:instrText xml:space="preserve"> PAGEREF _Toc237718647 \h </w:instrText>
         </w:r>
         <w:r>
           <w:rPr>
@@ -5587,7 +5578,7 @@
           <w14:ligatures w14:val="standardContextual"/>
         </w:rPr>
       </w:pPr>
-      <w:hyperlink w:anchor="_Toc237717657" w:history="1">
+      <w:hyperlink w:anchor="_Toc237718648" w:history="1">
         <w:r>
           <w:rPr>
             <w:rStyle w:val="Hipervnculo"/>
@@ -5614,7 +5605,7 @@
             <w:noProof/>
             <w:webHidden/>
           </w:rPr>
-          <w:instrText xml:space="preserve"> PAGEREF _Toc237717657 \h </w:instrText>
+          <w:instrText xml:space="preserve"> PAGEREF _Toc237718648 \h </w:instrText>
         </w:r>
         <w:r>
           <w:rPr>
@@ -5661,7 +5652,7 @@
           <w14:ligatures w14:val="standardContextual"/>
         </w:rPr>
       </w:pPr>
-      <w:hyperlink w:anchor="_Toc237717658" w:history="1">
+      <w:hyperlink w:anchor="_Toc237718649" w:history="1">
         <w:r>
           <w:rPr>
             <w:rStyle w:val="Hipervnculo"/>
@@ -5688,7 +5679,7 @@
             <w:noProof/>
             <w:webHidden/>
           </w:rPr>
-          <w:instrText xml:space="preserve"> PAGEREF _Toc237717658 \h </w:instrText>
+          <w:instrText xml:space="preserve"> PAGEREF _Toc237718649 \h </w:instrText>
         </w:r>
         <w:r>
           <w:rPr>
@@ -5735,7 +5726,7 @@
           <w14:ligatures w14:val="standardContextual"/>
         </w:rPr>
       </w:pPr>
-      <w:hyperlink w:anchor="_Toc237717659" w:history="1">
+      <w:hyperlink w:anchor="_Toc237718650" w:history="1">
         <w:r>
           <w:rPr>
             <w:rStyle w:val="Hipervnculo"/>
@@ -5762,7 +5753,7 @@
             <w:noProof/>
             <w:webHidden/>
           </w:rPr>
-          <w:instrText xml:space="preserve"> PAGEREF _Toc237717659 \h </w:instrText>
+          <w:instrText xml:space="preserve"> PAGEREF _Toc237718650 \h </w:instrText>
         </w:r>
         <w:r>
           <w:rPr>
@@ -5809,7 +5800,7 @@
           <w14:ligatures w14:val="standardContextual"/>
         </w:rPr>
       </w:pPr>
-      <w:hyperlink w:anchor="_Toc237717660" w:history="1">
+      <w:hyperlink w:anchor="_Toc237718651" w:history="1">
         <w:r>
           <w:rPr>
             <w:rStyle w:val="Hipervnculo"/>
@@ -5836,7 +5827,7 @@
             <w:noProof/>
             <w:webHidden/>
           </w:rPr>
-          <w:instrText xml:space="preserve"> PAGEREF _Toc237717660 \h </w:instrText>
+          <w:instrText xml:space="preserve"> PAGEREF _Toc237718651 \h </w:instrText>
         </w:r>
         <w:r>
           <w:rPr>
@@ -5883,7 +5874,7 @@
           <w14:ligatures w14:val="standardContextual"/>
         </w:rPr>
       </w:pPr>
-      <w:hyperlink w:anchor="_Toc237717661" w:history="1">
+      <w:hyperlink w:anchor="_Toc237718652" w:history="1">
         <w:r>
           <w:rPr>
             <w:rStyle w:val="Hipervnculo"/>
@@ -5910,7 +5901,7 @@
             <w:noProof/>
             <w:webHidden/>
           </w:rPr>
-          <w:instrText xml:space="preserve"> PAGEREF _Toc237717661 \h </w:instrText>
+          <w:instrText xml:space="preserve"> PAGEREF _Toc237718652 \h </w:instrText>
         </w:r>
         <w:r>
           <w:rPr>
@@ -5957,7 +5948,7 @@
           <w14:ligatures w14:val="standardContextual"/>
         </w:rPr>
       </w:pPr>
-      <w:hyperlink w:anchor="_Toc237717662" w:history="1">
+      <w:hyperlink w:anchor="_Toc237718653" w:history="1">
         <w:r>
           <w:rPr>
             <w:rStyle w:val="Hipervnculo"/>
@@ -5984,7 +5975,7 @@
             <w:noProof/>
             <w:webHidden/>
           </w:rPr>
-          <w:instrText xml:space="preserve"> PAGEREF _Toc237717662 \h </w:instrText>
+          <w:instrText xml:space="preserve"> PAGEREF _Toc237718653 \h </w:instrText>
         </w:r>
         <w:r>
           <w:rPr>
@@ -6068,7 +6059,7 @@
         <w:pStyle w:val="Ttulo1"/>
         <w:spacing w:before="100" w:after="30"/>
       </w:pPr>
-      <w:bookmarkStart w:id="0" w:name="_Toc237717600"/>
+      <w:bookmarkStart w:id="0" w:name="_Toc237718591"/>
       <w:r>
         <w:rPr>
           <w:rFonts w:ascii="Georgia" w:hAnsi="Georgia"/>
@@ -6085,7 +6076,7 @@
         <w:pStyle w:val="Ttulo2"/>
         <w:spacing w:before="70" w:after="20"/>
       </w:pPr>
-      <w:bookmarkStart w:id="1" w:name="_Toc237717601"/>
+      <w:bookmarkStart w:id="1" w:name="_Toc237718592"/>
       <w:r>
         <w:rPr>
           <w:rFonts w:ascii="Georgia" w:hAnsi="Georgia"/>
@@ -6126,7 +6117,7 @@
         <w:pStyle w:val="Ttulo2"/>
         <w:spacing w:before="70" w:after="20"/>
       </w:pPr>
-      <w:bookmarkStart w:id="2" w:name="_Toc237717602"/>
+      <w:bookmarkStart w:id="2" w:name="_Toc237718593"/>
       <w:r>
         <w:rPr>
           <w:rFonts w:ascii="Georgia" w:hAnsi="Georgia"/>
@@ -6187,7 +6178,7 @@
                 <w:noProof/>
               </w:rPr>
               <w:drawing>
-                <wp:inline distT="0" distB="0" distL="0" distR="0" wp14:anchorId="35577691" wp14:editId="776C5D75">
+                <wp:inline distT="0" distB="0" distL="0" distR="0" wp14:anchorId="0A435354" wp14:editId="53E081D9">
                   <wp:extent cx="2926080" cy="1524412"/>
                   <wp:effectExtent l="0" t="0" r="0" b="0"/>
                   <wp:docPr id="1" name="Picture 1"/>
@@ -6246,7 +6237,7 @@
                 <w:noProof/>
               </w:rPr>
               <w:drawing>
-                <wp:inline distT="0" distB="0" distL="0" distR="0" wp14:anchorId="134A55C1" wp14:editId="25C89785">
+                <wp:inline distT="0" distB="0" distL="0" distR="0" wp14:anchorId="66E254D8" wp14:editId="13DDDBB5">
                   <wp:extent cx="2926080" cy="1437831"/>
                   <wp:effectExtent l="0" t="0" r="0" b="0"/>
                   <wp:docPr id="2" name="Picture 2"/>
@@ -6351,7 +6342,7 @@
         <w:pStyle w:val="Ttulo2"/>
         <w:spacing w:before="70" w:after="20"/>
       </w:pPr>
-      <w:bookmarkStart w:id="3" w:name="_Toc237717603"/>
+      <w:bookmarkStart w:id="3" w:name="_Toc237718594"/>
       <w:r>
         <w:rPr>
           <w:rFonts w:ascii="Georgia" w:hAnsi="Georgia"/>
@@ -6478,7 +6469,7 @@
         <w:pStyle w:val="Ttulo2"/>
         <w:spacing w:before="70" w:after="20"/>
       </w:pPr>
-      <w:bookmarkStart w:id="4" w:name="_Toc237717604"/>
+      <w:bookmarkStart w:id="4" w:name="_Toc237718595"/>
       <w:r>
         <w:rPr>
           <w:rFonts w:ascii="Georgia" w:hAnsi="Georgia"/>
@@ -7006,7 +6997,7 @@
         <w:pStyle w:val="Ttulo2"/>
         <w:spacing w:before="70" w:after="20"/>
       </w:pPr>
-      <w:bookmarkStart w:id="5" w:name="_Toc237717605"/>
+      <w:bookmarkStart w:id="5" w:name="_Toc237718596"/>
       <w:r>
         <w:rPr>
           <w:rFonts w:ascii="Georgia" w:hAnsi="Georgia"/>
@@ -7139,7 +7130,7 @@
         <w:pStyle w:val="Ttulo2"/>
         <w:spacing w:before="70" w:after="20"/>
       </w:pPr>
-      <w:bookmarkStart w:id="6" w:name="_Toc237717606"/>
+      <w:bookmarkStart w:id="6" w:name="_Toc237718597"/>
       <w:r>
         <w:rPr>
           <w:rFonts w:ascii="Georgia" w:hAnsi="Georgia"/>
@@ -8356,7 +8347,7 @@
         <w:pStyle w:val="Ttulo1"/>
         <w:spacing w:before="100" w:after="30"/>
       </w:pPr>
-      <w:bookmarkStart w:id="7" w:name="_Toc237717607"/>
+      <w:bookmarkStart w:id="7" w:name="_Toc237718598"/>
       <w:r>
         <w:rPr>
           <w:rFonts w:ascii="Georgia" w:hAnsi="Georgia"/>
@@ -8372,7 +8363,7 @@
         <w:pStyle w:val="Ttulo2"/>
         <w:spacing w:before="70" w:after="20"/>
       </w:pPr>
-      <w:bookmarkStart w:id="8" w:name="_Toc237717608"/>
+      <w:bookmarkStart w:id="8" w:name="_Toc237718599"/>
       <w:r>
         <w:rPr>
           <w:rFonts w:ascii="Georgia" w:hAnsi="Georgia"/>
@@ -8430,7 +8421,7 @@
                 <w:noProof/>
               </w:rPr>
               <w:drawing>
-                <wp:inline distT="0" distB="0" distL="0" distR="0" wp14:anchorId="1B698AF5" wp14:editId="3B0490FA">
+                <wp:inline distT="0" distB="0" distL="0" distR="0" wp14:anchorId="41425E2F" wp14:editId="2A240A17">
                   <wp:extent cx="2926080" cy="1426594"/>
                   <wp:effectExtent l="0" t="0" r="0" b="0"/>
                   <wp:docPr id="3" name="Picture 3"/>
@@ -8489,7 +8480,7 @@
                 <w:noProof/>
               </w:rPr>
               <w:drawing>
-                <wp:inline distT="0" distB="0" distL="0" distR="0" wp14:anchorId="393A9499" wp14:editId="176379E4">
+                <wp:inline distT="0" distB="0" distL="0" distR="0" wp14:anchorId="43A3E61A" wp14:editId="01BF53CF">
                   <wp:extent cx="2926080" cy="1494260"/>
                   <wp:effectExtent l="0" t="0" r="0" b="0"/>
                   <wp:docPr id="4" name="Picture 4"/>
@@ -8604,7 +8595,7 @@
         <w:pStyle w:val="Ttulo2"/>
         <w:spacing w:before="70" w:after="20"/>
       </w:pPr>
-      <w:bookmarkStart w:id="9" w:name="_Toc237717609"/>
+      <w:bookmarkStart w:id="9" w:name="_Toc237718600"/>
       <w:r>
         <w:rPr>
           <w:rFonts w:ascii="Georgia" w:hAnsi="Georgia"/>
@@ -8838,7 +8829,7 @@
         <w:pStyle w:val="Ttulo1"/>
         <w:spacing w:before="100" w:after="30"/>
       </w:pPr>
-      <w:bookmarkStart w:id="10" w:name="_Toc237717610"/>
+      <w:bookmarkStart w:id="10" w:name="_Toc237718601"/>
       <w:r>
         <w:rPr>
           <w:rFonts w:ascii="Georgia" w:hAnsi="Georgia"/>
@@ -8854,7 +8845,7 @@
         <w:pStyle w:val="Ttulo2"/>
         <w:spacing w:before="70" w:after="20"/>
       </w:pPr>
-      <w:bookmarkStart w:id="11" w:name="_Toc237717611"/>
+      <w:bookmarkStart w:id="11" w:name="_Toc237718602"/>
       <w:r>
         <w:rPr>
           <w:rFonts w:ascii="Georgia" w:hAnsi="Georgia"/>
@@ -8915,7 +8906,7 @@
                 <w:noProof/>
               </w:rPr>
               <w:drawing>
-                <wp:inline distT="0" distB="0" distL="0" distR="0" wp14:anchorId="5E47DE2B" wp14:editId="0622F642">
+                <wp:inline distT="0" distB="0" distL="0" distR="0" wp14:anchorId="23FECFF1" wp14:editId="017C1CAF">
                   <wp:extent cx="2926080" cy="1636252"/>
                   <wp:effectExtent l="0" t="0" r="0" b="0"/>
                   <wp:docPr id="5" name="Picture 5"/>
@@ -8974,7 +8965,7 @@
                 <w:noProof/>
               </w:rPr>
               <w:drawing>
-                <wp:inline distT="0" distB="0" distL="0" distR="0" wp14:anchorId="064E0544" wp14:editId="7A2CB985">
+                <wp:inline distT="0" distB="0" distL="0" distR="0" wp14:anchorId="11651EAC" wp14:editId="6F566FB2">
                   <wp:extent cx="2926080" cy="1481181"/>
                   <wp:effectExtent l="0" t="0" r="0" b="0"/>
                   <wp:docPr id="6" name="Picture 6"/>
@@ -9089,7 +9080,7 @@
         <w:pStyle w:val="Ttulo2"/>
         <w:spacing w:before="70" w:after="20"/>
       </w:pPr>
-      <w:bookmarkStart w:id="12" w:name="_Toc237717612"/>
+      <w:bookmarkStart w:id="12" w:name="_Toc237718603"/>
       <w:r>
         <w:rPr>
           <w:rFonts w:ascii="Georgia" w:hAnsi="Georgia"/>
@@ -9120,7 +9111,7 @@
         <w:pStyle w:val="Ttulo2"/>
         <w:spacing w:before="70" w:after="20"/>
       </w:pPr>
-      <w:bookmarkStart w:id="13" w:name="_Toc237717613"/>
+      <w:bookmarkStart w:id="13" w:name="_Toc237718604"/>
       <w:r>
         <w:rPr>
           <w:rFonts w:ascii="Georgia" w:hAnsi="Georgia"/>
@@ -9178,7 +9169,7 @@
                 <w:noProof/>
               </w:rPr>
               <w:drawing>
-                <wp:inline distT="0" distB="0" distL="0" distR="0" wp14:anchorId="20D62FE2" wp14:editId="53F7C1A6">
+                <wp:inline distT="0" distB="0" distL="0" distR="0" wp14:anchorId="6207E261" wp14:editId="63849C3F">
                   <wp:extent cx="2926080" cy="1626307"/>
                   <wp:effectExtent l="0" t="0" r="0" b="0"/>
                   <wp:docPr id="7" name="Picture 7"/>
@@ -9237,7 +9228,7 @@
                 <w:noProof/>
               </w:rPr>
               <w:drawing>
-                <wp:inline distT="0" distB="0" distL="0" distR="0" wp14:anchorId="62CCE142" wp14:editId="68EA86A7">
+                <wp:inline distT="0" distB="0" distL="0" distR="0" wp14:anchorId="716B0423" wp14:editId="318A9818">
                   <wp:extent cx="2926080" cy="1479479"/>
                   <wp:effectExtent l="0" t="0" r="0" b="0"/>
                   <wp:docPr id="8" name="Picture 8"/>
@@ -9342,7 +9333,7 @@
         <w:pStyle w:val="Ttulo2"/>
         <w:spacing w:before="70" w:after="20"/>
       </w:pPr>
-      <w:bookmarkStart w:id="14" w:name="_Toc237717614"/>
+      <w:bookmarkStart w:id="14" w:name="_Toc237718605"/>
       <w:r>
         <w:rPr>
           <w:rFonts w:ascii="Georgia" w:hAnsi="Georgia"/>
@@ -9403,7 +9394,7 @@
                 <w:noProof/>
               </w:rPr>
               <w:drawing>
-                <wp:inline distT="0" distB="0" distL="0" distR="0" wp14:anchorId="083CA12B" wp14:editId="18FFA2B3">
+                <wp:inline distT="0" distB="0" distL="0" distR="0" wp14:anchorId="2CF9A16B" wp14:editId="7FB25165">
                   <wp:extent cx="2926080" cy="1662311"/>
                   <wp:effectExtent l="0" t="0" r="0" b="0"/>
                   <wp:docPr id="9" name="Picture 9"/>
@@ -9462,7 +9453,7 @@
                 <w:noProof/>
               </w:rPr>
               <w:drawing>
-                <wp:inline distT="0" distB="0" distL="0" distR="0" wp14:anchorId="221169B9" wp14:editId="111196A2">
+                <wp:inline distT="0" distB="0" distL="0" distR="0" wp14:anchorId="76E9937D" wp14:editId="79CC0FBA">
                   <wp:extent cx="2926080" cy="1801004"/>
                   <wp:effectExtent l="0" t="0" r="0" b="0"/>
                   <wp:docPr id="10" name="Picture 10"/>
@@ -9567,7 +9558,7 @@
         <w:pStyle w:val="Ttulo1"/>
         <w:spacing w:before="100" w:after="30"/>
       </w:pPr>
-      <w:bookmarkStart w:id="15" w:name="_Toc237717615"/>
+      <w:bookmarkStart w:id="15" w:name="_Toc237718606"/>
       <w:r>
         <w:rPr>
           <w:rFonts w:ascii="Georgia" w:hAnsi="Georgia"/>
@@ -9583,7 +9574,7 @@
         <w:pStyle w:val="Ttulo2"/>
         <w:spacing w:before="70" w:after="20"/>
       </w:pPr>
-      <w:bookmarkStart w:id="16" w:name="_Toc237717616"/>
+      <w:bookmarkStart w:id="16" w:name="_Toc237718607"/>
       <w:r>
         <w:rPr>
           <w:rFonts w:ascii="Georgia" w:hAnsi="Georgia"/>
@@ -10022,7 +10013,7 @@
         <w:pStyle w:val="Ttulo2"/>
         <w:spacing w:before="70" w:after="20"/>
       </w:pPr>
-      <w:bookmarkStart w:id="17" w:name="_Toc237717617"/>
+      <w:bookmarkStart w:id="17" w:name="_Toc237718608"/>
       <w:r>
         <w:rPr>
           <w:rFonts w:ascii="Georgia" w:hAnsi="Georgia"/>
@@ -10050,7 +10041,7 @@
         <w:pStyle w:val="Ttulo1"/>
         <w:spacing w:before="100" w:after="30"/>
       </w:pPr>
-      <w:bookmarkStart w:id="18" w:name="_Toc237717618"/>
+      <w:bookmarkStart w:id="18" w:name="_Toc237718609"/>
       <w:r>
         <w:rPr>
           <w:rFonts w:ascii="Georgia" w:hAnsi="Georgia"/>
@@ -10066,7 +10057,7 @@
         <w:pStyle w:val="Ttulo2"/>
         <w:spacing w:before="70" w:after="20"/>
       </w:pPr>
-      <w:bookmarkStart w:id="19" w:name="_Toc237717619"/>
+      <w:bookmarkStart w:id="19" w:name="_Toc237718610"/>
       <w:r>
         <w:rPr>
           <w:rFonts w:ascii="Georgia" w:hAnsi="Georgia"/>
@@ -10093,7 +10084,7 @@
         <w:pStyle w:val="Ttulo2"/>
         <w:spacing w:before="70" w:after="20"/>
       </w:pPr>
-      <w:bookmarkStart w:id="20" w:name="_Toc237717620"/>
+      <w:bookmarkStart w:id="20" w:name="_Toc237718611"/>
       <w:r>
         <w:rPr>
           <w:rFonts w:ascii="Georgia" w:hAnsi="Georgia"/>
@@ -10151,7 +10142,7 @@
                 <w:noProof/>
               </w:rPr>
               <w:drawing>
-                <wp:inline distT="0" distB="0" distL="0" distR="0" wp14:anchorId="6ACC6FB5" wp14:editId="3FE66F0F">
+                <wp:inline distT="0" distB="0" distL="0" distR="0" wp14:anchorId="24845360" wp14:editId="037F46A5">
                   <wp:extent cx="2926080" cy="1714660"/>
                   <wp:effectExtent l="0" t="0" r="0" b="0"/>
                   <wp:docPr id="11" name="Picture 11"/>
@@ -10210,7 +10201,7 @@
                 <w:noProof/>
               </w:rPr>
               <w:drawing>
-                <wp:inline distT="0" distB="0" distL="0" distR="0" wp14:anchorId="063F797B" wp14:editId="4C240DCB">
+                <wp:inline distT="0" distB="0" distL="0" distR="0" wp14:anchorId="44C5E755" wp14:editId="774874FA">
                   <wp:extent cx="2926080" cy="1558188"/>
                   <wp:effectExtent l="0" t="0" r="0" b="0"/>
                   <wp:docPr id="12" name="Picture 12"/>
@@ -11180,7 +11171,7 @@
         <w:pStyle w:val="Ttulo1"/>
         <w:spacing w:before="100" w:after="30"/>
       </w:pPr>
-      <w:bookmarkStart w:id="21" w:name="_Toc237717621"/>
+      <w:bookmarkStart w:id="21" w:name="_Toc237718612"/>
       <w:r>
         <w:rPr>
           <w:rFonts w:ascii="Georgia" w:hAnsi="Georgia"/>
@@ -11197,7 +11188,7 @@
         <w:pStyle w:val="Ttulo2"/>
         <w:spacing w:before="70" w:after="20"/>
       </w:pPr>
-      <w:bookmarkStart w:id="22" w:name="_Toc237717622"/>
+      <w:bookmarkStart w:id="22" w:name="_Toc237718613"/>
       <w:r>
         <w:rPr>
           <w:rFonts w:ascii="Georgia" w:hAnsi="Georgia"/>
@@ -11289,7 +11280,7 @@
         <w:pStyle w:val="Ttulo2"/>
         <w:spacing w:before="70" w:after="20"/>
       </w:pPr>
-      <w:bookmarkStart w:id="23" w:name="_Toc237717623"/>
+      <w:bookmarkStart w:id="23" w:name="_Toc237718614"/>
       <w:r>
         <w:rPr>
           <w:rFonts w:ascii="Georgia" w:hAnsi="Georgia"/>
@@ -11520,7 +11511,7 @@
                 <w:noProof/>
               </w:rPr>
               <w:drawing>
-                <wp:inline distT="0" distB="0" distL="0" distR="0" wp14:anchorId="1E3201BC" wp14:editId="7F794CBB">
+                <wp:inline distT="0" distB="0" distL="0" distR="0" wp14:anchorId="31BC9781" wp14:editId="2B0CECEE">
                   <wp:extent cx="2926080" cy="1540391"/>
                   <wp:effectExtent l="0" t="0" r="0" b="0"/>
                   <wp:docPr id="13" name="Picture 13"/>
@@ -11579,7 +11570,7 @@
                 <w:noProof/>
               </w:rPr>
               <w:drawing>
-                <wp:inline distT="0" distB="0" distL="0" distR="0" wp14:anchorId="6B818E0E" wp14:editId="64338D1E">
+                <wp:inline distT="0" distB="0" distL="0" distR="0" wp14:anchorId="29EA41BA" wp14:editId="1AE83931">
                   <wp:extent cx="2926080" cy="1658038"/>
                   <wp:effectExtent l="0" t="0" r="0" b="0"/>
                   <wp:docPr id="14" name="Picture 14"/>
@@ -11684,7 +11675,7 @@
         <w:pStyle w:val="Ttulo2"/>
         <w:spacing w:before="70" w:after="20"/>
       </w:pPr>
-      <w:bookmarkStart w:id="24" w:name="_Toc237717624"/>
+      <w:bookmarkStart w:id="24" w:name="_Toc237718615"/>
       <w:r>
         <w:rPr>
           <w:rFonts w:ascii="Georgia" w:hAnsi="Georgia"/>
@@ -12612,7 +12603,7 @@
         <w:pStyle w:val="Ttulo1"/>
         <w:spacing w:before="100" w:after="30"/>
       </w:pPr>
-      <w:bookmarkStart w:id="25" w:name="_Toc237717625"/>
+      <w:bookmarkStart w:id="25" w:name="_Toc237718616"/>
       <w:r>
         <w:rPr>
           <w:rFonts w:ascii="Georgia" w:hAnsi="Georgia"/>
@@ -12628,7 +12619,7 @@
         <w:pStyle w:val="Ttulo2"/>
         <w:spacing w:before="70" w:after="20"/>
       </w:pPr>
-      <w:bookmarkStart w:id="26" w:name="_Toc237717626"/>
+      <w:bookmarkStart w:id="26" w:name="_Toc237718617"/>
       <w:r>
         <w:rPr>
           <w:rFonts w:ascii="Georgia" w:hAnsi="Georgia"/>
@@ -14217,7 +14208,7 @@
         <w:pStyle w:val="Ttulo2"/>
         <w:spacing w:before="70" w:after="20"/>
       </w:pPr>
-      <w:bookmarkStart w:id="27" w:name="_Toc237717627"/>
+      <w:bookmarkStart w:id="27" w:name="_Toc237718618"/>
       <w:r>
         <w:rPr>
           <w:rFonts w:ascii="Georgia" w:hAnsi="Georgia"/>
@@ -14327,7 +14318,7 @@
         <w:pStyle w:val="Ttulo1"/>
         <w:spacing w:before="100" w:after="30"/>
       </w:pPr>
-      <w:bookmarkStart w:id="28" w:name="_Toc237717628"/>
+      <w:bookmarkStart w:id="28" w:name="_Toc237718619"/>
       <w:r>
         <w:rPr>
           <w:rFonts w:ascii="Georgia" w:hAnsi="Georgia"/>
@@ -14344,7 +14335,7 @@
         <w:pStyle w:val="Ttulo2"/>
         <w:spacing w:before="70" w:after="20"/>
       </w:pPr>
-      <w:bookmarkStart w:id="29" w:name="_Toc237717629"/>
+      <w:bookmarkStart w:id="29" w:name="_Toc237718620"/>
       <w:r>
         <w:rPr>
           <w:rFonts w:ascii="Georgia" w:hAnsi="Georgia"/>
@@ -14371,7 +14362,7 @@
         <w:pStyle w:val="Ttulo2"/>
         <w:spacing w:before="70" w:after="20"/>
       </w:pPr>
-      <w:bookmarkStart w:id="30" w:name="_Toc237717630"/>
+      <w:bookmarkStart w:id="30" w:name="_Toc237718621"/>
       <w:r>
         <w:rPr>
           <w:rFonts w:ascii="Georgia" w:hAnsi="Georgia"/>
@@ -14429,7 +14420,7 @@
                 <w:noProof/>
               </w:rPr>
               <w:drawing>
-                <wp:inline distT="0" distB="0" distL="0" distR="0" wp14:anchorId="28B9B69B" wp14:editId="779F11B3">
+                <wp:inline distT="0" distB="0" distL="0" distR="0" wp14:anchorId="59E6BE41" wp14:editId="041D98F6">
                   <wp:extent cx="2926080" cy="1534596"/>
                   <wp:effectExtent l="0" t="0" r="0" b="0"/>
                   <wp:docPr id="15" name="Picture 15"/>
@@ -14488,7 +14479,7 @@
                 <w:noProof/>
               </w:rPr>
               <w:drawing>
-                <wp:inline distT="0" distB="0" distL="0" distR="0" wp14:anchorId="2C77057A" wp14:editId="6D19E020">
+                <wp:inline distT="0" distB="0" distL="0" distR="0" wp14:anchorId="7E81C492" wp14:editId="535EFF83">
                   <wp:extent cx="2926080" cy="1680519"/>
                   <wp:effectExtent l="0" t="0" r="0" b="0"/>
                   <wp:docPr id="16" name="Picture 16"/>
@@ -14604,7 +14595,7 @@
         <w:pStyle w:val="Ttulo1"/>
         <w:spacing w:before="100" w:after="30"/>
       </w:pPr>
-      <w:bookmarkStart w:id="31" w:name="_Toc237717631"/>
+      <w:bookmarkStart w:id="31" w:name="_Toc237718622"/>
       <w:r>
         <w:rPr>
           <w:rFonts w:ascii="Georgia" w:hAnsi="Georgia"/>
@@ -14620,7 +14611,7 @@
         <w:pStyle w:val="Ttulo2"/>
         <w:spacing w:before="70" w:after="20"/>
       </w:pPr>
-      <w:bookmarkStart w:id="32" w:name="_Toc237717632"/>
+      <w:bookmarkStart w:id="32" w:name="_Toc237718623"/>
       <w:r>
         <w:rPr>
           <w:rFonts w:ascii="Georgia" w:hAnsi="Georgia"/>
@@ -15667,7 +15658,7 @@
         <w:pStyle w:val="Ttulo2"/>
         <w:spacing w:before="70" w:after="20"/>
       </w:pPr>
-      <w:bookmarkStart w:id="33" w:name="_Toc237717633"/>
+      <w:bookmarkStart w:id="33" w:name="_Toc237718624"/>
       <w:r>
         <w:rPr>
           <w:rFonts w:ascii="Georgia" w:hAnsi="Georgia"/>
@@ -15828,7 +15819,7 @@
         <w:pStyle w:val="Ttulo2"/>
         <w:spacing w:before="70" w:after="20"/>
       </w:pPr>
-      <w:bookmarkStart w:id="34" w:name="_Toc237717634"/>
+      <w:bookmarkStart w:id="34" w:name="_Toc237718625"/>
       <w:r>
         <w:rPr>
           <w:rFonts w:ascii="Georgia" w:hAnsi="Georgia"/>
@@ -15855,7 +15846,7 @@
         <w:pStyle w:val="Ttulo1"/>
         <w:spacing w:before="100" w:after="30"/>
       </w:pPr>
-      <w:bookmarkStart w:id="35" w:name="_Toc237717635"/>
+      <w:bookmarkStart w:id="35" w:name="_Toc237718626"/>
       <w:r>
         <w:rPr>
           <w:rFonts w:ascii="Georgia" w:hAnsi="Georgia"/>
@@ -15871,7 +15862,7 @@
         <w:pStyle w:val="Ttulo2"/>
         <w:spacing w:before="70" w:after="20"/>
       </w:pPr>
-      <w:bookmarkStart w:id="36" w:name="_Toc237717636"/>
+      <w:bookmarkStart w:id="36" w:name="_Toc237718627"/>
       <w:r>
         <w:rPr>
           <w:rFonts w:ascii="Georgia" w:hAnsi="Georgia"/>
@@ -18798,7 +18789,7 @@
         <w:pStyle w:val="Ttulo1"/>
         <w:spacing w:before="100" w:after="30"/>
       </w:pPr>
-      <w:bookmarkStart w:id="37" w:name="_Toc237717637"/>
+      <w:bookmarkStart w:id="37" w:name="_Toc237718628"/>
       <w:r>
         <w:rPr>
           <w:rFonts w:ascii="Georgia" w:hAnsi="Georgia"/>
@@ -18815,7 +18806,7 @@
         <w:pStyle w:val="Ttulo2"/>
         <w:spacing w:before="70" w:after="20"/>
       </w:pPr>
-      <w:bookmarkStart w:id="38" w:name="_Toc237717638"/>
+      <w:bookmarkStart w:id="38" w:name="_Toc237718629"/>
       <w:r>
         <w:rPr>
           <w:rFonts w:ascii="Georgia" w:hAnsi="Georgia"/>
@@ -19000,7 +18991,7 @@
         <w:pStyle w:val="Ttulo2"/>
         <w:spacing w:before="70" w:after="20"/>
       </w:pPr>
-      <w:bookmarkStart w:id="39" w:name="_Toc237717639"/>
+      <w:bookmarkStart w:id="39" w:name="_Toc237718630"/>
       <w:r>
         <w:rPr>
           <w:rFonts w:ascii="Georgia" w:hAnsi="Georgia"/>
@@ -19058,7 +19049,7 @@
                 <w:noProof/>
               </w:rPr>
               <w:drawing>
-                <wp:inline distT="0" distB="0" distL="0" distR="0" wp14:anchorId="14B81E6B" wp14:editId="7673ACD5">
+                <wp:inline distT="0" distB="0" distL="0" distR="0" wp14:anchorId="7E7D22C5" wp14:editId="21ABEC22">
                   <wp:extent cx="2926080" cy="1626569"/>
                   <wp:effectExtent l="0" t="0" r="0" b="0"/>
                   <wp:docPr id="17" name="Picture 17"/>
@@ -19117,7 +19108,7 @@
                 <w:noProof/>
               </w:rPr>
               <w:drawing>
-                <wp:inline distT="0" distB="0" distL="0" distR="0" wp14:anchorId="4EBA6FE6" wp14:editId="6163A298">
+                <wp:inline distT="0" distB="0" distL="0" distR="0" wp14:anchorId="5B8EA4E6" wp14:editId="0A58EF83">
                   <wp:extent cx="2926080" cy="1691675"/>
                   <wp:effectExtent l="0" t="0" r="0" b="0"/>
                   <wp:docPr id="18" name="Picture 18"/>
@@ -19222,7 +19213,7 @@
         <w:pStyle w:val="Ttulo2"/>
         <w:spacing w:before="70" w:after="20"/>
       </w:pPr>
-      <w:bookmarkStart w:id="40" w:name="_Toc237717640"/>
+      <w:bookmarkStart w:id="40" w:name="_Toc237718631"/>
       <w:r>
         <w:rPr>
           <w:rFonts w:ascii="Georgia" w:hAnsi="Georgia"/>
@@ -19851,7 +19842,7 @@
         <w:pStyle w:val="Ttulo1"/>
         <w:spacing w:before="100" w:after="30"/>
       </w:pPr>
-      <w:bookmarkStart w:id="41" w:name="_Toc237717641"/>
+      <w:bookmarkStart w:id="41" w:name="_Toc237718632"/>
       <w:r>
         <w:rPr>
           <w:rFonts w:ascii="Georgia" w:hAnsi="Georgia"/>
@@ -19867,7 +19858,7 @@
         <w:pStyle w:val="Ttulo2"/>
         <w:spacing w:before="70" w:after="20"/>
       </w:pPr>
-      <w:bookmarkStart w:id="42" w:name="_Toc237717642"/>
+      <w:bookmarkStart w:id="42" w:name="_Toc237718633"/>
       <w:r>
         <w:rPr>
           <w:rFonts w:ascii="Georgia" w:hAnsi="Georgia"/>
@@ -19925,7 +19916,7 @@
                 <w:noProof/>
               </w:rPr>
               <w:drawing>
-                <wp:inline distT="0" distB="0" distL="0" distR="0" wp14:anchorId="46618B78" wp14:editId="273043CD">
+                <wp:inline distT="0" distB="0" distL="0" distR="0" wp14:anchorId="10E933E8" wp14:editId="5D79116A">
                   <wp:extent cx="2926080" cy="1495195"/>
                   <wp:effectExtent l="0" t="0" r="0" b="0"/>
                   <wp:docPr id="19" name="Picture 19"/>
@@ -19984,7 +19975,7 @@
                 <w:noProof/>
               </w:rPr>
               <w:drawing>
-                <wp:inline distT="0" distB="0" distL="0" distR="0" wp14:anchorId="01A5D4B6" wp14:editId="51DDF74C">
+                <wp:inline distT="0" distB="0" distL="0" distR="0" wp14:anchorId="089DE9F3" wp14:editId="2D24CBF9">
                   <wp:extent cx="2926080" cy="1682608"/>
                   <wp:effectExtent l="0" t="0" r="0" b="0"/>
                   <wp:docPr id="20" name="Picture 20"/>
@@ -21119,7 +21110,7 @@
         <w:pStyle w:val="Ttulo1"/>
         <w:spacing w:before="100" w:after="30"/>
       </w:pPr>
-      <w:bookmarkStart w:id="43" w:name="_Toc237717643"/>
+      <w:bookmarkStart w:id="43" w:name="_Toc237718634"/>
       <w:r>
         <w:rPr>
           <w:rFonts w:ascii="Georgia" w:hAnsi="Georgia"/>
@@ -21136,7 +21127,7 @@
         <w:pStyle w:val="Ttulo2"/>
         <w:spacing w:before="70" w:after="20"/>
       </w:pPr>
-      <w:bookmarkStart w:id="44" w:name="_Toc237717644"/>
+      <w:bookmarkStart w:id="44" w:name="_Toc237718635"/>
       <w:r>
         <w:rPr>
           <w:rFonts w:ascii="Georgia" w:hAnsi="Georgia"/>
@@ -21191,7 +21182,7 @@
         <w:pStyle w:val="Ttulo2"/>
         <w:spacing w:before="70" w:after="20"/>
       </w:pPr>
-      <w:bookmarkStart w:id="45" w:name="_Toc237717645"/>
+      <w:bookmarkStart w:id="45" w:name="_Toc237718636"/>
       <w:r>
         <w:rPr>
           <w:rFonts w:ascii="Georgia" w:hAnsi="Georgia"/>
@@ -21249,7 +21240,7 @@
                 <w:noProof/>
               </w:rPr>
               <w:drawing>
-                <wp:inline distT="0" distB="0" distL="0" distR="0" wp14:anchorId="4B650CC1" wp14:editId="7EA72DDD">
+                <wp:inline distT="0" distB="0" distL="0" distR="0" wp14:anchorId="77B1C7E0" wp14:editId="7A4DD3F5">
                   <wp:extent cx="2926080" cy="1682608"/>
                   <wp:effectExtent l="0" t="0" r="0" b="0"/>
                   <wp:docPr id="21" name="Picture 21"/>
@@ -21308,7 +21299,7 @@
                 <w:noProof/>
               </w:rPr>
               <w:drawing>
-                <wp:inline distT="0" distB="0" distL="0" distR="0" wp14:anchorId="6E976ABF" wp14:editId="41E71E24">
+                <wp:inline distT="0" distB="0" distL="0" distR="0" wp14:anchorId="16C95A50" wp14:editId="459A6FBA">
                   <wp:extent cx="2926080" cy="1549755"/>
                   <wp:effectExtent l="0" t="0" r="0" b="0"/>
                   <wp:docPr id="22" name="Picture 22"/>
@@ -21413,7 +21404,7 @@
         <w:pStyle w:val="Ttulo1"/>
         <w:spacing w:before="100" w:after="30"/>
       </w:pPr>
-      <w:bookmarkStart w:id="46" w:name="_Toc237717646"/>
+      <w:bookmarkStart w:id="46" w:name="_Toc237718637"/>
       <w:r>
         <w:rPr>
           <w:rFonts w:ascii="Georgia" w:hAnsi="Georgia"/>
@@ -21429,7 +21420,7 @@
         <w:pStyle w:val="Ttulo2"/>
         <w:spacing w:before="70" w:after="20"/>
       </w:pPr>
-      <w:bookmarkStart w:id="47" w:name="_Toc237717647"/>
+      <w:bookmarkStart w:id="47" w:name="_Toc237718638"/>
       <w:r>
         <w:rPr>
           <w:rFonts w:ascii="Georgia" w:hAnsi="Georgia"/>
@@ -22977,7 +22968,7 @@
         <w:pStyle w:val="Ttulo1"/>
         <w:spacing w:before="100" w:after="30"/>
       </w:pPr>
-      <w:bookmarkStart w:id="48" w:name="_Toc237717648"/>
+      <w:bookmarkStart w:id="48" w:name="_Toc237718639"/>
       <w:r>
         <w:rPr>
           <w:rFonts w:ascii="Georgia" w:hAnsi="Georgia"/>
@@ -22994,7 +22985,7 @@
         <w:pStyle w:val="Ttulo2"/>
         <w:spacing w:before="70" w:after="20"/>
       </w:pPr>
-      <w:bookmarkStart w:id="49" w:name="_Toc237717649"/>
+      <w:bookmarkStart w:id="49" w:name="_Toc237718640"/>
       <w:r>
         <w:rPr>
           <w:rFonts w:ascii="Georgia" w:hAnsi="Georgia"/>
@@ -23117,7 +23108,7 @@
                 <w:noProof/>
               </w:rPr>
               <w:drawing>
-                <wp:inline distT="0" distB="0" distL="0" distR="0" wp14:anchorId="5A7C358D" wp14:editId="6A1F4055">
+                <wp:inline distT="0" distB="0" distL="0" distR="0" wp14:anchorId="50BD030B" wp14:editId="7E2A99FB">
                   <wp:extent cx="2926080" cy="1695124"/>
                   <wp:effectExtent l="0" t="0" r="0" b="0"/>
                   <wp:docPr id="23" name="Picture 23"/>
@@ -23176,7 +23167,7 @@
                 <w:noProof/>
               </w:rPr>
               <w:drawing>
-                <wp:inline distT="0" distB="0" distL="0" distR="0" wp14:anchorId="4BF3DC1D" wp14:editId="65501934">
+                <wp:inline distT="0" distB="0" distL="0" distR="0" wp14:anchorId="43621BFC" wp14:editId="25D8584F">
                   <wp:extent cx="2926080" cy="1572627"/>
                   <wp:effectExtent l="0" t="0" r="0" b="0"/>
                   <wp:docPr id="24" name="Picture 24"/>
@@ -23281,7 +23272,7 @@
         <w:pStyle w:val="Ttulo2"/>
         <w:spacing w:before="70" w:after="20"/>
       </w:pPr>
-      <w:bookmarkStart w:id="50" w:name="_Toc237717650"/>
+      <w:bookmarkStart w:id="50" w:name="_Toc237718641"/>
       <w:r>
         <w:rPr>
           <w:rFonts w:ascii="Georgia" w:hAnsi="Georgia"/>
@@ -24016,7 +24007,7 @@
         <w:pStyle w:val="Ttulo2"/>
         <w:spacing w:before="70" w:after="20"/>
       </w:pPr>
-      <w:bookmarkStart w:id="51" w:name="_Toc237717651"/>
+      <w:bookmarkStart w:id="51" w:name="_Toc237718642"/>
       <w:r>
         <w:rPr>
           <w:rFonts w:ascii="Georgia" w:hAnsi="Georgia"/>
@@ -24066,7 +24057,7 @@
         <w:pStyle w:val="Ttulo2"/>
         <w:spacing w:before="70" w:after="20"/>
       </w:pPr>
-      <w:bookmarkStart w:id="52" w:name="_Toc237717652"/>
+      <w:bookmarkStart w:id="52" w:name="_Toc237718643"/>
       <w:r>
         <w:rPr>
           <w:rFonts w:ascii="Georgia" w:hAnsi="Georgia"/>
@@ -24147,7 +24138,7 @@
                 <w:noProof/>
               </w:rPr>
               <w:drawing>
-                <wp:inline distT="0" distB="0" distL="0" distR="0" wp14:anchorId="4CE3C378" wp14:editId="58CEBBCB">
+                <wp:inline distT="0" distB="0" distL="0" distR="0" wp14:anchorId="77C0864B" wp14:editId="2FECE2E8">
                   <wp:extent cx="2926080" cy="1696900"/>
                   <wp:effectExtent l="0" t="0" r="0" b="0"/>
                   <wp:docPr id="25" name="Picture 25"/>
@@ -24206,7 +24197,7 @@
                 <w:noProof/>
               </w:rPr>
               <w:drawing>
-                <wp:inline distT="0" distB="0" distL="0" distR="0" wp14:anchorId="0E07357D" wp14:editId="459BAE9D">
+                <wp:inline distT="0" distB="0" distL="0" distR="0" wp14:anchorId="2DC9BB45" wp14:editId="2F220981">
                   <wp:extent cx="2926080" cy="1614092"/>
                   <wp:effectExtent l="0" t="0" r="0" b="0"/>
                   <wp:docPr id="26" name="Picture 26"/>
@@ -25231,7 +25222,7 @@
         <w:pStyle w:val="Ttulo2"/>
         <w:spacing w:before="70" w:after="20"/>
       </w:pPr>
-      <w:bookmarkStart w:id="53" w:name="_Toc237717653"/>
+      <w:bookmarkStart w:id="53" w:name="_Toc237718644"/>
       <w:r>
         <w:rPr>
           <w:rFonts w:ascii="Georgia" w:hAnsi="Georgia"/>
@@ -25289,7 +25280,7 @@
                 <w:noProof/>
               </w:rPr>
               <w:drawing>
-                <wp:inline distT="0" distB="0" distL="0" distR="0" wp14:anchorId="00868B57" wp14:editId="449C34F7">
+                <wp:inline distT="0" distB="0" distL="0" distR="0" wp14:anchorId="47D35F9F" wp14:editId="130834BA">
                   <wp:extent cx="2926080" cy="1654733"/>
                   <wp:effectExtent l="0" t="0" r="0" b="0"/>
                   <wp:docPr id="27" name="Picture 27"/>
@@ -25348,7 +25339,7 @@
                 <w:noProof/>
               </w:rPr>
               <w:drawing>
-                <wp:inline distT="0" distB="0" distL="0" distR="0" wp14:anchorId="37A8AF97" wp14:editId="5D64FA36">
+                <wp:inline distT="0" distB="0" distL="0" distR="0" wp14:anchorId="3CDB6E81" wp14:editId="492B27C6">
                   <wp:extent cx="2926080" cy="1698212"/>
                   <wp:effectExtent l="0" t="0" r="0" b="0"/>
                   <wp:docPr id="28" name="Picture 28"/>
@@ -25463,7 +25454,7 @@
         <w:pStyle w:val="Ttulo1"/>
         <w:spacing w:before="100" w:after="30"/>
       </w:pPr>
-      <w:bookmarkStart w:id="54" w:name="_Toc237717654"/>
+      <w:bookmarkStart w:id="54" w:name="_Toc237718645"/>
       <w:r>
         <w:rPr>
           <w:rFonts w:ascii="Georgia" w:hAnsi="Georgia"/>
@@ -25480,7 +25471,7 @@
         <w:pStyle w:val="Ttulo2"/>
         <w:spacing w:before="70" w:after="20"/>
       </w:pPr>
-      <w:bookmarkStart w:id="55" w:name="_Toc237717655"/>
+      <w:bookmarkStart w:id="55" w:name="_Toc237718646"/>
       <w:r>
         <w:rPr>
           <w:rFonts w:ascii="Georgia" w:hAnsi="Georgia"/>
@@ -25541,7 +25532,7 @@
         <w:pStyle w:val="Ttulo2"/>
         <w:spacing w:before="70" w:after="20"/>
       </w:pPr>
-      <w:bookmarkStart w:id="56" w:name="_Toc237717656"/>
+      <w:bookmarkStart w:id="56" w:name="_Toc237718647"/>
       <w:r>
         <w:rPr>
           <w:rFonts w:ascii="Georgia" w:hAnsi="Georgia"/>
@@ -25616,7 +25607,7 @@
                 <w:noProof/>
               </w:rPr>
               <w:drawing>
-                <wp:inline distT="0" distB="0" distL="0" distR="0" wp14:anchorId="05DFD8F7" wp14:editId="77932C0E">
+                <wp:inline distT="0" distB="0" distL="0" distR="0" wp14:anchorId="17A1B9C3" wp14:editId="326037B8">
                   <wp:extent cx="2926080" cy="1650045"/>
                   <wp:effectExtent l="0" t="0" r="0" b="0"/>
                   <wp:docPr id="29" name="Picture 29"/>
@@ -25675,7 +25666,7 @@
                 <w:noProof/>
               </w:rPr>
               <w:drawing>
-                <wp:inline distT="0" distB="0" distL="0" distR="0" wp14:anchorId="640E1B5B" wp14:editId="0C3C5F15">
+                <wp:inline distT="0" distB="0" distL="0" distR="0" wp14:anchorId="30466B6E" wp14:editId="18942FC8">
                   <wp:extent cx="2926080" cy="1611196"/>
                   <wp:effectExtent l="0" t="0" r="0" b="0"/>
                   <wp:docPr id="30" name="Picture 30"/>
@@ -26163,7 +26154,7 @@
         <w:pStyle w:val="Ttulo2"/>
         <w:spacing w:before="70" w:after="20"/>
       </w:pPr>
-      <w:bookmarkStart w:id="57" w:name="_Toc237717657"/>
+      <w:bookmarkStart w:id="57" w:name="_Toc237718648"/>
       <w:r>
         <w:rPr>
           <w:rFonts w:ascii="Georgia" w:hAnsi="Georgia"/>
@@ -26237,7 +26228,7 @@
                 <w:noProof/>
               </w:rPr>
               <w:drawing>
-                <wp:inline distT="0" distB="0" distL="0" distR="0" wp14:anchorId="03186720" wp14:editId="5A38D678">
+                <wp:inline distT="0" distB="0" distL="0" distR="0" wp14:anchorId="07F9D6D0" wp14:editId="16B2A429">
                   <wp:extent cx="2926080" cy="1687777"/>
                   <wp:effectExtent l="0" t="0" r="0" b="0"/>
                   <wp:docPr id="31" name="Picture 31"/>
@@ -26832,7 +26823,7 @@
         <w:pStyle w:val="Ttulo2"/>
         <w:spacing w:before="70" w:after="20"/>
       </w:pPr>
-      <w:bookmarkStart w:id="58" w:name="_Toc237717658"/>
+      <w:bookmarkStart w:id="58" w:name="_Toc237718649"/>
       <w:r>
         <w:rPr>
           <w:rFonts w:ascii="Georgia" w:hAnsi="Georgia"/>
@@ -28091,7 +28082,7 @@
         <w:pStyle w:val="Ttulo1"/>
         <w:spacing w:before="100" w:after="30"/>
       </w:pPr>
-      <w:bookmarkStart w:id="59" w:name="_Toc237717659"/>
+      <w:bookmarkStart w:id="59" w:name="_Toc237718650"/>
       <w:r>
         <w:rPr>
           <w:rFonts w:ascii="Georgia" w:hAnsi="Georgia"/>
@@ -28279,7 +28270,7 @@
         <w:pStyle w:val="Ttulo1"/>
         <w:spacing w:before="100" w:after="30"/>
       </w:pPr>
-      <w:bookmarkStart w:id="60" w:name="_Toc237717660"/>
+      <w:bookmarkStart w:id="60" w:name="_Toc237718651"/>
       <w:r>
         <w:rPr>
           <w:rFonts w:ascii="Georgia" w:hAnsi="Georgia"/>
@@ -37408,7 +37399,7 @@
         <w:pStyle w:val="Ttulo1"/>
         <w:spacing w:before="100" w:after="30"/>
       </w:pPr>
-      <w:bookmarkStart w:id="61" w:name="_Toc237717661"/>
+      <w:bookmarkStart w:id="61" w:name="_Toc237718652"/>
       <w:r>
         <w:rPr>
           <w:rFonts w:ascii="Georgia" w:hAnsi="Georgia"/>
@@ -37880,7 +37871,7 @@
         <w:pStyle w:val="Ttulo1"/>
         <w:spacing w:before="100" w:after="30"/>
       </w:pPr>
-      <w:bookmarkStart w:id="62" w:name="_Toc237717662"/>
+      <w:bookmarkStart w:id="62" w:name="_Toc237718653"/>
       <w:r>
         <w:rPr>
           <w:rFonts w:ascii="Georgia" w:hAnsi="Georgia"/>
@@ -38384,31 +38375,31 @@
       </w:rPr>
     </w:lvl>
   </w:abstractNum>
-  <w:num w:numId="1" w16cid:durableId="245845060">
+  <w:num w:numId="1" w16cid:durableId="1149134917">
     <w:abstractNumId w:val="8"/>
   </w:num>
-  <w:num w:numId="2" w16cid:durableId="648097607">
+  <w:num w:numId="2" w16cid:durableId="238711205">
     <w:abstractNumId w:val="6"/>
   </w:num>
-  <w:num w:numId="3" w16cid:durableId="1090738369">
+  <w:num w:numId="3" w16cid:durableId="880556269">
     <w:abstractNumId w:val="5"/>
   </w:num>
-  <w:num w:numId="4" w16cid:durableId="1179613204">
+  <w:num w:numId="4" w16cid:durableId="621109021">
     <w:abstractNumId w:val="4"/>
   </w:num>
-  <w:num w:numId="5" w16cid:durableId="1194415086">
+  <w:num w:numId="5" w16cid:durableId="1100833236">
     <w:abstractNumId w:val="7"/>
   </w:num>
-  <w:num w:numId="6" w16cid:durableId="894270959">
+  <w:num w:numId="6" w16cid:durableId="190536559">
     <w:abstractNumId w:val="3"/>
   </w:num>
-  <w:num w:numId="7" w16cid:durableId="717513006">
+  <w:num w:numId="7" w16cid:durableId="1266041630">
     <w:abstractNumId w:val="2"/>
   </w:num>
-  <w:num w:numId="8" w16cid:durableId="348414378">
+  <w:num w:numId="8" w16cid:durableId="1586719013">
     <w:abstractNumId w:val="1"/>
   </w:num>
-  <w:num w:numId="9" w16cid:durableId="1694768777">
+  <w:num w:numId="9" w16cid:durableId="396364403">
     <w:abstractNumId w:val="0"/>
   </w:num>
 </w:numbering>
@@ -49840,7 +49831,7 @@
     <w:autoRedefine/>
     <w:uiPriority w:val="39"/>
     <w:unhideWhenUsed/>
-    <w:rsid w:val="006864CA"/>
+    <w:rsid w:val="00087351"/>
     <w:pPr>
       <w:spacing w:before="10" w:after="10" w:line="240" w:lineRule="auto"/>
     </w:pPr>
@@ -49855,7 +49846,7 @@
     <w:autoRedefine/>
     <w:uiPriority w:val="39"/>
     <w:unhideWhenUsed/>
-    <w:rsid w:val="006864CA"/>
+    <w:rsid w:val="00087351"/>
     <w:pPr>
       <w:spacing w:after="0" w:line="240" w:lineRule="auto"/>
       <w:ind w:left="170"/>
@@ -49869,7 +49860,7 @@
     <w:basedOn w:val="Fuentedeprrafopredeter"/>
     <w:uiPriority w:val="99"/>
     <w:unhideWhenUsed/>
-    <w:rsid w:val="006864CA"/>
+    <w:rsid w:val="00087351"/>
     <w:rPr>
       <w:color w:val="0000FF" w:themeColor="hyperlink"/>
       <w:u w:val="single"/>

</xml_diff>

<commit_message>
feat(reporte): Establecer Hoja 2 exclusiva de Aviso Legal y Marco Regulatorio y Hoja 3 de Indice General
</commit_message>
<xml_diff>
--- a/01_Reporte_PDF/Informe_Valuacion_Aluar_UNCuyo.docx
+++ b/01_Reporte_PDF/Informe_Valuacion_Aluar_UNCuyo.docx
@@ -1286,6 +1286,262 @@
     </w:p>
     <w:p>
       <w:pPr>
+        <w:spacing w:before="120" w:after="40"/>
+        <w:jc w:val="center"/>
+        <w:rPr>
+          <w:rFonts w:hint="eastAsia"/>
+        </w:rPr>
+      </w:pPr>
+      <w:r>
+        <w:rPr>
+          <w:b/>
+          <w:color w:val="0D233A"/>
+          <w:sz w:val="26"/>
+        </w:rPr>
+        <w:lastRenderedPageBreak/>
+        <w:t>Aviso Legal, Declaración de Responsabilidad y Marco Regulatorio</w:t>
+      </w:r>
+    </w:p>
+    <w:p>
+      <w:pPr>
+        <w:spacing w:after="160"/>
+        <w:jc w:val="center"/>
+        <w:rPr>
+          <w:rFonts w:hint="eastAsia"/>
+        </w:rPr>
+      </w:pPr>
+      <w:r>
+        <w:rPr>
+          <w:i/>
+          <w:color w:val="4A4A4A"/>
+        </w:rPr>
+        <w:t>Cumplimiento Normativo Ley N.º 26.831 de Mercado de Capitales y Resoluciones de la CNV</w:t>
+      </w:r>
+    </w:p>
+    <w:tbl>
+      <w:tblPr>
+        <w:tblW w:w="0" w:type="auto"/>
+        <w:jc w:val="center"/>
+        <w:tblBorders>
+          <w:top w:val="single" w:sz="4" w:space="0" w:color="D1D5DB"/>
+          <w:left w:val="single" w:sz="20" w:space="0" w:color="0D233A"/>
+          <w:bottom w:val="single" w:sz="4" w:space="0" w:color="D1D5DB"/>
+          <w:right w:val="single" w:sz="4" w:space="0" w:color="D1D5DB"/>
+        </w:tblBorders>
+        <w:tblLook w:val="04A0" w:firstRow="1" w:lastRow="0" w:firstColumn="1" w:lastColumn="0" w:noHBand="0" w:noVBand="1"/>
+      </w:tblPr>
+      <w:tblGrid>
+        <w:gridCol w:w="10095"/>
+      </w:tblGrid>
+      <w:tr>
+        <w:trPr>
+          <w:jc w:val="center"/>
+        </w:trPr>
+        <w:tc>
+          <w:tcPr>
+            <w:tcW w:w="10095" w:type="dxa"/>
+            <w:shd w:val="clear" w:color="auto" w:fill="F8FAFC"/>
+            <w:tcMar>
+              <w:top w:w="14" w:type="dxa"/>
+              <w:left w:w="25" w:type="dxa"/>
+              <w:bottom w:w="14" w:type="dxa"/>
+              <w:right w:w="25" w:type="dxa"/>
+            </w:tcMar>
+          </w:tcPr>
+          <w:p>
+            <w:pPr>
+              <w:spacing w:after="16"/>
+              <w:rPr>
+                <w:rFonts w:hint="eastAsia"/>
+              </w:rPr>
+            </w:pPr>
+            <w:r>
+              <w:rPr>
+                <w:b/>
+                <w:color w:val="0D233A"/>
+                <w:sz w:val="15"/>
+              </w:rPr>
+              <w:t>Marco Regulatorio y Términos de Uso del Documento</w:t>
+            </w:r>
+          </w:p>
+          <w:p>
+            <w:pPr>
+              <w:spacing w:after="16" w:line="245" w:lineRule="auto"/>
+              <w:rPr>
+                <w:rFonts w:hint="eastAsia"/>
+              </w:rPr>
+            </w:pPr>
+            <w:r>
+              <w:rPr>
+                <w:b/>
+                <w:sz w:val="14"/>
+              </w:rPr>
+              <w:t>1. Naturaleza y Propósito del Documento:</w:t>
+            </w:r>
+            <w:r>
+              <w:rPr>
+                <w:sz w:val="14"/>
+              </w:rPr>
+              <w:t xml:space="preserve"> El presente informe de </w:t>
+            </w:r>
+            <w:r>
+              <w:rPr>
+                <w:i/>
+                <w:sz w:val="14"/>
+              </w:rPr>
+              <w:t>Equity Research</w:t>
+            </w:r>
+            <w:r>
+              <w:rPr>
+                <w:sz w:val="14"/>
+              </w:rPr>
+              <w:t xml:space="preserve"> constituye un trabajo de investigación y valuación financiera fundamental desarrollado de manera independiente por Federico Agustín Chillón. Su finalidad es exclusivamente analítica, académica y profesional, orientada a evaluar la estructura patrimonial, operativa y el valor intrínseco de Aluar Aluminio Argentino S.A.I.C. (ALUA.BA).</w:t>
+            </w:r>
+          </w:p>
+          <w:p>
+            <w:pPr>
+              <w:spacing w:after="16" w:line="245" w:lineRule="auto"/>
+              <w:rPr>
+                <w:rFonts w:hint="eastAsia"/>
+              </w:rPr>
+            </w:pPr>
+            <w:r>
+              <w:rPr>
+                <w:b/>
+                <w:sz w:val="14"/>
+              </w:rPr>
+              <w:t>2. Ausencia de Oferta Pública y Asesoramiento Financiero:</w:t>
+            </w:r>
+            <w:r>
+              <w:rPr>
+                <w:sz w:val="14"/>
+              </w:rPr>
+              <w:t xml:space="preserve"> Este documento no constituye, ni debe interpretarse bajo ninguna circunstancia como una oferta pública de compra, venta, suscripción o negociación de valores negociables, ni como una invitación a realizar operaciones financieras o asesoramiento de inversión personalizado en los términos de la Ley de Mercado de Capitales N.º 26.831 y sus normas complementarias dictadas por la Comisión Nacional de Valores (CNV). Los inversores deben realizar su propia evaluación de riesgo y consultar a profesionales matricul</w:t>
+            </w:r>
+            <w:r>
+              <w:rPr>
+                <w:sz w:val="14"/>
+              </w:rPr>
+              <w:t>ados antes de adoptar decisiones de asignación de capital.</w:t>
+            </w:r>
+          </w:p>
+          <w:p>
+            <w:pPr>
+              <w:spacing w:after="16" w:line="245" w:lineRule="auto"/>
+              <w:rPr>
+                <w:rFonts w:hint="eastAsia"/>
+              </w:rPr>
+            </w:pPr>
+            <w:r>
+              <w:rPr>
+                <w:b/>
+                <w:sz w:val="14"/>
+              </w:rPr>
+              <w:t>3. Fuentes de Información y Calidad de los Datos:</w:t>
+            </w:r>
+            <w:r>
+              <w:rPr>
+                <w:sz w:val="14"/>
+              </w:rPr>
+              <w:t xml:space="preserve"> Las estimaciones, análisis y proyecciones expuestas se fundamentan en información de dominio público, incluyendo los Estados Financieros Auditados de Aluar (con dictamen de Price Waterhouse &amp; Co. S.R.L.), Memorias Anuales, hechos relevantes comunicados a la CNV y BYMA, estadísticas del London Metal Exchange (LME), datos macroeconómicos del Banco Central de la República Argentina (BCRA) y series de la Reserva Federal de San Luis (FRED). Si bien las fuentes se consideran fidedignas y verificables, no se otor</w:t>
+            </w:r>
+            <w:r>
+              <w:rPr>
+                <w:sz w:val="14"/>
+              </w:rPr>
+              <w:t>ga garantía explícita o implícita respecto a su exactitud absoluta o exhaustividad futura.</w:t>
+            </w:r>
+          </w:p>
+          <w:p>
+            <w:pPr>
+              <w:spacing w:after="16" w:line="245" w:lineRule="auto"/>
+              <w:rPr>
+                <w:rFonts w:hint="eastAsia"/>
+              </w:rPr>
+            </w:pPr>
+            <w:r>
+              <w:rPr>
+                <w:b/>
+                <w:sz w:val="14"/>
+              </w:rPr>
+              <w:t>4. Modelos Cuantitativos y Factores de Riesgo:</w:t>
+            </w:r>
+            <w:r>
+              <w:rPr>
+                <w:sz w:val="14"/>
+              </w:rPr>
+              <w:t xml:space="preserve"> El precio objetivo y las métricas de rendimiento proyectado son el resultado de modelos econométricos y financieros (Flujo de Fondos Descontados DCF, WACC con factor λ, Opciones Reales por Longstaff-Schwartz, simulación de Monte Carlo, GARCH y Cópulas de Clayton). Dichas metodologías incorporan supuestos sobre variables sujetas a incertidumbre y volatilidad (precio internacional del aluminio, costo de la energía, tipo de cambio real, tasa libre de riesgo y prima por riesgo país). Los resultados pasados o t</w:t>
+            </w:r>
+            <w:r>
+              <w:rPr>
+                <w:sz w:val="14"/>
+              </w:rPr>
+              <w:t>eóricos no garantizan rendimientos futuros.</w:t>
+            </w:r>
+          </w:p>
+          <w:p>
+            <w:pPr>
+              <w:spacing w:after="16" w:line="245" w:lineRule="auto"/>
+              <w:rPr>
+                <w:rFonts w:hint="eastAsia"/>
+              </w:rPr>
+            </w:pPr>
+            <w:r>
+              <w:rPr>
+                <w:b/>
+                <w:sz w:val="14"/>
+              </w:rPr>
+              <w:t>5. Declaración de Independencia y Conflicto de Intereses:</w:t>
+            </w:r>
+            <w:r>
+              <w:rPr>
+                <w:sz w:val="14"/>
+              </w:rPr>
+              <w:t xml:space="preserve"> El autor declara bajo juramento no poseer tenencias accionarias, opciones ni intereses económicos directos o indirectos en Aluar Aluminio Argentino S.A.I.C. que puedan condicionar la objetividad e imparcialidad de las conclusiones formuladas en este reporte.</w:t>
+            </w:r>
+          </w:p>
+        </w:tc>
+      </w:tr>
+    </w:tbl>
+    <w:p>
+      <w:pPr>
+        <w:spacing w:before="240" w:after="0"/>
+        <w:rPr>
+          <w:rFonts w:hint="eastAsia"/>
+        </w:rPr>
+      </w:pPr>
+      <w:r>
+        <w:rPr>
+          <w:b/>
+          <w:color w:val="4A4A4A"/>
+          <w:sz w:val="14"/>
+        </w:rPr>
+        <w:t>Registro de Emisión:</w:t>
+      </w:r>
+      <w:r>
+        <w:rPr>
+          <w:color w:val="4A4A4A"/>
+          <w:sz w:val="14"/>
+        </w:rPr>
+        <w:t xml:space="preserve"> Elaborado en Mendoza, Argentina. Fecha de cierre de datos y modelos: 23 de julio de 2026. Publicación oficial: 5 de agosto de 2026. Contacto técnico: federico.chillon@fce.uncu.edu.ar.</w:t>
+      </w:r>
+    </w:p>
+    <w:p>
+      <w:pPr>
+        <w:rPr>
+          <w:rFonts w:hint="eastAsia"/>
+        </w:rPr>
+        <w:sectPr>
+          <w:pgSz w:w="11909" w:h="16834"/>
+          <w:pgMar w:top="907" w:right="907" w:bottom="907" w:left="907" w:header="432" w:footer="432" w:gutter="0"/>
+          <w:cols w:space="720"/>
+          <w:titlePg/>
+          <w:docGrid w:linePitch="360"/>
+        </w:sectPr>
+      </w:pPr>
+    </w:p>
+    <w:p>
+      <w:pPr>
         <w:spacing w:before="80" w:after="40"/>
         <w:jc w:val="center"/>
         <w:rPr>
@@ -1330,7 +1586,7 @@
         </w:rPr>
         <w:fldChar w:fldCharType="separate"/>
       </w:r>
-      <w:hyperlink w:anchor="_Toc237718591" w:history="1">
+      <w:hyperlink w:anchor="_Toc237720015" w:history="1">
         <w:r>
           <w:rPr>
             <w:rStyle w:val="Hipervnculo"/>
@@ -1357,7 +1613,7 @@
             <w:noProof/>
             <w:webHidden/>
           </w:rPr>
-          <w:instrText xml:space="preserve"> PAGEREF _Toc237718591 \h </w:instrText>
+          <w:instrText xml:space="preserve"> PAGEREF _Toc237720015 \h </w:instrText>
         </w:r>
         <w:r>
           <w:rPr>
@@ -1377,7 +1633,7 @@
             <w:noProof/>
             <w:webHidden/>
           </w:rPr>
-          <w:t>3</w:t>
+          <w:t>4</w:t>
         </w:r>
         <w:r>
           <w:rPr>
@@ -1404,7 +1660,7 @@
           <w14:ligatures w14:val="standardContextual"/>
         </w:rPr>
       </w:pPr>
-      <w:hyperlink w:anchor="_Toc237718592" w:history="1">
+      <w:hyperlink w:anchor="_Toc237720016" w:history="1">
         <w:r>
           <w:rPr>
             <w:rStyle w:val="Hipervnculo"/>
@@ -1431,7 +1687,7 @@
             <w:noProof/>
             <w:webHidden/>
           </w:rPr>
-          <w:instrText xml:space="preserve"> PAGEREF _Toc237718592 \h </w:instrText>
+          <w:instrText xml:space="preserve"> PAGEREF _Toc237720016 \h </w:instrText>
         </w:r>
         <w:r>
           <w:rPr>
@@ -1451,7 +1707,7 @@
             <w:noProof/>
             <w:webHidden/>
           </w:rPr>
-          <w:t>3</w:t>
+          <w:t>4</w:t>
         </w:r>
         <w:r>
           <w:rPr>
@@ -1478,7 +1734,7 @@
           <w14:ligatures w14:val="standardContextual"/>
         </w:rPr>
       </w:pPr>
-      <w:hyperlink w:anchor="_Toc237718593" w:history="1">
+      <w:hyperlink w:anchor="_Toc237720017" w:history="1">
         <w:r>
           <w:rPr>
             <w:rStyle w:val="Hipervnculo"/>
@@ -1505,7 +1761,7 @@
             <w:noProof/>
             <w:webHidden/>
           </w:rPr>
-          <w:instrText xml:space="preserve"> PAGEREF _Toc237718593 \h </w:instrText>
+          <w:instrText xml:space="preserve"> PAGEREF _Toc237720017 \h </w:instrText>
         </w:r>
         <w:r>
           <w:rPr>
@@ -1525,7 +1781,7 @@
             <w:noProof/>
             <w:webHidden/>
           </w:rPr>
-          <w:t>3</w:t>
+          <w:t>4</w:t>
         </w:r>
         <w:r>
           <w:rPr>
@@ -1552,7 +1808,7 @@
           <w14:ligatures w14:val="standardContextual"/>
         </w:rPr>
       </w:pPr>
-      <w:hyperlink w:anchor="_Toc237718594" w:history="1">
+      <w:hyperlink w:anchor="_Toc237720018" w:history="1">
         <w:r>
           <w:rPr>
             <w:rStyle w:val="Hipervnculo"/>
@@ -1579,7 +1835,7 @@
             <w:noProof/>
             <w:webHidden/>
           </w:rPr>
-          <w:instrText xml:space="preserve"> PAGEREF _Toc237718594 \h </w:instrText>
+          <w:instrText xml:space="preserve"> PAGEREF _Toc237720018 \h </w:instrText>
         </w:r>
         <w:r>
           <w:rPr>
@@ -1599,7 +1855,7 @@
             <w:noProof/>
             <w:webHidden/>
           </w:rPr>
-          <w:t>3</w:t>
+          <w:t>4</w:t>
         </w:r>
         <w:r>
           <w:rPr>
@@ -1626,7 +1882,7 @@
           <w14:ligatures w14:val="standardContextual"/>
         </w:rPr>
       </w:pPr>
-      <w:hyperlink w:anchor="_Toc237718595" w:history="1">
+      <w:hyperlink w:anchor="_Toc237720019" w:history="1">
         <w:r>
           <w:rPr>
             <w:rStyle w:val="Hipervnculo"/>
@@ -1653,7 +1909,7 @@
             <w:noProof/>
             <w:webHidden/>
           </w:rPr>
-          <w:instrText xml:space="preserve"> PAGEREF _Toc237718595 \h </w:instrText>
+          <w:instrText xml:space="preserve"> PAGEREF _Toc237720019 \h </w:instrText>
         </w:r>
         <w:r>
           <w:rPr>
@@ -1673,7 +1929,7 @@
             <w:noProof/>
             <w:webHidden/>
           </w:rPr>
-          <w:t>3</w:t>
+          <w:t>4</w:t>
         </w:r>
         <w:r>
           <w:rPr>
@@ -1700,7 +1956,7 @@
           <w14:ligatures w14:val="standardContextual"/>
         </w:rPr>
       </w:pPr>
-      <w:hyperlink w:anchor="_Toc237718596" w:history="1">
+      <w:hyperlink w:anchor="_Toc237720020" w:history="1">
         <w:r>
           <w:rPr>
             <w:rStyle w:val="Hipervnculo"/>
@@ -1727,7 +1983,7 @@
             <w:noProof/>
             <w:webHidden/>
           </w:rPr>
-          <w:instrText xml:space="preserve"> PAGEREF _Toc237718596 \h </w:instrText>
+          <w:instrText xml:space="preserve"> PAGEREF _Toc237720020 \h </w:instrText>
         </w:r>
         <w:r>
           <w:rPr>
@@ -1747,7 +2003,7 @@
             <w:noProof/>
             <w:webHidden/>
           </w:rPr>
-          <w:t>4</w:t>
+          <w:t>5</w:t>
         </w:r>
         <w:r>
           <w:rPr>
@@ -1774,7 +2030,7 @@
           <w14:ligatures w14:val="standardContextual"/>
         </w:rPr>
       </w:pPr>
-      <w:hyperlink w:anchor="_Toc237718597" w:history="1">
+      <w:hyperlink w:anchor="_Toc237720021" w:history="1">
         <w:r>
           <w:rPr>
             <w:rStyle w:val="Hipervnculo"/>
@@ -1801,7 +2057,7 @@
             <w:noProof/>
             <w:webHidden/>
           </w:rPr>
-          <w:instrText xml:space="preserve"> PAGEREF _Toc237718597 \h </w:instrText>
+          <w:instrText xml:space="preserve"> PAGEREF _Toc237720021 \h </w:instrText>
         </w:r>
         <w:r>
           <w:rPr>
@@ -1821,7 +2077,7 @@
             <w:noProof/>
             <w:webHidden/>
           </w:rPr>
-          <w:t>4</w:t>
+          <w:t>5</w:t>
         </w:r>
         <w:r>
           <w:rPr>
@@ -1848,7 +2104,7 @@
           <w14:ligatures w14:val="standardContextual"/>
         </w:rPr>
       </w:pPr>
-      <w:hyperlink w:anchor="_Toc237718598" w:history="1">
+      <w:hyperlink w:anchor="_Toc237720022" w:history="1">
         <w:r>
           <w:rPr>
             <w:rStyle w:val="Hipervnculo"/>
@@ -1875,7 +2131,7 @@
             <w:noProof/>
             <w:webHidden/>
           </w:rPr>
-          <w:instrText xml:space="preserve"> PAGEREF _Toc237718598 \h </w:instrText>
+          <w:instrText xml:space="preserve"> PAGEREF _Toc237720022 \h </w:instrText>
         </w:r>
         <w:r>
           <w:rPr>
@@ -1895,7 +2151,7 @@
             <w:noProof/>
             <w:webHidden/>
           </w:rPr>
-          <w:t>4</w:t>
+          <w:t>5</w:t>
         </w:r>
         <w:r>
           <w:rPr>
@@ -1922,7 +2178,7 @@
           <w14:ligatures w14:val="standardContextual"/>
         </w:rPr>
       </w:pPr>
-      <w:hyperlink w:anchor="_Toc237718599" w:history="1">
+      <w:hyperlink w:anchor="_Toc237720023" w:history="1">
         <w:r>
           <w:rPr>
             <w:rStyle w:val="Hipervnculo"/>
@@ -1949,7 +2205,7 @@
             <w:noProof/>
             <w:webHidden/>
           </w:rPr>
-          <w:instrText xml:space="preserve"> PAGEREF _Toc237718599 \h </w:instrText>
+          <w:instrText xml:space="preserve"> PAGEREF _Toc237720023 \h </w:instrText>
         </w:r>
         <w:r>
           <w:rPr>
@@ -1969,7 +2225,7 @@
             <w:noProof/>
             <w:webHidden/>
           </w:rPr>
-          <w:t>4</w:t>
+          <w:t>5</w:t>
         </w:r>
         <w:r>
           <w:rPr>
@@ -1996,7 +2252,7 @@
           <w14:ligatures w14:val="standardContextual"/>
         </w:rPr>
       </w:pPr>
-      <w:hyperlink w:anchor="_Toc237718600" w:history="1">
+      <w:hyperlink w:anchor="_Toc237720024" w:history="1">
         <w:r>
           <w:rPr>
             <w:rStyle w:val="Hipervnculo"/>
@@ -2023,7 +2279,7 @@
             <w:noProof/>
             <w:webHidden/>
           </w:rPr>
-          <w:instrText xml:space="preserve"> PAGEREF _Toc237718600 \h </w:instrText>
+          <w:instrText xml:space="preserve"> PAGEREF _Toc237720024 \h </w:instrText>
         </w:r>
         <w:r>
           <w:rPr>
@@ -2043,7 +2299,7 @@
             <w:noProof/>
             <w:webHidden/>
           </w:rPr>
-          <w:t>5</w:t>
+          <w:t>6</w:t>
         </w:r>
         <w:r>
           <w:rPr>
@@ -2070,7 +2326,7 @@
           <w14:ligatures w14:val="standardContextual"/>
         </w:rPr>
       </w:pPr>
-      <w:hyperlink w:anchor="_Toc237718601" w:history="1">
+      <w:hyperlink w:anchor="_Toc237720025" w:history="1">
         <w:r>
           <w:rPr>
             <w:rStyle w:val="Hipervnculo"/>
@@ -2097,7 +2353,7 @@
             <w:noProof/>
             <w:webHidden/>
           </w:rPr>
-          <w:instrText xml:space="preserve"> PAGEREF _Toc237718601 \h </w:instrText>
+          <w:instrText xml:space="preserve"> PAGEREF _Toc237720025 \h </w:instrText>
         </w:r>
         <w:r>
           <w:rPr>
@@ -2117,7 +2373,7 @@
             <w:noProof/>
             <w:webHidden/>
           </w:rPr>
-          <w:t>5</w:t>
+          <w:t>6</w:t>
         </w:r>
         <w:r>
           <w:rPr>
@@ -2144,7 +2400,7 @@
           <w14:ligatures w14:val="standardContextual"/>
         </w:rPr>
       </w:pPr>
-      <w:hyperlink w:anchor="_Toc237718602" w:history="1">
+      <w:hyperlink w:anchor="_Toc237720026" w:history="1">
         <w:r>
           <w:rPr>
             <w:rStyle w:val="Hipervnculo"/>
@@ -2171,7 +2427,7 @@
             <w:noProof/>
             <w:webHidden/>
           </w:rPr>
-          <w:instrText xml:space="preserve"> PAGEREF _Toc237718602 \h </w:instrText>
+          <w:instrText xml:space="preserve"> PAGEREF _Toc237720026 \h </w:instrText>
         </w:r>
         <w:r>
           <w:rPr>
@@ -2191,7 +2447,7 @@
             <w:noProof/>
             <w:webHidden/>
           </w:rPr>
-          <w:t>5</w:t>
+          <w:t>6</w:t>
         </w:r>
         <w:r>
           <w:rPr>
@@ -2218,7 +2474,7 @@
           <w14:ligatures w14:val="standardContextual"/>
         </w:rPr>
       </w:pPr>
-      <w:hyperlink w:anchor="_Toc237718603" w:history="1">
+      <w:hyperlink w:anchor="_Toc237720027" w:history="1">
         <w:r>
           <w:rPr>
             <w:rStyle w:val="Hipervnculo"/>
@@ -2245,7 +2501,7 @@
             <w:noProof/>
             <w:webHidden/>
           </w:rPr>
-          <w:instrText xml:space="preserve"> PAGEREF _Toc237718603 \h </w:instrText>
+          <w:instrText xml:space="preserve"> PAGEREF _Toc237720027 \h </w:instrText>
         </w:r>
         <w:r>
           <w:rPr>
@@ -2265,7 +2521,7 @@
             <w:noProof/>
             <w:webHidden/>
           </w:rPr>
-          <w:t>6</w:t>
+          <w:t>7</w:t>
         </w:r>
         <w:r>
           <w:rPr>
@@ -2292,7 +2548,7 @@
           <w14:ligatures w14:val="standardContextual"/>
         </w:rPr>
       </w:pPr>
-      <w:hyperlink w:anchor="_Toc237718604" w:history="1">
+      <w:hyperlink w:anchor="_Toc237720028" w:history="1">
         <w:r>
           <w:rPr>
             <w:rStyle w:val="Hipervnculo"/>
@@ -2319,7 +2575,7 @@
             <w:noProof/>
             <w:webHidden/>
           </w:rPr>
-          <w:instrText xml:space="preserve"> PAGEREF _Toc237718604 \h </w:instrText>
+          <w:instrText xml:space="preserve"> PAGEREF _Toc237720028 \h </w:instrText>
         </w:r>
         <w:r>
           <w:rPr>
@@ -2339,7 +2595,7 @@
             <w:noProof/>
             <w:webHidden/>
           </w:rPr>
-          <w:t>6</w:t>
+          <w:t>7</w:t>
         </w:r>
         <w:r>
           <w:rPr>
@@ -2366,7 +2622,7 @@
           <w14:ligatures w14:val="standardContextual"/>
         </w:rPr>
       </w:pPr>
-      <w:hyperlink w:anchor="_Toc237718605" w:history="1">
+      <w:hyperlink w:anchor="_Toc237720029" w:history="1">
         <w:r>
           <w:rPr>
             <w:rStyle w:val="Hipervnculo"/>
@@ -2393,7 +2649,7 @@
             <w:noProof/>
             <w:webHidden/>
           </w:rPr>
-          <w:instrText xml:space="preserve"> PAGEREF _Toc237718605 \h </w:instrText>
+          <w:instrText xml:space="preserve"> PAGEREF _Toc237720029 \h </w:instrText>
         </w:r>
         <w:r>
           <w:rPr>
@@ -2413,7 +2669,7 @@
             <w:noProof/>
             <w:webHidden/>
           </w:rPr>
-          <w:t>6</w:t>
+          <w:t>7</w:t>
         </w:r>
         <w:r>
           <w:rPr>
@@ -2440,7 +2696,7 @@
           <w14:ligatures w14:val="standardContextual"/>
         </w:rPr>
       </w:pPr>
-      <w:hyperlink w:anchor="_Toc237718606" w:history="1">
+      <w:hyperlink w:anchor="_Toc237720030" w:history="1">
         <w:r>
           <w:rPr>
             <w:rStyle w:val="Hipervnculo"/>
@@ -2467,7 +2723,7 @@
             <w:noProof/>
             <w:webHidden/>
           </w:rPr>
-          <w:instrText xml:space="preserve"> PAGEREF _Toc237718606 \h </w:instrText>
+          <w:instrText xml:space="preserve"> PAGEREF _Toc237720030 \h </w:instrText>
         </w:r>
         <w:r>
           <w:rPr>
@@ -2487,7 +2743,7 @@
             <w:noProof/>
             <w:webHidden/>
           </w:rPr>
-          <w:t>6</w:t>
+          <w:t>7</w:t>
         </w:r>
         <w:r>
           <w:rPr>
@@ -2514,7 +2770,7 @@
           <w14:ligatures w14:val="standardContextual"/>
         </w:rPr>
       </w:pPr>
-      <w:hyperlink w:anchor="_Toc237718607" w:history="1">
+      <w:hyperlink w:anchor="_Toc237720031" w:history="1">
         <w:r>
           <w:rPr>
             <w:rStyle w:val="Hipervnculo"/>
@@ -2541,7 +2797,7 @@
             <w:noProof/>
             <w:webHidden/>
           </w:rPr>
-          <w:instrText xml:space="preserve"> PAGEREF _Toc237718607 \h </w:instrText>
+          <w:instrText xml:space="preserve"> PAGEREF _Toc237720031 \h </w:instrText>
         </w:r>
         <w:r>
           <w:rPr>
@@ -2561,7 +2817,7 @@
             <w:noProof/>
             <w:webHidden/>
           </w:rPr>
-          <w:t>6</w:t>
+          <w:t>7</w:t>
         </w:r>
         <w:r>
           <w:rPr>
@@ -2588,7 +2844,7 @@
           <w14:ligatures w14:val="standardContextual"/>
         </w:rPr>
       </w:pPr>
-      <w:hyperlink w:anchor="_Toc237718608" w:history="1">
+      <w:hyperlink w:anchor="_Toc237720032" w:history="1">
         <w:r>
           <w:rPr>
             <w:rStyle w:val="Hipervnculo"/>
@@ -2615,7 +2871,7 @@
             <w:noProof/>
             <w:webHidden/>
           </w:rPr>
-          <w:instrText xml:space="preserve"> PAGEREF _Toc237718608 \h </w:instrText>
+          <w:instrText xml:space="preserve"> PAGEREF _Toc237720032 \h </w:instrText>
         </w:r>
         <w:r>
           <w:rPr>
@@ -2635,7 +2891,7 @@
             <w:noProof/>
             <w:webHidden/>
           </w:rPr>
-          <w:t>7</w:t>
+          <w:t>8</w:t>
         </w:r>
         <w:r>
           <w:rPr>
@@ -2662,7 +2918,7 @@
           <w14:ligatures w14:val="standardContextual"/>
         </w:rPr>
       </w:pPr>
-      <w:hyperlink w:anchor="_Toc237718609" w:history="1">
+      <w:hyperlink w:anchor="_Toc237720033" w:history="1">
         <w:r>
           <w:rPr>
             <w:rStyle w:val="Hipervnculo"/>
@@ -2689,7 +2945,7 @@
             <w:noProof/>
             <w:webHidden/>
           </w:rPr>
-          <w:instrText xml:space="preserve"> PAGEREF _Toc237718609 \h </w:instrText>
+          <w:instrText xml:space="preserve"> PAGEREF _Toc237720033 \h </w:instrText>
         </w:r>
         <w:r>
           <w:rPr>
@@ -2709,7 +2965,7 @@
             <w:noProof/>
             <w:webHidden/>
           </w:rPr>
-          <w:t>7</w:t>
+          <w:t>8</w:t>
         </w:r>
         <w:r>
           <w:rPr>
@@ -2736,7 +2992,7 @@
           <w14:ligatures w14:val="standardContextual"/>
         </w:rPr>
       </w:pPr>
-      <w:hyperlink w:anchor="_Toc237718610" w:history="1">
+      <w:hyperlink w:anchor="_Toc237720034" w:history="1">
         <w:r>
           <w:rPr>
             <w:rStyle w:val="Hipervnculo"/>
@@ -2763,7 +3019,7 @@
             <w:noProof/>
             <w:webHidden/>
           </w:rPr>
-          <w:instrText xml:space="preserve"> PAGEREF _Toc237718610 \h </w:instrText>
+          <w:instrText xml:space="preserve"> PAGEREF _Toc237720034 \h </w:instrText>
         </w:r>
         <w:r>
           <w:rPr>
@@ -2783,7 +3039,7 @@
             <w:noProof/>
             <w:webHidden/>
           </w:rPr>
-          <w:t>7</w:t>
+          <w:t>8</w:t>
         </w:r>
         <w:r>
           <w:rPr>
@@ -2810,7 +3066,7 @@
           <w14:ligatures w14:val="standardContextual"/>
         </w:rPr>
       </w:pPr>
-      <w:hyperlink w:anchor="_Toc237718611" w:history="1">
+      <w:hyperlink w:anchor="_Toc237720035" w:history="1">
         <w:r>
           <w:rPr>
             <w:rStyle w:val="Hipervnculo"/>
@@ -2837,7 +3093,7 @@
             <w:noProof/>
             <w:webHidden/>
           </w:rPr>
-          <w:instrText xml:space="preserve"> PAGEREF _Toc237718611 \h </w:instrText>
+          <w:instrText xml:space="preserve"> PAGEREF _Toc237720035 \h </w:instrText>
         </w:r>
         <w:r>
           <w:rPr>
@@ -2857,7 +3113,7 @@
             <w:noProof/>
             <w:webHidden/>
           </w:rPr>
-          <w:t>7</w:t>
+          <w:t>8</w:t>
         </w:r>
         <w:r>
           <w:rPr>
@@ -2884,7 +3140,7 @@
           <w14:ligatures w14:val="standardContextual"/>
         </w:rPr>
       </w:pPr>
-      <w:hyperlink w:anchor="_Toc237718612" w:history="1">
+      <w:hyperlink w:anchor="_Toc237720036" w:history="1">
         <w:r>
           <w:rPr>
             <w:rStyle w:val="Hipervnculo"/>
@@ -2911,7 +3167,7 @@
             <w:noProof/>
             <w:webHidden/>
           </w:rPr>
-          <w:instrText xml:space="preserve"> PAGEREF _Toc237718612 \h </w:instrText>
+          <w:instrText xml:space="preserve"> PAGEREF _Toc237720036 \h </w:instrText>
         </w:r>
         <w:r>
           <w:rPr>
@@ -2931,7 +3187,7 @@
             <w:noProof/>
             <w:webHidden/>
           </w:rPr>
-          <w:t>8</w:t>
+          <w:t>9</w:t>
         </w:r>
         <w:r>
           <w:rPr>
@@ -2958,7 +3214,7 @@
           <w14:ligatures w14:val="standardContextual"/>
         </w:rPr>
       </w:pPr>
-      <w:hyperlink w:anchor="_Toc237718613" w:history="1">
+      <w:hyperlink w:anchor="_Toc237720037" w:history="1">
         <w:r>
           <w:rPr>
             <w:rStyle w:val="Hipervnculo"/>
@@ -2985,7 +3241,7 @@
             <w:noProof/>
             <w:webHidden/>
           </w:rPr>
-          <w:instrText xml:space="preserve"> PAGEREF _Toc237718613 \h </w:instrText>
+          <w:instrText xml:space="preserve"> PAGEREF _Toc237720037 \h </w:instrText>
         </w:r>
         <w:r>
           <w:rPr>
@@ -3005,7 +3261,7 @@
             <w:noProof/>
             <w:webHidden/>
           </w:rPr>
-          <w:t>8</w:t>
+          <w:t>9</w:t>
         </w:r>
         <w:r>
           <w:rPr>
@@ -3032,7 +3288,7 @@
           <w14:ligatures w14:val="standardContextual"/>
         </w:rPr>
       </w:pPr>
-      <w:hyperlink w:anchor="_Toc237718614" w:history="1">
+      <w:hyperlink w:anchor="_Toc237720038" w:history="1">
         <w:r>
           <w:rPr>
             <w:rStyle w:val="Hipervnculo"/>
@@ -3089,7 +3345,7 @@
             <w:noProof/>
             <w:webHidden/>
           </w:rPr>
-          <w:instrText xml:space="preserve"> PAGEREF _Toc237718614 \h </w:instrText>
+          <w:instrText xml:space="preserve"> PAGEREF _Toc237720038 \h </w:instrText>
         </w:r>
         <w:r>
           <w:rPr>
@@ -3109,7 +3365,7 @@
             <w:noProof/>
             <w:webHidden/>
           </w:rPr>
-          <w:t>8</w:t>
+          <w:t>9</w:t>
         </w:r>
         <w:r>
           <w:rPr>
@@ -3136,7 +3392,7 @@
           <w14:ligatures w14:val="standardContextual"/>
         </w:rPr>
       </w:pPr>
-      <w:hyperlink w:anchor="_Toc237718615" w:history="1">
+      <w:hyperlink w:anchor="_Toc237720039" w:history="1">
         <w:r>
           <w:rPr>
             <w:rStyle w:val="Hipervnculo"/>
@@ -3163,7 +3419,7 @@
             <w:noProof/>
             <w:webHidden/>
           </w:rPr>
-          <w:instrText xml:space="preserve"> PAGEREF _Toc237718615 \h </w:instrText>
+          <w:instrText xml:space="preserve"> PAGEREF _Toc237720039 \h </w:instrText>
         </w:r>
         <w:r>
           <w:rPr>
@@ -3183,7 +3439,7 @@
             <w:noProof/>
             <w:webHidden/>
           </w:rPr>
-          <w:t>8</w:t>
+          <w:t>9</w:t>
         </w:r>
         <w:r>
           <w:rPr>
@@ -3210,7 +3466,7 @@
           <w14:ligatures w14:val="standardContextual"/>
         </w:rPr>
       </w:pPr>
-      <w:hyperlink w:anchor="_Toc237718616" w:history="1">
+      <w:hyperlink w:anchor="_Toc237720040" w:history="1">
         <w:r>
           <w:rPr>
             <w:rStyle w:val="Hipervnculo"/>
@@ -3237,7 +3493,7 @@
             <w:noProof/>
             <w:webHidden/>
           </w:rPr>
-          <w:instrText xml:space="preserve"> PAGEREF _Toc237718616 \h </w:instrText>
+          <w:instrText xml:space="preserve"> PAGEREF _Toc237720040 \h </w:instrText>
         </w:r>
         <w:r>
           <w:rPr>
@@ -3257,7 +3513,7 @@
             <w:noProof/>
             <w:webHidden/>
           </w:rPr>
-          <w:t>8</w:t>
+          <w:t>9</w:t>
         </w:r>
         <w:r>
           <w:rPr>
@@ -3284,7 +3540,7 @@
           <w14:ligatures w14:val="standardContextual"/>
         </w:rPr>
       </w:pPr>
-      <w:hyperlink w:anchor="_Toc237718617" w:history="1">
+      <w:hyperlink w:anchor="_Toc237720041" w:history="1">
         <w:r>
           <w:rPr>
             <w:rStyle w:val="Hipervnculo"/>
@@ -3311,7 +3567,7 @@
             <w:noProof/>
             <w:webHidden/>
           </w:rPr>
-          <w:instrText xml:space="preserve"> PAGEREF _Toc237718617 \h </w:instrText>
+          <w:instrText xml:space="preserve"> PAGEREF _Toc237720041 \h </w:instrText>
         </w:r>
         <w:r>
           <w:rPr>
@@ -3331,7 +3587,7 @@
             <w:noProof/>
             <w:webHidden/>
           </w:rPr>
-          <w:t>8</w:t>
+          <w:t>9</w:t>
         </w:r>
         <w:r>
           <w:rPr>
@@ -3358,7 +3614,7 @@
           <w14:ligatures w14:val="standardContextual"/>
         </w:rPr>
       </w:pPr>
-      <w:hyperlink w:anchor="_Toc237718618" w:history="1">
+      <w:hyperlink w:anchor="_Toc237720042" w:history="1">
         <w:r>
           <w:rPr>
             <w:rStyle w:val="Hipervnculo"/>
@@ -3385,7 +3641,7 @@
             <w:noProof/>
             <w:webHidden/>
           </w:rPr>
-          <w:instrText xml:space="preserve"> PAGEREF _Toc237718618 \h </w:instrText>
+          <w:instrText xml:space="preserve"> PAGEREF _Toc237720042 \h </w:instrText>
         </w:r>
         <w:r>
           <w:rPr>
@@ -3405,7 +3661,7 @@
             <w:noProof/>
             <w:webHidden/>
           </w:rPr>
-          <w:t>8</w:t>
+          <w:t>9</w:t>
         </w:r>
         <w:r>
           <w:rPr>
@@ -3432,7 +3688,7 @@
           <w14:ligatures w14:val="standardContextual"/>
         </w:rPr>
       </w:pPr>
-      <w:hyperlink w:anchor="_Toc237718619" w:history="1">
+      <w:hyperlink w:anchor="_Toc237720043" w:history="1">
         <w:r>
           <w:rPr>
             <w:rStyle w:val="Hipervnculo"/>
@@ -3459,7 +3715,7 @@
             <w:noProof/>
             <w:webHidden/>
           </w:rPr>
-          <w:instrText xml:space="preserve"> PAGEREF _Toc237718619 \h </w:instrText>
+          <w:instrText xml:space="preserve"> PAGEREF _Toc237720043 \h </w:instrText>
         </w:r>
         <w:r>
           <w:rPr>
@@ -3479,7 +3735,7 @@
             <w:noProof/>
             <w:webHidden/>
           </w:rPr>
-          <w:t>9</w:t>
+          <w:t>10</w:t>
         </w:r>
         <w:r>
           <w:rPr>
@@ -3506,7 +3762,7 @@
           <w14:ligatures w14:val="standardContextual"/>
         </w:rPr>
       </w:pPr>
-      <w:hyperlink w:anchor="_Toc237718620" w:history="1">
+      <w:hyperlink w:anchor="_Toc237720044" w:history="1">
         <w:r>
           <w:rPr>
             <w:rStyle w:val="Hipervnculo"/>
@@ -3533,7 +3789,7 @@
             <w:noProof/>
             <w:webHidden/>
           </w:rPr>
-          <w:instrText xml:space="preserve"> PAGEREF _Toc237718620 \h </w:instrText>
+          <w:instrText xml:space="preserve"> PAGEREF _Toc237720044 \h </w:instrText>
         </w:r>
         <w:r>
           <w:rPr>
@@ -3553,7 +3809,7 @@
             <w:noProof/>
             <w:webHidden/>
           </w:rPr>
-          <w:t>9</w:t>
+          <w:t>10</w:t>
         </w:r>
         <w:r>
           <w:rPr>
@@ -3580,7 +3836,7 @@
           <w14:ligatures w14:val="standardContextual"/>
         </w:rPr>
       </w:pPr>
-      <w:hyperlink w:anchor="_Toc237718621" w:history="1">
+      <w:hyperlink w:anchor="_Toc237720045" w:history="1">
         <w:r>
           <w:rPr>
             <w:rStyle w:val="Hipervnculo"/>
@@ -3607,7 +3863,7 @@
             <w:noProof/>
             <w:webHidden/>
           </w:rPr>
-          <w:instrText xml:space="preserve"> PAGEREF _Toc237718621 \h </w:instrText>
+          <w:instrText xml:space="preserve"> PAGEREF _Toc237720045 \h </w:instrText>
         </w:r>
         <w:r>
           <w:rPr>
@@ -3627,7 +3883,7 @@
             <w:noProof/>
             <w:webHidden/>
           </w:rPr>
-          <w:t>9</w:t>
+          <w:t>10</w:t>
         </w:r>
         <w:r>
           <w:rPr>
@@ -3654,7 +3910,7 @@
           <w14:ligatures w14:val="standardContextual"/>
         </w:rPr>
       </w:pPr>
-      <w:hyperlink w:anchor="_Toc237718622" w:history="1">
+      <w:hyperlink w:anchor="_Toc237720046" w:history="1">
         <w:r>
           <w:rPr>
             <w:rStyle w:val="Hipervnculo"/>
@@ -3681,7 +3937,7 @@
             <w:noProof/>
             <w:webHidden/>
           </w:rPr>
-          <w:instrText xml:space="preserve"> PAGEREF _Toc237718622 \h </w:instrText>
+          <w:instrText xml:space="preserve"> PAGEREF _Toc237720046 \h </w:instrText>
         </w:r>
         <w:r>
           <w:rPr>
@@ -3701,7 +3957,7 @@
             <w:noProof/>
             <w:webHidden/>
           </w:rPr>
-          <w:t>9</w:t>
+          <w:t>10</w:t>
         </w:r>
         <w:r>
           <w:rPr>
@@ -3728,7 +3984,7 @@
           <w14:ligatures w14:val="standardContextual"/>
         </w:rPr>
       </w:pPr>
-      <w:hyperlink w:anchor="_Toc237718623" w:history="1">
+      <w:hyperlink w:anchor="_Toc237720047" w:history="1">
         <w:r>
           <w:rPr>
             <w:rStyle w:val="Hipervnculo"/>
@@ -3755,7 +4011,7 @@
             <w:noProof/>
             <w:webHidden/>
           </w:rPr>
-          <w:instrText xml:space="preserve"> PAGEREF _Toc237718623 \h </w:instrText>
+          <w:instrText xml:space="preserve"> PAGEREF _Toc237720047 \h </w:instrText>
         </w:r>
         <w:r>
           <w:rPr>
@@ -3775,7 +4031,7 @@
             <w:noProof/>
             <w:webHidden/>
           </w:rPr>
-          <w:t>9</w:t>
+          <w:t>10</w:t>
         </w:r>
         <w:r>
           <w:rPr>
@@ -3802,7 +4058,7 @@
           <w14:ligatures w14:val="standardContextual"/>
         </w:rPr>
       </w:pPr>
-      <w:hyperlink w:anchor="_Toc237718624" w:history="1">
+      <w:hyperlink w:anchor="_Toc237720048" w:history="1">
         <w:r>
           <w:rPr>
             <w:rStyle w:val="Hipervnculo"/>
@@ -3829,7 +4085,7 @@
             <w:noProof/>
             <w:webHidden/>
           </w:rPr>
-          <w:instrText xml:space="preserve"> PAGEREF _Toc237718624 \h </w:instrText>
+          <w:instrText xml:space="preserve"> PAGEREF _Toc237720048 \h </w:instrText>
         </w:r>
         <w:r>
           <w:rPr>
@@ -3849,7 +4105,7 @@
             <w:noProof/>
             <w:webHidden/>
           </w:rPr>
-          <w:t>9</w:t>
+          <w:t>10</w:t>
         </w:r>
         <w:r>
           <w:rPr>
@@ -3876,7 +4132,7 @@
           <w14:ligatures w14:val="standardContextual"/>
         </w:rPr>
       </w:pPr>
-      <w:hyperlink w:anchor="_Toc237718625" w:history="1">
+      <w:hyperlink w:anchor="_Toc237720049" w:history="1">
         <w:r>
           <w:rPr>
             <w:rStyle w:val="Hipervnculo"/>
@@ -3903,7 +4159,7 @@
             <w:noProof/>
             <w:webHidden/>
           </w:rPr>
-          <w:instrText xml:space="preserve"> PAGEREF _Toc237718625 \h </w:instrText>
+          <w:instrText xml:space="preserve"> PAGEREF _Toc237720049 \h </w:instrText>
         </w:r>
         <w:r>
           <w:rPr>
@@ -3923,7 +4179,7 @@
             <w:noProof/>
             <w:webHidden/>
           </w:rPr>
-          <w:t>9</w:t>
+          <w:t>10</w:t>
         </w:r>
         <w:r>
           <w:rPr>
@@ -3950,7 +4206,7 @@
           <w14:ligatures w14:val="standardContextual"/>
         </w:rPr>
       </w:pPr>
-      <w:hyperlink w:anchor="_Toc237718626" w:history="1">
+      <w:hyperlink w:anchor="_Toc237720050" w:history="1">
         <w:r>
           <w:rPr>
             <w:rStyle w:val="Hipervnculo"/>
@@ -3977,7 +4233,7 @@
             <w:noProof/>
             <w:webHidden/>
           </w:rPr>
-          <w:instrText xml:space="preserve"> PAGEREF _Toc237718626 \h </w:instrText>
+          <w:instrText xml:space="preserve"> PAGEREF _Toc237720050 \h </w:instrText>
         </w:r>
         <w:r>
           <w:rPr>
@@ -3997,7 +4253,7 @@
             <w:noProof/>
             <w:webHidden/>
           </w:rPr>
-          <w:t>9</w:t>
+          <w:t>10</w:t>
         </w:r>
         <w:r>
           <w:rPr>
@@ -4024,7 +4280,7 @@
           <w14:ligatures w14:val="standardContextual"/>
         </w:rPr>
       </w:pPr>
-      <w:hyperlink w:anchor="_Toc237718627" w:history="1">
+      <w:hyperlink w:anchor="_Toc237720051" w:history="1">
         <w:r>
           <w:rPr>
             <w:rStyle w:val="Hipervnculo"/>
@@ -4051,7 +4307,7 @@
             <w:noProof/>
             <w:webHidden/>
           </w:rPr>
-          <w:instrText xml:space="preserve"> PAGEREF _Toc237718627 \h </w:instrText>
+          <w:instrText xml:space="preserve"> PAGEREF _Toc237720051 \h </w:instrText>
         </w:r>
         <w:r>
           <w:rPr>
@@ -4071,7 +4327,7 @@
             <w:noProof/>
             <w:webHidden/>
           </w:rPr>
-          <w:t>9</w:t>
+          <w:t>10</w:t>
         </w:r>
         <w:r>
           <w:rPr>
@@ -4098,7 +4354,7 @@
           <w14:ligatures w14:val="standardContextual"/>
         </w:rPr>
       </w:pPr>
-      <w:hyperlink w:anchor="_Toc237718628" w:history="1">
+      <w:hyperlink w:anchor="_Toc237720052" w:history="1">
         <w:r>
           <w:rPr>
             <w:rStyle w:val="Hipervnculo"/>
@@ -4125,7 +4381,7 @@
             <w:noProof/>
             <w:webHidden/>
           </w:rPr>
-          <w:instrText xml:space="preserve"> PAGEREF _Toc237718628 \h </w:instrText>
+          <w:instrText xml:space="preserve"> PAGEREF _Toc237720052 \h </w:instrText>
         </w:r>
         <w:r>
           <w:rPr>
@@ -4145,7 +4401,7 @@
             <w:noProof/>
             <w:webHidden/>
           </w:rPr>
-          <w:t>10</w:t>
+          <w:t>11</w:t>
         </w:r>
         <w:r>
           <w:rPr>
@@ -4172,7 +4428,7 @@
           <w14:ligatures w14:val="standardContextual"/>
         </w:rPr>
       </w:pPr>
-      <w:hyperlink w:anchor="_Toc237718629" w:history="1">
+      <w:hyperlink w:anchor="_Toc237720053" w:history="1">
         <w:r>
           <w:rPr>
             <w:rStyle w:val="Hipervnculo"/>
@@ -4199,7 +4455,7 @@
             <w:noProof/>
             <w:webHidden/>
           </w:rPr>
-          <w:instrText xml:space="preserve"> PAGEREF _Toc237718629 \h </w:instrText>
+          <w:instrText xml:space="preserve"> PAGEREF _Toc237720053 \h </w:instrText>
         </w:r>
         <w:r>
           <w:rPr>
@@ -4219,7 +4475,7 @@
             <w:noProof/>
             <w:webHidden/>
           </w:rPr>
-          <w:t>10</w:t>
+          <w:t>11</w:t>
         </w:r>
         <w:r>
           <w:rPr>
@@ -4246,7 +4502,7 @@
           <w14:ligatures w14:val="standardContextual"/>
         </w:rPr>
       </w:pPr>
-      <w:hyperlink w:anchor="_Toc237718630" w:history="1">
+      <w:hyperlink w:anchor="_Toc237720054" w:history="1">
         <w:r>
           <w:rPr>
             <w:rStyle w:val="Hipervnculo"/>
@@ -4273,7 +4529,7 @@
             <w:noProof/>
             <w:webHidden/>
           </w:rPr>
-          <w:instrText xml:space="preserve"> PAGEREF _Toc237718630 \h </w:instrText>
+          <w:instrText xml:space="preserve"> PAGEREF _Toc237720054 \h </w:instrText>
         </w:r>
         <w:r>
           <w:rPr>
@@ -4293,7 +4549,7 @@
             <w:noProof/>
             <w:webHidden/>
           </w:rPr>
-          <w:t>10</w:t>
+          <w:t>11</w:t>
         </w:r>
         <w:r>
           <w:rPr>
@@ -4320,7 +4576,7 @@
           <w14:ligatures w14:val="standardContextual"/>
         </w:rPr>
       </w:pPr>
-      <w:hyperlink w:anchor="_Toc237718631" w:history="1">
+      <w:hyperlink w:anchor="_Toc237720055" w:history="1">
         <w:r>
           <w:rPr>
             <w:rStyle w:val="Hipervnculo"/>
@@ -4347,7 +4603,7 @@
             <w:noProof/>
             <w:webHidden/>
           </w:rPr>
-          <w:instrText xml:space="preserve"> PAGEREF _Toc237718631 \h </w:instrText>
+          <w:instrText xml:space="preserve"> PAGEREF _Toc237720055 \h </w:instrText>
         </w:r>
         <w:r>
           <w:rPr>
@@ -4367,7 +4623,7 @@
             <w:noProof/>
             <w:webHidden/>
           </w:rPr>
-          <w:t>10</w:t>
+          <w:t>11</w:t>
         </w:r>
         <w:r>
           <w:rPr>
@@ -4394,7 +4650,7 @@
           <w14:ligatures w14:val="standardContextual"/>
         </w:rPr>
       </w:pPr>
-      <w:hyperlink w:anchor="_Toc237718632" w:history="1">
+      <w:hyperlink w:anchor="_Toc237720056" w:history="1">
         <w:r>
           <w:rPr>
             <w:rStyle w:val="Hipervnculo"/>
@@ -4421,7 +4677,7 @@
             <w:noProof/>
             <w:webHidden/>
           </w:rPr>
-          <w:instrText xml:space="preserve"> PAGEREF _Toc237718632 \h </w:instrText>
+          <w:instrText xml:space="preserve"> PAGEREF _Toc237720056 \h </w:instrText>
         </w:r>
         <w:r>
           <w:rPr>
@@ -4441,7 +4697,7 @@
             <w:noProof/>
             <w:webHidden/>
           </w:rPr>
-          <w:t>10</w:t>
+          <w:t>11</w:t>
         </w:r>
         <w:r>
           <w:rPr>
@@ -4468,7 +4724,7 @@
           <w14:ligatures w14:val="standardContextual"/>
         </w:rPr>
       </w:pPr>
-      <w:hyperlink w:anchor="_Toc237718633" w:history="1">
+      <w:hyperlink w:anchor="_Toc237720057" w:history="1">
         <w:r>
           <w:rPr>
             <w:rStyle w:val="Hipervnculo"/>
@@ -4495,7 +4751,7 @@
             <w:noProof/>
             <w:webHidden/>
           </w:rPr>
-          <w:instrText xml:space="preserve"> PAGEREF _Toc237718633 \h </w:instrText>
+          <w:instrText xml:space="preserve"> PAGEREF _Toc237720057 \h </w:instrText>
         </w:r>
         <w:r>
           <w:rPr>
@@ -4515,7 +4771,7 @@
             <w:noProof/>
             <w:webHidden/>
           </w:rPr>
-          <w:t>10</w:t>
+          <w:t>11</w:t>
         </w:r>
         <w:r>
           <w:rPr>
@@ -4542,7 +4798,7 @@
           <w14:ligatures w14:val="standardContextual"/>
         </w:rPr>
       </w:pPr>
-      <w:hyperlink w:anchor="_Toc237718634" w:history="1">
+      <w:hyperlink w:anchor="_Toc237720058" w:history="1">
         <w:r>
           <w:rPr>
             <w:rStyle w:val="Hipervnculo"/>
@@ -4569,7 +4825,7 @@
             <w:noProof/>
             <w:webHidden/>
           </w:rPr>
-          <w:instrText xml:space="preserve"> PAGEREF _Toc237718634 \h </w:instrText>
+          <w:instrText xml:space="preserve"> PAGEREF _Toc237720058 \h </w:instrText>
         </w:r>
         <w:r>
           <w:rPr>
@@ -4589,7 +4845,7 @@
             <w:noProof/>
             <w:webHidden/>
           </w:rPr>
-          <w:t>11</w:t>
+          <w:t>12</w:t>
         </w:r>
         <w:r>
           <w:rPr>
@@ -4616,7 +4872,7 @@
           <w14:ligatures w14:val="standardContextual"/>
         </w:rPr>
       </w:pPr>
-      <w:hyperlink w:anchor="_Toc237718635" w:history="1">
+      <w:hyperlink w:anchor="_Toc237720059" w:history="1">
         <w:r>
           <w:rPr>
             <w:rStyle w:val="Hipervnculo"/>
@@ -4643,7 +4899,7 @@
             <w:noProof/>
             <w:webHidden/>
           </w:rPr>
-          <w:instrText xml:space="preserve"> PAGEREF _Toc237718635 \h </w:instrText>
+          <w:instrText xml:space="preserve"> PAGEREF _Toc237720059 \h </w:instrText>
         </w:r>
         <w:r>
           <w:rPr>
@@ -4663,7 +4919,7 @@
             <w:noProof/>
             <w:webHidden/>
           </w:rPr>
-          <w:t>11</w:t>
+          <w:t>12</w:t>
         </w:r>
         <w:r>
           <w:rPr>
@@ -4690,7 +4946,7 @@
           <w14:ligatures w14:val="standardContextual"/>
         </w:rPr>
       </w:pPr>
-      <w:hyperlink w:anchor="_Toc237718636" w:history="1">
+      <w:hyperlink w:anchor="_Toc237720060" w:history="1">
         <w:r>
           <w:rPr>
             <w:rStyle w:val="Hipervnculo"/>
@@ -4717,7 +4973,7 @@
             <w:noProof/>
             <w:webHidden/>
           </w:rPr>
-          <w:instrText xml:space="preserve"> PAGEREF _Toc237718636 \h </w:instrText>
+          <w:instrText xml:space="preserve"> PAGEREF _Toc237720060 \h </w:instrText>
         </w:r>
         <w:r>
           <w:rPr>
@@ -4737,7 +4993,7 @@
             <w:noProof/>
             <w:webHidden/>
           </w:rPr>
-          <w:t>11</w:t>
+          <w:t>12</w:t>
         </w:r>
         <w:r>
           <w:rPr>
@@ -4764,7 +5020,7 @@
           <w14:ligatures w14:val="standardContextual"/>
         </w:rPr>
       </w:pPr>
-      <w:hyperlink w:anchor="_Toc237718637" w:history="1">
+      <w:hyperlink w:anchor="_Toc237720061" w:history="1">
         <w:r>
           <w:rPr>
             <w:rStyle w:val="Hipervnculo"/>
@@ -4791,7 +5047,7 @@
             <w:noProof/>
             <w:webHidden/>
           </w:rPr>
-          <w:instrText xml:space="preserve"> PAGEREF _Toc237718637 \h </w:instrText>
+          <w:instrText xml:space="preserve"> PAGEREF _Toc237720061 \h </w:instrText>
         </w:r>
         <w:r>
           <w:rPr>
@@ -4811,7 +5067,7 @@
             <w:noProof/>
             <w:webHidden/>
           </w:rPr>
-          <w:t>11</w:t>
+          <w:t>12</w:t>
         </w:r>
         <w:r>
           <w:rPr>
@@ -4838,7 +5094,7 @@
           <w14:ligatures w14:val="standardContextual"/>
         </w:rPr>
       </w:pPr>
-      <w:hyperlink w:anchor="_Toc237718638" w:history="1">
+      <w:hyperlink w:anchor="_Toc237720062" w:history="1">
         <w:r>
           <w:rPr>
             <w:rStyle w:val="Hipervnculo"/>
@@ -4865,7 +5121,7 @@
             <w:noProof/>
             <w:webHidden/>
           </w:rPr>
-          <w:instrText xml:space="preserve"> PAGEREF _Toc237718638 \h </w:instrText>
+          <w:instrText xml:space="preserve"> PAGEREF _Toc237720062 \h </w:instrText>
         </w:r>
         <w:r>
           <w:rPr>
@@ -4885,7 +5141,7 @@
             <w:noProof/>
             <w:webHidden/>
           </w:rPr>
-          <w:t>11</w:t>
+          <w:t>12</w:t>
         </w:r>
         <w:r>
           <w:rPr>
@@ -4912,7 +5168,7 @@
           <w14:ligatures w14:val="standardContextual"/>
         </w:rPr>
       </w:pPr>
-      <w:hyperlink w:anchor="_Toc237718639" w:history="1">
+      <w:hyperlink w:anchor="_Toc237720063" w:history="1">
         <w:r>
           <w:rPr>
             <w:rStyle w:val="Hipervnculo"/>
@@ -4939,7 +5195,7 @@
             <w:noProof/>
             <w:webHidden/>
           </w:rPr>
-          <w:instrText xml:space="preserve"> PAGEREF _Toc237718639 \h </w:instrText>
+          <w:instrText xml:space="preserve"> PAGEREF _Toc237720063 \h </w:instrText>
         </w:r>
         <w:r>
           <w:rPr>
@@ -4959,7 +5215,7 @@
             <w:noProof/>
             <w:webHidden/>
           </w:rPr>
-          <w:t>12</w:t>
+          <w:t>13</w:t>
         </w:r>
         <w:r>
           <w:rPr>
@@ -4986,7 +5242,7 @@
           <w14:ligatures w14:val="standardContextual"/>
         </w:rPr>
       </w:pPr>
-      <w:hyperlink w:anchor="_Toc237718640" w:history="1">
+      <w:hyperlink w:anchor="_Toc237720064" w:history="1">
         <w:r>
           <w:rPr>
             <w:rStyle w:val="Hipervnculo"/>
@@ -5013,7 +5269,7 @@
             <w:noProof/>
             <w:webHidden/>
           </w:rPr>
-          <w:instrText xml:space="preserve"> PAGEREF _Toc237718640 \h </w:instrText>
+          <w:instrText xml:space="preserve"> PAGEREF _Toc237720064 \h </w:instrText>
         </w:r>
         <w:r>
           <w:rPr>
@@ -5033,7 +5289,7 @@
             <w:noProof/>
             <w:webHidden/>
           </w:rPr>
-          <w:t>12</w:t>
+          <w:t>13</w:t>
         </w:r>
         <w:r>
           <w:rPr>
@@ -5060,7 +5316,7 @@
           <w14:ligatures w14:val="standardContextual"/>
         </w:rPr>
       </w:pPr>
-      <w:hyperlink w:anchor="_Toc237718641" w:history="1">
+      <w:hyperlink w:anchor="_Toc237720065" w:history="1">
         <w:r>
           <w:rPr>
             <w:rStyle w:val="Hipervnculo"/>
@@ -5087,7 +5343,7 @@
             <w:noProof/>
             <w:webHidden/>
           </w:rPr>
-          <w:instrText xml:space="preserve"> PAGEREF _Toc237718641 \h </w:instrText>
+          <w:instrText xml:space="preserve"> PAGEREF _Toc237720065 \h </w:instrText>
         </w:r>
         <w:r>
           <w:rPr>
@@ -5107,7 +5363,7 @@
             <w:noProof/>
             <w:webHidden/>
           </w:rPr>
-          <w:t>12</w:t>
+          <w:t>13</w:t>
         </w:r>
         <w:r>
           <w:rPr>
@@ -5134,7 +5390,7 @@
           <w14:ligatures w14:val="standardContextual"/>
         </w:rPr>
       </w:pPr>
-      <w:hyperlink w:anchor="_Toc237718642" w:history="1">
+      <w:hyperlink w:anchor="_Toc237720066" w:history="1">
         <w:r>
           <w:rPr>
             <w:rStyle w:val="Hipervnculo"/>
@@ -5161,7 +5417,7 @@
             <w:noProof/>
             <w:webHidden/>
           </w:rPr>
-          <w:instrText xml:space="preserve"> PAGEREF _Toc237718642 \h </w:instrText>
+          <w:instrText xml:space="preserve"> PAGEREF _Toc237720066 \h </w:instrText>
         </w:r>
         <w:r>
           <w:rPr>
@@ -5181,7 +5437,7 @@
             <w:noProof/>
             <w:webHidden/>
           </w:rPr>
-          <w:t>12</w:t>
+          <w:t>13</w:t>
         </w:r>
         <w:r>
           <w:rPr>
@@ -5208,7 +5464,7 @@
           <w14:ligatures w14:val="standardContextual"/>
         </w:rPr>
       </w:pPr>
-      <w:hyperlink w:anchor="_Toc237718643" w:history="1">
+      <w:hyperlink w:anchor="_Toc237720067" w:history="1">
         <w:r>
           <w:rPr>
             <w:rStyle w:val="Hipervnculo"/>
@@ -5235,7 +5491,7 @@
             <w:noProof/>
             <w:webHidden/>
           </w:rPr>
-          <w:instrText xml:space="preserve"> PAGEREF _Toc237718643 \h </w:instrText>
+          <w:instrText xml:space="preserve"> PAGEREF _Toc237720067 \h </w:instrText>
         </w:r>
         <w:r>
           <w:rPr>
@@ -5255,7 +5511,7 @@
             <w:noProof/>
             <w:webHidden/>
           </w:rPr>
-          <w:t>12</w:t>
+          <w:t>13</w:t>
         </w:r>
         <w:r>
           <w:rPr>
@@ -5282,7 +5538,7 @@
           <w14:ligatures w14:val="standardContextual"/>
         </w:rPr>
       </w:pPr>
-      <w:hyperlink w:anchor="_Toc237718644" w:history="1">
+      <w:hyperlink w:anchor="_Toc237720068" w:history="1">
         <w:r>
           <w:rPr>
             <w:rStyle w:val="Hipervnculo"/>
@@ -5309,7 +5565,7 @@
             <w:noProof/>
             <w:webHidden/>
           </w:rPr>
-          <w:instrText xml:space="preserve"> PAGEREF _Toc237718644 \h </w:instrText>
+          <w:instrText xml:space="preserve"> PAGEREF _Toc237720068 \h </w:instrText>
         </w:r>
         <w:r>
           <w:rPr>
@@ -5329,7 +5585,7 @@
             <w:noProof/>
             <w:webHidden/>
           </w:rPr>
-          <w:t>12</w:t>
+          <w:t>13</w:t>
         </w:r>
         <w:r>
           <w:rPr>
@@ -5356,7 +5612,7 @@
           <w14:ligatures w14:val="standardContextual"/>
         </w:rPr>
       </w:pPr>
-      <w:hyperlink w:anchor="_Toc237718645" w:history="1">
+      <w:hyperlink w:anchor="_Toc237720069" w:history="1">
         <w:r>
           <w:rPr>
             <w:rStyle w:val="Hipervnculo"/>
@@ -5383,7 +5639,7 @@
             <w:noProof/>
             <w:webHidden/>
           </w:rPr>
-          <w:instrText xml:space="preserve"> PAGEREF _Toc237718645 \h </w:instrText>
+          <w:instrText xml:space="preserve"> PAGEREF _Toc237720069 \h </w:instrText>
         </w:r>
         <w:r>
           <w:rPr>
@@ -5403,7 +5659,7 @@
             <w:noProof/>
             <w:webHidden/>
           </w:rPr>
-          <w:t>13</w:t>
+          <w:t>14</w:t>
         </w:r>
         <w:r>
           <w:rPr>
@@ -5430,7 +5686,7 @@
           <w14:ligatures w14:val="standardContextual"/>
         </w:rPr>
       </w:pPr>
-      <w:hyperlink w:anchor="_Toc237718646" w:history="1">
+      <w:hyperlink w:anchor="_Toc237720070" w:history="1">
         <w:r>
           <w:rPr>
             <w:rStyle w:val="Hipervnculo"/>
@@ -5457,7 +5713,7 @@
             <w:noProof/>
             <w:webHidden/>
           </w:rPr>
-          <w:instrText xml:space="preserve"> PAGEREF _Toc237718646 \h </w:instrText>
+          <w:instrText xml:space="preserve"> PAGEREF _Toc237720070 \h </w:instrText>
         </w:r>
         <w:r>
           <w:rPr>
@@ -5477,7 +5733,7 @@
             <w:noProof/>
             <w:webHidden/>
           </w:rPr>
-          <w:t>13</w:t>
+          <w:t>14</w:t>
         </w:r>
         <w:r>
           <w:rPr>
@@ -5504,7 +5760,7 @@
           <w14:ligatures w14:val="standardContextual"/>
         </w:rPr>
       </w:pPr>
-      <w:hyperlink w:anchor="_Toc237718647" w:history="1">
+      <w:hyperlink w:anchor="_Toc237720071" w:history="1">
         <w:r>
           <w:rPr>
             <w:rStyle w:val="Hipervnculo"/>
@@ -5531,7 +5787,7 @@
             <w:noProof/>
             <w:webHidden/>
           </w:rPr>
-          <w:instrText xml:space="preserve"> PAGEREF _Toc237718647 \h </w:instrText>
+          <w:instrText xml:space="preserve"> PAGEREF _Toc237720071 \h </w:instrText>
         </w:r>
         <w:r>
           <w:rPr>
@@ -5551,7 +5807,7 @@
             <w:noProof/>
             <w:webHidden/>
           </w:rPr>
-          <w:t>13</w:t>
+          <w:t>14</w:t>
         </w:r>
         <w:r>
           <w:rPr>
@@ -5578,7 +5834,7 @@
           <w14:ligatures w14:val="standardContextual"/>
         </w:rPr>
       </w:pPr>
-      <w:hyperlink w:anchor="_Toc237718648" w:history="1">
+      <w:hyperlink w:anchor="_Toc237720072" w:history="1">
         <w:r>
           <w:rPr>
             <w:rStyle w:val="Hipervnculo"/>
@@ -5605,7 +5861,7 @@
             <w:noProof/>
             <w:webHidden/>
           </w:rPr>
-          <w:instrText xml:space="preserve"> PAGEREF _Toc237718648 \h </w:instrText>
+          <w:instrText xml:space="preserve"> PAGEREF _Toc237720072 \h </w:instrText>
         </w:r>
         <w:r>
           <w:rPr>
@@ -5625,7 +5881,7 @@
             <w:noProof/>
             <w:webHidden/>
           </w:rPr>
-          <w:t>14</w:t>
+          <w:t>15</w:t>
         </w:r>
         <w:r>
           <w:rPr>
@@ -5652,7 +5908,7 @@
           <w14:ligatures w14:val="standardContextual"/>
         </w:rPr>
       </w:pPr>
-      <w:hyperlink w:anchor="_Toc237718649" w:history="1">
+      <w:hyperlink w:anchor="_Toc237720073" w:history="1">
         <w:r>
           <w:rPr>
             <w:rStyle w:val="Hipervnculo"/>
@@ -5679,7 +5935,7 @@
             <w:noProof/>
             <w:webHidden/>
           </w:rPr>
-          <w:instrText xml:space="preserve"> PAGEREF _Toc237718649 \h </w:instrText>
+          <w:instrText xml:space="preserve"> PAGEREF _Toc237720073 \h </w:instrText>
         </w:r>
         <w:r>
           <w:rPr>
@@ -5699,7 +5955,7 @@
             <w:noProof/>
             <w:webHidden/>
           </w:rPr>
-          <w:t>14</w:t>
+          <w:t>15</w:t>
         </w:r>
         <w:r>
           <w:rPr>
@@ -5726,7 +5982,7 @@
           <w14:ligatures w14:val="standardContextual"/>
         </w:rPr>
       </w:pPr>
-      <w:hyperlink w:anchor="_Toc237718650" w:history="1">
+      <w:hyperlink w:anchor="_Toc237720074" w:history="1">
         <w:r>
           <w:rPr>
             <w:rStyle w:val="Hipervnculo"/>
@@ -5753,7 +6009,7 @@
             <w:noProof/>
             <w:webHidden/>
           </w:rPr>
-          <w:instrText xml:space="preserve"> PAGEREF _Toc237718650 \h </w:instrText>
+          <w:instrText xml:space="preserve"> PAGEREF _Toc237720074 \h </w:instrText>
         </w:r>
         <w:r>
           <w:rPr>
@@ -5773,7 +6029,7 @@
             <w:noProof/>
             <w:webHidden/>
           </w:rPr>
-          <w:t>14</w:t>
+          <w:t>15</w:t>
         </w:r>
         <w:r>
           <w:rPr>
@@ -5800,7 +6056,7 @@
           <w14:ligatures w14:val="standardContextual"/>
         </w:rPr>
       </w:pPr>
-      <w:hyperlink w:anchor="_Toc237718651" w:history="1">
+      <w:hyperlink w:anchor="_Toc237720075" w:history="1">
         <w:r>
           <w:rPr>
             <w:rStyle w:val="Hipervnculo"/>
@@ -5827,7 +6083,7 @@
             <w:noProof/>
             <w:webHidden/>
           </w:rPr>
-          <w:instrText xml:space="preserve"> PAGEREF _Toc237718651 \h </w:instrText>
+          <w:instrText xml:space="preserve"> PAGEREF _Toc237720075 \h </w:instrText>
         </w:r>
         <w:r>
           <w:rPr>
@@ -5847,7 +6103,7 @@
             <w:noProof/>
             <w:webHidden/>
           </w:rPr>
-          <w:t>15</w:t>
+          <w:t>16</w:t>
         </w:r>
         <w:r>
           <w:rPr>
@@ -5874,7 +6130,7 @@
           <w14:ligatures w14:val="standardContextual"/>
         </w:rPr>
       </w:pPr>
-      <w:hyperlink w:anchor="_Toc237718652" w:history="1">
+      <w:hyperlink w:anchor="_Toc237720076" w:history="1">
         <w:r>
           <w:rPr>
             <w:rStyle w:val="Hipervnculo"/>
@@ -5901,7 +6157,7 @@
             <w:noProof/>
             <w:webHidden/>
           </w:rPr>
-          <w:instrText xml:space="preserve"> PAGEREF _Toc237718652 \h </w:instrText>
+          <w:instrText xml:space="preserve"> PAGEREF _Toc237720076 \h </w:instrText>
         </w:r>
         <w:r>
           <w:rPr>
@@ -5921,7 +6177,7 @@
             <w:noProof/>
             <w:webHidden/>
           </w:rPr>
-          <w:t>16</w:t>
+          <w:t>17</w:t>
         </w:r>
         <w:r>
           <w:rPr>
@@ -5948,7 +6204,7 @@
           <w14:ligatures w14:val="standardContextual"/>
         </w:rPr>
       </w:pPr>
-      <w:hyperlink w:anchor="_Toc237718653" w:history="1">
+      <w:hyperlink w:anchor="_Toc237720077" w:history="1">
         <w:r>
           <w:rPr>
             <w:rStyle w:val="Hipervnculo"/>
@@ -5975,7 +6231,7 @@
             <w:noProof/>
             <w:webHidden/>
           </w:rPr>
-          <w:instrText xml:space="preserve"> PAGEREF _Toc237718653 \h </w:instrText>
+          <w:instrText xml:space="preserve"> PAGEREF _Toc237720077 \h </w:instrText>
         </w:r>
         <w:r>
           <w:rPr>
@@ -5995,7 +6251,7 @@
             <w:noProof/>
             <w:webHidden/>
           </w:rPr>
-          <w:t>16</w:t>
+          <w:t>17</w:t>
         </w:r>
         <w:r>
           <w:rPr>
@@ -6059,7 +6315,7 @@
         <w:pStyle w:val="Ttulo1"/>
         <w:spacing w:before="100" w:after="30"/>
       </w:pPr>
-      <w:bookmarkStart w:id="0" w:name="_Toc237718591"/>
+      <w:bookmarkStart w:id="0" w:name="_Toc237720015"/>
       <w:r>
         <w:rPr>
           <w:rFonts w:ascii="Georgia" w:hAnsi="Georgia"/>
@@ -6076,7 +6332,7 @@
         <w:pStyle w:val="Ttulo2"/>
         <w:spacing w:before="70" w:after="20"/>
       </w:pPr>
-      <w:bookmarkStart w:id="1" w:name="_Toc237718592"/>
+      <w:bookmarkStart w:id="1" w:name="_Toc237720016"/>
       <w:r>
         <w:rPr>
           <w:rFonts w:ascii="Georgia" w:hAnsi="Georgia"/>
@@ -6117,7 +6373,7 @@
         <w:pStyle w:val="Ttulo2"/>
         <w:spacing w:before="70" w:after="20"/>
       </w:pPr>
-      <w:bookmarkStart w:id="2" w:name="_Toc237718593"/>
+      <w:bookmarkStart w:id="2" w:name="_Toc237720017"/>
       <w:r>
         <w:rPr>
           <w:rFonts w:ascii="Georgia" w:hAnsi="Georgia"/>
@@ -6178,7 +6434,7 @@
                 <w:noProof/>
               </w:rPr>
               <w:drawing>
-                <wp:inline distT="0" distB="0" distL="0" distR="0" wp14:anchorId="0A435354" wp14:editId="53E081D9">
+                <wp:inline distT="0" distB="0" distL="0" distR="0" wp14:anchorId="6A8F67C0" wp14:editId="1A8C1E5F">
                   <wp:extent cx="2926080" cy="1524412"/>
                   <wp:effectExtent l="0" t="0" r="0" b="0"/>
                   <wp:docPr id="1" name="Picture 1"/>
@@ -6237,7 +6493,7 @@
                 <w:noProof/>
               </w:rPr>
               <w:drawing>
-                <wp:inline distT="0" distB="0" distL="0" distR="0" wp14:anchorId="66E254D8" wp14:editId="13DDDBB5">
+                <wp:inline distT="0" distB="0" distL="0" distR="0" wp14:anchorId="0C75F264" wp14:editId="23E08B92">
                   <wp:extent cx="2926080" cy="1437831"/>
                   <wp:effectExtent l="0" t="0" r="0" b="0"/>
                   <wp:docPr id="2" name="Picture 2"/>
@@ -6342,7 +6598,7 @@
         <w:pStyle w:val="Ttulo2"/>
         <w:spacing w:before="70" w:after="20"/>
       </w:pPr>
-      <w:bookmarkStart w:id="3" w:name="_Toc237718594"/>
+      <w:bookmarkStart w:id="3" w:name="_Toc237720018"/>
       <w:r>
         <w:rPr>
           <w:rFonts w:ascii="Georgia" w:hAnsi="Georgia"/>
@@ -6469,7 +6725,7 @@
         <w:pStyle w:val="Ttulo2"/>
         <w:spacing w:before="70" w:after="20"/>
       </w:pPr>
-      <w:bookmarkStart w:id="4" w:name="_Toc237718595"/>
+      <w:bookmarkStart w:id="4" w:name="_Toc237720019"/>
       <w:r>
         <w:rPr>
           <w:rFonts w:ascii="Georgia" w:hAnsi="Georgia"/>
@@ -6997,7 +7253,7 @@
         <w:pStyle w:val="Ttulo2"/>
         <w:spacing w:before="70" w:after="20"/>
       </w:pPr>
-      <w:bookmarkStart w:id="5" w:name="_Toc237718596"/>
+      <w:bookmarkStart w:id="5" w:name="_Toc237720020"/>
       <w:r>
         <w:rPr>
           <w:rFonts w:ascii="Georgia" w:hAnsi="Georgia"/>
@@ -7130,7 +7386,7 @@
         <w:pStyle w:val="Ttulo2"/>
         <w:spacing w:before="70" w:after="20"/>
       </w:pPr>
-      <w:bookmarkStart w:id="6" w:name="_Toc237718597"/>
+      <w:bookmarkStart w:id="6" w:name="_Toc237720021"/>
       <w:r>
         <w:rPr>
           <w:rFonts w:ascii="Georgia" w:hAnsi="Georgia"/>
@@ -8347,7 +8603,7 @@
         <w:pStyle w:val="Ttulo1"/>
         <w:spacing w:before="100" w:after="30"/>
       </w:pPr>
-      <w:bookmarkStart w:id="7" w:name="_Toc237718598"/>
+      <w:bookmarkStart w:id="7" w:name="_Toc237720022"/>
       <w:r>
         <w:rPr>
           <w:rFonts w:ascii="Georgia" w:hAnsi="Georgia"/>
@@ -8363,7 +8619,7 @@
         <w:pStyle w:val="Ttulo2"/>
         <w:spacing w:before="70" w:after="20"/>
       </w:pPr>
-      <w:bookmarkStart w:id="8" w:name="_Toc237718599"/>
+      <w:bookmarkStart w:id="8" w:name="_Toc237720023"/>
       <w:r>
         <w:rPr>
           <w:rFonts w:ascii="Georgia" w:hAnsi="Georgia"/>
@@ -8421,7 +8677,7 @@
                 <w:noProof/>
               </w:rPr>
               <w:drawing>
-                <wp:inline distT="0" distB="0" distL="0" distR="0" wp14:anchorId="41425E2F" wp14:editId="2A240A17">
+                <wp:inline distT="0" distB="0" distL="0" distR="0" wp14:anchorId="78571E14" wp14:editId="4129CE64">
                   <wp:extent cx="2926080" cy="1426594"/>
                   <wp:effectExtent l="0" t="0" r="0" b="0"/>
                   <wp:docPr id="3" name="Picture 3"/>
@@ -8480,7 +8736,7 @@
                 <w:noProof/>
               </w:rPr>
               <w:drawing>
-                <wp:inline distT="0" distB="0" distL="0" distR="0" wp14:anchorId="43A3E61A" wp14:editId="01BF53CF">
+                <wp:inline distT="0" distB="0" distL="0" distR="0" wp14:anchorId="7BDFA62B" wp14:editId="4DF6C9A3">
                   <wp:extent cx="2926080" cy="1494260"/>
                   <wp:effectExtent l="0" t="0" r="0" b="0"/>
                   <wp:docPr id="4" name="Picture 4"/>
@@ -8595,7 +8851,7 @@
         <w:pStyle w:val="Ttulo2"/>
         <w:spacing w:before="70" w:after="20"/>
       </w:pPr>
-      <w:bookmarkStart w:id="9" w:name="_Toc237718600"/>
+      <w:bookmarkStart w:id="9" w:name="_Toc237720024"/>
       <w:r>
         <w:rPr>
           <w:rFonts w:ascii="Georgia" w:hAnsi="Georgia"/>
@@ -8829,7 +9085,7 @@
         <w:pStyle w:val="Ttulo1"/>
         <w:spacing w:before="100" w:after="30"/>
       </w:pPr>
-      <w:bookmarkStart w:id="10" w:name="_Toc237718601"/>
+      <w:bookmarkStart w:id="10" w:name="_Toc237720025"/>
       <w:r>
         <w:rPr>
           <w:rFonts w:ascii="Georgia" w:hAnsi="Georgia"/>
@@ -8845,7 +9101,7 @@
         <w:pStyle w:val="Ttulo2"/>
         <w:spacing w:before="70" w:after="20"/>
       </w:pPr>
-      <w:bookmarkStart w:id="11" w:name="_Toc237718602"/>
+      <w:bookmarkStart w:id="11" w:name="_Toc237720026"/>
       <w:r>
         <w:rPr>
           <w:rFonts w:ascii="Georgia" w:hAnsi="Georgia"/>
@@ -8906,7 +9162,7 @@
                 <w:noProof/>
               </w:rPr>
               <w:drawing>
-                <wp:inline distT="0" distB="0" distL="0" distR="0" wp14:anchorId="23FECFF1" wp14:editId="017C1CAF">
+                <wp:inline distT="0" distB="0" distL="0" distR="0" wp14:anchorId="0FA26289" wp14:editId="63AADFF5">
                   <wp:extent cx="2926080" cy="1636252"/>
                   <wp:effectExtent l="0" t="0" r="0" b="0"/>
                   <wp:docPr id="5" name="Picture 5"/>
@@ -8965,7 +9221,7 @@
                 <w:noProof/>
               </w:rPr>
               <w:drawing>
-                <wp:inline distT="0" distB="0" distL="0" distR="0" wp14:anchorId="11651EAC" wp14:editId="6F566FB2">
+                <wp:inline distT="0" distB="0" distL="0" distR="0" wp14:anchorId="2D5EB111" wp14:editId="24BBA4B5">
                   <wp:extent cx="2926080" cy="1481181"/>
                   <wp:effectExtent l="0" t="0" r="0" b="0"/>
                   <wp:docPr id="6" name="Picture 6"/>
@@ -9080,7 +9336,7 @@
         <w:pStyle w:val="Ttulo2"/>
         <w:spacing w:before="70" w:after="20"/>
       </w:pPr>
-      <w:bookmarkStart w:id="12" w:name="_Toc237718603"/>
+      <w:bookmarkStart w:id="12" w:name="_Toc237720027"/>
       <w:r>
         <w:rPr>
           <w:rFonts w:ascii="Georgia" w:hAnsi="Georgia"/>
@@ -9111,7 +9367,7 @@
         <w:pStyle w:val="Ttulo2"/>
         <w:spacing w:before="70" w:after="20"/>
       </w:pPr>
-      <w:bookmarkStart w:id="13" w:name="_Toc237718604"/>
+      <w:bookmarkStart w:id="13" w:name="_Toc237720028"/>
       <w:r>
         <w:rPr>
           <w:rFonts w:ascii="Georgia" w:hAnsi="Georgia"/>
@@ -9169,7 +9425,7 @@
                 <w:noProof/>
               </w:rPr>
               <w:drawing>
-                <wp:inline distT="0" distB="0" distL="0" distR="0" wp14:anchorId="6207E261" wp14:editId="63849C3F">
+                <wp:inline distT="0" distB="0" distL="0" distR="0" wp14:anchorId="4DAA6AD3" wp14:editId="1DD10DE6">
                   <wp:extent cx="2926080" cy="1626307"/>
                   <wp:effectExtent l="0" t="0" r="0" b="0"/>
                   <wp:docPr id="7" name="Picture 7"/>
@@ -9228,7 +9484,7 @@
                 <w:noProof/>
               </w:rPr>
               <w:drawing>
-                <wp:inline distT="0" distB="0" distL="0" distR="0" wp14:anchorId="716B0423" wp14:editId="318A9818">
+                <wp:inline distT="0" distB="0" distL="0" distR="0" wp14:anchorId="780F03F2" wp14:editId="7317617C">
                   <wp:extent cx="2926080" cy="1479479"/>
                   <wp:effectExtent l="0" t="0" r="0" b="0"/>
                   <wp:docPr id="8" name="Picture 8"/>
@@ -9333,7 +9589,7 @@
         <w:pStyle w:val="Ttulo2"/>
         <w:spacing w:before="70" w:after="20"/>
       </w:pPr>
-      <w:bookmarkStart w:id="14" w:name="_Toc237718605"/>
+      <w:bookmarkStart w:id="14" w:name="_Toc237720029"/>
       <w:r>
         <w:rPr>
           <w:rFonts w:ascii="Georgia" w:hAnsi="Georgia"/>
@@ -9394,7 +9650,7 @@
                 <w:noProof/>
               </w:rPr>
               <w:drawing>
-                <wp:inline distT="0" distB="0" distL="0" distR="0" wp14:anchorId="2CF9A16B" wp14:editId="7FB25165">
+                <wp:inline distT="0" distB="0" distL="0" distR="0" wp14:anchorId="6303B493" wp14:editId="20336636">
                   <wp:extent cx="2926080" cy="1662311"/>
                   <wp:effectExtent l="0" t="0" r="0" b="0"/>
                   <wp:docPr id="9" name="Picture 9"/>
@@ -9453,7 +9709,7 @@
                 <w:noProof/>
               </w:rPr>
               <w:drawing>
-                <wp:inline distT="0" distB="0" distL="0" distR="0" wp14:anchorId="76E9937D" wp14:editId="79CC0FBA">
+                <wp:inline distT="0" distB="0" distL="0" distR="0" wp14:anchorId="6EE4F44A" wp14:editId="607CB072">
                   <wp:extent cx="2926080" cy="1801004"/>
                   <wp:effectExtent l="0" t="0" r="0" b="0"/>
                   <wp:docPr id="10" name="Picture 10"/>
@@ -9558,7 +9814,7 @@
         <w:pStyle w:val="Ttulo1"/>
         <w:spacing w:before="100" w:after="30"/>
       </w:pPr>
-      <w:bookmarkStart w:id="15" w:name="_Toc237718606"/>
+      <w:bookmarkStart w:id="15" w:name="_Toc237720030"/>
       <w:r>
         <w:rPr>
           <w:rFonts w:ascii="Georgia" w:hAnsi="Georgia"/>
@@ -9574,7 +9830,7 @@
         <w:pStyle w:val="Ttulo2"/>
         <w:spacing w:before="70" w:after="20"/>
       </w:pPr>
-      <w:bookmarkStart w:id="16" w:name="_Toc237718607"/>
+      <w:bookmarkStart w:id="16" w:name="_Toc237720031"/>
       <w:r>
         <w:rPr>
           <w:rFonts w:ascii="Georgia" w:hAnsi="Georgia"/>
@@ -10013,7 +10269,7 @@
         <w:pStyle w:val="Ttulo2"/>
         <w:spacing w:before="70" w:after="20"/>
       </w:pPr>
-      <w:bookmarkStart w:id="17" w:name="_Toc237718608"/>
+      <w:bookmarkStart w:id="17" w:name="_Toc237720032"/>
       <w:r>
         <w:rPr>
           <w:rFonts w:ascii="Georgia" w:hAnsi="Georgia"/>
@@ -10041,7 +10297,7 @@
         <w:pStyle w:val="Ttulo1"/>
         <w:spacing w:before="100" w:after="30"/>
       </w:pPr>
-      <w:bookmarkStart w:id="18" w:name="_Toc237718609"/>
+      <w:bookmarkStart w:id="18" w:name="_Toc237720033"/>
       <w:r>
         <w:rPr>
           <w:rFonts w:ascii="Georgia" w:hAnsi="Georgia"/>
@@ -10057,7 +10313,7 @@
         <w:pStyle w:val="Ttulo2"/>
         <w:spacing w:before="70" w:after="20"/>
       </w:pPr>
-      <w:bookmarkStart w:id="19" w:name="_Toc237718610"/>
+      <w:bookmarkStart w:id="19" w:name="_Toc237720034"/>
       <w:r>
         <w:rPr>
           <w:rFonts w:ascii="Georgia" w:hAnsi="Georgia"/>
@@ -10084,7 +10340,7 @@
         <w:pStyle w:val="Ttulo2"/>
         <w:spacing w:before="70" w:after="20"/>
       </w:pPr>
-      <w:bookmarkStart w:id="20" w:name="_Toc237718611"/>
+      <w:bookmarkStart w:id="20" w:name="_Toc237720035"/>
       <w:r>
         <w:rPr>
           <w:rFonts w:ascii="Georgia" w:hAnsi="Georgia"/>
@@ -10142,7 +10398,7 @@
                 <w:noProof/>
               </w:rPr>
               <w:drawing>
-                <wp:inline distT="0" distB="0" distL="0" distR="0" wp14:anchorId="24845360" wp14:editId="037F46A5">
+                <wp:inline distT="0" distB="0" distL="0" distR="0" wp14:anchorId="2A89DF1B" wp14:editId="0640D28C">
                   <wp:extent cx="2926080" cy="1714660"/>
                   <wp:effectExtent l="0" t="0" r="0" b="0"/>
                   <wp:docPr id="11" name="Picture 11"/>
@@ -10201,7 +10457,7 @@
                 <w:noProof/>
               </w:rPr>
               <w:drawing>
-                <wp:inline distT="0" distB="0" distL="0" distR="0" wp14:anchorId="44C5E755" wp14:editId="774874FA">
+                <wp:inline distT="0" distB="0" distL="0" distR="0" wp14:anchorId="7FDA0020" wp14:editId="6943BF76">
                   <wp:extent cx="2926080" cy="1558188"/>
                   <wp:effectExtent l="0" t="0" r="0" b="0"/>
                   <wp:docPr id="12" name="Picture 12"/>
@@ -11171,7 +11427,7 @@
         <w:pStyle w:val="Ttulo1"/>
         <w:spacing w:before="100" w:after="30"/>
       </w:pPr>
-      <w:bookmarkStart w:id="21" w:name="_Toc237718612"/>
+      <w:bookmarkStart w:id="21" w:name="_Toc237720036"/>
       <w:r>
         <w:rPr>
           <w:rFonts w:ascii="Georgia" w:hAnsi="Georgia"/>
@@ -11188,7 +11444,7 @@
         <w:pStyle w:val="Ttulo2"/>
         <w:spacing w:before="70" w:after="20"/>
       </w:pPr>
-      <w:bookmarkStart w:id="22" w:name="_Toc237718613"/>
+      <w:bookmarkStart w:id="22" w:name="_Toc237720037"/>
       <w:r>
         <w:rPr>
           <w:rFonts w:ascii="Georgia" w:hAnsi="Georgia"/>
@@ -11280,7 +11536,7 @@
         <w:pStyle w:val="Ttulo2"/>
         <w:spacing w:before="70" w:after="20"/>
       </w:pPr>
-      <w:bookmarkStart w:id="23" w:name="_Toc237718614"/>
+      <w:bookmarkStart w:id="23" w:name="_Toc237720038"/>
       <w:r>
         <w:rPr>
           <w:rFonts w:ascii="Georgia" w:hAnsi="Georgia"/>
@@ -11511,7 +11767,7 @@
                 <w:noProof/>
               </w:rPr>
               <w:drawing>
-                <wp:inline distT="0" distB="0" distL="0" distR="0" wp14:anchorId="31BC9781" wp14:editId="2B0CECEE">
+                <wp:inline distT="0" distB="0" distL="0" distR="0" wp14:anchorId="67150B2D" wp14:editId="2D5A9A1C">
                   <wp:extent cx="2926080" cy="1540391"/>
                   <wp:effectExtent l="0" t="0" r="0" b="0"/>
                   <wp:docPr id="13" name="Picture 13"/>
@@ -11570,7 +11826,7 @@
                 <w:noProof/>
               </w:rPr>
               <w:drawing>
-                <wp:inline distT="0" distB="0" distL="0" distR="0" wp14:anchorId="29EA41BA" wp14:editId="1AE83931">
+                <wp:inline distT="0" distB="0" distL="0" distR="0" wp14:anchorId="07D6F912" wp14:editId="5D1DD34C">
                   <wp:extent cx="2926080" cy="1658038"/>
                   <wp:effectExtent l="0" t="0" r="0" b="0"/>
                   <wp:docPr id="14" name="Picture 14"/>
@@ -11675,7 +11931,7 @@
         <w:pStyle w:val="Ttulo2"/>
         <w:spacing w:before="70" w:after="20"/>
       </w:pPr>
-      <w:bookmarkStart w:id="24" w:name="_Toc237718615"/>
+      <w:bookmarkStart w:id="24" w:name="_Toc237720039"/>
       <w:r>
         <w:rPr>
           <w:rFonts w:ascii="Georgia" w:hAnsi="Georgia"/>
@@ -12603,7 +12859,7 @@
         <w:pStyle w:val="Ttulo1"/>
         <w:spacing w:before="100" w:after="30"/>
       </w:pPr>
-      <w:bookmarkStart w:id="25" w:name="_Toc237718616"/>
+      <w:bookmarkStart w:id="25" w:name="_Toc237720040"/>
       <w:r>
         <w:rPr>
           <w:rFonts w:ascii="Georgia" w:hAnsi="Georgia"/>
@@ -12619,7 +12875,7 @@
         <w:pStyle w:val="Ttulo2"/>
         <w:spacing w:before="70" w:after="20"/>
       </w:pPr>
-      <w:bookmarkStart w:id="26" w:name="_Toc237718617"/>
+      <w:bookmarkStart w:id="26" w:name="_Toc237720041"/>
       <w:r>
         <w:rPr>
           <w:rFonts w:ascii="Georgia" w:hAnsi="Georgia"/>
@@ -14208,7 +14464,7 @@
         <w:pStyle w:val="Ttulo2"/>
         <w:spacing w:before="70" w:after="20"/>
       </w:pPr>
-      <w:bookmarkStart w:id="27" w:name="_Toc237718618"/>
+      <w:bookmarkStart w:id="27" w:name="_Toc237720042"/>
       <w:r>
         <w:rPr>
           <w:rFonts w:ascii="Georgia" w:hAnsi="Georgia"/>
@@ -14318,7 +14574,7 @@
         <w:pStyle w:val="Ttulo1"/>
         <w:spacing w:before="100" w:after="30"/>
       </w:pPr>
-      <w:bookmarkStart w:id="28" w:name="_Toc237718619"/>
+      <w:bookmarkStart w:id="28" w:name="_Toc237720043"/>
       <w:r>
         <w:rPr>
           <w:rFonts w:ascii="Georgia" w:hAnsi="Georgia"/>
@@ -14335,7 +14591,7 @@
         <w:pStyle w:val="Ttulo2"/>
         <w:spacing w:before="70" w:after="20"/>
       </w:pPr>
-      <w:bookmarkStart w:id="29" w:name="_Toc237718620"/>
+      <w:bookmarkStart w:id="29" w:name="_Toc237720044"/>
       <w:r>
         <w:rPr>
           <w:rFonts w:ascii="Georgia" w:hAnsi="Georgia"/>
@@ -14362,7 +14618,7 @@
         <w:pStyle w:val="Ttulo2"/>
         <w:spacing w:before="70" w:after="20"/>
       </w:pPr>
-      <w:bookmarkStart w:id="30" w:name="_Toc237718621"/>
+      <w:bookmarkStart w:id="30" w:name="_Toc237720045"/>
       <w:r>
         <w:rPr>
           <w:rFonts w:ascii="Georgia" w:hAnsi="Georgia"/>
@@ -14420,7 +14676,7 @@
                 <w:noProof/>
               </w:rPr>
               <w:drawing>
-                <wp:inline distT="0" distB="0" distL="0" distR="0" wp14:anchorId="59E6BE41" wp14:editId="041D98F6">
+                <wp:inline distT="0" distB="0" distL="0" distR="0" wp14:anchorId="5C3FE772" wp14:editId="1A9EDC47">
                   <wp:extent cx="2926080" cy="1534596"/>
                   <wp:effectExtent l="0" t="0" r="0" b="0"/>
                   <wp:docPr id="15" name="Picture 15"/>
@@ -14479,7 +14735,7 @@
                 <w:noProof/>
               </w:rPr>
               <w:drawing>
-                <wp:inline distT="0" distB="0" distL="0" distR="0" wp14:anchorId="7E81C492" wp14:editId="535EFF83">
+                <wp:inline distT="0" distB="0" distL="0" distR="0" wp14:anchorId="5B755DCB" wp14:editId="409C11F5">
                   <wp:extent cx="2926080" cy="1680519"/>
                   <wp:effectExtent l="0" t="0" r="0" b="0"/>
                   <wp:docPr id="16" name="Picture 16"/>
@@ -14595,7 +14851,7 @@
         <w:pStyle w:val="Ttulo1"/>
         <w:spacing w:before="100" w:after="30"/>
       </w:pPr>
-      <w:bookmarkStart w:id="31" w:name="_Toc237718622"/>
+      <w:bookmarkStart w:id="31" w:name="_Toc237720046"/>
       <w:r>
         <w:rPr>
           <w:rFonts w:ascii="Georgia" w:hAnsi="Georgia"/>
@@ -14611,7 +14867,7 @@
         <w:pStyle w:val="Ttulo2"/>
         <w:spacing w:before="70" w:after="20"/>
       </w:pPr>
-      <w:bookmarkStart w:id="32" w:name="_Toc237718623"/>
+      <w:bookmarkStart w:id="32" w:name="_Toc237720047"/>
       <w:r>
         <w:rPr>
           <w:rFonts w:ascii="Georgia" w:hAnsi="Georgia"/>
@@ -15658,7 +15914,7 @@
         <w:pStyle w:val="Ttulo2"/>
         <w:spacing w:before="70" w:after="20"/>
       </w:pPr>
-      <w:bookmarkStart w:id="33" w:name="_Toc237718624"/>
+      <w:bookmarkStart w:id="33" w:name="_Toc237720048"/>
       <w:r>
         <w:rPr>
           <w:rFonts w:ascii="Georgia" w:hAnsi="Georgia"/>
@@ -15819,7 +16075,7 @@
         <w:pStyle w:val="Ttulo2"/>
         <w:spacing w:before="70" w:after="20"/>
       </w:pPr>
-      <w:bookmarkStart w:id="34" w:name="_Toc237718625"/>
+      <w:bookmarkStart w:id="34" w:name="_Toc237720049"/>
       <w:r>
         <w:rPr>
           <w:rFonts w:ascii="Georgia" w:hAnsi="Georgia"/>
@@ -15846,7 +16102,7 @@
         <w:pStyle w:val="Ttulo1"/>
         <w:spacing w:before="100" w:after="30"/>
       </w:pPr>
-      <w:bookmarkStart w:id="35" w:name="_Toc237718626"/>
+      <w:bookmarkStart w:id="35" w:name="_Toc237720050"/>
       <w:r>
         <w:rPr>
           <w:rFonts w:ascii="Georgia" w:hAnsi="Georgia"/>
@@ -15862,7 +16118,7 @@
         <w:pStyle w:val="Ttulo2"/>
         <w:spacing w:before="70" w:after="20"/>
       </w:pPr>
-      <w:bookmarkStart w:id="36" w:name="_Toc237718627"/>
+      <w:bookmarkStart w:id="36" w:name="_Toc237720051"/>
       <w:r>
         <w:rPr>
           <w:rFonts w:ascii="Georgia" w:hAnsi="Georgia"/>
@@ -18789,7 +19045,7 @@
         <w:pStyle w:val="Ttulo1"/>
         <w:spacing w:before="100" w:after="30"/>
       </w:pPr>
-      <w:bookmarkStart w:id="37" w:name="_Toc237718628"/>
+      <w:bookmarkStart w:id="37" w:name="_Toc237720052"/>
       <w:r>
         <w:rPr>
           <w:rFonts w:ascii="Georgia" w:hAnsi="Georgia"/>
@@ -18806,7 +19062,7 @@
         <w:pStyle w:val="Ttulo2"/>
         <w:spacing w:before="70" w:after="20"/>
       </w:pPr>
-      <w:bookmarkStart w:id="38" w:name="_Toc237718629"/>
+      <w:bookmarkStart w:id="38" w:name="_Toc237720053"/>
       <w:r>
         <w:rPr>
           <w:rFonts w:ascii="Georgia" w:hAnsi="Georgia"/>
@@ -18991,7 +19247,7 @@
         <w:pStyle w:val="Ttulo2"/>
         <w:spacing w:before="70" w:after="20"/>
       </w:pPr>
-      <w:bookmarkStart w:id="39" w:name="_Toc237718630"/>
+      <w:bookmarkStart w:id="39" w:name="_Toc237720054"/>
       <w:r>
         <w:rPr>
           <w:rFonts w:ascii="Georgia" w:hAnsi="Georgia"/>
@@ -19049,7 +19305,7 @@
                 <w:noProof/>
               </w:rPr>
               <w:drawing>
-                <wp:inline distT="0" distB="0" distL="0" distR="0" wp14:anchorId="7E7D22C5" wp14:editId="21ABEC22">
+                <wp:inline distT="0" distB="0" distL="0" distR="0" wp14:anchorId="3E69BC58" wp14:editId="796B5BB9">
                   <wp:extent cx="2926080" cy="1626569"/>
                   <wp:effectExtent l="0" t="0" r="0" b="0"/>
                   <wp:docPr id="17" name="Picture 17"/>
@@ -19108,7 +19364,7 @@
                 <w:noProof/>
               </w:rPr>
               <w:drawing>
-                <wp:inline distT="0" distB="0" distL="0" distR="0" wp14:anchorId="5B8EA4E6" wp14:editId="0A58EF83">
+                <wp:inline distT="0" distB="0" distL="0" distR="0" wp14:anchorId="26AACDA8" wp14:editId="01A06CD8">
                   <wp:extent cx="2926080" cy="1691675"/>
                   <wp:effectExtent l="0" t="0" r="0" b="0"/>
                   <wp:docPr id="18" name="Picture 18"/>
@@ -19213,7 +19469,7 @@
         <w:pStyle w:val="Ttulo2"/>
         <w:spacing w:before="70" w:after="20"/>
       </w:pPr>
-      <w:bookmarkStart w:id="40" w:name="_Toc237718631"/>
+      <w:bookmarkStart w:id="40" w:name="_Toc237720055"/>
       <w:r>
         <w:rPr>
           <w:rFonts w:ascii="Georgia" w:hAnsi="Georgia"/>
@@ -19842,7 +20098,7 @@
         <w:pStyle w:val="Ttulo1"/>
         <w:spacing w:before="100" w:after="30"/>
       </w:pPr>
-      <w:bookmarkStart w:id="41" w:name="_Toc237718632"/>
+      <w:bookmarkStart w:id="41" w:name="_Toc237720056"/>
       <w:r>
         <w:rPr>
           <w:rFonts w:ascii="Georgia" w:hAnsi="Georgia"/>
@@ -19858,7 +20114,7 @@
         <w:pStyle w:val="Ttulo2"/>
         <w:spacing w:before="70" w:after="20"/>
       </w:pPr>
-      <w:bookmarkStart w:id="42" w:name="_Toc237718633"/>
+      <w:bookmarkStart w:id="42" w:name="_Toc237720057"/>
       <w:r>
         <w:rPr>
           <w:rFonts w:ascii="Georgia" w:hAnsi="Georgia"/>
@@ -19916,7 +20172,7 @@
                 <w:noProof/>
               </w:rPr>
               <w:drawing>
-                <wp:inline distT="0" distB="0" distL="0" distR="0" wp14:anchorId="10E933E8" wp14:editId="5D79116A">
+                <wp:inline distT="0" distB="0" distL="0" distR="0" wp14:anchorId="027C4089" wp14:editId="73C485BC">
                   <wp:extent cx="2926080" cy="1495195"/>
                   <wp:effectExtent l="0" t="0" r="0" b="0"/>
                   <wp:docPr id="19" name="Picture 19"/>
@@ -19975,7 +20231,7 @@
                 <w:noProof/>
               </w:rPr>
               <w:drawing>
-                <wp:inline distT="0" distB="0" distL="0" distR="0" wp14:anchorId="089DE9F3" wp14:editId="2D24CBF9">
+                <wp:inline distT="0" distB="0" distL="0" distR="0" wp14:anchorId="554B6AF3" wp14:editId="4952E24A">
                   <wp:extent cx="2926080" cy="1682608"/>
                   <wp:effectExtent l="0" t="0" r="0" b="0"/>
                   <wp:docPr id="20" name="Picture 20"/>
@@ -21110,7 +21366,7 @@
         <w:pStyle w:val="Ttulo1"/>
         <w:spacing w:before="100" w:after="30"/>
       </w:pPr>
-      <w:bookmarkStart w:id="43" w:name="_Toc237718634"/>
+      <w:bookmarkStart w:id="43" w:name="_Toc237720058"/>
       <w:r>
         <w:rPr>
           <w:rFonts w:ascii="Georgia" w:hAnsi="Georgia"/>
@@ -21127,7 +21383,7 @@
         <w:pStyle w:val="Ttulo2"/>
         <w:spacing w:before="70" w:after="20"/>
       </w:pPr>
-      <w:bookmarkStart w:id="44" w:name="_Toc237718635"/>
+      <w:bookmarkStart w:id="44" w:name="_Toc237720059"/>
       <w:r>
         <w:rPr>
           <w:rFonts w:ascii="Georgia" w:hAnsi="Georgia"/>
@@ -21182,7 +21438,7 @@
         <w:pStyle w:val="Ttulo2"/>
         <w:spacing w:before="70" w:after="20"/>
       </w:pPr>
-      <w:bookmarkStart w:id="45" w:name="_Toc237718636"/>
+      <w:bookmarkStart w:id="45" w:name="_Toc237720060"/>
       <w:r>
         <w:rPr>
           <w:rFonts w:ascii="Georgia" w:hAnsi="Georgia"/>
@@ -21240,7 +21496,7 @@
                 <w:noProof/>
               </w:rPr>
               <w:drawing>
-                <wp:inline distT="0" distB="0" distL="0" distR="0" wp14:anchorId="77B1C7E0" wp14:editId="7A4DD3F5">
+                <wp:inline distT="0" distB="0" distL="0" distR="0" wp14:anchorId="0BC00DF2" wp14:editId="61E3C751">
                   <wp:extent cx="2926080" cy="1682608"/>
                   <wp:effectExtent l="0" t="0" r="0" b="0"/>
                   <wp:docPr id="21" name="Picture 21"/>
@@ -21299,7 +21555,7 @@
                 <w:noProof/>
               </w:rPr>
               <w:drawing>
-                <wp:inline distT="0" distB="0" distL="0" distR="0" wp14:anchorId="16C95A50" wp14:editId="459A6FBA">
+                <wp:inline distT="0" distB="0" distL="0" distR="0" wp14:anchorId="7A62566C" wp14:editId="299A71EF">
                   <wp:extent cx="2926080" cy="1549755"/>
                   <wp:effectExtent l="0" t="0" r="0" b="0"/>
                   <wp:docPr id="22" name="Picture 22"/>
@@ -21404,7 +21660,7 @@
         <w:pStyle w:val="Ttulo1"/>
         <w:spacing w:before="100" w:after="30"/>
       </w:pPr>
-      <w:bookmarkStart w:id="46" w:name="_Toc237718637"/>
+      <w:bookmarkStart w:id="46" w:name="_Toc237720061"/>
       <w:r>
         <w:rPr>
           <w:rFonts w:ascii="Georgia" w:hAnsi="Georgia"/>
@@ -21420,7 +21676,7 @@
         <w:pStyle w:val="Ttulo2"/>
         <w:spacing w:before="70" w:after="20"/>
       </w:pPr>
-      <w:bookmarkStart w:id="47" w:name="_Toc237718638"/>
+      <w:bookmarkStart w:id="47" w:name="_Toc237720062"/>
       <w:r>
         <w:rPr>
           <w:rFonts w:ascii="Georgia" w:hAnsi="Georgia"/>
@@ -22968,7 +23224,7 @@
         <w:pStyle w:val="Ttulo1"/>
         <w:spacing w:before="100" w:after="30"/>
       </w:pPr>
-      <w:bookmarkStart w:id="48" w:name="_Toc237718639"/>
+      <w:bookmarkStart w:id="48" w:name="_Toc237720063"/>
       <w:r>
         <w:rPr>
           <w:rFonts w:ascii="Georgia" w:hAnsi="Georgia"/>
@@ -22985,7 +23241,7 @@
         <w:pStyle w:val="Ttulo2"/>
         <w:spacing w:before="70" w:after="20"/>
       </w:pPr>
-      <w:bookmarkStart w:id="49" w:name="_Toc237718640"/>
+      <w:bookmarkStart w:id="49" w:name="_Toc237720064"/>
       <w:r>
         <w:rPr>
           <w:rFonts w:ascii="Georgia" w:hAnsi="Georgia"/>
@@ -23108,7 +23364,7 @@
                 <w:noProof/>
               </w:rPr>
               <w:drawing>
-                <wp:inline distT="0" distB="0" distL="0" distR="0" wp14:anchorId="50BD030B" wp14:editId="7E2A99FB">
+                <wp:inline distT="0" distB="0" distL="0" distR="0" wp14:anchorId="2511ABAD" wp14:editId="31F3DB1F">
                   <wp:extent cx="2926080" cy="1695124"/>
                   <wp:effectExtent l="0" t="0" r="0" b="0"/>
                   <wp:docPr id="23" name="Picture 23"/>
@@ -23167,7 +23423,7 @@
                 <w:noProof/>
               </w:rPr>
               <w:drawing>
-                <wp:inline distT="0" distB="0" distL="0" distR="0" wp14:anchorId="43621BFC" wp14:editId="25D8584F">
+                <wp:inline distT="0" distB="0" distL="0" distR="0" wp14:anchorId="732A14D7" wp14:editId="306E817B">
                   <wp:extent cx="2926080" cy="1572627"/>
                   <wp:effectExtent l="0" t="0" r="0" b="0"/>
                   <wp:docPr id="24" name="Picture 24"/>
@@ -23272,7 +23528,7 @@
         <w:pStyle w:val="Ttulo2"/>
         <w:spacing w:before="70" w:after="20"/>
       </w:pPr>
-      <w:bookmarkStart w:id="50" w:name="_Toc237718641"/>
+      <w:bookmarkStart w:id="50" w:name="_Toc237720065"/>
       <w:r>
         <w:rPr>
           <w:rFonts w:ascii="Georgia" w:hAnsi="Georgia"/>
@@ -24007,7 +24263,7 @@
         <w:pStyle w:val="Ttulo2"/>
         <w:spacing w:before="70" w:after="20"/>
       </w:pPr>
-      <w:bookmarkStart w:id="51" w:name="_Toc237718642"/>
+      <w:bookmarkStart w:id="51" w:name="_Toc237720066"/>
       <w:r>
         <w:rPr>
           <w:rFonts w:ascii="Georgia" w:hAnsi="Georgia"/>
@@ -24057,7 +24313,7 @@
         <w:pStyle w:val="Ttulo2"/>
         <w:spacing w:before="70" w:after="20"/>
       </w:pPr>
-      <w:bookmarkStart w:id="52" w:name="_Toc237718643"/>
+      <w:bookmarkStart w:id="52" w:name="_Toc237720067"/>
       <w:r>
         <w:rPr>
           <w:rFonts w:ascii="Georgia" w:hAnsi="Georgia"/>
@@ -24138,7 +24394,7 @@
                 <w:noProof/>
               </w:rPr>
               <w:drawing>
-                <wp:inline distT="0" distB="0" distL="0" distR="0" wp14:anchorId="77C0864B" wp14:editId="2FECE2E8">
+                <wp:inline distT="0" distB="0" distL="0" distR="0" wp14:anchorId="1A6A0B73" wp14:editId="7146045B">
                   <wp:extent cx="2926080" cy="1696900"/>
                   <wp:effectExtent l="0" t="0" r="0" b="0"/>
                   <wp:docPr id="25" name="Picture 25"/>
@@ -24197,7 +24453,7 @@
                 <w:noProof/>
               </w:rPr>
               <w:drawing>
-                <wp:inline distT="0" distB="0" distL="0" distR="0" wp14:anchorId="2DC9BB45" wp14:editId="2F220981">
+                <wp:inline distT="0" distB="0" distL="0" distR="0" wp14:anchorId="2621FF23" wp14:editId="0145A0BC">
                   <wp:extent cx="2926080" cy="1614092"/>
                   <wp:effectExtent l="0" t="0" r="0" b="0"/>
                   <wp:docPr id="26" name="Picture 26"/>
@@ -25222,7 +25478,7 @@
         <w:pStyle w:val="Ttulo2"/>
         <w:spacing w:before="70" w:after="20"/>
       </w:pPr>
-      <w:bookmarkStart w:id="53" w:name="_Toc237718644"/>
+      <w:bookmarkStart w:id="53" w:name="_Toc237720068"/>
       <w:r>
         <w:rPr>
           <w:rFonts w:ascii="Georgia" w:hAnsi="Georgia"/>
@@ -25280,7 +25536,7 @@
                 <w:noProof/>
               </w:rPr>
               <w:drawing>
-                <wp:inline distT="0" distB="0" distL="0" distR="0" wp14:anchorId="47D35F9F" wp14:editId="130834BA">
+                <wp:inline distT="0" distB="0" distL="0" distR="0" wp14:anchorId="6733F68E" wp14:editId="4F869082">
                   <wp:extent cx="2926080" cy="1654733"/>
                   <wp:effectExtent l="0" t="0" r="0" b="0"/>
                   <wp:docPr id="27" name="Picture 27"/>
@@ -25339,7 +25595,7 @@
                 <w:noProof/>
               </w:rPr>
               <w:drawing>
-                <wp:inline distT="0" distB="0" distL="0" distR="0" wp14:anchorId="3CDB6E81" wp14:editId="492B27C6">
+                <wp:inline distT="0" distB="0" distL="0" distR="0" wp14:anchorId="7862B83E" wp14:editId="7E432DBD">
                   <wp:extent cx="2926080" cy="1698212"/>
                   <wp:effectExtent l="0" t="0" r="0" b="0"/>
                   <wp:docPr id="28" name="Picture 28"/>
@@ -25454,7 +25710,7 @@
         <w:pStyle w:val="Ttulo1"/>
         <w:spacing w:before="100" w:after="30"/>
       </w:pPr>
-      <w:bookmarkStart w:id="54" w:name="_Toc237718645"/>
+      <w:bookmarkStart w:id="54" w:name="_Toc237720069"/>
       <w:r>
         <w:rPr>
           <w:rFonts w:ascii="Georgia" w:hAnsi="Georgia"/>
@@ -25471,7 +25727,7 @@
         <w:pStyle w:val="Ttulo2"/>
         <w:spacing w:before="70" w:after="20"/>
       </w:pPr>
-      <w:bookmarkStart w:id="55" w:name="_Toc237718646"/>
+      <w:bookmarkStart w:id="55" w:name="_Toc237720070"/>
       <w:r>
         <w:rPr>
           <w:rFonts w:ascii="Georgia" w:hAnsi="Georgia"/>
@@ -25532,7 +25788,7 @@
         <w:pStyle w:val="Ttulo2"/>
         <w:spacing w:before="70" w:after="20"/>
       </w:pPr>
-      <w:bookmarkStart w:id="56" w:name="_Toc237718647"/>
+      <w:bookmarkStart w:id="56" w:name="_Toc237720071"/>
       <w:r>
         <w:rPr>
           <w:rFonts w:ascii="Georgia" w:hAnsi="Georgia"/>
@@ -25607,7 +25863,7 @@
                 <w:noProof/>
               </w:rPr>
               <w:drawing>
-                <wp:inline distT="0" distB="0" distL="0" distR="0" wp14:anchorId="17A1B9C3" wp14:editId="326037B8">
+                <wp:inline distT="0" distB="0" distL="0" distR="0" wp14:anchorId="723E9861" wp14:editId="6668B0A8">
                   <wp:extent cx="2926080" cy="1650045"/>
                   <wp:effectExtent l="0" t="0" r="0" b="0"/>
                   <wp:docPr id="29" name="Picture 29"/>
@@ -25666,7 +25922,7 @@
                 <w:noProof/>
               </w:rPr>
               <w:drawing>
-                <wp:inline distT="0" distB="0" distL="0" distR="0" wp14:anchorId="30466B6E" wp14:editId="18942FC8">
+                <wp:inline distT="0" distB="0" distL="0" distR="0" wp14:anchorId="594DFAC4" wp14:editId="1F9A13F6">
                   <wp:extent cx="2926080" cy="1611196"/>
                   <wp:effectExtent l="0" t="0" r="0" b="0"/>
                   <wp:docPr id="30" name="Picture 30"/>
@@ -26154,7 +26410,7 @@
         <w:pStyle w:val="Ttulo2"/>
         <w:spacing w:before="70" w:after="20"/>
       </w:pPr>
-      <w:bookmarkStart w:id="57" w:name="_Toc237718648"/>
+      <w:bookmarkStart w:id="57" w:name="_Toc237720072"/>
       <w:r>
         <w:rPr>
           <w:rFonts w:ascii="Georgia" w:hAnsi="Georgia"/>
@@ -26228,7 +26484,7 @@
                 <w:noProof/>
               </w:rPr>
               <w:drawing>
-                <wp:inline distT="0" distB="0" distL="0" distR="0" wp14:anchorId="07F9D6D0" wp14:editId="16B2A429">
+                <wp:inline distT="0" distB="0" distL="0" distR="0" wp14:anchorId="74FC8746" wp14:editId="16DE9081">
                   <wp:extent cx="2926080" cy="1687777"/>
                   <wp:effectExtent l="0" t="0" r="0" b="0"/>
                   <wp:docPr id="31" name="Picture 31"/>
@@ -26823,7 +27079,7 @@
         <w:pStyle w:val="Ttulo2"/>
         <w:spacing w:before="70" w:after="20"/>
       </w:pPr>
-      <w:bookmarkStart w:id="58" w:name="_Toc237718649"/>
+      <w:bookmarkStart w:id="58" w:name="_Toc237720073"/>
       <w:r>
         <w:rPr>
           <w:rFonts w:ascii="Georgia" w:hAnsi="Georgia"/>
@@ -28082,7 +28338,7 @@
         <w:pStyle w:val="Ttulo1"/>
         <w:spacing w:before="100" w:after="30"/>
       </w:pPr>
-      <w:bookmarkStart w:id="59" w:name="_Toc237718650"/>
+      <w:bookmarkStart w:id="59" w:name="_Toc237720074"/>
       <w:r>
         <w:rPr>
           <w:rFonts w:ascii="Georgia" w:hAnsi="Georgia"/>
@@ -28270,7 +28526,7 @@
         <w:pStyle w:val="Ttulo1"/>
         <w:spacing w:before="100" w:after="30"/>
       </w:pPr>
-      <w:bookmarkStart w:id="60" w:name="_Toc237718651"/>
+      <w:bookmarkStart w:id="60" w:name="_Toc237720075"/>
       <w:r>
         <w:rPr>
           <w:rFonts w:ascii="Georgia" w:hAnsi="Georgia"/>
@@ -37399,7 +37655,7 @@
         <w:pStyle w:val="Ttulo1"/>
         <w:spacing w:before="100" w:after="30"/>
       </w:pPr>
-      <w:bookmarkStart w:id="61" w:name="_Toc237718652"/>
+      <w:bookmarkStart w:id="61" w:name="_Toc237720076"/>
       <w:r>
         <w:rPr>
           <w:rFonts w:ascii="Georgia" w:hAnsi="Georgia"/>
@@ -37871,7 +38127,7 @@
         <w:pStyle w:val="Ttulo1"/>
         <w:spacing w:before="100" w:after="30"/>
       </w:pPr>
-      <w:bookmarkStart w:id="62" w:name="_Toc237718653"/>
+      <w:bookmarkStart w:id="62" w:name="_Toc237720077"/>
       <w:r>
         <w:rPr>
           <w:rFonts w:ascii="Georgia" w:hAnsi="Georgia"/>
@@ -38124,7 +38380,7 @@
       <w:rPr>
         <w:noProof/>
       </w:rPr>
-      <w:t>4</w:t>
+      <w:t>5</w:t>
     </w:r>
     <w:r>
       <w:fldChar w:fldCharType="end"/>
@@ -38375,31 +38631,31 @@
       </w:rPr>
     </w:lvl>
   </w:abstractNum>
-  <w:num w:numId="1" w16cid:durableId="1149134917">
+  <w:num w:numId="1" w16cid:durableId="939798689">
     <w:abstractNumId w:val="8"/>
   </w:num>
-  <w:num w:numId="2" w16cid:durableId="238711205">
+  <w:num w:numId="2" w16cid:durableId="604578416">
     <w:abstractNumId w:val="6"/>
   </w:num>
-  <w:num w:numId="3" w16cid:durableId="880556269">
+  <w:num w:numId="3" w16cid:durableId="1316030491">
     <w:abstractNumId w:val="5"/>
   </w:num>
-  <w:num w:numId="4" w16cid:durableId="621109021">
+  <w:num w:numId="4" w16cid:durableId="126317323">
     <w:abstractNumId w:val="4"/>
   </w:num>
-  <w:num w:numId="5" w16cid:durableId="1100833236">
+  <w:num w:numId="5" w16cid:durableId="766385348">
     <w:abstractNumId w:val="7"/>
   </w:num>
-  <w:num w:numId="6" w16cid:durableId="190536559">
+  <w:num w:numId="6" w16cid:durableId="2021269761">
     <w:abstractNumId w:val="3"/>
   </w:num>
-  <w:num w:numId="7" w16cid:durableId="1266041630">
+  <w:num w:numId="7" w16cid:durableId="696731802">
     <w:abstractNumId w:val="2"/>
   </w:num>
-  <w:num w:numId="8" w16cid:durableId="1586719013">
+  <w:num w:numId="8" w16cid:durableId="1879245532">
     <w:abstractNumId w:val="1"/>
   </w:num>
-  <w:num w:numId="9" w16cid:durableId="396364403">
+  <w:num w:numId="9" w16cid:durableId="552742493">
     <w:abstractNumId w:val="0"/>
   </w:num>
 </w:numbering>
@@ -49831,7 +50087,7 @@
     <w:autoRedefine/>
     <w:uiPriority w:val="39"/>
     <w:unhideWhenUsed/>
-    <w:rsid w:val="00087351"/>
+    <w:rsid w:val="000471A5"/>
     <w:pPr>
       <w:spacing w:before="10" w:after="10" w:line="240" w:lineRule="auto"/>
     </w:pPr>
@@ -49846,7 +50102,7 @@
     <w:autoRedefine/>
     <w:uiPriority w:val="39"/>
     <w:unhideWhenUsed/>
-    <w:rsid w:val="00087351"/>
+    <w:rsid w:val="000471A5"/>
     <w:pPr>
       <w:spacing w:after="0" w:line="240" w:lineRule="auto"/>
       <w:ind w:left="170"/>
@@ -49860,7 +50116,7 @@
     <w:basedOn w:val="Fuentedeprrafopredeter"/>
     <w:uiPriority w:val="99"/>
     <w:unhideWhenUsed/>
-    <w:rsid w:val="00087351"/>
+    <w:rsid w:val="000471A5"/>
     <w:rPr>
       <w:color w:val="0000FF" w:themeColor="hyperlink"/>
       <w:u w:val="single"/>

</xml_diff>

<commit_message>
fix: indice en 1 columna — titulo y entradas TOC sin cortes
</commit_message>
<xml_diff>
--- a/01_Reporte_PDF/Informe_Valuacion_Aluar_UNCuyo.docx
+++ b/01_Reporte_PDF/Informe_Valuacion_Aluar_UNCuyo.docx
@@ -1539,7 +1539,7 @@
         <w:rPr>
           <w:b/>
           <w:color w:val="0D233A"/>
-          <w:sz w:val="24"/>
+          <w:sz w:val="28"/>
         </w:rPr>
         <w:lastRenderedPageBreak/>
         <w:t>Índice General de Secciones y Contenidos</w:t>
@@ -1549,7 +1549,7 @@
       <w:pPr>
         <w:pStyle w:val="TDC1"/>
         <w:tabs>
-          <w:tab w:val="right" w:leader="dot" w:pos="4722"/>
+          <w:tab w:val="right" w:leader="dot" w:pos="9855"/>
         </w:tabs>
         <w:rPr>
           <w:rFonts w:asciiTheme="minorHAnsi" w:hAnsiTheme="minorHAnsi"/>
@@ -1573,7 +1573,7 @@
         </w:rPr>
         <w:fldChar w:fldCharType="separate"/>
       </w:r>
-      <w:hyperlink w:anchor="_Toc237767716" w:history="1">
+      <w:hyperlink w:anchor="_Toc237779777" w:history="1">
         <w:r>
           <w:rPr>
             <w:rStyle w:val="Hipervnculo"/>
@@ -1600,7 +1600,7 @@
             <w:noProof/>
             <w:webHidden/>
           </w:rPr>
-          <w:instrText xml:space="preserve"> PAGEREF _Toc237767716 \h </w:instrText>
+          <w:instrText xml:space="preserve"> PAGEREF _Toc237779777 \h </w:instrText>
         </w:r>
         <w:r>
           <w:rPr>
@@ -1635,7 +1635,7 @@
       <w:pPr>
         <w:pStyle w:val="TDC2"/>
         <w:tabs>
-          <w:tab w:val="right" w:leader="dot" w:pos="4722"/>
+          <w:tab w:val="right" w:leader="dot" w:pos="9855"/>
         </w:tabs>
         <w:rPr>
           <w:rFonts w:asciiTheme="minorHAnsi" w:hAnsiTheme="minorHAnsi"/>
@@ -1647,7 +1647,7 @@
           <w14:ligatures w14:val="standardContextual"/>
         </w:rPr>
       </w:pPr>
-      <w:hyperlink w:anchor="_Toc237767717" w:history="1">
+      <w:hyperlink w:anchor="_Toc237779778" w:history="1">
         <w:r>
           <w:rPr>
             <w:rStyle w:val="Hipervnculo"/>
@@ -1674,7 +1674,7 @@
             <w:noProof/>
             <w:webHidden/>
           </w:rPr>
-          <w:instrText xml:space="preserve"> PAGEREF _Toc237767717 \h </w:instrText>
+          <w:instrText xml:space="preserve"> PAGEREF _Toc237779778 \h </w:instrText>
         </w:r>
         <w:r>
           <w:rPr>
@@ -1709,7 +1709,7 @@
       <w:pPr>
         <w:pStyle w:val="TDC2"/>
         <w:tabs>
-          <w:tab w:val="right" w:leader="dot" w:pos="4722"/>
+          <w:tab w:val="right" w:leader="dot" w:pos="9855"/>
         </w:tabs>
         <w:rPr>
           <w:rFonts w:asciiTheme="minorHAnsi" w:hAnsiTheme="minorHAnsi"/>
@@ -1721,7 +1721,7 @@
           <w14:ligatures w14:val="standardContextual"/>
         </w:rPr>
       </w:pPr>
-      <w:hyperlink w:anchor="_Toc237767718" w:history="1">
+      <w:hyperlink w:anchor="_Toc237779779" w:history="1">
         <w:r>
           <w:rPr>
             <w:rStyle w:val="Hipervnculo"/>
@@ -1748,7 +1748,7 @@
             <w:noProof/>
             <w:webHidden/>
           </w:rPr>
-          <w:instrText xml:space="preserve"> PAGEREF _Toc237767718 \h </w:instrText>
+          <w:instrText xml:space="preserve"> PAGEREF _Toc237779779 \h </w:instrText>
         </w:r>
         <w:r>
           <w:rPr>
@@ -1783,7 +1783,7 @@
       <w:pPr>
         <w:pStyle w:val="TDC2"/>
         <w:tabs>
-          <w:tab w:val="right" w:leader="dot" w:pos="4722"/>
+          <w:tab w:val="right" w:leader="dot" w:pos="9855"/>
         </w:tabs>
         <w:rPr>
           <w:rFonts w:asciiTheme="minorHAnsi" w:hAnsiTheme="minorHAnsi"/>
@@ -1795,7 +1795,7 @@
           <w14:ligatures w14:val="standardContextual"/>
         </w:rPr>
       </w:pPr>
-      <w:hyperlink w:anchor="_Toc237767719" w:history="1">
+      <w:hyperlink w:anchor="_Toc237779780" w:history="1">
         <w:r>
           <w:rPr>
             <w:rStyle w:val="Hipervnculo"/>
@@ -1822,7 +1822,7 @@
             <w:noProof/>
             <w:webHidden/>
           </w:rPr>
-          <w:instrText xml:space="preserve"> PAGEREF _Toc237767719 \h </w:instrText>
+          <w:instrText xml:space="preserve"> PAGEREF _Toc237779780 \h </w:instrText>
         </w:r>
         <w:r>
           <w:rPr>
@@ -1857,7 +1857,7 @@
       <w:pPr>
         <w:pStyle w:val="TDC2"/>
         <w:tabs>
-          <w:tab w:val="right" w:leader="dot" w:pos="4722"/>
+          <w:tab w:val="right" w:leader="dot" w:pos="9855"/>
         </w:tabs>
         <w:rPr>
           <w:rFonts w:asciiTheme="minorHAnsi" w:hAnsiTheme="minorHAnsi"/>
@@ -1869,7 +1869,7 @@
           <w14:ligatures w14:val="standardContextual"/>
         </w:rPr>
       </w:pPr>
-      <w:hyperlink w:anchor="_Toc237767720" w:history="1">
+      <w:hyperlink w:anchor="_Toc237779781" w:history="1">
         <w:r>
           <w:rPr>
             <w:rStyle w:val="Hipervnculo"/>
@@ -1896,7 +1896,7 @@
             <w:noProof/>
             <w:webHidden/>
           </w:rPr>
-          <w:instrText xml:space="preserve"> PAGEREF _Toc237767720 \h </w:instrText>
+          <w:instrText xml:space="preserve"> PAGEREF _Toc237779781 \h </w:instrText>
         </w:r>
         <w:r>
           <w:rPr>
@@ -1931,7 +1931,7 @@
       <w:pPr>
         <w:pStyle w:val="TDC2"/>
         <w:tabs>
-          <w:tab w:val="right" w:leader="dot" w:pos="4722"/>
+          <w:tab w:val="right" w:leader="dot" w:pos="9855"/>
         </w:tabs>
         <w:rPr>
           <w:rFonts w:asciiTheme="minorHAnsi" w:hAnsiTheme="minorHAnsi"/>
@@ -1943,7 +1943,7 @@
           <w14:ligatures w14:val="standardContextual"/>
         </w:rPr>
       </w:pPr>
-      <w:hyperlink w:anchor="_Toc237767721" w:history="1">
+      <w:hyperlink w:anchor="_Toc237779782" w:history="1">
         <w:r>
           <w:rPr>
             <w:rStyle w:val="Hipervnculo"/>
@@ -1970,7 +1970,7 @@
             <w:noProof/>
             <w:webHidden/>
           </w:rPr>
-          <w:instrText xml:space="preserve"> PAGEREF _Toc237767721 \h </w:instrText>
+          <w:instrText xml:space="preserve"> PAGEREF _Toc237779782 \h </w:instrText>
         </w:r>
         <w:r>
           <w:rPr>
@@ -2005,7 +2005,7 @@
       <w:pPr>
         <w:pStyle w:val="TDC2"/>
         <w:tabs>
-          <w:tab w:val="right" w:leader="dot" w:pos="4722"/>
+          <w:tab w:val="right" w:leader="dot" w:pos="9855"/>
         </w:tabs>
         <w:rPr>
           <w:rFonts w:asciiTheme="minorHAnsi" w:hAnsiTheme="minorHAnsi"/>
@@ -2017,7 +2017,7 @@
           <w14:ligatures w14:val="standardContextual"/>
         </w:rPr>
       </w:pPr>
-      <w:hyperlink w:anchor="_Toc237767722" w:history="1">
+      <w:hyperlink w:anchor="_Toc237779783" w:history="1">
         <w:r>
           <w:rPr>
             <w:rStyle w:val="Hipervnculo"/>
@@ -2044,7 +2044,7 @@
             <w:noProof/>
             <w:webHidden/>
           </w:rPr>
-          <w:instrText xml:space="preserve"> PAGEREF _Toc237767722 \h </w:instrText>
+          <w:instrText xml:space="preserve"> PAGEREF _Toc237779783 \h </w:instrText>
         </w:r>
         <w:r>
           <w:rPr>
@@ -2079,7 +2079,7 @@
       <w:pPr>
         <w:pStyle w:val="TDC1"/>
         <w:tabs>
-          <w:tab w:val="right" w:leader="dot" w:pos="4722"/>
+          <w:tab w:val="right" w:leader="dot" w:pos="9855"/>
         </w:tabs>
         <w:rPr>
           <w:rFonts w:asciiTheme="minorHAnsi" w:hAnsiTheme="minorHAnsi"/>
@@ -2091,7 +2091,7 @@
           <w14:ligatures w14:val="standardContextual"/>
         </w:rPr>
       </w:pPr>
-      <w:hyperlink w:anchor="_Toc237767723" w:history="1">
+      <w:hyperlink w:anchor="_Toc237779784" w:history="1">
         <w:r>
           <w:rPr>
             <w:rStyle w:val="Hipervnculo"/>
@@ -2118,7 +2118,7 @@
             <w:noProof/>
             <w:webHidden/>
           </w:rPr>
-          <w:instrText xml:space="preserve"> PAGEREF _Toc237767723 \h </w:instrText>
+          <w:instrText xml:space="preserve"> PAGEREF _Toc237779784 \h </w:instrText>
         </w:r>
         <w:r>
           <w:rPr>
@@ -2153,7 +2153,7 @@
       <w:pPr>
         <w:pStyle w:val="TDC2"/>
         <w:tabs>
-          <w:tab w:val="right" w:leader="dot" w:pos="4722"/>
+          <w:tab w:val="right" w:leader="dot" w:pos="9855"/>
         </w:tabs>
         <w:rPr>
           <w:rFonts w:asciiTheme="minorHAnsi" w:hAnsiTheme="minorHAnsi"/>
@@ -2165,7 +2165,7 @@
           <w14:ligatures w14:val="standardContextual"/>
         </w:rPr>
       </w:pPr>
-      <w:hyperlink w:anchor="_Toc237767724" w:history="1">
+      <w:hyperlink w:anchor="_Toc237779785" w:history="1">
         <w:r>
           <w:rPr>
             <w:rStyle w:val="Hipervnculo"/>
@@ -2192,7 +2192,7 @@
             <w:noProof/>
             <w:webHidden/>
           </w:rPr>
-          <w:instrText xml:space="preserve"> PAGEREF _Toc237767724 \h </w:instrText>
+          <w:instrText xml:space="preserve"> PAGEREF _Toc237779785 \h </w:instrText>
         </w:r>
         <w:r>
           <w:rPr>
@@ -2227,7 +2227,7 @@
       <w:pPr>
         <w:pStyle w:val="TDC2"/>
         <w:tabs>
-          <w:tab w:val="right" w:leader="dot" w:pos="4722"/>
+          <w:tab w:val="right" w:leader="dot" w:pos="9855"/>
         </w:tabs>
         <w:rPr>
           <w:rFonts w:asciiTheme="minorHAnsi" w:hAnsiTheme="minorHAnsi"/>
@@ -2239,7 +2239,7 @@
           <w14:ligatures w14:val="standardContextual"/>
         </w:rPr>
       </w:pPr>
-      <w:hyperlink w:anchor="_Toc237767725" w:history="1">
+      <w:hyperlink w:anchor="_Toc237779786" w:history="1">
         <w:r>
           <w:rPr>
             <w:rStyle w:val="Hipervnculo"/>
@@ -2266,7 +2266,7 @@
             <w:noProof/>
             <w:webHidden/>
           </w:rPr>
-          <w:instrText xml:space="preserve"> PAGEREF _Toc237767725 \h </w:instrText>
+          <w:instrText xml:space="preserve"> PAGEREF _Toc237779786 \h </w:instrText>
         </w:r>
         <w:r>
           <w:rPr>
@@ -2301,7 +2301,7 @@
       <w:pPr>
         <w:pStyle w:val="TDC1"/>
         <w:tabs>
-          <w:tab w:val="right" w:leader="dot" w:pos="4722"/>
+          <w:tab w:val="right" w:leader="dot" w:pos="9855"/>
         </w:tabs>
         <w:rPr>
           <w:rFonts w:asciiTheme="minorHAnsi" w:hAnsiTheme="minorHAnsi"/>
@@ -2313,7 +2313,7 @@
           <w14:ligatures w14:val="standardContextual"/>
         </w:rPr>
       </w:pPr>
-      <w:hyperlink w:anchor="_Toc237767726" w:history="1">
+      <w:hyperlink w:anchor="_Toc237779787" w:history="1">
         <w:r>
           <w:rPr>
             <w:rStyle w:val="Hipervnculo"/>
@@ -2340,7 +2340,7 @@
             <w:noProof/>
             <w:webHidden/>
           </w:rPr>
-          <w:instrText xml:space="preserve"> PAGEREF _Toc237767726 \h </w:instrText>
+          <w:instrText xml:space="preserve"> PAGEREF _Toc237779787 \h </w:instrText>
         </w:r>
         <w:r>
           <w:rPr>
@@ -2375,7 +2375,7 @@
       <w:pPr>
         <w:pStyle w:val="TDC2"/>
         <w:tabs>
-          <w:tab w:val="right" w:leader="dot" w:pos="4722"/>
+          <w:tab w:val="right" w:leader="dot" w:pos="9855"/>
         </w:tabs>
         <w:rPr>
           <w:rFonts w:asciiTheme="minorHAnsi" w:hAnsiTheme="minorHAnsi"/>
@@ -2387,7 +2387,7 @@
           <w14:ligatures w14:val="standardContextual"/>
         </w:rPr>
       </w:pPr>
-      <w:hyperlink w:anchor="_Toc237767727" w:history="1">
+      <w:hyperlink w:anchor="_Toc237779788" w:history="1">
         <w:r>
           <w:rPr>
             <w:rStyle w:val="Hipervnculo"/>
@@ -2414,7 +2414,7 @@
             <w:noProof/>
             <w:webHidden/>
           </w:rPr>
-          <w:instrText xml:space="preserve"> PAGEREF _Toc237767727 \h </w:instrText>
+          <w:instrText xml:space="preserve"> PAGEREF _Toc237779788 \h </w:instrText>
         </w:r>
         <w:r>
           <w:rPr>
@@ -2449,7 +2449,7 @@
       <w:pPr>
         <w:pStyle w:val="TDC2"/>
         <w:tabs>
-          <w:tab w:val="right" w:leader="dot" w:pos="4722"/>
+          <w:tab w:val="right" w:leader="dot" w:pos="9855"/>
         </w:tabs>
         <w:rPr>
           <w:rFonts w:asciiTheme="minorHAnsi" w:hAnsiTheme="minorHAnsi"/>
@@ -2461,7 +2461,7 @@
           <w14:ligatures w14:val="standardContextual"/>
         </w:rPr>
       </w:pPr>
-      <w:hyperlink w:anchor="_Toc237767728" w:history="1">
+      <w:hyperlink w:anchor="_Toc237779789" w:history="1">
         <w:r>
           <w:rPr>
             <w:rStyle w:val="Hipervnculo"/>
@@ -2488,7 +2488,7 @@
             <w:noProof/>
             <w:webHidden/>
           </w:rPr>
-          <w:instrText xml:space="preserve"> PAGEREF _Toc237767728 \h </w:instrText>
+          <w:instrText xml:space="preserve"> PAGEREF _Toc237779789 \h </w:instrText>
         </w:r>
         <w:r>
           <w:rPr>
@@ -2523,7 +2523,7 @@
       <w:pPr>
         <w:pStyle w:val="TDC2"/>
         <w:tabs>
-          <w:tab w:val="right" w:leader="dot" w:pos="4722"/>
+          <w:tab w:val="right" w:leader="dot" w:pos="9855"/>
         </w:tabs>
         <w:rPr>
           <w:rFonts w:asciiTheme="minorHAnsi" w:hAnsiTheme="minorHAnsi"/>
@@ -2535,7 +2535,7 @@
           <w14:ligatures w14:val="standardContextual"/>
         </w:rPr>
       </w:pPr>
-      <w:hyperlink w:anchor="_Toc237767729" w:history="1">
+      <w:hyperlink w:anchor="_Toc237779790" w:history="1">
         <w:r>
           <w:rPr>
             <w:rStyle w:val="Hipervnculo"/>
@@ -2562,7 +2562,7 @@
             <w:noProof/>
             <w:webHidden/>
           </w:rPr>
-          <w:instrText xml:space="preserve"> PAGEREF _Toc237767729 \h </w:instrText>
+          <w:instrText xml:space="preserve"> PAGEREF _Toc237779790 \h </w:instrText>
         </w:r>
         <w:r>
           <w:rPr>
@@ -2597,7 +2597,7 @@
       <w:pPr>
         <w:pStyle w:val="TDC2"/>
         <w:tabs>
-          <w:tab w:val="right" w:leader="dot" w:pos="4722"/>
+          <w:tab w:val="right" w:leader="dot" w:pos="9855"/>
         </w:tabs>
         <w:rPr>
           <w:rFonts w:asciiTheme="minorHAnsi" w:hAnsiTheme="minorHAnsi"/>
@@ -2609,7 +2609,7 @@
           <w14:ligatures w14:val="standardContextual"/>
         </w:rPr>
       </w:pPr>
-      <w:hyperlink w:anchor="_Toc237767730" w:history="1">
+      <w:hyperlink w:anchor="_Toc237779791" w:history="1">
         <w:r>
           <w:rPr>
             <w:rStyle w:val="Hipervnculo"/>
@@ -2636,7 +2636,7 @@
             <w:noProof/>
             <w:webHidden/>
           </w:rPr>
-          <w:instrText xml:space="preserve"> PAGEREF _Toc237767730 \h </w:instrText>
+          <w:instrText xml:space="preserve"> PAGEREF _Toc237779791 \h </w:instrText>
         </w:r>
         <w:r>
           <w:rPr>
@@ -2671,7 +2671,7 @@
       <w:pPr>
         <w:pStyle w:val="TDC1"/>
         <w:tabs>
-          <w:tab w:val="right" w:leader="dot" w:pos="4722"/>
+          <w:tab w:val="right" w:leader="dot" w:pos="9855"/>
         </w:tabs>
         <w:rPr>
           <w:rFonts w:asciiTheme="minorHAnsi" w:hAnsiTheme="minorHAnsi"/>
@@ -2683,7 +2683,7 @@
           <w14:ligatures w14:val="standardContextual"/>
         </w:rPr>
       </w:pPr>
-      <w:hyperlink w:anchor="_Toc237767731" w:history="1">
+      <w:hyperlink w:anchor="_Toc237779792" w:history="1">
         <w:r>
           <w:rPr>
             <w:rStyle w:val="Hipervnculo"/>
@@ -2710,7 +2710,7 @@
             <w:noProof/>
             <w:webHidden/>
           </w:rPr>
-          <w:instrText xml:space="preserve"> PAGEREF _Toc237767731 \h </w:instrText>
+          <w:instrText xml:space="preserve"> PAGEREF _Toc237779792 \h </w:instrText>
         </w:r>
         <w:r>
           <w:rPr>
@@ -2745,7 +2745,7 @@
       <w:pPr>
         <w:pStyle w:val="TDC2"/>
         <w:tabs>
-          <w:tab w:val="right" w:leader="dot" w:pos="4722"/>
+          <w:tab w:val="right" w:leader="dot" w:pos="9855"/>
         </w:tabs>
         <w:rPr>
           <w:rFonts w:asciiTheme="minorHAnsi" w:hAnsiTheme="minorHAnsi"/>
@@ -2757,7 +2757,7 @@
           <w14:ligatures w14:val="standardContextual"/>
         </w:rPr>
       </w:pPr>
-      <w:hyperlink w:anchor="_Toc237767732" w:history="1">
+      <w:hyperlink w:anchor="_Toc237779793" w:history="1">
         <w:r>
           <w:rPr>
             <w:rStyle w:val="Hipervnculo"/>
@@ -2784,7 +2784,7 @@
             <w:noProof/>
             <w:webHidden/>
           </w:rPr>
-          <w:instrText xml:space="preserve"> PAGEREF _Toc237767732 \h </w:instrText>
+          <w:instrText xml:space="preserve"> PAGEREF _Toc237779793 \h </w:instrText>
         </w:r>
         <w:r>
           <w:rPr>
@@ -2819,7 +2819,7 @@
       <w:pPr>
         <w:pStyle w:val="TDC2"/>
         <w:tabs>
-          <w:tab w:val="right" w:leader="dot" w:pos="4722"/>
+          <w:tab w:val="right" w:leader="dot" w:pos="9855"/>
         </w:tabs>
         <w:rPr>
           <w:rFonts w:asciiTheme="minorHAnsi" w:hAnsiTheme="minorHAnsi"/>
@@ -2831,7 +2831,7 @@
           <w14:ligatures w14:val="standardContextual"/>
         </w:rPr>
       </w:pPr>
-      <w:hyperlink w:anchor="_Toc237767733" w:history="1">
+      <w:hyperlink w:anchor="_Toc237779794" w:history="1">
         <w:r>
           <w:rPr>
             <w:rStyle w:val="Hipervnculo"/>
@@ -2858,7 +2858,7 @@
             <w:noProof/>
             <w:webHidden/>
           </w:rPr>
-          <w:instrText xml:space="preserve"> PAGEREF _Toc237767733 \h </w:instrText>
+          <w:instrText xml:space="preserve"> PAGEREF _Toc237779794 \h </w:instrText>
         </w:r>
         <w:r>
           <w:rPr>
@@ -2893,7 +2893,7 @@
       <w:pPr>
         <w:pStyle w:val="TDC1"/>
         <w:tabs>
-          <w:tab w:val="right" w:leader="dot" w:pos="4722"/>
+          <w:tab w:val="right" w:leader="dot" w:pos="9855"/>
         </w:tabs>
         <w:rPr>
           <w:rFonts w:asciiTheme="minorHAnsi" w:hAnsiTheme="minorHAnsi"/>
@@ -2905,7 +2905,7 @@
           <w14:ligatures w14:val="standardContextual"/>
         </w:rPr>
       </w:pPr>
-      <w:hyperlink w:anchor="_Toc237767734" w:history="1">
+      <w:hyperlink w:anchor="_Toc237779795" w:history="1">
         <w:r>
           <w:rPr>
             <w:rStyle w:val="Hipervnculo"/>
@@ -2932,7 +2932,7 @@
             <w:noProof/>
             <w:webHidden/>
           </w:rPr>
-          <w:instrText xml:space="preserve"> PAGEREF _Toc237767734 \h </w:instrText>
+          <w:instrText xml:space="preserve"> PAGEREF _Toc237779795 \h </w:instrText>
         </w:r>
         <w:r>
           <w:rPr>
@@ -2967,7 +2967,7 @@
       <w:pPr>
         <w:pStyle w:val="TDC2"/>
         <w:tabs>
-          <w:tab w:val="right" w:leader="dot" w:pos="4722"/>
+          <w:tab w:val="right" w:leader="dot" w:pos="9855"/>
         </w:tabs>
         <w:rPr>
           <w:rFonts w:asciiTheme="minorHAnsi" w:hAnsiTheme="minorHAnsi"/>
@@ -2979,7 +2979,7 @@
           <w14:ligatures w14:val="standardContextual"/>
         </w:rPr>
       </w:pPr>
-      <w:hyperlink w:anchor="_Toc237767735" w:history="1">
+      <w:hyperlink w:anchor="_Toc237779796" w:history="1">
         <w:r>
           <w:rPr>
             <w:rStyle w:val="Hipervnculo"/>
@@ -3006,7 +3006,7 @@
             <w:noProof/>
             <w:webHidden/>
           </w:rPr>
-          <w:instrText xml:space="preserve"> PAGEREF _Toc237767735 \h </w:instrText>
+          <w:instrText xml:space="preserve"> PAGEREF _Toc237779796 \h </w:instrText>
         </w:r>
         <w:r>
           <w:rPr>
@@ -3041,7 +3041,7 @@
       <w:pPr>
         <w:pStyle w:val="TDC2"/>
         <w:tabs>
-          <w:tab w:val="right" w:leader="dot" w:pos="4722"/>
+          <w:tab w:val="right" w:leader="dot" w:pos="9855"/>
         </w:tabs>
         <w:rPr>
           <w:rFonts w:asciiTheme="minorHAnsi" w:hAnsiTheme="minorHAnsi"/>
@@ -3053,7 +3053,7 @@
           <w14:ligatures w14:val="standardContextual"/>
         </w:rPr>
       </w:pPr>
-      <w:hyperlink w:anchor="_Toc237767736" w:history="1">
+      <w:hyperlink w:anchor="_Toc237779797" w:history="1">
         <w:r>
           <w:rPr>
             <w:rStyle w:val="Hipervnculo"/>
@@ -3080,7 +3080,7 @@
             <w:noProof/>
             <w:webHidden/>
           </w:rPr>
-          <w:instrText xml:space="preserve"> PAGEREF _Toc237767736 \h </w:instrText>
+          <w:instrText xml:space="preserve"> PAGEREF _Toc237779797 \h </w:instrText>
         </w:r>
         <w:r>
           <w:rPr>
@@ -3115,7 +3115,7 @@
       <w:pPr>
         <w:pStyle w:val="TDC1"/>
         <w:tabs>
-          <w:tab w:val="right" w:leader="dot" w:pos="4722"/>
+          <w:tab w:val="right" w:leader="dot" w:pos="9855"/>
         </w:tabs>
         <w:rPr>
           <w:rFonts w:asciiTheme="minorHAnsi" w:hAnsiTheme="minorHAnsi"/>
@@ -3127,7 +3127,7 @@
           <w14:ligatures w14:val="standardContextual"/>
         </w:rPr>
       </w:pPr>
-      <w:hyperlink w:anchor="_Toc237767737" w:history="1">
+      <w:hyperlink w:anchor="_Toc237779798" w:history="1">
         <w:r>
           <w:rPr>
             <w:rStyle w:val="Hipervnculo"/>
@@ -3154,7 +3154,7 @@
             <w:noProof/>
             <w:webHidden/>
           </w:rPr>
-          <w:instrText xml:space="preserve"> PAGEREF _Toc237767737 \h </w:instrText>
+          <w:instrText xml:space="preserve"> PAGEREF _Toc237779798 \h </w:instrText>
         </w:r>
         <w:r>
           <w:rPr>
@@ -3189,7 +3189,7 @@
       <w:pPr>
         <w:pStyle w:val="TDC2"/>
         <w:tabs>
-          <w:tab w:val="right" w:leader="dot" w:pos="4722"/>
+          <w:tab w:val="right" w:leader="dot" w:pos="9855"/>
         </w:tabs>
         <w:rPr>
           <w:rFonts w:asciiTheme="minorHAnsi" w:hAnsiTheme="minorHAnsi"/>
@@ -3201,7 +3201,7 @@
           <w14:ligatures w14:val="standardContextual"/>
         </w:rPr>
       </w:pPr>
-      <w:hyperlink w:anchor="_Toc237767738" w:history="1">
+      <w:hyperlink w:anchor="_Toc237779799" w:history="1">
         <w:r>
           <w:rPr>
             <w:rStyle w:val="Hipervnculo"/>
@@ -3228,7 +3228,7 @@
             <w:noProof/>
             <w:webHidden/>
           </w:rPr>
-          <w:instrText xml:space="preserve"> PAGEREF _Toc237767738 \h </w:instrText>
+          <w:instrText xml:space="preserve"> PAGEREF _Toc237779799 \h </w:instrText>
         </w:r>
         <w:r>
           <w:rPr>
@@ -3263,7 +3263,7 @@
       <w:pPr>
         <w:pStyle w:val="TDC2"/>
         <w:tabs>
-          <w:tab w:val="right" w:leader="dot" w:pos="4722"/>
+          <w:tab w:val="right" w:leader="dot" w:pos="9855"/>
         </w:tabs>
         <w:rPr>
           <w:rFonts w:asciiTheme="minorHAnsi" w:hAnsiTheme="minorHAnsi"/>
@@ -3275,7 +3275,7 @@
           <w14:ligatures w14:val="standardContextual"/>
         </w:rPr>
       </w:pPr>
-      <w:hyperlink w:anchor="_Toc237767739" w:history="1">
+      <w:hyperlink w:anchor="_Toc237779800" w:history="1">
         <w:r>
           <w:rPr>
             <w:rStyle w:val="Hipervnculo"/>
@@ -3332,7 +3332,7 @@
             <w:noProof/>
             <w:webHidden/>
           </w:rPr>
-          <w:instrText xml:space="preserve"> PAGEREF _Toc237767739 \h </w:instrText>
+          <w:instrText xml:space="preserve"> PAGEREF _Toc237779800 \h </w:instrText>
         </w:r>
         <w:r>
           <w:rPr>
@@ -3367,7 +3367,7 @@
       <w:pPr>
         <w:pStyle w:val="TDC2"/>
         <w:tabs>
-          <w:tab w:val="right" w:leader="dot" w:pos="4722"/>
+          <w:tab w:val="right" w:leader="dot" w:pos="9855"/>
         </w:tabs>
         <w:rPr>
           <w:rFonts w:asciiTheme="minorHAnsi" w:hAnsiTheme="minorHAnsi"/>
@@ -3379,7 +3379,7 @@
           <w14:ligatures w14:val="standardContextual"/>
         </w:rPr>
       </w:pPr>
-      <w:hyperlink w:anchor="_Toc237767740" w:history="1">
+      <w:hyperlink w:anchor="_Toc237779801" w:history="1">
         <w:r>
           <w:rPr>
             <w:rStyle w:val="Hipervnculo"/>
@@ -3406,7 +3406,7 @@
             <w:noProof/>
             <w:webHidden/>
           </w:rPr>
-          <w:instrText xml:space="preserve"> PAGEREF _Toc237767740 \h </w:instrText>
+          <w:instrText xml:space="preserve"> PAGEREF _Toc237779801 \h </w:instrText>
         </w:r>
         <w:r>
           <w:rPr>
@@ -3441,7 +3441,7 @@
       <w:pPr>
         <w:pStyle w:val="TDC1"/>
         <w:tabs>
-          <w:tab w:val="right" w:leader="dot" w:pos="4722"/>
+          <w:tab w:val="right" w:leader="dot" w:pos="9855"/>
         </w:tabs>
         <w:rPr>
           <w:rFonts w:asciiTheme="minorHAnsi" w:hAnsiTheme="minorHAnsi"/>
@@ -3453,7 +3453,7 @@
           <w14:ligatures w14:val="standardContextual"/>
         </w:rPr>
       </w:pPr>
-      <w:hyperlink w:anchor="_Toc237767741" w:history="1">
+      <w:hyperlink w:anchor="_Toc237779802" w:history="1">
         <w:r>
           <w:rPr>
             <w:rStyle w:val="Hipervnculo"/>
@@ -3480,7 +3480,7 @@
             <w:noProof/>
             <w:webHidden/>
           </w:rPr>
-          <w:instrText xml:space="preserve"> PAGEREF _Toc237767741 \h </w:instrText>
+          <w:instrText xml:space="preserve"> PAGEREF _Toc237779802 \h </w:instrText>
         </w:r>
         <w:r>
           <w:rPr>
@@ -3515,7 +3515,7 @@
       <w:pPr>
         <w:pStyle w:val="TDC2"/>
         <w:tabs>
-          <w:tab w:val="right" w:leader="dot" w:pos="4722"/>
+          <w:tab w:val="right" w:leader="dot" w:pos="9855"/>
         </w:tabs>
         <w:rPr>
           <w:rFonts w:asciiTheme="minorHAnsi" w:hAnsiTheme="minorHAnsi"/>
@@ -3527,7 +3527,7 @@
           <w14:ligatures w14:val="standardContextual"/>
         </w:rPr>
       </w:pPr>
-      <w:hyperlink w:anchor="_Toc237767742" w:history="1">
+      <w:hyperlink w:anchor="_Toc237779803" w:history="1">
         <w:r>
           <w:rPr>
             <w:rStyle w:val="Hipervnculo"/>
@@ -3554,7 +3554,7 @@
             <w:noProof/>
             <w:webHidden/>
           </w:rPr>
-          <w:instrText xml:space="preserve"> PAGEREF _Toc237767742 \h </w:instrText>
+          <w:instrText xml:space="preserve"> PAGEREF _Toc237779803 \h </w:instrText>
         </w:r>
         <w:r>
           <w:rPr>
@@ -3589,7 +3589,7 @@
       <w:pPr>
         <w:pStyle w:val="TDC2"/>
         <w:tabs>
-          <w:tab w:val="right" w:leader="dot" w:pos="4722"/>
+          <w:tab w:val="right" w:leader="dot" w:pos="9855"/>
         </w:tabs>
         <w:rPr>
           <w:rFonts w:asciiTheme="minorHAnsi" w:hAnsiTheme="minorHAnsi"/>
@@ -3601,7 +3601,7 @@
           <w14:ligatures w14:val="standardContextual"/>
         </w:rPr>
       </w:pPr>
-      <w:hyperlink w:anchor="_Toc237767743" w:history="1">
+      <w:hyperlink w:anchor="_Toc237779804" w:history="1">
         <w:r>
           <w:rPr>
             <w:rStyle w:val="Hipervnculo"/>
@@ -3628,7 +3628,7 @@
             <w:noProof/>
             <w:webHidden/>
           </w:rPr>
-          <w:instrText xml:space="preserve"> PAGEREF _Toc237767743 \h </w:instrText>
+          <w:instrText xml:space="preserve"> PAGEREF _Toc237779804 \h </w:instrText>
         </w:r>
         <w:r>
           <w:rPr>
@@ -3663,7 +3663,7 @@
       <w:pPr>
         <w:pStyle w:val="TDC1"/>
         <w:tabs>
-          <w:tab w:val="right" w:leader="dot" w:pos="4722"/>
+          <w:tab w:val="right" w:leader="dot" w:pos="9855"/>
         </w:tabs>
         <w:rPr>
           <w:rFonts w:asciiTheme="minorHAnsi" w:hAnsiTheme="minorHAnsi"/>
@@ -3675,7 +3675,7 @@
           <w14:ligatures w14:val="standardContextual"/>
         </w:rPr>
       </w:pPr>
-      <w:hyperlink w:anchor="_Toc237767744" w:history="1">
+      <w:hyperlink w:anchor="_Toc237779805" w:history="1">
         <w:r>
           <w:rPr>
             <w:rStyle w:val="Hipervnculo"/>
@@ -3702,7 +3702,7 @@
             <w:noProof/>
             <w:webHidden/>
           </w:rPr>
-          <w:instrText xml:space="preserve"> PAGEREF _Toc237767744 \h </w:instrText>
+          <w:instrText xml:space="preserve"> PAGEREF _Toc237779805 \h </w:instrText>
         </w:r>
         <w:r>
           <w:rPr>
@@ -3737,7 +3737,7 @@
       <w:pPr>
         <w:pStyle w:val="TDC2"/>
         <w:tabs>
-          <w:tab w:val="right" w:leader="dot" w:pos="4722"/>
+          <w:tab w:val="right" w:leader="dot" w:pos="9855"/>
         </w:tabs>
         <w:rPr>
           <w:rFonts w:asciiTheme="minorHAnsi" w:hAnsiTheme="minorHAnsi"/>
@@ -3749,7 +3749,7 @@
           <w14:ligatures w14:val="standardContextual"/>
         </w:rPr>
       </w:pPr>
-      <w:hyperlink w:anchor="_Toc237767745" w:history="1">
+      <w:hyperlink w:anchor="_Toc237779806" w:history="1">
         <w:r>
           <w:rPr>
             <w:rStyle w:val="Hipervnculo"/>
@@ -3776,7 +3776,7 @@
             <w:noProof/>
             <w:webHidden/>
           </w:rPr>
-          <w:instrText xml:space="preserve"> PAGEREF _Toc237767745 \h </w:instrText>
+          <w:instrText xml:space="preserve"> PAGEREF _Toc237779806 \h </w:instrText>
         </w:r>
         <w:r>
           <w:rPr>
@@ -3811,7 +3811,7 @@
       <w:pPr>
         <w:pStyle w:val="TDC2"/>
         <w:tabs>
-          <w:tab w:val="right" w:leader="dot" w:pos="4722"/>
+          <w:tab w:val="right" w:leader="dot" w:pos="9855"/>
         </w:tabs>
         <w:rPr>
           <w:rFonts w:asciiTheme="minorHAnsi" w:hAnsiTheme="minorHAnsi"/>
@@ -3823,7 +3823,7 @@
           <w14:ligatures w14:val="standardContextual"/>
         </w:rPr>
       </w:pPr>
-      <w:hyperlink w:anchor="_Toc237767746" w:history="1">
+      <w:hyperlink w:anchor="_Toc237779807" w:history="1">
         <w:r>
           <w:rPr>
             <w:rStyle w:val="Hipervnculo"/>
@@ -3850,7 +3850,7 @@
             <w:noProof/>
             <w:webHidden/>
           </w:rPr>
-          <w:instrText xml:space="preserve"> PAGEREF _Toc237767746 \h </w:instrText>
+          <w:instrText xml:space="preserve"> PAGEREF _Toc237779807 \h </w:instrText>
         </w:r>
         <w:r>
           <w:rPr>
@@ -3885,7 +3885,7 @@
       <w:pPr>
         <w:pStyle w:val="TDC1"/>
         <w:tabs>
-          <w:tab w:val="right" w:leader="dot" w:pos="4722"/>
+          <w:tab w:val="right" w:leader="dot" w:pos="9855"/>
         </w:tabs>
         <w:rPr>
           <w:rFonts w:asciiTheme="minorHAnsi" w:hAnsiTheme="minorHAnsi"/>
@@ -3897,7 +3897,7 @@
           <w14:ligatures w14:val="standardContextual"/>
         </w:rPr>
       </w:pPr>
-      <w:hyperlink w:anchor="_Toc237767747" w:history="1">
+      <w:hyperlink w:anchor="_Toc237779808" w:history="1">
         <w:r>
           <w:rPr>
             <w:rStyle w:val="Hipervnculo"/>
@@ -3924,7 +3924,7 @@
             <w:noProof/>
             <w:webHidden/>
           </w:rPr>
-          <w:instrText xml:space="preserve"> PAGEREF _Toc237767747 \h </w:instrText>
+          <w:instrText xml:space="preserve"> PAGEREF _Toc237779808 \h </w:instrText>
         </w:r>
         <w:r>
           <w:rPr>
@@ -3959,7 +3959,7 @@
       <w:pPr>
         <w:pStyle w:val="TDC2"/>
         <w:tabs>
-          <w:tab w:val="right" w:leader="dot" w:pos="4722"/>
+          <w:tab w:val="right" w:leader="dot" w:pos="9855"/>
         </w:tabs>
         <w:rPr>
           <w:rFonts w:asciiTheme="minorHAnsi" w:hAnsiTheme="minorHAnsi"/>
@@ -3971,7 +3971,7 @@
           <w14:ligatures w14:val="standardContextual"/>
         </w:rPr>
       </w:pPr>
-      <w:hyperlink w:anchor="_Toc237767748" w:history="1">
+      <w:hyperlink w:anchor="_Toc237779809" w:history="1">
         <w:r>
           <w:rPr>
             <w:rStyle w:val="Hipervnculo"/>
@@ -3998,7 +3998,7 @@
             <w:noProof/>
             <w:webHidden/>
           </w:rPr>
-          <w:instrText xml:space="preserve"> PAGEREF _Toc237767748 \h </w:instrText>
+          <w:instrText xml:space="preserve"> PAGEREF _Toc237779809 \h </w:instrText>
         </w:r>
         <w:r>
           <w:rPr>
@@ -4033,7 +4033,7 @@
       <w:pPr>
         <w:pStyle w:val="TDC2"/>
         <w:tabs>
-          <w:tab w:val="right" w:leader="dot" w:pos="4722"/>
+          <w:tab w:val="right" w:leader="dot" w:pos="9855"/>
         </w:tabs>
         <w:rPr>
           <w:rFonts w:asciiTheme="minorHAnsi" w:hAnsiTheme="minorHAnsi"/>
@@ -4045,7 +4045,7 @@
           <w14:ligatures w14:val="standardContextual"/>
         </w:rPr>
       </w:pPr>
-      <w:hyperlink w:anchor="_Toc237767749" w:history="1">
+      <w:hyperlink w:anchor="_Toc237779810" w:history="1">
         <w:r>
           <w:rPr>
             <w:rStyle w:val="Hipervnculo"/>
@@ -4072,7 +4072,7 @@
             <w:noProof/>
             <w:webHidden/>
           </w:rPr>
-          <w:instrText xml:space="preserve"> PAGEREF _Toc237767749 \h </w:instrText>
+          <w:instrText xml:space="preserve"> PAGEREF _Toc237779810 \h </w:instrText>
         </w:r>
         <w:r>
           <w:rPr>
@@ -4107,7 +4107,7 @@
       <w:pPr>
         <w:pStyle w:val="TDC2"/>
         <w:tabs>
-          <w:tab w:val="right" w:leader="dot" w:pos="4722"/>
+          <w:tab w:val="right" w:leader="dot" w:pos="9855"/>
         </w:tabs>
         <w:rPr>
           <w:rFonts w:asciiTheme="minorHAnsi" w:hAnsiTheme="minorHAnsi"/>
@@ -4119,7 +4119,7 @@
           <w14:ligatures w14:val="standardContextual"/>
         </w:rPr>
       </w:pPr>
-      <w:hyperlink w:anchor="_Toc237767750" w:history="1">
+      <w:hyperlink w:anchor="_Toc237779811" w:history="1">
         <w:r>
           <w:rPr>
             <w:rStyle w:val="Hipervnculo"/>
@@ -4146,7 +4146,7 @@
             <w:noProof/>
             <w:webHidden/>
           </w:rPr>
-          <w:instrText xml:space="preserve"> PAGEREF _Toc237767750 \h </w:instrText>
+          <w:instrText xml:space="preserve"> PAGEREF _Toc237779811 \h </w:instrText>
         </w:r>
         <w:r>
           <w:rPr>
@@ -4181,7 +4181,7 @@
       <w:pPr>
         <w:pStyle w:val="TDC1"/>
         <w:tabs>
-          <w:tab w:val="right" w:leader="dot" w:pos="4722"/>
+          <w:tab w:val="right" w:leader="dot" w:pos="9855"/>
         </w:tabs>
         <w:rPr>
           <w:rFonts w:asciiTheme="minorHAnsi" w:hAnsiTheme="minorHAnsi"/>
@@ -4193,7 +4193,7 @@
           <w14:ligatures w14:val="standardContextual"/>
         </w:rPr>
       </w:pPr>
-      <w:hyperlink w:anchor="_Toc237767751" w:history="1">
+      <w:hyperlink w:anchor="_Toc237779812" w:history="1">
         <w:r>
           <w:rPr>
             <w:rStyle w:val="Hipervnculo"/>
@@ -4220,7 +4220,7 @@
             <w:noProof/>
             <w:webHidden/>
           </w:rPr>
-          <w:instrText xml:space="preserve"> PAGEREF _Toc237767751 \h </w:instrText>
+          <w:instrText xml:space="preserve"> PAGEREF _Toc237779812 \h </w:instrText>
         </w:r>
         <w:r>
           <w:rPr>
@@ -4255,7 +4255,7 @@
       <w:pPr>
         <w:pStyle w:val="TDC2"/>
         <w:tabs>
-          <w:tab w:val="right" w:leader="dot" w:pos="4722"/>
+          <w:tab w:val="right" w:leader="dot" w:pos="9855"/>
         </w:tabs>
         <w:rPr>
           <w:rFonts w:asciiTheme="minorHAnsi" w:hAnsiTheme="minorHAnsi"/>
@@ -4267,7 +4267,7 @@
           <w14:ligatures w14:val="standardContextual"/>
         </w:rPr>
       </w:pPr>
-      <w:hyperlink w:anchor="_Toc237767752" w:history="1">
+      <w:hyperlink w:anchor="_Toc237779813" w:history="1">
         <w:r>
           <w:rPr>
             <w:rStyle w:val="Hipervnculo"/>
@@ -4294,7 +4294,7 @@
             <w:noProof/>
             <w:webHidden/>
           </w:rPr>
-          <w:instrText xml:space="preserve"> PAGEREF _Toc237767752 \h </w:instrText>
+          <w:instrText xml:space="preserve"> PAGEREF _Toc237779813 \h </w:instrText>
         </w:r>
         <w:r>
           <w:rPr>
@@ -4329,7 +4329,7 @@
       <w:pPr>
         <w:pStyle w:val="TDC1"/>
         <w:tabs>
-          <w:tab w:val="right" w:leader="dot" w:pos="4722"/>
+          <w:tab w:val="right" w:leader="dot" w:pos="9855"/>
         </w:tabs>
         <w:rPr>
           <w:rFonts w:asciiTheme="minorHAnsi" w:hAnsiTheme="minorHAnsi"/>
@@ -4341,7 +4341,7 @@
           <w14:ligatures w14:val="standardContextual"/>
         </w:rPr>
       </w:pPr>
-      <w:hyperlink w:anchor="_Toc237767753" w:history="1">
+      <w:hyperlink w:anchor="_Toc237779814" w:history="1">
         <w:r>
           <w:rPr>
             <w:rStyle w:val="Hipervnculo"/>
@@ -4368,7 +4368,7 @@
             <w:noProof/>
             <w:webHidden/>
           </w:rPr>
-          <w:instrText xml:space="preserve"> PAGEREF _Toc237767753 \h </w:instrText>
+          <w:instrText xml:space="preserve"> PAGEREF _Toc237779814 \h </w:instrText>
         </w:r>
         <w:r>
           <w:rPr>
@@ -4403,7 +4403,7 @@
       <w:pPr>
         <w:pStyle w:val="TDC2"/>
         <w:tabs>
-          <w:tab w:val="right" w:leader="dot" w:pos="4722"/>
+          <w:tab w:val="right" w:leader="dot" w:pos="9855"/>
         </w:tabs>
         <w:rPr>
           <w:rFonts w:asciiTheme="minorHAnsi" w:hAnsiTheme="minorHAnsi"/>
@@ -4415,7 +4415,7 @@
           <w14:ligatures w14:val="standardContextual"/>
         </w:rPr>
       </w:pPr>
-      <w:hyperlink w:anchor="_Toc237767754" w:history="1">
+      <w:hyperlink w:anchor="_Toc237779815" w:history="1">
         <w:r>
           <w:rPr>
             <w:rStyle w:val="Hipervnculo"/>
@@ -4442,7 +4442,7 @@
             <w:noProof/>
             <w:webHidden/>
           </w:rPr>
-          <w:instrText xml:space="preserve"> PAGEREF _Toc237767754 \h </w:instrText>
+          <w:instrText xml:space="preserve"> PAGEREF _Toc237779815 \h </w:instrText>
         </w:r>
         <w:r>
           <w:rPr>
@@ -4477,7 +4477,7 @@
       <w:pPr>
         <w:pStyle w:val="TDC2"/>
         <w:tabs>
-          <w:tab w:val="right" w:leader="dot" w:pos="4722"/>
+          <w:tab w:val="right" w:leader="dot" w:pos="9855"/>
         </w:tabs>
         <w:rPr>
           <w:rFonts w:asciiTheme="minorHAnsi" w:hAnsiTheme="minorHAnsi"/>
@@ -4489,7 +4489,7 @@
           <w14:ligatures w14:val="standardContextual"/>
         </w:rPr>
       </w:pPr>
-      <w:hyperlink w:anchor="_Toc237767755" w:history="1">
+      <w:hyperlink w:anchor="_Toc237779816" w:history="1">
         <w:r>
           <w:rPr>
             <w:rStyle w:val="Hipervnculo"/>
@@ -4516,7 +4516,7 @@
             <w:noProof/>
             <w:webHidden/>
           </w:rPr>
-          <w:instrText xml:space="preserve"> PAGEREF _Toc237767755 \h </w:instrText>
+          <w:instrText xml:space="preserve"> PAGEREF _Toc237779816 \h </w:instrText>
         </w:r>
         <w:r>
           <w:rPr>
@@ -4551,7 +4551,7 @@
       <w:pPr>
         <w:pStyle w:val="TDC2"/>
         <w:tabs>
-          <w:tab w:val="right" w:leader="dot" w:pos="4722"/>
+          <w:tab w:val="right" w:leader="dot" w:pos="9855"/>
         </w:tabs>
         <w:rPr>
           <w:rFonts w:asciiTheme="minorHAnsi" w:hAnsiTheme="minorHAnsi"/>
@@ -4563,7 +4563,7 @@
           <w14:ligatures w14:val="standardContextual"/>
         </w:rPr>
       </w:pPr>
-      <w:hyperlink w:anchor="_Toc237767756" w:history="1">
+      <w:hyperlink w:anchor="_Toc237779817" w:history="1">
         <w:r>
           <w:rPr>
             <w:rStyle w:val="Hipervnculo"/>
@@ -4590,7 +4590,7 @@
             <w:noProof/>
             <w:webHidden/>
           </w:rPr>
-          <w:instrText xml:space="preserve"> PAGEREF _Toc237767756 \h </w:instrText>
+          <w:instrText xml:space="preserve"> PAGEREF _Toc237779817 \h </w:instrText>
         </w:r>
         <w:r>
           <w:rPr>
@@ -4625,7 +4625,7 @@
       <w:pPr>
         <w:pStyle w:val="TDC1"/>
         <w:tabs>
-          <w:tab w:val="right" w:leader="dot" w:pos="4722"/>
+          <w:tab w:val="right" w:leader="dot" w:pos="9855"/>
         </w:tabs>
         <w:rPr>
           <w:rFonts w:asciiTheme="minorHAnsi" w:hAnsiTheme="minorHAnsi"/>
@@ -4637,7 +4637,7 @@
           <w14:ligatures w14:val="standardContextual"/>
         </w:rPr>
       </w:pPr>
-      <w:hyperlink w:anchor="_Toc237767757" w:history="1">
+      <w:hyperlink w:anchor="_Toc237779818" w:history="1">
         <w:r>
           <w:rPr>
             <w:rStyle w:val="Hipervnculo"/>
@@ -4664,7 +4664,7 @@
             <w:noProof/>
             <w:webHidden/>
           </w:rPr>
-          <w:instrText xml:space="preserve"> PAGEREF _Toc237767757 \h </w:instrText>
+          <w:instrText xml:space="preserve"> PAGEREF _Toc237779818 \h </w:instrText>
         </w:r>
         <w:r>
           <w:rPr>
@@ -4699,7 +4699,7 @@
       <w:pPr>
         <w:pStyle w:val="TDC2"/>
         <w:tabs>
-          <w:tab w:val="right" w:leader="dot" w:pos="4722"/>
+          <w:tab w:val="right" w:leader="dot" w:pos="9855"/>
         </w:tabs>
         <w:rPr>
           <w:rFonts w:asciiTheme="minorHAnsi" w:hAnsiTheme="minorHAnsi"/>
@@ -4711,7 +4711,7 @@
           <w14:ligatures w14:val="standardContextual"/>
         </w:rPr>
       </w:pPr>
-      <w:hyperlink w:anchor="_Toc237767758" w:history="1">
+      <w:hyperlink w:anchor="_Toc237779819" w:history="1">
         <w:r>
           <w:rPr>
             <w:rStyle w:val="Hipervnculo"/>
@@ -4738,7 +4738,7 @@
             <w:noProof/>
             <w:webHidden/>
           </w:rPr>
-          <w:instrText xml:space="preserve"> PAGEREF _Toc237767758 \h </w:instrText>
+          <w:instrText xml:space="preserve"> PAGEREF _Toc237779819 \h </w:instrText>
         </w:r>
         <w:r>
           <w:rPr>
@@ -4773,7 +4773,7 @@
       <w:pPr>
         <w:pStyle w:val="TDC1"/>
         <w:tabs>
-          <w:tab w:val="right" w:leader="dot" w:pos="4722"/>
+          <w:tab w:val="right" w:leader="dot" w:pos="9855"/>
         </w:tabs>
         <w:rPr>
           <w:rFonts w:asciiTheme="minorHAnsi" w:hAnsiTheme="minorHAnsi"/>
@@ -4785,7 +4785,7 @@
           <w14:ligatures w14:val="standardContextual"/>
         </w:rPr>
       </w:pPr>
-      <w:hyperlink w:anchor="_Toc237767759" w:history="1">
+      <w:hyperlink w:anchor="_Toc237779820" w:history="1">
         <w:r>
           <w:rPr>
             <w:rStyle w:val="Hipervnculo"/>
@@ -4812,7 +4812,7 @@
             <w:noProof/>
             <w:webHidden/>
           </w:rPr>
-          <w:instrText xml:space="preserve"> PAGEREF _Toc237767759 \h </w:instrText>
+          <w:instrText xml:space="preserve"> PAGEREF _Toc237779820 \h </w:instrText>
         </w:r>
         <w:r>
           <w:rPr>
@@ -4847,7 +4847,7 @@
       <w:pPr>
         <w:pStyle w:val="TDC2"/>
         <w:tabs>
-          <w:tab w:val="right" w:leader="dot" w:pos="4722"/>
+          <w:tab w:val="right" w:leader="dot" w:pos="9855"/>
         </w:tabs>
         <w:rPr>
           <w:rFonts w:asciiTheme="minorHAnsi" w:hAnsiTheme="minorHAnsi"/>
@@ -4859,7 +4859,7 @@
           <w14:ligatures w14:val="standardContextual"/>
         </w:rPr>
       </w:pPr>
-      <w:hyperlink w:anchor="_Toc237767760" w:history="1">
+      <w:hyperlink w:anchor="_Toc237779821" w:history="1">
         <w:r>
           <w:rPr>
             <w:rStyle w:val="Hipervnculo"/>
@@ -4886,7 +4886,7 @@
             <w:noProof/>
             <w:webHidden/>
           </w:rPr>
-          <w:instrText xml:space="preserve"> PAGEREF _Toc237767760 \h </w:instrText>
+          <w:instrText xml:space="preserve"> PAGEREF _Toc237779821 \h </w:instrText>
         </w:r>
         <w:r>
           <w:rPr>
@@ -4921,7 +4921,7 @@
       <w:pPr>
         <w:pStyle w:val="TDC2"/>
         <w:tabs>
-          <w:tab w:val="right" w:leader="dot" w:pos="4722"/>
+          <w:tab w:val="right" w:leader="dot" w:pos="9855"/>
         </w:tabs>
         <w:rPr>
           <w:rFonts w:asciiTheme="minorHAnsi" w:hAnsiTheme="minorHAnsi"/>
@@ -4933,7 +4933,7 @@
           <w14:ligatures w14:val="standardContextual"/>
         </w:rPr>
       </w:pPr>
-      <w:hyperlink w:anchor="_Toc237767761" w:history="1">
+      <w:hyperlink w:anchor="_Toc237779822" w:history="1">
         <w:r>
           <w:rPr>
             <w:rStyle w:val="Hipervnculo"/>
@@ -4960,7 +4960,7 @@
             <w:noProof/>
             <w:webHidden/>
           </w:rPr>
-          <w:instrText xml:space="preserve"> PAGEREF _Toc237767761 \h </w:instrText>
+          <w:instrText xml:space="preserve"> PAGEREF _Toc237779822 \h </w:instrText>
         </w:r>
         <w:r>
           <w:rPr>
@@ -4995,7 +4995,7 @@
       <w:pPr>
         <w:pStyle w:val="TDC1"/>
         <w:tabs>
-          <w:tab w:val="right" w:leader="dot" w:pos="4722"/>
+          <w:tab w:val="right" w:leader="dot" w:pos="9855"/>
         </w:tabs>
         <w:rPr>
           <w:rFonts w:asciiTheme="minorHAnsi" w:hAnsiTheme="minorHAnsi"/>
@@ -5007,7 +5007,7 @@
           <w14:ligatures w14:val="standardContextual"/>
         </w:rPr>
       </w:pPr>
-      <w:hyperlink w:anchor="_Toc237767762" w:history="1">
+      <w:hyperlink w:anchor="_Toc237779823" w:history="1">
         <w:r>
           <w:rPr>
             <w:rStyle w:val="Hipervnculo"/>
@@ -5034,7 +5034,7 @@
             <w:noProof/>
             <w:webHidden/>
           </w:rPr>
-          <w:instrText xml:space="preserve"> PAGEREF _Toc237767762 \h </w:instrText>
+          <w:instrText xml:space="preserve"> PAGEREF _Toc237779823 \h </w:instrText>
         </w:r>
         <w:r>
           <w:rPr>
@@ -5069,7 +5069,7 @@
       <w:pPr>
         <w:pStyle w:val="TDC2"/>
         <w:tabs>
-          <w:tab w:val="right" w:leader="dot" w:pos="4722"/>
+          <w:tab w:val="right" w:leader="dot" w:pos="9855"/>
         </w:tabs>
         <w:rPr>
           <w:rFonts w:asciiTheme="minorHAnsi" w:hAnsiTheme="minorHAnsi"/>
@@ -5081,7 +5081,7 @@
           <w14:ligatures w14:val="standardContextual"/>
         </w:rPr>
       </w:pPr>
-      <w:hyperlink w:anchor="_Toc237767763" w:history="1">
+      <w:hyperlink w:anchor="_Toc237779824" w:history="1">
         <w:r>
           <w:rPr>
             <w:rStyle w:val="Hipervnculo"/>
@@ -5108,7 +5108,7 @@
             <w:noProof/>
             <w:webHidden/>
           </w:rPr>
-          <w:instrText xml:space="preserve"> PAGEREF _Toc237767763 \h </w:instrText>
+          <w:instrText xml:space="preserve"> PAGEREF _Toc237779824 \h </w:instrText>
         </w:r>
         <w:r>
           <w:rPr>
@@ -5143,7 +5143,7 @@
       <w:pPr>
         <w:pStyle w:val="TDC1"/>
         <w:tabs>
-          <w:tab w:val="right" w:leader="dot" w:pos="4722"/>
+          <w:tab w:val="right" w:leader="dot" w:pos="9855"/>
         </w:tabs>
         <w:rPr>
           <w:rFonts w:asciiTheme="minorHAnsi" w:hAnsiTheme="minorHAnsi"/>
@@ -5155,7 +5155,7 @@
           <w14:ligatures w14:val="standardContextual"/>
         </w:rPr>
       </w:pPr>
-      <w:hyperlink w:anchor="_Toc237767764" w:history="1">
+      <w:hyperlink w:anchor="_Toc237779825" w:history="1">
         <w:r>
           <w:rPr>
             <w:rStyle w:val="Hipervnculo"/>
@@ -5182,7 +5182,7 @@
             <w:noProof/>
             <w:webHidden/>
           </w:rPr>
-          <w:instrText xml:space="preserve"> PAGEREF _Toc237767764 \h </w:instrText>
+          <w:instrText xml:space="preserve"> PAGEREF _Toc237779825 \h </w:instrText>
         </w:r>
         <w:r>
           <w:rPr>
@@ -5217,7 +5217,7 @@
       <w:pPr>
         <w:pStyle w:val="TDC2"/>
         <w:tabs>
-          <w:tab w:val="right" w:leader="dot" w:pos="4722"/>
+          <w:tab w:val="right" w:leader="dot" w:pos="9855"/>
         </w:tabs>
         <w:rPr>
           <w:rFonts w:asciiTheme="minorHAnsi" w:hAnsiTheme="minorHAnsi"/>
@@ -5229,7 +5229,7 @@
           <w14:ligatures w14:val="standardContextual"/>
         </w:rPr>
       </w:pPr>
-      <w:hyperlink w:anchor="_Toc237767765" w:history="1">
+      <w:hyperlink w:anchor="_Toc237779826" w:history="1">
         <w:r>
           <w:rPr>
             <w:rStyle w:val="Hipervnculo"/>
@@ -5256,7 +5256,7 @@
             <w:noProof/>
             <w:webHidden/>
           </w:rPr>
-          <w:instrText xml:space="preserve"> PAGEREF _Toc237767765 \h </w:instrText>
+          <w:instrText xml:space="preserve"> PAGEREF _Toc237779826 \h </w:instrText>
         </w:r>
         <w:r>
           <w:rPr>
@@ -5291,7 +5291,7 @@
       <w:pPr>
         <w:pStyle w:val="TDC2"/>
         <w:tabs>
-          <w:tab w:val="right" w:leader="dot" w:pos="4722"/>
+          <w:tab w:val="right" w:leader="dot" w:pos="9855"/>
         </w:tabs>
         <w:rPr>
           <w:rFonts w:asciiTheme="minorHAnsi" w:hAnsiTheme="minorHAnsi"/>
@@ -5303,7 +5303,7 @@
           <w14:ligatures w14:val="standardContextual"/>
         </w:rPr>
       </w:pPr>
-      <w:hyperlink w:anchor="_Toc237767766" w:history="1">
+      <w:hyperlink w:anchor="_Toc237779827" w:history="1">
         <w:r>
           <w:rPr>
             <w:rStyle w:val="Hipervnculo"/>
@@ -5330,7 +5330,7 @@
             <w:noProof/>
             <w:webHidden/>
           </w:rPr>
-          <w:instrText xml:space="preserve"> PAGEREF _Toc237767766 \h </w:instrText>
+          <w:instrText xml:space="preserve"> PAGEREF _Toc237779827 \h </w:instrText>
         </w:r>
         <w:r>
           <w:rPr>
@@ -5365,7 +5365,7 @@
       <w:pPr>
         <w:pStyle w:val="TDC2"/>
         <w:tabs>
-          <w:tab w:val="right" w:leader="dot" w:pos="4722"/>
+          <w:tab w:val="right" w:leader="dot" w:pos="9855"/>
         </w:tabs>
         <w:rPr>
           <w:rFonts w:asciiTheme="minorHAnsi" w:hAnsiTheme="minorHAnsi"/>
@@ -5377,7 +5377,7 @@
           <w14:ligatures w14:val="standardContextual"/>
         </w:rPr>
       </w:pPr>
-      <w:hyperlink w:anchor="_Toc237767767" w:history="1">
+      <w:hyperlink w:anchor="_Toc237779828" w:history="1">
         <w:r>
           <w:rPr>
             <w:rStyle w:val="Hipervnculo"/>
@@ -5404,7 +5404,7 @@
             <w:noProof/>
             <w:webHidden/>
           </w:rPr>
-          <w:instrText xml:space="preserve"> PAGEREF _Toc237767767 \h </w:instrText>
+          <w:instrText xml:space="preserve"> PAGEREF _Toc237779828 \h </w:instrText>
         </w:r>
         <w:r>
           <w:rPr>
@@ -5439,7 +5439,7 @@
       <w:pPr>
         <w:pStyle w:val="TDC2"/>
         <w:tabs>
-          <w:tab w:val="right" w:leader="dot" w:pos="4722"/>
+          <w:tab w:val="right" w:leader="dot" w:pos="9855"/>
         </w:tabs>
         <w:rPr>
           <w:rFonts w:asciiTheme="minorHAnsi" w:hAnsiTheme="minorHAnsi"/>
@@ -5451,7 +5451,7 @@
           <w14:ligatures w14:val="standardContextual"/>
         </w:rPr>
       </w:pPr>
-      <w:hyperlink w:anchor="_Toc237767768" w:history="1">
+      <w:hyperlink w:anchor="_Toc237779829" w:history="1">
         <w:r>
           <w:rPr>
             <w:rStyle w:val="Hipervnculo"/>
@@ -5478,7 +5478,7 @@
             <w:noProof/>
             <w:webHidden/>
           </w:rPr>
-          <w:instrText xml:space="preserve"> PAGEREF _Toc237767768 \h </w:instrText>
+          <w:instrText xml:space="preserve"> PAGEREF _Toc237779829 \h </w:instrText>
         </w:r>
         <w:r>
           <w:rPr>
@@ -5513,7 +5513,7 @@
       <w:pPr>
         <w:pStyle w:val="TDC2"/>
         <w:tabs>
-          <w:tab w:val="right" w:leader="dot" w:pos="4722"/>
+          <w:tab w:val="right" w:leader="dot" w:pos="9855"/>
         </w:tabs>
         <w:rPr>
           <w:rFonts w:asciiTheme="minorHAnsi" w:hAnsiTheme="minorHAnsi"/>
@@ -5525,7 +5525,7 @@
           <w14:ligatures w14:val="standardContextual"/>
         </w:rPr>
       </w:pPr>
-      <w:hyperlink w:anchor="_Toc237767769" w:history="1">
+      <w:hyperlink w:anchor="_Toc237779830" w:history="1">
         <w:r>
           <w:rPr>
             <w:rStyle w:val="Hipervnculo"/>
@@ -5552,7 +5552,7 @@
             <w:noProof/>
             <w:webHidden/>
           </w:rPr>
-          <w:instrText xml:space="preserve"> PAGEREF _Toc237767769 \h </w:instrText>
+          <w:instrText xml:space="preserve"> PAGEREF _Toc237779830 \h </w:instrText>
         </w:r>
         <w:r>
           <w:rPr>
@@ -5587,7 +5587,7 @@
       <w:pPr>
         <w:pStyle w:val="TDC1"/>
         <w:tabs>
-          <w:tab w:val="right" w:leader="dot" w:pos="4722"/>
+          <w:tab w:val="right" w:leader="dot" w:pos="9855"/>
         </w:tabs>
         <w:rPr>
           <w:rFonts w:asciiTheme="minorHAnsi" w:hAnsiTheme="minorHAnsi"/>
@@ -5599,7 +5599,7 @@
           <w14:ligatures w14:val="standardContextual"/>
         </w:rPr>
       </w:pPr>
-      <w:hyperlink w:anchor="_Toc237767770" w:history="1">
+      <w:hyperlink w:anchor="_Toc237779831" w:history="1">
         <w:r>
           <w:rPr>
             <w:rStyle w:val="Hipervnculo"/>
@@ -5626,7 +5626,7 @@
             <w:noProof/>
             <w:webHidden/>
           </w:rPr>
-          <w:instrText xml:space="preserve"> PAGEREF _Toc237767770 \h </w:instrText>
+          <w:instrText xml:space="preserve"> PAGEREF _Toc237779831 \h </w:instrText>
         </w:r>
         <w:r>
           <w:rPr>
@@ -5661,7 +5661,7 @@
       <w:pPr>
         <w:pStyle w:val="TDC2"/>
         <w:tabs>
-          <w:tab w:val="right" w:leader="dot" w:pos="4722"/>
+          <w:tab w:val="right" w:leader="dot" w:pos="9855"/>
         </w:tabs>
         <w:rPr>
           <w:rFonts w:asciiTheme="minorHAnsi" w:hAnsiTheme="minorHAnsi"/>
@@ -5673,7 +5673,7 @@
           <w14:ligatures w14:val="standardContextual"/>
         </w:rPr>
       </w:pPr>
-      <w:hyperlink w:anchor="_Toc237767771" w:history="1">
+      <w:hyperlink w:anchor="_Toc237779832" w:history="1">
         <w:r>
           <w:rPr>
             <w:rStyle w:val="Hipervnculo"/>
@@ -5700,7 +5700,7 @@
             <w:noProof/>
             <w:webHidden/>
           </w:rPr>
-          <w:instrText xml:space="preserve"> PAGEREF _Toc237767771 \h </w:instrText>
+          <w:instrText xml:space="preserve"> PAGEREF _Toc237779832 \h </w:instrText>
         </w:r>
         <w:r>
           <w:rPr>
@@ -5735,7 +5735,7 @@
       <w:pPr>
         <w:pStyle w:val="TDC2"/>
         <w:tabs>
-          <w:tab w:val="right" w:leader="dot" w:pos="4722"/>
+          <w:tab w:val="right" w:leader="dot" w:pos="9855"/>
         </w:tabs>
         <w:rPr>
           <w:rFonts w:asciiTheme="minorHAnsi" w:hAnsiTheme="minorHAnsi"/>
@@ -5747,7 +5747,7 @@
           <w14:ligatures w14:val="standardContextual"/>
         </w:rPr>
       </w:pPr>
-      <w:hyperlink w:anchor="_Toc237767772" w:history="1">
+      <w:hyperlink w:anchor="_Toc237779833" w:history="1">
         <w:r>
           <w:rPr>
             <w:rStyle w:val="Hipervnculo"/>
@@ -5774,7 +5774,7 @@
             <w:noProof/>
             <w:webHidden/>
           </w:rPr>
-          <w:instrText xml:space="preserve"> PAGEREF _Toc237767772 \h </w:instrText>
+          <w:instrText xml:space="preserve"> PAGEREF _Toc237779833 \h </w:instrText>
         </w:r>
         <w:r>
           <w:rPr>
@@ -5809,7 +5809,7 @@
       <w:pPr>
         <w:pStyle w:val="TDC2"/>
         <w:tabs>
-          <w:tab w:val="right" w:leader="dot" w:pos="4722"/>
+          <w:tab w:val="right" w:leader="dot" w:pos="9855"/>
         </w:tabs>
         <w:rPr>
           <w:rFonts w:asciiTheme="minorHAnsi" w:hAnsiTheme="minorHAnsi"/>
@@ -5821,7 +5821,7 @@
           <w14:ligatures w14:val="standardContextual"/>
         </w:rPr>
       </w:pPr>
-      <w:hyperlink w:anchor="_Toc237767773" w:history="1">
+      <w:hyperlink w:anchor="_Toc237779834" w:history="1">
         <w:r>
           <w:rPr>
             <w:rStyle w:val="Hipervnculo"/>
@@ -5848,7 +5848,7 @@
             <w:noProof/>
             <w:webHidden/>
           </w:rPr>
-          <w:instrText xml:space="preserve"> PAGEREF _Toc237767773 \h </w:instrText>
+          <w:instrText xml:space="preserve"> PAGEREF _Toc237779834 \h </w:instrText>
         </w:r>
         <w:r>
           <w:rPr>
@@ -5883,7 +5883,7 @@
       <w:pPr>
         <w:pStyle w:val="TDC2"/>
         <w:tabs>
-          <w:tab w:val="right" w:leader="dot" w:pos="4722"/>
+          <w:tab w:val="right" w:leader="dot" w:pos="9855"/>
         </w:tabs>
         <w:rPr>
           <w:rFonts w:asciiTheme="minorHAnsi" w:hAnsiTheme="minorHAnsi"/>
@@ -5895,7 +5895,7 @@
           <w14:ligatures w14:val="standardContextual"/>
         </w:rPr>
       </w:pPr>
-      <w:hyperlink w:anchor="_Toc237767774" w:history="1">
+      <w:hyperlink w:anchor="_Toc237779835" w:history="1">
         <w:r>
           <w:rPr>
             <w:rStyle w:val="Hipervnculo"/>
@@ -5922,7 +5922,7 @@
             <w:noProof/>
             <w:webHidden/>
           </w:rPr>
-          <w:instrText xml:space="preserve"> PAGEREF _Toc237767774 \h </w:instrText>
+          <w:instrText xml:space="preserve"> PAGEREF _Toc237779835 \h </w:instrText>
         </w:r>
         <w:r>
           <w:rPr>
@@ -5957,7 +5957,7 @@
       <w:pPr>
         <w:pStyle w:val="TDC1"/>
         <w:tabs>
-          <w:tab w:val="right" w:leader="dot" w:pos="4722"/>
+          <w:tab w:val="right" w:leader="dot" w:pos="9855"/>
         </w:tabs>
         <w:rPr>
           <w:rFonts w:asciiTheme="minorHAnsi" w:hAnsiTheme="minorHAnsi"/>
@@ -5969,7 +5969,7 @@
           <w14:ligatures w14:val="standardContextual"/>
         </w:rPr>
       </w:pPr>
-      <w:hyperlink w:anchor="_Toc237767775" w:history="1">
+      <w:hyperlink w:anchor="_Toc237779836" w:history="1">
         <w:r>
           <w:rPr>
             <w:rStyle w:val="Hipervnculo"/>
@@ -5996,7 +5996,7 @@
             <w:noProof/>
             <w:webHidden/>
           </w:rPr>
-          <w:instrText xml:space="preserve"> PAGEREF _Toc237767775 \h </w:instrText>
+          <w:instrText xml:space="preserve"> PAGEREF _Toc237779836 \h </w:instrText>
         </w:r>
         <w:r>
           <w:rPr>
@@ -6031,7 +6031,7 @@
       <w:pPr>
         <w:pStyle w:val="TDC1"/>
         <w:tabs>
-          <w:tab w:val="right" w:leader="dot" w:pos="4722"/>
+          <w:tab w:val="right" w:leader="dot" w:pos="9855"/>
         </w:tabs>
         <w:rPr>
           <w:rFonts w:asciiTheme="minorHAnsi" w:hAnsiTheme="minorHAnsi"/>
@@ -6043,7 +6043,7 @@
           <w14:ligatures w14:val="standardContextual"/>
         </w:rPr>
       </w:pPr>
-      <w:hyperlink w:anchor="_Toc237767776" w:history="1">
+      <w:hyperlink w:anchor="_Toc237779837" w:history="1">
         <w:r>
           <w:rPr>
             <w:rStyle w:val="Hipervnculo"/>
@@ -6070,7 +6070,7 @@
             <w:noProof/>
             <w:webHidden/>
           </w:rPr>
-          <w:instrText xml:space="preserve"> PAGEREF _Toc237767776 \h </w:instrText>
+          <w:instrText xml:space="preserve"> PAGEREF _Toc237779837 \h </w:instrText>
         </w:r>
         <w:r>
           <w:rPr>
@@ -6105,7 +6105,7 @@
       <w:pPr>
         <w:pStyle w:val="TDC1"/>
         <w:tabs>
-          <w:tab w:val="right" w:leader="dot" w:pos="4722"/>
+          <w:tab w:val="right" w:leader="dot" w:pos="9855"/>
         </w:tabs>
         <w:rPr>
           <w:rFonts w:asciiTheme="minorHAnsi" w:hAnsiTheme="minorHAnsi"/>
@@ -6117,7 +6117,7 @@
           <w14:ligatures w14:val="standardContextual"/>
         </w:rPr>
       </w:pPr>
-      <w:hyperlink w:anchor="_Toc237767777" w:history="1">
+      <w:hyperlink w:anchor="_Toc237779838" w:history="1">
         <w:r>
           <w:rPr>
             <w:rStyle w:val="Hipervnculo"/>
@@ -6144,7 +6144,7 @@
             <w:noProof/>
             <w:webHidden/>
           </w:rPr>
-          <w:instrText xml:space="preserve"> PAGEREF _Toc237767777 \h </w:instrText>
+          <w:instrText xml:space="preserve"> PAGEREF _Toc237779838 \h </w:instrText>
         </w:r>
         <w:r>
           <w:rPr>
@@ -6179,7 +6179,7 @@
       <w:pPr>
         <w:pStyle w:val="TDC1"/>
         <w:tabs>
-          <w:tab w:val="right" w:leader="dot" w:pos="4722"/>
+          <w:tab w:val="right" w:leader="dot" w:pos="9855"/>
         </w:tabs>
         <w:rPr>
           <w:rFonts w:asciiTheme="minorHAnsi" w:hAnsiTheme="minorHAnsi"/>
@@ -6191,7 +6191,7 @@
           <w14:ligatures w14:val="standardContextual"/>
         </w:rPr>
       </w:pPr>
-      <w:hyperlink w:anchor="_Toc237767778" w:history="1">
+      <w:hyperlink w:anchor="_Toc237779839" w:history="1">
         <w:r>
           <w:rPr>
             <w:rStyle w:val="Hipervnculo"/>
@@ -6218,7 +6218,7 @@
             <w:noProof/>
             <w:webHidden/>
           </w:rPr>
-          <w:instrText xml:space="preserve"> PAGEREF _Toc237767778 \h </w:instrText>
+          <w:instrText xml:space="preserve"> PAGEREF _Toc237779839 \h </w:instrText>
         </w:r>
         <w:r>
           <w:rPr>
@@ -6291,7 +6291,7 @@
         <w:sectPr>
           <w:pgSz w:w="11909" w:h="16834"/>
           <w:pgMar w:top="1022" w:right="1022" w:bottom="1022" w:left="1022" w:header="504" w:footer="504" w:gutter="0"/>
-          <w:cols w:num="2" w:space="400"/>
+          <w:cols w:space="400"/>
           <w:titlePg/>
           <w:docGrid w:linePitch="360"/>
         </w:sectPr>
@@ -6302,7 +6302,7 @@
         <w:pStyle w:val="Ttulo1"/>
         <w:spacing w:before="160" w:after="60"/>
       </w:pPr>
-      <w:bookmarkStart w:id="0" w:name="_Toc237767716"/>
+      <w:bookmarkStart w:id="0" w:name="_Toc237779777"/>
       <w:r>
         <w:rPr>
           <w:rFonts w:ascii="Georgia" w:hAnsi="Georgia"/>
@@ -6319,7 +6319,7 @@
         <w:pStyle w:val="Ttulo2"/>
         <w:spacing w:before="120" w:after="40"/>
       </w:pPr>
-      <w:bookmarkStart w:id="1" w:name="_Toc237767717"/>
+      <w:bookmarkStart w:id="1" w:name="_Toc237779778"/>
       <w:r>
         <w:rPr>
           <w:rFonts w:ascii="Georgia" w:hAnsi="Georgia"/>
@@ -6360,7 +6360,7 @@
         <w:pStyle w:val="Ttulo2"/>
         <w:spacing w:before="120" w:after="40"/>
       </w:pPr>
-      <w:bookmarkStart w:id="2" w:name="_Toc237767718"/>
+      <w:bookmarkStart w:id="2" w:name="_Toc237779779"/>
       <w:r>
         <w:rPr>
           <w:rFonts w:ascii="Georgia" w:hAnsi="Georgia"/>
@@ -6421,7 +6421,7 @@
                 <w:noProof/>
               </w:rPr>
               <w:drawing>
-                <wp:inline distT="0" distB="0" distL="0" distR="0" wp14:anchorId="3E2DEC92" wp14:editId="02D974A2">
+                <wp:inline distT="0" distB="0" distL="0" distR="0" wp14:anchorId="713212EC" wp14:editId="290CD056">
                   <wp:extent cx="3017520" cy="1572050"/>
                   <wp:effectExtent l="0" t="0" r="0" b="0"/>
                   <wp:docPr id="1" name="Picture 1"/>
@@ -6480,7 +6480,7 @@
                 <w:noProof/>
               </w:rPr>
               <w:drawing>
-                <wp:inline distT="0" distB="0" distL="0" distR="0" wp14:anchorId="6B5C2B4A" wp14:editId="49F597D1">
+                <wp:inline distT="0" distB="0" distL="0" distR="0" wp14:anchorId="6BA13C98" wp14:editId="239E8CC1">
                   <wp:extent cx="3017520" cy="1482763"/>
                   <wp:effectExtent l="0" t="0" r="0" b="0"/>
                   <wp:docPr id="2" name="Picture 2"/>
@@ -6585,7 +6585,7 @@
         <w:pStyle w:val="Ttulo2"/>
         <w:spacing w:before="120" w:after="40"/>
       </w:pPr>
-      <w:bookmarkStart w:id="3" w:name="_Toc237767719"/>
+      <w:bookmarkStart w:id="3" w:name="_Toc237779780"/>
       <w:r>
         <w:rPr>
           <w:rFonts w:ascii="Georgia" w:hAnsi="Georgia"/>
@@ -6733,7 +6733,7 @@
         <w:pStyle w:val="Ttulo2"/>
         <w:spacing w:before="120" w:after="40"/>
       </w:pPr>
-      <w:bookmarkStart w:id="4" w:name="_Toc237767720"/>
+      <w:bookmarkStart w:id="4" w:name="_Toc237779781"/>
       <w:r>
         <w:rPr>
           <w:rFonts w:ascii="Georgia" w:hAnsi="Georgia"/>
@@ -7261,7 +7261,7 @@
         <w:pStyle w:val="Ttulo2"/>
         <w:spacing w:before="120" w:after="40"/>
       </w:pPr>
-      <w:bookmarkStart w:id="5" w:name="_Toc237767721"/>
+      <w:bookmarkStart w:id="5" w:name="_Toc237779782"/>
       <w:r>
         <w:rPr>
           <w:rFonts w:ascii="Georgia" w:hAnsi="Georgia"/>
@@ -7422,7 +7422,7 @@
         <w:pStyle w:val="Ttulo2"/>
         <w:spacing w:before="120" w:after="40"/>
       </w:pPr>
-      <w:bookmarkStart w:id="6" w:name="_Toc237767722"/>
+      <w:bookmarkStart w:id="6" w:name="_Toc237779783"/>
       <w:r>
         <w:rPr>
           <w:rFonts w:ascii="Georgia" w:hAnsi="Georgia"/>
@@ -8651,7 +8651,7 @@
         <w:pStyle w:val="Ttulo1"/>
         <w:spacing w:before="160" w:after="60"/>
       </w:pPr>
-      <w:bookmarkStart w:id="7" w:name="_Toc237767723"/>
+      <w:bookmarkStart w:id="7" w:name="_Toc237779784"/>
       <w:r>
         <w:rPr>
           <w:rFonts w:ascii="Georgia" w:hAnsi="Georgia"/>
@@ -8667,7 +8667,7 @@
         <w:pStyle w:val="Ttulo2"/>
         <w:spacing w:before="120" w:after="40"/>
       </w:pPr>
-      <w:bookmarkStart w:id="8" w:name="_Toc237767724"/>
+      <w:bookmarkStart w:id="8" w:name="_Toc237779785"/>
       <w:r>
         <w:rPr>
           <w:rFonts w:ascii="Georgia" w:hAnsi="Georgia"/>
@@ -8725,7 +8725,7 @@
                 <w:noProof/>
               </w:rPr>
               <w:drawing>
-                <wp:inline distT="0" distB="0" distL="0" distR="0" wp14:anchorId="6DCE06EA" wp14:editId="13EC1E9F">
+                <wp:inline distT="0" distB="0" distL="0" distR="0" wp14:anchorId="148A9392" wp14:editId="234BF825">
                   <wp:extent cx="3017520" cy="1471175"/>
                   <wp:effectExtent l="0" t="0" r="0" b="0"/>
                   <wp:docPr id="3" name="Picture 3"/>
@@ -8784,7 +8784,7 @@
                 <w:noProof/>
               </w:rPr>
               <w:drawing>
-                <wp:inline distT="0" distB="0" distL="0" distR="0" wp14:anchorId="645F648B" wp14:editId="3AA11DD6">
+                <wp:inline distT="0" distB="0" distL="0" distR="0" wp14:anchorId="347B6E72" wp14:editId="7E48DE6E">
                   <wp:extent cx="3017520" cy="1540956"/>
                   <wp:effectExtent l="0" t="0" r="0" b="0"/>
                   <wp:docPr id="4" name="Picture 4"/>
@@ -8889,7 +8889,7 @@
         <w:pStyle w:val="Ttulo2"/>
         <w:spacing w:before="120" w:after="40"/>
       </w:pPr>
-      <w:bookmarkStart w:id="9" w:name="_Toc237767725"/>
+      <w:bookmarkStart w:id="9" w:name="_Toc237779786"/>
       <w:r>
         <w:rPr>
           <w:rFonts w:ascii="Georgia" w:hAnsi="Georgia"/>
@@ -9122,7 +9122,7 @@
         <w:pStyle w:val="Ttulo1"/>
         <w:spacing w:before="160" w:after="60"/>
       </w:pPr>
-      <w:bookmarkStart w:id="10" w:name="_Toc237767726"/>
+      <w:bookmarkStart w:id="10" w:name="_Toc237779787"/>
       <w:r>
         <w:rPr>
           <w:rFonts w:ascii="Georgia" w:hAnsi="Georgia"/>
@@ -9138,7 +9138,7 @@
         <w:pStyle w:val="Ttulo2"/>
         <w:spacing w:before="120" w:after="40"/>
       </w:pPr>
-      <w:bookmarkStart w:id="11" w:name="_Toc237767727"/>
+      <w:bookmarkStart w:id="11" w:name="_Toc237779788"/>
       <w:r>
         <w:rPr>
           <w:rFonts w:ascii="Georgia" w:hAnsi="Georgia"/>
@@ -9200,7 +9200,7 @@
                 <w:noProof/>
               </w:rPr>
               <w:drawing>
-                <wp:inline distT="0" distB="0" distL="0" distR="0" wp14:anchorId="52025F73" wp14:editId="4014AE45">
+                <wp:inline distT="0" distB="0" distL="0" distR="0" wp14:anchorId="4C8A2C0E" wp14:editId="6BC8E5EE">
                   <wp:extent cx="3017520" cy="1687385"/>
                   <wp:effectExtent l="0" t="0" r="0" b="0"/>
                   <wp:docPr id="5" name="Picture 5"/>
@@ -9259,7 +9259,7 @@
                 <w:noProof/>
               </w:rPr>
               <w:drawing>
-                <wp:inline distT="0" distB="0" distL="0" distR="0" wp14:anchorId="746E71B1" wp14:editId="4C0C9154">
+                <wp:inline distT="0" distB="0" distL="0" distR="0" wp14:anchorId="1529DB4B" wp14:editId="01CE7B3B">
                   <wp:extent cx="3017520" cy="1527468"/>
                   <wp:effectExtent l="0" t="0" r="0" b="0"/>
                   <wp:docPr id="6" name="Picture 6"/>
@@ -9364,7 +9364,7 @@
         <w:pStyle w:val="Ttulo2"/>
         <w:spacing w:before="120" w:after="40"/>
       </w:pPr>
-      <w:bookmarkStart w:id="12" w:name="_Toc237767728"/>
+      <w:bookmarkStart w:id="12" w:name="_Toc237779789"/>
       <w:r>
         <w:rPr>
           <w:rFonts w:ascii="Georgia" w:hAnsi="Georgia"/>
@@ -9394,7 +9394,7 @@
         <w:pStyle w:val="Ttulo2"/>
         <w:spacing w:before="120" w:after="40"/>
       </w:pPr>
-      <w:bookmarkStart w:id="13" w:name="_Toc237767729"/>
+      <w:bookmarkStart w:id="13" w:name="_Toc237779790"/>
       <w:r>
         <w:rPr>
           <w:rFonts w:ascii="Georgia" w:hAnsi="Georgia"/>
@@ -9452,7 +9452,7 @@
                 <w:noProof/>
               </w:rPr>
               <w:drawing>
-                <wp:inline distT="0" distB="0" distL="0" distR="0" wp14:anchorId="19303170" wp14:editId="68E55B12">
+                <wp:inline distT="0" distB="0" distL="0" distR="0" wp14:anchorId="695A35A3" wp14:editId="44C898B1">
                   <wp:extent cx="3017520" cy="1677129"/>
                   <wp:effectExtent l="0" t="0" r="0" b="0"/>
                   <wp:docPr id="7" name="Picture 7"/>
@@ -9511,7 +9511,7 @@
                 <w:noProof/>
               </w:rPr>
               <w:drawing>
-                <wp:inline distT="0" distB="0" distL="0" distR="0" wp14:anchorId="41E3A305" wp14:editId="54F1DCB8">
+                <wp:inline distT="0" distB="0" distL="0" distR="0" wp14:anchorId="5E968D0D" wp14:editId="50AE01E4">
                   <wp:extent cx="3017520" cy="1525712"/>
                   <wp:effectExtent l="0" t="0" r="0" b="0"/>
                   <wp:docPr id="8" name="Picture 8"/>
@@ -9616,7 +9616,7 @@
         <w:pStyle w:val="Ttulo2"/>
         <w:spacing w:before="120" w:after="40"/>
       </w:pPr>
-      <w:bookmarkStart w:id="14" w:name="_Toc237767730"/>
+      <w:bookmarkStart w:id="14" w:name="_Toc237779791"/>
       <w:r>
         <w:rPr>
           <w:rFonts w:ascii="Georgia" w:hAnsi="Georgia"/>
@@ -9678,7 +9678,7 @@
               </w:rPr>
               <w:lastRenderedPageBreak/>
               <w:drawing>
-                <wp:inline distT="0" distB="0" distL="0" distR="0" wp14:anchorId="5DAD59E1" wp14:editId="5E5E012D">
+                <wp:inline distT="0" distB="0" distL="0" distR="0" wp14:anchorId="3E8B5D52" wp14:editId="0387F64C">
                   <wp:extent cx="3017520" cy="1714258"/>
                   <wp:effectExtent l="0" t="0" r="0" b="0"/>
                   <wp:docPr id="9" name="Picture 9"/>
@@ -9737,7 +9737,7 @@
                 <w:noProof/>
               </w:rPr>
               <w:drawing>
-                <wp:inline distT="0" distB="0" distL="0" distR="0" wp14:anchorId="575FFF87" wp14:editId="18DAB244">
+                <wp:inline distT="0" distB="0" distL="0" distR="0" wp14:anchorId="12007D7B" wp14:editId="37DA902E">
                   <wp:extent cx="3017520" cy="1857285"/>
                   <wp:effectExtent l="0" t="0" r="0" b="0"/>
                   <wp:docPr id="10" name="Picture 10"/>
@@ -9842,7 +9842,7 @@
         <w:pStyle w:val="Ttulo1"/>
         <w:spacing w:before="160" w:after="60"/>
       </w:pPr>
-      <w:bookmarkStart w:id="15" w:name="_Toc237767731"/>
+      <w:bookmarkStart w:id="15" w:name="_Toc237779792"/>
       <w:r>
         <w:rPr>
           <w:rFonts w:ascii="Georgia" w:hAnsi="Georgia"/>
@@ -9858,7 +9858,7 @@
         <w:pStyle w:val="Ttulo2"/>
         <w:spacing w:before="120" w:after="40"/>
       </w:pPr>
-      <w:bookmarkStart w:id="16" w:name="_Toc237767732"/>
+      <w:bookmarkStart w:id="16" w:name="_Toc237779793"/>
       <w:r>
         <w:rPr>
           <w:rFonts w:ascii="Georgia" w:hAnsi="Georgia"/>
@@ -10292,7 +10292,7 @@
         <w:pStyle w:val="Ttulo2"/>
         <w:spacing w:before="120" w:after="40"/>
       </w:pPr>
-      <w:bookmarkStart w:id="17" w:name="_Toc237767733"/>
+      <w:bookmarkStart w:id="17" w:name="_Toc237779794"/>
       <w:r>
         <w:rPr>
           <w:rFonts w:ascii="Georgia" w:hAnsi="Georgia"/>
@@ -10319,7 +10319,7 @@
         <w:pStyle w:val="Ttulo1"/>
         <w:spacing w:before="160" w:after="60"/>
       </w:pPr>
-      <w:bookmarkStart w:id="18" w:name="_Toc237767734"/>
+      <w:bookmarkStart w:id="18" w:name="_Toc237779795"/>
       <w:r>
         <w:rPr>
           <w:rFonts w:ascii="Georgia" w:hAnsi="Georgia"/>
@@ -10335,7 +10335,7 @@
         <w:pStyle w:val="Ttulo2"/>
         <w:spacing w:before="120" w:after="40"/>
       </w:pPr>
-      <w:bookmarkStart w:id="19" w:name="_Toc237767735"/>
+      <w:bookmarkStart w:id="19" w:name="_Toc237779796"/>
       <w:r>
         <w:rPr>
           <w:rFonts w:ascii="Georgia" w:hAnsi="Georgia"/>
@@ -10362,7 +10362,7 @@
         <w:pStyle w:val="Ttulo2"/>
         <w:spacing w:before="120" w:after="40"/>
       </w:pPr>
-      <w:bookmarkStart w:id="20" w:name="_Toc237767736"/>
+      <w:bookmarkStart w:id="20" w:name="_Toc237779797"/>
       <w:r>
         <w:rPr>
           <w:rFonts w:ascii="Georgia" w:hAnsi="Georgia"/>
@@ -10420,7 +10420,7 @@
                 <w:noProof/>
               </w:rPr>
               <w:drawing>
-                <wp:inline distT="0" distB="0" distL="0" distR="0" wp14:anchorId="18F5947A" wp14:editId="204DC186">
+                <wp:inline distT="0" distB="0" distL="0" distR="0" wp14:anchorId="56DA0CE7" wp14:editId="062DCBBE">
                   <wp:extent cx="3017520" cy="1768243"/>
                   <wp:effectExtent l="0" t="0" r="0" b="0"/>
                   <wp:docPr id="11" name="Picture 11"/>
@@ -10479,7 +10479,7 @@
                 <w:noProof/>
               </w:rPr>
               <w:drawing>
-                <wp:inline distT="0" distB="0" distL="0" distR="0" wp14:anchorId="6205E3CE" wp14:editId="17014389">
+                <wp:inline distT="0" distB="0" distL="0" distR="0" wp14:anchorId="25EDF8FD" wp14:editId="3575C7E5">
                   <wp:extent cx="3017520" cy="1606881"/>
                   <wp:effectExtent l="0" t="0" r="0" b="0"/>
                   <wp:docPr id="12" name="Picture 12"/>
@@ -11453,7 +11453,7 @@
         <w:pStyle w:val="Ttulo1"/>
         <w:spacing w:before="160" w:after="60"/>
       </w:pPr>
-      <w:bookmarkStart w:id="21" w:name="_Toc237767737"/>
+      <w:bookmarkStart w:id="21" w:name="_Toc237779798"/>
       <w:r>
         <w:rPr>
           <w:rFonts w:ascii="Georgia" w:hAnsi="Georgia"/>
@@ -11469,7 +11469,7 @@
         <w:pStyle w:val="Ttulo2"/>
         <w:spacing w:before="120" w:after="40"/>
       </w:pPr>
-      <w:bookmarkStart w:id="22" w:name="_Toc237767738"/>
+      <w:bookmarkStart w:id="22" w:name="_Toc237779799"/>
       <w:r>
         <w:rPr>
           <w:rFonts w:ascii="Georgia" w:hAnsi="Georgia"/>
@@ -11561,7 +11561,7 @@
         <w:pStyle w:val="Ttulo2"/>
         <w:spacing w:before="120" w:after="40"/>
       </w:pPr>
-      <w:bookmarkStart w:id="23" w:name="_Toc237767739"/>
+      <w:bookmarkStart w:id="23" w:name="_Toc237779800"/>
       <w:r>
         <w:rPr>
           <w:rFonts w:ascii="Georgia" w:hAnsi="Georgia"/>
@@ -11792,7 +11792,7 @@
                 <w:noProof/>
               </w:rPr>
               <w:drawing>
-                <wp:inline distT="0" distB="0" distL="0" distR="0" wp14:anchorId="26888F40" wp14:editId="5FEC51BB">
+                <wp:inline distT="0" distB="0" distL="0" distR="0" wp14:anchorId="028268B3" wp14:editId="5FF73999">
                   <wp:extent cx="3017520" cy="1588528"/>
                   <wp:effectExtent l="0" t="0" r="0" b="0"/>
                   <wp:docPr id="13" name="Picture 13"/>
@@ -11851,7 +11851,7 @@
                 <w:noProof/>
               </w:rPr>
               <w:drawing>
-                <wp:inline distT="0" distB="0" distL="0" distR="0" wp14:anchorId="080857B7" wp14:editId="4319C6B8">
+                <wp:inline distT="0" distB="0" distL="0" distR="0" wp14:anchorId="2A69809F" wp14:editId="2C781CAB">
                   <wp:extent cx="3017520" cy="1709851"/>
                   <wp:effectExtent l="0" t="0" r="0" b="0"/>
                   <wp:docPr id="14" name="Picture 14"/>
@@ -11956,7 +11956,7 @@
         <w:pStyle w:val="Ttulo2"/>
         <w:spacing w:before="120" w:after="40"/>
       </w:pPr>
-      <w:bookmarkStart w:id="24" w:name="_Toc237767740"/>
+      <w:bookmarkStart w:id="24" w:name="_Toc237779801"/>
       <w:r>
         <w:rPr>
           <w:rFonts w:ascii="Georgia" w:hAnsi="Georgia"/>
@@ -12900,7 +12900,7 @@
         <w:pStyle w:val="Ttulo1"/>
         <w:spacing w:before="160" w:after="60"/>
       </w:pPr>
-      <w:bookmarkStart w:id="25" w:name="_Toc237767741"/>
+      <w:bookmarkStart w:id="25" w:name="_Toc237779802"/>
       <w:r>
         <w:rPr>
           <w:rFonts w:ascii="Georgia" w:hAnsi="Georgia"/>
@@ -12916,7 +12916,7 @@
         <w:pStyle w:val="Ttulo2"/>
         <w:spacing w:before="120" w:after="40"/>
       </w:pPr>
-      <w:bookmarkStart w:id="26" w:name="_Toc237767742"/>
+      <w:bookmarkStart w:id="26" w:name="_Toc237779803"/>
       <w:r>
         <w:rPr>
           <w:rFonts w:ascii="Georgia" w:hAnsi="Georgia"/>
@@ -14529,7 +14529,7 @@
         <w:pStyle w:val="Ttulo2"/>
         <w:spacing w:before="120" w:after="40"/>
       </w:pPr>
-      <w:bookmarkStart w:id="27" w:name="_Toc237767743"/>
+      <w:bookmarkStart w:id="27" w:name="_Toc237779804"/>
       <w:r>
         <w:rPr>
           <w:rFonts w:ascii="Georgia" w:hAnsi="Georgia"/>
@@ -14643,7 +14643,7 @@
         <w:pStyle w:val="Ttulo1"/>
         <w:spacing w:before="160" w:after="60"/>
       </w:pPr>
-      <w:bookmarkStart w:id="28" w:name="_Toc237767744"/>
+      <w:bookmarkStart w:id="28" w:name="_Toc237779805"/>
       <w:r>
         <w:rPr>
           <w:rFonts w:ascii="Georgia" w:hAnsi="Georgia"/>
@@ -14659,7 +14659,7 @@
         <w:pStyle w:val="Ttulo2"/>
         <w:spacing w:before="120" w:after="40"/>
       </w:pPr>
-      <w:bookmarkStart w:id="29" w:name="_Toc237767745"/>
+      <w:bookmarkStart w:id="29" w:name="_Toc237779806"/>
       <w:r>
         <w:rPr>
           <w:rFonts w:ascii="Georgia" w:hAnsi="Georgia"/>
@@ -14686,7 +14686,7 @@
         <w:pStyle w:val="Ttulo2"/>
         <w:spacing w:before="120" w:after="40"/>
       </w:pPr>
-      <w:bookmarkStart w:id="30" w:name="_Toc237767746"/>
+      <w:bookmarkStart w:id="30" w:name="_Toc237779807"/>
       <w:r>
         <w:rPr>
           <w:rFonts w:ascii="Georgia" w:hAnsi="Georgia"/>
@@ -14744,7 +14744,7 @@
                 <w:noProof/>
               </w:rPr>
               <w:drawing>
-                <wp:inline distT="0" distB="0" distL="0" distR="0" wp14:anchorId="4EE9665F" wp14:editId="6B092912">
+                <wp:inline distT="0" distB="0" distL="0" distR="0" wp14:anchorId="16F09BD9" wp14:editId="27979180">
                   <wp:extent cx="3017520" cy="1582552"/>
                   <wp:effectExtent l="0" t="0" r="0" b="0"/>
                   <wp:docPr id="15" name="Picture 15"/>
@@ -14803,7 +14803,7 @@
                 <w:noProof/>
               </w:rPr>
               <w:drawing>
-                <wp:inline distT="0" distB="0" distL="0" distR="0" wp14:anchorId="59797A38" wp14:editId="245298BA">
+                <wp:inline distT="0" distB="0" distL="0" distR="0" wp14:anchorId="7CB5A1C8" wp14:editId="5F0C5E08">
                   <wp:extent cx="3017520" cy="1733035"/>
                   <wp:effectExtent l="0" t="0" r="0" b="0"/>
                   <wp:docPr id="16" name="Picture 16"/>
@@ -14919,7 +14919,7 @@
         <w:pStyle w:val="Ttulo1"/>
         <w:spacing w:before="160" w:after="60"/>
       </w:pPr>
-      <w:bookmarkStart w:id="31" w:name="_Toc237767747"/>
+      <w:bookmarkStart w:id="31" w:name="_Toc237779808"/>
       <w:r>
         <w:rPr>
           <w:rFonts w:ascii="Georgia" w:hAnsi="Georgia"/>
@@ -14935,7 +14935,7 @@
         <w:pStyle w:val="Ttulo2"/>
         <w:spacing w:before="120" w:after="40"/>
       </w:pPr>
-      <w:bookmarkStart w:id="32" w:name="_Toc237767748"/>
+      <w:bookmarkStart w:id="32" w:name="_Toc237779809"/>
       <w:r>
         <w:rPr>
           <w:rFonts w:ascii="Georgia" w:hAnsi="Georgia"/>
@@ -16000,7 +16000,7 @@
         <w:pStyle w:val="Ttulo2"/>
         <w:spacing w:before="120" w:after="40"/>
       </w:pPr>
-      <w:bookmarkStart w:id="33" w:name="_Toc237767749"/>
+      <w:bookmarkStart w:id="33" w:name="_Toc237779810"/>
       <w:r>
         <w:rPr>
           <w:rFonts w:ascii="Georgia" w:hAnsi="Georgia"/>
@@ -16196,7 +16196,7 @@
         <w:pStyle w:val="Ttulo2"/>
         <w:spacing w:before="120" w:after="40"/>
       </w:pPr>
-      <w:bookmarkStart w:id="34" w:name="_Toc237767750"/>
+      <w:bookmarkStart w:id="34" w:name="_Toc237779811"/>
       <w:r>
         <w:rPr>
           <w:rFonts w:ascii="Georgia" w:hAnsi="Georgia"/>
@@ -16223,7 +16223,7 @@
         <w:pStyle w:val="Ttulo1"/>
         <w:spacing w:before="160" w:after="60"/>
       </w:pPr>
-      <w:bookmarkStart w:id="35" w:name="_Toc237767751"/>
+      <w:bookmarkStart w:id="35" w:name="_Toc237779812"/>
       <w:r>
         <w:rPr>
           <w:rFonts w:ascii="Georgia" w:hAnsi="Georgia"/>
@@ -16239,7 +16239,7 @@
         <w:pStyle w:val="Ttulo2"/>
         <w:spacing w:before="120" w:after="40"/>
       </w:pPr>
-      <w:bookmarkStart w:id="36" w:name="_Toc237767752"/>
+      <w:bookmarkStart w:id="36" w:name="_Toc237779813"/>
       <w:r>
         <w:rPr>
           <w:rFonts w:ascii="Georgia" w:hAnsi="Georgia"/>
@@ -19183,7 +19183,7 @@
         <w:pStyle w:val="Ttulo1"/>
         <w:spacing w:before="160" w:after="60"/>
       </w:pPr>
-      <w:bookmarkStart w:id="37" w:name="_Toc237767753"/>
+      <w:bookmarkStart w:id="37" w:name="_Toc237779814"/>
       <w:r>
         <w:rPr>
           <w:rFonts w:ascii="Georgia" w:hAnsi="Georgia"/>
@@ -19199,7 +19199,7 @@
         <w:pStyle w:val="Ttulo2"/>
         <w:spacing w:before="120" w:after="40"/>
       </w:pPr>
-      <w:bookmarkStart w:id="38" w:name="_Toc237767754"/>
+      <w:bookmarkStart w:id="38" w:name="_Toc237779815"/>
       <w:r>
         <w:rPr>
           <w:rFonts w:ascii="Georgia" w:hAnsi="Georgia"/>
@@ -19406,7 +19406,7 @@
         <w:pStyle w:val="Ttulo2"/>
         <w:spacing w:before="120" w:after="40"/>
       </w:pPr>
-      <w:bookmarkStart w:id="39" w:name="_Toc237767755"/>
+      <w:bookmarkStart w:id="39" w:name="_Toc237779816"/>
       <w:r>
         <w:rPr>
           <w:rFonts w:ascii="Georgia" w:hAnsi="Georgia"/>
@@ -19464,7 +19464,7 @@
                 <w:noProof/>
               </w:rPr>
               <w:drawing>
-                <wp:inline distT="0" distB="0" distL="0" distR="0" wp14:anchorId="0FB9DE02" wp14:editId="68869C4F">
+                <wp:inline distT="0" distB="0" distL="0" distR="0" wp14:anchorId="788033CB" wp14:editId="694FD93F">
                   <wp:extent cx="3017520" cy="1677399"/>
                   <wp:effectExtent l="0" t="0" r="0" b="0"/>
                   <wp:docPr id="17" name="Picture 17"/>
@@ -19523,7 +19523,7 @@
                 <w:noProof/>
               </w:rPr>
               <w:drawing>
-                <wp:inline distT="0" distB="0" distL="0" distR="0" wp14:anchorId="0F277BA3" wp14:editId="78BED622">
+                <wp:inline distT="0" distB="0" distL="0" distR="0" wp14:anchorId="374E324F" wp14:editId="4DECD42B">
                   <wp:extent cx="3017520" cy="1744540"/>
                   <wp:effectExtent l="0" t="0" r="0" b="0"/>
                   <wp:docPr id="18" name="Picture 18"/>
@@ -19628,7 +19628,7 @@
         <w:pStyle w:val="Ttulo2"/>
         <w:spacing w:before="120" w:after="40"/>
       </w:pPr>
-      <w:bookmarkStart w:id="40" w:name="_Toc237767756"/>
+      <w:bookmarkStart w:id="40" w:name="_Toc237779817"/>
       <w:r>
         <w:rPr>
           <w:rFonts w:ascii="Georgia" w:hAnsi="Georgia"/>
@@ -20266,7 +20266,7 @@
         <w:pStyle w:val="Ttulo1"/>
         <w:spacing w:before="160" w:after="60"/>
       </w:pPr>
-      <w:bookmarkStart w:id="41" w:name="_Toc237767757"/>
+      <w:bookmarkStart w:id="41" w:name="_Toc237779818"/>
       <w:r>
         <w:rPr>
           <w:rFonts w:ascii="Georgia" w:hAnsi="Georgia"/>
@@ -20282,7 +20282,7 @@
         <w:pStyle w:val="Ttulo2"/>
         <w:spacing w:before="120" w:after="40"/>
       </w:pPr>
-      <w:bookmarkStart w:id="42" w:name="_Toc237767758"/>
+      <w:bookmarkStart w:id="42" w:name="_Toc237779819"/>
       <w:r>
         <w:rPr>
           <w:rFonts w:ascii="Georgia" w:hAnsi="Georgia"/>
@@ -20340,7 +20340,7 @@
                 <w:noProof/>
               </w:rPr>
               <w:drawing>
-                <wp:inline distT="0" distB="0" distL="0" distR="0" wp14:anchorId="4C29BFDA" wp14:editId="78B1DE71">
+                <wp:inline distT="0" distB="0" distL="0" distR="0" wp14:anchorId="11945CCD" wp14:editId="03B8DC86">
                   <wp:extent cx="3017520" cy="1541920"/>
                   <wp:effectExtent l="0" t="0" r="0" b="0"/>
                   <wp:docPr id="19" name="Picture 19"/>
@@ -20399,7 +20399,7 @@
                 <w:noProof/>
               </w:rPr>
               <w:drawing>
-                <wp:inline distT="0" distB="0" distL="0" distR="0" wp14:anchorId="5AAF837E" wp14:editId="1A546F16">
+                <wp:inline distT="0" distB="0" distL="0" distR="0" wp14:anchorId="65F0AF0F" wp14:editId="5D78BCFF">
                   <wp:extent cx="3017520" cy="1735190"/>
                   <wp:effectExtent l="0" t="0" r="0" b="0"/>
                   <wp:docPr id="20" name="Picture 20"/>
@@ -21539,7 +21539,7 @@
         <w:pStyle w:val="Ttulo1"/>
         <w:spacing w:before="160" w:after="60"/>
       </w:pPr>
-      <w:bookmarkStart w:id="43" w:name="_Toc237767759"/>
+      <w:bookmarkStart w:id="43" w:name="_Toc237779820"/>
       <w:r>
         <w:rPr>
           <w:rFonts w:ascii="Georgia" w:hAnsi="Georgia"/>
@@ -21555,7 +21555,7 @@
         <w:pStyle w:val="Ttulo2"/>
         <w:spacing w:before="120" w:after="40"/>
       </w:pPr>
-      <w:bookmarkStart w:id="44" w:name="_Toc237767760"/>
+      <w:bookmarkStart w:id="44" w:name="_Toc237779821"/>
       <w:r>
         <w:rPr>
           <w:rFonts w:ascii="Georgia" w:hAnsi="Georgia"/>
@@ -21610,7 +21610,7 @@
         <w:pStyle w:val="Ttulo2"/>
         <w:spacing w:before="120" w:after="40"/>
       </w:pPr>
-      <w:bookmarkStart w:id="45" w:name="_Toc237767761"/>
+      <w:bookmarkStart w:id="45" w:name="_Toc237779822"/>
       <w:r>
         <w:rPr>
           <w:rFonts w:ascii="Georgia" w:hAnsi="Georgia"/>
@@ -21668,7 +21668,7 @@
                 <w:noProof/>
               </w:rPr>
               <w:drawing>
-                <wp:inline distT="0" distB="0" distL="0" distR="0" wp14:anchorId="34367190" wp14:editId="27AF8199">
+                <wp:inline distT="0" distB="0" distL="0" distR="0" wp14:anchorId="7BF767B6" wp14:editId="5D52B298">
                   <wp:extent cx="3017520" cy="1735190"/>
                   <wp:effectExtent l="0" t="0" r="0" b="0"/>
                   <wp:docPr id="21" name="Picture 21"/>
@@ -21727,7 +21727,7 @@
                 <w:noProof/>
               </w:rPr>
               <w:drawing>
-                <wp:inline distT="0" distB="0" distL="0" distR="0" wp14:anchorId="130B8DB9" wp14:editId="3D489C18">
+                <wp:inline distT="0" distB="0" distL="0" distR="0" wp14:anchorId="489A4643" wp14:editId="61865865">
                   <wp:extent cx="3017520" cy="1598185"/>
                   <wp:effectExtent l="0" t="0" r="0" b="0"/>
                   <wp:docPr id="22" name="Picture 22"/>
@@ -21832,7 +21832,7 @@
         <w:pStyle w:val="Ttulo1"/>
         <w:spacing w:before="160" w:after="60"/>
       </w:pPr>
-      <w:bookmarkStart w:id="46" w:name="_Toc237767762"/>
+      <w:bookmarkStart w:id="46" w:name="_Toc237779823"/>
       <w:r>
         <w:rPr>
           <w:rFonts w:ascii="Georgia" w:hAnsi="Georgia"/>
@@ -21848,7 +21848,7 @@
         <w:pStyle w:val="Ttulo2"/>
         <w:spacing w:before="120" w:after="40"/>
       </w:pPr>
-      <w:bookmarkStart w:id="47" w:name="_Toc237767763"/>
+      <w:bookmarkStart w:id="47" w:name="_Toc237779824"/>
       <w:r>
         <w:rPr>
           <w:rFonts w:ascii="Georgia" w:hAnsi="Georgia"/>
@@ -23405,7 +23405,7 @@
         <w:pStyle w:val="Ttulo1"/>
         <w:spacing w:before="160" w:after="60"/>
       </w:pPr>
-      <w:bookmarkStart w:id="48" w:name="_Toc237767764"/>
+      <w:bookmarkStart w:id="48" w:name="_Toc237779825"/>
       <w:r>
         <w:rPr>
           <w:rFonts w:ascii="Georgia" w:hAnsi="Georgia"/>
@@ -23421,7 +23421,7 @@
         <w:pStyle w:val="Ttulo2"/>
         <w:spacing w:before="120" w:after="40"/>
       </w:pPr>
-      <w:bookmarkStart w:id="49" w:name="_Toc237767765"/>
+      <w:bookmarkStart w:id="49" w:name="_Toc237779826"/>
       <w:r>
         <w:rPr>
           <w:rFonts w:ascii="Georgia" w:hAnsi="Georgia"/>
@@ -23545,7 +23545,7 @@
               </w:rPr>
               <w:lastRenderedPageBreak/>
               <w:drawing>
-                <wp:inline distT="0" distB="0" distL="0" distR="0" wp14:anchorId="25990CCD" wp14:editId="7B8CE445">
+                <wp:inline distT="0" distB="0" distL="0" distR="0" wp14:anchorId="79FA15A5" wp14:editId="0A1D5DEB">
                   <wp:extent cx="3017520" cy="1748097"/>
                   <wp:effectExtent l="0" t="0" r="0" b="0"/>
                   <wp:docPr id="23" name="Picture 23"/>
@@ -23604,7 +23604,7 @@
                 <w:noProof/>
               </w:rPr>
               <w:drawing>
-                <wp:inline distT="0" distB="0" distL="0" distR="0" wp14:anchorId="671E1610" wp14:editId="08414C57">
+                <wp:inline distT="0" distB="0" distL="0" distR="0" wp14:anchorId="23A8C755" wp14:editId="1CF3BBE2">
                   <wp:extent cx="3017520" cy="1621771"/>
                   <wp:effectExtent l="0" t="0" r="0" b="0"/>
                   <wp:docPr id="24" name="Picture 24"/>
@@ -23709,7 +23709,7 @@
         <w:pStyle w:val="Ttulo2"/>
         <w:spacing w:before="120" w:after="40"/>
       </w:pPr>
-      <w:bookmarkStart w:id="50" w:name="_Toc237767766"/>
+      <w:bookmarkStart w:id="50" w:name="_Toc237779827"/>
       <w:r>
         <w:rPr>
           <w:rFonts w:ascii="Georgia" w:hAnsi="Georgia"/>
@@ -24453,7 +24453,7 @@
         <w:pStyle w:val="Ttulo2"/>
         <w:spacing w:before="120" w:after="40"/>
       </w:pPr>
-      <w:bookmarkStart w:id="51" w:name="_Toc237767767"/>
+      <w:bookmarkStart w:id="51" w:name="_Toc237779828"/>
       <w:r>
         <w:rPr>
           <w:rFonts w:ascii="Georgia" w:hAnsi="Georgia"/>
@@ -24514,7 +24514,7 @@
         <w:pStyle w:val="Ttulo2"/>
         <w:spacing w:before="120" w:after="40"/>
       </w:pPr>
-      <w:bookmarkStart w:id="52" w:name="_Toc237767768"/>
+      <w:bookmarkStart w:id="52" w:name="_Toc237779829"/>
       <w:r>
         <w:rPr>
           <w:rFonts w:ascii="Georgia" w:hAnsi="Georgia"/>
@@ -24595,7 +24595,7 @@
                 <w:noProof/>
               </w:rPr>
               <w:drawing>
-                <wp:inline distT="0" distB="0" distL="0" distR="0" wp14:anchorId="4C1A67FE" wp14:editId="2C145291">
+                <wp:inline distT="0" distB="0" distL="0" distR="0" wp14:anchorId="4D7B82D3" wp14:editId="1656BB90">
                   <wp:extent cx="3017520" cy="1749929"/>
                   <wp:effectExtent l="0" t="0" r="0" b="0"/>
                   <wp:docPr id="25" name="Picture 25"/>
@@ -24654,7 +24654,7 @@
                 <w:noProof/>
               </w:rPr>
               <w:drawing>
-                <wp:inline distT="0" distB="0" distL="0" distR="0" wp14:anchorId="22B04F9B" wp14:editId="60EAB95C">
+                <wp:inline distT="0" distB="0" distL="0" distR="0" wp14:anchorId="18662DCD" wp14:editId="22F7C493">
                   <wp:extent cx="3017520" cy="1664532"/>
                   <wp:effectExtent l="0" t="0" r="0" b="0"/>
                   <wp:docPr id="26" name="Picture 26"/>
@@ -25697,7 +25697,7 @@
         <w:pStyle w:val="Ttulo2"/>
         <w:spacing w:before="120" w:after="40"/>
       </w:pPr>
-      <w:bookmarkStart w:id="53" w:name="_Toc237767769"/>
+      <w:bookmarkStart w:id="53" w:name="_Toc237779830"/>
       <w:r>
         <w:rPr>
           <w:rFonts w:ascii="Georgia" w:hAnsi="Georgia"/>
@@ -25755,7 +25755,7 @@
                 <w:noProof/>
               </w:rPr>
               <w:drawing>
-                <wp:inline distT="0" distB="0" distL="0" distR="0" wp14:anchorId="27D5E646" wp14:editId="53EFDBD4">
+                <wp:inline distT="0" distB="0" distL="0" distR="0" wp14:anchorId="163D1099" wp14:editId="3FB28537">
                   <wp:extent cx="3017520" cy="1706444"/>
                   <wp:effectExtent l="0" t="0" r="0" b="0"/>
                   <wp:docPr id="27" name="Picture 27"/>
@@ -25814,7 +25814,7 @@
                 <w:noProof/>
               </w:rPr>
               <w:drawing>
-                <wp:inline distT="0" distB="0" distL="0" distR="0" wp14:anchorId="33D12A09" wp14:editId="7A4662D3">
+                <wp:inline distT="0" distB="0" distL="0" distR="0" wp14:anchorId="3EAD5B55" wp14:editId="1B95A93E">
                   <wp:extent cx="3017520" cy="1751281"/>
                   <wp:effectExtent l="0" t="0" r="0" b="0"/>
                   <wp:docPr id="28" name="Picture 28"/>
@@ -25919,7 +25919,7 @@
         <w:pStyle w:val="Ttulo1"/>
         <w:spacing w:before="160" w:after="60"/>
       </w:pPr>
-      <w:bookmarkStart w:id="54" w:name="_Toc237767770"/>
+      <w:bookmarkStart w:id="54" w:name="_Toc237779831"/>
       <w:r>
         <w:rPr>
           <w:rFonts w:ascii="Georgia" w:hAnsi="Georgia"/>
@@ -25935,7 +25935,7 @@
         <w:pStyle w:val="Ttulo2"/>
         <w:spacing w:before="120" w:after="40"/>
       </w:pPr>
-      <w:bookmarkStart w:id="55" w:name="_Toc237767771"/>
+      <w:bookmarkStart w:id="55" w:name="_Toc237779832"/>
       <w:r>
         <w:rPr>
           <w:rFonts w:ascii="Georgia" w:hAnsi="Georgia"/>
@@ -25996,7 +25996,7 @@
         <w:pStyle w:val="Ttulo2"/>
         <w:spacing w:before="120" w:after="40"/>
       </w:pPr>
-      <w:bookmarkStart w:id="56" w:name="_Toc237767772"/>
+      <w:bookmarkStart w:id="56" w:name="_Toc237779833"/>
       <w:r>
         <w:rPr>
           <w:rFonts w:ascii="Georgia" w:hAnsi="Georgia"/>
@@ -26091,7 +26091,7 @@
                 <w:noProof/>
               </w:rPr>
               <w:drawing>
-                <wp:inline distT="0" distB="0" distL="0" distR="0" wp14:anchorId="794A2465" wp14:editId="2C633EB0">
+                <wp:inline distT="0" distB="0" distL="0" distR="0" wp14:anchorId="578A6F70" wp14:editId="74E1F333">
                   <wp:extent cx="3017520" cy="1701609"/>
                   <wp:effectExtent l="0" t="0" r="0" b="0"/>
                   <wp:docPr id="29" name="Picture 29"/>
@@ -26150,7 +26150,7 @@
                 <w:noProof/>
               </w:rPr>
               <w:drawing>
-                <wp:inline distT="0" distB="0" distL="0" distR="0" wp14:anchorId="7668B37C" wp14:editId="29BA9C2D">
+                <wp:inline distT="0" distB="0" distL="0" distR="0" wp14:anchorId="1B3BF1BA" wp14:editId="65B52C55">
                   <wp:extent cx="3017520" cy="1661546"/>
                   <wp:effectExtent l="0" t="0" r="0" b="0"/>
                   <wp:docPr id="30" name="Picture 30"/>
@@ -26645,7 +26645,7 @@
         <w:pStyle w:val="Ttulo2"/>
         <w:spacing w:before="120" w:after="40"/>
       </w:pPr>
-      <w:bookmarkStart w:id="57" w:name="_Toc237767773"/>
+      <w:bookmarkStart w:id="57" w:name="_Toc237779834"/>
       <w:r>
         <w:rPr>
           <w:rFonts w:ascii="Georgia" w:hAnsi="Georgia"/>
@@ -26722,7 +26722,7 @@
                 <w:noProof/>
               </w:rPr>
               <w:drawing>
-                <wp:inline distT="0" distB="0" distL="0" distR="0" wp14:anchorId="77063533" wp14:editId="4433D0F9">
+                <wp:inline distT="0" distB="0" distL="0" distR="0" wp14:anchorId="7272A8D2" wp14:editId="33C3685E">
                   <wp:extent cx="3017520" cy="1740520"/>
                   <wp:effectExtent l="0" t="0" r="0" b="0"/>
                   <wp:docPr id="31" name="Picture 31"/>
@@ -27317,7 +27317,7 @@
         <w:pStyle w:val="Ttulo2"/>
         <w:spacing w:before="120" w:after="40"/>
       </w:pPr>
-      <w:bookmarkStart w:id="58" w:name="_Toc237767774"/>
+      <w:bookmarkStart w:id="58" w:name="_Toc237779835"/>
       <w:r>
         <w:rPr>
           <w:rFonts w:ascii="Georgia" w:hAnsi="Georgia"/>
@@ -28592,7 +28592,7 @@
         <w:pStyle w:val="Ttulo1"/>
         <w:spacing w:before="160" w:after="60"/>
       </w:pPr>
-      <w:bookmarkStart w:id="59" w:name="_Toc237767775"/>
+      <w:bookmarkStart w:id="59" w:name="_Toc237779836"/>
       <w:r>
         <w:rPr>
           <w:rFonts w:ascii="Georgia" w:hAnsi="Georgia"/>
@@ -28808,7 +28808,7 @@
         <w:pStyle w:val="Ttulo1"/>
         <w:spacing w:before="160" w:after="60"/>
       </w:pPr>
-      <w:bookmarkStart w:id="60" w:name="_Toc237767776"/>
+      <w:bookmarkStart w:id="60" w:name="_Toc237779837"/>
       <w:r>
         <w:rPr>
           <w:rFonts w:ascii="Georgia" w:hAnsi="Georgia"/>
@@ -37655,7 +37655,7 @@
         <w:pStyle w:val="Ttulo1"/>
         <w:spacing w:before="160" w:after="60"/>
       </w:pPr>
-      <w:bookmarkStart w:id="61" w:name="_Toc237767777"/>
+      <w:bookmarkStart w:id="61" w:name="_Toc237779838"/>
       <w:r>
         <w:rPr>
           <w:rFonts w:ascii="Georgia" w:hAnsi="Georgia"/>
@@ -38127,7 +38127,7 @@
         <w:pStyle w:val="Ttulo1"/>
         <w:spacing w:before="160" w:after="60"/>
       </w:pPr>
-      <w:bookmarkStart w:id="62" w:name="_Toc237767778"/>
+      <w:bookmarkStart w:id="62" w:name="_Toc237779839"/>
       <w:r>
         <w:rPr>
           <w:rFonts w:ascii="Georgia" w:hAnsi="Georgia"/>
@@ -38631,31 +38631,31 @@
       </w:rPr>
     </w:lvl>
   </w:abstractNum>
-  <w:num w:numId="1" w16cid:durableId="1171526930">
+  <w:num w:numId="1" w16cid:durableId="662008724">
     <w:abstractNumId w:val="8"/>
   </w:num>
-  <w:num w:numId="2" w16cid:durableId="1719160331">
+  <w:num w:numId="2" w16cid:durableId="2027705978">
     <w:abstractNumId w:val="6"/>
   </w:num>
-  <w:num w:numId="3" w16cid:durableId="1012343941">
+  <w:num w:numId="3" w16cid:durableId="680086900">
     <w:abstractNumId w:val="5"/>
   </w:num>
-  <w:num w:numId="4" w16cid:durableId="1015230547">
+  <w:num w:numId="4" w16cid:durableId="1799686532">
     <w:abstractNumId w:val="4"/>
   </w:num>
-  <w:num w:numId="5" w16cid:durableId="1858881808">
+  <w:num w:numId="5" w16cid:durableId="64645941">
     <w:abstractNumId w:val="7"/>
   </w:num>
-  <w:num w:numId="6" w16cid:durableId="586110915">
+  <w:num w:numId="6" w16cid:durableId="1139955322">
     <w:abstractNumId w:val="3"/>
   </w:num>
-  <w:num w:numId="7" w16cid:durableId="522789342">
+  <w:num w:numId="7" w16cid:durableId="871071078">
     <w:abstractNumId w:val="2"/>
   </w:num>
-  <w:num w:numId="8" w16cid:durableId="270092410">
+  <w:num w:numId="8" w16cid:durableId="1666165">
     <w:abstractNumId w:val="1"/>
   </w:num>
-  <w:num w:numId="9" w16cid:durableId="110318484">
+  <w:num w:numId="9" w16cid:durableId="953748764">
     <w:abstractNumId w:val="0"/>
   </w:num>
 </w:numbering>
@@ -50086,7 +50086,7 @@
     <w:autoRedefine/>
     <w:uiPriority w:val="39"/>
     <w:unhideWhenUsed/>
-    <w:rsid w:val="00E95AC0"/>
+    <w:rsid w:val="006123D8"/>
     <w:pPr>
       <w:spacing w:before="10" w:after="10" w:line="240" w:lineRule="auto"/>
     </w:pPr>
@@ -50101,7 +50101,7 @@
     <w:autoRedefine/>
     <w:uiPriority w:val="39"/>
     <w:unhideWhenUsed/>
-    <w:rsid w:val="00E95AC0"/>
+    <w:rsid w:val="006123D8"/>
     <w:pPr>
       <w:spacing w:after="0" w:line="240" w:lineRule="auto"/>
       <w:ind w:left="180"/>
@@ -50115,7 +50115,7 @@
     <w:basedOn w:val="Fuentedeprrafopredeter"/>
     <w:uiPriority w:val="99"/>
     <w:unhideWhenUsed/>
-    <w:rsid w:val="00E95AC0"/>
+    <w:rsid w:val="006123D8"/>
     <w:rPr>
       <w:color w:val="0000FF" w:themeColor="hyperlink"/>
       <w:u w:val="single"/>

</xml_diff>

<commit_message>
fix: actualizar fecha al 16-ago-2026, eliminar linea lateral de cuadros y dar espaciado perfecto a parametros en Word
</commit_message>
<xml_diff>
--- a/01_Reporte_PDF/Informe_Valuacion_Aluar_UNCuyo.docx
+++ b/01_Reporte_PDF/Informe_Valuacion_Aluar_UNCuyo.docx
@@ -97,7 +97,7 @@
                 <w:sz w:val="17"/>
               </w:rPr>
               <w:br/>
-              <w:t>5 de agosto de 2026</w:t>
+              <w:t>16 de agosto de 2026</w:t>
             </w:r>
           </w:p>
         </w:tc>
@@ -360,14 +360,12 @@
               <w:jc w:val="center"/>
               <w:tblBorders>
                 <w:top w:val="single" w:sz="4" w:space="0" w:color="D1D5DB"/>
-                <w:left w:val="single" w:sz="20" w:space="0" w:color="0D233A"/>
                 <w:bottom w:val="single" w:sz="4" w:space="0" w:color="D1D5DB"/>
-                <w:right w:val="single" w:sz="4" w:space="0" w:color="D1D5DB"/>
               </w:tblBorders>
               <w:tblLook w:val="04A0" w:firstRow="1" w:lastRow="0" w:firstColumn="1" w:lastColumn="0" w:noHBand="0" w:noVBand="1"/>
             </w:tblPr>
             <w:tblGrid>
-              <w:gridCol w:w="4872"/>
+              <w:gridCol w:w="4902"/>
             </w:tblGrid>
             <w:tr>
               <w:trPr>
@@ -378,10 +376,10 @@
                   <w:tcW w:w="4932" w:type="dxa"/>
                   <w:shd w:val="clear" w:color="auto" w:fill="F8FAFC"/>
                   <w:tcMar>
-                    <w:top w:w="20" w:type="dxa"/>
-                    <w:left w:w="30" w:type="dxa"/>
-                    <w:bottom w:w="20" w:type="dxa"/>
-                    <w:right w:w="30" w:type="dxa"/>
+                    <w:top w:w="28" w:type="dxa"/>
+                    <w:left w:w="40" w:type="dxa"/>
+                    <w:bottom w:w="28" w:type="dxa"/>
+                    <w:right w:w="40" w:type="dxa"/>
                   </w:tcMar>
                 </w:tcPr>
                 <w:p>
@@ -516,13 +514,14 @@
                   <w:tblPr>
                     <w:tblW w:w="0" w:type="auto"/>
                     <w:jc w:val="center"/>
+                    <w:tblLayout w:type="fixed"/>
                     <w:tblLook w:val="04A0" w:firstRow="1" w:lastRow="0" w:firstColumn="1" w:lastColumn="0" w:noHBand="0" w:noVBand="1"/>
                   </w:tblPr>
                   <w:tblGrid>
-                    <w:gridCol w:w="1212"/>
-                    <w:gridCol w:w="1196"/>
-                    <w:gridCol w:w="1208"/>
-                    <w:gridCol w:w="1196"/>
+                    <w:gridCol w:w="1512"/>
+                    <w:gridCol w:w="792"/>
+                    <w:gridCol w:w="1584"/>
+                    <w:gridCol w:w="720"/>
                   </w:tblGrid>
                   <w:tr>
                     <w:trPr>
@@ -530,12 +529,12 @@
                     </w:trPr>
                     <w:tc>
                       <w:tcPr>
-                        <w:tcW w:w="1233" w:type="dxa"/>
+                        <w:tcW w:w="1512" w:type="dxa"/>
                         <w:tcMar>
-                          <w:top w:w="3" w:type="dxa"/>
-                          <w:left w:w="2" w:type="dxa"/>
-                          <w:bottom w:w="3" w:type="dxa"/>
-                          <w:right w:w="2" w:type="dxa"/>
+                          <w:top w:w="2" w:type="dxa"/>
+                          <w:left w:w="1" w:type="dxa"/>
+                          <w:bottom w:w="2" w:type="dxa"/>
+                          <w:right w:w="1" w:type="dxa"/>
                         </w:tcMar>
                       </w:tcPr>
                       <w:p>
@@ -549,7 +548,7 @@
                           <w:rPr>
                             <w:b/>
                             <w:color w:val="0D233A"/>
-                            <w:sz w:val="14"/>
+                            <w:sz w:val="13"/>
                           </w:rPr>
                           <w:t>WACC:</w:t>
                         </w:r>
@@ -557,12 +556,12 @@
                     </w:tc>
                     <w:tc>
                       <w:tcPr>
-                        <w:tcW w:w="1233" w:type="dxa"/>
+                        <w:tcW w:w="792" w:type="dxa"/>
                         <w:tcMar>
-                          <w:top w:w="3" w:type="dxa"/>
-                          <w:left w:w="2" w:type="dxa"/>
-                          <w:bottom w:w="3" w:type="dxa"/>
-                          <w:right w:w="2" w:type="dxa"/>
+                          <w:top w:w="2" w:type="dxa"/>
+                          <w:left w:w="1" w:type="dxa"/>
+                          <w:bottom w:w="2" w:type="dxa"/>
+                          <w:right w:w="1" w:type="dxa"/>
                         </w:tcMar>
                       </w:tcPr>
                       <w:p>
@@ -575,7 +574,7 @@
                         </w:pPr>
                         <w:r>
                           <w:rPr>
-                            <w:sz w:val="14"/>
+                            <w:sz w:val="13"/>
                           </w:rPr>
                           <w:t>7,06%</w:t>
                         </w:r>
@@ -583,12 +582,12 @@
                     </w:tc>
                     <w:tc>
                       <w:tcPr>
-                        <w:tcW w:w="1233" w:type="dxa"/>
+                        <w:tcW w:w="1584" w:type="dxa"/>
                         <w:tcMar>
-                          <w:top w:w="3" w:type="dxa"/>
-                          <w:left w:w="2" w:type="dxa"/>
-                          <w:bottom w:w="3" w:type="dxa"/>
-                          <w:right w:w="2" w:type="dxa"/>
+                          <w:top w:w="2" w:type="dxa"/>
+                          <w:left w:w="1" w:type="dxa"/>
+                          <w:bottom w:w="2" w:type="dxa"/>
+                          <w:right w:w="1" w:type="dxa"/>
                         </w:tcMar>
                       </w:tcPr>
                       <w:p>
@@ -602,7 +601,7 @@
                           <w:rPr>
                             <w:b/>
                             <w:color w:val="0D233A"/>
-                            <w:sz w:val="14"/>
+                            <w:sz w:val="13"/>
                           </w:rPr>
                           <w:t>Ke (λ = 0,20):</w:t>
                         </w:r>
@@ -610,12 +609,12 @@
                     </w:tc>
                     <w:tc>
                       <w:tcPr>
-                        <w:tcW w:w="1233" w:type="dxa"/>
+                        <w:tcW w:w="720" w:type="dxa"/>
                         <w:tcMar>
-                          <w:top w:w="3" w:type="dxa"/>
-                          <w:left w:w="2" w:type="dxa"/>
-                          <w:bottom w:w="3" w:type="dxa"/>
-                          <w:right w:w="2" w:type="dxa"/>
+                          <w:top w:w="2" w:type="dxa"/>
+                          <w:left w:w="1" w:type="dxa"/>
+                          <w:bottom w:w="2" w:type="dxa"/>
+                          <w:right w:w="1" w:type="dxa"/>
                         </w:tcMar>
                       </w:tcPr>
                       <w:p>
@@ -628,7 +627,7 @@
                         </w:pPr>
                         <w:r>
                           <w:rPr>
-                            <w:sz w:val="14"/>
+                            <w:sz w:val="13"/>
                           </w:rPr>
                           <w:t>9,30%</w:t>
                         </w:r>
@@ -641,12 +640,12 @@
                     </w:trPr>
                     <w:tc>
                       <w:tcPr>
-                        <w:tcW w:w="1233" w:type="dxa"/>
+                        <w:tcW w:w="1512" w:type="dxa"/>
                         <w:tcMar>
-                          <w:top w:w="3" w:type="dxa"/>
-                          <w:left w:w="2" w:type="dxa"/>
-                          <w:bottom w:w="3" w:type="dxa"/>
-                          <w:right w:w="2" w:type="dxa"/>
+                          <w:top w:w="2" w:type="dxa"/>
+                          <w:left w:w="1" w:type="dxa"/>
+                          <w:bottom w:w="2" w:type="dxa"/>
+                          <w:right w:w="1" w:type="dxa"/>
                         </w:tcMar>
                       </w:tcPr>
                       <w:p>
@@ -660,7 +659,7 @@
                           <w:rPr>
                             <w:b/>
                             <w:color w:val="0D233A"/>
-                            <w:sz w:val="14"/>
+                            <w:sz w:val="13"/>
                           </w:rPr>
                           <w:t>Beta (Hamada):</w:t>
                         </w:r>
@@ -668,12 +667,12 @@
                     </w:tc>
                     <w:tc>
                       <w:tcPr>
-                        <w:tcW w:w="1233" w:type="dxa"/>
+                        <w:tcW w:w="792" w:type="dxa"/>
                         <w:tcMar>
-                          <w:top w:w="3" w:type="dxa"/>
-                          <w:left w:w="2" w:type="dxa"/>
-                          <w:bottom w:w="3" w:type="dxa"/>
-                          <w:right w:w="2" w:type="dxa"/>
+                          <w:top w:w="2" w:type="dxa"/>
+                          <w:left w:w="1" w:type="dxa"/>
+                          <w:bottom w:w="2" w:type="dxa"/>
+                          <w:right w:w="1" w:type="dxa"/>
                         </w:tcMar>
                       </w:tcPr>
                       <w:p>
@@ -686,7 +685,7 @@
                         </w:pPr>
                         <w:r>
                           <w:rPr>
-                            <w:sz w:val="14"/>
+                            <w:sz w:val="13"/>
                           </w:rPr>
                           <w:t>0,888</w:t>
                         </w:r>
@@ -694,12 +693,12 @@
                     </w:tc>
                     <w:tc>
                       <w:tcPr>
-                        <w:tcW w:w="1233" w:type="dxa"/>
+                        <w:tcW w:w="1584" w:type="dxa"/>
                         <w:tcMar>
-                          <w:top w:w="3" w:type="dxa"/>
-                          <w:left w:w="2" w:type="dxa"/>
-                          <w:bottom w:w="3" w:type="dxa"/>
-                          <w:right w:w="2" w:type="dxa"/>
+                          <w:top w:w="2" w:type="dxa"/>
+                          <w:left w:w="1" w:type="dxa"/>
+                          <w:bottom w:w="2" w:type="dxa"/>
+                          <w:right w:w="1" w:type="dxa"/>
                         </w:tcMar>
                       </w:tcPr>
                       <w:p>
@@ -713,7 +712,7 @@
                           <w:rPr>
                             <w:b/>
                             <w:color w:val="0D233A"/>
-                            <w:sz w:val="14"/>
+                            <w:sz w:val="13"/>
                           </w:rPr>
                           <w:t>ERP:</w:t>
                         </w:r>
@@ -721,12 +720,12 @@
                     </w:tc>
                     <w:tc>
                       <w:tcPr>
-                        <w:tcW w:w="1233" w:type="dxa"/>
+                        <w:tcW w:w="720" w:type="dxa"/>
                         <w:tcMar>
-                          <w:top w:w="3" w:type="dxa"/>
-                          <w:left w:w="2" w:type="dxa"/>
-                          <w:bottom w:w="3" w:type="dxa"/>
-                          <w:right w:w="2" w:type="dxa"/>
+                          <w:top w:w="2" w:type="dxa"/>
+                          <w:left w:w="1" w:type="dxa"/>
+                          <w:bottom w:w="2" w:type="dxa"/>
+                          <w:right w:w="1" w:type="dxa"/>
                         </w:tcMar>
                       </w:tcPr>
                       <w:p>
@@ -739,7 +738,7 @@
                         </w:pPr>
                         <w:r>
                           <w:rPr>
-                            <w:sz w:val="14"/>
+                            <w:sz w:val="13"/>
                           </w:rPr>
                           <w:t>4,18%</w:t>
                         </w:r>
@@ -752,12 +751,12 @@
                     </w:trPr>
                     <w:tc>
                       <w:tcPr>
-                        <w:tcW w:w="1233" w:type="dxa"/>
+                        <w:tcW w:w="1512" w:type="dxa"/>
                         <w:tcMar>
-                          <w:top w:w="3" w:type="dxa"/>
-                          <w:left w:w="2" w:type="dxa"/>
-                          <w:bottom w:w="3" w:type="dxa"/>
-                          <w:right w:w="2" w:type="dxa"/>
+                          <w:top w:w="2" w:type="dxa"/>
+                          <w:left w:w="1" w:type="dxa"/>
+                          <w:bottom w:w="2" w:type="dxa"/>
+                          <w:right w:w="1" w:type="dxa"/>
                         </w:tcMar>
                       </w:tcPr>
                       <w:p>
@@ -771,7 +770,7 @@
                           <w:rPr>
                             <w:b/>
                             <w:color w:val="0D233A"/>
-                            <w:sz w:val="14"/>
+                            <w:sz w:val="13"/>
                           </w:rPr>
                           <w:t>Prima País (λ):</w:t>
                         </w:r>
@@ -779,12 +778,12 @@
                     </w:tc>
                     <w:tc>
                       <w:tcPr>
-                        <w:tcW w:w="1233" w:type="dxa"/>
+                        <w:tcW w:w="792" w:type="dxa"/>
                         <w:tcMar>
-                          <w:top w:w="3" w:type="dxa"/>
-                          <w:left w:w="2" w:type="dxa"/>
-                          <w:bottom w:w="3" w:type="dxa"/>
-                          <w:right w:w="2" w:type="dxa"/>
+                          <w:top w:w="2" w:type="dxa"/>
+                          <w:left w:w="1" w:type="dxa"/>
+                          <w:bottom w:w="2" w:type="dxa"/>
+                          <w:right w:w="1" w:type="dxa"/>
                         </w:tcMar>
                       </w:tcPr>
                       <w:p>
@@ -797,7 +796,7 @@
                         </w:pPr>
                         <w:r>
                           <w:rPr>
-                            <w:sz w:val="14"/>
+                            <w:sz w:val="13"/>
                           </w:rPr>
                           <w:t>0,88%</w:t>
                         </w:r>
@@ -805,12 +804,12 @@
                     </w:tc>
                     <w:tc>
                       <w:tcPr>
-                        <w:tcW w:w="1233" w:type="dxa"/>
+                        <w:tcW w:w="1584" w:type="dxa"/>
                         <w:tcMar>
-                          <w:top w:w="3" w:type="dxa"/>
-                          <w:left w:w="2" w:type="dxa"/>
-                          <w:bottom w:w="3" w:type="dxa"/>
-                          <w:right w:w="2" w:type="dxa"/>
+                          <w:top w:w="2" w:type="dxa"/>
+                          <w:left w:w="1" w:type="dxa"/>
+                          <w:bottom w:w="2" w:type="dxa"/>
+                          <w:right w:w="1" w:type="dxa"/>
                         </w:tcMar>
                       </w:tcPr>
                       <w:p>
@@ -824,7 +823,7 @@
                           <w:rPr>
                             <w:b/>
                             <w:color w:val="0D233A"/>
-                            <w:sz w:val="14"/>
+                            <w:sz w:val="13"/>
                           </w:rPr>
                           <w:t>Kd post-imp.:</w:t>
                         </w:r>
@@ -832,12 +831,12 @@
                     </w:tc>
                     <w:tc>
                       <w:tcPr>
-                        <w:tcW w:w="1233" w:type="dxa"/>
+                        <w:tcW w:w="720" w:type="dxa"/>
                         <w:tcMar>
-                          <w:top w:w="3" w:type="dxa"/>
-                          <w:left w:w="2" w:type="dxa"/>
-                          <w:bottom w:w="3" w:type="dxa"/>
-                          <w:right w:w="2" w:type="dxa"/>
+                          <w:top w:w="2" w:type="dxa"/>
+                          <w:left w:w="1" w:type="dxa"/>
+                          <w:bottom w:w="2" w:type="dxa"/>
+                          <w:right w:w="1" w:type="dxa"/>
                         </w:tcMar>
                       </w:tcPr>
                       <w:p>
@@ -850,7 +849,7 @@
                         </w:pPr>
                         <w:r>
                           <w:rPr>
-                            <w:sz w:val="14"/>
+                            <w:sz w:val="13"/>
                           </w:rPr>
                           <w:t>2,47%</w:t>
                         </w:r>
@@ -863,12 +862,12 @@
                     </w:trPr>
                     <w:tc>
                       <w:tcPr>
-                        <w:tcW w:w="1233" w:type="dxa"/>
+                        <w:tcW w:w="1512" w:type="dxa"/>
                         <w:tcMar>
-                          <w:top w:w="3" w:type="dxa"/>
-                          <w:left w:w="2" w:type="dxa"/>
-                          <w:bottom w:w="3" w:type="dxa"/>
-                          <w:right w:w="2" w:type="dxa"/>
+                          <w:top w:w="2" w:type="dxa"/>
+                          <w:left w:w="1" w:type="dxa"/>
+                          <w:bottom w:w="2" w:type="dxa"/>
+                          <w:right w:w="1" w:type="dxa"/>
                         </w:tcMar>
                       </w:tcPr>
                       <w:p>
@@ -882,7 +881,7 @@
                           <w:rPr>
                             <w:b/>
                             <w:color w:val="0D233A"/>
-                            <w:sz w:val="14"/>
+                            <w:sz w:val="13"/>
                           </w:rPr>
                           <w:t>Estructura D/E:</w:t>
                         </w:r>
@@ -890,12 +889,12 @@
                     </w:tc>
                     <w:tc>
                       <w:tcPr>
-                        <w:tcW w:w="1233" w:type="dxa"/>
+                        <w:tcW w:w="792" w:type="dxa"/>
                         <w:tcMar>
-                          <w:top w:w="3" w:type="dxa"/>
-                          <w:left w:w="2" w:type="dxa"/>
-                          <w:bottom w:w="3" w:type="dxa"/>
-                          <w:right w:w="2" w:type="dxa"/>
+                          <w:top w:w="2" w:type="dxa"/>
+                          <w:left w:w="1" w:type="dxa"/>
+                          <w:bottom w:w="2" w:type="dxa"/>
+                          <w:right w:w="1" w:type="dxa"/>
                         </w:tcMar>
                       </w:tcPr>
                       <w:p>
@@ -908,7 +907,7 @@
                         </w:pPr>
                         <w:r>
                           <w:rPr>
-                            <w:sz w:val="14"/>
+                            <w:sz w:val="13"/>
                           </w:rPr>
                           <w:t>0,486</w:t>
                         </w:r>
@@ -916,12 +915,12 @@
                     </w:tc>
                     <w:tc>
                       <w:tcPr>
-                        <w:tcW w:w="1233" w:type="dxa"/>
+                        <w:tcW w:w="1584" w:type="dxa"/>
                         <w:tcMar>
-                          <w:top w:w="3" w:type="dxa"/>
-                          <w:left w:w="2" w:type="dxa"/>
-                          <w:bottom w:w="3" w:type="dxa"/>
-                          <w:right w:w="2" w:type="dxa"/>
+                          <w:top w:w="2" w:type="dxa"/>
+                          <w:left w:w="1" w:type="dxa"/>
+                          <w:bottom w:w="2" w:type="dxa"/>
+                          <w:right w:w="1" w:type="dxa"/>
                         </w:tcMar>
                       </w:tcPr>
                       <w:p>
@@ -935,7 +934,7 @@
                           <w:rPr>
                             <w:b/>
                             <w:color w:val="0D233A"/>
-                            <w:sz w:val="14"/>
+                            <w:sz w:val="13"/>
                           </w:rPr>
                           <w:t>Crec. Terminal (g):</w:t>
                         </w:r>
@@ -943,12 +942,12 @@
                     </w:tc>
                     <w:tc>
                       <w:tcPr>
-                        <w:tcW w:w="1233" w:type="dxa"/>
+                        <w:tcW w:w="720" w:type="dxa"/>
                         <w:tcMar>
-                          <w:top w:w="3" w:type="dxa"/>
-                          <w:left w:w="2" w:type="dxa"/>
-                          <w:bottom w:w="3" w:type="dxa"/>
-                          <w:right w:w="2" w:type="dxa"/>
+                          <w:top w:w="2" w:type="dxa"/>
+                          <w:left w:w="1" w:type="dxa"/>
+                          <w:bottom w:w="2" w:type="dxa"/>
+                          <w:right w:w="1" w:type="dxa"/>
                         </w:tcMar>
                       </w:tcPr>
                       <w:p>
@@ -961,7 +960,7 @@
                         </w:pPr>
                         <w:r>
                           <w:rPr>
-                            <w:sz w:val="14"/>
+                            <w:sz w:val="13"/>
                           </w:rPr>
                           <w:t>2,00%</w:t>
                         </w:r>
@@ -974,13 +973,13 @@
                     </w:trPr>
                     <w:tc>
                       <w:tcPr>
-                        <w:tcW w:w="2466" w:type="dxa"/>
+                        <w:tcW w:w="2304" w:type="dxa"/>
                         <w:gridSpan w:val="2"/>
                         <w:tcMar>
-                          <w:top w:w="3" w:type="dxa"/>
-                          <w:left w:w="2" w:type="dxa"/>
-                          <w:bottom w:w="3" w:type="dxa"/>
-                          <w:right w:w="2" w:type="dxa"/>
+                          <w:top w:w="2" w:type="dxa"/>
+                          <w:left w:w="1" w:type="dxa"/>
+                          <w:bottom w:w="2" w:type="dxa"/>
+                          <w:right w:w="1" w:type="dxa"/>
                         </w:tcMar>
                       </w:tcPr>
                       <w:p>
@@ -994,7 +993,7 @@
                           <w:rPr>
                             <w:b/>
                             <w:color w:val="0D233A"/>
-                            <w:sz w:val="14"/>
+                            <w:sz w:val="13"/>
                           </w:rPr>
                           <w:t>Potencial Base / Int.:</w:t>
                         </w:r>
@@ -1002,13 +1001,13 @@
                     </w:tc>
                     <w:tc>
                       <w:tcPr>
-                        <w:tcW w:w="2466" w:type="dxa"/>
+                        <w:tcW w:w="2304" w:type="dxa"/>
                         <w:gridSpan w:val="2"/>
                         <w:tcMar>
-                          <w:top w:w="3" w:type="dxa"/>
-                          <w:left w:w="2" w:type="dxa"/>
-                          <w:bottom w:w="3" w:type="dxa"/>
-                          <w:right w:w="2" w:type="dxa"/>
+                          <w:top w:w="2" w:type="dxa"/>
+                          <w:left w:w="1" w:type="dxa"/>
+                          <w:bottom w:w="2" w:type="dxa"/>
+                          <w:right w:w="1" w:type="dxa"/>
                         </w:tcMar>
                       </w:tcPr>
                       <w:p>
@@ -1022,7 +1021,7 @@
                         <w:r>
                           <w:rPr>
                             <w:b/>
-                            <w:sz w:val="14"/>
+                            <w:sz w:val="13"/>
                           </w:rPr>
                           <w:t>+25,8% / +27,8%</w:t>
                         </w:r>
@@ -1035,13 +1034,13 @@
                     </w:trPr>
                     <w:tc>
                       <w:tcPr>
-                        <w:tcW w:w="2466" w:type="dxa"/>
+                        <w:tcW w:w="2304" w:type="dxa"/>
                         <w:gridSpan w:val="2"/>
                         <w:tcMar>
-                          <w:top w:w="3" w:type="dxa"/>
-                          <w:left w:w="2" w:type="dxa"/>
-                          <w:bottom w:w="3" w:type="dxa"/>
-                          <w:right w:w="2" w:type="dxa"/>
+                          <w:top w:w="2" w:type="dxa"/>
+                          <w:left w:w="1" w:type="dxa"/>
+                          <w:bottom w:w="2" w:type="dxa"/>
+                          <w:right w:w="1" w:type="dxa"/>
                         </w:tcMar>
                       </w:tcPr>
                       <w:p>
@@ -1055,7 +1054,7 @@
                           <w:rPr>
                             <w:b/>
                             <w:color w:val="0D233A"/>
-                            <w:sz w:val="14"/>
+                            <w:sz w:val="13"/>
                           </w:rPr>
                           <w:t>CCL Implícito:</w:t>
                         </w:r>
@@ -1063,13 +1062,13 @@
                     </w:tc>
                     <w:tc>
                       <w:tcPr>
-                        <w:tcW w:w="2466" w:type="dxa"/>
+                        <w:tcW w:w="2304" w:type="dxa"/>
                         <w:gridSpan w:val="2"/>
                         <w:tcMar>
-                          <w:top w:w="3" w:type="dxa"/>
-                          <w:left w:w="2" w:type="dxa"/>
-                          <w:bottom w:w="3" w:type="dxa"/>
-                          <w:right w:w="2" w:type="dxa"/>
+                          <w:top w:w="2" w:type="dxa"/>
+                          <w:left w:w="1" w:type="dxa"/>
+                          <w:bottom w:w="2" w:type="dxa"/>
+                          <w:right w:w="1" w:type="dxa"/>
                         </w:tcMar>
                       </w:tcPr>
                       <w:p>
@@ -1082,7 +1081,7 @@
                         </w:pPr>
                         <w:r>
                           <w:rPr>
-                            <w:sz w:val="14"/>
+                            <w:sz w:val="13"/>
                           </w:rPr>
                           <w:t>1.584,25</w:t>
                         </w:r>
@@ -1119,7 +1118,7 @@
                       <w:color w:val="4A4A4A"/>
                       <w:sz w:val="13"/>
                     </w:rPr>
-                    <w:t xml:space="preserve"> Valuación fundamental según metodología de Dumrauf (Cap. 14) con CRP = λ × EMBI+ y Opción Real por mínimos cuadrados de Longstaff-Schwartz. Datos al 23-jul-2026.</w:t>
+                    <w:t xml:space="preserve"> Valuación fundamental según metodología de Dumrauf (Cap. 14) con CRP = λ × EMBI+ y Opción Real por mínimos cuadrados de Longstaff-Schwartz. Datos al 16-ago-2026.</w:t>
                   </w:r>
                 </w:p>
               </w:tc>
@@ -1149,9 +1148,7 @@
         <w:jc w:val="center"/>
         <w:tblBorders>
           <w:top w:val="single" w:sz="4" w:space="0" w:color="D1D5DB"/>
-          <w:left w:val="single" w:sz="20" w:space="0" w:color="1E3A8A"/>
           <w:bottom w:val="single" w:sz="4" w:space="0" w:color="D1D5DB"/>
-          <w:right w:val="single" w:sz="4" w:space="0" w:color="D1D5DB"/>
         </w:tblBorders>
         <w:tblLook w:val="04A0" w:firstRow="1" w:lastRow="0" w:firstColumn="1" w:lastColumn="0" w:noHBand="0" w:noVBand="1"/>
       </w:tblPr>
@@ -1311,9 +1308,7 @@
         <w:jc w:val="center"/>
         <w:tblBorders>
           <w:top w:val="single" w:sz="4" w:space="0" w:color="D1D5DB"/>
-          <w:left w:val="single" w:sz="20" w:space="0" w:color="0D233A"/>
           <w:bottom w:val="single" w:sz="4" w:space="0" w:color="D1D5DB"/>
-          <w:right w:val="single" w:sz="4" w:space="0" w:color="D1D5DB"/>
         </w:tblBorders>
         <w:tblLook w:val="04A0" w:firstRow="1" w:lastRow="0" w:firstColumn="1" w:lastColumn="0" w:noHBand="0" w:noVBand="1"/>
       </w:tblPr>
@@ -1510,7 +1505,7 @@
           <w:color w:val="4A4A4A"/>
           <w:sz w:val="15"/>
         </w:rPr>
-        <w:t xml:space="preserve"> Elaborado en Mendoza, Argentina. Fecha de cierre de datos y modelos: 23 de julio de 2026. Publicación oficial: 5 de agosto de 2026. Contacto técnico: federico.chillon@fce.uncu.edu.ar.</w:t>
+        <w:t xml:space="preserve"> Elaborado en Mendoza, Argentina. Fecha de cierre de datos y modelos: 16 de agosto de 2026. Publicación oficial: 16 de agosto de 2026. Contacto técnico: federico.chillon@fce.uncu.edu.ar.</w:t>
       </w:r>
     </w:p>
     <w:p>
@@ -1565,7 +1560,7 @@
         <w:fldChar w:fldCharType="begin"/>
       </w:r>
       <w:r>
-        <w:instrText>TOC \o "1-2" \h \z \u</w:instrText>
+        <w:instrText xml:space="preserve"> TOC \o "1-2" \h \z \u </w:instrText>
       </w:r>
       <w:r>
         <w:rPr>
@@ -1573,7 +1568,7 @@
         </w:rPr>
         <w:fldChar w:fldCharType="separate"/>
       </w:r>
-      <w:hyperlink w:anchor="_Toc237779777" w:history="1">
+      <w:hyperlink w:anchor="_Toc237782184" w:history="1">
         <w:r>
           <w:rPr>
             <w:rStyle w:val="Hipervnculo"/>
@@ -1600,7 +1595,7 @@
             <w:noProof/>
             <w:webHidden/>
           </w:rPr>
-          <w:instrText xml:space="preserve"> PAGEREF _Toc237779777 \h </w:instrText>
+          <w:instrText xml:space="preserve"> PAGEREF _Toc237782184 \h </w:instrText>
         </w:r>
         <w:r>
           <w:rPr>
@@ -1647,7 +1642,7 @@
           <w14:ligatures w14:val="standardContextual"/>
         </w:rPr>
       </w:pPr>
-      <w:hyperlink w:anchor="_Toc237779778" w:history="1">
+      <w:hyperlink w:anchor="_Toc237782185" w:history="1">
         <w:r>
           <w:rPr>
             <w:rStyle w:val="Hipervnculo"/>
@@ -1674,7 +1669,7 @@
             <w:noProof/>
             <w:webHidden/>
           </w:rPr>
-          <w:instrText xml:space="preserve"> PAGEREF _Toc237779778 \h </w:instrText>
+          <w:instrText xml:space="preserve"> PAGEREF _Toc237782185 \h </w:instrText>
         </w:r>
         <w:r>
           <w:rPr>
@@ -1721,7 +1716,7 @@
           <w14:ligatures w14:val="standardContextual"/>
         </w:rPr>
       </w:pPr>
-      <w:hyperlink w:anchor="_Toc237779779" w:history="1">
+      <w:hyperlink w:anchor="_Toc237782186" w:history="1">
         <w:r>
           <w:rPr>
             <w:rStyle w:val="Hipervnculo"/>
@@ -1748,7 +1743,7 @@
             <w:noProof/>
             <w:webHidden/>
           </w:rPr>
-          <w:instrText xml:space="preserve"> PAGEREF _Toc237779779 \h </w:instrText>
+          <w:instrText xml:space="preserve"> PAGEREF _Toc237782186 \h </w:instrText>
         </w:r>
         <w:r>
           <w:rPr>
@@ -1795,7 +1790,7 @@
           <w14:ligatures w14:val="standardContextual"/>
         </w:rPr>
       </w:pPr>
-      <w:hyperlink w:anchor="_Toc237779780" w:history="1">
+      <w:hyperlink w:anchor="_Toc237782187" w:history="1">
         <w:r>
           <w:rPr>
             <w:rStyle w:val="Hipervnculo"/>
@@ -1822,7 +1817,7 @@
             <w:noProof/>
             <w:webHidden/>
           </w:rPr>
-          <w:instrText xml:space="preserve"> PAGEREF _Toc237779780 \h </w:instrText>
+          <w:instrText xml:space="preserve"> PAGEREF _Toc237782187 \h </w:instrText>
         </w:r>
         <w:r>
           <w:rPr>
@@ -1869,7 +1864,7 @@
           <w14:ligatures w14:val="standardContextual"/>
         </w:rPr>
       </w:pPr>
-      <w:hyperlink w:anchor="_Toc237779781" w:history="1">
+      <w:hyperlink w:anchor="_Toc237782188" w:history="1">
         <w:r>
           <w:rPr>
             <w:rStyle w:val="Hipervnculo"/>
@@ -1896,7 +1891,7 @@
             <w:noProof/>
             <w:webHidden/>
           </w:rPr>
-          <w:instrText xml:space="preserve"> PAGEREF _Toc237779781 \h </w:instrText>
+          <w:instrText xml:space="preserve"> PAGEREF _Toc237782188 \h </w:instrText>
         </w:r>
         <w:r>
           <w:rPr>
@@ -1943,7 +1938,7 @@
           <w14:ligatures w14:val="standardContextual"/>
         </w:rPr>
       </w:pPr>
-      <w:hyperlink w:anchor="_Toc237779782" w:history="1">
+      <w:hyperlink w:anchor="_Toc237782189" w:history="1">
         <w:r>
           <w:rPr>
             <w:rStyle w:val="Hipervnculo"/>
@@ -1970,7 +1965,7 @@
             <w:noProof/>
             <w:webHidden/>
           </w:rPr>
-          <w:instrText xml:space="preserve"> PAGEREF _Toc237779782 \h </w:instrText>
+          <w:instrText xml:space="preserve"> PAGEREF _Toc237782189 \h </w:instrText>
         </w:r>
         <w:r>
           <w:rPr>
@@ -2017,7 +2012,7 @@
           <w14:ligatures w14:val="standardContextual"/>
         </w:rPr>
       </w:pPr>
-      <w:hyperlink w:anchor="_Toc237779783" w:history="1">
+      <w:hyperlink w:anchor="_Toc237782190" w:history="1">
         <w:r>
           <w:rPr>
             <w:rStyle w:val="Hipervnculo"/>
@@ -2044,7 +2039,7 @@
             <w:noProof/>
             <w:webHidden/>
           </w:rPr>
-          <w:instrText xml:space="preserve"> PAGEREF _Toc237779783 \h </w:instrText>
+          <w:instrText xml:space="preserve"> PAGEREF _Toc237782190 \h </w:instrText>
         </w:r>
         <w:r>
           <w:rPr>
@@ -2091,7 +2086,7 @@
           <w14:ligatures w14:val="standardContextual"/>
         </w:rPr>
       </w:pPr>
-      <w:hyperlink w:anchor="_Toc237779784" w:history="1">
+      <w:hyperlink w:anchor="_Toc237782191" w:history="1">
         <w:r>
           <w:rPr>
             <w:rStyle w:val="Hipervnculo"/>
@@ -2118,7 +2113,7 @@
             <w:noProof/>
             <w:webHidden/>
           </w:rPr>
-          <w:instrText xml:space="preserve"> PAGEREF _Toc237779784 \h </w:instrText>
+          <w:instrText xml:space="preserve"> PAGEREF _Toc237782191 \h </w:instrText>
         </w:r>
         <w:r>
           <w:rPr>
@@ -2165,7 +2160,7 @@
           <w14:ligatures w14:val="standardContextual"/>
         </w:rPr>
       </w:pPr>
-      <w:hyperlink w:anchor="_Toc237779785" w:history="1">
+      <w:hyperlink w:anchor="_Toc237782192" w:history="1">
         <w:r>
           <w:rPr>
             <w:rStyle w:val="Hipervnculo"/>
@@ -2192,7 +2187,7 @@
             <w:noProof/>
             <w:webHidden/>
           </w:rPr>
-          <w:instrText xml:space="preserve"> PAGEREF _Toc237779785 \h </w:instrText>
+          <w:instrText xml:space="preserve"> PAGEREF _Toc237782192 \h </w:instrText>
         </w:r>
         <w:r>
           <w:rPr>
@@ -2239,7 +2234,7 @@
           <w14:ligatures w14:val="standardContextual"/>
         </w:rPr>
       </w:pPr>
-      <w:hyperlink w:anchor="_Toc237779786" w:history="1">
+      <w:hyperlink w:anchor="_Toc237782193" w:history="1">
         <w:r>
           <w:rPr>
             <w:rStyle w:val="Hipervnculo"/>
@@ -2266,7 +2261,7 @@
             <w:noProof/>
             <w:webHidden/>
           </w:rPr>
-          <w:instrText xml:space="preserve"> PAGEREF _Toc237779786 \h </w:instrText>
+          <w:instrText xml:space="preserve"> PAGEREF _Toc237782193 \h </w:instrText>
         </w:r>
         <w:r>
           <w:rPr>
@@ -2313,7 +2308,7 @@
           <w14:ligatures w14:val="standardContextual"/>
         </w:rPr>
       </w:pPr>
-      <w:hyperlink w:anchor="_Toc237779787" w:history="1">
+      <w:hyperlink w:anchor="_Toc237782194" w:history="1">
         <w:r>
           <w:rPr>
             <w:rStyle w:val="Hipervnculo"/>
@@ -2340,7 +2335,7 @@
             <w:noProof/>
             <w:webHidden/>
           </w:rPr>
-          <w:instrText xml:space="preserve"> PAGEREF _Toc237779787 \h </w:instrText>
+          <w:instrText xml:space="preserve"> PAGEREF _Toc237782194 \h </w:instrText>
         </w:r>
         <w:r>
           <w:rPr>
@@ -2387,7 +2382,7 @@
           <w14:ligatures w14:val="standardContextual"/>
         </w:rPr>
       </w:pPr>
-      <w:hyperlink w:anchor="_Toc237779788" w:history="1">
+      <w:hyperlink w:anchor="_Toc237782195" w:history="1">
         <w:r>
           <w:rPr>
             <w:rStyle w:val="Hipervnculo"/>
@@ -2414,7 +2409,7 @@
             <w:noProof/>
             <w:webHidden/>
           </w:rPr>
-          <w:instrText xml:space="preserve"> PAGEREF _Toc237779788 \h </w:instrText>
+          <w:instrText xml:space="preserve"> PAGEREF _Toc237782195 \h </w:instrText>
         </w:r>
         <w:r>
           <w:rPr>
@@ -2461,7 +2456,7 @@
           <w14:ligatures w14:val="standardContextual"/>
         </w:rPr>
       </w:pPr>
-      <w:hyperlink w:anchor="_Toc237779789" w:history="1">
+      <w:hyperlink w:anchor="_Toc237782196" w:history="1">
         <w:r>
           <w:rPr>
             <w:rStyle w:val="Hipervnculo"/>
@@ -2488,7 +2483,7 @@
             <w:noProof/>
             <w:webHidden/>
           </w:rPr>
-          <w:instrText xml:space="preserve"> PAGEREF _Toc237779789 \h </w:instrText>
+          <w:instrText xml:space="preserve"> PAGEREF _Toc237782196 \h </w:instrText>
         </w:r>
         <w:r>
           <w:rPr>
@@ -2535,7 +2530,7 @@
           <w14:ligatures w14:val="standardContextual"/>
         </w:rPr>
       </w:pPr>
-      <w:hyperlink w:anchor="_Toc237779790" w:history="1">
+      <w:hyperlink w:anchor="_Toc237782197" w:history="1">
         <w:r>
           <w:rPr>
             <w:rStyle w:val="Hipervnculo"/>
@@ -2562,7 +2557,7 @@
             <w:noProof/>
             <w:webHidden/>
           </w:rPr>
-          <w:instrText xml:space="preserve"> PAGEREF _Toc237779790 \h </w:instrText>
+          <w:instrText xml:space="preserve"> PAGEREF _Toc237782197 \h </w:instrText>
         </w:r>
         <w:r>
           <w:rPr>
@@ -2609,7 +2604,7 @@
           <w14:ligatures w14:val="standardContextual"/>
         </w:rPr>
       </w:pPr>
-      <w:hyperlink w:anchor="_Toc237779791" w:history="1">
+      <w:hyperlink w:anchor="_Toc237782198" w:history="1">
         <w:r>
           <w:rPr>
             <w:rStyle w:val="Hipervnculo"/>
@@ -2636,7 +2631,7 @@
             <w:noProof/>
             <w:webHidden/>
           </w:rPr>
-          <w:instrText xml:space="preserve"> PAGEREF _Toc237779791 \h </w:instrText>
+          <w:instrText xml:space="preserve"> PAGEREF _Toc237782198 \h </w:instrText>
         </w:r>
         <w:r>
           <w:rPr>
@@ -2683,7 +2678,7 @@
           <w14:ligatures w14:val="standardContextual"/>
         </w:rPr>
       </w:pPr>
-      <w:hyperlink w:anchor="_Toc237779792" w:history="1">
+      <w:hyperlink w:anchor="_Toc237782199" w:history="1">
         <w:r>
           <w:rPr>
             <w:rStyle w:val="Hipervnculo"/>
@@ -2710,7 +2705,7 @@
             <w:noProof/>
             <w:webHidden/>
           </w:rPr>
-          <w:instrText xml:space="preserve"> PAGEREF _Toc237779792 \h </w:instrText>
+          <w:instrText xml:space="preserve"> PAGEREF _Toc237782199 \h </w:instrText>
         </w:r>
         <w:r>
           <w:rPr>
@@ -2757,7 +2752,7 @@
           <w14:ligatures w14:val="standardContextual"/>
         </w:rPr>
       </w:pPr>
-      <w:hyperlink w:anchor="_Toc237779793" w:history="1">
+      <w:hyperlink w:anchor="_Toc237782200" w:history="1">
         <w:r>
           <w:rPr>
             <w:rStyle w:val="Hipervnculo"/>
@@ -2784,7 +2779,7 @@
             <w:noProof/>
             <w:webHidden/>
           </w:rPr>
-          <w:instrText xml:space="preserve"> PAGEREF _Toc237779793 \h </w:instrText>
+          <w:instrText xml:space="preserve"> PAGEREF _Toc237782200 \h </w:instrText>
         </w:r>
         <w:r>
           <w:rPr>
@@ -2831,7 +2826,7 @@
           <w14:ligatures w14:val="standardContextual"/>
         </w:rPr>
       </w:pPr>
-      <w:hyperlink w:anchor="_Toc237779794" w:history="1">
+      <w:hyperlink w:anchor="_Toc237782201" w:history="1">
         <w:r>
           <w:rPr>
             <w:rStyle w:val="Hipervnculo"/>
@@ -2858,7 +2853,7 @@
             <w:noProof/>
             <w:webHidden/>
           </w:rPr>
-          <w:instrText xml:space="preserve"> PAGEREF _Toc237779794 \h </w:instrText>
+          <w:instrText xml:space="preserve"> PAGEREF _Toc237782201 \h </w:instrText>
         </w:r>
         <w:r>
           <w:rPr>
@@ -2905,7 +2900,7 @@
           <w14:ligatures w14:val="standardContextual"/>
         </w:rPr>
       </w:pPr>
-      <w:hyperlink w:anchor="_Toc237779795" w:history="1">
+      <w:hyperlink w:anchor="_Toc237782202" w:history="1">
         <w:r>
           <w:rPr>
             <w:rStyle w:val="Hipervnculo"/>
@@ -2932,7 +2927,7 @@
             <w:noProof/>
             <w:webHidden/>
           </w:rPr>
-          <w:instrText xml:space="preserve"> PAGEREF _Toc237779795 \h </w:instrText>
+          <w:instrText xml:space="preserve"> PAGEREF _Toc237782202 \h </w:instrText>
         </w:r>
         <w:r>
           <w:rPr>
@@ -2979,7 +2974,7 @@
           <w14:ligatures w14:val="standardContextual"/>
         </w:rPr>
       </w:pPr>
-      <w:hyperlink w:anchor="_Toc237779796" w:history="1">
+      <w:hyperlink w:anchor="_Toc237782203" w:history="1">
         <w:r>
           <w:rPr>
             <w:rStyle w:val="Hipervnculo"/>
@@ -3006,7 +3001,7 @@
             <w:noProof/>
             <w:webHidden/>
           </w:rPr>
-          <w:instrText xml:space="preserve"> PAGEREF _Toc237779796 \h </w:instrText>
+          <w:instrText xml:space="preserve"> PAGEREF _Toc237782203 \h </w:instrText>
         </w:r>
         <w:r>
           <w:rPr>
@@ -3053,7 +3048,7 @@
           <w14:ligatures w14:val="standardContextual"/>
         </w:rPr>
       </w:pPr>
-      <w:hyperlink w:anchor="_Toc237779797" w:history="1">
+      <w:hyperlink w:anchor="_Toc237782204" w:history="1">
         <w:r>
           <w:rPr>
             <w:rStyle w:val="Hipervnculo"/>
@@ -3080,7 +3075,7 @@
             <w:noProof/>
             <w:webHidden/>
           </w:rPr>
-          <w:instrText xml:space="preserve"> PAGEREF _Toc237779797 \h </w:instrText>
+          <w:instrText xml:space="preserve"> PAGEREF _Toc237782204 \h </w:instrText>
         </w:r>
         <w:r>
           <w:rPr>
@@ -3127,7 +3122,7 @@
           <w14:ligatures w14:val="standardContextual"/>
         </w:rPr>
       </w:pPr>
-      <w:hyperlink w:anchor="_Toc237779798" w:history="1">
+      <w:hyperlink w:anchor="_Toc237782205" w:history="1">
         <w:r>
           <w:rPr>
             <w:rStyle w:val="Hipervnculo"/>
@@ -3154,7 +3149,7 @@
             <w:noProof/>
             <w:webHidden/>
           </w:rPr>
-          <w:instrText xml:space="preserve"> PAGEREF _Toc237779798 \h </w:instrText>
+          <w:instrText xml:space="preserve"> PAGEREF _Toc237782205 \h </w:instrText>
         </w:r>
         <w:r>
           <w:rPr>
@@ -3201,7 +3196,7 @@
           <w14:ligatures w14:val="standardContextual"/>
         </w:rPr>
       </w:pPr>
-      <w:hyperlink w:anchor="_Toc237779799" w:history="1">
+      <w:hyperlink w:anchor="_Toc237782206" w:history="1">
         <w:r>
           <w:rPr>
             <w:rStyle w:val="Hipervnculo"/>
@@ -3228,7 +3223,7 @@
             <w:noProof/>
             <w:webHidden/>
           </w:rPr>
-          <w:instrText xml:space="preserve"> PAGEREF _Toc237779799 \h </w:instrText>
+          <w:instrText xml:space="preserve"> PAGEREF _Toc237782206 \h </w:instrText>
         </w:r>
         <w:r>
           <w:rPr>
@@ -3275,7 +3270,7 @@
           <w14:ligatures w14:val="standardContextual"/>
         </w:rPr>
       </w:pPr>
-      <w:hyperlink w:anchor="_Toc237779800" w:history="1">
+      <w:hyperlink w:anchor="_Toc237782207" w:history="1">
         <w:r>
           <w:rPr>
             <w:rStyle w:val="Hipervnculo"/>
@@ -3332,7 +3327,7 @@
             <w:noProof/>
             <w:webHidden/>
           </w:rPr>
-          <w:instrText xml:space="preserve"> PAGEREF _Toc237779800 \h </w:instrText>
+          <w:instrText xml:space="preserve"> PAGEREF _Toc237782207 \h </w:instrText>
         </w:r>
         <w:r>
           <w:rPr>
@@ -3379,7 +3374,7 @@
           <w14:ligatures w14:val="standardContextual"/>
         </w:rPr>
       </w:pPr>
-      <w:hyperlink w:anchor="_Toc237779801" w:history="1">
+      <w:hyperlink w:anchor="_Toc237782208" w:history="1">
         <w:r>
           <w:rPr>
             <w:rStyle w:val="Hipervnculo"/>
@@ -3406,7 +3401,7 @@
             <w:noProof/>
             <w:webHidden/>
           </w:rPr>
-          <w:instrText xml:space="preserve"> PAGEREF _Toc237779801 \h </w:instrText>
+          <w:instrText xml:space="preserve"> PAGEREF _Toc237782208 \h </w:instrText>
         </w:r>
         <w:r>
           <w:rPr>
@@ -3453,7 +3448,7 @@
           <w14:ligatures w14:val="standardContextual"/>
         </w:rPr>
       </w:pPr>
-      <w:hyperlink w:anchor="_Toc237779802" w:history="1">
+      <w:hyperlink w:anchor="_Toc237782209" w:history="1">
         <w:r>
           <w:rPr>
             <w:rStyle w:val="Hipervnculo"/>
@@ -3480,7 +3475,7 @@
             <w:noProof/>
             <w:webHidden/>
           </w:rPr>
-          <w:instrText xml:space="preserve"> PAGEREF _Toc237779802 \h </w:instrText>
+          <w:instrText xml:space="preserve"> PAGEREF _Toc237782209 \h </w:instrText>
         </w:r>
         <w:r>
           <w:rPr>
@@ -3527,7 +3522,7 @@
           <w14:ligatures w14:val="standardContextual"/>
         </w:rPr>
       </w:pPr>
-      <w:hyperlink w:anchor="_Toc237779803" w:history="1">
+      <w:hyperlink w:anchor="_Toc237782210" w:history="1">
         <w:r>
           <w:rPr>
             <w:rStyle w:val="Hipervnculo"/>
@@ -3554,7 +3549,7 @@
             <w:noProof/>
             <w:webHidden/>
           </w:rPr>
-          <w:instrText xml:space="preserve"> PAGEREF _Toc237779803 \h </w:instrText>
+          <w:instrText xml:space="preserve"> PAGEREF _Toc237782210 \h </w:instrText>
         </w:r>
         <w:r>
           <w:rPr>
@@ -3601,7 +3596,7 @@
           <w14:ligatures w14:val="standardContextual"/>
         </w:rPr>
       </w:pPr>
-      <w:hyperlink w:anchor="_Toc237779804" w:history="1">
+      <w:hyperlink w:anchor="_Toc237782211" w:history="1">
         <w:r>
           <w:rPr>
             <w:rStyle w:val="Hipervnculo"/>
@@ -3628,7 +3623,7 @@
             <w:noProof/>
             <w:webHidden/>
           </w:rPr>
-          <w:instrText xml:space="preserve"> PAGEREF _Toc237779804 \h </w:instrText>
+          <w:instrText xml:space="preserve"> PAGEREF _Toc237782211 \h </w:instrText>
         </w:r>
         <w:r>
           <w:rPr>
@@ -3675,7 +3670,7 @@
           <w14:ligatures w14:val="standardContextual"/>
         </w:rPr>
       </w:pPr>
-      <w:hyperlink w:anchor="_Toc237779805" w:history="1">
+      <w:hyperlink w:anchor="_Toc237782212" w:history="1">
         <w:r>
           <w:rPr>
             <w:rStyle w:val="Hipervnculo"/>
@@ -3702,7 +3697,7 @@
             <w:noProof/>
             <w:webHidden/>
           </w:rPr>
-          <w:instrText xml:space="preserve"> PAGEREF _Toc237779805 \h </w:instrText>
+          <w:instrText xml:space="preserve"> PAGEREF _Toc237782212 \h </w:instrText>
         </w:r>
         <w:r>
           <w:rPr>
@@ -3749,7 +3744,7 @@
           <w14:ligatures w14:val="standardContextual"/>
         </w:rPr>
       </w:pPr>
-      <w:hyperlink w:anchor="_Toc237779806" w:history="1">
+      <w:hyperlink w:anchor="_Toc237782213" w:history="1">
         <w:r>
           <w:rPr>
             <w:rStyle w:val="Hipervnculo"/>
@@ -3776,7 +3771,7 @@
             <w:noProof/>
             <w:webHidden/>
           </w:rPr>
-          <w:instrText xml:space="preserve"> PAGEREF _Toc237779806 \h </w:instrText>
+          <w:instrText xml:space="preserve"> PAGEREF _Toc237782213 \h </w:instrText>
         </w:r>
         <w:r>
           <w:rPr>
@@ -3823,7 +3818,7 @@
           <w14:ligatures w14:val="standardContextual"/>
         </w:rPr>
       </w:pPr>
-      <w:hyperlink w:anchor="_Toc237779807" w:history="1">
+      <w:hyperlink w:anchor="_Toc237782214" w:history="1">
         <w:r>
           <w:rPr>
             <w:rStyle w:val="Hipervnculo"/>
@@ -3850,7 +3845,7 @@
             <w:noProof/>
             <w:webHidden/>
           </w:rPr>
-          <w:instrText xml:space="preserve"> PAGEREF _Toc237779807 \h </w:instrText>
+          <w:instrText xml:space="preserve"> PAGEREF _Toc237782214 \h </w:instrText>
         </w:r>
         <w:r>
           <w:rPr>
@@ -3897,7 +3892,7 @@
           <w14:ligatures w14:val="standardContextual"/>
         </w:rPr>
       </w:pPr>
-      <w:hyperlink w:anchor="_Toc237779808" w:history="1">
+      <w:hyperlink w:anchor="_Toc237782215" w:history="1">
         <w:r>
           <w:rPr>
             <w:rStyle w:val="Hipervnculo"/>
@@ -3924,7 +3919,7 @@
             <w:noProof/>
             <w:webHidden/>
           </w:rPr>
-          <w:instrText xml:space="preserve"> PAGEREF _Toc237779808 \h </w:instrText>
+          <w:instrText xml:space="preserve"> PAGEREF _Toc237782215 \h </w:instrText>
         </w:r>
         <w:r>
           <w:rPr>
@@ -3971,7 +3966,7 @@
           <w14:ligatures w14:val="standardContextual"/>
         </w:rPr>
       </w:pPr>
-      <w:hyperlink w:anchor="_Toc237779809" w:history="1">
+      <w:hyperlink w:anchor="_Toc237782216" w:history="1">
         <w:r>
           <w:rPr>
             <w:rStyle w:val="Hipervnculo"/>
@@ -3998,7 +3993,7 @@
             <w:noProof/>
             <w:webHidden/>
           </w:rPr>
-          <w:instrText xml:space="preserve"> PAGEREF _Toc237779809 \h </w:instrText>
+          <w:instrText xml:space="preserve"> PAGEREF _Toc237782216 \h </w:instrText>
         </w:r>
         <w:r>
           <w:rPr>
@@ -4045,7 +4040,7 @@
           <w14:ligatures w14:val="standardContextual"/>
         </w:rPr>
       </w:pPr>
-      <w:hyperlink w:anchor="_Toc237779810" w:history="1">
+      <w:hyperlink w:anchor="_Toc237782217" w:history="1">
         <w:r>
           <w:rPr>
             <w:rStyle w:val="Hipervnculo"/>
@@ -4072,7 +4067,7 @@
             <w:noProof/>
             <w:webHidden/>
           </w:rPr>
-          <w:instrText xml:space="preserve"> PAGEREF _Toc237779810 \h </w:instrText>
+          <w:instrText xml:space="preserve"> PAGEREF _Toc237782217 \h </w:instrText>
         </w:r>
         <w:r>
           <w:rPr>
@@ -4119,7 +4114,7 @@
           <w14:ligatures w14:val="standardContextual"/>
         </w:rPr>
       </w:pPr>
-      <w:hyperlink w:anchor="_Toc237779811" w:history="1">
+      <w:hyperlink w:anchor="_Toc237782218" w:history="1">
         <w:r>
           <w:rPr>
             <w:rStyle w:val="Hipervnculo"/>
@@ -4146,7 +4141,7 @@
             <w:noProof/>
             <w:webHidden/>
           </w:rPr>
-          <w:instrText xml:space="preserve"> PAGEREF _Toc237779811 \h </w:instrText>
+          <w:instrText xml:space="preserve"> PAGEREF _Toc237782218 \h </w:instrText>
         </w:r>
         <w:r>
           <w:rPr>
@@ -4193,7 +4188,7 @@
           <w14:ligatures w14:val="standardContextual"/>
         </w:rPr>
       </w:pPr>
-      <w:hyperlink w:anchor="_Toc237779812" w:history="1">
+      <w:hyperlink w:anchor="_Toc237782219" w:history="1">
         <w:r>
           <w:rPr>
             <w:rStyle w:val="Hipervnculo"/>
@@ -4220,7 +4215,7 @@
             <w:noProof/>
             <w:webHidden/>
           </w:rPr>
-          <w:instrText xml:space="preserve"> PAGEREF _Toc237779812 \h </w:instrText>
+          <w:instrText xml:space="preserve"> PAGEREF _Toc237782219 \h </w:instrText>
         </w:r>
         <w:r>
           <w:rPr>
@@ -4267,7 +4262,7 @@
           <w14:ligatures w14:val="standardContextual"/>
         </w:rPr>
       </w:pPr>
-      <w:hyperlink w:anchor="_Toc237779813" w:history="1">
+      <w:hyperlink w:anchor="_Toc237782220" w:history="1">
         <w:r>
           <w:rPr>
             <w:rStyle w:val="Hipervnculo"/>
@@ -4294,7 +4289,7 @@
             <w:noProof/>
             <w:webHidden/>
           </w:rPr>
-          <w:instrText xml:space="preserve"> PAGEREF _Toc237779813 \h </w:instrText>
+          <w:instrText xml:space="preserve"> PAGEREF _Toc237782220 \h </w:instrText>
         </w:r>
         <w:r>
           <w:rPr>
@@ -4341,7 +4336,7 @@
           <w14:ligatures w14:val="standardContextual"/>
         </w:rPr>
       </w:pPr>
-      <w:hyperlink w:anchor="_Toc237779814" w:history="1">
+      <w:hyperlink w:anchor="_Toc237782221" w:history="1">
         <w:r>
           <w:rPr>
             <w:rStyle w:val="Hipervnculo"/>
@@ -4368,7 +4363,7 @@
             <w:noProof/>
             <w:webHidden/>
           </w:rPr>
-          <w:instrText xml:space="preserve"> PAGEREF _Toc237779814 \h </w:instrText>
+          <w:instrText xml:space="preserve"> PAGEREF _Toc237782221 \h </w:instrText>
         </w:r>
         <w:r>
           <w:rPr>
@@ -4415,7 +4410,7 @@
           <w14:ligatures w14:val="standardContextual"/>
         </w:rPr>
       </w:pPr>
-      <w:hyperlink w:anchor="_Toc237779815" w:history="1">
+      <w:hyperlink w:anchor="_Toc237782222" w:history="1">
         <w:r>
           <w:rPr>
             <w:rStyle w:val="Hipervnculo"/>
@@ -4442,7 +4437,7 @@
             <w:noProof/>
             <w:webHidden/>
           </w:rPr>
-          <w:instrText xml:space="preserve"> PAGEREF _Toc237779815 \h </w:instrText>
+          <w:instrText xml:space="preserve"> PAGEREF _Toc237782222 \h </w:instrText>
         </w:r>
         <w:r>
           <w:rPr>
@@ -4489,7 +4484,7 @@
           <w14:ligatures w14:val="standardContextual"/>
         </w:rPr>
       </w:pPr>
-      <w:hyperlink w:anchor="_Toc237779816" w:history="1">
+      <w:hyperlink w:anchor="_Toc237782223" w:history="1">
         <w:r>
           <w:rPr>
             <w:rStyle w:val="Hipervnculo"/>
@@ -4516,7 +4511,7 @@
             <w:noProof/>
             <w:webHidden/>
           </w:rPr>
-          <w:instrText xml:space="preserve"> PAGEREF _Toc237779816 \h </w:instrText>
+          <w:instrText xml:space="preserve"> PAGEREF _Toc237782223 \h </w:instrText>
         </w:r>
         <w:r>
           <w:rPr>
@@ -4563,7 +4558,7 @@
           <w14:ligatures w14:val="standardContextual"/>
         </w:rPr>
       </w:pPr>
-      <w:hyperlink w:anchor="_Toc237779817" w:history="1">
+      <w:hyperlink w:anchor="_Toc237782224" w:history="1">
         <w:r>
           <w:rPr>
             <w:rStyle w:val="Hipervnculo"/>
@@ -4590,7 +4585,7 @@
             <w:noProof/>
             <w:webHidden/>
           </w:rPr>
-          <w:instrText xml:space="preserve"> PAGEREF _Toc237779817 \h </w:instrText>
+          <w:instrText xml:space="preserve"> PAGEREF _Toc237782224 \h </w:instrText>
         </w:r>
         <w:r>
           <w:rPr>
@@ -4637,7 +4632,7 @@
           <w14:ligatures w14:val="standardContextual"/>
         </w:rPr>
       </w:pPr>
-      <w:hyperlink w:anchor="_Toc237779818" w:history="1">
+      <w:hyperlink w:anchor="_Toc237782225" w:history="1">
         <w:r>
           <w:rPr>
             <w:rStyle w:val="Hipervnculo"/>
@@ -4664,7 +4659,7 @@
             <w:noProof/>
             <w:webHidden/>
           </w:rPr>
-          <w:instrText xml:space="preserve"> PAGEREF _Toc237779818 \h </w:instrText>
+          <w:instrText xml:space="preserve"> PAGEREF _Toc237782225 \h </w:instrText>
         </w:r>
         <w:r>
           <w:rPr>
@@ -4711,7 +4706,7 @@
           <w14:ligatures w14:val="standardContextual"/>
         </w:rPr>
       </w:pPr>
-      <w:hyperlink w:anchor="_Toc237779819" w:history="1">
+      <w:hyperlink w:anchor="_Toc237782226" w:history="1">
         <w:r>
           <w:rPr>
             <w:rStyle w:val="Hipervnculo"/>
@@ -4738,7 +4733,7 @@
             <w:noProof/>
             <w:webHidden/>
           </w:rPr>
-          <w:instrText xml:space="preserve"> PAGEREF _Toc237779819 \h </w:instrText>
+          <w:instrText xml:space="preserve"> PAGEREF _Toc237782226 \h </w:instrText>
         </w:r>
         <w:r>
           <w:rPr>
@@ -4785,7 +4780,7 @@
           <w14:ligatures w14:val="standardContextual"/>
         </w:rPr>
       </w:pPr>
-      <w:hyperlink w:anchor="_Toc237779820" w:history="1">
+      <w:hyperlink w:anchor="_Toc237782227" w:history="1">
         <w:r>
           <w:rPr>
             <w:rStyle w:val="Hipervnculo"/>
@@ -4812,7 +4807,7 @@
             <w:noProof/>
             <w:webHidden/>
           </w:rPr>
-          <w:instrText xml:space="preserve"> PAGEREF _Toc237779820 \h </w:instrText>
+          <w:instrText xml:space="preserve"> PAGEREF _Toc237782227 \h </w:instrText>
         </w:r>
         <w:r>
           <w:rPr>
@@ -4859,7 +4854,7 @@
           <w14:ligatures w14:val="standardContextual"/>
         </w:rPr>
       </w:pPr>
-      <w:hyperlink w:anchor="_Toc237779821" w:history="1">
+      <w:hyperlink w:anchor="_Toc237782228" w:history="1">
         <w:r>
           <w:rPr>
             <w:rStyle w:val="Hipervnculo"/>
@@ -4886,7 +4881,7 @@
             <w:noProof/>
             <w:webHidden/>
           </w:rPr>
-          <w:instrText xml:space="preserve"> PAGEREF _Toc237779821 \h </w:instrText>
+          <w:instrText xml:space="preserve"> PAGEREF _Toc237782228 \h </w:instrText>
         </w:r>
         <w:r>
           <w:rPr>
@@ -4933,7 +4928,7 @@
           <w14:ligatures w14:val="standardContextual"/>
         </w:rPr>
       </w:pPr>
-      <w:hyperlink w:anchor="_Toc237779822" w:history="1">
+      <w:hyperlink w:anchor="_Toc237782229" w:history="1">
         <w:r>
           <w:rPr>
             <w:rStyle w:val="Hipervnculo"/>
@@ -4960,7 +4955,7 @@
             <w:noProof/>
             <w:webHidden/>
           </w:rPr>
-          <w:instrText xml:space="preserve"> PAGEREF _Toc237779822 \h </w:instrText>
+          <w:instrText xml:space="preserve"> PAGEREF _Toc237782229 \h </w:instrText>
         </w:r>
         <w:r>
           <w:rPr>
@@ -5007,7 +5002,7 @@
           <w14:ligatures w14:val="standardContextual"/>
         </w:rPr>
       </w:pPr>
-      <w:hyperlink w:anchor="_Toc237779823" w:history="1">
+      <w:hyperlink w:anchor="_Toc237782230" w:history="1">
         <w:r>
           <w:rPr>
             <w:rStyle w:val="Hipervnculo"/>
@@ -5034,7 +5029,7 @@
             <w:noProof/>
             <w:webHidden/>
           </w:rPr>
-          <w:instrText xml:space="preserve"> PAGEREF _Toc237779823 \h </w:instrText>
+          <w:instrText xml:space="preserve"> PAGEREF _Toc237782230 \h </w:instrText>
         </w:r>
         <w:r>
           <w:rPr>
@@ -5081,7 +5076,7 @@
           <w14:ligatures w14:val="standardContextual"/>
         </w:rPr>
       </w:pPr>
-      <w:hyperlink w:anchor="_Toc237779824" w:history="1">
+      <w:hyperlink w:anchor="_Toc237782231" w:history="1">
         <w:r>
           <w:rPr>
             <w:rStyle w:val="Hipervnculo"/>
@@ -5108,7 +5103,7 @@
             <w:noProof/>
             <w:webHidden/>
           </w:rPr>
-          <w:instrText xml:space="preserve"> PAGEREF _Toc237779824 \h </w:instrText>
+          <w:instrText xml:space="preserve"> PAGEREF _Toc237782231 \h </w:instrText>
         </w:r>
         <w:r>
           <w:rPr>
@@ -5155,7 +5150,7 @@
           <w14:ligatures w14:val="standardContextual"/>
         </w:rPr>
       </w:pPr>
-      <w:hyperlink w:anchor="_Toc237779825" w:history="1">
+      <w:hyperlink w:anchor="_Toc237782232" w:history="1">
         <w:r>
           <w:rPr>
             <w:rStyle w:val="Hipervnculo"/>
@@ -5182,7 +5177,7 @@
             <w:noProof/>
             <w:webHidden/>
           </w:rPr>
-          <w:instrText xml:space="preserve"> PAGEREF _Toc237779825 \h </w:instrText>
+          <w:instrText xml:space="preserve"> PAGEREF _Toc237782232 \h </w:instrText>
         </w:r>
         <w:r>
           <w:rPr>
@@ -5229,7 +5224,7 @@
           <w14:ligatures w14:val="standardContextual"/>
         </w:rPr>
       </w:pPr>
-      <w:hyperlink w:anchor="_Toc237779826" w:history="1">
+      <w:hyperlink w:anchor="_Toc237782233" w:history="1">
         <w:r>
           <w:rPr>
             <w:rStyle w:val="Hipervnculo"/>
@@ -5256,7 +5251,7 @@
             <w:noProof/>
             <w:webHidden/>
           </w:rPr>
-          <w:instrText xml:space="preserve"> PAGEREF _Toc237779826 \h </w:instrText>
+          <w:instrText xml:space="preserve"> PAGEREF _Toc237782233 \h </w:instrText>
         </w:r>
         <w:r>
           <w:rPr>
@@ -5303,7 +5298,7 @@
           <w14:ligatures w14:val="standardContextual"/>
         </w:rPr>
       </w:pPr>
-      <w:hyperlink w:anchor="_Toc237779827" w:history="1">
+      <w:hyperlink w:anchor="_Toc237782234" w:history="1">
         <w:r>
           <w:rPr>
             <w:rStyle w:val="Hipervnculo"/>
@@ -5330,7 +5325,7 @@
             <w:noProof/>
             <w:webHidden/>
           </w:rPr>
-          <w:instrText xml:space="preserve"> PAGEREF _Toc237779827 \h </w:instrText>
+          <w:instrText xml:space="preserve"> PAGEREF _Toc237782234 \h </w:instrText>
         </w:r>
         <w:r>
           <w:rPr>
@@ -5377,7 +5372,7 @@
           <w14:ligatures w14:val="standardContextual"/>
         </w:rPr>
       </w:pPr>
-      <w:hyperlink w:anchor="_Toc237779828" w:history="1">
+      <w:hyperlink w:anchor="_Toc237782235" w:history="1">
         <w:r>
           <w:rPr>
             <w:rStyle w:val="Hipervnculo"/>
@@ -5404,7 +5399,7 @@
             <w:noProof/>
             <w:webHidden/>
           </w:rPr>
-          <w:instrText xml:space="preserve"> PAGEREF _Toc237779828 \h </w:instrText>
+          <w:instrText xml:space="preserve"> PAGEREF _Toc237782235 \h </w:instrText>
         </w:r>
         <w:r>
           <w:rPr>
@@ -5451,7 +5446,7 @@
           <w14:ligatures w14:val="standardContextual"/>
         </w:rPr>
       </w:pPr>
-      <w:hyperlink w:anchor="_Toc237779829" w:history="1">
+      <w:hyperlink w:anchor="_Toc237782236" w:history="1">
         <w:r>
           <w:rPr>
             <w:rStyle w:val="Hipervnculo"/>
@@ -5478,7 +5473,7 @@
             <w:noProof/>
             <w:webHidden/>
           </w:rPr>
-          <w:instrText xml:space="preserve"> PAGEREF _Toc237779829 \h </w:instrText>
+          <w:instrText xml:space="preserve"> PAGEREF _Toc237782236 \h </w:instrText>
         </w:r>
         <w:r>
           <w:rPr>
@@ -5525,7 +5520,7 @@
           <w14:ligatures w14:val="standardContextual"/>
         </w:rPr>
       </w:pPr>
-      <w:hyperlink w:anchor="_Toc237779830" w:history="1">
+      <w:hyperlink w:anchor="_Toc237782237" w:history="1">
         <w:r>
           <w:rPr>
             <w:rStyle w:val="Hipervnculo"/>
@@ -5552,7 +5547,7 @@
             <w:noProof/>
             <w:webHidden/>
           </w:rPr>
-          <w:instrText xml:space="preserve"> PAGEREF _Toc237779830 \h </w:instrText>
+          <w:instrText xml:space="preserve"> PAGEREF _Toc237782237 \h </w:instrText>
         </w:r>
         <w:r>
           <w:rPr>
@@ -5599,7 +5594,7 @@
           <w14:ligatures w14:val="standardContextual"/>
         </w:rPr>
       </w:pPr>
-      <w:hyperlink w:anchor="_Toc237779831" w:history="1">
+      <w:hyperlink w:anchor="_Toc237782238" w:history="1">
         <w:r>
           <w:rPr>
             <w:rStyle w:val="Hipervnculo"/>
@@ -5626,7 +5621,7 @@
             <w:noProof/>
             <w:webHidden/>
           </w:rPr>
-          <w:instrText xml:space="preserve"> PAGEREF _Toc237779831 \h </w:instrText>
+          <w:instrText xml:space="preserve"> PAGEREF _Toc237782238 \h </w:instrText>
         </w:r>
         <w:r>
           <w:rPr>
@@ -5673,7 +5668,7 @@
           <w14:ligatures w14:val="standardContextual"/>
         </w:rPr>
       </w:pPr>
-      <w:hyperlink w:anchor="_Toc237779832" w:history="1">
+      <w:hyperlink w:anchor="_Toc237782239" w:history="1">
         <w:r>
           <w:rPr>
             <w:rStyle w:val="Hipervnculo"/>
@@ -5700,7 +5695,7 @@
             <w:noProof/>
             <w:webHidden/>
           </w:rPr>
-          <w:instrText xml:space="preserve"> PAGEREF _Toc237779832 \h </w:instrText>
+          <w:instrText xml:space="preserve"> PAGEREF _Toc237782239 \h </w:instrText>
         </w:r>
         <w:r>
           <w:rPr>
@@ -5747,7 +5742,7 @@
           <w14:ligatures w14:val="standardContextual"/>
         </w:rPr>
       </w:pPr>
-      <w:hyperlink w:anchor="_Toc237779833" w:history="1">
+      <w:hyperlink w:anchor="_Toc237782240" w:history="1">
         <w:r>
           <w:rPr>
             <w:rStyle w:val="Hipervnculo"/>
@@ -5774,7 +5769,7 @@
             <w:noProof/>
             <w:webHidden/>
           </w:rPr>
-          <w:instrText xml:space="preserve"> PAGEREF _Toc237779833 \h </w:instrText>
+          <w:instrText xml:space="preserve"> PAGEREF _Toc237782240 \h </w:instrText>
         </w:r>
         <w:r>
           <w:rPr>
@@ -5821,7 +5816,7 @@
           <w14:ligatures w14:val="standardContextual"/>
         </w:rPr>
       </w:pPr>
-      <w:hyperlink w:anchor="_Toc237779834" w:history="1">
+      <w:hyperlink w:anchor="_Toc237782241" w:history="1">
         <w:r>
           <w:rPr>
             <w:rStyle w:val="Hipervnculo"/>
@@ -5848,7 +5843,7 @@
             <w:noProof/>
             <w:webHidden/>
           </w:rPr>
-          <w:instrText xml:space="preserve"> PAGEREF _Toc237779834 \h </w:instrText>
+          <w:instrText xml:space="preserve"> PAGEREF _Toc237782241 \h </w:instrText>
         </w:r>
         <w:r>
           <w:rPr>
@@ -5895,7 +5890,7 @@
           <w14:ligatures w14:val="standardContextual"/>
         </w:rPr>
       </w:pPr>
-      <w:hyperlink w:anchor="_Toc237779835" w:history="1">
+      <w:hyperlink w:anchor="_Toc237782242" w:history="1">
         <w:r>
           <w:rPr>
             <w:rStyle w:val="Hipervnculo"/>
@@ -5922,7 +5917,7 @@
             <w:noProof/>
             <w:webHidden/>
           </w:rPr>
-          <w:instrText xml:space="preserve"> PAGEREF _Toc237779835 \h </w:instrText>
+          <w:instrText xml:space="preserve"> PAGEREF _Toc237782242 \h </w:instrText>
         </w:r>
         <w:r>
           <w:rPr>
@@ -5969,7 +5964,7 @@
           <w14:ligatures w14:val="standardContextual"/>
         </w:rPr>
       </w:pPr>
-      <w:hyperlink w:anchor="_Toc237779836" w:history="1">
+      <w:hyperlink w:anchor="_Toc237782243" w:history="1">
         <w:r>
           <w:rPr>
             <w:rStyle w:val="Hipervnculo"/>
@@ -5996,7 +5991,7 @@
             <w:noProof/>
             <w:webHidden/>
           </w:rPr>
-          <w:instrText xml:space="preserve"> PAGEREF _Toc237779836 \h </w:instrText>
+          <w:instrText xml:space="preserve"> PAGEREF _Toc237782243 \h </w:instrText>
         </w:r>
         <w:r>
           <w:rPr>
@@ -6043,7 +6038,7 @@
           <w14:ligatures w14:val="standardContextual"/>
         </w:rPr>
       </w:pPr>
-      <w:hyperlink w:anchor="_Toc237779837" w:history="1">
+      <w:hyperlink w:anchor="_Toc237782244" w:history="1">
         <w:r>
           <w:rPr>
             <w:rStyle w:val="Hipervnculo"/>
@@ -6070,7 +6065,7 @@
             <w:noProof/>
             <w:webHidden/>
           </w:rPr>
-          <w:instrText xml:space="preserve"> PAGEREF _Toc237779837 \h </w:instrText>
+          <w:instrText xml:space="preserve"> PAGEREF _Toc237782244 \h </w:instrText>
         </w:r>
         <w:r>
           <w:rPr>
@@ -6117,7 +6112,7 @@
           <w14:ligatures w14:val="standardContextual"/>
         </w:rPr>
       </w:pPr>
-      <w:hyperlink w:anchor="_Toc237779838" w:history="1">
+      <w:hyperlink w:anchor="_Toc237782245" w:history="1">
         <w:r>
           <w:rPr>
             <w:rStyle w:val="Hipervnculo"/>
@@ -6144,7 +6139,7 @@
             <w:noProof/>
             <w:webHidden/>
           </w:rPr>
-          <w:instrText xml:space="preserve"> PAGEREF _Toc237779838 \h </w:instrText>
+          <w:instrText xml:space="preserve"> PAGEREF _Toc237782245 \h </w:instrText>
         </w:r>
         <w:r>
           <w:rPr>
@@ -6191,7 +6186,7 @@
           <w14:ligatures w14:val="standardContextual"/>
         </w:rPr>
       </w:pPr>
-      <w:hyperlink w:anchor="_Toc237779839" w:history="1">
+      <w:hyperlink w:anchor="_Toc237782246" w:history="1">
         <w:r>
           <w:rPr>
             <w:rStyle w:val="Hipervnculo"/>
@@ -6218,7 +6213,7 @@
             <w:noProof/>
             <w:webHidden/>
           </w:rPr>
-          <w:instrText xml:space="preserve"> PAGEREF _Toc237779839 \h </w:instrText>
+          <w:instrText xml:space="preserve"> PAGEREF _Toc237782246 \h </w:instrText>
         </w:r>
         <w:r>
           <w:rPr>
@@ -6302,7 +6297,7 @@
         <w:pStyle w:val="Ttulo1"/>
         <w:spacing w:before="160" w:after="60"/>
       </w:pPr>
-      <w:bookmarkStart w:id="0" w:name="_Toc237779777"/>
+      <w:bookmarkStart w:id="0" w:name="_Toc237782184"/>
       <w:r>
         <w:rPr>
           <w:rFonts w:ascii="Georgia" w:hAnsi="Georgia"/>
@@ -6319,7 +6314,7 @@
         <w:pStyle w:val="Ttulo2"/>
         <w:spacing w:before="120" w:after="40"/>
       </w:pPr>
-      <w:bookmarkStart w:id="1" w:name="_Toc237779778"/>
+      <w:bookmarkStart w:id="1" w:name="_Toc237782185"/>
       <w:r>
         <w:rPr>
           <w:rFonts w:ascii="Georgia" w:hAnsi="Georgia"/>
@@ -6360,7 +6355,7 @@
         <w:pStyle w:val="Ttulo2"/>
         <w:spacing w:before="120" w:after="40"/>
       </w:pPr>
-      <w:bookmarkStart w:id="2" w:name="_Toc237779779"/>
+      <w:bookmarkStart w:id="2" w:name="_Toc237782186"/>
       <w:r>
         <w:rPr>
           <w:rFonts w:ascii="Georgia" w:hAnsi="Georgia"/>
@@ -6421,7 +6416,7 @@
                 <w:noProof/>
               </w:rPr>
               <w:drawing>
-                <wp:inline distT="0" distB="0" distL="0" distR="0" wp14:anchorId="713212EC" wp14:editId="290CD056">
+                <wp:inline distT="0" distB="0" distL="0" distR="0" wp14:anchorId="23495755" wp14:editId="4FA81133">
                   <wp:extent cx="3017520" cy="1572050"/>
                   <wp:effectExtent l="0" t="0" r="0" b="0"/>
                   <wp:docPr id="1" name="Picture 1"/>
@@ -6480,7 +6475,7 @@
                 <w:noProof/>
               </w:rPr>
               <w:drawing>
-                <wp:inline distT="0" distB="0" distL="0" distR="0" wp14:anchorId="6BA13C98" wp14:editId="239E8CC1">
+                <wp:inline distT="0" distB="0" distL="0" distR="0" wp14:anchorId="7DA8A9A4" wp14:editId="4A80E9CB">
                   <wp:extent cx="3017520" cy="1482763"/>
                   <wp:effectExtent l="0" t="0" r="0" b="0"/>
                   <wp:docPr id="2" name="Picture 2"/>
@@ -6585,7 +6580,7 @@
         <w:pStyle w:val="Ttulo2"/>
         <w:spacing w:before="120" w:after="40"/>
       </w:pPr>
-      <w:bookmarkStart w:id="3" w:name="_Toc237779780"/>
+      <w:bookmarkStart w:id="3" w:name="_Toc237782187"/>
       <w:r>
         <w:rPr>
           <w:rFonts w:ascii="Georgia" w:hAnsi="Georgia"/>
@@ -6733,7 +6728,7 @@
         <w:pStyle w:val="Ttulo2"/>
         <w:spacing w:before="120" w:after="40"/>
       </w:pPr>
-      <w:bookmarkStart w:id="4" w:name="_Toc237779781"/>
+      <w:bookmarkStart w:id="4" w:name="_Toc237782188"/>
       <w:r>
         <w:rPr>
           <w:rFonts w:ascii="Georgia" w:hAnsi="Georgia"/>
@@ -7261,7 +7256,7 @@
         <w:pStyle w:val="Ttulo2"/>
         <w:spacing w:before="120" w:after="40"/>
       </w:pPr>
-      <w:bookmarkStart w:id="5" w:name="_Toc237779782"/>
+      <w:bookmarkStart w:id="5" w:name="_Toc237782189"/>
       <w:r>
         <w:rPr>
           <w:rFonts w:ascii="Georgia" w:hAnsi="Georgia"/>
@@ -7422,7 +7417,7 @@
         <w:pStyle w:val="Ttulo2"/>
         <w:spacing w:before="120" w:after="40"/>
       </w:pPr>
-      <w:bookmarkStart w:id="6" w:name="_Toc237779783"/>
+      <w:bookmarkStart w:id="6" w:name="_Toc237782190"/>
       <w:r>
         <w:rPr>
           <w:rFonts w:ascii="Georgia" w:hAnsi="Georgia"/>
@@ -8651,7 +8646,7 @@
         <w:pStyle w:val="Ttulo1"/>
         <w:spacing w:before="160" w:after="60"/>
       </w:pPr>
-      <w:bookmarkStart w:id="7" w:name="_Toc237779784"/>
+      <w:bookmarkStart w:id="7" w:name="_Toc237782191"/>
       <w:r>
         <w:rPr>
           <w:rFonts w:ascii="Georgia" w:hAnsi="Georgia"/>
@@ -8667,7 +8662,7 @@
         <w:pStyle w:val="Ttulo2"/>
         <w:spacing w:before="120" w:after="40"/>
       </w:pPr>
-      <w:bookmarkStart w:id="8" w:name="_Toc237779785"/>
+      <w:bookmarkStart w:id="8" w:name="_Toc237782192"/>
       <w:r>
         <w:rPr>
           <w:rFonts w:ascii="Georgia" w:hAnsi="Georgia"/>
@@ -8725,7 +8720,7 @@
                 <w:noProof/>
               </w:rPr>
               <w:drawing>
-                <wp:inline distT="0" distB="0" distL="0" distR="0" wp14:anchorId="148A9392" wp14:editId="234BF825">
+                <wp:inline distT="0" distB="0" distL="0" distR="0" wp14:anchorId="4E95FC45" wp14:editId="6AFBAFA4">
                   <wp:extent cx="3017520" cy="1471175"/>
                   <wp:effectExtent l="0" t="0" r="0" b="0"/>
                   <wp:docPr id="3" name="Picture 3"/>
@@ -8784,7 +8779,7 @@
                 <w:noProof/>
               </w:rPr>
               <w:drawing>
-                <wp:inline distT="0" distB="0" distL="0" distR="0" wp14:anchorId="347B6E72" wp14:editId="7E48DE6E">
+                <wp:inline distT="0" distB="0" distL="0" distR="0" wp14:anchorId="548E18D8" wp14:editId="6A5BF075">
                   <wp:extent cx="3017520" cy="1540956"/>
                   <wp:effectExtent l="0" t="0" r="0" b="0"/>
                   <wp:docPr id="4" name="Picture 4"/>
@@ -8889,7 +8884,7 @@
         <w:pStyle w:val="Ttulo2"/>
         <w:spacing w:before="120" w:after="40"/>
       </w:pPr>
-      <w:bookmarkStart w:id="9" w:name="_Toc237779786"/>
+      <w:bookmarkStart w:id="9" w:name="_Toc237782193"/>
       <w:r>
         <w:rPr>
           <w:rFonts w:ascii="Georgia" w:hAnsi="Georgia"/>
@@ -9122,7 +9117,7 @@
         <w:pStyle w:val="Ttulo1"/>
         <w:spacing w:before="160" w:after="60"/>
       </w:pPr>
-      <w:bookmarkStart w:id="10" w:name="_Toc237779787"/>
+      <w:bookmarkStart w:id="10" w:name="_Toc237782194"/>
       <w:r>
         <w:rPr>
           <w:rFonts w:ascii="Georgia" w:hAnsi="Georgia"/>
@@ -9138,7 +9133,7 @@
         <w:pStyle w:val="Ttulo2"/>
         <w:spacing w:before="120" w:after="40"/>
       </w:pPr>
-      <w:bookmarkStart w:id="11" w:name="_Toc237779788"/>
+      <w:bookmarkStart w:id="11" w:name="_Toc237782195"/>
       <w:r>
         <w:rPr>
           <w:rFonts w:ascii="Georgia" w:hAnsi="Georgia"/>
@@ -9200,7 +9195,7 @@
                 <w:noProof/>
               </w:rPr>
               <w:drawing>
-                <wp:inline distT="0" distB="0" distL="0" distR="0" wp14:anchorId="4C8A2C0E" wp14:editId="6BC8E5EE">
+                <wp:inline distT="0" distB="0" distL="0" distR="0" wp14:anchorId="6424981C" wp14:editId="6AEC61AE">
                   <wp:extent cx="3017520" cy="1687385"/>
                   <wp:effectExtent l="0" t="0" r="0" b="0"/>
                   <wp:docPr id="5" name="Picture 5"/>
@@ -9259,7 +9254,7 @@
                 <w:noProof/>
               </w:rPr>
               <w:drawing>
-                <wp:inline distT="0" distB="0" distL="0" distR="0" wp14:anchorId="1529DB4B" wp14:editId="01CE7B3B">
+                <wp:inline distT="0" distB="0" distL="0" distR="0" wp14:anchorId="096C458D" wp14:editId="19B4F716">
                   <wp:extent cx="3017520" cy="1527468"/>
                   <wp:effectExtent l="0" t="0" r="0" b="0"/>
                   <wp:docPr id="6" name="Picture 6"/>
@@ -9364,7 +9359,7 @@
         <w:pStyle w:val="Ttulo2"/>
         <w:spacing w:before="120" w:after="40"/>
       </w:pPr>
-      <w:bookmarkStart w:id="12" w:name="_Toc237779789"/>
+      <w:bookmarkStart w:id="12" w:name="_Toc237782196"/>
       <w:r>
         <w:rPr>
           <w:rFonts w:ascii="Georgia" w:hAnsi="Georgia"/>
@@ -9394,7 +9389,7 @@
         <w:pStyle w:val="Ttulo2"/>
         <w:spacing w:before="120" w:after="40"/>
       </w:pPr>
-      <w:bookmarkStart w:id="13" w:name="_Toc237779790"/>
+      <w:bookmarkStart w:id="13" w:name="_Toc237782197"/>
       <w:r>
         <w:rPr>
           <w:rFonts w:ascii="Georgia" w:hAnsi="Georgia"/>
@@ -9452,7 +9447,7 @@
                 <w:noProof/>
               </w:rPr>
               <w:drawing>
-                <wp:inline distT="0" distB="0" distL="0" distR="0" wp14:anchorId="695A35A3" wp14:editId="44C898B1">
+                <wp:inline distT="0" distB="0" distL="0" distR="0" wp14:anchorId="4E77B7B2" wp14:editId="61CF040D">
                   <wp:extent cx="3017520" cy="1677129"/>
                   <wp:effectExtent l="0" t="0" r="0" b="0"/>
                   <wp:docPr id="7" name="Picture 7"/>
@@ -9511,7 +9506,7 @@
                 <w:noProof/>
               </w:rPr>
               <w:drawing>
-                <wp:inline distT="0" distB="0" distL="0" distR="0" wp14:anchorId="5E968D0D" wp14:editId="50AE01E4">
+                <wp:inline distT="0" distB="0" distL="0" distR="0" wp14:anchorId="5DDB3F23" wp14:editId="3F120871">
                   <wp:extent cx="3017520" cy="1525712"/>
                   <wp:effectExtent l="0" t="0" r="0" b="0"/>
                   <wp:docPr id="8" name="Picture 8"/>
@@ -9616,7 +9611,7 @@
         <w:pStyle w:val="Ttulo2"/>
         <w:spacing w:before="120" w:after="40"/>
       </w:pPr>
-      <w:bookmarkStart w:id="14" w:name="_Toc237779791"/>
+      <w:bookmarkStart w:id="14" w:name="_Toc237782198"/>
       <w:r>
         <w:rPr>
           <w:rFonts w:ascii="Georgia" w:hAnsi="Georgia"/>
@@ -9678,7 +9673,7 @@
               </w:rPr>
               <w:lastRenderedPageBreak/>
               <w:drawing>
-                <wp:inline distT="0" distB="0" distL="0" distR="0" wp14:anchorId="3E8B5D52" wp14:editId="0387F64C">
+                <wp:inline distT="0" distB="0" distL="0" distR="0" wp14:anchorId="31DAB204" wp14:editId="2DEC0A90">
                   <wp:extent cx="3017520" cy="1714258"/>
                   <wp:effectExtent l="0" t="0" r="0" b="0"/>
                   <wp:docPr id="9" name="Picture 9"/>
@@ -9737,7 +9732,7 @@
                 <w:noProof/>
               </w:rPr>
               <w:drawing>
-                <wp:inline distT="0" distB="0" distL="0" distR="0" wp14:anchorId="12007D7B" wp14:editId="37DA902E">
+                <wp:inline distT="0" distB="0" distL="0" distR="0" wp14:anchorId="535DF840" wp14:editId="57098318">
                   <wp:extent cx="3017520" cy="1857285"/>
                   <wp:effectExtent l="0" t="0" r="0" b="0"/>
                   <wp:docPr id="10" name="Picture 10"/>
@@ -9842,7 +9837,7 @@
         <w:pStyle w:val="Ttulo1"/>
         <w:spacing w:before="160" w:after="60"/>
       </w:pPr>
-      <w:bookmarkStart w:id="15" w:name="_Toc237779792"/>
+      <w:bookmarkStart w:id="15" w:name="_Toc237782199"/>
       <w:r>
         <w:rPr>
           <w:rFonts w:ascii="Georgia" w:hAnsi="Georgia"/>
@@ -9858,7 +9853,7 @@
         <w:pStyle w:val="Ttulo2"/>
         <w:spacing w:before="120" w:after="40"/>
       </w:pPr>
-      <w:bookmarkStart w:id="16" w:name="_Toc237779793"/>
+      <w:bookmarkStart w:id="16" w:name="_Toc237782200"/>
       <w:r>
         <w:rPr>
           <w:rFonts w:ascii="Georgia" w:hAnsi="Georgia"/>
@@ -10292,7 +10287,7 @@
         <w:pStyle w:val="Ttulo2"/>
         <w:spacing w:before="120" w:after="40"/>
       </w:pPr>
-      <w:bookmarkStart w:id="17" w:name="_Toc237779794"/>
+      <w:bookmarkStart w:id="17" w:name="_Toc237782201"/>
       <w:r>
         <w:rPr>
           <w:rFonts w:ascii="Georgia" w:hAnsi="Georgia"/>
@@ -10319,7 +10314,7 @@
         <w:pStyle w:val="Ttulo1"/>
         <w:spacing w:before="160" w:after="60"/>
       </w:pPr>
-      <w:bookmarkStart w:id="18" w:name="_Toc237779795"/>
+      <w:bookmarkStart w:id="18" w:name="_Toc237782202"/>
       <w:r>
         <w:rPr>
           <w:rFonts w:ascii="Georgia" w:hAnsi="Georgia"/>
@@ -10335,7 +10330,7 @@
         <w:pStyle w:val="Ttulo2"/>
         <w:spacing w:before="120" w:after="40"/>
       </w:pPr>
-      <w:bookmarkStart w:id="19" w:name="_Toc237779796"/>
+      <w:bookmarkStart w:id="19" w:name="_Toc237782203"/>
       <w:r>
         <w:rPr>
           <w:rFonts w:ascii="Georgia" w:hAnsi="Georgia"/>
@@ -10362,7 +10357,7 @@
         <w:pStyle w:val="Ttulo2"/>
         <w:spacing w:before="120" w:after="40"/>
       </w:pPr>
-      <w:bookmarkStart w:id="20" w:name="_Toc237779797"/>
+      <w:bookmarkStart w:id="20" w:name="_Toc237782204"/>
       <w:r>
         <w:rPr>
           <w:rFonts w:ascii="Georgia" w:hAnsi="Georgia"/>
@@ -10420,7 +10415,7 @@
                 <w:noProof/>
               </w:rPr>
               <w:drawing>
-                <wp:inline distT="0" distB="0" distL="0" distR="0" wp14:anchorId="56DA0CE7" wp14:editId="062DCBBE">
+                <wp:inline distT="0" distB="0" distL="0" distR="0" wp14:anchorId="22F71360" wp14:editId="7BAF13AD">
                   <wp:extent cx="3017520" cy="1768243"/>
                   <wp:effectExtent l="0" t="0" r="0" b="0"/>
                   <wp:docPr id="11" name="Picture 11"/>
@@ -10479,7 +10474,7 @@
                 <w:noProof/>
               </w:rPr>
               <w:drawing>
-                <wp:inline distT="0" distB="0" distL="0" distR="0" wp14:anchorId="25EDF8FD" wp14:editId="3575C7E5">
+                <wp:inline distT="0" distB="0" distL="0" distR="0" wp14:anchorId="0692D0D5" wp14:editId="49622DF5">
                   <wp:extent cx="3017520" cy="1606881"/>
                   <wp:effectExtent l="0" t="0" r="0" b="0"/>
                   <wp:docPr id="12" name="Picture 12"/>
@@ -11453,7 +11448,7 @@
         <w:pStyle w:val="Ttulo1"/>
         <w:spacing w:before="160" w:after="60"/>
       </w:pPr>
-      <w:bookmarkStart w:id="21" w:name="_Toc237779798"/>
+      <w:bookmarkStart w:id="21" w:name="_Toc237782205"/>
       <w:r>
         <w:rPr>
           <w:rFonts w:ascii="Georgia" w:hAnsi="Georgia"/>
@@ -11469,7 +11464,7 @@
         <w:pStyle w:val="Ttulo2"/>
         <w:spacing w:before="120" w:after="40"/>
       </w:pPr>
-      <w:bookmarkStart w:id="22" w:name="_Toc237779799"/>
+      <w:bookmarkStart w:id="22" w:name="_Toc237782206"/>
       <w:r>
         <w:rPr>
           <w:rFonts w:ascii="Georgia" w:hAnsi="Georgia"/>
@@ -11561,7 +11556,7 @@
         <w:pStyle w:val="Ttulo2"/>
         <w:spacing w:before="120" w:after="40"/>
       </w:pPr>
-      <w:bookmarkStart w:id="23" w:name="_Toc237779800"/>
+      <w:bookmarkStart w:id="23" w:name="_Toc237782207"/>
       <w:r>
         <w:rPr>
           <w:rFonts w:ascii="Georgia" w:hAnsi="Georgia"/>
@@ -11792,7 +11787,7 @@
                 <w:noProof/>
               </w:rPr>
               <w:drawing>
-                <wp:inline distT="0" distB="0" distL="0" distR="0" wp14:anchorId="028268B3" wp14:editId="5FF73999">
+                <wp:inline distT="0" distB="0" distL="0" distR="0" wp14:anchorId="5689DAC8" wp14:editId="019B0F24">
                   <wp:extent cx="3017520" cy="1588528"/>
                   <wp:effectExtent l="0" t="0" r="0" b="0"/>
                   <wp:docPr id="13" name="Picture 13"/>
@@ -11851,7 +11846,7 @@
                 <w:noProof/>
               </w:rPr>
               <w:drawing>
-                <wp:inline distT="0" distB="0" distL="0" distR="0" wp14:anchorId="2A69809F" wp14:editId="2C781CAB">
+                <wp:inline distT="0" distB="0" distL="0" distR="0" wp14:anchorId="34A07B72" wp14:editId="0BAC9411">
                   <wp:extent cx="3017520" cy="1709851"/>
                   <wp:effectExtent l="0" t="0" r="0" b="0"/>
                   <wp:docPr id="14" name="Picture 14"/>
@@ -11956,7 +11951,7 @@
         <w:pStyle w:val="Ttulo2"/>
         <w:spacing w:before="120" w:after="40"/>
       </w:pPr>
-      <w:bookmarkStart w:id="24" w:name="_Toc237779801"/>
+      <w:bookmarkStart w:id="24" w:name="_Toc237782208"/>
       <w:r>
         <w:rPr>
           <w:rFonts w:ascii="Georgia" w:hAnsi="Georgia"/>
@@ -12900,7 +12895,7 @@
         <w:pStyle w:val="Ttulo1"/>
         <w:spacing w:before="160" w:after="60"/>
       </w:pPr>
-      <w:bookmarkStart w:id="25" w:name="_Toc237779802"/>
+      <w:bookmarkStart w:id="25" w:name="_Toc237782209"/>
       <w:r>
         <w:rPr>
           <w:rFonts w:ascii="Georgia" w:hAnsi="Georgia"/>
@@ -12916,7 +12911,7 @@
         <w:pStyle w:val="Ttulo2"/>
         <w:spacing w:before="120" w:after="40"/>
       </w:pPr>
-      <w:bookmarkStart w:id="26" w:name="_Toc237779803"/>
+      <w:bookmarkStart w:id="26" w:name="_Toc237782210"/>
       <w:r>
         <w:rPr>
           <w:rFonts w:ascii="Georgia" w:hAnsi="Georgia"/>
@@ -14529,7 +14524,7 @@
         <w:pStyle w:val="Ttulo2"/>
         <w:spacing w:before="120" w:after="40"/>
       </w:pPr>
-      <w:bookmarkStart w:id="27" w:name="_Toc237779804"/>
+      <w:bookmarkStart w:id="27" w:name="_Toc237782211"/>
       <w:r>
         <w:rPr>
           <w:rFonts w:ascii="Georgia" w:hAnsi="Georgia"/>
@@ -14643,7 +14638,7 @@
         <w:pStyle w:val="Ttulo1"/>
         <w:spacing w:before="160" w:after="60"/>
       </w:pPr>
-      <w:bookmarkStart w:id="28" w:name="_Toc237779805"/>
+      <w:bookmarkStart w:id="28" w:name="_Toc237782212"/>
       <w:r>
         <w:rPr>
           <w:rFonts w:ascii="Georgia" w:hAnsi="Georgia"/>
@@ -14659,7 +14654,7 @@
         <w:pStyle w:val="Ttulo2"/>
         <w:spacing w:before="120" w:after="40"/>
       </w:pPr>
-      <w:bookmarkStart w:id="29" w:name="_Toc237779806"/>
+      <w:bookmarkStart w:id="29" w:name="_Toc237782213"/>
       <w:r>
         <w:rPr>
           <w:rFonts w:ascii="Georgia" w:hAnsi="Georgia"/>
@@ -14686,7 +14681,7 @@
         <w:pStyle w:val="Ttulo2"/>
         <w:spacing w:before="120" w:after="40"/>
       </w:pPr>
-      <w:bookmarkStart w:id="30" w:name="_Toc237779807"/>
+      <w:bookmarkStart w:id="30" w:name="_Toc237782214"/>
       <w:r>
         <w:rPr>
           <w:rFonts w:ascii="Georgia" w:hAnsi="Georgia"/>
@@ -14744,7 +14739,7 @@
                 <w:noProof/>
               </w:rPr>
               <w:drawing>
-                <wp:inline distT="0" distB="0" distL="0" distR="0" wp14:anchorId="16F09BD9" wp14:editId="27979180">
+                <wp:inline distT="0" distB="0" distL="0" distR="0" wp14:anchorId="76B9125F" wp14:editId="3502C5EE">
                   <wp:extent cx="3017520" cy="1582552"/>
                   <wp:effectExtent l="0" t="0" r="0" b="0"/>
                   <wp:docPr id="15" name="Picture 15"/>
@@ -14803,7 +14798,7 @@
                 <w:noProof/>
               </w:rPr>
               <w:drawing>
-                <wp:inline distT="0" distB="0" distL="0" distR="0" wp14:anchorId="7CB5A1C8" wp14:editId="5F0C5E08">
+                <wp:inline distT="0" distB="0" distL="0" distR="0" wp14:anchorId="466FFD9F" wp14:editId="5161A583">
                   <wp:extent cx="3017520" cy="1733035"/>
                   <wp:effectExtent l="0" t="0" r="0" b="0"/>
                   <wp:docPr id="16" name="Picture 16"/>
@@ -14919,7 +14914,7 @@
         <w:pStyle w:val="Ttulo1"/>
         <w:spacing w:before="160" w:after="60"/>
       </w:pPr>
-      <w:bookmarkStart w:id="31" w:name="_Toc237779808"/>
+      <w:bookmarkStart w:id="31" w:name="_Toc237782215"/>
       <w:r>
         <w:rPr>
           <w:rFonts w:ascii="Georgia" w:hAnsi="Georgia"/>
@@ -14935,7 +14930,7 @@
         <w:pStyle w:val="Ttulo2"/>
         <w:spacing w:before="120" w:after="40"/>
       </w:pPr>
-      <w:bookmarkStart w:id="32" w:name="_Toc237779809"/>
+      <w:bookmarkStart w:id="32" w:name="_Toc237782216"/>
       <w:r>
         <w:rPr>
           <w:rFonts w:ascii="Georgia" w:hAnsi="Georgia"/>
@@ -16000,7 +15995,7 @@
         <w:pStyle w:val="Ttulo2"/>
         <w:spacing w:before="120" w:after="40"/>
       </w:pPr>
-      <w:bookmarkStart w:id="33" w:name="_Toc237779810"/>
+      <w:bookmarkStart w:id="33" w:name="_Toc237782217"/>
       <w:r>
         <w:rPr>
           <w:rFonts w:ascii="Georgia" w:hAnsi="Georgia"/>
@@ -16196,7 +16191,7 @@
         <w:pStyle w:val="Ttulo2"/>
         <w:spacing w:before="120" w:after="40"/>
       </w:pPr>
-      <w:bookmarkStart w:id="34" w:name="_Toc237779811"/>
+      <w:bookmarkStart w:id="34" w:name="_Toc237782218"/>
       <w:r>
         <w:rPr>
           <w:rFonts w:ascii="Georgia" w:hAnsi="Georgia"/>
@@ -16223,7 +16218,7 @@
         <w:pStyle w:val="Ttulo1"/>
         <w:spacing w:before="160" w:after="60"/>
       </w:pPr>
-      <w:bookmarkStart w:id="35" w:name="_Toc237779812"/>
+      <w:bookmarkStart w:id="35" w:name="_Toc237782219"/>
       <w:r>
         <w:rPr>
           <w:rFonts w:ascii="Georgia" w:hAnsi="Georgia"/>
@@ -16239,7 +16234,7 @@
         <w:pStyle w:val="Ttulo2"/>
         <w:spacing w:before="120" w:after="40"/>
       </w:pPr>
-      <w:bookmarkStart w:id="36" w:name="_Toc237779813"/>
+      <w:bookmarkStart w:id="36" w:name="_Toc237782220"/>
       <w:r>
         <w:rPr>
           <w:rFonts w:ascii="Georgia" w:hAnsi="Georgia"/>
@@ -19183,7 +19178,7 @@
         <w:pStyle w:val="Ttulo1"/>
         <w:spacing w:before="160" w:after="60"/>
       </w:pPr>
-      <w:bookmarkStart w:id="37" w:name="_Toc237779814"/>
+      <w:bookmarkStart w:id="37" w:name="_Toc237782221"/>
       <w:r>
         <w:rPr>
           <w:rFonts w:ascii="Georgia" w:hAnsi="Georgia"/>
@@ -19199,7 +19194,7 @@
         <w:pStyle w:val="Ttulo2"/>
         <w:spacing w:before="120" w:after="40"/>
       </w:pPr>
-      <w:bookmarkStart w:id="38" w:name="_Toc237779815"/>
+      <w:bookmarkStart w:id="38" w:name="_Toc237782222"/>
       <w:r>
         <w:rPr>
           <w:rFonts w:ascii="Georgia" w:hAnsi="Georgia"/>
@@ -19406,7 +19401,7 @@
         <w:pStyle w:val="Ttulo2"/>
         <w:spacing w:before="120" w:after="40"/>
       </w:pPr>
-      <w:bookmarkStart w:id="39" w:name="_Toc237779816"/>
+      <w:bookmarkStart w:id="39" w:name="_Toc237782223"/>
       <w:r>
         <w:rPr>
           <w:rFonts w:ascii="Georgia" w:hAnsi="Georgia"/>
@@ -19464,7 +19459,7 @@
                 <w:noProof/>
               </w:rPr>
               <w:drawing>
-                <wp:inline distT="0" distB="0" distL="0" distR="0" wp14:anchorId="788033CB" wp14:editId="694FD93F">
+                <wp:inline distT="0" distB="0" distL="0" distR="0" wp14:anchorId="2A1769E2" wp14:editId="5F45CE07">
                   <wp:extent cx="3017520" cy="1677399"/>
                   <wp:effectExtent l="0" t="0" r="0" b="0"/>
                   <wp:docPr id="17" name="Picture 17"/>
@@ -19523,7 +19518,7 @@
                 <w:noProof/>
               </w:rPr>
               <w:drawing>
-                <wp:inline distT="0" distB="0" distL="0" distR="0" wp14:anchorId="374E324F" wp14:editId="4DECD42B">
+                <wp:inline distT="0" distB="0" distL="0" distR="0" wp14:anchorId="13FDD4F6" wp14:editId="0BDFA2DC">
                   <wp:extent cx="3017520" cy="1744540"/>
                   <wp:effectExtent l="0" t="0" r="0" b="0"/>
                   <wp:docPr id="18" name="Picture 18"/>
@@ -19628,7 +19623,7 @@
         <w:pStyle w:val="Ttulo2"/>
         <w:spacing w:before="120" w:after="40"/>
       </w:pPr>
-      <w:bookmarkStart w:id="40" w:name="_Toc237779817"/>
+      <w:bookmarkStart w:id="40" w:name="_Toc237782224"/>
       <w:r>
         <w:rPr>
           <w:rFonts w:ascii="Georgia" w:hAnsi="Georgia"/>
@@ -20266,7 +20261,7 @@
         <w:pStyle w:val="Ttulo1"/>
         <w:spacing w:before="160" w:after="60"/>
       </w:pPr>
-      <w:bookmarkStart w:id="41" w:name="_Toc237779818"/>
+      <w:bookmarkStart w:id="41" w:name="_Toc237782225"/>
       <w:r>
         <w:rPr>
           <w:rFonts w:ascii="Georgia" w:hAnsi="Georgia"/>
@@ -20282,7 +20277,7 @@
         <w:pStyle w:val="Ttulo2"/>
         <w:spacing w:before="120" w:after="40"/>
       </w:pPr>
-      <w:bookmarkStart w:id="42" w:name="_Toc237779819"/>
+      <w:bookmarkStart w:id="42" w:name="_Toc237782226"/>
       <w:r>
         <w:rPr>
           <w:rFonts w:ascii="Georgia" w:hAnsi="Georgia"/>
@@ -20340,7 +20335,7 @@
                 <w:noProof/>
               </w:rPr>
               <w:drawing>
-                <wp:inline distT="0" distB="0" distL="0" distR="0" wp14:anchorId="11945CCD" wp14:editId="03B8DC86">
+                <wp:inline distT="0" distB="0" distL="0" distR="0" wp14:anchorId="1D777BF6" wp14:editId="0BDB3C06">
                   <wp:extent cx="3017520" cy="1541920"/>
                   <wp:effectExtent l="0" t="0" r="0" b="0"/>
                   <wp:docPr id="19" name="Picture 19"/>
@@ -20399,7 +20394,7 @@
                 <w:noProof/>
               </w:rPr>
               <w:drawing>
-                <wp:inline distT="0" distB="0" distL="0" distR="0" wp14:anchorId="65F0AF0F" wp14:editId="5D78BCFF">
+                <wp:inline distT="0" distB="0" distL="0" distR="0" wp14:anchorId="749A79BC" wp14:editId="653D0D0B">
                   <wp:extent cx="3017520" cy="1735190"/>
                   <wp:effectExtent l="0" t="0" r="0" b="0"/>
                   <wp:docPr id="20" name="Picture 20"/>
@@ -21539,7 +21534,7 @@
         <w:pStyle w:val="Ttulo1"/>
         <w:spacing w:before="160" w:after="60"/>
       </w:pPr>
-      <w:bookmarkStart w:id="43" w:name="_Toc237779820"/>
+      <w:bookmarkStart w:id="43" w:name="_Toc237782227"/>
       <w:r>
         <w:rPr>
           <w:rFonts w:ascii="Georgia" w:hAnsi="Georgia"/>
@@ -21555,7 +21550,7 @@
         <w:pStyle w:val="Ttulo2"/>
         <w:spacing w:before="120" w:after="40"/>
       </w:pPr>
-      <w:bookmarkStart w:id="44" w:name="_Toc237779821"/>
+      <w:bookmarkStart w:id="44" w:name="_Toc237782228"/>
       <w:r>
         <w:rPr>
           <w:rFonts w:ascii="Georgia" w:hAnsi="Georgia"/>
@@ -21610,7 +21605,7 @@
         <w:pStyle w:val="Ttulo2"/>
         <w:spacing w:before="120" w:after="40"/>
       </w:pPr>
-      <w:bookmarkStart w:id="45" w:name="_Toc237779822"/>
+      <w:bookmarkStart w:id="45" w:name="_Toc237782229"/>
       <w:r>
         <w:rPr>
           <w:rFonts w:ascii="Georgia" w:hAnsi="Georgia"/>
@@ -21668,7 +21663,7 @@
                 <w:noProof/>
               </w:rPr>
               <w:drawing>
-                <wp:inline distT="0" distB="0" distL="0" distR="0" wp14:anchorId="7BF767B6" wp14:editId="5D52B298">
+                <wp:inline distT="0" distB="0" distL="0" distR="0" wp14:anchorId="722A40A0" wp14:editId="59FE2DF7">
                   <wp:extent cx="3017520" cy="1735190"/>
                   <wp:effectExtent l="0" t="0" r="0" b="0"/>
                   <wp:docPr id="21" name="Picture 21"/>
@@ -21727,7 +21722,7 @@
                 <w:noProof/>
               </w:rPr>
               <w:drawing>
-                <wp:inline distT="0" distB="0" distL="0" distR="0" wp14:anchorId="489A4643" wp14:editId="61865865">
+                <wp:inline distT="0" distB="0" distL="0" distR="0" wp14:anchorId="07362FAE" wp14:editId="44CFDC9C">
                   <wp:extent cx="3017520" cy="1598185"/>
                   <wp:effectExtent l="0" t="0" r="0" b="0"/>
                   <wp:docPr id="22" name="Picture 22"/>
@@ -21832,7 +21827,7 @@
         <w:pStyle w:val="Ttulo1"/>
         <w:spacing w:before="160" w:after="60"/>
       </w:pPr>
-      <w:bookmarkStart w:id="46" w:name="_Toc237779823"/>
+      <w:bookmarkStart w:id="46" w:name="_Toc237782230"/>
       <w:r>
         <w:rPr>
           <w:rFonts w:ascii="Georgia" w:hAnsi="Georgia"/>
@@ -21848,7 +21843,7 @@
         <w:pStyle w:val="Ttulo2"/>
         <w:spacing w:before="120" w:after="40"/>
       </w:pPr>
-      <w:bookmarkStart w:id="47" w:name="_Toc237779824"/>
+      <w:bookmarkStart w:id="47" w:name="_Toc237782231"/>
       <w:r>
         <w:rPr>
           <w:rFonts w:ascii="Georgia" w:hAnsi="Georgia"/>
@@ -23405,7 +23400,7 @@
         <w:pStyle w:val="Ttulo1"/>
         <w:spacing w:before="160" w:after="60"/>
       </w:pPr>
-      <w:bookmarkStart w:id="48" w:name="_Toc237779825"/>
+      <w:bookmarkStart w:id="48" w:name="_Toc237782232"/>
       <w:r>
         <w:rPr>
           <w:rFonts w:ascii="Georgia" w:hAnsi="Georgia"/>
@@ -23421,7 +23416,7 @@
         <w:pStyle w:val="Ttulo2"/>
         <w:spacing w:before="120" w:after="40"/>
       </w:pPr>
-      <w:bookmarkStart w:id="49" w:name="_Toc237779826"/>
+      <w:bookmarkStart w:id="49" w:name="_Toc237782233"/>
       <w:r>
         <w:rPr>
           <w:rFonts w:ascii="Georgia" w:hAnsi="Georgia"/>
@@ -23545,7 +23540,7 @@
               </w:rPr>
               <w:lastRenderedPageBreak/>
               <w:drawing>
-                <wp:inline distT="0" distB="0" distL="0" distR="0" wp14:anchorId="79FA15A5" wp14:editId="0A1D5DEB">
+                <wp:inline distT="0" distB="0" distL="0" distR="0" wp14:anchorId="754F2190" wp14:editId="77C789CB">
                   <wp:extent cx="3017520" cy="1748097"/>
                   <wp:effectExtent l="0" t="0" r="0" b="0"/>
                   <wp:docPr id="23" name="Picture 23"/>
@@ -23604,7 +23599,7 @@
                 <w:noProof/>
               </w:rPr>
               <w:drawing>
-                <wp:inline distT="0" distB="0" distL="0" distR="0" wp14:anchorId="23A8C755" wp14:editId="1CF3BBE2">
+                <wp:inline distT="0" distB="0" distL="0" distR="0" wp14:anchorId="3CFE33F2" wp14:editId="7F1BA6D9">
                   <wp:extent cx="3017520" cy="1621771"/>
                   <wp:effectExtent l="0" t="0" r="0" b="0"/>
                   <wp:docPr id="24" name="Picture 24"/>
@@ -23709,7 +23704,7 @@
         <w:pStyle w:val="Ttulo2"/>
         <w:spacing w:before="120" w:after="40"/>
       </w:pPr>
-      <w:bookmarkStart w:id="50" w:name="_Toc237779827"/>
+      <w:bookmarkStart w:id="50" w:name="_Toc237782234"/>
       <w:r>
         <w:rPr>
           <w:rFonts w:ascii="Georgia" w:hAnsi="Georgia"/>
@@ -24453,7 +24448,7 @@
         <w:pStyle w:val="Ttulo2"/>
         <w:spacing w:before="120" w:after="40"/>
       </w:pPr>
-      <w:bookmarkStart w:id="51" w:name="_Toc237779828"/>
+      <w:bookmarkStart w:id="51" w:name="_Toc237782235"/>
       <w:r>
         <w:rPr>
           <w:rFonts w:ascii="Georgia" w:hAnsi="Georgia"/>
@@ -24514,7 +24509,7 @@
         <w:pStyle w:val="Ttulo2"/>
         <w:spacing w:before="120" w:after="40"/>
       </w:pPr>
-      <w:bookmarkStart w:id="52" w:name="_Toc237779829"/>
+      <w:bookmarkStart w:id="52" w:name="_Toc237782236"/>
       <w:r>
         <w:rPr>
           <w:rFonts w:ascii="Georgia" w:hAnsi="Georgia"/>
@@ -24595,7 +24590,7 @@
                 <w:noProof/>
               </w:rPr>
               <w:drawing>
-                <wp:inline distT="0" distB="0" distL="0" distR="0" wp14:anchorId="4D7B82D3" wp14:editId="1656BB90">
+                <wp:inline distT="0" distB="0" distL="0" distR="0" wp14:anchorId="62DCCE2A" wp14:editId="4BDDFA7F">
                   <wp:extent cx="3017520" cy="1749929"/>
                   <wp:effectExtent l="0" t="0" r="0" b="0"/>
                   <wp:docPr id="25" name="Picture 25"/>
@@ -24654,7 +24649,7 @@
                 <w:noProof/>
               </w:rPr>
               <w:drawing>
-                <wp:inline distT="0" distB="0" distL="0" distR="0" wp14:anchorId="18662DCD" wp14:editId="22F7C493">
+                <wp:inline distT="0" distB="0" distL="0" distR="0" wp14:anchorId="1DDFC0CA" wp14:editId="2BF3D961">
                   <wp:extent cx="3017520" cy="1664532"/>
                   <wp:effectExtent l="0" t="0" r="0" b="0"/>
                   <wp:docPr id="26" name="Picture 26"/>
@@ -25697,7 +25692,7 @@
         <w:pStyle w:val="Ttulo2"/>
         <w:spacing w:before="120" w:after="40"/>
       </w:pPr>
-      <w:bookmarkStart w:id="53" w:name="_Toc237779830"/>
+      <w:bookmarkStart w:id="53" w:name="_Toc237782237"/>
       <w:r>
         <w:rPr>
           <w:rFonts w:ascii="Georgia" w:hAnsi="Georgia"/>
@@ -25755,7 +25750,7 @@
                 <w:noProof/>
               </w:rPr>
               <w:drawing>
-                <wp:inline distT="0" distB="0" distL="0" distR="0" wp14:anchorId="163D1099" wp14:editId="3FB28537">
+                <wp:inline distT="0" distB="0" distL="0" distR="0" wp14:anchorId="44E72977" wp14:editId="732EA227">
                   <wp:extent cx="3017520" cy="1706444"/>
                   <wp:effectExtent l="0" t="0" r="0" b="0"/>
                   <wp:docPr id="27" name="Picture 27"/>
@@ -25814,7 +25809,7 @@
                 <w:noProof/>
               </w:rPr>
               <w:drawing>
-                <wp:inline distT="0" distB="0" distL="0" distR="0" wp14:anchorId="3EAD5B55" wp14:editId="1B95A93E">
+                <wp:inline distT="0" distB="0" distL="0" distR="0" wp14:anchorId="5F0FAFE5" wp14:editId="77DBDC99">
                   <wp:extent cx="3017520" cy="1751281"/>
                   <wp:effectExtent l="0" t="0" r="0" b="0"/>
                   <wp:docPr id="28" name="Picture 28"/>
@@ -25919,7 +25914,7 @@
         <w:pStyle w:val="Ttulo1"/>
         <w:spacing w:before="160" w:after="60"/>
       </w:pPr>
-      <w:bookmarkStart w:id="54" w:name="_Toc237779831"/>
+      <w:bookmarkStart w:id="54" w:name="_Toc237782238"/>
       <w:r>
         <w:rPr>
           <w:rFonts w:ascii="Georgia" w:hAnsi="Georgia"/>
@@ -25935,7 +25930,7 @@
         <w:pStyle w:val="Ttulo2"/>
         <w:spacing w:before="120" w:after="40"/>
       </w:pPr>
-      <w:bookmarkStart w:id="55" w:name="_Toc237779832"/>
+      <w:bookmarkStart w:id="55" w:name="_Toc237782239"/>
       <w:r>
         <w:rPr>
           <w:rFonts w:ascii="Georgia" w:hAnsi="Georgia"/>
@@ -25996,7 +25991,7 @@
         <w:pStyle w:val="Ttulo2"/>
         <w:spacing w:before="120" w:after="40"/>
       </w:pPr>
-      <w:bookmarkStart w:id="56" w:name="_Toc237779833"/>
+      <w:bookmarkStart w:id="56" w:name="_Toc237782240"/>
       <w:r>
         <w:rPr>
           <w:rFonts w:ascii="Georgia" w:hAnsi="Georgia"/>
@@ -26091,7 +26086,7 @@
                 <w:noProof/>
               </w:rPr>
               <w:drawing>
-                <wp:inline distT="0" distB="0" distL="0" distR="0" wp14:anchorId="578A6F70" wp14:editId="74E1F333">
+                <wp:inline distT="0" distB="0" distL="0" distR="0" wp14:anchorId="48AAD5D0" wp14:editId="5CD96CB2">
                   <wp:extent cx="3017520" cy="1701609"/>
                   <wp:effectExtent l="0" t="0" r="0" b="0"/>
                   <wp:docPr id="29" name="Picture 29"/>
@@ -26150,7 +26145,7 @@
                 <w:noProof/>
               </w:rPr>
               <w:drawing>
-                <wp:inline distT="0" distB="0" distL="0" distR="0" wp14:anchorId="1B3BF1BA" wp14:editId="65B52C55">
+                <wp:inline distT="0" distB="0" distL="0" distR="0" wp14:anchorId="1C2BC43B" wp14:editId="5613BD8F">
                   <wp:extent cx="3017520" cy="1661546"/>
                   <wp:effectExtent l="0" t="0" r="0" b="0"/>
                   <wp:docPr id="30" name="Picture 30"/>
@@ -26645,7 +26640,7 @@
         <w:pStyle w:val="Ttulo2"/>
         <w:spacing w:before="120" w:after="40"/>
       </w:pPr>
-      <w:bookmarkStart w:id="57" w:name="_Toc237779834"/>
+      <w:bookmarkStart w:id="57" w:name="_Toc237782241"/>
       <w:r>
         <w:rPr>
           <w:rFonts w:ascii="Georgia" w:hAnsi="Georgia"/>
@@ -26722,7 +26717,7 @@
                 <w:noProof/>
               </w:rPr>
               <w:drawing>
-                <wp:inline distT="0" distB="0" distL="0" distR="0" wp14:anchorId="7272A8D2" wp14:editId="33C3685E">
+                <wp:inline distT="0" distB="0" distL="0" distR="0" wp14:anchorId="4E5C04A5" wp14:editId="3B2B04C9">
                   <wp:extent cx="3017520" cy="1740520"/>
                   <wp:effectExtent l="0" t="0" r="0" b="0"/>
                   <wp:docPr id="31" name="Picture 31"/>
@@ -26799,14 +26794,12 @@
               <w:jc w:val="center"/>
               <w:tblBorders>
                 <w:top w:val="single" w:sz="4" w:space="0" w:color="D1D5DB"/>
-                <w:left w:val="single" w:sz="20" w:space="0" w:color="0D233A"/>
                 <w:bottom w:val="single" w:sz="4" w:space="0" w:color="D1D5DB"/>
-                <w:right w:val="single" w:sz="4" w:space="0" w:color="D1D5DB"/>
               </w:tblBorders>
               <w:tblLook w:val="04A0" w:firstRow="1" w:lastRow="0" w:firstColumn="1" w:lastColumn="0" w:noHBand="0" w:noVBand="1"/>
             </w:tblPr>
             <w:tblGrid>
-              <w:gridCol w:w="4894"/>
+              <w:gridCol w:w="4924"/>
             </w:tblGrid>
             <w:tr>
               <w:trPr>
@@ -26846,9 +26839,9 @@
                     <w:tblLook w:val="04A0" w:firstRow="1" w:lastRow="0" w:firstColumn="1" w:lastColumn="0" w:noHBand="0" w:noVBand="1"/>
                   </w:tblPr>
                   <w:tblGrid>
-                    <w:gridCol w:w="1624"/>
-                    <w:gridCol w:w="1621"/>
-                    <w:gridCol w:w="1619"/>
+                    <w:gridCol w:w="1636"/>
+                    <w:gridCol w:w="1634"/>
+                    <w:gridCol w:w="1634"/>
                   </w:tblGrid>
                   <w:tr>
                     <w:trPr>
@@ -27317,7 +27310,7 @@
         <w:pStyle w:val="Ttulo2"/>
         <w:spacing w:before="120" w:after="40"/>
       </w:pPr>
-      <w:bookmarkStart w:id="58" w:name="_Toc237779835"/>
+      <w:bookmarkStart w:id="58" w:name="_Toc237782242"/>
       <w:r>
         <w:rPr>
           <w:rFonts w:ascii="Georgia" w:hAnsi="Georgia"/>
@@ -28592,7 +28585,7 @@
         <w:pStyle w:val="Ttulo1"/>
         <w:spacing w:before="160" w:after="60"/>
       </w:pPr>
-      <w:bookmarkStart w:id="59" w:name="_Toc237779836"/>
+      <w:bookmarkStart w:id="59" w:name="_Toc237782243"/>
       <w:r>
         <w:rPr>
           <w:rFonts w:ascii="Georgia" w:hAnsi="Georgia"/>
@@ -28808,7 +28801,7 @@
         <w:pStyle w:val="Ttulo1"/>
         <w:spacing w:before="160" w:after="60"/>
       </w:pPr>
-      <w:bookmarkStart w:id="60" w:name="_Toc237779837"/>
+      <w:bookmarkStart w:id="60" w:name="_Toc237782244"/>
       <w:r>
         <w:rPr>
           <w:rFonts w:ascii="Georgia" w:hAnsi="Georgia"/>
@@ -37655,7 +37648,7 @@
         <w:pStyle w:val="Ttulo1"/>
         <w:spacing w:before="160" w:after="60"/>
       </w:pPr>
-      <w:bookmarkStart w:id="61" w:name="_Toc237779838"/>
+      <w:bookmarkStart w:id="61" w:name="_Toc237782245"/>
       <w:r>
         <w:rPr>
           <w:rFonts w:ascii="Georgia" w:hAnsi="Georgia"/>
@@ -38127,7 +38120,7 @@
         <w:pStyle w:val="Ttulo1"/>
         <w:spacing w:before="160" w:after="60"/>
       </w:pPr>
-      <w:bookmarkStart w:id="62" w:name="_Toc237779839"/>
+      <w:bookmarkStart w:id="62" w:name="_Toc237782246"/>
       <w:r>
         <w:rPr>
           <w:rFonts w:ascii="Georgia" w:hAnsi="Georgia"/>
@@ -38144,9 +38137,7 @@
         <w:jc w:val="center"/>
         <w:tblBorders>
           <w:top w:val="single" w:sz="4" w:space="0" w:color="D1D5DB"/>
-          <w:left w:val="single" w:sz="20" w:space="0" w:color="0D233A"/>
           <w:bottom w:val="single" w:sz="4" w:space="0" w:color="D1D5DB"/>
-          <w:right w:val="single" w:sz="4" w:space="0" w:color="D1D5DB"/>
         </w:tblBorders>
         <w:tblLook w:val="04A0" w:firstRow="1" w:lastRow="0" w:firstColumn="1" w:lastColumn="0" w:noHBand="0" w:noVBand="1"/>
       </w:tblPr>
@@ -38631,31 +38622,31 @@
       </w:rPr>
     </w:lvl>
   </w:abstractNum>
-  <w:num w:numId="1" w16cid:durableId="662008724">
+  <w:num w:numId="1" w16cid:durableId="719524366">
     <w:abstractNumId w:val="8"/>
   </w:num>
-  <w:num w:numId="2" w16cid:durableId="2027705978">
+  <w:num w:numId="2" w16cid:durableId="2077701981">
     <w:abstractNumId w:val="6"/>
   </w:num>
-  <w:num w:numId="3" w16cid:durableId="680086900">
+  <w:num w:numId="3" w16cid:durableId="2038114245">
     <w:abstractNumId w:val="5"/>
   </w:num>
-  <w:num w:numId="4" w16cid:durableId="1799686532">
+  <w:num w:numId="4" w16cid:durableId="446431315">
     <w:abstractNumId w:val="4"/>
   </w:num>
-  <w:num w:numId="5" w16cid:durableId="64645941">
+  <w:num w:numId="5" w16cid:durableId="306476620">
     <w:abstractNumId w:val="7"/>
   </w:num>
-  <w:num w:numId="6" w16cid:durableId="1139955322">
+  <w:num w:numId="6" w16cid:durableId="403912689">
     <w:abstractNumId w:val="3"/>
   </w:num>
-  <w:num w:numId="7" w16cid:durableId="871071078">
+  <w:num w:numId="7" w16cid:durableId="412166992">
     <w:abstractNumId w:val="2"/>
   </w:num>
-  <w:num w:numId="8" w16cid:durableId="1666165">
+  <w:num w:numId="8" w16cid:durableId="92364450">
     <w:abstractNumId w:val="1"/>
   </w:num>
-  <w:num w:numId="9" w16cid:durableId="953748764">
+  <w:num w:numId="9" w16cid:durableId="1459689207">
     <w:abstractNumId w:val="0"/>
   </w:num>
 </w:numbering>
@@ -50086,7 +50077,7 @@
     <w:autoRedefine/>
     <w:uiPriority w:val="39"/>
     <w:unhideWhenUsed/>
-    <w:rsid w:val="006123D8"/>
+    <w:rsid w:val="00D949AC"/>
     <w:pPr>
       <w:spacing w:before="10" w:after="10" w:line="240" w:lineRule="auto"/>
     </w:pPr>
@@ -50101,7 +50092,7 @@
     <w:autoRedefine/>
     <w:uiPriority w:val="39"/>
     <w:unhideWhenUsed/>
-    <w:rsid w:val="006123D8"/>
+    <w:rsid w:val="00D949AC"/>
     <w:pPr>
       <w:spacing w:after="0" w:line="240" w:lineRule="auto"/>
       <w:ind w:left="180"/>
@@ -50115,7 +50106,7 @@
     <w:basedOn w:val="Fuentedeprrafopredeter"/>
     <w:uiPriority w:val="99"/>
     <w:unhideWhenUsed/>
-    <w:rsid w:val="006123D8"/>
+    <w:rsid w:val="00D949AC"/>
     <w:rPr>
       <w:color w:val="0000FF" w:themeColor="hyperlink"/>
       <w:u w:val="single"/>

</xml_diff>

<commit_message>
style: depuracion exhaustiva de expresiones formulaicas y perfeccionamiento de redaccion tecnica en PDF y Word
</commit_message>
<xml_diff>
--- a/01_Reporte_PDF/Informe_Valuacion_Aluar_UNCuyo.docx
+++ b/01_Reporte_PDF/Informe_Valuacion_Aluar_UNCuyo.docx
@@ -1204,7 +1204,7 @@
               <w:rPr>
                 <w:sz w:val="16"/>
               </w:rPr>
-              <w:t xml:space="preserve"> El mercado asigna un múltiplo histórico deprimido (13,4x EV/EBITDA) sobre el ejercicio recesivo 2025; nuestro modelo demuestra que la normalización operativa en 2026e (EBITDA USD 391,2 MM) reduce el múltiplo forward a 5,2x.</w:t>
+              <w:t xml:space="preserve"> La cotización actual descuenta el ejercicio recesivo 2025 (13,4x EV/EBITDA); la recuperación operativa proyectada para 2026e (EBITDA USD 391,2 MM) sitúa el múltiplo forward en 5,2x.</w:t>
             </w:r>
           </w:p>
           <w:p>
@@ -1225,7 +1225,7 @@
               <w:rPr>
                 <w:sz w:val="16"/>
               </w:rPr>
-              <w:t xml:space="preserve"> Tras finalizar la etapa intensiva del parque eólico, el flujo de caja operativo reduce la Deuda Neta a &lt;1,0x EBITDA hacia 2028e, liberando recursos para dividendos.</w:t>
+              <w:t xml:space="preserve"> Concluida la etapa intensiva del parque eólico, la generación operativa reduce la Deuda Neta a &lt;1,0x EBITDA hacia 2028e, habilitando mayor distribución de dividendos.</w:t>
             </w:r>
           </w:p>
           <w:p>
@@ -1246,7 +1246,7 @@
               <w:rPr>
                 <w:sz w:val="16"/>
               </w:rPr>
-              <w:t xml:space="preserve"> El mercado sobreestima la prima por riesgo soberano al asumir λ = 1,0; el 80% de ventas en moneda dura y costos fijos en pesos justifican un costo de capital de 7,06%.</w:t>
+              <w:t xml:space="preserve"> El mercado sobreestima la prima soberana al asumir λ = 1,0; la estructura con 80% de ventas dolarizadas y costos operativos en moneda local fundamenta un costo de capital de 7,06%.</w:t>
             </w:r>
           </w:p>
         </w:tc>
@@ -1568,7 +1568,7 @@
         </w:rPr>
         <w:fldChar w:fldCharType="separate"/>
       </w:r>
-      <w:hyperlink w:anchor="_Toc237782184" w:history="1">
+      <w:hyperlink w:anchor="_Toc237786946" w:history="1">
         <w:r>
           <w:rPr>
             <w:rStyle w:val="Hipervnculo"/>
@@ -1595,7 +1595,7 @@
             <w:noProof/>
             <w:webHidden/>
           </w:rPr>
-          <w:instrText xml:space="preserve"> PAGEREF _Toc237782184 \h </w:instrText>
+          <w:instrText xml:space="preserve"> PAGEREF _Toc237786946 \h </w:instrText>
         </w:r>
         <w:r>
           <w:rPr>
@@ -1642,7 +1642,7 @@
           <w14:ligatures w14:val="standardContextual"/>
         </w:rPr>
       </w:pPr>
-      <w:hyperlink w:anchor="_Toc237782185" w:history="1">
+      <w:hyperlink w:anchor="_Toc237786947" w:history="1">
         <w:r>
           <w:rPr>
             <w:rStyle w:val="Hipervnculo"/>
@@ -1669,7 +1669,7 @@
             <w:noProof/>
             <w:webHidden/>
           </w:rPr>
-          <w:instrText xml:space="preserve"> PAGEREF _Toc237782185 \h </w:instrText>
+          <w:instrText xml:space="preserve"> PAGEREF _Toc237786947 \h </w:instrText>
         </w:r>
         <w:r>
           <w:rPr>
@@ -1716,7 +1716,7 @@
           <w14:ligatures w14:val="standardContextual"/>
         </w:rPr>
       </w:pPr>
-      <w:hyperlink w:anchor="_Toc237782186" w:history="1">
+      <w:hyperlink w:anchor="_Toc237786948" w:history="1">
         <w:r>
           <w:rPr>
             <w:rStyle w:val="Hipervnculo"/>
@@ -1743,7 +1743,7 @@
             <w:noProof/>
             <w:webHidden/>
           </w:rPr>
-          <w:instrText xml:space="preserve"> PAGEREF _Toc237782186 \h </w:instrText>
+          <w:instrText xml:space="preserve"> PAGEREF _Toc237786948 \h </w:instrText>
         </w:r>
         <w:r>
           <w:rPr>
@@ -1790,7 +1790,7 @@
           <w14:ligatures w14:val="standardContextual"/>
         </w:rPr>
       </w:pPr>
-      <w:hyperlink w:anchor="_Toc237782187" w:history="1">
+      <w:hyperlink w:anchor="_Toc237786949" w:history="1">
         <w:r>
           <w:rPr>
             <w:rStyle w:val="Hipervnculo"/>
@@ -1817,7 +1817,7 @@
             <w:noProof/>
             <w:webHidden/>
           </w:rPr>
-          <w:instrText xml:space="preserve"> PAGEREF _Toc237782187 \h </w:instrText>
+          <w:instrText xml:space="preserve"> PAGEREF _Toc237786949 \h </w:instrText>
         </w:r>
         <w:r>
           <w:rPr>
@@ -1864,7 +1864,7 @@
           <w14:ligatures w14:val="standardContextual"/>
         </w:rPr>
       </w:pPr>
-      <w:hyperlink w:anchor="_Toc237782188" w:history="1">
+      <w:hyperlink w:anchor="_Toc237786950" w:history="1">
         <w:r>
           <w:rPr>
             <w:rStyle w:val="Hipervnculo"/>
@@ -1891,7 +1891,7 @@
             <w:noProof/>
             <w:webHidden/>
           </w:rPr>
-          <w:instrText xml:space="preserve"> PAGEREF _Toc237782188 \h </w:instrText>
+          <w:instrText xml:space="preserve"> PAGEREF _Toc237786950 \h </w:instrText>
         </w:r>
         <w:r>
           <w:rPr>
@@ -1938,7 +1938,7 @@
           <w14:ligatures w14:val="standardContextual"/>
         </w:rPr>
       </w:pPr>
-      <w:hyperlink w:anchor="_Toc237782189" w:history="1">
+      <w:hyperlink w:anchor="_Toc237786951" w:history="1">
         <w:r>
           <w:rPr>
             <w:rStyle w:val="Hipervnculo"/>
@@ -1965,7 +1965,7 @@
             <w:noProof/>
             <w:webHidden/>
           </w:rPr>
-          <w:instrText xml:space="preserve"> PAGEREF _Toc237782189 \h </w:instrText>
+          <w:instrText xml:space="preserve"> PAGEREF _Toc237786951 \h </w:instrText>
         </w:r>
         <w:r>
           <w:rPr>
@@ -2012,7 +2012,7 @@
           <w14:ligatures w14:val="standardContextual"/>
         </w:rPr>
       </w:pPr>
-      <w:hyperlink w:anchor="_Toc237782190" w:history="1">
+      <w:hyperlink w:anchor="_Toc237786952" w:history="1">
         <w:r>
           <w:rPr>
             <w:rStyle w:val="Hipervnculo"/>
@@ -2039,7 +2039,7 @@
             <w:noProof/>
             <w:webHidden/>
           </w:rPr>
-          <w:instrText xml:space="preserve"> PAGEREF _Toc237782190 \h </w:instrText>
+          <w:instrText xml:space="preserve"> PAGEREF _Toc237786952 \h </w:instrText>
         </w:r>
         <w:r>
           <w:rPr>
@@ -2086,7 +2086,7 @@
           <w14:ligatures w14:val="standardContextual"/>
         </w:rPr>
       </w:pPr>
-      <w:hyperlink w:anchor="_Toc237782191" w:history="1">
+      <w:hyperlink w:anchor="_Toc237786953" w:history="1">
         <w:r>
           <w:rPr>
             <w:rStyle w:val="Hipervnculo"/>
@@ -2113,7 +2113,7 @@
             <w:noProof/>
             <w:webHidden/>
           </w:rPr>
-          <w:instrText xml:space="preserve"> PAGEREF _Toc237782191 \h </w:instrText>
+          <w:instrText xml:space="preserve"> PAGEREF _Toc237786953 \h </w:instrText>
         </w:r>
         <w:r>
           <w:rPr>
@@ -2160,7 +2160,7 @@
           <w14:ligatures w14:val="standardContextual"/>
         </w:rPr>
       </w:pPr>
-      <w:hyperlink w:anchor="_Toc237782192" w:history="1">
+      <w:hyperlink w:anchor="_Toc237786954" w:history="1">
         <w:r>
           <w:rPr>
             <w:rStyle w:val="Hipervnculo"/>
@@ -2187,7 +2187,7 @@
             <w:noProof/>
             <w:webHidden/>
           </w:rPr>
-          <w:instrText xml:space="preserve"> PAGEREF _Toc237782192 \h </w:instrText>
+          <w:instrText xml:space="preserve"> PAGEREF _Toc237786954 \h </w:instrText>
         </w:r>
         <w:r>
           <w:rPr>
@@ -2234,7 +2234,7 @@
           <w14:ligatures w14:val="standardContextual"/>
         </w:rPr>
       </w:pPr>
-      <w:hyperlink w:anchor="_Toc237782193" w:history="1">
+      <w:hyperlink w:anchor="_Toc237786955" w:history="1">
         <w:r>
           <w:rPr>
             <w:rStyle w:val="Hipervnculo"/>
@@ -2261,7 +2261,7 @@
             <w:noProof/>
             <w:webHidden/>
           </w:rPr>
-          <w:instrText xml:space="preserve"> PAGEREF _Toc237782193 \h </w:instrText>
+          <w:instrText xml:space="preserve"> PAGEREF _Toc237786955 \h </w:instrText>
         </w:r>
         <w:r>
           <w:rPr>
@@ -2308,7 +2308,7 @@
           <w14:ligatures w14:val="standardContextual"/>
         </w:rPr>
       </w:pPr>
-      <w:hyperlink w:anchor="_Toc237782194" w:history="1">
+      <w:hyperlink w:anchor="_Toc237786956" w:history="1">
         <w:r>
           <w:rPr>
             <w:rStyle w:val="Hipervnculo"/>
@@ -2335,7 +2335,7 @@
             <w:noProof/>
             <w:webHidden/>
           </w:rPr>
-          <w:instrText xml:space="preserve"> PAGEREF _Toc237782194 \h </w:instrText>
+          <w:instrText xml:space="preserve"> PAGEREF _Toc237786956 \h </w:instrText>
         </w:r>
         <w:r>
           <w:rPr>
@@ -2382,7 +2382,7 @@
           <w14:ligatures w14:val="standardContextual"/>
         </w:rPr>
       </w:pPr>
-      <w:hyperlink w:anchor="_Toc237782195" w:history="1">
+      <w:hyperlink w:anchor="_Toc237786957" w:history="1">
         <w:r>
           <w:rPr>
             <w:rStyle w:val="Hipervnculo"/>
@@ -2409,7 +2409,7 @@
             <w:noProof/>
             <w:webHidden/>
           </w:rPr>
-          <w:instrText xml:space="preserve"> PAGEREF _Toc237782195 \h </w:instrText>
+          <w:instrText xml:space="preserve"> PAGEREF _Toc237786957 \h </w:instrText>
         </w:r>
         <w:r>
           <w:rPr>
@@ -2456,7 +2456,7 @@
           <w14:ligatures w14:val="standardContextual"/>
         </w:rPr>
       </w:pPr>
-      <w:hyperlink w:anchor="_Toc237782196" w:history="1">
+      <w:hyperlink w:anchor="_Toc237786958" w:history="1">
         <w:r>
           <w:rPr>
             <w:rStyle w:val="Hipervnculo"/>
@@ -2483,7 +2483,7 @@
             <w:noProof/>
             <w:webHidden/>
           </w:rPr>
-          <w:instrText xml:space="preserve"> PAGEREF _Toc237782196 \h </w:instrText>
+          <w:instrText xml:space="preserve"> PAGEREF _Toc237786958 \h </w:instrText>
         </w:r>
         <w:r>
           <w:rPr>
@@ -2530,7 +2530,7 @@
           <w14:ligatures w14:val="standardContextual"/>
         </w:rPr>
       </w:pPr>
-      <w:hyperlink w:anchor="_Toc237782197" w:history="1">
+      <w:hyperlink w:anchor="_Toc237786959" w:history="1">
         <w:r>
           <w:rPr>
             <w:rStyle w:val="Hipervnculo"/>
@@ -2557,7 +2557,7 @@
             <w:noProof/>
             <w:webHidden/>
           </w:rPr>
-          <w:instrText xml:space="preserve"> PAGEREF _Toc237782197 \h </w:instrText>
+          <w:instrText xml:space="preserve"> PAGEREF _Toc237786959 \h </w:instrText>
         </w:r>
         <w:r>
           <w:rPr>
@@ -2604,7 +2604,7 @@
           <w14:ligatures w14:val="standardContextual"/>
         </w:rPr>
       </w:pPr>
-      <w:hyperlink w:anchor="_Toc237782198" w:history="1">
+      <w:hyperlink w:anchor="_Toc237786960" w:history="1">
         <w:r>
           <w:rPr>
             <w:rStyle w:val="Hipervnculo"/>
@@ -2631,7 +2631,7 @@
             <w:noProof/>
             <w:webHidden/>
           </w:rPr>
-          <w:instrText xml:space="preserve"> PAGEREF _Toc237782198 \h </w:instrText>
+          <w:instrText xml:space="preserve"> PAGEREF _Toc237786960 \h </w:instrText>
         </w:r>
         <w:r>
           <w:rPr>
@@ -2678,7 +2678,7 @@
           <w14:ligatures w14:val="standardContextual"/>
         </w:rPr>
       </w:pPr>
-      <w:hyperlink w:anchor="_Toc237782199" w:history="1">
+      <w:hyperlink w:anchor="_Toc237786961" w:history="1">
         <w:r>
           <w:rPr>
             <w:rStyle w:val="Hipervnculo"/>
@@ -2705,7 +2705,7 @@
             <w:noProof/>
             <w:webHidden/>
           </w:rPr>
-          <w:instrText xml:space="preserve"> PAGEREF _Toc237782199 \h </w:instrText>
+          <w:instrText xml:space="preserve"> PAGEREF _Toc237786961 \h </w:instrText>
         </w:r>
         <w:r>
           <w:rPr>
@@ -2752,7 +2752,7 @@
           <w14:ligatures w14:val="standardContextual"/>
         </w:rPr>
       </w:pPr>
-      <w:hyperlink w:anchor="_Toc237782200" w:history="1">
+      <w:hyperlink w:anchor="_Toc237786962" w:history="1">
         <w:r>
           <w:rPr>
             <w:rStyle w:val="Hipervnculo"/>
@@ -2779,7 +2779,7 @@
             <w:noProof/>
             <w:webHidden/>
           </w:rPr>
-          <w:instrText xml:space="preserve"> PAGEREF _Toc237782200 \h </w:instrText>
+          <w:instrText xml:space="preserve"> PAGEREF _Toc237786962 \h </w:instrText>
         </w:r>
         <w:r>
           <w:rPr>
@@ -2826,7 +2826,7 @@
           <w14:ligatures w14:val="standardContextual"/>
         </w:rPr>
       </w:pPr>
-      <w:hyperlink w:anchor="_Toc237782201" w:history="1">
+      <w:hyperlink w:anchor="_Toc237786963" w:history="1">
         <w:r>
           <w:rPr>
             <w:rStyle w:val="Hipervnculo"/>
@@ -2853,7 +2853,7 @@
             <w:noProof/>
             <w:webHidden/>
           </w:rPr>
-          <w:instrText xml:space="preserve"> PAGEREF _Toc237782201 \h </w:instrText>
+          <w:instrText xml:space="preserve"> PAGEREF _Toc237786963 \h </w:instrText>
         </w:r>
         <w:r>
           <w:rPr>
@@ -2900,7 +2900,7 @@
           <w14:ligatures w14:val="standardContextual"/>
         </w:rPr>
       </w:pPr>
-      <w:hyperlink w:anchor="_Toc237782202" w:history="1">
+      <w:hyperlink w:anchor="_Toc237786964" w:history="1">
         <w:r>
           <w:rPr>
             <w:rStyle w:val="Hipervnculo"/>
@@ -2927,7 +2927,7 @@
             <w:noProof/>
             <w:webHidden/>
           </w:rPr>
-          <w:instrText xml:space="preserve"> PAGEREF _Toc237782202 \h </w:instrText>
+          <w:instrText xml:space="preserve"> PAGEREF _Toc237786964 \h </w:instrText>
         </w:r>
         <w:r>
           <w:rPr>
@@ -2974,7 +2974,7 @@
           <w14:ligatures w14:val="standardContextual"/>
         </w:rPr>
       </w:pPr>
-      <w:hyperlink w:anchor="_Toc237782203" w:history="1">
+      <w:hyperlink w:anchor="_Toc237786965" w:history="1">
         <w:r>
           <w:rPr>
             <w:rStyle w:val="Hipervnculo"/>
@@ -3001,7 +3001,7 @@
             <w:noProof/>
             <w:webHidden/>
           </w:rPr>
-          <w:instrText xml:space="preserve"> PAGEREF _Toc237782203 \h </w:instrText>
+          <w:instrText xml:space="preserve"> PAGEREF _Toc237786965 \h </w:instrText>
         </w:r>
         <w:r>
           <w:rPr>
@@ -3048,7 +3048,7 @@
           <w14:ligatures w14:val="standardContextual"/>
         </w:rPr>
       </w:pPr>
-      <w:hyperlink w:anchor="_Toc237782204" w:history="1">
+      <w:hyperlink w:anchor="_Toc237786966" w:history="1">
         <w:r>
           <w:rPr>
             <w:rStyle w:val="Hipervnculo"/>
@@ -3075,7 +3075,7 @@
             <w:noProof/>
             <w:webHidden/>
           </w:rPr>
-          <w:instrText xml:space="preserve"> PAGEREF _Toc237782204 \h </w:instrText>
+          <w:instrText xml:space="preserve"> PAGEREF _Toc237786966 \h </w:instrText>
         </w:r>
         <w:r>
           <w:rPr>
@@ -3122,7 +3122,7 @@
           <w14:ligatures w14:val="standardContextual"/>
         </w:rPr>
       </w:pPr>
-      <w:hyperlink w:anchor="_Toc237782205" w:history="1">
+      <w:hyperlink w:anchor="_Toc237786967" w:history="1">
         <w:r>
           <w:rPr>
             <w:rStyle w:val="Hipervnculo"/>
@@ -3149,7 +3149,7 @@
             <w:noProof/>
             <w:webHidden/>
           </w:rPr>
-          <w:instrText xml:space="preserve"> PAGEREF _Toc237782205 \h </w:instrText>
+          <w:instrText xml:space="preserve"> PAGEREF _Toc237786967 \h </w:instrText>
         </w:r>
         <w:r>
           <w:rPr>
@@ -3196,7 +3196,7 @@
           <w14:ligatures w14:val="standardContextual"/>
         </w:rPr>
       </w:pPr>
-      <w:hyperlink w:anchor="_Toc237782206" w:history="1">
+      <w:hyperlink w:anchor="_Toc237786968" w:history="1">
         <w:r>
           <w:rPr>
             <w:rStyle w:val="Hipervnculo"/>
@@ -3223,7 +3223,7 @@
             <w:noProof/>
             <w:webHidden/>
           </w:rPr>
-          <w:instrText xml:space="preserve"> PAGEREF _Toc237782206 \h </w:instrText>
+          <w:instrText xml:space="preserve"> PAGEREF _Toc237786968 \h </w:instrText>
         </w:r>
         <w:r>
           <w:rPr>
@@ -3270,7 +3270,7 @@
           <w14:ligatures w14:val="standardContextual"/>
         </w:rPr>
       </w:pPr>
-      <w:hyperlink w:anchor="_Toc237782207" w:history="1">
+      <w:hyperlink w:anchor="_Toc237786969" w:history="1">
         <w:r>
           <w:rPr>
             <w:rStyle w:val="Hipervnculo"/>
@@ -3327,7 +3327,7 @@
             <w:noProof/>
             <w:webHidden/>
           </w:rPr>
-          <w:instrText xml:space="preserve"> PAGEREF _Toc237782207 \h </w:instrText>
+          <w:instrText xml:space="preserve"> PAGEREF _Toc237786969 \h </w:instrText>
         </w:r>
         <w:r>
           <w:rPr>
@@ -3374,7 +3374,7 @@
           <w14:ligatures w14:val="standardContextual"/>
         </w:rPr>
       </w:pPr>
-      <w:hyperlink w:anchor="_Toc237782208" w:history="1">
+      <w:hyperlink w:anchor="_Toc237786970" w:history="1">
         <w:r>
           <w:rPr>
             <w:rStyle w:val="Hipervnculo"/>
@@ -3401,7 +3401,7 @@
             <w:noProof/>
             <w:webHidden/>
           </w:rPr>
-          <w:instrText xml:space="preserve"> PAGEREF _Toc237782208 \h </w:instrText>
+          <w:instrText xml:space="preserve"> PAGEREF _Toc237786970 \h </w:instrText>
         </w:r>
         <w:r>
           <w:rPr>
@@ -3448,7 +3448,7 @@
           <w14:ligatures w14:val="standardContextual"/>
         </w:rPr>
       </w:pPr>
-      <w:hyperlink w:anchor="_Toc237782209" w:history="1">
+      <w:hyperlink w:anchor="_Toc237786971" w:history="1">
         <w:r>
           <w:rPr>
             <w:rStyle w:val="Hipervnculo"/>
@@ -3475,7 +3475,7 @@
             <w:noProof/>
             <w:webHidden/>
           </w:rPr>
-          <w:instrText xml:space="preserve"> PAGEREF _Toc237782209 \h </w:instrText>
+          <w:instrText xml:space="preserve"> PAGEREF _Toc237786971 \h </w:instrText>
         </w:r>
         <w:r>
           <w:rPr>
@@ -3522,7 +3522,7 @@
           <w14:ligatures w14:val="standardContextual"/>
         </w:rPr>
       </w:pPr>
-      <w:hyperlink w:anchor="_Toc237782210" w:history="1">
+      <w:hyperlink w:anchor="_Toc237786972" w:history="1">
         <w:r>
           <w:rPr>
             <w:rStyle w:val="Hipervnculo"/>
@@ -3549,7 +3549,7 @@
             <w:noProof/>
             <w:webHidden/>
           </w:rPr>
-          <w:instrText xml:space="preserve"> PAGEREF _Toc237782210 \h </w:instrText>
+          <w:instrText xml:space="preserve"> PAGEREF _Toc237786972 \h </w:instrText>
         </w:r>
         <w:r>
           <w:rPr>
@@ -3596,13 +3596,13 @@
           <w14:ligatures w14:val="standardContextual"/>
         </w:rPr>
       </w:pPr>
-      <w:hyperlink w:anchor="_Toc237782211" w:history="1">
+      <w:hyperlink w:anchor="_Toc237786973" w:history="1">
         <w:r>
           <w:rPr>
             <w:rStyle w:val="Hipervnculo"/>
             <w:noProof/>
           </w:rPr>
-          <w:t>Criterios Metodológicos: Caso Base Dumrauf vs. Cota de Reinversión Damodaran</w:t>
+          <w:t>Criterios Metodológicos: Flujo Base Dumrauf vs. Modelo de Reinversión Damodaran</w:t>
         </w:r>
         <w:r>
           <w:rPr>
@@ -3623,7 +3623,7 @@
             <w:noProof/>
             <w:webHidden/>
           </w:rPr>
-          <w:instrText xml:space="preserve"> PAGEREF _Toc237782211 \h </w:instrText>
+          <w:instrText xml:space="preserve"> PAGEREF _Toc237786973 \h </w:instrText>
         </w:r>
         <w:r>
           <w:rPr>
@@ -3670,7 +3670,7 @@
           <w14:ligatures w14:val="standardContextual"/>
         </w:rPr>
       </w:pPr>
-      <w:hyperlink w:anchor="_Toc237782212" w:history="1">
+      <w:hyperlink w:anchor="_Toc237786974" w:history="1">
         <w:r>
           <w:rPr>
             <w:rStyle w:val="Hipervnculo"/>
@@ -3697,7 +3697,7 @@
             <w:noProof/>
             <w:webHidden/>
           </w:rPr>
-          <w:instrText xml:space="preserve"> PAGEREF _Toc237782212 \h </w:instrText>
+          <w:instrText xml:space="preserve"> PAGEREF _Toc237786974 \h </w:instrText>
         </w:r>
         <w:r>
           <w:rPr>
@@ -3744,7 +3744,7 @@
           <w14:ligatures w14:val="standardContextual"/>
         </w:rPr>
       </w:pPr>
-      <w:hyperlink w:anchor="_Toc237782213" w:history="1">
+      <w:hyperlink w:anchor="_Toc237786975" w:history="1">
         <w:r>
           <w:rPr>
             <w:rStyle w:val="Hipervnculo"/>
@@ -3771,7 +3771,7 @@
             <w:noProof/>
             <w:webHidden/>
           </w:rPr>
-          <w:instrText xml:space="preserve"> PAGEREF _Toc237782213 \h </w:instrText>
+          <w:instrText xml:space="preserve"> PAGEREF _Toc237786975 \h </w:instrText>
         </w:r>
         <w:r>
           <w:rPr>
@@ -3818,7 +3818,7 @@
           <w14:ligatures w14:val="standardContextual"/>
         </w:rPr>
       </w:pPr>
-      <w:hyperlink w:anchor="_Toc237782214" w:history="1">
+      <w:hyperlink w:anchor="_Toc237786976" w:history="1">
         <w:r>
           <w:rPr>
             <w:rStyle w:val="Hipervnculo"/>
@@ -3845,7 +3845,7 @@
             <w:noProof/>
             <w:webHidden/>
           </w:rPr>
-          <w:instrText xml:space="preserve"> PAGEREF _Toc237782214 \h </w:instrText>
+          <w:instrText xml:space="preserve"> PAGEREF _Toc237786976 \h </w:instrText>
         </w:r>
         <w:r>
           <w:rPr>
@@ -3892,7 +3892,7 @@
           <w14:ligatures w14:val="standardContextual"/>
         </w:rPr>
       </w:pPr>
-      <w:hyperlink w:anchor="_Toc237782215" w:history="1">
+      <w:hyperlink w:anchor="_Toc237786977" w:history="1">
         <w:r>
           <w:rPr>
             <w:rStyle w:val="Hipervnculo"/>
@@ -3919,7 +3919,7 @@
             <w:noProof/>
             <w:webHidden/>
           </w:rPr>
-          <w:instrText xml:space="preserve"> PAGEREF _Toc237782215 \h </w:instrText>
+          <w:instrText xml:space="preserve"> PAGEREF _Toc237786977 \h </w:instrText>
         </w:r>
         <w:r>
           <w:rPr>
@@ -3966,7 +3966,7 @@
           <w14:ligatures w14:val="standardContextual"/>
         </w:rPr>
       </w:pPr>
-      <w:hyperlink w:anchor="_Toc237782216" w:history="1">
+      <w:hyperlink w:anchor="_Toc237786978" w:history="1">
         <w:r>
           <w:rPr>
             <w:rStyle w:val="Hipervnculo"/>
@@ -3993,7 +3993,7 @@
             <w:noProof/>
             <w:webHidden/>
           </w:rPr>
-          <w:instrText xml:space="preserve"> PAGEREF _Toc237782216 \h </w:instrText>
+          <w:instrText xml:space="preserve"> PAGEREF _Toc237786978 \h </w:instrText>
         </w:r>
         <w:r>
           <w:rPr>
@@ -4040,7 +4040,7 @@
           <w14:ligatures w14:val="standardContextual"/>
         </w:rPr>
       </w:pPr>
-      <w:hyperlink w:anchor="_Toc237782217" w:history="1">
+      <w:hyperlink w:anchor="_Toc237786979" w:history="1">
         <w:r>
           <w:rPr>
             <w:rStyle w:val="Hipervnculo"/>
@@ -4067,7 +4067,7 @@
             <w:noProof/>
             <w:webHidden/>
           </w:rPr>
-          <w:instrText xml:space="preserve"> PAGEREF _Toc237782217 \h </w:instrText>
+          <w:instrText xml:space="preserve"> PAGEREF _Toc237786979 \h </w:instrText>
         </w:r>
         <w:r>
           <w:rPr>
@@ -4114,7 +4114,7 @@
           <w14:ligatures w14:val="standardContextual"/>
         </w:rPr>
       </w:pPr>
-      <w:hyperlink w:anchor="_Toc237782218" w:history="1">
+      <w:hyperlink w:anchor="_Toc237786980" w:history="1">
         <w:r>
           <w:rPr>
             <w:rStyle w:val="Hipervnculo"/>
@@ -4141,7 +4141,7 @@
             <w:noProof/>
             <w:webHidden/>
           </w:rPr>
-          <w:instrText xml:space="preserve"> PAGEREF _Toc237782218 \h </w:instrText>
+          <w:instrText xml:space="preserve"> PAGEREF _Toc237786980 \h </w:instrText>
         </w:r>
         <w:r>
           <w:rPr>
@@ -4188,7 +4188,7 @@
           <w14:ligatures w14:val="standardContextual"/>
         </w:rPr>
       </w:pPr>
-      <w:hyperlink w:anchor="_Toc237782219" w:history="1">
+      <w:hyperlink w:anchor="_Toc237786981" w:history="1">
         <w:r>
           <w:rPr>
             <w:rStyle w:val="Hipervnculo"/>
@@ -4215,7 +4215,7 @@
             <w:noProof/>
             <w:webHidden/>
           </w:rPr>
-          <w:instrText xml:space="preserve"> PAGEREF _Toc237782219 \h </w:instrText>
+          <w:instrText xml:space="preserve"> PAGEREF _Toc237786981 \h </w:instrText>
         </w:r>
         <w:r>
           <w:rPr>
@@ -4262,7 +4262,7 @@
           <w14:ligatures w14:val="standardContextual"/>
         </w:rPr>
       </w:pPr>
-      <w:hyperlink w:anchor="_Toc237782220" w:history="1">
+      <w:hyperlink w:anchor="_Toc237786982" w:history="1">
         <w:r>
           <w:rPr>
             <w:rStyle w:val="Hipervnculo"/>
@@ -4289,7 +4289,7 @@
             <w:noProof/>
             <w:webHidden/>
           </w:rPr>
-          <w:instrText xml:space="preserve"> PAGEREF _Toc237782220 \h </w:instrText>
+          <w:instrText xml:space="preserve"> PAGEREF _Toc237786982 \h </w:instrText>
         </w:r>
         <w:r>
           <w:rPr>
@@ -4336,7 +4336,7 @@
           <w14:ligatures w14:val="standardContextual"/>
         </w:rPr>
       </w:pPr>
-      <w:hyperlink w:anchor="_Toc237782221" w:history="1">
+      <w:hyperlink w:anchor="_Toc237786983" w:history="1">
         <w:r>
           <w:rPr>
             <w:rStyle w:val="Hipervnculo"/>
@@ -4363,7 +4363,7 @@
             <w:noProof/>
             <w:webHidden/>
           </w:rPr>
-          <w:instrText xml:space="preserve"> PAGEREF _Toc237782221 \h </w:instrText>
+          <w:instrText xml:space="preserve"> PAGEREF _Toc237786983 \h </w:instrText>
         </w:r>
         <w:r>
           <w:rPr>
@@ -4410,7 +4410,7 @@
           <w14:ligatures w14:val="standardContextual"/>
         </w:rPr>
       </w:pPr>
-      <w:hyperlink w:anchor="_Toc237782222" w:history="1">
+      <w:hyperlink w:anchor="_Toc237786984" w:history="1">
         <w:r>
           <w:rPr>
             <w:rStyle w:val="Hipervnculo"/>
@@ -4437,7 +4437,7 @@
             <w:noProof/>
             <w:webHidden/>
           </w:rPr>
-          <w:instrText xml:space="preserve"> PAGEREF _Toc237782222 \h </w:instrText>
+          <w:instrText xml:space="preserve"> PAGEREF _Toc237786984 \h </w:instrText>
         </w:r>
         <w:r>
           <w:rPr>
@@ -4484,7 +4484,7 @@
           <w14:ligatures w14:val="standardContextual"/>
         </w:rPr>
       </w:pPr>
-      <w:hyperlink w:anchor="_Toc237782223" w:history="1">
+      <w:hyperlink w:anchor="_Toc237786985" w:history="1">
         <w:r>
           <w:rPr>
             <w:rStyle w:val="Hipervnculo"/>
@@ -4511,7 +4511,7 @@
             <w:noProof/>
             <w:webHidden/>
           </w:rPr>
-          <w:instrText xml:space="preserve"> PAGEREF _Toc237782223 \h </w:instrText>
+          <w:instrText xml:space="preserve"> PAGEREF _Toc237786985 \h </w:instrText>
         </w:r>
         <w:r>
           <w:rPr>
@@ -4558,7 +4558,7 @@
           <w14:ligatures w14:val="standardContextual"/>
         </w:rPr>
       </w:pPr>
-      <w:hyperlink w:anchor="_Toc237782224" w:history="1">
+      <w:hyperlink w:anchor="_Toc237786986" w:history="1">
         <w:r>
           <w:rPr>
             <w:rStyle w:val="Hipervnculo"/>
@@ -4585,7 +4585,7 @@
             <w:noProof/>
             <w:webHidden/>
           </w:rPr>
-          <w:instrText xml:space="preserve"> PAGEREF _Toc237782224 \h </w:instrText>
+          <w:instrText xml:space="preserve"> PAGEREF _Toc237786986 \h </w:instrText>
         </w:r>
         <w:r>
           <w:rPr>
@@ -4632,7 +4632,7 @@
           <w14:ligatures w14:val="standardContextual"/>
         </w:rPr>
       </w:pPr>
-      <w:hyperlink w:anchor="_Toc237782225" w:history="1">
+      <w:hyperlink w:anchor="_Toc237786987" w:history="1">
         <w:r>
           <w:rPr>
             <w:rStyle w:val="Hipervnculo"/>
@@ -4659,7 +4659,7 @@
             <w:noProof/>
             <w:webHidden/>
           </w:rPr>
-          <w:instrText xml:space="preserve"> PAGEREF _Toc237782225 \h </w:instrText>
+          <w:instrText xml:space="preserve"> PAGEREF _Toc237786987 \h </w:instrText>
         </w:r>
         <w:r>
           <w:rPr>
@@ -4706,7 +4706,7 @@
           <w14:ligatures w14:val="standardContextual"/>
         </w:rPr>
       </w:pPr>
-      <w:hyperlink w:anchor="_Toc237782226" w:history="1">
+      <w:hyperlink w:anchor="_Toc237786988" w:history="1">
         <w:r>
           <w:rPr>
             <w:rStyle w:val="Hipervnculo"/>
@@ -4733,7 +4733,7 @@
             <w:noProof/>
             <w:webHidden/>
           </w:rPr>
-          <w:instrText xml:space="preserve"> PAGEREF _Toc237782226 \h </w:instrText>
+          <w:instrText xml:space="preserve"> PAGEREF _Toc237786988 \h </w:instrText>
         </w:r>
         <w:r>
           <w:rPr>
@@ -4780,7 +4780,7 @@
           <w14:ligatures w14:val="standardContextual"/>
         </w:rPr>
       </w:pPr>
-      <w:hyperlink w:anchor="_Toc237782227" w:history="1">
+      <w:hyperlink w:anchor="_Toc237786989" w:history="1">
         <w:r>
           <w:rPr>
             <w:rStyle w:val="Hipervnculo"/>
@@ -4807,7 +4807,7 @@
             <w:noProof/>
             <w:webHidden/>
           </w:rPr>
-          <w:instrText xml:space="preserve"> PAGEREF _Toc237782227 \h </w:instrText>
+          <w:instrText xml:space="preserve"> PAGEREF _Toc237786989 \h </w:instrText>
         </w:r>
         <w:r>
           <w:rPr>
@@ -4854,7 +4854,7 @@
           <w14:ligatures w14:val="standardContextual"/>
         </w:rPr>
       </w:pPr>
-      <w:hyperlink w:anchor="_Toc237782228" w:history="1">
+      <w:hyperlink w:anchor="_Toc237786990" w:history="1">
         <w:r>
           <w:rPr>
             <w:rStyle w:val="Hipervnculo"/>
@@ -4881,7 +4881,7 @@
             <w:noProof/>
             <w:webHidden/>
           </w:rPr>
-          <w:instrText xml:space="preserve"> PAGEREF _Toc237782228 \h </w:instrText>
+          <w:instrText xml:space="preserve"> PAGEREF _Toc237786990 \h </w:instrText>
         </w:r>
         <w:r>
           <w:rPr>
@@ -4928,7 +4928,7 @@
           <w14:ligatures w14:val="standardContextual"/>
         </w:rPr>
       </w:pPr>
-      <w:hyperlink w:anchor="_Toc237782229" w:history="1">
+      <w:hyperlink w:anchor="_Toc237786991" w:history="1">
         <w:r>
           <w:rPr>
             <w:rStyle w:val="Hipervnculo"/>
@@ -4955,7 +4955,7 @@
             <w:noProof/>
             <w:webHidden/>
           </w:rPr>
-          <w:instrText xml:space="preserve"> PAGEREF _Toc237782229 \h </w:instrText>
+          <w:instrText xml:space="preserve"> PAGEREF _Toc237786991 \h </w:instrText>
         </w:r>
         <w:r>
           <w:rPr>
@@ -5002,7 +5002,7 @@
           <w14:ligatures w14:val="standardContextual"/>
         </w:rPr>
       </w:pPr>
-      <w:hyperlink w:anchor="_Toc237782230" w:history="1">
+      <w:hyperlink w:anchor="_Toc237786992" w:history="1">
         <w:r>
           <w:rPr>
             <w:rStyle w:val="Hipervnculo"/>
@@ -5029,7 +5029,7 @@
             <w:noProof/>
             <w:webHidden/>
           </w:rPr>
-          <w:instrText xml:space="preserve"> PAGEREF _Toc237782230 \h </w:instrText>
+          <w:instrText xml:space="preserve"> PAGEREF _Toc237786992 \h </w:instrText>
         </w:r>
         <w:r>
           <w:rPr>
@@ -5076,7 +5076,7 @@
           <w14:ligatures w14:val="standardContextual"/>
         </w:rPr>
       </w:pPr>
-      <w:hyperlink w:anchor="_Toc237782231" w:history="1">
+      <w:hyperlink w:anchor="_Toc237786993" w:history="1">
         <w:r>
           <w:rPr>
             <w:rStyle w:val="Hipervnculo"/>
@@ -5103,7 +5103,7 @@
             <w:noProof/>
             <w:webHidden/>
           </w:rPr>
-          <w:instrText xml:space="preserve"> PAGEREF _Toc237782231 \h </w:instrText>
+          <w:instrText xml:space="preserve"> PAGEREF _Toc237786993 \h </w:instrText>
         </w:r>
         <w:r>
           <w:rPr>
@@ -5150,7 +5150,7 @@
           <w14:ligatures w14:val="standardContextual"/>
         </w:rPr>
       </w:pPr>
-      <w:hyperlink w:anchor="_Toc237782232" w:history="1">
+      <w:hyperlink w:anchor="_Toc237786994" w:history="1">
         <w:r>
           <w:rPr>
             <w:rStyle w:val="Hipervnculo"/>
@@ -5177,7 +5177,7 @@
             <w:noProof/>
             <w:webHidden/>
           </w:rPr>
-          <w:instrText xml:space="preserve"> PAGEREF _Toc237782232 \h </w:instrText>
+          <w:instrText xml:space="preserve"> PAGEREF _Toc237786994 \h </w:instrText>
         </w:r>
         <w:r>
           <w:rPr>
@@ -5224,7 +5224,7 @@
           <w14:ligatures w14:val="standardContextual"/>
         </w:rPr>
       </w:pPr>
-      <w:hyperlink w:anchor="_Toc237782233" w:history="1">
+      <w:hyperlink w:anchor="_Toc237786995" w:history="1">
         <w:r>
           <w:rPr>
             <w:rStyle w:val="Hipervnculo"/>
@@ -5251,7 +5251,7 @@
             <w:noProof/>
             <w:webHidden/>
           </w:rPr>
-          <w:instrText xml:space="preserve"> PAGEREF _Toc237782233 \h </w:instrText>
+          <w:instrText xml:space="preserve"> PAGEREF _Toc237786995 \h </w:instrText>
         </w:r>
         <w:r>
           <w:rPr>
@@ -5298,7 +5298,7 @@
           <w14:ligatures w14:val="standardContextual"/>
         </w:rPr>
       </w:pPr>
-      <w:hyperlink w:anchor="_Toc237782234" w:history="1">
+      <w:hyperlink w:anchor="_Toc237786996" w:history="1">
         <w:r>
           <w:rPr>
             <w:rStyle w:val="Hipervnculo"/>
@@ -5325,7 +5325,7 @@
             <w:noProof/>
             <w:webHidden/>
           </w:rPr>
-          <w:instrText xml:space="preserve"> PAGEREF _Toc237782234 \h </w:instrText>
+          <w:instrText xml:space="preserve"> PAGEREF _Toc237786996 \h </w:instrText>
         </w:r>
         <w:r>
           <w:rPr>
@@ -5372,7 +5372,7 @@
           <w14:ligatures w14:val="standardContextual"/>
         </w:rPr>
       </w:pPr>
-      <w:hyperlink w:anchor="_Toc237782235" w:history="1">
+      <w:hyperlink w:anchor="_Toc237786997" w:history="1">
         <w:r>
           <w:rPr>
             <w:rStyle w:val="Hipervnculo"/>
@@ -5399,7 +5399,7 @@
             <w:noProof/>
             <w:webHidden/>
           </w:rPr>
-          <w:instrText xml:space="preserve"> PAGEREF _Toc237782235 \h </w:instrText>
+          <w:instrText xml:space="preserve"> PAGEREF _Toc237786997 \h </w:instrText>
         </w:r>
         <w:r>
           <w:rPr>
@@ -5446,7 +5446,7 @@
           <w14:ligatures w14:val="standardContextual"/>
         </w:rPr>
       </w:pPr>
-      <w:hyperlink w:anchor="_Toc237782236" w:history="1">
+      <w:hyperlink w:anchor="_Toc237786998" w:history="1">
         <w:r>
           <w:rPr>
             <w:rStyle w:val="Hipervnculo"/>
@@ -5473,7 +5473,7 @@
             <w:noProof/>
             <w:webHidden/>
           </w:rPr>
-          <w:instrText xml:space="preserve"> PAGEREF _Toc237782236 \h </w:instrText>
+          <w:instrText xml:space="preserve"> PAGEREF _Toc237786998 \h </w:instrText>
         </w:r>
         <w:r>
           <w:rPr>
@@ -5520,7 +5520,7 @@
           <w14:ligatures w14:val="standardContextual"/>
         </w:rPr>
       </w:pPr>
-      <w:hyperlink w:anchor="_Toc237782237" w:history="1">
+      <w:hyperlink w:anchor="_Toc237786999" w:history="1">
         <w:r>
           <w:rPr>
             <w:rStyle w:val="Hipervnculo"/>
@@ -5547,7 +5547,7 @@
             <w:noProof/>
             <w:webHidden/>
           </w:rPr>
-          <w:instrText xml:space="preserve"> PAGEREF _Toc237782237 \h </w:instrText>
+          <w:instrText xml:space="preserve"> PAGEREF _Toc237786999 \h </w:instrText>
         </w:r>
         <w:r>
           <w:rPr>
@@ -5594,7 +5594,7 @@
           <w14:ligatures w14:val="standardContextual"/>
         </w:rPr>
       </w:pPr>
-      <w:hyperlink w:anchor="_Toc237782238" w:history="1">
+      <w:hyperlink w:anchor="_Toc237787000" w:history="1">
         <w:r>
           <w:rPr>
             <w:rStyle w:val="Hipervnculo"/>
@@ -5621,7 +5621,7 @@
             <w:noProof/>
             <w:webHidden/>
           </w:rPr>
-          <w:instrText xml:space="preserve"> PAGEREF _Toc237782238 \h </w:instrText>
+          <w:instrText xml:space="preserve"> PAGEREF _Toc237787000 \h </w:instrText>
         </w:r>
         <w:r>
           <w:rPr>
@@ -5668,7 +5668,7 @@
           <w14:ligatures w14:val="standardContextual"/>
         </w:rPr>
       </w:pPr>
-      <w:hyperlink w:anchor="_Toc237782239" w:history="1">
+      <w:hyperlink w:anchor="_Toc237787001" w:history="1">
         <w:r>
           <w:rPr>
             <w:rStyle w:val="Hipervnculo"/>
@@ -5695,7 +5695,7 @@
             <w:noProof/>
             <w:webHidden/>
           </w:rPr>
-          <w:instrText xml:space="preserve"> PAGEREF _Toc237782239 \h </w:instrText>
+          <w:instrText xml:space="preserve"> PAGEREF _Toc237787001 \h </w:instrText>
         </w:r>
         <w:r>
           <w:rPr>
@@ -5742,7 +5742,7 @@
           <w14:ligatures w14:val="standardContextual"/>
         </w:rPr>
       </w:pPr>
-      <w:hyperlink w:anchor="_Toc237782240" w:history="1">
+      <w:hyperlink w:anchor="_Toc237787002" w:history="1">
         <w:r>
           <w:rPr>
             <w:rStyle w:val="Hipervnculo"/>
@@ -5769,7 +5769,7 @@
             <w:noProof/>
             <w:webHidden/>
           </w:rPr>
-          <w:instrText xml:space="preserve"> PAGEREF _Toc237782240 \h </w:instrText>
+          <w:instrText xml:space="preserve"> PAGEREF _Toc237787002 \h </w:instrText>
         </w:r>
         <w:r>
           <w:rPr>
@@ -5816,7 +5816,7 @@
           <w14:ligatures w14:val="standardContextual"/>
         </w:rPr>
       </w:pPr>
-      <w:hyperlink w:anchor="_Toc237782241" w:history="1">
+      <w:hyperlink w:anchor="_Toc237787003" w:history="1">
         <w:r>
           <w:rPr>
             <w:rStyle w:val="Hipervnculo"/>
@@ -5843,7 +5843,7 @@
             <w:noProof/>
             <w:webHidden/>
           </w:rPr>
-          <w:instrText xml:space="preserve"> PAGEREF _Toc237782241 \h </w:instrText>
+          <w:instrText xml:space="preserve"> PAGEREF _Toc237787003 \h </w:instrText>
         </w:r>
         <w:r>
           <w:rPr>
@@ -5890,7 +5890,7 @@
           <w14:ligatures w14:val="standardContextual"/>
         </w:rPr>
       </w:pPr>
-      <w:hyperlink w:anchor="_Toc237782242" w:history="1">
+      <w:hyperlink w:anchor="_Toc237787004" w:history="1">
         <w:r>
           <w:rPr>
             <w:rStyle w:val="Hipervnculo"/>
@@ -5917,7 +5917,7 @@
             <w:noProof/>
             <w:webHidden/>
           </w:rPr>
-          <w:instrText xml:space="preserve"> PAGEREF _Toc237782242 \h </w:instrText>
+          <w:instrText xml:space="preserve"> PAGEREF _Toc237787004 \h </w:instrText>
         </w:r>
         <w:r>
           <w:rPr>
@@ -5964,7 +5964,7 @@
           <w14:ligatures w14:val="standardContextual"/>
         </w:rPr>
       </w:pPr>
-      <w:hyperlink w:anchor="_Toc237782243" w:history="1">
+      <w:hyperlink w:anchor="_Toc237787005" w:history="1">
         <w:r>
           <w:rPr>
             <w:rStyle w:val="Hipervnculo"/>
@@ -5991,7 +5991,7 @@
             <w:noProof/>
             <w:webHidden/>
           </w:rPr>
-          <w:instrText xml:space="preserve"> PAGEREF _Toc237782243 \h </w:instrText>
+          <w:instrText xml:space="preserve"> PAGEREF _Toc237787005 \h </w:instrText>
         </w:r>
         <w:r>
           <w:rPr>
@@ -6038,7 +6038,7 @@
           <w14:ligatures w14:val="standardContextual"/>
         </w:rPr>
       </w:pPr>
-      <w:hyperlink w:anchor="_Toc237782244" w:history="1">
+      <w:hyperlink w:anchor="_Toc237787006" w:history="1">
         <w:r>
           <w:rPr>
             <w:rStyle w:val="Hipervnculo"/>
@@ -6065,7 +6065,7 @@
             <w:noProof/>
             <w:webHidden/>
           </w:rPr>
-          <w:instrText xml:space="preserve"> PAGEREF _Toc237782244 \h </w:instrText>
+          <w:instrText xml:space="preserve"> PAGEREF _Toc237787006 \h </w:instrText>
         </w:r>
         <w:r>
           <w:rPr>
@@ -6112,7 +6112,7 @@
           <w14:ligatures w14:val="standardContextual"/>
         </w:rPr>
       </w:pPr>
-      <w:hyperlink w:anchor="_Toc237782245" w:history="1">
+      <w:hyperlink w:anchor="_Toc237787007" w:history="1">
         <w:r>
           <w:rPr>
             <w:rStyle w:val="Hipervnculo"/>
@@ -6139,7 +6139,7 @@
             <w:noProof/>
             <w:webHidden/>
           </w:rPr>
-          <w:instrText xml:space="preserve"> PAGEREF _Toc237782245 \h </w:instrText>
+          <w:instrText xml:space="preserve"> PAGEREF _Toc237787007 \h </w:instrText>
         </w:r>
         <w:r>
           <w:rPr>
@@ -6186,7 +6186,7 @@
           <w14:ligatures w14:val="standardContextual"/>
         </w:rPr>
       </w:pPr>
-      <w:hyperlink w:anchor="_Toc237782246" w:history="1">
+      <w:hyperlink w:anchor="_Toc237787008" w:history="1">
         <w:r>
           <w:rPr>
             <w:rStyle w:val="Hipervnculo"/>
@@ -6213,7 +6213,7 @@
             <w:noProof/>
             <w:webHidden/>
           </w:rPr>
-          <w:instrText xml:space="preserve"> PAGEREF _Toc237782246 \h </w:instrText>
+          <w:instrText xml:space="preserve"> PAGEREF _Toc237787008 \h </w:instrText>
         </w:r>
         <w:r>
           <w:rPr>
@@ -6297,7 +6297,7 @@
         <w:pStyle w:val="Ttulo1"/>
         <w:spacing w:before="160" w:after="60"/>
       </w:pPr>
-      <w:bookmarkStart w:id="0" w:name="_Toc237782184"/>
+      <w:bookmarkStart w:id="0" w:name="_Toc237786946"/>
       <w:r>
         <w:rPr>
           <w:rFonts w:ascii="Georgia" w:hAnsi="Georgia"/>
@@ -6314,7 +6314,7 @@
         <w:pStyle w:val="Ttulo2"/>
         <w:spacing w:before="120" w:after="40"/>
       </w:pPr>
-      <w:bookmarkStart w:id="1" w:name="_Toc237782185"/>
+      <w:bookmarkStart w:id="1" w:name="_Toc237786947"/>
       <w:r>
         <w:rPr>
           <w:rFonts w:ascii="Georgia" w:hAnsi="Georgia"/>
@@ -6355,7 +6355,7 @@
         <w:pStyle w:val="Ttulo2"/>
         <w:spacing w:before="120" w:after="40"/>
       </w:pPr>
-      <w:bookmarkStart w:id="2" w:name="_Toc237782186"/>
+      <w:bookmarkStart w:id="2" w:name="_Toc237786948"/>
       <w:r>
         <w:rPr>
           <w:rFonts w:ascii="Georgia" w:hAnsi="Georgia"/>
@@ -6416,7 +6416,7 @@
                 <w:noProof/>
               </w:rPr>
               <w:drawing>
-                <wp:inline distT="0" distB="0" distL="0" distR="0" wp14:anchorId="23495755" wp14:editId="4FA81133">
+                <wp:inline distT="0" distB="0" distL="0" distR="0" wp14:anchorId="4B9DC825" wp14:editId="7F14039C">
                   <wp:extent cx="3017520" cy="1572050"/>
                   <wp:effectExtent l="0" t="0" r="0" b="0"/>
                   <wp:docPr id="1" name="Picture 1"/>
@@ -6475,7 +6475,7 @@
                 <w:noProof/>
               </w:rPr>
               <w:drawing>
-                <wp:inline distT="0" distB="0" distL="0" distR="0" wp14:anchorId="7DA8A9A4" wp14:editId="4A80E9CB">
+                <wp:inline distT="0" distB="0" distL="0" distR="0" wp14:anchorId="3DDB8583" wp14:editId="299DC696">
                   <wp:extent cx="3017520" cy="1482763"/>
                   <wp:effectExtent l="0" t="0" r="0" b="0"/>
                   <wp:docPr id="2" name="Picture 2"/>
@@ -6580,7 +6580,7 @@
         <w:pStyle w:val="Ttulo2"/>
         <w:spacing w:before="120" w:after="40"/>
       </w:pPr>
-      <w:bookmarkStart w:id="3" w:name="_Toc237782187"/>
+      <w:bookmarkStart w:id="3" w:name="_Toc237786949"/>
       <w:r>
         <w:rPr>
           <w:rFonts w:ascii="Georgia" w:hAnsi="Georgia"/>
@@ -6728,7 +6728,7 @@
         <w:pStyle w:val="Ttulo2"/>
         <w:spacing w:before="120" w:after="40"/>
       </w:pPr>
-      <w:bookmarkStart w:id="4" w:name="_Toc237782188"/>
+      <w:bookmarkStart w:id="4" w:name="_Toc237786950"/>
       <w:r>
         <w:rPr>
           <w:rFonts w:ascii="Georgia" w:hAnsi="Georgia"/>
@@ -7256,7 +7256,7 @@
         <w:pStyle w:val="Ttulo2"/>
         <w:spacing w:before="120" w:after="40"/>
       </w:pPr>
-      <w:bookmarkStart w:id="5" w:name="_Toc237782189"/>
+      <w:bookmarkStart w:id="5" w:name="_Toc237786951"/>
       <w:r>
         <w:rPr>
           <w:rFonts w:ascii="Georgia" w:hAnsi="Georgia"/>
@@ -7417,7 +7417,7 @@
         <w:pStyle w:val="Ttulo2"/>
         <w:spacing w:before="120" w:after="40"/>
       </w:pPr>
-      <w:bookmarkStart w:id="6" w:name="_Toc237782190"/>
+      <w:bookmarkStart w:id="6" w:name="_Toc237786952"/>
       <w:r>
         <w:rPr>
           <w:rFonts w:ascii="Georgia" w:hAnsi="Georgia"/>
@@ -8646,7 +8646,7 @@
         <w:pStyle w:val="Ttulo1"/>
         <w:spacing w:before="160" w:after="60"/>
       </w:pPr>
-      <w:bookmarkStart w:id="7" w:name="_Toc237782191"/>
+      <w:bookmarkStart w:id="7" w:name="_Toc237786953"/>
       <w:r>
         <w:rPr>
           <w:rFonts w:ascii="Georgia" w:hAnsi="Georgia"/>
@@ -8662,7 +8662,7 @@
         <w:pStyle w:val="Ttulo2"/>
         <w:spacing w:before="120" w:after="40"/>
       </w:pPr>
-      <w:bookmarkStart w:id="8" w:name="_Toc237782192"/>
+      <w:bookmarkStart w:id="8" w:name="_Toc237786954"/>
       <w:r>
         <w:rPr>
           <w:rFonts w:ascii="Georgia" w:hAnsi="Georgia"/>
@@ -8720,7 +8720,7 @@
                 <w:noProof/>
               </w:rPr>
               <w:drawing>
-                <wp:inline distT="0" distB="0" distL="0" distR="0" wp14:anchorId="4E95FC45" wp14:editId="6AFBAFA4">
+                <wp:inline distT="0" distB="0" distL="0" distR="0" wp14:anchorId="24D833B9" wp14:editId="154501C6">
                   <wp:extent cx="3017520" cy="1471175"/>
                   <wp:effectExtent l="0" t="0" r="0" b="0"/>
                   <wp:docPr id="3" name="Picture 3"/>
@@ -8779,7 +8779,7 @@
                 <w:noProof/>
               </w:rPr>
               <w:drawing>
-                <wp:inline distT="0" distB="0" distL="0" distR="0" wp14:anchorId="548E18D8" wp14:editId="6A5BF075">
+                <wp:inline distT="0" distB="0" distL="0" distR="0" wp14:anchorId="1361B9F0" wp14:editId="2726D7B9">
                   <wp:extent cx="3017520" cy="1540956"/>
                   <wp:effectExtent l="0" t="0" r="0" b="0"/>
                   <wp:docPr id="4" name="Picture 4"/>
@@ -8884,7 +8884,7 @@
         <w:pStyle w:val="Ttulo2"/>
         <w:spacing w:before="120" w:after="40"/>
       </w:pPr>
-      <w:bookmarkStart w:id="9" w:name="_Toc237782193"/>
+      <w:bookmarkStart w:id="9" w:name="_Toc237786955"/>
       <w:r>
         <w:rPr>
           <w:rFonts w:ascii="Georgia" w:hAnsi="Georgia"/>
@@ -9117,7 +9117,7 @@
         <w:pStyle w:val="Ttulo1"/>
         <w:spacing w:before="160" w:after="60"/>
       </w:pPr>
-      <w:bookmarkStart w:id="10" w:name="_Toc237782194"/>
+      <w:bookmarkStart w:id="10" w:name="_Toc237786956"/>
       <w:r>
         <w:rPr>
           <w:rFonts w:ascii="Georgia" w:hAnsi="Georgia"/>
@@ -9133,7 +9133,7 @@
         <w:pStyle w:val="Ttulo2"/>
         <w:spacing w:before="120" w:after="40"/>
       </w:pPr>
-      <w:bookmarkStart w:id="11" w:name="_Toc237782195"/>
+      <w:bookmarkStart w:id="11" w:name="_Toc237786957"/>
       <w:r>
         <w:rPr>
           <w:rFonts w:ascii="Georgia" w:hAnsi="Georgia"/>
@@ -9195,7 +9195,7 @@
                 <w:noProof/>
               </w:rPr>
               <w:drawing>
-                <wp:inline distT="0" distB="0" distL="0" distR="0" wp14:anchorId="6424981C" wp14:editId="6AEC61AE">
+                <wp:inline distT="0" distB="0" distL="0" distR="0" wp14:anchorId="182E9C24" wp14:editId="4F28D2F1">
                   <wp:extent cx="3017520" cy="1687385"/>
                   <wp:effectExtent l="0" t="0" r="0" b="0"/>
                   <wp:docPr id="5" name="Picture 5"/>
@@ -9254,7 +9254,7 @@
                 <w:noProof/>
               </w:rPr>
               <w:drawing>
-                <wp:inline distT="0" distB="0" distL="0" distR="0" wp14:anchorId="096C458D" wp14:editId="19B4F716">
+                <wp:inline distT="0" distB="0" distL="0" distR="0" wp14:anchorId="6C31346D" wp14:editId="36B52160">
                   <wp:extent cx="3017520" cy="1527468"/>
                   <wp:effectExtent l="0" t="0" r="0" b="0"/>
                   <wp:docPr id="6" name="Picture 6"/>
@@ -9359,7 +9359,7 @@
         <w:pStyle w:val="Ttulo2"/>
         <w:spacing w:before="120" w:after="40"/>
       </w:pPr>
-      <w:bookmarkStart w:id="12" w:name="_Toc237782196"/>
+      <w:bookmarkStart w:id="12" w:name="_Toc237786958"/>
       <w:r>
         <w:rPr>
           <w:rFonts w:ascii="Georgia" w:hAnsi="Georgia"/>
@@ -9389,7 +9389,7 @@
         <w:pStyle w:val="Ttulo2"/>
         <w:spacing w:before="120" w:after="40"/>
       </w:pPr>
-      <w:bookmarkStart w:id="13" w:name="_Toc237782197"/>
+      <w:bookmarkStart w:id="13" w:name="_Toc237786959"/>
       <w:r>
         <w:rPr>
           <w:rFonts w:ascii="Georgia" w:hAnsi="Georgia"/>
@@ -9447,7 +9447,7 @@
                 <w:noProof/>
               </w:rPr>
               <w:drawing>
-                <wp:inline distT="0" distB="0" distL="0" distR="0" wp14:anchorId="4E77B7B2" wp14:editId="61CF040D">
+                <wp:inline distT="0" distB="0" distL="0" distR="0" wp14:anchorId="5DCE2961" wp14:editId="49164F58">
                   <wp:extent cx="3017520" cy="1677129"/>
                   <wp:effectExtent l="0" t="0" r="0" b="0"/>
                   <wp:docPr id="7" name="Picture 7"/>
@@ -9506,7 +9506,7 @@
                 <w:noProof/>
               </w:rPr>
               <w:drawing>
-                <wp:inline distT="0" distB="0" distL="0" distR="0" wp14:anchorId="5DDB3F23" wp14:editId="3F120871">
+                <wp:inline distT="0" distB="0" distL="0" distR="0" wp14:anchorId="77EECC64" wp14:editId="1F2407F9">
                   <wp:extent cx="3017520" cy="1525712"/>
                   <wp:effectExtent l="0" t="0" r="0" b="0"/>
                   <wp:docPr id="8" name="Picture 8"/>
@@ -9611,7 +9611,7 @@
         <w:pStyle w:val="Ttulo2"/>
         <w:spacing w:before="120" w:after="40"/>
       </w:pPr>
-      <w:bookmarkStart w:id="14" w:name="_Toc237782198"/>
+      <w:bookmarkStart w:id="14" w:name="_Toc237786960"/>
       <w:r>
         <w:rPr>
           <w:rFonts w:ascii="Georgia" w:hAnsi="Georgia"/>
@@ -9673,7 +9673,7 @@
               </w:rPr>
               <w:lastRenderedPageBreak/>
               <w:drawing>
-                <wp:inline distT="0" distB="0" distL="0" distR="0" wp14:anchorId="31DAB204" wp14:editId="2DEC0A90">
+                <wp:inline distT="0" distB="0" distL="0" distR="0" wp14:anchorId="4452A7CF" wp14:editId="31FC8D90">
                   <wp:extent cx="3017520" cy="1714258"/>
                   <wp:effectExtent l="0" t="0" r="0" b="0"/>
                   <wp:docPr id="9" name="Picture 9"/>
@@ -9732,7 +9732,7 @@
                 <w:noProof/>
               </w:rPr>
               <w:drawing>
-                <wp:inline distT="0" distB="0" distL="0" distR="0" wp14:anchorId="535DF840" wp14:editId="57098318">
+                <wp:inline distT="0" distB="0" distL="0" distR="0" wp14:anchorId="40CF8D3A" wp14:editId="7569C195">
                   <wp:extent cx="3017520" cy="1857285"/>
                   <wp:effectExtent l="0" t="0" r="0" b="0"/>
                   <wp:docPr id="10" name="Picture 10"/>
@@ -9837,7 +9837,7 @@
         <w:pStyle w:val="Ttulo1"/>
         <w:spacing w:before="160" w:after="60"/>
       </w:pPr>
-      <w:bookmarkStart w:id="15" w:name="_Toc237782199"/>
+      <w:bookmarkStart w:id="15" w:name="_Toc237786961"/>
       <w:r>
         <w:rPr>
           <w:rFonts w:ascii="Georgia" w:hAnsi="Georgia"/>
@@ -9853,7 +9853,7 @@
         <w:pStyle w:val="Ttulo2"/>
         <w:spacing w:before="120" w:after="40"/>
       </w:pPr>
-      <w:bookmarkStart w:id="16" w:name="_Toc237782200"/>
+      <w:bookmarkStart w:id="16" w:name="_Toc237786962"/>
       <w:r>
         <w:rPr>
           <w:rFonts w:ascii="Georgia" w:hAnsi="Georgia"/>
@@ -10287,7 +10287,7 @@
         <w:pStyle w:val="Ttulo2"/>
         <w:spacing w:before="120" w:after="40"/>
       </w:pPr>
-      <w:bookmarkStart w:id="17" w:name="_Toc237782201"/>
+      <w:bookmarkStart w:id="17" w:name="_Toc237786963"/>
       <w:r>
         <w:rPr>
           <w:rFonts w:ascii="Georgia" w:hAnsi="Georgia"/>
@@ -10314,7 +10314,7 @@
         <w:pStyle w:val="Ttulo1"/>
         <w:spacing w:before="160" w:after="60"/>
       </w:pPr>
-      <w:bookmarkStart w:id="18" w:name="_Toc237782202"/>
+      <w:bookmarkStart w:id="18" w:name="_Toc237786964"/>
       <w:r>
         <w:rPr>
           <w:rFonts w:ascii="Georgia" w:hAnsi="Georgia"/>
@@ -10330,7 +10330,7 @@
         <w:pStyle w:val="Ttulo2"/>
         <w:spacing w:before="120" w:after="40"/>
       </w:pPr>
-      <w:bookmarkStart w:id="19" w:name="_Toc237782203"/>
+      <w:bookmarkStart w:id="19" w:name="_Toc237786965"/>
       <w:r>
         <w:rPr>
           <w:rFonts w:ascii="Georgia" w:hAnsi="Georgia"/>
@@ -10357,7 +10357,7 @@
         <w:pStyle w:val="Ttulo2"/>
         <w:spacing w:before="120" w:after="40"/>
       </w:pPr>
-      <w:bookmarkStart w:id="20" w:name="_Toc237782204"/>
+      <w:bookmarkStart w:id="20" w:name="_Toc237786966"/>
       <w:r>
         <w:rPr>
           <w:rFonts w:ascii="Georgia" w:hAnsi="Georgia"/>
@@ -10415,7 +10415,7 @@
                 <w:noProof/>
               </w:rPr>
               <w:drawing>
-                <wp:inline distT="0" distB="0" distL="0" distR="0" wp14:anchorId="22F71360" wp14:editId="7BAF13AD">
+                <wp:inline distT="0" distB="0" distL="0" distR="0" wp14:anchorId="75347753" wp14:editId="78D29147">
                   <wp:extent cx="3017520" cy="1768243"/>
                   <wp:effectExtent l="0" t="0" r="0" b="0"/>
                   <wp:docPr id="11" name="Picture 11"/>
@@ -10474,7 +10474,7 @@
                 <w:noProof/>
               </w:rPr>
               <w:drawing>
-                <wp:inline distT="0" distB="0" distL="0" distR="0" wp14:anchorId="0692D0D5" wp14:editId="49622DF5">
+                <wp:inline distT="0" distB="0" distL="0" distR="0" wp14:anchorId="411C40D0" wp14:editId="73EF3451">
                   <wp:extent cx="3017520" cy="1606881"/>
                   <wp:effectExtent l="0" t="0" r="0" b="0"/>
                   <wp:docPr id="12" name="Picture 12"/>
@@ -11448,7 +11448,7 @@
         <w:pStyle w:val="Ttulo1"/>
         <w:spacing w:before="160" w:after="60"/>
       </w:pPr>
-      <w:bookmarkStart w:id="21" w:name="_Toc237782205"/>
+      <w:bookmarkStart w:id="21" w:name="_Toc237786967"/>
       <w:r>
         <w:rPr>
           <w:rFonts w:ascii="Georgia" w:hAnsi="Georgia"/>
@@ -11464,7 +11464,7 @@
         <w:pStyle w:val="Ttulo2"/>
         <w:spacing w:before="120" w:after="40"/>
       </w:pPr>
-      <w:bookmarkStart w:id="22" w:name="_Toc237782206"/>
+      <w:bookmarkStart w:id="22" w:name="_Toc237786968"/>
       <w:r>
         <w:rPr>
           <w:rFonts w:ascii="Georgia" w:hAnsi="Georgia"/>
@@ -11556,7 +11556,7 @@
         <w:pStyle w:val="Ttulo2"/>
         <w:spacing w:before="120" w:after="40"/>
       </w:pPr>
-      <w:bookmarkStart w:id="23" w:name="_Toc237782207"/>
+      <w:bookmarkStart w:id="23" w:name="_Toc237786969"/>
       <w:r>
         <w:rPr>
           <w:rFonts w:ascii="Georgia" w:hAnsi="Georgia"/>
@@ -11787,7 +11787,7 @@
                 <w:noProof/>
               </w:rPr>
               <w:drawing>
-                <wp:inline distT="0" distB="0" distL="0" distR="0" wp14:anchorId="5689DAC8" wp14:editId="019B0F24">
+                <wp:inline distT="0" distB="0" distL="0" distR="0" wp14:anchorId="3AB6EF94" wp14:editId="1711C6D4">
                   <wp:extent cx="3017520" cy="1588528"/>
                   <wp:effectExtent l="0" t="0" r="0" b="0"/>
                   <wp:docPr id="13" name="Picture 13"/>
@@ -11846,7 +11846,7 @@
                 <w:noProof/>
               </w:rPr>
               <w:drawing>
-                <wp:inline distT="0" distB="0" distL="0" distR="0" wp14:anchorId="34A07B72" wp14:editId="0BAC9411">
+                <wp:inline distT="0" distB="0" distL="0" distR="0" wp14:anchorId="20056020" wp14:editId="09456C71">
                   <wp:extent cx="3017520" cy="1709851"/>
                   <wp:effectExtent l="0" t="0" r="0" b="0"/>
                   <wp:docPr id="14" name="Picture 14"/>
@@ -11951,7 +11951,7 @@
         <w:pStyle w:val="Ttulo2"/>
         <w:spacing w:before="120" w:after="40"/>
       </w:pPr>
-      <w:bookmarkStart w:id="24" w:name="_Toc237782208"/>
+      <w:bookmarkStart w:id="24" w:name="_Toc237786970"/>
       <w:r>
         <w:rPr>
           <w:rFonts w:ascii="Georgia" w:hAnsi="Georgia"/>
@@ -12895,7 +12895,7 @@
         <w:pStyle w:val="Ttulo1"/>
         <w:spacing w:before="160" w:after="60"/>
       </w:pPr>
-      <w:bookmarkStart w:id="25" w:name="_Toc237782209"/>
+      <w:bookmarkStart w:id="25" w:name="_Toc237786971"/>
       <w:r>
         <w:rPr>
           <w:rFonts w:ascii="Georgia" w:hAnsi="Georgia"/>
@@ -12911,7 +12911,7 @@
         <w:pStyle w:val="Ttulo2"/>
         <w:spacing w:before="120" w:after="40"/>
       </w:pPr>
-      <w:bookmarkStart w:id="26" w:name="_Toc237782210"/>
+      <w:bookmarkStart w:id="26" w:name="_Toc237786972"/>
       <w:r>
         <w:rPr>
           <w:rFonts w:ascii="Georgia" w:hAnsi="Georgia"/>
@@ -14524,14 +14524,14 @@
         <w:pStyle w:val="Ttulo2"/>
         <w:spacing w:before="120" w:after="40"/>
       </w:pPr>
-      <w:bookmarkStart w:id="27" w:name="_Toc237782211"/>
+      <w:bookmarkStart w:id="27" w:name="_Toc237786973"/>
       <w:r>
         <w:rPr>
           <w:rFonts w:ascii="Georgia" w:hAnsi="Georgia"/>
           <w:color w:val="1E3A8A"/>
           <w:sz w:val="20"/>
         </w:rPr>
-        <w:t>Criterios Metodológicos: Caso Base Dumrauf vs. Cota de Reinversión Damodaran</w:t>
+        <w:t>Criterios Metodológicos: Flujo Base Dumrauf vs. Modelo de Reinversión Damodaran</w:t>
       </w:r>
       <w:bookmarkEnd w:id="27"/>
     </w:p>
@@ -14624,13 +14624,13 @@
           <w:b/>
           <w:sz w:val="17"/>
         </w:rPr>
-        <w:t>Cota de Reinversión (Damodaran, ROIC → WACC):</w:t>
+        <w:t>Ajuste por Tasa de Reinversión (Damodaran, ROIC → WACC):</w:t>
       </w:r>
       <w:r>
         <w:rPr>
           <w:sz w:val="17"/>
         </w:rPr>
-        <w:t xml:space="preserve"> Asumiendo una tasa de reinversión implícita RR = g / WACC = 2,0% / 7,06% = 28,3%, el flujo terminal se ajusta a NOPAT × (1 - RR) = USD 97,1 MM, arrojando un precio objetivo de ARS 993,00, que se adopta como cota conservadora de control.</w:t>
+        <w:t xml:space="preserve"> Con una reinversión implícita RR = g / WACC = 2,0% / 7,06% = 28,3%, el flujo terminal ajustado resulta en NOPAT × (1 - RR) = USD 97,1 MM, determinando una valuación de ARS 993,00 por acción.</w:t>
       </w:r>
     </w:p>
     <w:p>
@@ -14638,7 +14638,7 @@
         <w:pStyle w:val="Ttulo1"/>
         <w:spacing w:before="160" w:after="60"/>
       </w:pPr>
-      <w:bookmarkStart w:id="28" w:name="_Toc237782212"/>
+      <w:bookmarkStart w:id="28" w:name="_Toc237786974"/>
       <w:r>
         <w:rPr>
           <w:rFonts w:ascii="Georgia" w:hAnsi="Georgia"/>
@@ -14654,7 +14654,7 @@
         <w:pStyle w:val="Ttulo2"/>
         <w:spacing w:before="120" w:after="40"/>
       </w:pPr>
-      <w:bookmarkStart w:id="29" w:name="_Toc237782213"/>
+      <w:bookmarkStart w:id="29" w:name="_Toc237786975"/>
       <w:r>
         <w:rPr>
           <w:rFonts w:ascii="Georgia" w:hAnsi="Georgia"/>
@@ -14681,7 +14681,7 @@
         <w:pStyle w:val="Ttulo2"/>
         <w:spacing w:before="120" w:after="40"/>
       </w:pPr>
-      <w:bookmarkStart w:id="30" w:name="_Toc237782214"/>
+      <w:bookmarkStart w:id="30" w:name="_Toc237786976"/>
       <w:r>
         <w:rPr>
           <w:rFonts w:ascii="Georgia" w:hAnsi="Georgia"/>
@@ -14739,7 +14739,7 @@
                 <w:noProof/>
               </w:rPr>
               <w:drawing>
-                <wp:inline distT="0" distB="0" distL="0" distR="0" wp14:anchorId="76B9125F" wp14:editId="3502C5EE">
+                <wp:inline distT="0" distB="0" distL="0" distR="0" wp14:anchorId="475DE319" wp14:editId="77DE0AD3">
                   <wp:extent cx="3017520" cy="1582552"/>
                   <wp:effectExtent l="0" t="0" r="0" b="0"/>
                   <wp:docPr id="15" name="Picture 15"/>
@@ -14798,7 +14798,7 @@
                 <w:noProof/>
               </w:rPr>
               <w:drawing>
-                <wp:inline distT="0" distB="0" distL="0" distR="0" wp14:anchorId="466FFD9F" wp14:editId="5161A583">
+                <wp:inline distT="0" distB="0" distL="0" distR="0" wp14:anchorId="1C522B34" wp14:editId="175028C2">
                   <wp:extent cx="3017520" cy="1733035"/>
                   <wp:effectExtent l="0" t="0" r="0" b="0"/>
                   <wp:docPr id="16" name="Picture 16"/>
@@ -14914,7 +14914,7 @@
         <w:pStyle w:val="Ttulo1"/>
         <w:spacing w:before="160" w:after="60"/>
       </w:pPr>
-      <w:bookmarkStart w:id="31" w:name="_Toc237782215"/>
+      <w:bookmarkStart w:id="31" w:name="_Toc237786977"/>
       <w:r>
         <w:rPr>
           <w:rFonts w:ascii="Georgia" w:hAnsi="Georgia"/>
@@ -14930,7 +14930,7 @@
         <w:pStyle w:val="Ttulo2"/>
         <w:spacing w:before="120" w:after="40"/>
       </w:pPr>
-      <w:bookmarkStart w:id="32" w:name="_Toc237782216"/>
+      <w:bookmarkStart w:id="32" w:name="_Toc237786978"/>
       <w:r>
         <w:rPr>
           <w:rFonts w:ascii="Georgia" w:hAnsi="Georgia"/>
@@ -15995,7 +15995,7 @@
         <w:pStyle w:val="Ttulo2"/>
         <w:spacing w:before="120" w:after="40"/>
       </w:pPr>
-      <w:bookmarkStart w:id="33" w:name="_Toc237782217"/>
+      <w:bookmarkStart w:id="33" w:name="_Toc237786979"/>
       <w:r>
         <w:rPr>
           <w:rFonts w:ascii="Georgia" w:hAnsi="Georgia"/>
@@ -16191,7 +16191,7 @@
         <w:pStyle w:val="Ttulo2"/>
         <w:spacing w:before="120" w:after="40"/>
       </w:pPr>
-      <w:bookmarkStart w:id="34" w:name="_Toc237782218"/>
+      <w:bookmarkStart w:id="34" w:name="_Toc237786980"/>
       <w:r>
         <w:rPr>
           <w:rFonts w:ascii="Georgia" w:hAnsi="Georgia"/>
@@ -16218,7 +16218,7 @@
         <w:pStyle w:val="Ttulo1"/>
         <w:spacing w:before="160" w:after="60"/>
       </w:pPr>
-      <w:bookmarkStart w:id="35" w:name="_Toc237782219"/>
+      <w:bookmarkStart w:id="35" w:name="_Toc237786981"/>
       <w:r>
         <w:rPr>
           <w:rFonts w:ascii="Georgia" w:hAnsi="Georgia"/>
@@ -16234,7 +16234,7 @@
         <w:pStyle w:val="Ttulo2"/>
         <w:spacing w:before="120" w:after="40"/>
       </w:pPr>
-      <w:bookmarkStart w:id="36" w:name="_Toc237782220"/>
+      <w:bookmarkStart w:id="36" w:name="_Toc237786982"/>
       <w:r>
         <w:rPr>
           <w:rFonts w:ascii="Georgia" w:hAnsi="Georgia"/>
@@ -16253,10 +16253,10 @@
         </w:rPr>
       </w:pPr>
       <w:r>
-        <w:t xml:space="preserve">El análisis de ratios auditados (2020–2025) demuestra la solidez de Aluar en cuatro dimensiones: 1) Rentabilidad (ROIC y Márgenes): Margen EBITDA promedió 20,1% (pico del 32,0% en 2022) y el ROIC cerró en 3,52% en 2025 por la inmovilización de USD 243,9 MM en PEAL V, normalizándose a 7,06% terminal; 2) Solvencia y Endeudamiento: Deuda Neta / EBITDA de 3,22x en el pico de inversión, con cobertura de intereses de 3,53x (EBIT/Intereses) y Deuda Total / PN de 0,59x, asegurando el servicio de deuda; 3) Liquidez </w:t>
+        <w:t xml:space="preserve">La serie financiera auditada (2020–2025) comprende cuatro ejes operativos: 1) Rentabilidad (ROIC y Márgenes): Margen EBITDA promedio de 20,1% (pico de 32,0% en 2022) y ROIC de 3,52% en 2025 por la asignación de USD 243,9 MM al Parque Eólico (Etapa V), convergiendo al 7,06% terminal; 2) Solvencia: Deuda Neta / EBITDA de 3,22x en el cierre del plan de inversión, con cobertura de intereses de 3,53x (EBIT/Intereses) y Deuda Total / PN de 0,59x; 3) Liquidez: Razón corriente de 2,44x (prueba ácida de 1,42x) para </w:t>
       </w:r>
       <w:r>
-        <w:t>Estructural: Liquidez Corriente de 2,44x (Prueba Ácida 1,42x), asegurando la compra de alúmina de ultramar; y 4) Eficiencia Operativa: Ciclo de Conversión de Efectivo en 64 días (DIO = 120, DSO = 45, DPO = 101), optimizando el capital de trabajo.</w:t>
+        <w:t>respaldar compras internacionales de alúmina; y 4) Eficiencia: Ciclo de Conversión de Efectivo en 64 días (DIO = 120, DSO = 45, DPO = 101).</w:t>
       </w:r>
     </w:p>
     <w:p>
@@ -19178,7 +19178,7 @@
         <w:pStyle w:val="Ttulo1"/>
         <w:spacing w:before="160" w:after="60"/>
       </w:pPr>
-      <w:bookmarkStart w:id="37" w:name="_Toc237782221"/>
+      <w:bookmarkStart w:id="37" w:name="_Toc237786983"/>
       <w:r>
         <w:rPr>
           <w:rFonts w:ascii="Georgia" w:hAnsi="Georgia"/>
@@ -19194,7 +19194,7 @@
         <w:pStyle w:val="Ttulo2"/>
         <w:spacing w:before="120" w:after="40"/>
       </w:pPr>
-      <w:bookmarkStart w:id="38" w:name="_Toc237782222"/>
+      <w:bookmarkStart w:id="38" w:name="_Toc237786984"/>
       <w:r>
         <w:rPr>
           <w:rFonts w:ascii="Georgia" w:hAnsi="Georgia"/>
@@ -19295,7 +19295,6 @@
           <w:b/>
           <w:color w:val="0D233A"/>
         </w:rPr>
-        <w:lastRenderedPageBreak/>
         <w:t>▪</w:t>
       </w:r>
       <w:r>
@@ -19316,7 +19315,14 @@
         <w:rPr>
           <w:sz w:val="17"/>
         </w:rPr>
-        <w:t xml:space="preserve"> El DCF tradicional asume decisiones rígidas. La opción real valúa la flexibilidad de postergar o ejecutar la ampliación de 312 MW según evolucionen los precios del metal y el costo eléctrico, modelada mediante mínimos cuadrados (LSMC) con polinomios de Laguerre (I_0 = USD 350 MM, tenor de 5 años, σ = 28,5%, R_f = 4,70%, ahorro de USD 25–30/MWh):</w:t>
+        <w:t xml:space="preserve"> El DCF tradicional asume decisiones rígidas. La opción real valúa la flexibilidad de postergar o ejecutar la ampliación de 312 MW según </w:t>
+      </w:r>
+      <w:r>
+        <w:rPr>
+          <w:sz w:val="17"/>
+        </w:rPr>
+        <w:lastRenderedPageBreak/>
+        <w:t>evolucionen los precios del metal y el costo eléctrico, modelada mediante mínimos cuadrados (LSMC) con polinomios de Laguerre (I_0 = USD 350 MM, tenor de 5 años, σ = 28,5%, R_f = 4,70%, ahorro de USD 25–30/MWh):</w:t>
       </w:r>
     </w:p>
     <w:p>
@@ -19401,7 +19407,7 @@
         <w:pStyle w:val="Ttulo2"/>
         <w:spacing w:before="120" w:after="40"/>
       </w:pPr>
-      <w:bookmarkStart w:id="39" w:name="_Toc237782223"/>
+      <w:bookmarkStart w:id="39" w:name="_Toc237786985"/>
       <w:r>
         <w:rPr>
           <w:rFonts w:ascii="Georgia" w:hAnsi="Georgia"/>
@@ -19459,7 +19465,7 @@
                 <w:noProof/>
               </w:rPr>
               <w:drawing>
-                <wp:inline distT="0" distB="0" distL="0" distR="0" wp14:anchorId="2A1769E2" wp14:editId="5F45CE07">
+                <wp:inline distT="0" distB="0" distL="0" distR="0" wp14:anchorId="79385D29" wp14:editId="025AE110">
                   <wp:extent cx="3017520" cy="1677399"/>
                   <wp:effectExtent l="0" t="0" r="0" b="0"/>
                   <wp:docPr id="17" name="Picture 17"/>
@@ -19518,7 +19524,7 @@
                 <w:noProof/>
               </w:rPr>
               <w:drawing>
-                <wp:inline distT="0" distB="0" distL="0" distR="0" wp14:anchorId="13FDD4F6" wp14:editId="0BDFA2DC">
+                <wp:inline distT="0" distB="0" distL="0" distR="0" wp14:anchorId="7378DD54" wp14:editId="7ECFDA66">
                   <wp:extent cx="3017520" cy="1744540"/>
                   <wp:effectExtent l="0" t="0" r="0" b="0"/>
                   <wp:docPr id="18" name="Picture 18"/>
@@ -19623,7 +19629,7 @@
         <w:pStyle w:val="Ttulo2"/>
         <w:spacing w:before="120" w:after="40"/>
       </w:pPr>
-      <w:bookmarkStart w:id="40" w:name="_Toc237782224"/>
+      <w:bookmarkStart w:id="40" w:name="_Toc237786986"/>
       <w:r>
         <w:rPr>
           <w:rFonts w:ascii="Georgia" w:hAnsi="Georgia"/>
@@ -20261,7 +20267,7 @@
         <w:pStyle w:val="Ttulo1"/>
         <w:spacing w:before="160" w:after="60"/>
       </w:pPr>
-      <w:bookmarkStart w:id="41" w:name="_Toc237782225"/>
+      <w:bookmarkStart w:id="41" w:name="_Toc237786987"/>
       <w:r>
         <w:rPr>
           <w:rFonts w:ascii="Georgia" w:hAnsi="Georgia"/>
@@ -20277,7 +20283,7 @@
         <w:pStyle w:val="Ttulo2"/>
         <w:spacing w:before="120" w:after="40"/>
       </w:pPr>
-      <w:bookmarkStart w:id="42" w:name="_Toc237782226"/>
+      <w:bookmarkStart w:id="42" w:name="_Toc237786988"/>
       <w:r>
         <w:rPr>
           <w:rFonts w:ascii="Georgia" w:hAnsi="Georgia"/>
@@ -20335,7 +20341,7 @@
                 <w:noProof/>
               </w:rPr>
               <w:drawing>
-                <wp:inline distT="0" distB="0" distL="0" distR="0" wp14:anchorId="1D777BF6" wp14:editId="0BDB3C06">
+                <wp:inline distT="0" distB="0" distL="0" distR="0" wp14:anchorId="06FA67C8" wp14:editId="4F6C0659">
                   <wp:extent cx="3017520" cy="1541920"/>
                   <wp:effectExtent l="0" t="0" r="0" b="0"/>
                   <wp:docPr id="19" name="Picture 19"/>
@@ -20394,7 +20400,7 @@
                 <w:noProof/>
               </w:rPr>
               <w:drawing>
-                <wp:inline distT="0" distB="0" distL="0" distR="0" wp14:anchorId="749A79BC" wp14:editId="653D0D0B">
+                <wp:inline distT="0" distB="0" distL="0" distR="0" wp14:anchorId="7E3C61FD" wp14:editId="6D88290F">
                   <wp:extent cx="3017520" cy="1735190"/>
                   <wp:effectExtent l="0" t="0" r="0" b="0"/>
                   <wp:docPr id="20" name="Picture 20"/>
@@ -21114,7 +21120,6 @@
               <w:rPr>
                 <w:sz w:val="14"/>
               </w:rPr>
-              <w:lastRenderedPageBreak/>
               <w:t>Monte Carlo (Percentiles P5 / Mediana / P95)</w:t>
             </w:r>
           </w:p>
@@ -21228,6 +21233,7 @@
                 <w:b/>
                 <w:sz w:val="14"/>
               </w:rPr>
+              <w:lastRenderedPageBreak/>
               <w:t>Target Integrado (DCF + Opción Real PEAL V)</w:t>
             </w:r>
           </w:p>
@@ -21534,7 +21540,7 @@
         <w:pStyle w:val="Ttulo1"/>
         <w:spacing w:before="160" w:after="60"/>
       </w:pPr>
-      <w:bookmarkStart w:id="43" w:name="_Toc237782227"/>
+      <w:bookmarkStart w:id="43" w:name="_Toc237786989"/>
       <w:r>
         <w:rPr>
           <w:rFonts w:ascii="Georgia" w:hAnsi="Georgia"/>
@@ -21550,7 +21556,7 @@
         <w:pStyle w:val="Ttulo2"/>
         <w:spacing w:before="120" w:after="40"/>
       </w:pPr>
-      <w:bookmarkStart w:id="44" w:name="_Toc237782228"/>
+      <w:bookmarkStart w:id="44" w:name="_Toc237786990"/>
       <w:r>
         <w:rPr>
           <w:rFonts w:ascii="Georgia" w:hAnsi="Georgia"/>
@@ -21605,7 +21611,7 @@
         <w:pStyle w:val="Ttulo2"/>
         <w:spacing w:before="120" w:after="40"/>
       </w:pPr>
-      <w:bookmarkStart w:id="45" w:name="_Toc237782229"/>
+      <w:bookmarkStart w:id="45" w:name="_Toc237786991"/>
       <w:r>
         <w:rPr>
           <w:rFonts w:ascii="Georgia" w:hAnsi="Georgia"/>
@@ -21624,7 +21630,7 @@
         </w:rPr>
       </w:pPr>
       <w:r>
-        <w:t>Despejando la tasa de crecimiento terminal implícita en la cotización de mercado (Figura 21), se comprueba que el precio actual descuenta un crecimiento a perpetuidad de apenas g^* = 0,69%, muy por debajo del 2,0% fundamental de largo plazo.</w:t>
+        <w:t>Despejando la tasa de crecimiento terminal implícita en la cotización de mercado (Figura 21), el precio descuenta un crecimiento a perpetuidad de g^* = 0,69%, inferior al 2,0% del modelo de equilibrio (g).</w:t>
       </w:r>
     </w:p>
     <w:tbl>
@@ -21663,7 +21669,7 @@
                 <w:noProof/>
               </w:rPr>
               <w:drawing>
-                <wp:inline distT="0" distB="0" distL="0" distR="0" wp14:anchorId="722A40A0" wp14:editId="59FE2DF7">
+                <wp:inline distT="0" distB="0" distL="0" distR="0" wp14:anchorId="1B9C11EC" wp14:editId="4D684CBF">
                   <wp:extent cx="3017520" cy="1735190"/>
                   <wp:effectExtent l="0" t="0" r="0" b="0"/>
                   <wp:docPr id="21" name="Picture 21"/>
@@ -21722,7 +21728,7 @@
                 <w:noProof/>
               </w:rPr>
               <w:drawing>
-                <wp:inline distT="0" distB="0" distL="0" distR="0" wp14:anchorId="07362FAE" wp14:editId="44CFDC9C">
+                <wp:inline distT="0" distB="0" distL="0" distR="0" wp14:anchorId="35551633" wp14:editId="1C418210">
                   <wp:extent cx="3017520" cy="1598185"/>
                   <wp:effectExtent l="0" t="0" r="0" b="0"/>
                   <wp:docPr id="22" name="Picture 22"/>
@@ -21827,7 +21833,7 @@
         <w:pStyle w:val="Ttulo1"/>
         <w:spacing w:before="160" w:after="60"/>
       </w:pPr>
-      <w:bookmarkStart w:id="46" w:name="_Toc237782230"/>
+      <w:bookmarkStart w:id="46" w:name="_Toc237786992"/>
       <w:r>
         <w:rPr>
           <w:rFonts w:ascii="Georgia" w:hAnsi="Georgia"/>
@@ -21843,7 +21849,7 @@
         <w:pStyle w:val="Ttulo2"/>
         <w:spacing w:before="120" w:after="40"/>
       </w:pPr>
-      <w:bookmarkStart w:id="47" w:name="_Toc237782231"/>
+      <w:bookmarkStart w:id="47" w:name="_Toc237786993"/>
       <w:r>
         <w:rPr>
           <w:rFonts w:ascii="Georgia" w:hAnsi="Georgia"/>
@@ -23400,7 +23406,7 @@
         <w:pStyle w:val="Ttulo1"/>
         <w:spacing w:before="160" w:after="60"/>
       </w:pPr>
-      <w:bookmarkStart w:id="48" w:name="_Toc237782232"/>
+      <w:bookmarkStart w:id="48" w:name="_Toc237786994"/>
       <w:r>
         <w:rPr>
           <w:rFonts w:ascii="Georgia" w:hAnsi="Georgia"/>
@@ -23416,7 +23422,7 @@
         <w:pStyle w:val="Ttulo2"/>
         <w:spacing w:before="120" w:after="40"/>
       </w:pPr>
-      <w:bookmarkStart w:id="49" w:name="_Toc237782233"/>
+      <w:bookmarkStart w:id="49" w:name="_Toc237786995"/>
       <w:r>
         <w:rPr>
           <w:rFonts w:ascii="Georgia" w:hAnsi="Georgia"/>
@@ -23500,7 +23506,7 @@
         </w:rPr>
       </w:pPr>
       <w:r>
-        <w:t>Esto demuestra que el beta Hamada de 0,888 utilizado en el WACC introduce un margen de seguridad conservador.</w:t>
+        <w:t>El beta Hamada de 0,888 incorpora una prima de prudencia sobre el estimador dinámico puntual.</w:t>
       </w:r>
     </w:p>
     <w:tbl>
@@ -23540,7 +23546,7 @@
               </w:rPr>
               <w:lastRenderedPageBreak/>
               <w:drawing>
-                <wp:inline distT="0" distB="0" distL="0" distR="0" wp14:anchorId="754F2190" wp14:editId="77C789CB">
+                <wp:inline distT="0" distB="0" distL="0" distR="0" wp14:anchorId="182769FF" wp14:editId="3B1A085F">
                   <wp:extent cx="3017520" cy="1748097"/>
                   <wp:effectExtent l="0" t="0" r="0" b="0"/>
                   <wp:docPr id="23" name="Picture 23"/>
@@ -23599,7 +23605,7 @@
                 <w:noProof/>
               </w:rPr>
               <w:drawing>
-                <wp:inline distT="0" distB="0" distL="0" distR="0" wp14:anchorId="3CFE33F2" wp14:editId="7F1BA6D9">
+                <wp:inline distT="0" distB="0" distL="0" distR="0" wp14:anchorId="70BFE8D8" wp14:editId="0D54997D">
                   <wp:extent cx="3017520" cy="1621771"/>
                   <wp:effectExtent l="0" t="0" r="0" b="0"/>
                   <wp:docPr id="24" name="Picture 24"/>
@@ -23704,7 +23710,7 @@
         <w:pStyle w:val="Ttulo2"/>
         <w:spacing w:before="120" w:after="40"/>
       </w:pPr>
-      <w:bookmarkStart w:id="50" w:name="_Toc237782234"/>
+      <w:bookmarkStart w:id="50" w:name="_Toc237786996"/>
       <w:r>
         <w:rPr>
           <w:rFonts w:ascii="Georgia" w:hAnsi="Georgia"/>
@@ -24448,7 +24454,7 @@
         <w:pStyle w:val="Ttulo2"/>
         <w:spacing w:before="120" w:after="40"/>
       </w:pPr>
-      <w:bookmarkStart w:id="51" w:name="_Toc237782235"/>
+      <w:bookmarkStart w:id="51" w:name="_Toc237786997"/>
       <w:r>
         <w:rPr>
           <w:rFonts w:ascii="Georgia" w:hAnsi="Georgia"/>
@@ -24509,7 +24515,7 @@
         <w:pStyle w:val="Ttulo2"/>
         <w:spacing w:before="120" w:after="40"/>
       </w:pPr>
-      <w:bookmarkStart w:id="52" w:name="_Toc237782236"/>
+      <w:bookmarkStart w:id="52" w:name="_Toc237786998"/>
       <w:r>
         <w:rPr>
           <w:rFonts w:ascii="Georgia" w:hAnsi="Georgia"/>
@@ -24590,7 +24596,7 @@
                 <w:noProof/>
               </w:rPr>
               <w:drawing>
-                <wp:inline distT="0" distB="0" distL="0" distR="0" wp14:anchorId="62DCCE2A" wp14:editId="4BDDFA7F">
+                <wp:inline distT="0" distB="0" distL="0" distR="0" wp14:anchorId="0190FCFF" wp14:editId="32467909">
                   <wp:extent cx="3017520" cy="1749929"/>
                   <wp:effectExtent l="0" t="0" r="0" b="0"/>
                   <wp:docPr id="25" name="Picture 25"/>
@@ -24649,7 +24655,7 @@
                 <w:noProof/>
               </w:rPr>
               <w:drawing>
-                <wp:inline distT="0" distB="0" distL="0" distR="0" wp14:anchorId="1DDFC0CA" wp14:editId="2BF3D961">
+                <wp:inline distT="0" distB="0" distL="0" distR="0" wp14:anchorId="549E232A" wp14:editId="51B7DFE1">
                   <wp:extent cx="3017520" cy="1664532"/>
                   <wp:effectExtent l="0" t="0" r="0" b="0"/>
                   <wp:docPr id="26" name="Picture 26"/>
@@ -25692,7 +25698,7 @@
         <w:pStyle w:val="Ttulo2"/>
         <w:spacing w:before="120" w:after="40"/>
       </w:pPr>
-      <w:bookmarkStart w:id="53" w:name="_Toc237782237"/>
+      <w:bookmarkStart w:id="53" w:name="_Toc237786999"/>
       <w:r>
         <w:rPr>
           <w:rFonts w:ascii="Georgia" w:hAnsi="Georgia"/>
@@ -25711,7 +25717,7 @@
         </w:rPr>
       </w:pPr>
       <w:r>
-        <w:t>La integración de 10.000 trayectorias de precios y costos en tiempo continuo (Figura 27) produce una distribución suave del valor de la firma, cuyos riesgos operativos y financieros se sintetizan en la Matriz de Probabilidad vs. Impacto (Figura 28).</w:t>
+        <w:t>La simulación de 10.000 trayectorias de precios y costos en tiempo continuo (Figura 27) determina la distribución del valor del patrimonio, estructurada por criticidad en la Matriz de Probabilidad e Impacto (Figura 28).</w:t>
       </w:r>
     </w:p>
     <w:tbl>
@@ -25750,7 +25756,7 @@
                 <w:noProof/>
               </w:rPr>
               <w:drawing>
-                <wp:inline distT="0" distB="0" distL="0" distR="0" wp14:anchorId="44E72977" wp14:editId="732EA227">
+                <wp:inline distT="0" distB="0" distL="0" distR="0" wp14:anchorId="1614A630" wp14:editId="3138450C">
                   <wp:extent cx="3017520" cy="1706444"/>
                   <wp:effectExtent l="0" t="0" r="0" b="0"/>
                   <wp:docPr id="27" name="Picture 27"/>
@@ -25809,7 +25815,7 @@
                 <w:noProof/>
               </w:rPr>
               <w:drawing>
-                <wp:inline distT="0" distB="0" distL="0" distR="0" wp14:anchorId="5F0FAFE5" wp14:editId="77DBDC99">
+                <wp:inline distT="0" distB="0" distL="0" distR="0" wp14:anchorId="56BDAD62" wp14:editId="45B16224">
                   <wp:extent cx="3017520" cy="1751281"/>
                   <wp:effectExtent l="0" t="0" r="0" b="0"/>
                   <wp:docPr id="28" name="Picture 28"/>
@@ -25914,7 +25920,7 @@
         <w:pStyle w:val="Ttulo1"/>
         <w:spacing w:before="160" w:after="60"/>
       </w:pPr>
-      <w:bookmarkStart w:id="54" w:name="_Toc237782238"/>
+      <w:bookmarkStart w:id="54" w:name="_Toc237787000"/>
       <w:r>
         <w:rPr>
           <w:rFonts w:ascii="Georgia" w:hAnsi="Georgia"/>
@@ -25930,7 +25936,7 @@
         <w:pStyle w:val="Ttulo2"/>
         <w:spacing w:before="120" w:after="40"/>
       </w:pPr>
-      <w:bookmarkStart w:id="55" w:name="_Toc237782239"/>
+      <w:bookmarkStart w:id="55" w:name="_Toc237787001"/>
       <w:r>
         <w:rPr>
           <w:rFonts w:ascii="Georgia" w:hAnsi="Georgia"/>
@@ -25991,7 +25997,7 @@
         <w:pStyle w:val="Ttulo2"/>
         <w:spacing w:before="120" w:after="40"/>
       </w:pPr>
-      <w:bookmarkStart w:id="56" w:name="_Toc237782240"/>
+      <w:bookmarkStart w:id="56" w:name="_Toc237787002"/>
       <w:r>
         <w:rPr>
           <w:rFonts w:ascii="Georgia" w:hAnsi="Georgia"/>
@@ -26010,7 +26016,16 @@
         </w:rPr>
       </w:pPr>
       <w:r>
-        <w:t>El test ARCH-LM (LM = 48,2, p &lt; 0,001) rechaza la hipótesis de homocedasticidad en los residuos OLS, evidenciando que la varianza no es constante sino que se agrupa en conglomerados temporales. Para capturar esta dinámica condicional, se calibra un modelo GARCH(1,1) (Figura 30):</w:t>
+        <w:t>El test ARCH-LM (LM = 48,2, p &lt; 0,001) rechaza la hipótesis de homocedasticidad en los residuos OLS; la presencia de agrupamiento de volatilidad (</w:t>
+      </w:r>
+      <w:r>
+        <w:rPr>
+          <w:i/>
+        </w:rPr>
+        <w:t>volatility clustering</w:t>
+      </w:r>
+      <w:r>
+        <w:t>) exige modelar la dinámica condicional de la varianza. Para capturar esta dinámica, se calibra un modelo GARCH(1,1) (Figura 30):</w:t>
       </w:r>
     </w:p>
     <w:p>
@@ -26038,16 +26053,7 @@
         </w:rPr>
       </w:pPr>
       <w:r>
-        <w:t>La alta persistencia (α+β = 0,977) refleja la lenta absorción de shocks cambiarios y de commodities. Durante fases de tensión (</w:t>
-      </w:r>
-      <w:r>
-        <w:rPr>
-          <w:i/>
-        </w:rPr>
-        <w:t>flight-to-quality</w:t>
-      </w:r>
-      <w:r>
-        <w:t>), el Beta condicional se contrae temporalmente hacia 0,65, mientras que el Beta Hamada de 0,888 utilizado en el WACC preserva la representatividad estructural de ciclo completo.</w:t>
+        <w:t>La persistencia condicional (α+β = 0,977) describe la propagación gradual de shocks cambiarios y de commodities. En episodios de contracción de liquidez y aversión al riesgo en el mercado local, el Beta condicional desciende a 0,65, mientras que el parámetro estructural de 0,888 mantiene la calibración de ciclo completo para el costo de capital.</w:t>
       </w:r>
     </w:p>
     <w:tbl>
@@ -26086,7 +26092,7 @@
                 <w:noProof/>
               </w:rPr>
               <w:drawing>
-                <wp:inline distT="0" distB="0" distL="0" distR="0" wp14:anchorId="48AAD5D0" wp14:editId="5CD96CB2">
+                <wp:inline distT="0" distB="0" distL="0" distR="0" wp14:anchorId="410EDB3D" wp14:editId="71FD9D08">
                   <wp:extent cx="3017520" cy="1701609"/>
                   <wp:effectExtent l="0" t="0" r="0" b="0"/>
                   <wp:docPr id="29" name="Picture 29"/>
@@ -26145,7 +26151,7 @@
                 <w:noProof/>
               </w:rPr>
               <w:drawing>
-                <wp:inline distT="0" distB="0" distL="0" distR="0" wp14:anchorId="1C2BC43B" wp14:editId="5613BD8F">
+                <wp:inline distT="0" distB="0" distL="0" distR="0" wp14:anchorId="297E2EFF" wp14:editId="68DDC679">
                   <wp:extent cx="3017520" cy="1661546"/>
                   <wp:effectExtent l="0" t="0" r="0" b="0"/>
                   <wp:docPr id="30" name="Picture 30"/>
@@ -26259,15 +26265,7 @@
           <w:color w:val="0D233A"/>
           <w:sz w:val="16"/>
         </w:rPr>
-        <w:t xml:space="preserve">Tabla: </w:t>
-      </w:r>
-      <w:r>
-        <w:rPr>
-          <w:b/>
-          <w:color w:val="0D233A"/>
-          <w:sz w:val="16"/>
-        </w:rPr>
-        <w:t>Bondad de Ajuste para el Modelado del Riesgo Soberano</w:t>
+        <w:t>Tabla: Bondad de Ajuste para el Modelado del Riesgo Soberano</w:t>
       </w:r>
     </w:p>
     <w:tbl>
@@ -26640,7 +26638,7 @@
         <w:pStyle w:val="Ttulo2"/>
         <w:spacing w:before="120" w:after="40"/>
       </w:pPr>
-      <w:bookmarkStart w:id="57" w:name="_Toc237782241"/>
+      <w:bookmarkStart w:id="57" w:name="_Toc237787003"/>
       <w:r>
         <w:rPr>
           <w:rFonts w:ascii="Georgia" w:hAnsi="Georgia"/>
@@ -26717,7 +26715,7 @@
                 <w:noProof/>
               </w:rPr>
               <w:drawing>
-                <wp:inline distT="0" distB="0" distL="0" distR="0" wp14:anchorId="4E5C04A5" wp14:editId="3B2B04C9">
+                <wp:inline distT="0" distB="0" distL="0" distR="0" wp14:anchorId="1F1407FF" wp14:editId="5E8374A9">
                   <wp:extent cx="3017520" cy="1740520"/>
                   <wp:effectExtent l="0" t="0" r="0" b="0"/>
                   <wp:docPr id="31" name="Picture 31"/>
@@ -27310,7 +27308,7 @@
         <w:pStyle w:val="Ttulo2"/>
         <w:spacing w:before="120" w:after="40"/>
       </w:pPr>
-      <w:bookmarkStart w:id="58" w:name="_Toc237782242"/>
+      <w:bookmarkStart w:id="58" w:name="_Toc237787004"/>
       <w:r>
         <w:rPr>
           <w:rFonts w:ascii="Georgia" w:hAnsi="Georgia"/>
@@ -28585,7 +28583,7 @@
         <w:pStyle w:val="Ttulo1"/>
         <w:spacing w:before="160" w:after="60"/>
       </w:pPr>
-      <w:bookmarkStart w:id="59" w:name="_Toc237782243"/>
+      <w:bookmarkStart w:id="59" w:name="_Toc237787005"/>
       <w:r>
         <w:rPr>
           <w:rFonts w:ascii="Georgia" w:hAnsi="Georgia"/>
@@ -28801,7 +28799,7 @@
         <w:pStyle w:val="Ttulo1"/>
         <w:spacing w:before="160" w:after="60"/>
       </w:pPr>
-      <w:bookmarkStart w:id="60" w:name="_Toc237782244"/>
+      <w:bookmarkStart w:id="60" w:name="_Toc237787006"/>
       <w:r>
         <w:rPr>
           <w:rFonts w:ascii="Georgia" w:hAnsi="Georgia"/>
@@ -37648,7 +37646,7 @@
         <w:pStyle w:val="Ttulo1"/>
         <w:spacing w:before="160" w:after="60"/>
       </w:pPr>
-      <w:bookmarkStart w:id="61" w:name="_Toc237782245"/>
+      <w:bookmarkStart w:id="61" w:name="_Toc237787007"/>
       <w:r>
         <w:rPr>
           <w:rFonts w:ascii="Georgia" w:hAnsi="Georgia"/>
@@ -38120,7 +38118,7 @@
         <w:pStyle w:val="Ttulo1"/>
         <w:spacing w:before="160" w:after="60"/>
       </w:pPr>
-      <w:bookmarkStart w:id="62" w:name="_Toc237782246"/>
+      <w:bookmarkStart w:id="62" w:name="_Toc237787008"/>
       <w:r>
         <w:rPr>
           <w:rFonts w:ascii="Georgia" w:hAnsi="Georgia"/>
@@ -38622,31 +38620,31 @@
       </w:rPr>
     </w:lvl>
   </w:abstractNum>
-  <w:num w:numId="1" w16cid:durableId="719524366">
+  <w:num w:numId="1" w16cid:durableId="949819689">
     <w:abstractNumId w:val="8"/>
   </w:num>
-  <w:num w:numId="2" w16cid:durableId="2077701981">
+  <w:num w:numId="2" w16cid:durableId="337969449">
     <w:abstractNumId w:val="6"/>
   </w:num>
-  <w:num w:numId="3" w16cid:durableId="2038114245">
+  <w:num w:numId="3" w16cid:durableId="147937554">
     <w:abstractNumId w:val="5"/>
   </w:num>
-  <w:num w:numId="4" w16cid:durableId="446431315">
+  <w:num w:numId="4" w16cid:durableId="302006464">
     <w:abstractNumId w:val="4"/>
   </w:num>
-  <w:num w:numId="5" w16cid:durableId="306476620">
+  <w:num w:numId="5" w16cid:durableId="958222524">
     <w:abstractNumId w:val="7"/>
   </w:num>
-  <w:num w:numId="6" w16cid:durableId="403912689">
+  <w:num w:numId="6" w16cid:durableId="1093546825">
     <w:abstractNumId w:val="3"/>
   </w:num>
-  <w:num w:numId="7" w16cid:durableId="412166992">
+  <w:num w:numId="7" w16cid:durableId="296686639">
     <w:abstractNumId w:val="2"/>
   </w:num>
-  <w:num w:numId="8" w16cid:durableId="92364450">
+  <w:num w:numId="8" w16cid:durableId="1132558822">
     <w:abstractNumId w:val="1"/>
   </w:num>
-  <w:num w:numId="9" w16cid:durableId="1459689207">
+  <w:num w:numId="9" w16cid:durableId="591159565">
     <w:abstractNumId w:val="0"/>
   </w:num>
 </w:numbering>
@@ -50077,7 +50075,7 @@
     <w:autoRedefine/>
     <w:uiPriority w:val="39"/>
     <w:unhideWhenUsed/>
-    <w:rsid w:val="00D949AC"/>
+    <w:rsid w:val="00F156C8"/>
     <w:pPr>
       <w:spacing w:before="10" w:after="10" w:line="240" w:lineRule="auto"/>
     </w:pPr>
@@ -50092,7 +50090,7 @@
     <w:autoRedefine/>
     <w:uiPriority w:val="39"/>
     <w:unhideWhenUsed/>
-    <w:rsid w:val="00D949AC"/>
+    <w:rsid w:val="00F156C8"/>
     <w:pPr>
       <w:spacing w:after="0" w:line="240" w:lineRule="auto"/>
       <w:ind w:left="180"/>
@@ -50106,7 +50104,7 @@
     <w:basedOn w:val="Fuentedeprrafopredeter"/>
     <w:uiPriority w:val="99"/>
     <w:unhideWhenUsed/>
-    <w:rsid w:val="00D949AC"/>
+    <w:rsid w:val="00F156C8"/>
     <w:rPr>
       <w:color w:val="0000FF" w:themeColor="hyperlink"/>
       <w:u w:val="single"/>

</xml_diff>

<commit_message>
Achicar aviso legal, mover fuentes y metodología a un anexo, y frases mas naturales
</commit_message>
<xml_diff>
--- a/01_Reporte_PDF/Informe_Valuacion_Aluar_UNCuyo.docx
+++ b/01_Reporte_PDF/Informe_Valuacion_Aluar_UNCuyo.docx
@@ -1340,7 +1340,7 @@
         </w:rPr>
         <w:fldChar w:fldCharType="separate"/>
       </w:r>
-      <w:hyperlink w:anchor="_Toc238660445" w:history="1">
+      <w:hyperlink w:anchor="_Toc238661164" w:history="1">
         <w:r>
           <w:rPr>
             <w:rStyle w:val="Hipervnculo"/>
@@ -1367,7 +1367,7 @@
             <w:noProof/>
             <w:webHidden/>
           </w:rPr>
-          <w:instrText xml:space="preserve"> PAGEREF _Toc238660445 \h </w:instrText>
+          <w:instrText xml:space="preserve"> PAGEREF _Toc238661164 \h </w:instrText>
         </w:r>
         <w:r>
           <w:rPr>
@@ -1414,7 +1414,7 @@
           <w14:ligatures w14:val="standardContextual"/>
         </w:rPr>
       </w:pPr>
-      <w:hyperlink w:anchor="_Toc238660446" w:history="1">
+      <w:hyperlink w:anchor="_Toc238661165" w:history="1">
         <w:r>
           <w:rPr>
             <w:rStyle w:val="Hipervnculo"/>
@@ -1441,7 +1441,7 @@
             <w:noProof/>
             <w:webHidden/>
           </w:rPr>
-          <w:instrText xml:space="preserve"> PAGEREF _Toc238660446 \h </w:instrText>
+          <w:instrText xml:space="preserve"> PAGEREF _Toc238661165 \h </w:instrText>
         </w:r>
         <w:r>
           <w:rPr>
@@ -1488,7 +1488,7 @@
           <w14:ligatures w14:val="standardContextual"/>
         </w:rPr>
       </w:pPr>
-      <w:hyperlink w:anchor="_Toc238660447" w:history="1">
+      <w:hyperlink w:anchor="_Toc238661166" w:history="1">
         <w:r>
           <w:rPr>
             <w:rStyle w:val="Hipervnculo"/>
@@ -1515,7 +1515,81 @@
             <w:noProof/>
             <w:webHidden/>
           </w:rPr>
-          <w:instrText xml:space="preserve"> PAGEREF _Toc238660447 \h </w:instrText>
+          <w:instrText xml:space="preserve"> PAGEREF _Toc238661166 \h </w:instrText>
+        </w:r>
+        <w:r>
+          <w:rPr>
+            <w:noProof/>
+            <w:webHidden/>
+          </w:rPr>
+        </w:r>
+        <w:r>
+          <w:rPr>
+            <w:noProof/>
+            <w:webHidden/>
+          </w:rPr>
+          <w:fldChar w:fldCharType="separate"/>
+        </w:r>
+        <w:r>
+          <w:rPr>
+            <w:noProof/>
+            <w:webHidden/>
+          </w:rPr>
+          <w:t>3</w:t>
+        </w:r>
+        <w:r>
+          <w:rPr>
+            <w:noProof/>
+            <w:webHidden/>
+          </w:rPr>
+          <w:fldChar w:fldCharType="end"/>
+        </w:r>
+      </w:hyperlink>
+    </w:p>
+    <w:p>
+      <w:pPr>
+        <w:pStyle w:val="TDC2"/>
+        <w:tabs>
+          <w:tab w:val="right" w:leader="dot" w:pos="4837"/>
+        </w:tabs>
+        <w:rPr>
+          <w:rFonts w:asciiTheme="minorHAnsi" w:hAnsiTheme="minorHAnsi"/>
+          <w:noProof/>
+          <w:color w:val="auto"/>
+          <w:kern w:val="2"/>
+          <w:sz w:val="24"/>
+          <w:szCs w:val="24"/>
+          <w14:ligatures w14:val="standardContextual"/>
+        </w:rPr>
+      </w:pPr>
+      <w:hyperlink w:anchor="_Toc238661167" w:history="1">
+        <w:r>
+          <w:rPr>
+            <w:rStyle w:val="Hipervnculo"/>
+            <w:noProof/>
+          </w:rPr>
+          <w:t>Matriz Energética y Posición de Costos C1</w:t>
+        </w:r>
+        <w:r>
+          <w:rPr>
+            <w:noProof/>
+            <w:webHidden/>
+          </w:rPr>
+          <w:tab/>
+        </w:r>
+        <w:r>
+          <w:rPr>
+            <w:noProof/>
+            <w:webHidden/>
+          </w:rPr>
+          <w:fldChar w:fldCharType="begin"/>
+        </w:r>
+        <w:r>
+          <w:rPr>
+            <w:noProof/>
+            <w:webHidden/>
+          </w:rPr>
+          <w:instrText xml:space="preserve"> PAGEREF _Toc238661167 \h </w:instrText>
         </w:r>
         <w:r>
           <w:rPr>
@@ -1562,13 +1636,13 @@
           <w14:ligatures w14:val="standardContextual"/>
         </w:rPr>
       </w:pPr>
-      <w:hyperlink w:anchor="_Toc238660448" w:history="1">
+      <w:hyperlink w:anchor="_Toc238661168" w:history="1">
         <w:r>
           <w:rPr>
             <w:rStyle w:val="Hipervnculo"/>
             <w:noProof/>
           </w:rPr>
-          <w:t>Matriz Energética y Posición de Costos C1</w:t>
+          <w:t>Certificación ASI y Mezcla de Elaborados</w:t>
         </w:r>
         <w:r>
           <w:rPr>
@@ -1589,7 +1663,7 @@
             <w:noProof/>
             <w:webHidden/>
           </w:rPr>
-          <w:instrText xml:space="preserve"> PAGEREF _Toc238660448 \h </w:instrText>
+          <w:instrText xml:space="preserve"> PAGEREF _Toc238661168 \h </w:instrText>
         </w:r>
         <w:r>
           <w:rPr>
@@ -1636,13 +1710,13 @@
           <w14:ligatures w14:val="standardContextual"/>
         </w:rPr>
       </w:pPr>
-      <w:hyperlink w:anchor="_Toc238660449" w:history="1">
+      <w:hyperlink w:anchor="_Toc238661169" w:history="1">
         <w:r>
           <w:rPr>
             <w:rStyle w:val="Hipervnculo"/>
             <w:noProof/>
           </w:rPr>
-          <w:t>Certificación ASI y Mezcla de Elaborados</w:t>
+          <w:t>Diagnóstico Estratégico FODA</w:t>
         </w:r>
         <w:r>
           <w:rPr>
@@ -1663,7 +1737,7 @@
             <w:noProof/>
             <w:webHidden/>
           </w:rPr>
-          <w:instrText xml:space="preserve"> PAGEREF _Toc238660449 \h </w:instrText>
+          <w:instrText xml:space="preserve"> PAGEREF _Toc238661169 \h </w:instrText>
         </w:r>
         <w:r>
           <w:rPr>
@@ -1710,13 +1784,13 @@
           <w14:ligatures w14:val="standardContextual"/>
         </w:rPr>
       </w:pPr>
-      <w:hyperlink w:anchor="_Toc238660450" w:history="1">
+      <w:hyperlink w:anchor="_Toc238661170" w:history="1">
         <w:r>
           <w:rPr>
             <w:rStyle w:val="Hipervnculo"/>
             <w:noProof/>
           </w:rPr>
-          <w:t>Diagnóstico Estratégico FODA</w:t>
+          <w:t>Desempeño Financiero Reciente (2020–2025)</w:t>
         </w:r>
         <w:r>
           <w:rPr>
@@ -1737,7 +1811,81 @@
             <w:noProof/>
             <w:webHidden/>
           </w:rPr>
-          <w:instrText xml:space="preserve"> PAGEREF _Toc238660450 \h </w:instrText>
+          <w:instrText xml:space="preserve"> PAGEREF _Toc238661170 \h </w:instrText>
+        </w:r>
+        <w:r>
+          <w:rPr>
+            <w:noProof/>
+            <w:webHidden/>
+          </w:rPr>
+        </w:r>
+        <w:r>
+          <w:rPr>
+            <w:noProof/>
+            <w:webHidden/>
+          </w:rPr>
+          <w:fldChar w:fldCharType="separate"/>
+        </w:r>
+        <w:r>
+          <w:rPr>
+            <w:noProof/>
+            <w:webHidden/>
+          </w:rPr>
+          <w:t>4</w:t>
+        </w:r>
+        <w:r>
+          <w:rPr>
+            <w:noProof/>
+            <w:webHidden/>
+          </w:rPr>
+          <w:fldChar w:fldCharType="end"/>
+        </w:r>
+      </w:hyperlink>
+    </w:p>
+    <w:p>
+      <w:pPr>
+        <w:pStyle w:val="TDC1"/>
+        <w:tabs>
+          <w:tab w:val="right" w:leader="dot" w:pos="4837"/>
+        </w:tabs>
+        <w:rPr>
+          <w:rFonts w:asciiTheme="minorHAnsi" w:hAnsiTheme="minorHAnsi"/>
+          <w:noProof/>
+          <w:color w:val="auto"/>
+          <w:kern w:val="2"/>
+          <w:sz w:val="24"/>
+          <w:szCs w:val="24"/>
+          <w14:ligatures w14:val="standardContextual"/>
+        </w:rPr>
+      </w:pPr>
+      <w:hyperlink w:anchor="_Toc238661171" w:history="1">
+        <w:r>
+          <w:rPr>
+            <w:rStyle w:val="Hipervnculo"/>
+            <w:noProof/>
+          </w:rPr>
+          <w:t>Contexto Macroeconómico y Mecánica Operativa de Proyección (P × Q)</w:t>
+        </w:r>
+        <w:r>
+          <w:rPr>
+            <w:noProof/>
+            <w:webHidden/>
+          </w:rPr>
+          <w:tab/>
+        </w:r>
+        <w:r>
+          <w:rPr>
+            <w:noProof/>
+            <w:webHidden/>
+          </w:rPr>
+          <w:fldChar w:fldCharType="begin"/>
+        </w:r>
+        <w:r>
+          <w:rPr>
+            <w:noProof/>
+            <w:webHidden/>
+          </w:rPr>
+          <w:instrText xml:space="preserve"> PAGEREF _Toc238661171 \h </w:instrText>
         </w:r>
         <w:r>
           <w:rPr>
@@ -1784,13 +1932,13 @@
           <w14:ligatures w14:val="standardContextual"/>
         </w:rPr>
       </w:pPr>
-      <w:hyperlink w:anchor="_Toc238660451" w:history="1">
+      <w:hyperlink w:anchor="_Toc238661172" w:history="1">
         <w:r>
           <w:rPr>
             <w:rStyle w:val="Hipervnculo"/>
             <w:noProof/>
           </w:rPr>
-          <w:t>Desempeño Financiero Reciente (2020–2025)</w:t>
+          <w:t>Entorno Macroeconómico y Dinámica del Riesgo Soberano</w:t>
         </w:r>
         <w:r>
           <w:rPr>
@@ -1811,7 +1959,81 @@
             <w:noProof/>
             <w:webHidden/>
           </w:rPr>
-          <w:instrText xml:space="preserve"> PAGEREF _Toc238660451 \h </w:instrText>
+          <w:instrText xml:space="preserve"> PAGEREF _Toc238661172 \h </w:instrText>
+        </w:r>
+        <w:r>
+          <w:rPr>
+            <w:noProof/>
+            <w:webHidden/>
+          </w:rPr>
+        </w:r>
+        <w:r>
+          <w:rPr>
+            <w:noProof/>
+            <w:webHidden/>
+          </w:rPr>
+          <w:fldChar w:fldCharType="separate"/>
+        </w:r>
+        <w:r>
+          <w:rPr>
+            <w:noProof/>
+            <w:webHidden/>
+          </w:rPr>
+          <w:t>4</w:t>
+        </w:r>
+        <w:r>
+          <w:rPr>
+            <w:noProof/>
+            <w:webHidden/>
+          </w:rPr>
+          <w:fldChar w:fldCharType="end"/>
+        </w:r>
+      </w:hyperlink>
+    </w:p>
+    <w:p>
+      <w:pPr>
+        <w:pStyle w:val="TDC2"/>
+        <w:tabs>
+          <w:tab w:val="right" w:leader="dot" w:pos="4837"/>
+        </w:tabs>
+        <w:rPr>
+          <w:rFonts w:asciiTheme="minorHAnsi" w:hAnsiTheme="minorHAnsi"/>
+          <w:noProof/>
+          <w:color w:val="auto"/>
+          <w:kern w:val="2"/>
+          <w:sz w:val="24"/>
+          <w:szCs w:val="24"/>
+          <w14:ligatures w14:val="standardContextual"/>
+        </w:rPr>
+      </w:pPr>
+      <w:hyperlink w:anchor="_Toc238661173" w:history="1">
+        <w:r>
+          <w:rPr>
+            <w:rStyle w:val="Hipervnculo"/>
+            <w:noProof/>
+          </w:rPr>
+          <w:t>Volumen Saturado y Reversión del LME sobre los Ingresos</w:t>
+        </w:r>
+        <w:r>
+          <w:rPr>
+            <w:noProof/>
+            <w:webHidden/>
+          </w:rPr>
+          <w:tab/>
+        </w:r>
+        <w:r>
+          <w:rPr>
+            <w:noProof/>
+            <w:webHidden/>
+          </w:rPr>
+          <w:fldChar w:fldCharType="begin"/>
+        </w:r>
+        <w:r>
+          <w:rPr>
+            <w:noProof/>
+            <w:webHidden/>
+          </w:rPr>
+          <w:instrText xml:space="preserve"> PAGEREF _Toc238661173 \h </w:instrText>
         </w:r>
         <w:r>
           <w:rPr>
@@ -1858,229 +2080,7 @@
           <w14:ligatures w14:val="standardContextual"/>
         </w:rPr>
       </w:pPr>
-      <w:hyperlink w:anchor="_Toc238660452" w:history="1">
-        <w:r>
-          <w:rPr>
-            <w:rStyle w:val="Hipervnculo"/>
-            <w:noProof/>
-          </w:rPr>
-          <w:t>Contexto Macroeconómico y Mecánica Operativa de Proyección (P × Q)</w:t>
-        </w:r>
-        <w:r>
-          <w:rPr>
-            <w:noProof/>
-            <w:webHidden/>
-          </w:rPr>
-          <w:tab/>
-        </w:r>
-        <w:r>
-          <w:rPr>
-            <w:noProof/>
-            <w:webHidden/>
-          </w:rPr>
-          <w:fldChar w:fldCharType="begin"/>
-        </w:r>
-        <w:r>
-          <w:rPr>
-            <w:noProof/>
-            <w:webHidden/>
-          </w:rPr>
-          <w:instrText xml:space="preserve"> PAGEREF _Toc238660452 \h </w:instrText>
-        </w:r>
-        <w:r>
-          <w:rPr>
-            <w:noProof/>
-            <w:webHidden/>
-          </w:rPr>
-        </w:r>
-        <w:r>
-          <w:rPr>
-            <w:noProof/>
-            <w:webHidden/>
-          </w:rPr>
-          <w:fldChar w:fldCharType="separate"/>
-        </w:r>
-        <w:r>
-          <w:rPr>
-            <w:noProof/>
-            <w:webHidden/>
-          </w:rPr>
-          <w:t>4</w:t>
-        </w:r>
-        <w:r>
-          <w:rPr>
-            <w:noProof/>
-            <w:webHidden/>
-          </w:rPr>
-          <w:fldChar w:fldCharType="end"/>
-        </w:r>
-      </w:hyperlink>
-    </w:p>
-    <w:p>
-      <w:pPr>
-        <w:pStyle w:val="TDC2"/>
-        <w:tabs>
-          <w:tab w:val="right" w:leader="dot" w:pos="4837"/>
-        </w:tabs>
-        <w:rPr>
-          <w:rFonts w:asciiTheme="minorHAnsi" w:hAnsiTheme="minorHAnsi"/>
-          <w:noProof/>
-          <w:color w:val="auto"/>
-          <w:kern w:val="2"/>
-          <w:sz w:val="24"/>
-          <w:szCs w:val="24"/>
-          <w14:ligatures w14:val="standardContextual"/>
-        </w:rPr>
-      </w:pPr>
-      <w:hyperlink w:anchor="_Toc238660453" w:history="1">
-        <w:r>
-          <w:rPr>
-            <w:rStyle w:val="Hipervnculo"/>
-            <w:noProof/>
-          </w:rPr>
-          <w:t>Entorno Macroeconómico y Dinámica del Riesgo Soberano</w:t>
-        </w:r>
-        <w:r>
-          <w:rPr>
-            <w:noProof/>
-            <w:webHidden/>
-          </w:rPr>
-          <w:tab/>
-        </w:r>
-        <w:r>
-          <w:rPr>
-            <w:noProof/>
-            <w:webHidden/>
-          </w:rPr>
-          <w:fldChar w:fldCharType="begin"/>
-        </w:r>
-        <w:r>
-          <w:rPr>
-            <w:noProof/>
-            <w:webHidden/>
-          </w:rPr>
-          <w:instrText xml:space="preserve"> PAGEREF _Toc238660453 \h </w:instrText>
-        </w:r>
-        <w:r>
-          <w:rPr>
-            <w:noProof/>
-            <w:webHidden/>
-          </w:rPr>
-        </w:r>
-        <w:r>
-          <w:rPr>
-            <w:noProof/>
-            <w:webHidden/>
-          </w:rPr>
-          <w:fldChar w:fldCharType="separate"/>
-        </w:r>
-        <w:r>
-          <w:rPr>
-            <w:noProof/>
-            <w:webHidden/>
-          </w:rPr>
-          <w:t>4</w:t>
-        </w:r>
-        <w:r>
-          <w:rPr>
-            <w:noProof/>
-            <w:webHidden/>
-          </w:rPr>
-          <w:fldChar w:fldCharType="end"/>
-        </w:r>
-      </w:hyperlink>
-    </w:p>
-    <w:p>
-      <w:pPr>
-        <w:pStyle w:val="TDC2"/>
-        <w:tabs>
-          <w:tab w:val="right" w:leader="dot" w:pos="4837"/>
-        </w:tabs>
-        <w:rPr>
-          <w:rFonts w:asciiTheme="minorHAnsi" w:hAnsiTheme="minorHAnsi"/>
-          <w:noProof/>
-          <w:color w:val="auto"/>
-          <w:kern w:val="2"/>
-          <w:sz w:val="24"/>
-          <w:szCs w:val="24"/>
-          <w14:ligatures w14:val="standardContextual"/>
-        </w:rPr>
-      </w:pPr>
-      <w:hyperlink w:anchor="_Toc238660454" w:history="1">
-        <w:r>
-          <w:rPr>
-            <w:rStyle w:val="Hipervnculo"/>
-            <w:noProof/>
-          </w:rPr>
-          <w:t>Volumen Saturado y Reversión del LME sobre los Ingresos</w:t>
-        </w:r>
-        <w:r>
-          <w:rPr>
-            <w:noProof/>
-            <w:webHidden/>
-          </w:rPr>
-          <w:tab/>
-        </w:r>
-        <w:r>
-          <w:rPr>
-            <w:noProof/>
-            <w:webHidden/>
-          </w:rPr>
-          <w:fldChar w:fldCharType="begin"/>
-        </w:r>
-        <w:r>
-          <w:rPr>
-            <w:noProof/>
-            <w:webHidden/>
-          </w:rPr>
-          <w:instrText xml:space="preserve"> PAGEREF _Toc238660454 \h </w:instrText>
-        </w:r>
-        <w:r>
-          <w:rPr>
-            <w:noProof/>
-            <w:webHidden/>
-          </w:rPr>
-        </w:r>
-        <w:r>
-          <w:rPr>
-            <w:noProof/>
-            <w:webHidden/>
-          </w:rPr>
-          <w:fldChar w:fldCharType="separate"/>
-        </w:r>
-        <w:r>
-          <w:rPr>
-            <w:noProof/>
-            <w:webHidden/>
-          </w:rPr>
-          <w:t>4</w:t>
-        </w:r>
-        <w:r>
-          <w:rPr>
-            <w:noProof/>
-            <w:webHidden/>
-          </w:rPr>
-          <w:fldChar w:fldCharType="end"/>
-        </w:r>
-      </w:hyperlink>
-    </w:p>
-    <w:p>
-      <w:pPr>
-        <w:pStyle w:val="TDC1"/>
-        <w:tabs>
-          <w:tab w:val="right" w:leader="dot" w:pos="4837"/>
-        </w:tabs>
-        <w:rPr>
-          <w:rFonts w:asciiTheme="minorHAnsi" w:hAnsiTheme="minorHAnsi"/>
-          <w:noProof/>
-          <w:color w:val="auto"/>
-          <w:kern w:val="2"/>
-          <w:sz w:val="24"/>
-          <w:szCs w:val="24"/>
-          <w14:ligatures w14:val="standardContextual"/>
-        </w:rPr>
-      </w:pPr>
-      <w:hyperlink w:anchor="_Toc238660455" w:history="1">
+      <w:hyperlink w:anchor="_Toc238661174" w:history="1">
         <w:r>
           <w:rPr>
             <w:rStyle w:val="Hipervnculo"/>
@@ -2107,7 +2107,7 @@
             <w:noProof/>
             <w:webHidden/>
           </w:rPr>
-          <w:instrText xml:space="preserve"> PAGEREF _Toc238660455 \h </w:instrText>
+          <w:instrText xml:space="preserve"> PAGEREF _Toc238661174 \h </w:instrText>
         </w:r>
         <w:r>
           <w:rPr>
@@ -2154,7 +2154,7 @@
           <w14:ligatures w14:val="standardContextual"/>
         </w:rPr>
       </w:pPr>
-      <w:hyperlink w:anchor="_Toc238660456" w:history="1">
+      <w:hyperlink w:anchor="_Toc238661175" w:history="1">
         <w:r>
           <w:rPr>
             <w:rStyle w:val="Hipervnculo"/>
@@ -2181,7 +2181,7 @@
             <w:noProof/>
             <w:webHidden/>
           </w:rPr>
-          <w:instrText xml:space="preserve"> PAGEREF _Toc238660456 \h </w:instrText>
+          <w:instrText xml:space="preserve"> PAGEREF _Toc238661175 \h </w:instrText>
         </w:r>
         <w:r>
           <w:rPr>
@@ -2228,7 +2228,7 @@
           <w14:ligatures w14:val="standardContextual"/>
         </w:rPr>
       </w:pPr>
-      <w:hyperlink w:anchor="_Toc238660457" w:history="1">
+      <w:hyperlink w:anchor="_Toc238661176" w:history="1">
         <w:r>
           <w:rPr>
             <w:rStyle w:val="Hipervnculo"/>
@@ -2255,7 +2255,7 @@
             <w:noProof/>
             <w:webHidden/>
           </w:rPr>
-          <w:instrText xml:space="preserve"> PAGEREF _Toc238660457 \h </w:instrText>
+          <w:instrText xml:space="preserve"> PAGEREF _Toc238661176 \h </w:instrText>
         </w:r>
         <w:r>
           <w:rPr>
@@ -2302,7 +2302,7 @@
           <w14:ligatures w14:val="standardContextual"/>
         </w:rPr>
       </w:pPr>
-      <w:hyperlink w:anchor="_Toc238660458" w:history="1">
+      <w:hyperlink w:anchor="_Toc238661177" w:history="1">
         <w:r>
           <w:rPr>
             <w:rStyle w:val="Hipervnculo"/>
@@ -2329,7 +2329,7 @@
             <w:noProof/>
             <w:webHidden/>
           </w:rPr>
-          <w:instrText xml:space="preserve"> PAGEREF _Toc238660458 \h </w:instrText>
+          <w:instrText xml:space="preserve"> PAGEREF _Toc238661177 \h </w:instrText>
         </w:r>
         <w:r>
           <w:rPr>
@@ -2376,7 +2376,7 @@
           <w14:ligatures w14:val="standardContextual"/>
         </w:rPr>
       </w:pPr>
-      <w:hyperlink w:anchor="_Toc238660459" w:history="1">
+      <w:hyperlink w:anchor="_Toc238661178" w:history="1">
         <w:r>
           <w:rPr>
             <w:rStyle w:val="Hipervnculo"/>
@@ -2403,7 +2403,7 @@
             <w:noProof/>
             <w:webHidden/>
           </w:rPr>
-          <w:instrText xml:space="preserve"> PAGEREF _Toc238660459 \h </w:instrText>
+          <w:instrText xml:space="preserve"> PAGEREF _Toc238661178 \h </w:instrText>
         </w:r>
         <w:r>
           <w:rPr>
@@ -2450,7 +2450,7 @@
           <w14:ligatures w14:val="standardContextual"/>
         </w:rPr>
       </w:pPr>
-      <w:hyperlink w:anchor="_Toc238660460" w:history="1">
+      <w:hyperlink w:anchor="_Toc238661179" w:history="1">
         <w:r>
           <w:rPr>
             <w:rStyle w:val="Hipervnculo"/>
@@ -2477,7 +2477,7 @@
             <w:noProof/>
             <w:webHidden/>
           </w:rPr>
-          <w:instrText xml:space="preserve"> PAGEREF _Toc238660460 \h </w:instrText>
+          <w:instrText xml:space="preserve"> PAGEREF _Toc238661179 \h </w:instrText>
         </w:r>
         <w:r>
           <w:rPr>
@@ -2524,7 +2524,7 @@
           <w14:ligatures w14:val="standardContextual"/>
         </w:rPr>
       </w:pPr>
-      <w:hyperlink w:anchor="_Toc238660461" w:history="1">
+      <w:hyperlink w:anchor="_Toc238661180" w:history="1">
         <w:r>
           <w:rPr>
             <w:rStyle w:val="Hipervnculo"/>
@@ -2551,7 +2551,7 @@
             <w:noProof/>
             <w:webHidden/>
           </w:rPr>
-          <w:instrText xml:space="preserve"> PAGEREF _Toc238660461 \h </w:instrText>
+          <w:instrText xml:space="preserve"> PAGEREF _Toc238661180 \h </w:instrText>
         </w:r>
         <w:r>
           <w:rPr>
@@ -2598,7 +2598,7 @@
           <w14:ligatures w14:val="standardContextual"/>
         </w:rPr>
       </w:pPr>
-      <w:hyperlink w:anchor="_Toc238660462" w:history="1">
+      <w:hyperlink w:anchor="_Toc238661181" w:history="1">
         <w:r>
           <w:rPr>
             <w:rStyle w:val="Hipervnculo"/>
@@ -2625,7 +2625,7 @@
             <w:noProof/>
             <w:webHidden/>
           </w:rPr>
-          <w:instrText xml:space="preserve"> PAGEREF _Toc238660462 \h </w:instrText>
+          <w:instrText xml:space="preserve"> PAGEREF _Toc238661181 \h </w:instrText>
         </w:r>
         <w:r>
           <w:rPr>
@@ -2672,7 +2672,7 @@
           <w14:ligatures w14:val="standardContextual"/>
         </w:rPr>
       </w:pPr>
-      <w:hyperlink w:anchor="_Toc238660463" w:history="1">
+      <w:hyperlink w:anchor="_Toc238661182" w:history="1">
         <w:r>
           <w:rPr>
             <w:rStyle w:val="Hipervnculo"/>
@@ -2699,7 +2699,7 @@
             <w:noProof/>
             <w:webHidden/>
           </w:rPr>
-          <w:instrText xml:space="preserve"> PAGEREF _Toc238660463 \h </w:instrText>
+          <w:instrText xml:space="preserve"> PAGEREF _Toc238661182 \h </w:instrText>
         </w:r>
         <w:r>
           <w:rPr>
@@ -2746,7 +2746,7 @@
           <w14:ligatures w14:val="standardContextual"/>
         </w:rPr>
       </w:pPr>
-      <w:hyperlink w:anchor="_Toc238660464" w:history="1">
+      <w:hyperlink w:anchor="_Toc238661183" w:history="1">
         <w:r>
           <w:rPr>
             <w:rStyle w:val="Hipervnculo"/>
@@ -2773,7 +2773,7 @@
             <w:noProof/>
             <w:webHidden/>
           </w:rPr>
-          <w:instrText xml:space="preserve"> PAGEREF _Toc238660464 \h </w:instrText>
+          <w:instrText xml:space="preserve"> PAGEREF _Toc238661183 \h </w:instrText>
         </w:r>
         <w:r>
           <w:rPr>
@@ -2820,7 +2820,7 @@
           <w14:ligatures w14:val="standardContextual"/>
         </w:rPr>
       </w:pPr>
-      <w:hyperlink w:anchor="_Toc238660465" w:history="1">
+      <w:hyperlink w:anchor="_Toc238661184" w:history="1">
         <w:r>
           <w:rPr>
             <w:rStyle w:val="Hipervnculo"/>
@@ -2847,7 +2847,7 @@
             <w:noProof/>
             <w:webHidden/>
           </w:rPr>
-          <w:instrText xml:space="preserve"> PAGEREF _Toc238660465 \h </w:instrText>
+          <w:instrText xml:space="preserve"> PAGEREF _Toc238661184 \h </w:instrText>
         </w:r>
         <w:r>
           <w:rPr>
@@ -2894,7 +2894,7 @@
           <w14:ligatures w14:val="standardContextual"/>
         </w:rPr>
       </w:pPr>
-      <w:hyperlink w:anchor="_Toc238660466" w:history="1">
+      <w:hyperlink w:anchor="_Toc238661185" w:history="1">
         <w:r>
           <w:rPr>
             <w:rStyle w:val="Hipervnculo"/>
@@ -2921,7 +2921,7 @@
             <w:noProof/>
             <w:webHidden/>
           </w:rPr>
-          <w:instrText xml:space="preserve"> PAGEREF _Toc238660466 \h </w:instrText>
+          <w:instrText xml:space="preserve"> PAGEREF _Toc238661185 \h </w:instrText>
         </w:r>
         <w:r>
           <w:rPr>
@@ -2968,7 +2968,7 @@
           <w14:ligatures w14:val="standardContextual"/>
         </w:rPr>
       </w:pPr>
-      <w:hyperlink w:anchor="_Toc238660467" w:history="1">
+      <w:hyperlink w:anchor="_Toc238661186" w:history="1">
         <w:r>
           <w:rPr>
             <w:rStyle w:val="Hipervnculo"/>
@@ -2995,7 +2995,7 @@
             <w:noProof/>
             <w:webHidden/>
           </w:rPr>
-          <w:instrText xml:space="preserve"> PAGEREF _Toc238660467 \h </w:instrText>
+          <w:instrText xml:space="preserve"> PAGEREF _Toc238661186 \h </w:instrText>
         </w:r>
         <w:r>
           <w:rPr>
@@ -3042,7 +3042,7 @@
           <w14:ligatures w14:val="standardContextual"/>
         </w:rPr>
       </w:pPr>
-      <w:hyperlink w:anchor="_Toc238660468" w:history="1">
+      <w:hyperlink w:anchor="_Toc238661187" w:history="1">
         <w:r>
           <w:rPr>
             <w:rStyle w:val="Hipervnculo"/>
@@ -3099,7 +3099,7 @@
             <w:noProof/>
             <w:webHidden/>
           </w:rPr>
-          <w:instrText xml:space="preserve"> PAGEREF _Toc238660468 \h </w:instrText>
+          <w:instrText xml:space="preserve"> PAGEREF _Toc238661187 \h </w:instrText>
         </w:r>
         <w:r>
           <w:rPr>
@@ -3146,7 +3146,7 @@
           <w14:ligatures w14:val="standardContextual"/>
         </w:rPr>
       </w:pPr>
-      <w:hyperlink w:anchor="_Toc238660469" w:history="1">
+      <w:hyperlink w:anchor="_Toc238661188" w:history="1">
         <w:r>
           <w:rPr>
             <w:rStyle w:val="Hipervnculo"/>
@@ -3173,7 +3173,7 @@
             <w:noProof/>
             <w:webHidden/>
           </w:rPr>
-          <w:instrText xml:space="preserve"> PAGEREF _Toc238660469 \h </w:instrText>
+          <w:instrText xml:space="preserve"> PAGEREF _Toc238661188 \h </w:instrText>
         </w:r>
         <w:r>
           <w:rPr>
@@ -3220,7 +3220,7 @@
           <w14:ligatures w14:val="standardContextual"/>
         </w:rPr>
       </w:pPr>
-      <w:hyperlink w:anchor="_Toc238660470" w:history="1">
+      <w:hyperlink w:anchor="_Toc238661189" w:history="1">
         <w:r>
           <w:rPr>
             <w:rStyle w:val="Hipervnculo"/>
@@ -3247,7 +3247,7 @@
             <w:noProof/>
             <w:webHidden/>
           </w:rPr>
-          <w:instrText xml:space="preserve"> PAGEREF _Toc238660470 \h </w:instrText>
+          <w:instrText xml:space="preserve"> PAGEREF _Toc238661189 \h </w:instrText>
         </w:r>
         <w:r>
           <w:rPr>
@@ -3294,7 +3294,7 @@
           <w14:ligatures w14:val="standardContextual"/>
         </w:rPr>
       </w:pPr>
-      <w:hyperlink w:anchor="_Toc238660471" w:history="1">
+      <w:hyperlink w:anchor="_Toc238661190" w:history="1">
         <w:r>
           <w:rPr>
             <w:rStyle w:val="Hipervnculo"/>
@@ -3321,7 +3321,7 @@
             <w:noProof/>
             <w:webHidden/>
           </w:rPr>
-          <w:instrText xml:space="preserve"> PAGEREF _Toc238660471 \h </w:instrText>
+          <w:instrText xml:space="preserve"> PAGEREF _Toc238661190 \h </w:instrText>
         </w:r>
         <w:r>
           <w:rPr>
@@ -3368,7 +3368,7 @@
           <w14:ligatures w14:val="standardContextual"/>
         </w:rPr>
       </w:pPr>
-      <w:hyperlink w:anchor="_Toc238660472" w:history="1">
+      <w:hyperlink w:anchor="_Toc238661191" w:history="1">
         <w:r>
           <w:rPr>
             <w:rStyle w:val="Hipervnculo"/>
@@ -3395,7 +3395,7 @@
             <w:noProof/>
             <w:webHidden/>
           </w:rPr>
-          <w:instrText xml:space="preserve"> PAGEREF _Toc238660472 \h </w:instrText>
+          <w:instrText xml:space="preserve"> PAGEREF _Toc238661191 \h </w:instrText>
         </w:r>
         <w:r>
           <w:rPr>
@@ -3442,7 +3442,7 @@
           <w14:ligatures w14:val="standardContextual"/>
         </w:rPr>
       </w:pPr>
-      <w:hyperlink w:anchor="_Toc238660473" w:history="1">
+      <w:hyperlink w:anchor="_Toc238661192" w:history="1">
         <w:r>
           <w:rPr>
             <w:rStyle w:val="Hipervnculo"/>
@@ -3469,7 +3469,7 @@
             <w:noProof/>
             <w:webHidden/>
           </w:rPr>
-          <w:instrText xml:space="preserve"> PAGEREF _Toc238660473 \h </w:instrText>
+          <w:instrText xml:space="preserve"> PAGEREF _Toc238661192 \h </w:instrText>
         </w:r>
         <w:r>
           <w:rPr>
@@ -3516,7 +3516,7 @@
           <w14:ligatures w14:val="standardContextual"/>
         </w:rPr>
       </w:pPr>
-      <w:hyperlink w:anchor="_Toc238660474" w:history="1">
+      <w:hyperlink w:anchor="_Toc238661193" w:history="1">
         <w:r>
           <w:rPr>
             <w:rStyle w:val="Hipervnculo"/>
@@ -3543,7 +3543,7 @@
             <w:noProof/>
             <w:webHidden/>
           </w:rPr>
-          <w:instrText xml:space="preserve"> PAGEREF _Toc238660474 \h </w:instrText>
+          <w:instrText xml:space="preserve"> PAGEREF _Toc238661193 \h </w:instrText>
         </w:r>
         <w:r>
           <w:rPr>
@@ -3590,7 +3590,7 @@
           <w14:ligatures w14:val="standardContextual"/>
         </w:rPr>
       </w:pPr>
-      <w:hyperlink w:anchor="_Toc238660475" w:history="1">
+      <w:hyperlink w:anchor="_Toc238661194" w:history="1">
         <w:r>
           <w:rPr>
             <w:rStyle w:val="Hipervnculo"/>
@@ -3617,7 +3617,7 @@
             <w:noProof/>
             <w:webHidden/>
           </w:rPr>
-          <w:instrText xml:space="preserve"> PAGEREF _Toc238660475 \h </w:instrText>
+          <w:instrText xml:space="preserve"> PAGEREF _Toc238661194 \h </w:instrText>
         </w:r>
         <w:r>
           <w:rPr>
@@ -3664,7 +3664,7 @@
           <w14:ligatures w14:val="standardContextual"/>
         </w:rPr>
       </w:pPr>
-      <w:hyperlink w:anchor="_Toc238660476" w:history="1">
+      <w:hyperlink w:anchor="_Toc238661195" w:history="1">
         <w:r>
           <w:rPr>
             <w:rStyle w:val="Hipervnculo"/>
@@ -3691,7 +3691,7 @@
             <w:noProof/>
             <w:webHidden/>
           </w:rPr>
-          <w:instrText xml:space="preserve"> PAGEREF _Toc238660476 \h </w:instrText>
+          <w:instrText xml:space="preserve"> PAGEREF _Toc238661195 \h </w:instrText>
         </w:r>
         <w:r>
           <w:rPr>
@@ -3738,7 +3738,7 @@
           <w14:ligatures w14:val="standardContextual"/>
         </w:rPr>
       </w:pPr>
-      <w:hyperlink w:anchor="_Toc238660477" w:history="1">
+      <w:hyperlink w:anchor="_Toc238661196" w:history="1">
         <w:r>
           <w:rPr>
             <w:rStyle w:val="Hipervnculo"/>
@@ -3765,7 +3765,7 @@
             <w:noProof/>
             <w:webHidden/>
           </w:rPr>
-          <w:instrText xml:space="preserve"> PAGEREF _Toc238660477 \h </w:instrText>
+          <w:instrText xml:space="preserve"> PAGEREF _Toc238661196 \h </w:instrText>
         </w:r>
         <w:r>
           <w:rPr>
@@ -3812,7 +3812,7 @@
           <w14:ligatures w14:val="standardContextual"/>
         </w:rPr>
       </w:pPr>
-      <w:hyperlink w:anchor="_Toc238660478" w:history="1">
+      <w:hyperlink w:anchor="_Toc238661197" w:history="1">
         <w:r>
           <w:rPr>
             <w:rStyle w:val="Hipervnculo"/>
@@ -3839,7 +3839,7 @@
             <w:noProof/>
             <w:webHidden/>
           </w:rPr>
-          <w:instrText xml:space="preserve"> PAGEREF _Toc238660478 \h </w:instrText>
+          <w:instrText xml:space="preserve"> PAGEREF _Toc238661197 \h </w:instrText>
         </w:r>
         <w:r>
           <w:rPr>
@@ -3886,7 +3886,7 @@
           <w14:ligatures w14:val="standardContextual"/>
         </w:rPr>
       </w:pPr>
-      <w:hyperlink w:anchor="_Toc238660479" w:history="1">
+      <w:hyperlink w:anchor="_Toc238661198" w:history="1">
         <w:r>
           <w:rPr>
             <w:rStyle w:val="Hipervnculo"/>
@@ -3913,7 +3913,7 @@
             <w:noProof/>
             <w:webHidden/>
           </w:rPr>
-          <w:instrText xml:space="preserve"> PAGEREF _Toc238660479 \h </w:instrText>
+          <w:instrText xml:space="preserve"> PAGEREF _Toc238661198 \h </w:instrText>
         </w:r>
         <w:r>
           <w:rPr>
@@ -3960,7 +3960,7 @@
           <w14:ligatures w14:val="standardContextual"/>
         </w:rPr>
       </w:pPr>
-      <w:hyperlink w:anchor="_Toc238660480" w:history="1">
+      <w:hyperlink w:anchor="_Toc238661199" w:history="1">
         <w:r>
           <w:rPr>
             <w:rStyle w:val="Hipervnculo"/>
@@ -3987,7 +3987,7 @@
             <w:noProof/>
             <w:webHidden/>
           </w:rPr>
-          <w:instrText xml:space="preserve"> PAGEREF _Toc238660480 \h </w:instrText>
+          <w:instrText xml:space="preserve"> PAGEREF _Toc238661199 \h </w:instrText>
         </w:r>
         <w:r>
           <w:rPr>
@@ -4034,7 +4034,7 @@
           <w14:ligatures w14:val="standardContextual"/>
         </w:rPr>
       </w:pPr>
-      <w:hyperlink w:anchor="_Toc238660481" w:history="1">
+      <w:hyperlink w:anchor="_Toc238661200" w:history="1">
         <w:r>
           <w:rPr>
             <w:rStyle w:val="Hipervnculo"/>
@@ -4061,7 +4061,7 @@
             <w:noProof/>
             <w:webHidden/>
           </w:rPr>
-          <w:instrText xml:space="preserve"> PAGEREF _Toc238660481 \h </w:instrText>
+          <w:instrText xml:space="preserve"> PAGEREF _Toc238661200 \h </w:instrText>
         </w:r>
         <w:r>
           <w:rPr>
@@ -4108,7 +4108,7 @@
           <w14:ligatures w14:val="standardContextual"/>
         </w:rPr>
       </w:pPr>
-      <w:hyperlink w:anchor="_Toc238660482" w:history="1">
+      <w:hyperlink w:anchor="_Toc238661201" w:history="1">
         <w:r>
           <w:rPr>
             <w:rStyle w:val="Hipervnculo"/>
@@ -4135,7 +4135,7 @@
             <w:noProof/>
             <w:webHidden/>
           </w:rPr>
-          <w:instrText xml:space="preserve"> PAGEREF _Toc238660482 \h </w:instrText>
+          <w:instrText xml:space="preserve"> PAGEREF _Toc238661201 \h </w:instrText>
         </w:r>
         <w:r>
           <w:rPr>
@@ -4182,7 +4182,7 @@
           <w14:ligatures w14:val="standardContextual"/>
         </w:rPr>
       </w:pPr>
-      <w:hyperlink w:anchor="_Toc238660483" w:history="1">
+      <w:hyperlink w:anchor="_Toc238661202" w:history="1">
         <w:r>
           <w:rPr>
             <w:rStyle w:val="Hipervnculo"/>
@@ -4209,7 +4209,7 @@
             <w:noProof/>
             <w:webHidden/>
           </w:rPr>
-          <w:instrText xml:space="preserve"> PAGEREF _Toc238660483 \h </w:instrText>
+          <w:instrText xml:space="preserve"> PAGEREF _Toc238661202 \h </w:instrText>
         </w:r>
         <w:r>
           <w:rPr>
@@ -4256,7 +4256,7 @@
           <w14:ligatures w14:val="standardContextual"/>
         </w:rPr>
       </w:pPr>
-      <w:hyperlink w:anchor="_Toc238660484" w:history="1">
+      <w:hyperlink w:anchor="_Toc238661203" w:history="1">
         <w:r>
           <w:rPr>
             <w:rStyle w:val="Hipervnculo"/>
@@ -4283,7 +4283,7 @@
             <w:noProof/>
             <w:webHidden/>
           </w:rPr>
-          <w:instrText xml:space="preserve"> PAGEREF _Toc238660484 \h </w:instrText>
+          <w:instrText xml:space="preserve"> PAGEREF _Toc238661203 \h </w:instrText>
         </w:r>
         <w:r>
           <w:rPr>
@@ -4330,7 +4330,7 @@
           <w14:ligatures w14:val="standardContextual"/>
         </w:rPr>
       </w:pPr>
-      <w:hyperlink w:anchor="_Toc238660485" w:history="1">
+      <w:hyperlink w:anchor="_Toc238661204" w:history="1">
         <w:r>
           <w:rPr>
             <w:rStyle w:val="Hipervnculo"/>
@@ -4357,7 +4357,7 @@
             <w:noProof/>
             <w:webHidden/>
           </w:rPr>
-          <w:instrText xml:space="preserve"> PAGEREF _Toc238660485 \h </w:instrText>
+          <w:instrText xml:space="preserve"> PAGEREF _Toc238661204 \h </w:instrText>
         </w:r>
         <w:r>
           <w:rPr>
@@ -4404,7 +4404,7 @@
           <w14:ligatures w14:val="standardContextual"/>
         </w:rPr>
       </w:pPr>
-      <w:hyperlink w:anchor="_Toc238660486" w:history="1">
+      <w:hyperlink w:anchor="_Toc238661205" w:history="1">
         <w:r>
           <w:rPr>
             <w:rStyle w:val="Hipervnculo"/>
@@ -4431,7 +4431,7 @@
             <w:noProof/>
             <w:webHidden/>
           </w:rPr>
-          <w:instrText xml:space="preserve"> PAGEREF _Toc238660486 \h </w:instrText>
+          <w:instrText xml:space="preserve"> PAGEREF _Toc238661205 \h </w:instrText>
         </w:r>
         <w:r>
           <w:rPr>
@@ -4478,7 +4478,7 @@
           <w14:ligatures w14:val="standardContextual"/>
         </w:rPr>
       </w:pPr>
-      <w:hyperlink w:anchor="_Toc238660487" w:history="1">
+      <w:hyperlink w:anchor="_Toc238661206" w:history="1">
         <w:r>
           <w:rPr>
             <w:rStyle w:val="Hipervnculo"/>
@@ -4505,7 +4505,7 @@
             <w:noProof/>
             <w:webHidden/>
           </w:rPr>
-          <w:instrText xml:space="preserve"> PAGEREF _Toc238660487 \h </w:instrText>
+          <w:instrText xml:space="preserve"> PAGEREF _Toc238661206 \h </w:instrText>
         </w:r>
         <w:r>
           <w:rPr>
@@ -4552,7 +4552,7 @@
           <w14:ligatures w14:val="standardContextual"/>
         </w:rPr>
       </w:pPr>
-      <w:hyperlink w:anchor="_Toc238660488" w:history="1">
+      <w:hyperlink w:anchor="_Toc238661207" w:history="1">
         <w:r>
           <w:rPr>
             <w:rStyle w:val="Hipervnculo"/>
@@ -4579,7 +4579,7 @@
             <w:noProof/>
             <w:webHidden/>
           </w:rPr>
-          <w:instrText xml:space="preserve"> PAGEREF _Toc238660488 \h </w:instrText>
+          <w:instrText xml:space="preserve"> PAGEREF _Toc238661207 \h </w:instrText>
         </w:r>
         <w:r>
           <w:rPr>
@@ -4626,7 +4626,7 @@
           <w14:ligatures w14:val="standardContextual"/>
         </w:rPr>
       </w:pPr>
-      <w:hyperlink w:anchor="_Toc238660489" w:history="1">
+      <w:hyperlink w:anchor="_Toc238661208" w:history="1">
         <w:r>
           <w:rPr>
             <w:rStyle w:val="Hipervnculo"/>
@@ -4653,7 +4653,7 @@
             <w:noProof/>
             <w:webHidden/>
           </w:rPr>
-          <w:instrText xml:space="preserve"> PAGEREF _Toc238660489 \h </w:instrText>
+          <w:instrText xml:space="preserve"> PAGEREF _Toc238661208 \h </w:instrText>
         </w:r>
         <w:r>
           <w:rPr>
@@ -4700,7 +4700,7 @@
           <w14:ligatures w14:val="standardContextual"/>
         </w:rPr>
       </w:pPr>
-      <w:hyperlink w:anchor="_Toc238660490" w:history="1">
+      <w:hyperlink w:anchor="_Toc238661209" w:history="1">
         <w:r>
           <w:rPr>
             <w:rStyle w:val="Hipervnculo"/>
@@ -4727,7 +4727,7 @@
             <w:noProof/>
             <w:webHidden/>
           </w:rPr>
-          <w:instrText xml:space="preserve"> PAGEREF _Toc238660490 \h </w:instrText>
+          <w:instrText xml:space="preserve"> PAGEREF _Toc238661209 \h </w:instrText>
         </w:r>
         <w:r>
           <w:rPr>
@@ -4774,7 +4774,7 @@
           <w14:ligatures w14:val="standardContextual"/>
         </w:rPr>
       </w:pPr>
-      <w:hyperlink w:anchor="_Toc238660491" w:history="1">
+      <w:hyperlink w:anchor="_Toc238661210" w:history="1">
         <w:r>
           <w:rPr>
             <w:rStyle w:val="Hipervnculo"/>
@@ -4801,7 +4801,7 @@
             <w:noProof/>
             <w:webHidden/>
           </w:rPr>
-          <w:instrText xml:space="preserve"> PAGEREF _Toc238660491 \h </w:instrText>
+          <w:instrText xml:space="preserve"> PAGEREF _Toc238661210 \h </w:instrText>
         </w:r>
         <w:r>
           <w:rPr>
@@ -4848,7 +4848,7 @@
           <w14:ligatures w14:val="standardContextual"/>
         </w:rPr>
       </w:pPr>
-      <w:hyperlink w:anchor="_Toc238660492" w:history="1">
+      <w:hyperlink w:anchor="_Toc238661211" w:history="1">
         <w:r>
           <w:rPr>
             <w:rStyle w:val="Hipervnculo"/>
@@ -4875,7 +4875,7 @@
             <w:noProof/>
             <w:webHidden/>
           </w:rPr>
-          <w:instrText xml:space="preserve"> PAGEREF _Toc238660492 \h </w:instrText>
+          <w:instrText xml:space="preserve"> PAGEREF _Toc238661211 \h </w:instrText>
         </w:r>
         <w:r>
           <w:rPr>
@@ -4922,7 +4922,7 @@
           <w14:ligatures w14:val="standardContextual"/>
         </w:rPr>
       </w:pPr>
-      <w:hyperlink w:anchor="_Toc238660493" w:history="1">
+      <w:hyperlink w:anchor="_Toc238661212" w:history="1">
         <w:r>
           <w:rPr>
             <w:rStyle w:val="Hipervnculo"/>
@@ -4949,7 +4949,7 @@
             <w:noProof/>
             <w:webHidden/>
           </w:rPr>
-          <w:instrText xml:space="preserve"> PAGEREF _Toc238660493 \h </w:instrText>
+          <w:instrText xml:space="preserve"> PAGEREF _Toc238661212 \h </w:instrText>
         </w:r>
         <w:r>
           <w:rPr>
@@ -4996,7 +4996,7 @@
           <w14:ligatures w14:val="standardContextual"/>
         </w:rPr>
       </w:pPr>
-      <w:hyperlink w:anchor="_Toc238660494" w:history="1">
+      <w:hyperlink w:anchor="_Toc238661213" w:history="1">
         <w:r>
           <w:rPr>
             <w:rStyle w:val="Hipervnculo"/>
@@ -5023,7 +5023,7 @@
             <w:noProof/>
             <w:webHidden/>
           </w:rPr>
-          <w:instrText xml:space="preserve"> PAGEREF _Toc238660494 \h </w:instrText>
+          <w:instrText xml:space="preserve"> PAGEREF _Toc238661213 \h </w:instrText>
         </w:r>
         <w:r>
           <w:rPr>
@@ -5070,7 +5070,7 @@
           <w14:ligatures w14:val="standardContextual"/>
         </w:rPr>
       </w:pPr>
-      <w:hyperlink w:anchor="_Toc238660495" w:history="1">
+      <w:hyperlink w:anchor="_Toc238661214" w:history="1">
         <w:r>
           <w:rPr>
             <w:rStyle w:val="Hipervnculo"/>
@@ -5097,7 +5097,7 @@
             <w:noProof/>
             <w:webHidden/>
           </w:rPr>
-          <w:instrText xml:space="preserve"> PAGEREF _Toc238660495 \h </w:instrText>
+          <w:instrText xml:space="preserve"> PAGEREF _Toc238661214 \h </w:instrText>
         </w:r>
         <w:r>
           <w:rPr>
@@ -5144,7 +5144,7 @@
           <w14:ligatures w14:val="standardContextual"/>
         </w:rPr>
       </w:pPr>
-      <w:hyperlink w:anchor="_Toc238660496" w:history="1">
+      <w:hyperlink w:anchor="_Toc238661215" w:history="1">
         <w:r>
           <w:rPr>
             <w:rStyle w:val="Hipervnculo"/>
@@ -5171,7 +5171,7 @@
             <w:noProof/>
             <w:webHidden/>
           </w:rPr>
-          <w:instrText xml:space="preserve"> PAGEREF _Toc238660496 \h </w:instrText>
+          <w:instrText xml:space="preserve"> PAGEREF _Toc238661215 \h </w:instrText>
         </w:r>
         <w:r>
           <w:rPr>
@@ -5218,7 +5218,7 @@
           <w14:ligatures w14:val="standardContextual"/>
         </w:rPr>
       </w:pPr>
-      <w:hyperlink w:anchor="_Toc238660497" w:history="1">
+      <w:hyperlink w:anchor="_Toc238661216" w:history="1">
         <w:r>
           <w:rPr>
             <w:rStyle w:val="Hipervnculo"/>
@@ -5245,7 +5245,7 @@
             <w:noProof/>
             <w:webHidden/>
           </w:rPr>
-          <w:instrText xml:space="preserve"> PAGEREF _Toc238660497 \h </w:instrText>
+          <w:instrText xml:space="preserve"> PAGEREF _Toc238661216 \h </w:instrText>
         </w:r>
         <w:r>
           <w:rPr>
@@ -5292,7 +5292,7 @@
           <w14:ligatures w14:val="standardContextual"/>
         </w:rPr>
       </w:pPr>
-      <w:hyperlink w:anchor="_Toc238660498" w:history="1">
+      <w:hyperlink w:anchor="_Toc238661217" w:history="1">
         <w:r>
           <w:rPr>
             <w:rStyle w:val="Hipervnculo"/>
@@ -5319,7 +5319,7 @@
             <w:noProof/>
             <w:webHidden/>
           </w:rPr>
-          <w:instrText xml:space="preserve"> PAGEREF _Toc238660498 \h </w:instrText>
+          <w:instrText xml:space="preserve"> PAGEREF _Toc238661217 \h </w:instrText>
         </w:r>
         <w:r>
           <w:rPr>
@@ -5366,7 +5366,7 @@
           <w14:ligatures w14:val="standardContextual"/>
         </w:rPr>
       </w:pPr>
-      <w:hyperlink w:anchor="_Toc238660499" w:history="1">
+      <w:hyperlink w:anchor="_Toc238661218" w:history="1">
         <w:r>
           <w:rPr>
             <w:rStyle w:val="Hipervnculo"/>
@@ -5393,7 +5393,7 @@
             <w:noProof/>
             <w:webHidden/>
           </w:rPr>
-          <w:instrText xml:space="preserve"> PAGEREF _Toc238660499 \h </w:instrText>
+          <w:instrText xml:space="preserve"> PAGEREF _Toc238661218 \h </w:instrText>
         </w:r>
         <w:r>
           <w:rPr>
@@ -5440,7 +5440,7 @@
           <w14:ligatures w14:val="standardContextual"/>
         </w:rPr>
       </w:pPr>
-      <w:hyperlink w:anchor="_Toc238660500" w:history="1">
+      <w:hyperlink w:anchor="_Toc238661219" w:history="1">
         <w:r>
           <w:rPr>
             <w:rStyle w:val="Hipervnculo"/>
@@ -5467,7 +5467,7 @@
             <w:noProof/>
             <w:webHidden/>
           </w:rPr>
-          <w:instrText xml:space="preserve"> PAGEREF _Toc238660500 \h </w:instrText>
+          <w:instrText xml:space="preserve"> PAGEREF _Toc238661219 \h </w:instrText>
         </w:r>
         <w:r>
           <w:rPr>
@@ -5514,7 +5514,7 @@
           <w14:ligatures w14:val="standardContextual"/>
         </w:rPr>
       </w:pPr>
-      <w:hyperlink w:anchor="_Toc238660501" w:history="1">
+      <w:hyperlink w:anchor="_Toc238661220" w:history="1">
         <w:r>
           <w:rPr>
             <w:rStyle w:val="Hipervnculo"/>
@@ -5541,7 +5541,7 @@
             <w:noProof/>
             <w:webHidden/>
           </w:rPr>
-          <w:instrText xml:space="preserve"> PAGEREF _Toc238660501 \h </w:instrText>
+          <w:instrText xml:space="preserve"> PAGEREF _Toc238661220 \h </w:instrText>
         </w:r>
         <w:r>
           <w:rPr>
@@ -5588,7 +5588,7 @@
           <w14:ligatures w14:val="standardContextual"/>
         </w:rPr>
       </w:pPr>
-      <w:hyperlink w:anchor="_Toc238660502" w:history="1">
+      <w:hyperlink w:anchor="_Toc238661221" w:history="1">
         <w:r>
           <w:rPr>
             <w:rStyle w:val="Hipervnculo"/>
@@ -5615,7 +5615,7 @@
             <w:noProof/>
             <w:webHidden/>
           </w:rPr>
-          <w:instrText xml:space="preserve"> PAGEREF _Toc238660502 \h </w:instrText>
+          <w:instrText xml:space="preserve"> PAGEREF _Toc238661221 \h </w:instrText>
         </w:r>
         <w:r>
           <w:rPr>
@@ -5662,7 +5662,7 @@
           <w14:ligatures w14:val="standardContextual"/>
         </w:rPr>
       </w:pPr>
-      <w:hyperlink w:anchor="_Toc238660503" w:history="1">
+      <w:hyperlink w:anchor="_Toc238661222" w:history="1">
         <w:r>
           <w:rPr>
             <w:rStyle w:val="Hipervnculo"/>
@@ -5689,7 +5689,7 @@
             <w:noProof/>
             <w:webHidden/>
           </w:rPr>
-          <w:instrText xml:space="preserve"> PAGEREF _Toc238660503 \h </w:instrText>
+          <w:instrText xml:space="preserve"> PAGEREF _Toc238661222 \h </w:instrText>
         </w:r>
         <w:r>
           <w:rPr>
@@ -5736,7 +5736,81 @@
           <w14:ligatures w14:val="standardContextual"/>
         </w:rPr>
       </w:pPr>
-      <w:hyperlink w:anchor="_Toc238660504" w:history="1">
+      <w:hyperlink w:anchor="_Toc238661223" w:history="1">
+        <w:r>
+          <w:rPr>
+            <w:rStyle w:val="Hipervnculo"/>
+            <w:noProof/>
+          </w:rPr>
+          <w:t>Anexo de Fuentes y Metodología</w:t>
+        </w:r>
+        <w:r>
+          <w:rPr>
+            <w:noProof/>
+            <w:webHidden/>
+          </w:rPr>
+          <w:tab/>
+        </w:r>
+        <w:r>
+          <w:rPr>
+            <w:noProof/>
+            <w:webHidden/>
+          </w:rPr>
+          <w:fldChar w:fldCharType="begin"/>
+        </w:r>
+        <w:r>
+          <w:rPr>
+            <w:noProof/>
+            <w:webHidden/>
+          </w:rPr>
+          <w:instrText xml:space="preserve"> PAGEREF _Toc238661223 \h </w:instrText>
+        </w:r>
+        <w:r>
+          <w:rPr>
+            <w:noProof/>
+            <w:webHidden/>
+          </w:rPr>
+        </w:r>
+        <w:r>
+          <w:rPr>
+            <w:noProof/>
+            <w:webHidden/>
+          </w:rPr>
+          <w:fldChar w:fldCharType="separate"/>
+        </w:r>
+        <w:r>
+          <w:rPr>
+            <w:noProof/>
+            <w:webHidden/>
+          </w:rPr>
+          <w:t>13</w:t>
+        </w:r>
+        <w:r>
+          <w:rPr>
+            <w:noProof/>
+            <w:webHidden/>
+          </w:rPr>
+          <w:fldChar w:fldCharType="end"/>
+        </w:r>
+      </w:hyperlink>
+    </w:p>
+    <w:p>
+      <w:pPr>
+        <w:pStyle w:val="TDC1"/>
+        <w:tabs>
+          <w:tab w:val="right" w:leader="dot" w:pos="4837"/>
+        </w:tabs>
+        <w:rPr>
+          <w:rFonts w:asciiTheme="minorHAnsi" w:hAnsiTheme="minorHAnsi"/>
+          <w:noProof/>
+          <w:color w:val="auto"/>
+          <w:kern w:val="2"/>
+          <w:sz w:val="24"/>
+          <w:szCs w:val="24"/>
+          <w14:ligatures w14:val="standardContextual"/>
+        </w:rPr>
+      </w:pPr>
+      <w:hyperlink w:anchor="_Toc238661224" w:history="1">
         <w:r>
           <w:rPr>
             <w:rStyle w:val="Hipervnculo"/>
@@ -5763,7 +5837,7 @@
             <w:noProof/>
             <w:webHidden/>
           </w:rPr>
-          <w:instrText xml:space="preserve"> PAGEREF _Toc238660504 \h </w:instrText>
+          <w:instrText xml:space="preserve"> PAGEREF _Toc238661224 \h </w:instrText>
         </w:r>
         <w:r>
           <w:rPr>
@@ -5997,7 +6071,7 @@
         <w:t>ARS 1.268,47</w:t>
       </w:r>
       <w:r>
-        <w:t xml:space="preserve"> por acción (+29,1% de retorno esperado frente a una cotización de mercado de ARS 982,50). El modelo integra asimismo el valor de la opción real de expansión eólica de la Etapa V del Parque Eólico Aluar (+ARS 105,74), alcanzando un precio objetivo integrado de ARS 1.374,22 (+39,9%). La cotización actual descuenta un crecimiento terminal implícito deprimido (g^* = 0,69%), subestimando la ventaja en costos por energía propia y el desapalancamiento financiero proyectado.</w:t>
+        <w:t xml:space="preserve"> por acción (+29,1% de retorno esperado frente a una cotización de mercado de ARS 982,50). Sumando el valor de la opción real de expansión eólica de la Etapa V del Parque Eólico Aluar (+ARS 105,74), el precio objetivo integrado llega a ARS 1.374,22 (+39,9%). La cotización actual descuenta un crecimiento terminal implícito deprimido (g^* = 0,69%), subestimando la ventaja en costos por energía propia y el desapalancamiento financiero proyectado.</w:t>
       </w:r>
     </w:p>
     <w:p>
@@ -6617,9 +6691,16 @@
             </w:pPr>
             <w:r>
               <w:rPr>
+                <w:b/>
                 <w:sz w:val="14"/>
               </w:rPr>
-              <w:t>1. Naturaleza y Propósito del Documento\\[2pt]</w:t>
+              <w:t xml:space="preserve"> 1. Naturaleza y Propósito del Documento</w:t>
+            </w:r>
+            <w:r>
+              <w:rPr>
+                <w:sz w:val="14"/>
+              </w:rPr>
+              <w:t>\\[2pt]</w:t>
             </w:r>
           </w:p>
           <w:p>
@@ -6645,9 +6726,16 @@
             </w:pPr>
             <w:r>
               <w:rPr>
+                <w:b/>
                 <w:sz w:val="14"/>
               </w:rPr>
-              <w:t>2. Ausencia de Oferta Pública y No Asesoramiento\\[2pt]</w:t>
+              <w:t xml:space="preserve"> 2. Ausencia de Oferta Pública y No Asesoramiento</w:t>
+            </w:r>
+            <w:r>
+              <w:rPr>
+                <w:sz w:val="14"/>
+              </w:rPr>
+              <w:t>\\[2pt]</w:t>
             </w:r>
           </w:p>
           <w:p>
@@ -6673,9 +6761,16 @@
             </w:pPr>
             <w:r>
               <w:rPr>
+                <w:b/>
                 <w:sz w:val="14"/>
               </w:rPr>
-              <w:t>3. Fuentes de Información y Fecha de Corte\\[2pt]</w:t>
+              <w:t xml:space="preserve"> 3. Declaración de Independencia y Conflictos de Interés</w:t>
+            </w:r>
+            <w:r>
+              <w:rPr>
+                <w:sz w:val="14"/>
+              </w:rPr>
+              <w:t>\\[2pt]</w:t>
             </w:r>
           </w:p>
           <w:p>
@@ -6689,13 +6784,21 @@
               <w:rPr>
                 <w:sz w:val="14"/>
               </w:rPr>
-              <w:t>Las estimaciones y proyecciones se basan únicamente en información pública: Estados Financieros Consolidados Auditados de Aluar (dictamen de Price Waterhouse &amp; Co. S.R.L., ejercicios cerrados al 30 de junio 2020–2025), Memorias Anuales, hechos relevantes publicados en CNV y BYMA, estadísticas del London Metal Exchange (LME), datos del BCRA y series de la Reserva Federal (FRED). Las variables de mercado (LME spot, EMBI+ Argentina, CCL implícito vía GGAL) corresponden al cierre del 23 de julio de 2026. No ref</w:t>
-            </w:r>
+              <w:t>El autor declara lo siguiente.</w:t>
+            </w:r>
+          </w:p>
+          <w:p>
+            <w:pPr>
+              <w:spacing w:after="16" w:line="245" w:lineRule="auto"/>
+              <w:rPr>
+                <w:rFonts w:hint="eastAsia"/>
+              </w:rPr>
+            </w:pPr>
             <w:r>
               <w:rPr>
                 <w:sz w:val="14"/>
               </w:rPr>
-              <w:t>lejan movimientos posteriores a esa fecha.</w:t>
+              <w:t>\setlength\itemsep0pt\setlengthsep0pt\setlength→psep2pt</w:t>
             </w:r>
           </w:p>
           <w:p>
@@ -6709,7 +6812,7 @@
               <w:rPr>
                 <w:sz w:val="14"/>
               </w:rPr>
-              <w:t>4. Metodología Cuantitativa y Supuestos Clave\\[2pt]</w:t>
+              <w:t>\item No mantiene una posición directa en acciones de Aluar Aluminio Argentino S.A.I.C. No puede descartarse una exposición indirecta e inmaterial a través de fondos comunes de inversión u otros vehículos de terceros en los que el autor invierte, sobre cuya composición no tiene control ni conocimiento detallado. No mantiene opciones, derivados ni otra exposición directa a ALUA.BA.</w:t>
             </w:r>
           </w:p>
           <w:p>
@@ -6723,13 +6826,21 @@
               <w:rPr>
                 <w:sz w:val="14"/>
               </w:rPr>
-              <w:t>El precio objetivo surge de un modelo de Flujo de Fondos Descontados (DCF) bajo la formulación de Dumrauf (Cap. 14) con WACC ajustado por riesgo país (λ=0,1617), Beta Hamada, crecimiento terminal g=2,0%, complementado con opción real de expansión de la Etapa V eólica (LSMC Longstaff-Schwartz), simulación Monte Carlo (20.000 iteraciones, innovaciones t-Student ν=4,2), EVT-GPD, GARCH(1,1), Filtro de Kalman, y selección de cópulas por AIC. Horizonte de inversión de referencia: 12 meses. Índice de referencia: S</w:t>
-            </w:r>
+              <w:t>\item No recibe compensación, remuneración ni beneficio alguno vinculado a las conclusiones de este trabajo.</w:t>
+            </w:r>
+          </w:p>
+          <w:p>
+            <w:pPr>
+              <w:spacing w:after="16" w:line="245" w:lineRule="auto"/>
+              <w:rPr>
+                <w:rFonts w:hint="eastAsia"/>
+              </w:rPr>
+            </w:pPr>
             <w:r>
               <w:rPr>
                 <w:sz w:val="14"/>
               </w:rPr>
-              <w:t>&amp;P Merval (MERVAL). Escala de recomendación: COMPRAR (retorno esperado &gt;+15%), MANTENER (-15% a +15%), VENDER (&lt;-15%).</w:t>
+              <w:t>\item No existe relación comercial, societaria, laboral, de asesoramiento, ni vínculo familiar con Aluar S.A.I.C., sus controlantes (Familia Madanes, CIPAL S.A., Estancias San Javier de Catamarca S.A., Angerona Group Trust), sociedades vinculadas (Hidroeléctrica Futaleufú S.A., Transpa S.A.), ni colocadores o brokers intervinientes en emisiones recientes.</w:t>
             </w:r>
           </w:p>
           <w:p>
@@ -6743,124 +6854,23 @@
               <w:rPr>
                 <w:sz w:val="14"/>
               </w:rPr>
-              <w:t>5. Declaración Completa de Independencia y Conflictos de Interés\\[2pt]</w:t>
-            </w:r>
-          </w:p>
-          <w:p>
-            <w:pPr>
-              <w:spacing w:after="16" w:line="245" w:lineRule="auto"/>
-              <w:rPr>
-                <w:rFonts w:hint="eastAsia"/>
-              </w:rPr>
-            </w:pPr>
-            <w:r>
-              <w:rPr>
-                <w:sz w:val="14"/>
-              </w:rPr>
-              <w:t>El autor declara lo siguiente.</w:t>
-            </w:r>
-          </w:p>
-          <w:p>
-            <w:pPr>
-              <w:spacing w:after="16" w:line="245" w:lineRule="auto"/>
-              <w:rPr>
-                <w:rFonts w:hint="eastAsia"/>
-              </w:rPr>
-            </w:pPr>
-            <w:r>
-              <w:rPr>
-                <w:sz w:val="14"/>
-              </w:rPr>
-              <w:t>\setlength\itemsep0pt\setlengthsep0pt\setlength→psep2pt</w:t>
-            </w:r>
-          </w:p>
-          <w:p>
-            <w:pPr>
-              <w:spacing w:after="16" w:line="245" w:lineRule="auto"/>
-              <w:rPr>
-                <w:rFonts w:hint="eastAsia"/>
-              </w:rPr>
-            </w:pPr>
-            <w:r>
-              <w:rPr>
-                <w:sz w:val="14"/>
-              </w:rPr>
-              <w:t>\item No mantiene una posición directa en acciones de Aluar Aluminio Argentino S.A.I.C. No puede descartarse una exposición indirecta e inmaterial a través de fondos comunes de inversión u otros vehículos de terceros en los que el autor invierte, sobre cuya composición no tiene control ni conocimiento detallado. No mantiene opciones, derivados ni otra exposición directa a ALUA.BA.</w:t>
-            </w:r>
-          </w:p>
-          <w:p>
-            <w:pPr>
-              <w:spacing w:after="16" w:line="245" w:lineRule="auto"/>
-              <w:rPr>
-                <w:rFonts w:hint="eastAsia"/>
-              </w:rPr>
-            </w:pPr>
-            <w:r>
-              <w:rPr>
-                <w:sz w:val="14"/>
-              </w:rPr>
-              <w:t>\item No recibe compensación, remuneración ni beneficio alguno vinculado a las conclusiones de este trabajo.</w:t>
-            </w:r>
-          </w:p>
-          <w:p>
-            <w:pPr>
-              <w:spacing w:after="16" w:line="245" w:lineRule="auto"/>
-              <w:rPr>
-                <w:rFonts w:hint="eastAsia"/>
-              </w:rPr>
-            </w:pPr>
-            <w:r>
-              <w:rPr>
-                <w:sz w:val="14"/>
-              </w:rPr>
-              <w:t>\item No existe relación comercial, societaria, laboral, de asesoramiento, ni vínculo familiar con Aluar S.A.I.C., sus controlantes (Familia Madanes, CIPAL S.A., Estancias San Javier de Catamarca S.A., Angerona Group Trust), sociedades vinculadas (Hidroeléctrica Futaleufú S.A., Transpa S.A.), ni colocadores o brokers intervinientes en emisiones recientes.</w:t>
-            </w:r>
-          </w:p>
-          <w:p>
-            <w:pPr>
-              <w:spacing w:after="16" w:line="245" w:lineRule="auto"/>
-              <w:rPr>
-                <w:rFonts w:hint="eastAsia"/>
-              </w:rPr>
-            </w:pPr>
-            <w:r>
-              <w:rPr>
-                <w:sz w:val="14"/>
-              </w:rPr>
               <w:t>\item El presente trabajo se elabora de forma personal e independiente, sin mandato de terceros.</w:t>
-            </w:r>
-          </w:p>
-          <w:p>
-            <w:pPr>
-              <w:spacing w:after="16" w:line="245" w:lineRule="auto"/>
-              <w:rPr>
-                <w:rFonts w:hint="eastAsia"/>
-              </w:rPr>
-            </w:pPr>
-            <w:r>
-              <w:rPr>
-                <w:sz w:val="14"/>
-              </w:rPr>
-              <w:t>6. Vigencia y Próxima Revisión\\[2pt]</w:t>
-            </w:r>
-          </w:p>
-          <w:p>
-            <w:pPr>
-              <w:spacing w:after="16" w:line="245" w:lineRule="auto"/>
-              <w:rPr>
-                <w:rFonts w:hint="eastAsia"/>
-              </w:rPr>
-            </w:pPr>
-            <w:r>
-              <w:rPr>
-                <w:sz w:val="14"/>
-              </w:rPr>
-              <w:t>Fecha de emisión: 23 de julio de 2026. Próxima revisión programada: 23 de octubre de 2026 (frecuencia trimestral) o ante evento material que modifique sustancialmente los supuestos de valuación (resultados trimestrales, cambios macroeconómicos significativos, anuncios corporativos relevantes).</w:t>
             </w:r>
           </w:p>
         </w:tc>
       </w:tr>
     </w:tbl>
+    <w:p>
+      <w:pPr>
+        <w:spacing w:after="20" w:line="247" w:lineRule="auto"/>
+        <w:rPr>
+          <w:rFonts w:hint="eastAsia"/>
+        </w:rPr>
+      </w:pPr>
+      <w:r>
+        <w:t>Las fuentes de información, la metodología cuantitativa y la vigencia de este informe se detallan en el Anexo de Fuentes y Metodología, antes de la bibliografía.</w:t>
+      </w:r>
+    </w:p>
     <w:p>
       <w:pPr>
         <w:spacing w:after="20" w:line="247" w:lineRule="auto"/>
@@ -6953,7 +6963,7 @@
         <w:pStyle w:val="Ttulo1"/>
         <w:spacing w:before="100" w:after="30"/>
       </w:pPr>
-      <w:bookmarkStart w:id="0" w:name="_Toc238660445"/>
+      <w:bookmarkStart w:id="0" w:name="_Toc238661164"/>
       <w:r>
         <w:rPr>
           <w:rFonts w:ascii="Georgia" w:hAnsi="Georgia"/>
@@ -6969,7 +6979,7 @@
         <w:pStyle w:val="Ttulo2"/>
         <w:spacing w:before="70" w:after="20"/>
       </w:pPr>
-      <w:bookmarkStart w:id="1" w:name="_Toc238660446"/>
+      <w:bookmarkStart w:id="1" w:name="_Toc238661165"/>
       <w:r>
         <w:rPr>
           <w:rFonts w:ascii="Georgia" w:hAnsi="Georgia"/>
@@ -7002,11 +7012,7 @@
         </w:rPr>
       </w:pPr>
       <w:r>
-        <w:t xml:space="preserve">Alrededor del 83,8% del volumen físico producido se destina a la exportación (Estados Unidos, Brasil, Europa y Japón), liquidado en dólares estadounidenses sobre cotizaciones del London Metal </w:t>
-      </w:r>
-      <w:r>
-        <w:lastRenderedPageBreak/>
-        <w:t>Exchange (LME) más primas regionales, lo que otorga a la firma una cobertura cambiaria estructural.</w:t>
+        <w:t>Alrededor del 83,8% del volumen físico producido se destina a la exportación (Estados Unidos, Brasil, Europa y Japón), liquidado en dólares estadounidenses sobre cotizaciones del London Metal Exchange (LME) más primas regionales, lo que otorga a la firma una cobertura cambiaria estructural.</w:t>
       </w:r>
     </w:p>
     <w:p>
@@ -7014,7 +7020,7 @@
         <w:pStyle w:val="Ttulo2"/>
         <w:spacing w:before="70" w:after="20"/>
       </w:pPr>
-      <w:bookmarkStart w:id="2" w:name="_Toc238660447"/>
+      <w:bookmarkStart w:id="2" w:name="_Toc238661166"/>
       <w:r>
         <w:rPr>
           <w:rFonts w:ascii="Georgia" w:hAnsi="Georgia"/>
@@ -7074,8 +7080,9 @@
               <w:rPr>
                 <w:noProof/>
               </w:rPr>
+              <w:lastRenderedPageBreak/>
               <w:drawing>
-                <wp:inline distT="0" distB="0" distL="0" distR="0" wp14:anchorId="7EDDF1C9" wp14:editId="2391BB5C">
+                <wp:inline distT="0" distB="0" distL="0" distR="0" wp14:anchorId="0A3A5D41" wp14:editId="7C182DA6">
                   <wp:extent cx="2926080" cy="1524412"/>
                   <wp:effectExtent l="0" t="0" r="0" b="0"/>
                   <wp:docPr id="1" name="Picture 1"/>
@@ -7134,7 +7141,7 @@
                 <w:noProof/>
               </w:rPr>
               <w:drawing>
-                <wp:inline distT="0" distB="0" distL="0" distR="0" wp14:anchorId="28CD7E55" wp14:editId="6E744869">
+                <wp:inline distT="0" distB="0" distL="0" distR="0" wp14:anchorId="469C2B7F" wp14:editId="703D7A14">
                   <wp:extent cx="2926080" cy="1437831"/>
                   <wp:effectExtent l="0" t="0" r="0" b="0"/>
                   <wp:docPr id="2" name="Picture 2"/>
@@ -7239,7 +7246,7 @@
         <w:pStyle w:val="Ttulo2"/>
         <w:spacing w:before="70" w:after="20"/>
       </w:pPr>
-      <w:bookmarkStart w:id="3" w:name="_Toc238660448"/>
+      <w:bookmarkStart w:id="3" w:name="_Toc238661167"/>
       <w:r>
         <w:rPr>
           <w:rFonts w:ascii="Georgia" w:hAnsi="Georgia"/>
@@ -7366,7 +7373,7 @@
         <w:pStyle w:val="Ttulo2"/>
         <w:spacing w:before="70" w:after="20"/>
       </w:pPr>
-      <w:bookmarkStart w:id="4" w:name="_Toc238660449"/>
+      <w:bookmarkStart w:id="4" w:name="_Toc238661168"/>
       <w:r>
         <w:rPr>
           <w:rFonts w:ascii="Georgia" w:hAnsi="Georgia"/>
@@ -7878,7 +7885,7 @@
         <w:pStyle w:val="Ttulo2"/>
         <w:spacing w:before="70" w:after="20"/>
       </w:pPr>
-      <w:bookmarkStart w:id="5" w:name="_Toc238660450"/>
+      <w:bookmarkStart w:id="5" w:name="_Toc238661169"/>
       <w:r>
         <w:rPr>
           <w:rFonts w:ascii="Georgia" w:hAnsi="Georgia"/>
@@ -8010,7 +8017,7 @@
         <w:pStyle w:val="Ttulo2"/>
         <w:spacing w:before="70" w:after="20"/>
       </w:pPr>
-      <w:bookmarkStart w:id="6" w:name="_Toc238660451"/>
+      <w:bookmarkStart w:id="6" w:name="_Toc238661170"/>
       <w:r>
         <w:rPr>
           <w:rFonts w:ascii="Georgia" w:hAnsi="Georgia"/>
@@ -9235,7 +9242,7 @@
         <w:pStyle w:val="Ttulo1"/>
         <w:spacing w:before="100" w:after="30"/>
       </w:pPr>
-      <w:bookmarkStart w:id="7" w:name="_Toc238660452"/>
+      <w:bookmarkStart w:id="7" w:name="_Toc238661171"/>
       <w:r>
         <w:rPr>
           <w:rFonts w:ascii="Georgia" w:hAnsi="Georgia"/>
@@ -9251,7 +9258,7 @@
         <w:pStyle w:val="Ttulo2"/>
         <w:spacing w:before="70" w:after="20"/>
       </w:pPr>
-      <w:bookmarkStart w:id="8" w:name="_Toc238660453"/>
+      <w:bookmarkStart w:id="8" w:name="_Toc238661172"/>
       <w:r>
         <w:rPr>
           <w:rFonts w:ascii="Georgia" w:hAnsi="Georgia"/>
@@ -9309,7 +9316,7 @@
                 <w:noProof/>
               </w:rPr>
               <w:drawing>
-                <wp:inline distT="0" distB="0" distL="0" distR="0" wp14:anchorId="7E0AD38F" wp14:editId="0063190D">
+                <wp:inline distT="0" distB="0" distL="0" distR="0" wp14:anchorId="01815465" wp14:editId="598F555F">
                   <wp:extent cx="2926080" cy="1426594"/>
                   <wp:effectExtent l="0" t="0" r="0" b="0"/>
                   <wp:docPr id="3" name="Picture 3"/>
@@ -9368,7 +9375,7 @@
                 <w:noProof/>
               </w:rPr>
               <w:drawing>
-                <wp:inline distT="0" distB="0" distL="0" distR="0" wp14:anchorId="74C4C430" wp14:editId="3BA755AF">
+                <wp:inline distT="0" distB="0" distL="0" distR="0" wp14:anchorId="6ACAFD92" wp14:editId="086EAA1A">
                   <wp:extent cx="2926080" cy="1494260"/>
                   <wp:effectExtent l="0" t="0" r="0" b="0"/>
                   <wp:docPr id="4" name="Picture 4"/>
@@ -9473,7 +9480,7 @@
         <w:pStyle w:val="Ttulo2"/>
         <w:spacing w:before="70" w:after="20"/>
       </w:pPr>
-      <w:bookmarkStart w:id="9" w:name="_Toc238660454"/>
+      <w:bookmarkStart w:id="9" w:name="_Toc238661173"/>
       <w:r>
         <w:rPr>
           <w:rFonts w:ascii="Georgia" w:hAnsi="Georgia"/>
@@ -9600,7 +9607,6 @@
           <w:b/>
           <w:color w:val="0D233A"/>
         </w:rPr>
-        <w:lastRenderedPageBreak/>
         <w:t xml:space="preserve">3. </w:t>
       </w:r>
       <w:r>
@@ -9699,6 +9705,7 @@
         </w:rPr>
       </w:pPr>
       <w:r>
+        <w:lastRenderedPageBreak/>
         <w:t>Esta absorción inicial de capital de trabajo obedece a la recomposición de cuentas por cobrar (DSO ≈ 45 días) y la reposición de existencias de alúmina a precios internacionales más altos tras el shock de facturación por el LME (con volumen físico constante en 432.400 t). Luego libera +USD 23,9 MM/año de forma recurrente en el resto del horizonte proyectado, a medida que el precio converge a su media histórica.</w:t>
       </w:r>
     </w:p>
@@ -9707,7 +9714,7 @@
         <w:pStyle w:val="Ttulo1"/>
         <w:spacing w:before="100" w:after="30"/>
       </w:pPr>
-      <w:bookmarkStart w:id="10" w:name="_Toc238660455"/>
+      <w:bookmarkStart w:id="10" w:name="_Toc238661174"/>
       <w:r>
         <w:rPr>
           <w:rFonts w:ascii="Georgia" w:hAnsi="Georgia"/>
@@ -9723,7 +9730,7 @@
         <w:pStyle w:val="Ttulo2"/>
         <w:spacing w:before="70" w:after="20"/>
       </w:pPr>
-      <w:bookmarkStart w:id="11" w:name="_Toc238660456"/>
+      <w:bookmarkStart w:id="11" w:name="_Toc238661175"/>
       <w:r>
         <w:rPr>
           <w:rFonts w:ascii="Georgia" w:hAnsi="Georgia"/>
@@ -9784,7 +9791,7 @@
                 <w:noProof/>
               </w:rPr>
               <w:drawing>
-                <wp:inline distT="0" distB="0" distL="0" distR="0" wp14:anchorId="1D8EE02F" wp14:editId="0D3B3B1A">
+                <wp:inline distT="0" distB="0" distL="0" distR="0" wp14:anchorId="188055D4" wp14:editId="0E696A34">
                   <wp:extent cx="2926080" cy="1636252"/>
                   <wp:effectExtent l="0" t="0" r="0" b="0"/>
                   <wp:docPr id="5" name="Picture 5"/>
@@ -9843,7 +9850,7 @@
                 <w:noProof/>
               </w:rPr>
               <w:drawing>
-                <wp:inline distT="0" distB="0" distL="0" distR="0" wp14:anchorId="3457079F" wp14:editId="09CC3AED">
+                <wp:inline distT="0" distB="0" distL="0" distR="0" wp14:anchorId="7D1C0B9A" wp14:editId="37F6146C">
                   <wp:extent cx="2926080" cy="1481181"/>
                   <wp:effectExtent l="0" t="0" r="0" b="0"/>
                   <wp:docPr id="6" name="Picture 6"/>
@@ -9948,7 +9955,7 @@
         <w:pStyle w:val="Ttulo2"/>
         <w:spacing w:before="70" w:after="20"/>
       </w:pPr>
-      <w:bookmarkStart w:id="12" w:name="_Toc238660457"/>
+      <w:bookmarkStart w:id="12" w:name="_Toc238661176"/>
       <w:r>
         <w:rPr>
           <w:rFonts w:ascii="Georgia" w:hAnsi="Georgia"/>
@@ -9978,7 +9985,7 @@
         <w:pStyle w:val="Ttulo2"/>
         <w:spacing w:before="70" w:after="20"/>
       </w:pPr>
-      <w:bookmarkStart w:id="13" w:name="_Toc238660458"/>
+      <w:bookmarkStart w:id="13" w:name="_Toc238661177"/>
       <w:r>
         <w:rPr>
           <w:rFonts w:ascii="Georgia" w:hAnsi="Georgia"/>
@@ -10036,7 +10043,7 @@
                 <w:noProof/>
               </w:rPr>
               <w:drawing>
-                <wp:inline distT="0" distB="0" distL="0" distR="0" wp14:anchorId="7AFD599B" wp14:editId="64638266">
+                <wp:inline distT="0" distB="0" distL="0" distR="0" wp14:anchorId="767A4846" wp14:editId="4C33ABDA">
                   <wp:extent cx="2926080" cy="1626307"/>
                   <wp:effectExtent l="0" t="0" r="0" b="0"/>
                   <wp:docPr id="7" name="Picture 7"/>
@@ -10095,7 +10102,7 @@
                 <w:noProof/>
               </w:rPr>
               <w:drawing>
-                <wp:inline distT="0" distB="0" distL="0" distR="0" wp14:anchorId="588E5CE4" wp14:editId="688E8EDC">
+                <wp:inline distT="0" distB="0" distL="0" distR="0" wp14:anchorId="75549EF0" wp14:editId="4A6247BC">
                   <wp:extent cx="2926080" cy="1479479"/>
                   <wp:effectExtent l="0" t="0" r="0" b="0"/>
                   <wp:docPr id="8" name="Picture 8"/>
@@ -10200,7 +10207,7 @@
         <w:pStyle w:val="Ttulo2"/>
         <w:spacing w:before="70" w:after="20"/>
       </w:pPr>
-      <w:bookmarkStart w:id="14" w:name="_Toc238660459"/>
+      <w:bookmarkStart w:id="14" w:name="_Toc238661178"/>
       <w:r>
         <w:rPr>
           <w:rFonts w:ascii="Georgia" w:hAnsi="Georgia"/>
@@ -10258,7 +10265,7 @@
                 <w:noProof/>
               </w:rPr>
               <w:drawing>
-                <wp:inline distT="0" distB="0" distL="0" distR="0" wp14:anchorId="400B8DAD" wp14:editId="1646F413">
+                <wp:inline distT="0" distB="0" distL="0" distR="0" wp14:anchorId="3766DC87" wp14:editId="0026E9BC">
                   <wp:extent cx="2926080" cy="1662311"/>
                   <wp:effectExtent l="0" t="0" r="0" b="0"/>
                   <wp:docPr id="9" name="Picture 9"/>
@@ -10317,7 +10324,7 @@
                 <w:noProof/>
               </w:rPr>
               <w:drawing>
-                <wp:inline distT="0" distB="0" distL="0" distR="0" wp14:anchorId="3B0E48A8" wp14:editId="2E062103">
+                <wp:inline distT="0" distB="0" distL="0" distR="0" wp14:anchorId="6FE177BC" wp14:editId="37BB481B">
                   <wp:extent cx="2926080" cy="1801004"/>
                   <wp:effectExtent l="0" t="0" r="0" b="0"/>
                   <wp:docPr id="10" name="Picture 10"/>
@@ -10422,7 +10429,7 @@
         <w:pStyle w:val="Ttulo1"/>
         <w:spacing w:before="100" w:after="30"/>
       </w:pPr>
-      <w:bookmarkStart w:id="15" w:name="_Toc238660460"/>
+      <w:bookmarkStart w:id="15" w:name="_Toc238661179"/>
       <w:r>
         <w:rPr>
           <w:rFonts w:ascii="Georgia" w:hAnsi="Georgia"/>
@@ -10438,7 +10445,7 @@
         <w:pStyle w:val="Ttulo2"/>
         <w:spacing w:before="70" w:after="20"/>
       </w:pPr>
-      <w:bookmarkStart w:id="16" w:name="_Toc238660461"/>
+      <w:bookmarkStart w:id="16" w:name="_Toc238661180"/>
       <w:r>
         <w:rPr>
           <w:rFonts w:ascii="Georgia" w:hAnsi="Georgia"/>
@@ -10877,7 +10884,7 @@
         <w:pStyle w:val="Ttulo2"/>
         <w:spacing w:before="70" w:after="20"/>
       </w:pPr>
-      <w:bookmarkStart w:id="17" w:name="_Toc238660462"/>
+      <w:bookmarkStart w:id="17" w:name="_Toc238661181"/>
       <w:r>
         <w:rPr>
           <w:rFonts w:ascii="Georgia" w:hAnsi="Georgia"/>
@@ -10905,7 +10912,7 @@
         <w:pStyle w:val="Ttulo1"/>
         <w:spacing w:before="100" w:after="30"/>
       </w:pPr>
-      <w:bookmarkStart w:id="18" w:name="_Toc238660463"/>
+      <w:bookmarkStart w:id="18" w:name="_Toc238661182"/>
       <w:r>
         <w:rPr>
           <w:rFonts w:ascii="Georgia" w:hAnsi="Georgia"/>
@@ -10921,7 +10928,7 @@
         <w:pStyle w:val="Ttulo2"/>
         <w:spacing w:before="70" w:after="20"/>
       </w:pPr>
-      <w:bookmarkStart w:id="19" w:name="_Toc238660464"/>
+      <w:bookmarkStart w:id="19" w:name="_Toc238661183"/>
       <w:r>
         <w:rPr>
           <w:rFonts w:ascii="Georgia" w:hAnsi="Georgia"/>
@@ -10948,7 +10955,7 @@
         <w:pStyle w:val="Ttulo2"/>
         <w:spacing w:before="70" w:after="20"/>
       </w:pPr>
-      <w:bookmarkStart w:id="20" w:name="_Toc238660465"/>
+      <w:bookmarkStart w:id="20" w:name="_Toc238661184"/>
       <w:r>
         <w:rPr>
           <w:rFonts w:ascii="Georgia" w:hAnsi="Georgia"/>
@@ -11006,7 +11013,7 @@
                 <w:noProof/>
               </w:rPr>
               <w:drawing>
-                <wp:inline distT="0" distB="0" distL="0" distR="0" wp14:anchorId="3C2D2A9C" wp14:editId="2BC87731">
+                <wp:inline distT="0" distB="0" distL="0" distR="0" wp14:anchorId="26CA0FBF" wp14:editId="30CAE75B">
                   <wp:extent cx="2926080" cy="1714660"/>
                   <wp:effectExtent l="0" t="0" r="0" b="0"/>
                   <wp:docPr id="11" name="Picture 11"/>
@@ -11065,7 +11072,7 @@
                 <w:noProof/>
               </w:rPr>
               <w:drawing>
-                <wp:inline distT="0" distB="0" distL="0" distR="0" wp14:anchorId="44916872" wp14:editId="1960A87F">
+                <wp:inline distT="0" distB="0" distL="0" distR="0" wp14:anchorId="731A6725" wp14:editId="56F3F585">
                   <wp:extent cx="2926080" cy="1558188"/>
                   <wp:effectExtent l="0" t="0" r="0" b="0"/>
                   <wp:docPr id="12" name="Picture 12"/>
@@ -12035,7 +12042,7 @@
         <w:pStyle w:val="Ttulo1"/>
         <w:spacing w:before="100" w:after="30"/>
       </w:pPr>
-      <w:bookmarkStart w:id="21" w:name="_Toc238660466"/>
+      <w:bookmarkStart w:id="21" w:name="_Toc238661185"/>
       <w:r>
         <w:rPr>
           <w:rFonts w:ascii="Georgia" w:hAnsi="Georgia"/>
@@ -12052,7 +12059,7 @@
         <w:pStyle w:val="Ttulo2"/>
         <w:spacing w:before="70" w:after="20"/>
       </w:pPr>
-      <w:bookmarkStart w:id="22" w:name="_Toc238660467"/>
+      <w:bookmarkStart w:id="22" w:name="_Toc238661186"/>
       <w:r>
         <w:rPr>
           <w:rFonts w:ascii="Georgia" w:hAnsi="Georgia"/>
@@ -12144,7 +12151,7 @@
         <w:pStyle w:val="Ttulo2"/>
         <w:spacing w:before="70" w:after="20"/>
       </w:pPr>
-      <w:bookmarkStart w:id="23" w:name="_Toc238660468"/>
+      <w:bookmarkStart w:id="23" w:name="_Toc238661187"/>
       <w:r>
         <w:rPr>
           <w:rFonts w:ascii="Georgia" w:hAnsi="Georgia"/>
@@ -12386,7 +12393,7 @@
                 <w:noProof/>
               </w:rPr>
               <w:drawing>
-                <wp:inline distT="0" distB="0" distL="0" distR="0" wp14:anchorId="2C2CC3C4" wp14:editId="4C5EEF73">
+                <wp:inline distT="0" distB="0" distL="0" distR="0" wp14:anchorId="681ECB8D" wp14:editId="0073D112">
                   <wp:extent cx="2926080" cy="1540391"/>
                   <wp:effectExtent l="0" t="0" r="0" b="0"/>
                   <wp:docPr id="13" name="Picture 13"/>
@@ -12445,7 +12452,7 @@
                 <w:noProof/>
               </w:rPr>
               <w:drawing>
-                <wp:inline distT="0" distB="0" distL="0" distR="0" wp14:anchorId="7114DFEC" wp14:editId="48DF5612">
+                <wp:inline distT="0" distB="0" distL="0" distR="0" wp14:anchorId="762841C7" wp14:editId="01706FE0">
                   <wp:extent cx="2926080" cy="1658038"/>
                   <wp:effectExtent l="0" t="0" r="0" b="0"/>
                   <wp:docPr id="14" name="Picture 14"/>
@@ -12550,7 +12557,7 @@
         <w:pStyle w:val="Ttulo2"/>
         <w:spacing w:before="70" w:after="20"/>
       </w:pPr>
-      <w:bookmarkStart w:id="24" w:name="_Toc238660469"/>
+      <w:bookmarkStart w:id="24" w:name="_Toc238661188"/>
       <w:r>
         <w:rPr>
           <w:rFonts w:ascii="Georgia" w:hAnsi="Georgia"/>
@@ -13480,7 +13487,7 @@
         <w:pStyle w:val="Ttulo1"/>
         <w:spacing w:before="100" w:after="30"/>
       </w:pPr>
-      <w:bookmarkStart w:id="25" w:name="_Toc238660470"/>
+      <w:bookmarkStart w:id="25" w:name="_Toc238661189"/>
       <w:r>
         <w:rPr>
           <w:rFonts w:ascii="Georgia" w:hAnsi="Georgia"/>
@@ -13496,7 +13503,7 @@
         <w:pStyle w:val="Ttulo2"/>
         <w:spacing w:before="70" w:after="20"/>
       </w:pPr>
-      <w:bookmarkStart w:id="26" w:name="_Toc238660471"/>
+      <w:bookmarkStart w:id="26" w:name="_Toc238661190"/>
       <w:r>
         <w:rPr>
           <w:rFonts w:ascii="Georgia" w:hAnsi="Georgia"/>
@@ -15093,7 +15100,7 @@
         <w:pStyle w:val="Ttulo2"/>
         <w:spacing w:before="70" w:after="20"/>
       </w:pPr>
-      <w:bookmarkStart w:id="27" w:name="_Toc238660472"/>
+      <w:bookmarkStart w:id="27" w:name="_Toc238661191"/>
       <w:r>
         <w:rPr>
           <w:rFonts w:ascii="Georgia" w:hAnsi="Georgia"/>
@@ -15203,7 +15210,7 @@
         <w:pStyle w:val="Ttulo1"/>
         <w:spacing w:before="100" w:after="30"/>
       </w:pPr>
-      <w:bookmarkStart w:id="28" w:name="_Toc238660473"/>
+      <w:bookmarkStart w:id="28" w:name="_Toc238661192"/>
       <w:r>
         <w:rPr>
           <w:rFonts w:ascii="Georgia" w:hAnsi="Georgia"/>
@@ -15220,7 +15227,7 @@
         <w:pStyle w:val="Ttulo2"/>
         <w:spacing w:before="70" w:after="20"/>
       </w:pPr>
-      <w:bookmarkStart w:id="29" w:name="_Toc238660474"/>
+      <w:bookmarkStart w:id="29" w:name="_Toc238661193"/>
       <w:r>
         <w:rPr>
           <w:rFonts w:ascii="Georgia" w:hAnsi="Georgia"/>
@@ -15247,7 +15254,7 @@
         <w:pStyle w:val="Ttulo2"/>
         <w:spacing w:before="70" w:after="20"/>
       </w:pPr>
-      <w:bookmarkStart w:id="30" w:name="_Toc238660475"/>
+      <w:bookmarkStart w:id="30" w:name="_Toc238661194"/>
       <w:r>
         <w:rPr>
           <w:rFonts w:ascii="Georgia" w:hAnsi="Georgia"/>
@@ -15305,7 +15312,7 @@
                 <w:noProof/>
               </w:rPr>
               <w:drawing>
-                <wp:inline distT="0" distB="0" distL="0" distR="0" wp14:anchorId="3AF5DBC3" wp14:editId="04FC9EE9">
+                <wp:inline distT="0" distB="0" distL="0" distR="0" wp14:anchorId="518097B3" wp14:editId="4D489820">
                   <wp:extent cx="2926080" cy="1534596"/>
                   <wp:effectExtent l="0" t="0" r="0" b="0"/>
                   <wp:docPr id="15" name="Picture 15"/>
@@ -15364,7 +15371,7 @@
                 <w:noProof/>
               </w:rPr>
               <w:drawing>
-                <wp:inline distT="0" distB="0" distL="0" distR="0" wp14:anchorId="6A6906AA" wp14:editId="5A31A689">
+                <wp:inline distT="0" distB="0" distL="0" distR="0" wp14:anchorId="7500F0B8" wp14:editId="401FAEAA">
                   <wp:extent cx="2926080" cy="1680519"/>
                   <wp:effectExtent l="0" t="0" r="0" b="0"/>
                   <wp:docPr id="16" name="Picture 16"/>
@@ -15480,7 +15487,7 @@
         <w:pStyle w:val="Ttulo1"/>
         <w:spacing w:before="100" w:after="30"/>
       </w:pPr>
-      <w:bookmarkStart w:id="31" w:name="_Toc238660476"/>
+      <w:bookmarkStart w:id="31" w:name="_Toc238661195"/>
       <w:r>
         <w:rPr>
           <w:rFonts w:ascii="Georgia" w:hAnsi="Georgia"/>
@@ -15496,7 +15503,7 @@
         <w:pStyle w:val="Ttulo2"/>
         <w:spacing w:before="70" w:after="20"/>
       </w:pPr>
-      <w:bookmarkStart w:id="32" w:name="_Toc238660477"/>
+      <w:bookmarkStart w:id="32" w:name="_Toc238661196"/>
       <w:r>
         <w:rPr>
           <w:rFonts w:ascii="Georgia" w:hAnsi="Georgia"/>
@@ -16543,7 +16550,7 @@
         <w:pStyle w:val="Ttulo2"/>
         <w:spacing w:before="70" w:after="20"/>
       </w:pPr>
-      <w:bookmarkStart w:id="33" w:name="_Toc238660478"/>
+      <w:bookmarkStart w:id="33" w:name="_Toc238661197"/>
       <w:r>
         <w:rPr>
           <w:rFonts w:ascii="Georgia" w:hAnsi="Georgia"/>
@@ -16704,7 +16711,7 @@
         <w:pStyle w:val="Ttulo2"/>
         <w:spacing w:before="70" w:after="20"/>
       </w:pPr>
-      <w:bookmarkStart w:id="34" w:name="_Toc238660479"/>
+      <w:bookmarkStart w:id="34" w:name="_Toc238661198"/>
       <w:r>
         <w:rPr>
           <w:rFonts w:ascii="Georgia" w:hAnsi="Georgia"/>
@@ -16731,7 +16738,7 @@
         <w:pStyle w:val="Ttulo1"/>
         <w:spacing w:before="100" w:after="30"/>
       </w:pPr>
-      <w:bookmarkStart w:id="35" w:name="_Toc238660480"/>
+      <w:bookmarkStart w:id="35" w:name="_Toc238661199"/>
       <w:r>
         <w:rPr>
           <w:rFonts w:ascii="Georgia" w:hAnsi="Georgia"/>
@@ -16747,7 +16754,7 @@
         <w:pStyle w:val="Ttulo2"/>
         <w:spacing w:before="70" w:after="20"/>
       </w:pPr>
-      <w:bookmarkStart w:id="36" w:name="_Toc238660481"/>
+      <w:bookmarkStart w:id="36" w:name="_Toc238661200"/>
       <w:r>
         <w:rPr>
           <w:rFonts w:ascii="Georgia" w:hAnsi="Georgia"/>
@@ -19674,7 +19681,7 @@
         <w:pStyle w:val="Ttulo1"/>
         <w:spacing w:before="100" w:after="30"/>
       </w:pPr>
-      <w:bookmarkStart w:id="37" w:name="_Toc238660482"/>
+      <w:bookmarkStart w:id="37" w:name="_Toc238661201"/>
       <w:r>
         <w:rPr>
           <w:rFonts w:ascii="Georgia" w:hAnsi="Georgia"/>
@@ -19691,7 +19698,7 @@
         <w:pStyle w:val="Ttulo2"/>
         <w:spacing w:before="70" w:after="20"/>
       </w:pPr>
-      <w:bookmarkStart w:id="38" w:name="_Toc238660483"/>
+      <w:bookmarkStart w:id="38" w:name="_Toc238661202"/>
       <w:r>
         <w:rPr>
           <w:rFonts w:ascii="Georgia" w:hAnsi="Georgia"/>
@@ -19900,7 +19907,7 @@
         <w:pStyle w:val="Ttulo2"/>
         <w:spacing w:before="70" w:after="20"/>
       </w:pPr>
-      <w:bookmarkStart w:id="39" w:name="_Toc238660484"/>
+      <w:bookmarkStart w:id="39" w:name="_Toc238661203"/>
       <w:r>
         <w:rPr>
           <w:rFonts w:ascii="Georgia" w:hAnsi="Georgia"/>
@@ -19936,7 +19943,7 @@
           <w:noProof/>
         </w:rPr>
         <w:drawing>
-          <wp:inline distT="0" distB="0" distL="0" distR="0" wp14:anchorId="3DCEBC7F" wp14:editId="3F222F1A">
+          <wp:inline distT="0" distB="0" distL="0" distR="0" wp14:anchorId="1A7C9849" wp14:editId="38EAEAE8">
             <wp:extent cx="4206240" cy="2338193"/>
             <wp:effectExtent l="0" t="0" r="0" b="0"/>
             <wp:docPr id="17" name="Picture 17"/>
@@ -19995,7 +20002,7 @@
         <w:pStyle w:val="Ttulo2"/>
         <w:spacing w:before="70" w:after="20"/>
       </w:pPr>
-      <w:bookmarkStart w:id="40" w:name="_Toc238660485"/>
+      <w:bookmarkStart w:id="40" w:name="_Toc238661204"/>
       <w:r>
         <w:rPr>
           <w:rFonts w:ascii="Georgia" w:hAnsi="Georgia"/>
@@ -20616,7 +20623,7 @@
         <w:pStyle w:val="Ttulo2"/>
         <w:spacing w:before="70" w:after="20"/>
       </w:pPr>
-      <w:bookmarkStart w:id="41" w:name="_Toc238660486"/>
+      <w:bookmarkStart w:id="41" w:name="_Toc238661205"/>
       <w:r>
         <w:rPr>
           <w:rFonts w:ascii="Georgia" w:hAnsi="Georgia"/>
@@ -20652,7 +20659,7 @@
           <w:noProof/>
         </w:rPr>
         <w:drawing>
-          <wp:inline distT="0" distB="0" distL="0" distR="0" wp14:anchorId="1D75BF8E" wp14:editId="49426C86">
+          <wp:inline distT="0" distB="0" distL="0" distR="0" wp14:anchorId="27429D93" wp14:editId="41A3DB55">
             <wp:extent cx="4206240" cy="2471742"/>
             <wp:effectExtent l="0" t="0" r="0" b="0"/>
             <wp:docPr id="18" name="Picture 18"/>
@@ -21731,7 +21738,7 @@
         <w:pStyle w:val="Ttulo1"/>
         <w:spacing w:before="100" w:after="30"/>
       </w:pPr>
-      <w:bookmarkStart w:id="42" w:name="_Toc238660487"/>
+      <w:bookmarkStart w:id="42" w:name="_Toc238661206"/>
       <w:r>
         <w:rPr>
           <w:rFonts w:ascii="Georgia" w:hAnsi="Georgia"/>
@@ -21747,7 +21754,7 @@
         <w:pStyle w:val="Ttulo2"/>
         <w:spacing w:before="70" w:after="20"/>
       </w:pPr>
-      <w:bookmarkStart w:id="43" w:name="_Toc238660488"/>
+      <w:bookmarkStart w:id="43" w:name="_Toc238661207"/>
       <w:r>
         <w:rPr>
           <w:rFonts w:ascii="Georgia" w:hAnsi="Georgia"/>
@@ -21784,7 +21791,7 @@
         </w:rPr>
         <w:lastRenderedPageBreak/>
         <w:drawing>
-          <wp:inline distT="0" distB="0" distL="0" distR="0" wp14:anchorId="144A2487" wp14:editId="7B680C55">
+          <wp:inline distT="0" distB="0" distL="0" distR="0" wp14:anchorId="462217EE" wp14:editId="24FCED50">
             <wp:extent cx="4206240" cy="2149342"/>
             <wp:effectExtent l="0" t="0" r="0" b="0"/>
             <wp:docPr id="19" name="Picture 19"/>
@@ -21843,7 +21850,7 @@
         <w:pStyle w:val="Ttulo1"/>
         <w:spacing w:before="100" w:after="30"/>
       </w:pPr>
-      <w:bookmarkStart w:id="44" w:name="_Toc238660489"/>
+      <w:bookmarkStart w:id="44" w:name="_Toc238661208"/>
       <w:r>
         <w:rPr>
           <w:rFonts w:ascii="Georgia" w:hAnsi="Georgia"/>
@@ -21859,7 +21866,7 @@
         <w:pStyle w:val="Ttulo2"/>
         <w:spacing w:before="70" w:after="20"/>
       </w:pPr>
-      <w:bookmarkStart w:id="45" w:name="_Toc238660490"/>
+      <w:bookmarkStart w:id="45" w:name="_Toc238661209"/>
       <w:r>
         <w:rPr>
           <w:rFonts w:ascii="Georgia" w:hAnsi="Georgia"/>
@@ -21914,7 +21921,7 @@
         <w:pStyle w:val="Ttulo2"/>
         <w:spacing w:before="70" w:after="20"/>
       </w:pPr>
-      <w:bookmarkStart w:id="46" w:name="_Toc238660491"/>
+      <w:bookmarkStart w:id="46" w:name="_Toc238661210"/>
       <w:r>
         <w:rPr>
           <w:rFonts w:ascii="Georgia" w:hAnsi="Georgia"/>
@@ -21972,7 +21979,7 @@
                 <w:noProof/>
               </w:rPr>
               <w:drawing>
-                <wp:inline distT="0" distB="0" distL="0" distR="0" wp14:anchorId="61AE090B" wp14:editId="6C9DE80D">
+                <wp:inline distT="0" distB="0" distL="0" distR="0" wp14:anchorId="1628E677" wp14:editId="3A1E12E3">
                   <wp:extent cx="2926080" cy="1682608"/>
                   <wp:effectExtent l="0" t="0" r="0" b="0"/>
                   <wp:docPr id="20" name="Picture 20"/>
@@ -22031,7 +22038,7 @@
                 <w:noProof/>
               </w:rPr>
               <w:drawing>
-                <wp:inline distT="0" distB="0" distL="0" distR="0" wp14:anchorId="00DC1AA3" wp14:editId="16F67F83">
+                <wp:inline distT="0" distB="0" distL="0" distR="0" wp14:anchorId="2EC75606" wp14:editId="303BE991">
                   <wp:extent cx="2926080" cy="1655981"/>
                   <wp:effectExtent l="0" t="0" r="0" b="0"/>
                   <wp:docPr id="21" name="Picture 21"/>
@@ -22136,7 +22143,7 @@
         <w:pStyle w:val="Ttulo1"/>
         <w:spacing w:before="100" w:after="30"/>
       </w:pPr>
-      <w:bookmarkStart w:id="47" w:name="_Toc238660492"/>
+      <w:bookmarkStart w:id="47" w:name="_Toc238661211"/>
       <w:r>
         <w:rPr>
           <w:rFonts w:ascii="Georgia" w:hAnsi="Georgia"/>
@@ -22152,7 +22159,7 @@
         <w:pStyle w:val="Ttulo2"/>
         <w:spacing w:before="70" w:after="20"/>
       </w:pPr>
-      <w:bookmarkStart w:id="48" w:name="_Toc238660493"/>
+      <w:bookmarkStart w:id="48" w:name="_Toc238661212"/>
       <w:r>
         <w:rPr>
           <w:rFonts w:ascii="Georgia" w:hAnsi="Georgia"/>
@@ -22188,7 +22195,7 @@
           <w:noProof/>
         </w:rPr>
         <w:drawing>
-          <wp:inline distT="0" distB="0" distL="0" distR="0" wp14:anchorId="09868316" wp14:editId="085F8E58">
+          <wp:inline distT="0" distB="0" distL="0" distR="0" wp14:anchorId="057C1ACC" wp14:editId="051CC3A7">
             <wp:extent cx="4206240" cy="2227773"/>
             <wp:effectExtent l="0" t="0" r="0" b="0"/>
             <wp:docPr id="22" name="Picture 22"/>
@@ -23776,7 +23783,7 @@
         <w:pStyle w:val="Ttulo1"/>
         <w:spacing w:before="100" w:after="30"/>
       </w:pPr>
-      <w:bookmarkStart w:id="49" w:name="_Toc238660494"/>
+      <w:bookmarkStart w:id="49" w:name="_Toc238661213"/>
       <w:r>
         <w:rPr>
           <w:rFonts w:ascii="Georgia" w:hAnsi="Georgia"/>
@@ -23793,7 +23800,7 @@
         <w:pStyle w:val="Ttulo2"/>
         <w:spacing w:before="70" w:after="20"/>
       </w:pPr>
-      <w:bookmarkStart w:id="50" w:name="_Toc238660495"/>
+      <w:bookmarkStart w:id="50" w:name="_Toc238661214"/>
       <w:r>
         <w:rPr>
           <w:rFonts w:ascii="Georgia" w:hAnsi="Georgia"/>
@@ -23888,7 +23895,7 @@
                 <w:noProof/>
               </w:rPr>
               <w:drawing>
-                <wp:inline distT="0" distB="0" distL="0" distR="0" wp14:anchorId="54E4694C" wp14:editId="59A867F4">
+                <wp:inline distT="0" distB="0" distL="0" distR="0" wp14:anchorId="3B8A9258" wp14:editId="4E1D080B">
                   <wp:extent cx="2926080" cy="1695124"/>
                   <wp:effectExtent l="0" t="0" r="0" b="0"/>
                   <wp:docPr id="23" name="Picture 23"/>
@@ -23947,7 +23954,7 @@
                 <w:noProof/>
               </w:rPr>
               <w:drawing>
-                <wp:inline distT="0" distB="0" distL="0" distR="0" wp14:anchorId="2CA8EDFC" wp14:editId="67BE9710">
+                <wp:inline distT="0" distB="0" distL="0" distR="0" wp14:anchorId="4ACA722D" wp14:editId="538AFC91">
                   <wp:extent cx="2926080" cy="1698212"/>
                   <wp:effectExtent l="0" t="0" r="0" b="0"/>
                   <wp:docPr id="24" name="Picture 24"/>
@@ -24052,7 +24059,7 @@
         <w:pStyle w:val="Ttulo2"/>
         <w:spacing w:before="70" w:after="20"/>
       </w:pPr>
-      <w:bookmarkStart w:id="51" w:name="_Toc238660496"/>
+      <w:bookmarkStart w:id="51" w:name="_Toc238661215"/>
       <w:r>
         <w:rPr>
           <w:rFonts w:ascii="Georgia" w:hAnsi="Georgia"/>
@@ -24138,7 +24145,7 @@
                 <w:noProof/>
               </w:rPr>
               <w:drawing>
-                <wp:inline distT="0" distB="0" distL="0" distR="0" wp14:anchorId="15B63BB3" wp14:editId="0B1CF150">
+                <wp:inline distT="0" distB="0" distL="0" distR="0" wp14:anchorId="160826D0" wp14:editId="51C5AEC3">
                   <wp:extent cx="2926080" cy="1696900"/>
                   <wp:effectExtent l="0" t="0" r="0" b="0"/>
                   <wp:docPr id="25" name="Picture 25"/>
@@ -24197,7 +24204,7 @@
                 <w:noProof/>
               </w:rPr>
               <w:drawing>
-                <wp:inline distT="0" distB="0" distL="0" distR="0" wp14:anchorId="70622EC6" wp14:editId="01A96249">
+                <wp:inline distT="0" distB="0" distL="0" distR="0" wp14:anchorId="27CE4755" wp14:editId="2F934F36">
                   <wp:extent cx="2926080" cy="1654733"/>
                   <wp:effectExtent l="0" t="0" r="0" b="0"/>
                   <wp:docPr id="26" name="Picture 26"/>
@@ -25957,7 +25964,7 @@
         <w:pStyle w:val="Ttulo1"/>
         <w:spacing w:before="100" w:after="30"/>
       </w:pPr>
-      <w:bookmarkStart w:id="52" w:name="_Toc238660497"/>
+      <w:bookmarkStart w:id="52" w:name="_Toc238661216"/>
       <w:r>
         <w:rPr>
           <w:rFonts w:ascii="Georgia" w:hAnsi="Georgia"/>
@@ -25973,7 +25980,7 @@
         <w:pStyle w:val="Ttulo2"/>
         <w:spacing w:before="70" w:after="20"/>
       </w:pPr>
-      <w:bookmarkStart w:id="53" w:name="_Toc238660498"/>
+      <w:bookmarkStart w:id="53" w:name="_Toc238661217"/>
       <w:r>
         <w:rPr>
           <w:rFonts w:ascii="Georgia" w:hAnsi="Georgia"/>
@@ -26090,7 +26097,7 @@
                 <w:noProof/>
               </w:rPr>
               <w:drawing>
-                <wp:inline distT="0" distB="0" distL="0" distR="0" wp14:anchorId="5A2C43D7" wp14:editId="6F336738">
+                <wp:inline distT="0" distB="0" distL="0" distR="0" wp14:anchorId="4152A176" wp14:editId="1A08F35A">
                   <wp:extent cx="2926080" cy="1614092"/>
                   <wp:effectExtent l="0" t="0" r="0" b="0"/>
                   <wp:docPr id="27" name="Picture 27"/>
@@ -26149,7 +26156,7 @@
                 <w:noProof/>
               </w:rPr>
               <w:drawing>
-                <wp:inline distT="0" distB="0" distL="0" distR="0" wp14:anchorId="220BCC07" wp14:editId="399EE59C">
+                <wp:inline distT="0" distB="0" distL="0" distR="0" wp14:anchorId="646C821C" wp14:editId="31C851C7">
                   <wp:extent cx="2926080" cy="1650045"/>
                   <wp:effectExtent l="0" t="0" r="0" b="0"/>
                   <wp:docPr id="28" name="Picture 28"/>
@@ -26562,7 +26569,7 @@
         <w:pStyle w:val="Ttulo2"/>
         <w:spacing w:before="70" w:after="20"/>
       </w:pPr>
-      <w:bookmarkStart w:id="54" w:name="_Toc238660499"/>
+      <w:bookmarkStart w:id="54" w:name="_Toc238661218"/>
       <w:r>
         <w:rPr>
           <w:rFonts w:ascii="Georgia" w:hAnsi="Georgia"/>
@@ -26609,10 +26616,7 @@
         </w:rPr>
       </w:pPr>
       <w:r>
-        <w:t>Por el teorema de difusión límite de Nelson (1990), este GARCH(1,1) representa la aproximación discreta de un proceso de volatilidad estocástica continua de tipo Heston (1993). Adicionalmente, la descomposición de variación bipotencia (Barndorff-Nielsen &amp; Shephard 2004) bajo difusión con saltos de Merton (1976) evidencia que el 28,4% de la varianza histórica total proviene de shocks discretos devaluatorios, mientras que el Beta estructural de Hamada de 0,888 mantiene la calibración de ciclo completo para el</w:t>
-      </w:r>
-      <w:r>
-        <w:t xml:space="preserve"> WACC.</w:t>
+        <w:t>Por el teorema de difusión límite de Nelson (1990), este GARCH(1,1) representa la aproximación discreta de un proceso de volatilidad estocástica continua de tipo Heston (1993). La descomposición de variación bipotencia (Barndorff-Nielsen &amp; Shephard 2004) bajo difusión con saltos de Merton (1976) muestra que el 28,4% de la varianza histórica total proviene de shocks discretos devaluatorios, mientras que el Beta estructural de Hamada de 0,888 mantiene la calibración de ciclo completo para el WACC.</w:t>
       </w:r>
     </w:p>
     <w:tbl>
@@ -26651,7 +26655,7 @@
                 <w:noProof/>
               </w:rPr>
               <w:drawing>
-                <wp:inline distT="0" distB="0" distL="0" distR="0" wp14:anchorId="1FDB6CF0" wp14:editId="3FEEEFCE">
+                <wp:inline distT="0" distB="0" distL="0" distR="0" wp14:anchorId="6CF5FE75" wp14:editId="342FAD11">
                   <wp:extent cx="2926080" cy="1527796"/>
                   <wp:effectExtent l="0" t="0" r="0" b="0"/>
                   <wp:docPr id="29" name="Picture 29"/>
@@ -26710,7 +26714,7 @@
                 <w:noProof/>
               </w:rPr>
               <w:drawing>
-                <wp:inline distT="0" distB="0" distL="0" distR="0" wp14:anchorId="4C7289A7" wp14:editId="6117A102">
+                <wp:inline distT="0" distB="0" distL="0" distR="0" wp14:anchorId="240F21A5" wp14:editId="738A80D1">
                   <wp:extent cx="2926080" cy="1611196"/>
                   <wp:effectExtent l="0" t="0" r="0" b="0"/>
                   <wp:docPr id="30" name="Picture 30"/>
@@ -26815,7 +26819,7 @@
         <w:pStyle w:val="Ttulo2"/>
         <w:spacing w:before="70" w:after="20"/>
       </w:pPr>
-      <w:bookmarkStart w:id="55" w:name="_Toc238660500"/>
+      <w:bookmarkStart w:id="55" w:name="_Toc238661219"/>
       <w:r>
         <w:rPr>
           <w:rFonts w:ascii="Georgia" w:hAnsi="Georgia"/>
@@ -26837,7 +26841,7 @@
         <w:t>Se calibraron por máxima verosimilitud tres estructuras de cópulas sobre retornos diarios ALUA-USD vs. Merval-USD (n=2.328, dado que la serie EMBI+ local dispone de observaciones anuales): Gaussiana, Clayton C_θ(u,v)=(u^-θ+v^-θ-1)^-1/θ y t-Student, comparándolas mediante el Criterio de Información de Akaike (AIC). La Cópula de Clayton (θ = 1,09, λ_L = 2^-1/θ = 0,53, Figura [fig:31]) captura dependencia asimétrica en la cola inferior, pero es superada por la t-Student (\rho = 0,623, ν = 6,84, λ_L = λ_U = 0,2</w:t>
       </w:r>
       <w:r>
-        <w:t>15), que registra mayor bondad de ajuste relativo por AIC frente a Clayton (Δ AIC = +207,9) y frente a la Gaussiana (Δ AIC = +161,5). El resultado evidencia que la comovilidad entre el activo y el índice bursátil doméstico exhibe colas pesadas simétricas, donde ambos extremos (movimientos conjuntos de gran magnitud al alza o a la baja) muestran probabilidades equiparables, descartando una asimetría bajista predominante.</w:t>
+        <w:t>15), que registra mayor bondad de ajuste relativo por AIC frente a Clayton (Δ AIC = +207,9) y frente a la Gaussiana (Δ AIC = +161,5). Esto muestra que la comovilidad entre el activo y el índice bursátil doméstico exhibe colas pesadas simétricas, donde ambos extremos (movimientos conjuntos de gran magnitud al alza o a la baja) tienen probabilidades equiparables, descartando una asimetría bajista predominante.</w:t>
       </w:r>
     </w:p>
     <w:tbl>
@@ -26876,7 +26880,7 @@
                 <w:noProof/>
               </w:rPr>
               <w:drawing>
-                <wp:inline distT="0" distB="0" distL="0" distR="0" wp14:anchorId="6288C5A8" wp14:editId="3413A881">
+                <wp:inline distT="0" distB="0" distL="0" distR="0" wp14:anchorId="237CD5E0" wp14:editId="0725C746">
                   <wp:extent cx="2926080" cy="1723518"/>
                   <wp:effectExtent l="0" t="0" r="0" b="0"/>
                   <wp:docPr id="31" name="Picture 31"/>
@@ -27477,7 +27481,7 @@
         <w:pStyle w:val="Ttulo2"/>
         <w:spacing w:before="70" w:after="20"/>
       </w:pPr>
-      <w:bookmarkStart w:id="56" w:name="_Toc238660501"/>
+      <w:bookmarkStart w:id="56" w:name="_Toc238661220"/>
       <w:r>
         <w:rPr>
           <w:rFonts w:ascii="Georgia" w:hAnsi="Georgia"/>
@@ -28902,7 +28906,7 @@
         <w:pStyle w:val="Ttulo1"/>
         <w:spacing w:before="100" w:after="30"/>
       </w:pPr>
-      <w:bookmarkStart w:id="57" w:name="_Toc238660502"/>
+      <w:bookmarkStart w:id="57" w:name="_Toc238661221"/>
       <w:r>
         <w:rPr>
           <w:rFonts w:ascii="Georgia" w:hAnsi="Georgia"/>
@@ -29081,7 +29085,7 @@
         <w:pStyle w:val="Ttulo1"/>
         <w:spacing w:before="100" w:after="30"/>
       </w:pPr>
-      <w:bookmarkStart w:id="58" w:name="_Toc238660503"/>
+      <w:bookmarkStart w:id="58" w:name="_Toc238661222"/>
       <w:r>
         <w:rPr>
           <w:rFonts w:ascii="Georgia" w:hAnsi="Georgia"/>
@@ -38178,17 +38182,123 @@
         <w:pStyle w:val="Ttulo1"/>
         <w:spacing w:before="100" w:after="30"/>
       </w:pPr>
-      <w:bookmarkStart w:id="59" w:name="_Toc238660504"/>
+      <w:bookmarkStart w:id="59" w:name="_Toc238661223"/>
       <w:r>
         <w:rPr>
           <w:rFonts w:ascii="Georgia" w:hAnsi="Georgia"/>
           <w:color w:val="0D233A"/>
           <w:sz w:val="21"/>
         </w:rPr>
+        <w:t>Anexo de Fuentes y Metodología</w:t>
+      </w:r>
+      <w:bookmarkEnd w:id="59"/>
+    </w:p>
+    <w:p>
+      <w:pPr>
+        <w:spacing w:after="20" w:line="247" w:lineRule="auto"/>
+        <w:rPr>
+          <w:rFonts w:hint="eastAsia"/>
+        </w:rPr>
+      </w:pPr>
+      <w:r>
+        <w:rPr>
+          <w:b/>
+        </w:rPr>
+        <w:t xml:space="preserve"> Fuentes de Información y Fecha de Corte</w:t>
+      </w:r>
+      <w:r>
+        <w:t>\\[2pt]</w:t>
+      </w:r>
+    </w:p>
+    <w:p>
+      <w:pPr>
+        <w:spacing w:after="20" w:line="247" w:lineRule="auto"/>
+        <w:rPr>
+          <w:rFonts w:hint="eastAsia"/>
+        </w:rPr>
+      </w:pPr>
+      <w:r>
         <w:lastRenderedPageBreak/>
+        <w:t>Las estimaciones y proyecciones se basan únicamente en información pública: Estados Financieros Consolidados Auditados de Aluar (dictamen de Price Waterhouse &amp; Co. S.R.L., ejercicios cerrados al 30 de junio 2020–2025), Memorias Anuales, hechos relevantes publicados en CNV y BYMA, estadísticas del London Metal Exchange (LME), datos del BCRA y series de la Reserva Federal (FRED). Las variables de mercado (LME spot, EMBI+ Argentina, CCL implícito vía GGAL) corresponden al cierre del 23 de julio de 2026. No ref</w:t>
+      </w:r>
+      <w:r>
+        <w:t>lejan movimientos posteriores a esa fecha.</w:t>
+      </w:r>
+    </w:p>
+    <w:p>
+      <w:pPr>
+        <w:spacing w:after="20" w:line="247" w:lineRule="auto"/>
+        <w:rPr>
+          <w:rFonts w:hint="eastAsia"/>
+        </w:rPr>
+      </w:pPr>
+      <w:r>
+        <w:rPr>
+          <w:b/>
+        </w:rPr>
+        <w:t xml:space="preserve"> Metodología Cuantitativa y Supuestos Clave</w:t>
+      </w:r>
+      <w:r>
+        <w:t>\\[2pt]</w:t>
+      </w:r>
+    </w:p>
+    <w:p>
+      <w:pPr>
+        <w:spacing w:after="20" w:line="247" w:lineRule="auto"/>
+        <w:rPr>
+          <w:rFonts w:hint="eastAsia"/>
+        </w:rPr>
+      </w:pPr>
+      <w:r>
+        <w:t>El precio objetivo surge de un modelo de Flujo de Fondos Descontados (DCF) bajo la formulación de Dumrauf (Cap. 14) con WACC ajustado por riesgo país (λ=0,1617), Beta Hamada, crecimiento terminal g=2,0%, complementado con opción real de expansión de la Etapa V eólica (LSMC Longstaff-Schwartz), simulación Monte Carlo (20.000 iteraciones, innovaciones t-Student ν=4,2), EVT-GPD, GARCH(1,1), Filtro de Kalman, y selección de cópulas por AIC. Horizonte de inversión de referencia: 12 meses. Índice de referencia: S</w:t>
+      </w:r>
+      <w:r>
+        <w:t>&amp;P Merval (MERVAL). Escala de recomendación: COMPRAR (retorno esperado &gt;+15%), MANTENER (-15% a +15%), VENDER (&lt;-15%).</w:t>
+      </w:r>
+    </w:p>
+    <w:p>
+      <w:pPr>
+        <w:spacing w:after="20" w:line="247" w:lineRule="auto"/>
+        <w:rPr>
+          <w:rFonts w:hint="eastAsia"/>
+        </w:rPr>
+      </w:pPr>
+      <w:r>
+        <w:rPr>
+          <w:b/>
+        </w:rPr>
+        <w:t xml:space="preserve"> Vigencia y Próxima Revisión</w:t>
+      </w:r>
+      <w:r>
+        <w:t>\\[2pt]</w:t>
+      </w:r>
+    </w:p>
+    <w:p>
+      <w:pPr>
+        <w:spacing w:after="20" w:line="247" w:lineRule="auto"/>
+        <w:rPr>
+          <w:rFonts w:hint="eastAsia"/>
+        </w:rPr>
+      </w:pPr>
+      <w:r>
+        <w:t>Fecha de emisión: 23 de julio de 2026. Próxima revisión programada: 23 de octubre de 2026 (frecuencia trimestral) o ante evento material que modifique sustancialmente los supuestos de valuación (resultados trimestrales, cambios macroeconómicos significativos, anuncios corporativos relevantes).</w:t>
+      </w:r>
+    </w:p>
+    <w:p>
+      <w:pPr>
+        <w:pStyle w:val="Ttulo1"/>
+        <w:spacing w:before="100" w:after="30"/>
+      </w:pPr>
+      <w:bookmarkStart w:id="60" w:name="_Toc238661224"/>
+      <w:r>
+        <w:rPr>
+          <w:rFonts w:ascii="Georgia" w:hAnsi="Georgia"/>
+          <w:color w:val="0D233A"/>
+          <w:sz w:val="21"/>
+        </w:rPr>
         <w:t>Bibliografía y Referencias</w:t>
       </w:r>
-      <w:bookmarkEnd w:id="59"/>
+      <w:bookmarkEnd w:id="60"/>
     </w:p>
     <w:p>
       <w:pPr>
@@ -39405,31 +39515,31 @@
       </w:rPr>
     </w:lvl>
   </w:abstractNum>
-  <w:num w:numId="1" w16cid:durableId="992753426">
+  <w:num w:numId="1" w16cid:durableId="196695820">
     <w:abstractNumId w:val="8"/>
   </w:num>
-  <w:num w:numId="2" w16cid:durableId="430592838">
+  <w:num w:numId="2" w16cid:durableId="198863396">
     <w:abstractNumId w:val="6"/>
   </w:num>
-  <w:num w:numId="3" w16cid:durableId="833836376">
+  <w:num w:numId="3" w16cid:durableId="1533805790">
     <w:abstractNumId w:val="5"/>
   </w:num>
-  <w:num w:numId="4" w16cid:durableId="280889584">
+  <w:num w:numId="4" w16cid:durableId="205413312">
     <w:abstractNumId w:val="4"/>
   </w:num>
-  <w:num w:numId="5" w16cid:durableId="1584299719">
+  <w:num w:numId="5" w16cid:durableId="1410039261">
     <w:abstractNumId w:val="7"/>
   </w:num>
-  <w:num w:numId="6" w16cid:durableId="769161982">
+  <w:num w:numId="6" w16cid:durableId="2043943682">
     <w:abstractNumId w:val="3"/>
   </w:num>
-  <w:num w:numId="7" w16cid:durableId="1890649402">
+  <w:num w:numId="7" w16cid:durableId="989598233">
     <w:abstractNumId w:val="2"/>
   </w:num>
-  <w:num w:numId="8" w16cid:durableId="1566449272">
+  <w:num w:numId="8" w16cid:durableId="331682481">
     <w:abstractNumId w:val="1"/>
   </w:num>
-  <w:num w:numId="9" w16cid:durableId="643504391">
+  <w:num w:numId="9" w16cid:durableId="2036074008">
     <w:abstractNumId w:val="0"/>
   </w:num>
 </w:numbering>
@@ -50861,7 +50971,7 @@
     <w:autoRedefine/>
     <w:uiPriority w:val="39"/>
     <w:unhideWhenUsed/>
-    <w:rsid w:val="003A4C74"/>
+    <w:rsid w:val="0019138D"/>
     <w:pPr>
       <w:spacing w:before="10" w:after="10" w:line="240" w:lineRule="auto"/>
     </w:pPr>
@@ -50876,7 +50986,7 @@
     <w:autoRedefine/>
     <w:uiPriority w:val="39"/>
     <w:unhideWhenUsed/>
-    <w:rsid w:val="003A4C74"/>
+    <w:rsid w:val="0019138D"/>
     <w:pPr>
       <w:spacing w:after="0" w:line="240" w:lineRule="auto"/>
       <w:ind w:left="170"/>
@@ -50890,7 +51000,7 @@
     <w:basedOn w:val="Fuentedeprrafopredeter"/>
     <w:uiPriority w:val="99"/>
     <w:unhideWhenUsed/>
-    <w:rsid w:val="003A4C74"/>
+    <w:rsid w:val="0019138D"/>
     <w:rPr>
       <w:color w:val="0000FF" w:themeColor="hyperlink"/>
       <w:u w:val="single"/>

</xml_diff>

<commit_message>
Simplificar declaración de tenencia de acciones
</commit_message>
<xml_diff>
--- a/01_Reporte_PDF/Informe_Valuacion_Aluar_UNCuyo.docx
+++ b/01_Reporte_PDF/Informe_Valuacion_Aluar_UNCuyo.docx
@@ -1340,7 +1340,7 @@
         </w:rPr>
         <w:fldChar w:fldCharType="separate"/>
       </w:r>
-      <w:hyperlink w:anchor="_Toc238661164" w:history="1">
+      <w:hyperlink w:anchor="_Toc238661264" w:history="1">
         <w:r>
           <w:rPr>
             <w:rStyle w:val="Hipervnculo"/>
@@ -1367,7 +1367,7 @@
             <w:noProof/>
             <w:webHidden/>
           </w:rPr>
-          <w:instrText xml:space="preserve"> PAGEREF _Toc238661164 \h </w:instrText>
+          <w:instrText xml:space="preserve"> PAGEREF _Toc238661264 \h </w:instrText>
         </w:r>
         <w:r>
           <w:rPr>
@@ -1414,7 +1414,7 @@
           <w14:ligatures w14:val="standardContextual"/>
         </w:rPr>
       </w:pPr>
-      <w:hyperlink w:anchor="_Toc238661165" w:history="1">
+      <w:hyperlink w:anchor="_Toc238661265" w:history="1">
         <w:r>
           <w:rPr>
             <w:rStyle w:val="Hipervnculo"/>
@@ -1441,7 +1441,7 @@
             <w:noProof/>
             <w:webHidden/>
           </w:rPr>
-          <w:instrText xml:space="preserve"> PAGEREF _Toc238661165 \h </w:instrText>
+          <w:instrText xml:space="preserve"> PAGEREF _Toc238661265 \h </w:instrText>
         </w:r>
         <w:r>
           <w:rPr>
@@ -1488,7 +1488,7 @@
           <w14:ligatures w14:val="standardContextual"/>
         </w:rPr>
       </w:pPr>
-      <w:hyperlink w:anchor="_Toc238661166" w:history="1">
+      <w:hyperlink w:anchor="_Toc238661266" w:history="1">
         <w:r>
           <w:rPr>
             <w:rStyle w:val="Hipervnculo"/>
@@ -1515,7 +1515,7 @@
             <w:noProof/>
             <w:webHidden/>
           </w:rPr>
-          <w:instrText xml:space="preserve"> PAGEREF _Toc238661166 \h </w:instrText>
+          <w:instrText xml:space="preserve"> PAGEREF _Toc238661266 \h </w:instrText>
         </w:r>
         <w:r>
           <w:rPr>
@@ -1562,7 +1562,7 @@
           <w14:ligatures w14:val="standardContextual"/>
         </w:rPr>
       </w:pPr>
-      <w:hyperlink w:anchor="_Toc238661167" w:history="1">
+      <w:hyperlink w:anchor="_Toc238661267" w:history="1">
         <w:r>
           <w:rPr>
             <w:rStyle w:val="Hipervnculo"/>
@@ -1589,7 +1589,7 @@
             <w:noProof/>
             <w:webHidden/>
           </w:rPr>
-          <w:instrText xml:space="preserve"> PAGEREF _Toc238661167 \h </w:instrText>
+          <w:instrText xml:space="preserve"> PAGEREF _Toc238661267 \h </w:instrText>
         </w:r>
         <w:r>
           <w:rPr>
@@ -1636,7 +1636,7 @@
           <w14:ligatures w14:val="standardContextual"/>
         </w:rPr>
       </w:pPr>
-      <w:hyperlink w:anchor="_Toc238661168" w:history="1">
+      <w:hyperlink w:anchor="_Toc238661268" w:history="1">
         <w:r>
           <w:rPr>
             <w:rStyle w:val="Hipervnculo"/>
@@ -1663,7 +1663,7 @@
             <w:noProof/>
             <w:webHidden/>
           </w:rPr>
-          <w:instrText xml:space="preserve"> PAGEREF _Toc238661168 \h </w:instrText>
+          <w:instrText xml:space="preserve"> PAGEREF _Toc238661268 \h </w:instrText>
         </w:r>
         <w:r>
           <w:rPr>
@@ -1710,7 +1710,7 @@
           <w14:ligatures w14:val="standardContextual"/>
         </w:rPr>
       </w:pPr>
-      <w:hyperlink w:anchor="_Toc238661169" w:history="1">
+      <w:hyperlink w:anchor="_Toc238661269" w:history="1">
         <w:r>
           <w:rPr>
             <w:rStyle w:val="Hipervnculo"/>
@@ -1737,7 +1737,7 @@
             <w:noProof/>
             <w:webHidden/>
           </w:rPr>
-          <w:instrText xml:space="preserve"> PAGEREF _Toc238661169 \h </w:instrText>
+          <w:instrText xml:space="preserve"> PAGEREF _Toc238661269 \h </w:instrText>
         </w:r>
         <w:r>
           <w:rPr>
@@ -1784,7 +1784,7 @@
           <w14:ligatures w14:val="standardContextual"/>
         </w:rPr>
       </w:pPr>
-      <w:hyperlink w:anchor="_Toc238661170" w:history="1">
+      <w:hyperlink w:anchor="_Toc238661270" w:history="1">
         <w:r>
           <w:rPr>
             <w:rStyle w:val="Hipervnculo"/>
@@ -1811,7 +1811,7 @@
             <w:noProof/>
             <w:webHidden/>
           </w:rPr>
-          <w:instrText xml:space="preserve"> PAGEREF _Toc238661170 \h </w:instrText>
+          <w:instrText xml:space="preserve"> PAGEREF _Toc238661270 \h </w:instrText>
         </w:r>
         <w:r>
           <w:rPr>
@@ -1858,7 +1858,7 @@
           <w14:ligatures w14:val="standardContextual"/>
         </w:rPr>
       </w:pPr>
-      <w:hyperlink w:anchor="_Toc238661171" w:history="1">
+      <w:hyperlink w:anchor="_Toc238661271" w:history="1">
         <w:r>
           <w:rPr>
             <w:rStyle w:val="Hipervnculo"/>
@@ -1885,7 +1885,7 @@
             <w:noProof/>
             <w:webHidden/>
           </w:rPr>
-          <w:instrText xml:space="preserve"> PAGEREF _Toc238661171 \h </w:instrText>
+          <w:instrText xml:space="preserve"> PAGEREF _Toc238661271 \h </w:instrText>
         </w:r>
         <w:r>
           <w:rPr>
@@ -1932,7 +1932,7 @@
           <w14:ligatures w14:val="standardContextual"/>
         </w:rPr>
       </w:pPr>
-      <w:hyperlink w:anchor="_Toc238661172" w:history="1">
+      <w:hyperlink w:anchor="_Toc238661272" w:history="1">
         <w:r>
           <w:rPr>
             <w:rStyle w:val="Hipervnculo"/>
@@ -1959,7 +1959,7 @@
             <w:noProof/>
             <w:webHidden/>
           </w:rPr>
-          <w:instrText xml:space="preserve"> PAGEREF _Toc238661172 \h </w:instrText>
+          <w:instrText xml:space="preserve"> PAGEREF _Toc238661272 \h </w:instrText>
         </w:r>
         <w:r>
           <w:rPr>
@@ -2006,7 +2006,7 @@
           <w14:ligatures w14:val="standardContextual"/>
         </w:rPr>
       </w:pPr>
-      <w:hyperlink w:anchor="_Toc238661173" w:history="1">
+      <w:hyperlink w:anchor="_Toc238661273" w:history="1">
         <w:r>
           <w:rPr>
             <w:rStyle w:val="Hipervnculo"/>
@@ -2033,7 +2033,7 @@
             <w:noProof/>
             <w:webHidden/>
           </w:rPr>
-          <w:instrText xml:space="preserve"> PAGEREF _Toc238661173 \h </w:instrText>
+          <w:instrText xml:space="preserve"> PAGEREF _Toc238661273 \h </w:instrText>
         </w:r>
         <w:r>
           <w:rPr>
@@ -2080,7 +2080,7 @@
           <w14:ligatures w14:val="standardContextual"/>
         </w:rPr>
       </w:pPr>
-      <w:hyperlink w:anchor="_Toc238661174" w:history="1">
+      <w:hyperlink w:anchor="_Toc238661274" w:history="1">
         <w:r>
           <w:rPr>
             <w:rStyle w:val="Hipervnculo"/>
@@ -2107,7 +2107,7 @@
             <w:noProof/>
             <w:webHidden/>
           </w:rPr>
-          <w:instrText xml:space="preserve"> PAGEREF _Toc238661174 \h </w:instrText>
+          <w:instrText xml:space="preserve"> PAGEREF _Toc238661274 \h </w:instrText>
         </w:r>
         <w:r>
           <w:rPr>
@@ -2154,7 +2154,7 @@
           <w14:ligatures w14:val="standardContextual"/>
         </w:rPr>
       </w:pPr>
-      <w:hyperlink w:anchor="_Toc238661175" w:history="1">
+      <w:hyperlink w:anchor="_Toc238661275" w:history="1">
         <w:r>
           <w:rPr>
             <w:rStyle w:val="Hipervnculo"/>
@@ -2181,7 +2181,7 @@
             <w:noProof/>
             <w:webHidden/>
           </w:rPr>
-          <w:instrText xml:space="preserve"> PAGEREF _Toc238661175 \h </w:instrText>
+          <w:instrText xml:space="preserve"> PAGEREF _Toc238661275 \h </w:instrText>
         </w:r>
         <w:r>
           <w:rPr>
@@ -2228,7 +2228,7 @@
           <w14:ligatures w14:val="standardContextual"/>
         </w:rPr>
       </w:pPr>
-      <w:hyperlink w:anchor="_Toc238661176" w:history="1">
+      <w:hyperlink w:anchor="_Toc238661276" w:history="1">
         <w:r>
           <w:rPr>
             <w:rStyle w:val="Hipervnculo"/>
@@ -2255,7 +2255,7 @@
             <w:noProof/>
             <w:webHidden/>
           </w:rPr>
-          <w:instrText xml:space="preserve"> PAGEREF _Toc238661176 \h </w:instrText>
+          <w:instrText xml:space="preserve"> PAGEREF _Toc238661276 \h </w:instrText>
         </w:r>
         <w:r>
           <w:rPr>
@@ -2302,7 +2302,7 @@
           <w14:ligatures w14:val="standardContextual"/>
         </w:rPr>
       </w:pPr>
-      <w:hyperlink w:anchor="_Toc238661177" w:history="1">
+      <w:hyperlink w:anchor="_Toc238661277" w:history="1">
         <w:r>
           <w:rPr>
             <w:rStyle w:val="Hipervnculo"/>
@@ -2329,7 +2329,7 @@
             <w:noProof/>
             <w:webHidden/>
           </w:rPr>
-          <w:instrText xml:space="preserve"> PAGEREF _Toc238661177 \h </w:instrText>
+          <w:instrText xml:space="preserve"> PAGEREF _Toc238661277 \h </w:instrText>
         </w:r>
         <w:r>
           <w:rPr>
@@ -2376,7 +2376,7 @@
           <w14:ligatures w14:val="standardContextual"/>
         </w:rPr>
       </w:pPr>
-      <w:hyperlink w:anchor="_Toc238661178" w:history="1">
+      <w:hyperlink w:anchor="_Toc238661278" w:history="1">
         <w:r>
           <w:rPr>
             <w:rStyle w:val="Hipervnculo"/>
@@ -2403,7 +2403,7 @@
             <w:noProof/>
             <w:webHidden/>
           </w:rPr>
-          <w:instrText xml:space="preserve"> PAGEREF _Toc238661178 \h </w:instrText>
+          <w:instrText xml:space="preserve"> PAGEREF _Toc238661278 \h </w:instrText>
         </w:r>
         <w:r>
           <w:rPr>
@@ -2450,7 +2450,7 @@
           <w14:ligatures w14:val="standardContextual"/>
         </w:rPr>
       </w:pPr>
-      <w:hyperlink w:anchor="_Toc238661179" w:history="1">
+      <w:hyperlink w:anchor="_Toc238661279" w:history="1">
         <w:r>
           <w:rPr>
             <w:rStyle w:val="Hipervnculo"/>
@@ -2477,7 +2477,7 @@
             <w:noProof/>
             <w:webHidden/>
           </w:rPr>
-          <w:instrText xml:space="preserve"> PAGEREF _Toc238661179 \h </w:instrText>
+          <w:instrText xml:space="preserve"> PAGEREF _Toc238661279 \h </w:instrText>
         </w:r>
         <w:r>
           <w:rPr>
@@ -2524,7 +2524,7 @@
           <w14:ligatures w14:val="standardContextual"/>
         </w:rPr>
       </w:pPr>
-      <w:hyperlink w:anchor="_Toc238661180" w:history="1">
+      <w:hyperlink w:anchor="_Toc238661280" w:history="1">
         <w:r>
           <w:rPr>
             <w:rStyle w:val="Hipervnculo"/>
@@ -2551,7 +2551,7 @@
             <w:noProof/>
             <w:webHidden/>
           </w:rPr>
-          <w:instrText xml:space="preserve"> PAGEREF _Toc238661180 \h </w:instrText>
+          <w:instrText xml:space="preserve"> PAGEREF _Toc238661280 \h </w:instrText>
         </w:r>
         <w:r>
           <w:rPr>
@@ -2598,7 +2598,7 @@
           <w14:ligatures w14:val="standardContextual"/>
         </w:rPr>
       </w:pPr>
-      <w:hyperlink w:anchor="_Toc238661181" w:history="1">
+      <w:hyperlink w:anchor="_Toc238661281" w:history="1">
         <w:r>
           <w:rPr>
             <w:rStyle w:val="Hipervnculo"/>
@@ -2625,7 +2625,7 @@
             <w:noProof/>
             <w:webHidden/>
           </w:rPr>
-          <w:instrText xml:space="preserve"> PAGEREF _Toc238661181 \h </w:instrText>
+          <w:instrText xml:space="preserve"> PAGEREF _Toc238661281 \h </w:instrText>
         </w:r>
         <w:r>
           <w:rPr>
@@ -2672,7 +2672,7 @@
           <w14:ligatures w14:val="standardContextual"/>
         </w:rPr>
       </w:pPr>
-      <w:hyperlink w:anchor="_Toc238661182" w:history="1">
+      <w:hyperlink w:anchor="_Toc238661282" w:history="1">
         <w:r>
           <w:rPr>
             <w:rStyle w:val="Hipervnculo"/>
@@ -2699,7 +2699,7 @@
             <w:noProof/>
             <w:webHidden/>
           </w:rPr>
-          <w:instrText xml:space="preserve"> PAGEREF _Toc238661182 \h </w:instrText>
+          <w:instrText xml:space="preserve"> PAGEREF _Toc238661282 \h </w:instrText>
         </w:r>
         <w:r>
           <w:rPr>
@@ -2746,7 +2746,7 @@
           <w14:ligatures w14:val="standardContextual"/>
         </w:rPr>
       </w:pPr>
-      <w:hyperlink w:anchor="_Toc238661183" w:history="1">
+      <w:hyperlink w:anchor="_Toc238661283" w:history="1">
         <w:r>
           <w:rPr>
             <w:rStyle w:val="Hipervnculo"/>
@@ -2773,7 +2773,7 @@
             <w:noProof/>
             <w:webHidden/>
           </w:rPr>
-          <w:instrText xml:space="preserve"> PAGEREF _Toc238661183 \h </w:instrText>
+          <w:instrText xml:space="preserve"> PAGEREF _Toc238661283 \h </w:instrText>
         </w:r>
         <w:r>
           <w:rPr>
@@ -2820,7 +2820,7 @@
           <w14:ligatures w14:val="standardContextual"/>
         </w:rPr>
       </w:pPr>
-      <w:hyperlink w:anchor="_Toc238661184" w:history="1">
+      <w:hyperlink w:anchor="_Toc238661284" w:history="1">
         <w:r>
           <w:rPr>
             <w:rStyle w:val="Hipervnculo"/>
@@ -2847,7 +2847,7 @@
             <w:noProof/>
             <w:webHidden/>
           </w:rPr>
-          <w:instrText xml:space="preserve"> PAGEREF _Toc238661184 \h </w:instrText>
+          <w:instrText xml:space="preserve"> PAGEREF _Toc238661284 \h </w:instrText>
         </w:r>
         <w:r>
           <w:rPr>
@@ -2894,7 +2894,7 @@
           <w14:ligatures w14:val="standardContextual"/>
         </w:rPr>
       </w:pPr>
-      <w:hyperlink w:anchor="_Toc238661185" w:history="1">
+      <w:hyperlink w:anchor="_Toc238661285" w:history="1">
         <w:r>
           <w:rPr>
             <w:rStyle w:val="Hipervnculo"/>
@@ -2921,7 +2921,7 @@
             <w:noProof/>
             <w:webHidden/>
           </w:rPr>
-          <w:instrText xml:space="preserve"> PAGEREF _Toc238661185 \h </w:instrText>
+          <w:instrText xml:space="preserve"> PAGEREF _Toc238661285 \h </w:instrText>
         </w:r>
         <w:r>
           <w:rPr>
@@ -2968,7 +2968,7 @@
           <w14:ligatures w14:val="standardContextual"/>
         </w:rPr>
       </w:pPr>
-      <w:hyperlink w:anchor="_Toc238661186" w:history="1">
+      <w:hyperlink w:anchor="_Toc238661286" w:history="1">
         <w:r>
           <w:rPr>
             <w:rStyle w:val="Hipervnculo"/>
@@ -2995,7 +2995,7 @@
             <w:noProof/>
             <w:webHidden/>
           </w:rPr>
-          <w:instrText xml:space="preserve"> PAGEREF _Toc238661186 \h </w:instrText>
+          <w:instrText xml:space="preserve"> PAGEREF _Toc238661286 \h </w:instrText>
         </w:r>
         <w:r>
           <w:rPr>
@@ -3042,7 +3042,7 @@
           <w14:ligatures w14:val="standardContextual"/>
         </w:rPr>
       </w:pPr>
-      <w:hyperlink w:anchor="_Toc238661187" w:history="1">
+      <w:hyperlink w:anchor="_Toc238661287" w:history="1">
         <w:r>
           <w:rPr>
             <w:rStyle w:val="Hipervnculo"/>
@@ -3099,7 +3099,7 @@
             <w:noProof/>
             <w:webHidden/>
           </w:rPr>
-          <w:instrText xml:space="preserve"> PAGEREF _Toc238661187 \h </w:instrText>
+          <w:instrText xml:space="preserve"> PAGEREF _Toc238661287 \h </w:instrText>
         </w:r>
         <w:r>
           <w:rPr>
@@ -3146,7 +3146,7 @@
           <w14:ligatures w14:val="standardContextual"/>
         </w:rPr>
       </w:pPr>
-      <w:hyperlink w:anchor="_Toc238661188" w:history="1">
+      <w:hyperlink w:anchor="_Toc238661288" w:history="1">
         <w:r>
           <w:rPr>
             <w:rStyle w:val="Hipervnculo"/>
@@ -3173,7 +3173,7 @@
             <w:noProof/>
             <w:webHidden/>
           </w:rPr>
-          <w:instrText xml:space="preserve"> PAGEREF _Toc238661188 \h </w:instrText>
+          <w:instrText xml:space="preserve"> PAGEREF _Toc238661288 \h </w:instrText>
         </w:r>
         <w:r>
           <w:rPr>
@@ -3220,7 +3220,7 @@
           <w14:ligatures w14:val="standardContextual"/>
         </w:rPr>
       </w:pPr>
-      <w:hyperlink w:anchor="_Toc238661189" w:history="1">
+      <w:hyperlink w:anchor="_Toc238661289" w:history="1">
         <w:r>
           <w:rPr>
             <w:rStyle w:val="Hipervnculo"/>
@@ -3247,7 +3247,7 @@
             <w:noProof/>
             <w:webHidden/>
           </w:rPr>
-          <w:instrText xml:space="preserve"> PAGEREF _Toc238661189 \h </w:instrText>
+          <w:instrText xml:space="preserve"> PAGEREF _Toc238661289 \h </w:instrText>
         </w:r>
         <w:r>
           <w:rPr>
@@ -3294,7 +3294,7 @@
           <w14:ligatures w14:val="standardContextual"/>
         </w:rPr>
       </w:pPr>
-      <w:hyperlink w:anchor="_Toc238661190" w:history="1">
+      <w:hyperlink w:anchor="_Toc238661290" w:history="1">
         <w:r>
           <w:rPr>
             <w:rStyle w:val="Hipervnculo"/>
@@ -3321,7 +3321,7 @@
             <w:noProof/>
             <w:webHidden/>
           </w:rPr>
-          <w:instrText xml:space="preserve"> PAGEREF _Toc238661190 \h </w:instrText>
+          <w:instrText xml:space="preserve"> PAGEREF _Toc238661290 \h </w:instrText>
         </w:r>
         <w:r>
           <w:rPr>
@@ -3368,7 +3368,7 @@
           <w14:ligatures w14:val="standardContextual"/>
         </w:rPr>
       </w:pPr>
-      <w:hyperlink w:anchor="_Toc238661191" w:history="1">
+      <w:hyperlink w:anchor="_Toc238661291" w:history="1">
         <w:r>
           <w:rPr>
             <w:rStyle w:val="Hipervnculo"/>
@@ -3395,7 +3395,7 @@
             <w:noProof/>
             <w:webHidden/>
           </w:rPr>
-          <w:instrText xml:space="preserve"> PAGEREF _Toc238661191 \h </w:instrText>
+          <w:instrText xml:space="preserve"> PAGEREF _Toc238661291 \h </w:instrText>
         </w:r>
         <w:r>
           <w:rPr>
@@ -3442,7 +3442,7 @@
           <w14:ligatures w14:val="standardContextual"/>
         </w:rPr>
       </w:pPr>
-      <w:hyperlink w:anchor="_Toc238661192" w:history="1">
+      <w:hyperlink w:anchor="_Toc238661292" w:history="1">
         <w:r>
           <w:rPr>
             <w:rStyle w:val="Hipervnculo"/>
@@ -3469,7 +3469,7 @@
             <w:noProof/>
             <w:webHidden/>
           </w:rPr>
-          <w:instrText xml:space="preserve"> PAGEREF _Toc238661192 \h </w:instrText>
+          <w:instrText xml:space="preserve"> PAGEREF _Toc238661292 \h </w:instrText>
         </w:r>
         <w:r>
           <w:rPr>
@@ -3516,7 +3516,7 @@
           <w14:ligatures w14:val="standardContextual"/>
         </w:rPr>
       </w:pPr>
-      <w:hyperlink w:anchor="_Toc238661193" w:history="1">
+      <w:hyperlink w:anchor="_Toc238661293" w:history="1">
         <w:r>
           <w:rPr>
             <w:rStyle w:val="Hipervnculo"/>
@@ -3543,7 +3543,7 @@
             <w:noProof/>
             <w:webHidden/>
           </w:rPr>
-          <w:instrText xml:space="preserve"> PAGEREF _Toc238661193 \h </w:instrText>
+          <w:instrText xml:space="preserve"> PAGEREF _Toc238661293 \h </w:instrText>
         </w:r>
         <w:r>
           <w:rPr>
@@ -3590,7 +3590,7 @@
           <w14:ligatures w14:val="standardContextual"/>
         </w:rPr>
       </w:pPr>
-      <w:hyperlink w:anchor="_Toc238661194" w:history="1">
+      <w:hyperlink w:anchor="_Toc238661294" w:history="1">
         <w:r>
           <w:rPr>
             <w:rStyle w:val="Hipervnculo"/>
@@ -3617,7 +3617,7 @@
             <w:noProof/>
             <w:webHidden/>
           </w:rPr>
-          <w:instrText xml:space="preserve"> PAGEREF _Toc238661194 \h </w:instrText>
+          <w:instrText xml:space="preserve"> PAGEREF _Toc238661294 \h </w:instrText>
         </w:r>
         <w:r>
           <w:rPr>
@@ -3664,7 +3664,7 @@
           <w14:ligatures w14:val="standardContextual"/>
         </w:rPr>
       </w:pPr>
-      <w:hyperlink w:anchor="_Toc238661195" w:history="1">
+      <w:hyperlink w:anchor="_Toc238661295" w:history="1">
         <w:r>
           <w:rPr>
             <w:rStyle w:val="Hipervnculo"/>
@@ -3691,7 +3691,7 @@
             <w:noProof/>
             <w:webHidden/>
           </w:rPr>
-          <w:instrText xml:space="preserve"> PAGEREF _Toc238661195 \h </w:instrText>
+          <w:instrText xml:space="preserve"> PAGEREF _Toc238661295 \h </w:instrText>
         </w:r>
         <w:r>
           <w:rPr>
@@ -3738,7 +3738,7 @@
           <w14:ligatures w14:val="standardContextual"/>
         </w:rPr>
       </w:pPr>
-      <w:hyperlink w:anchor="_Toc238661196" w:history="1">
+      <w:hyperlink w:anchor="_Toc238661296" w:history="1">
         <w:r>
           <w:rPr>
             <w:rStyle w:val="Hipervnculo"/>
@@ -3765,7 +3765,7 @@
             <w:noProof/>
             <w:webHidden/>
           </w:rPr>
-          <w:instrText xml:space="preserve"> PAGEREF _Toc238661196 \h </w:instrText>
+          <w:instrText xml:space="preserve"> PAGEREF _Toc238661296 \h </w:instrText>
         </w:r>
         <w:r>
           <w:rPr>
@@ -3812,7 +3812,7 @@
           <w14:ligatures w14:val="standardContextual"/>
         </w:rPr>
       </w:pPr>
-      <w:hyperlink w:anchor="_Toc238661197" w:history="1">
+      <w:hyperlink w:anchor="_Toc238661297" w:history="1">
         <w:r>
           <w:rPr>
             <w:rStyle w:val="Hipervnculo"/>
@@ -3839,7 +3839,7 @@
             <w:noProof/>
             <w:webHidden/>
           </w:rPr>
-          <w:instrText xml:space="preserve"> PAGEREF _Toc238661197 \h </w:instrText>
+          <w:instrText xml:space="preserve"> PAGEREF _Toc238661297 \h </w:instrText>
         </w:r>
         <w:r>
           <w:rPr>
@@ -3886,7 +3886,7 @@
           <w14:ligatures w14:val="standardContextual"/>
         </w:rPr>
       </w:pPr>
-      <w:hyperlink w:anchor="_Toc238661198" w:history="1">
+      <w:hyperlink w:anchor="_Toc238661298" w:history="1">
         <w:r>
           <w:rPr>
             <w:rStyle w:val="Hipervnculo"/>
@@ -3913,7 +3913,7 @@
             <w:noProof/>
             <w:webHidden/>
           </w:rPr>
-          <w:instrText xml:space="preserve"> PAGEREF _Toc238661198 \h </w:instrText>
+          <w:instrText xml:space="preserve"> PAGEREF _Toc238661298 \h </w:instrText>
         </w:r>
         <w:r>
           <w:rPr>
@@ -3960,7 +3960,7 @@
           <w14:ligatures w14:val="standardContextual"/>
         </w:rPr>
       </w:pPr>
-      <w:hyperlink w:anchor="_Toc238661199" w:history="1">
+      <w:hyperlink w:anchor="_Toc238661299" w:history="1">
         <w:r>
           <w:rPr>
             <w:rStyle w:val="Hipervnculo"/>
@@ -3987,7 +3987,7 @@
             <w:noProof/>
             <w:webHidden/>
           </w:rPr>
-          <w:instrText xml:space="preserve"> PAGEREF _Toc238661199 \h </w:instrText>
+          <w:instrText xml:space="preserve"> PAGEREF _Toc238661299 \h </w:instrText>
         </w:r>
         <w:r>
           <w:rPr>
@@ -4034,7 +4034,7 @@
           <w14:ligatures w14:val="standardContextual"/>
         </w:rPr>
       </w:pPr>
-      <w:hyperlink w:anchor="_Toc238661200" w:history="1">
+      <w:hyperlink w:anchor="_Toc238661300" w:history="1">
         <w:r>
           <w:rPr>
             <w:rStyle w:val="Hipervnculo"/>
@@ -4061,7 +4061,7 @@
             <w:noProof/>
             <w:webHidden/>
           </w:rPr>
-          <w:instrText xml:space="preserve"> PAGEREF _Toc238661200 \h </w:instrText>
+          <w:instrText xml:space="preserve"> PAGEREF _Toc238661300 \h </w:instrText>
         </w:r>
         <w:r>
           <w:rPr>
@@ -4108,7 +4108,7 @@
           <w14:ligatures w14:val="standardContextual"/>
         </w:rPr>
       </w:pPr>
-      <w:hyperlink w:anchor="_Toc238661201" w:history="1">
+      <w:hyperlink w:anchor="_Toc238661301" w:history="1">
         <w:r>
           <w:rPr>
             <w:rStyle w:val="Hipervnculo"/>
@@ -4135,7 +4135,7 @@
             <w:noProof/>
             <w:webHidden/>
           </w:rPr>
-          <w:instrText xml:space="preserve"> PAGEREF _Toc238661201 \h </w:instrText>
+          <w:instrText xml:space="preserve"> PAGEREF _Toc238661301 \h </w:instrText>
         </w:r>
         <w:r>
           <w:rPr>
@@ -4182,7 +4182,7 @@
           <w14:ligatures w14:val="standardContextual"/>
         </w:rPr>
       </w:pPr>
-      <w:hyperlink w:anchor="_Toc238661202" w:history="1">
+      <w:hyperlink w:anchor="_Toc238661302" w:history="1">
         <w:r>
           <w:rPr>
             <w:rStyle w:val="Hipervnculo"/>
@@ -4209,7 +4209,7 @@
             <w:noProof/>
             <w:webHidden/>
           </w:rPr>
-          <w:instrText xml:space="preserve"> PAGEREF _Toc238661202 \h </w:instrText>
+          <w:instrText xml:space="preserve"> PAGEREF _Toc238661302 \h </w:instrText>
         </w:r>
         <w:r>
           <w:rPr>
@@ -4256,7 +4256,7 @@
           <w14:ligatures w14:val="standardContextual"/>
         </w:rPr>
       </w:pPr>
-      <w:hyperlink w:anchor="_Toc238661203" w:history="1">
+      <w:hyperlink w:anchor="_Toc238661303" w:history="1">
         <w:r>
           <w:rPr>
             <w:rStyle w:val="Hipervnculo"/>
@@ -4283,7 +4283,7 @@
             <w:noProof/>
             <w:webHidden/>
           </w:rPr>
-          <w:instrText xml:space="preserve"> PAGEREF _Toc238661203 \h </w:instrText>
+          <w:instrText xml:space="preserve"> PAGEREF _Toc238661303 \h </w:instrText>
         </w:r>
         <w:r>
           <w:rPr>
@@ -4330,7 +4330,7 @@
           <w14:ligatures w14:val="standardContextual"/>
         </w:rPr>
       </w:pPr>
-      <w:hyperlink w:anchor="_Toc238661204" w:history="1">
+      <w:hyperlink w:anchor="_Toc238661304" w:history="1">
         <w:r>
           <w:rPr>
             <w:rStyle w:val="Hipervnculo"/>
@@ -4357,7 +4357,7 @@
             <w:noProof/>
             <w:webHidden/>
           </w:rPr>
-          <w:instrText xml:space="preserve"> PAGEREF _Toc238661204 \h </w:instrText>
+          <w:instrText xml:space="preserve"> PAGEREF _Toc238661304 \h </w:instrText>
         </w:r>
         <w:r>
           <w:rPr>
@@ -4404,7 +4404,7 @@
           <w14:ligatures w14:val="standardContextual"/>
         </w:rPr>
       </w:pPr>
-      <w:hyperlink w:anchor="_Toc238661205" w:history="1">
+      <w:hyperlink w:anchor="_Toc238661305" w:history="1">
         <w:r>
           <w:rPr>
             <w:rStyle w:val="Hipervnculo"/>
@@ -4431,7 +4431,7 @@
             <w:noProof/>
             <w:webHidden/>
           </w:rPr>
-          <w:instrText xml:space="preserve"> PAGEREF _Toc238661205 \h </w:instrText>
+          <w:instrText xml:space="preserve"> PAGEREF _Toc238661305 \h </w:instrText>
         </w:r>
         <w:r>
           <w:rPr>
@@ -4478,7 +4478,7 @@
           <w14:ligatures w14:val="standardContextual"/>
         </w:rPr>
       </w:pPr>
-      <w:hyperlink w:anchor="_Toc238661206" w:history="1">
+      <w:hyperlink w:anchor="_Toc238661306" w:history="1">
         <w:r>
           <w:rPr>
             <w:rStyle w:val="Hipervnculo"/>
@@ -4505,7 +4505,7 @@
             <w:noProof/>
             <w:webHidden/>
           </w:rPr>
-          <w:instrText xml:space="preserve"> PAGEREF _Toc238661206 \h </w:instrText>
+          <w:instrText xml:space="preserve"> PAGEREF _Toc238661306 \h </w:instrText>
         </w:r>
         <w:r>
           <w:rPr>
@@ -4552,7 +4552,7 @@
           <w14:ligatures w14:val="standardContextual"/>
         </w:rPr>
       </w:pPr>
-      <w:hyperlink w:anchor="_Toc238661207" w:history="1">
+      <w:hyperlink w:anchor="_Toc238661307" w:history="1">
         <w:r>
           <w:rPr>
             <w:rStyle w:val="Hipervnculo"/>
@@ -4579,7 +4579,7 @@
             <w:noProof/>
             <w:webHidden/>
           </w:rPr>
-          <w:instrText xml:space="preserve"> PAGEREF _Toc238661207 \h </w:instrText>
+          <w:instrText xml:space="preserve"> PAGEREF _Toc238661307 \h </w:instrText>
         </w:r>
         <w:r>
           <w:rPr>
@@ -4626,7 +4626,7 @@
           <w14:ligatures w14:val="standardContextual"/>
         </w:rPr>
       </w:pPr>
-      <w:hyperlink w:anchor="_Toc238661208" w:history="1">
+      <w:hyperlink w:anchor="_Toc238661308" w:history="1">
         <w:r>
           <w:rPr>
             <w:rStyle w:val="Hipervnculo"/>
@@ -4653,7 +4653,7 @@
             <w:noProof/>
             <w:webHidden/>
           </w:rPr>
-          <w:instrText xml:space="preserve"> PAGEREF _Toc238661208 \h </w:instrText>
+          <w:instrText xml:space="preserve"> PAGEREF _Toc238661308 \h </w:instrText>
         </w:r>
         <w:r>
           <w:rPr>
@@ -4700,7 +4700,7 @@
           <w14:ligatures w14:val="standardContextual"/>
         </w:rPr>
       </w:pPr>
-      <w:hyperlink w:anchor="_Toc238661209" w:history="1">
+      <w:hyperlink w:anchor="_Toc238661309" w:history="1">
         <w:r>
           <w:rPr>
             <w:rStyle w:val="Hipervnculo"/>
@@ -4727,7 +4727,7 @@
             <w:noProof/>
             <w:webHidden/>
           </w:rPr>
-          <w:instrText xml:space="preserve"> PAGEREF _Toc238661209 \h </w:instrText>
+          <w:instrText xml:space="preserve"> PAGEREF _Toc238661309 \h </w:instrText>
         </w:r>
         <w:r>
           <w:rPr>
@@ -4774,7 +4774,7 @@
           <w14:ligatures w14:val="standardContextual"/>
         </w:rPr>
       </w:pPr>
-      <w:hyperlink w:anchor="_Toc238661210" w:history="1">
+      <w:hyperlink w:anchor="_Toc238661310" w:history="1">
         <w:r>
           <w:rPr>
             <w:rStyle w:val="Hipervnculo"/>
@@ -4801,7 +4801,7 @@
             <w:noProof/>
             <w:webHidden/>
           </w:rPr>
-          <w:instrText xml:space="preserve"> PAGEREF _Toc238661210 \h </w:instrText>
+          <w:instrText xml:space="preserve"> PAGEREF _Toc238661310 \h </w:instrText>
         </w:r>
         <w:r>
           <w:rPr>
@@ -4848,7 +4848,7 @@
           <w14:ligatures w14:val="standardContextual"/>
         </w:rPr>
       </w:pPr>
-      <w:hyperlink w:anchor="_Toc238661211" w:history="1">
+      <w:hyperlink w:anchor="_Toc238661311" w:history="1">
         <w:r>
           <w:rPr>
             <w:rStyle w:val="Hipervnculo"/>
@@ -4875,7 +4875,7 @@
             <w:noProof/>
             <w:webHidden/>
           </w:rPr>
-          <w:instrText xml:space="preserve"> PAGEREF _Toc238661211 \h </w:instrText>
+          <w:instrText xml:space="preserve"> PAGEREF _Toc238661311 \h </w:instrText>
         </w:r>
         <w:r>
           <w:rPr>
@@ -4922,7 +4922,7 @@
           <w14:ligatures w14:val="standardContextual"/>
         </w:rPr>
       </w:pPr>
-      <w:hyperlink w:anchor="_Toc238661212" w:history="1">
+      <w:hyperlink w:anchor="_Toc238661312" w:history="1">
         <w:r>
           <w:rPr>
             <w:rStyle w:val="Hipervnculo"/>
@@ -4949,7 +4949,7 @@
             <w:noProof/>
             <w:webHidden/>
           </w:rPr>
-          <w:instrText xml:space="preserve"> PAGEREF _Toc238661212 \h </w:instrText>
+          <w:instrText xml:space="preserve"> PAGEREF _Toc238661312 \h </w:instrText>
         </w:r>
         <w:r>
           <w:rPr>
@@ -4996,7 +4996,7 @@
           <w14:ligatures w14:val="standardContextual"/>
         </w:rPr>
       </w:pPr>
-      <w:hyperlink w:anchor="_Toc238661213" w:history="1">
+      <w:hyperlink w:anchor="_Toc238661313" w:history="1">
         <w:r>
           <w:rPr>
             <w:rStyle w:val="Hipervnculo"/>
@@ -5023,7 +5023,7 @@
             <w:noProof/>
             <w:webHidden/>
           </w:rPr>
-          <w:instrText xml:space="preserve"> PAGEREF _Toc238661213 \h </w:instrText>
+          <w:instrText xml:space="preserve"> PAGEREF _Toc238661313 \h </w:instrText>
         </w:r>
         <w:r>
           <w:rPr>
@@ -5070,7 +5070,7 @@
           <w14:ligatures w14:val="standardContextual"/>
         </w:rPr>
       </w:pPr>
-      <w:hyperlink w:anchor="_Toc238661214" w:history="1">
+      <w:hyperlink w:anchor="_Toc238661314" w:history="1">
         <w:r>
           <w:rPr>
             <w:rStyle w:val="Hipervnculo"/>
@@ -5097,7 +5097,7 @@
             <w:noProof/>
             <w:webHidden/>
           </w:rPr>
-          <w:instrText xml:space="preserve"> PAGEREF _Toc238661214 \h </w:instrText>
+          <w:instrText xml:space="preserve"> PAGEREF _Toc238661314 \h </w:instrText>
         </w:r>
         <w:r>
           <w:rPr>
@@ -5144,7 +5144,7 @@
           <w14:ligatures w14:val="standardContextual"/>
         </w:rPr>
       </w:pPr>
-      <w:hyperlink w:anchor="_Toc238661215" w:history="1">
+      <w:hyperlink w:anchor="_Toc238661315" w:history="1">
         <w:r>
           <w:rPr>
             <w:rStyle w:val="Hipervnculo"/>
@@ -5171,7 +5171,7 @@
             <w:noProof/>
             <w:webHidden/>
           </w:rPr>
-          <w:instrText xml:space="preserve"> PAGEREF _Toc238661215 \h </w:instrText>
+          <w:instrText xml:space="preserve"> PAGEREF _Toc238661315 \h </w:instrText>
         </w:r>
         <w:r>
           <w:rPr>
@@ -5218,7 +5218,7 @@
           <w14:ligatures w14:val="standardContextual"/>
         </w:rPr>
       </w:pPr>
-      <w:hyperlink w:anchor="_Toc238661216" w:history="1">
+      <w:hyperlink w:anchor="_Toc238661316" w:history="1">
         <w:r>
           <w:rPr>
             <w:rStyle w:val="Hipervnculo"/>
@@ -5245,7 +5245,7 @@
             <w:noProof/>
             <w:webHidden/>
           </w:rPr>
-          <w:instrText xml:space="preserve"> PAGEREF _Toc238661216 \h </w:instrText>
+          <w:instrText xml:space="preserve"> PAGEREF _Toc238661316 \h </w:instrText>
         </w:r>
         <w:r>
           <w:rPr>
@@ -5292,7 +5292,7 @@
           <w14:ligatures w14:val="standardContextual"/>
         </w:rPr>
       </w:pPr>
-      <w:hyperlink w:anchor="_Toc238661217" w:history="1">
+      <w:hyperlink w:anchor="_Toc238661317" w:history="1">
         <w:r>
           <w:rPr>
             <w:rStyle w:val="Hipervnculo"/>
@@ -5319,7 +5319,7 @@
             <w:noProof/>
             <w:webHidden/>
           </w:rPr>
-          <w:instrText xml:space="preserve"> PAGEREF _Toc238661217 \h </w:instrText>
+          <w:instrText xml:space="preserve"> PAGEREF _Toc238661317 \h </w:instrText>
         </w:r>
         <w:r>
           <w:rPr>
@@ -5366,7 +5366,7 @@
           <w14:ligatures w14:val="standardContextual"/>
         </w:rPr>
       </w:pPr>
-      <w:hyperlink w:anchor="_Toc238661218" w:history="1">
+      <w:hyperlink w:anchor="_Toc238661318" w:history="1">
         <w:r>
           <w:rPr>
             <w:rStyle w:val="Hipervnculo"/>
@@ -5393,7 +5393,7 @@
             <w:noProof/>
             <w:webHidden/>
           </w:rPr>
-          <w:instrText xml:space="preserve"> PAGEREF _Toc238661218 \h </w:instrText>
+          <w:instrText xml:space="preserve"> PAGEREF _Toc238661318 \h </w:instrText>
         </w:r>
         <w:r>
           <w:rPr>
@@ -5440,7 +5440,7 @@
           <w14:ligatures w14:val="standardContextual"/>
         </w:rPr>
       </w:pPr>
-      <w:hyperlink w:anchor="_Toc238661219" w:history="1">
+      <w:hyperlink w:anchor="_Toc238661319" w:history="1">
         <w:r>
           <w:rPr>
             <w:rStyle w:val="Hipervnculo"/>
@@ -5467,7 +5467,7 @@
             <w:noProof/>
             <w:webHidden/>
           </w:rPr>
-          <w:instrText xml:space="preserve"> PAGEREF _Toc238661219 \h </w:instrText>
+          <w:instrText xml:space="preserve"> PAGEREF _Toc238661319 \h </w:instrText>
         </w:r>
         <w:r>
           <w:rPr>
@@ -5514,7 +5514,7 @@
           <w14:ligatures w14:val="standardContextual"/>
         </w:rPr>
       </w:pPr>
-      <w:hyperlink w:anchor="_Toc238661220" w:history="1">
+      <w:hyperlink w:anchor="_Toc238661320" w:history="1">
         <w:r>
           <w:rPr>
             <w:rStyle w:val="Hipervnculo"/>
@@ -5541,7 +5541,7 @@
             <w:noProof/>
             <w:webHidden/>
           </w:rPr>
-          <w:instrText xml:space="preserve"> PAGEREF _Toc238661220 \h </w:instrText>
+          <w:instrText xml:space="preserve"> PAGEREF _Toc238661320 \h </w:instrText>
         </w:r>
         <w:r>
           <w:rPr>
@@ -5588,7 +5588,7 @@
           <w14:ligatures w14:val="standardContextual"/>
         </w:rPr>
       </w:pPr>
-      <w:hyperlink w:anchor="_Toc238661221" w:history="1">
+      <w:hyperlink w:anchor="_Toc238661321" w:history="1">
         <w:r>
           <w:rPr>
             <w:rStyle w:val="Hipervnculo"/>
@@ -5615,7 +5615,7 @@
             <w:noProof/>
             <w:webHidden/>
           </w:rPr>
-          <w:instrText xml:space="preserve"> PAGEREF _Toc238661221 \h </w:instrText>
+          <w:instrText xml:space="preserve"> PAGEREF _Toc238661321 \h </w:instrText>
         </w:r>
         <w:r>
           <w:rPr>
@@ -5662,7 +5662,7 @@
           <w14:ligatures w14:val="standardContextual"/>
         </w:rPr>
       </w:pPr>
-      <w:hyperlink w:anchor="_Toc238661222" w:history="1">
+      <w:hyperlink w:anchor="_Toc238661322" w:history="1">
         <w:r>
           <w:rPr>
             <w:rStyle w:val="Hipervnculo"/>
@@ -5689,7 +5689,7 @@
             <w:noProof/>
             <w:webHidden/>
           </w:rPr>
-          <w:instrText xml:space="preserve"> PAGEREF _Toc238661222 \h </w:instrText>
+          <w:instrText xml:space="preserve"> PAGEREF _Toc238661322 \h </w:instrText>
         </w:r>
         <w:r>
           <w:rPr>
@@ -5736,7 +5736,7 @@
           <w14:ligatures w14:val="standardContextual"/>
         </w:rPr>
       </w:pPr>
-      <w:hyperlink w:anchor="_Toc238661223" w:history="1">
+      <w:hyperlink w:anchor="_Toc238661323" w:history="1">
         <w:r>
           <w:rPr>
             <w:rStyle w:val="Hipervnculo"/>
@@ -5763,7 +5763,7 @@
             <w:noProof/>
             <w:webHidden/>
           </w:rPr>
-          <w:instrText xml:space="preserve"> PAGEREF _Toc238661223 \h </w:instrText>
+          <w:instrText xml:space="preserve"> PAGEREF _Toc238661323 \h </w:instrText>
         </w:r>
         <w:r>
           <w:rPr>
@@ -5810,7 +5810,7 @@
           <w14:ligatures w14:val="standardContextual"/>
         </w:rPr>
       </w:pPr>
-      <w:hyperlink w:anchor="_Toc238661224" w:history="1">
+      <w:hyperlink w:anchor="_Toc238661324" w:history="1">
         <w:r>
           <w:rPr>
             <w:rStyle w:val="Hipervnculo"/>
@@ -5837,7 +5837,7 @@
             <w:noProof/>
             <w:webHidden/>
           </w:rPr>
-          <w:instrText xml:space="preserve"> PAGEREF _Toc238661224 \h </w:instrText>
+          <w:instrText xml:space="preserve"> PAGEREF _Toc238661324 \h </w:instrText>
         </w:r>
         <w:r>
           <w:rPr>
@@ -6812,7 +6812,7 @@
               <w:rPr>
                 <w:sz w:val="14"/>
               </w:rPr>
-              <w:t>\item No mantiene una posición directa en acciones de Aluar Aluminio Argentino S.A.I.C. No puede descartarse una exposición indirecta e inmaterial a través de fondos comunes de inversión u otros vehículos de terceros en los que el autor invierte, sobre cuya composición no tiene control ni conocimiento detallado. No mantiene opciones, derivados ni otra exposición directa a ALUA.BA.</w:t>
+              <w:t>\item No mantiene una posición directa en acciones de Aluar Aluminio Argentino S.A.I.C., ni opciones o derivados sobre ALUA.BA. Podría tener una exposición indirecta e inmaterial a través de fondos comunes de inversión, sobre cuya composición no tiene control ni conocimiento detallado.</w:t>
             </w:r>
           </w:p>
           <w:p>
@@ -6963,7 +6963,7 @@
         <w:pStyle w:val="Ttulo1"/>
         <w:spacing w:before="100" w:after="30"/>
       </w:pPr>
-      <w:bookmarkStart w:id="0" w:name="_Toc238661164"/>
+      <w:bookmarkStart w:id="0" w:name="_Toc238661264"/>
       <w:r>
         <w:rPr>
           <w:rFonts w:ascii="Georgia" w:hAnsi="Georgia"/>
@@ -6979,7 +6979,7 @@
         <w:pStyle w:val="Ttulo2"/>
         <w:spacing w:before="70" w:after="20"/>
       </w:pPr>
-      <w:bookmarkStart w:id="1" w:name="_Toc238661165"/>
+      <w:bookmarkStart w:id="1" w:name="_Toc238661265"/>
       <w:r>
         <w:rPr>
           <w:rFonts w:ascii="Georgia" w:hAnsi="Georgia"/>
@@ -7020,7 +7020,7 @@
         <w:pStyle w:val="Ttulo2"/>
         <w:spacing w:before="70" w:after="20"/>
       </w:pPr>
-      <w:bookmarkStart w:id="2" w:name="_Toc238661166"/>
+      <w:bookmarkStart w:id="2" w:name="_Toc238661266"/>
       <w:r>
         <w:rPr>
           <w:rFonts w:ascii="Georgia" w:hAnsi="Georgia"/>
@@ -7082,7 +7082,7 @@
               </w:rPr>
               <w:lastRenderedPageBreak/>
               <w:drawing>
-                <wp:inline distT="0" distB="0" distL="0" distR="0" wp14:anchorId="0A3A5D41" wp14:editId="7C182DA6">
+                <wp:inline distT="0" distB="0" distL="0" distR="0" wp14:anchorId="3650C716" wp14:editId="53F26631">
                   <wp:extent cx="2926080" cy="1524412"/>
                   <wp:effectExtent l="0" t="0" r="0" b="0"/>
                   <wp:docPr id="1" name="Picture 1"/>
@@ -7141,7 +7141,7 @@
                 <w:noProof/>
               </w:rPr>
               <w:drawing>
-                <wp:inline distT="0" distB="0" distL="0" distR="0" wp14:anchorId="469C2B7F" wp14:editId="703D7A14">
+                <wp:inline distT="0" distB="0" distL="0" distR="0" wp14:anchorId="15473F6B" wp14:editId="6958A8A3">
                   <wp:extent cx="2926080" cy="1437831"/>
                   <wp:effectExtent l="0" t="0" r="0" b="0"/>
                   <wp:docPr id="2" name="Picture 2"/>
@@ -7246,7 +7246,7 @@
         <w:pStyle w:val="Ttulo2"/>
         <w:spacing w:before="70" w:after="20"/>
       </w:pPr>
-      <w:bookmarkStart w:id="3" w:name="_Toc238661167"/>
+      <w:bookmarkStart w:id="3" w:name="_Toc238661267"/>
       <w:r>
         <w:rPr>
           <w:rFonts w:ascii="Georgia" w:hAnsi="Georgia"/>
@@ -7373,7 +7373,7 @@
         <w:pStyle w:val="Ttulo2"/>
         <w:spacing w:before="70" w:after="20"/>
       </w:pPr>
-      <w:bookmarkStart w:id="4" w:name="_Toc238661168"/>
+      <w:bookmarkStart w:id="4" w:name="_Toc238661268"/>
       <w:r>
         <w:rPr>
           <w:rFonts w:ascii="Georgia" w:hAnsi="Georgia"/>
@@ -7885,7 +7885,7 @@
         <w:pStyle w:val="Ttulo2"/>
         <w:spacing w:before="70" w:after="20"/>
       </w:pPr>
-      <w:bookmarkStart w:id="5" w:name="_Toc238661169"/>
+      <w:bookmarkStart w:id="5" w:name="_Toc238661269"/>
       <w:r>
         <w:rPr>
           <w:rFonts w:ascii="Georgia" w:hAnsi="Georgia"/>
@@ -8017,7 +8017,7 @@
         <w:pStyle w:val="Ttulo2"/>
         <w:spacing w:before="70" w:after="20"/>
       </w:pPr>
-      <w:bookmarkStart w:id="6" w:name="_Toc238661170"/>
+      <w:bookmarkStart w:id="6" w:name="_Toc238661270"/>
       <w:r>
         <w:rPr>
           <w:rFonts w:ascii="Georgia" w:hAnsi="Georgia"/>
@@ -9242,7 +9242,7 @@
         <w:pStyle w:val="Ttulo1"/>
         <w:spacing w:before="100" w:after="30"/>
       </w:pPr>
-      <w:bookmarkStart w:id="7" w:name="_Toc238661171"/>
+      <w:bookmarkStart w:id="7" w:name="_Toc238661271"/>
       <w:r>
         <w:rPr>
           <w:rFonts w:ascii="Georgia" w:hAnsi="Georgia"/>
@@ -9258,7 +9258,7 @@
         <w:pStyle w:val="Ttulo2"/>
         <w:spacing w:before="70" w:after="20"/>
       </w:pPr>
-      <w:bookmarkStart w:id="8" w:name="_Toc238661172"/>
+      <w:bookmarkStart w:id="8" w:name="_Toc238661272"/>
       <w:r>
         <w:rPr>
           <w:rFonts w:ascii="Georgia" w:hAnsi="Georgia"/>
@@ -9316,7 +9316,7 @@
                 <w:noProof/>
               </w:rPr>
               <w:drawing>
-                <wp:inline distT="0" distB="0" distL="0" distR="0" wp14:anchorId="01815465" wp14:editId="598F555F">
+                <wp:inline distT="0" distB="0" distL="0" distR="0" wp14:anchorId="094A5AF9" wp14:editId="0490A933">
                   <wp:extent cx="2926080" cy="1426594"/>
                   <wp:effectExtent l="0" t="0" r="0" b="0"/>
                   <wp:docPr id="3" name="Picture 3"/>
@@ -9375,7 +9375,7 @@
                 <w:noProof/>
               </w:rPr>
               <w:drawing>
-                <wp:inline distT="0" distB="0" distL="0" distR="0" wp14:anchorId="6ACAFD92" wp14:editId="086EAA1A">
+                <wp:inline distT="0" distB="0" distL="0" distR="0" wp14:anchorId="3CB7B97B" wp14:editId="6F53871C">
                   <wp:extent cx="2926080" cy="1494260"/>
                   <wp:effectExtent l="0" t="0" r="0" b="0"/>
                   <wp:docPr id="4" name="Picture 4"/>
@@ -9480,7 +9480,7 @@
         <w:pStyle w:val="Ttulo2"/>
         <w:spacing w:before="70" w:after="20"/>
       </w:pPr>
-      <w:bookmarkStart w:id="9" w:name="_Toc238661173"/>
+      <w:bookmarkStart w:id="9" w:name="_Toc238661273"/>
       <w:r>
         <w:rPr>
           <w:rFonts w:ascii="Georgia" w:hAnsi="Georgia"/>
@@ -9714,7 +9714,7 @@
         <w:pStyle w:val="Ttulo1"/>
         <w:spacing w:before="100" w:after="30"/>
       </w:pPr>
-      <w:bookmarkStart w:id="10" w:name="_Toc238661174"/>
+      <w:bookmarkStart w:id="10" w:name="_Toc238661274"/>
       <w:r>
         <w:rPr>
           <w:rFonts w:ascii="Georgia" w:hAnsi="Georgia"/>
@@ -9730,7 +9730,7 @@
         <w:pStyle w:val="Ttulo2"/>
         <w:spacing w:before="70" w:after="20"/>
       </w:pPr>
-      <w:bookmarkStart w:id="11" w:name="_Toc238661175"/>
+      <w:bookmarkStart w:id="11" w:name="_Toc238661275"/>
       <w:r>
         <w:rPr>
           <w:rFonts w:ascii="Georgia" w:hAnsi="Georgia"/>
@@ -9791,7 +9791,7 @@
                 <w:noProof/>
               </w:rPr>
               <w:drawing>
-                <wp:inline distT="0" distB="0" distL="0" distR="0" wp14:anchorId="188055D4" wp14:editId="0E696A34">
+                <wp:inline distT="0" distB="0" distL="0" distR="0" wp14:anchorId="72733ECC" wp14:editId="4A3CFB3D">
                   <wp:extent cx="2926080" cy="1636252"/>
                   <wp:effectExtent l="0" t="0" r="0" b="0"/>
                   <wp:docPr id="5" name="Picture 5"/>
@@ -9850,7 +9850,7 @@
                 <w:noProof/>
               </w:rPr>
               <w:drawing>
-                <wp:inline distT="0" distB="0" distL="0" distR="0" wp14:anchorId="7D1C0B9A" wp14:editId="37F6146C">
+                <wp:inline distT="0" distB="0" distL="0" distR="0" wp14:anchorId="207F38FD" wp14:editId="4BBA15FB">
                   <wp:extent cx="2926080" cy="1481181"/>
                   <wp:effectExtent l="0" t="0" r="0" b="0"/>
                   <wp:docPr id="6" name="Picture 6"/>
@@ -9955,7 +9955,7 @@
         <w:pStyle w:val="Ttulo2"/>
         <w:spacing w:before="70" w:after="20"/>
       </w:pPr>
-      <w:bookmarkStart w:id="12" w:name="_Toc238661176"/>
+      <w:bookmarkStart w:id="12" w:name="_Toc238661276"/>
       <w:r>
         <w:rPr>
           <w:rFonts w:ascii="Georgia" w:hAnsi="Georgia"/>
@@ -9985,7 +9985,7 @@
         <w:pStyle w:val="Ttulo2"/>
         <w:spacing w:before="70" w:after="20"/>
       </w:pPr>
-      <w:bookmarkStart w:id="13" w:name="_Toc238661177"/>
+      <w:bookmarkStart w:id="13" w:name="_Toc238661277"/>
       <w:r>
         <w:rPr>
           <w:rFonts w:ascii="Georgia" w:hAnsi="Georgia"/>
@@ -10043,7 +10043,7 @@
                 <w:noProof/>
               </w:rPr>
               <w:drawing>
-                <wp:inline distT="0" distB="0" distL="0" distR="0" wp14:anchorId="767A4846" wp14:editId="4C33ABDA">
+                <wp:inline distT="0" distB="0" distL="0" distR="0" wp14:anchorId="3CEA1061" wp14:editId="7A833D0A">
                   <wp:extent cx="2926080" cy="1626307"/>
                   <wp:effectExtent l="0" t="0" r="0" b="0"/>
                   <wp:docPr id="7" name="Picture 7"/>
@@ -10102,7 +10102,7 @@
                 <w:noProof/>
               </w:rPr>
               <w:drawing>
-                <wp:inline distT="0" distB="0" distL="0" distR="0" wp14:anchorId="75549EF0" wp14:editId="4A6247BC">
+                <wp:inline distT="0" distB="0" distL="0" distR="0" wp14:anchorId="17C9A6BD" wp14:editId="2E0E6F1D">
                   <wp:extent cx="2926080" cy="1479479"/>
                   <wp:effectExtent l="0" t="0" r="0" b="0"/>
                   <wp:docPr id="8" name="Picture 8"/>
@@ -10207,7 +10207,7 @@
         <w:pStyle w:val="Ttulo2"/>
         <w:spacing w:before="70" w:after="20"/>
       </w:pPr>
-      <w:bookmarkStart w:id="14" w:name="_Toc238661178"/>
+      <w:bookmarkStart w:id="14" w:name="_Toc238661278"/>
       <w:r>
         <w:rPr>
           <w:rFonts w:ascii="Georgia" w:hAnsi="Georgia"/>
@@ -10265,7 +10265,7 @@
                 <w:noProof/>
               </w:rPr>
               <w:drawing>
-                <wp:inline distT="0" distB="0" distL="0" distR="0" wp14:anchorId="3766DC87" wp14:editId="0026E9BC">
+                <wp:inline distT="0" distB="0" distL="0" distR="0" wp14:anchorId="7AC965D3" wp14:editId="1B545BFF">
                   <wp:extent cx="2926080" cy="1662311"/>
                   <wp:effectExtent l="0" t="0" r="0" b="0"/>
                   <wp:docPr id="9" name="Picture 9"/>
@@ -10324,7 +10324,7 @@
                 <w:noProof/>
               </w:rPr>
               <w:drawing>
-                <wp:inline distT="0" distB="0" distL="0" distR="0" wp14:anchorId="6FE177BC" wp14:editId="37BB481B">
+                <wp:inline distT="0" distB="0" distL="0" distR="0" wp14:anchorId="0E5A015C" wp14:editId="2DF2D0FC">
                   <wp:extent cx="2926080" cy="1801004"/>
                   <wp:effectExtent l="0" t="0" r="0" b="0"/>
                   <wp:docPr id="10" name="Picture 10"/>
@@ -10429,7 +10429,7 @@
         <w:pStyle w:val="Ttulo1"/>
         <w:spacing w:before="100" w:after="30"/>
       </w:pPr>
-      <w:bookmarkStart w:id="15" w:name="_Toc238661179"/>
+      <w:bookmarkStart w:id="15" w:name="_Toc238661279"/>
       <w:r>
         <w:rPr>
           <w:rFonts w:ascii="Georgia" w:hAnsi="Georgia"/>
@@ -10445,7 +10445,7 @@
         <w:pStyle w:val="Ttulo2"/>
         <w:spacing w:before="70" w:after="20"/>
       </w:pPr>
-      <w:bookmarkStart w:id="16" w:name="_Toc238661180"/>
+      <w:bookmarkStart w:id="16" w:name="_Toc238661280"/>
       <w:r>
         <w:rPr>
           <w:rFonts w:ascii="Georgia" w:hAnsi="Georgia"/>
@@ -10884,7 +10884,7 @@
         <w:pStyle w:val="Ttulo2"/>
         <w:spacing w:before="70" w:after="20"/>
       </w:pPr>
-      <w:bookmarkStart w:id="17" w:name="_Toc238661181"/>
+      <w:bookmarkStart w:id="17" w:name="_Toc238661281"/>
       <w:r>
         <w:rPr>
           <w:rFonts w:ascii="Georgia" w:hAnsi="Georgia"/>
@@ -10912,7 +10912,7 @@
         <w:pStyle w:val="Ttulo1"/>
         <w:spacing w:before="100" w:after="30"/>
       </w:pPr>
-      <w:bookmarkStart w:id="18" w:name="_Toc238661182"/>
+      <w:bookmarkStart w:id="18" w:name="_Toc238661282"/>
       <w:r>
         <w:rPr>
           <w:rFonts w:ascii="Georgia" w:hAnsi="Georgia"/>
@@ -10928,7 +10928,7 @@
         <w:pStyle w:val="Ttulo2"/>
         <w:spacing w:before="70" w:after="20"/>
       </w:pPr>
-      <w:bookmarkStart w:id="19" w:name="_Toc238661183"/>
+      <w:bookmarkStart w:id="19" w:name="_Toc238661283"/>
       <w:r>
         <w:rPr>
           <w:rFonts w:ascii="Georgia" w:hAnsi="Georgia"/>
@@ -10955,7 +10955,7 @@
         <w:pStyle w:val="Ttulo2"/>
         <w:spacing w:before="70" w:after="20"/>
       </w:pPr>
-      <w:bookmarkStart w:id="20" w:name="_Toc238661184"/>
+      <w:bookmarkStart w:id="20" w:name="_Toc238661284"/>
       <w:r>
         <w:rPr>
           <w:rFonts w:ascii="Georgia" w:hAnsi="Georgia"/>
@@ -11013,7 +11013,7 @@
                 <w:noProof/>
               </w:rPr>
               <w:drawing>
-                <wp:inline distT="0" distB="0" distL="0" distR="0" wp14:anchorId="26CA0FBF" wp14:editId="30CAE75B">
+                <wp:inline distT="0" distB="0" distL="0" distR="0" wp14:anchorId="57480D9D" wp14:editId="023F377A">
                   <wp:extent cx="2926080" cy="1714660"/>
                   <wp:effectExtent l="0" t="0" r="0" b="0"/>
                   <wp:docPr id="11" name="Picture 11"/>
@@ -11072,7 +11072,7 @@
                 <w:noProof/>
               </w:rPr>
               <w:drawing>
-                <wp:inline distT="0" distB="0" distL="0" distR="0" wp14:anchorId="731A6725" wp14:editId="56F3F585">
+                <wp:inline distT="0" distB="0" distL="0" distR="0" wp14:anchorId="4E3FE4F6" wp14:editId="043FA091">
                   <wp:extent cx="2926080" cy="1558188"/>
                   <wp:effectExtent l="0" t="0" r="0" b="0"/>
                   <wp:docPr id="12" name="Picture 12"/>
@@ -12042,7 +12042,7 @@
         <w:pStyle w:val="Ttulo1"/>
         <w:spacing w:before="100" w:after="30"/>
       </w:pPr>
-      <w:bookmarkStart w:id="21" w:name="_Toc238661185"/>
+      <w:bookmarkStart w:id="21" w:name="_Toc238661285"/>
       <w:r>
         <w:rPr>
           <w:rFonts w:ascii="Georgia" w:hAnsi="Georgia"/>
@@ -12059,7 +12059,7 @@
         <w:pStyle w:val="Ttulo2"/>
         <w:spacing w:before="70" w:after="20"/>
       </w:pPr>
-      <w:bookmarkStart w:id="22" w:name="_Toc238661186"/>
+      <w:bookmarkStart w:id="22" w:name="_Toc238661286"/>
       <w:r>
         <w:rPr>
           <w:rFonts w:ascii="Georgia" w:hAnsi="Georgia"/>
@@ -12151,7 +12151,7 @@
         <w:pStyle w:val="Ttulo2"/>
         <w:spacing w:before="70" w:after="20"/>
       </w:pPr>
-      <w:bookmarkStart w:id="23" w:name="_Toc238661187"/>
+      <w:bookmarkStart w:id="23" w:name="_Toc238661287"/>
       <w:r>
         <w:rPr>
           <w:rFonts w:ascii="Georgia" w:hAnsi="Georgia"/>
@@ -12393,7 +12393,7 @@
                 <w:noProof/>
               </w:rPr>
               <w:drawing>
-                <wp:inline distT="0" distB="0" distL="0" distR="0" wp14:anchorId="681ECB8D" wp14:editId="0073D112">
+                <wp:inline distT="0" distB="0" distL="0" distR="0" wp14:anchorId="17FF9413" wp14:editId="42E055A0">
                   <wp:extent cx="2926080" cy="1540391"/>
                   <wp:effectExtent l="0" t="0" r="0" b="0"/>
                   <wp:docPr id="13" name="Picture 13"/>
@@ -12452,7 +12452,7 @@
                 <w:noProof/>
               </w:rPr>
               <w:drawing>
-                <wp:inline distT="0" distB="0" distL="0" distR="0" wp14:anchorId="762841C7" wp14:editId="01706FE0">
+                <wp:inline distT="0" distB="0" distL="0" distR="0" wp14:anchorId="3341A1DC" wp14:editId="77EB3A61">
                   <wp:extent cx="2926080" cy="1658038"/>
                   <wp:effectExtent l="0" t="0" r="0" b="0"/>
                   <wp:docPr id="14" name="Picture 14"/>
@@ -12557,7 +12557,7 @@
         <w:pStyle w:val="Ttulo2"/>
         <w:spacing w:before="70" w:after="20"/>
       </w:pPr>
-      <w:bookmarkStart w:id="24" w:name="_Toc238661188"/>
+      <w:bookmarkStart w:id="24" w:name="_Toc238661288"/>
       <w:r>
         <w:rPr>
           <w:rFonts w:ascii="Georgia" w:hAnsi="Georgia"/>
@@ -13487,7 +13487,7 @@
         <w:pStyle w:val="Ttulo1"/>
         <w:spacing w:before="100" w:after="30"/>
       </w:pPr>
-      <w:bookmarkStart w:id="25" w:name="_Toc238661189"/>
+      <w:bookmarkStart w:id="25" w:name="_Toc238661289"/>
       <w:r>
         <w:rPr>
           <w:rFonts w:ascii="Georgia" w:hAnsi="Georgia"/>
@@ -13503,7 +13503,7 @@
         <w:pStyle w:val="Ttulo2"/>
         <w:spacing w:before="70" w:after="20"/>
       </w:pPr>
-      <w:bookmarkStart w:id="26" w:name="_Toc238661190"/>
+      <w:bookmarkStart w:id="26" w:name="_Toc238661290"/>
       <w:r>
         <w:rPr>
           <w:rFonts w:ascii="Georgia" w:hAnsi="Georgia"/>
@@ -15100,7 +15100,7 @@
         <w:pStyle w:val="Ttulo2"/>
         <w:spacing w:before="70" w:after="20"/>
       </w:pPr>
-      <w:bookmarkStart w:id="27" w:name="_Toc238661191"/>
+      <w:bookmarkStart w:id="27" w:name="_Toc238661291"/>
       <w:r>
         <w:rPr>
           <w:rFonts w:ascii="Georgia" w:hAnsi="Georgia"/>
@@ -15210,7 +15210,7 @@
         <w:pStyle w:val="Ttulo1"/>
         <w:spacing w:before="100" w:after="30"/>
       </w:pPr>
-      <w:bookmarkStart w:id="28" w:name="_Toc238661192"/>
+      <w:bookmarkStart w:id="28" w:name="_Toc238661292"/>
       <w:r>
         <w:rPr>
           <w:rFonts w:ascii="Georgia" w:hAnsi="Georgia"/>
@@ -15227,7 +15227,7 @@
         <w:pStyle w:val="Ttulo2"/>
         <w:spacing w:before="70" w:after="20"/>
       </w:pPr>
-      <w:bookmarkStart w:id="29" w:name="_Toc238661193"/>
+      <w:bookmarkStart w:id="29" w:name="_Toc238661293"/>
       <w:r>
         <w:rPr>
           <w:rFonts w:ascii="Georgia" w:hAnsi="Georgia"/>
@@ -15254,7 +15254,7 @@
         <w:pStyle w:val="Ttulo2"/>
         <w:spacing w:before="70" w:after="20"/>
       </w:pPr>
-      <w:bookmarkStart w:id="30" w:name="_Toc238661194"/>
+      <w:bookmarkStart w:id="30" w:name="_Toc238661294"/>
       <w:r>
         <w:rPr>
           <w:rFonts w:ascii="Georgia" w:hAnsi="Georgia"/>
@@ -15312,7 +15312,7 @@
                 <w:noProof/>
               </w:rPr>
               <w:drawing>
-                <wp:inline distT="0" distB="0" distL="0" distR="0" wp14:anchorId="518097B3" wp14:editId="4D489820">
+                <wp:inline distT="0" distB="0" distL="0" distR="0" wp14:anchorId="162B83B1" wp14:editId="1E67D8DF">
                   <wp:extent cx="2926080" cy="1534596"/>
                   <wp:effectExtent l="0" t="0" r="0" b="0"/>
                   <wp:docPr id="15" name="Picture 15"/>
@@ -15371,7 +15371,7 @@
                 <w:noProof/>
               </w:rPr>
               <w:drawing>
-                <wp:inline distT="0" distB="0" distL="0" distR="0" wp14:anchorId="7500F0B8" wp14:editId="401FAEAA">
+                <wp:inline distT="0" distB="0" distL="0" distR="0" wp14:anchorId="10F7A600" wp14:editId="07A81051">
                   <wp:extent cx="2926080" cy="1680519"/>
                   <wp:effectExtent l="0" t="0" r="0" b="0"/>
                   <wp:docPr id="16" name="Picture 16"/>
@@ -15487,7 +15487,7 @@
         <w:pStyle w:val="Ttulo1"/>
         <w:spacing w:before="100" w:after="30"/>
       </w:pPr>
-      <w:bookmarkStart w:id="31" w:name="_Toc238661195"/>
+      <w:bookmarkStart w:id="31" w:name="_Toc238661295"/>
       <w:r>
         <w:rPr>
           <w:rFonts w:ascii="Georgia" w:hAnsi="Georgia"/>
@@ -15503,7 +15503,7 @@
         <w:pStyle w:val="Ttulo2"/>
         <w:spacing w:before="70" w:after="20"/>
       </w:pPr>
-      <w:bookmarkStart w:id="32" w:name="_Toc238661196"/>
+      <w:bookmarkStart w:id="32" w:name="_Toc238661296"/>
       <w:r>
         <w:rPr>
           <w:rFonts w:ascii="Georgia" w:hAnsi="Georgia"/>
@@ -16550,7 +16550,7 @@
         <w:pStyle w:val="Ttulo2"/>
         <w:spacing w:before="70" w:after="20"/>
       </w:pPr>
-      <w:bookmarkStart w:id="33" w:name="_Toc238661197"/>
+      <w:bookmarkStart w:id="33" w:name="_Toc238661297"/>
       <w:r>
         <w:rPr>
           <w:rFonts w:ascii="Georgia" w:hAnsi="Georgia"/>
@@ -16711,7 +16711,7 @@
         <w:pStyle w:val="Ttulo2"/>
         <w:spacing w:before="70" w:after="20"/>
       </w:pPr>
-      <w:bookmarkStart w:id="34" w:name="_Toc238661198"/>
+      <w:bookmarkStart w:id="34" w:name="_Toc238661298"/>
       <w:r>
         <w:rPr>
           <w:rFonts w:ascii="Georgia" w:hAnsi="Georgia"/>
@@ -16738,7 +16738,7 @@
         <w:pStyle w:val="Ttulo1"/>
         <w:spacing w:before="100" w:after="30"/>
       </w:pPr>
-      <w:bookmarkStart w:id="35" w:name="_Toc238661199"/>
+      <w:bookmarkStart w:id="35" w:name="_Toc238661299"/>
       <w:r>
         <w:rPr>
           <w:rFonts w:ascii="Georgia" w:hAnsi="Georgia"/>
@@ -16754,7 +16754,7 @@
         <w:pStyle w:val="Ttulo2"/>
         <w:spacing w:before="70" w:after="20"/>
       </w:pPr>
-      <w:bookmarkStart w:id="36" w:name="_Toc238661200"/>
+      <w:bookmarkStart w:id="36" w:name="_Toc238661300"/>
       <w:r>
         <w:rPr>
           <w:rFonts w:ascii="Georgia" w:hAnsi="Georgia"/>
@@ -19681,7 +19681,7 @@
         <w:pStyle w:val="Ttulo1"/>
         <w:spacing w:before="100" w:after="30"/>
       </w:pPr>
-      <w:bookmarkStart w:id="37" w:name="_Toc238661201"/>
+      <w:bookmarkStart w:id="37" w:name="_Toc238661301"/>
       <w:r>
         <w:rPr>
           <w:rFonts w:ascii="Georgia" w:hAnsi="Georgia"/>
@@ -19698,7 +19698,7 @@
         <w:pStyle w:val="Ttulo2"/>
         <w:spacing w:before="70" w:after="20"/>
       </w:pPr>
-      <w:bookmarkStart w:id="38" w:name="_Toc238661202"/>
+      <w:bookmarkStart w:id="38" w:name="_Toc238661302"/>
       <w:r>
         <w:rPr>
           <w:rFonts w:ascii="Georgia" w:hAnsi="Georgia"/>
@@ -19907,7 +19907,7 @@
         <w:pStyle w:val="Ttulo2"/>
         <w:spacing w:before="70" w:after="20"/>
       </w:pPr>
-      <w:bookmarkStart w:id="39" w:name="_Toc238661203"/>
+      <w:bookmarkStart w:id="39" w:name="_Toc238661303"/>
       <w:r>
         <w:rPr>
           <w:rFonts w:ascii="Georgia" w:hAnsi="Georgia"/>
@@ -19943,7 +19943,7 @@
           <w:noProof/>
         </w:rPr>
         <w:drawing>
-          <wp:inline distT="0" distB="0" distL="0" distR="0" wp14:anchorId="1A7C9849" wp14:editId="38EAEAE8">
+          <wp:inline distT="0" distB="0" distL="0" distR="0" wp14:anchorId="55869D62" wp14:editId="2850AE04">
             <wp:extent cx="4206240" cy="2338193"/>
             <wp:effectExtent l="0" t="0" r="0" b="0"/>
             <wp:docPr id="17" name="Picture 17"/>
@@ -20002,7 +20002,7 @@
         <w:pStyle w:val="Ttulo2"/>
         <w:spacing w:before="70" w:after="20"/>
       </w:pPr>
-      <w:bookmarkStart w:id="40" w:name="_Toc238661204"/>
+      <w:bookmarkStart w:id="40" w:name="_Toc238661304"/>
       <w:r>
         <w:rPr>
           <w:rFonts w:ascii="Georgia" w:hAnsi="Georgia"/>
@@ -20623,7 +20623,7 @@
         <w:pStyle w:val="Ttulo2"/>
         <w:spacing w:before="70" w:after="20"/>
       </w:pPr>
-      <w:bookmarkStart w:id="41" w:name="_Toc238661205"/>
+      <w:bookmarkStart w:id="41" w:name="_Toc238661305"/>
       <w:r>
         <w:rPr>
           <w:rFonts w:ascii="Georgia" w:hAnsi="Georgia"/>
@@ -20659,7 +20659,7 @@
           <w:noProof/>
         </w:rPr>
         <w:drawing>
-          <wp:inline distT="0" distB="0" distL="0" distR="0" wp14:anchorId="27429D93" wp14:editId="41A3DB55">
+          <wp:inline distT="0" distB="0" distL="0" distR="0" wp14:anchorId="3A309B22" wp14:editId="75BC2C5C">
             <wp:extent cx="4206240" cy="2471742"/>
             <wp:effectExtent l="0" t="0" r="0" b="0"/>
             <wp:docPr id="18" name="Picture 18"/>
@@ -21738,7 +21738,7 @@
         <w:pStyle w:val="Ttulo1"/>
         <w:spacing w:before="100" w:after="30"/>
       </w:pPr>
-      <w:bookmarkStart w:id="42" w:name="_Toc238661206"/>
+      <w:bookmarkStart w:id="42" w:name="_Toc238661306"/>
       <w:r>
         <w:rPr>
           <w:rFonts w:ascii="Georgia" w:hAnsi="Georgia"/>
@@ -21754,7 +21754,7 @@
         <w:pStyle w:val="Ttulo2"/>
         <w:spacing w:before="70" w:after="20"/>
       </w:pPr>
-      <w:bookmarkStart w:id="43" w:name="_Toc238661207"/>
+      <w:bookmarkStart w:id="43" w:name="_Toc238661307"/>
       <w:r>
         <w:rPr>
           <w:rFonts w:ascii="Georgia" w:hAnsi="Georgia"/>
@@ -21791,7 +21791,7 @@
         </w:rPr>
         <w:lastRenderedPageBreak/>
         <w:drawing>
-          <wp:inline distT="0" distB="0" distL="0" distR="0" wp14:anchorId="462217EE" wp14:editId="24FCED50">
+          <wp:inline distT="0" distB="0" distL="0" distR="0" wp14:anchorId="4EFEAA6D" wp14:editId="1ADCEBBF">
             <wp:extent cx="4206240" cy="2149342"/>
             <wp:effectExtent l="0" t="0" r="0" b="0"/>
             <wp:docPr id="19" name="Picture 19"/>
@@ -21850,7 +21850,7 @@
         <w:pStyle w:val="Ttulo1"/>
         <w:spacing w:before="100" w:after="30"/>
       </w:pPr>
-      <w:bookmarkStart w:id="44" w:name="_Toc238661208"/>
+      <w:bookmarkStart w:id="44" w:name="_Toc238661308"/>
       <w:r>
         <w:rPr>
           <w:rFonts w:ascii="Georgia" w:hAnsi="Georgia"/>
@@ -21866,7 +21866,7 @@
         <w:pStyle w:val="Ttulo2"/>
         <w:spacing w:before="70" w:after="20"/>
       </w:pPr>
-      <w:bookmarkStart w:id="45" w:name="_Toc238661209"/>
+      <w:bookmarkStart w:id="45" w:name="_Toc238661309"/>
       <w:r>
         <w:rPr>
           <w:rFonts w:ascii="Georgia" w:hAnsi="Georgia"/>
@@ -21921,7 +21921,7 @@
         <w:pStyle w:val="Ttulo2"/>
         <w:spacing w:before="70" w:after="20"/>
       </w:pPr>
-      <w:bookmarkStart w:id="46" w:name="_Toc238661210"/>
+      <w:bookmarkStart w:id="46" w:name="_Toc238661310"/>
       <w:r>
         <w:rPr>
           <w:rFonts w:ascii="Georgia" w:hAnsi="Georgia"/>
@@ -21979,7 +21979,7 @@
                 <w:noProof/>
               </w:rPr>
               <w:drawing>
-                <wp:inline distT="0" distB="0" distL="0" distR="0" wp14:anchorId="1628E677" wp14:editId="3A1E12E3">
+                <wp:inline distT="0" distB="0" distL="0" distR="0" wp14:anchorId="284CB131" wp14:editId="21365E20">
                   <wp:extent cx="2926080" cy="1682608"/>
                   <wp:effectExtent l="0" t="0" r="0" b="0"/>
                   <wp:docPr id="20" name="Picture 20"/>
@@ -22038,7 +22038,7 @@
                 <w:noProof/>
               </w:rPr>
               <w:drawing>
-                <wp:inline distT="0" distB="0" distL="0" distR="0" wp14:anchorId="2EC75606" wp14:editId="303BE991">
+                <wp:inline distT="0" distB="0" distL="0" distR="0" wp14:anchorId="3DC5A361" wp14:editId="62198B17">
                   <wp:extent cx="2926080" cy="1655981"/>
                   <wp:effectExtent l="0" t="0" r="0" b="0"/>
                   <wp:docPr id="21" name="Picture 21"/>
@@ -22143,7 +22143,7 @@
         <w:pStyle w:val="Ttulo1"/>
         <w:spacing w:before="100" w:after="30"/>
       </w:pPr>
-      <w:bookmarkStart w:id="47" w:name="_Toc238661211"/>
+      <w:bookmarkStart w:id="47" w:name="_Toc238661311"/>
       <w:r>
         <w:rPr>
           <w:rFonts w:ascii="Georgia" w:hAnsi="Georgia"/>
@@ -22159,7 +22159,7 @@
         <w:pStyle w:val="Ttulo2"/>
         <w:spacing w:before="70" w:after="20"/>
       </w:pPr>
-      <w:bookmarkStart w:id="48" w:name="_Toc238661212"/>
+      <w:bookmarkStart w:id="48" w:name="_Toc238661312"/>
       <w:r>
         <w:rPr>
           <w:rFonts w:ascii="Georgia" w:hAnsi="Georgia"/>
@@ -22195,7 +22195,7 @@
           <w:noProof/>
         </w:rPr>
         <w:drawing>
-          <wp:inline distT="0" distB="0" distL="0" distR="0" wp14:anchorId="057C1ACC" wp14:editId="051CC3A7">
+          <wp:inline distT="0" distB="0" distL="0" distR="0" wp14:anchorId="08F9DCCE" wp14:editId="74989071">
             <wp:extent cx="4206240" cy="2227773"/>
             <wp:effectExtent l="0" t="0" r="0" b="0"/>
             <wp:docPr id="22" name="Picture 22"/>
@@ -23783,7 +23783,7 @@
         <w:pStyle w:val="Ttulo1"/>
         <w:spacing w:before="100" w:after="30"/>
       </w:pPr>
-      <w:bookmarkStart w:id="49" w:name="_Toc238661213"/>
+      <w:bookmarkStart w:id="49" w:name="_Toc238661313"/>
       <w:r>
         <w:rPr>
           <w:rFonts w:ascii="Georgia" w:hAnsi="Georgia"/>
@@ -23800,7 +23800,7 @@
         <w:pStyle w:val="Ttulo2"/>
         <w:spacing w:before="70" w:after="20"/>
       </w:pPr>
-      <w:bookmarkStart w:id="50" w:name="_Toc238661214"/>
+      <w:bookmarkStart w:id="50" w:name="_Toc238661314"/>
       <w:r>
         <w:rPr>
           <w:rFonts w:ascii="Georgia" w:hAnsi="Georgia"/>
@@ -23895,7 +23895,7 @@
                 <w:noProof/>
               </w:rPr>
               <w:drawing>
-                <wp:inline distT="0" distB="0" distL="0" distR="0" wp14:anchorId="3B8A9258" wp14:editId="4E1D080B">
+                <wp:inline distT="0" distB="0" distL="0" distR="0" wp14:anchorId="1BEA3571" wp14:editId="0310E33B">
                   <wp:extent cx="2926080" cy="1695124"/>
                   <wp:effectExtent l="0" t="0" r="0" b="0"/>
                   <wp:docPr id="23" name="Picture 23"/>
@@ -23954,7 +23954,7 @@
                 <w:noProof/>
               </w:rPr>
               <w:drawing>
-                <wp:inline distT="0" distB="0" distL="0" distR="0" wp14:anchorId="4ACA722D" wp14:editId="538AFC91">
+                <wp:inline distT="0" distB="0" distL="0" distR="0" wp14:anchorId="39EA043C" wp14:editId="61B1354F">
                   <wp:extent cx="2926080" cy="1698212"/>
                   <wp:effectExtent l="0" t="0" r="0" b="0"/>
                   <wp:docPr id="24" name="Picture 24"/>
@@ -24059,7 +24059,7 @@
         <w:pStyle w:val="Ttulo2"/>
         <w:spacing w:before="70" w:after="20"/>
       </w:pPr>
-      <w:bookmarkStart w:id="51" w:name="_Toc238661215"/>
+      <w:bookmarkStart w:id="51" w:name="_Toc238661315"/>
       <w:r>
         <w:rPr>
           <w:rFonts w:ascii="Georgia" w:hAnsi="Georgia"/>
@@ -24145,7 +24145,7 @@
                 <w:noProof/>
               </w:rPr>
               <w:drawing>
-                <wp:inline distT="0" distB="0" distL="0" distR="0" wp14:anchorId="160826D0" wp14:editId="51C5AEC3">
+                <wp:inline distT="0" distB="0" distL="0" distR="0" wp14:anchorId="6656FB6D" wp14:editId="31F87BBC">
                   <wp:extent cx="2926080" cy="1696900"/>
                   <wp:effectExtent l="0" t="0" r="0" b="0"/>
                   <wp:docPr id="25" name="Picture 25"/>
@@ -24204,7 +24204,7 @@
                 <w:noProof/>
               </w:rPr>
               <w:drawing>
-                <wp:inline distT="0" distB="0" distL="0" distR="0" wp14:anchorId="27CE4755" wp14:editId="2F934F36">
+                <wp:inline distT="0" distB="0" distL="0" distR="0" wp14:anchorId="24AFADCB" wp14:editId="02AB1E11">
                   <wp:extent cx="2926080" cy="1654733"/>
                   <wp:effectExtent l="0" t="0" r="0" b="0"/>
                   <wp:docPr id="26" name="Picture 26"/>
@@ -25964,7 +25964,7 @@
         <w:pStyle w:val="Ttulo1"/>
         <w:spacing w:before="100" w:after="30"/>
       </w:pPr>
-      <w:bookmarkStart w:id="52" w:name="_Toc238661216"/>
+      <w:bookmarkStart w:id="52" w:name="_Toc238661316"/>
       <w:r>
         <w:rPr>
           <w:rFonts w:ascii="Georgia" w:hAnsi="Georgia"/>
@@ -25980,7 +25980,7 @@
         <w:pStyle w:val="Ttulo2"/>
         <w:spacing w:before="70" w:after="20"/>
       </w:pPr>
-      <w:bookmarkStart w:id="53" w:name="_Toc238661217"/>
+      <w:bookmarkStart w:id="53" w:name="_Toc238661317"/>
       <w:r>
         <w:rPr>
           <w:rFonts w:ascii="Georgia" w:hAnsi="Georgia"/>
@@ -26097,7 +26097,7 @@
                 <w:noProof/>
               </w:rPr>
               <w:drawing>
-                <wp:inline distT="0" distB="0" distL="0" distR="0" wp14:anchorId="4152A176" wp14:editId="1A08F35A">
+                <wp:inline distT="0" distB="0" distL="0" distR="0" wp14:anchorId="79AD1311" wp14:editId="7FC16969">
                   <wp:extent cx="2926080" cy="1614092"/>
                   <wp:effectExtent l="0" t="0" r="0" b="0"/>
                   <wp:docPr id="27" name="Picture 27"/>
@@ -26156,7 +26156,7 @@
                 <w:noProof/>
               </w:rPr>
               <w:drawing>
-                <wp:inline distT="0" distB="0" distL="0" distR="0" wp14:anchorId="646C821C" wp14:editId="31C851C7">
+                <wp:inline distT="0" distB="0" distL="0" distR="0" wp14:anchorId="39F5EA30" wp14:editId="2A2615D2">
                   <wp:extent cx="2926080" cy="1650045"/>
                   <wp:effectExtent l="0" t="0" r="0" b="0"/>
                   <wp:docPr id="28" name="Picture 28"/>
@@ -26569,7 +26569,7 @@
         <w:pStyle w:val="Ttulo2"/>
         <w:spacing w:before="70" w:after="20"/>
       </w:pPr>
-      <w:bookmarkStart w:id="54" w:name="_Toc238661218"/>
+      <w:bookmarkStart w:id="54" w:name="_Toc238661318"/>
       <w:r>
         <w:rPr>
           <w:rFonts w:ascii="Georgia" w:hAnsi="Georgia"/>
@@ -26655,7 +26655,7 @@
                 <w:noProof/>
               </w:rPr>
               <w:drawing>
-                <wp:inline distT="0" distB="0" distL="0" distR="0" wp14:anchorId="6CF5FE75" wp14:editId="342FAD11">
+                <wp:inline distT="0" distB="0" distL="0" distR="0" wp14:anchorId="121FDFBA" wp14:editId="6BD68C27">
                   <wp:extent cx="2926080" cy="1527796"/>
                   <wp:effectExtent l="0" t="0" r="0" b="0"/>
                   <wp:docPr id="29" name="Picture 29"/>
@@ -26714,7 +26714,7 @@
                 <w:noProof/>
               </w:rPr>
               <w:drawing>
-                <wp:inline distT="0" distB="0" distL="0" distR="0" wp14:anchorId="240F21A5" wp14:editId="738A80D1">
+                <wp:inline distT="0" distB="0" distL="0" distR="0" wp14:anchorId="20CBAD1B" wp14:editId="40BC9EE1">
                   <wp:extent cx="2926080" cy="1611196"/>
                   <wp:effectExtent l="0" t="0" r="0" b="0"/>
                   <wp:docPr id="30" name="Picture 30"/>
@@ -26819,7 +26819,7 @@
         <w:pStyle w:val="Ttulo2"/>
         <w:spacing w:before="70" w:after="20"/>
       </w:pPr>
-      <w:bookmarkStart w:id="55" w:name="_Toc238661219"/>
+      <w:bookmarkStart w:id="55" w:name="_Toc238661319"/>
       <w:r>
         <w:rPr>
           <w:rFonts w:ascii="Georgia" w:hAnsi="Georgia"/>
@@ -26880,7 +26880,7 @@
                 <w:noProof/>
               </w:rPr>
               <w:drawing>
-                <wp:inline distT="0" distB="0" distL="0" distR="0" wp14:anchorId="237CD5E0" wp14:editId="0725C746">
+                <wp:inline distT="0" distB="0" distL="0" distR="0" wp14:anchorId="1F27EED0" wp14:editId="5A016991">
                   <wp:extent cx="2926080" cy="1723518"/>
                   <wp:effectExtent l="0" t="0" r="0" b="0"/>
                   <wp:docPr id="31" name="Picture 31"/>
@@ -27481,7 +27481,7 @@
         <w:pStyle w:val="Ttulo2"/>
         <w:spacing w:before="70" w:after="20"/>
       </w:pPr>
-      <w:bookmarkStart w:id="56" w:name="_Toc238661220"/>
+      <w:bookmarkStart w:id="56" w:name="_Toc238661320"/>
       <w:r>
         <w:rPr>
           <w:rFonts w:ascii="Georgia" w:hAnsi="Georgia"/>
@@ -28906,7 +28906,7 @@
         <w:pStyle w:val="Ttulo1"/>
         <w:spacing w:before="100" w:after="30"/>
       </w:pPr>
-      <w:bookmarkStart w:id="57" w:name="_Toc238661221"/>
+      <w:bookmarkStart w:id="57" w:name="_Toc238661321"/>
       <w:r>
         <w:rPr>
           <w:rFonts w:ascii="Georgia" w:hAnsi="Georgia"/>
@@ -29085,7 +29085,7 @@
         <w:pStyle w:val="Ttulo1"/>
         <w:spacing w:before="100" w:after="30"/>
       </w:pPr>
-      <w:bookmarkStart w:id="58" w:name="_Toc238661222"/>
+      <w:bookmarkStart w:id="58" w:name="_Toc238661322"/>
       <w:r>
         <w:rPr>
           <w:rFonts w:ascii="Georgia" w:hAnsi="Georgia"/>
@@ -38182,7 +38182,7 @@
         <w:pStyle w:val="Ttulo1"/>
         <w:spacing w:before="100" w:after="30"/>
       </w:pPr>
-      <w:bookmarkStart w:id="59" w:name="_Toc238661223"/>
+      <w:bookmarkStart w:id="59" w:name="_Toc238661323"/>
       <w:r>
         <w:rPr>
           <w:rFonts w:ascii="Georgia" w:hAnsi="Georgia"/>
@@ -38289,7 +38289,7 @@
         <w:pStyle w:val="Ttulo1"/>
         <w:spacing w:before="100" w:after="30"/>
       </w:pPr>
-      <w:bookmarkStart w:id="60" w:name="_Toc238661224"/>
+      <w:bookmarkStart w:id="60" w:name="_Toc238661324"/>
       <w:r>
         <w:rPr>
           <w:rFonts w:ascii="Georgia" w:hAnsi="Georgia"/>
@@ -39515,31 +39515,31 @@
       </w:rPr>
     </w:lvl>
   </w:abstractNum>
-  <w:num w:numId="1" w16cid:durableId="196695820">
+  <w:num w:numId="1" w16cid:durableId="1453860416">
     <w:abstractNumId w:val="8"/>
   </w:num>
-  <w:num w:numId="2" w16cid:durableId="198863396">
+  <w:num w:numId="2" w16cid:durableId="7099426">
     <w:abstractNumId w:val="6"/>
   </w:num>
-  <w:num w:numId="3" w16cid:durableId="1533805790">
+  <w:num w:numId="3" w16cid:durableId="272203569">
     <w:abstractNumId w:val="5"/>
   </w:num>
-  <w:num w:numId="4" w16cid:durableId="205413312">
+  <w:num w:numId="4" w16cid:durableId="1426851719">
     <w:abstractNumId w:val="4"/>
   </w:num>
-  <w:num w:numId="5" w16cid:durableId="1410039261">
+  <w:num w:numId="5" w16cid:durableId="424107193">
     <w:abstractNumId w:val="7"/>
   </w:num>
-  <w:num w:numId="6" w16cid:durableId="2043943682">
+  <w:num w:numId="6" w16cid:durableId="2056000684">
     <w:abstractNumId w:val="3"/>
   </w:num>
-  <w:num w:numId="7" w16cid:durableId="989598233">
+  <w:num w:numId="7" w16cid:durableId="2000648586">
     <w:abstractNumId w:val="2"/>
   </w:num>
-  <w:num w:numId="8" w16cid:durableId="331682481">
+  <w:num w:numId="8" w16cid:durableId="634410264">
     <w:abstractNumId w:val="1"/>
   </w:num>
-  <w:num w:numId="9" w16cid:durableId="2036074008">
+  <w:num w:numId="9" w16cid:durableId="1315136601">
     <w:abstractNumId w:val="0"/>
   </w:num>
 </w:numbering>
@@ -50971,7 +50971,7 @@
     <w:autoRedefine/>
     <w:uiPriority w:val="39"/>
     <w:unhideWhenUsed/>
-    <w:rsid w:val="0019138D"/>
+    <w:rsid w:val="005A3A23"/>
     <w:pPr>
       <w:spacing w:before="10" w:after="10" w:line="240" w:lineRule="auto"/>
     </w:pPr>
@@ -50986,7 +50986,7 @@
     <w:autoRedefine/>
     <w:uiPriority w:val="39"/>
     <w:unhideWhenUsed/>
-    <w:rsid w:val="0019138D"/>
+    <w:rsid w:val="005A3A23"/>
     <w:pPr>
       <w:spacing w:after="0" w:line="240" w:lineRule="auto"/>
       <w:ind w:left="170"/>
@@ -51000,7 +51000,7 @@
     <w:basedOn w:val="Fuentedeprrafopredeter"/>
     <w:uiPriority w:val="99"/>
     <w:unhideWhenUsed/>
-    <w:rsid w:val="0019138D"/>
+    <w:rsid w:val="005A3A23"/>
     <w:rPr>
       <w:color w:val="0000FF" w:themeColor="hyperlink"/>
       <w:u w:val="single"/>

</xml_diff>

<commit_message>
Sacar prefijo FY del gráfico de EBITDA
</commit_message>
<xml_diff>
--- a/01_Reporte_PDF/Informe_Valuacion_Aluar_UNCuyo.docx
+++ b/01_Reporte_PDF/Informe_Valuacion_Aluar_UNCuyo.docx
@@ -1340,7 +1340,7 @@
         </w:rPr>
         <w:fldChar w:fldCharType="separate"/>
       </w:r>
-      <w:hyperlink w:anchor="_Toc238661264" w:history="1">
+      <w:hyperlink w:anchor="_Toc238661542" w:history="1">
         <w:r>
           <w:rPr>
             <w:rStyle w:val="Hipervnculo"/>
@@ -1367,7 +1367,7 @@
             <w:noProof/>
             <w:webHidden/>
           </w:rPr>
-          <w:instrText xml:space="preserve"> PAGEREF _Toc238661264 \h </w:instrText>
+          <w:instrText xml:space="preserve"> PAGEREF _Toc238661542 \h </w:instrText>
         </w:r>
         <w:r>
           <w:rPr>
@@ -1414,7 +1414,7 @@
           <w14:ligatures w14:val="standardContextual"/>
         </w:rPr>
       </w:pPr>
-      <w:hyperlink w:anchor="_Toc238661265" w:history="1">
+      <w:hyperlink w:anchor="_Toc238661543" w:history="1">
         <w:r>
           <w:rPr>
             <w:rStyle w:val="Hipervnculo"/>
@@ -1441,7 +1441,7 @@
             <w:noProof/>
             <w:webHidden/>
           </w:rPr>
-          <w:instrText xml:space="preserve"> PAGEREF _Toc238661265 \h </w:instrText>
+          <w:instrText xml:space="preserve"> PAGEREF _Toc238661543 \h </w:instrText>
         </w:r>
         <w:r>
           <w:rPr>
@@ -1488,7 +1488,7 @@
           <w14:ligatures w14:val="standardContextual"/>
         </w:rPr>
       </w:pPr>
-      <w:hyperlink w:anchor="_Toc238661266" w:history="1">
+      <w:hyperlink w:anchor="_Toc238661544" w:history="1">
         <w:r>
           <w:rPr>
             <w:rStyle w:val="Hipervnculo"/>
@@ -1515,7 +1515,7 @@
             <w:noProof/>
             <w:webHidden/>
           </w:rPr>
-          <w:instrText xml:space="preserve"> PAGEREF _Toc238661266 \h </w:instrText>
+          <w:instrText xml:space="preserve"> PAGEREF _Toc238661544 \h </w:instrText>
         </w:r>
         <w:r>
           <w:rPr>
@@ -1562,7 +1562,7 @@
           <w14:ligatures w14:val="standardContextual"/>
         </w:rPr>
       </w:pPr>
-      <w:hyperlink w:anchor="_Toc238661267" w:history="1">
+      <w:hyperlink w:anchor="_Toc238661545" w:history="1">
         <w:r>
           <w:rPr>
             <w:rStyle w:val="Hipervnculo"/>
@@ -1589,7 +1589,7 @@
             <w:noProof/>
             <w:webHidden/>
           </w:rPr>
-          <w:instrText xml:space="preserve"> PAGEREF _Toc238661267 \h </w:instrText>
+          <w:instrText xml:space="preserve"> PAGEREF _Toc238661545 \h </w:instrText>
         </w:r>
         <w:r>
           <w:rPr>
@@ -1636,7 +1636,7 @@
           <w14:ligatures w14:val="standardContextual"/>
         </w:rPr>
       </w:pPr>
-      <w:hyperlink w:anchor="_Toc238661268" w:history="1">
+      <w:hyperlink w:anchor="_Toc238661546" w:history="1">
         <w:r>
           <w:rPr>
             <w:rStyle w:val="Hipervnculo"/>
@@ -1663,7 +1663,7 @@
             <w:noProof/>
             <w:webHidden/>
           </w:rPr>
-          <w:instrText xml:space="preserve"> PAGEREF _Toc238661268 \h </w:instrText>
+          <w:instrText xml:space="preserve"> PAGEREF _Toc238661546 \h </w:instrText>
         </w:r>
         <w:r>
           <w:rPr>
@@ -1710,7 +1710,7 @@
           <w14:ligatures w14:val="standardContextual"/>
         </w:rPr>
       </w:pPr>
-      <w:hyperlink w:anchor="_Toc238661269" w:history="1">
+      <w:hyperlink w:anchor="_Toc238661547" w:history="1">
         <w:r>
           <w:rPr>
             <w:rStyle w:val="Hipervnculo"/>
@@ -1737,7 +1737,7 @@
             <w:noProof/>
             <w:webHidden/>
           </w:rPr>
-          <w:instrText xml:space="preserve"> PAGEREF _Toc238661269 \h </w:instrText>
+          <w:instrText xml:space="preserve"> PAGEREF _Toc238661547 \h </w:instrText>
         </w:r>
         <w:r>
           <w:rPr>
@@ -1784,7 +1784,7 @@
           <w14:ligatures w14:val="standardContextual"/>
         </w:rPr>
       </w:pPr>
-      <w:hyperlink w:anchor="_Toc238661270" w:history="1">
+      <w:hyperlink w:anchor="_Toc238661548" w:history="1">
         <w:r>
           <w:rPr>
             <w:rStyle w:val="Hipervnculo"/>
@@ -1811,7 +1811,7 @@
             <w:noProof/>
             <w:webHidden/>
           </w:rPr>
-          <w:instrText xml:space="preserve"> PAGEREF _Toc238661270 \h </w:instrText>
+          <w:instrText xml:space="preserve"> PAGEREF _Toc238661548 \h </w:instrText>
         </w:r>
         <w:r>
           <w:rPr>
@@ -1858,7 +1858,7 @@
           <w14:ligatures w14:val="standardContextual"/>
         </w:rPr>
       </w:pPr>
-      <w:hyperlink w:anchor="_Toc238661271" w:history="1">
+      <w:hyperlink w:anchor="_Toc238661549" w:history="1">
         <w:r>
           <w:rPr>
             <w:rStyle w:val="Hipervnculo"/>
@@ -1885,7 +1885,7 @@
             <w:noProof/>
             <w:webHidden/>
           </w:rPr>
-          <w:instrText xml:space="preserve"> PAGEREF _Toc238661271 \h </w:instrText>
+          <w:instrText xml:space="preserve"> PAGEREF _Toc238661549 \h </w:instrText>
         </w:r>
         <w:r>
           <w:rPr>
@@ -1932,7 +1932,7 @@
           <w14:ligatures w14:val="standardContextual"/>
         </w:rPr>
       </w:pPr>
-      <w:hyperlink w:anchor="_Toc238661272" w:history="1">
+      <w:hyperlink w:anchor="_Toc238661550" w:history="1">
         <w:r>
           <w:rPr>
             <w:rStyle w:val="Hipervnculo"/>
@@ -1959,7 +1959,7 @@
             <w:noProof/>
             <w:webHidden/>
           </w:rPr>
-          <w:instrText xml:space="preserve"> PAGEREF _Toc238661272 \h </w:instrText>
+          <w:instrText xml:space="preserve"> PAGEREF _Toc238661550 \h </w:instrText>
         </w:r>
         <w:r>
           <w:rPr>
@@ -2006,7 +2006,7 @@
           <w14:ligatures w14:val="standardContextual"/>
         </w:rPr>
       </w:pPr>
-      <w:hyperlink w:anchor="_Toc238661273" w:history="1">
+      <w:hyperlink w:anchor="_Toc238661551" w:history="1">
         <w:r>
           <w:rPr>
             <w:rStyle w:val="Hipervnculo"/>
@@ -2033,7 +2033,7 @@
             <w:noProof/>
             <w:webHidden/>
           </w:rPr>
-          <w:instrText xml:space="preserve"> PAGEREF _Toc238661273 \h </w:instrText>
+          <w:instrText xml:space="preserve"> PAGEREF _Toc238661551 \h </w:instrText>
         </w:r>
         <w:r>
           <w:rPr>
@@ -2080,7 +2080,7 @@
           <w14:ligatures w14:val="standardContextual"/>
         </w:rPr>
       </w:pPr>
-      <w:hyperlink w:anchor="_Toc238661274" w:history="1">
+      <w:hyperlink w:anchor="_Toc238661552" w:history="1">
         <w:r>
           <w:rPr>
             <w:rStyle w:val="Hipervnculo"/>
@@ -2107,7 +2107,7 @@
             <w:noProof/>
             <w:webHidden/>
           </w:rPr>
-          <w:instrText xml:space="preserve"> PAGEREF _Toc238661274 \h </w:instrText>
+          <w:instrText xml:space="preserve"> PAGEREF _Toc238661552 \h </w:instrText>
         </w:r>
         <w:r>
           <w:rPr>
@@ -2154,7 +2154,7 @@
           <w14:ligatures w14:val="standardContextual"/>
         </w:rPr>
       </w:pPr>
-      <w:hyperlink w:anchor="_Toc238661275" w:history="1">
+      <w:hyperlink w:anchor="_Toc238661553" w:history="1">
         <w:r>
           <w:rPr>
             <w:rStyle w:val="Hipervnculo"/>
@@ -2181,7 +2181,7 @@
             <w:noProof/>
             <w:webHidden/>
           </w:rPr>
-          <w:instrText xml:space="preserve"> PAGEREF _Toc238661275 \h </w:instrText>
+          <w:instrText xml:space="preserve"> PAGEREF _Toc238661553 \h </w:instrText>
         </w:r>
         <w:r>
           <w:rPr>
@@ -2228,7 +2228,7 @@
           <w14:ligatures w14:val="standardContextual"/>
         </w:rPr>
       </w:pPr>
-      <w:hyperlink w:anchor="_Toc238661276" w:history="1">
+      <w:hyperlink w:anchor="_Toc238661554" w:history="1">
         <w:r>
           <w:rPr>
             <w:rStyle w:val="Hipervnculo"/>
@@ -2255,7 +2255,7 @@
             <w:noProof/>
             <w:webHidden/>
           </w:rPr>
-          <w:instrText xml:space="preserve"> PAGEREF _Toc238661276 \h </w:instrText>
+          <w:instrText xml:space="preserve"> PAGEREF _Toc238661554 \h </w:instrText>
         </w:r>
         <w:r>
           <w:rPr>
@@ -2302,7 +2302,7 @@
           <w14:ligatures w14:val="standardContextual"/>
         </w:rPr>
       </w:pPr>
-      <w:hyperlink w:anchor="_Toc238661277" w:history="1">
+      <w:hyperlink w:anchor="_Toc238661555" w:history="1">
         <w:r>
           <w:rPr>
             <w:rStyle w:val="Hipervnculo"/>
@@ -2329,7 +2329,7 @@
             <w:noProof/>
             <w:webHidden/>
           </w:rPr>
-          <w:instrText xml:space="preserve"> PAGEREF _Toc238661277 \h </w:instrText>
+          <w:instrText xml:space="preserve"> PAGEREF _Toc238661555 \h </w:instrText>
         </w:r>
         <w:r>
           <w:rPr>
@@ -2376,7 +2376,7 @@
           <w14:ligatures w14:val="standardContextual"/>
         </w:rPr>
       </w:pPr>
-      <w:hyperlink w:anchor="_Toc238661278" w:history="1">
+      <w:hyperlink w:anchor="_Toc238661556" w:history="1">
         <w:r>
           <w:rPr>
             <w:rStyle w:val="Hipervnculo"/>
@@ -2403,7 +2403,7 @@
             <w:noProof/>
             <w:webHidden/>
           </w:rPr>
-          <w:instrText xml:space="preserve"> PAGEREF _Toc238661278 \h </w:instrText>
+          <w:instrText xml:space="preserve"> PAGEREF _Toc238661556 \h </w:instrText>
         </w:r>
         <w:r>
           <w:rPr>
@@ -2450,7 +2450,7 @@
           <w14:ligatures w14:val="standardContextual"/>
         </w:rPr>
       </w:pPr>
-      <w:hyperlink w:anchor="_Toc238661279" w:history="1">
+      <w:hyperlink w:anchor="_Toc238661557" w:history="1">
         <w:r>
           <w:rPr>
             <w:rStyle w:val="Hipervnculo"/>
@@ -2477,7 +2477,7 @@
             <w:noProof/>
             <w:webHidden/>
           </w:rPr>
-          <w:instrText xml:space="preserve"> PAGEREF _Toc238661279 \h </w:instrText>
+          <w:instrText xml:space="preserve"> PAGEREF _Toc238661557 \h </w:instrText>
         </w:r>
         <w:r>
           <w:rPr>
@@ -2524,7 +2524,7 @@
           <w14:ligatures w14:val="standardContextual"/>
         </w:rPr>
       </w:pPr>
-      <w:hyperlink w:anchor="_Toc238661280" w:history="1">
+      <w:hyperlink w:anchor="_Toc238661558" w:history="1">
         <w:r>
           <w:rPr>
             <w:rStyle w:val="Hipervnculo"/>
@@ -2551,7 +2551,7 @@
             <w:noProof/>
             <w:webHidden/>
           </w:rPr>
-          <w:instrText xml:space="preserve"> PAGEREF _Toc238661280 \h </w:instrText>
+          <w:instrText xml:space="preserve"> PAGEREF _Toc238661558 \h </w:instrText>
         </w:r>
         <w:r>
           <w:rPr>
@@ -2598,7 +2598,7 @@
           <w14:ligatures w14:val="standardContextual"/>
         </w:rPr>
       </w:pPr>
-      <w:hyperlink w:anchor="_Toc238661281" w:history="1">
+      <w:hyperlink w:anchor="_Toc238661559" w:history="1">
         <w:r>
           <w:rPr>
             <w:rStyle w:val="Hipervnculo"/>
@@ -2625,7 +2625,7 @@
             <w:noProof/>
             <w:webHidden/>
           </w:rPr>
-          <w:instrText xml:space="preserve"> PAGEREF _Toc238661281 \h </w:instrText>
+          <w:instrText xml:space="preserve"> PAGEREF _Toc238661559 \h </w:instrText>
         </w:r>
         <w:r>
           <w:rPr>
@@ -2672,7 +2672,7 @@
           <w14:ligatures w14:val="standardContextual"/>
         </w:rPr>
       </w:pPr>
-      <w:hyperlink w:anchor="_Toc238661282" w:history="1">
+      <w:hyperlink w:anchor="_Toc238661560" w:history="1">
         <w:r>
           <w:rPr>
             <w:rStyle w:val="Hipervnculo"/>
@@ -2699,7 +2699,7 @@
             <w:noProof/>
             <w:webHidden/>
           </w:rPr>
-          <w:instrText xml:space="preserve"> PAGEREF _Toc238661282 \h </w:instrText>
+          <w:instrText xml:space="preserve"> PAGEREF _Toc238661560 \h </w:instrText>
         </w:r>
         <w:r>
           <w:rPr>
@@ -2746,7 +2746,7 @@
           <w14:ligatures w14:val="standardContextual"/>
         </w:rPr>
       </w:pPr>
-      <w:hyperlink w:anchor="_Toc238661283" w:history="1">
+      <w:hyperlink w:anchor="_Toc238661561" w:history="1">
         <w:r>
           <w:rPr>
             <w:rStyle w:val="Hipervnculo"/>
@@ -2773,7 +2773,7 @@
             <w:noProof/>
             <w:webHidden/>
           </w:rPr>
-          <w:instrText xml:space="preserve"> PAGEREF _Toc238661283 \h </w:instrText>
+          <w:instrText xml:space="preserve"> PAGEREF _Toc238661561 \h </w:instrText>
         </w:r>
         <w:r>
           <w:rPr>
@@ -2820,7 +2820,7 @@
           <w14:ligatures w14:val="standardContextual"/>
         </w:rPr>
       </w:pPr>
-      <w:hyperlink w:anchor="_Toc238661284" w:history="1">
+      <w:hyperlink w:anchor="_Toc238661562" w:history="1">
         <w:r>
           <w:rPr>
             <w:rStyle w:val="Hipervnculo"/>
@@ -2847,7 +2847,7 @@
             <w:noProof/>
             <w:webHidden/>
           </w:rPr>
-          <w:instrText xml:space="preserve"> PAGEREF _Toc238661284 \h </w:instrText>
+          <w:instrText xml:space="preserve"> PAGEREF _Toc238661562 \h </w:instrText>
         </w:r>
         <w:r>
           <w:rPr>
@@ -2894,7 +2894,7 @@
           <w14:ligatures w14:val="standardContextual"/>
         </w:rPr>
       </w:pPr>
-      <w:hyperlink w:anchor="_Toc238661285" w:history="1">
+      <w:hyperlink w:anchor="_Toc238661563" w:history="1">
         <w:r>
           <w:rPr>
             <w:rStyle w:val="Hipervnculo"/>
@@ -2921,7 +2921,7 @@
             <w:noProof/>
             <w:webHidden/>
           </w:rPr>
-          <w:instrText xml:space="preserve"> PAGEREF _Toc238661285 \h </w:instrText>
+          <w:instrText xml:space="preserve"> PAGEREF _Toc238661563 \h </w:instrText>
         </w:r>
         <w:r>
           <w:rPr>
@@ -2968,7 +2968,7 @@
           <w14:ligatures w14:val="standardContextual"/>
         </w:rPr>
       </w:pPr>
-      <w:hyperlink w:anchor="_Toc238661286" w:history="1">
+      <w:hyperlink w:anchor="_Toc238661564" w:history="1">
         <w:r>
           <w:rPr>
             <w:rStyle w:val="Hipervnculo"/>
@@ -2995,7 +2995,7 @@
             <w:noProof/>
             <w:webHidden/>
           </w:rPr>
-          <w:instrText xml:space="preserve"> PAGEREF _Toc238661286 \h </w:instrText>
+          <w:instrText xml:space="preserve"> PAGEREF _Toc238661564 \h </w:instrText>
         </w:r>
         <w:r>
           <w:rPr>
@@ -3042,7 +3042,7 @@
           <w14:ligatures w14:val="standardContextual"/>
         </w:rPr>
       </w:pPr>
-      <w:hyperlink w:anchor="_Toc238661287" w:history="1">
+      <w:hyperlink w:anchor="_Toc238661565" w:history="1">
         <w:r>
           <w:rPr>
             <w:rStyle w:val="Hipervnculo"/>
@@ -3099,7 +3099,7 @@
             <w:noProof/>
             <w:webHidden/>
           </w:rPr>
-          <w:instrText xml:space="preserve"> PAGEREF _Toc238661287 \h </w:instrText>
+          <w:instrText xml:space="preserve"> PAGEREF _Toc238661565 \h </w:instrText>
         </w:r>
         <w:r>
           <w:rPr>
@@ -3146,7 +3146,7 @@
           <w14:ligatures w14:val="standardContextual"/>
         </w:rPr>
       </w:pPr>
-      <w:hyperlink w:anchor="_Toc238661288" w:history="1">
+      <w:hyperlink w:anchor="_Toc238661566" w:history="1">
         <w:r>
           <w:rPr>
             <w:rStyle w:val="Hipervnculo"/>
@@ -3173,7 +3173,7 @@
             <w:noProof/>
             <w:webHidden/>
           </w:rPr>
-          <w:instrText xml:space="preserve"> PAGEREF _Toc238661288 \h </w:instrText>
+          <w:instrText xml:space="preserve"> PAGEREF _Toc238661566 \h </w:instrText>
         </w:r>
         <w:r>
           <w:rPr>
@@ -3220,7 +3220,7 @@
           <w14:ligatures w14:val="standardContextual"/>
         </w:rPr>
       </w:pPr>
-      <w:hyperlink w:anchor="_Toc238661289" w:history="1">
+      <w:hyperlink w:anchor="_Toc238661567" w:history="1">
         <w:r>
           <w:rPr>
             <w:rStyle w:val="Hipervnculo"/>
@@ -3247,7 +3247,7 @@
             <w:noProof/>
             <w:webHidden/>
           </w:rPr>
-          <w:instrText xml:space="preserve"> PAGEREF _Toc238661289 \h </w:instrText>
+          <w:instrText xml:space="preserve"> PAGEREF _Toc238661567 \h </w:instrText>
         </w:r>
         <w:r>
           <w:rPr>
@@ -3294,7 +3294,7 @@
           <w14:ligatures w14:val="standardContextual"/>
         </w:rPr>
       </w:pPr>
-      <w:hyperlink w:anchor="_Toc238661290" w:history="1">
+      <w:hyperlink w:anchor="_Toc238661568" w:history="1">
         <w:r>
           <w:rPr>
             <w:rStyle w:val="Hipervnculo"/>
@@ -3321,7 +3321,7 @@
             <w:noProof/>
             <w:webHidden/>
           </w:rPr>
-          <w:instrText xml:space="preserve"> PAGEREF _Toc238661290 \h </w:instrText>
+          <w:instrText xml:space="preserve"> PAGEREF _Toc238661568 \h </w:instrText>
         </w:r>
         <w:r>
           <w:rPr>
@@ -3368,7 +3368,7 @@
           <w14:ligatures w14:val="standardContextual"/>
         </w:rPr>
       </w:pPr>
-      <w:hyperlink w:anchor="_Toc238661291" w:history="1">
+      <w:hyperlink w:anchor="_Toc238661569" w:history="1">
         <w:r>
           <w:rPr>
             <w:rStyle w:val="Hipervnculo"/>
@@ -3395,7 +3395,7 @@
             <w:noProof/>
             <w:webHidden/>
           </w:rPr>
-          <w:instrText xml:space="preserve"> PAGEREF _Toc238661291 \h </w:instrText>
+          <w:instrText xml:space="preserve"> PAGEREF _Toc238661569 \h </w:instrText>
         </w:r>
         <w:r>
           <w:rPr>
@@ -3442,7 +3442,7 @@
           <w14:ligatures w14:val="standardContextual"/>
         </w:rPr>
       </w:pPr>
-      <w:hyperlink w:anchor="_Toc238661292" w:history="1">
+      <w:hyperlink w:anchor="_Toc238661570" w:history="1">
         <w:r>
           <w:rPr>
             <w:rStyle w:val="Hipervnculo"/>
@@ -3469,7 +3469,7 @@
             <w:noProof/>
             <w:webHidden/>
           </w:rPr>
-          <w:instrText xml:space="preserve"> PAGEREF _Toc238661292 \h </w:instrText>
+          <w:instrText xml:space="preserve"> PAGEREF _Toc238661570 \h </w:instrText>
         </w:r>
         <w:r>
           <w:rPr>
@@ -3516,7 +3516,7 @@
           <w14:ligatures w14:val="standardContextual"/>
         </w:rPr>
       </w:pPr>
-      <w:hyperlink w:anchor="_Toc238661293" w:history="1">
+      <w:hyperlink w:anchor="_Toc238661571" w:history="1">
         <w:r>
           <w:rPr>
             <w:rStyle w:val="Hipervnculo"/>
@@ -3543,7 +3543,7 @@
             <w:noProof/>
             <w:webHidden/>
           </w:rPr>
-          <w:instrText xml:space="preserve"> PAGEREF _Toc238661293 \h </w:instrText>
+          <w:instrText xml:space="preserve"> PAGEREF _Toc238661571 \h </w:instrText>
         </w:r>
         <w:r>
           <w:rPr>
@@ -3590,7 +3590,7 @@
           <w14:ligatures w14:val="standardContextual"/>
         </w:rPr>
       </w:pPr>
-      <w:hyperlink w:anchor="_Toc238661294" w:history="1">
+      <w:hyperlink w:anchor="_Toc238661572" w:history="1">
         <w:r>
           <w:rPr>
             <w:rStyle w:val="Hipervnculo"/>
@@ -3617,7 +3617,7 @@
             <w:noProof/>
             <w:webHidden/>
           </w:rPr>
-          <w:instrText xml:space="preserve"> PAGEREF _Toc238661294 \h </w:instrText>
+          <w:instrText xml:space="preserve"> PAGEREF _Toc238661572 \h </w:instrText>
         </w:r>
         <w:r>
           <w:rPr>
@@ -3664,7 +3664,7 @@
           <w14:ligatures w14:val="standardContextual"/>
         </w:rPr>
       </w:pPr>
-      <w:hyperlink w:anchor="_Toc238661295" w:history="1">
+      <w:hyperlink w:anchor="_Toc238661573" w:history="1">
         <w:r>
           <w:rPr>
             <w:rStyle w:val="Hipervnculo"/>
@@ -3691,7 +3691,7 @@
             <w:noProof/>
             <w:webHidden/>
           </w:rPr>
-          <w:instrText xml:space="preserve"> PAGEREF _Toc238661295 \h </w:instrText>
+          <w:instrText xml:space="preserve"> PAGEREF _Toc238661573 \h </w:instrText>
         </w:r>
         <w:r>
           <w:rPr>
@@ -3738,7 +3738,7 @@
           <w14:ligatures w14:val="standardContextual"/>
         </w:rPr>
       </w:pPr>
-      <w:hyperlink w:anchor="_Toc238661296" w:history="1">
+      <w:hyperlink w:anchor="_Toc238661574" w:history="1">
         <w:r>
           <w:rPr>
             <w:rStyle w:val="Hipervnculo"/>
@@ -3765,7 +3765,7 @@
             <w:noProof/>
             <w:webHidden/>
           </w:rPr>
-          <w:instrText xml:space="preserve"> PAGEREF _Toc238661296 \h </w:instrText>
+          <w:instrText xml:space="preserve"> PAGEREF _Toc238661574 \h </w:instrText>
         </w:r>
         <w:r>
           <w:rPr>
@@ -3812,7 +3812,7 @@
           <w14:ligatures w14:val="standardContextual"/>
         </w:rPr>
       </w:pPr>
-      <w:hyperlink w:anchor="_Toc238661297" w:history="1">
+      <w:hyperlink w:anchor="_Toc238661575" w:history="1">
         <w:r>
           <w:rPr>
             <w:rStyle w:val="Hipervnculo"/>
@@ -3839,7 +3839,7 @@
             <w:noProof/>
             <w:webHidden/>
           </w:rPr>
-          <w:instrText xml:space="preserve"> PAGEREF _Toc238661297 \h </w:instrText>
+          <w:instrText xml:space="preserve"> PAGEREF _Toc238661575 \h </w:instrText>
         </w:r>
         <w:r>
           <w:rPr>
@@ -3886,7 +3886,7 @@
           <w14:ligatures w14:val="standardContextual"/>
         </w:rPr>
       </w:pPr>
-      <w:hyperlink w:anchor="_Toc238661298" w:history="1">
+      <w:hyperlink w:anchor="_Toc238661576" w:history="1">
         <w:r>
           <w:rPr>
             <w:rStyle w:val="Hipervnculo"/>
@@ -3913,7 +3913,7 @@
             <w:noProof/>
             <w:webHidden/>
           </w:rPr>
-          <w:instrText xml:space="preserve"> PAGEREF _Toc238661298 \h </w:instrText>
+          <w:instrText xml:space="preserve"> PAGEREF _Toc238661576 \h </w:instrText>
         </w:r>
         <w:r>
           <w:rPr>
@@ -3960,7 +3960,7 @@
           <w14:ligatures w14:val="standardContextual"/>
         </w:rPr>
       </w:pPr>
-      <w:hyperlink w:anchor="_Toc238661299" w:history="1">
+      <w:hyperlink w:anchor="_Toc238661577" w:history="1">
         <w:r>
           <w:rPr>
             <w:rStyle w:val="Hipervnculo"/>
@@ -3987,7 +3987,7 @@
             <w:noProof/>
             <w:webHidden/>
           </w:rPr>
-          <w:instrText xml:space="preserve"> PAGEREF _Toc238661299 \h </w:instrText>
+          <w:instrText xml:space="preserve"> PAGEREF _Toc238661577 \h </w:instrText>
         </w:r>
         <w:r>
           <w:rPr>
@@ -4034,7 +4034,7 @@
           <w14:ligatures w14:val="standardContextual"/>
         </w:rPr>
       </w:pPr>
-      <w:hyperlink w:anchor="_Toc238661300" w:history="1">
+      <w:hyperlink w:anchor="_Toc238661578" w:history="1">
         <w:r>
           <w:rPr>
             <w:rStyle w:val="Hipervnculo"/>
@@ -4061,7 +4061,7 @@
             <w:noProof/>
             <w:webHidden/>
           </w:rPr>
-          <w:instrText xml:space="preserve"> PAGEREF _Toc238661300 \h </w:instrText>
+          <w:instrText xml:space="preserve"> PAGEREF _Toc238661578 \h </w:instrText>
         </w:r>
         <w:r>
           <w:rPr>
@@ -4108,7 +4108,7 @@
           <w14:ligatures w14:val="standardContextual"/>
         </w:rPr>
       </w:pPr>
-      <w:hyperlink w:anchor="_Toc238661301" w:history="1">
+      <w:hyperlink w:anchor="_Toc238661579" w:history="1">
         <w:r>
           <w:rPr>
             <w:rStyle w:val="Hipervnculo"/>
@@ -4135,7 +4135,7 @@
             <w:noProof/>
             <w:webHidden/>
           </w:rPr>
-          <w:instrText xml:space="preserve"> PAGEREF _Toc238661301 \h </w:instrText>
+          <w:instrText xml:space="preserve"> PAGEREF _Toc238661579 \h </w:instrText>
         </w:r>
         <w:r>
           <w:rPr>
@@ -4182,7 +4182,7 @@
           <w14:ligatures w14:val="standardContextual"/>
         </w:rPr>
       </w:pPr>
-      <w:hyperlink w:anchor="_Toc238661302" w:history="1">
+      <w:hyperlink w:anchor="_Toc238661580" w:history="1">
         <w:r>
           <w:rPr>
             <w:rStyle w:val="Hipervnculo"/>
@@ -4209,7 +4209,7 @@
             <w:noProof/>
             <w:webHidden/>
           </w:rPr>
-          <w:instrText xml:space="preserve"> PAGEREF _Toc238661302 \h </w:instrText>
+          <w:instrText xml:space="preserve"> PAGEREF _Toc238661580 \h </w:instrText>
         </w:r>
         <w:r>
           <w:rPr>
@@ -4256,7 +4256,7 @@
           <w14:ligatures w14:val="standardContextual"/>
         </w:rPr>
       </w:pPr>
-      <w:hyperlink w:anchor="_Toc238661303" w:history="1">
+      <w:hyperlink w:anchor="_Toc238661581" w:history="1">
         <w:r>
           <w:rPr>
             <w:rStyle w:val="Hipervnculo"/>
@@ -4283,7 +4283,7 @@
             <w:noProof/>
             <w:webHidden/>
           </w:rPr>
-          <w:instrText xml:space="preserve"> PAGEREF _Toc238661303 \h </w:instrText>
+          <w:instrText xml:space="preserve"> PAGEREF _Toc238661581 \h </w:instrText>
         </w:r>
         <w:r>
           <w:rPr>
@@ -4330,7 +4330,7 @@
           <w14:ligatures w14:val="standardContextual"/>
         </w:rPr>
       </w:pPr>
-      <w:hyperlink w:anchor="_Toc238661304" w:history="1">
+      <w:hyperlink w:anchor="_Toc238661582" w:history="1">
         <w:r>
           <w:rPr>
             <w:rStyle w:val="Hipervnculo"/>
@@ -4357,7 +4357,7 @@
             <w:noProof/>
             <w:webHidden/>
           </w:rPr>
-          <w:instrText xml:space="preserve"> PAGEREF _Toc238661304 \h </w:instrText>
+          <w:instrText xml:space="preserve"> PAGEREF _Toc238661582 \h </w:instrText>
         </w:r>
         <w:r>
           <w:rPr>
@@ -4404,7 +4404,7 @@
           <w14:ligatures w14:val="standardContextual"/>
         </w:rPr>
       </w:pPr>
-      <w:hyperlink w:anchor="_Toc238661305" w:history="1">
+      <w:hyperlink w:anchor="_Toc238661583" w:history="1">
         <w:r>
           <w:rPr>
             <w:rStyle w:val="Hipervnculo"/>
@@ -4431,7 +4431,7 @@
             <w:noProof/>
             <w:webHidden/>
           </w:rPr>
-          <w:instrText xml:space="preserve"> PAGEREF _Toc238661305 \h </w:instrText>
+          <w:instrText xml:space="preserve"> PAGEREF _Toc238661583 \h </w:instrText>
         </w:r>
         <w:r>
           <w:rPr>
@@ -4478,7 +4478,7 @@
           <w14:ligatures w14:val="standardContextual"/>
         </w:rPr>
       </w:pPr>
-      <w:hyperlink w:anchor="_Toc238661306" w:history="1">
+      <w:hyperlink w:anchor="_Toc238661584" w:history="1">
         <w:r>
           <w:rPr>
             <w:rStyle w:val="Hipervnculo"/>
@@ -4505,7 +4505,7 @@
             <w:noProof/>
             <w:webHidden/>
           </w:rPr>
-          <w:instrText xml:space="preserve"> PAGEREF _Toc238661306 \h </w:instrText>
+          <w:instrText xml:space="preserve"> PAGEREF _Toc238661584 \h </w:instrText>
         </w:r>
         <w:r>
           <w:rPr>
@@ -4552,7 +4552,7 @@
           <w14:ligatures w14:val="standardContextual"/>
         </w:rPr>
       </w:pPr>
-      <w:hyperlink w:anchor="_Toc238661307" w:history="1">
+      <w:hyperlink w:anchor="_Toc238661585" w:history="1">
         <w:r>
           <w:rPr>
             <w:rStyle w:val="Hipervnculo"/>
@@ -4579,7 +4579,7 @@
             <w:noProof/>
             <w:webHidden/>
           </w:rPr>
-          <w:instrText xml:space="preserve"> PAGEREF _Toc238661307 \h </w:instrText>
+          <w:instrText xml:space="preserve"> PAGEREF _Toc238661585 \h </w:instrText>
         </w:r>
         <w:r>
           <w:rPr>
@@ -4626,7 +4626,7 @@
           <w14:ligatures w14:val="standardContextual"/>
         </w:rPr>
       </w:pPr>
-      <w:hyperlink w:anchor="_Toc238661308" w:history="1">
+      <w:hyperlink w:anchor="_Toc238661586" w:history="1">
         <w:r>
           <w:rPr>
             <w:rStyle w:val="Hipervnculo"/>
@@ -4653,7 +4653,7 @@
             <w:noProof/>
             <w:webHidden/>
           </w:rPr>
-          <w:instrText xml:space="preserve"> PAGEREF _Toc238661308 \h </w:instrText>
+          <w:instrText xml:space="preserve"> PAGEREF _Toc238661586 \h </w:instrText>
         </w:r>
         <w:r>
           <w:rPr>
@@ -4700,7 +4700,7 @@
           <w14:ligatures w14:val="standardContextual"/>
         </w:rPr>
       </w:pPr>
-      <w:hyperlink w:anchor="_Toc238661309" w:history="1">
+      <w:hyperlink w:anchor="_Toc238661587" w:history="1">
         <w:r>
           <w:rPr>
             <w:rStyle w:val="Hipervnculo"/>
@@ -4727,7 +4727,7 @@
             <w:noProof/>
             <w:webHidden/>
           </w:rPr>
-          <w:instrText xml:space="preserve"> PAGEREF _Toc238661309 \h </w:instrText>
+          <w:instrText xml:space="preserve"> PAGEREF _Toc238661587 \h </w:instrText>
         </w:r>
         <w:r>
           <w:rPr>
@@ -4774,7 +4774,7 @@
           <w14:ligatures w14:val="standardContextual"/>
         </w:rPr>
       </w:pPr>
-      <w:hyperlink w:anchor="_Toc238661310" w:history="1">
+      <w:hyperlink w:anchor="_Toc238661588" w:history="1">
         <w:r>
           <w:rPr>
             <w:rStyle w:val="Hipervnculo"/>
@@ -4801,7 +4801,7 @@
             <w:noProof/>
             <w:webHidden/>
           </w:rPr>
-          <w:instrText xml:space="preserve"> PAGEREF _Toc238661310 \h </w:instrText>
+          <w:instrText xml:space="preserve"> PAGEREF _Toc238661588 \h </w:instrText>
         </w:r>
         <w:r>
           <w:rPr>
@@ -4848,7 +4848,7 @@
           <w14:ligatures w14:val="standardContextual"/>
         </w:rPr>
       </w:pPr>
-      <w:hyperlink w:anchor="_Toc238661311" w:history="1">
+      <w:hyperlink w:anchor="_Toc238661589" w:history="1">
         <w:r>
           <w:rPr>
             <w:rStyle w:val="Hipervnculo"/>
@@ -4875,7 +4875,7 @@
             <w:noProof/>
             <w:webHidden/>
           </w:rPr>
-          <w:instrText xml:space="preserve"> PAGEREF _Toc238661311 \h </w:instrText>
+          <w:instrText xml:space="preserve"> PAGEREF _Toc238661589 \h </w:instrText>
         </w:r>
         <w:r>
           <w:rPr>
@@ -4922,7 +4922,7 @@
           <w14:ligatures w14:val="standardContextual"/>
         </w:rPr>
       </w:pPr>
-      <w:hyperlink w:anchor="_Toc238661312" w:history="1">
+      <w:hyperlink w:anchor="_Toc238661590" w:history="1">
         <w:r>
           <w:rPr>
             <w:rStyle w:val="Hipervnculo"/>
@@ -4949,7 +4949,7 @@
             <w:noProof/>
             <w:webHidden/>
           </w:rPr>
-          <w:instrText xml:space="preserve"> PAGEREF _Toc238661312 \h </w:instrText>
+          <w:instrText xml:space="preserve"> PAGEREF _Toc238661590 \h </w:instrText>
         </w:r>
         <w:r>
           <w:rPr>
@@ -4996,7 +4996,7 @@
           <w14:ligatures w14:val="standardContextual"/>
         </w:rPr>
       </w:pPr>
-      <w:hyperlink w:anchor="_Toc238661313" w:history="1">
+      <w:hyperlink w:anchor="_Toc238661591" w:history="1">
         <w:r>
           <w:rPr>
             <w:rStyle w:val="Hipervnculo"/>
@@ -5023,7 +5023,7 @@
             <w:noProof/>
             <w:webHidden/>
           </w:rPr>
-          <w:instrText xml:space="preserve"> PAGEREF _Toc238661313 \h </w:instrText>
+          <w:instrText xml:space="preserve"> PAGEREF _Toc238661591 \h </w:instrText>
         </w:r>
         <w:r>
           <w:rPr>
@@ -5070,7 +5070,7 @@
           <w14:ligatures w14:val="standardContextual"/>
         </w:rPr>
       </w:pPr>
-      <w:hyperlink w:anchor="_Toc238661314" w:history="1">
+      <w:hyperlink w:anchor="_Toc238661592" w:history="1">
         <w:r>
           <w:rPr>
             <w:rStyle w:val="Hipervnculo"/>
@@ -5097,7 +5097,7 @@
             <w:noProof/>
             <w:webHidden/>
           </w:rPr>
-          <w:instrText xml:space="preserve"> PAGEREF _Toc238661314 \h </w:instrText>
+          <w:instrText xml:space="preserve"> PAGEREF _Toc238661592 \h </w:instrText>
         </w:r>
         <w:r>
           <w:rPr>
@@ -5144,7 +5144,7 @@
           <w14:ligatures w14:val="standardContextual"/>
         </w:rPr>
       </w:pPr>
-      <w:hyperlink w:anchor="_Toc238661315" w:history="1">
+      <w:hyperlink w:anchor="_Toc238661593" w:history="1">
         <w:r>
           <w:rPr>
             <w:rStyle w:val="Hipervnculo"/>
@@ -5171,7 +5171,7 @@
             <w:noProof/>
             <w:webHidden/>
           </w:rPr>
-          <w:instrText xml:space="preserve"> PAGEREF _Toc238661315 \h </w:instrText>
+          <w:instrText xml:space="preserve"> PAGEREF _Toc238661593 \h </w:instrText>
         </w:r>
         <w:r>
           <w:rPr>
@@ -5218,7 +5218,7 @@
           <w14:ligatures w14:val="standardContextual"/>
         </w:rPr>
       </w:pPr>
-      <w:hyperlink w:anchor="_Toc238661316" w:history="1">
+      <w:hyperlink w:anchor="_Toc238661594" w:history="1">
         <w:r>
           <w:rPr>
             <w:rStyle w:val="Hipervnculo"/>
@@ -5245,7 +5245,7 @@
             <w:noProof/>
             <w:webHidden/>
           </w:rPr>
-          <w:instrText xml:space="preserve"> PAGEREF _Toc238661316 \h </w:instrText>
+          <w:instrText xml:space="preserve"> PAGEREF _Toc238661594 \h </w:instrText>
         </w:r>
         <w:r>
           <w:rPr>
@@ -5292,7 +5292,7 @@
           <w14:ligatures w14:val="standardContextual"/>
         </w:rPr>
       </w:pPr>
-      <w:hyperlink w:anchor="_Toc238661317" w:history="1">
+      <w:hyperlink w:anchor="_Toc238661595" w:history="1">
         <w:r>
           <w:rPr>
             <w:rStyle w:val="Hipervnculo"/>
@@ -5319,7 +5319,7 @@
             <w:noProof/>
             <w:webHidden/>
           </w:rPr>
-          <w:instrText xml:space="preserve"> PAGEREF _Toc238661317 \h </w:instrText>
+          <w:instrText xml:space="preserve"> PAGEREF _Toc238661595 \h </w:instrText>
         </w:r>
         <w:r>
           <w:rPr>
@@ -5366,7 +5366,7 @@
           <w14:ligatures w14:val="standardContextual"/>
         </w:rPr>
       </w:pPr>
-      <w:hyperlink w:anchor="_Toc238661318" w:history="1">
+      <w:hyperlink w:anchor="_Toc238661596" w:history="1">
         <w:r>
           <w:rPr>
             <w:rStyle w:val="Hipervnculo"/>
@@ -5393,7 +5393,7 @@
             <w:noProof/>
             <w:webHidden/>
           </w:rPr>
-          <w:instrText xml:space="preserve"> PAGEREF _Toc238661318 \h </w:instrText>
+          <w:instrText xml:space="preserve"> PAGEREF _Toc238661596 \h </w:instrText>
         </w:r>
         <w:r>
           <w:rPr>
@@ -5440,7 +5440,7 @@
           <w14:ligatures w14:val="standardContextual"/>
         </w:rPr>
       </w:pPr>
-      <w:hyperlink w:anchor="_Toc238661319" w:history="1">
+      <w:hyperlink w:anchor="_Toc238661597" w:history="1">
         <w:r>
           <w:rPr>
             <w:rStyle w:val="Hipervnculo"/>
@@ -5467,7 +5467,7 @@
             <w:noProof/>
             <w:webHidden/>
           </w:rPr>
-          <w:instrText xml:space="preserve"> PAGEREF _Toc238661319 \h </w:instrText>
+          <w:instrText xml:space="preserve"> PAGEREF _Toc238661597 \h </w:instrText>
         </w:r>
         <w:r>
           <w:rPr>
@@ -5514,7 +5514,7 @@
           <w14:ligatures w14:val="standardContextual"/>
         </w:rPr>
       </w:pPr>
-      <w:hyperlink w:anchor="_Toc238661320" w:history="1">
+      <w:hyperlink w:anchor="_Toc238661598" w:history="1">
         <w:r>
           <w:rPr>
             <w:rStyle w:val="Hipervnculo"/>
@@ -5541,7 +5541,7 @@
             <w:noProof/>
             <w:webHidden/>
           </w:rPr>
-          <w:instrText xml:space="preserve"> PAGEREF _Toc238661320 \h </w:instrText>
+          <w:instrText xml:space="preserve"> PAGEREF _Toc238661598 \h </w:instrText>
         </w:r>
         <w:r>
           <w:rPr>
@@ -5588,7 +5588,7 @@
           <w14:ligatures w14:val="standardContextual"/>
         </w:rPr>
       </w:pPr>
-      <w:hyperlink w:anchor="_Toc238661321" w:history="1">
+      <w:hyperlink w:anchor="_Toc238661599" w:history="1">
         <w:r>
           <w:rPr>
             <w:rStyle w:val="Hipervnculo"/>
@@ -5615,7 +5615,7 @@
             <w:noProof/>
             <w:webHidden/>
           </w:rPr>
-          <w:instrText xml:space="preserve"> PAGEREF _Toc238661321 \h </w:instrText>
+          <w:instrText xml:space="preserve"> PAGEREF _Toc238661599 \h </w:instrText>
         </w:r>
         <w:r>
           <w:rPr>
@@ -5662,7 +5662,7 @@
           <w14:ligatures w14:val="standardContextual"/>
         </w:rPr>
       </w:pPr>
-      <w:hyperlink w:anchor="_Toc238661322" w:history="1">
+      <w:hyperlink w:anchor="_Toc238661600" w:history="1">
         <w:r>
           <w:rPr>
             <w:rStyle w:val="Hipervnculo"/>
@@ -5689,7 +5689,7 @@
             <w:noProof/>
             <w:webHidden/>
           </w:rPr>
-          <w:instrText xml:space="preserve"> PAGEREF _Toc238661322 \h </w:instrText>
+          <w:instrText xml:space="preserve"> PAGEREF _Toc238661600 \h </w:instrText>
         </w:r>
         <w:r>
           <w:rPr>
@@ -5736,7 +5736,7 @@
           <w14:ligatures w14:val="standardContextual"/>
         </w:rPr>
       </w:pPr>
-      <w:hyperlink w:anchor="_Toc238661323" w:history="1">
+      <w:hyperlink w:anchor="_Toc238661601" w:history="1">
         <w:r>
           <w:rPr>
             <w:rStyle w:val="Hipervnculo"/>
@@ -5763,7 +5763,7 @@
             <w:noProof/>
             <w:webHidden/>
           </w:rPr>
-          <w:instrText xml:space="preserve"> PAGEREF _Toc238661323 \h </w:instrText>
+          <w:instrText xml:space="preserve"> PAGEREF _Toc238661601 \h </w:instrText>
         </w:r>
         <w:r>
           <w:rPr>
@@ -5810,7 +5810,7 @@
           <w14:ligatures w14:val="standardContextual"/>
         </w:rPr>
       </w:pPr>
-      <w:hyperlink w:anchor="_Toc238661324" w:history="1">
+      <w:hyperlink w:anchor="_Toc238661602" w:history="1">
         <w:r>
           <w:rPr>
             <w:rStyle w:val="Hipervnculo"/>
@@ -5837,7 +5837,7 @@
             <w:noProof/>
             <w:webHidden/>
           </w:rPr>
-          <w:instrText xml:space="preserve"> PAGEREF _Toc238661324 \h </w:instrText>
+          <w:instrText xml:space="preserve"> PAGEREF _Toc238661602 \h </w:instrText>
         </w:r>
         <w:r>
           <w:rPr>
@@ -6963,7 +6963,7 @@
         <w:pStyle w:val="Ttulo1"/>
         <w:spacing w:before="100" w:after="30"/>
       </w:pPr>
-      <w:bookmarkStart w:id="0" w:name="_Toc238661264"/>
+      <w:bookmarkStart w:id="0" w:name="_Toc238661542"/>
       <w:r>
         <w:rPr>
           <w:rFonts w:ascii="Georgia" w:hAnsi="Georgia"/>
@@ -6979,7 +6979,7 @@
         <w:pStyle w:val="Ttulo2"/>
         <w:spacing w:before="70" w:after="20"/>
       </w:pPr>
-      <w:bookmarkStart w:id="1" w:name="_Toc238661265"/>
+      <w:bookmarkStart w:id="1" w:name="_Toc238661543"/>
       <w:r>
         <w:rPr>
           <w:rFonts w:ascii="Georgia" w:hAnsi="Georgia"/>
@@ -7020,7 +7020,7 @@
         <w:pStyle w:val="Ttulo2"/>
         <w:spacing w:before="70" w:after="20"/>
       </w:pPr>
-      <w:bookmarkStart w:id="2" w:name="_Toc238661266"/>
+      <w:bookmarkStart w:id="2" w:name="_Toc238661544"/>
       <w:r>
         <w:rPr>
           <w:rFonts w:ascii="Georgia" w:hAnsi="Georgia"/>
@@ -7082,7 +7082,7 @@
               </w:rPr>
               <w:lastRenderedPageBreak/>
               <w:drawing>
-                <wp:inline distT="0" distB="0" distL="0" distR="0" wp14:anchorId="3650C716" wp14:editId="53F26631">
+                <wp:inline distT="0" distB="0" distL="0" distR="0" wp14:anchorId="3C158D5A" wp14:editId="21DC8665">
                   <wp:extent cx="2926080" cy="1524412"/>
                   <wp:effectExtent l="0" t="0" r="0" b="0"/>
                   <wp:docPr id="1" name="Picture 1"/>
@@ -7141,7 +7141,7 @@
                 <w:noProof/>
               </w:rPr>
               <w:drawing>
-                <wp:inline distT="0" distB="0" distL="0" distR="0" wp14:anchorId="15473F6B" wp14:editId="6958A8A3">
+                <wp:inline distT="0" distB="0" distL="0" distR="0" wp14:anchorId="241C9C39" wp14:editId="78A1EDC7">
                   <wp:extent cx="2926080" cy="1437831"/>
                   <wp:effectExtent l="0" t="0" r="0" b="0"/>
                   <wp:docPr id="2" name="Picture 2"/>
@@ -7246,7 +7246,7 @@
         <w:pStyle w:val="Ttulo2"/>
         <w:spacing w:before="70" w:after="20"/>
       </w:pPr>
-      <w:bookmarkStart w:id="3" w:name="_Toc238661267"/>
+      <w:bookmarkStart w:id="3" w:name="_Toc238661545"/>
       <w:r>
         <w:rPr>
           <w:rFonts w:ascii="Georgia" w:hAnsi="Georgia"/>
@@ -7373,7 +7373,7 @@
         <w:pStyle w:val="Ttulo2"/>
         <w:spacing w:before="70" w:after="20"/>
       </w:pPr>
-      <w:bookmarkStart w:id="4" w:name="_Toc238661268"/>
+      <w:bookmarkStart w:id="4" w:name="_Toc238661546"/>
       <w:r>
         <w:rPr>
           <w:rFonts w:ascii="Georgia" w:hAnsi="Georgia"/>
@@ -7885,7 +7885,7 @@
         <w:pStyle w:val="Ttulo2"/>
         <w:spacing w:before="70" w:after="20"/>
       </w:pPr>
-      <w:bookmarkStart w:id="5" w:name="_Toc238661269"/>
+      <w:bookmarkStart w:id="5" w:name="_Toc238661547"/>
       <w:r>
         <w:rPr>
           <w:rFonts w:ascii="Georgia" w:hAnsi="Georgia"/>
@@ -8017,7 +8017,7 @@
         <w:pStyle w:val="Ttulo2"/>
         <w:spacing w:before="70" w:after="20"/>
       </w:pPr>
-      <w:bookmarkStart w:id="6" w:name="_Toc238661270"/>
+      <w:bookmarkStart w:id="6" w:name="_Toc238661548"/>
       <w:r>
         <w:rPr>
           <w:rFonts w:ascii="Georgia" w:hAnsi="Georgia"/>
@@ -9242,7 +9242,7 @@
         <w:pStyle w:val="Ttulo1"/>
         <w:spacing w:before="100" w:after="30"/>
       </w:pPr>
-      <w:bookmarkStart w:id="7" w:name="_Toc238661271"/>
+      <w:bookmarkStart w:id="7" w:name="_Toc238661549"/>
       <w:r>
         <w:rPr>
           <w:rFonts w:ascii="Georgia" w:hAnsi="Georgia"/>
@@ -9258,7 +9258,7 @@
         <w:pStyle w:val="Ttulo2"/>
         <w:spacing w:before="70" w:after="20"/>
       </w:pPr>
-      <w:bookmarkStart w:id="8" w:name="_Toc238661272"/>
+      <w:bookmarkStart w:id="8" w:name="_Toc238661550"/>
       <w:r>
         <w:rPr>
           <w:rFonts w:ascii="Georgia" w:hAnsi="Georgia"/>
@@ -9316,7 +9316,7 @@
                 <w:noProof/>
               </w:rPr>
               <w:drawing>
-                <wp:inline distT="0" distB="0" distL="0" distR="0" wp14:anchorId="094A5AF9" wp14:editId="0490A933">
+                <wp:inline distT="0" distB="0" distL="0" distR="0" wp14:anchorId="772BD889" wp14:editId="681EF9AD">
                   <wp:extent cx="2926080" cy="1426594"/>
                   <wp:effectExtent l="0" t="0" r="0" b="0"/>
                   <wp:docPr id="3" name="Picture 3"/>
@@ -9375,7 +9375,7 @@
                 <w:noProof/>
               </w:rPr>
               <w:drawing>
-                <wp:inline distT="0" distB="0" distL="0" distR="0" wp14:anchorId="3CB7B97B" wp14:editId="6F53871C">
+                <wp:inline distT="0" distB="0" distL="0" distR="0" wp14:anchorId="075D5012" wp14:editId="21D57D6F">
                   <wp:extent cx="2926080" cy="1494260"/>
                   <wp:effectExtent l="0" t="0" r="0" b="0"/>
                   <wp:docPr id="4" name="Picture 4"/>
@@ -9480,7 +9480,7 @@
         <w:pStyle w:val="Ttulo2"/>
         <w:spacing w:before="70" w:after="20"/>
       </w:pPr>
-      <w:bookmarkStart w:id="9" w:name="_Toc238661273"/>
+      <w:bookmarkStart w:id="9" w:name="_Toc238661551"/>
       <w:r>
         <w:rPr>
           <w:rFonts w:ascii="Georgia" w:hAnsi="Georgia"/>
@@ -9714,7 +9714,7 @@
         <w:pStyle w:val="Ttulo1"/>
         <w:spacing w:before="100" w:after="30"/>
       </w:pPr>
-      <w:bookmarkStart w:id="10" w:name="_Toc238661274"/>
+      <w:bookmarkStart w:id="10" w:name="_Toc238661552"/>
       <w:r>
         <w:rPr>
           <w:rFonts w:ascii="Georgia" w:hAnsi="Georgia"/>
@@ -9730,7 +9730,7 @@
         <w:pStyle w:val="Ttulo2"/>
         <w:spacing w:before="70" w:after="20"/>
       </w:pPr>
-      <w:bookmarkStart w:id="11" w:name="_Toc238661275"/>
+      <w:bookmarkStart w:id="11" w:name="_Toc238661553"/>
       <w:r>
         <w:rPr>
           <w:rFonts w:ascii="Georgia" w:hAnsi="Georgia"/>
@@ -9791,7 +9791,7 @@
                 <w:noProof/>
               </w:rPr>
               <w:drawing>
-                <wp:inline distT="0" distB="0" distL="0" distR="0" wp14:anchorId="72733ECC" wp14:editId="4A3CFB3D">
+                <wp:inline distT="0" distB="0" distL="0" distR="0" wp14:anchorId="1639DC53" wp14:editId="44C61D31">
                   <wp:extent cx="2926080" cy="1636252"/>
                   <wp:effectExtent l="0" t="0" r="0" b="0"/>
                   <wp:docPr id="5" name="Picture 5"/>
@@ -9850,7 +9850,7 @@
                 <w:noProof/>
               </w:rPr>
               <w:drawing>
-                <wp:inline distT="0" distB="0" distL="0" distR="0" wp14:anchorId="207F38FD" wp14:editId="4BBA15FB">
+                <wp:inline distT="0" distB="0" distL="0" distR="0" wp14:anchorId="7F5AADC0" wp14:editId="54C88D7E">
                   <wp:extent cx="2926080" cy="1481181"/>
                   <wp:effectExtent l="0" t="0" r="0" b="0"/>
                   <wp:docPr id="6" name="Picture 6"/>
@@ -9955,7 +9955,7 @@
         <w:pStyle w:val="Ttulo2"/>
         <w:spacing w:before="70" w:after="20"/>
       </w:pPr>
-      <w:bookmarkStart w:id="12" w:name="_Toc238661276"/>
+      <w:bookmarkStart w:id="12" w:name="_Toc238661554"/>
       <w:r>
         <w:rPr>
           <w:rFonts w:ascii="Georgia" w:hAnsi="Georgia"/>
@@ -9985,7 +9985,7 @@
         <w:pStyle w:val="Ttulo2"/>
         <w:spacing w:before="70" w:after="20"/>
       </w:pPr>
-      <w:bookmarkStart w:id="13" w:name="_Toc238661277"/>
+      <w:bookmarkStart w:id="13" w:name="_Toc238661555"/>
       <w:r>
         <w:rPr>
           <w:rFonts w:ascii="Georgia" w:hAnsi="Georgia"/>
@@ -10043,7 +10043,7 @@
                 <w:noProof/>
               </w:rPr>
               <w:drawing>
-                <wp:inline distT="0" distB="0" distL="0" distR="0" wp14:anchorId="3CEA1061" wp14:editId="7A833D0A">
+                <wp:inline distT="0" distB="0" distL="0" distR="0" wp14:anchorId="2CE90699" wp14:editId="02AEDDAC">
                   <wp:extent cx="2926080" cy="1626307"/>
                   <wp:effectExtent l="0" t="0" r="0" b="0"/>
                   <wp:docPr id="7" name="Picture 7"/>
@@ -10102,7 +10102,7 @@
                 <w:noProof/>
               </w:rPr>
               <w:drawing>
-                <wp:inline distT="0" distB="0" distL="0" distR="0" wp14:anchorId="17C9A6BD" wp14:editId="2E0E6F1D">
+                <wp:inline distT="0" distB="0" distL="0" distR="0" wp14:anchorId="097ACAE8" wp14:editId="46C6DB55">
                   <wp:extent cx="2926080" cy="1479479"/>
                   <wp:effectExtent l="0" t="0" r="0" b="0"/>
                   <wp:docPr id="8" name="Picture 8"/>
@@ -10207,7 +10207,7 @@
         <w:pStyle w:val="Ttulo2"/>
         <w:spacing w:before="70" w:after="20"/>
       </w:pPr>
-      <w:bookmarkStart w:id="14" w:name="_Toc238661278"/>
+      <w:bookmarkStart w:id="14" w:name="_Toc238661556"/>
       <w:r>
         <w:rPr>
           <w:rFonts w:ascii="Georgia" w:hAnsi="Georgia"/>
@@ -10265,7 +10265,7 @@
                 <w:noProof/>
               </w:rPr>
               <w:drawing>
-                <wp:inline distT="0" distB="0" distL="0" distR="0" wp14:anchorId="7AC965D3" wp14:editId="1B545BFF">
+                <wp:inline distT="0" distB="0" distL="0" distR="0" wp14:anchorId="55D92D6D" wp14:editId="07B08C30">
                   <wp:extent cx="2926080" cy="1662311"/>
                   <wp:effectExtent l="0" t="0" r="0" b="0"/>
                   <wp:docPr id="9" name="Picture 9"/>
@@ -10324,7 +10324,7 @@
                 <w:noProof/>
               </w:rPr>
               <w:drawing>
-                <wp:inline distT="0" distB="0" distL="0" distR="0" wp14:anchorId="0E5A015C" wp14:editId="2DF2D0FC">
+                <wp:inline distT="0" distB="0" distL="0" distR="0" wp14:anchorId="1AFEBBE5" wp14:editId="397B0B58">
                   <wp:extent cx="2926080" cy="1801004"/>
                   <wp:effectExtent l="0" t="0" r="0" b="0"/>
                   <wp:docPr id="10" name="Picture 10"/>
@@ -10429,7 +10429,7 @@
         <w:pStyle w:val="Ttulo1"/>
         <w:spacing w:before="100" w:after="30"/>
       </w:pPr>
-      <w:bookmarkStart w:id="15" w:name="_Toc238661279"/>
+      <w:bookmarkStart w:id="15" w:name="_Toc238661557"/>
       <w:r>
         <w:rPr>
           <w:rFonts w:ascii="Georgia" w:hAnsi="Georgia"/>
@@ -10445,7 +10445,7 @@
         <w:pStyle w:val="Ttulo2"/>
         <w:spacing w:before="70" w:after="20"/>
       </w:pPr>
-      <w:bookmarkStart w:id="16" w:name="_Toc238661280"/>
+      <w:bookmarkStart w:id="16" w:name="_Toc238661558"/>
       <w:r>
         <w:rPr>
           <w:rFonts w:ascii="Georgia" w:hAnsi="Georgia"/>
@@ -10884,7 +10884,7 @@
         <w:pStyle w:val="Ttulo2"/>
         <w:spacing w:before="70" w:after="20"/>
       </w:pPr>
-      <w:bookmarkStart w:id="17" w:name="_Toc238661281"/>
+      <w:bookmarkStart w:id="17" w:name="_Toc238661559"/>
       <w:r>
         <w:rPr>
           <w:rFonts w:ascii="Georgia" w:hAnsi="Georgia"/>
@@ -10912,7 +10912,7 @@
         <w:pStyle w:val="Ttulo1"/>
         <w:spacing w:before="100" w:after="30"/>
       </w:pPr>
-      <w:bookmarkStart w:id="18" w:name="_Toc238661282"/>
+      <w:bookmarkStart w:id="18" w:name="_Toc238661560"/>
       <w:r>
         <w:rPr>
           <w:rFonts w:ascii="Georgia" w:hAnsi="Georgia"/>
@@ -10928,7 +10928,7 @@
         <w:pStyle w:val="Ttulo2"/>
         <w:spacing w:before="70" w:after="20"/>
       </w:pPr>
-      <w:bookmarkStart w:id="19" w:name="_Toc238661283"/>
+      <w:bookmarkStart w:id="19" w:name="_Toc238661561"/>
       <w:r>
         <w:rPr>
           <w:rFonts w:ascii="Georgia" w:hAnsi="Georgia"/>
@@ -10955,7 +10955,7 @@
         <w:pStyle w:val="Ttulo2"/>
         <w:spacing w:before="70" w:after="20"/>
       </w:pPr>
-      <w:bookmarkStart w:id="20" w:name="_Toc238661284"/>
+      <w:bookmarkStart w:id="20" w:name="_Toc238661562"/>
       <w:r>
         <w:rPr>
           <w:rFonts w:ascii="Georgia" w:hAnsi="Georgia"/>
@@ -11013,7 +11013,7 @@
                 <w:noProof/>
               </w:rPr>
               <w:drawing>
-                <wp:inline distT="0" distB="0" distL="0" distR="0" wp14:anchorId="57480D9D" wp14:editId="023F377A">
+                <wp:inline distT="0" distB="0" distL="0" distR="0" wp14:anchorId="406F0FED" wp14:editId="7FC2D295">
                   <wp:extent cx="2926080" cy="1714660"/>
                   <wp:effectExtent l="0" t="0" r="0" b="0"/>
                   <wp:docPr id="11" name="Picture 11"/>
@@ -11072,7 +11072,7 @@
                 <w:noProof/>
               </w:rPr>
               <w:drawing>
-                <wp:inline distT="0" distB="0" distL="0" distR="0" wp14:anchorId="4E3FE4F6" wp14:editId="043FA091">
+                <wp:inline distT="0" distB="0" distL="0" distR="0" wp14:anchorId="70159603" wp14:editId="0728E2E9">
                   <wp:extent cx="2926080" cy="1558188"/>
                   <wp:effectExtent l="0" t="0" r="0" b="0"/>
                   <wp:docPr id="12" name="Picture 12"/>
@@ -12042,7 +12042,7 @@
         <w:pStyle w:val="Ttulo1"/>
         <w:spacing w:before="100" w:after="30"/>
       </w:pPr>
-      <w:bookmarkStart w:id="21" w:name="_Toc238661285"/>
+      <w:bookmarkStart w:id="21" w:name="_Toc238661563"/>
       <w:r>
         <w:rPr>
           <w:rFonts w:ascii="Georgia" w:hAnsi="Georgia"/>
@@ -12059,7 +12059,7 @@
         <w:pStyle w:val="Ttulo2"/>
         <w:spacing w:before="70" w:after="20"/>
       </w:pPr>
-      <w:bookmarkStart w:id="22" w:name="_Toc238661286"/>
+      <w:bookmarkStart w:id="22" w:name="_Toc238661564"/>
       <w:r>
         <w:rPr>
           <w:rFonts w:ascii="Georgia" w:hAnsi="Georgia"/>
@@ -12151,7 +12151,7 @@
         <w:pStyle w:val="Ttulo2"/>
         <w:spacing w:before="70" w:after="20"/>
       </w:pPr>
-      <w:bookmarkStart w:id="23" w:name="_Toc238661287"/>
+      <w:bookmarkStart w:id="23" w:name="_Toc238661565"/>
       <w:r>
         <w:rPr>
           <w:rFonts w:ascii="Georgia" w:hAnsi="Georgia"/>
@@ -12393,7 +12393,7 @@
                 <w:noProof/>
               </w:rPr>
               <w:drawing>
-                <wp:inline distT="0" distB="0" distL="0" distR="0" wp14:anchorId="17FF9413" wp14:editId="42E055A0">
+                <wp:inline distT="0" distB="0" distL="0" distR="0" wp14:anchorId="4695B4D3" wp14:editId="7846D49F">
                   <wp:extent cx="2926080" cy="1540391"/>
                   <wp:effectExtent l="0" t="0" r="0" b="0"/>
                   <wp:docPr id="13" name="Picture 13"/>
@@ -12452,7 +12452,7 @@
                 <w:noProof/>
               </w:rPr>
               <w:drawing>
-                <wp:inline distT="0" distB="0" distL="0" distR="0" wp14:anchorId="3341A1DC" wp14:editId="77EB3A61">
+                <wp:inline distT="0" distB="0" distL="0" distR="0" wp14:anchorId="5057CD06" wp14:editId="5361435C">
                   <wp:extent cx="2926080" cy="1658038"/>
                   <wp:effectExtent l="0" t="0" r="0" b="0"/>
                   <wp:docPr id="14" name="Picture 14"/>
@@ -12557,7 +12557,7 @@
         <w:pStyle w:val="Ttulo2"/>
         <w:spacing w:before="70" w:after="20"/>
       </w:pPr>
-      <w:bookmarkStart w:id="24" w:name="_Toc238661288"/>
+      <w:bookmarkStart w:id="24" w:name="_Toc238661566"/>
       <w:r>
         <w:rPr>
           <w:rFonts w:ascii="Georgia" w:hAnsi="Georgia"/>
@@ -13487,7 +13487,7 @@
         <w:pStyle w:val="Ttulo1"/>
         <w:spacing w:before="100" w:after="30"/>
       </w:pPr>
-      <w:bookmarkStart w:id="25" w:name="_Toc238661289"/>
+      <w:bookmarkStart w:id="25" w:name="_Toc238661567"/>
       <w:r>
         <w:rPr>
           <w:rFonts w:ascii="Georgia" w:hAnsi="Georgia"/>
@@ -13503,7 +13503,7 @@
         <w:pStyle w:val="Ttulo2"/>
         <w:spacing w:before="70" w:after="20"/>
       </w:pPr>
-      <w:bookmarkStart w:id="26" w:name="_Toc238661290"/>
+      <w:bookmarkStart w:id="26" w:name="_Toc238661568"/>
       <w:r>
         <w:rPr>
           <w:rFonts w:ascii="Georgia" w:hAnsi="Georgia"/>
@@ -15100,7 +15100,7 @@
         <w:pStyle w:val="Ttulo2"/>
         <w:spacing w:before="70" w:after="20"/>
       </w:pPr>
-      <w:bookmarkStart w:id="27" w:name="_Toc238661291"/>
+      <w:bookmarkStart w:id="27" w:name="_Toc238661569"/>
       <w:r>
         <w:rPr>
           <w:rFonts w:ascii="Georgia" w:hAnsi="Georgia"/>
@@ -15210,7 +15210,7 @@
         <w:pStyle w:val="Ttulo1"/>
         <w:spacing w:before="100" w:after="30"/>
       </w:pPr>
-      <w:bookmarkStart w:id="28" w:name="_Toc238661292"/>
+      <w:bookmarkStart w:id="28" w:name="_Toc238661570"/>
       <w:r>
         <w:rPr>
           <w:rFonts w:ascii="Georgia" w:hAnsi="Georgia"/>
@@ -15227,7 +15227,7 @@
         <w:pStyle w:val="Ttulo2"/>
         <w:spacing w:before="70" w:after="20"/>
       </w:pPr>
-      <w:bookmarkStart w:id="29" w:name="_Toc238661293"/>
+      <w:bookmarkStart w:id="29" w:name="_Toc238661571"/>
       <w:r>
         <w:rPr>
           <w:rFonts w:ascii="Georgia" w:hAnsi="Georgia"/>
@@ -15254,7 +15254,7 @@
         <w:pStyle w:val="Ttulo2"/>
         <w:spacing w:before="70" w:after="20"/>
       </w:pPr>
-      <w:bookmarkStart w:id="30" w:name="_Toc238661294"/>
+      <w:bookmarkStart w:id="30" w:name="_Toc238661572"/>
       <w:r>
         <w:rPr>
           <w:rFonts w:ascii="Georgia" w:hAnsi="Georgia"/>
@@ -15312,7 +15312,7 @@
                 <w:noProof/>
               </w:rPr>
               <w:drawing>
-                <wp:inline distT="0" distB="0" distL="0" distR="0" wp14:anchorId="162B83B1" wp14:editId="1E67D8DF">
+                <wp:inline distT="0" distB="0" distL="0" distR="0" wp14:anchorId="5561F4A4" wp14:editId="29F317B6">
                   <wp:extent cx="2926080" cy="1534596"/>
                   <wp:effectExtent l="0" t="0" r="0" b="0"/>
                   <wp:docPr id="15" name="Picture 15"/>
@@ -15371,7 +15371,7 @@
                 <w:noProof/>
               </w:rPr>
               <w:drawing>
-                <wp:inline distT="0" distB="0" distL="0" distR="0" wp14:anchorId="10F7A600" wp14:editId="07A81051">
+                <wp:inline distT="0" distB="0" distL="0" distR="0" wp14:anchorId="6DE17CAD" wp14:editId="7E78F7B3">
                   <wp:extent cx="2926080" cy="1680519"/>
                   <wp:effectExtent l="0" t="0" r="0" b="0"/>
                   <wp:docPr id="16" name="Picture 16"/>
@@ -15487,7 +15487,7 @@
         <w:pStyle w:val="Ttulo1"/>
         <w:spacing w:before="100" w:after="30"/>
       </w:pPr>
-      <w:bookmarkStart w:id="31" w:name="_Toc238661295"/>
+      <w:bookmarkStart w:id="31" w:name="_Toc238661573"/>
       <w:r>
         <w:rPr>
           <w:rFonts w:ascii="Georgia" w:hAnsi="Georgia"/>
@@ -15503,7 +15503,7 @@
         <w:pStyle w:val="Ttulo2"/>
         <w:spacing w:before="70" w:after="20"/>
       </w:pPr>
-      <w:bookmarkStart w:id="32" w:name="_Toc238661296"/>
+      <w:bookmarkStart w:id="32" w:name="_Toc238661574"/>
       <w:r>
         <w:rPr>
           <w:rFonts w:ascii="Georgia" w:hAnsi="Georgia"/>
@@ -16550,7 +16550,7 @@
         <w:pStyle w:val="Ttulo2"/>
         <w:spacing w:before="70" w:after="20"/>
       </w:pPr>
-      <w:bookmarkStart w:id="33" w:name="_Toc238661297"/>
+      <w:bookmarkStart w:id="33" w:name="_Toc238661575"/>
       <w:r>
         <w:rPr>
           <w:rFonts w:ascii="Georgia" w:hAnsi="Georgia"/>
@@ -16711,7 +16711,7 @@
         <w:pStyle w:val="Ttulo2"/>
         <w:spacing w:before="70" w:after="20"/>
       </w:pPr>
-      <w:bookmarkStart w:id="34" w:name="_Toc238661298"/>
+      <w:bookmarkStart w:id="34" w:name="_Toc238661576"/>
       <w:r>
         <w:rPr>
           <w:rFonts w:ascii="Georgia" w:hAnsi="Georgia"/>
@@ -16738,7 +16738,7 @@
         <w:pStyle w:val="Ttulo1"/>
         <w:spacing w:before="100" w:after="30"/>
       </w:pPr>
-      <w:bookmarkStart w:id="35" w:name="_Toc238661299"/>
+      <w:bookmarkStart w:id="35" w:name="_Toc238661577"/>
       <w:r>
         <w:rPr>
           <w:rFonts w:ascii="Georgia" w:hAnsi="Georgia"/>
@@ -16754,7 +16754,7 @@
         <w:pStyle w:val="Ttulo2"/>
         <w:spacing w:before="70" w:after="20"/>
       </w:pPr>
-      <w:bookmarkStart w:id="36" w:name="_Toc238661300"/>
+      <w:bookmarkStart w:id="36" w:name="_Toc238661578"/>
       <w:r>
         <w:rPr>
           <w:rFonts w:ascii="Georgia" w:hAnsi="Georgia"/>
@@ -19681,7 +19681,7 @@
         <w:pStyle w:val="Ttulo1"/>
         <w:spacing w:before="100" w:after="30"/>
       </w:pPr>
-      <w:bookmarkStart w:id="37" w:name="_Toc238661301"/>
+      <w:bookmarkStart w:id="37" w:name="_Toc238661579"/>
       <w:r>
         <w:rPr>
           <w:rFonts w:ascii="Georgia" w:hAnsi="Georgia"/>
@@ -19698,7 +19698,7 @@
         <w:pStyle w:val="Ttulo2"/>
         <w:spacing w:before="70" w:after="20"/>
       </w:pPr>
-      <w:bookmarkStart w:id="38" w:name="_Toc238661302"/>
+      <w:bookmarkStart w:id="38" w:name="_Toc238661580"/>
       <w:r>
         <w:rPr>
           <w:rFonts w:ascii="Georgia" w:hAnsi="Georgia"/>
@@ -19907,7 +19907,7 @@
         <w:pStyle w:val="Ttulo2"/>
         <w:spacing w:before="70" w:after="20"/>
       </w:pPr>
-      <w:bookmarkStart w:id="39" w:name="_Toc238661303"/>
+      <w:bookmarkStart w:id="39" w:name="_Toc238661581"/>
       <w:r>
         <w:rPr>
           <w:rFonts w:ascii="Georgia" w:hAnsi="Georgia"/>
@@ -19943,7 +19943,7 @@
           <w:noProof/>
         </w:rPr>
         <w:drawing>
-          <wp:inline distT="0" distB="0" distL="0" distR="0" wp14:anchorId="55869D62" wp14:editId="2850AE04">
+          <wp:inline distT="0" distB="0" distL="0" distR="0" wp14:anchorId="01C37BCD" wp14:editId="43711EFF">
             <wp:extent cx="4206240" cy="2338193"/>
             <wp:effectExtent l="0" t="0" r="0" b="0"/>
             <wp:docPr id="17" name="Picture 17"/>
@@ -20002,7 +20002,7 @@
         <w:pStyle w:val="Ttulo2"/>
         <w:spacing w:before="70" w:after="20"/>
       </w:pPr>
-      <w:bookmarkStart w:id="40" w:name="_Toc238661304"/>
+      <w:bookmarkStart w:id="40" w:name="_Toc238661582"/>
       <w:r>
         <w:rPr>
           <w:rFonts w:ascii="Georgia" w:hAnsi="Georgia"/>
@@ -20623,7 +20623,7 @@
         <w:pStyle w:val="Ttulo2"/>
         <w:spacing w:before="70" w:after="20"/>
       </w:pPr>
-      <w:bookmarkStart w:id="41" w:name="_Toc238661305"/>
+      <w:bookmarkStart w:id="41" w:name="_Toc238661583"/>
       <w:r>
         <w:rPr>
           <w:rFonts w:ascii="Georgia" w:hAnsi="Georgia"/>
@@ -20659,7 +20659,7 @@
           <w:noProof/>
         </w:rPr>
         <w:drawing>
-          <wp:inline distT="0" distB="0" distL="0" distR="0" wp14:anchorId="3A309B22" wp14:editId="75BC2C5C">
+          <wp:inline distT="0" distB="0" distL="0" distR="0" wp14:anchorId="65BEE6F7" wp14:editId="67AF89C3">
             <wp:extent cx="4206240" cy="2471742"/>
             <wp:effectExtent l="0" t="0" r="0" b="0"/>
             <wp:docPr id="18" name="Picture 18"/>
@@ -21738,7 +21738,7 @@
         <w:pStyle w:val="Ttulo1"/>
         <w:spacing w:before="100" w:after="30"/>
       </w:pPr>
-      <w:bookmarkStart w:id="42" w:name="_Toc238661306"/>
+      <w:bookmarkStart w:id="42" w:name="_Toc238661584"/>
       <w:r>
         <w:rPr>
           <w:rFonts w:ascii="Georgia" w:hAnsi="Georgia"/>
@@ -21754,7 +21754,7 @@
         <w:pStyle w:val="Ttulo2"/>
         <w:spacing w:before="70" w:after="20"/>
       </w:pPr>
-      <w:bookmarkStart w:id="43" w:name="_Toc238661307"/>
+      <w:bookmarkStart w:id="43" w:name="_Toc238661585"/>
       <w:r>
         <w:rPr>
           <w:rFonts w:ascii="Georgia" w:hAnsi="Georgia"/>
@@ -21791,7 +21791,7 @@
         </w:rPr>
         <w:lastRenderedPageBreak/>
         <w:drawing>
-          <wp:inline distT="0" distB="0" distL="0" distR="0" wp14:anchorId="4EFEAA6D" wp14:editId="1ADCEBBF">
+          <wp:inline distT="0" distB="0" distL="0" distR="0" wp14:anchorId="5444FD97" wp14:editId="75C17E71">
             <wp:extent cx="4206240" cy="2149342"/>
             <wp:effectExtent l="0" t="0" r="0" b="0"/>
             <wp:docPr id="19" name="Picture 19"/>
@@ -21850,7 +21850,7 @@
         <w:pStyle w:val="Ttulo1"/>
         <w:spacing w:before="100" w:after="30"/>
       </w:pPr>
-      <w:bookmarkStart w:id="44" w:name="_Toc238661308"/>
+      <w:bookmarkStart w:id="44" w:name="_Toc238661586"/>
       <w:r>
         <w:rPr>
           <w:rFonts w:ascii="Georgia" w:hAnsi="Georgia"/>
@@ -21866,7 +21866,7 @@
         <w:pStyle w:val="Ttulo2"/>
         <w:spacing w:before="70" w:after="20"/>
       </w:pPr>
-      <w:bookmarkStart w:id="45" w:name="_Toc238661309"/>
+      <w:bookmarkStart w:id="45" w:name="_Toc238661587"/>
       <w:r>
         <w:rPr>
           <w:rFonts w:ascii="Georgia" w:hAnsi="Georgia"/>
@@ -21921,7 +21921,7 @@
         <w:pStyle w:val="Ttulo2"/>
         <w:spacing w:before="70" w:after="20"/>
       </w:pPr>
-      <w:bookmarkStart w:id="46" w:name="_Toc238661310"/>
+      <w:bookmarkStart w:id="46" w:name="_Toc238661588"/>
       <w:r>
         <w:rPr>
           <w:rFonts w:ascii="Georgia" w:hAnsi="Georgia"/>
@@ -21979,7 +21979,7 @@
                 <w:noProof/>
               </w:rPr>
               <w:drawing>
-                <wp:inline distT="0" distB="0" distL="0" distR="0" wp14:anchorId="284CB131" wp14:editId="21365E20">
+                <wp:inline distT="0" distB="0" distL="0" distR="0" wp14:anchorId="1B1CA72B" wp14:editId="3545E8AD">
                   <wp:extent cx="2926080" cy="1682608"/>
                   <wp:effectExtent l="0" t="0" r="0" b="0"/>
                   <wp:docPr id="20" name="Picture 20"/>
@@ -22038,7 +22038,7 @@
                 <w:noProof/>
               </w:rPr>
               <w:drawing>
-                <wp:inline distT="0" distB="0" distL="0" distR="0" wp14:anchorId="3DC5A361" wp14:editId="62198B17">
+                <wp:inline distT="0" distB="0" distL="0" distR="0" wp14:anchorId="55FBF655" wp14:editId="3E2611A4">
                   <wp:extent cx="2926080" cy="1655981"/>
                   <wp:effectExtent l="0" t="0" r="0" b="0"/>
                   <wp:docPr id="21" name="Picture 21"/>
@@ -22143,7 +22143,7 @@
         <w:pStyle w:val="Ttulo1"/>
         <w:spacing w:before="100" w:after="30"/>
       </w:pPr>
-      <w:bookmarkStart w:id="47" w:name="_Toc238661311"/>
+      <w:bookmarkStart w:id="47" w:name="_Toc238661589"/>
       <w:r>
         <w:rPr>
           <w:rFonts w:ascii="Georgia" w:hAnsi="Georgia"/>
@@ -22159,7 +22159,7 @@
         <w:pStyle w:val="Ttulo2"/>
         <w:spacing w:before="70" w:after="20"/>
       </w:pPr>
-      <w:bookmarkStart w:id="48" w:name="_Toc238661312"/>
+      <w:bookmarkStart w:id="48" w:name="_Toc238661590"/>
       <w:r>
         <w:rPr>
           <w:rFonts w:ascii="Georgia" w:hAnsi="Georgia"/>
@@ -22195,7 +22195,7 @@
           <w:noProof/>
         </w:rPr>
         <w:drawing>
-          <wp:inline distT="0" distB="0" distL="0" distR="0" wp14:anchorId="08F9DCCE" wp14:editId="74989071">
+          <wp:inline distT="0" distB="0" distL="0" distR="0" wp14:anchorId="557F9698" wp14:editId="1AC13324">
             <wp:extent cx="4206240" cy="2227773"/>
             <wp:effectExtent l="0" t="0" r="0" b="0"/>
             <wp:docPr id="22" name="Picture 22"/>
@@ -23783,7 +23783,7 @@
         <w:pStyle w:val="Ttulo1"/>
         <w:spacing w:before="100" w:after="30"/>
       </w:pPr>
-      <w:bookmarkStart w:id="49" w:name="_Toc238661313"/>
+      <w:bookmarkStart w:id="49" w:name="_Toc238661591"/>
       <w:r>
         <w:rPr>
           <w:rFonts w:ascii="Georgia" w:hAnsi="Georgia"/>
@@ -23800,7 +23800,7 @@
         <w:pStyle w:val="Ttulo2"/>
         <w:spacing w:before="70" w:after="20"/>
       </w:pPr>
-      <w:bookmarkStart w:id="50" w:name="_Toc238661314"/>
+      <w:bookmarkStart w:id="50" w:name="_Toc238661592"/>
       <w:r>
         <w:rPr>
           <w:rFonts w:ascii="Georgia" w:hAnsi="Georgia"/>
@@ -23895,7 +23895,7 @@
                 <w:noProof/>
               </w:rPr>
               <w:drawing>
-                <wp:inline distT="0" distB="0" distL="0" distR="0" wp14:anchorId="1BEA3571" wp14:editId="0310E33B">
+                <wp:inline distT="0" distB="0" distL="0" distR="0" wp14:anchorId="00D3B177" wp14:editId="544BDD59">
                   <wp:extent cx="2926080" cy="1695124"/>
                   <wp:effectExtent l="0" t="0" r="0" b="0"/>
                   <wp:docPr id="23" name="Picture 23"/>
@@ -23954,7 +23954,7 @@
                 <w:noProof/>
               </w:rPr>
               <w:drawing>
-                <wp:inline distT="0" distB="0" distL="0" distR="0" wp14:anchorId="39EA043C" wp14:editId="61B1354F">
+                <wp:inline distT="0" distB="0" distL="0" distR="0" wp14:anchorId="7D77853B" wp14:editId="6D3F354C">
                   <wp:extent cx="2926080" cy="1698212"/>
                   <wp:effectExtent l="0" t="0" r="0" b="0"/>
                   <wp:docPr id="24" name="Picture 24"/>
@@ -24059,7 +24059,7 @@
         <w:pStyle w:val="Ttulo2"/>
         <w:spacing w:before="70" w:after="20"/>
       </w:pPr>
-      <w:bookmarkStart w:id="51" w:name="_Toc238661315"/>
+      <w:bookmarkStart w:id="51" w:name="_Toc238661593"/>
       <w:r>
         <w:rPr>
           <w:rFonts w:ascii="Georgia" w:hAnsi="Georgia"/>
@@ -24145,7 +24145,7 @@
                 <w:noProof/>
               </w:rPr>
               <w:drawing>
-                <wp:inline distT="0" distB="0" distL="0" distR="0" wp14:anchorId="6656FB6D" wp14:editId="31F87BBC">
+                <wp:inline distT="0" distB="0" distL="0" distR="0" wp14:anchorId="2CEC9108" wp14:editId="0A84B374">
                   <wp:extent cx="2926080" cy="1696900"/>
                   <wp:effectExtent l="0" t="0" r="0" b="0"/>
                   <wp:docPr id="25" name="Picture 25"/>
@@ -24204,7 +24204,7 @@
                 <w:noProof/>
               </w:rPr>
               <w:drawing>
-                <wp:inline distT="0" distB="0" distL="0" distR="0" wp14:anchorId="24AFADCB" wp14:editId="02AB1E11">
+                <wp:inline distT="0" distB="0" distL="0" distR="0" wp14:anchorId="1FE530ED" wp14:editId="3692A806">
                   <wp:extent cx="2926080" cy="1654733"/>
                   <wp:effectExtent l="0" t="0" r="0" b="0"/>
                   <wp:docPr id="26" name="Picture 26"/>
@@ -25964,7 +25964,7 @@
         <w:pStyle w:val="Ttulo1"/>
         <w:spacing w:before="100" w:after="30"/>
       </w:pPr>
-      <w:bookmarkStart w:id="52" w:name="_Toc238661316"/>
+      <w:bookmarkStart w:id="52" w:name="_Toc238661594"/>
       <w:r>
         <w:rPr>
           <w:rFonts w:ascii="Georgia" w:hAnsi="Georgia"/>
@@ -25980,7 +25980,7 @@
         <w:pStyle w:val="Ttulo2"/>
         <w:spacing w:before="70" w:after="20"/>
       </w:pPr>
-      <w:bookmarkStart w:id="53" w:name="_Toc238661317"/>
+      <w:bookmarkStart w:id="53" w:name="_Toc238661595"/>
       <w:r>
         <w:rPr>
           <w:rFonts w:ascii="Georgia" w:hAnsi="Georgia"/>
@@ -26097,7 +26097,7 @@
                 <w:noProof/>
               </w:rPr>
               <w:drawing>
-                <wp:inline distT="0" distB="0" distL="0" distR="0" wp14:anchorId="79AD1311" wp14:editId="7FC16969">
+                <wp:inline distT="0" distB="0" distL="0" distR="0" wp14:anchorId="3344C34D" wp14:editId="700521A2">
                   <wp:extent cx="2926080" cy="1614092"/>
                   <wp:effectExtent l="0" t="0" r="0" b="0"/>
                   <wp:docPr id="27" name="Picture 27"/>
@@ -26156,7 +26156,7 @@
                 <w:noProof/>
               </w:rPr>
               <w:drawing>
-                <wp:inline distT="0" distB="0" distL="0" distR="0" wp14:anchorId="39F5EA30" wp14:editId="2A2615D2">
+                <wp:inline distT="0" distB="0" distL="0" distR="0" wp14:anchorId="0FE83AB1" wp14:editId="5B204F12">
                   <wp:extent cx="2926080" cy="1650045"/>
                   <wp:effectExtent l="0" t="0" r="0" b="0"/>
                   <wp:docPr id="28" name="Picture 28"/>
@@ -26569,7 +26569,7 @@
         <w:pStyle w:val="Ttulo2"/>
         <w:spacing w:before="70" w:after="20"/>
       </w:pPr>
-      <w:bookmarkStart w:id="54" w:name="_Toc238661318"/>
+      <w:bookmarkStart w:id="54" w:name="_Toc238661596"/>
       <w:r>
         <w:rPr>
           <w:rFonts w:ascii="Georgia" w:hAnsi="Georgia"/>
@@ -26655,7 +26655,7 @@
                 <w:noProof/>
               </w:rPr>
               <w:drawing>
-                <wp:inline distT="0" distB="0" distL="0" distR="0" wp14:anchorId="121FDFBA" wp14:editId="6BD68C27">
+                <wp:inline distT="0" distB="0" distL="0" distR="0" wp14:anchorId="01865D47" wp14:editId="1AB52A50">
                   <wp:extent cx="2926080" cy="1527796"/>
                   <wp:effectExtent l="0" t="0" r="0" b="0"/>
                   <wp:docPr id="29" name="Picture 29"/>
@@ -26714,7 +26714,7 @@
                 <w:noProof/>
               </w:rPr>
               <w:drawing>
-                <wp:inline distT="0" distB="0" distL="0" distR="0" wp14:anchorId="20CBAD1B" wp14:editId="40BC9EE1">
+                <wp:inline distT="0" distB="0" distL="0" distR="0" wp14:anchorId="3324F769" wp14:editId="2C344CE7">
                   <wp:extent cx="2926080" cy="1611196"/>
                   <wp:effectExtent l="0" t="0" r="0" b="0"/>
                   <wp:docPr id="30" name="Picture 30"/>
@@ -26819,7 +26819,7 @@
         <w:pStyle w:val="Ttulo2"/>
         <w:spacing w:before="70" w:after="20"/>
       </w:pPr>
-      <w:bookmarkStart w:id="55" w:name="_Toc238661319"/>
+      <w:bookmarkStart w:id="55" w:name="_Toc238661597"/>
       <w:r>
         <w:rPr>
           <w:rFonts w:ascii="Georgia" w:hAnsi="Georgia"/>
@@ -26880,7 +26880,7 @@
                 <w:noProof/>
               </w:rPr>
               <w:drawing>
-                <wp:inline distT="0" distB="0" distL="0" distR="0" wp14:anchorId="1F27EED0" wp14:editId="5A016991">
+                <wp:inline distT="0" distB="0" distL="0" distR="0" wp14:anchorId="6D76FC44" wp14:editId="08B8A3B2">
                   <wp:extent cx="2926080" cy="1723518"/>
                   <wp:effectExtent l="0" t="0" r="0" b="0"/>
                   <wp:docPr id="31" name="Picture 31"/>
@@ -27481,7 +27481,7 @@
         <w:pStyle w:val="Ttulo2"/>
         <w:spacing w:before="70" w:after="20"/>
       </w:pPr>
-      <w:bookmarkStart w:id="56" w:name="_Toc238661320"/>
+      <w:bookmarkStart w:id="56" w:name="_Toc238661598"/>
       <w:r>
         <w:rPr>
           <w:rFonts w:ascii="Georgia" w:hAnsi="Georgia"/>
@@ -28906,7 +28906,7 @@
         <w:pStyle w:val="Ttulo1"/>
         <w:spacing w:before="100" w:after="30"/>
       </w:pPr>
-      <w:bookmarkStart w:id="57" w:name="_Toc238661321"/>
+      <w:bookmarkStart w:id="57" w:name="_Toc238661599"/>
       <w:r>
         <w:rPr>
           <w:rFonts w:ascii="Georgia" w:hAnsi="Georgia"/>
@@ -29085,7 +29085,7 @@
         <w:pStyle w:val="Ttulo1"/>
         <w:spacing w:before="100" w:after="30"/>
       </w:pPr>
-      <w:bookmarkStart w:id="58" w:name="_Toc238661322"/>
+      <w:bookmarkStart w:id="58" w:name="_Toc238661600"/>
       <w:r>
         <w:rPr>
           <w:rFonts w:ascii="Georgia" w:hAnsi="Georgia"/>
@@ -38182,7 +38182,7 @@
         <w:pStyle w:val="Ttulo1"/>
         <w:spacing w:before="100" w:after="30"/>
       </w:pPr>
-      <w:bookmarkStart w:id="59" w:name="_Toc238661323"/>
+      <w:bookmarkStart w:id="59" w:name="_Toc238661601"/>
       <w:r>
         <w:rPr>
           <w:rFonts w:ascii="Georgia" w:hAnsi="Georgia"/>
@@ -38289,7 +38289,7 @@
         <w:pStyle w:val="Ttulo1"/>
         <w:spacing w:before="100" w:after="30"/>
       </w:pPr>
-      <w:bookmarkStart w:id="60" w:name="_Toc238661324"/>
+      <w:bookmarkStart w:id="60" w:name="_Toc238661602"/>
       <w:r>
         <w:rPr>
           <w:rFonts w:ascii="Georgia" w:hAnsi="Georgia"/>
@@ -39515,31 +39515,31 @@
       </w:rPr>
     </w:lvl>
   </w:abstractNum>
-  <w:num w:numId="1" w16cid:durableId="1453860416">
+  <w:num w:numId="1" w16cid:durableId="828056703">
     <w:abstractNumId w:val="8"/>
   </w:num>
-  <w:num w:numId="2" w16cid:durableId="7099426">
+  <w:num w:numId="2" w16cid:durableId="1458526779">
     <w:abstractNumId w:val="6"/>
   </w:num>
-  <w:num w:numId="3" w16cid:durableId="272203569">
+  <w:num w:numId="3" w16cid:durableId="147285472">
     <w:abstractNumId w:val="5"/>
   </w:num>
-  <w:num w:numId="4" w16cid:durableId="1426851719">
+  <w:num w:numId="4" w16cid:durableId="1052659255">
     <w:abstractNumId w:val="4"/>
   </w:num>
-  <w:num w:numId="5" w16cid:durableId="424107193">
+  <w:num w:numId="5" w16cid:durableId="799422730">
     <w:abstractNumId w:val="7"/>
   </w:num>
-  <w:num w:numId="6" w16cid:durableId="2056000684">
+  <w:num w:numId="6" w16cid:durableId="1673294226">
     <w:abstractNumId w:val="3"/>
   </w:num>
-  <w:num w:numId="7" w16cid:durableId="2000648586">
+  <w:num w:numId="7" w16cid:durableId="129830532">
     <w:abstractNumId w:val="2"/>
   </w:num>
-  <w:num w:numId="8" w16cid:durableId="634410264">
+  <w:num w:numId="8" w16cid:durableId="1455249806">
     <w:abstractNumId w:val="1"/>
   </w:num>
-  <w:num w:numId="9" w16cid:durableId="1315136601">
+  <w:num w:numId="9" w16cid:durableId="458840282">
     <w:abstractNumId w:val="0"/>
   </w:num>
 </w:numbering>
@@ -50971,7 +50971,7 @@
     <w:autoRedefine/>
     <w:uiPriority w:val="39"/>
     <w:unhideWhenUsed/>
-    <w:rsid w:val="005A3A23"/>
+    <w:rsid w:val="004974DC"/>
     <w:pPr>
       <w:spacing w:before="10" w:after="10" w:line="240" w:lineRule="auto"/>
     </w:pPr>
@@ -50986,7 +50986,7 @@
     <w:autoRedefine/>
     <w:uiPriority w:val="39"/>
     <w:unhideWhenUsed/>
-    <w:rsid w:val="005A3A23"/>
+    <w:rsid w:val="004974DC"/>
     <w:pPr>
       <w:spacing w:after="0" w:line="240" w:lineRule="auto"/>
       <w:ind w:left="170"/>
@@ -51000,7 +51000,7 @@
     <w:basedOn w:val="Fuentedeprrafopredeter"/>
     <w:uiPriority w:val="99"/>
     <w:unhideWhenUsed/>
-    <w:rsid w:val="005A3A23"/>
+    <w:rsid w:val="004974DC"/>
     <w:rPr>
       <w:color w:val="0000FF" w:themeColor="hyperlink"/>
       <w:u w:val="single"/>

</xml_diff>

<commit_message>
Corregir RR y WACC en fórmula del TV, unificar tickers de comparables, sacar generadores del repo y frases de IA
</commit_message>
<xml_diff>
--- a/01_Reporte_PDF/Informe_Valuacion_Aluar_UNCuyo.docx
+++ b/01_Reporte_PDF/Informe_Valuacion_Aluar_UNCuyo.docx
@@ -1340,7 +1340,7 @@
         </w:rPr>
         <w:fldChar w:fldCharType="separate"/>
       </w:r>
-      <w:hyperlink w:anchor="_Toc238661542" w:history="1">
+      <w:hyperlink w:anchor="_Toc238663117" w:history="1">
         <w:r>
           <w:rPr>
             <w:rStyle w:val="Hipervnculo"/>
@@ -1367,7 +1367,7 @@
             <w:noProof/>
             <w:webHidden/>
           </w:rPr>
-          <w:instrText xml:space="preserve"> PAGEREF _Toc238661542 \h </w:instrText>
+          <w:instrText xml:space="preserve"> PAGEREF _Toc238663117 \h </w:instrText>
         </w:r>
         <w:r>
           <w:rPr>
@@ -1414,7 +1414,7 @@
           <w14:ligatures w14:val="standardContextual"/>
         </w:rPr>
       </w:pPr>
-      <w:hyperlink w:anchor="_Toc238661543" w:history="1">
+      <w:hyperlink w:anchor="_Toc238663118" w:history="1">
         <w:r>
           <w:rPr>
             <w:rStyle w:val="Hipervnculo"/>
@@ -1441,7 +1441,7 @@
             <w:noProof/>
             <w:webHidden/>
           </w:rPr>
-          <w:instrText xml:space="preserve"> PAGEREF _Toc238661543 \h </w:instrText>
+          <w:instrText xml:space="preserve"> PAGEREF _Toc238663118 \h </w:instrText>
         </w:r>
         <w:r>
           <w:rPr>
@@ -1488,7 +1488,7 @@
           <w14:ligatures w14:val="standardContextual"/>
         </w:rPr>
       </w:pPr>
-      <w:hyperlink w:anchor="_Toc238661544" w:history="1">
+      <w:hyperlink w:anchor="_Toc238663119" w:history="1">
         <w:r>
           <w:rPr>
             <w:rStyle w:val="Hipervnculo"/>
@@ -1515,7 +1515,7 @@
             <w:noProof/>
             <w:webHidden/>
           </w:rPr>
-          <w:instrText xml:space="preserve"> PAGEREF _Toc238661544 \h </w:instrText>
+          <w:instrText xml:space="preserve"> PAGEREF _Toc238663119 \h </w:instrText>
         </w:r>
         <w:r>
           <w:rPr>
@@ -1562,7 +1562,7 @@
           <w14:ligatures w14:val="standardContextual"/>
         </w:rPr>
       </w:pPr>
-      <w:hyperlink w:anchor="_Toc238661545" w:history="1">
+      <w:hyperlink w:anchor="_Toc238663120" w:history="1">
         <w:r>
           <w:rPr>
             <w:rStyle w:val="Hipervnculo"/>
@@ -1589,7 +1589,7 @@
             <w:noProof/>
             <w:webHidden/>
           </w:rPr>
-          <w:instrText xml:space="preserve"> PAGEREF _Toc238661545 \h </w:instrText>
+          <w:instrText xml:space="preserve"> PAGEREF _Toc238663120 \h </w:instrText>
         </w:r>
         <w:r>
           <w:rPr>
@@ -1636,7 +1636,7 @@
           <w14:ligatures w14:val="standardContextual"/>
         </w:rPr>
       </w:pPr>
-      <w:hyperlink w:anchor="_Toc238661546" w:history="1">
+      <w:hyperlink w:anchor="_Toc238663121" w:history="1">
         <w:r>
           <w:rPr>
             <w:rStyle w:val="Hipervnculo"/>
@@ -1663,7 +1663,7 @@
             <w:noProof/>
             <w:webHidden/>
           </w:rPr>
-          <w:instrText xml:space="preserve"> PAGEREF _Toc238661546 \h </w:instrText>
+          <w:instrText xml:space="preserve"> PAGEREF _Toc238663121 \h </w:instrText>
         </w:r>
         <w:r>
           <w:rPr>
@@ -1710,7 +1710,7 @@
           <w14:ligatures w14:val="standardContextual"/>
         </w:rPr>
       </w:pPr>
-      <w:hyperlink w:anchor="_Toc238661547" w:history="1">
+      <w:hyperlink w:anchor="_Toc238663122" w:history="1">
         <w:r>
           <w:rPr>
             <w:rStyle w:val="Hipervnculo"/>
@@ -1737,7 +1737,7 @@
             <w:noProof/>
             <w:webHidden/>
           </w:rPr>
-          <w:instrText xml:space="preserve"> PAGEREF _Toc238661547 \h </w:instrText>
+          <w:instrText xml:space="preserve"> PAGEREF _Toc238663122 \h </w:instrText>
         </w:r>
         <w:r>
           <w:rPr>
@@ -1784,7 +1784,7 @@
           <w14:ligatures w14:val="standardContextual"/>
         </w:rPr>
       </w:pPr>
-      <w:hyperlink w:anchor="_Toc238661548" w:history="1">
+      <w:hyperlink w:anchor="_Toc238663123" w:history="1">
         <w:r>
           <w:rPr>
             <w:rStyle w:val="Hipervnculo"/>
@@ -1811,7 +1811,7 @@
             <w:noProof/>
             <w:webHidden/>
           </w:rPr>
-          <w:instrText xml:space="preserve"> PAGEREF _Toc238661548 \h </w:instrText>
+          <w:instrText xml:space="preserve"> PAGEREF _Toc238663123 \h </w:instrText>
         </w:r>
         <w:r>
           <w:rPr>
@@ -1858,7 +1858,7 @@
           <w14:ligatures w14:val="standardContextual"/>
         </w:rPr>
       </w:pPr>
-      <w:hyperlink w:anchor="_Toc238661549" w:history="1">
+      <w:hyperlink w:anchor="_Toc238663124" w:history="1">
         <w:r>
           <w:rPr>
             <w:rStyle w:val="Hipervnculo"/>
@@ -1885,7 +1885,7 @@
             <w:noProof/>
             <w:webHidden/>
           </w:rPr>
-          <w:instrText xml:space="preserve"> PAGEREF _Toc238661549 \h </w:instrText>
+          <w:instrText xml:space="preserve"> PAGEREF _Toc238663124 \h </w:instrText>
         </w:r>
         <w:r>
           <w:rPr>
@@ -1932,7 +1932,7 @@
           <w14:ligatures w14:val="standardContextual"/>
         </w:rPr>
       </w:pPr>
-      <w:hyperlink w:anchor="_Toc238661550" w:history="1">
+      <w:hyperlink w:anchor="_Toc238663125" w:history="1">
         <w:r>
           <w:rPr>
             <w:rStyle w:val="Hipervnculo"/>
@@ -1959,7 +1959,7 @@
             <w:noProof/>
             <w:webHidden/>
           </w:rPr>
-          <w:instrText xml:space="preserve"> PAGEREF _Toc238661550 \h </w:instrText>
+          <w:instrText xml:space="preserve"> PAGEREF _Toc238663125 \h </w:instrText>
         </w:r>
         <w:r>
           <w:rPr>
@@ -2006,7 +2006,7 @@
           <w14:ligatures w14:val="standardContextual"/>
         </w:rPr>
       </w:pPr>
-      <w:hyperlink w:anchor="_Toc238661551" w:history="1">
+      <w:hyperlink w:anchor="_Toc238663126" w:history="1">
         <w:r>
           <w:rPr>
             <w:rStyle w:val="Hipervnculo"/>
@@ -2033,7 +2033,7 @@
             <w:noProof/>
             <w:webHidden/>
           </w:rPr>
-          <w:instrText xml:space="preserve"> PAGEREF _Toc238661551 \h </w:instrText>
+          <w:instrText xml:space="preserve"> PAGEREF _Toc238663126 \h </w:instrText>
         </w:r>
         <w:r>
           <w:rPr>
@@ -2080,7 +2080,7 @@
           <w14:ligatures w14:val="standardContextual"/>
         </w:rPr>
       </w:pPr>
-      <w:hyperlink w:anchor="_Toc238661552" w:history="1">
+      <w:hyperlink w:anchor="_Toc238663127" w:history="1">
         <w:r>
           <w:rPr>
             <w:rStyle w:val="Hipervnculo"/>
@@ -2107,7 +2107,7 @@
             <w:noProof/>
             <w:webHidden/>
           </w:rPr>
-          <w:instrText xml:space="preserve"> PAGEREF _Toc238661552 \h </w:instrText>
+          <w:instrText xml:space="preserve"> PAGEREF _Toc238663127 \h </w:instrText>
         </w:r>
         <w:r>
           <w:rPr>
@@ -2154,7 +2154,7 @@
           <w14:ligatures w14:val="standardContextual"/>
         </w:rPr>
       </w:pPr>
-      <w:hyperlink w:anchor="_Toc238661553" w:history="1">
+      <w:hyperlink w:anchor="_Toc238663128" w:history="1">
         <w:r>
           <w:rPr>
             <w:rStyle w:val="Hipervnculo"/>
@@ -2181,7 +2181,7 @@
             <w:noProof/>
             <w:webHidden/>
           </w:rPr>
-          <w:instrText xml:space="preserve"> PAGEREF _Toc238661553 \h </w:instrText>
+          <w:instrText xml:space="preserve"> PAGEREF _Toc238663128 \h </w:instrText>
         </w:r>
         <w:r>
           <w:rPr>
@@ -2228,7 +2228,7 @@
           <w14:ligatures w14:val="standardContextual"/>
         </w:rPr>
       </w:pPr>
-      <w:hyperlink w:anchor="_Toc238661554" w:history="1">
+      <w:hyperlink w:anchor="_Toc238663129" w:history="1">
         <w:r>
           <w:rPr>
             <w:rStyle w:val="Hipervnculo"/>
@@ -2255,7 +2255,7 @@
             <w:noProof/>
             <w:webHidden/>
           </w:rPr>
-          <w:instrText xml:space="preserve"> PAGEREF _Toc238661554 \h </w:instrText>
+          <w:instrText xml:space="preserve"> PAGEREF _Toc238663129 \h </w:instrText>
         </w:r>
         <w:r>
           <w:rPr>
@@ -2302,7 +2302,7 @@
           <w14:ligatures w14:val="standardContextual"/>
         </w:rPr>
       </w:pPr>
-      <w:hyperlink w:anchor="_Toc238661555" w:history="1">
+      <w:hyperlink w:anchor="_Toc238663130" w:history="1">
         <w:r>
           <w:rPr>
             <w:rStyle w:val="Hipervnculo"/>
@@ -2329,7 +2329,7 @@
             <w:noProof/>
             <w:webHidden/>
           </w:rPr>
-          <w:instrText xml:space="preserve"> PAGEREF _Toc238661555 \h </w:instrText>
+          <w:instrText xml:space="preserve"> PAGEREF _Toc238663130 \h </w:instrText>
         </w:r>
         <w:r>
           <w:rPr>
@@ -2376,7 +2376,7 @@
           <w14:ligatures w14:val="standardContextual"/>
         </w:rPr>
       </w:pPr>
-      <w:hyperlink w:anchor="_Toc238661556" w:history="1">
+      <w:hyperlink w:anchor="_Toc238663131" w:history="1">
         <w:r>
           <w:rPr>
             <w:rStyle w:val="Hipervnculo"/>
@@ -2403,7 +2403,7 @@
             <w:noProof/>
             <w:webHidden/>
           </w:rPr>
-          <w:instrText xml:space="preserve"> PAGEREF _Toc238661556 \h </w:instrText>
+          <w:instrText xml:space="preserve"> PAGEREF _Toc238663131 \h </w:instrText>
         </w:r>
         <w:r>
           <w:rPr>
@@ -2450,7 +2450,7 @@
           <w14:ligatures w14:val="standardContextual"/>
         </w:rPr>
       </w:pPr>
-      <w:hyperlink w:anchor="_Toc238661557" w:history="1">
+      <w:hyperlink w:anchor="_Toc238663132" w:history="1">
         <w:r>
           <w:rPr>
             <w:rStyle w:val="Hipervnculo"/>
@@ -2477,7 +2477,7 @@
             <w:noProof/>
             <w:webHidden/>
           </w:rPr>
-          <w:instrText xml:space="preserve"> PAGEREF _Toc238661557 \h </w:instrText>
+          <w:instrText xml:space="preserve"> PAGEREF _Toc238663132 \h </w:instrText>
         </w:r>
         <w:r>
           <w:rPr>
@@ -2524,7 +2524,7 @@
           <w14:ligatures w14:val="standardContextual"/>
         </w:rPr>
       </w:pPr>
-      <w:hyperlink w:anchor="_Toc238661558" w:history="1">
+      <w:hyperlink w:anchor="_Toc238663133" w:history="1">
         <w:r>
           <w:rPr>
             <w:rStyle w:val="Hipervnculo"/>
@@ -2551,7 +2551,7 @@
             <w:noProof/>
             <w:webHidden/>
           </w:rPr>
-          <w:instrText xml:space="preserve"> PAGEREF _Toc238661558 \h </w:instrText>
+          <w:instrText xml:space="preserve"> PAGEREF _Toc238663133 \h </w:instrText>
         </w:r>
         <w:r>
           <w:rPr>
@@ -2598,7 +2598,7 @@
           <w14:ligatures w14:val="standardContextual"/>
         </w:rPr>
       </w:pPr>
-      <w:hyperlink w:anchor="_Toc238661559" w:history="1">
+      <w:hyperlink w:anchor="_Toc238663134" w:history="1">
         <w:r>
           <w:rPr>
             <w:rStyle w:val="Hipervnculo"/>
@@ -2625,7 +2625,7 @@
             <w:noProof/>
             <w:webHidden/>
           </w:rPr>
-          <w:instrText xml:space="preserve"> PAGEREF _Toc238661559 \h </w:instrText>
+          <w:instrText xml:space="preserve"> PAGEREF _Toc238663134 \h </w:instrText>
         </w:r>
         <w:r>
           <w:rPr>
@@ -2672,7 +2672,7 @@
           <w14:ligatures w14:val="standardContextual"/>
         </w:rPr>
       </w:pPr>
-      <w:hyperlink w:anchor="_Toc238661560" w:history="1">
+      <w:hyperlink w:anchor="_Toc238663135" w:history="1">
         <w:r>
           <w:rPr>
             <w:rStyle w:val="Hipervnculo"/>
@@ -2699,7 +2699,7 @@
             <w:noProof/>
             <w:webHidden/>
           </w:rPr>
-          <w:instrText xml:space="preserve"> PAGEREF _Toc238661560 \h </w:instrText>
+          <w:instrText xml:space="preserve"> PAGEREF _Toc238663135 \h </w:instrText>
         </w:r>
         <w:r>
           <w:rPr>
@@ -2746,7 +2746,7 @@
           <w14:ligatures w14:val="standardContextual"/>
         </w:rPr>
       </w:pPr>
-      <w:hyperlink w:anchor="_Toc238661561" w:history="1">
+      <w:hyperlink w:anchor="_Toc238663136" w:history="1">
         <w:r>
           <w:rPr>
             <w:rStyle w:val="Hipervnculo"/>
@@ -2773,7 +2773,7 @@
             <w:noProof/>
             <w:webHidden/>
           </w:rPr>
-          <w:instrText xml:space="preserve"> PAGEREF _Toc238661561 \h </w:instrText>
+          <w:instrText xml:space="preserve"> PAGEREF _Toc238663136 \h </w:instrText>
         </w:r>
         <w:r>
           <w:rPr>
@@ -2820,7 +2820,7 @@
           <w14:ligatures w14:val="standardContextual"/>
         </w:rPr>
       </w:pPr>
-      <w:hyperlink w:anchor="_Toc238661562" w:history="1">
+      <w:hyperlink w:anchor="_Toc238663137" w:history="1">
         <w:r>
           <w:rPr>
             <w:rStyle w:val="Hipervnculo"/>
@@ -2847,7 +2847,7 @@
             <w:noProof/>
             <w:webHidden/>
           </w:rPr>
-          <w:instrText xml:space="preserve"> PAGEREF _Toc238661562 \h </w:instrText>
+          <w:instrText xml:space="preserve"> PAGEREF _Toc238663137 \h </w:instrText>
         </w:r>
         <w:r>
           <w:rPr>
@@ -2894,7 +2894,7 @@
           <w14:ligatures w14:val="standardContextual"/>
         </w:rPr>
       </w:pPr>
-      <w:hyperlink w:anchor="_Toc238661563" w:history="1">
+      <w:hyperlink w:anchor="_Toc238663138" w:history="1">
         <w:r>
           <w:rPr>
             <w:rStyle w:val="Hipervnculo"/>
@@ -2921,7 +2921,7 @@
             <w:noProof/>
             <w:webHidden/>
           </w:rPr>
-          <w:instrText xml:space="preserve"> PAGEREF _Toc238661563 \h </w:instrText>
+          <w:instrText xml:space="preserve"> PAGEREF _Toc238663138 \h </w:instrText>
         </w:r>
         <w:r>
           <w:rPr>
@@ -2968,7 +2968,7 @@
           <w14:ligatures w14:val="standardContextual"/>
         </w:rPr>
       </w:pPr>
-      <w:hyperlink w:anchor="_Toc238661564" w:history="1">
+      <w:hyperlink w:anchor="_Toc238663139" w:history="1">
         <w:r>
           <w:rPr>
             <w:rStyle w:val="Hipervnculo"/>
@@ -2995,7 +2995,7 @@
             <w:noProof/>
             <w:webHidden/>
           </w:rPr>
-          <w:instrText xml:space="preserve"> PAGEREF _Toc238661564 \h </w:instrText>
+          <w:instrText xml:space="preserve"> PAGEREF _Toc238663139 \h </w:instrText>
         </w:r>
         <w:r>
           <w:rPr>
@@ -3042,7 +3042,7 @@
           <w14:ligatures w14:val="standardContextual"/>
         </w:rPr>
       </w:pPr>
-      <w:hyperlink w:anchor="_Toc238661565" w:history="1">
+      <w:hyperlink w:anchor="_Toc238663140" w:history="1">
         <w:r>
           <w:rPr>
             <w:rStyle w:val="Hipervnculo"/>
@@ -3099,7 +3099,7 @@
             <w:noProof/>
             <w:webHidden/>
           </w:rPr>
-          <w:instrText xml:space="preserve"> PAGEREF _Toc238661565 \h </w:instrText>
+          <w:instrText xml:space="preserve"> PAGEREF _Toc238663140 \h </w:instrText>
         </w:r>
         <w:r>
           <w:rPr>
@@ -3146,7 +3146,7 @@
           <w14:ligatures w14:val="standardContextual"/>
         </w:rPr>
       </w:pPr>
-      <w:hyperlink w:anchor="_Toc238661566" w:history="1">
+      <w:hyperlink w:anchor="_Toc238663141" w:history="1">
         <w:r>
           <w:rPr>
             <w:rStyle w:val="Hipervnculo"/>
@@ -3173,7 +3173,7 @@
             <w:noProof/>
             <w:webHidden/>
           </w:rPr>
-          <w:instrText xml:space="preserve"> PAGEREF _Toc238661566 \h </w:instrText>
+          <w:instrText xml:space="preserve"> PAGEREF _Toc238663141 \h </w:instrText>
         </w:r>
         <w:r>
           <w:rPr>
@@ -3220,7 +3220,7 @@
           <w14:ligatures w14:val="standardContextual"/>
         </w:rPr>
       </w:pPr>
-      <w:hyperlink w:anchor="_Toc238661567" w:history="1">
+      <w:hyperlink w:anchor="_Toc238663142" w:history="1">
         <w:r>
           <w:rPr>
             <w:rStyle w:val="Hipervnculo"/>
@@ -3247,7 +3247,7 @@
             <w:noProof/>
             <w:webHidden/>
           </w:rPr>
-          <w:instrText xml:space="preserve"> PAGEREF _Toc238661567 \h </w:instrText>
+          <w:instrText xml:space="preserve"> PAGEREF _Toc238663142 \h </w:instrText>
         </w:r>
         <w:r>
           <w:rPr>
@@ -3294,7 +3294,7 @@
           <w14:ligatures w14:val="standardContextual"/>
         </w:rPr>
       </w:pPr>
-      <w:hyperlink w:anchor="_Toc238661568" w:history="1">
+      <w:hyperlink w:anchor="_Toc238663143" w:history="1">
         <w:r>
           <w:rPr>
             <w:rStyle w:val="Hipervnculo"/>
@@ -3321,7 +3321,7 @@
             <w:noProof/>
             <w:webHidden/>
           </w:rPr>
-          <w:instrText xml:space="preserve"> PAGEREF _Toc238661568 \h </w:instrText>
+          <w:instrText xml:space="preserve"> PAGEREF _Toc238663143 \h </w:instrText>
         </w:r>
         <w:r>
           <w:rPr>
@@ -3368,7 +3368,7 @@
           <w14:ligatures w14:val="standardContextual"/>
         </w:rPr>
       </w:pPr>
-      <w:hyperlink w:anchor="_Toc238661569" w:history="1">
+      <w:hyperlink w:anchor="_Toc238663144" w:history="1">
         <w:r>
           <w:rPr>
             <w:rStyle w:val="Hipervnculo"/>
@@ -3395,7 +3395,7 @@
             <w:noProof/>
             <w:webHidden/>
           </w:rPr>
-          <w:instrText xml:space="preserve"> PAGEREF _Toc238661569 \h </w:instrText>
+          <w:instrText xml:space="preserve"> PAGEREF _Toc238663144 \h </w:instrText>
         </w:r>
         <w:r>
           <w:rPr>
@@ -3442,7 +3442,7 @@
           <w14:ligatures w14:val="standardContextual"/>
         </w:rPr>
       </w:pPr>
-      <w:hyperlink w:anchor="_Toc238661570" w:history="1">
+      <w:hyperlink w:anchor="_Toc238663145" w:history="1">
         <w:r>
           <w:rPr>
             <w:rStyle w:val="Hipervnculo"/>
@@ -3469,7 +3469,7 @@
             <w:noProof/>
             <w:webHidden/>
           </w:rPr>
-          <w:instrText xml:space="preserve"> PAGEREF _Toc238661570 \h </w:instrText>
+          <w:instrText xml:space="preserve"> PAGEREF _Toc238663145 \h </w:instrText>
         </w:r>
         <w:r>
           <w:rPr>
@@ -3516,7 +3516,7 @@
           <w14:ligatures w14:val="standardContextual"/>
         </w:rPr>
       </w:pPr>
-      <w:hyperlink w:anchor="_Toc238661571" w:history="1">
+      <w:hyperlink w:anchor="_Toc238663146" w:history="1">
         <w:r>
           <w:rPr>
             <w:rStyle w:val="Hipervnculo"/>
@@ -3543,7 +3543,7 @@
             <w:noProof/>
             <w:webHidden/>
           </w:rPr>
-          <w:instrText xml:space="preserve"> PAGEREF _Toc238661571 \h </w:instrText>
+          <w:instrText xml:space="preserve"> PAGEREF _Toc238663146 \h </w:instrText>
         </w:r>
         <w:r>
           <w:rPr>
@@ -3590,7 +3590,7 @@
           <w14:ligatures w14:val="standardContextual"/>
         </w:rPr>
       </w:pPr>
-      <w:hyperlink w:anchor="_Toc238661572" w:history="1">
+      <w:hyperlink w:anchor="_Toc238663147" w:history="1">
         <w:r>
           <w:rPr>
             <w:rStyle w:val="Hipervnculo"/>
@@ -3617,7 +3617,7 @@
             <w:noProof/>
             <w:webHidden/>
           </w:rPr>
-          <w:instrText xml:space="preserve"> PAGEREF _Toc238661572 \h </w:instrText>
+          <w:instrText xml:space="preserve"> PAGEREF _Toc238663147 \h </w:instrText>
         </w:r>
         <w:r>
           <w:rPr>
@@ -3664,7 +3664,7 @@
           <w14:ligatures w14:val="standardContextual"/>
         </w:rPr>
       </w:pPr>
-      <w:hyperlink w:anchor="_Toc238661573" w:history="1">
+      <w:hyperlink w:anchor="_Toc238663148" w:history="1">
         <w:r>
           <w:rPr>
             <w:rStyle w:val="Hipervnculo"/>
@@ -3691,7 +3691,7 @@
             <w:noProof/>
             <w:webHidden/>
           </w:rPr>
-          <w:instrText xml:space="preserve"> PAGEREF _Toc238661573 \h </w:instrText>
+          <w:instrText xml:space="preserve"> PAGEREF _Toc238663148 \h </w:instrText>
         </w:r>
         <w:r>
           <w:rPr>
@@ -3738,7 +3738,7 @@
           <w14:ligatures w14:val="standardContextual"/>
         </w:rPr>
       </w:pPr>
-      <w:hyperlink w:anchor="_Toc238661574" w:history="1">
+      <w:hyperlink w:anchor="_Toc238663149" w:history="1">
         <w:r>
           <w:rPr>
             <w:rStyle w:val="Hipervnculo"/>
@@ -3765,7 +3765,7 @@
             <w:noProof/>
             <w:webHidden/>
           </w:rPr>
-          <w:instrText xml:space="preserve"> PAGEREF _Toc238661574 \h </w:instrText>
+          <w:instrText xml:space="preserve"> PAGEREF _Toc238663149 \h </w:instrText>
         </w:r>
         <w:r>
           <w:rPr>
@@ -3812,7 +3812,7 @@
           <w14:ligatures w14:val="standardContextual"/>
         </w:rPr>
       </w:pPr>
-      <w:hyperlink w:anchor="_Toc238661575" w:history="1">
+      <w:hyperlink w:anchor="_Toc238663150" w:history="1">
         <w:r>
           <w:rPr>
             <w:rStyle w:val="Hipervnculo"/>
@@ -3839,7 +3839,7 @@
             <w:noProof/>
             <w:webHidden/>
           </w:rPr>
-          <w:instrText xml:space="preserve"> PAGEREF _Toc238661575 \h </w:instrText>
+          <w:instrText xml:space="preserve"> PAGEREF _Toc238663150 \h </w:instrText>
         </w:r>
         <w:r>
           <w:rPr>
@@ -3886,7 +3886,7 @@
           <w14:ligatures w14:val="standardContextual"/>
         </w:rPr>
       </w:pPr>
-      <w:hyperlink w:anchor="_Toc238661576" w:history="1">
+      <w:hyperlink w:anchor="_Toc238663151" w:history="1">
         <w:r>
           <w:rPr>
             <w:rStyle w:val="Hipervnculo"/>
@@ -3913,7 +3913,7 @@
             <w:noProof/>
             <w:webHidden/>
           </w:rPr>
-          <w:instrText xml:space="preserve"> PAGEREF _Toc238661576 \h </w:instrText>
+          <w:instrText xml:space="preserve"> PAGEREF _Toc238663151 \h </w:instrText>
         </w:r>
         <w:r>
           <w:rPr>
@@ -3960,7 +3960,7 @@
           <w14:ligatures w14:val="standardContextual"/>
         </w:rPr>
       </w:pPr>
-      <w:hyperlink w:anchor="_Toc238661577" w:history="1">
+      <w:hyperlink w:anchor="_Toc238663152" w:history="1">
         <w:r>
           <w:rPr>
             <w:rStyle w:val="Hipervnculo"/>
@@ -3987,7 +3987,7 @@
             <w:noProof/>
             <w:webHidden/>
           </w:rPr>
-          <w:instrText xml:space="preserve"> PAGEREF _Toc238661577 \h </w:instrText>
+          <w:instrText xml:space="preserve"> PAGEREF _Toc238663152 \h </w:instrText>
         </w:r>
         <w:r>
           <w:rPr>
@@ -4034,7 +4034,7 @@
           <w14:ligatures w14:val="standardContextual"/>
         </w:rPr>
       </w:pPr>
-      <w:hyperlink w:anchor="_Toc238661578" w:history="1">
+      <w:hyperlink w:anchor="_Toc238663153" w:history="1">
         <w:r>
           <w:rPr>
             <w:rStyle w:val="Hipervnculo"/>
@@ -4061,7 +4061,7 @@
             <w:noProof/>
             <w:webHidden/>
           </w:rPr>
-          <w:instrText xml:space="preserve"> PAGEREF _Toc238661578 \h </w:instrText>
+          <w:instrText xml:space="preserve"> PAGEREF _Toc238663153 \h </w:instrText>
         </w:r>
         <w:r>
           <w:rPr>
@@ -4108,7 +4108,7 @@
           <w14:ligatures w14:val="standardContextual"/>
         </w:rPr>
       </w:pPr>
-      <w:hyperlink w:anchor="_Toc238661579" w:history="1">
+      <w:hyperlink w:anchor="_Toc238663154" w:history="1">
         <w:r>
           <w:rPr>
             <w:rStyle w:val="Hipervnculo"/>
@@ -4135,7 +4135,7 @@
             <w:noProof/>
             <w:webHidden/>
           </w:rPr>
-          <w:instrText xml:space="preserve"> PAGEREF _Toc238661579 \h </w:instrText>
+          <w:instrText xml:space="preserve"> PAGEREF _Toc238663154 \h </w:instrText>
         </w:r>
         <w:r>
           <w:rPr>
@@ -4182,7 +4182,7 @@
           <w14:ligatures w14:val="standardContextual"/>
         </w:rPr>
       </w:pPr>
-      <w:hyperlink w:anchor="_Toc238661580" w:history="1">
+      <w:hyperlink w:anchor="_Toc238663155" w:history="1">
         <w:r>
           <w:rPr>
             <w:rStyle w:val="Hipervnculo"/>
@@ -4209,7 +4209,7 @@
             <w:noProof/>
             <w:webHidden/>
           </w:rPr>
-          <w:instrText xml:space="preserve"> PAGEREF _Toc238661580 \h </w:instrText>
+          <w:instrText xml:space="preserve"> PAGEREF _Toc238663155 \h </w:instrText>
         </w:r>
         <w:r>
           <w:rPr>
@@ -4256,7 +4256,7 @@
           <w14:ligatures w14:val="standardContextual"/>
         </w:rPr>
       </w:pPr>
-      <w:hyperlink w:anchor="_Toc238661581" w:history="1">
+      <w:hyperlink w:anchor="_Toc238663156" w:history="1">
         <w:r>
           <w:rPr>
             <w:rStyle w:val="Hipervnculo"/>
@@ -4283,7 +4283,7 @@
             <w:noProof/>
             <w:webHidden/>
           </w:rPr>
-          <w:instrText xml:space="preserve"> PAGEREF _Toc238661581 \h </w:instrText>
+          <w:instrText xml:space="preserve"> PAGEREF _Toc238663156 \h </w:instrText>
         </w:r>
         <w:r>
           <w:rPr>
@@ -4330,7 +4330,7 @@
           <w14:ligatures w14:val="standardContextual"/>
         </w:rPr>
       </w:pPr>
-      <w:hyperlink w:anchor="_Toc238661582" w:history="1">
+      <w:hyperlink w:anchor="_Toc238663157" w:history="1">
         <w:r>
           <w:rPr>
             <w:rStyle w:val="Hipervnculo"/>
@@ -4357,7 +4357,7 @@
             <w:noProof/>
             <w:webHidden/>
           </w:rPr>
-          <w:instrText xml:space="preserve"> PAGEREF _Toc238661582 \h </w:instrText>
+          <w:instrText xml:space="preserve"> PAGEREF _Toc238663157 \h </w:instrText>
         </w:r>
         <w:r>
           <w:rPr>
@@ -4404,7 +4404,7 @@
           <w14:ligatures w14:val="standardContextual"/>
         </w:rPr>
       </w:pPr>
-      <w:hyperlink w:anchor="_Toc238661583" w:history="1">
+      <w:hyperlink w:anchor="_Toc238663158" w:history="1">
         <w:r>
           <w:rPr>
             <w:rStyle w:val="Hipervnculo"/>
@@ -4431,7 +4431,7 @@
             <w:noProof/>
             <w:webHidden/>
           </w:rPr>
-          <w:instrText xml:space="preserve"> PAGEREF _Toc238661583 \h </w:instrText>
+          <w:instrText xml:space="preserve"> PAGEREF _Toc238663158 \h </w:instrText>
         </w:r>
         <w:r>
           <w:rPr>
@@ -4478,7 +4478,7 @@
           <w14:ligatures w14:val="standardContextual"/>
         </w:rPr>
       </w:pPr>
-      <w:hyperlink w:anchor="_Toc238661584" w:history="1">
+      <w:hyperlink w:anchor="_Toc238663159" w:history="1">
         <w:r>
           <w:rPr>
             <w:rStyle w:val="Hipervnculo"/>
@@ -4505,7 +4505,7 @@
             <w:noProof/>
             <w:webHidden/>
           </w:rPr>
-          <w:instrText xml:space="preserve"> PAGEREF _Toc238661584 \h </w:instrText>
+          <w:instrText xml:space="preserve"> PAGEREF _Toc238663159 \h </w:instrText>
         </w:r>
         <w:r>
           <w:rPr>
@@ -4552,7 +4552,7 @@
           <w14:ligatures w14:val="standardContextual"/>
         </w:rPr>
       </w:pPr>
-      <w:hyperlink w:anchor="_Toc238661585" w:history="1">
+      <w:hyperlink w:anchor="_Toc238663160" w:history="1">
         <w:r>
           <w:rPr>
             <w:rStyle w:val="Hipervnculo"/>
@@ -4579,7 +4579,7 @@
             <w:noProof/>
             <w:webHidden/>
           </w:rPr>
-          <w:instrText xml:space="preserve"> PAGEREF _Toc238661585 \h </w:instrText>
+          <w:instrText xml:space="preserve"> PAGEREF _Toc238663160 \h </w:instrText>
         </w:r>
         <w:r>
           <w:rPr>
@@ -4626,7 +4626,7 @@
           <w14:ligatures w14:val="standardContextual"/>
         </w:rPr>
       </w:pPr>
-      <w:hyperlink w:anchor="_Toc238661586" w:history="1">
+      <w:hyperlink w:anchor="_Toc238663161" w:history="1">
         <w:r>
           <w:rPr>
             <w:rStyle w:val="Hipervnculo"/>
@@ -4653,7 +4653,7 @@
             <w:noProof/>
             <w:webHidden/>
           </w:rPr>
-          <w:instrText xml:space="preserve"> PAGEREF _Toc238661586 \h </w:instrText>
+          <w:instrText xml:space="preserve"> PAGEREF _Toc238663161 \h </w:instrText>
         </w:r>
         <w:r>
           <w:rPr>
@@ -4700,7 +4700,7 @@
           <w14:ligatures w14:val="standardContextual"/>
         </w:rPr>
       </w:pPr>
-      <w:hyperlink w:anchor="_Toc238661587" w:history="1">
+      <w:hyperlink w:anchor="_Toc238663162" w:history="1">
         <w:r>
           <w:rPr>
             <w:rStyle w:val="Hipervnculo"/>
@@ -4727,7 +4727,7 @@
             <w:noProof/>
             <w:webHidden/>
           </w:rPr>
-          <w:instrText xml:space="preserve"> PAGEREF _Toc238661587 \h </w:instrText>
+          <w:instrText xml:space="preserve"> PAGEREF _Toc238663162 \h </w:instrText>
         </w:r>
         <w:r>
           <w:rPr>
@@ -4774,7 +4774,7 @@
           <w14:ligatures w14:val="standardContextual"/>
         </w:rPr>
       </w:pPr>
-      <w:hyperlink w:anchor="_Toc238661588" w:history="1">
+      <w:hyperlink w:anchor="_Toc238663163" w:history="1">
         <w:r>
           <w:rPr>
             <w:rStyle w:val="Hipervnculo"/>
@@ -4801,7 +4801,7 @@
             <w:noProof/>
             <w:webHidden/>
           </w:rPr>
-          <w:instrText xml:space="preserve"> PAGEREF _Toc238661588 \h </w:instrText>
+          <w:instrText xml:space="preserve"> PAGEREF _Toc238663163 \h </w:instrText>
         </w:r>
         <w:r>
           <w:rPr>
@@ -4848,7 +4848,7 @@
           <w14:ligatures w14:val="standardContextual"/>
         </w:rPr>
       </w:pPr>
-      <w:hyperlink w:anchor="_Toc238661589" w:history="1">
+      <w:hyperlink w:anchor="_Toc238663164" w:history="1">
         <w:r>
           <w:rPr>
             <w:rStyle w:val="Hipervnculo"/>
@@ -4875,7 +4875,7 @@
             <w:noProof/>
             <w:webHidden/>
           </w:rPr>
-          <w:instrText xml:space="preserve"> PAGEREF _Toc238661589 \h </w:instrText>
+          <w:instrText xml:space="preserve"> PAGEREF _Toc238663164 \h </w:instrText>
         </w:r>
         <w:r>
           <w:rPr>
@@ -4922,7 +4922,7 @@
           <w14:ligatures w14:val="standardContextual"/>
         </w:rPr>
       </w:pPr>
-      <w:hyperlink w:anchor="_Toc238661590" w:history="1">
+      <w:hyperlink w:anchor="_Toc238663165" w:history="1">
         <w:r>
           <w:rPr>
             <w:rStyle w:val="Hipervnculo"/>
@@ -4949,7 +4949,7 @@
             <w:noProof/>
             <w:webHidden/>
           </w:rPr>
-          <w:instrText xml:space="preserve"> PAGEREF _Toc238661590 \h </w:instrText>
+          <w:instrText xml:space="preserve"> PAGEREF _Toc238663165 \h </w:instrText>
         </w:r>
         <w:r>
           <w:rPr>
@@ -4996,7 +4996,7 @@
           <w14:ligatures w14:val="standardContextual"/>
         </w:rPr>
       </w:pPr>
-      <w:hyperlink w:anchor="_Toc238661591" w:history="1">
+      <w:hyperlink w:anchor="_Toc238663166" w:history="1">
         <w:r>
           <w:rPr>
             <w:rStyle w:val="Hipervnculo"/>
@@ -5023,7 +5023,7 @@
             <w:noProof/>
             <w:webHidden/>
           </w:rPr>
-          <w:instrText xml:space="preserve"> PAGEREF _Toc238661591 \h </w:instrText>
+          <w:instrText xml:space="preserve"> PAGEREF _Toc238663166 \h </w:instrText>
         </w:r>
         <w:r>
           <w:rPr>
@@ -5070,7 +5070,7 @@
           <w14:ligatures w14:val="standardContextual"/>
         </w:rPr>
       </w:pPr>
-      <w:hyperlink w:anchor="_Toc238661592" w:history="1">
+      <w:hyperlink w:anchor="_Toc238663167" w:history="1">
         <w:r>
           <w:rPr>
             <w:rStyle w:val="Hipervnculo"/>
@@ -5097,7 +5097,7 @@
             <w:noProof/>
             <w:webHidden/>
           </w:rPr>
-          <w:instrText xml:space="preserve"> PAGEREF _Toc238661592 \h </w:instrText>
+          <w:instrText xml:space="preserve"> PAGEREF _Toc238663167 \h </w:instrText>
         </w:r>
         <w:r>
           <w:rPr>
@@ -5144,7 +5144,7 @@
           <w14:ligatures w14:val="standardContextual"/>
         </w:rPr>
       </w:pPr>
-      <w:hyperlink w:anchor="_Toc238661593" w:history="1">
+      <w:hyperlink w:anchor="_Toc238663168" w:history="1">
         <w:r>
           <w:rPr>
             <w:rStyle w:val="Hipervnculo"/>
@@ -5171,7 +5171,7 @@
             <w:noProof/>
             <w:webHidden/>
           </w:rPr>
-          <w:instrText xml:space="preserve"> PAGEREF _Toc238661593 \h </w:instrText>
+          <w:instrText xml:space="preserve"> PAGEREF _Toc238663168 \h </w:instrText>
         </w:r>
         <w:r>
           <w:rPr>
@@ -5218,7 +5218,7 @@
           <w14:ligatures w14:val="standardContextual"/>
         </w:rPr>
       </w:pPr>
-      <w:hyperlink w:anchor="_Toc238661594" w:history="1">
+      <w:hyperlink w:anchor="_Toc238663169" w:history="1">
         <w:r>
           <w:rPr>
             <w:rStyle w:val="Hipervnculo"/>
@@ -5245,7 +5245,7 @@
             <w:noProof/>
             <w:webHidden/>
           </w:rPr>
-          <w:instrText xml:space="preserve"> PAGEREF _Toc238661594 \h </w:instrText>
+          <w:instrText xml:space="preserve"> PAGEREF _Toc238663169 \h </w:instrText>
         </w:r>
         <w:r>
           <w:rPr>
@@ -5292,7 +5292,7 @@
           <w14:ligatures w14:val="standardContextual"/>
         </w:rPr>
       </w:pPr>
-      <w:hyperlink w:anchor="_Toc238661595" w:history="1">
+      <w:hyperlink w:anchor="_Toc238663170" w:history="1">
         <w:r>
           <w:rPr>
             <w:rStyle w:val="Hipervnculo"/>
@@ -5319,7 +5319,7 @@
             <w:noProof/>
             <w:webHidden/>
           </w:rPr>
-          <w:instrText xml:space="preserve"> PAGEREF _Toc238661595 \h </w:instrText>
+          <w:instrText xml:space="preserve"> PAGEREF _Toc238663170 \h </w:instrText>
         </w:r>
         <w:r>
           <w:rPr>
@@ -5366,7 +5366,7 @@
           <w14:ligatures w14:val="standardContextual"/>
         </w:rPr>
       </w:pPr>
-      <w:hyperlink w:anchor="_Toc238661596" w:history="1">
+      <w:hyperlink w:anchor="_Toc238663171" w:history="1">
         <w:r>
           <w:rPr>
             <w:rStyle w:val="Hipervnculo"/>
@@ -5393,7 +5393,7 @@
             <w:noProof/>
             <w:webHidden/>
           </w:rPr>
-          <w:instrText xml:space="preserve"> PAGEREF _Toc238661596 \h </w:instrText>
+          <w:instrText xml:space="preserve"> PAGEREF _Toc238663171 \h </w:instrText>
         </w:r>
         <w:r>
           <w:rPr>
@@ -5440,7 +5440,7 @@
           <w14:ligatures w14:val="standardContextual"/>
         </w:rPr>
       </w:pPr>
-      <w:hyperlink w:anchor="_Toc238661597" w:history="1">
+      <w:hyperlink w:anchor="_Toc238663172" w:history="1">
         <w:r>
           <w:rPr>
             <w:rStyle w:val="Hipervnculo"/>
@@ -5467,7 +5467,7 @@
             <w:noProof/>
             <w:webHidden/>
           </w:rPr>
-          <w:instrText xml:space="preserve"> PAGEREF _Toc238661597 \h </w:instrText>
+          <w:instrText xml:space="preserve"> PAGEREF _Toc238663172 \h </w:instrText>
         </w:r>
         <w:r>
           <w:rPr>
@@ -5514,7 +5514,7 @@
           <w14:ligatures w14:val="standardContextual"/>
         </w:rPr>
       </w:pPr>
-      <w:hyperlink w:anchor="_Toc238661598" w:history="1">
+      <w:hyperlink w:anchor="_Toc238663173" w:history="1">
         <w:r>
           <w:rPr>
             <w:rStyle w:val="Hipervnculo"/>
@@ -5541,7 +5541,7 @@
             <w:noProof/>
             <w:webHidden/>
           </w:rPr>
-          <w:instrText xml:space="preserve"> PAGEREF _Toc238661598 \h </w:instrText>
+          <w:instrText xml:space="preserve"> PAGEREF _Toc238663173 \h </w:instrText>
         </w:r>
         <w:r>
           <w:rPr>
@@ -5588,7 +5588,7 @@
           <w14:ligatures w14:val="standardContextual"/>
         </w:rPr>
       </w:pPr>
-      <w:hyperlink w:anchor="_Toc238661599" w:history="1">
+      <w:hyperlink w:anchor="_Toc238663174" w:history="1">
         <w:r>
           <w:rPr>
             <w:rStyle w:val="Hipervnculo"/>
@@ -5615,7 +5615,7 @@
             <w:noProof/>
             <w:webHidden/>
           </w:rPr>
-          <w:instrText xml:space="preserve"> PAGEREF _Toc238661599 \h </w:instrText>
+          <w:instrText xml:space="preserve"> PAGEREF _Toc238663174 \h </w:instrText>
         </w:r>
         <w:r>
           <w:rPr>
@@ -5662,7 +5662,7 @@
           <w14:ligatures w14:val="standardContextual"/>
         </w:rPr>
       </w:pPr>
-      <w:hyperlink w:anchor="_Toc238661600" w:history="1">
+      <w:hyperlink w:anchor="_Toc238663175" w:history="1">
         <w:r>
           <w:rPr>
             <w:rStyle w:val="Hipervnculo"/>
@@ -5689,7 +5689,7 @@
             <w:noProof/>
             <w:webHidden/>
           </w:rPr>
-          <w:instrText xml:space="preserve"> PAGEREF _Toc238661600 \h </w:instrText>
+          <w:instrText xml:space="preserve"> PAGEREF _Toc238663175 \h </w:instrText>
         </w:r>
         <w:r>
           <w:rPr>
@@ -5736,7 +5736,7 @@
           <w14:ligatures w14:val="standardContextual"/>
         </w:rPr>
       </w:pPr>
-      <w:hyperlink w:anchor="_Toc238661601" w:history="1">
+      <w:hyperlink w:anchor="_Toc238663176" w:history="1">
         <w:r>
           <w:rPr>
             <w:rStyle w:val="Hipervnculo"/>
@@ -5763,7 +5763,7 @@
             <w:noProof/>
             <w:webHidden/>
           </w:rPr>
-          <w:instrText xml:space="preserve"> PAGEREF _Toc238661601 \h </w:instrText>
+          <w:instrText xml:space="preserve"> PAGEREF _Toc238663176 \h </w:instrText>
         </w:r>
         <w:r>
           <w:rPr>
@@ -5810,7 +5810,7 @@
           <w14:ligatures w14:val="standardContextual"/>
         </w:rPr>
       </w:pPr>
-      <w:hyperlink w:anchor="_Toc238661602" w:history="1">
+      <w:hyperlink w:anchor="_Toc238663177" w:history="1">
         <w:r>
           <w:rPr>
             <w:rStyle w:val="Hipervnculo"/>
@@ -5837,7 +5837,7 @@
             <w:noProof/>
             <w:webHidden/>
           </w:rPr>
-          <w:instrText xml:space="preserve"> PAGEREF _Toc238661602 \h </w:instrText>
+          <w:instrText xml:space="preserve"> PAGEREF _Toc238663177 \h </w:instrText>
         </w:r>
         <w:r>
           <w:rPr>
@@ -6963,7 +6963,7 @@
         <w:pStyle w:val="Ttulo1"/>
         <w:spacing w:before="100" w:after="30"/>
       </w:pPr>
-      <w:bookmarkStart w:id="0" w:name="_Toc238661542"/>
+      <w:bookmarkStart w:id="0" w:name="_Toc238663117"/>
       <w:r>
         <w:rPr>
           <w:rFonts w:ascii="Georgia" w:hAnsi="Georgia"/>
@@ -6979,7 +6979,7 @@
         <w:pStyle w:val="Ttulo2"/>
         <w:spacing w:before="70" w:after="20"/>
       </w:pPr>
-      <w:bookmarkStart w:id="1" w:name="_Toc238661543"/>
+      <w:bookmarkStart w:id="1" w:name="_Toc238663118"/>
       <w:r>
         <w:rPr>
           <w:rFonts w:ascii="Georgia" w:hAnsi="Georgia"/>
@@ -7020,7 +7020,7 @@
         <w:pStyle w:val="Ttulo2"/>
         <w:spacing w:before="70" w:after="20"/>
       </w:pPr>
-      <w:bookmarkStart w:id="2" w:name="_Toc238661544"/>
+      <w:bookmarkStart w:id="2" w:name="_Toc238663119"/>
       <w:r>
         <w:rPr>
           <w:rFonts w:ascii="Georgia" w:hAnsi="Georgia"/>
@@ -7082,7 +7082,7 @@
               </w:rPr>
               <w:lastRenderedPageBreak/>
               <w:drawing>
-                <wp:inline distT="0" distB="0" distL="0" distR="0" wp14:anchorId="3C158D5A" wp14:editId="21DC8665">
+                <wp:inline distT="0" distB="0" distL="0" distR="0" wp14:anchorId="51D67E14" wp14:editId="2CAF973D">
                   <wp:extent cx="2926080" cy="1524412"/>
                   <wp:effectExtent l="0" t="0" r="0" b="0"/>
                   <wp:docPr id="1" name="Picture 1"/>
@@ -7141,7 +7141,7 @@
                 <w:noProof/>
               </w:rPr>
               <w:drawing>
-                <wp:inline distT="0" distB="0" distL="0" distR="0" wp14:anchorId="241C9C39" wp14:editId="78A1EDC7">
+                <wp:inline distT="0" distB="0" distL="0" distR="0" wp14:anchorId="6749CE0F" wp14:editId="1572F98E">
                   <wp:extent cx="2926080" cy="1437831"/>
                   <wp:effectExtent l="0" t="0" r="0" b="0"/>
                   <wp:docPr id="2" name="Picture 2"/>
@@ -7246,7 +7246,7 @@
         <w:pStyle w:val="Ttulo2"/>
         <w:spacing w:before="70" w:after="20"/>
       </w:pPr>
-      <w:bookmarkStart w:id="3" w:name="_Toc238661545"/>
+      <w:bookmarkStart w:id="3" w:name="_Toc238663120"/>
       <w:r>
         <w:rPr>
           <w:rFonts w:ascii="Georgia" w:hAnsi="Georgia"/>
@@ -7373,7 +7373,7 @@
         <w:pStyle w:val="Ttulo2"/>
         <w:spacing w:before="70" w:after="20"/>
       </w:pPr>
-      <w:bookmarkStart w:id="4" w:name="_Toc238661546"/>
+      <w:bookmarkStart w:id="4" w:name="_Toc238663121"/>
       <w:r>
         <w:rPr>
           <w:rFonts w:ascii="Georgia" w:hAnsi="Georgia"/>
@@ -7885,7 +7885,7 @@
         <w:pStyle w:val="Ttulo2"/>
         <w:spacing w:before="70" w:after="20"/>
       </w:pPr>
-      <w:bookmarkStart w:id="5" w:name="_Toc238661547"/>
+      <w:bookmarkStart w:id="5" w:name="_Toc238663122"/>
       <w:r>
         <w:rPr>
           <w:rFonts w:ascii="Georgia" w:hAnsi="Georgia"/>
@@ -8017,7 +8017,7 @@
         <w:pStyle w:val="Ttulo2"/>
         <w:spacing w:before="70" w:after="20"/>
       </w:pPr>
-      <w:bookmarkStart w:id="6" w:name="_Toc238661548"/>
+      <w:bookmarkStart w:id="6" w:name="_Toc238663123"/>
       <w:r>
         <w:rPr>
           <w:rFonts w:ascii="Georgia" w:hAnsi="Georgia"/>
@@ -9242,7 +9242,7 @@
         <w:pStyle w:val="Ttulo1"/>
         <w:spacing w:before="100" w:after="30"/>
       </w:pPr>
-      <w:bookmarkStart w:id="7" w:name="_Toc238661549"/>
+      <w:bookmarkStart w:id="7" w:name="_Toc238663124"/>
       <w:r>
         <w:rPr>
           <w:rFonts w:ascii="Georgia" w:hAnsi="Georgia"/>
@@ -9258,7 +9258,7 @@
         <w:pStyle w:val="Ttulo2"/>
         <w:spacing w:before="70" w:after="20"/>
       </w:pPr>
-      <w:bookmarkStart w:id="8" w:name="_Toc238661550"/>
+      <w:bookmarkStart w:id="8" w:name="_Toc238663125"/>
       <w:r>
         <w:rPr>
           <w:rFonts w:ascii="Georgia" w:hAnsi="Georgia"/>
@@ -9316,7 +9316,7 @@
                 <w:noProof/>
               </w:rPr>
               <w:drawing>
-                <wp:inline distT="0" distB="0" distL="0" distR="0" wp14:anchorId="772BD889" wp14:editId="681EF9AD">
+                <wp:inline distT="0" distB="0" distL="0" distR="0" wp14:anchorId="76DC89D6" wp14:editId="05A0BB00">
                   <wp:extent cx="2926080" cy="1426594"/>
                   <wp:effectExtent l="0" t="0" r="0" b="0"/>
                   <wp:docPr id="3" name="Picture 3"/>
@@ -9375,7 +9375,7 @@
                 <w:noProof/>
               </w:rPr>
               <w:drawing>
-                <wp:inline distT="0" distB="0" distL="0" distR="0" wp14:anchorId="075D5012" wp14:editId="21D57D6F">
+                <wp:inline distT="0" distB="0" distL="0" distR="0" wp14:anchorId="0232A3FA" wp14:editId="6BC97167">
                   <wp:extent cx="2926080" cy="1494260"/>
                   <wp:effectExtent l="0" t="0" r="0" b="0"/>
                   <wp:docPr id="4" name="Picture 4"/>
@@ -9480,7 +9480,7 @@
         <w:pStyle w:val="Ttulo2"/>
         <w:spacing w:before="70" w:after="20"/>
       </w:pPr>
-      <w:bookmarkStart w:id="9" w:name="_Toc238661551"/>
+      <w:bookmarkStart w:id="9" w:name="_Toc238663126"/>
       <w:r>
         <w:rPr>
           <w:rFonts w:ascii="Georgia" w:hAnsi="Georgia"/>
@@ -9714,7 +9714,7 @@
         <w:pStyle w:val="Ttulo1"/>
         <w:spacing w:before="100" w:after="30"/>
       </w:pPr>
-      <w:bookmarkStart w:id="10" w:name="_Toc238661552"/>
+      <w:bookmarkStart w:id="10" w:name="_Toc238663127"/>
       <w:r>
         <w:rPr>
           <w:rFonts w:ascii="Georgia" w:hAnsi="Georgia"/>
@@ -9730,7 +9730,7 @@
         <w:pStyle w:val="Ttulo2"/>
         <w:spacing w:before="70" w:after="20"/>
       </w:pPr>
-      <w:bookmarkStart w:id="11" w:name="_Toc238661553"/>
+      <w:bookmarkStart w:id="11" w:name="_Toc238663128"/>
       <w:r>
         <w:rPr>
           <w:rFonts w:ascii="Georgia" w:hAnsi="Georgia"/>
@@ -9791,7 +9791,7 @@
                 <w:noProof/>
               </w:rPr>
               <w:drawing>
-                <wp:inline distT="0" distB="0" distL="0" distR="0" wp14:anchorId="1639DC53" wp14:editId="44C61D31">
+                <wp:inline distT="0" distB="0" distL="0" distR="0" wp14:anchorId="2A10767B" wp14:editId="549E130A">
                   <wp:extent cx="2926080" cy="1636252"/>
                   <wp:effectExtent l="0" t="0" r="0" b="0"/>
                   <wp:docPr id="5" name="Picture 5"/>
@@ -9850,7 +9850,7 @@
                 <w:noProof/>
               </w:rPr>
               <w:drawing>
-                <wp:inline distT="0" distB="0" distL="0" distR="0" wp14:anchorId="7F5AADC0" wp14:editId="54C88D7E">
+                <wp:inline distT="0" distB="0" distL="0" distR="0" wp14:anchorId="4F4D55FA" wp14:editId="64E82E83">
                   <wp:extent cx="2926080" cy="1481181"/>
                   <wp:effectExtent l="0" t="0" r="0" b="0"/>
                   <wp:docPr id="6" name="Picture 6"/>
@@ -9955,7 +9955,7 @@
         <w:pStyle w:val="Ttulo2"/>
         <w:spacing w:before="70" w:after="20"/>
       </w:pPr>
-      <w:bookmarkStart w:id="12" w:name="_Toc238661554"/>
+      <w:bookmarkStart w:id="12" w:name="_Toc238663129"/>
       <w:r>
         <w:rPr>
           <w:rFonts w:ascii="Georgia" w:hAnsi="Georgia"/>
@@ -9985,7 +9985,7 @@
         <w:pStyle w:val="Ttulo2"/>
         <w:spacing w:before="70" w:after="20"/>
       </w:pPr>
-      <w:bookmarkStart w:id="13" w:name="_Toc238661555"/>
+      <w:bookmarkStart w:id="13" w:name="_Toc238663130"/>
       <w:r>
         <w:rPr>
           <w:rFonts w:ascii="Georgia" w:hAnsi="Georgia"/>
@@ -10043,7 +10043,7 @@
                 <w:noProof/>
               </w:rPr>
               <w:drawing>
-                <wp:inline distT="0" distB="0" distL="0" distR="0" wp14:anchorId="2CE90699" wp14:editId="02AEDDAC">
+                <wp:inline distT="0" distB="0" distL="0" distR="0" wp14:anchorId="3A4D3780" wp14:editId="3F56F028">
                   <wp:extent cx="2926080" cy="1626307"/>
                   <wp:effectExtent l="0" t="0" r="0" b="0"/>
                   <wp:docPr id="7" name="Picture 7"/>
@@ -10102,7 +10102,7 @@
                 <w:noProof/>
               </w:rPr>
               <w:drawing>
-                <wp:inline distT="0" distB="0" distL="0" distR="0" wp14:anchorId="097ACAE8" wp14:editId="46C6DB55">
+                <wp:inline distT="0" distB="0" distL="0" distR="0" wp14:anchorId="05481363" wp14:editId="391C832C">
                   <wp:extent cx="2926080" cy="1479479"/>
                   <wp:effectExtent l="0" t="0" r="0" b="0"/>
                   <wp:docPr id="8" name="Picture 8"/>
@@ -10207,7 +10207,7 @@
         <w:pStyle w:val="Ttulo2"/>
         <w:spacing w:before="70" w:after="20"/>
       </w:pPr>
-      <w:bookmarkStart w:id="14" w:name="_Toc238661556"/>
+      <w:bookmarkStart w:id="14" w:name="_Toc238663131"/>
       <w:r>
         <w:rPr>
           <w:rFonts w:ascii="Georgia" w:hAnsi="Georgia"/>
@@ -10265,7 +10265,7 @@
                 <w:noProof/>
               </w:rPr>
               <w:drawing>
-                <wp:inline distT="0" distB="0" distL="0" distR="0" wp14:anchorId="55D92D6D" wp14:editId="07B08C30">
+                <wp:inline distT="0" distB="0" distL="0" distR="0" wp14:anchorId="15E11065" wp14:editId="763EAB42">
                   <wp:extent cx="2926080" cy="1662311"/>
                   <wp:effectExtent l="0" t="0" r="0" b="0"/>
                   <wp:docPr id="9" name="Picture 9"/>
@@ -10324,7 +10324,7 @@
                 <w:noProof/>
               </w:rPr>
               <w:drawing>
-                <wp:inline distT="0" distB="0" distL="0" distR="0" wp14:anchorId="1AFEBBE5" wp14:editId="397B0B58">
+                <wp:inline distT="0" distB="0" distL="0" distR="0" wp14:anchorId="5D3D087F" wp14:editId="097BE45B">
                   <wp:extent cx="2926080" cy="1801004"/>
                   <wp:effectExtent l="0" t="0" r="0" b="0"/>
                   <wp:docPr id="10" name="Picture 10"/>
@@ -10429,7 +10429,7 @@
         <w:pStyle w:val="Ttulo1"/>
         <w:spacing w:before="100" w:after="30"/>
       </w:pPr>
-      <w:bookmarkStart w:id="15" w:name="_Toc238661557"/>
+      <w:bookmarkStart w:id="15" w:name="_Toc238663132"/>
       <w:r>
         <w:rPr>
           <w:rFonts w:ascii="Georgia" w:hAnsi="Georgia"/>
@@ -10445,7 +10445,7 @@
         <w:pStyle w:val="Ttulo2"/>
         <w:spacing w:before="70" w:after="20"/>
       </w:pPr>
-      <w:bookmarkStart w:id="16" w:name="_Toc238661558"/>
+      <w:bookmarkStart w:id="16" w:name="_Toc238663133"/>
       <w:r>
         <w:rPr>
           <w:rFonts w:ascii="Georgia" w:hAnsi="Georgia"/>
@@ -10884,7 +10884,7 @@
         <w:pStyle w:val="Ttulo2"/>
         <w:spacing w:before="70" w:after="20"/>
       </w:pPr>
-      <w:bookmarkStart w:id="17" w:name="_Toc238661559"/>
+      <w:bookmarkStart w:id="17" w:name="_Toc238663134"/>
       <w:r>
         <w:rPr>
           <w:rFonts w:ascii="Georgia" w:hAnsi="Georgia"/>
@@ -10912,7 +10912,7 @@
         <w:pStyle w:val="Ttulo1"/>
         <w:spacing w:before="100" w:after="30"/>
       </w:pPr>
-      <w:bookmarkStart w:id="18" w:name="_Toc238661560"/>
+      <w:bookmarkStart w:id="18" w:name="_Toc238663135"/>
       <w:r>
         <w:rPr>
           <w:rFonts w:ascii="Georgia" w:hAnsi="Georgia"/>
@@ -10928,7 +10928,7 @@
         <w:pStyle w:val="Ttulo2"/>
         <w:spacing w:before="70" w:after="20"/>
       </w:pPr>
-      <w:bookmarkStart w:id="19" w:name="_Toc238661561"/>
+      <w:bookmarkStart w:id="19" w:name="_Toc238663136"/>
       <w:r>
         <w:rPr>
           <w:rFonts w:ascii="Georgia" w:hAnsi="Georgia"/>
@@ -10955,7 +10955,7 @@
         <w:pStyle w:val="Ttulo2"/>
         <w:spacing w:before="70" w:after="20"/>
       </w:pPr>
-      <w:bookmarkStart w:id="20" w:name="_Toc238661562"/>
+      <w:bookmarkStart w:id="20" w:name="_Toc238663137"/>
       <w:r>
         <w:rPr>
           <w:rFonts w:ascii="Georgia" w:hAnsi="Georgia"/>
@@ -11013,7 +11013,7 @@
                 <w:noProof/>
               </w:rPr>
               <w:drawing>
-                <wp:inline distT="0" distB="0" distL="0" distR="0" wp14:anchorId="406F0FED" wp14:editId="7FC2D295">
+                <wp:inline distT="0" distB="0" distL="0" distR="0" wp14:anchorId="70F41FF7" wp14:editId="607B4DAD">
                   <wp:extent cx="2926080" cy="1714660"/>
                   <wp:effectExtent l="0" t="0" r="0" b="0"/>
                   <wp:docPr id="11" name="Picture 11"/>
@@ -11072,7 +11072,7 @@
                 <w:noProof/>
               </w:rPr>
               <w:drawing>
-                <wp:inline distT="0" distB="0" distL="0" distR="0" wp14:anchorId="70159603" wp14:editId="0728E2E9">
+                <wp:inline distT="0" distB="0" distL="0" distR="0" wp14:anchorId="755FC4EE" wp14:editId="7612CB8E">
                   <wp:extent cx="2926080" cy="1558188"/>
                   <wp:effectExtent l="0" t="0" r="0" b="0"/>
                   <wp:docPr id="12" name="Picture 12"/>
@@ -12042,7 +12042,7 @@
         <w:pStyle w:val="Ttulo1"/>
         <w:spacing w:before="100" w:after="30"/>
       </w:pPr>
-      <w:bookmarkStart w:id="21" w:name="_Toc238661563"/>
+      <w:bookmarkStart w:id="21" w:name="_Toc238663138"/>
       <w:r>
         <w:rPr>
           <w:rFonts w:ascii="Georgia" w:hAnsi="Georgia"/>
@@ -12059,7 +12059,7 @@
         <w:pStyle w:val="Ttulo2"/>
         <w:spacing w:before="70" w:after="20"/>
       </w:pPr>
-      <w:bookmarkStart w:id="22" w:name="_Toc238661564"/>
+      <w:bookmarkStart w:id="22" w:name="_Toc238663139"/>
       <w:r>
         <w:rPr>
           <w:rFonts w:ascii="Georgia" w:hAnsi="Georgia"/>
@@ -12151,7 +12151,7 @@
         <w:pStyle w:val="Ttulo2"/>
         <w:spacing w:before="70" w:after="20"/>
       </w:pPr>
-      <w:bookmarkStart w:id="23" w:name="_Toc238661565"/>
+      <w:bookmarkStart w:id="23" w:name="_Toc238663140"/>
       <w:r>
         <w:rPr>
           <w:rFonts w:ascii="Georgia" w:hAnsi="Georgia"/>
@@ -12393,7 +12393,7 @@
                 <w:noProof/>
               </w:rPr>
               <w:drawing>
-                <wp:inline distT="0" distB="0" distL="0" distR="0" wp14:anchorId="4695B4D3" wp14:editId="7846D49F">
+                <wp:inline distT="0" distB="0" distL="0" distR="0" wp14:anchorId="4A17F268" wp14:editId="13BB684F">
                   <wp:extent cx="2926080" cy="1540391"/>
                   <wp:effectExtent l="0" t="0" r="0" b="0"/>
                   <wp:docPr id="13" name="Picture 13"/>
@@ -12452,7 +12452,7 @@
                 <w:noProof/>
               </w:rPr>
               <w:drawing>
-                <wp:inline distT="0" distB="0" distL="0" distR="0" wp14:anchorId="5057CD06" wp14:editId="5361435C">
+                <wp:inline distT="0" distB="0" distL="0" distR="0" wp14:anchorId="179D6117" wp14:editId="0BA2604A">
                   <wp:extent cx="2926080" cy="1658038"/>
                   <wp:effectExtent l="0" t="0" r="0" b="0"/>
                   <wp:docPr id="14" name="Picture 14"/>
@@ -12557,7 +12557,7 @@
         <w:pStyle w:val="Ttulo2"/>
         <w:spacing w:before="70" w:after="20"/>
       </w:pPr>
-      <w:bookmarkStart w:id="24" w:name="_Toc238661566"/>
+      <w:bookmarkStart w:id="24" w:name="_Toc238663141"/>
       <w:r>
         <w:rPr>
           <w:rFonts w:ascii="Georgia" w:hAnsi="Georgia"/>
@@ -13487,7 +13487,7 @@
         <w:pStyle w:val="Ttulo1"/>
         <w:spacing w:before="100" w:after="30"/>
       </w:pPr>
-      <w:bookmarkStart w:id="25" w:name="_Toc238661567"/>
+      <w:bookmarkStart w:id="25" w:name="_Toc238663142"/>
       <w:r>
         <w:rPr>
           <w:rFonts w:ascii="Georgia" w:hAnsi="Georgia"/>
@@ -13503,7 +13503,7 @@
         <w:pStyle w:val="Ttulo2"/>
         <w:spacing w:before="70" w:after="20"/>
       </w:pPr>
-      <w:bookmarkStart w:id="26" w:name="_Toc238661568"/>
+      <w:bookmarkStart w:id="26" w:name="_Toc238663143"/>
       <w:r>
         <w:rPr>
           <w:rFonts w:ascii="Georgia" w:hAnsi="Georgia"/>
@@ -15100,7 +15100,7 @@
         <w:pStyle w:val="Ttulo2"/>
         <w:spacing w:before="70" w:after="20"/>
       </w:pPr>
-      <w:bookmarkStart w:id="27" w:name="_Toc238661569"/>
+      <w:bookmarkStart w:id="27" w:name="_Toc238663144"/>
       <w:r>
         <w:rPr>
           <w:rFonts w:ascii="Georgia" w:hAnsi="Georgia"/>
@@ -15137,20 +15137,20 @@
         <w:rPr>
           <w:sz w:val="16"/>
         </w:rPr>
-        <w:t xml:space="preserve"> En estado estacionario a plena capacidad (460 kt), CAPEX = D&amp;A y Δ NWC = 0, por lo que FCFF_terminal = NOPAT_2030 = USD 135,5 MM. El valor terminal descontado resulta TV = (135,5 × 1,02 / 0,0706 - 0,02) = </w:t>
+        <w:t xml:space="preserve"> En estado estacionario a plena capacidad (460 kt), CAPEX = D&amp;A y Δ NWC = 0, por lo que FCFF_terminal = NOPAT_2030 = USD 135,5 MM. El valor terminal resulta TV = (135,5 × 1,02 / 0,0695 - 0,02) = </w:t>
       </w:r>
       <w:r>
         <w:rPr>
           <w:b/>
           <w:sz w:val="16"/>
         </w:rPr>
-        <w:t>USD 2.731,4 MM</w:t>
+        <w:t>USD 2.791,4 MM</w:t>
       </w:r>
       <w:r>
         <w:rPr>
           <w:sz w:val="16"/>
         </w:rPr>
-        <w:t xml:space="preserve">, determinando el precio objetivo de </w:t>
+        <w:t xml:space="preserve">, que descontado a valor presente y sumado al flujo explícito determina el precio objetivo de </w:t>
       </w:r>
       <w:r>
         <w:rPr>
@@ -15192,7 +15192,7 @@
         <w:rPr>
           <w:sz w:val="16"/>
         </w:rPr>
-        <w:t xml:space="preserve"> Con una reinversión implícita RR = g / WACC = 2,0% / 6,95% = 28,3%, el flujo terminal ajustado resulta en NOPAT × (1 - RR) = USD 97,1 MM, determinando una valuación de ARS 993,00 por acción.</w:t>
+        <w:t xml:space="preserve"> Con una reinversión implícita RR = g / WACC = 2,0% / 6,95% = 28,78%, el flujo terminal ajustado resulta en NOPAT × (1 - RR) = USD 96,5 MM, determinando una valuación de ARS 921,10 por acción.</w:t>
       </w:r>
     </w:p>
     <w:p>
@@ -15210,7 +15210,7 @@
         <w:pStyle w:val="Ttulo1"/>
         <w:spacing w:before="100" w:after="30"/>
       </w:pPr>
-      <w:bookmarkStart w:id="28" w:name="_Toc238661570"/>
+      <w:bookmarkStart w:id="28" w:name="_Toc238663145"/>
       <w:r>
         <w:rPr>
           <w:rFonts w:ascii="Georgia" w:hAnsi="Georgia"/>
@@ -15227,7 +15227,7 @@
         <w:pStyle w:val="Ttulo2"/>
         <w:spacing w:before="70" w:after="20"/>
       </w:pPr>
-      <w:bookmarkStart w:id="29" w:name="_Toc238661571"/>
+      <w:bookmarkStart w:id="29" w:name="_Toc238663146"/>
       <w:r>
         <w:rPr>
           <w:rFonts w:ascii="Georgia" w:hAnsi="Georgia"/>
@@ -15254,7 +15254,7 @@
         <w:pStyle w:val="Ttulo2"/>
         <w:spacing w:before="70" w:after="20"/>
       </w:pPr>
-      <w:bookmarkStart w:id="30" w:name="_Toc238661572"/>
+      <w:bookmarkStart w:id="30" w:name="_Toc238663147"/>
       <w:r>
         <w:rPr>
           <w:rFonts w:ascii="Georgia" w:hAnsi="Georgia"/>
@@ -15312,7 +15312,7 @@
                 <w:noProof/>
               </w:rPr>
               <w:drawing>
-                <wp:inline distT="0" distB="0" distL="0" distR="0" wp14:anchorId="5561F4A4" wp14:editId="29F317B6">
+                <wp:inline distT="0" distB="0" distL="0" distR="0" wp14:anchorId="6F549B72" wp14:editId="1BDC56D5">
                   <wp:extent cx="2926080" cy="1534596"/>
                   <wp:effectExtent l="0" t="0" r="0" b="0"/>
                   <wp:docPr id="15" name="Picture 15"/>
@@ -15371,7 +15371,7 @@
                 <w:noProof/>
               </w:rPr>
               <w:drawing>
-                <wp:inline distT="0" distB="0" distL="0" distR="0" wp14:anchorId="6DE17CAD" wp14:editId="7E78F7B3">
+                <wp:inline distT="0" distB="0" distL="0" distR="0" wp14:anchorId="6EFBEAF0" wp14:editId="5170F6EB">
                   <wp:extent cx="2926080" cy="1680519"/>
                   <wp:effectExtent l="0" t="0" r="0" b="0"/>
                   <wp:docPr id="16" name="Picture 16"/>
@@ -15487,7 +15487,7 @@
         <w:pStyle w:val="Ttulo1"/>
         <w:spacing w:before="100" w:after="30"/>
       </w:pPr>
-      <w:bookmarkStart w:id="31" w:name="_Toc238661573"/>
+      <w:bookmarkStart w:id="31" w:name="_Toc238663148"/>
       <w:r>
         <w:rPr>
           <w:rFonts w:ascii="Georgia" w:hAnsi="Georgia"/>
@@ -15503,7 +15503,7 @@
         <w:pStyle w:val="Ttulo2"/>
         <w:spacing w:before="70" w:after="20"/>
       </w:pPr>
-      <w:bookmarkStart w:id="32" w:name="_Toc238661574"/>
+      <w:bookmarkStart w:id="32" w:name="_Toc238663149"/>
       <w:r>
         <w:rPr>
           <w:rFonts w:ascii="Georgia" w:hAnsi="Georgia"/>
@@ -16550,7 +16550,7 @@
         <w:pStyle w:val="Ttulo2"/>
         <w:spacing w:before="70" w:after="20"/>
       </w:pPr>
-      <w:bookmarkStart w:id="33" w:name="_Toc238661575"/>
+      <w:bookmarkStart w:id="33" w:name="_Toc238663150"/>
       <w:r>
         <w:rPr>
           <w:rFonts w:ascii="Georgia" w:hAnsi="Georgia"/>
@@ -16711,7 +16711,7 @@
         <w:pStyle w:val="Ttulo2"/>
         <w:spacing w:before="70" w:after="20"/>
       </w:pPr>
-      <w:bookmarkStart w:id="34" w:name="_Toc238661576"/>
+      <w:bookmarkStart w:id="34" w:name="_Toc238663151"/>
       <w:r>
         <w:rPr>
           <w:rFonts w:ascii="Georgia" w:hAnsi="Georgia"/>
@@ -16738,7 +16738,7 @@
         <w:pStyle w:val="Ttulo1"/>
         <w:spacing w:before="100" w:after="30"/>
       </w:pPr>
-      <w:bookmarkStart w:id="35" w:name="_Toc238661577"/>
+      <w:bookmarkStart w:id="35" w:name="_Toc238663152"/>
       <w:r>
         <w:rPr>
           <w:rFonts w:ascii="Georgia" w:hAnsi="Georgia"/>
@@ -16754,7 +16754,7 @@
         <w:pStyle w:val="Ttulo2"/>
         <w:spacing w:before="70" w:after="20"/>
       </w:pPr>
-      <w:bookmarkStart w:id="36" w:name="_Toc238661578"/>
+      <w:bookmarkStart w:id="36" w:name="_Toc238663153"/>
       <w:r>
         <w:rPr>
           <w:rFonts w:ascii="Georgia" w:hAnsi="Georgia"/>
@@ -19681,7 +19681,7 @@
         <w:pStyle w:val="Ttulo1"/>
         <w:spacing w:before="100" w:after="30"/>
       </w:pPr>
-      <w:bookmarkStart w:id="37" w:name="_Toc238661579"/>
+      <w:bookmarkStart w:id="37" w:name="_Toc238663154"/>
       <w:r>
         <w:rPr>
           <w:rFonts w:ascii="Georgia" w:hAnsi="Georgia"/>
@@ -19698,7 +19698,7 @@
         <w:pStyle w:val="Ttulo2"/>
         <w:spacing w:before="70" w:after="20"/>
       </w:pPr>
-      <w:bookmarkStart w:id="38" w:name="_Toc238661580"/>
+      <w:bookmarkStart w:id="38" w:name="_Toc238663155"/>
       <w:r>
         <w:rPr>
           <w:rFonts w:ascii="Georgia" w:hAnsi="Georgia"/>
@@ -19799,19 +19799,13 @@
           <w:b/>
           <w:sz w:val="16"/>
         </w:rPr>
-        <w:t>Opción Real sobre la Etapa V Eólica (Longstaff-Schwartz) – Flexibilidad Gerencial y Diferimiento de CAPEX:</w:t>
+        <w:t>Opción Real sobre la Etapa V Eólica (Longstaff-Schwartz):</w:t>
       </w:r>
       <w:r>
         <w:rPr>
           <w:sz w:val="16"/>
         </w:rPr>
-        <w:t xml:space="preserve"> Frente a la rigidez estática del DCF clásico, la opción real cuantifica la flexibilidad gerencial para diferir o ejecutar la ampliación de 312 MW anunciados originalmente (312–336 MW según etapa de construcción) según evolucionen las cotizaciones del metal y el costo eléctrico, modelada mediante mínimos cuadrados (LSMC) con polinomios de Laguerre (I_0 = USD 400 MM, inversión estimada de la Etapa V, tenor de 5 años, σ = 19,97% del proceso GBM del LME calibrado sobre la serie histórica diaria de cotizaciones</w:t>
-      </w:r>
-      <w:r>
-        <w:rPr>
-          <w:sz w:val="16"/>
-        </w:rPr>
-        <w:t xml:space="preserve"> del metal (2016–2026), R_f = 4,70%, ahorro de USD 25–30/MWh):</w:t>
+        <w:t xml:space="preserve"> Cuantifica el valor de poder diferir o ejecutar la ampliación de 312 MW anunciados originalmente (312–336 MW según etapa de construcción) según evolucionen las cotizaciones del metal y el costo eléctrico, modelada mediante mínimos cuadrados (LSMC) con polinomios de Laguerre (I_0 = USD 400 MM, inversión estimada de la Etapa V, tenor de 5 años, σ = 19,97% del proceso GBM del LME calibrado sobre la serie histórica diaria de cotizaciones del metal (2016–2026), R_f = 4,70%, ahorro de USD 25–30/MWh):</w:t>
       </w:r>
     </w:p>
     <w:p>
@@ -19907,7 +19901,7 @@
         <w:pStyle w:val="Ttulo2"/>
         <w:spacing w:before="70" w:after="20"/>
       </w:pPr>
-      <w:bookmarkStart w:id="39" w:name="_Toc238661581"/>
+      <w:bookmarkStart w:id="39" w:name="_Toc238663156"/>
       <w:r>
         <w:rPr>
           <w:rFonts w:ascii="Georgia" w:hAnsi="Georgia"/>
@@ -19943,7 +19937,7 @@
           <w:noProof/>
         </w:rPr>
         <w:drawing>
-          <wp:inline distT="0" distB="0" distL="0" distR="0" wp14:anchorId="01C37BCD" wp14:editId="43711EFF">
+          <wp:inline distT="0" distB="0" distL="0" distR="0" wp14:anchorId="75BD676A" wp14:editId="7E3549BC">
             <wp:extent cx="4206240" cy="2338193"/>
             <wp:effectExtent l="0" t="0" r="0" b="0"/>
             <wp:docPr id="17" name="Picture 17"/>
@@ -20002,7 +19996,7 @@
         <w:pStyle w:val="Ttulo2"/>
         <w:spacing w:before="70" w:after="20"/>
       </w:pPr>
-      <w:bookmarkStart w:id="40" w:name="_Toc238661582"/>
+      <w:bookmarkStart w:id="40" w:name="_Toc238663157"/>
       <w:r>
         <w:rPr>
           <w:rFonts w:ascii="Georgia" w:hAnsi="Georgia"/>
@@ -20623,7 +20617,7 @@
         <w:pStyle w:val="Ttulo2"/>
         <w:spacing w:before="70" w:after="20"/>
       </w:pPr>
-      <w:bookmarkStart w:id="41" w:name="_Toc238661583"/>
+      <w:bookmarkStart w:id="41" w:name="_Toc238663158"/>
       <w:r>
         <w:rPr>
           <w:rFonts w:ascii="Georgia" w:hAnsi="Georgia"/>
@@ -20659,7 +20653,7 @@
           <w:noProof/>
         </w:rPr>
         <w:drawing>
-          <wp:inline distT="0" distB="0" distL="0" distR="0" wp14:anchorId="65BEE6F7" wp14:editId="67AF89C3">
+          <wp:inline distT="0" distB="0" distL="0" distR="0" wp14:anchorId="5D5AB7CB" wp14:editId="7C49C261">
             <wp:extent cx="4206240" cy="2471742"/>
             <wp:effectExtent l="0" t="0" r="0" b="0"/>
             <wp:docPr id="18" name="Picture 18"/>
@@ -21738,7 +21732,7 @@
         <w:pStyle w:val="Ttulo1"/>
         <w:spacing w:before="100" w:after="30"/>
       </w:pPr>
-      <w:bookmarkStart w:id="42" w:name="_Toc238661584"/>
+      <w:bookmarkStart w:id="42" w:name="_Toc238663159"/>
       <w:r>
         <w:rPr>
           <w:rFonts w:ascii="Georgia" w:hAnsi="Georgia"/>
@@ -21754,7 +21748,7 @@
         <w:pStyle w:val="Ttulo2"/>
         <w:spacing w:before="70" w:after="20"/>
       </w:pPr>
-      <w:bookmarkStart w:id="43" w:name="_Toc238661585"/>
+      <w:bookmarkStart w:id="43" w:name="_Toc238663160"/>
       <w:r>
         <w:rPr>
           <w:rFonts w:ascii="Georgia" w:hAnsi="Georgia"/>
@@ -21791,7 +21785,7 @@
         </w:rPr>
         <w:lastRenderedPageBreak/>
         <w:drawing>
-          <wp:inline distT="0" distB="0" distL="0" distR="0" wp14:anchorId="5444FD97" wp14:editId="75C17E71">
+          <wp:inline distT="0" distB="0" distL="0" distR="0" wp14:anchorId="34B30910" wp14:editId="536F6E2C">
             <wp:extent cx="4206240" cy="2149342"/>
             <wp:effectExtent l="0" t="0" r="0" b="0"/>
             <wp:docPr id="19" name="Picture 19"/>
@@ -21850,7 +21844,7 @@
         <w:pStyle w:val="Ttulo1"/>
         <w:spacing w:before="100" w:after="30"/>
       </w:pPr>
-      <w:bookmarkStart w:id="44" w:name="_Toc238661586"/>
+      <w:bookmarkStart w:id="44" w:name="_Toc238663161"/>
       <w:r>
         <w:rPr>
           <w:rFonts w:ascii="Georgia" w:hAnsi="Georgia"/>
@@ -21866,7 +21860,7 @@
         <w:pStyle w:val="Ttulo2"/>
         <w:spacing w:before="70" w:after="20"/>
       </w:pPr>
-      <w:bookmarkStart w:id="45" w:name="_Toc238661587"/>
+      <w:bookmarkStart w:id="45" w:name="_Toc238663162"/>
       <w:r>
         <w:rPr>
           <w:rFonts w:ascii="Georgia" w:hAnsi="Georgia"/>
@@ -21921,7 +21915,7 @@
         <w:pStyle w:val="Ttulo2"/>
         <w:spacing w:before="70" w:after="20"/>
       </w:pPr>
-      <w:bookmarkStart w:id="46" w:name="_Toc238661588"/>
+      <w:bookmarkStart w:id="46" w:name="_Toc238663163"/>
       <w:r>
         <w:rPr>
           <w:rFonts w:ascii="Georgia" w:hAnsi="Georgia"/>
@@ -21979,7 +21973,7 @@
                 <w:noProof/>
               </w:rPr>
               <w:drawing>
-                <wp:inline distT="0" distB="0" distL="0" distR="0" wp14:anchorId="1B1CA72B" wp14:editId="3545E8AD">
+                <wp:inline distT="0" distB="0" distL="0" distR="0" wp14:anchorId="74E27322" wp14:editId="2E67E7CC">
                   <wp:extent cx="2926080" cy="1682608"/>
                   <wp:effectExtent l="0" t="0" r="0" b="0"/>
                   <wp:docPr id="20" name="Picture 20"/>
@@ -22038,7 +22032,7 @@
                 <w:noProof/>
               </w:rPr>
               <w:drawing>
-                <wp:inline distT="0" distB="0" distL="0" distR="0" wp14:anchorId="55FBF655" wp14:editId="3E2611A4">
+                <wp:inline distT="0" distB="0" distL="0" distR="0" wp14:anchorId="63344E1B" wp14:editId="68A54935">
                   <wp:extent cx="2926080" cy="1655981"/>
                   <wp:effectExtent l="0" t="0" r="0" b="0"/>
                   <wp:docPr id="21" name="Picture 21"/>
@@ -22143,7 +22137,7 @@
         <w:pStyle w:val="Ttulo1"/>
         <w:spacing w:before="100" w:after="30"/>
       </w:pPr>
-      <w:bookmarkStart w:id="47" w:name="_Toc238661589"/>
+      <w:bookmarkStart w:id="47" w:name="_Toc238663164"/>
       <w:r>
         <w:rPr>
           <w:rFonts w:ascii="Georgia" w:hAnsi="Georgia"/>
@@ -22159,7 +22153,7 @@
         <w:pStyle w:val="Ttulo2"/>
         <w:spacing w:before="70" w:after="20"/>
       </w:pPr>
-      <w:bookmarkStart w:id="48" w:name="_Toc238661590"/>
+      <w:bookmarkStart w:id="48" w:name="_Toc238663165"/>
       <w:r>
         <w:rPr>
           <w:rFonts w:ascii="Georgia" w:hAnsi="Georgia"/>
@@ -22195,7 +22189,7 @@
           <w:noProof/>
         </w:rPr>
         <w:drawing>
-          <wp:inline distT="0" distB="0" distL="0" distR="0" wp14:anchorId="557F9698" wp14:editId="1AC13324">
+          <wp:inline distT="0" distB="0" distL="0" distR="0" wp14:anchorId="27F66992" wp14:editId="333CCE6C">
             <wp:extent cx="4206240" cy="2227773"/>
             <wp:effectExtent l="0" t="0" r="0" b="0"/>
             <wp:docPr id="22" name="Picture 22"/>
@@ -22818,7 +22812,7 @@
               <w:rPr>
                 <w:sz w:val="13"/>
               </w:rPr>
-              <w:t>Chalco (ACH)</w:t>
+              <w:t>Chalco (2600.HK)</w:t>
             </w:r>
           </w:p>
         </w:tc>
@@ -23144,7 +23138,7 @@
               <w:rPr>
                 <w:sz w:val="13"/>
               </w:rPr>
-              <w:t>Norsk Hydro (NHYDY)</w:t>
+              <w:t>Norsk Hydro (NHY.OL)</w:t>
             </w:r>
           </w:p>
         </w:tc>
@@ -23783,7 +23777,7 @@
         <w:pStyle w:val="Ttulo1"/>
         <w:spacing w:before="100" w:after="30"/>
       </w:pPr>
-      <w:bookmarkStart w:id="49" w:name="_Toc238661591"/>
+      <w:bookmarkStart w:id="49" w:name="_Toc238663166"/>
       <w:r>
         <w:rPr>
           <w:rFonts w:ascii="Georgia" w:hAnsi="Georgia"/>
@@ -23800,7 +23794,7 @@
         <w:pStyle w:val="Ttulo2"/>
         <w:spacing w:before="70" w:after="20"/>
       </w:pPr>
-      <w:bookmarkStart w:id="50" w:name="_Toc238661592"/>
+      <w:bookmarkStart w:id="50" w:name="_Toc238663167"/>
       <w:r>
         <w:rPr>
           <w:rFonts w:ascii="Georgia" w:hAnsi="Georgia"/>
@@ -23819,7 +23813,7 @@
         </w:rPr>
       </w:pPr>
       <w:r>
-        <w:t>En el marco de la teoría moderna de selección de inversiones y optimización de media-varianza (Alexander, Sharpe &amp; Bailey, 2003), el criterio de crecimiento de Kelly determina una fracción teórica óptima de:</w:t>
+        <w:t>El criterio de crecimiento de Kelly (Alexander, Sharpe &amp; Bailey, 2003) determina una fracción teórica óptima de:</w:t>
       </w:r>
     </w:p>
     <w:p>
@@ -23895,7 +23889,7 @@
                 <w:noProof/>
               </w:rPr>
               <w:drawing>
-                <wp:inline distT="0" distB="0" distL="0" distR="0" wp14:anchorId="00D3B177" wp14:editId="544BDD59">
+                <wp:inline distT="0" distB="0" distL="0" distR="0" wp14:anchorId="3EC7CA8B" wp14:editId="11B21103">
                   <wp:extent cx="2926080" cy="1695124"/>
                   <wp:effectExtent l="0" t="0" r="0" b="0"/>
                   <wp:docPr id="23" name="Picture 23"/>
@@ -23954,7 +23948,7 @@
                 <w:noProof/>
               </w:rPr>
               <w:drawing>
-                <wp:inline distT="0" distB="0" distL="0" distR="0" wp14:anchorId="7D77853B" wp14:editId="6D3F354C">
+                <wp:inline distT="0" distB="0" distL="0" distR="0" wp14:anchorId="774363BF" wp14:editId="6F569769">
                   <wp:extent cx="2926080" cy="1698212"/>
                   <wp:effectExtent l="0" t="0" r="0" b="0"/>
                   <wp:docPr id="24" name="Picture 24"/>
@@ -24059,7 +24053,7 @@
         <w:pStyle w:val="Ttulo2"/>
         <w:spacing w:before="70" w:after="20"/>
       </w:pPr>
-      <w:bookmarkStart w:id="51" w:name="_Toc238661593"/>
+      <w:bookmarkStart w:id="51" w:name="_Toc238663168"/>
       <w:r>
         <w:rPr>
           <w:rFonts w:ascii="Georgia" w:hAnsi="Georgia"/>
@@ -24145,7 +24139,7 @@
                 <w:noProof/>
               </w:rPr>
               <w:drawing>
-                <wp:inline distT="0" distB="0" distL="0" distR="0" wp14:anchorId="2CEC9108" wp14:editId="0A84B374">
+                <wp:inline distT="0" distB="0" distL="0" distR="0" wp14:anchorId="67FB8F41" wp14:editId="38B3910C">
                   <wp:extent cx="2926080" cy="1696900"/>
                   <wp:effectExtent l="0" t="0" r="0" b="0"/>
                   <wp:docPr id="25" name="Picture 25"/>
@@ -24204,7 +24198,7 @@
                 <w:noProof/>
               </w:rPr>
               <w:drawing>
-                <wp:inline distT="0" distB="0" distL="0" distR="0" wp14:anchorId="1FE530ED" wp14:editId="3692A806">
+                <wp:inline distT="0" distB="0" distL="0" distR="0" wp14:anchorId="5BD04A6E" wp14:editId="60C44C54">
                   <wp:extent cx="2926080" cy="1654733"/>
                   <wp:effectExtent l="0" t="0" r="0" b="0"/>
                   <wp:docPr id="26" name="Picture 26"/>
@@ -25964,7 +25958,7 @@
         <w:pStyle w:val="Ttulo1"/>
         <w:spacing w:before="100" w:after="30"/>
       </w:pPr>
-      <w:bookmarkStart w:id="52" w:name="_Toc238661594"/>
+      <w:bookmarkStart w:id="52" w:name="_Toc238663169"/>
       <w:r>
         <w:rPr>
           <w:rFonts w:ascii="Georgia" w:hAnsi="Georgia"/>
@@ -25980,7 +25974,7 @@
         <w:pStyle w:val="Ttulo2"/>
         <w:spacing w:before="70" w:after="20"/>
       </w:pPr>
-      <w:bookmarkStart w:id="53" w:name="_Toc238661595"/>
+      <w:bookmarkStart w:id="53" w:name="_Toc238663170"/>
       <w:r>
         <w:rPr>
           <w:rFonts w:ascii="Georgia" w:hAnsi="Georgia"/>
@@ -26097,7 +26091,7 @@
                 <w:noProof/>
               </w:rPr>
               <w:drawing>
-                <wp:inline distT="0" distB="0" distL="0" distR="0" wp14:anchorId="3344C34D" wp14:editId="700521A2">
+                <wp:inline distT="0" distB="0" distL="0" distR="0" wp14:anchorId="65B121B5" wp14:editId="57670BDF">
                   <wp:extent cx="2926080" cy="1614092"/>
                   <wp:effectExtent l="0" t="0" r="0" b="0"/>
                   <wp:docPr id="27" name="Picture 27"/>
@@ -26156,7 +26150,7 @@
                 <w:noProof/>
               </w:rPr>
               <w:drawing>
-                <wp:inline distT="0" distB="0" distL="0" distR="0" wp14:anchorId="0FE83AB1" wp14:editId="5B204F12">
+                <wp:inline distT="0" distB="0" distL="0" distR="0" wp14:anchorId="273F522A" wp14:editId="433FDB2B">
                   <wp:extent cx="2926080" cy="1650045"/>
                   <wp:effectExtent l="0" t="0" r="0" b="0"/>
                   <wp:docPr id="28" name="Picture 28"/>
@@ -26560,7 +26554,6 @@
           <w:color w:val="4A4A4A"/>
           <w:sz w:val="13"/>
         </w:rPr>
-        <w:lastRenderedPageBreak/>
         <w:t>μlticolumn3l Δ AIC = -1.431,89 a favor del CIR (evidencia estadística concluyente). \\</w:t>
       </w:r>
     </w:p>
@@ -26569,13 +26562,14 @@
         <w:pStyle w:val="Ttulo2"/>
         <w:spacing w:before="70" w:after="20"/>
       </w:pPr>
-      <w:bookmarkStart w:id="54" w:name="_Toc238661596"/>
+      <w:bookmarkStart w:id="54" w:name="_Toc238663171"/>
       <w:r>
         <w:rPr>
           <w:rFonts w:ascii="Georgia" w:hAnsi="Georgia"/>
           <w:color w:val="1E3A8A"/>
           <w:sz w:val="18"/>
         </w:rPr>
+        <w:lastRenderedPageBreak/>
         <w:t>Beta Dinámico (Filtro de Kalman, GARCH y Saltos)</w:t>
       </w:r>
       <w:bookmarkEnd w:id="54"/>
@@ -26655,7 +26649,7 @@
                 <w:noProof/>
               </w:rPr>
               <w:drawing>
-                <wp:inline distT="0" distB="0" distL="0" distR="0" wp14:anchorId="01865D47" wp14:editId="1AB52A50">
+                <wp:inline distT="0" distB="0" distL="0" distR="0" wp14:anchorId="03C7C629" wp14:editId="2209B597">
                   <wp:extent cx="2926080" cy="1527796"/>
                   <wp:effectExtent l="0" t="0" r="0" b="0"/>
                   <wp:docPr id="29" name="Picture 29"/>
@@ -26714,7 +26708,7 @@
                 <w:noProof/>
               </w:rPr>
               <w:drawing>
-                <wp:inline distT="0" distB="0" distL="0" distR="0" wp14:anchorId="3324F769" wp14:editId="2C344CE7">
+                <wp:inline distT="0" distB="0" distL="0" distR="0" wp14:anchorId="69881926" wp14:editId="2539C8F5">
                   <wp:extent cx="2926080" cy="1611196"/>
                   <wp:effectExtent l="0" t="0" r="0" b="0"/>
                   <wp:docPr id="30" name="Picture 30"/>
@@ -26819,7 +26813,7 @@
         <w:pStyle w:val="Ttulo2"/>
         <w:spacing w:before="70" w:after="20"/>
       </w:pPr>
-      <w:bookmarkStart w:id="55" w:name="_Toc238661597"/>
+      <w:bookmarkStart w:id="55" w:name="_Toc238663172"/>
       <w:r>
         <w:rPr>
           <w:rFonts w:ascii="Georgia" w:hAnsi="Georgia"/>
@@ -26880,7 +26874,7 @@
                 <w:noProof/>
               </w:rPr>
               <w:drawing>
-                <wp:inline distT="0" distB="0" distL="0" distR="0" wp14:anchorId="6D76FC44" wp14:editId="08B8A3B2">
+                <wp:inline distT="0" distB="0" distL="0" distR="0" wp14:anchorId="34DF2609" wp14:editId="6FC30899">
                   <wp:extent cx="2926080" cy="1723518"/>
                   <wp:effectExtent l="0" t="0" r="0" b="0"/>
                   <wp:docPr id="31" name="Picture 31"/>
@@ -27292,13 +27286,7 @@
                           <w:rPr>
                             <w:sz w:val="13"/>
                           </w:rPr>
-                          <w:t>Costo Energía / Alúmin</w:t>
-                        </w:r>
-                        <w:r>
-                          <w:rPr>
-                            <w:sz w:val="13"/>
-                          </w:rPr>
-                          <w:t>a</w:t>
+                          <w:t>Costo Energía / Alúmina</w:t>
                         </w:r>
                       </w:p>
                     </w:tc>
@@ -27382,7 +27370,13 @@
                           <w:rPr>
                             <w:sz w:val="13"/>
                           </w:rPr>
-                          <w:t>Tipo de Cambio Real</w:t>
+                          <w:t xml:space="preserve">Tipo de Cambio </w:t>
+                        </w:r>
+                        <w:r>
+                          <w:rPr>
+                            <w:sz w:val="13"/>
+                          </w:rPr>
+                          <w:t>Real</w:t>
                         </w:r>
                       </w:p>
                     </w:tc>
@@ -27481,7 +27475,7 @@
         <w:pStyle w:val="Ttulo2"/>
         <w:spacing w:before="70" w:after="20"/>
       </w:pPr>
-      <w:bookmarkStart w:id="56" w:name="_Toc238661598"/>
+      <w:bookmarkStart w:id="56" w:name="_Toc238663173"/>
       <w:r>
         <w:rPr>
           <w:rFonts w:ascii="Georgia" w:hAnsi="Georgia"/>
@@ -27506,7 +27500,7 @@
         <w:t>p F = 11,27, p ≈ 0,00 por bootstrap de residuos, recorte 15 %–85 %) sí detecta un quiebre paramétrico significativo, fechado el 19 de marzo de 2020 (semana del colapso global por COVID-19): el Beta salta de 1,208 en el tramo previo a 0,665 en el posterior. Se conserva de todos modos la regresión de 10 años sin segmentar porque (i) es la ventana estándar de referencia para el Beta OLS en la práctica de valuación, (ii) el quiebre corresponde a un evento de mercado extremo y transitorio, no a un cambio estruct</w:t>
       </w:r>
       <w:r>
-        <w:t>ural del negocio de Aluar, y (iii) el propio proceso de Blume y el Filtro de Kalman de la Sección [subsec:kalman-garch] ya corrigen el Beta hacia su nivel reciente, absorbiendo en la práctica el efecto del quiebre. Se documenta el resultado completo del test, en lugar de omitirlo, precisamente porque contradice la hipótesis de estabilidad y el lector debe poder juzgarlo.</w:t>
+        <w:t>ural del negocio de Aluar, y (iii) el propio proceso de Blume y el Filtro de Kalman de la Sección [subsec:kalman-garch] ya corrigen el Beta hacia su nivel reciente, absorbiendo en la práctica el efecto del quiebre.</w:t>
       </w:r>
     </w:p>
     <w:p>
@@ -28802,14 +28796,7 @@
               <w:rPr>
                 <w:sz w:val="13"/>
               </w:rPr>
-              <w:t xml:space="preserve">Estabilidad de Parámetros (Beta </w:t>
-            </w:r>
-            <w:r>
-              <w:rPr>
-                <w:sz w:val="13"/>
-              </w:rPr>
-              <w:lastRenderedPageBreak/>
-              <w:t>OLS)</w:t>
+              <w:t>Estabilidad de Parámetros (Beta OLS)</w:t>
             </w:r>
           </w:p>
         </w:tc>
@@ -28835,7 +28822,6 @@
               <w:rPr>
                 <w:sz w:val="13"/>
               </w:rPr>
-              <w:lastRenderedPageBreak/>
               <w:t>\sup F = 11,27</w:t>
             </w:r>
           </w:p>
@@ -28888,14 +28874,7 @@
               <w:rPr>
                 <w:sz w:val="13"/>
               </w:rPr>
-              <w:t xml:space="preserve">Detecta quiebre en 19-mar-2020 </w:t>
-            </w:r>
-            <w:r>
-              <w:rPr>
-                <w:sz w:val="13"/>
-              </w:rPr>
-              <w:lastRenderedPageBreak/>
-              <w:t>(COVID). β 1,208 → 0,665, corregido por Blume/Kalman.</w:t>
+              <w:t>Detecta quiebre en 19-mar-2020 (COVID). β 1,208 → 0,665, corregido por Blume/Kalman.</w:t>
             </w:r>
           </w:p>
         </w:tc>
@@ -28906,7 +28885,7 @@
         <w:pStyle w:val="Ttulo1"/>
         <w:spacing w:before="100" w:after="30"/>
       </w:pPr>
-      <w:bookmarkStart w:id="57" w:name="_Toc238661599"/>
+      <w:bookmarkStart w:id="57" w:name="_Toc238663174"/>
       <w:r>
         <w:rPr>
           <w:rFonts w:ascii="Georgia" w:hAnsi="Georgia"/>
@@ -29085,7 +29064,7 @@
         <w:pStyle w:val="Ttulo1"/>
         <w:spacing w:before="100" w:after="30"/>
       </w:pPr>
-      <w:bookmarkStart w:id="58" w:name="_Toc238661600"/>
+      <w:bookmarkStart w:id="58" w:name="_Toc238663175"/>
       <w:r>
         <w:rPr>
           <w:rFonts w:ascii="Georgia" w:hAnsi="Georgia"/>
@@ -32415,14 +32394,7 @@
                 <w:b/>
                 <w:sz w:val="13"/>
               </w:rPr>
-              <w:t xml:space="preserve">NOPAT (Resultado Operativo Neto </w:t>
-            </w:r>
-            <w:r>
-              <w:rPr>
-                <w:b/>
-                <w:sz w:val="13"/>
-              </w:rPr>
-              <w:t>de Impuestos)</w:t>
+              <w:t>NOPAT (Resultado Operativo Neto de Impuestos)</w:t>
             </w:r>
           </w:p>
         </w:tc>
@@ -32675,7 +32647,15 @@
                 <w:color w:val="FFFFFF"/>
                 <w:sz w:val="13"/>
               </w:rPr>
-              <w:t>Rubro Patrimonial</w:t>
+              <w:t xml:space="preserve">Rubro </w:t>
+            </w:r>
+            <w:r>
+              <w:rPr>
+                <w:b/>
+                <w:color w:val="FFFFFF"/>
+                <w:sz w:val="13"/>
+              </w:rPr>
+              <w:t>Patrimonial</w:t>
             </w:r>
           </w:p>
         </w:tc>
@@ -38182,7 +38162,7 @@
         <w:pStyle w:val="Ttulo1"/>
         <w:spacing w:before="100" w:after="30"/>
       </w:pPr>
-      <w:bookmarkStart w:id="59" w:name="_Toc238661601"/>
+      <w:bookmarkStart w:id="59" w:name="_Toc238663176"/>
       <w:r>
         <w:rPr>
           <w:rFonts w:ascii="Georgia" w:hAnsi="Georgia"/>
@@ -38218,11 +38198,11 @@
         </w:rPr>
       </w:pPr>
       <w:r>
-        <w:lastRenderedPageBreak/>
-        <w:t>Las estimaciones y proyecciones se basan únicamente en información pública: Estados Financieros Consolidados Auditados de Aluar (dictamen de Price Waterhouse &amp; Co. S.R.L., ejercicios cerrados al 30 de junio 2020–2025), Memorias Anuales, hechos relevantes publicados en CNV y BYMA, estadísticas del London Metal Exchange (LME), datos del BCRA y series de la Reserva Federal (FRED). Las variables de mercado (LME spot, EMBI+ Argentina, CCL implícito vía GGAL) corresponden al cierre del 23 de julio de 2026. No ref</w:t>
+        <w:t xml:space="preserve">Las estimaciones y proyecciones se basan únicamente en información pública: Estados Financieros Consolidados Auditados de Aluar (dictamen de Price Waterhouse &amp; Co. S.R.L., ejercicios cerrados al 30 de junio 2020–2025), Memorias Anuales, hechos relevantes publicados en CNV y BYMA, </w:t>
       </w:r>
       <w:r>
-        <w:t>lejan movimientos posteriores a esa fecha.</w:t>
+        <w:lastRenderedPageBreak/>
+        <w:t>estadísticas del London Metal Exchange (LME), datos del BCRA y series de la Reserva Federal (FRED). Las variables de mercado (LME spot, EMBI+ Argentina, CCL implícito vía GGAL) corresponden al cierre del 23 de julio de 2026. No reflejan movimientos posteriores a esa fecha.</w:t>
       </w:r>
     </w:p>
     <w:p>
@@ -38289,7 +38269,7 @@
         <w:pStyle w:val="Ttulo1"/>
         <w:spacing w:before="100" w:after="30"/>
       </w:pPr>
-      <w:bookmarkStart w:id="60" w:name="_Toc238661602"/>
+      <w:bookmarkStart w:id="60" w:name="_Toc238663177"/>
       <w:r>
         <w:rPr>
           <w:rFonts w:ascii="Georgia" w:hAnsi="Georgia"/>
@@ -39515,31 +39495,31 @@
       </w:rPr>
     </w:lvl>
   </w:abstractNum>
-  <w:num w:numId="1" w16cid:durableId="828056703">
+  <w:num w:numId="1" w16cid:durableId="1193760923">
     <w:abstractNumId w:val="8"/>
   </w:num>
-  <w:num w:numId="2" w16cid:durableId="1458526779">
+  <w:num w:numId="2" w16cid:durableId="709182924">
     <w:abstractNumId w:val="6"/>
   </w:num>
-  <w:num w:numId="3" w16cid:durableId="147285472">
+  <w:num w:numId="3" w16cid:durableId="889027692">
     <w:abstractNumId w:val="5"/>
   </w:num>
-  <w:num w:numId="4" w16cid:durableId="1052659255">
+  <w:num w:numId="4" w16cid:durableId="133257988">
     <w:abstractNumId w:val="4"/>
   </w:num>
-  <w:num w:numId="5" w16cid:durableId="799422730">
+  <w:num w:numId="5" w16cid:durableId="1526287774">
     <w:abstractNumId w:val="7"/>
   </w:num>
-  <w:num w:numId="6" w16cid:durableId="1673294226">
+  <w:num w:numId="6" w16cid:durableId="34430431">
     <w:abstractNumId w:val="3"/>
   </w:num>
-  <w:num w:numId="7" w16cid:durableId="129830532">
+  <w:num w:numId="7" w16cid:durableId="1139226291">
     <w:abstractNumId w:val="2"/>
   </w:num>
-  <w:num w:numId="8" w16cid:durableId="1455249806">
+  <w:num w:numId="8" w16cid:durableId="472723215">
     <w:abstractNumId w:val="1"/>
   </w:num>
-  <w:num w:numId="9" w16cid:durableId="458840282">
+  <w:num w:numId="9" w16cid:durableId="894776403">
     <w:abstractNumId w:val="0"/>
   </w:num>
 </w:numbering>
@@ -50971,7 +50951,7 @@
     <w:autoRedefine/>
     <w:uiPriority w:val="39"/>
     <w:unhideWhenUsed/>
-    <w:rsid w:val="004974DC"/>
+    <w:rsid w:val="00D83C5E"/>
     <w:pPr>
       <w:spacing w:before="10" w:after="10" w:line="240" w:lineRule="auto"/>
     </w:pPr>
@@ -50986,7 +50966,7 @@
     <w:autoRedefine/>
     <w:uiPriority w:val="39"/>
     <w:unhideWhenUsed/>
-    <w:rsid w:val="004974DC"/>
+    <w:rsid w:val="00D83C5E"/>
     <w:pPr>
       <w:spacing w:after="0" w:line="240" w:lineRule="auto"/>
       <w:ind w:left="170"/>
@@ -51000,7 +50980,7 @@
     <w:basedOn w:val="Fuentedeprrafopredeter"/>
     <w:uiPriority w:val="99"/>
     <w:unhideWhenUsed/>
-    <w:rsid w:val="004974DC"/>
+    <w:rsid w:val="00D83C5E"/>
     <w:rPr>
       <w:color w:val="0000FF" w:themeColor="hyperlink"/>
       <w:u w:val="single"/>

</xml_diff>

<commit_message>
Reconciliar comparables (Tabla 4/11 vs static_inputs), Monte Carlo texto vs motor, y percentiles C1/China hardcodeados
</commit_message>
<xml_diff>
--- a/01_Reporte_PDF/Informe_Valuacion_Aluar_UNCuyo.docx
+++ b/01_Reporte_PDF/Informe_Valuacion_Aluar_UNCuyo.docx
@@ -1340,7 +1340,7 @@
         </w:rPr>
         <w:fldChar w:fldCharType="separate"/>
       </w:r>
-      <w:hyperlink w:anchor="_Toc238663117" w:history="1">
+      <w:hyperlink w:anchor="_Toc238664242" w:history="1">
         <w:r>
           <w:rPr>
             <w:rStyle w:val="Hipervnculo"/>
@@ -1367,7 +1367,7 @@
             <w:noProof/>
             <w:webHidden/>
           </w:rPr>
-          <w:instrText xml:space="preserve"> PAGEREF _Toc238663117 \h </w:instrText>
+          <w:instrText xml:space="preserve"> PAGEREF _Toc238664242 \h </w:instrText>
         </w:r>
         <w:r>
           <w:rPr>
@@ -1414,7 +1414,7 @@
           <w14:ligatures w14:val="standardContextual"/>
         </w:rPr>
       </w:pPr>
-      <w:hyperlink w:anchor="_Toc238663118" w:history="1">
+      <w:hyperlink w:anchor="_Toc238664243" w:history="1">
         <w:r>
           <w:rPr>
             <w:rStyle w:val="Hipervnculo"/>
@@ -1441,7 +1441,7 @@
             <w:noProof/>
             <w:webHidden/>
           </w:rPr>
-          <w:instrText xml:space="preserve"> PAGEREF _Toc238663118 \h </w:instrText>
+          <w:instrText xml:space="preserve"> PAGEREF _Toc238664243 \h </w:instrText>
         </w:r>
         <w:r>
           <w:rPr>
@@ -1488,7 +1488,7 @@
           <w14:ligatures w14:val="standardContextual"/>
         </w:rPr>
       </w:pPr>
-      <w:hyperlink w:anchor="_Toc238663119" w:history="1">
+      <w:hyperlink w:anchor="_Toc238664244" w:history="1">
         <w:r>
           <w:rPr>
             <w:rStyle w:val="Hipervnculo"/>
@@ -1515,7 +1515,7 @@
             <w:noProof/>
             <w:webHidden/>
           </w:rPr>
-          <w:instrText xml:space="preserve"> PAGEREF _Toc238663119 \h </w:instrText>
+          <w:instrText xml:space="preserve"> PAGEREF _Toc238664244 \h </w:instrText>
         </w:r>
         <w:r>
           <w:rPr>
@@ -1562,7 +1562,7 @@
           <w14:ligatures w14:val="standardContextual"/>
         </w:rPr>
       </w:pPr>
-      <w:hyperlink w:anchor="_Toc238663120" w:history="1">
+      <w:hyperlink w:anchor="_Toc238664245" w:history="1">
         <w:r>
           <w:rPr>
             <w:rStyle w:val="Hipervnculo"/>
@@ -1589,7 +1589,7 @@
             <w:noProof/>
             <w:webHidden/>
           </w:rPr>
-          <w:instrText xml:space="preserve"> PAGEREF _Toc238663120 \h </w:instrText>
+          <w:instrText xml:space="preserve"> PAGEREF _Toc238664245 \h </w:instrText>
         </w:r>
         <w:r>
           <w:rPr>
@@ -1636,7 +1636,7 @@
           <w14:ligatures w14:val="standardContextual"/>
         </w:rPr>
       </w:pPr>
-      <w:hyperlink w:anchor="_Toc238663121" w:history="1">
+      <w:hyperlink w:anchor="_Toc238664246" w:history="1">
         <w:r>
           <w:rPr>
             <w:rStyle w:val="Hipervnculo"/>
@@ -1663,7 +1663,7 @@
             <w:noProof/>
             <w:webHidden/>
           </w:rPr>
-          <w:instrText xml:space="preserve"> PAGEREF _Toc238663121 \h </w:instrText>
+          <w:instrText xml:space="preserve"> PAGEREF _Toc238664246 \h </w:instrText>
         </w:r>
         <w:r>
           <w:rPr>
@@ -1710,7 +1710,7 @@
           <w14:ligatures w14:val="standardContextual"/>
         </w:rPr>
       </w:pPr>
-      <w:hyperlink w:anchor="_Toc238663122" w:history="1">
+      <w:hyperlink w:anchor="_Toc238664247" w:history="1">
         <w:r>
           <w:rPr>
             <w:rStyle w:val="Hipervnculo"/>
@@ -1737,7 +1737,7 @@
             <w:noProof/>
             <w:webHidden/>
           </w:rPr>
-          <w:instrText xml:space="preserve"> PAGEREF _Toc238663122 \h </w:instrText>
+          <w:instrText xml:space="preserve"> PAGEREF _Toc238664247 \h </w:instrText>
         </w:r>
         <w:r>
           <w:rPr>
@@ -1784,7 +1784,7 @@
           <w14:ligatures w14:val="standardContextual"/>
         </w:rPr>
       </w:pPr>
-      <w:hyperlink w:anchor="_Toc238663123" w:history="1">
+      <w:hyperlink w:anchor="_Toc238664248" w:history="1">
         <w:r>
           <w:rPr>
             <w:rStyle w:val="Hipervnculo"/>
@@ -1811,7 +1811,7 @@
             <w:noProof/>
             <w:webHidden/>
           </w:rPr>
-          <w:instrText xml:space="preserve"> PAGEREF _Toc238663123 \h </w:instrText>
+          <w:instrText xml:space="preserve"> PAGEREF _Toc238664248 \h </w:instrText>
         </w:r>
         <w:r>
           <w:rPr>
@@ -1858,13 +1858,13 @@
           <w14:ligatures w14:val="standardContextual"/>
         </w:rPr>
       </w:pPr>
-      <w:hyperlink w:anchor="_Toc238663124" w:history="1">
+      <w:hyperlink w:anchor="_Toc238664249" w:history="1">
         <w:r>
           <w:rPr>
             <w:rStyle w:val="Hipervnculo"/>
             <w:noProof/>
           </w:rPr>
-          <w:t>Contexto Macroeconómico y Mecánica Operativa de Proyección (P × Q)</w:t>
+          <w:t>Entorno Macroeconómico y Modelo Operativo (P × Q)</w:t>
         </w:r>
         <w:r>
           <w:rPr>
@@ -1885,7 +1885,7 @@
             <w:noProof/>
             <w:webHidden/>
           </w:rPr>
-          <w:instrText xml:space="preserve"> PAGEREF _Toc238663124 \h </w:instrText>
+          <w:instrText xml:space="preserve"> PAGEREF _Toc238664249 \h </w:instrText>
         </w:r>
         <w:r>
           <w:rPr>
@@ -1932,7 +1932,7 @@
           <w14:ligatures w14:val="standardContextual"/>
         </w:rPr>
       </w:pPr>
-      <w:hyperlink w:anchor="_Toc238663125" w:history="1">
+      <w:hyperlink w:anchor="_Toc238664250" w:history="1">
         <w:r>
           <w:rPr>
             <w:rStyle w:val="Hipervnculo"/>
@@ -1959,7 +1959,7 @@
             <w:noProof/>
             <w:webHidden/>
           </w:rPr>
-          <w:instrText xml:space="preserve"> PAGEREF _Toc238663125 \h </w:instrText>
+          <w:instrText xml:space="preserve"> PAGEREF _Toc238664250 \h </w:instrText>
         </w:r>
         <w:r>
           <w:rPr>
@@ -2006,7 +2006,7 @@
           <w14:ligatures w14:val="standardContextual"/>
         </w:rPr>
       </w:pPr>
-      <w:hyperlink w:anchor="_Toc238663126" w:history="1">
+      <w:hyperlink w:anchor="_Toc238664251" w:history="1">
         <w:r>
           <w:rPr>
             <w:rStyle w:val="Hipervnculo"/>
@@ -2033,7 +2033,7 @@
             <w:noProof/>
             <w:webHidden/>
           </w:rPr>
-          <w:instrText xml:space="preserve"> PAGEREF _Toc238663126 \h </w:instrText>
+          <w:instrText xml:space="preserve"> PAGEREF _Toc238664251 \h </w:instrText>
         </w:r>
         <w:r>
           <w:rPr>
@@ -2080,7 +2080,7 @@
           <w14:ligatures w14:val="standardContextual"/>
         </w:rPr>
       </w:pPr>
-      <w:hyperlink w:anchor="_Toc238663127" w:history="1">
+      <w:hyperlink w:anchor="_Toc238664252" w:history="1">
         <w:r>
           <w:rPr>
             <w:rStyle w:val="Hipervnculo"/>
@@ -2107,7 +2107,7 @@
             <w:noProof/>
             <w:webHidden/>
           </w:rPr>
-          <w:instrText xml:space="preserve"> PAGEREF _Toc238663127 \h </w:instrText>
+          <w:instrText xml:space="preserve"> PAGEREF _Toc238664252 \h </w:instrText>
         </w:r>
         <w:r>
           <w:rPr>
@@ -2154,7 +2154,7 @@
           <w14:ligatures w14:val="standardContextual"/>
         </w:rPr>
       </w:pPr>
-      <w:hyperlink w:anchor="_Toc238663128" w:history="1">
+      <w:hyperlink w:anchor="_Toc238664253" w:history="1">
         <w:r>
           <w:rPr>
             <w:rStyle w:val="Hipervnculo"/>
@@ -2181,7 +2181,7 @@
             <w:noProof/>
             <w:webHidden/>
           </w:rPr>
-          <w:instrText xml:space="preserve"> PAGEREF _Toc238663128 \h </w:instrText>
+          <w:instrText xml:space="preserve"> PAGEREF _Toc238664253 \h </w:instrText>
         </w:r>
         <w:r>
           <w:rPr>
@@ -2228,7 +2228,7 @@
           <w14:ligatures w14:val="standardContextual"/>
         </w:rPr>
       </w:pPr>
-      <w:hyperlink w:anchor="_Toc238663129" w:history="1">
+      <w:hyperlink w:anchor="_Toc238664254" w:history="1">
         <w:r>
           <w:rPr>
             <w:rStyle w:val="Hipervnculo"/>
@@ -2255,7 +2255,7 @@
             <w:noProof/>
             <w:webHidden/>
           </w:rPr>
-          <w:instrText xml:space="preserve"> PAGEREF _Toc238663129 \h </w:instrText>
+          <w:instrText xml:space="preserve"> PAGEREF _Toc238664254 \h </w:instrText>
         </w:r>
         <w:r>
           <w:rPr>
@@ -2302,7 +2302,7 @@
           <w14:ligatures w14:val="standardContextual"/>
         </w:rPr>
       </w:pPr>
-      <w:hyperlink w:anchor="_Toc238663130" w:history="1">
+      <w:hyperlink w:anchor="_Toc238664255" w:history="1">
         <w:r>
           <w:rPr>
             <w:rStyle w:val="Hipervnculo"/>
@@ -2329,7 +2329,7 @@
             <w:noProof/>
             <w:webHidden/>
           </w:rPr>
-          <w:instrText xml:space="preserve"> PAGEREF _Toc238663130 \h </w:instrText>
+          <w:instrText xml:space="preserve"> PAGEREF _Toc238664255 \h </w:instrText>
         </w:r>
         <w:r>
           <w:rPr>
@@ -2376,7 +2376,7 @@
           <w14:ligatures w14:val="standardContextual"/>
         </w:rPr>
       </w:pPr>
-      <w:hyperlink w:anchor="_Toc238663131" w:history="1">
+      <w:hyperlink w:anchor="_Toc238664256" w:history="1">
         <w:r>
           <w:rPr>
             <w:rStyle w:val="Hipervnculo"/>
@@ -2403,7 +2403,7 @@
             <w:noProof/>
             <w:webHidden/>
           </w:rPr>
-          <w:instrText xml:space="preserve"> PAGEREF _Toc238663131 \h </w:instrText>
+          <w:instrText xml:space="preserve"> PAGEREF _Toc238664256 \h </w:instrText>
         </w:r>
         <w:r>
           <w:rPr>
@@ -2450,7 +2450,7 @@
           <w14:ligatures w14:val="standardContextual"/>
         </w:rPr>
       </w:pPr>
-      <w:hyperlink w:anchor="_Toc238663132" w:history="1">
+      <w:hyperlink w:anchor="_Toc238664257" w:history="1">
         <w:r>
           <w:rPr>
             <w:rStyle w:val="Hipervnculo"/>
@@ -2477,7 +2477,7 @@
             <w:noProof/>
             <w:webHidden/>
           </w:rPr>
-          <w:instrText xml:space="preserve"> PAGEREF _Toc238663132 \h </w:instrText>
+          <w:instrText xml:space="preserve"> PAGEREF _Toc238664257 \h </w:instrText>
         </w:r>
         <w:r>
           <w:rPr>
@@ -2524,7 +2524,7 @@
           <w14:ligatures w14:val="standardContextual"/>
         </w:rPr>
       </w:pPr>
-      <w:hyperlink w:anchor="_Toc238663133" w:history="1">
+      <w:hyperlink w:anchor="_Toc238664258" w:history="1">
         <w:r>
           <w:rPr>
             <w:rStyle w:val="Hipervnculo"/>
@@ -2551,7 +2551,7 @@
             <w:noProof/>
             <w:webHidden/>
           </w:rPr>
-          <w:instrText xml:space="preserve"> PAGEREF _Toc238663133 \h </w:instrText>
+          <w:instrText xml:space="preserve"> PAGEREF _Toc238664258 \h </w:instrText>
         </w:r>
         <w:r>
           <w:rPr>
@@ -2598,7 +2598,7 @@
           <w14:ligatures w14:val="standardContextual"/>
         </w:rPr>
       </w:pPr>
-      <w:hyperlink w:anchor="_Toc238663134" w:history="1">
+      <w:hyperlink w:anchor="_Toc238664259" w:history="1">
         <w:r>
           <w:rPr>
             <w:rStyle w:val="Hipervnculo"/>
@@ -2625,7 +2625,7 @@
             <w:noProof/>
             <w:webHidden/>
           </w:rPr>
-          <w:instrText xml:space="preserve"> PAGEREF _Toc238663134 \h </w:instrText>
+          <w:instrText xml:space="preserve"> PAGEREF _Toc238664259 \h </w:instrText>
         </w:r>
         <w:r>
           <w:rPr>
@@ -2672,13 +2672,13 @@
           <w14:ligatures w14:val="standardContextual"/>
         </w:rPr>
       </w:pPr>
-      <w:hyperlink w:anchor="_Toc238663135" w:history="1">
+      <w:hyperlink w:anchor="_Toc238664260" w:history="1">
         <w:r>
           <w:rPr>
             <w:rStyle w:val="Hipervnculo"/>
             <w:noProof/>
           </w:rPr>
-          <w:t>Valuación Relativa y Dinámica de Desapalancamiento Post-CAPEX</w:t>
+          <w:t>Valuación Relativa y Perfil de Desapalancamiento</w:t>
         </w:r>
         <w:r>
           <w:rPr>
@@ -2699,7 +2699,7 @@
             <w:noProof/>
             <w:webHidden/>
           </w:rPr>
-          <w:instrText xml:space="preserve"> PAGEREF _Toc238663135 \h </w:instrText>
+          <w:instrText xml:space="preserve"> PAGEREF _Toc238664260 \h </w:instrText>
         </w:r>
         <w:r>
           <w:rPr>
@@ -2746,7 +2746,7 @@
           <w14:ligatures w14:val="standardContextual"/>
         </w:rPr>
       </w:pPr>
-      <w:hyperlink w:anchor="_Toc238663136" w:history="1">
+      <w:hyperlink w:anchor="_Toc238664261" w:history="1">
         <w:r>
           <w:rPr>
             <w:rStyle w:val="Hipervnculo"/>
@@ -2773,7 +2773,7 @@
             <w:noProof/>
             <w:webHidden/>
           </w:rPr>
-          <w:instrText xml:space="preserve"> PAGEREF _Toc238663136 \h </w:instrText>
+          <w:instrText xml:space="preserve"> PAGEREF _Toc238664261 \h </w:instrText>
         </w:r>
         <w:r>
           <w:rPr>
@@ -2820,7 +2820,7 @@
           <w14:ligatures w14:val="standardContextual"/>
         </w:rPr>
       </w:pPr>
-      <w:hyperlink w:anchor="_Toc238663137" w:history="1">
+      <w:hyperlink w:anchor="_Toc238664262" w:history="1">
         <w:r>
           <w:rPr>
             <w:rStyle w:val="Hipervnculo"/>
@@ -2847,7 +2847,7 @@
             <w:noProof/>
             <w:webHidden/>
           </w:rPr>
-          <w:instrText xml:space="preserve"> PAGEREF _Toc238663137 \h </w:instrText>
+          <w:instrText xml:space="preserve"> PAGEREF _Toc238664262 \h </w:instrText>
         </w:r>
         <w:r>
           <w:rPr>
@@ -2894,7 +2894,7 @@
           <w14:ligatures w14:val="standardContextual"/>
         </w:rPr>
       </w:pPr>
-      <w:hyperlink w:anchor="_Toc238663138" w:history="1">
+      <w:hyperlink w:anchor="_Toc238664263" w:history="1">
         <w:r>
           <w:rPr>
             <w:rStyle w:val="Hipervnculo"/>
@@ -2921,7 +2921,7 @@
             <w:noProof/>
             <w:webHidden/>
           </w:rPr>
-          <w:instrText xml:space="preserve"> PAGEREF _Toc238663138 \h </w:instrText>
+          <w:instrText xml:space="preserve"> PAGEREF _Toc238664263 \h </w:instrText>
         </w:r>
         <w:r>
           <w:rPr>
@@ -2968,7 +2968,7 @@
           <w14:ligatures w14:val="standardContextual"/>
         </w:rPr>
       </w:pPr>
-      <w:hyperlink w:anchor="_Toc238663139" w:history="1">
+      <w:hyperlink w:anchor="_Toc238664264" w:history="1">
         <w:r>
           <w:rPr>
             <w:rStyle w:val="Hipervnculo"/>
@@ -2995,7 +2995,7 @@
             <w:noProof/>
             <w:webHidden/>
           </w:rPr>
-          <w:instrText xml:space="preserve"> PAGEREF _Toc238663139 \h </w:instrText>
+          <w:instrText xml:space="preserve"> PAGEREF _Toc238664264 \h </w:instrText>
         </w:r>
         <w:r>
           <w:rPr>
@@ -3042,7 +3042,7 @@
           <w14:ligatures w14:val="standardContextual"/>
         </w:rPr>
       </w:pPr>
-      <w:hyperlink w:anchor="_Toc238663140" w:history="1">
+      <w:hyperlink w:anchor="_Toc238664265" w:history="1">
         <w:r>
           <w:rPr>
             <w:rStyle w:val="Hipervnculo"/>
@@ -3099,7 +3099,7 @@
             <w:noProof/>
             <w:webHidden/>
           </w:rPr>
-          <w:instrText xml:space="preserve"> PAGEREF _Toc238663140 \h </w:instrText>
+          <w:instrText xml:space="preserve"> PAGEREF _Toc238664265 \h </w:instrText>
         </w:r>
         <w:r>
           <w:rPr>
@@ -3146,7 +3146,7 @@
           <w14:ligatures w14:val="standardContextual"/>
         </w:rPr>
       </w:pPr>
-      <w:hyperlink w:anchor="_Toc238663141" w:history="1">
+      <w:hyperlink w:anchor="_Toc238664266" w:history="1">
         <w:r>
           <w:rPr>
             <w:rStyle w:val="Hipervnculo"/>
@@ -3173,7 +3173,7 @@
             <w:noProof/>
             <w:webHidden/>
           </w:rPr>
-          <w:instrText xml:space="preserve"> PAGEREF _Toc238663141 \h </w:instrText>
+          <w:instrText xml:space="preserve"> PAGEREF _Toc238664266 \h </w:instrText>
         </w:r>
         <w:r>
           <w:rPr>
@@ -3220,7 +3220,7 @@
           <w14:ligatures w14:val="standardContextual"/>
         </w:rPr>
       </w:pPr>
-      <w:hyperlink w:anchor="_Toc238663142" w:history="1">
+      <w:hyperlink w:anchor="_Toc238664267" w:history="1">
         <w:r>
           <w:rPr>
             <w:rStyle w:val="Hipervnculo"/>
@@ -3247,7 +3247,7 @@
             <w:noProof/>
             <w:webHidden/>
           </w:rPr>
-          <w:instrText xml:space="preserve"> PAGEREF _Toc238663142 \h </w:instrText>
+          <w:instrText xml:space="preserve"> PAGEREF _Toc238664267 \h </w:instrText>
         </w:r>
         <w:r>
           <w:rPr>
@@ -3294,7 +3294,7 @@
           <w14:ligatures w14:val="standardContextual"/>
         </w:rPr>
       </w:pPr>
-      <w:hyperlink w:anchor="_Toc238663143" w:history="1">
+      <w:hyperlink w:anchor="_Toc238664268" w:history="1">
         <w:r>
           <w:rPr>
             <w:rStyle w:val="Hipervnculo"/>
@@ -3321,7 +3321,7 @@
             <w:noProof/>
             <w:webHidden/>
           </w:rPr>
-          <w:instrText xml:space="preserve"> PAGEREF _Toc238663143 \h </w:instrText>
+          <w:instrText xml:space="preserve"> PAGEREF _Toc238664268 \h </w:instrText>
         </w:r>
         <w:r>
           <w:rPr>
@@ -3368,7 +3368,7 @@
           <w14:ligatures w14:val="standardContextual"/>
         </w:rPr>
       </w:pPr>
-      <w:hyperlink w:anchor="_Toc238663144" w:history="1">
+      <w:hyperlink w:anchor="_Toc238664269" w:history="1">
         <w:r>
           <w:rPr>
             <w:rStyle w:val="Hipervnculo"/>
@@ -3395,7 +3395,7 @@
             <w:noProof/>
             <w:webHidden/>
           </w:rPr>
-          <w:instrText xml:space="preserve"> PAGEREF _Toc238663144 \h </w:instrText>
+          <w:instrText xml:space="preserve"> PAGEREF _Toc238664269 \h </w:instrText>
         </w:r>
         <w:r>
           <w:rPr>
@@ -3442,7 +3442,7 @@
           <w14:ligatures w14:val="standardContextual"/>
         </w:rPr>
       </w:pPr>
-      <w:hyperlink w:anchor="_Toc238663145" w:history="1">
+      <w:hyperlink w:anchor="_Toc238664270" w:history="1">
         <w:r>
           <w:rPr>
             <w:rStyle w:val="Hipervnculo"/>
@@ -3469,7 +3469,7 @@
             <w:noProof/>
             <w:webHidden/>
           </w:rPr>
-          <w:instrText xml:space="preserve"> PAGEREF _Toc238663145 \h </w:instrText>
+          <w:instrText xml:space="preserve"> PAGEREF _Toc238664270 \h </w:instrText>
         </w:r>
         <w:r>
           <w:rPr>
@@ -3516,7 +3516,7 @@
           <w14:ligatures w14:val="standardContextual"/>
         </w:rPr>
       </w:pPr>
-      <w:hyperlink w:anchor="_Toc238663146" w:history="1">
+      <w:hyperlink w:anchor="_Toc238664271" w:history="1">
         <w:r>
           <w:rPr>
             <w:rStyle w:val="Hipervnculo"/>
@@ -3543,7 +3543,7 @@
             <w:noProof/>
             <w:webHidden/>
           </w:rPr>
-          <w:instrText xml:space="preserve"> PAGEREF _Toc238663146 \h </w:instrText>
+          <w:instrText xml:space="preserve"> PAGEREF _Toc238664271 \h </w:instrText>
         </w:r>
         <w:r>
           <w:rPr>
@@ -3590,7 +3590,7 @@
           <w14:ligatures w14:val="standardContextual"/>
         </w:rPr>
       </w:pPr>
-      <w:hyperlink w:anchor="_Toc238663147" w:history="1">
+      <w:hyperlink w:anchor="_Toc238664272" w:history="1">
         <w:r>
           <w:rPr>
             <w:rStyle w:val="Hipervnculo"/>
@@ -3617,7 +3617,7 @@
             <w:noProof/>
             <w:webHidden/>
           </w:rPr>
-          <w:instrText xml:space="preserve"> PAGEREF _Toc238663147 \h </w:instrText>
+          <w:instrText xml:space="preserve"> PAGEREF _Toc238664272 \h </w:instrText>
         </w:r>
         <w:r>
           <w:rPr>
@@ -3664,7 +3664,7 @@
           <w14:ligatures w14:val="standardContextual"/>
         </w:rPr>
       </w:pPr>
-      <w:hyperlink w:anchor="_Toc238663148" w:history="1">
+      <w:hyperlink w:anchor="_Toc238664273" w:history="1">
         <w:r>
           <w:rPr>
             <w:rStyle w:val="Hipervnculo"/>
@@ -3691,7 +3691,7 @@
             <w:noProof/>
             <w:webHidden/>
           </w:rPr>
-          <w:instrText xml:space="preserve"> PAGEREF _Toc238663148 \h </w:instrText>
+          <w:instrText xml:space="preserve"> PAGEREF _Toc238664273 \h </w:instrText>
         </w:r>
         <w:r>
           <w:rPr>
@@ -3738,7 +3738,7 @@
           <w14:ligatures w14:val="standardContextual"/>
         </w:rPr>
       </w:pPr>
-      <w:hyperlink w:anchor="_Toc238663149" w:history="1">
+      <w:hyperlink w:anchor="_Toc238664274" w:history="1">
         <w:r>
           <w:rPr>
             <w:rStyle w:val="Hipervnculo"/>
@@ -3765,7 +3765,7 @@
             <w:noProof/>
             <w:webHidden/>
           </w:rPr>
-          <w:instrText xml:space="preserve"> PAGEREF _Toc238663149 \h </w:instrText>
+          <w:instrText xml:space="preserve"> PAGEREF _Toc238664274 \h </w:instrText>
         </w:r>
         <w:r>
           <w:rPr>
@@ -3812,7 +3812,7 @@
           <w14:ligatures w14:val="standardContextual"/>
         </w:rPr>
       </w:pPr>
-      <w:hyperlink w:anchor="_Toc238663150" w:history="1">
+      <w:hyperlink w:anchor="_Toc238664275" w:history="1">
         <w:r>
           <w:rPr>
             <w:rStyle w:val="Hipervnculo"/>
@@ -3839,7 +3839,7 @@
             <w:noProof/>
             <w:webHidden/>
           </w:rPr>
-          <w:instrText xml:space="preserve"> PAGEREF _Toc238663150 \h </w:instrText>
+          <w:instrText xml:space="preserve"> PAGEREF _Toc238664275 \h </w:instrText>
         </w:r>
         <w:r>
           <w:rPr>
@@ -3886,7 +3886,7 @@
           <w14:ligatures w14:val="standardContextual"/>
         </w:rPr>
       </w:pPr>
-      <w:hyperlink w:anchor="_Toc238663151" w:history="1">
+      <w:hyperlink w:anchor="_Toc238664276" w:history="1">
         <w:r>
           <w:rPr>
             <w:rStyle w:val="Hipervnculo"/>
@@ -3913,7 +3913,7 @@
             <w:noProof/>
             <w:webHidden/>
           </w:rPr>
-          <w:instrText xml:space="preserve"> PAGEREF _Toc238663151 \h </w:instrText>
+          <w:instrText xml:space="preserve"> PAGEREF _Toc238664276 \h </w:instrText>
         </w:r>
         <w:r>
           <w:rPr>
@@ -3960,7 +3960,7 @@
           <w14:ligatures w14:val="standardContextual"/>
         </w:rPr>
       </w:pPr>
-      <w:hyperlink w:anchor="_Toc238663152" w:history="1">
+      <w:hyperlink w:anchor="_Toc238664277" w:history="1">
         <w:r>
           <w:rPr>
             <w:rStyle w:val="Hipervnculo"/>
@@ -3987,7 +3987,7 @@
             <w:noProof/>
             <w:webHidden/>
           </w:rPr>
-          <w:instrText xml:space="preserve"> PAGEREF _Toc238663152 \h </w:instrText>
+          <w:instrText xml:space="preserve"> PAGEREF _Toc238664277 \h </w:instrText>
         </w:r>
         <w:r>
           <w:rPr>
@@ -4034,7 +4034,7 @@
           <w14:ligatures w14:val="standardContextual"/>
         </w:rPr>
       </w:pPr>
-      <w:hyperlink w:anchor="_Toc238663153" w:history="1">
+      <w:hyperlink w:anchor="_Toc238664278" w:history="1">
         <w:r>
           <w:rPr>
             <w:rStyle w:val="Hipervnculo"/>
@@ -4061,7 +4061,7 @@
             <w:noProof/>
             <w:webHidden/>
           </w:rPr>
-          <w:instrText xml:space="preserve"> PAGEREF _Toc238663153 \h </w:instrText>
+          <w:instrText xml:space="preserve"> PAGEREF _Toc238664278 \h </w:instrText>
         </w:r>
         <w:r>
           <w:rPr>
@@ -4108,7 +4108,7 @@
           <w14:ligatures w14:val="standardContextual"/>
         </w:rPr>
       </w:pPr>
-      <w:hyperlink w:anchor="_Toc238663154" w:history="1">
+      <w:hyperlink w:anchor="_Toc238664279" w:history="1">
         <w:r>
           <w:rPr>
             <w:rStyle w:val="Hipervnculo"/>
@@ -4135,7 +4135,7 @@
             <w:noProof/>
             <w:webHidden/>
           </w:rPr>
-          <w:instrText xml:space="preserve"> PAGEREF _Toc238663154 \h </w:instrText>
+          <w:instrText xml:space="preserve"> PAGEREF _Toc238664279 \h </w:instrText>
         </w:r>
         <w:r>
           <w:rPr>
@@ -4182,7 +4182,7 @@
           <w14:ligatures w14:val="standardContextual"/>
         </w:rPr>
       </w:pPr>
-      <w:hyperlink w:anchor="_Toc238663155" w:history="1">
+      <w:hyperlink w:anchor="_Toc238664280" w:history="1">
         <w:r>
           <w:rPr>
             <w:rStyle w:val="Hipervnculo"/>
@@ -4209,7 +4209,7 @@
             <w:noProof/>
             <w:webHidden/>
           </w:rPr>
-          <w:instrText xml:space="preserve"> PAGEREF _Toc238663155 \h </w:instrText>
+          <w:instrText xml:space="preserve"> PAGEREF _Toc238664280 \h </w:instrText>
         </w:r>
         <w:r>
           <w:rPr>
@@ -4256,7 +4256,7 @@
           <w14:ligatures w14:val="standardContextual"/>
         </w:rPr>
       </w:pPr>
-      <w:hyperlink w:anchor="_Toc238663156" w:history="1">
+      <w:hyperlink w:anchor="_Toc238664281" w:history="1">
         <w:r>
           <w:rPr>
             <w:rStyle w:val="Hipervnculo"/>
@@ -4283,7 +4283,7 @@
             <w:noProof/>
             <w:webHidden/>
           </w:rPr>
-          <w:instrText xml:space="preserve"> PAGEREF _Toc238663156 \h </w:instrText>
+          <w:instrText xml:space="preserve"> PAGEREF _Toc238664281 \h </w:instrText>
         </w:r>
         <w:r>
           <w:rPr>
@@ -4330,7 +4330,7 @@
           <w14:ligatures w14:val="standardContextual"/>
         </w:rPr>
       </w:pPr>
-      <w:hyperlink w:anchor="_Toc238663157" w:history="1">
+      <w:hyperlink w:anchor="_Toc238664282" w:history="1">
         <w:r>
           <w:rPr>
             <w:rStyle w:val="Hipervnculo"/>
@@ -4357,7 +4357,7 @@
             <w:noProof/>
             <w:webHidden/>
           </w:rPr>
-          <w:instrText xml:space="preserve"> PAGEREF _Toc238663157 \h </w:instrText>
+          <w:instrText xml:space="preserve"> PAGEREF _Toc238664282 \h </w:instrText>
         </w:r>
         <w:r>
           <w:rPr>
@@ -4404,7 +4404,7 @@
           <w14:ligatures w14:val="standardContextual"/>
         </w:rPr>
       </w:pPr>
-      <w:hyperlink w:anchor="_Toc238663158" w:history="1">
+      <w:hyperlink w:anchor="_Toc238664283" w:history="1">
         <w:r>
           <w:rPr>
             <w:rStyle w:val="Hipervnculo"/>
@@ -4431,7 +4431,7 @@
             <w:noProof/>
             <w:webHidden/>
           </w:rPr>
-          <w:instrText xml:space="preserve"> PAGEREF _Toc238663158 \h </w:instrText>
+          <w:instrText xml:space="preserve"> PAGEREF _Toc238664283 \h </w:instrText>
         </w:r>
         <w:r>
           <w:rPr>
@@ -4478,7 +4478,7 @@
           <w14:ligatures w14:val="standardContextual"/>
         </w:rPr>
       </w:pPr>
-      <w:hyperlink w:anchor="_Toc238663159" w:history="1">
+      <w:hyperlink w:anchor="_Toc238664284" w:history="1">
         <w:r>
           <w:rPr>
             <w:rStyle w:val="Hipervnculo"/>
@@ -4505,7 +4505,7 @@
             <w:noProof/>
             <w:webHidden/>
           </w:rPr>
-          <w:instrText xml:space="preserve"> PAGEREF _Toc238663159 \h </w:instrText>
+          <w:instrText xml:space="preserve"> PAGEREF _Toc238664284 \h </w:instrText>
         </w:r>
         <w:r>
           <w:rPr>
@@ -4552,7 +4552,7 @@
           <w14:ligatures w14:val="standardContextual"/>
         </w:rPr>
       </w:pPr>
-      <w:hyperlink w:anchor="_Toc238663160" w:history="1">
+      <w:hyperlink w:anchor="_Toc238664285" w:history="1">
         <w:r>
           <w:rPr>
             <w:rStyle w:val="Hipervnculo"/>
@@ -4579,7 +4579,7 @@
             <w:noProof/>
             <w:webHidden/>
           </w:rPr>
-          <w:instrText xml:space="preserve"> PAGEREF _Toc238663160 \h </w:instrText>
+          <w:instrText xml:space="preserve"> PAGEREF _Toc238664285 \h </w:instrText>
         </w:r>
         <w:r>
           <w:rPr>
@@ -4626,7 +4626,7 @@
           <w14:ligatures w14:val="standardContextual"/>
         </w:rPr>
       </w:pPr>
-      <w:hyperlink w:anchor="_Toc238663161" w:history="1">
+      <w:hyperlink w:anchor="_Toc238664286" w:history="1">
         <w:r>
           <w:rPr>
             <w:rStyle w:val="Hipervnculo"/>
@@ -4653,7 +4653,7 @@
             <w:noProof/>
             <w:webHidden/>
           </w:rPr>
-          <w:instrText xml:space="preserve"> PAGEREF _Toc238663161 \h </w:instrText>
+          <w:instrText xml:space="preserve"> PAGEREF _Toc238664286 \h </w:instrText>
         </w:r>
         <w:r>
           <w:rPr>
@@ -4700,7 +4700,7 @@
           <w14:ligatures w14:val="standardContextual"/>
         </w:rPr>
       </w:pPr>
-      <w:hyperlink w:anchor="_Toc238663162" w:history="1">
+      <w:hyperlink w:anchor="_Toc238664287" w:history="1">
         <w:r>
           <w:rPr>
             <w:rStyle w:val="Hipervnculo"/>
@@ -4727,7 +4727,7 @@
             <w:noProof/>
             <w:webHidden/>
           </w:rPr>
-          <w:instrText xml:space="preserve"> PAGEREF _Toc238663162 \h </w:instrText>
+          <w:instrText xml:space="preserve"> PAGEREF _Toc238664287 \h </w:instrText>
         </w:r>
         <w:r>
           <w:rPr>
@@ -4774,7 +4774,7 @@
           <w14:ligatures w14:val="standardContextual"/>
         </w:rPr>
       </w:pPr>
-      <w:hyperlink w:anchor="_Toc238663163" w:history="1">
+      <w:hyperlink w:anchor="_Toc238664288" w:history="1">
         <w:r>
           <w:rPr>
             <w:rStyle w:val="Hipervnculo"/>
@@ -4801,7 +4801,7 @@
             <w:noProof/>
             <w:webHidden/>
           </w:rPr>
-          <w:instrText xml:space="preserve"> PAGEREF _Toc238663163 \h </w:instrText>
+          <w:instrText xml:space="preserve"> PAGEREF _Toc238664288 \h </w:instrText>
         </w:r>
         <w:r>
           <w:rPr>
@@ -4848,7 +4848,7 @@
           <w14:ligatures w14:val="standardContextual"/>
         </w:rPr>
       </w:pPr>
-      <w:hyperlink w:anchor="_Toc238663164" w:history="1">
+      <w:hyperlink w:anchor="_Toc238664289" w:history="1">
         <w:r>
           <w:rPr>
             <w:rStyle w:val="Hipervnculo"/>
@@ -4875,7 +4875,7 @@
             <w:noProof/>
             <w:webHidden/>
           </w:rPr>
-          <w:instrText xml:space="preserve"> PAGEREF _Toc238663164 \h </w:instrText>
+          <w:instrText xml:space="preserve"> PAGEREF _Toc238664289 \h </w:instrText>
         </w:r>
         <w:r>
           <w:rPr>
@@ -4922,7 +4922,7 @@
           <w14:ligatures w14:val="standardContextual"/>
         </w:rPr>
       </w:pPr>
-      <w:hyperlink w:anchor="_Toc238663165" w:history="1">
+      <w:hyperlink w:anchor="_Toc238664290" w:history="1">
         <w:r>
           <w:rPr>
             <w:rStyle w:val="Hipervnculo"/>
@@ -4949,7 +4949,7 @@
             <w:noProof/>
             <w:webHidden/>
           </w:rPr>
-          <w:instrText xml:space="preserve"> PAGEREF _Toc238663165 \h </w:instrText>
+          <w:instrText xml:space="preserve"> PAGEREF _Toc238664290 \h </w:instrText>
         </w:r>
         <w:r>
           <w:rPr>
@@ -4996,7 +4996,7 @@
           <w14:ligatures w14:val="standardContextual"/>
         </w:rPr>
       </w:pPr>
-      <w:hyperlink w:anchor="_Toc238663166" w:history="1">
+      <w:hyperlink w:anchor="_Toc238664291" w:history="1">
         <w:r>
           <w:rPr>
             <w:rStyle w:val="Hipervnculo"/>
@@ -5023,7 +5023,7 @@
             <w:noProof/>
             <w:webHidden/>
           </w:rPr>
-          <w:instrText xml:space="preserve"> PAGEREF _Toc238663166 \h </w:instrText>
+          <w:instrText xml:space="preserve"> PAGEREF _Toc238664291 \h </w:instrText>
         </w:r>
         <w:r>
           <w:rPr>
@@ -5070,7 +5070,7 @@
           <w14:ligatures w14:val="standardContextual"/>
         </w:rPr>
       </w:pPr>
-      <w:hyperlink w:anchor="_Toc238663167" w:history="1">
+      <w:hyperlink w:anchor="_Toc238664292" w:history="1">
         <w:r>
           <w:rPr>
             <w:rStyle w:val="Hipervnculo"/>
@@ -5097,7 +5097,7 @@
             <w:noProof/>
             <w:webHidden/>
           </w:rPr>
-          <w:instrText xml:space="preserve"> PAGEREF _Toc238663167 \h </w:instrText>
+          <w:instrText xml:space="preserve"> PAGEREF _Toc238664292 \h </w:instrText>
         </w:r>
         <w:r>
           <w:rPr>
@@ -5144,7 +5144,7 @@
           <w14:ligatures w14:val="standardContextual"/>
         </w:rPr>
       </w:pPr>
-      <w:hyperlink w:anchor="_Toc238663168" w:history="1">
+      <w:hyperlink w:anchor="_Toc238664293" w:history="1">
         <w:r>
           <w:rPr>
             <w:rStyle w:val="Hipervnculo"/>
@@ -5171,7 +5171,7 @@
             <w:noProof/>
             <w:webHidden/>
           </w:rPr>
-          <w:instrText xml:space="preserve"> PAGEREF _Toc238663168 \h </w:instrText>
+          <w:instrText xml:space="preserve"> PAGEREF _Toc238664293 \h </w:instrText>
         </w:r>
         <w:r>
           <w:rPr>
@@ -5218,7 +5218,7 @@
           <w14:ligatures w14:val="standardContextual"/>
         </w:rPr>
       </w:pPr>
-      <w:hyperlink w:anchor="_Toc238663169" w:history="1">
+      <w:hyperlink w:anchor="_Toc238664294" w:history="1">
         <w:r>
           <w:rPr>
             <w:rStyle w:val="Hipervnculo"/>
@@ -5245,7 +5245,7 @@
             <w:noProof/>
             <w:webHidden/>
           </w:rPr>
-          <w:instrText xml:space="preserve"> PAGEREF _Toc238663169 \h </w:instrText>
+          <w:instrText xml:space="preserve"> PAGEREF _Toc238664294 \h </w:instrText>
         </w:r>
         <w:r>
           <w:rPr>
@@ -5292,7 +5292,7 @@
           <w14:ligatures w14:val="standardContextual"/>
         </w:rPr>
       </w:pPr>
-      <w:hyperlink w:anchor="_Toc238663170" w:history="1">
+      <w:hyperlink w:anchor="_Toc238664295" w:history="1">
         <w:r>
           <w:rPr>
             <w:rStyle w:val="Hipervnculo"/>
@@ -5319,7 +5319,7 @@
             <w:noProof/>
             <w:webHidden/>
           </w:rPr>
-          <w:instrText xml:space="preserve"> PAGEREF _Toc238663170 \h </w:instrText>
+          <w:instrText xml:space="preserve"> PAGEREF _Toc238664295 \h </w:instrText>
         </w:r>
         <w:r>
           <w:rPr>
@@ -5366,7 +5366,7 @@
           <w14:ligatures w14:val="standardContextual"/>
         </w:rPr>
       </w:pPr>
-      <w:hyperlink w:anchor="_Toc238663171" w:history="1">
+      <w:hyperlink w:anchor="_Toc238664296" w:history="1">
         <w:r>
           <w:rPr>
             <w:rStyle w:val="Hipervnculo"/>
@@ -5393,7 +5393,7 @@
             <w:noProof/>
             <w:webHidden/>
           </w:rPr>
-          <w:instrText xml:space="preserve"> PAGEREF _Toc238663171 \h </w:instrText>
+          <w:instrText xml:space="preserve"> PAGEREF _Toc238664296 \h </w:instrText>
         </w:r>
         <w:r>
           <w:rPr>
@@ -5440,7 +5440,7 @@
           <w14:ligatures w14:val="standardContextual"/>
         </w:rPr>
       </w:pPr>
-      <w:hyperlink w:anchor="_Toc238663172" w:history="1">
+      <w:hyperlink w:anchor="_Toc238664297" w:history="1">
         <w:r>
           <w:rPr>
             <w:rStyle w:val="Hipervnculo"/>
@@ -5467,7 +5467,7 @@
             <w:noProof/>
             <w:webHidden/>
           </w:rPr>
-          <w:instrText xml:space="preserve"> PAGEREF _Toc238663172 \h </w:instrText>
+          <w:instrText xml:space="preserve"> PAGEREF _Toc238664297 \h </w:instrText>
         </w:r>
         <w:r>
           <w:rPr>
@@ -5514,7 +5514,7 @@
           <w14:ligatures w14:val="standardContextual"/>
         </w:rPr>
       </w:pPr>
-      <w:hyperlink w:anchor="_Toc238663173" w:history="1">
+      <w:hyperlink w:anchor="_Toc238664298" w:history="1">
         <w:r>
           <w:rPr>
             <w:rStyle w:val="Hipervnculo"/>
@@ -5541,7 +5541,7 @@
             <w:noProof/>
             <w:webHidden/>
           </w:rPr>
-          <w:instrText xml:space="preserve"> PAGEREF _Toc238663173 \h </w:instrText>
+          <w:instrText xml:space="preserve"> PAGEREF _Toc238664298 \h </w:instrText>
         </w:r>
         <w:r>
           <w:rPr>
@@ -5588,7 +5588,7 @@
           <w14:ligatures w14:val="standardContextual"/>
         </w:rPr>
       </w:pPr>
-      <w:hyperlink w:anchor="_Toc238663174" w:history="1">
+      <w:hyperlink w:anchor="_Toc238664299" w:history="1">
         <w:r>
           <w:rPr>
             <w:rStyle w:val="Hipervnculo"/>
@@ -5615,7 +5615,7 @@
             <w:noProof/>
             <w:webHidden/>
           </w:rPr>
-          <w:instrText xml:space="preserve"> PAGEREF _Toc238663174 \h </w:instrText>
+          <w:instrText xml:space="preserve"> PAGEREF _Toc238664299 \h </w:instrText>
         </w:r>
         <w:r>
           <w:rPr>
@@ -5662,7 +5662,7 @@
           <w14:ligatures w14:val="standardContextual"/>
         </w:rPr>
       </w:pPr>
-      <w:hyperlink w:anchor="_Toc238663175" w:history="1">
+      <w:hyperlink w:anchor="_Toc238664300" w:history="1">
         <w:r>
           <w:rPr>
             <w:rStyle w:val="Hipervnculo"/>
@@ -5689,7 +5689,7 @@
             <w:noProof/>
             <w:webHidden/>
           </w:rPr>
-          <w:instrText xml:space="preserve"> PAGEREF _Toc238663175 \h </w:instrText>
+          <w:instrText xml:space="preserve"> PAGEREF _Toc238664300 \h </w:instrText>
         </w:r>
         <w:r>
           <w:rPr>
@@ -5736,7 +5736,7 @@
           <w14:ligatures w14:val="standardContextual"/>
         </w:rPr>
       </w:pPr>
-      <w:hyperlink w:anchor="_Toc238663176" w:history="1">
+      <w:hyperlink w:anchor="_Toc238664301" w:history="1">
         <w:r>
           <w:rPr>
             <w:rStyle w:val="Hipervnculo"/>
@@ -5763,7 +5763,7 @@
             <w:noProof/>
             <w:webHidden/>
           </w:rPr>
-          <w:instrText xml:space="preserve"> PAGEREF _Toc238663176 \h </w:instrText>
+          <w:instrText xml:space="preserve"> PAGEREF _Toc238664301 \h </w:instrText>
         </w:r>
         <w:r>
           <w:rPr>
@@ -5810,7 +5810,7 @@
           <w14:ligatures w14:val="standardContextual"/>
         </w:rPr>
       </w:pPr>
-      <w:hyperlink w:anchor="_Toc238663177" w:history="1">
+      <w:hyperlink w:anchor="_Toc238664302" w:history="1">
         <w:r>
           <w:rPr>
             <w:rStyle w:val="Hipervnculo"/>
@@ -5837,7 +5837,7 @@
             <w:noProof/>
             <w:webHidden/>
           </w:rPr>
-          <w:instrText xml:space="preserve"> PAGEREF _Toc238663177 \h </w:instrText>
+          <w:instrText xml:space="preserve"> PAGEREF _Toc238664302 \h </w:instrText>
         </w:r>
         <w:r>
           <w:rPr>
@@ -6963,7 +6963,7 @@
         <w:pStyle w:val="Ttulo1"/>
         <w:spacing w:before="100" w:after="30"/>
       </w:pPr>
-      <w:bookmarkStart w:id="0" w:name="_Toc238663117"/>
+      <w:bookmarkStart w:id="0" w:name="_Toc238664242"/>
       <w:r>
         <w:rPr>
           <w:rFonts w:ascii="Georgia" w:hAnsi="Georgia"/>
@@ -6979,7 +6979,7 @@
         <w:pStyle w:val="Ttulo2"/>
         <w:spacing w:before="70" w:after="20"/>
       </w:pPr>
-      <w:bookmarkStart w:id="1" w:name="_Toc238663118"/>
+      <w:bookmarkStart w:id="1" w:name="_Toc238664243"/>
       <w:r>
         <w:rPr>
           <w:rFonts w:ascii="Georgia" w:hAnsi="Georgia"/>
@@ -7020,7 +7020,7 @@
         <w:pStyle w:val="Ttulo2"/>
         <w:spacing w:before="70" w:after="20"/>
       </w:pPr>
-      <w:bookmarkStart w:id="2" w:name="_Toc238663119"/>
+      <w:bookmarkStart w:id="2" w:name="_Toc238664244"/>
       <w:r>
         <w:rPr>
           <w:rFonts w:ascii="Georgia" w:hAnsi="Georgia"/>
@@ -7082,7 +7082,7 @@
               </w:rPr>
               <w:lastRenderedPageBreak/>
               <w:drawing>
-                <wp:inline distT="0" distB="0" distL="0" distR="0" wp14:anchorId="51D67E14" wp14:editId="2CAF973D">
+                <wp:inline distT="0" distB="0" distL="0" distR="0" wp14:anchorId="18BE9505" wp14:editId="6267A8F8">
                   <wp:extent cx="2926080" cy="1524412"/>
                   <wp:effectExtent l="0" t="0" r="0" b="0"/>
                   <wp:docPr id="1" name="Picture 1"/>
@@ -7141,7 +7141,7 @@
                 <w:noProof/>
               </w:rPr>
               <w:drawing>
-                <wp:inline distT="0" distB="0" distL="0" distR="0" wp14:anchorId="6749CE0F" wp14:editId="1572F98E">
+                <wp:inline distT="0" distB="0" distL="0" distR="0" wp14:anchorId="3DCA2F39" wp14:editId="10828496">
                   <wp:extent cx="2926080" cy="1437831"/>
                   <wp:effectExtent l="0" t="0" r="0" b="0"/>
                   <wp:docPr id="2" name="Picture 2"/>
@@ -7246,7 +7246,7 @@
         <w:pStyle w:val="Ttulo2"/>
         <w:spacing w:before="70" w:after="20"/>
       </w:pPr>
-      <w:bookmarkStart w:id="3" w:name="_Toc238663120"/>
+      <w:bookmarkStart w:id="3" w:name="_Toc238664245"/>
       <w:r>
         <w:rPr>
           <w:rFonts w:ascii="Georgia" w:hAnsi="Georgia"/>
@@ -7373,7 +7373,7 @@
         <w:pStyle w:val="Ttulo2"/>
         <w:spacing w:before="70" w:after="20"/>
       </w:pPr>
-      <w:bookmarkStart w:id="4" w:name="_Toc238663121"/>
+      <w:bookmarkStart w:id="4" w:name="_Toc238664246"/>
       <w:r>
         <w:rPr>
           <w:rFonts w:ascii="Georgia" w:hAnsi="Georgia"/>
@@ -7885,7 +7885,7 @@
         <w:pStyle w:val="Ttulo2"/>
         <w:spacing w:before="70" w:after="20"/>
       </w:pPr>
-      <w:bookmarkStart w:id="5" w:name="_Toc238663122"/>
+      <w:bookmarkStart w:id="5" w:name="_Toc238664247"/>
       <w:r>
         <w:rPr>
           <w:rFonts w:ascii="Georgia" w:hAnsi="Georgia"/>
@@ -8017,7 +8017,7 @@
         <w:pStyle w:val="Ttulo2"/>
         <w:spacing w:before="70" w:after="20"/>
       </w:pPr>
-      <w:bookmarkStart w:id="6" w:name="_Toc238663123"/>
+      <w:bookmarkStart w:id="6" w:name="_Toc238664248"/>
       <w:r>
         <w:rPr>
           <w:rFonts w:ascii="Georgia" w:hAnsi="Georgia"/>
@@ -9242,14 +9242,14 @@
         <w:pStyle w:val="Ttulo1"/>
         <w:spacing w:before="100" w:after="30"/>
       </w:pPr>
-      <w:bookmarkStart w:id="7" w:name="_Toc238663124"/>
+      <w:bookmarkStart w:id="7" w:name="_Toc238664249"/>
       <w:r>
         <w:rPr>
           <w:rFonts w:ascii="Georgia" w:hAnsi="Georgia"/>
           <w:color w:val="0D233A"/>
           <w:sz w:val="21"/>
         </w:rPr>
-        <w:t>Contexto Macroeconómico y Mecánica Operativa de Proyección (P × Q)</w:t>
+        <w:t>Entorno Macroeconómico y Modelo Operativo (P × Q)</w:t>
       </w:r>
       <w:bookmarkEnd w:id="7"/>
     </w:p>
@@ -9258,7 +9258,7 @@
         <w:pStyle w:val="Ttulo2"/>
         <w:spacing w:before="70" w:after="20"/>
       </w:pPr>
-      <w:bookmarkStart w:id="8" w:name="_Toc238663125"/>
+      <w:bookmarkStart w:id="8" w:name="_Toc238664250"/>
       <w:r>
         <w:rPr>
           <w:rFonts w:ascii="Georgia" w:hAnsi="Georgia"/>
@@ -9316,7 +9316,7 @@
                 <w:noProof/>
               </w:rPr>
               <w:drawing>
-                <wp:inline distT="0" distB="0" distL="0" distR="0" wp14:anchorId="76DC89D6" wp14:editId="05A0BB00">
+                <wp:inline distT="0" distB="0" distL="0" distR="0" wp14:anchorId="7A253106" wp14:editId="7FD6BEC4">
                   <wp:extent cx="2926080" cy="1426594"/>
                   <wp:effectExtent l="0" t="0" r="0" b="0"/>
                   <wp:docPr id="3" name="Picture 3"/>
@@ -9375,7 +9375,7 @@
                 <w:noProof/>
               </w:rPr>
               <w:drawing>
-                <wp:inline distT="0" distB="0" distL="0" distR="0" wp14:anchorId="0232A3FA" wp14:editId="6BC97167">
+                <wp:inline distT="0" distB="0" distL="0" distR="0" wp14:anchorId="6C6174B0" wp14:editId="71C67E25">
                   <wp:extent cx="2926080" cy="1494260"/>
                   <wp:effectExtent l="0" t="0" r="0" b="0"/>
                   <wp:docPr id="4" name="Picture 4"/>
@@ -9480,7 +9480,7 @@
         <w:pStyle w:val="Ttulo2"/>
         <w:spacing w:before="70" w:after="20"/>
       </w:pPr>
-      <w:bookmarkStart w:id="9" w:name="_Toc238663126"/>
+      <w:bookmarkStart w:id="9" w:name="_Toc238664251"/>
       <w:r>
         <w:rPr>
           <w:rFonts w:ascii="Georgia" w:hAnsi="Georgia"/>
@@ -9714,7 +9714,7 @@
         <w:pStyle w:val="Ttulo1"/>
         <w:spacing w:before="100" w:after="30"/>
       </w:pPr>
-      <w:bookmarkStart w:id="10" w:name="_Toc238663127"/>
+      <w:bookmarkStart w:id="10" w:name="_Toc238664252"/>
       <w:r>
         <w:rPr>
           <w:rFonts w:ascii="Georgia" w:hAnsi="Georgia"/>
@@ -9730,7 +9730,7 @@
         <w:pStyle w:val="Ttulo2"/>
         <w:spacing w:before="70" w:after="20"/>
       </w:pPr>
-      <w:bookmarkStart w:id="11" w:name="_Toc238663128"/>
+      <w:bookmarkStart w:id="11" w:name="_Toc238664253"/>
       <w:r>
         <w:rPr>
           <w:rFonts w:ascii="Georgia" w:hAnsi="Georgia"/>
@@ -9791,7 +9791,7 @@
                 <w:noProof/>
               </w:rPr>
               <w:drawing>
-                <wp:inline distT="0" distB="0" distL="0" distR="0" wp14:anchorId="2A10767B" wp14:editId="549E130A">
+                <wp:inline distT="0" distB="0" distL="0" distR="0" wp14:anchorId="66E2352B" wp14:editId="0F1EA9D6">
                   <wp:extent cx="2926080" cy="1636252"/>
                   <wp:effectExtent l="0" t="0" r="0" b="0"/>
                   <wp:docPr id="5" name="Picture 5"/>
@@ -9850,7 +9850,7 @@
                 <w:noProof/>
               </w:rPr>
               <w:drawing>
-                <wp:inline distT="0" distB="0" distL="0" distR="0" wp14:anchorId="4F4D55FA" wp14:editId="64E82E83">
+                <wp:inline distT="0" distB="0" distL="0" distR="0" wp14:anchorId="266629D8" wp14:editId="386018AA">
                   <wp:extent cx="2926080" cy="1481181"/>
                   <wp:effectExtent l="0" t="0" r="0" b="0"/>
                   <wp:docPr id="6" name="Picture 6"/>
@@ -9955,7 +9955,7 @@
         <w:pStyle w:val="Ttulo2"/>
         <w:spacing w:before="70" w:after="20"/>
       </w:pPr>
-      <w:bookmarkStart w:id="12" w:name="_Toc238663129"/>
+      <w:bookmarkStart w:id="12" w:name="_Toc238664254"/>
       <w:r>
         <w:rPr>
           <w:rFonts w:ascii="Georgia" w:hAnsi="Georgia"/>
@@ -9985,7 +9985,7 @@
         <w:pStyle w:val="Ttulo2"/>
         <w:spacing w:before="70" w:after="20"/>
       </w:pPr>
-      <w:bookmarkStart w:id="13" w:name="_Toc238663130"/>
+      <w:bookmarkStart w:id="13" w:name="_Toc238664255"/>
       <w:r>
         <w:rPr>
           <w:rFonts w:ascii="Georgia" w:hAnsi="Georgia"/>
@@ -10043,7 +10043,7 @@
                 <w:noProof/>
               </w:rPr>
               <w:drawing>
-                <wp:inline distT="0" distB="0" distL="0" distR="0" wp14:anchorId="3A4D3780" wp14:editId="3F56F028">
+                <wp:inline distT="0" distB="0" distL="0" distR="0" wp14:anchorId="599EF963" wp14:editId="42D23DAE">
                   <wp:extent cx="2926080" cy="1626307"/>
                   <wp:effectExtent l="0" t="0" r="0" b="0"/>
                   <wp:docPr id="7" name="Picture 7"/>
@@ -10102,7 +10102,7 @@
                 <w:noProof/>
               </w:rPr>
               <w:drawing>
-                <wp:inline distT="0" distB="0" distL="0" distR="0" wp14:anchorId="05481363" wp14:editId="391C832C">
+                <wp:inline distT="0" distB="0" distL="0" distR="0" wp14:anchorId="16951993" wp14:editId="7102DC50">
                   <wp:extent cx="2926080" cy="1479479"/>
                   <wp:effectExtent l="0" t="0" r="0" b="0"/>
                   <wp:docPr id="8" name="Picture 8"/>
@@ -10207,7 +10207,7 @@
         <w:pStyle w:val="Ttulo2"/>
         <w:spacing w:before="70" w:after="20"/>
       </w:pPr>
-      <w:bookmarkStart w:id="14" w:name="_Toc238663131"/>
+      <w:bookmarkStart w:id="14" w:name="_Toc238664256"/>
       <w:r>
         <w:rPr>
           <w:rFonts w:ascii="Georgia" w:hAnsi="Georgia"/>
@@ -10265,7 +10265,7 @@
                 <w:noProof/>
               </w:rPr>
               <w:drawing>
-                <wp:inline distT="0" distB="0" distL="0" distR="0" wp14:anchorId="15E11065" wp14:editId="763EAB42">
+                <wp:inline distT="0" distB="0" distL="0" distR="0" wp14:anchorId="15CAE6F2" wp14:editId="240A8B63">
                   <wp:extent cx="2926080" cy="1662311"/>
                   <wp:effectExtent l="0" t="0" r="0" b="0"/>
                   <wp:docPr id="9" name="Picture 9"/>
@@ -10324,7 +10324,7 @@
                 <w:noProof/>
               </w:rPr>
               <w:drawing>
-                <wp:inline distT="0" distB="0" distL="0" distR="0" wp14:anchorId="5D3D087F" wp14:editId="097BE45B">
+                <wp:inline distT="0" distB="0" distL="0" distR="0" wp14:anchorId="439214A7" wp14:editId="562F33A4">
                   <wp:extent cx="2926080" cy="1801004"/>
                   <wp:effectExtent l="0" t="0" r="0" b="0"/>
                   <wp:docPr id="10" name="Picture 10"/>
@@ -10429,7 +10429,7 @@
         <w:pStyle w:val="Ttulo1"/>
         <w:spacing w:before="100" w:after="30"/>
       </w:pPr>
-      <w:bookmarkStart w:id="15" w:name="_Toc238663132"/>
+      <w:bookmarkStart w:id="15" w:name="_Toc238664257"/>
       <w:r>
         <w:rPr>
           <w:rFonts w:ascii="Georgia" w:hAnsi="Georgia"/>
@@ -10445,7 +10445,7 @@
         <w:pStyle w:val="Ttulo2"/>
         <w:spacing w:before="70" w:after="20"/>
       </w:pPr>
-      <w:bookmarkStart w:id="16" w:name="_Toc238663133"/>
+      <w:bookmarkStart w:id="16" w:name="_Toc238664258"/>
       <w:r>
         <w:rPr>
           <w:rFonts w:ascii="Georgia" w:hAnsi="Georgia"/>
@@ -10884,7 +10884,7 @@
         <w:pStyle w:val="Ttulo2"/>
         <w:spacing w:before="70" w:after="20"/>
       </w:pPr>
-      <w:bookmarkStart w:id="17" w:name="_Toc238663134"/>
+      <w:bookmarkStart w:id="17" w:name="_Toc238664259"/>
       <w:r>
         <w:rPr>
           <w:rFonts w:ascii="Georgia" w:hAnsi="Georgia"/>
@@ -10912,14 +10912,14 @@
         <w:pStyle w:val="Ttulo1"/>
         <w:spacing w:before="100" w:after="30"/>
       </w:pPr>
-      <w:bookmarkStart w:id="18" w:name="_Toc238663135"/>
+      <w:bookmarkStart w:id="18" w:name="_Toc238664260"/>
       <w:r>
         <w:rPr>
           <w:rFonts w:ascii="Georgia" w:hAnsi="Georgia"/>
           <w:color w:val="0D233A"/>
           <w:sz w:val="21"/>
         </w:rPr>
-        <w:t>Valuación Relativa y Dinámica de Desapalancamiento Post-CAPEX</w:t>
+        <w:t>Valuación Relativa y Perfil de Desapalancamiento</w:t>
       </w:r>
       <w:bookmarkEnd w:id="18"/>
     </w:p>
@@ -10928,7 +10928,7 @@
         <w:pStyle w:val="Ttulo2"/>
         <w:spacing w:before="70" w:after="20"/>
       </w:pPr>
-      <w:bookmarkStart w:id="19" w:name="_Toc238663136"/>
+      <w:bookmarkStart w:id="19" w:name="_Toc238664261"/>
       <w:r>
         <w:rPr>
           <w:rFonts w:ascii="Georgia" w:hAnsi="Georgia"/>
@@ -10947,7 +10947,7 @@
         </w:rPr>
       </w:pPr>
       <w:r>
-        <w:t>Aluar cotiza a un múltiplo EV/EBITDA de los últimos doce meses de 13,4x sobre el resultado deprimido de 2025 (USD 163,3 MM, Figura [fig:11]). Al normalizar la proyección sobre el EBITDA estimado de 2026e (USD 391,2 MM), el múltiplo implícito desciende a 5,2x EV/EBITDA proyectado, situando a la firma con un descuento del 20%–25% frente a comparables internacionales como Alcoa (8,1x) y Norsk Hydro (6,5x).</w:t>
+        <w:t>Aluar cotiza a un múltiplo EV/EBITDA de los últimos doce meses de 13,4x sobre el resultado deprimido de 2025 (USD 163,3 MM, Figura [fig:11]). Al normalizar la proyección sobre el EBITDA estimado de 2026e (USD 391,2 MM), el múltiplo implícito desciende a 5,2x EV/EBITDA proyectado, situando a la firma con un descuento del 20%–25% frente a comparables internacionales como Alcoa (8,5x) y Norsk Hydro (7,7x).</w:t>
       </w:r>
     </w:p>
     <w:p>
@@ -10955,7 +10955,7 @@
         <w:pStyle w:val="Ttulo2"/>
         <w:spacing w:before="70" w:after="20"/>
       </w:pPr>
-      <w:bookmarkStart w:id="20" w:name="_Toc238663137"/>
+      <w:bookmarkStart w:id="20" w:name="_Toc238664262"/>
       <w:r>
         <w:rPr>
           <w:rFonts w:ascii="Georgia" w:hAnsi="Georgia"/>
@@ -11013,7 +11013,7 @@
                 <w:noProof/>
               </w:rPr>
               <w:drawing>
-                <wp:inline distT="0" distB="0" distL="0" distR="0" wp14:anchorId="70F41FF7" wp14:editId="607B4DAD">
+                <wp:inline distT="0" distB="0" distL="0" distR="0" wp14:anchorId="6BDD06C6" wp14:editId="1959BEDC">
                   <wp:extent cx="2926080" cy="1714660"/>
                   <wp:effectExtent l="0" t="0" r="0" b="0"/>
                   <wp:docPr id="11" name="Picture 11"/>
@@ -11072,7 +11072,7 @@
                 <w:noProof/>
               </w:rPr>
               <w:drawing>
-                <wp:inline distT="0" distB="0" distL="0" distR="0" wp14:anchorId="755FC4EE" wp14:editId="7612CB8E">
+                <wp:inline distT="0" distB="0" distL="0" distR="0" wp14:anchorId="22FBCB2D" wp14:editId="30AE3B3D">
                   <wp:extent cx="2926080" cy="1558188"/>
                   <wp:effectExtent l="0" t="0" r="0" b="0"/>
                   <wp:docPr id="12" name="Picture 12"/>
@@ -11485,7 +11485,7 @@
               <w:rPr>
                 <w:sz w:val="13"/>
               </w:rPr>
-              <w:t>3,22x</w:t>
+              <w:t>3,20x</w:t>
             </w:r>
           </w:p>
         </w:tc>
@@ -11566,7 +11566,7 @@
               <w:rPr>
                 <w:sz w:val="13"/>
               </w:rPr>
-              <w:t>8,1x</w:t>
+              <w:t>8,5x</w:t>
             </w:r>
           </w:p>
         </w:tc>
@@ -11592,7 +11592,7 @@
               <w:rPr>
                 <w:sz w:val="13"/>
               </w:rPr>
-              <w:t>9,2</w:t>
+              <w:t>13,1</w:t>
             </w:r>
           </w:p>
         </w:tc>
@@ -11618,7 +11618,7 @@
               <w:rPr>
                 <w:sz w:val="13"/>
               </w:rPr>
-              <w:t>2,10x</w:t>
+              <w:t>0,51x</w:t>
             </w:r>
           </w:p>
         </w:tc>
@@ -11702,7 +11702,7 @@
               <w:rPr>
                 <w:sz w:val="13"/>
               </w:rPr>
-              <w:t>6,5x</w:t>
+              <w:t>7,7x</w:t>
             </w:r>
           </w:p>
         </w:tc>
@@ -11729,7 +11729,7 @@
               <w:rPr>
                 <w:sz w:val="13"/>
               </w:rPr>
-              <w:t>11,4</w:t>
+              <w:t>11,9</w:t>
             </w:r>
           </w:p>
         </w:tc>
@@ -11756,7 +11756,7 @@
               <w:rPr>
                 <w:sz w:val="13"/>
               </w:rPr>
-              <w:t>1,40x</w:t>
+              <w:t>0,39x</w:t>
             </w:r>
           </w:p>
         </w:tc>
@@ -11837,7 +11837,7 @@
               <w:rPr>
                 <w:sz w:val="13"/>
               </w:rPr>
-              <w:t>5,8x</w:t>
+              <w:t>5,2x</w:t>
             </w:r>
           </w:p>
         </w:tc>
@@ -11863,7 +11863,7 @@
               <w:rPr>
                 <w:sz w:val="13"/>
               </w:rPr>
-              <w:t>8,8</w:t>
+              <w:t>15,5</w:t>
             </w:r>
           </w:p>
         </w:tc>
@@ -11889,7 +11889,7 @@
               <w:rPr>
                 <w:sz w:val="13"/>
               </w:rPr>
-              <w:t>3,80x</w:t>
+              <w:t>0,61x</w:t>
             </w:r>
           </w:p>
         </w:tc>
@@ -11968,7 +11968,7 @@
                 <w:b/>
                 <w:sz w:val="13"/>
               </w:rPr>
-              <w:t>6,5x</w:t>
+              <w:t>7,7x</w:t>
             </w:r>
           </w:p>
         </w:tc>
@@ -11994,7 +11994,7 @@
               <w:rPr>
                 <w:sz w:val="13"/>
               </w:rPr>
-              <w:t>**9,2</w:t>
+              <w:t>**13,1</w:t>
             </w:r>
           </w:p>
         </w:tc>
@@ -12021,7 +12021,7 @@
                 <w:b/>
                 <w:sz w:val="13"/>
               </w:rPr>
-              <w:t>2,10x</w:t>
+              <w:t>0,51x</w:t>
             </w:r>
           </w:p>
         </w:tc>
@@ -12042,7 +12042,7 @@
         <w:pStyle w:val="Ttulo1"/>
         <w:spacing w:before="100" w:after="30"/>
       </w:pPr>
-      <w:bookmarkStart w:id="21" w:name="_Toc238663138"/>
+      <w:bookmarkStart w:id="21" w:name="_Toc238664263"/>
       <w:r>
         <w:rPr>
           <w:rFonts w:ascii="Georgia" w:hAnsi="Georgia"/>
@@ -12059,7 +12059,7 @@
         <w:pStyle w:val="Ttulo2"/>
         <w:spacing w:before="70" w:after="20"/>
       </w:pPr>
-      <w:bookmarkStart w:id="22" w:name="_Toc238663139"/>
+      <w:bookmarkStart w:id="22" w:name="_Toc238664264"/>
       <w:r>
         <w:rPr>
           <w:rFonts w:ascii="Georgia" w:hAnsi="Georgia"/>
@@ -12151,7 +12151,7 @@
         <w:pStyle w:val="Ttulo2"/>
         <w:spacing w:before="70" w:after="20"/>
       </w:pPr>
-      <w:bookmarkStart w:id="23" w:name="_Toc238663140"/>
+      <w:bookmarkStart w:id="23" w:name="_Toc238664265"/>
       <w:r>
         <w:rPr>
           <w:rFonts w:ascii="Georgia" w:hAnsi="Georgia"/>
@@ -12393,7 +12393,7 @@
                 <w:noProof/>
               </w:rPr>
               <w:drawing>
-                <wp:inline distT="0" distB="0" distL="0" distR="0" wp14:anchorId="4A17F268" wp14:editId="13BB684F">
+                <wp:inline distT="0" distB="0" distL="0" distR="0" wp14:anchorId="27236E5A" wp14:editId="154D2859">
                   <wp:extent cx="2926080" cy="1540391"/>
                   <wp:effectExtent l="0" t="0" r="0" b="0"/>
                   <wp:docPr id="13" name="Picture 13"/>
@@ -12452,7 +12452,7 @@
                 <w:noProof/>
               </w:rPr>
               <w:drawing>
-                <wp:inline distT="0" distB="0" distL="0" distR="0" wp14:anchorId="179D6117" wp14:editId="0BA2604A">
+                <wp:inline distT="0" distB="0" distL="0" distR="0" wp14:anchorId="4C1193E8" wp14:editId="59640040">
                   <wp:extent cx="2926080" cy="1658038"/>
                   <wp:effectExtent l="0" t="0" r="0" b="0"/>
                   <wp:docPr id="14" name="Picture 14"/>
@@ -12557,7 +12557,7 @@
         <w:pStyle w:val="Ttulo2"/>
         <w:spacing w:before="70" w:after="20"/>
       </w:pPr>
-      <w:bookmarkStart w:id="24" w:name="_Toc238663141"/>
+      <w:bookmarkStart w:id="24" w:name="_Toc238664266"/>
       <w:r>
         <w:rPr>
           <w:rFonts w:ascii="Georgia" w:hAnsi="Georgia"/>
@@ -13487,7 +13487,7 @@
         <w:pStyle w:val="Ttulo1"/>
         <w:spacing w:before="100" w:after="30"/>
       </w:pPr>
-      <w:bookmarkStart w:id="25" w:name="_Toc238663142"/>
+      <w:bookmarkStart w:id="25" w:name="_Toc238664267"/>
       <w:r>
         <w:rPr>
           <w:rFonts w:ascii="Georgia" w:hAnsi="Georgia"/>
@@ -13503,7 +13503,7 @@
         <w:pStyle w:val="Ttulo2"/>
         <w:spacing w:before="70" w:after="20"/>
       </w:pPr>
-      <w:bookmarkStart w:id="26" w:name="_Toc238663143"/>
+      <w:bookmarkStart w:id="26" w:name="_Toc238664268"/>
       <w:r>
         <w:rPr>
           <w:rFonts w:ascii="Georgia" w:hAnsi="Georgia"/>
@@ -15100,7 +15100,7 @@
         <w:pStyle w:val="Ttulo2"/>
         <w:spacing w:before="70" w:after="20"/>
       </w:pPr>
-      <w:bookmarkStart w:id="27" w:name="_Toc238663144"/>
+      <w:bookmarkStart w:id="27" w:name="_Toc238664269"/>
       <w:r>
         <w:rPr>
           <w:rFonts w:ascii="Georgia" w:hAnsi="Georgia"/>
@@ -15210,7 +15210,7 @@
         <w:pStyle w:val="Ttulo1"/>
         <w:spacing w:before="100" w:after="30"/>
       </w:pPr>
-      <w:bookmarkStart w:id="28" w:name="_Toc238663145"/>
+      <w:bookmarkStart w:id="28" w:name="_Toc238664270"/>
       <w:r>
         <w:rPr>
           <w:rFonts w:ascii="Georgia" w:hAnsi="Georgia"/>
@@ -15227,7 +15227,7 @@
         <w:pStyle w:val="Ttulo2"/>
         <w:spacing w:before="70" w:after="20"/>
       </w:pPr>
-      <w:bookmarkStart w:id="29" w:name="_Toc238663146"/>
+      <w:bookmarkStart w:id="29" w:name="_Toc238664271"/>
       <w:r>
         <w:rPr>
           <w:rFonts w:ascii="Georgia" w:hAnsi="Georgia"/>
@@ -15254,7 +15254,7 @@
         <w:pStyle w:val="Ttulo2"/>
         <w:spacing w:before="70" w:after="20"/>
       </w:pPr>
-      <w:bookmarkStart w:id="30" w:name="_Toc238663147"/>
+      <w:bookmarkStart w:id="30" w:name="_Toc238664272"/>
       <w:r>
         <w:rPr>
           <w:rFonts w:ascii="Georgia" w:hAnsi="Georgia"/>
@@ -15312,7 +15312,7 @@
                 <w:noProof/>
               </w:rPr>
               <w:drawing>
-                <wp:inline distT="0" distB="0" distL="0" distR="0" wp14:anchorId="6F549B72" wp14:editId="1BDC56D5">
+                <wp:inline distT="0" distB="0" distL="0" distR="0" wp14:anchorId="6C6A7056" wp14:editId="4A649252">
                   <wp:extent cx="2926080" cy="1534596"/>
                   <wp:effectExtent l="0" t="0" r="0" b="0"/>
                   <wp:docPr id="15" name="Picture 15"/>
@@ -15371,7 +15371,7 @@
                 <w:noProof/>
               </w:rPr>
               <w:drawing>
-                <wp:inline distT="0" distB="0" distL="0" distR="0" wp14:anchorId="6EFBEAF0" wp14:editId="5170F6EB">
+                <wp:inline distT="0" distB="0" distL="0" distR="0" wp14:anchorId="0F4E3007" wp14:editId="45954706">
                   <wp:extent cx="2926080" cy="1680519"/>
                   <wp:effectExtent l="0" t="0" r="0" b="0"/>
                   <wp:docPr id="16" name="Picture 16"/>
@@ -15487,7 +15487,7 @@
         <w:pStyle w:val="Ttulo1"/>
         <w:spacing w:before="100" w:after="30"/>
       </w:pPr>
-      <w:bookmarkStart w:id="31" w:name="_Toc238663148"/>
+      <w:bookmarkStart w:id="31" w:name="_Toc238664273"/>
       <w:r>
         <w:rPr>
           <w:rFonts w:ascii="Georgia" w:hAnsi="Georgia"/>
@@ -15503,7 +15503,7 @@
         <w:pStyle w:val="Ttulo2"/>
         <w:spacing w:before="70" w:after="20"/>
       </w:pPr>
-      <w:bookmarkStart w:id="32" w:name="_Toc238663149"/>
+      <w:bookmarkStart w:id="32" w:name="_Toc238664274"/>
       <w:r>
         <w:rPr>
           <w:rFonts w:ascii="Georgia" w:hAnsi="Georgia"/>
@@ -16550,7 +16550,7 @@
         <w:pStyle w:val="Ttulo2"/>
         <w:spacing w:before="70" w:after="20"/>
       </w:pPr>
-      <w:bookmarkStart w:id="33" w:name="_Toc238663150"/>
+      <w:bookmarkStart w:id="33" w:name="_Toc238664275"/>
       <w:r>
         <w:rPr>
           <w:rFonts w:ascii="Georgia" w:hAnsi="Georgia"/>
@@ -16711,7 +16711,7 @@
         <w:pStyle w:val="Ttulo2"/>
         <w:spacing w:before="70" w:after="20"/>
       </w:pPr>
-      <w:bookmarkStart w:id="34" w:name="_Toc238663151"/>
+      <w:bookmarkStart w:id="34" w:name="_Toc238664276"/>
       <w:r>
         <w:rPr>
           <w:rFonts w:ascii="Georgia" w:hAnsi="Georgia"/>
@@ -16738,7 +16738,7 @@
         <w:pStyle w:val="Ttulo1"/>
         <w:spacing w:before="100" w:after="30"/>
       </w:pPr>
-      <w:bookmarkStart w:id="35" w:name="_Toc238663152"/>
+      <w:bookmarkStart w:id="35" w:name="_Toc238664277"/>
       <w:r>
         <w:rPr>
           <w:rFonts w:ascii="Georgia" w:hAnsi="Georgia"/>
@@ -16754,7 +16754,7 @@
         <w:pStyle w:val="Ttulo2"/>
         <w:spacing w:before="70" w:after="20"/>
       </w:pPr>
-      <w:bookmarkStart w:id="36" w:name="_Toc238663153"/>
+      <w:bookmarkStart w:id="36" w:name="_Toc238664278"/>
       <w:r>
         <w:rPr>
           <w:rFonts w:ascii="Georgia" w:hAnsi="Georgia"/>
@@ -19681,7 +19681,7 @@
         <w:pStyle w:val="Ttulo1"/>
         <w:spacing w:before="100" w:after="30"/>
       </w:pPr>
-      <w:bookmarkStart w:id="37" w:name="_Toc238663154"/>
+      <w:bookmarkStart w:id="37" w:name="_Toc238664279"/>
       <w:r>
         <w:rPr>
           <w:rFonts w:ascii="Georgia" w:hAnsi="Georgia"/>
@@ -19698,7 +19698,7 @@
         <w:pStyle w:val="Ttulo2"/>
         <w:spacing w:before="70" w:after="20"/>
       </w:pPr>
-      <w:bookmarkStart w:id="38" w:name="_Toc238663155"/>
+      <w:bookmarkStart w:id="38" w:name="_Toc238664280"/>
       <w:r>
         <w:rPr>
           <w:rFonts w:ascii="Georgia" w:hAnsi="Georgia"/>
@@ -19901,7 +19901,7 @@
         <w:pStyle w:val="Ttulo2"/>
         <w:spacing w:before="70" w:after="20"/>
       </w:pPr>
-      <w:bookmarkStart w:id="39" w:name="_Toc238663156"/>
+      <w:bookmarkStart w:id="39" w:name="_Toc238664281"/>
       <w:r>
         <w:rPr>
           <w:rFonts w:ascii="Georgia" w:hAnsi="Georgia"/>
@@ -19937,7 +19937,7 @@
           <w:noProof/>
         </w:rPr>
         <w:drawing>
-          <wp:inline distT="0" distB="0" distL="0" distR="0" wp14:anchorId="75BD676A" wp14:editId="7E3549BC">
+          <wp:inline distT="0" distB="0" distL="0" distR="0" wp14:anchorId="0AD279CA" wp14:editId="4796EE3C">
             <wp:extent cx="4206240" cy="2338193"/>
             <wp:effectExtent l="0" t="0" r="0" b="0"/>
             <wp:docPr id="17" name="Picture 17"/>
@@ -19996,7 +19996,7 @@
         <w:pStyle w:val="Ttulo2"/>
         <w:spacing w:before="70" w:after="20"/>
       </w:pPr>
-      <w:bookmarkStart w:id="40" w:name="_Toc238663157"/>
+      <w:bookmarkStart w:id="40" w:name="_Toc238664282"/>
       <w:r>
         <w:rPr>
           <w:rFonts w:ascii="Georgia" w:hAnsi="Georgia"/>
@@ -20617,7 +20617,7 @@
         <w:pStyle w:val="Ttulo2"/>
         <w:spacing w:before="70" w:after="20"/>
       </w:pPr>
-      <w:bookmarkStart w:id="41" w:name="_Toc238663158"/>
+      <w:bookmarkStart w:id="41" w:name="_Toc238664283"/>
       <w:r>
         <w:rPr>
           <w:rFonts w:ascii="Georgia" w:hAnsi="Georgia"/>
@@ -20653,7 +20653,7 @@
           <w:noProof/>
         </w:rPr>
         <w:drawing>
-          <wp:inline distT="0" distB="0" distL="0" distR="0" wp14:anchorId="5D5AB7CB" wp14:editId="7C49C261">
+          <wp:inline distT="0" distB="0" distL="0" distR="0" wp14:anchorId="043E41F3" wp14:editId="6374CC0F">
             <wp:extent cx="4206240" cy="2471742"/>
             <wp:effectExtent l="0" t="0" r="0" b="0"/>
             <wp:docPr id="18" name="Picture 18"/>
@@ -21044,7 +21044,7 @@
               <w:rPr>
                 <w:sz w:val="13"/>
               </w:rPr>
-              <w:t>993</w:t>
+              <w:t>921</w:t>
             </w:r>
           </w:p>
         </w:tc>
@@ -21344,7 +21344,7 @@
               <w:rPr>
                 <w:sz w:val="13"/>
               </w:rPr>
-              <w:t>844</w:t>
+              <w:t>866</w:t>
             </w:r>
           </w:p>
         </w:tc>
@@ -21371,7 +21371,7 @@
               <w:rPr>
                 <w:sz w:val="13"/>
               </w:rPr>
-              <w:t>1.237</w:t>
+              <w:t>1.270</w:t>
             </w:r>
           </w:p>
         </w:tc>
@@ -21398,7 +21398,7 @@
               <w:rPr>
                 <w:sz w:val="13"/>
               </w:rPr>
-              <w:t>1.737</w:t>
+              <w:t>1.790</w:t>
             </w:r>
           </w:p>
         </w:tc>
@@ -21732,7 +21732,7 @@
         <w:pStyle w:val="Ttulo1"/>
         <w:spacing w:before="100" w:after="30"/>
       </w:pPr>
-      <w:bookmarkStart w:id="42" w:name="_Toc238663159"/>
+      <w:bookmarkStart w:id="42" w:name="_Toc238664284"/>
       <w:r>
         <w:rPr>
           <w:rFonts w:ascii="Georgia" w:hAnsi="Georgia"/>
@@ -21748,7 +21748,7 @@
         <w:pStyle w:val="Ttulo2"/>
         <w:spacing w:before="70" w:after="20"/>
       </w:pPr>
-      <w:bookmarkStart w:id="43" w:name="_Toc238663160"/>
+      <w:bookmarkStart w:id="43" w:name="_Toc238664285"/>
       <w:r>
         <w:rPr>
           <w:rFonts w:ascii="Georgia" w:hAnsi="Georgia"/>
@@ -21785,7 +21785,7 @@
         </w:rPr>
         <w:lastRenderedPageBreak/>
         <w:drawing>
-          <wp:inline distT="0" distB="0" distL="0" distR="0" wp14:anchorId="34B30910" wp14:editId="536F6E2C">
+          <wp:inline distT="0" distB="0" distL="0" distR="0" wp14:anchorId="12C551EA" wp14:editId="36E43827">
             <wp:extent cx="4206240" cy="2149342"/>
             <wp:effectExtent l="0" t="0" r="0" b="0"/>
             <wp:docPr id="19" name="Picture 19"/>
@@ -21844,7 +21844,7 @@
         <w:pStyle w:val="Ttulo1"/>
         <w:spacing w:before="100" w:after="30"/>
       </w:pPr>
-      <w:bookmarkStart w:id="44" w:name="_Toc238663161"/>
+      <w:bookmarkStart w:id="44" w:name="_Toc238664286"/>
       <w:r>
         <w:rPr>
           <w:rFonts w:ascii="Georgia" w:hAnsi="Georgia"/>
@@ -21860,7 +21860,7 @@
         <w:pStyle w:val="Ttulo2"/>
         <w:spacing w:before="70" w:after="20"/>
       </w:pPr>
-      <w:bookmarkStart w:id="45" w:name="_Toc238663162"/>
+      <w:bookmarkStart w:id="45" w:name="_Toc238664287"/>
       <w:r>
         <w:rPr>
           <w:rFonts w:ascii="Georgia" w:hAnsi="Georgia"/>
@@ -21907,7 +21907,7 @@
         </w:rPr>
       </w:pPr>
       <w:r>
-        <w:t>Resulta en una mediana de ARS 1.237 y un intervalo de confianza P5–P95 de ARS 844 a ARS 1.737, con un 85,2% de probabilidad empírica de retorno positivo frente a la cotización de mercado.</w:t>
+        <w:t>Resulta en una mediana de ARS 1.270 y un intervalo de confianza P5–P95 de ARS 866 a ARS 1.790, con un 87,7% de probabilidad empírica de retorno positivo frente a la cotización de mercado.</w:t>
       </w:r>
     </w:p>
     <w:p>
@@ -21915,7 +21915,7 @@
         <w:pStyle w:val="Ttulo2"/>
         <w:spacing w:before="70" w:after="20"/>
       </w:pPr>
-      <w:bookmarkStart w:id="46" w:name="_Toc238663163"/>
+      <w:bookmarkStart w:id="46" w:name="_Toc238664288"/>
       <w:r>
         <w:rPr>
           <w:rFonts w:ascii="Georgia" w:hAnsi="Georgia"/>
@@ -21973,7 +21973,7 @@
                 <w:noProof/>
               </w:rPr>
               <w:drawing>
-                <wp:inline distT="0" distB="0" distL="0" distR="0" wp14:anchorId="74E27322" wp14:editId="2E67E7CC">
+                <wp:inline distT="0" distB="0" distL="0" distR="0" wp14:anchorId="6C4B0835" wp14:editId="1586C381">
                   <wp:extent cx="2926080" cy="1682608"/>
                   <wp:effectExtent l="0" t="0" r="0" b="0"/>
                   <wp:docPr id="20" name="Picture 20"/>
@@ -22032,7 +22032,7 @@
                 <w:noProof/>
               </w:rPr>
               <w:drawing>
-                <wp:inline distT="0" distB="0" distL="0" distR="0" wp14:anchorId="63344E1B" wp14:editId="68A54935">
+                <wp:inline distT="0" distB="0" distL="0" distR="0" wp14:anchorId="6E06F537" wp14:editId="1BFA3884">
                   <wp:extent cx="2926080" cy="1655981"/>
                   <wp:effectExtent l="0" t="0" r="0" b="0"/>
                   <wp:docPr id="21" name="Picture 21"/>
@@ -22137,7 +22137,7 @@
         <w:pStyle w:val="Ttulo1"/>
         <w:spacing w:before="100" w:after="30"/>
       </w:pPr>
-      <w:bookmarkStart w:id="47" w:name="_Toc238663164"/>
+      <w:bookmarkStart w:id="47" w:name="_Toc238664289"/>
       <w:r>
         <w:rPr>
           <w:rFonts w:ascii="Georgia" w:hAnsi="Georgia"/>
@@ -22153,7 +22153,7 @@
         <w:pStyle w:val="Ttulo2"/>
         <w:spacing w:before="70" w:after="20"/>
       </w:pPr>
-      <w:bookmarkStart w:id="48" w:name="_Toc238663165"/>
+      <w:bookmarkStart w:id="48" w:name="_Toc238664290"/>
       <w:r>
         <w:rPr>
           <w:rFonts w:ascii="Georgia" w:hAnsi="Georgia"/>
@@ -22172,7 +22172,7 @@
         </w:rPr>
       </w:pPr>
       <w:r>
-        <w:t>El análisis comparativo sectorial confirma la divergencia entre la valuación basada en cifras históricas y la capacidad de generación normalizada. Mientras el múltiplo histórico de Aluar (13,3x) refleja la compresión de resultados de 2025, el rendimiento proyectado del flujo libre de caja (&gt;10%) supera ampliamente la mediana de los pares internacionales (3,8%). A medida que se normaliza el EBITDA en 2026E–2027E, el múltiplo converge hacia 6,75x (Figura [fig:22]):</w:t>
+        <w:t>El análisis comparativo sectorial confirma la divergencia entre la valuación basada en cifras históricas y la capacidad de generación normalizada. Mientras el múltiplo histórico de Aluar (13,4x) refleja la compresión de resultados de 2025, el rendimiento proyectado del flujo libre de caja (&gt;10%) supera ampliamente la mediana de los pares internacionales (3,8%). A medida que se normaliza el EBITDA en 2026E–2027E, el múltiplo converge hacia 7,72x (Figura [fig:22]):</w:t>
       </w:r>
     </w:p>
     <w:p>
@@ -22189,7 +22189,7 @@
           <w:noProof/>
         </w:rPr>
         <w:drawing>
-          <wp:inline distT="0" distB="0" distL="0" distR="0" wp14:anchorId="27F66992" wp14:editId="333CCE6C">
+          <wp:inline distT="0" distB="0" distL="0" distR="0" wp14:anchorId="6956EB67" wp14:editId="4691CB40">
             <wp:extent cx="4206240" cy="2227773"/>
             <wp:effectExtent l="0" t="0" r="0" b="0"/>
             <wp:docPr id="22" name="Picture 22"/>
@@ -22513,7 +22513,7 @@
               <w:rPr>
                 <w:sz w:val="13"/>
               </w:rPr>
-              <w:t>13,3x</w:t>
+              <w:t>13,4x</w:t>
             </w:r>
           </w:p>
         </w:tc>
@@ -22729,7 +22729,7 @@
               <w:rPr>
                 <w:sz w:val="13"/>
               </w:rPr>
-              <w:t>12,0</w:t>
+              <w:t>13,1</w:t>
             </w:r>
           </w:p>
         </w:tc>
@@ -22839,7 +22839,7 @@
               <w:rPr>
                 <w:sz w:val="13"/>
               </w:rPr>
-              <w:t>9,0x</w:t>
+              <w:t>5,2x</w:t>
             </w:r>
           </w:p>
         </w:tc>
@@ -22893,7 +22893,7 @@
               <w:rPr>
                 <w:sz w:val="13"/>
               </w:rPr>
-              <w:t>15,1</w:t>
+              <w:t>15,5</w:t>
             </w:r>
           </w:p>
         </w:tc>
@@ -23165,7 +23165,7 @@
               <w:rPr>
                 <w:sz w:val="13"/>
               </w:rPr>
-              <w:t>6,4x</w:t>
+              <w:t>7,7x</w:t>
             </w:r>
           </w:p>
         </w:tc>
@@ -23219,7 +23219,7 @@
               <w:rPr>
                 <w:sz w:val="13"/>
               </w:rPr>
-              <w:t>13,5</w:t>
+              <w:t>11,9</w:t>
             </w:r>
           </w:p>
         </w:tc>
@@ -23656,7 +23656,7 @@
                 <w:b/>
                 <w:sz w:val="13"/>
               </w:rPr>
-              <w:t>7,2x</w:t>
+              <w:t>6,3x</w:t>
             </w:r>
           </w:p>
         </w:tc>
@@ -23706,7 +23706,7 @@
               <w:rPr>
                 <w:sz w:val="13"/>
               </w:rPr>
-              <w:t>**11,1</w:t>
+              <w:t>**11,0</w:t>
             </w:r>
           </w:p>
         </w:tc>
@@ -23777,7 +23777,7 @@
         <w:pStyle w:val="Ttulo1"/>
         <w:spacing w:before="100" w:after="30"/>
       </w:pPr>
-      <w:bookmarkStart w:id="49" w:name="_Toc238663166"/>
+      <w:bookmarkStart w:id="49" w:name="_Toc238664291"/>
       <w:r>
         <w:rPr>
           <w:rFonts w:ascii="Georgia" w:hAnsi="Georgia"/>
@@ -23794,7 +23794,7 @@
         <w:pStyle w:val="Ttulo2"/>
         <w:spacing w:before="70" w:after="20"/>
       </w:pPr>
-      <w:bookmarkStart w:id="50" w:name="_Toc238663167"/>
+      <w:bookmarkStart w:id="50" w:name="_Toc238664292"/>
       <w:r>
         <w:rPr>
           <w:rFonts w:ascii="Georgia" w:hAnsi="Georgia"/>
@@ -23889,7 +23889,7 @@
                 <w:noProof/>
               </w:rPr>
               <w:drawing>
-                <wp:inline distT="0" distB="0" distL="0" distR="0" wp14:anchorId="3EC7CA8B" wp14:editId="11B21103">
+                <wp:inline distT="0" distB="0" distL="0" distR="0" wp14:anchorId="622F2140" wp14:editId="451B8DA2">
                   <wp:extent cx="2926080" cy="1695124"/>
                   <wp:effectExtent l="0" t="0" r="0" b="0"/>
                   <wp:docPr id="23" name="Picture 23"/>
@@ -23948,7 +23948,7 @@
                 <w:noProof/>
               </w:rPr>
               <w:drawing>
-                <wp:inline distT="0" distB="0" distL="0" distR="0" wp14:anchorId="774363BF" wp14:editId="6F569769">
+                <wp:inline distT="0" distB="0" distL="0" distR="0" wp14:anchorId="4D156395" wp14:editId="489A1BE7">
                   <wp:extent cx="2926080" cy="1698212"/>
                   <wp:effectExtent l="0" t="0" r="0" b="0"/>
                   <wp:docPr id="24" name="Picture 24"/>
@@ -24053,7 +24053,7 @@
         <w:pStyle w:val="Ttulo2"/>
         <w:spacing w:before="70" w:after="20"/>
       </w:pPr>
-      <w:bookmarkStart w:id="51" w:name="_Toc238663168"/>
+      <w:bookmarkStart w:id="51" w:name="_Toc238664293"/>
       <w:r>
         <w:rPr>
           <w:rFonts w:ascii="Georgia" w:hAnsi="Georgia"/>
@@ -24139,7 +24139,7 @@
                 <w:noProof/>
               </w:rPr>
               <w:drawing>
-                <wp:inline distT="0" distB="0" distL="0" distR="0" wp14:anchorId="67FB8F41" wp14:editId="38B3910C">
+                <wp:inline distT="0" distB="0" distL="0" distR="0" wp14:anchorId="5B2D3F6A" wp14:editId="71E69ED2">
                   <wp:extent cx="2926080" cy="1696900"/>
                   <wp:effectExtent l="0" t="0" r="0" b="0"/>
                   <wp:docPr id="25" name="Picture 25"/>
@@ -24198,7 +24198,7 @@
                 <w:noProof/>
               </w:rPr>
               <w:drawing>
-                <wp:inline distT="0" distB="0" distL="0" distR="0" wp14:anchorId="5BD04A6E" wp14:editId="60C44C54">
+                <wp:inline distT="0" distB="0" distL="0" distR="0" wp14:anchorId="3767CBE9" wp14:editId="24067998">
                   <wp:extent cx="2926080" cy="1654733"/>
                   <wp:effectExtent l="0" t="0" r="0" b="0"/>
                   <wp:docPr id="26" name="Picture 26"/>
@@ -25958,7 +25958,7 @@
         <w:pStyle w:val="Ttulo1"/>
         <w:spacing w:before="100" w:after="30"/>
       </w:pPr>
-      <w:bookmarkStart w:id="52" w:name="_Toc238663169"/>
+      <w:bookmarkStart w:id="52" w:name="_Toc238664294"/>
       <w:r>
         <w:rPr>
           <w:rFonts w:ascii="Georgia" w:hAnsi="Georgia"/>
@@ -25974,7 +25974,7 @@
         <w:pStyle w:val="Ttulo2"/>
         <w:spacing w:before="70" w:after="20"/>
       </w:pPr>
-      <w:bookmarkStart w:id="53" w:name="_Toc238663170"/>
+      <w:bookmarkStart w:id="53" w:name="_Toc238664295"/>
       <w:r>
         <w:rPr>
           <w:rFonts w:ascii="Georgia" w:hAnsi="Georgia"/>
@@ -26091,7 +26091,7 @@
                 <w:noProof/>
               </w:rPr>
               <w:drawing>
-                <wp:inline distT="0" distB="0" distL="0" distR="0" wp14:anchorId="65B121B5" wp14:editId="57670BDF">
+                <wp:inline distT="0" distB="0" distL="0" distR="0" wp14:anchorId="27738ECB" wp14:editId="1739BBAB">
                   <wp:extent cx="2926080" cy="1614092"/>
                   <wp:effectExtent l="0" t="0" r="0" b="0"/>
                   <wp:docPr id="27" name="Picture 27"/>
@@ -26150,7 +26150,7 @@
                 <w:noProof/>
               </w:rPr>
               <w:drawing>
-                <wp:inline distT="0" distB="0" distL="0" distR="0" wp14:anchorId="273F522A" wp14:editId="433FDB2B">
+                <wp:inline distT="0" distB="0" distL="0" distR="0" wp14:anchorId="1CE15242" wp14:editId="0B1D7E3A">
                   <wp:extent cx="2926080" cy="1650045"/>
                   <wp:effectExtent l="0" t="0" r="0" b="0"/>
                   <wp:docPr id="28" name="Picture 28"/>
@@ -26562,7 +26562,7 @@
         <w:pStyle w:val="Ttulo2"/>
         <w:spacing w:before="70" w:after="20"/>
       </w:pPr>
-      <w:bookmarkStart w:id="54" w:name="_Toc238663171"/>
+      <w:bookmarkStart w:id="54" w:name="_Toc238664296"/>
       <w:r>
         <w:rPr>
           <w:rFonts w:ascii="Georgia" w:hAnsi="Georgia"/>
@@ -26649,7 +26649,7 @@
                 <w:noProof/>
               </w:rPr>
               <w:drawing>
-                <wp:inline distT="0" distB="0" distL="0" distR="0" wp14:anchorId="03C7C629" wp14:editId="2209B597">
+                <wp:inline distT="0" distB="0" distL="0" distR="0" wp14:anchorId="05803F28" wp14:editId="24038AF8">
                   <wp:extent cx="2926080" cy="1527796"/>
                   <wp:effectExtent l="0" t="0" r="0" b="0"/>
                   <wp:docPr id="29" name="Picture 29"/>
@@ -26708,7 +26708,7 @@
                 <w:noProof/>
               </w:rPr>
               <w:drawing>
-                <wp:inline distT="0" distB="0" distL="0" distR="0" wp14:anchorId="69881926" wp14:editId="2539C8F5">
+                <wp:inline distT="0" distB="0" distL="0" distR="0" wp14:anchorId="36F710BB" wp14:editId="3F499818">
                   <wp:extent cx="2926080" cy="1611196"/>
                   <wp:effectExtent l="0" t="0" r="0" b="0"/>
                   <wp:docPr id="30" name="Picture 30"/>
@@ -26813,7 +26813,7 @@
         <w:pStyle w:val="Ttulo2"/>
         <w:spacing w:before="70" w:after="20"/>
       </w:pPr>
-      <w:bookmarkStart w:id="55" w:name="_Toc238663172"/>
+      <w:bookmarkStart w:id="55" w:name="_Toc238664297"/>
       <w:r>
         <w:rPr>
           <w:rFonts w:ascii="Georgia" w:hAnsi="Georgia"/>
@@ -26874,7 +26874,7 @@
                 <w:noProof/>
               </w:rPr>
               <w:drawing>
-                <wp:inline distT="0" distB="0" distL="0" distR="0" wp14:anchorId="34DF2609" wp14:editId="6FC30899">
+                <wp:inline distT="0" distB="0" distL="0" distR="0" wp14:anchorId="055CB979" wp14:editId="514407E2">
                   <wp:extent cx="2926080" cy="1723518"/>
                   <wp:effectExtent l="0" t="0" r="0" b="0"/>
                   <wp:docPr id="31" name="Picture 31"/>
@@ -27475,7 +27475,7 @@
         <w:pStyle w:val="Ttulo2"/>
         <w:spacing w:before="70" w:after="20"/>
       </w:pPr>
-      <w:bookmarkStart w:id="56" w:name="_Toc238663173"/>
+      <w:bookmarkStart w:id="56" w:name="_Toc238664298"/>
       <w:r>
         <w:rPr>
           <w:rFonts w:ascii="Georgia" w:hAnsi="Georgia"/>
@@ -28885,7 +28885,7 @@
         <w:pStyle w:val="Ttulo1"/>
         <w:spacing w:before="100" w:after="30"/>
       </w:pPr>
-      <w:bookmarkStart w:id="57" w:name="_Toc238663174"/>
+      <w:bookmarkStart w:id="57" w:name="_Toc238664299"/>
       <w:r>
         <w:rPr>
           <w:rFonts w:ascii="Georgia" w:hAnsi="Georgia"/>
@@ -29027,7 +29027,7 @@
         <w:rPr>
           <w:sz w:val="16"/>
         </w:rPr>
-        <w:t xml:space="preserve"> ARS 844 a ARS 1.737 por acción, con 85,2% de probabilidad de retorno positivo.</w:t>
+        <w:t xml:space="preserve"> ARS 866 a ARS 1.790 por acción, con 87,7% de probabilidad de retorno positivo.</w:t>
       </w:r>
     </w:p>
     <w:p>
@@ -29064,7 +29064,7 @@
         <w:pStyle w:val="Ttulo1"/>
         <w:spacing w:before="100" w:after="30"/>
       </w:pPr>
-      <w:bookmarkStart w:id="58" w:name="_Toc238663175"/>
+      <w:bookmarkStart w:id="58" w:name="_Toc238664300"/>
       <w:r>
         <w:rPr>
           <w:rFonts w:ascii="Georgia" w:hAnsi="Georgia"/>
@@ -38162,7 +38162,7 @@
         <w:pStyle w:val="Ttulo1"/>
         <w:spacing w:before="100" w:after="30"/>
       </w:pPr>
-      <w:bookmarkStart w:id="59" w:name="_Toc238663176"/>
+      <w:bookmarkStart w:id="59" w:name="_Toc238664301"/>
       <w:r>
         <w:rPr>
           <w:rFonts w:ascii="Georgia" w:hAnsi="Georgia"/>
@@ -38269,7 +38269,7 @@
         <w:pStyle w:val="Ttulo1"/>
         <w:spacing w:before="100" w:after="30"/>
       </w:pPr>
-      <w:bookmarkStart w:id="60" w:name="_Toc238663177"/>
+      <w:bookmarkStart w:id="60" w:name="_Toc238664302"/>
       <w:r>
         <w:rPr>
           <w:rFonts w:ascii="Georgia" w:hAnsi="Georgia"/>
@@ -39495,31 +39495,31 @@
       </w:rPr>
     </w:lvl>
   </w:abstractNum>
-  <w:num w:numId="1" w16cid:durableId="1193760923">
+  <w:num w:numId="1" w16cid:durableId="2105414886">
     <w:abstractNumId w:val="8"/>
   </w:num>
-  <w:num w:numId="2" w16cid:durableId="709182924">
+  <w:num w:numId="2" w16cid:durableId="614018323">
     <w:abstractNumId w:val="6"/>
   </w:num>
-  <w:num w:numId="3" w16cid:durableId="889027692">
+  <w:num w:numId="3" w16cid:durableId="1113281426">
     <w:abstractNumId w:val="5"/>
   </w:num>
-  <w:num w:numId="4" w16cid:durableId="133257988">
+  <w:num w:numId="4" w16cid:durableId="110368852">
     <w:abstractNumId w:val="4"/>
   </w:num>
-  <w:num w:numId="5" w16cid:durableId="1526287774">
+  <w:num w:numId="5" w16cid:durableId="1836801137">
     <w:abstractNumId w:val="7"/>
   </w:num>
-  <w:num w:numId="6" w16cid:durableId="34430431">
+  <w:num w:numId="6" w16cid:durableId="1111558520">
     <w:abstractNumId w:val="3"/>
   </w:num>
-  <w:num w:numId="7" w16cid:durableId="1139226291">
+  <w:num w:numId="7" w16cid:durableId="486475805">
     <w:abstractNumId w:val="2"/>
   </w:num>
-  <w:num w:numId="8" w16cid:durableId="472723215">
+  <w:num w:numId="8" w16cid:durableId="1155562314">
     <w:abstractNumId w:val="1"/>
   </w:num>
-  <w:num w:numId="9" w16cid:durableId="894776403">
+  <w:num w:numId="9" w16cid:durableId="147863547">
     <w:abstractNumId w:val="0"/>
   </w:num>
 </w:numbering>
@@ -50951,7 +50951,7 @@
     <w:autoRedefine/>
     <w:uiPriority w:val="39"/>
     <w:unhideWhenUsed/>
-    <w:rsid w:val="00D83C5E"/>
+    <w:rsid w:val="000615E5"/>
     <w:pPr>
       <w:spacing w:before="10" w:after="10" w:line="240" w:lineRule="auto"/>
     </w:pPr>
@@ -50966,7 +50966,7 @@
     <w:autoRedefine/>
     <w:uiPriority w:val="39"/>
     <w:unhideWhenUsed/>
-    <w:rsid w:val="00D83C5E"/>
+    <w:rsid w:val="000615E5"/>
     <w:pPr>
       <w:spacing w:after="0" w:line="240" w:lineRule="auto"/>
       <w:ind w:left="170"/>
@@ -50980,7 +50980,7 @@
     <w:basedOn w:val="Fuentedeprrafopredeter"/>
     <w:uiPriority w:val="99"/>
     <w:unhideWhenUsed/>
-    <w:rsid w:val="00D83C5E"/>
+    <w:rsid w:val="000615E5"/>
     <w:rPr>
       <w:color w:val="0000FF" w:themeColor="hyperlink"/>
       <w:u w:val="single"/>

</xml_diff>